<commit_message>
Test section 4 arrangement
</commit_message>
<xml_diff>
--- a/Quarto_report/Audit_Report.docx
+++ b/Quarto_report/Audit_Report.docx
@@ -47,7 +47,7 @@
         <w:pStyle w:val="BodyText"/>
       </w:pPr>
       <w:r>
-        <w:t xml:space="preserve">Date: May 5 2025</w:t>
+        <w:t xml:space="preserve">Date: May 12 2025</w:t>
       </w:r>
     </w:p>
     <w:p>
@@ -4543,6 +4543,190 @@
       </w:r>
     </w:p>
     <w:bookmarkEnd w:id="57"/>
+    <w:bookmarkStart w:id="72" w:name="section-four-tests"/>
+    <w:p>
+      <w:pPr>
+        <w:pStyle w:val="Heading2"/>
+      </w:pPr>
+      <w:r>
+        <w:t xml:space="preserve">6 Section Four Tests</w:t>
+      </w:r>
+    </w:p>
+    <w:bookmarkStart w:id="58" w:name="furnaceboiler-tune-up-1"/>
+    <w:p>
+      <w:pPr>
+        <w:pStyle w:val="Heading3"/>
+      </w:pPr>
+      <w:r>
+        <w:t xml:space="preserve">6.1 Furnace/Boiler Tune-up</w:t>
+      </w:r>
+    </w:p>
+    <w:bookmarkEnd w:id="58"/>
+    <w:bookmarkStart w:id="59" w:name="windowdressers"/>
+    <w:p>
+      <w:pPr>
+        <w:pStyle w:val="Heading3"/>
+      </w:pPr>
+      <w:r>
+        <w:t xml:space="preserve">6.2 WindowDressers</w:t>
+      </w:r>
+    </w:p>
+    <w:bookmarkEnd w:id="59"/>
+    <w:bookmarkStart w:id="60" w:name="gutters-1"/>
+    <w:p>
+      <w:pPr>
+        <w:pStyle w:val="Heading3"/>
+      </w:pPr>
+      <w:r>
+        <w:t xml:space="preserve">6.3 Gutters</w:t>
+      </w:r>
+    </w:p>
+    <w:bookmarkEnd w:id="60"/>
+    <w:bookmarkStart w:id="61" w:name="pipe-insulation-1"/>
+    <w:p>
+      <w:pPr>
+        <w:pStyle w:val="Heading3"/>
+      </w:pPr>
+      <w:r>
+        <w:t xml:space="preserve">6.4 Pipe Insulation</w:t>
+      </w:r>
+    </w:p>
+    <w:bookmarkEnd w:id="61"/>
+    <w:bookmarkStart w:id="62" w:name="heat-pump-water-heater-1"/>
+    <w:p>
+      <w:pPr>
+        <w:pStyle w:val="Heading3"/>
+      </w:pPr>
+      <w:r>
+        <w:t xml:space="preserve">6.5 Heat Pump Water Heater</w:t>
+      </w:r>
+    </w:p>
+    <w:bookmarkEnd w:id="62"/>
+    <w:bookmarkStart w:id="63" w:name="attic-air-sealing-and-insulation"/>
+    <w:p>
+      <w:pPr>
+        <w:pStyle w:val="Heading3"/>
+      </w:pPr>
+      <w:r>
+        <w:t xml:space="preserve">6.6 Attic Air Sealing and Insulation</w:t>
+      </w:r>
+    </w:p>
+    <w:bookmarkEnd w:id="63"/>
+    <w:bookmarkStart w:id="64" w:name="air-source-heat-pump-1"/>
+    <w:p>
+      <w:pPr>
+        <w:pStyle w:val="Heading3"/>
+      </w:pPr>
+      <w:r>
+        <w:t xml:space="preserve">6.7 Air Source Heat Pump</w:t>
+      </w:r>
+    </w:p>
+    <w:bookmarkEnd w:id="64"/>
+    <w:bookmarkStart w:id="65" w:name="electrical-panel-upgrade-1"/>
+    <w:p>
+      <w:pPr>
+        <w:pStyle w:val="Heading3"/>
+      </w:pPr>
+      <w:r>
+        <w:t xml:space="preserve">6.8 Electrical Panel Upgrade</w:t>
+      </w:r>
+    </w:p>
+    <w:bookmarkEnd w:id="65"/>
+    <w:bookmarkStart w:id="66" w:name="whole-house-surge-protection-1"/>
+    <w:p>
+      <w:pPr>
+        <w:pStyle w:val="Heading3"/>
+      </w:pPr>
+      <w:r>
+        <w:t xml:space="preserve">6.9 Whole-House Surge Protection</w:t>
+      </w:r>
+    </w:p>
+    <w:bookmarkEnd w:id="66"/>
+    <w:bookmarkStart w:id="67" w:name="replace-windows-1"/>
+    <w:p>
+      <w:pPr>
+        <w:pStyle w:val="Heading3"/>
+      </w:pPr>
+      <w:r>
+        <w:t xml:space="preserve">6.10 Replace Windows</w:t>
+      </w:r>
+    </w:p>
+    <w:bookmarkEnd w:id="67"/>
+    <w:bookmarkStart w:id="68" w:name="replace-doors-1"/>
+    <w:p>
+      <w:pPr>
+        <w:pStyle w:val="Heading3"/>
+      </w:pPr>
+      <w:r>
+        <w:t xml:space="preserve">6.11 Replace Doors</w:t>
+      </w:r>
+    </w:p>
+    <w:bookmarkEnd w:id="68"/>
+    <w:bookmarkStart w:id="69" w:name="vapor-barrier-1"/>
+    <w:p>
+      <w:pPr>
+        <w:pStyle w:val="Heading3"/>
+      </w:pPr>
+      <w:r>
+        <w:t xml:space="preserve">6.12 Vapor Barrier</w:t>
+      </w:r>
+    </w:p>
+    <w:bookmarkEnd w:id="69"/>
+    <w:bookmarkStart w:id="70" w:name="spray-foam-basementcrawlspace-walls"/>
+    <w:p>
+      <w:pPr>
+        <w:pStyle w:val="Heading3"/>
+      </w:pPr>
+      <w:r>
+        <w:t xml:space="preserve">6.13 Spray Foam Basement/Crawlspace Walls</w:t>
+      </w:r>
+    </w:p>
+    <w:bookmarkEnd w:id="70"/>
+    <w:bookmarkStart w:id="71" w:name="continuous-exterior-wall-insulation-1"/>
+    <w:p>
+      <w:pPr>
+        <w:pStyle w:val="Heading3"/>
+      </w:pPr>
+      <w:r>
+        <w:t xml:space="preserve">6.14 Continuous Exterior Wall Insulation</w:t>
+      </w:r>
+    </w:p>
+    <w:p>
+      <w:pPr>
+        <w:pStyle w:val="FirstParagraph"/>
+      </w:pPr>
+      <w:r>
+        <w:t xml:space="preserve">Row 2 : Name = Bob , Score = 85</w:t>
+      </w:r>
+    </w:p>
+    <w:p>
+      <w:pPr>
+        <w:pStyle w:val="SourceCode"/>
+      </w:pPr>
+      <w:r>
+        <w:rPr>
+          <w:rStyle w:val="VerbatimChar"/>
+        </w:rPr>
+        <w:t xml:space="preserve">  Row 4 : Name = Dave , Score = 92 </w:t>
+      </w:r>
+      <w:r>
+        <w:br/>
+      </w:r>
+      <w:r>
+        <w:br/>
+      </w:r>
+      <w:r>
+        <w:br/>
+      </w:r>
+      <w:r>
+        <w:rPr>
+          <w:rStyle w:val="VerbatimChar"/>
+        </w:rPr>
+        <w:t xml:space="preserve">  Row 6 : Name = Frank , Score = 87 </w:t>
+      </w:r>
+    </w:p>
+    <w:bookmarkEnd w:id="71"/>
+    <w:bookmarkEnd w:id="72"/>
     <w:sectPr>
       <w:pgSz w:h="15840" w:w="12240"/>
       <w:pgMar w:bottom="1440" w:footer="720" w:gutter="0" w:header="720" w:left="1440" w:right="1440" w:top="1440"/>

</xml_diff>

<commit_message>
Render Dane Thompson autit report
</commit_message>
<xml_diff>
--- a/Quarto_report/Audit_Report.docx
+++ b/Quarto_report/Audit_Report.docx
@@ -15,7 +15,7 @@
         <w:pStyle w:val="FirstParagraph"/>
       </w:pPr>
       <w:r>
-        <w:t xml:space="preserve">Homeowner(s): David Gibson</w:t>
+        <w:t xml:space="preserve">Homeowner(s): Dane Thompson</w:t>
       </w:r>
     </w:p>
     <w:p>
@@ -23,7 +23,7 @@
         <w:pStyle w:val="BodyText"/>
       </w:pPr>
       <w:r>
-        <w:t xml:space="preserve">Address: 105 Eden St Bar Harbor, ME 04609</w:t>
+        <w:t xml:space="preserve">Address: 25 Komusin Lane, Cranberry Isles, Maine, 04625</w:t>
       </w:r>
     </w:p>
     <w:p>
@@ -31,7 +31,7 @@
         <w:pStyle w:val="BodyText"/>
       </w:pPr>
       <w:r>
-        <w:t xml:space="preserve">Owner Contact: dgibson@coa.edu</w:t>
+        <w:t xml:space="preserve">Owner Contact: NA</w:t>
       </w:r>
     </w:p>
     <w:p>
@@ -39,7 +39,7 @@
         <w:pStyle w:val="BodyText"/>
       </w:pPr>
       <w:r>
-        <w:t xml:space="preserve">Auditors: Pema Lhundrup, Mabon Young</w:t>
+        <w:t xml:space="preserve">Auditors: Nicole Grohoski, Uriel Orozco Brenes, Zoe Duni</w:t>
       </w:r>
     </w:p>
     <w:p>
@@ -55,7 +55,7 @@
         <w:pStyle w:val="BodyText"/>
       </w:pPr>
       <w:r>
-        <w:t xml:space="preserve">Report Date: June 13, 2025</w:t>
+        <w:t xml:space="preserve">Report Date: June 20, 2025</w:t>
       </w:r>
     </w:p>
     <w:p>
@@ -70,7 +70,7 @@
         <w:pStyle w:val="FirstParagraph"/>
       </w:pPr>
       <w:r>
-        <w:t xml:space="preserve">We conducted an energy assessment of your home on 6/13/2025. This report will tell you what we did, what we found, and what we suggest for your home. These suggestions include information on incentives and financing to make improvements more affordable.</w:t>
+        <w:t xml:space="preserve">We conducted an energy assessment of your home on 8/28/2024. This report will tell you what we did, what we found, and what we suggest for your home. These suggestions include information on incentives and financing to make improvements more affordable.</w:t>
       </w:r>
     </w:p>
     <w:p>
@@ -387,31 +387,31 @@
                 <w:rFonts w:ascii="Calibri" w:hAnsi="Calibri"/>
                 <w:sz w:val="20"/>
               </w:rPr>
-              <w:t xml:space="default">Refrigerator</w:t>
-            </w:r>
-          </w:p>
-        </w:tc>
-        <w:tc>
-          <w:tcPr>
-            <w:tcBorders>
-              <w:top w:val="single" w:space="0" w:color="D3D3D3"/>
-              <w:bottom w:val="single" w:space="0" w:color="D3D3D3"/>
-              <w:start w:val="single" w:space="0" w:color="D3D3D3"/>
-              <w:end w:val="single" w:space="0" w:color="D3D3D3"/>
-            </w:tcBorders>
-          </w:tcPr>
-          <w:p>
-            <w:pPr>
-              <w:spacing w:before="0" w:after="60"/>
-              <w:keepNext/>
-              <w:jc w:val="start"/>
-            </w:pPr>
-            <w:r>
-              <w:rPr>
-                <w:rFonts w:ascii="Calibri" w:hAnsi="Calibri"/>
-                <w:sz w:val="20"/>
-              </w:rPr>
-              <w:t xml:space="default">Replace your refrigerator with a new, EnergyStar certified fridge. Look at the Energy Guide label to compare the energy use of new refrigerators.</w:t>
+              <w:t xml:space="default">Gutters</w:t>
+            </w:r>
+          </w:p>
+        </w:tc>
+        <w:tc>
+          <w:tcPr>
+            <w:tcBorders>
+              <w:top w:val="single" w:space="0" w:color="D3D3D3"/>
+              <w:bottom w:val="single" w:space="0" w:color="D3D3D3"/>
+              <w:start w:val="single" w:space="0" w:color="D3D3D3"/>
+              <w:end w:val="single" w:space="0" w:color="D3D3D3"/>
+            </w:tcBorders>
+          </w:tcPr>
+          <w:p>
+            <w:pPr>
+              <w:spacing w:before="0" w:after="60"/>
+              <w:keepNext/>
+              <w:jc w:val="start"/>
+            </w:pPr>
+            <w:r>
+              <w:rPr>
+                <w:rFonts w:ascii="Calibri" w:hAnsi="Calibri"/>
+                <w:sz w:val="20"/>
+              </w:rPr>
+              <w:t xml:space="default">Install gutters and downspouts that divert water at least six feet away from the foundation and to where the ground slopes away from the house.</w:t>
             </w:r>
           </w:p>
         </w:tc>
@@ -440,31 +440,31 @@
                 <w:rFonts w:ascii="Calibri" w:hAnsi="Calibri"/>
                 <w:sz w:val="20"/>
               </w:rPr>
-              <w:t xml:space="default">Induction Stove/Oven</w:t>
-            </w:r>
-          </w:p>
-        </w:tc>
-        <w:tc>
-          <w:tcPr>
-            <w:tcBorders>
-              <w:top w:val="single" w:space="0" w:color="D3D3D3"/>
-              <w:bottom w:val="single" w:space="0" w:color="D3D3D3"/>
-              <w:start w:val="single" w:space="0" w:color="D3D3D3"/>
-              <w:end w:val="single" w:space="0" w:color="D3D3D3"/>
-            </w:tcBorders>
-          </w:tcPr>
-          <w:p>
-            <w:pPr>
-              <w:spacing w:before="0" w:after="60"/>
-              <w:keepNext/>
-              <w:jc w:val="start"/>
-            </w:pPr>
-            <w:r>
-              <w:rPr>
-                <w:rFonts w:ascii="Calibri" w:hAnsi="Calibri"/>
-                <w:sz w:val="20"/>
-              </w:rPr>
-              <w:t xml:space="default">Induction cooking appliances are more efficient and safer than electric or gas ones. There is no risk of carbon monoxide or other harmful combustion gases, and the surface doesn’t heat up without a pot or pan on it.</w:t>
+              <w:t xml:space="default">Other 1</w:t>
+            </w:r>
+          </w:p>
+        </w:tc>
+        <w:tc>
+          <w:tcPr>
+            <w:tcBorders>
+              <w:top w:val="single" w:space="0" w:color="D3D3D3"/>
+              <w:bottom w:val="single" w:space="0" w:color="D3D3D3"/>
+              <w:start w:val="single" w:space="0" w:color="D3D3D3"/>
+              <w:end w:val="single" w:space="0" w:color="D3D3D3"/>
+            </w:tcBorders>
+          </w:tcPr>
+          <w:p>
+            <w:pPr>
+              <w:spacing w:before="0" w:after="60"/>
+              <w:keepNext/>
+              <w:jc w:val="start"/>
+            </w:pPr>
+            <w:r>
+              <w:rPr>
+                <w:rFonts w:ascii="Calibri" w:hAnsi="Calibri"/>
+                <w:sz w:val="20"/>
+              </w:rPr>
+              <w:t xml:space="default">TYPE HERE 1</w:t>
             </w:r>
           </w:p>
         </w:tc>
@@ -493,112 +493,6 @@
                 <w:rFonts w:ascii="Calibri" w:hAnsi="Calibri"/>
                 <w:sz w:val="20"/>
               </w:rPr>
-              <w:t xml:space="default">Gutters</w:t>
-            </w:r>
-          </w:p>
-        </w:tc>
-        <w:tc>
-          <w:tcPr>
-            <w:tcBorders>
-              <w:top w:val="single" w:space="0" w:color="D3D3D3"/>
-              <w:bottom w:val="single" w:space="0" w:color="D3D3D3"/>
-              <w:start w:val="single" w:space="0" w:color="D3D3D3"/>
-              <w:end w:val="single" w:space="0" w:color="D3D3D3"/>
-            </w:tcBorders>
-          </w:tcPr>
-          <w:p>
-            <w:pPr>
-              <w:spacing w:before="0" w:after="60"/>
-              <w:keepNext/>
-              <w:jc w:val="start"/>
-            </w:pPr>
-            <w:r>
-              <w:rPr>
-                <w:rFonts w:ascii="Calibri" w:hAnsi="Calibri"/>
-                <w:sz w:val="20"/>
-              </w:rPr>
-              <w:t xml:space="default">Install gutters and downspouts that divert water at least six feet away from the foundation and to where the ground slopes away from the house.</w:t>
-            </w:r>
-          </w:p>
-        </w:tc>
-      </w:tr>
-      <w:tr>
-        <w:trPr>
-          <w:cantSplit/>
-        </w:trPr>
-        <w:tc>
-          <w:tcPr>
-            <w:tcBorders>
-              <w:top w:val="single" w:space="0" w:color="D3D3D3"/>
-              <w:bottom w:val="single" w:space="0" w:color="D3D3D3"/>
-              <w:start w:val="single" w:space="0" w:color="D3D3D3"/>
-              <w:end w:val="single" w:space="0" w:color="D3D3D3"/>
-            </w:tcBorders>
-          </w:tcPr>
-          <w:p>
-            <w:pPr>
-              <w:spacing w:before="0" w:after="60"/>
-              <w:keepNext/>
-              <w:jc w:val="start"/>
-            </w:pPr>
-            <w:r>
-              <w:rPr>
-                <w:rFonts w:ascii="Calibri" w:hAnsi="Calibri"/>
-                <w:sz w:val="20"/>
-              </w:rPr>
-              <w:t xml:space="default">Bathroom Exhaust Fan(s)</w:t>
-            </w:r>
-          </w:p>
-        </w:tc>
-        <w:tc>
-          <w:tcPr>
-            <w:tcBorders>
-              <w:top w:val="single" w:space="0" w:color="D3D3D3"/>
-              <w:bottom w:val="single" w:space="0" w:color="D3D3D3"/>
-              <w:start w:val="single" w:space="0" w:color="D3D3D3"/>
-              <w:end w:val="single" w:space="0" w:color="D3D3D3"/>
-            </w:tcBorders>
-          </w:tcPr>
-          <w:p>
-            <w:pPr>
-              <w:spacing w:before="0" w:after="60"/>
-              <w:keepNext/>
-              <w:jc w:val="start"/>
-            </w:pPr>
-            <w:r>
-              <w:rPr>
-                <w:rFonts w:ascii="Calibri" w:hAnsi="Calibri"/>
-                <w:sz w:val="20"/>
-              </w:rPr>
-              <w:t xml:space="default">Bathroom exhaust fans should be rated for at least 80 cubic feet per minute (CFM) if there is a shower. We recommend Panasonic WhisperQuiet or similar fans that don’t create excess noise.</w:t>
-            </w:r>
-          </w:p>
-        </w:tc>
-      </w:tr>
-      <w:tr>
-        <w:trPr>
-          <w:cantSplit/>
-        </w:trPr>
-        <w:tc>
-          <w:tcPr>
-            <w:tcBorders>
-              <w:top w:val="single" w:space="0" w:color="D3D3D3"/>
-              <w:bottom w:val="single" w:space="0" w:color="D3D3D3"/>
-              <w:start w:val="single" w:space="0" w:color="D3D3D3"/>
-              <w:end w:val="single" w:space="0" w:color="D3D3D3"/>
-            </w:tcBorders>
-          </w:tcPr>
-          <w:p>
-            <w:pPr>
-              <w:spacing w:before="0" w:after="60"/>
-              <w:keepNext/>
-              <w:jc w:val="start"/>
-            </w:pPr>
-            <w:r>
-              <w:rPr>
-                <w:rFonts w:ascii="Calibri" w:hAnsi="Calibri"/>
-                <w:sz w:val="20"/>
-              </w:rPr>
               <w:t xml:space="default">Kitchen Exhaust Fan</w:t>
             </w:r>
           </w:p>
@@ -624,642 +518,6 @@
                 <w:sz w:val="20"/>
               </w:rPr>
               <w:t xml:space="default">A kitchen exhaust fan will remove harmful combustion gases from your home and should be rated for at least 100 cubic feet per minute (CFM). A fan can also help with moisture concerns.</w:t>
-            </w:r>
-          </w:p>
-        </w:tc>
-      </w:tr>
-      <w:tr>
-        <w:trPr>
-          <w:cantSplit/>
-        </w:trPr>
-        <w:tc>
-          <w:tcPr>
-            <w:tcBorders>
-              <w:top w:val="single" w:space="0" w:color="D3D3D3"/>
-              <w:bottom w:val="single" w:space="0" w:color="D3D3D3"/>
-              <w:start w:val="single" w:space="0" w:color="D3D3D3"/>
-              <w:end w:val="single" w:space="0" w:color="D3D3D3"/>
-            </w:tcBorders>
-          </w:tcPr>
-          <w:p>
-            <w:pPr>
-              <w:spacing w:before="0" w:after="60"/>
-              <w:keepNext/>
-              <w:jc w:val="start"/>
-            </w:pPr>
-            <w:r>
-              <w:rPr>
-                <w:rFonts w:ascii="Calibri" w:hAnsi="Calibri"/>
-                <w:sz w:val="20"/>
-              </w:rPr>
-              <w:t xml:space="default">Vapor Barrier</w:t>
-            </w:r>
-          </w:p>
-        </w:tc>
-        <w:tc>
-          <w:tcPr>
-            <w:tcBorders>
-              <w:top w:val="single" w:space="0" w:color="D3D3D3"/>
-              <w:bottom w:val="single" w:space="0" w:color="D3D3D3"/>
-              <w:start w:val="single" w:space="0" w:color="D3D3D3"/>
-              <w:end w:val="single" w:space="0" w:color="D3D3D3"/>
-            </w:tcBorders>
-          </w:tcPr>
-          <w:p>
-            <w:pPr>
-              <w:spacing w:before="0" w:after="60"/>
-              <w:keepNext/>
-              <w:jc w:val="start"/>
-            </w:pPr>
-            <w:r>
-              <w:rPr>
-                <w:rFonts w:ascii="Calibri" w:hAnsi="Calibri"/>
-                <w:sz w:val="20"/>
-              </w:rPr>
-              <w:t xml:space="default">Install a vapor barrier on the basement floor to stop moisture from entering the basement and house.</w:t>
-            </w:r>
-          </w:p>
-        </w:tc>
-      </w:tr>
-      <w:tr>
-        <w:trPr>
-          <w:cantSplit/>
-        </w:trPr>
-        <w:tc>
-          <w:tcPr>
-            <w:tcBorders>
-              <w:top w:val="single" w:space="0" w:color="D3D3D3"/>
-              <w:bottom w:val="single" w:space="0" w:color="D3D3D3"/>
-              <w:start w:val="single" w:space="0" w:color="D3D3D3"/>
-              <w:end w:val="single" w:space="0" w:color="D3D3D3"/>
-            </w:tcBorders>
-          </w:tcPr>
-          <w:p>
-            <w:pPr>
-              <w:spacing w:before="0" w:after="60"/>
-              <w:keepNext/>
-              <w:jc w:val="start"/>
-            </w:pPr>
-            <w:r>
-              <w:rPr>
-                <w:rFonts w:ascii="Calibri" w:hAnsi="Calibri"/>
-                <w:sz w:val="20"/>
-              </w:rPr>
-              <w:t xml:space="default">Spray Foam Basement/Crawlspace Walls</w:t>
-            </w:r>
-          </w:p>
-        </w:tc>
-        <w:tc>
-          <w:tcPr>
-            <w:tcBorders>
-              <w:top w:val="single" w:space="0" w:color="D3D3D3"/>
-              <w:bottom w:val="single" w:space="0" w:color="D3D3D3"/>
-              <w:start w:val="single" w:space="0" w:color="D3D3D3"/>
-              <w:end w:val="single" w:space="0" w:color="D3D3D3"/>
-            </w:tcBorders>
-          </w:tcPr>
-          <w:p>
-            <w:pPr>
-              <w:spacing w:before="0" w:after="60"/>
-              <w:keepNext/>
-              <w:jc w:val="start"/>
-            </w:pPr>
-            <w:r>
-              <w:rPr>
-                <w:rFonts w:ascii="Calibri" w:hAnsi="Calibri"/>
-                <w:sz w:val="20"/>
-              </w:rPr>
-              <w:t xml:space="default">Install spray foam on the basement/crawlspace walls to prevent moisture infiltration and reduce heat loss.</w:t>
-            </w:r>
-          </w:p>
-        </w:tc>
-      </w:tr>
-      <w:tr>
-        <w:trPr>
-          <w:cantSplit/>
-        </w:trPr>
-        <w:tc>
-          <w:tcPr>
-            <w:tcBorders>
-              <w:top w:val="single" w:space="0" w:color="D3D3D3"/>
-              <w:bottom w:val="single" w:space="0" w:color="D3D3D3"/>
-              <w:start w:val="single" w:space="0" w:color="D3D3D3"/>
-              <w:end w:val="single" w:space="0" w:color="D3D3D3"/>
-            </w:tcBorders>
-          </w:tcPr>
-          <w:p>
-            <w:pPr>
-              <w:spacing w:before="0" w:after="60"/>
-              <w:keepNext/>
-              <w:jc w:val="start"/>
-            </w:pPr>
-            <w:r>
-              <w:rPr>
-                <w:rFonts w:ascii="Calibri" w:hAnsi="Calibri"/>
-                <w:sz w:val="20"/>
-              </w:rPr>
-              <w:t xml:space="default">Attic Air Sealing and Insulation</w:t>
-            </w:r>
-          </w:p>
-        </w:tc>
-        <w:tc>
-          <w:tcPr>
-            <w:tcBorders>
-              <w:top w:val="single" w:space="0" w:color="D3D3D3"/>
-              <w:bottom w:val="single" w:space="0" w:color="D3D3D3"/>
-              <w:start w:val="single" w:space="0" w:color="D3D3D3"/>
-              <w:end w:val="single" w:space="0" w:color="D3D3D3"/>
-            </w:tcBorders>
-          </w:tcPr>
-          <w:p>
-            <w:pPr>
-              <w:spacing w:before="0" w:after="60"/>
-              <w:keepNext/>
-              <w:jc w:val="start"/>
-            </w:pPr>
-            <w:r>
-              <w:rPr>
-                <w:rFonts w:ascii="Calibri" w:hAnsi="Calibri"/>
-                <w:sz w:val="20"/>
-              </w:rPr>
-              <w:t xml:space="default">Air seal the attic and insulate it to at least R-60 (18” of loose-fill cellulose insulation).</w:t>
-            </w:r>
-          </w:p>
-        </w:tc>
-      </w:tr>
-      <w:tr>
-        <w:trPr>
-          <w:cantSplit/>
-        </w:trPr>
-        <w:tc>
-          <w:tcPr>
-            <w:tcBorders>
-              <w:top w:val="single" w:space="0" w:color="D3D3D3"/>
-              <w:bottom w:val="single" w:space="0" w:color="D3D3D3"/>
-              <w:start w:val="single" w:space="0" w:color="D3D3D3"/>
-              <w:end w:val="single" w:space="0" w:color="D3D3D3"/>
-            </w:tcBorders>
-          </w:tcPr>
-          <w:p>
-            <w:pPr>
-              <w:spacing w:before="0" w:after="60"/>
-              <w:keepNext/>
-              <w:jc w:val="start"/>
-            </w:pPr>
-            <w:r>
-              <w:rPr>
-                <w:rFonts w:ascii="Calibri" w:hAnsi="Calibri"/>
-                <w:sz w:val="20"/>
-              </w:rPr>
-              <w:t xml:space="default">Blown-in Cellulose Wall Insulation</w:t>
-            </w:r>
-          </w:p>
-        </w:tc>
-        <w:tc>
-          <w:tcPr>
-            <w:tcBorders>
-              <w:top w:val="single" w:space="0" w:color="D3D3D3"/>
-              <w:bottom w:val="single" w:space="0" w:color="D3D3D3"/>
-              <w:start w:val="single" w:space="0" w:color="D3D3D3"/>
-              <w:end w:val="single" w:space="0" w:color="D3D3D3"/>
-            </w:tcBorders>
-          </w:tcPr>
-          <w:p>
-            <w:pPr>
-              <w:spacing w:before="0" w:after="60"/>
-              <w:keepNext/>
-              <w:jc w:val="start"/>
-            </w:pPr>
-            <w:r>
-              <w:rPr>
-                <w:rFonts w:ascii="Calibri" w:hAnsi="Calibri"/>
-                <w:sz w:val="20"/>
-              </w:rPr>
-              <w:t xml:space="default">Insulate the wall stud cavities with dense packed, blown-in cellulose insulation.</w:t>
-            </w:r>
-          </w:p>
-        </w:tc>
-      </w:tr>
-      <w:tr>
-        <w:trPr>
-          <w:cantSplit/>
-        </w:trPr>
-        <w:tc>
-          <w:tcPr>
-            <w:tcBorders>
-              <w:top w:val="single" w:space="0" w:color="D3D3D3"/>
-              <w:bottom w:val="single" w:space="0" w:color="D3D3D3"/>
-              <w:start w:val="single" w:space="0" w:color="D3D3D3"/>
-              <w:end w:val="single" w:space="0" w:color="D3D3D3"/>
-            </w:tcBorders>
-          </w:tcPr>
-          <w:p>
-            <w:pPr>
-              <w:spacing w:before="0" w:after="60"/>
-              <w:keepNext/>
-              <w:jc w:val="start"/>
-            </w:pPr>
-            <w:r>
-              <w:rPr>
-                <w:rFonts w:ascii="Calibri" w:hAnsi="Calibri"/>
-                <w:sz w:val="20"/>
-              </w:rPr>
-              <w:t xml:space="default">Continuous Exterior Wall Insulation</w:t>
-            </w:r>
-          </w:p>
-        </w:tc>
-        <w:tc>
-          <w:tcPr>
-            <w:tcBorders>
-              <w:top w:val="single" w:space="0" w:color="D3D3D3"/>
-              <w:bottom w:val="single" w:space="0" w:color="D3D3D3"/>
-              <w:start w:val="single" w:space="0" w:color="D3D3D3"/>
-              <w:end w:val="single" w:space="0" w:color="D3D3D3"/>
-            </w:tcBorders>
-          </w:tcPr>
-          <w:p>
-            <w:pPr>
-              <w:spacing w:before="0" w:after="60"/>
-              <w:keepNext/>
-              <w:jc w:val="start"/>
-            </w:pPr>
-            <w:r>
-              <w:rPr>
-                <w:rFonts w:ascii="Calibri" w:hAnsi="Calibri"/>
-                <w:sz w:val="20"/>
-              </w:rPr>
-              <w:t xml:space="default">Add a continuous layer of insulation and potentially replace the air and moisture barrier once it becomes time to replace the siding.</w:t>
-            </w:r>
-          </w:p>
-        </w:tc>
-      </w:tr>
-      <w:tr>
-        <w:trPr>
-          <w:cantSplit/>
-        </w:trPr>
-        <w:tc>
-          <w:tcPr>
-            <w:tcBorders>
-              <w:top w:val="single" w:space="0" w:color="D3D3D3"/>
-              <w:bottom w:val="single" w:space="0" w:color="D3D3D3"/>
-              <w:start w:val="single" w:space="0" w:color="D3D3D3"/>
-              <w:end w:val="single" w:space="0" w:color="D3D3D3"/>
-            </w:tcBorders>
-          </w:tcPr>
-          <w:p>
-            <w:pPr>
-              <w:spacing w:before="0" w:after="60"/>
-              <w:keepNext/>
-              <w:jc w:val="start"/>
-            </w:pPr>
-            <w:r>
-              <w:rPr>
-                <w:rFonts w:ascii="Calibri" w:hAnsi="Calibri"/>
-                <w:sz w:val="20"/>
-              </w:rPr>
-              <w:t xml:space="default">Air Source Heat Pump</w:t>
-            </w:r>
-          </w:p>
-        </w:tc>
-        <w:tc>
-          <w:tcPr>
-            <w:tcBorders>
-              <w:top w:val="single" w:space="0" w:color="D3D3D3"/>
-              <w:bottom w:val="single" w:space="0" w:color="D3D3D3"/>
-              <w:start w:val="single" w:space="0" w:color="D3D3D3"/>
-              <w:end w:val="single" w:space="0" w:color="D3D3D3"/>
-            </w:tcBorders>
-          </w:tcPr>
-          <w:p>
-            <w:pPr>
-              <w:spacing w:before="0" w:after="60"/>
-              <w:keepNext/>
-              <w:jc w:val="start"/>
-            </w:pPr>
-            <w:r>
-              <w:rPr>
-                <w:rFonts w:ascii="Calibri" w:hAnsi="Calibri"/>
-                <w:sz w:val="20"/>
-              </w:rPr>
-              <w:t xml:space="default">Install air source heat pumps and whole-house surge protection.</w:t>
-            </w:r>
-          </w:p>
-        </w:tc>
-      </w:tr>
-      <w:tr>
-        <w:trPr>
-          <w:cantSplit/>
-        </w:trPr>
-        <w:tc>
-          <w:tcPr>
-            <w:tcBorders>
-              <w:top w:val="single" w:space="0" w:color="D3D3D3"/>
-              <w:bottom w:val="single" w:space="0" w:color="D3D3D3"/>
-              <w:start w:val="single" w:space="0" w:color="D3D3D3"/>
-              <w:end w:val="single" w:space="0" w:color="D3D3D3"/>
-            </w:tcBorders>
-          </w:tcPr>
-          <w:p>
-            <w:pPr>
-              <w:spacing w:before="0" w:after="60"/>
-              <w:keepNext/>
-              <w:jc w:val="start"/>
-            </w:pPr>
-            <w:r>
-              <w:rPr>
-                <w:rFonts w:ascii="Calibri" w:hAnsi="Calibri"/>
-                <w:sz w:val="20"/>
-              </w:rPr>
-              <w:t xml:space="default">Whole-House Surge Protection</w:t>
-            </w:r>
-          </w:p>
-        </w:tc>
-        <w:tc>
-          <w:tcPr>
-            <w:tcBorders>
-              <w:top w:val="single" w:space="0" w:color="D3D3D3"/>
-              <w:bottom w:val="single" w:space="0" w:color="D3D3D3"/>
-              <w:start w:val="single" w:space="0" w:color="D3D3D3"/>
-              <w:end w:val="single" w:space="0" w:color="D3D3D3"/>
-            </w:tcBorders>
-          </w:tcPr>
-          <w:p>
-            <w:pPr>
-              <w:spacing w:before="0" w:after="60"/>
-              <w:keepNext/>
-              <w:jc w:val="start"/>
-            </w:pPr>
-            <w:r>
-              <w:rPr>
-                <w:rFonts w:ascii="Calibri" w:hAnsi="Calibri"/>
-                <w:sz w:val="20"/>
-              </w:rPr>
-              <w:t xml:space="default">Upgrade your electrical panel to add whole-house surge protection.</w:t>
-            </w:r>
-          </w:p>
-        </w:tc>
-      </w:tr>
-      <w:tr>
-        <w:trPr>
-          <w:cantSplit/>
-        </w:trPr>
-        <w:tc>
-          <w:tcPr>
-            <w:tcBorders>
-              <w:top w:val="single" w:space="0" w:color="D3D3D3"/>
-              <w:bottom w:val="single" w:space="0" w:color="D3D3D3"/>
-              <w:start w:val="single" w:space="0" w:color="D3D3D3"/>
-              <w:end w:val="single" w:space="0" w:color="D3D3D3"/>
-            </w:tcBorders>
-          </w:tcPr>
-          <w:p>
-            <w:pPr>
-              <w:spacing w:before="0" w:after="60"/>
-              <w:keepNext/>
-              <w:jc w:val="start"/>
-            </w:pPr>
-            <w:r>
-              <w:rPr>
-                <w:rFonts w:ascii="Calibri" w:hAnsi="Calibri"/>
-                <w:sz w:val="20"/>
-              </w:rPr>
-              <w:t xml:space="default">Pipe Insulation</w:t>
-            </w:r>
-          </w:p>
-        </w:tc>
-        <w:tc>
-          <w:tcPr>
-            <w:tcBorders>
-              <w:top w:val="single" w:space="0" w:color="D3D3D3"/>
-              <w:bottom w:val="single" w:space="0" w:color="D3D3D3"/>
-              <w:start w:val="single" w:space="0" w:color="D3D3D3"/>
-              <w:end w:val="single" w:space="0" w:color="D3D3D3"/>
-            </w:tcBorders>
-          </w:tcPr>
-          <w:p>
-            <w:pPr>
-              <w:spacing w:before="0" w:after="60"/>
-              <w:keepNext/>
-              <w:jc w:val="start"/>
-            </w:pPr>
-            <w:r>
-              <w:rPr>
-                <w:rFonts w:ascii="Calibri" w:hAnsi="Calibri"/>
-                <w:sz w:val="20"/>
-              </w:rPr>
-              <w:t xml:space="default">Insulate both hot and cold water pipes that are uninsulated in the basement/crawlspace. This will save energy and prevent condensation.</w:t>
-            </w:r>
-          </w:p>
-        </w:tc>
-      </w:tr>
-      <w:tr>
-        <w:trPr>
-          <w:cantSplit/>
-        </w:trPr>
-        <w:tc>
-          <w:tcPr>
-            <w:tcBorders>
-              <w:top w:val="single" w:space="0" w:color="D3D3D3"/>
-              <w:bottom w:val="single" w:space="0" w:color="D3D3D3"/>
-              <w:start w:val="single" w:space="0" w:color="D3D3D3"/>
-              <w:end w:val="single" w:space="0" w:color="D3D3D3"/>
-            </w:tcBorders>
-          </w:tcPr>
-          <w:p>
-            <w:pPr>
-              <w:spacing w:before="0" w:after="60"/>
-              <w:keepNext/>
-              <w:jc w:val="start"/>
-            </w:pPr>
-            <w:r>
-              <w:rPr>
-                <w:rFonts w:ascii="Calibri" w:hAnsi="Calibri"/>
-                <w:sz w:val="20"/>
-              </w:rPr>
-              <w:t xml:space="default">DIY Air Sealing</w:t>
-            </w:r>
-          </w:p>
-        </w:tc>
-        <w:tc>
-          <w:tcPr>
-            <w:tcBorders>
-              <w:top w:val="single" w:space="0" w:color="D3D3D3"/>
-              <w:bottom w:val="single" w:space="0" w:color="D3D3D3"/>
-              <w:start w:val="single" w:space="0" w:color="D3D3D3"/>
-              <w:end w:val="single" w:space="0" w:color="D3D3D3"/>
-            </w:tcBorders>
-          </w:tcPr>
-          <w:p>
-            <w:pPr>
-              <w:spacing w:before="0" w:after="60"/>
-              <w:keepNext/>
-              <w:jc w:val="start"/>
-            </w:pPr>
-            <w:r>
-              <w:rPr>
-                <w:rFonts w:ascii="Calibri" w:hAnsi="Calibri"/>
-                <w:sz w:val="20"/>
-              </w:rPr>
-              <w:t xml:space="default">Seal easy-to-access air leaks and weatherstrip exterior doors.</w:t>
-            </w:r>
-          </w:p>
-        </w:tc>
-      </w:tr>
-      <w:tr>
-        <w:trPr>
-          <w:cantSplit/>
-        </w:trPr>
-        <w:tc>
-          <w:tcPr>
-            <w:tcBorders>
-              <w:top w:val="single" w:space="0" w:color="D3D3D3"/>
-              <w:bottom w:val="single" w:space="0" w:color="D3D3D3"/>
-              <w:start w:val="single" w:space="0" w:color="D3D3D3"/>
-              <w:end w:val="single" w:space="0" w:color="D3D3D3"/>
-            </w:tcBorders>
-          </w:tcPr>
-          <w:p>
-            <w:pPr>
-              <w:spacing w:before="0" w:after="60"/>
-              <w:keepNext/>
-              <w:jc w:val="start"/>
-            </w:pPr>
-            <w:r>
-              <w:rPr>
-                <w:rFonts w:ascii="Calibri" w:hAnsi="Calibri"/>
-                <w:sz w:val="20"/>
-              </w:rPr>
-              <w:t xml:space="default">Misc. Air Sealing and Insulation</w:t>
-            </w:r>
-          </w:p>
-        </w:tc>
-        <w:tc>
-          <w:tcPr>
-            <w:tcBorders>
-              <w:top w:val="single" w:space="0" w:color="D3D3D3"/>
-              <w:bottom w:val="single" w:space="0" w:color="D3D3D3"/>
-              <w:start w:val="single" w:space="0" w:color="D3D3D3"/>
-              <w:end w:val="single" w:space="0" w:color="D3D3D3"/>
-            </w:tcBorders>
-          </w:tcPr>
-          <w:p>
-            <w:pPr>
-              <w:spacing w:before="0" w:after="60"/>
-              <w:keepNext/>
-              <w:jc w:val="start"/>
-            </w:pPr>
-            <w:r>
-              <w:rPr>
-                <w:rFonts w:ascii="Calibri" w:hAnsi="Calibri"/>
-                <w:sz w:val="20"/>
-              </w:rPr>
-              <w:t xml:space="default">Air seal and insulate [** insert auditor description - bay window, bulkhead door, chase, kneewall, anything else that is unique to the home and not otherwise covered in another recommendation]</w:t>
-            </w:r>
-          </w:p>
-        </w:tc>
-      </w:tr>
-      <w:tr>
-        <w:trPr>
-          <w:cantSplit/>
-        </w:trPr>
-        <w:tc>
-          <w:tcPr>
-            <w:tcBorders>
-              <w:top w:val="single" w:space="0" w:color="D3D3D3"/>
-              <w:bottom w:val="single" w:space="0" w:color="D3D3D3"/>
-              <w:start w:val="single" w:space="0" w:color="D3D3D3"/>
-              <w:end w:val="single" w:space="0" w:color="D3D3D3"/>
-            </w:tcBorders>
-          </w:tcPr>
-          <w:p>
-            <w:pPr>
-              <w:spacing w:before="0" w:after="60"/>
-              <w:keepNext/>
-              <w:jc w:val="start"/>
-            </w:pPr>
-            <w:r>
-              <w:rPr>
-                <w:rFonts w:ascii="Calibri" w:hAnsi="Calibri"/>
-                <w:sz w:val="20"/>
-              </w:rPr>
-              <w:t xml:space="default">Replace Windows</w:t>
-            </w:r>
-          </w:p>
-        </w:tc>
-        <w:tc>
-          <w:tcPr>
-            <w:tcBorders>
-              <w:top w:val="single" w:space="0" w:color="D3D3D3"/>
-              <w:bottom w:val="single" w:space="0" w:color="D3D3D3"/>
-              <w:start w:val="single" w:space="0" w:color="D3D3D3"/>
-              <w:end w:val="single" w:space="0" w:color="D3D3D3"/>
-            </w:tcBorders>
-          </w:tcPr>
-          <w:p>
-            <w:pPr>
-              <w:spacing w:before="0" w:after="60"/>
-              <w:keepNext/>
-              <w:jc w:val="start"/>
-            </w:pPr>
-            <w:r>
-              <w:rPr>
-                <w:rFonts w:ascii="Calibri" w:hAnsi="Calibri"/>
-                <w:sz w:val="20"/>
-              </w:rPr>
-              <w:t xml:space="default">Replace single-paned windows with double- or triple-paned windows and ensure the frames are airsealed. We recommend installing windows that are Energy Star certified for 'Northern' climate.</w:t>
-            </w:r>
-          </w:p>
-        </w:tc>
-      </w:tr>
-      <w:tr>
-        <w:trPr>
-          <w:cantSplit/>
-        </w:trPr>
-        <w:tc>
-          <w:tcPr>
-            <w:tcBorders>
-              <w:top w:val="single" w:space="0" w:color="D3D3D3"/>
-              <w:bottom w:val="single" w:space="0" w:color="D3D3D3"/>
-              <w:start w:val="single" w:space="0" w:color="D3D3D3"/>
-              <w:end w:val="single" w:space="0" w:color="D3D3D3"/>
-            </w:tcBorders>
-          </w:tcPr>
-          <w:p>
-            <w:pPr>
-              <w:spacing w:before="0" w:after="60"/>
-              <w:keepNext/>
-              <w:jc w:val="start"/>
-            </w:pPr>
-            <w:r>
-              <w:rPr>
-                <w:rFonts w:ascii="Calibri" w:hAnsi="Calibri"/>
-                <w:sz w:val="20"/>
-              </w:rPr>
-              <w:t xml:space="default">Replace Doors</w:t>
-            </w:r>
-          </w:p>
-        </w:tc>
-        <w:tc>
-          <w:tcPr>
-            <w:tcBorders>
-              <w:top w:val="single" w:space="0" w:color="D3D3D3"/>
-              <w:bottom w:val="single" w:space="0" w:color="D3D3D3"/>
-              <w:start w:val="single" w:space="0" w:color="D3D3D3"/>
-              <w:end w:val="single" w:space="0" w:color="D3D3D3"/>
-            </w:tcBorders>
-          </w:tcPr>
-          <w:p>
-            <w:pPr>
-              <w:spacing w:before="0" w:after="60"/>
-              <w:keepNext/>
-              <w:jc w:val="start"/>
-            </w:pPr>
-            <w:r>
-              <w:rPr>
-                <w:rFonts w:ascii="Calibri" w:hAnsi="Calibri"/>
-                <w:sz w:val="20"/>
-              </w:rPr>
-              <w:t xml:space="default">Replace uninsulated exterior doors and ensure new doors are insulated and properly weatherstripped. We recommend installing doors that are Energy Star certified for 'Northern' climate.</w:t>
             </w:r>
           </w:p>
         </w:tc>
@@ -1344,7 +602,7 @@
                 <w:rFonts w:ascii="Calibri" w:hAnsi="Calibri"/>
                 <w:sz w:val="20"/>
               </w:rPr>
-              <w:t xml:space="default">~1880-90s</w:t>
+              <w:t xml:space="default">2023</w:t>
             </w:r>
           </w:p>
         </w:tc>
@@ -1397,7 +655,7 @@
                 <w:rFonts w:ascii="Calibri" w:hAnsi="Calibri"/>
                 <w:sz w:val="20"/>
               </w:rPr>
-              <w:t xml:space="default">Crawlspace</w:t>
+              <w:t xml:space="default">Walk in basement</w:t>
             </w:r>
           </w:p>
         </w:tc>
@@ -1450,7 +708,7 @@
                 <w:rFonts w:ascii="Calibri" w:hAnsi="Calibri"/>
                 <w:sz w:val="20"/>
               </w:rPr>
-              <w:t xml:space="default">Loose Cellulose , 5 inches</w:t>
+              <w:t xml:space="default">Batts of Fiberglass, Loose Cellulose , 12 inches</w:t>
             </w:r>
           </w:p>
         </w:tc>
@@ -1503,7 +761,7 @@
                 <w:rFonts w:ascii="Calibri" w:hAnsi="Calibri"/>
                 <w:sz w:val="20"/>
               </w:rPr>
-              <w:t xml:space="default">2</w:t>
+              <w:t xml:space="default">1</w:t>
             </w:r>
           </w:p>
         </w:tc>
@@ -1556,7 +814,7 @@
                 <w:rFonts w:ascii="Calibri" w:hAnsi="Calibri"/>
                 <w:sz w:val="20"/>
               </w:rPr>
-              <w:t xml:space="default">NA</w:t>
+              <w:t xml:space="default">1392</w:t>
             </w:r>
           </w:p>
         </w:tc>
@@ -1609,7 +867,7 @@
                 <w:rFonts w:ascii="Calibri" w:hAnsi="Calibri"/>
                 <w:sz w:val="20"/>
               </w:rPr>
-              <w:t xml:space="default">25116.75</w:t>
+              <w:t xml:space="default">11136</w:t>
             </w:r>
           </w:p>
         </w:tc>
@@ -1738,7 +996,7 @@
                 <w:rFonts w:ascii="Calibri" w:hAnsi="Calibri"/>
                 <w:sz w:val="20"/>
               </w:rPr>
-              <w:t xml:space="default">2</w:t>
+              <w:t xml:space="default">1</w:t>
             </w:r>
           </w:p>
         </w:tc>
@@ -1791,7 +1049,7 @@
                 <w:rFonts w:ascii="Calibri" w:hAnsi="Calibri"/>
                 <w:sz w:val="20"/>
               </w:rPr>
-              <w:t xml:space="default">Northeast/Southwest</w:t>
+              <w:t xml:space="default">North/South</w:t>
             </w:r>
           </w:p>
         </w:tc>
@@ -1844,7 +1102,7 @@
                 <w:rFonts w:ascii="Calibri" w:hAnsi="Calibri"/>
                 <w:sz w:val="20"/>
               </w:rPr>
-              <w:t xml:space="default">Standing Seam Metalin excellentcondition. Roof recently replaced with metal</w:t>
+              <w:t xml:space="default">Asphalt Shinglesin excellentcondition. NA</w:t>
             </w:r>
           </w:p>
         </w:tc>
@@ -1950,7 +1208,7 @@
                 <w:rFonts w:ascii="Calibri" w:hAnsi="Calibri"/>
                 <w:sz w:val="20"/>
               </w:rPr>
-              <w:t xml:space="default">wood siding in fair condition. Paint chipping and water damage in various places, some holes in wall sections</w:t>
+              <w:t xml:space="default">vinyl siding in excellent condition. NA</w:t>
             </w:r>
           </w:p>
         </w:tc>
@@ -2003,7 +1261,7 @@
                 <w:rFonts w:ascii="Calibri" w:hAnsi="Calibri"/>
                 <w:sz w:val="20"/>
               </w:rPr>
-              <w:t xml:space="default">There are no exterior doors</w:t>
+              <w:t xml:space="default">There are 2 insulated vinyl exterior doors. In fair condition, totaling 34 square feet.</w:t>
             </w:r>
           </w:p>
         </w:tc>
@@ -2056,7 +1314,7 @@
                 <w:rFonts w:ascii="Calibri" w:hAnsi="Calibri"/>
                 <w:sz w:val="20"/>
               </w:rPr>
-              <w:t xml:space="default">There are no exterior windows</w:t>
+              <w:t xml:space="default">There are 14 0 paned 0 windows. In excellent condition, totaling 176 square feet.</w:t>
             </w:r>
           </w:p>
         </w:tc>
@@ -2132,7 +1390,7 @@
                 <w:rFonts w:ascii="Calibri" w:hAnsi="Calibri"/>
                 <w:sz w:val="20"/>
               </w:rPr>
-              <w:t xml:space="default">The framing type of the home is balloon framing, which means the wall cavities extend the full height of the building (from the foundation to the roof). Often the wall cavities are interconnected with the floor and ceiling cavities. This framing type can create connected passageways for air to leave the house and rodents to enter the house. There is Batts of Fiberglass insulation 4 inches thick in poor condition. Wall insulation is very inconsistent and mostly missing, only certain sections have fiberglass batts</w:t>
+              <w:t xml:space="default">The framing type of the home is platform framing, which means that wall cavities do not extend the full height of the building and are instead separated by floors. There is NA insulation NA inches thick in NA condition. NA</w:t>
             </w:r>
           </w:p>
         </w:tc>
@@ -2291,7 +1549,7 @@
                 <w:rFonts w:ascii="Calibri" w:hAnsi="Calibri"/>
                 <w:sz w:val="20"/>
               </w:rPr>
-              <w:t xml:space="default">Fridge/freezer used 0.4 kWh in 240 minutes. Minifridge used 0.17 kWh in 236 minutes. NA</w:t>
+              <w:t xml:space="default">Refridgerator used NA kWh in 94 minutes. NA used NA kWh in NA minutes. There is some kind of vent below the kitchen and bathroom cabinets.</w:t>
             </w:r>
           </w:p>
         </w:tc>
@@ -2399,7 +1657,7 @@
                 <w:rFonts w:ascii="Calibri" w:hAnsi="Calibri"/>
                 <w:sz w:val="20"/>
               </w:rPr>
-              <w:t xml:space="default">7274</w:t>
+              <w:t xml:space="default">600</w:t>
             </w:r>
           </w:p>
         </w:tc>
@@ -2476,7 +1734,7 @@
                 <w:rFonts w:ascii="Calibri" w:hAnsi="Calibri"/>
                 <w:sz w:val="20"/>
               </w:rPr>
-              <w:t xml:space="default">17.4</w:t>
+              <w:t xml:space="default">3.2</w:t>
             </w:r>
           </w:p>
         </w:tc>
@@ -2553,7 +1811,7 @@
                 <w:rFonts w:ascii="Calibri" w:hAnsi="Calibri"/>
                 <w:sz w:val="20"/>
               </w:rPr>
-              <w:t xml:space="default">727.4 under natural conditions. TEST</w:t>
+              <w:t xml:space="default">60 under natural conditions. TEST</w:t>
             </w:r>
           </w:p>
         </w:tc>
@@ -2630,7 +1888,7 @@
                 <w:rFonts w:ascii="Calibri" w:hAnsi="Calibri"/>
                 <w:sz w:val="20"/>
               </w:rPr>
-              <w:t xml:space="default">1.3</w:t>
+              <w:t xml:space="default">0.2</w:t>
             </w:r>
           </w:p>
         </w:tc>
@@ -2785,7 +2043,7 @@
                 <w:rFonts w:ascii="Calibri" w:hAnsi="Calibri"/>
                 <w:sz w:val="20"/>
               </w:rPr>
-              <w:t xml:space="default">NA</w:t>
+              <w:t xml:space="default">1392</w:t>
             </w:r>
           </w:p>
         </w:tc>
@@ -2838,7 +2096,7 @@
                 <w:rFonts w:ascii="Calibri" w:hAnsi="Calibri"/>
                 <w:sz w:val="20"/>
               </w:rPr>
-              <w:t xml:space="default">Loose Cellulose</w:t>
+              <w:t xml:space="default">Batts of Fiberglass, Loose Cellulose</w:t>
             </w:r>
           </w:p>
         </w:tc>
@@ -2891,7 +2149,7 @@
                 <w:rFonts w:ascii="Calibri" w:hAnsi="Calibri"/>
                 <w:sz w:val="20"/>
               </w:rPr>
-              <w:t xml:space="default">Fair</w:t>
+              <w:t xml:space="default">Excellent</w:t>
             </w:r>
           </w:p>
         </w:tc>
@@ -2944,7 +2202,7 @@
                 <w:rFonts w:ascii="Calibri" w:hAnsi="Calibri"/>
                 <w:sz w:val="20"/>
               </w:rPr>
-              <w:t xml:space="default">There is Noair sealing. NA</w:t>
+              <w:t xml:space="default">There is NAair sealing. We could not confirm whether the attic is air sealed due to the insulation. This is especially important for the recessed can lights.</w:t>
             </w:r>
           </w:p>
         </w:tc>
@@ -2997,7 +2255,7 @@
                 <w:rFonts w:ascii="Calibri" w:hAnsi="Calibri"/>
                 <w:sz w:val="20"/>
               </w:rPr>
-              <w:t xml:space="default">Attic insulation thickness is highly variable, some parts reach 9" No NA</w:t>
+              <w:t xml:space="default">NA No NA</w:t>
             </w:r>
           </w:p>
         </w:tc>
@@ -3050,7 +2308,7 @@
                 <w:rFonts w:ascii="Calibri" w:hAnsi="Calibri"/>
                 <w:sz w:val="20"/>
               </w:rPr>
-              <w:t xml:space="default">NA</w:t>
+              <w:t xml:space="default">Yes</w:t>
             </w:r>
           </w:p>
         </w:tc>
@@ -3232,7 +2490,7 @@
                 <w:rFonts w:ascii="Calibri" w:hAnsi="Calibri"/>
                 <w:sz w:val="20"/>
               </w:rPr>
-              <w:t xml:space="default">Uninsulated</w:t>
+              <w:t xml:space="default">Spray Foam</w:t>
             </w:r>
           </w:p>
         </w:tc>
@@ -3285,7 +2543,7 @@
                 <w:rFonts w:ascii="Calibri" w:hAnsi="Calibri"/>
                 <w:sz w:val="20"/>
               </w:rPr>
-              <w:t xml:space="default">NANA</w:t>
+              <w:t xml:space="default">FairWe were not able to confirm the quality of the spray foam insulation. However, what we could see was well done.</w:t>
             </w:r>
           </w:p>
         </w:tc>
@@ -3338,7 +2596,7 @@
                 <w:rFonts w:ascii="Calibri" w:hAnsi="Calibri"/>
                 <w:sz w:val="20"/>
               </w:rPr>
-              <w:t xml:space="default">No appliances</w:t>
+              <w:t xml:space="default">Appliances insulated, Ducts/pipes not insulated</w:t>
             </w:r>
           </w:p>
         </w:tc>
@@ -3497,7 +2755,7 @@
                 <w:rFonts w:ascii="Calibri" w:hAnsi="Calibri"/>
                 <w:sz w:val="20"/>
               </w:rPr>
-              <w:t xml:space="default">There is NANA</w:t>
+              <w:t xml:space="default">There is There is a leak coming from the home.NA</w:t>
             </w:r>
           </w:p>
         </w:tc>
@@ -3573,7 +2831,7 @@
                 <w:rFonts w:ascii="Calibri" w:hAnsi="Calibri"/>
                 <w:sz w:val="20"/>
               </w:rPr>
-              <w:t xml:space="default">The electrical panel has and amperage of NA. There are NA unused breaker spaces. NA</w:t>
+              <w:t xml:space="default">The electrical panel has and amperage of 200. There are 5 unused breaker spaces. NA</w:t>
             </w:r>
           </w:p>
         </w:tc>
@@ -3640,7 +2898,7 @@
             <w:pPr>
               <w:spacing w:before="0" w:after="60"/>
               <w:keepNext/>
-              <w:jc w:val="end"/>
+              <w:jc w:val="start"/>
             </w:pPr>
             <w:r>
               <w:rPr>
@@ -3685,7 +2943,7 @@
             <w:pPr>
               <w:spacing w:before="0" w:after="60"/>
               <w:keepNext/>
-              <w:jc w:val="end"/>
+              <w:jc w:val="start"/>
             </w:pPr>
             <w:r>
               <w:rPr>
@@ -3693,107 +2951,6 @@
                 <w:sz w:val="20"/>
               </w:rPr>
               <w:t xml:space="default">Cost (USD)</w:t>
-            </w:r>
-          </w:p>
-        </w:tc>
-      </w:tr>
-      <w:tr>
-        <w:trPr>
-          <w:cantSplit/>
-        </w:trPr>
-        <w:tc>
-          <w:tcPr>
-            <w:tcBorders>
-              <w:top w:val="single" w:space="0" w:color="D3D3D3"/>
-              <w:bottom w:val="single" w:space="0" w:color="D3D3D3"/>
-              <w:start w:val="single" w:space="0" w:color="D3D3D3"/>
-              <w:end w:val="single" w:space="0" w:color="D3D3D3"/>
-            </w:tcBorders>
-          </w:tcPr>
-          <w:p>
-            <w:pPr>
-              <w:spacing w:before="0" w:after="60"/>
-              <w:keepNext/>
-              <w:jc w:val="start"/>
-            </w:pPr>
-            <w:r>
-              <w:rPr>
-                <w:rFonts w:ascii="Calibri" w:hAnsi="Calibri"/>
-                <w:sz w:val="20"/>
-              </w:rPr>
-              <w:t xml:space="default">Electricity</w:t>
-            </w:r>
-          </w:p>
-        </w:tc>
-        <w:tc>
-          <w:tcPr>
-            <w:tcBorders>
-              <w:top w:val="single" w:space="0" w:color="D3D3D3"/>
-              <w:bottom w:val="single" w:space="0" w:color="D3D3D3"/>
-              <w:start w:val="single" w:space="0" w:color="D3D3D3"/>
-              <w:end w:val="single" w:space="0" w:color="D3D3D3"/>
-            </w:tcBorders>
-          </w:tcPr>
-          <w:p>
-            <w:pPr>
-              <w:spacing w:before="0" w:after="60"/>
-              <w:keepNext/>
-              <w:jc w:val="end"/>
-            </w:pPr>
-            <w:r>
-              <w:rPr>
-                <w:rFonts w:ascii="Calibri" w:hAnsi="Calibri"/>
-                <w:sz w:val="20"/>
-              </w:rPr>
-              <w:t xml:space="default">29491</w:t>
-            </w:r>
-          </w:p>
-        </w:tc>
-        <w:tc>
-          <w:tcPr>
-            <w:tcBorders>
-              <w:top w:val="single" w:space="0" w:color="D3D3D3"/>
-              <w:bottom w:val="single" w:space="0" w:color="D3D3D3"/>
-              <w:start w:val="single" w:space="0" w:color="D3D3D3"/>
-              <w:end w:val="single" w:space="0" w:color="D3D3D3"/>
-            </w:tcBorders>
-          </w:tcPr>
-          <w:p>
-            <w:pPr>
-              <w:spacing w:before="0" w:after="60"/>
-              <w:keepNext/>
-              <w:jc w:val="start"/>
-            </w:pPr>
-            <w:r>
-              <w:rPr>
-                <w:rFonts w:ascii="Calibri" w:hAnsi="Calibri"/>
-                <w:sz w:val="20"/>
-              </w:rPr>
-              <w:t xml:space="default">cost_in_dollars_electricity</w:t>
-            </w:r>
-          </w:p>
-        </w:tc>
-        <w:tc>
-          <w:tcPr>
-            <w:tcBorders>
-              <w:top w:val="single" w:space="0" w:color="D3D3D3"/>
-              <w:bottom w:val="single" w:space="0" w:color="D3D3D3"/>
-              <w:start w:val="single" w:space="0" w:color="D3D3D3"/>
-              <w:end w:val="single" w:space="0" w:color="D3D3D3"/>
-            </w:tcBorders>
-          </w:tcPr>
-          <w:p>
-            <w:pPr>
-              <w:spacing w:before="0" w:after="60"/>
-              <w:keepNext/>
-              <w:jc w:val="end"/>
-            </w:pPr>
-            <w:r>
-              <w:rPr>
-                <w:rFonts w:ascii="Calibri" w:hAnsi="Calibri"/>
-                <w:sz w:val="20"/>
-              </w:rPr>
-              <w:t xml:space="default">9060</w:t>
             </w:r>
           </w:p>
         </w:tc>
@@ -3801,7 +2958,7 @@
     </w:tbl>
     <w:bookmarkEnd w:id="39"/>
     <w:bookmarkEnd w:id="40"/>
-    <w:bookmarkStart w:id="59" w:name="recommendations"/>
+    <w:bookmarkStart w:id="45" w:name="recommendations"/>
     <w:p>
       <w:pPr>
         <w:pStyle w:val="Heading2"/>
@@ -3864,7 +3021,7 @@
         <w:pStyle w:val="BodyText"/>
       </w:pPr>
       <w:r>
-        <w:t xml:space="preserve">WindowDressers insulating window inserts help air-seal windows and reduce heat loss and gain.</w:t>
+        <w:t xml:space="preserve">WindowDressers insulating window inserts help air-seal windows and reduce heat loss and gain. WindowDressers are transparent and let in light while stopping drafts. Each insert is made of a custom-made pine frame wrapped on each side with tightly sealed, clear polyolefin film, creating an airspace between the two layers for additional insulation. The insert is finished with a compressible foam weather seal. The foam allows enough give for the inserts to be easily slid into place in the fall and removed in the spring while holding firmly enough to provide a tight, friction-based seal. The inserts are installed inside your existing window frame with no fasteners required and last 5-10 years. They are most effective in the winter, but depending on the window’s exposure, they can sometimes be used in the summer to keep the house cooler.</w:t>
       </w:r>
       <w:r>
         <w:t xml:space="preserve"> </w:t>
@@ -3914,13 +3071,13 @@
       </w:r>
     </w:p>
     <w:bookmarkEnd w:id="41"/>
-    <w:bookmarkStart w:id="42" w:name="refrigerator"/>
+    <w:bookmarkStart w:id="42" w:name="gutters"/>
     <w:p>
       <w:pPr>
         <w:pStyle w:val="Heading3"/>
       </w:pPr>
       <w:r>
-        <w:t xml:space="preserve">4.2 Refrigerator</w:t>
+        <w:t xml:space="preserve">4.2 Gutters</w:t>
       </w:r>
     </w:p>
     <w:p>
@@ -3940,19 +3097,7 @@
         <w:pStyle w:val="BodyText"/>
       </w:pPr>
       <w:r>
-        <w:t xml:space="preserve">Your refrigerator uses more energy than newer models.</w:t>
-      </w:r>
-    </w:p>
-    <w:p>
-      <w:pPr>
-        <w:pStyle w:val="BodyText"/>
-      </w:pPr>
-      <w:r>
-        <w:rPr>
-          <w:b/>
-          <w:bCs/>
-        </w:rPr>
-        <w:t xml:space="preserve">Ideally, the auditor notes the annual energy consumption (kWh) of the existing fridge compared to a new model of similar size</w:t>
+        <w:t xml:space="preserve">The house has no gutters, so water runs off your roof and directly onto the ground next to your house. Water that splashes off the ground can damage the exterior of your house. Runoff that is absorbed into the ground can seep into the basement/crawlspace, causing moisture issues there and throughout your house.</w:t>
       </w:r>
     </w:p>
     <w:p>
@@ -3972,7 +3117,7 @@
         <w:pStyle w:val="BodyText"/>
       </w:pPr>
       <w:r>
-        <w:t xml:space="preserve">Replace your refrigerator with a new, EnergyStar certified fridge. Look at the Energy Guide label to compare the energy use of new refrigerators.</w:t>
+        <w:t xml:space="preserve">Install gutters and downspouts that divert water at least six feet away from the foundation and to where the ground slopes away from the house.</w:t>
       </w:r>
     </w:p>
     <w:p>
@@ -3992,29 +3137,17 @@
         <w:pStyle w:val="BodyText"/>
       </w:pPr>
       <w:r>
-        <w:t xml:space="preserve">If you are able to afford the upfront cost of purchasing a new refrigerator, you will recoup significant savings in the long run. Whenever you need to buy a new appliance, consider EnergyStar certified models, which use less energy and are cheaper to run. Remember, it doesn’t save energy if you relocate your existing refrigerator to the basement or garage and continue using it.</w:t>
-      </w:r>
-    </w:p>
-    <w:p>
-      <w:pPr>
-        <w:pStyle w:val="BodyText"/>
-      </w:pPr>
-      <w:r>
-        <w:rPr>
-          <w:b/>
-          <w:bCs/>
-        </w:rPr>
-        <w:t xml:space="preserve">Ideally, auditor locates similar volume fridge online to calculate monthly savings and payback period compared to kill-a-watt meter reading for current refrigerator. “This example refrigerator would save $XX in electricity each month and pay for itself within XX months</w:t>
+        <w:t xml:space="preserve">Adding gutters would mitigate moisture damage and save you from having to replace/fix other parts of the house.</w:t>
       </w:r>
     </w:p>
     <w:bookmarkEnd w:id="42"/>
-    <w:bookmarkStart w:id="43" w:name="induction-stoveoven"/>
+    <w:bookmarkStart w:id="43" w:name="kitchen-exhaust-fans"/>
     <w:p>
       <w:pPr>
         <w:pStyle w:val="Heading3"/>
       </w:pPr>
       <w:r>
-        <w:t xml:space="preserve">4.3 Induction Stove/Oven</w:t>
+        <w:t xml:space="preserve">4.3 Kitchen exhaust fan(s)</w:t>
       </w:r>
     </w:p>
     <w:p>
@@ -4034,7 +3167,7 @@
         <w:pStyle w:val="BodyText"/>
       </w:pPr>
       <w:r>
-        <w:t xml:space="preserve">Your gas range has the potential to release propane, carbon monoxide, and combustion gases into your house. Gas ranges are also inefficient at transferring heat to your food at 32% efficiency, compared to 85% efficiency for induction cooktops.</w:t>
+        <w:t xml:space="preserve">Currently, there is no kitchen exhaust fan, so fumes, smoke, and moisture from cooking stay in the house which can cause health concerns.</w:t>
       </w:r>
     </w:p>
     <w:p>
@@ -4054,7 +3187,7 @@
         <w:pStyle w:val="BodyText"/>
       </w:pPr>
       <w:r>
-        <w:t xml:space="preserve">Induction cooking appliances are more efficient and safer than electric or gas ones. There is no risk of carbon monoxide or other harmful combustion gases, and the surface doesn’t heat up without a pot or pan on it.</w:t>
+        <w:t xml:space="preserve">A kitchen exhaust fan will remove harmful combustion gases from your home and should be rated for at least 100 cubic feet per minute (CFM). A fan can also help with moisture concerns. A kitchen fan should be ducted to the outdoors. If the ductwork will run through the attic, it should be installed before the attic is air-sealed and insulated.</w:t>
       </w:r>
     </w:p>
     <w:p>
@@ -4074,17 +3207,17 @@
         <w:pStyle w:val="BodyText"/>
       </w:pPr>
       <w:r>
-        <w:t xml:space="preserve">Currently, Efficiency Maine does not offer a rebate for induction stoves. If you’re interested in trying out induction cooking but don’t want to replace your kitchen stove, consider buying a portable induction cooktop, which costs less than $100.</w:t>
+        <w:t xml:space="preserve">Kitchen range hoods typically cost $150 or more; installation costs depend on the complexity of the exhaust ducting.</w:t>
       </w:r>
     </w:p>
     <w:bookmarkEnd w:id="43"/>
-    <w:bookmarkStart w:id="44" w:name="gutters"/>
+    <w:bookmarkStart w:id="44" w:name="other-1"/>
     <w:p>
       <w:pPr>
         <w:pStyle w:val="Heading3"/>
       </w:pPr>
       <w:r>
-        <w:t xml:space="preserve">4.4 Gutters</w:t>
+        <w:t xml:space="preserve">4.4 Other 1</w:t>
       </w:r>
     </w:p>
     <w:p>
@@ -4104,14 +3237,6 @@
         <w:pStyle w:val="BodyText"/>
       </w:pPr>
       <w:r>
-        <w:t xml:space="preserve">The house has no gutters, so water runs off your roof and directly onto the ground next to your house. Water that splashes off the ground can damage the exterior of your house. Runoff that is absorbed into the ground can seep into the basement/crawlspace, causing moisture issues there and throughout your house.</w:t>
-      </w:r>
-    </w:p>
-    <w:p>
-      <w:pPr>
-        <w:pStyle w:val="BodyText"/>
-      </w:pPr>
-      <w:r>
         <w:rPr>
           <w:i/>
           <w:iCs/>
@@ -4124,7 +3249,7 @@
         <w:pStyle w:val="BodyText"/>
       </w:pPr>
       <w:r>
-        <w:t xml:space="preserve">Install gutters and downspouts that divert water at least six feet away from the foundation and to where the ground slopes away from the house.</w:t>
+        <w:t xml:space="preserve">Upgrade your electrical panel to add whole-house surge protection. This will help to protect your heat pumps, heat pump water heater, refrigerator, well pump, and other electronics from damage due to lightning or other electrical surges.</w:t>
       </w:r>
     </w:p>
     <w:p>
@@ -4144,2367 +3269,119 @@
         <w:pStyle w:val="BodyText"/>
       </w:pPr>
       <w:r>
-        <w:t xml:space="preserve">Adding gutters would mitigate moisture damage and save you from having to replace/fix other parts of the house.</w:t>
-      </w:r>
-    </w:p>
-    <w:bookmarkEnd w:id="44"/>
-    <w:bookmarkStart w:id="45" w:name="bathroom-exhaust-fans"/>
-    <w:p>
-      <w:pPr>
-        <w:pStyle w:val="Heading3"/>
-      </w:pPr>
-      <w:r>
-        <w:t xml:space="preserve">4.5 Bathroom exhaust fan(s)</w:t>
-      </w:r>
-    </w:p>
-    <w:p>
-      <w:pPr>
-        <w:pStyle w:val="FirstParagraph"/>
-      </w:pPr>
-      <w:r>
-        <w:rPr>
-          <w:i/>
-          <w:iCs/>
-        </w:rPr>
-        <w:t xml:space="preserve">Problem</w:t>
-      </w:r>
-    </w:p>
-    <w:p>
-      <w:pPr>
-        <w:pStyle w:val="BodyText"/>
-      </w:pPr>
-      <w:r>
-        <w:t xml:space="preserve">Currently, there is no bathroom exhaust fan, so moisture from the shower, toilet, and sink remains in the house, which can cause moisture issues such as mold.</w:t>
-      </w:r>
-    </w:p>
-    <w:p>
-      <w:pPr>
-        <w:pStyle w:val="BodyText"/>
-      </w:pPr>
-      <w:r>
-        <w:rPr>
-          <w:i/>
-          <w:iCs/>
-        </w:rPr>
-        <w:t xml:space="preserve">Recommendation</w:t>
-      </w:r>
-    </w:p>
-    <w:p>
-      <w:pPr>
-        <w:pStyle w:val="BodyText"/>
-      </w:pPr>
-      <w:r>
-        <w:t xml:space="preserve">Bathroom exhaust fans should be rated for at least 80 cubic feet per minute (CFM) if there is a shower. We recommend Panasonic WhisperQuiet or similar fans that don’t create excess noise.</w:t>
-      </w:r>
-    </w:p>
-    <w:p>
-      <w:pPr>
-        <w:pStyle w:val="BodyText"/>
-      </w:pPr>
-      <w:r>
-        <w:rPr>
-          <w:i/>
-          <w:iCs/>
-        </w:rPr>
-        <w:t xml:space="preserve">Estimated Cost/Benefits/Incentives</w:t>
-      </w:r>
-    </w:p>
-    <w:p>
-      <w:pPr>
-        <w:pStyle w:val="BodyText"/>
-      </w:pPr>
-      <w:r>
-        <w:t xml:space="preserve">The typical fan is around $130 plus the cost of installation.</w:t>
-      </w:r>
-    </w:p>
-    <w:bookmarkEnd w:id="45"/>
-    <w:bookmarkStart w:id="46" w:name="kitchen-exhaust-fans"/>
-    <w:p>
-      <w:pPr>
-        <w:pStyle w:val="Heading3"/>
-      </w:pPr>
-      <w:r>
-        <w:t xml:space="preserve">4.6 Kitchen exhaust fan(s)</w:t>
-      </w:r>
-    </w:p>
-    <w:p>
-      <w:pPr>
-        <w:pStyle w:val="FirstParagraph"/>
-      </w:pPr>
-      <w:r>
-        <w:rPr>
-          <w:i/>
-          <w:iCs/>
-        </w:rPr>
-        <w:t xml:space="preserve">Problem</w:t>
-      </w:r>
-    </w:p>
-    <w:p>
-      <w:pPr>
-        <w:pStyle w:val="BodyText"/>
-      </w:pPr>
-      <w:r>
-        <w:t xml:space="preserve">Currently, there is no kitchen exhaust fan, so fumes, smoke, and moisture from cooking stay in the house which can cause health concerns.</w:t>
-      </w:r>
-    </w:p>
-    <w:p>
-      <w:pPr>
-        <w:pStyle w:val="BodyText"/>
-      </w:pPr>
-      <w:r>
-        <w:rPr>
-          <w:i/>
-          <w:iCs/>
-        </w:rPr>
-        <w:t xml:space="preserve">Recommendation</w:t>
-      </w:r>
-    </w:p>
-    <w:p>
-      <w:pPr>
-        <w:pStyle w:val="BodyText"/>
-      </w:pPr>
-      <w:r>
-        <w:t xml:space="preserve">A kitchen exhaust fan will remove harmful combustion gases from your home and should be rated for at least 100 cubic feet per minute (CFM). A fan can also help with moisture concerns.</w:t>
-      </w:r>
-    </w:p>
-    <w:p>
-      <w:pPr>
-        <w:pStyle w:val="BodyText"/>
-      </w:pPr>
-      <w:r>
-        <w:rPr>
-          <w:i/>
-          <w:iCs/>
-        </w:rPr>
-        <w:t xml:space="preserve">Estimated Cost/Benefits/Incentives</w:t>
-      </w:r>
-    </w:p>
-    <w:p>
-      <w:pPr>
-        <w:pStyle w:val="BodyText"/>
-      </w:pPr>
-      <w:r>
-        <w:t xml:space="preserve">Kitchen range hoods typically cost $150 or more; installation costs depend on the complexity of the exhaust ducting.</w:t>
-      </w:r>
-    </w:p>
-    <w:bookmarkEnd w:id="46"/>
-    <w:bookmarkStart w:id="47" w:name="vapor-barrier"/>
-    <w:p>
-      <w:pPr>
-        <w:pStyle w:val="Heading3"/>
-      </w:pPr>
-      <w:r>
-        <w:t xml:space="preserve">4.7 Vapor Barrier</w:t>
-      </w:r>
-    </w:p>
-    <w:p>
-      <w:pPr>
-        <w:pStyle w:val="FirstParagraph"/>
-      </w:pPr>
-      <w:r>
-        <w:rPr>
-          <w:i/>
-          <w:iCs/>
-        </w:rPr>
-        <w:t xml:space="preserve">Problem</w:t>
-      </w:r>
-    </w:p>
-    <w:p>
-      <w:pPr>
-        <w:pStyle w:val="BodyText"/>
-      </w:pPr>
-      <w:r>
-        <w:t xml:space="preserve">There is excess moisture in the basement/crawlspace, which is evaporating out of the ground. This moisture can enter the house and cause mold, mildew, rot, and air quality issues.</w:t>
-      </w:r>
-    </w:p>
-    <w:p>
-      <w:pPr>
-        <w:pStyle w:val="BodyText"/>
-      </w:pPr>
-      <w:r>
-        <w:rPr>
-          <w:i/>
-          <w:iCs/>
-        </w:rPr>
-        <w:t xml:space="preserve">Recommendation</w:t>
-      </w:r>
-    </w:p>
-    <w:p>
-      <w:pPr>
-        <w:pStyle w:val="BodyText"/>
-      </w:pPr>
-      <w:r>
-        <w:t xml:space="preserve">Install a vapor barrier on the basement floor to stop moisture from entering the basement and house.</w:t>
-      </w:r>
-    </w:p>
-    <w:p>
-      <w:pPr>
-        <w:pStyle w:val="BodyText"/>
-      </w:pPr>
-      <w:r>
-        <w:rPr>
-          <w:i/>
-          <w:iCs/>
-        </w:rPr>
-        <w:t xml:space="preserve">Estimated Cost/Benefits/Incentives</w:t>
-      </w:r>
-    </w:p>
-    <w:p>
-      <w:pPr>
-        <w:pStyle w:val="BodyText"/>
-      </w:pPr>
-      <w:r>
-        <w:t xml:space="preserve">Efficiency Maine rebates will cover vapor barriers up to 25% of a weatherization project cost, if done as part of a larger insulation project. Most insulation companies can install spray foam and vapor barriers together. Efficiency Maine rebates and other incentives for insulation work can fund up to 80% of the overall cost to weatherize your home (subject to a lifetime limit per building), up to $9,200 when combined with nonrefundable federal tax credits. You can call them at 866-376-2463 (Monday to Friday, 8:00 am to 5:00 pm) or visit their webpage about insulation rebates: https://www.efficiencymaine.com/at-home/insulation-rebates/</w:t>
-      </w:r>
-    </w:p>
-    <w:bookmarkEnd w:id="47"/>
-    <w:bookmarkStart w:id="48" w:name="spray-foam-basement-walls"/>
-    <w:p>
-      <w:pPr>
-        <w:pStyle w:val="Heading3"/>
-      </w:pPr>
-      <w:r>
-        <w:t xml:space="preserve">4.8 Spray foam Basement Walls</w:t>
-      </w:r>
-    </w:p>
-    <w:p>
-      <w:pPr>
-        <w:pStyle w:val="FirstParagraph"/>
-      </w:pPr>
-      <w:r>
-        <w:rPr>
-          <w:i/>
-          <w:iCs/>
-        </w:rPr>
-        <w:t xml:space="preserve">Problem</w:t>
-      </w:r>
-    </w:p>
-    <w:p>
-      <w:pPr>
-        <w:pStyle w:val="BodyText"/>
-      </w:pPr>
-      <w:r>
-        <w:t xml:space="preserve">The basement/crawlspace is uninsulated and used for mechanical equipment and plumbing. The walls are porous and allow moisture into the house and rapidly conduct heat out of the space.</w:t>
-      </w:r>
-    </w:p>
-    <w:p>
-      <w:pPr>
-        <w:pStyle w:val="BodyText"/>
-      </w:pPr>
-      <w:r>
-        <w:rPr>
-          <w:i/>
-          <w:iCs/>
-        </w:rPr>
-        <w:t xml:space="preserve">Recommendation</w:t>
-      </w:r>
-    </w:p>
-    <w:p>
-      <w:pPr>
-        <w:pStyle w:val="BodyText"/>
-      </w:pPr>
-      <w:r>
-        <w:t xml:space="preserve">Install spray foam on the basement/crawlspace walls to prevent moisture infiltration and reduce heat loss.</w:t>
-      </w:r>
-    </w:p>
-    <w:p>
-      <w:pPr>
-        <w:pStyle w:val="BodyText"/>
-      </w:pPr>
-      <w:r>
-        <w:rPr>
-          <w:i/>
-          <w:iCs/>
-        </w:rPr>
-        <w:t xml:space="preserve">Estimated Cost/Benefits/Incentives</w:t>
-      </w:r>
-    </w:p>
-    <w:p>
-      <w:pPr>
-        <w:pStyle w:val="BodyText"/>
-      </w:pPr>
-      <w:r>
-        <w:t xml:space="preserve">Installation of spray foam insulation will cost around $5-7 per square foot. Efficiency Maine rebates and other incentives for insulation work can fund up to 80% of the project cost (subject to a lifetime limit per building), up to $9,200 when combined with nonrefundable federal tax credits. You can call them at 866-376-2463 (Monday to Friday, 8:00 am to 5:00 pm) or visit their webpage about insulation rebates: https://www.efficiencymaine.com/at-home/insulation-rebates/</w:t>
-      </w:r>
-    </w:p>
-    <w:bookmarkEnd w:id="48"/>
-    <w:bookmarkStart w:id="49" w:name="attic-insulation-and-air-sealing"/>
-    <w:p>
-      <w:pPr>
-        <w:pStyle w:val="Heading3"/>
-      </w:pPr>
-      <w:r>
-        <w:t xml:space="preserve">4.9 Attic Insulation and Air Sealing</w:t>
-      </w:r>
-    </w:p>
-    <w:p>
-      <w:pPr>
-        <w:pStyle w:val="FirstParagraph"/>
-      </w:pPr>
-      <w:r>
-        <w:rPr>
-          <w:i/>
-          <w:iCs/>
-        </w:rPr>
-        <w:t xml:space="preserve">Problem</w:t>
-      </w:r>
-    </w:p>
-    <w:p>
-      <w:pPr>
-        <w:pStyle w:val="BodyText"/>
-      </w:pPr>
-      <w:r>
-        <w:t xml:space="preserve">The attic is uninsulated or is missing insulation and the attic could also benefit from air-sealing. These upgrades will reduce draftiness and heat loss in the winter and heat gain in the summer.</w:t>
-      </w:r>
-    </w:p>
-    <w:p>
-      <w:pPr>
-        <w:pStyle w:val="BodyText"/>
-      </w:pPr>
-      <w:r>
-        <w:rPr>
-          <w:i/>
-          <w:iCs/>
-        </w:rPr>
-        <w:t xml:space="preserve">Recommendation</w:t>
-      </w:r>
-    </w:p>
-    <w:p>
-      <w:pPr>
-        <w:pStyle w:val="BodyText"/>
-      </w:pPr>
-      <w:r>
-        <w:t xml:space="preserve">Air seal the attic and insulate it to at least R-60 (18” of loose-fill cellulose insulation).</w:t>
-      </w:r>
-    </w:p>
-    <w:p>
-      <w:pPr>
-        <w:pStyle w:val="BodyText"/>
-      </w:pPr>
-      <w:r>
-        <w:rPr>
-          <w:i/>
-          <w:iCs/>
-        </w:rPr>
-        <w:t xml:space="preserve">Estimated Cost/Benefits/Incentives</w:t>
-      </w:r>
-    </w:p>
-    <w:p>
-      <w:pPr>
-        <w:pStyle w:val="BodyText"/>
-      </w:pPr>
-      <w:r>
-        <w:t xml:space="preserve">Efficiency Maine rebates and other incentives for insulation work can fund up to 80% of the overall cost to weatherize your home (subject to a lifetime limit per building), up to $9,200 when combined with nonrefundable federal tax credits. You can call them at 866-376-2463 (Monday to Friday, 8:00 am to 5:00 pm) or visit their webpage about insulation rebates: https://www.efficiencymaine.com/at-home/insulation-rebates/</w:t>
-      </w:r>
-    </w:p>
-    <w:bookmarkEnd w:id="49"/>
-    <w:bookmarkStart w:id="50" w:name="blow-in-cellulose-wall-insulation"/>
-    <w:p>
-      <w:pPr>
-        <w:pStyle w:val="Heading3"/>
-      </w:pPr>
-      <w:r>
-        <w:t xml:space="preserve">4.10 Blow-in cellulose wall insulation</w:t>
-      </w:r>
-    </w:p>
-    <w:p>
-      <w:pPr>
-        <w:pStyle w:val="FirstParagraph"/>
-      </w:pPr>
-      <w:r>
-        <w:rPr>
-          <w:i/>
-          <w:iCs/>
-        </w:rPr>
-        <w:t xml:space="preserve">Problem</w:t>
-      </w:r>
-    </w:p>
-    <w:p>
-      <w:pPr>
-        <w:pStyle w:val="BodyText"/>
-      </w:pPr>
-      <w:r>
-        <w:t xml:space="preserve">The walls of the house are uninsulated, which is a significant source of heat loss.</w:t>
-      </w:r>
-    </w:p>
-    <w:p>
-      <w:pPr>
-        <w:pStyle w:val="BodyText"/>
-      </w:pPr>
-      <w:r>
-        <w:rPr>
-          <w:i/>
-          <w:iCs/>
-        </w:rPr>
-        <w:t xml:space="preserve">Recommendation</w:t>
-      </w:r>
-    </w:p>
-    <w:p>
-      <w:pPr>
-        <w:pStyle w:val="BodyText"/>
-      </w:pPr>
-      <w:r>
-        <w:t xml:space="preserve">Insulate the wall stud cavities with dense packed, blown-in cellulose insulation.</w:t>
-      </w:r>
-      <w:r>
-        <w:t xml:space="preserve"> </w:t>
-      </w:r>
-      <w:r>
-        <w:rPr>
-          <w:i/>
-          <w:iCs/>
-        </w:rPr>
-        <w:t xml:space="preserve">Estimated Cost/Benefits/Incentives</w:t>
-      </w:r>
-    </w:p>
-    <w:p>
-      <w:pPr>
-        <w:pStyle w:val="BodyText"/>
-      </w:pPr>
-      <w:r>
-        <w:t xml:space="preserve">Efficiency Maine rebates and other incentives for insulation work can fund up to 80% of the overall cost to weatherize your home (subject to a lifetime limit per building), up to $9,200 when combined with nonrefundable federal tax credits. You can call them at 866-376-2463 (Monday to Friday, 8:00 am to 5:00 pm) or visit their webpage about insulation rebates: https://www.efficiencymaine.com/at-home/insulation-rebates/</w:t>
-      </w:r>
-    </w:p>
-    <w:bookmarkEnd w:id="50"/>
-    <w:bookmarkStart w:id="51" w:name="continuous-exterior-wall-insulation"/>
-    <w:p>
-      <w:pPr>
-        <w:pStyle w:val="Heading3"/>
-      </w:pPr>
-      <w:r>
-        <w:t xml:space="preserve">4.11 Continuous exterior wall insulation</w:t>
-      </w:r>
-    </w:p>
-    <w:p>
-      <w:pPr>
-        <w:pStyle w:val="FirstParagraph"/>
-      </w:pPr>
-      <w:r>
-        <w:rPr>
-          <w:i/>
-          <w:iCs/>
-        </w:rPr>
-        <w:t xml:space="preserve">Problem</w:t>
-      </w:r>
-    </w:p>
-    <w:p>
-      <w:pPr>
-        <w:pStyle w:val="BodyText"/>
-      </w:pPr>
-      <w:r>
-        <w:t xml:space="preserve">There isn’t continuous insulation between the siding and the exterior walls of the house. Continuous insulation helps create a complete thermal boundary for your house, and it is now an energy code requirement for new houses.</w:t>
-      </w:r>
-    </w:p>
-    <w:p>
-      <w:pPr>
-        <w:pStyle w:val="BodyText"/>
-      </w:pPr>
-      <w:r>
-        <w:rPr>
-          <w:i/>
-          <w:iCs/>
-        </w:rPr>
-        <w:t xml:space="preserve">Recommendation</w:t>
-      </w:r>
-    </w:p>
-    <w:p>
-      <w:pPr>
-        <w:pStyle w:val="BodyText"/>
-      </w:pPr>
-      <w:r>
-        <w:t xml:space="preserve">Add a continuous layer of insulation and potentially replace the air and moisture barrier once it becomes time to replace the siding.</w:t>
-      </w:r>
-    </w:p>
-    <w:p>
-      <w:pPr>
-        <w:pStyle w:val="BodyText"/>
-      </w:pPr>
-      <w:r>
-        <w:rPr>
-          <w:i/>
-          <w:iCs/>
-        </w:rPr>
-        <w:t xml:space="preserve">Estimated Cost/Benefits/Incentives</w:t>
-      </w:r>
-    </w:p>
-    <w:p>
-      <w:pPr>
-        <w:pStyle w:val="BodyText"/>
-      </w:pPr>
-      <w:r>
-        <w:t xml:space="preserve">Efficiency Maine rebates and other incentives for insulation work can fund up to 80% of the overall cost to weatherize your home (subject to a lifetime limit per building), up to $9,200 when combined with nonrefundable federal tax credits. You can call them at 866-376-2463 (Monday to Friday, 8:00 am to 5:00 pm) or visit their webpage about insulation rebates: https://www.efficiencymaine.com/at-home/insulation-rebates/</w:t>
-      </w:r>
-    </w:p>
-    <w:bookmarkEnd w:id="51"/>
-    <w:bookmarkStart w:id="52" w:name="air-source-heat-pump"/>
-    <w:p>
-      <w:pPr>
-        <w:pStyle w:val="Heading3"/>
-      </w:pPr>
-      <w:r>
-        <w:t xml:space="preserve">4.12 Air Source Heat Pump</w:t>
-      </w:r>
-    </w:p>
-    <w:p>
-      <w:pPr>
-        <w:pStyle w:val="FirstParagraph"/>
-      </w:pPr>
-      <w:r>
-        <w:rPr>
-          <w:i/>
-          <w:iCs/>
-        </w:rPr>
-        <w:t xml:space="preserve">Problem</w:t>
-      </w:r>
-    </w:p>
-    <w:p>
-      <w:pPr>
-        <w:pStyle w:val="BodyText"/>
-      </w:pPr>
-      <w:r>
-        <w:t xml:space="preserve">Combustion heating equipment is expensive, inefficient, and has the potential to release harmful combustion gases like carbon monoxide into the home.</w:t>
-      </w:r>
-    </w:p>
-    <w:p>
-      <w:pPr>
-        <w:pStyle w:val="BodyText"/>
-      </w:pPr>
-      <w:r>
-        <w:rPr>
-          <w:i/>
-          <w:iCs/>
-        </w:rPr>
-        <w:t xml:space="preserve">Recommendation</w:t>
-      </w:r>
-    </w:p>
-    <w:p>
-      <w:pPr>
-        <w:pStyle w:val="BodyText"/>
-      </w:pPr>
-      <w:r>
-        <w:t xml:space="preserve">Install air source heat pumps and whole-house surge protection.</w:t>
-      </w:r>
-    </w:p>
-    <w:p>
-      <w:pPr>
-        <w:pStyle w:val="BodyText"/>
-      </w:pPr>
-      <w:r>
-        <w:rPr>
-          <w:i/>
-          <w:iCs/>
-        </w:rPr>
-        <w:t xml:space="preserve">Estimated Cost/Benefits/Incentives</w:t>
-      </w:r>
-    </w:p>
-    <w:p>
-      <w:pPr>
-        <w:pStyle w:val="BodyText"/>
-      </w:pPr>
-      <w:r>
-        <w:t xml:space="preserve">Efficiency Maine rebates can fund $1,000 to $3,000 per unit up to a lifetime limit per housing unit for $3,000 to $9,000 (depending on income level) to install heat pumps. The rebate can be combined with a nonrefundable federal tax credit of 30% of the remaining cost of the unit and labor, subject to an annual maximum benefit of $2,000 (shared with other energy property, like a heat pump water heater). You can call Efficiency Maine at 866-376-2463 (Monday to Friday, 8:00 am to 5:00 pm) or visit their website: https://www.efficiencymaine.com/at-home/residential-heat-pump-incentives/</w:t>
-      </w:r>
-    </w:p>
-    <w:bookmarkEnd w:id="52"/>
-    <w:bookmarkStart w:id="53" w:name="pipe-insulation"/>
-    <w:p>
-      <w:pPr>
-        <w:pStyle w:val="Heading3"/>
-      </w:pPr>
-      <w:r>
-        <w:t xml:space="preserve">4.13 Pipe Insulation</w:t>
-      </w:r>
-    </w:p>
-    <w:p>
-      <w:pPr>
-        <w:pStyle w:val="FirstParagraph"/>
-      </w:pPr>
-      <w:r>
-        <w:rPr>
-          <w:i/>
-          <w:iCs/>
-        </w:rPr>
-        <w:t xml:space="preserve">Problem</w:t>
-      </w:r>
-    </w:p>
-    <w:p>
-      <w:pPr>
-        <w:pStyle w:val="BodyText"/>
-      </w:pPr>
-      <w:r>
-        <w:t xml:space="preserve">Uninsulated water pipes are responsible for heat loss and excess moisture (from condensation) in your basement/crawlspace.</w:t>
-      </w:r>
-    </w:p>
-    <w:p>
-      <w:pPr>
-        <w:pStyle w:val="BodyText"/>
-      </w:pPr>
-      <w:r>
-        <w:rPr>
-          <w:i/>
-          <w:iCs/>
-        </w:rPr>
-        <w:t xml:space="preserve">Recommendation</w:t>
-      </w:r>
-    </w:p>
-    <w:p>
-      <w:pPr>
-        <w:pStyle w:val="BodyText"/>
-      </w:pPr>
-      <w:r>
-        <w:t xml:space="preserve">Insulate both hot and cold water pipes that are uninsulated in the basement/crawlspace. This will save energy and prevent condensation.</w:t>
-      </w:r>
-    </w:p>
-    <w:p>
-      <w:pPr>
-        <w:pStyle w:val="BodyText"/>
-      </w:pPr>
-      <w:r>
-        <w:rPr>
-          <w:i/>
-          <w:iCs/>
-        </w:rPr>
-        <w:t xml:space="preserve">Estimated Cost/Benefits/Incentives</w:t>
-      </w:r>
-    </w:p>
-    <w:p>
-      <w:pPr>
-        <w:pStyle w:val="BodyText"/>
-      </w:pPr>
-      <w:r>
-        <w:t xml:space="preserve">Insulating water pipes can save 2%-4% on hot water bills and increase the temperature of the water while reducing the time it takes for hot water to reach your tap. Materials cost around $100-200, depending on the length of pipe to insulate. Many people find this to be an easy project to do themselves.</w:t>
-      </w:r>
-    </w:p>
-    <w:bookmarkEnd w:id="53"/>
-    <w:bookmarkStart w:id="54" w:name="whole-house-surge-protection"/>
-    <w:p>
-      <w:pPr>
-        <w:pStyle w:val="Heading3"/>
-      </w:pPr>
-      <w:r>
-        <w:t xml:space="preserve">4.14 Whole House Surge Protection</w:t>
-      </w:r>
-    </w:p>
-    <w:p>
-      <w:pPr>
-        <w:pStyle w:val="FirstParagraph"/>
-      </w:pPr>
-      <w:r>
-        <w:rPr>
-          <w:i/>
-          <w:iCs/>
-        </w:rPr>
-        <w:t xml:space="preserve">Problem</w:t>
-      </w:r>
-    </w:p>
-    <w:p>
-      <w:pPr>
-        <w:pStyle w:val="BodyText"/>
-      </w:pPr>
-      <w:r>
-        <w:t xml:space="preserve">Your house does not have whole-house surge protection. This will protect your large electrical appliances from damage in the case of an electrical surge. Heat pumps, heat pump water heaters, and other electronics are particularly sensitive to electrical surges.</w:t>
-      </w:r>
-    </w:p>
-    <w:p>
-      <w:pPr>
-        <w:pStyle w:val="BodyText"/>
-      </w:pPr>
-      <w:r>
-        <w:rPr>
-          <w:i/>
-          <w:iCs/>
-        </w:rPr>
-        <w:t xml:space="preserve">Recommendation</w:t>
-      </w:r>
-    </w:p>
-    <w:p>
-      <w:pPr>
-        <w:pStyle w:val="BodyText"/>
-      </w:pPr>
-      <w:r>
-        <w:t xml:space="preserve">Seal easy-to-access air leaks and weatherstrip exterior doors.</w:t>
-      </w:r>
-      <w:r>
-        <w:t xml:space="preserve"> </w:t>
-      </w:r>
-      <w:r>
-        <w:rPr>
-          <w:i/>
-          <w:iCs/>
-        </w:rPr>
-        <w:t xml:space="preserve">Estimated Cost/Benefits/Incentives</w:t>
-      </w:r>
-    </w:p>
-    <w:p>
-      <w:pPr>
-        <w:pStyle w:val="BodyText"/>
-      </w:pPr>
-      <w:r>
-        <w:t xml:space="preserve">The device costs $100-$400 and needs to be installed by an electrician. Here are some options: https://www.popularmechanics.com/home/interior-projects/g43140886/best-whole-house-surge-protectors/</w:t>
-      </w:r>
-    </w:p>
-    <w:bookmarkEnd w:id="54"/>
-    <w:bookmarkStart w:id="55" w:name="diy-air-sealing"/>
-    <w:p>
-      <w:pPr>
-        <w:pStyle w:val="Heading3"/>
-      </w:pPr>
-      <w:r>
-        <w:t xml:space="preserve">4.15 DIY Air Sealing</w:t>
-      </w:r>
-    </w:p>
-    <w:p>
-      <w:pPr>
-        <w:pStyle w:val="FirstParagraph"/>
-      </w:pPr>
-      <w:r>
-        <w:rPr>
-          <w:i/>
-          <w:iCs/>
-        </w:rPr>
-        <w:t xml:space="preserve">Problem</w:t>
-      </w:r>
-    </w:p>
-    <w:p>
-      <w:pPr>
-        <w:pStyle w:val="BodyText"/>
-      </w:pPr>
-      <w:r>
-        <w:t xml:space="preserve">During the blower door test, we noted sources of air leakage in the living areas of your house.</w:t>
-      </w:r>
-    </w:p>
-    <w:p>
-      <w:pPr>
-        <w:pStyle w:val="BodyText"/>
-      </w:pPr>
-      <w:r>
         <w:rPr>
           <w:b/>
           <w:bCs/>
         </w:rPr>
-        <w:t xml:space="preserve">Auditor to detail customized findings.</w:t>
-      </w:r>
-      <w:r>
-        <w:rPr>
-          <w:b/>
-          <w:bCs/>
-        </w:rPr>
+        <w:t xml:space="preserve">Auditor to describe. Primary residence</w:t>
+      </w:r>
+    </w:p>
+    <w:bookmarkEnd w:id="44"/>
+    <w:bookmarkEnd w:id="45"/>
+    <w:bookmarkStart w:id="46" w:name="additional-resources"/>
+    <w:p>
+      <w:pPr>
+        <w:pStyle w:val="Heading2"/>
+      </w:pPr>
+      <w:r>
+        <w:t xml:space="preserve">5 Additional Resources</w:t>
+      </w:r>
+    </w:p>
+    <w:p>
+      <w:pPr>
+        <w:pStyle w:val="FirstParagraph"/>
+      </w:pPr>
+      <w:r>
+        <w:t xml:space="preserve">Many home efficiency upgrades are eligible for Efficiency Maine rebates and federal tax credits. Financial incentives vary based on income level and type of occupancy. An overview of all state rebates and federal tax credits can be found here: https://www.efficiencymaine.com/at-home/.</w:t>
+      </w:r>
+    </w:p>
+    <w:p>
+      <w:pPr>
+        <w:pStyle w:val="BodyText"/>
+      </w:pPr>
+      <w:r>
+        <w:t xml:space="preserve">You can search for Efficiency Maine registered contractors here: https://www.efficiencymaine.com/at-home/vendor-locator/.</w:t>
+      </w:r>
+    </w:p>
+    <w:p>
+      <w:pPr>
+        <w:pStyle w:val="BodyText"/>
+      </w:pPr>
+      <w:r>
+        <w:t xml:space="preserve">We recommend discussing a whole-home plan for insulation and air sealing work in the basement, walls, and attic with contractors to determine how to best sequence the work to take full advantage of the Efficiency Maine rebates (which are subject to lifetime maximums) and nonrefundable federal tax credits (which are subject to annual maximums).</w:t>
+      </w:r>
+    </w:p>
+    <w:bookmarkEnd w:id="46"/>
+    <w:bookmarkStart w:id="51" w:name="section-four-tests"/>
+    <w:p>
+      <w:pPr>
+        <w:pStyle w:val="Heading2"/>
+      </w:pPr>
+      <w:r>
+        <w:t xml:space="preserve">6 Section Four Tests</w:t>
+      </w:r>
+    </w:p>
+    <w:bookmarkStart w:id="47" w:name="windowdressers"/>
+    <w:p>
+      <w:pPr>
+        <w:pStyle w:val="Heading3"/>
+      </w:pPr>
+      <w:r>
+        <w:t xml:space="preserve">6.1 WindowDressers</w:t>
+      </w:r>
+    </w:p>
+    <w:bookmarkEnd w:id="47"/>
+    <w:bookmarkStart w:id="48" w:name="gutters-1"/>
+    <w:p>
+      <w:pPr>
+        <w:pStyle w:val="Heading3"/>
+      </w:pPr>
+      <w:r>
+        <w:t xml:space="preserve">6.2 Gutters</w:t>
+      </w:r>
+    </w:p>
+    <w:bookmarkEnd w:id="48"/>
+    <w:bookmarkStart w:id="49" w:name="other-1-1"/>
+    <w:p>
+      <w:pPr>
+        <w:pStyle w:val="Heading3"/>
+      </w:pPr>
+      <w:r>
+        <w:t xml:space="preserve">6.3 Other 1</w:t>
+      </w:r>
+    </w:p>
+    <w:bookmarkEnd w:id="49"/>
+    <w:bookmarkStart w:id="50" w:name="kitchen-exhaust-fan"/>
+    <w:p>
+      <w:pPr>
+        <w:pStyle w:val="Heading3"/>
+      </w:pPr>
+      <w:r>
+        <w:t xml:space="preserve">6.4 Kitchen Exhaust Fan</w:t>
+      </w:r>
+    </w:p>
+    <w:p>
+      <w:pPr>
+        <w:pStyle w:val="FirstParagraph"/>
+      </w:pPr>
+      <w:r>
+        <w:t xml:space="preserve">[1]</w:t>
+      </w:r>
+      <w:r>
         <w:t xml:space="preserve"> </w:t>
       </w:r>
-    </w:p>
-    <w:p>
-      <w:pPr>
-        <w:pStyle w:val="BodyText"/>
-      </w:pPr>
-      <w:r>
-        <w:rPr>
-          <w:i/>
-          <w:iCs/>
-        </w:rPr>
-        <w:t xml:space="preserve">Recommendation</w:t>
-      </w:r>
-    </w:p>
-    <w:p>
-      <w:pPr>
-        <w:pStyle w:val="BodyText"/>
-      </w:pPr>
-      <w:r>
-        <w:t xml:space="preserve">Air sealing the air leaks we identified around the living areas of your house can be a DIY solution to lower energy use, or an insulation contractor can seal the leaks when they come to your house for a larger project. Please address any moisture concerns before undertaking significant air sealing efforts.</w:t>
-      </w:r>
-    </w:p>
-    <w:p>
-      <w:pPr>
-        <w:pStyle w:val="BodyText"/>
-      </w:pPr>
-      <w:r>
-        <w:rPr>
-          <w:i/>
-          <w:iCs/>
-        </w:rPr>
-        <w:t xml:space="preserve">Estimated Cost/Benefits/Incentives</w:t>
-      </w:r>
-    </w:p>
-    <w:p>
-      <w:pPr>
-        <w:pStyle w:val="BodyText"/>
-      </w:pPr>
-      <w:r>
-        <w:t xml:space="preserve">Air sealing and insulating ductwork is eligible for a non-refundable federal tax credit (</w:t>
-      </w:r>
-      <w:r>
-        <w:t xml:space="preserve">“Energy Efficient Home Improvement Credit”</w:t>
-      </w:r>
-      <w:r>
-        <w:t xml:space="preserve">), which can pay for 30% of the project cost, subject to an annual maximum of $1,200 (shared with other home envelope improvements, like attic and basement projects).</w:t>
-      </w:r>
-    </w:p>
-    <w:bookmarkEnd w:id="55"/>
-    <w:bookmarkStart w:id="56" w:name="misc.-air-sealing-and-insulation"/>
-    <w:p>
-      <w:pPr>
-        <w:pStyle w:val="Heading3"/>
-      </w:pPr>
-      <w:r>
-        <w:t xml:space="preserve">4.16 Misc. Air Sealing and Insulation</w:t>
-      </w:r>
-    </w:p>
-    <w:p>
-      <w:pPr>
-        <w:pStyle w:val="FirstParagraph"/>
-      </w:pPr>
-      <w:r>
-        <w:rPr>
-          <w:i/>
-          <w:iCs/>
-        </w:rPr>
-        <w:t xml:space="preserve">Problem</w:t>
-      </w:r>
-    </w:p>
-    <w:p>
-      <w:pPr>
-        <w:pStyle w:val="BodyText"/>
-      </w:pPr>
-      <w:r>
-        <w:rPr>
-          <w:b/>
-          <w:bCs/>
-        </w:rPr>
-        <w:t xml:space="preserve">Need a description for the problem</w:t>
-      </w:r>
-    </w:p>
-    <w:p>
-      <w:pPr>
-        <w:pStyle w:val="BodyText"/>
-      </w:pPr>
-      <w:r>
-        <w:rPr>
-          <w:i/>
-          <w:iCs/>
-        </w:rPr>
-        <w:t xml:space="preserve">Recommendation</w:t>
-      </w:r>
-    </w:p>
-    <w:p>
-      <w:pPr>
-        <w:pStyle w:val="BodyText"/>
-      </w:pPr>
-      <w:r>
-        <w:t xml:space="preserve">Air seal and insulate [** insert auditor description - bay window, bulkhead door, chase, kneewall, anything else that is unique to the home and not otherwise covered in another recommendation]</w:t>
-      </w:r>
-      <w:r>
-        <w:rPr>
-          <w:i/>
-          <w:iCs/>
-        </w:rPr>
-        <w:t xml:space="preserve">Estimated Costs/Benefits/Incentives</w:t>
-      </w:r>
-    </w:p>
-    <w:p>
-      <w:pPr>
-        <w:pStyle w:val="BodyText"/>
-      </w:pPr>
-      <w:r>
-        <w:t xml:space="preserve">As part of a larger insulation project, this work may be eligible for Efficiency Maine rebates and other incentives for insulation work, up to 80% of the overall cost to weatherize your home (subject to a lifetime limit per building).</w:t>
-      </w:r>
-    </w:p>
-    <w:bookmarkEnd w:id="56"/>
-    <w:bookmarkStart w:id="57" w:name="replace-windows"/>
-    <w:p>
-      <w:pPr>
-        <w:pStyle w:val="Heading3"/>
-      </w:pPr>
-      <w:r>
-        <w:t xml:space="preserve">4.17 Replace Windows</w:t>
-      </w:r>
-    </w:p>
-    <w:p>
-      <w:pPr>
-        <w:pStyle w:val="FirstParagraph"/>
-      </w:pPr>
-      <w:r>
-        <w:rPr>
-          <w:i/>
-          <w:iCs/>
-        </w:rPr>
-        <w:t xml:space="preserve">Problem</w:t>
-      </w:r>
-    </w:p>
-    <w:p>
-      <w:pPr>
-        <w:pStyle w:val="BodyText"/>
-      </w:pPr>
-      <w:r>
-        <w:rPr>
-          <w:b/>
-          <w:bCs/>
-        </w:rPr>
-        <w:t xml:space="preserve">Need to get the description of the problem</w:t>
-      </w:r>
-    </w:p>
-    <w:p>
-      <w:pPr>
-        <w:pStyle w:val="BodyText"/>
-      </w:pPr>
-      <w:r>
-        <w:rPr>
-          <w:i/>
-          <w:iCs/>
-        </w:rPr>
-        <w:t xml:space="preserve">Recommendation</w:t>
-      </w:r>
-    </w:p>
-    <w:p>
-      <w:pPr>
-        <w:pStyle w:val="BodyText"/>
-      </w:pPr>
-      <w:r>
-        <w:t xml:space="preserve">Replace single-paned windows with double- or triple-paned windows and ensure the frames are airsealed. We recommend installing windows that are Energy Star certified for</w:t>
-      </w:r>
-      <w:r>
-        <w:t xml:space="preserve"> </w:t>
-      </w:r>
-      <w:r>
-        <w:t xml:space="preserve">‘Northern’</w:t>
-      </w:r>
-      <w:r>
-        <w:t xml:space="preserve"> </w:t>
-      </w:r>
-      <w:r>
-        <w:t xml:space="preserve">climate.</w:t>
-      </w:r>
-      <w:r>
-        <w:rPr>
-          <w:i/>
-          <w:iCs/>
-        </w:rPr>
-        <w:t xml:space="preserve">Estimated Costs/Benefits/Incentives</w:t>
-      </w:r>
-    </w:p>
-    <w:p>
-      <w:pPr>
-        <w:pStyle w:val="BodyText"/>
-      </w:pPr>
-      <w:r>
-        <w:t xml:space="preserve">New windows are eligible for a nonrefundable federal tax credit of 30% of the cost of the window units up to $600, subject to an annual maximum benefit of $1,200 (shared with other home envelope improvements, like attic and basement insulation).</w:t>
-      </w:r>
-    </w:p>
-    <w:bookmarkEnd w:id="57"/>
-    <w:bookmarkStart w:id="58" w:name="replace-doors"/>
-    <w:p>
-      <w:pPr>
-        <w:pStyle w:val="Heading3"/>
-      </w:pPr>
-      <w:r>
-        <w:t xml:space="preserve">4.18 Replace Doors</w:t>
-      </w:r>
-    </w:p>
-    <w:p>
-      <w:pPr>
-        <w:pStyle w:val="FirstParagraph"/>
-      </w:pPr>
-      <w:r>
-        <w:rPr>
-          <w:i/>
-          <w:iCs/>
-        </w:rPr>
-        <w:t xml:space="preserve">Problem</w:t>
-      </w:r>
-    </w:p>
-    <w:p>
-      <w:pPr>
-        <w:pStyle w:val="BodyText"/>
-      </w:pPr>
-      <w:r>
-        <w:rPr>
-          <w:b/>
-          <w:bCs/>
-        </w:rPr>
-        <w:t xml:space="preserve">Need to get the description of the problem</w:t>
-      </w:r>
-    </w:p>
-    <w:p>
-      <w:pPr>
-        <w:pStyle w:val="BodyText"/>
-      </w:pPr>
-      <w:r>
-        <w:rPr>
-          <w:i/>
-          <w:iCs/>
-        </w:rPr>
-        <w:t xml:space="preserve">Recommendation</w:t>
-      </w:r>
-    </w:p>
-    <w:p>
-      <w:pPr>
-        <w:pStyle w:val="BodyText"/>
-      </w:pPr>
-      <w:r>
-        <w:t xml:space="preserve">Replace uninsulated exterior doors and ensure new doors are insulated and properly weatherstripped. We recommend installing doors that are Energy Star certified for</w:t>
-      </w:r>
-      <w:r>
-        <w:t xml:space="preserve"> </w:t>
-      </w:r>
-      <w:r>
-        <w:t xml:space="preserve">‘Northern’</w:t>
-      </w:r>
-      <w:r>
-        <w:t xml:space="preserve"> </w:t>
-      </w:r>
-      <w:r>
-        <w:t xml:space="preserve">climate.</w:t>
-      </w:r>
-      <w:r>
-        <w:rPr>
-          <w:i/>
-          <w:iCs/>
-        </w:rPr>
-        <w:t xml:space="preserve">Estimated Costs/Benefits/Incentives</w:t>
-      </w:r>
-    </w:p>
-    <w:p>
-      <w:pPr>
-        <w:pStyle w:val="BodyText"/>
-      </w:pPr>
-      <w:r>
-        <w:t xml:space="preserve">New doors are eligible for a nonrefundable federal tax credit of 30% of the cost of the door units up to $250 per door and $500 total, subject to an annual maximum benefit of $1,200 (shared with other home envelope improvements, like attic and basement insulation).</w:t>
-      </w:r>
-    </w:p>
-    <w:bookmarkEnd w:id="58"/>
-    <w:bookmarkEnd w:id="59"/>
-    <w:bookmarkStart w:id="60" w:name="additional-resources"/>
-    <w:p>
-      <w:pPr>
-        <w:pStyle w:val="Heading2"/>
-      </w:pPr>
-      <w:r>
-        <w:t xml:space="preserve">5 Additional Resources</w:t>
-      </w:r>
-    </w:p>
-    <w:p>
-      <w:pPr>
-        <w:pStyle w:val="FirstParagraph"/>
-      </w:pPr>
-      <w:r>
-        <w:t xml:space="preserve">Many home efficiency upgrades are eligible for Efficiency Maine rebates and federal tax credits. Financial incentives vary based on income level and type of occupancy. An overview of all state rebates and federal tax credits can be found here: https://www.efficiencymaine.com/at-home/.</w:t>
-      </w:r>
-    </w:p>
-    <w:p>
-      <w:pPr>
-        <w:pStyle w:val="BodyText"/>
-      </w:pPr>
-      <w:r>
-        <w:t xml:space="preserve">You can search for Efficiency Maine registered contractors here: https://www.efficiencymaine.com/at-home/vendor-locator/.</w:t>
-      </w:r>
-    </w:p>
-    <w:p>
-      <w:pPr>
-        <w:pStyle w:val="BodyText"/>
-      </w:pPr>
-      <w:r>
-        <w:t xml:space="preserve">We recommend discussing a whole-home plan for insulation and air sealing work in the basement, walls, and attic with contractors to determine how to best sequence the work to take full advantage of the Efficiency Maine rebates (which are subject to lifetime maximums) and nonrefundable federal tax credits (which are subject to annual maximums).</w:t>
-      </w:r>
-    </w:p>
-    <w:p>
-      <w:pPr>
-        <w:pStyle w:val="BodyText"/>
-      </w:pPr>
-      <w:r>
-        <w:t xml:space="preserve">Efficiency Maine also offers home energy loans to help homeowners who are Maine residents pay for energy and related health and safety upgrades. There are no fees, and interest rates for multi-year loans are between 5.99% (max $7,500) and 7.99% (max $25,000), depending on income level. Low- and moderate-income homeowners who borrow the full $7,500 and pay it back over 10 years will pay a monthly cost of $83. There is also a 1-year, 0% APR option. To learn more or apply, call 866-376-2463 or visit https://www.efficiencymaine.com/home-energy-loans/</w:t>
-      </w:r>
-    </w:p>
-    <w:bookmarkEnd w:id="60"/>
-    <w:bookmarkStart w:id="79" w:name="section-four-tests"/>
-    <w:p>
-      <w:pPr>
-        <w:pStyle w:val="Heading2"/>
-      </w:pPr>
-      <w:r>
-        <w:t xml:space="preserve">6 Section Four Tests</w:t>
-      </w:r>
-    </w:p>
-    <w:p>
-      <w:pPr>
-        <w:pStyle w:val="SourceCode"/>
-      </w:pPr>
-      <w:r>
-        <w:rPr>
-          <w:rStyle w:val="CommentTok"/>
-        </w:rPr>
-        <w:t xml:space="preserve"># for (i in 1:length(ranked_sect_4_problem_text)) {</w:t>
-      </w:r>
-      <w:r>
-        <w:br/>
-      </w:r>
-      <w:r>
-        <w:rPr>
-          <w:rStyle w:val="CommentTok"/>
-        </w:rPr>
-        <w:t xml:space="preserve">#   cat(ranked_sect_4_problem_text$Problem)</w:t>
-      </w:r>
-      <w:r>
-        <w:br/>
-      </w:r>
-      <w:r>
-        <w:rPr>
-          <w:rStyle w:val="CommentTok"/>
-        </w:rPr>
-        <w:t xml:space="preserve"># }</w:t>
-      </w:r>
-      <w:r>
-        <w:br/>
-      </w:r>
-      <w:r>
-        <w:br/>
-      </w:r>
-      <w:r>
-        <w:rPr>
-          <w:rStyle w:val="CommentTok"/>
-        </w:rPr>
-        <w:t xml:space="preserve"># Create a vector filled with random normal values</w:t>
-      </w:r>
-      <w:r>
-        <w:br/>
-      </w:r>
-      <w:r>
-        <w:br/>
-      </w:r>
-      <w:r>
-        <w:rPr>
-          <w:rStyle w:val="NormalTok"/>
-        </w:rPr>
-        <w:t xml:space="preserve">name.vec </w:t>
-      </w:r>
-      <w:r>
-        <w:rPr>
-          <w:rStyle w:val="OtherTok"/>
-        </w:rPr>
-        <w:t xml:space="preserve">&lt;-</w:t>
-      </w:r>
-      <w:r>
-        <w:rPr>
-          <w:rStyle w:val="NormalTok"/>
-        </w:rPr>
-        <w:t xml:space="preserve"> </w:t>
-      </w:r>
-      <w:r>
-        <w:rPr>
-          <w:rStyle w:val="FunctionTok"/>
-        </w:rPr>
-        <w:t xml:space="preserve">as.vector</w:t>
-      </w:r>
-      <w:r>
-        <w:rPr>
-          <w:rStyle w:val="NormalTok"/>
-        </w:rPr>
-        <w:t xml:space="preserve">(ranked_sect_4_problem_text</w:t>
-      </w:r>
-      <w:r>
-        <w:rPr>
-          <w:rStyle w:val="SpecialCharTok"/>
-        </w:rPr>
-        <w:t xml:space="preserve">$</w:t>
-      </w:r>
-      <w:r>
-        <w:rPr>
-          <w:rStyle w:val="NormalTok"/>
-        </w:rPr>
-        <w:t xml:space="preserve">Problem) </w:t>
-      </w:r>
-      <w:r>
-        <w:br/>
-      </w:r>
-      <w:r>
-        <w:br/>
-      </w:r>
-      <w:r>
-        <w:rPr>
-          <w:rStyle w:val="NormalTok"/>
-        </w:rPr>
-        <w:t xml:space="preserve">name.vec2 </w:t>
-      </w:r>
-      <w:r>
-        <w:rPr>
-          <w:rStyle w:val="OtherTok"/>
-        </w:rPr>
-        <w:t xml:space="preserve">&lt;-</w:t>
-      </w:r>
-      <w:r>
-        <w:rPr>
-          <w:rStyle w:val="NormalTok"/>
-        </w:rPr>
-        <w:t xml:space="preserve"> </w:t>
-      </w:r>
-      <w:r>
-        <w:rPr>
-          <w:rStyle w:val="FunctionTok"/>
-        </w:rPr>
-        <w:t xml:space="preserve">as.vector</w:t>
-      </w:r>
-      <w:r>
-        <w:rPr>
-          <w:rStyle w:val="NormalTok"/>
-        </w:rPr>
-        <w:t xml:space="preserve">(ranked_sect_4_problem_text</w:t>
-      </w:r>
-      <w:r>
-        <w:rPr>
-          <w:rStyle w:val="SpecialCharTok"/>
-        </w:rPr>
-        <w:t xml:space="preserve">$</w:t>
-      </w:r>
-      <w:r>
-        <w:rPr>
-          <w:rStyle w:val="NormalTok"/>
-        </w:rPr>
-        <w:t xml:space="preserve">Problem)</w:t>
-      </w:r>
-      <w:r>
-        <w:br/>
-      </w:r>
-      <w:r>
-        <w:rPr>
-          <w:rStyle w:val="CommentTok"/>
-        </w:rPr>
-        <w:t xml:space="preserve">#u1 &lt;- rnorm(30)</w:t>
-      </w:r>
-      <w:r>
-        <w:br/>
-      </w:r>
-      <w:r>
-        <w:rPr>
-          <w:rStyle w:val="CommentTok"/>
-        </w:rPr>
-        <w:t xml:space="preserve">#print("This loop calculates the square of the first 10 elements of vector u1")</w:t>
-      </w:r>
-      <w:r>
-        <w:br/>
-      </w:r>
-      <w:r>
-        <w:br/>
-      </w:r>
-      <w:r>
-        <w:rPr>
-          <w:rStyle w:val="CommentTok"/>
-        </w:rPr>
-        <w:t xml:space="preserve"># # Initialize `usq`</w:t>
-      </w:r>
-      <w:r>
-        <w:br/>
-      </w:r>
-      <w:r>
-        <w:rPr>
-          <w:rStyle w:val="CommentTok"/>
-        </w:rPr>
-        <w:t xml:space="preserve"># usq &lt;- ""</w:t>
-      </w:r>
-      <w:r>
-        <w:br/>
-      </w:r>
-      <w:r>
-        <w:br/>
-      </w:r>
-      <w:r>
-        <w:rPr>
-          <w:rStyle w:val="ControlFlowTok"/>
-        </w:rPr>
-        <w:t xml:space="preserve">for</w:t>
-      </w:r>
-      <w:r>
-        <w:rPr>
-          <w:rStyle w:val="NormalTok"/>
-        </w:rPr>
-        <w:t xml:space="preserve"> (i </w:t>
-      </w:r>
-      <w:r>
-        <w:rPr>
-          <w:rStyle w:val="ControlFlowTok"/>
-        </w:rPr>
-        <w:t xml:space="preserve">in</w:t>
-      </w:r>
-      <w:r>
-        <w:rPr>
-          <w:rStyle w:val="NormalTok"/>
-        </w:rPr>
-        <w:t xml:space="preserve"> </w:t>
-      </w:r>
-      <w:r>
-        <w:rPr>
-          <w:rStyle w:val="DecValTok"/>
-        </w:rPr>
-        <w:t xml:space="preserve">1</w:t>
-      </w:r>
-      <w:r>
-        <w:rPr>
-          <w:rStyle w:val="SpecialCharTok"/>
-        </w:rPr>
-        <w:t xml:space="preserve">:</w:t>
-      </w:r>
-      <w:r>
-        <w:rPr>
-          <w:rStyle w:val="NormalTok"/>
-        </w:rPr>
-        <w:t xml:space="preserve"> </w:t>
-      </w:r>
-      <w:r>
-        <w:rPr>
-          <w:rStyle w:val="FunctionTok"/>
-        </w:rPr>
-        <w:t xml:space="preserve">nrow</w:t>
-      </w:r>
-      <w:r>
-        <w:rPr>
-          <w:rStyle w:val="NormalTok"/>
-        </w:rPr>
-        <w:t xml:space="preserve">(ranked_sect_4_problem_text)) {</w:t>
-      </w:r>
-      <w:r>
-        <w:br/>
-      </w:r>
-      <w:r>
-        <w:rPr>
-          <w:rStyle w:val="NormalTok"/>
-        </w:rPr>
-        <w:t xml:space="preserve">    </w:t>
-      </w:r>
-      <w:r>
-        <w:rPr>
-          <w:rStyle w:val="CommentTok"/>
-        </w:rPr>
-        <w:t xml:space="preserve"># i-th element of `u1` squared into `i`-th position of `usq`</w:t>
-      </w:r>
-      <w:r>
-        <w:br/>
-      </w:r>
-      <w:r>
-        <w:rPr>
-          <w:rStyle w:val="NormalTok"/>
-        </w:rPr>
-        <w:t xml:space="preserve">   </w:t>
-      </w:r>
-      <w:r>
-        <w:br/>
-      </w:r>
-      <w:r>
-        <w:rPr>
-          <w:rStyle w:val="NormalTok"/>
-        </w:rPr>
-        <w:t xml:space="preserve">    </w:t>
-      </w:r>
-      <w:r>
-        <w:rPr>
-          <w:rStyle w:val="FunctionTok"/>
-        </w:rPr>
-        <w:t xml:space="preserve">cat</w:t>
-      </w:r>
-      <w:r>
-        <w:rPr>
-          <w:rStyle w:val="NormalTok"/>
-        </w:rPr>
-        <w:t xml:space="preserve">(</w:t>
-      </w:r>
-      <w:r>
-        <w:rPr>
-          <w:rStyle w:val="StringTok"/>
-        </w:rPr>
-        <w:t xml:space="preserve">"###"</w:t>
-      </w:r>
-      <w:r>
-        <w:rPr>
-          <w:rStyle w:val="NormalTok"/>
-        </w:rPr>
-        <w:t xml:space="preserve">, ranked_sect_4_problem_text</w:t>
-      </w:r>
-      <w:r>
-        <w:rPr>
-          <w:rStyle w:val="SpecialCharTok"/>
-        </w:rPr>
-        <w:t xml:space="preserve">$</w:t>
-      </w:r>
-      <w:r>
-        <w:rPr>
-          <w:rStyle w:val="NormalTok"/>
-        </w:rPr>
-        <w:t xml:space="preserve">Recommendations[i] , </w:t>
-      </w:r>
-      <w:r>
-        <w:rPr>
-          <w:rStyle w:val="StringTok"/>
-        </w:rPr>
-        <w:t xml:space="preserve">"</w:t>
-      </w:r>
-      <w:r>
-        <w:rPr>
-          <w:rStyle w:val="SpecialCharTok"/>
-        </w:rPr>
-        <w:t xml:space="preserve">\n</w:t>
-      </w:r>
-      <w:r>
-        <w:rPr>
-          <w:rStyle w:val="StringTok"/>
-        </w:rPr>
-        <w:t xml:space="preserve">"</w:t>
-      </w:r>
-      <w:r>
-        <w:rPr>
-          <w:rStyle w:val="NormalTok"/>
-        </w:rPr>
-        <w:t xml:space="preserve">)</w:t>
-      </w:r>
-      <w:r>
-        <w:br/>
-      </w:r>
-      <w:r>
-        <w:rPr>
-          <w:rStyle w:val="NormalTok"/>
-        </w:rPr>
+      <w:r>
+        <w:t xml:space="preserve">“)</w:t>
+      </w:r>
+      <w:r>
         <w:t xml:space="preserve">}</w:t>
       </w:r>
-    </w:p>
-    <w:bookmarkStart w:id="61" w:name="windowdressers"/>
-    <w:p>
-      <w:pPr>
-        <w:pStyle w:val="Heading3"/>
-      </w:pPr>
-      <w:r>
-        <w:t xml:space="preserve">6.1 WindowDressers</w:t>
-      </w:r>
-    </w:p>
-    <w:bookmarkEnd w:id="61"/>
-    <w:bookmarkStart w:id="62" w:name="refrigerator-1"/>
-    <w:p>
-      <w:pPr>
-        <w:pStyle w:val="Heading3"/>
-      </w:pPr>
-      <w:r>
-        <w:t xml:space="preserve">6.2 Refrigerator</w:t>
-      </w:r>
-    </w:p>
-    <w:bookmarkEnd w:id="62"/>
-    <w:bookmarkStart w:id="63" w:name="induction-stoveoven-1"/>
-    <w:p>
-      <w:pPr>
-        <w:pStyle w:val="Heading3"/>
-      </w:pPr>
-      <w:r>
-        <w:t xml:space="preserve">6.3 Induction Stove/Oven</w:t>
-      </w:r>
-    </w:p>
-    <w:bookmarkEnd w:id="63"/>
-    <w:bookmarkStart w:id="64" w:name="gutters-1"/>
-    <w:p>
-      <w:pPr>
-        <w:pStyle w:val="Heading3"/>
-      </w:pPr>
-      <w:r>
-        <w:t xml:space="preserve">6.4 Gutters</w:t>
-      </w:r>
-    </w:p>
-    <w:bookmarkEnd w:id="64"/>
-    <w:bookmarkStart w:id="65" w:name="bathroom-exhaust-fans-1"/>
-    <w:p>
-      <w:pPr>
-        <w:pStyle w:val="Heading3"/>
-      </w:pPr>
-      <w:r>
-        <w:t xml:space="preserve">6.5 Bathroom Exhaust Fan(s)</w:t>
-      </w:r>
-    </w:p>
-    <w:bookmarkEnd w:id="65"/>
-    <w:bookmarkStart w:id="66" w:name="kitchen-exhaust-fan"/>
-    <w:p>
-      <w:pPr>
-        <w:pStyle w:val="Heading3"/>
-      </w:pPr>
-      <w:r>
-        <w:t xml:space="preserve">6.6 Kitchen Exhaust Fan</w:t>
-      </w:r>
-    </w:p>
-    <w:bookmarkEnd w:id="66"/>
-    <w:bookmarkStart w:id="67" w:name="vapor-barrier-1"/>
-    <w:p>
-      <w:pPr>
-        <w:pStyle w:val="Heading3"/>
-      </w:pPr>
-      <w:r>
-        <w:t xml:space="preserve">6.7 Vapor Barrier</w:t>
-      </w:r>
-    </w:p>
-    <w:bookmarkEnd w:id="67"/>
-    <w:bookmarkStart w:id="68" w:name="spray-foam-basementcrawlspace-walls"/>
-    <w:p>
-      <w:pPr>
-        <w:pStyle w:val="Heading3"/>
-      </w:pPr>
-      <w:r>
-        <w:t xml:space="preserve">6.8 Spray Foam Basement/Crawlspace Walls</w:t>
-      </w:r>
-    </w:p>
-    <w:bookmarkEnd w:id="68"/>
-    <w:bookmarkStart w:id="69" w:name="attic-air-sealing-and-insulation"/>
-    <w:p>
-      <w:pPr>
-        <w:pStyle w:val="Heading3"/>
-      </w:pPr>
-      <w:r>
-        <w:t xml:space="preserve">6.9 Attic Air Sealing and Insulation</w:t>
-      </w:r>
-    </w:p>
-    <w:bookmarkEnd w:id="69"/>
-    <w:bookmarkStart w:id="70" w:name="blown-in-cellulose-wall-insulation"/>
-    <w:p>
-      <w:pPr>
-        <w:pStyle w:val="Heading3"/>
-      </w:pPr>
-      <w:r>
-        <w:t xml:space="preserve">6.10 Blown-in Cellulose Wall Insulation</w:t>
-      </w:r>
-    </w:p>
-    <w:bookmarkEnd w:id="70"/>
-    <w:bookmarkStart w:id="71" w:name="continuous-exterior-wall-insulation-1"/>
-    <w:p>
-      <w:pPr>
-        <w:pStyle w:val="Heading3"/>
-      </w:pPr>
-      <w:r>
-        <w:t xml:space="preserve">6.11 Continuous Exterior Wall Insulation</w:t>
-      </w:r>
-    </w:p>
-    <w:bookmarkEnd w:id="71"/>
-    <w:bookmarkStart w:id="72" w:name="air-source-heat-pump-1"/>
-    <w:p>
-      <w:pPr>
-        <w:pStyle w:val="Heading3"/>
-      </w:pPr>
-      <w:r>
-        <w:t xml:space="preserve">6.12 Air Source Heat Pump</w:t>
-      </w:r>
-    </w:p>
-    <w:bookmarkEnd w:id="72"/>
-    <w:bookmarkStart w:id="73" w:name="whole-house-surge-protection-1"/>
-    <w:p>
-      <w:pPr>
-        <w:pStyle w:val="Heading3"/>
-      </w:pPr>
-      <w:r>
-        <w:t xml:space="preserve">6.13 Whole-House Surge Protection</w:t>
-      </w:r>
-    </w:p>
-    <w:bookmarkEnd w:id="73"/>
-    <w:bookmarkStart w:id="74" w:name="pipe-insulation-1"/>
-    <w:p>
-      <w:pPr>
-        <w:pStyle w:val="Heading3"/>
-      </w:pPr>
-      <w:r>
-        <w:t xml:space="preserve">6.14 Pipe Insulation</w:t>
-      </w:r>
-    </w:p>
-    <w:bookmarkEnd w:id="74"/>
-    <w:bookmarkStart w:id="75" w:name="diy-air-sealing-1"/>
-    <w:p>
-      <w:pPr>
-        <w:pStyle w:val="Heading3"/>
-      </w:pPr>
-      <w:r>
-        <w:t xml:space="preserve">6.15 DIY Air Sealing</w:t>
-      </w:r>
-    </w:p>
-    <w:bookmarkEnd w:id="75"/>
-    <w:bookmarkStart w:id="76" w:name="misc.-air-sealing-and-insulation-1"/>
-    <w:p>
-      <w:pPr>
-        <w:pStyle w:val="Heading3"/>
-      </w:pPr>
-      <w:r>
-        <w:t xml:space="preserve">6.16 Misc. Air Sealing and Insulation</w:t>
-      </w:r>
-    </w:p>
-    <w:bookmarkEnd w:id="76"/>
-    <w:bookmarkStart w:id="77" w:name="replace-windows-1"/>
-    <w:p>
-      <w:pPr>
-        <w:pStyle w:val="Heading3"/>
-      </w:pPr>
-      <w:r>
-        <w:t xml:space="preserve">6.17 Replace Windows</w:t>
-      </w:r>
-    </w:p>
-    <w:bookmarkEnd w:id="77"/>
-    <w:bookmarkStart w:id="78" w:name="replace-doors-1"/>
-    <w:p>
-      <w:pPr>
-        <w:pStyle w:val="Heading3"/>
-      </w:pPr>
-      <w:r>
-        <w:t xml:space="preserve">6.18 Replace Doors</w:t>
-      </w:r>
-    </w:p>
-    <w:p>
-      <w:pPr>
-        <w:pStyle w:val="SourceCode"/>
-      </w:pPr>
-      <w:r>
-        <w:rPr>
-          <w:rStyle w:val="CommentTok"/>
-        </w:rPr>
-        <w:t xml:space="preserve"># if( window_dressers == TRUE){</w:t>
-      </w:r>
-      <w:r>
-        <w:br/>
-      </w:r>
-      <w:r>
-        <w:rPr>
-          <w:rStyle w:val="CommentTok"/>
-        </w:rPr>
-        <w:t xml:space="preserve">#   cat(ranked_sect_4_problem_text)</w:t>
-      </w:r>
-      <w:r>
-        <w:br/>
-      </w:r>
-      <w:r>
-        <w:rPr>
-          <w:rStyle w:val="CommentTok"/>
-        </w:rPr>
-        <w:t xml:space="preserve"># }else{</w:t>
-      </w:r>
-      <w:r>
-        <w:br/>
-      </w:r>
-      <w:r>
-        <w:rPr>
-          <w:rStyle w:val="CommentTok"/>
-        </w:rPr>
-        <w:t xml:space="preserve">#   cat("")</w:t>
-      </w:r>
-      <w:r>
-        <w:br/>
-      </w:r>
-      <w:r>
-        <w:rPr>
-          <w:rStyle w:val="CommentTok"/>
-        </w:rPr>
-        <w:t xml:space="preserve"># }</w:t>
-      </w:r>
-      <w:r>
-        <w:br/>
-      </w:r>
-      <w:r>
-        <w:rPr>
-          <w:rStyle w:val="CommentTok"/>
-        </w:rPr>
-        <w:t xml:space="preserve"># </w:t>
-      </w:r>
-      <w:r>
-        <w:br/>
-      </w:r>
-      <w:r>
-        <w:rPr>
-          <w:rStyle w:val="CommentTok"/>
-        </w:rPr>
-        <w:t xml:space="preserve"># if(window_dressers == TRUE){</w:t>
-      </w:r>
-      <w:r>
-        <w:br/>
-      </w:r>
-      <w:r>
-        <w:rPr>
-          <w:rStyle w:val="CommentTok"/>
-        </w:rPr>
-        <w:t xml:space="preserve">#   cat(auto_window_dressers$Description</w:t>
-      </w:r>
-      <w:r>
-        <w:br/>
-      </w:r>
-      <w:r>
-        <w:rPr>
-          <w:rStyle w:val="CommentTok"/>
-        </w:rPr>
-        <w:t xml:space="preserve">#     </w:t>
-      </w:r>
-      <w:r>
-        <w:br/>
-      </w:r>
-      <w:r>
-        <w:rPr>
-          <w:rStyle w:val="CommentTok"/>
-        </w:rPr>
-        <w:t xml:space="preserve">#   )</w:t>
-      </w:r>
-      <w:r>
-        <w:br/>
-      </w:r>
-      <w:r>
-        <w:rPr>
-          <w:rStyle w:val="CommentTok"/>
-        </w:rPr>
-        <w:t xml:space="preserve"># }else{</w:t>
-      </w:r>
-      <w:r>
-        <w:br/>
-      </w:r>
-      <w:r>
-        <w:rPr>
-          <w:rStyle w:val="CommentTok"/>
-        </w:rPr>
-        <w:t xml:space="preserve">#   cat("")</w:t>
-      </w:r>
-      <w:r>
-        <w:br/>
-      </w:r>
-      <w:r>
-        <w:rPr>
-          <w:rStyle w:val="CommentTok"/>
-        </w:rPr>
-        <w:t xml:space="preserve">#   }</w:t>
-      </w:r>
-      <w:r>
-        <w:br/>
-      </w:r>
-      <w:r>
-        <w:rPr>
-          <w:rStyle w:val="CommentTok"/>
-        </w:rPr>
-        <w:t xml:space="preserve"># </w:t>
-      </w:r>
-      <w:r>
-        <w:br/>
-      </w:r>
-      <w:r>
-        <w:rPr>
-          <w:rStyle w:val="CommentTok"/>
-        </w:rPr>
-        <w:t xml:space="preserve"># if(window_dressers == TRUE){</w:t>
-      </w:r>
-      <w:r>
-        <w:br/>
-      </w:r>
-      <w:r>
-        <w:rPr>
-          <w:rStyle w:val="CommentTok"/>
-        </w:rPr>
-        <w:t xml:space="preserve">#   cat("</w:t>
-      </w:r>
-      <w:r>
-        <w:br/>
-      </w:r>
-      <w:r>
-        <w:rPr>
-          <w:rStyle w:val="CommentTok"/>
-        </w:rPr>
-        <w:t xml:space="preserve"># *Estimated Cost/Benefits/Incentives*</w:t>
-      </w:r>
-      <w:r>
-        <w:br/>
-      </w:r>
-      <w:r>
-        <w:rPr>
-          <w:rStyle w:val="CommentTok"/>
-        </w:rPr>
-        <w:t xml:space="preserve"># </w:t>
-      </w:r>
-      <w:r>
-        <w:br/>
-      </w:r>
-      <w:r>
-        <w:rPr>
-          <w:rStyle w:val="CommentTok"/>
-        </w:rPr>
-        <w:t xml:space="preserve"># ",auto_window_dresserds_estimates$Description)</w:t>
-      </w:r>
-      <w:r>
-        <w:br/>
-      </w:r>
-      <w:r>
-        <w:rPr>
-          <w:rStyle w:val="CommentTok"/>
-        </w:rPr>
-        <w:t xml:space="preserve"># }else{</w:t>
-      </w:r>
-      <w:r>
-        <w:br/>
-      </w:r>
-      <w:r>
-        <w:rPr>
-          <w:rStyle w:val="CommentTok"/>
-        </w:rPr>
-        <w:t xml:space="preserve">#   cat("")</w:t>
-      </w:r>
-      <w:r>
-        <w:br/>
-      </w:r>
-      <w:r>
-        <w:rPr>
-          <w:rStyle w:val="CommentTok"/>
-        </w:rPr>
-        <w:t xml:space="preserve">#   }</w:t>
-      </w:r>
-      <w:r>
-        <w:br/>
-      </w:r>
-      <w:r>
-        <w:br/>
-      </w:r>
-      <w:r>
-        <w:rPr>
-          <w:rStyle w:val="NormalTok"/>
-        </w:rPr>
-        <w:t xml:space="preserve">df </w:t>
-      </w:r>
-      <w:r>
-        <w:rPr>
-          <w:rStyle w:val="OtherTok"/>
-        </w:rPr>
-        <w:t xml:space="preserve">&lt;-</w:t>
-      </w:r>
-      <w:r>
-        <w:rPr>
-          <w:rStyle w:val="NormalTok"/>
-        </w:rPr>
-        <w:t xml:space="preserve"> </w:t>
-      </w:r>
-      <w:r>
-        <w:rPr>
-          <w:rStyle w:val="FunctionTok"/>
-        </w:rPr>
-        <w:t xml:space="preserve">data.frame</w:t>
-      </w:r>
-      <w:r>
-        <w:rPr>
-          <w:rStyle w:val="NormalTok"/>
-        </w:rPr>
-        <w:t xml:space="preserve">(</w:t>
-      </w:r>
-      <w:r>
-        <w:br/>
-      </w:r>
-      <w:r>
-        <w:rPr>
-          <w:rStyle w:val="NormalTok"/>
-        </w:rPr>
-        <w:t xml:space="preserve">  </w:t>
-      </w:r>
-      <w:r>
-        <w:rPr>
-          <w:rStyle w:val="AttributeTok"/>
-        </w:rPr>
-        <w:t xml:space="preserve">Name =</w:t>
-      </w:r>
-      <w:r>
-        <w:rPr>
-          <w:rStyle w:val="NormalTok"/>
-        </w:rPr>
-        <w:t xml:space="preserve"> </w:t>
-      </w:r>
-      <w:r>
-        <w:rPr>
-          <w:rStyle w:val="FunctionTok"/>
-        </w:rPr>
-        <w:t xml:space="preserve">c</w:t>
-      </w:r>
-      <w:r>
-        <w:rPr>
-          <w:rStyle w:val="NormalTok"/>
-        </w:rPr>
-        <w:t xml:space="preserve">(</w:t>
-      </w:r>
-      <w:r>
-        <w:rPr>
-          <w:rStyle w:val="StringTok"/>
-        </w:rPr>
-        <w:t xml:space="preserve">"Alice"</w:t>
-      </w:r>
-      <w:r>
-        <w:rPr>
-          <w:rStyle w:val="NormalTok"/>
-        </w:rPr>
-        <w:t xml:space="preserve">, </w:t>
-      </w:r>
-      <w:r>
-        <w:rPr>
-          <w:rStyle w:val="StringTok"/>
-        </w:rPr>
-        <w:t xml:space="preserve">"Bob"</w:t>
-      </w:r>
-      <w:r>
-        <w:rPr>
-          <w:rStyle w:val="NormalTok"/>
-        </w:rPr>
-        <w:t xml:space="preserve">, </w:t>
-      </w:r>
-      <w:r>
-        <w:rPr>
-          <w:rStyle w:val="StringTok"/>
-        </w:rPr>
-        <w:t xml:space="preserve">"Carol"</w:t>
-      </w:r>
-      <w:r>
-        <w:rPr>
-          <w:rStyle w:val="NormalTok"/>
-        </w:rPr>
-        <w:t xml:space="preserve">, </w:t>
-      </w:r>
-      <w:r>
-        <w:rPr>
-          <w:rStyle w:val="StringTok"/>
-        </w:rPr>
-        <w:t xml:space="preserve">"Dave"</w:t>
-      </w:r>
-      <w:r>
-        <w:rPr>
-          <w:rStyle w:val="NormalTok"/>
-        </w:rPr>
-        <w:t xml:space="preserve">, </w:t>
-      </w:r>
-      <w:r>
-        <w:rPr>
-          <w:rStyle w:val="StringTok"/>
-        </w:rPr>
-        <w:t xml:space="preserve">"Eve"</w:t>
-      </w:r>
-      <w:r>
-        <w:rPr>
-          <w:rStyle w:val="NormalTok"/>
-        </w:rPr>
-        <w:t xml:space="preserve">, </w:t>
-      </w:r>
-      <w:r>
-        <w:rPr>
-          <w:rStyle w:val="StringTok"/>
-        </w:rPr>
-        <w:t xml:space="preserve">"Frank"</w:t>
-      </w:r>
-      <w:r>
-        <w:rPr>
-          <w:rStyle w:val="NormalTok"/>
-        </w:rPr>
-        <w:t xml:space="preserve">),</w:t>
-      </w:r>
-      <w:r>
-        <w:br/>
-      </w:r>
-      <w:r>
-        <w:rPr>
-          <w:rStyle w:val="NormalTok"/>
-        </w:rPr>
-        <w:t xml:space="preserve">  </w:t>
-      </w:r>
-      <w:r>
-        <w:rPr>
-          <w:rStyle w:val="AttributeTok"/>
-        </w:rPr>
-        <w:t xml:space="preserve">Score =</w:t>
-      </w:r>
-      <w:r>
-        <w:rPr>
-          <w:rStyle w:val="NormalTok"/>
-        </w:rPr>
-        <w:t xml:space="preserve"> </w:t>
-      </w:r>
-      <w:r>
-        <w:rPr>
-          <w:rStyle w:val="FunctionTok"/>
-        </w:rPr>
-        <w:t xml:space="preserve">c</w:t>
-      </w:r>
-      <w:r>
-        <w:rPr>
-          <w:rStyle w:val="NormalTok"/>
-        </w:rPr>
-        <w:t xml:space="preserve">(</w:t>
-      </w:r>
-      <w:r>
-        <w:rPr>
-          <w:rStyle w:val="DecValTok"/>
-        </w:rPr>
-        <w:t xml:space="preserve">90</w:t>
-      </w:r>
-      <w:r>
-        <w:rPr>
-          <w:rStyle w:val="NormalTok"/>
-        </w:rPr>
-        <w:t xml:space="preserve">, </w:t>
-      </w:r>
-      <w:r>
-        <w:rPr>
-          <w:rStyle w:val="DecValTok"/>
-        </w:rPr>
-        <w:t xml:space="preserve">85</w:t>
-      </w:r>
-      <w:r>
-        <w:rPr>
-          <w:rStyle w:val="NormalTok"/>
-        </w:rPr>
-        <w:t xml:space="preserve">, </w:t>
-      </w:r>
-      <w:r>
-        <w:rPr>
-          <w:rStyle w:val="DecValTok"/>
-        </w:rPr>
-        <w:t xml:space="preserve">88</w:t>
-      </w:r>
-      <w:r>
-        <w:rPr>
-          <w:rStyle w:val="NormalTok"/>
-        </w:rPr>
-        <w:t xml:space="preserve">, </w:t>
-      </w:r>
-      <w:r>
-        <w:rPr>
-          <w:rStyle w:val="DecValTok"/>
-        </w:rPr>
-        <w:t xml:space="preserve">92</w:t>
-      </w:r>
-      <w:r>
-        <w:rPr>
-          <w:rStyle w:val="NormalTok"/>
-        </w:rPr>
-        <w:t xml:space="preserve">, </w:t>
-      </w:r>
-      <w:r>
-        <w:rPr>
-          <w:rStyle w:val="DecValTok"/>
-        </w:rPr>
-        <w:t xml:space="preserve">95</w:t>
-      </w:r>
-      <w:r>
-        <w:rPr>
-          <w:rStyle w:val="NormalTok"/>
-        </w:rPr>
-        <w:t xml:space="preserve">, </w:t>
-      </w:r>
-      <w:r>
-        <w:rPr>
-          <w:rStyle w:val="DecValTok"/>
-        </w:rPr>
-        <w:t xml:space="preserve">87</w:t>
-      </w:r>
-      <w:r>
-        <w:rPr>
-          <w:rStyle w:val="NormalTok"/>
-        </w:rPr>
-        <w:t xml:space="preserve">)</w:t>
-      </w:r>
-      <w:r>
-        <w:br/>
-      </w:r>
-      <w:r>
-        <w:rPr>
-          <w:rStyle w:val="NormalTok"/>
-        </w:rPr>
-        <w:t xml:space="preserve">)</w:t>
-      </w:r>
-      <w:r>
-        <w:br/>
-      </w:r>
-      <w:r>
-        <w:br/>
-      </w:r>
-      <w:r>
-        <w:rPr>
-          <w:rStyle w:val="CommentTok"/>
-        </w:rPr>
-        <w:t xml:space="preserve"># Specific rows to print</w:t>
-      </w:r>
-      <w:r>
-        <w:br/>
-      </w:r>
-      <w:r>
-        <w:rPr>
-          <w:rStyle w:val="NormalTok"/>
-        </w:rPr>
-        <w:t xml:space="preserve">rows_to_print </w:t>
-      </w:r>
-      <w:r>
-        <w:rPr>
-          <w:rStyle w:val="OtherTok"/>
-        </w:rPr>
-        <w:t xml:space="preserve">&lt;-</w:t>
-      </w:r>
-      <w:r>
-        <w:rPr>
-          <w:rStyle w:val="NormalTok"/>
-        </w:rPr>
-        <w:t xml:space="preserve"> </w:t>
-      </w:r>
-      <w:r>
-        <w:rPr>
-          <w:rStyle w:val="FunctionTok"/>
-        </w:rPr>
-        <w:t xml:space="preserve">c</w:t>
-      </w:r>
-      <w:r>
-        <w:rPr>
-          <w:rStyle w:val="NormalTok"/>
-        </w:rPr>
-        <w:t xml:space="preserve">(</w:t>
-      </w:r>
-      <w:r>
-        <w:rPr>
-          <w:rStyle w:val="DecValTok"/>
-        </w:rPr>
-        <w:t xml:space="preserve">2</w:t>
-      </w:r>
-      <w:r>
-        <w:rPr>
-          <w:rStyle w:val="NormalTok"/>
-        </w:rPr>
-        <w:t xml:space="preserve">, </w:t>
-      </w:r>
-      <w:r>
-        <w:rPr>
-          <w:rStyle w:val="DecValTok"/>
-        </w:rPr>
-        <w:t xml:space="preserve">4</w:t>
-      </w:r>
-      <w:r>
-        <w:rPr>
-          <w:rStyle w:val="NormalTok"/>
-        </w:rPr>
-        <w:t xml:space="preserve">, </w:t>
-      </w:r>
-      <w:r>
-        <w:rPr>
-          <w:rStyle w:val="DecValTok"/>
-        </w:rPr>
-        <w:t xml:space="preserve">6</w:t>
-      </w:r>
-      <w:r>
-        <w:rPr>
-          <w:rStyle w:val="NormalTok"/>
-        </w:rPr>
-        <w:t xml:space="preserve">)</w:t>
-      </w:r>
-      <w:r>
-        <w:br/>
-      </w:r>
-      <w:r>
-        <w:br/>
-      </w:r>
-      <w:r>
-        <w:rPr>
-          <w:rStyle w:val="ControlFlowTok"/>
-        </w:rPr>
-        <w:t xml:space="preserve">for</w:t>
-      </w:r>
-      <w:r>
-        <w:rPr>
-          <w:rStyle w:val="NormalTok"/>
-        </w:rPr>
-        <w:t xml:space="preserve"> (i </w:t>
-      </w:r>
-      <w:r>
-        <w:rPr>
-          <w:rStyle w:val="ControlFlowTok"/>
-        </w:rPr>
-        <w:t xml:space="preserve">in</w:t>
-      </w:r>
-      <w:r>
-        <w:rPr>
-          <w:rStyle w:val="NormalTok"/>
-        </w:rPr>
-        <w:t xml:space="preserve"> rows_to_print) {</w:t>
-      </w:r>
-      <w:r>
-        <w:br/>
-      </w:r>
-      <w:r>
-        <w:rPr>
-          <w:rStyle w:val="NormalTok"/>
-        </w:rPr>
-        <w:t xml:space="preserve">  </w:t>
-      </w:r>
-      <w:r>
-        <w:rPr>
-          <w:rStyle w:val="FunctionTok"/>
-        </w:rPr>
-        <w:t xml:space="preserve">cat</w:t>
-      </w:r>
-      <w:r>
-        <w:rPr>
-          <w:rStyle w:val="NormalTok"/>
-        </w:rPr>
-        <w:t xml:space="preserve">(</w:t>
-      </w:r>
-      <w:r>
-        <w:rPr>
-          <w:rStyle w:val="StringTok"/>
-        </w:rPr>
-        <w:t xml:space="preserve">"Row"</w:t>
-      </w:r>
-      <w:r>
-        <w:rPr>
-          <w:rStyle w:val="NormalTok"/>
-        </w:rPr>
-        <w:t xml:space="preserve">, i, </w:t>
-      </w:r>
-      <w:r>
-        <w:rPr>
-          <w:rStyle w:val="StringTok"/>
-        </w:rPr>
-        <w:t xml:space="preserve">": Name ="</w:t>
-      </w:r>
-      <w:r>
-        <w:rPr>
-          <w:rStyle w:val="NormalTok"/>
-        </w:rPr>
-        <w:t xml:space="preserve">, df</w:t>
-      </w:r>
-      <w:r>
-        <w:rPr>
-          <w:rStyle w:val="SpecialCharTok"/>
-        </w:rPr>
-        <w:t xml:space="preserve">$</w:t>
-      </w:r>
-      <w:r>
-        <w:rPr>
-          <w:rStyle w:val="NormalTok"/>
-        </w:rPr>
-        <w:t xml:space="preserve">Name[i], </w:t>
-      </w:r>
-      <w:r>
-        <w:rPr>
-          <w:rStyle w:val="StringTok"/>
-        </w:rPr>
-        <w:t xml:space="preserve">", Score ="</w:t>
-      </w:r>
-      <w:r>
-        <w:rPr>
-          <w:rStyle w:val="NormalTok"/>
-        </w:rPr>
-        <w:t xml:space="preserve">, df</w:t>
-      </w:r>
-      <w:r>
-        <w:rPr>
-          <w:rStyle w:val="SpecialCharTok"/>
-        </w:rPr>
-        <w:t xml:space="preserve">$</w:t>
-      </w:r>
-      <w:r>
-        <w:rPr>
-          <w:rStyle w:val="NormalTok"/>
-        </w:rPr>
-        <w:t xml:space="preserve">Score[i], </w:t>
-      </w:r>
-      <w:r>
-        <w:rPr>
-          <w:rStyle w:val="StringTok"/>
-        </w:rPr>
-        <w:t xml:space="preserve">"</w:t>
-      </w:r>
-      <w:r>
-        <w:rPr>
-          <w:rStyle w:val="SpecialCharTok"/>
-        </w:rPr>
-        <w:t xml:space="preserve">\n</w:t>
-      </w:r>
-      <w:r>
-        <w:br/>
-      </w:r>
-      <w:r>
-        <w:rPr>
-          <w:rStyle w:val="StringTok"/>
-        </w:rPr>
-        <w:t xml:space="preserve">      </w:t>
-      </w:r>
-      <w:r>
-        <w:br/>
-      </w:r>
-      <w:r>
-        <w:rPr>
-          <w:rStyle w:val="StringTok"/>
-        </w:rPr>
-        <w:t xml:space="preserve">      "</w:t>
-      </w:r>
-      <w:r>
-        <w:rPr>
-          <w:rStyle w:val="NormalTok"/>
-        </w:rPr>
-        <w:t xml:space="preserve">)</w:t>
-      </w:r>
-      <w:r>
-        <w:br/>
-      </w:r>
-      <w:r>
-        <w:rPr>
-          <w:rStyle w:val="NormalTok"/>
-        </w:rPr>
-        <w:t xml:space="preserve">}</w:t>
-      </w:r>
-    </w:p>
-    <w:p>
-      <w:pPr>
-        <w:pStyle w:val="FirstParagraph"/>
-      </w:pPr>
-      <w:r>
-        <w:t xml:space="preserve">Row 2 : Name = Bob , Score = 85</w:t>
-      </w:r>
-    </w:p>
-    <w:p>
-      <w:pPr>
-        <w:pStyle w:val="SourceCode"/>
-      </w:pPr>
-      <w:r>
-        <w:rPr>
-          <w:rStyle w:val="VerbatimChar"/>
-        </w:rPr>
-        <w:t xml:space="preserve">  Row 4 : Name = Dave , Score = 92 </w:t>
-      </w:r>
-      <w:r>
-        <w:br/>
-      </w:r>
-      <w:r>
-        <w:br/>
-      </w:r>
-      <w:r>
-        <w:br/>
-      </w:r>
-      <w:r>
-        <w:rPr>
-          <w:rStyle w:val="VerbatimChar"/>
-        </w:rPr>
-        <w:t xml:space="preserve">  Row 6 : Name = Frank , Score = 87 </w:t>
-      </w:r>
-    </w:p>
-    <w:p>
-      <w:pPr>
-        <w:pStyle w:val="SourceCode"/>
-      </w:pPr>
-      <w:r>
-        <w:rPr>
-          <w:rStyle w:val="CommentTok"/>
-        </w:rPr>
-        <w:t xml:space="preserve"># cat("###", ranked_sect_4_problem_text$Recommendations[i] , "\n"</w:t>
-      </w:r>
-      <w:r>
-        <w:br/>
-      </w:r>
-      <w:r>
-        <w:rPr>
-          <w:rStyle w:val="CommentTok"/>
-        </w:rPr>
-        <w:t xml:space="preserve">#      ,</w:t>
-      </w:r>
-      <w:r>
-        <w:br/>
-      </w:r>
-      <w:r>
-        <w:rPr>
-          <w:rStyle w:val="CommentTok"/>
-        </w:rPr>
-        <w:t xml:space="preserve">#   </w:t>
-      </w:r>
-      <w:r>
-        <w:br/>
-      </w:r>
-      <w:r>
-        <w:rPr>
-          <w:rStyle w:val="CommentTok"/>
-        </w:rPr>
-        <w:t xml:space="preserve"># "*Problem*", i ,"\n")</w:t>
-      </w:r>
-    </w:p>
-    <w:bookmarkEnd w:id="78"/>
-    <w:bookmarkEnd w:id="79"/>
+      <w:r>
+        <w:t xml:space="preserve"># cat(”</w:t>
+      </w:r>
+    </w:p>
+    <w:bookmarkEnd w:id="50"/>
+    <w:bookmarkEnd w:id="51"/>
     <w:sectPr>
       <w:footerReference r:id="rId9" w:type="default"/>
       <w:pgSz w:h="15840" w:w="12240"/>

</xml_diff>

<commit_message>
Render Dan & Katy Fernald audit report
</commit_message>
<xml_diff>
--- a/Quarto_report/Audit_Report.docx
+++ b/Quarto_report/Audit_Report.docx
@@ -15,31 +15,31 @@
         <w:pStyle w:val="FirstParagraph"/>
       </w:pPr>
       <w:r>
-        <w:t xml:space="preserve">Homeowner(s): Bonnie Collins</w:t>
-      </w:r>
-    </w:p>
-    <w:p>
-      <w:pPr>
-        <w:pStyle w:val="BodyText"/>
-      </w:pPr>
-      <w:r>
-        <w:t xml:space="preserve">Address: 23 Wekosos Lane, Pleasent Point, Maine, 04667</w:t>
-      </w:r>
-    </w:p>
-    <w:p>
-      <w:pPr>
-        <w:pStyle w:val="BodyText"/>
-      </w:pPr>
-      <w:r>
-        <w:t xml:space="preserve">Owner Contact: n/a, 207-904-9484</w:t>
-      </w:r>
-    </w:p>
-    <w:p>
-      <w:pPr>
-        <w:pStyle w:val="BodyText"/>
-      </w:pPr>
-      <w:r>
-        <w:t xml:space="preserve">Auditors: Helen Lloyd, Tyler Hebert</w:t>
+        <w:t xml:space="preserve">Homeowner(s): Dan Fernald, Katy Fernald</w:t>
+      </w:r>
+    </w:p>
+    <w:p>
+      <w:pPr>
+        <w:pStyle w:val="BodyText"/>
+      </w:pPr>
+      <w:r>
+        <w:t xml:space="preserve">Address: 16 Mosswood Rd Islesford, ME 04646</w:t>
+      </w:r>
+    </w:p>
+    <w:p>
+      <w:pPr>
+        <w:pStyle w:val="BodyText"/>
+      </w:pPr>
+      <w:r>
+        <w:t xml:space="preserve">Owner Contact: islesfordartists@gmail.com, (207) 244-3145</w:t>
+      </w:r>
+    </w:p>
+    <w:p>
+      <w:pPr>
+        <w:pStyle w:val="BodyText"/>
+      </w:pPr>
+      <w:r>
+        <w:t xml:space="preserve">Auditors: David Gibson, Pema Lhundrup, Mabon Young, Rashmi Mohan</w:t>
       </w:r>
     </w:p>
     <w:p>
@@ -55,7 +55,7 @@
         <w:pStyle w:val="BodyText"/>
       </w:pPr>
       <w:r>
-        <w:t xml:space="preserve">Report Date: June 20, 2025</w:t>
+        <w:t xml:space="preserve">Report Date: June 24, 2025</w:t>
       </w:r>
     </w:p>
     <w:p>
@@ -70,7 +70,7 @@
         <w:pStyle w:val="FirstParagraph"/>
       </w:pPr>
       <w:r>
-        <w:t xml:space="preserve">We conducted an energy assessment of your home on 6/19/2025. This report will tell you what we did, what we found, and what we suggest for your home. These suggestions include information on incentives and financing to make improvements more affordable.</w:t>
+        <w:t xml:space="preserve">We conducted an energy assessment of your home on 6/23/2025. This report will tell you what we did, what we found, and what we suggest for your home. These suggestions include information on incentives and financing to make improvements more affordable.</w:t>
       </w:r>
     </w:p>
     <w:p>
@@ -234,7 +234,7 @@
         <w:pStyle w:val="FirstParagraph"/>
       </w:pPr>
       <w:r>
-        <w:t xml:space="preserve">We assessed combustion appliances that burn fossil fuels such as propane, heating oil, or kerosene. These include furnaces, boilers, water heaters, and gas ovens. We visually inspected the combustion appliance(s) in your home, but we were unable to perform combustion safety tests.</w:t>
+        <w:t xml:space="preserve">We assessed combustion appliances that burn fossil fuels such as propane, heating oil, or kerosene. These include furnaces, boilers, water heaters, and gas ovens. We visually inspected the combustion appliance(s) in your home, as well as conducted combustion safety tests. This included measuring for carbon monoxide and testing that flue gases are properly exhausting from the home. We also performed gas leak detection tests on your propane appliance(s).</w:t>
       </w:r>
     </w:p>
     <w:bookmarkEnd w:id="27"/>
@@ -344,31 +344,31 @@
                 <w:rFonts w:ascii="Calibri" w:hAnsi="Calibri"/>
                 <w:sz w:val="20"/>
               </w:rPr>
-              <w:t xml:space="default">Replace Windows</w:t>
-            </w:r>
-          </w:p>
-        </w:tc>
-        <w:tc>
-          <w:tcPr>
-            <w:tcBorders>
-              <w:top w:val="single" w:space="0" w:color="D3D3D3"/>
-              <w:bottom w:val="single" w:space="0" w:color="D3D3D3"/>
-              <w:start w:val="single" w:space="0" w:color="D3D3D3"/>
-              <w:end w:val="single" w:space="0" w:color="D3D3D3"/>
-            </w:tcBorders>
-          </w:tcPr>
-          <w:p>
-            <w:pPr>
-              <w:spacing w:before="0" w:after="60"/>
-              <w:keepNext/>
-              <w:jc w:val="start"/>
-            </w:pPr>
-            <w:r>
-              <w:rPr>
-                <w:rFonts w:ascii="Calibri" w:hAnsi="Calibri"/>
-                <w:sz w:val="20"/>
-              </w:rPr>
-              <w:t xml:space="default">Replace single-paned windows with double- or triple-paned windows and ensure the frames are airsealed. We recommend installing windows that are Energy Star certified for 'Northern' climate.</w:t>
+              <w:t xml:space="default">Furnace/Boiler Tune-up</w:t>
+            </w:r>
+          </w:p>
+        </w:tc>
+        <w:tc>
+          <w:tcPr>
+            <w:tcBorders>
+              <w:top w:val="single" w:space="0" w:color="D3D3D3"/>
+              <w:bottom w:val="single" w:space="0" w:color="D3D3D3"/>
+              <w:start w:val="single" w:space="0" w:color="D3D3D3"/>
+              <w:end w:val="single" w:space="0" w:color="D3D3D3"/>
+            </w:tcBorders>
+          </w:tcPr>
+          <w:p>
+            <w:pPr>
+              <w:spacing w:before="0" w:after="60"/>
+              <w:keepNext/>
+              <w:jc w:val="start"/>
+            </w:pPr>
+            <w:r>
+              <w:rPr>
+                <w:rFonts w:ascii="Calibri" w:hAnsi="Calibri"/>
+                <w:sz w:val="20"/>
+              </w:rPr>
+              <w:t xml:space="default">Have the furnace/boiler and flue inspected and adjusted by a licensed professional. This should be available from your fuel delivery company.</w:t>
             </w:r>
           </w:p>
         </w:tc>
@@ -397,31 +397,31 @@
                 <w:rFonts w:ascii="Calibri" w:hAnsi="Calibri"/>
                 <w:sz w:val="20"/>
               </w:rPr>
-              <w:t xml:space="default">Misc. Air Sealing and Insulation</w:t>
-            </w:r>
-          </w:p>
-        </w:tc>
-        <w:tc>
-          <w:tcPr>
-            <w:tcBorders>
-              <w:top w:val="single" w:space="0" w:color="D3D3D3"/>
-              <w:bottom w:val="single" w:space="0" w:color="D3D3D3"/>
-              <w:start w:val="single" w:space="0" w:color="D3D3D3"/>
-              <w:end w:val="single" w:space="0" w:color="D3D3D3"/>
-            </w:tcBorders>
-          </w:tcPr>
-          <w:p>
-            <w:pPr>
-              <w:spacing w:before="0" w:after="60"/>
-              <w:keepNext/>
-              <w:jc w:val="start"/>
-            </w:pPr>
-            <w:r>
-              <w:rPr>
-                <w:rFonts w:ascii="Calibri" w:hAnsi="Calibri"/>
-                <w:sz w:val="20"/>
-              </w:rPr>
-              <w:t xml:space="default">Air seal and insulate [** insert auditor description - bay window, bulkhead door, chase, kneewall, anything else that is unique to the home and not otherwise covered in another recommendation]</w:t>
+              <w:t xml:space="default">High-efficiency Shower Head(s)</w:t>
+            </w:r>
+          </w:p>
+        </w:tc>
+        <w:tc>
+          <w:tcPr>
+            <w:tcBorders>
+              <w:top w:val="single" w:space="0" w:color="D3D3D3"/>
+              <w:bottom w:val="single" w:space="0" w:color="D3D3D3"/>
+              <w:start w:val="single" w:space="0" w:color="D3D3D3"/>
+              <w:end w:val="single" w:space="0" w:color="D3D3D3"/>
+            </w:tcBorders>
+          </w:tcPr>
+          <w:p>
+            <w:pPr>
+              <w:spacing w:before="0" w:after="60"/>
+              <w:keepNext/>
+              <w:jc w:val="start"/>
+            </w:pPr>
+            <w:r>
+              <w:rPr>
+                <w:rFonts w:ascii="Calibri" w:hAnsi="Calibri"/>
+                <w:sz w:val="20"/>
+              </w:rPr>
+              <w:t xml:space="default">Install high-efficiency shower heads to reduce the amount of water and energy to heat the water used when showering.</w:t>
             </w:r>
           </w:p>
         </w:tc>
@@ -450,31 +450,31 @@
                 <w:rFonts w:ascii="Calibri" w:hAnsi="Calibri"/>
                 <w:sz w:val="20"/>
               </w:rPr>
-              <w:t xml:space="default">DIY Air Sealing</w:t>
-            </w:r>
-          </w:p>
-        </w:tc>
-        <w:tc>
-          <w:tcPr>
-            <w:tcBorders>
-              <w:top w:val="single" w:space="0" w:color="D3D3D3"/>
-              <w:bottom w:val="single" w:space="0" w:color="D3D3D3"/>
-              <w:start w:val="single" w:space="0" w:color="D3D3D3"/>
-              <w:end w:val="single" w:space="0" w:color="D3D3D3"/>
-            </w:tcBorders>
-          </w:tcPr>
-          <w:p>
-            <w:pPr>
-              <w:spacing w:before="0" w:after="60"/>
-              <w:keepNext/>
-              <w:jc w:val="start"/>
-            </w:pPr>
-            <w:r>
-              <w:rPr>
-                <w:rFonts w:ascii="Calibri" w:hAnsi="Calibri"/>
-                <w:sz w:val="20"/>
-              </w:rPr>
-              <w:t xml:space="default">Seal easy-to-access air leaks and weatherstrip exterior doors.</w:t>
+              <w:t xml:space="default">WindowDressers</w:t>
+            </w:r>
+          </w:p>
+        </w:tc>
+        <w:tc>
+          <w:tcPr>
+            <w:tcBorders>
+              <w:top w:val="single" w:space="0" w:color="D3D3D3"/>
+              <w:bottom w:val="single" w:space="0" w:color="D3D3D3"/>
+              <w:start w:val="single" w:space="0" w:color="D3D3D3"/>
+              <w:end w:val="single" w:space="0" w:color="D3D3D3"/>
+            </w:tcBorders>
+          </w:tcPr>
+          <w:p>
+            <w:pPr>
+              <w:spacing w:before="0" w:after="60"/>
+              <w:keepNext/>
+              <w:jc w:val="start"/>
+            </w:pPr>
+            <w:r>
+              <w:rPr>
+                <w:rFonts w:ascii="Calibri" w:hAnsi="Calibri"/>
+                <w:sz w:val="20"/>
+              </w:rPr>
+              <w:t xml:space="default">WindowDressers are insulating window inserts that help air-seal windows and reduce heat loss and gain.</w:t>
             </w:r>
           </w:p>
         </w:tc>
@@ -503,31 +503,31 @@
                 <w:rFonts w:ascii="Calibri" w:hAnsi="Calibri"/>
                 <w:sz w:val="20"/>
               </w:rPr>
-              <w:t xml:space="default">Pipe Insulation</w:t>
-            </w:r>
-          </w:p>
-        </w:tc>
-        <w:tc>
-          <w:tcPr>
-            <w:tcBorders>
-              <w:top w:val="single" w:space="0" w:color="D3D3D3"/>
-              <w:bottom w:val="single" w:space="0" w:color="D3D3D3"/>
-              <w:start w:val="single" w:space="0" w:color="D3D3D3"/>
-              <w:end w:val="single" w:space="0" w:color="D3D3D3"/>
-            </w:tcBorders>
-          </w:tcPr>
-          <w:p>
-            <w:pPr>
-              <w:spacing w:before="0" w:after="60"/>
-              <w:keepNext/>
-              <w:jc w:val="start"/>
-            </w:pPr>
-            <w:r>
-              <w:rPr>
-                <w:rFonts w:ascii="Calibri" w:hAnsi="Calibri"/>
-                <w:sz w:val="20"/>
-              </w:rPr>
-              <w:t xml:space="default">Insulate both hot and cold water pipes that are uninsulated in the basement/crawlspace. This will save energy and prevent condensation.</w:t>
+              <w:t xml:space="default">Freezer</w:t>
+            </w:r>
+          </w:p>
+        </w:tc>
+        <w:tc>
+          <w:tcPr>
+            <w:tcBorders>
+              <w:top w:val="single" w:space="0" w:color="D3D3D3"/>
+              <w:bottom w:val="single" w:space="0" w:color="D3D3D3"/>
+              <w:start w:val="single" w:space="0" w:color="D3D3D3"/>
+              <w:end w:val="single" w:space="0" w:color="D3D3D3"/>
+            </w:tcBorders>
+          </w:tcPr>
+          <w:p>
+            <w:pPr>
+              <w:spacing w:before="0" w:after="60"/>
+              <w:keepNext/>
+              <w:jc w:val="start"/>
+            </w:pPr>
+            <w:r>
+              <w:rPr>
+                <w:rFonts w:ascii="Calibri" w:hAnsi="Calibri"/>
+                <w:sz w:val="20"/>
+              </w:rPr>
+              <w:t xml:space="default">Replace your freezer with a new, EnergyStar certified freezer. Look at the Energy Guide label to compare the energy use of new freezers.</w:t>
             </w:r>
           </w:p>
         </w:tc>
@@ -556,31 +556,31 @@
                 <w:rFonts w:ascii="Calibri" w:hAnsi="Calibri"/>
                 <w:sz w:val="20"/>
               </w:rPr>
-              <w:t xml:space="default">Whole-House Surge Protection</w:t>
-            </w:r>
-          </w:p>
-        </w:tc>
-        <w:tc>
-          <w:tcPr>
-            <w:tcBorders>
-              <w:top w:val="single" w:space="0" w:color="D3D3D3"/>
-              <w:bottom w:val="single" w:space="0" w:color="D3D3D3"/>
-              <w:start w:val="single" w:space="0" w:color="D3D3D3"/>
-              <w:end w:val="single" w:space="0" w:color="D3D3D3"/>
-            </w:tcBorders>
-          </w:tcPr>
-          <w:p>
-            <w:pPr>
-              <w:spacing w:before="0" w:after="60"/>
-              <w:keepNext/>
-              <w:jc w:val="start"/>
-            </w:pPr>
-            <w:r>
-              <w:rPr>
-                <w:rFonts w:ascii="Calibri" w:hAnsi="Calibri"/>
-                <w:sz w:val="20"/>
-              </w:rPr>
-              <w:t xml:space="default">Upgrade your electrical panel to add whole-house surge protection.</w:t>
+              <w:t xml:space="default">Induction Stove/Oven</w:t>
+            </w:r>
+          </w:p>
+        </w:tc>
+        <w:tc>
+          <w:tcPr>
+            <w:tcBorders>
+              <w:top w:val="single" w:space="0" w:color="D3D3D3"/>
+              <w:bottom w:val="single" w:space="0" w:color="D3D3D3"/>
+              <w:start w:val="single" w:space="0" w:color="D3D3D3"/>
+              <w:end w:val="single" w:space="0" w:color="D3D3D3"/>
+            </w:tcBorders>
+          </w:tcPr>
+          <w:p>
+            <w:pPr>
+              <w:spacing w:before="0" w:after="60"/>
+              <w:keepNext/>
+              <w:jc w:val="start"/>
+            </w:pPr>
+            <w:r>
+              <w:rPr>
+                <w:rFonts w:ascii="Calibri" w:hAnsi="Calibri"/>
+                <w:sz w:val="20"/>
+              </w:rPr>
+              <w:t xml:space="default">Induction cooking appliances are more efficient and safer than electric or gas ones. There is no risk of carbon monoxide or other harmful combustion gases, and the surface doesn’t heat up without a pot or pan on it.</w:t>
             </w:r>
           </w:p>
         </w:tc>
@@ -609,31 +609,31 @@
                 <w:rFonts w:ascii="Calibri" w:hAnsi="Calibri"/>
                 <w:sz w:val="20"/>
               </w:rPr>
-              <w:t xml:space="default">Air Source Heat Pump</w:t>
-            </w:r>
-          </w:p>
-        </w:tc>
-        <w:tc>
-          <w:tcPr>
-            <w:tcBorders>
-              <w:top w:val="single" w:space="0" w:color="D3D3D3"/>
-              <w:bottom w:val="single" w:space="0" w:color="D3D3D3"/>
-              <w:start w:val="single" w:space="0" w:color="D3D3D3"/>
-              <w:end w:val="single" w:space="0" w:color="D3D3D3"/>
-            </w:tcBorders>
-          </w:tcPr>
-          <w:p>
-            <w:pPr>
-              <w:spacing w:before="0" w:after="60"/>
-              <w:keepNext/>
-              <w:jc w:val="start"/>
-            </w:pPr>
-            <w:r>
-              <w:rPr>
-                <w:rFonts w:ascii="Calibri" w:hAnsi="Calibri"/>
-                <w:sz w:val="20"/>
-              </w:rPr>
-              <w:t xml:space="default">Install air source heat pumps and whole-house surge protection.</w:t>
+              <w:t xml:space="default">Bathroom Exhaust Fan(s)</w:t>
+            </w:r>
+          </w:p>
+        </w:tc>
+        <w:tc>
+          <w:tcPr>
+            <w:tcBorders>
+              <w:top w:val="single" w:space="0" w:color="D3D3D3"/>
+              <w:bottom w:val="single" w:space="0" w:color="D3D3D3"/>
+              <w:start w:val="single" w:space="0" w:color="D3D3D3"/>
+              <w:end w:val="single" w:space="0" w:color="D3D3D3"/>
+            </w:tcBorders>
+          </w:tcPr>
+          <w:p>
+            <w:pPr>
+              <w:spacing w:before="0" w:after="60"/>
+              <w:keepNext/>
+              <w:jc w:val="start"/>
+            </w:pPr>
+            <w:r>
+              <w:rPr>
+                <w:rFonts w:ascii="Calibri" w:hAnsi="Calibri"/>
+                <w:sz w:val="20"/>
+              </w:rPr>
+              <w:t xml:space="default">Install bathroom exhaust fans in all bathrooms that do not have them. These should be rated for at least 80 cubic feet per minute (CFM) if there is a shower. We recommend the Panasonic Whisper series or similar fans that don’t create excess noise.</w:t>
             </w:r>
           </w:p>
         </w:tc>
@@ -662,31 +662,31 @@
                 <w:rFonts w:ascii="Calibri" w:hAnsi="Calibri"/>
                 <w:sz w:val="20"/>
               </w:rPr>
-              <w:t xml:space="default">Electrical Panel Upgrade</w:t>
-            </w:r>
-          </w:p>
-        </w:tc>
-        <w:tc>
-          <w:tcPr>
-            <w:tcBorders>
-              <w:top w:val="single" w:space="0" w:color="D3D3D3"/>
-              <w:bottom w:val="single" w:space="0" w:color="D3D3D3"/>
-              <w:start w:val="single" w:space="0" w:color="D3D3D3"/>
-              <w:end w:val="single" w:space="0" w:color="D3D3D3"/>
-            </w:tcBorders>
-          </w:tcPr>
-          <w:p>
-            <w:pPr>
-              <w:spacing w:before="0" w:after="60"/>
-              <w:keepNext/>
-              <w:jc w:val="start"/>
-            </w:pPr>
-            <w:r>
-              <w:rPr>
-                <w:rFonts w:ascii="Calibri" w:hAnsi="Calibri"/>
-                <w:sz w:val="20"/>
-              </w:rPr>
-              <w:t xml:space="default">Consult with an electrician about replacing your existing electrical panel with a 200 amp panel as you add electrical appliances to your home.</w:t>
+              <w:t xml:space="default">Kitchen Exhaust Fan</w:t>
+            </w:r>
+          </w:p>
+        </w:tc>
+        <w:tc>
+          <w:tcPr>
+            <w:tcBorders>
+              <w:top w:val="single" w:space="0" w:color="D3D3D3"/>
+              <w:bottom w:val="single" w:space="0" w:color="D3D3D3"/>
+              <w:start w:val="single" w:space="0" w:color="D3D3D3"/>
+              <w:end w:val="single" w:space="0" w:color="D3D3D3"/>
+            </w:tcBorders>
+          </w:tcPr>
+          <w:p>
+            <w:pPr>
+              <w:spacing w:before="0" w:after="60"/>
+              <w:keepNext/>
+              <w:jc w:val="start"/>
+            </w:pPr>
+            <w:r>
+              <w:rPr>
+                <w:rFonts w:ascii="Calibri" w:hAnsi="Calibri"/>
+                <w:sz w:val="20"/>
+              </w:rPr>
+              <w:t xml:space="default">Install a kitchen exhaust fan to remove cooking fumes and moisture from your home. The fan should be rated for at least 100 cubic feet per minute. A kitchen fan should be ducted to the outdoors. If the ductwork will run through the attic, it should be installed before the attic is air-sealed and insulated.</w:t>
             </w:r>
           </w:p>
         </w:tc>
@@ -715,31 +715,31 @@
                 <w:rFonts w:ascii="Calibri" w:hAnsi="Calibri"/>
                 <w:sz w:val="20"/>
               </w:rPr>
-              <w:t xml:space="default">Continuous Exterior Wall Insulation</w:t>
-            </w:r>
-          </w:p>
-        </w:tc>
-        <w:tc>
-          <w:tcPr>
-            <w:tcBorders>
-              <w:top w:val="single" w:space="0" w:color="D3D3D3"/>
-              <w:bottom w:val="single" w:space="0" w:color="D3D3D3"/>
-              <w:start w:val="single" w:space="0" w:color="D3D3D3"/>
-              <w:end w:val="single" w:space="0" w:color="D3D3D3"/>
-            </w:tcBorders>
-          </w:tcPr>
-          <w:p>
-            <w:pPr>
-              <w:spacing w:before="0" w:after="60"/>
-              <w:keepNext/>
-              <w:jc w:val="start"/>
-            </w:pPr>
-            <w:r>
-              <w:rPr>
-                <w:rFonts w:ascii="Calibri" w:hAnsi="Calibri"/>
-                <w:sz w:val="20"/>
-              </w:rPr>
-              <w:t xml:space="default">Add a continuous layer of insulation and potentially replace the air and moisture barrier once it becomes time to replace the siding.</w:t>
+              <w:t xml:space="default">Vapor Barrier</w:t>
+            </w:r>
+          </w:p>
+        </w:tc>
+        <w:tc>
+          <w:tcPr>
+            <w:tcBorders>
+              <w:top w:val="single" w:space="0" w:color="D3D3D3"/>
+              <w:bottom w:val="single" w:space="0" w:color="D3D3D3"/>
+              <w:start w:val="single" w:space="0" w:color="D3D3D3"/>
+              <w:end w:val="single" w:space="0" w:color="D3D3D3"/>
+            </w:tcBorders>
+          </w:tcPr>
+          <w:p>
+            <w:pPr>
+              <w:spacing w:before="0" w:after="60"/>
+              <w:keepNext/>
+              <w:jc w:val="start"/>
+            </w:pPr>
+            <w:r>
+              <w:rPr>
+                <w:rFonts w:ascii="Calibri" w:hAnsi="Calibri"/>
+                <w:sz w:val="20"/>
+              </w:rPr>
+              <w:t xml:space="default">Install a vapor barrier on the basement floor to stop moisture from entering the basement and house.</w:t>
             </w:r>
           </w:p>
         </w:tc>
@@ -768,31 +768,31 @@
                 <w:rFonts w:ascii="Calibri" w:hAnsi="Calibri"/>
                 <w:sz w:val="20"/>
               </w:rPr>
-              <w:t xml:space="default">Blown-in Cellulose Wall Insulation</w:t>
-            </w:r>
-          </w:p>
-        </w:tc>
-        <w:tc>
-          <w:tcPr>
-            <w:tcBorders>
-              <w:top w:val="single" w:space="0" w:color="D3D3D3"/>
-              <w:bottom w:val="single" w:space="0" w:color="D3D3D3"/>
-              <w:start w:val="single" w:space="0" w:color="D3D3D3"/>
-              <w:end w:val="single" w:space="0" w:color="D3D3D3"/>
-            </w:tcBorders>
-          </w:tcPr>
-          <w:p>
-            <w:pPr>
-              <w:spacing w:before="0" w:after="60"/>
-              <w:keepNext/>
-              <w:jc w:val="start"/>
-            </w:pPr>
-            <w:r>
-              <w:rPr>
-                <w:rFonts w:ascii="Calibri" w:hAnsi="Calibri"/>
-                <w:sz w:val="20"/>
-              </w:rPr>
-              <w:t xml:space="default">Insulate the wall stud cavities with dense packed, blown-in cellulose insulation.</w:t>
+              <w:t xml:space="default">Spray Foam Basement/Crawlspace Walls</w:t>
+            </w:r>
+          </w:p>
+        </w:tc>
+        <w:tc>
+          <w:tcPr>
+            <w:tcBorders>
+              <w:top w:val="single" w:space="0" w:color="D3D3D3"/>
+              <w:bottom w:val="single" w:space="0" w:color="D3D3D3"/>
+              <w:start w:val="single" w:space="0" w:color="D3D3D3"/>
+              <w:end w:val="single" w:space="0" w:color="D3D3D3"/>
+            </w:tcBorders>
+          </w:tcPr>
+          <w:p>
+            <w:pPr>
+              <w:spacing w:before="0" w:after="60"/>
+              <w:keepNext/>
+              <w:jc w:val="start"/>
+            </w:pPr>
+            <w:r>
+              <w:rPr>
+                <w:rFonts w:ascii="Calibri" w:hAnsi="Calibri"/>
+                <w:sz w:val="20"/>
+              </w:rPr>
+              <w:t xml:space="default">Install spray foam on the basement/crawlspace walls to prevent moisture infiltration and reduce heat loss.</w:t>
             </w:r>
           </w:p>
         </w:tc>
@@ -845,7 +845,7 @@
                 <w:rFonts w:ascii="Calibri" w:hAnsi="Calibri"/>
                 <w:sz w:val="20"/>
               </w:rPr>
-              <w:t xml:space="default">Air seal the attic and insulate it to at least R-60 (18” of loose-fill cellulose insulation).</w:t>
+              <w:t xml:space="default">Air seal the attic and insulate it to at least R-60 (18 inches of loose-fill cellulose insulation).</w:t>
             </w:r>
           </w:p>
         </w:tc>
@@ -874,31 +874,31 @@
                 <w:rFonts w:ascii="Calibri" w:hAnsi="Calibri"/>
                 <w:sz w:val="20"/>
               </w:rPr>
-              <w:t xml:space="default">Kitchen Exhaust Fan</w:t>
-            </w:r>
-          </w:p>
-        </w:tc>
-        <w:tc>
-          <w:tcPr>
-            <w:tcBorders>
-              <w:top w:val="single" w:space="0" w:color="D3D3D3"/>
-              <w:bottom w:val="single" w:space="0" w:color="D3D3D3"/>
-              <w:start w:val="single" w:space="0" w:color="D3D3D3"/>
-              <w:end w:val="single" w:space="0" w:color="D3D3D3"/>
-            </w:tcBorders>
-          </w:tcPr>
-          <w:p>
-            <w:pPr>
-              <w:spacing w:before="0" w:after="60"/>
-              <w:keepNext/>
-              <w:jc w:val="start"/>
-            </w:pPr>
-            <w:r>
-              <w:rPr>
-                <w:rFonts w:ascii="Calibri" w:hAnsi="Calibri"/>
-                <w:sz w:val="20"/>
-              </w:rPr>
-              <w:t xml:space="default">A kitchen exhaust fan will remove harmful combustion gases from your home and should be rated for at least 100 cubic feet per minute (CFM). A fan can also help with moisture concerns.</w:t>
+              <w:t xml:space="default">Blown-in Cellulose Wall Insulation</w:t>
+            </w:r>
+          </w:p>
+        </w:tc>
+        <w:tc>
+          <w:tcPr>
+            <w:tcBorders>
+              <w:top w:val="single" w:space="0" w:color="D3D3D3"/>
+              <w:bottom w:val="single" w:space="0" w:color="D3D3D3"/>
+              <w:start w:val="single" w:space="0" w:color="D3D3D3"/>
+              <w:end w:val="single" w:space="0" w:color="D3D3D3"/>
+            </w:tcBorders>
+          </w:tcPr>
+          <w:p>
+            <w:pPr>
+              <w:spacing w:before="0" w:after="60"/>
+              <w:keepNext/>
+              <w:jc w:val="start"/>
+            </w:pPr>
+            <w:r>
+              <w:rPr>
+                <w:rFonts w:ascii="Calibri" w:hAnsi="Calibri"/>
+                <w:sz w:val="20"/>
+              </w:rPr>
+              <w:t xml:space="default">Insulate the wall stud cavities with dense packed, blown-in cellulose insulation.</w:t>
             </w:r>
           </w:p>
         </w:tc>
@@ -927,31 +927,31 @@
                 <w:rFonts w:ascii="Calibri" w:hAnsi="Calibri"/>
                 <w:sz w:val="20"/>
               </w:rPr>
-              <w:t xml:space="default">Bathroom Exhaust Fan(s)</w:t>
-            </w:r>
-          </w:p>
-        </w:tc>
-        <w:tc>
-          <w:tcPr>
-            <w:tcBorders>
-              <w:top w:val="single" w:space="0" w:color="D3D3D3"/>
-              <w:bottom w:val="single" w:space="0" w:color="D3D3D3"/>
-              <w:start w:val="single" w:space="0" w:color="D3D3D3"/>
-              <w:end w:val="single" w:space="0" w:color="D3D3D3"/>
-            </w:tcBorders>
-          </w:tcPr>
-          <w:p>
-            <w:pPr>
-              <w:spacing w:before="0" w:after="60"/>
-              <w:keepNext/>
-              <w:jc w:val="start"/>
-            </w:pPr>
-            <w:r>
-              <w:rPr>
-                <w:rFonts w:ascii="Calibri" w:hAnsi="Calibri"/>
-                <w:sz w:val="20"/>
-              </w:rPr>
-              <w:t xml:space="default">Bathroom exhaust fans should be rated for at least 80 cubic feet per minute (CFM) if there is a shower. We recommend Panasonic WhisperQuiet or similar fans that don’t create excess noise.</w:t>
+              <w:t xml:space="default">Continuous Exterior Wall Insulation</w:t>
+            </w:r>
+          </w:p>
+        </w:tc>
+        <w:tc>
+          <w:tcPr>
+            <w:tcBorders>
+              <w:top w:val="single" w:space="0" w:color="D3D3D3"/>
+              <w:bottom w:val="single" w:space="0" w:color="D3D3D3"/>
+              <w:start w:val="single" w:space="0" w:color="D3D3D3"/>
+              <w:end w:val="single" w:space="0" w:color="D3D3D3"/>
+            </w:tcBorders>
+          </w:tcPr>
+          <w:p>
+            <w:pPr>
+              <w:spacing w:before="0" w:after="60"/>
+              <w:keepNext/>
+              <w:jc w:val="start"/>
+            </w:pPr>
+            <w:r>
+              <w:rPr>
+                <w:rFonts w:ascii="Calibri" w:hAnsi="Calibri"/>
+                <w:sz w:val="20"/>
+              </w:rPr>
+              <w:t xml:space="default">Add a continuous layer of insulation and potentially replace the air and moisture barrier once it becomes time to replace the siding.</w:t>
             </w:r>
           </w:p>
         </w:tc>
@@ -980,31 +980,31 @@
                 <w:rFonts w:ascii="Calibri" w:hAnsi="Calibri"/>
                 <w:sz w:val="20"/>
               </w:rPr>
-              <w:t xml:space="default">Gutters</w:t>
-            </w:r>
-          </w:p>
-        </w:tc>
-        <w:tc>
-          <w:tcPr>
-            <w:tcBorders>
-              <w:top w:val="single" w:space="0" w:color="D3D3D3"/>
-              <w:bottom w:val="single" w:space="0" w:color="D3D3D3"/>
-              <w:start w:val="single" w:space="0" w:color="D3D3D3"/>
-              <w:end w:val="single" w:space="0" w:color="D3D3D3"/>
-            </w:tcBorders>
-          </w:tcPr>
-          <w:p>
-            <w:pPr>
-              <w:spacing w:before="0" w:after="60"/>
-              <w:keepNext/>
-              <w:jc w:val="start"/>
-            </w:pPr>
-            <w:r>
-              <w:rPr>
-                <w:rFonts w:ascii="Calibri" w:hAnsi="Calibri"/>
-                <w:sz w:val="20"/>
-              </w:rPr>
-              <w:t xml:space="default">Install gutters and downspouts that divert water at least six feet away from the foundation and to where the ground slopes away from the house.</w:t>
+              <w:t xml:space="default">Electrical Panel Upgrade</w:t>
+            </w:r>
+          </w:p>
+        </w:tc>
+        <w:tc>
+          <w:tcPr>
+            <w:tcBorders>
+              <w:top w:val="single" w:space="0" w:color="D3D3D3"/>
+              <w:bottom w:val="single" w:space="0" w:color="D3D3D3"/>
+              <w:start w:val="single" w:space="0" w:color="D3D3D3"/>
+              <w:end w:val="single" w:space="0" w:color="D3D3D3"/>
+            </w:tcBorders>
+          </w:tcPr>
+          <w:p>
+            <w:pPr>
+              <w:spacing w:before="0" w:after="60"/>
+              <w:keepNext/>
+              <w:jc w:val="start"/>
+            </w:pPr>
+            <w:r>
+              <w:rPr>
+                <w:rFonts w:ascii="Calibri" w:hAnsi="Calibri"/>
+                <w:sz w:val="20"/>
+              </w:rPr>
+              <w:t xml:space="default">Consult with an electrician about replacing your existing electrical panel with a 200 amp panel as you add electrical appliances to your home.</w:t>
             </w:r>
           </w:p>
         </w:tc>
@@ -1033,31 +1033,31 @@
                 <w:rFonts w:ascii="Calibri" w:hAnsi="Calibri"/>
                 <w:sz w:val="20"/>
               </w:rPr>
-              <w:t xml:space="default">Refrigerator</w:t>
-            </w:r>
-          </w:p>
-        </w:tc>
-        <w:tc>
-          <w:tcPr>
-            <w:tcBorders>
-              <w:top w:val="single" w:space="0" w:color="D3D3D3"/>
-              <w:bottom w:val="single" w:space="0" w:color="D3D3D3"/>
-              <w:start w:val="single" w:space="0" w:color="D3D3D3"/>
-              <w:end w:val="single" w:space="0" w:color="D3D3D3"/>
-            </w:tcBorders>
-          </w:tcPr>
-          <w:p>
-            <w:pPr>
-              <w:spacing w:before="0" w:after="60"/>
-              <w:keepNext/>
-              <w:jc w:val="start"/>
-            </w:pPr>
-            <w:r>
-              <w:rPr>
-                <w:rFonts w:ascii="Calibri" w:hAnsi="Calibri"/>
-                <w:sz w:val="20"/>
-              </w:rPr>
-              <w:t xml:space="default">Replace your refrigerator with a new, EnergyStar certified fridge. Look at the Energy Guide label to compare the energy use of new refrigerators.</w:t>
+              <w:t xml:space="default">Whole-House Surge Protection</w:t>
+            </w:r>
+          </w:p>
+        </w:tc>
+        <w:tc>
+          <w:tcPr>
+            <w:tcBorders>
+              <w:top w:val="single" w:space="0" w:color="D3D3D3"/>
+              <w:bottom w:val="single" w:space="0" w:color="D3D3D3"/>
+              <w:start w:val="single" w:space="0" w:color="D3D3D3"/>
+              <w:end w:val="single" w:space="0" w:color="D3D3D3"/>
+            </w:tcBorders>
+          </w:tcPr>
+          <w:p>
+            <w:pPr>
+              <w:spacing w:before="0" w:after="60"/>
+              <w:keepNext/>
+              <w:jc w:val="start"/>
+            </w:pPr>
+            <w:r>
+              <w:rPr>
+                <w:rFonts w:ascii="Calibri" w:hAnsi="Calibri"/>
+                <w:sz w:val="20"/>
+              </w:rPr>
+              <w:t xml:space="default">Upgrade your electrical panel to add whole-house surge protection.</w:t>
             </w:r>
           </w:p>
         </w:tc>
@@ -1086,31 +1086,31 @@
                 <w:rFonts w:ascii="Calibri" w:hAnsi="Calibri"/>
                 <w:sz w:val="20"/>
               </w:rPr>
-              <w:t xml:space="default">WindowDressers</w:t>
-            </w:r>
-          </w:p>
-        </w:tc>
-        <w:tc>
-          <w:tcPr>
-            <w:tcBorders>
-              <w:top w:val="single" w:space="0" w:color="D3D3D3"/>
-              <w:bottom w:val="single" w:space="0" w:color="D3D3D3"/>
-              <w:start w:val="single" w:space="0" w:color="D3D3D3"/>
-              <w:end w:val="single" w:space="0" w:color="D3D3D3"/>
-            </w:tcBorders>
-          </w:tcPr>
-          <w:p>
-            <w:pPr>
-              <w:spacing w:before="0" w:after="60"/>
-              <w:keepNext/>
-              <w:jc w:val="start"/>
-            </w:pPr>
-            <w:r>
-              <w:rPr>
-                <w:rFonts w:ascii="Calibri" w:hAnsi="Calibri"/>
-                <w:sz w:val="20"/>
-              </w:rPr>
-              <w:t xml:space="default">WindowDressers insulating window inserts help air-seal windows and reduce heat loss and gain.</w:t>
+              <w:t xml:space="default">Pipe Insulation</w:t>
+            </w:r>
+          </w:p>
+        </w:tc>
+        <w:tc>
+          <w:tcPr>
+            <w:tcBorders>
+              <w:top w:val="single" w:space="0" w:color="D3D3D3"/>
+              <w:bottom w:val="single" w:space="0" w:color="D3D3D3"/>
+              <w:start w:val="single" w:space="0" w:color="D3D3D3"/>
+              <w:end w:val="single" w:space="0" w:color="D3D3D3"/>
+            </w:tcBorders>
+          </w:tcPr>
+          <w:p>
+            <w:pPr>
+              <w:spacing w:before="0" w:after="60"/>
+              <w:keepNext/>
+              <w:jc w:val="start"/>
+            </w:pPr>
+            <w:r>
+              <w:rPr>
+                <w:rFonts w:ascii="Calibri" w:hAnsi="Calibri"/>
+                <w:sz w:val="20"/>
+              </w:rPr>
+              <w:t xml:space="default">Insulate both hot and cold water pipes that are uninsulated in the basement/crawlspace. This will save energy and prevent condensation.</w:t>
             </w:r>
           </w:p>
         </w:tc>
@@ -1139,31 +1139,31 @@
                 <w:rFonts w:ascii="Calibri" w:hAnsi="Calibri"/>
                 <w:sz w:val="20"/>
               </w:rPr>
-              <w:t xml:space="default">High-efficiency Shower Head(s)</w:t>
-            </w:r>
-          </w:p>
-        </w:tc>
-        <w:tc>
-          <w:tcPr>
-            <w:tcBorders>
-              <w:top w:val="single" w:space="0" w:color="D3D3D3"/>
-              <w:bottom w:val="single" w:space="0" w:color="D3D3D3"/>
-              <w:start w:val="single" w:space="0" w:color="D3D3D3"/>
-              <w:end w:val="single" w:space="0" w:color="D3D3D3"/>
-            </w:tcBorders>
-          </w:tcPr>
-          <w:p>
-            <w:pPr>
-              <w:spacing w:before="0" w:after="60"/>
-              <w:keepNext/>
-              <w:jc w:val="start"/>
-            </w:pPr>
-            <w:r>
-              <w:rPr>
-                <w:rFonts w:ascii="Calibri" w:hAnsi="Calibri"/>
-                <w:sz w:val="20"/>
-              </w:rPr>
-              <w:t xml:space="default">Install high-efficiency shower heads to reduce the amount of water and energy to heat the water used when showering.</w:t>
+              <w:t xml:space="default">DIY Air Sealing</w:t>
+            </w:r>
+          </w:p>
+        </w:tc>
+        <w:tc>
+          <w:tcPr>
+            <w:tcBorders>
+              <w:top w:val="single" w:space="0" w:color="D3D3D3"/>
+              <w:bottom w:val="single" w:space="0" w:color="D3D3D3"/>
+              <w:start w:val="single" w:space="0" w:color="D3D3D3"/>
+              <w:end w:val="single" w:space="0" w:color="D3D3D3"/>
+            </w:tcBorders>
+          </w:tcPr>
+          <w:p>
+            <w:pPr>
+              <w:spacing w:before="0" w:after="60"/>
+              <w:keepNext/>
+              <w:jc w:val="start"/>
+            </w:pPr>
+            <w:r>
+              <w:rPr>
+                <w:rFonts w:ascii="Calibri" w:hAnsi="Calibri"/>
+                <w:sz w:val="20"/>
+              </w:rPr>
+              <w:t xml:space="default">Seal easy-to-access air leaks and weatherstrip exterior doors.</w:t>
             </w:r>
           </w:p>
         </w:tc>
@@ -1192,31 +1192,31 @@
                 <w:rFonts w:ascii="Calibri" w:hAnsi="Calibri"/>
                 <w:sz w:val="20"/>
               </w:rPr>
-              <w:t xml:space="default">Furnace/Boiler Tune-up</w:t>
-            </w:r>
-          </w:p>
-        </w:tc>
-        <w:tc>
-          <w:tcPr>
-            <w:tcBorders>
-              <w:top w:val="single" w:space="0" w:color="D3D3D3"/>
-              <w:bottom w:val="single" w:space="0" w:color="D3D3D3"/>
-              <w:start w:val="single" w:space="0" w:color="D3D3D3"/>
-              <w:end w:val="single" w:space="0" w:color="D3D3D3"/>
-            </w:tcBorders>
-          </w:tcPr>
-          <w:p>
-            <w:pPr>
-              <w:spacing w:before="0" w:after="60"/>
-              <w:keepNext/>
-              <w:jc w:val="start"/>
-            </w:pPr>
-            <w:r>
-              <w:rPr>
-                <w:rFonts w:ascii="Calibri" w:hAnsi="Calibri"/>
-                <w:sz w:val="20"/>
-              </w:rPr>
-              <w:t xml:space="default">Have the furnace/boiler and flue inspected and adjusted by a licensed professional. This should be available from your fuel delivery company.</w:t>
+              <w:t xml:space="default">Other 1</w:t>
+            </w:r>
+          </w:p>
+        </w:tc>
+        <w:tc>
+          <w:tcPr>
+            <w:tcBorders>
+              <w:top w:val="single" w:space="0" w:color="D3D3D3"/>
+              <w:bottom w:val="single" w:space="0" w:color="D3D3D3"/>
+              <w:start w:val="single" w:space="0" w:color="D3D3D3"/>
+              <w:end w:val="single" w:space="0" w:color="D3D3D3"/>
+            </w:tcBorders>
+          </w:tcPr>
+          <w:p>
+            <w:pPr>
+              <w:spacing w:before="0" w:after="60"/>
+              <w:keepNext/>
+              <w:jc w:val="start"/>
+            </w:pPr>
+            <w:r>
+              <w:rPr>
+                <w:rFonts w:ascii="Calibri" w:hAnsi="Calibri"/>
+                <w:sz w:val="20"/>
+              </w:rPr>
+              <w:t xml:space="default">TYPE HERE 1</w:t>
             </w:r>
           </w:p>
         </w:tc>
@@ -1245,84 +1245,31 @@
                 <w:rFonts w:ascii="Calibri" w:hAnsi="Calibri"/>
                 <w:sz w:val="20"/>
               </w:rPr>
-              <w:t xml:space="default">Other 2</w:t>
-            </w:r>
-          </w:p>
-        </w:tc>
-        <w:tc>
-          <w:tcPr>
-            <w:tcBorders>
-              <w:top w:val="single" w:space="0" w:color="D3D3D3"/>
-              <w:bottom w:val="single" w:space="0" w:color="D3D3D3"/>
-              <w:start w:val="single" w:space="0" w:color="D3D3D3"/>
-              <w:end w:val="single" w:space="0" w:color="D3D3D3"/>
-            </w:tcBorders>
-          </w:tcPr>
-          <w:p>
-            <w:pPr>
-              <w:spacing w:before="0" w:after="60"/>
-              <w:keepNext/>
-              <w:jc w:val="start"/>
-            </w:pPr>
-            <w:r>
-              <w:rPr>
-                <w:rFonts w:ascii="Calibri" w:hAnsi="Calibri"/>
-                <w:sz w:val="20"/>
-              </w:rPr>
-              <w:t xml:space="default">TYPE HERE 2</w:t>
-            </w:r>
-          </w:p>
-        </w:tc>
-      </w:tr>
-      <w:tr>
-        <w:trPr>
-          <w:cantSplit/>
-        </w:trPr>
-        <w:tc>
-          <w:tcPr>
-            <w:tcBorders>
-              <w:top w:val="single" w:space="0" w:color="D3D3D3"/>
-              <w:bottom w:val="single" w:space="0" w:color="D3D3D3"/>
-              <w:start w:val="single" w:space="0" w:color="D3D3D3"/>
-              <w:end w:val="single" w:space="0" w:color="D3D3D3"/>
-            </w:tcBorders>
-          </w:tcPr>
-          <w:p>
-            <w:pPr>
-              <w:spacing w:before="0" w:after="60"/>
-              <w:keepNext/>
-              <w:jc w:val="start"/>
-            </w:pPr>
-            <w:r>
-              <w:rPr>
-                <w:rFonts w:ascii="Calibri" w:hAnsi="Calibri"/>
-                <w:sz w:val="20"/>
-              </w:rPr>
-              <w:t xml:space="default">Other 1</w:t>
-            </w:r>
-          </w:p>
-        </w:tc>
-        <w:tc>
-          <w:tcPr>
-            <w:tcBorders>
-              <w:top w:val="single" w:space="0" w:color="D3D3D3"/>
-              <w:bottom w:val="single" w:space="0" w:color="D3D3D3"/>
-              <w:start w:val="single" w:space="0" w:color="D3D3D3"/>
-              <w:end w:val="single" w:space="0" w:color="D3D3D3"/>
-            </w:tcBorders>
-          </w:tcPr>
-          <w:p>
-            <w:pPr>
-              <w:spacing w:before="0" w:after="60"/>
-              <w:keepNext/>
-              <w:jc w:val="start"/>
-            </w:pPr>
-            <w:r>
-              <w:rPr>
-                <w:rFonts w:ascii="Calibri" w:hAnsi="Calibri"/>
-                <w:sz w:val="20"/>
-              </w:rPr>
-              <w:t xml:space="default">TYPE HERE 1</w:t>
+              <w:t xml:space="default">Misc. Air Sealing and Insulation</w:t>
+            </w:r>
+          </w:p>
+        </w:tc>
+        <w:tc>
+          <w:tcPr>
+            <w:tcBorders>
+              <w:top w:val="single" w:space="0" w:color="D3D3D3"/>
+              <w:bottom w:val="single" w:space="0" w:color="D3D3D3"/>
+              <w:start w:val="single" w:space="0" w:color="D3D3D3"/>
+              <w:end w:val="single" w:space="0" w:color="D3D3D3"/>
+            </w:tcBorders>
+          </w:tcPr>
+          <w:p>
+            <w:pPr>
+              <w:spacing w:before="0" w:after="60"/>
+              <w:keepNext/>
+              <w:jc w:val="start"/>
+            </w:pPr>
+            <w:r>
+              <w:rPr>
+                <w:rFonts w:ascii="Calibri" w:hAnsi="Calibri"/>
+                <w:sz w:val="20"/>
+              </w:rPr>
+              <w:t xml:space="default">Air seal and insulate [** insert auditor description - bay window, bulkhead door, chase, kneewall, anything else that is unique to the home and not otherwise covered in another recommendation]</w:t>
             </w:r>
           </w:p>
         </w:tc>
@@ -1407,7 +1354,7 @@
                 <w:rFonts w:ascii="Calibri" w:hAnsi="Calibri"/>
                 <w:sz w:val="20"/>
               </w:rPr>
-              <w:t xml:space="default">1979</w:t>
+              <w:t xml:space="default">1907</w:t>
             </w:r>
           </w:p>
         </w:tc>
@@ -1460,7 +1407,7 @@
                 <w:rFonts w:ascii="Calibri" w:hAnsi="Calibri"/>
                 <w:sz w:val="20"/>
               </w:rPr>
-              <w:t xml:space="default">Slab</w:t>
+              <w:t xml:space="default">Walk in basement</w:t>
             </w:r>
           </w:p>
         </w:tc>
@@ -1513,7 +1460,7 @@
                 <w:rFonts w:ascii="Calibri" w:hAnsi="Calibri"/>
                 <w:sz w:val="20"/>
               </w:rPr>
-              <w:t xml:space="default">Batts of Fiberglass , 6 inches</w:t>
+              <w:t xml:space="default">Loose Cellulose , 3 inches</w:t>
             </w:r>
           </w:p>
         </w:tc>
@@ -1619,7 +1566,7 @@
                 <w:rFonts w:ascii="Calibri" w:hAnsi="Calibri"/>
                 <w:sz w:val="20"/>
               </w:rPr>
-              <w:t xml:space="default">1776</w:t>
+              <w:t xml:space="default">2458</w:t>
             </w:r>
           </w:p>
         </w:tc>
@@ -1672,7 +1619,7 @@
                 <w:rFonts w:ascii="Calibri" w:hAnsi="Calibri"/>
                 <w:sz w:val="20"/>
               </w:rPr>
-              <w:t xml:space="default">12200</w:t>
+              <w:t xml:space="default">21760</w:t>
             </w:r>
           </w:p>
         </w:tc>
@@ -1801,7 +1748,7 @@
                 <w:rFonts w:ascii="Calibri" w:hAnsi="Calibri"/>
                 <w:sz w:val="20"/>
               </w:rPr>
-              <w:t xml:space="default">10</w:t>
+              <w:t xml:space="default">NA</w:t>
             </w:r>
           </w:p>
         </w:tc>
@@ -1907,7 +1854,7 @@
                 <w:rFonts w:ascii="Calibri" w:hAnsi="Calibri"/>
                 <w:sz w:val="20"/>
               </w:rPr>
-              <w:t xml:space="default">Asphalt Shinglesin faircondition. Roof trusses are in need of repair. The shingles are in fine condition.</w:t>
+              <w:t xml:space="default">Asphalt Shingles, Standing Seam Metal, Synthetic Slate Tilein faircondition. Gallery connection has full standing seam, main house has a combination of shingles and standing seam, all in fairly good condition</w:t>
             </w:r>
           </w:p>
         </w:tc>
@@ -1960,7 +1907,7 @@
                 <w:rFonts w:ascii="Calibri" w:hAnsi="Calibri"/>
                 <w:sz w:val="20"/>
               </w:rPr>
-              <w:t xml:space="default">Current moisture control strategies: NA. These were in NA condition .NA</w:t>
+              <w:t xml:space="default">Current moisture control strategies: gutters, ground slopes away from foundation. These were in fair condition .Some water damage marks around gutters on intersecting sections, ground does not slope away from all parts of the house. Many plants also are planted around the house that assist with moisture control.</w:t>
             </w:r>
           </w:p>
         </w:tc>
@@ -2013,7 +1960,7 @@
                 <w:rFonts w:ascii="Calibri" w:hAnsi="Calibri"/>
                 <w:sz w:val="20"/>
               </w:rPr>
-              <w:t xml:space="default">wood siding in fair condition. On the south facing side of the house, the siding is in poor condtion. Two specific locations have siding peeling away from the house. The rest of the siding is in fair condition.</w:t>
+              <w:t xml:space="default">Combination of wood shingles and siding in fair condition. Siding shows signs of weathering and aging, some sections have water damage marks, otherwise in good condition and intact</w:t>
             </w:r>
           </w:p>
         </w:tc>
@@ -2066,7 +2013,7 @@
                 <w:rFonts w:ascii="Calibri" w:hAnsi="Calibri"/>
                 <w:sz w:val="20"/>
               </w:rPr>
-              <w:t xml:space="default">There are 2 hollow fiberglass exterior doors. In fair condition, totaling 38 square feet.</w:t>
+              <w:t xml:space="default">There are 1 insulated wood exterior doors. In fair condition, totaling 18 square feet.Furthermore there are 1 glass door wood exterior doors. In fair condition, totaling 18.5 square feet. Moreover there are 1 insulated wood exterior doors. In fair condition, totaling 18 square feet.</w:t>
             </w:r>
           </w:p>
         </w:tc>
@@ -2119,7 +2066,7 @@
                 <w:rFonts w:ascii="Calibri" w:hAnsi="Calibri"/>
                 <w:sz w:val="20"/>
               </w:rPr>
-              <w:t xml:space="default">There are 16 double paned fiberglass windows. In fair condition, totaling 171 square feet.</w:t>
+              <w:t xml:space="default">There are 16 double paned wood windows. In fair condition, totaling 169 square feet. Moreover there are 6 double paned wood windows. In excellent condition, totaling 98 square feet.</w:t>
             </w:r>
           </w:p>
         </w:tc>
@@ -2195,7 +2142,7 @@
                 <w:rFonts w:ascii="Calibri" w:hAnsi="Calibri"/>
                 <w:sz w:val="20"/>
               </w:rPr>
-              <w:t xml:space="default">The framing type of the home is platform framing, which means that wall cavities do not extend the full height of the building and are instead separated by floors. There is Batts of Fiberglass insulation 4 inches thick in fair condition. Ceiling to wall connections are lacking insualtion and airsealing</w:t>
+              <w:t xml:space="default">The framing type of the home is balloon framing, which means the wall cavities extend the full height of the building (from the foundation to the roof). Often the wall cavities are interconnected with the floor and ceiling cavities. This framing type can create connected passageways for air to leave the house and rodents to enter the house. There is Batts of Fiberglass, Loose Cellulose insulation 4 inches thick in NA condition. Insulation depth and quality unknown, could not access wall cavity. Some thermal cam images show inconsistent insulation on second floor</w:t>
             </w:r>
           </w:p>
         </w:tc>
@@ -2301,7 +2248,7 @@
                 <w:rFonts w:ascii="Calibri" w:hAnsi="Calibri"/>
                 <w:sz w:val="20"/>
               </w:rPr>
-              <w:t xml:space="default">The 1st floor bathroom fan is not working, the 2nd floor bathroom does not have an exhaust fan</w:t>
+              <w:t xml:space="default">NA</w:t>
             </w:r>
           </w:p>
         </w:tc>
@@ -2354,7 +2301,7 @@
                 <w:rFonts w:ascii="Calibri" w:hAnsi="Calibri"/>
                 <w:sz w:val="20"/>
               </w:rPr>
-              <w:t xml:space="default">Fridge/Freezer Combo used 0.08 kWh in 1.5 minutes. NA used NA kWh in NA minutes. Kitchen exhaust fan does not vent to the outside</w:t>
+              <w:t xml:space="default">Main fridge/freezer used 0.23 kWh in 135 minutes. Basement upright freezer used 0.32 kWh in 182 minutes. Kitchen has gas stove and range, recirculating fan but no exhaust fan</w:t>
             </w:r>
           </w:p>
         </w:tc>
@@ -2462,7 +2409,7 @@
                 <w:rFonts w:ascii="Calibri" w:hAnsi="Calibri"/>
                 <w:sz w:val="20"/>
               </w:rPr>
-              <w:t xml:space="default">4100</w:t>
+              <w:t xml:space="default">3383</w:t>
             </w:r>
           </w:p>
         </w:tc>
@@ -2539,7 +2486,7 @@
                 <w:rFonts w:ascii="Calibri" w:hAnsi="Calibri"/>
                 <w:sz w:val="20"/>
               </w:rPr>
-              <w:t xml:space="default">20.2</w:t>
+              <w:t xml:space="default">9.3</w:t>
             </w:r>
           </w:p>
         </w:tc>
@@ -2616,7 +2563,7 @@
                 <w:rFonts w:ascii="Calibri" w:hAnsi="Calibri"/>
                 <w:sz w:val="20"/>
               </w:rPr>
-              <w:t xml:space="default">410 under natural conditions. TEST</w:t>
+              <w:t xml:space="default">338.3 under natural conditions. TEST</w:t>
             </w:r>
           </w:p>
         </w:tc>
@@ -2693,7 +2640,7 @@
                 <w:rFonts w:ascii="Calibri" w:hAnsi="Calibri"/>
                 <w:sz w:val="20"/>
               </w:rPr>
-              <w:t xml:space="default">1.4</w:t>
+              <w:t xml:space="default">0.5</w:t>
             </w:r>
           </w:p>
         </w:tc>
@@ -2848,7 +2795,7 @@
                 <w:rFonts w:ascii="Calibri" w:hAnsi="Calibri"/>
                 <w:sz w:val="20"/>
               </w:rPr>
-              <w:t xml:space="default">448</w:t>
+              <w:t xml:space="default">NA</w:t>
             </w:r>
           </w:p>
         </w:tc>
@@ -2901,7 +2848,7 @@
                 <w:rFonts w:ascii="Calibri" w:hAnsi="Calibri"/>
                 <w:sz w:val="20"/>
               </w:rPr>
-              <w:t xml:space="default">Batts of Fiberglass</w:t>
+              <w:t xml:space="default">Loose Cellulose</w:t>
             </w:r>
           </w:p>
         </w:tc>
@@ -2954,7 +2901,7 @@
                 <w:rFonts w:ascii="Calibri" w:hAnsi="Calibri"/>
                 <w:sz w:val="20"/>
               </w:rPr>
-              <w:t xml:space="default">Fair</w:t>
+              <w:t xml:space="default">Partially</w:t>
             </w:r>
           </w:p>
         </w:tc>
@@ -3007,7 +2954,7 @@
                 <w:rFonts w:ascii="Calibri" w:hAnsi="Calibri"/>
                 <w:sz w:val="20"/>
               </w:rPr>
-              <w:t xml:space="default">There is Noair sealing. NA</w:t>
+              <w:t xml:space="default">There is Yesair sealing. Air sealing behind rafters, inconsistent but primarily above additions</w:t>
             </w:r>
           </w:p>
         </w:tc>
@@ -3060,7 +3007,7 @@
                 <w:rFonts w:ascii="Calibri" w:hAnsi="Calibri"/>
                 <w:sz w:val="20"/>
               </w:rPr>
-              <w:t xml:space="default">The insulation is collecting a large amount of particulate and dirt. This impacts the indoor air quality within the home No NA</w:t>
+              <w:t xml:space="default">Cellulose has badly settled, depth under floor varies. Wall cavities have been dense packed, but have also settled to varying degrees. No NA</w:t>
             </w:r>
           </w:p>
         </w:tc>
@@ -3113,7 +3060,7 @@
                 <w:rFonts w:ascii="Calibri" w:hAnsi="Calibri"/>
                 <w:sz w:val="20"/>
               </w:rPr>
-              <w:t xml:space="default">No</w:t>
+              <w:t xml:space="default">NA</w:t>
             </w:r>
           </w:p>
         </w:tc>
@@ -3295,7 +3242,7 @@
                 <w:rFonts w:ascii="Calibri" w:hAnsi="Calibri"/>
                 <w:sz w:val="20"/>
               </w:rPr>
-              <w:t xml:space="default">NA</w:t>
+              <w:t xml:space="default">Uninsulated</w:t>
             </w:r>
           </w:p>
         </w:tc>
@@ -3401,7 +3348,7 @@
                 <w:rFonts w:ascii="Calibri" w:hAnsi="Calibri"/>
                 <w:sz w:val="20"/>
               </w:rPr>
-              <w:t xml:space="default">NA</w:t>
+              <w:t xml:space="default">Appliances not insulated, Ducts/pipes partially insulated</w:t>
             </w:r>
           </w:p>
         </w:tc>
@@ -3454,7 +3401,7 @@
                 <w:rFonts w:ascii="Calibri" w:hAnsi="Calibri"/>
                 <w:sz w:val="20"/>
               </w:rPr>
-              <w:t xml:space="default">NAin NAcondition. NA</w:t>
+              <w:t xml:space="default">dehumidifierin faircondition. Some water damage marks around gutters on intersecting sections, ground does not slope away from all parts of the house. Many plants also are planted around the house that assist with moisture control.</w:t>
             </w:r>
           </w:p>
         </w:tc>
@@ -3636,7 +3583,7 @@
                 <w:rFonts w:ascii="Calibri" w:hAnsi="Calibri"/>
                 <w:sz w:val="20"/>
               </w:rPr>
-              <w:t xml:space="default">The electrical panel has and amperage of 100. There are 3 unused breaker spaces. Older panel</w:t>
+              <w:t xml:space="default">The electrical panel has and amperage of 100. There are 0 unused breaker spaces. NA</w:t>
             </w:r>
           </w:p>
         </w:tc>
@@ -3763,7 +3710,7 @@
     </w:tbl>
     <w:bookmarkEnd w:id="40"/>
     <w:bookmarkEnd w:id="41"/>
-    <w:bookmarkStart w:id="61" w:name="recommendations"/>
+    <w:bookmarkStart w:id="60" w:name="recommendations"/>
     <w:p>
       <w:pPr>
         <w:pStyle w:val="Heading2"/>
@@ -3850,7 +3797,7 @@
         <w:pStyle w:val="BodyText"/>
       </w:pPr>
       <w:r>
-        <w:t xml:space="preserve">Test 1 A tune-up can improve the efficiency of your furnace/boiler, confirm that it is exhausting properly, and identify areas of concern before they become urgent. If you have a service contract with your fuel delivery company, an annual tune-up is usually included.</w:t>
+        <w:t xml:space="preserve">A tune-up can improve the efficiency of your furnace/boiler, confirm that it is exhausting properly, and identify areas of concern before they become urgent. If you have a service contract with your fuel delivery company, an annual tune-up is usually included.</w:t>
       </w:r>
     </w:p>
     <w:bookmarkEnd w:id="42"/>
@@ -3968,7 +3915,7 @@
         <w:pStyle w:val="BodyText"/>
       </w:pPr>
       <w:r>
-        <w:t xml:space="preserve">WindowDressers insulating window inserts help air-seal windows and reduce heat loss and gain. WindowDressers are transparent and let in light while stopping drafts. Each insert is made of a custom-made pine frame wrapped on each side with tightly sealed, clear polyolefin film, creating an airspace between the two layers for additional insulation. The insert is finished with a compressible foam weather seal. The foam allows enough give for the inserts to be easily slid into place in the fall and removed in the spring while holding firmly enough to provide a tight, friction-based seal. The inserts are installed inside your existing window frame with no fasteners required and last 5-10 years. They are most effective in the winter, but depending on the window’s exposure, they can sometimes be used in the summer to keep the house cooler.</w:t>
+        <w:t xml:space="preserve">WindowDressers are insulating window inserts that help air-seal windows and reduce heat loss and gain. WindowDressers are transparent and let in light while stopping drafts. Each insert is made of a custom-made pine frame wrapped on each side with tightly sealed, clear polyolefin film, creating an airspace between the two layers for additional insulation. The insert is finished with a compressible foam weather seal. The foam allows enough give for the inserts to be easily slid into place in the fall and removed in the spring while holding firmly enough to provide a tight, friction-based seal. The inserts are installed inside your existing window frame with no fasteners required and last 5-10 years. They are most effective in the winter, but depending on the window’s exposure, they can sometimes be used in the summer to keep the house cooler.</w:t>
       </w:r>
       <w:r>
         <w:t xml:space="preserve"> </w:t>
@@ -4018,13 +3965,13 @@
       </w:r>
     </w:p>
     <w:bookmarkEnd w:id="44"/>
-    <w:bookmarkStart w:id="45" w:name="refrigerator"/>
+    <w:bookmarkStart w:id="45" w:name="freezer"/>
     <w:p>
       <w:pPr>
         <w:pStyle w:val="Heading3"/>
       </w:pPr>
       <w:r>
-        <w:t xml:space="preserve">4.4 Refrigerator</w:t>
+        <w:t xml:space="preserve">4.4 Freezer</w:t>
       </w:r>
     </w:p>
     <w:p>
@@ -4044,7 +3991,7 @@
         <w:pStyle w:val="BodyText"/>
       </w:pPr>
       <w:r>
-        <w:t xml:space="preserve">Your refrigerator uses more energy than newer models.</w:t>
+        <w:t xml:space="preserve">Your freezer uses more energy than newer models. Consider how the cost of running the freezer compares to the benefits of keeping it on.</w:t>
       </w:r>
     </w:p>
     <w:p>
@@ -4056,7 +4003,7 @@
           <w:b/>
           <w:bCs/>
         </w:rPr>
-        <w:t xml:space="preserve">Ideally, the auditor notes the annual energy consumption (kWh) of the existing fridge compared to a new model of similar size</w:t>
+        <w:t xml:space="preserve">Ideally, the auditor notes the annual energy consumption (kWh) of the existing freezer compared to a new model of similar size</w:t>
       </w:r>
     </w:p>
     <w:p>
@@ -4076,7 +4023,7 @@
         <w:pStyle w:val="BodyText"/>
       </w:pPr>
       <w:r>
-        <w:t xml:space="preserve">Replace your refrigerator with a new, EnergyStar certified fridge. Look at the Energy Guide label to compare the energy use of new refrigerators.</w:t>
+        <w:t xml:space="preserve">Replace your freezer with a new, EnergyStar certified freezer. Look at the Energy Guide label to compare the energy use of new freezers.</w:t>
       </w:r>
     </w:p>
     <w:p>
@@ -4096,7 +4043,7 @@
         <w:pStyle w:val="BodyText"/>
       </w:pPr>
       <w:r>
-        <w:t xml:space="preserve">If you are able to afford the upfront cost of purchasing a new refrigerator, you will recoup significant savings in the long run. Whenever you need to buy a new appliance, consider EnergyStar certified models, which use less energy and are cheaper to run. Remember, it doesn’t save energy if you relocate your existing refrigerator to the basement or garage and continue using it.</w:t>
+        <w:t xml:space="preserve">If you are able to afford the upfront cost of purchasing a new freezer, you will recoup significant savings in the long run. Whenever you need to buy a new appliance, consider EnergyStar certified models, which use electricity and are cheaper to run.</w:t>
       </w:r>
     </w:p>
     <w:p>
@@ -4108,17 +4055,31 @@
           <w:b/>
           <w:bCs/>
         </w:rPr>
-        <w:t xml:space="preserve">Ideally, auditor locates similar volume fridge online to calculate monthly savings and payback period compared to kill-a-watt meter reading for current refrigerator. “This example refrigerator would save $XX in electricity each month and pay for itself within XX months</w:t>
+        <w:t xml:space="preserve">Ideally, auditor locates similar volume freezer online to calculate monthly savings and payback period compared to kill-a-watt meter reading for current freezer.</w:t>
+      </w:r>
+      <w:r>
+        <w:rPr>
+          <w:b/>
+          <w:bCs/>
+        </w:rPr>
+        <w:t xml:space="preserve"> </w:t>
+      </w:r>
+      <w:r>
+        <w:rPr>
+          <w:b/>
+          <w:bCs/>
+        </w:rPr>
+        <w:t xml:space="preserve">“This example freezer would save $XX in electricity each month and pay for itself within XX months.”</w:t>
       </w:r>
     </w:p>
     <w:bookmarkEnd w:id="45"/>
-    <w:bookmarkStart w:id="46" w:name="gutters"/>
+    <w:bookmarkStart w:id="46" w:name="induction-stoveoven"/>
     <w:p>
       <w:pPr>
         <w:pStyle w:val="Heading3"/>
       </w:pPr>
       <w:r>
-        <w:t xml:space="preserve">4.5 Gutters</w:t>
+        <w:t xml:space="preserve">4.5 Induction Stove/Oven</w:t>
       </w:r>
     </w:p>
     <w:p>
@@ -4138,7 +4099,7 @@
         <w:pStyle w:val="BodyText"/>
       </w:pPr>
       <w:r>
-        <w:t xml:space="preserve">The house has no gutters, so water runs off your roof and directly onto the ground next to your house. Water that splashes off the ground can damage the exterior of your house. Runoff that is absorbed into the ground can seep into the basement/crawlspace, causing moisture issues there and throughout your house.</w:t>
+        <w:t xml:space="preserve">Your gas range has the potential to release propane, carbon monoxide, and combustion gases into your house. Gas ranges are also inefficient at transferring heat to your food at 32% efficiency, compared to 85% efficiency for induction cooktops.</w:t>
       </w:r>
     </w:p>
     <w:p>
@@ -4158,7 +4119,7 @@
         <w:pStyle w:val="BodyText"/>
       </w:pPr>
       <w:r>
-        <w:t xml:space="preserve">Install gutters and downspouts that divert water at least six feet away from the foundation and to where the ground slopes away from the house.</w:t>
+        <w:t xml:space="preserve">Induction cooking appliances are more efficient and safer than electric or gas ones. There is no risk of carbon monoxide or other harmful combustion gases, and the surface doesn’t heat up without a pot or pan on it.</w:t>
       </w:r>
     </w:p>
     <w:p>
@@ -4178,7 +4139,7 @@
         <w:pStyle w:val="BodyText"/>
       </w:pPr>
       <w:r>
-        <w:t xml:space="preserve">Adding gutters would mitigate moisture damage and save you from having to replace/fix other parts of the house.</w:t>
+        <w:t xml:space="preserve">Currently, Efficiency Maine does not offer a rebate for induction stoves. If you’re interested in trying out induction cooking but don’t want to replace your kitchen stove, consider buying a portable induction cooktop, which costs less than $100.</w:t>
       </w:r>
     </w:p>
     <w:bookmarkEnd w:id="46"/>
@@ -4228,7 +4189,7 @@
         <w:pStyle w:val="BodyText"/>
       </w:pPr>
       <w:r>
-        <w:t xml:space="preserve">Bathroom exhaust fans should be rated for at least 80 cubic feet per minute (CFM) if there is a shower. We recommend Panasonic WhisperQuiet or similar fans that don’t create excess noise. If the ductwork will run through the attic, it should be installed before the attic is air-sealed and insulated. The fan needs to be ducted outside, so it does not add moisture into the attic.</w:t>
+        <w:t xml:space="preserve">Install bathroom exhaust fans in all bathrooms that do not have them. These should be rated for at least 80 cubic feet per minute (CFM) if there is a shower. We recommend the Panasonic Whisper series or similar fans that don’t create excess noise. If the ductwork will run through the attic, it should be installed before the attic is air-sealed and insulated. The fan needs to be ducted outside, so it does not add moisture into the attic.</w:t>
       </w:r>
     </w:p>
     <w:p>
@@ -4298,7 +4259,7 @@
         <w:pStyle w:val="BodyText"/>
       </w:pPr>
       <w:r>
-        <w:t xml:space="preserve">A kitchen exhaust fan will remove harmful combustion gases from your home and should be rated for at least 100 cubic feet per minute (CFM). A fan can also help with moisture concerns. A kitchen fan should be ducted to the outdoors. If the ductwork will run through the attic, it should be installed before the attic is air-sealed and insulated.</w:t>
+        <w:t xml:space="preserve">Install a kitchen exhaust fan to remove cooking fumes and moisture from your home. The fan should be rated for at least 100 cubic feet per minute. A kitchen fan should be ducted to the outdoors. If the ductwork will run through the attic, it should be installed before the attic is air-sealed and insulated. A kitchen fan should be ducted to the outdoors. If the ductwork will run through the attic, it should be installed before the attic is air-sealed and insulated.</w:t>
       </w:r>
     </w:p>
     <w:p>
@@ -4322,13 +4283,13 @@
       </w:r>
     </w:p>
     <w:bookmarkEnd w:id="48"/>
-    <w:bookmarkStart w:id="49" w:name="attic-insulation-and-air-sealing"/>
+    <w:bookmarkStart w:id="49" w:name="vapor-barrier"/>
     <w:p>
       <w:pPr>
         <w:pStyle w:val="Heading3"/>
       </w:pPr>
       <w:r>
-        <w:t xml:space="preserve">4.8 Attic Insulation and Air Sealing</w:t>
+        <w:t xml:space="preserve">4.8 Vapor Barrier</w:t>
       </w:r>
     </w:p>
     <w:p>
@@ -4348,7 +4309,7 @@
         <w:pStyle w:val="BodyText"/>
       </w:pPr>
       <w:r>
-        <w:t xml:space="preserve">The attic is uninsulated or is missing insulation and the attic could also benefit from air-sealing. These upgrades will reduce draftiness and heat loss in the winter and heat gain in the summer.</w:t>
+        <w:t xml:space="preserve">There is excess moisture in the basement/crawlspace, which is evaporating out of the ground. This moisture can enter the house and cause mold, mildew, rot, and air quality issues.</w:t>
       </w:r>
     </w:p>
     <w:p>
@@ -4368,24 +4329,19 @@
         <w:pStyle w:val="BodyText"/>
       </w:pPr>
       <w:r>
-        <w:t xml:space="preserve">Air seal the attic and insulate it to at least R-60 (18” of loose-fill cellulose insulation). COA has been installing 24” (R-80) of cellulose insulation in attics on our campus. Before the attic is insulated, ensure that any needed bathroom and kitchen fans are installed and that all fans are properly vented to the outside.</w:t>
-      </w:r>
-    </w:p>
-    <w:p>
-      <w:pPr>
-        <w:pStyle w:val="BodyText"/>
-      </w:pPr>
-      <w:r>
-        <w:t xml:space="preserve">In older homes, most heat loss is due to air leakage. Air sealing is particularly important in the attic (and basement or crawlspace). As warm air rises and leaks out the top of your home, cold air is pulled in at the bottom. This is called the</w:t>
+        <w:t xml:space="preserve">Install a vapor barrier on the basement floor to stop moisture from entering the basement and house. Vapor barriers typically consist of either reinforced plastic sheeting or EPDM rubber membrane over a</w:t>
       </w:r>
       <w:r>
         <w:t xml:space="preserve"> </w:t>
       </w:r>
       <w:r>
-        <w:t xml:space="preserve">‘stack effect’</w:t>
-      </w:r>
-      <w:r>
-        <w:t xml:space="preserve">, and is more pronounced in taller homes. Thus, air sealing is necessary anywhere gaps allow air to move between your house and the attic. This typically includes gaps around the chimney, electrical penetrations, and wall top plates.</w:t>
+        <w:t xml:space="preserve">‘dimple mat’</w:t>
+      </w:r>
+      <w:r>
+        <w:t xml:space="preserve"> </w:t>
+      </w:r>
+      <w:r>
+        <w:t xml:space="preserve">that allows for drainage below the vapor barrier and prevents rocks from puncturing it. If the basement/crawlspace walls are going to be spray foamed, we recommend the foam go all the way to the floor and overlap the vapor barrier to create a continuous air and moisture barrier.</w:t>
       </w:r>
     </w:p>
     <w:p>
@@ -4405,17 +4361,17 @@
         <w:pStyle w:val="BodyText"/>
       </w:pPr>
       <w:r>
-        <w:t xml:space="preserve">Efficiency Maine rebates and other incentives for insulation work can fund up to 80% of the overall cost to weatherize your home (subject to a lifetime limit per building), up to $9,200 when combined with nonrefundable federal tax credits. You can call them at 866-376-2463 (Monday to Friday, 8:00 am to 5:00 pm) or visit their webpage about insulation rebates: https://www.efficiencymaine.com/at-home/insulation-rebates/</w:t>
+        <w:t xml:space="preserve">Efficiency Maine rebates will cover vapor barriers up to 25% of a weatherization project cost, if done as part of a larger insulation project. Most insulation companies can install spray foam and vapor barriers together. Efficiency Maine rebates and other incentives for insulation work can fund up to 80% of the overall cost to weatherize your home (subject to a lifetime limit per building), up to $9,200 when combined with nonrefundable federal tax credits. You can call them at 866-376-2463 (Monday to Friday, 8:00 am to 5:00 pm) or visit their webpage about insulation rebates: https://www.efficiencymaine.com/at-home/insulation-rebates/</w:t>
       </w:r>
     </w:p>
     <w:bookmarkEnd w:id="49"/>
-    <w:bookmarkStart w:id="50" w:name="blow-in-cellulose-wall-insulation"/>
+    <w:bookmarkStart w:id="50" w:name="spray-foam-basement-walls"/>
     <w:p>
       <w:pPr>
         <w:pStyle w:val="Heading3"/>
       </w:pPr>
       <w:r>
-        <w:t xml:space="preserve">4.9 Blow-in cellulose wall insulation</w:t>
+        <w:t xml:space="preserve">4.9 Spray foam Basement Walls</w:t>
       </w:r>
     </w:p>
     <w:p>
@@ -4435,7 +4391,7 @@
         <w:pStyle w:val="BodyText"/>
       </w:pPr>
       <w:r>
-        <w:t xml:space="preserve">The walls of the house are uninsulated, which is a significant source of heat loss.</w:t>
+        <w:t xml:space="preserve">The basement/crawlspace is uninsulated and used for mechanical equipment and plumbing. The walls are porous and allow moisture into the house and rapidly conduct heat out of the space.</w:t>
       </w:r>
     </w:p>
     <w:p>
@@ -4455,11 +4411,30 @@
         <w:pStyle w:val="BodyText"/>
       </w:pPr>
       <w:r>
-        <w:t xml:space="preserve">Insulate the wall stud cavities with dense packed, blown-in cellulose insulation. In balloon-framed homes, this can often be done from the attic, otherwise it can be done by drilling holes into the wall cavities from either the inside or outside.</w:t>
+        <w:t xml:space="preserve">Install spray foam on the basement/crawlspace walls to prevent moisture infiltration and reduce heat loss. In older homes, most heat loss is due to air leakage. Air sealing is particularly important in the basement or crawlspace (and attic). As warm air rises and leaks out the top of your home, cold air is pulled in at the bottom. This is called the</w:t>
       </w:r>
       <w:r>
         <w:t xml:space="preserve"> </w:t>
       </w:r>
+      <w:r>
+        <w:t xml:space="preserve">‘stack effect’</w:t>
+      </w:r>
+      <w:r>
+        <w:t xml:space="preserve">, and is more pronounced in taller homes. Thus, air sealing is necessary anywhere gaps allow air to move into your house through the basement/crawlspace.</w:t>
+      </w:r>
+    </w:p>
+    <w:p>
+      <w:pPr>
+        <w:pStyle w:val="BodyText"/>
+      </w:pPr>
+      <w:r>
+        <w:t xml:space="preserve">Spray foam should be applied 2-3 inches thick on the walls to seal and insulate them. It is often ideal to install a vapor barrier at the same time as the spray foam insulation. Spray foam generally requires a layer of intumescent (fire-rated) paint over it to meet fire code.</w:t>
+      </w:r>
+    </w:p>
+    <w:p>
+      <w:pPr>
+        <w:pStyle w:val="BodyText"/>
+      </w:pPr>
       <w:r>
         <w:rPr>
           <w:i/>
@@ -4473,17 +4448,17 @@
         <w:pStyle w:val="BodyText"/>
       </w:pPr>
       <w:r>
-        <w:t xml:space="preserve">Efficiency Maine rebates and other incentives for insulation work can fund up to 80% of the overall cost to weatherize your home (subject to a lifetime limit per building), up to $9,200 when combined with nonrefundable federal tax credits. You can call them at 866-376-2463 (Monday to Friday, 8:00 am to 5:00 pm) or visit their webpage about insulation rebates: https://www.efficiencymaine.com/at-home/insulation-rebates/</w:t>
+        <w:t xml:space="preserve">Installation of spray foam insulation will cost around $5-7 per square foot. Efficiency Maine rebates and other incentives for insulation work can fund up to 80% of the project cost (subject to a lifetime limit per building), up to $9,200 when combined with nonrefundable federal tax credits. You can call them at 866-376-2463 (Monday to Friday, 8:00 am to 5:00 pm) or visit their webpage about insulation rebates: https://www.efficiencymaine.com/at-home/insulation-rebates/</w:t>
       </w:r>
     </w:p>
     <w:bookmarkEnd w:id="50"/>
-    <w:bookmarkStart w:id="51" w:name="continuous-exterior-wall-insulation"/>
+    <w:bookmarkStart w:id="51" w:name="attic-insulation-and-air-sealing"/>
     <w:p>
       <w:pPr>
         <w:pStyle w:val="Heading3"/>
       </w:pPr>
       <w:r>
-        <w:t xml:space="preserve">4.10 Continuous exterior wall insulation</w:t>
+        <w:t xml:space="preserve">4.10 Attic Insulation and Air Sealing</w:t>
       </w:r>
     </w:p>
     <w:p>
@@ -4503,7 +4478,7 @@
         <w:pStyle w:val="BodyText"/>
       </w:pPr>
       <w:r>
-        <w:t xml:space="preserve">There isn’t continuous insulation between the siding and the exterior walls of the house. Continuous insulation helps create a complete thermal boundary for your house, and it is now an energy code requirement for new houses.</w:t>
+        <w:t xml:space="preserve">The attic is uninsulated or is missing insulation and the attic could also benefit from air-sealing. These upgrades will reduce draftiness and heat loss in the winter and heat gain in the summer.</w:t>
       </w:r>
     </w:p>
     <w:p>
@@ -4523,7 +4498,24 @@
         <w:pStyle w:val="BodyText"/>
       </w:pPr>
       <w:r>
-        <w:t xml:space="preserve">Add a continuous layer of insulation and potentially replace the air and moisture barrier once it becomes time to replace the siding. Add continuous insulation (R-6 or more) under the new siding to keep the house warmer in the winter and cooler in the summer. We recommend TimberHP TimberBoard insulation (produced in Madison, Maine) or Rockwool Comfortboard, but foam board can also be used. Before installing exterior insulation, the contractor can check if insulation is needed between the interior wall studs.</w:t>
+        <w:t xml:space="preserve">Air seal the attic and insulate it to at least R-60 (18 inches of loose-fill cellulose insulation). COA has been installing 24 inches (R-80) of cellulose insulation in attics on our campus. Before the attic is insulated, ensure that any needed bathroom and kitchen fans are installed and that all fans are properly vented to the outside.</w:t>
+      </w:r>
+    </w:p>
+    <w:p>
+      <w:pPr>
+        <w:pStyle w:val="BodyText"/>
+      </w:pPr>
+      <w:r>
+        <w:t xml:space="preserve">In older homes, most heat loss is due to air leakage. Air sealing is particularly important in the attic (and basement or crawlspace). As warm air rises and leaks out the top of your home, cold air is pulled in at the bottom. This is called the</w:t>
+      </w:r>
+      <w:r>
+        <w:t xml:space="preserve"> </w:t>
+      </w:r>
+      <w:r>
+        <w:t xml:space="preserve">‘stack effect’</w:t>
+      </w:r>
+      <w:r>
+        <w:t xml:space="preserve">, and is more pronounced in taller homes. Thus, air sealing is necessary anywhere gaps allow air to move between your house and the attic. This typically includes gaps around the chimney, electrical penetrations, and wall top plates.</w:t>
       </w:r>
     </w:p>
     <w:p>
@@ -4547,13 +4539,13 @@
       </w:r>
     </w:p>
     <w:bookmarkEnd w:id="51"/>
-    <w:bookmarkStart w:id="52" w:name="electrical-panel-upgrade"/>
+    <w:bookmarkStart w:id="52" w:name="blow-in-cellulose-wall-insulation"/>
     <w:p>
       <w:pPr>
         <w:pStyle w:val="Heading3"/>
       </w:pPr>
       <w:r>
-        <w:t xml:space="preserve">4.11 Electrical Panel Upgrade</w:t>
+        <w:t xml:space="preserve">4.11 Blow-in cellulose wall insulation</w:t>
       </w:r>
     </w:p>
     <w:p>
@@ -4573,6 +4565,144 @@
         <w:pStyle w:val="BodyText"/>
       </w:pPr>
       <w:r>
+        <w:t xml:space="preserve">The walls of the house are uninsulated, which is a significant source of heat loss.</w:t>
+      </w:r>
+    </w:p>
+    <w:p>
+      <w:pPr>
+        <w:pStyle w:val="BodyText"/>
+      </w:pPr>
+      <w:r>
+        <w:rPr>
+          <w:i/>
+          <w:iCs/>
+        </w:rPr>
+        <w:t xml:space="preserve">Recommendation</w:t>
+      </w:r>
+    </w:p>
+    <w:p>
+      <w:pPr>
+        <w:pStyle w:val="BodyText"/>
+      </w:pPr>
+      <w:r>
+        <w:t xml:space="preserve">Insulate the wall stud cavities with dense packed, blown-in cellulose insulation. In balloon-framed homes, this can often be done from the attic, otherwise it can be done by drilling holes into the wall cavities from either the inside or outside.</w:t>
+      </w:r>
+      <w:r>
+        <w:t xml:space="preserve"> </w:t>
+      </w:r>
+      <w:r>
+        <w:rPr>
+          <w:i/>
+          <w:iCs/>
+        </w:rPr>
+        <w:t xml:space="preserve">Estimated Cost/Benefits/Incentives</w:t>
+      </w:r>
+    </w:p>
+    <w:p>
+      <w:pPr>
+        <w:pStyle w:val="BodyText"/>
+      </w:pPr>
+      <w:r>
+        <w:t xml:space="preserve">Efficiency Maine rebates and other incentives for insulation work can fund up to 80% of the overall cost to weatherize your home (subject to a lifetime limit per building), up to $9,200 when combined with nonrefundable federal tax credits. You can call them at 866-376-2463 (Monday to Friday, 8:00 am to 5:00 pm) or visit their webpage about insulation rebates: https://www.efficiencymaine.com/at-home/insulation-rebates/</w:t>
+      </w:r>
+    </w:p>
+    <w:bookmarkEnd w:id="52"/>
+    <w:bookmarkStart w:id="53" w:name="continuous-exterior-wall-insulation"/>
+    <w:p>
+      <w:pPr>
+        <w:pStyle w:val="Heading3"/>
+      </w:pPr>
+      <w:r>
+        <w:t xml:space="preserve">4.12 Continuous exterior wall insulation</w:t>
+      </w:r>
+    </w:p>
+    <w:p>
+      <w:pPr>
+        <w:pStyle w:val="FirstParagraph"/>
+      </w:pPr>
+      <w:r>
+        <w:rPr>
+          <w:i/>
+          <w:iCs/>
+        </w:rPr>
+        <w:t xml:space="preserve">Problem</w:t>
+      </w:r>
+    </w:p>
+    <w:p>
+      <w:pPr>
+        <w:pStyle w:val="BodyText"/>
+      </w:pPr>
+      <w:r>
+        <w:t xml:space="preserve">There isn’t continuous insulation between the siding and the exterior walls of the house. Continuous insulation helps create a complete thermal boundary for your house, and it is now an energy code requirement for new houses.</w:t>
+      </w:r>
+    </w:p>
+    <w:p>
+      <w:pPr>
+        <w:pStyle w:val="BodyText"/>
+      </w:pPr>
+      <w:r>
+        <w:rPr>
+          <w:i/>
+          <w:iCs/>
+        </w:rPr>
+        <w:t xml:space="preserve">Recommendation</w:t>
+      </w:r>
+    </w:p>
+    <w:p>
+      <w:pPr>
+        <w:pStyle w:val="BodyText"/>
+      </w:pPr>
+      <w:r>
+        <w:t xml:space="preserve">Add a continuous layer of insulation and potentially replace the air and moisture barrier once it becomes time to replace the siding. Add continuous insulation (R-6 or more) under the new siding to keep the house warmer in the winter and cooler in the summer. We recommend TimberHP TimberBoard insulation (produced in Madison, Maine) or Rockwool Comfortboard, but foam board can also be used. Before installing exterior insulation, the contractor can check if insulation is needed between the interior wall studs.</w:t>
+      </w:r>
+    </w:p>
+    <w:p>
+      <w:pPr>
+        <w:pStyle w:val="BodyText"/>
+      </w:pPr>
+      <w:r>
+        <w:rPr>
+          <w:i/>
+          <w:iCs/>
+        </w:rPr>
+        <w:t xml:space="preserve">Estimated Cost/Benefits/Incentives</w:t>
+      </w:r>
+    </w:p>
+    <w:p>
+      <w:pPr>
+        <w:pStyle w:val="BodyText"/>
+      </w:pPr>
+      <w:r>
+        <w:t xml:space="preserve">Efficiency Maine rebates and other incentives for insulation work can fund up to 80% of the overall cost to weatherize your home (subject to a lifetime limit per building), up to $9,200 when combined with nonrefundable federal tax credits. You can call them at 866-376-2463 (Monday to Friday, 8:00 am to 5:00 pm) or visit their webpage about insulation rebates: https://www.efficiencymaine.com/at-home/insulation-rebates/</w:t>
+      </w:r>
+    </w:p>
+    <w:bookmarkEnd w:id="53"/>
+    <w:bookmarkStart w:id="54" w:name="electrical-panel-upgrade"/>
+    <w:p>
+      <w:pPr>
+        <w:pStyle w:val="Heading3"/>
+      </w:pPr>
+      <w:r>
+        <w:t xml:space="preserve">4.13 Electrical Panel Upgrade</w:t>
+      </w:r>
+    </w:p>
+    <w:p>
+      <w:pPr>
+        <w:pStyle w:val="FirstParagraph"/>
+      </w:pPr>
+      <w:r>
+        <w:rPr>
+          <w:i/>
+          <w:iCs/>
+        </w:rPr>
+        <w:t xml:space="preserve">Problem</w:t>
+      </w:r>
+    </w:p>
+    <w:p>
+      <w:pPr>
+        <w:pStyle w:val="BodyText"/>
+      </w:pPr>
+      <w:r>
         <w:rPr>
           <w:b/>
           <w:bCs/>
@@ -4620,14 +4750,14 @@
         <w:t xml:space="preserve">Costs of electrical components needed to support residential energy upgrades – including panels, sub-panels, branch circuits, and feeders – qualify for a 30% nonrefundable tax credit (up to $600 per item) if they have a capacity of 200 amps or more. An electrical panel upgrades also provides a good opportunity for an electrician to install whole-house surge protection, which costs $100-$400. Here are some options: https://www.popularmechanics.com/home/interior-projects/g43140886/best-whole-house-surge-protectors/</w:t>
       </w:r>
     </w:p>
-    <w:bookmarkEnd w:id="52"/>
-    <w:bookmarkStart w:id="53" w:name="air-source-heat-pump"/>
+    <w:bookmarkEnd w:id="54"/>
+    <w:bookmarkStart w:id="55" w:name="pipe-insulation"/>
     <w:p>
       <w:pPr>
         <w:pStyle w:val="Heading3"/>
       </w:pPr>
       <w:r>
-        <w:t xml:space="preserve">4.12 Air Source Heat Pump</w:t>
+        <w:t xml:space="preserve">4.14 Pipe Insulation</w:t>
       </w:r>
     </w:p>
     <w:p>
@@ -4647,7 +4777,7 @@
         <w:pStyle w:val="BodyText"/>
       </w:pPr>
       <w:r>
-        <w:t xml:space="preserve">Combustion heating equipment is expensive, inefficient, and has the potential to release harmful combustion gases like carbon monoxide into the home.</w:t>
+        <w:t xml:space="preserve">Uninsulated water pipes are responsible for heat loss and excess moisture (from condensation) in your basement/crawlspace.</w:t>
       </w:r>
     </w:p>
     <w:p>
@@ -4667,7 +4797,7 @@
         <w:pStyle w:val="BodyText"/>
       </w:pPr>
       <w:r>
-        <w:t xml:space="preserve">Install air source heat pumps and whole-house surge protection. Air source heat pumps can be up to 300% efficient and heat, cool, and dehumidify your house. A qualified installer will help determine what size system to install and where. Whole-house surge protection will protect your appliances and heat pumps from being damaged by an electrical surge.</w:t>
+        <w:t xml:space="preserve">Insulate both hot and cold water pipes that are uninsulated in the basement/crawlspace. This will save energy and prevent condensation. We recommend foam pipe insulation made of polyethylene or neoprene.</w:t>
       </w:r>
     </w:p>
     <w:p>
@@ -4687,17 +4817,17 @@
         <w:pStyle w:val="BodyText"/>
       </w:pPr>
       <w:r>
-        <w:t xml:space="preserve">Efficiency Maine rebates can fund $1,000 to $3,000 per unit up to a lifetime limit per housing unit for $3,000 to $9,000 (depending on income level) to install heat pumps. The rebate can be combined with a nonrefundable federal tax credit of 30% of the remaining cost of the unit and labor, subject to an annual maximum benefit of $2,000 (shared with other energy property, like a heat pump water heater). You can call Efficiency Maine at 866-376-2463 (Monday to Friday, 8:00 am to 5:00 pm) or visit their website: https://www.efficiencymaine.com/at-home/residential-heat-pump-incentives/</w:t>
-      </w:r>
-    </w:p>
-    <w:bookmarkEnd w:id="53"/>
-    <w:bookmarkStart w:id="54" w:name="pipe-insulation"/>
+        <w:t xml:space="preserve">Insulating water pipes can save 2%-4% on hot water bills and increase the temperature of the water while reducing the time it takes for hot water to reach your tap. Materials cost around $100-200, depending on the length of pipe to insulate. Many people find this to be an easy project to do themselves.</w:t>
+      </w:r>
+    </w:p>
+    <w:bookmarkEnd w:id="55"/>
+    <w:bookmarkStart w:id="56" w:name="whole-house-surge-protection"/>
     <w:p>
       <w:pPr>
         <w:pStyle w:val="Heading3"/>
       </w:pPr>
       <w:r>
-        <w:t xml:space="preserve">4.13 Pipe Insulation</w:t>
+        <w:t xml:space="preserve">4.15 Whole House Surge Protection</w:t>
       </w:r>
     </w:p>
     <w:p>
@@ -4717,7 +4847,7 @@
         <w:pStyle w:val="BodyText"/>
       </w:pPr>
       <w:r>
-        <w:t xml:space="preserve">Uninsulated water pipes are responsible for heat loss and excess moisture (from condensation) in your basement/crawlspace.</w:t>
+        <w:t xml:space="preserve">Your house does not have whole-house surge protection. This will protect your large electrical appliances from damage in the case of an electrical surge. Heat pumps, heat pump water heaters, and other electronics are particularly sensitive to electrical surges.</w:t>
       </w:r>
     </w:p>
     <w:p>
@@ -4737,13 +4867,11 @@
         <w:pStyle w:val="BodyText"/>
       </w:pPr>
       <w:r>
-        <w:t xml:space="preserve">Insulate both hot and cold water pipes that are uninsulated in the basement/crawlspace. This will save energy and prevent condensation. We recommend foam pipe insulation made of polyethylene or neoprene.</w:t>
-      </w:r>
-    </w:p>
-    <w:p>
-      <w:pPr>
-        <w:pStyle w:val="BodyText"/>
-      </w:pPr>
+        <w:t xml:space="preserve">Seal easy-to-access air leaks and weatherstrip exterior doors. In older homes, most heat loss is due to air leakage. WindowDressers insulating window inserts can also help reduce air leakage.</w:t>
+      </w:r>
+      <w:r>
+        <w:t xml:space="preserve"> </w:t>
+      </w:r>
       <w:r>
         <w:rPr>
           <w:i/>
@@ -4757,17 +4885,17 @@
         <w:pStyle w:val="BodyText"/>
       </w:pPr>
       <w:r>
-        <w:t xml:space="preserve">Insulating water pipes can save 2%-4% on hot water bills and increase the temperature of the water while reducing the time it takes for hot water to reach your tap. Materials cost around $100-200, depending on the length of pipe to insulate. Many people find this to be an easy project to do themselves.</w:t>
-      </w:r>
-    </w:p>
-    <w:bookmarkEnd w:id="54"/>
-    <w:bookmarkStart w:id="55" w:name="whole-house-surge-protection"/>
+        <w:t xml:space="preserve">The device costs $100-$400 and needs to be installed by an electrician. Here are some options: https://www.popularmechanics.com/home/interior-projects/g43140886/best-whole-house-surge-protectors/</w:t>
+      </w:r>
+    </w:p>
+    <w:bookmarkEnd w:id="56"/>
+    <w:bookmarkStart w:id="57" w:name="diy-air-sealing"/>
     <w:p>
       <w:pPr>
         <w:pStyle w:val="Heading3"/>
       </w:pPr>
       <w:r>
-        <w:t xml:space="preserve">4.14 Whole House Surge Protection</w:t>
+        <w:t xml:space="preserve">4.16 DIY Air Sealing</w:t>
       </w:r>
     </w:p>
     <w:p>
@@ -4787,7 +4915,26 @@
         <w:pStyle w:val="BodyText"/>
       </w:pPr>
       <w:r>
-        <w:t xml:space="preserve">Your house does not have whole-house surge protection. This will protect your large electrical appliances from damage in the case of an electrical surge. Heat pumps, heat pump water heaters, and other electronics are particularly sensitive to electrical surges.</w:t>
+        <w:t xml:space="preserve">During the blower door test, we noted sources of air leakage in the living areas of your house.</w:t>
+      </w:r>
+    </w:p>
+    <w:p>
+      <w:pPr>
+        <w:pStyle w:val="BodyText"/>
+      </w:pPr>
+      <w:r>
+        <w:rPr>
+          <w:b/>
+          <w:bCs/>
+        </w:rPr>
+        <w:t xml:space="preserve">Auditor to detail customized findings.</w:t>
+      </w:r>
+      <w:r>
+        <w:rPr>
+          <w:b/>
+          <w:bCs/>
+        </w:rPr>
+        <w:t xml:space="preserve"> </w:t>
       </w:r>
     </w:p>
     <w:p>
@@ -4807,11 +4954,13 @@
         <w:pStyle w:val="BodyText"/>
       </w:pPr>
       <w:r>
-        <w:t xml:space="preserve">Seal easy-to-access air leaks and weatherstrip exterior doors. In older homes, most heat loss is due to air leakage. WindowDressers insulating window inserts can also help reduce air leakage.</w:t>
-      </w:r>
-      <w:r>
-        <w:t xml:space="preserve"> </w:t>
-      </w:r>
+        <w:t xml:space="preserve">Air sealing the air leaks we identified around the living areas of your house can be a DIY solution to lower energy use, or an insulation contractor can seal the leaks when they come to your house for a larger project. Please address any moisture concerns before undertaking significant air sealing efforts.</w:t>
+      </w:r>
+    </w:p>
+    <w:p>
+      <w:pPr>
+        <w:pStyle w:val="BodyText"/>
+      </w:pPr>
       <w:r>
         <w:rPr>
           <w:i/>
@@ -4825,17 +4974,23 @@
         <w:pStyle w:val="BodyText"/>
       </w:pPr>
       <w:r>
-        <w:t xml:space="preserve">The device costs $100-$400 and needs to be installed by an electrician. Here are some options: https://www.popularmechanics.com/home/interior-projects/g43140886/best-whole-house-surge-protectors/</w:t>
-      </w:r>
-    </w:p>
-    <w:bookmarkEnd w:id="55"/>
-    <w:bookmarkStart w:id="56" w:name="diy-air-sealing"/>
+        <w:t xml:space="preserve">Air sealing and insulating ductwork is eligible for a non-refundable federal tax credit (</w:t>
+      </w:r>
+      <w:r>
+        <w:t xml:space="preserve">“Energy Efficient Home Improvement Credit”</w:t>
+      </w:r>
+      <w:r>
+        <w:t xml:space="preserve">), which can pay for 30% of the project cost, subject to an annual maximum of $1,200 (shared with other home envelope improvements, like attic and basement projects).</w:t>
+      </w:r>
+    </w:p>
+    <w:bookmarkEnd w:id="57"/>
+    <w:bookmarkStart w:id="58" w:name="other-1"/>
     <w:p>
       <w:pPr>
         <w:pStyle w:val="Heading3"/>
       </w:pPr>
       <w:r>
-        <w:t xml:space="preserve">4.15 DIY Air Sealing</w:t>
+        <w:t xml:space="preserve">4.17 Other 1</w:t>
       </w:r>
     </w:p>
     <w:p>
@@ -4855,7 +5010,31 @@
         <w:pStyle w:val="BodyText"/>
       </w:pPr>
       <w:r>
-        <w:t xml:space="preserve">During the blower door test, we noted sources of air leakage in the living areas of your house.</w:t>
+        <w:rPr>
+          <w:i/>
+          <w:iCs/>
+        </w:rPr>
+        <w:t xml:space="preserve">Recommendation</w:t>
+      </w:r>
+    </w:p>
+    <w:p>
+      <w:pPr>
+        <w:pStyle w:val="BodyText"/>
+      </w:pPr>
+      <w:r>
+        <w:t xml:space="preserve">Upgrade your electrical panel to add whole-house surge protection. This will help to protect your heat pumps, heat pump water heater, refrigerator, well pump, and other electronics from damage due to lightning or other electrical surges.</w:t>
+      </w:r>
+    </w:p>
+    <w:p>
+      <w:pPr>
+        <w:pStyle w:val="BodyText"/>
+      </w:pPr>
+      <w:r>
+        <w:rPr>
+          <w:i/>
+          <w:iCs/>
+        </w:rPr>
+        <w:t xml:space="preserve">Estimated Cost/Benefits/Incentives</w:t>
       </w:r>
     </w:p>
     <w:p>
@@ -4867,14 +5046,601 @@
           <w:b/>
           <w:bCs/>
         </w:rPr>
-        <w:t xml:space="preserve">Auditor to detail customized findings.</w:t>
-      </w:r>
+        <w:t xml:space="preserve">Auditor to describe. Primary residence</w:t>
+      </w:r>
+    </w:p>
+    <w:p>
+      <w:pPr>
+        <w:pStyle w:val="SourceCode"/>
+      </w:pPr>
+      <w:r>
+        <w:rPr>
+          <w:rStyle w:val="NormalTok"/>
+        </w:rPr>
+        <w:t xml:space="preserve"> </w:t>
+      </w:r>
+      <w:r>
+        <w:rPr>
+          <w:rStyle w:val="CommentTok"/>
+        </w:rPr>
+        <w:t xml:space="preserve">#| label: other 3 recommendation</w:t>
+      </w:r>
+      <w:r>
+        <w:br/>
+      </w:r>
+      <w:r>
+        <w:rPr>
+          <w:rStyle w:val="NormalTok"/>
+        </w:rPr>
+        <w:t xml:space="preserve"> </w:t>
+      </w:r>
+      <w:r>
+        <w:rPr>
+          <w:rStyle w:val="CommentTok"/>
+        </w:rPr>
+        <w:t xml:space="preserve">#| echo: false</w:t>
+      </w:r>
+      <w:r>
+        <w:br/>
+      </w:r>
+      <w:r>
+        <w:rPr>
+          <w:rStyle w:val="NormalTok"/>
+        </w:rPr>
+        <w:t xml:space="preserve"> </w:t>
+      </w:r>
+      <w:r>
+        <w:rPr>
+          <w:rStyle w:val="CommentTok"/>
+        </w:rPr>
+        <w:t xml:space="preserve">#| results: asis</w:t>
+      </w:r>
+      <w:r>
+        <w:br/>
+      </w:r>
+      <w:r>
+        <w:br/>
+      </w:r>
+      <w:r>
+        <w:br/>
+      </w:r>
+      <w:r>
+        <w:rPr>
+          <w:rStyle w:val="ControlFlowTok"/>
+        </w:rPr>
+        <w:t xml:space="preserve">if</w:t>
+      </w:r>
+      <w:r>
+        <w:rPr>
+          <w:rStyle w:val="NormalTok"/>
+        </w:rPr>
+        <w:t xml:space="preserve">( other_3 </w:t>
+      </w:r>
+      <w:r>
+        <w:rPr>
+          <w:rStyle w:val="SpecialCharTok"/>
+        </w:rPr>
+        <w:t xml:space="preserve">==</w:t>
+      </w:r>
+      <w:r>
+        <w:rPr>
+          <w:rStyle w:val="NormalTok"/>
+        </w:rPr>
+        <w:t xml:space="preserve"> </w:t>
+      </w:r>
+      <w:r>
+        <w:rPr>
+          <w:rStyle w:val="ConstantTok"/>
+        </w:rPr>
+        <w:t xml:space="preserve">TRUE</w:t>
+      </w:r>
+      <w:r>
+        <w:rPr>
+          <w:rStyle w:val="NormalTok"/>
+        </w:rPr>
+        <w:t xml:space="preserve">){</w:t>
+      </w:r>
+      <w:r>
+        <w:br/>
+      </w:r>
+      <w:r>
+        <w:rPr>
+          <w:rStyle w:val="NormalTok"/>
+        </w:rPr>
+        <w:t xml:space="preserve">  </w:t>
+      </w:r>
+      <w:r>
+        <w:rPr>
+          <w:rStyle w:val="FunctionTok"/>
+        </w:rPr>
+        <w:t xml:space="preserve">cat</w:t>
+      </w:r>
+      <w:r>
+        <w:rPr>
+          <w:rStyle w:val="NormalTok"/>
+        </w:rPr>
+        <w:t xml:space="preserve">(</w:t>
+      </w:r>
+      <w:r>
+        <w:rPr>
+          <w:rStyle w:val="StringTok"/>
+        </w:rPr>
+        <w:t xml:space="preserve">"### Other 3</w:t>
+      </w:r>
+      <w:r>
+        <w:br/>
+      </w:r>
+      <w:r>
+        <w:rPr>
+          <w:rStyle w:val="StringTok"/>
+        </w:rPr>
+        <w:t xml:space="preserve">  </w:t>
+      </w:r>
+      <w:r>
+        <w:br/>
+      </w:r>
+      <w:r>
+        <w:rPr>
+          <w:rStyle w:val="StringTok"/>
+        </w:rPr>
+        <w:t xml:space="preserve">*Problem*</w:t>
+      </w:r>
+      <w:r>
+        <w:br/>
+      </w:r>
+      <w:r>
+        <w:br/>
+      </w:r>
+      <w:r>
+        <w:rPr>
+          <w:rStyle w:val="StringTok"/>
+        </w:rPr>
+        <w:t xml:space="preserve">*Recommendation*</w:t>
+      </w:r>
+      <w:r>
+        <w:br/>
+      </w:r>
+      <w:r>
+        <w:br/>
+      </w:r>
+      <w:r>
+        <w:rPr>
+          <w:rStyle w:val="StringTok"/>
+        </w:rPr>
+        <w:t xml:space="preserve">"</w:t>
+      </w:r>
+      <w:r>
+        <w:rPr>
+          <w:rStyle w:val="NormalTok"/>
+        </w:rPr>
+        <w:t xml:space="preserve">)</w:t>
+      </w:r>
+      <w:r>
+        <w:br/>
+      </w:r>
+      <w:r>
+        <w:rPr>
+          <w:rStyle w:val="NormalTok"/>
+        </w:rPr>
+        <w:t xml:space="preserve">}</w:t>
+      </w:r>
+      <w:r>
+        <w:rPr>
+          <w:rStyle w:val="ControlFlowTok"/>
+        </w:rPr>
+        <w:t xml:space="preserve">else</w:t>
+      </w:r>
+      <w:r>
+        <w:rPr>
+          <w:rStyle w:val="NormalTok"/>
+        </w:rPr>
+        <w:t xml:space="preserve">{</w:t>
+      </w:r>
+      <w:r>
+        <w:br/>
+      </w:r>
+      <w:r>
+        <w:rPr>
+          <w:rStyle w:val="NormalTok"/>
+        </w:rPr>
+        <w:t xml:space="preserve">  </w:t>
+      </w:r>
+      <w:r>
+        <w:rPr>
+          <w:rStyle w:val="FunctionTok"/>
+        </w:rPr>
+        <w:t xml:space="preserve">cat</w:t>
+      </w:r>
+      <w:r>
+        <w:rPr>
+          <w:rStyle w:val="NormalTok"/>
+        </w:rPr>
+        <w:t xml:space="preserve">(</w:t>
+      </w:r>
+      <w:r>
+        <w:rPr>
+          <w:rStyle w:val="StringTok"/>
+        </w:rPr>
+        <w:t xml:space="preserve">""</w:t>
+      </w:r>
+      <w:r>
+        <w:rPr>
+          <w:rStyle w:val="NormalTok"/>
+        </w:rPr>
+        <w:t xml:space="preserve">)</w:t>
+      </w:r>
+      <w:r>
+        <w:br/>
+      </w:r>
+      <w:r>
+        <w:rPr>
+          <w:rStyle w:val="NormalTok"/>
+        </w:rPr>
+        <w:t xml:space="preserve">}</w:t>
+      </w:r>
+      <w:r>
+        <w:br/>
+      </w:r>
+      <w:r>
+        <w:br/>
+      </w:r>
+      <w:r>
+        <w:rPr>
+          <w:rStyle w:val="ControlFlowTok"/>
+        </w:rPr>
+        <w:t xml:space="preserve">if</w:t>
+      </w:r>
+      <w:r>
+        <w:rPr>
+          <w:rStyle w:val="NormalTok"/>
+        </w:rPr>
+        <w:t xml:space="preserve">(other_3 </w:t>
+      </w:r>
+      <w:r>
+        <w:rPr>
+          <w:rStyle w:val="SpecialCharTok"/>
+        </w:rPr>
+        <w:t xml:space="preserve">==</w:t>
+      </w:r>
+      <w:r>
+        <w:rPr>
+          <w:rStyle w:val="NormalTok"/>
+        </w:rPr>
+        <w:t xml:space="preserve"> </w:t>
+      </w:r>
+      <w:r>
+        <w:rPr>
+          <w:rStyle w:val="ConstantTok"/>
+        </w:rPr>
+        <w:t xml:space="preserve">TRUE</w:t>
+      </w:r>
+      <w:r>
+        <w:rPr>
+          <w:rStyle w:val="NormalTok"/>
+        </w:rPr>
+        <w:t xml:space="preserve">){</w:t>
+      </w:r>
+      <w:r>
+        <w:br/>
+      </w:r>
+      <w:r>
+        <w:rPr>
+          <w:rStyle w:val="NormalTok"/>
+        </w:rPr>
+        <w:t xml:space="preserve">  </w:t>
+      </w:r>
+      <w:r>
+        <w:rPr>
+          <w:rStyle w:val="FunctionTok"/>
+        </w:rPr>
+        <w:t xml:space="preserve">cat</w:t>
+      </w:r>
+      <w:r>
+        <w:rPr>
+          <w:rStyle w:val="NormalTok"/>
+        </w:rPr>
+        <w:t xml:space="preserve">(a_other_3</w:t>
+      </w:r>
+      <w:r>
+        <w:rPr>
+          <w:rStyle w:val="SpecialCharTok"/>
+        </w:rPr>
+        <w:t xml:space="preserve">$</w:t>
+      </w:r>
+      <w:r>
+        <w:rPr>
+          <w:rStyle w:val="NormalTok"/>
+        </w:rPr>
+        <w:t xml:space="preserve">Description</w:t>
+      </w:r>
+      <w:r>
+        <w:br/>
+      </w:r>
+      <w:r>
+        <w:rPr>
+          <w:rStyle w:val="NormalTok"/>
+        </w:rPr>
+        <w:t xml:space="preserve">    </w:t>
+      </w:r>
+      <w:r>
+        <w:br/>
+      </w:r>
+      <w:r>
+        <w:rPr>
+          <w:rStyle w:val="NormalTok"/>
+        </w:rPr>
+        <w:t xml:space="preserve">  )</w:t>
+      </w:r>
+      <w:r>
+        <w:br/>
+      </w:r>
+      <w:r>
+        <w:rPr>
+          <w:rStyle w:val="NormalTok"/>
+        </w:rPr>
+        <w:t xml:space="preserve">}</w:t>
+      </w:r>
+      <w:r>
+        <w:rPr>
+          <w:rStyle w:val="ControlFlowTok"/>
+        </w:rPr>
+        <w:t xml:space="preserve">else</w:t>
+      </w:r>
+      <w:r>
+        <w:rPr>
+          <w:rStyle w:val="NormalTok"/>
+        </w:rPr>
+        <w:t xml:space="preserve">{</w:t>
+      </w:r>
+      <w:r>
+        <w:br/>
+      </w:r>
+      <w:r>
+        <w:rPr>
+          <w:rStyle w:val="NormalTok"/>
+        </w:rPr>
+        <w:t xml:space="preserve">  </w:t>
+      </w:r>
+      <w:r>
+        <w:rPr>
+          <w:rStyle w:val="FunctionTok"/>
+        </w:rPr>
+        <w:t xml:space="preserve">cat</w:t>
+      </w:r>
+      <w:r>
+        <w:rPr>
+          <w:rStyle w:val="NormalTok"/>
+        </w:rPr>
+        <w:t xml:space="preserve">(</w:t>
+      </w:r>
+      <w:r>
+        <w:rPr>
+          <w:rStyle w:val="StringTok"/>
+        </w:rPr>
+        <w:t xml:space="preserve">""</w:t>
+      </w:r>
+      <w:r>
+        <w:rPr>
+          <w:rStyle w:val="NormalTok"/>
+        </w:rPr>
+        <w:t xml:space="preserve">)</w:t>
+      </w:r>
+      <w:r>
+        <w:br/>
+      </w:r>
+      <w:r>
+        <w:rPr>
+          <w:rStyle w:val="NormalTok"/>
+        </w:rPr>
+        <w:t xml:space="preserve">  }</w:t>
+      </w:r>
+      <w:r>
+        <w:br/>
+      </w:r>
+      <w:r>
+        <w:br/>
+      </w:r>
+      <w:r>
+        <w:rPr>
+          <w:rStyle w:val="ControlFlowTok"/>
+        </w:rPr>
+        <w:t xml:space="preserve">if</w:t>
+      </w:r>
+      <w:r>
+        <w:rPr>
+          <w:rStyle w:val="NormalTok"/>
+        </w:rPr>
+        <w:t xml:space="preserve">(other_3 </w:t>
+      </w:r>
+      <w:r>
+        <w:rPr>
+          <w:rStyle w:val="SpecialCharTok"/>
+        </w:rPr>
+        <w:t xml:space="preserve">==</w:t>
+      </w:r>
+      <w:r>
+        <w:rPr>
+          <w:rStyle w:val="NormalTok"/>
+        </w:rPr>
+        <w:t xml:space="preserve"> </w:t>
+      </w:r>
+      <w:r>
+        <w:rPr>
+          <w:rStyle w:val="ConstantTok"/>
+        </w:rPr>
+        <w:t xml:space="preserve">TRUE</w:t>
+      </w:r>
+      <w:r>
+        <w:rPr>
+          <w:rStyle w:val="NormalTok"/>
+        </w:rPr>
+        <w:t xml:space="preserve">){</w:t>
+      </w:r>
+      <w:r>
+        <w:br/>
+      </w:r>
+      <w:r>
+        <w:rPr>
+          <w:rStyle w:val="NormalTok"/>
+        </w:rPr>
+        <w:t xml:space="preserve">  </w:t>
+      </w:r>
+      <w:r>
+        <w:rPr>
+          <w:rStyle w:val="FunctionTok"/>
+        </w:rPr>
+        <w:t xml:space="preserve">cat</w:t>
+      </w:r>
+      <w:r>
+        <w:rPr>
+          <w:rStyle w:val="NormalTok"/>
+        </w:rPr>
+        <w:t xml:space="preserve">(</w:t>
+      </w:r>
+      <w:r>
+        <w:rPr>
+          <w:rStyle w:val="StringTok"/>
+        </w:rPr>
+        <w:t xml:space="preserve">"</w:t>
+      </w:r>
+      <w:r>
+        <w:br/>
+      </w:r>
+      <w:r>
+        <w:br/>
+      </w:r>
+      <w:r>
+        <w:rPr>
+          <w:rStyle w:val="StringTok"/>
+        </w:rPr>
+        <w:t xml:space="preserve">*Estimated Cost/Benefits/Incentives*</w:t>
+      </w:r>
+      <w:r>
+        <w:br/>
+      </w:r>
+      <w:r>
+        <w:br/>
+      </w:r>
+      <w:r>
+        <w:rPr>
+          <w:rStyle w:val="StringTok"/>
+        </w:rPr>
+        <w:t xml:space="preserve">"</w:t>
+      </w:r>
+      <w:r>
+        <w:rPr>
+          <w:rStyle w:val="NormalTok"/>
+        </w:rPr>
+        <w:t xml:space="preserve">, auto_other_3_estimates</w:t>
+      </w:r>
+      <w:r>
+        <w:rPr>
+          <w:rStyle w:val="SpecialCharTok"/>
+        </w:rPr>
+        <w:t xml:space="preserve">$</w:t>
+      </w:r>
+      <w:r>
+        <w:rPr>
+          <w:rStyle w:val="NormalTok"/>
+        </w:rPr>
+        <w:t xml:space="preserve">Description)</w:t>
+      </w:r>
+      <w:r>
+        <w:br/>
+      </w:r>
+      <w:r>
+        <w:rPr>
+          <w:rStyle w:val="NormalTok"/>
+        </w:rPr>
+        <w:t xml:space="preserve">}</w:t>
+      </w:r>
+      <w:r>
+        <w:rPr>
+          <w:rStyle w:val="ControlFlowTok"/>
+        </w:rPr>
+        <w:t xml:space="preserve">else</w:t>
+      </w:r>
+      <w:r>
+        <w:rPr>
+          <w:rStyle w:val="NormalTok"/>
+        </w:rPr>
+        <w:t xml:space="preserve">{</w:t>
+      </w:r>
+      <w:r>
+        <w:br/>
+      </w:r>
+      <w:r>
+        <w:rPr>
+          <w:rStyle w:val="NormalTok"/>
+        </w:rPr>
+        <w:t xml:space="preserve">  </w:t>
+      </w:r>
+      <w:r>
+        <w:rPr>
+          <w:rStyle w:val="FunctionTok"/>
+        </w:rPr>
+        <w:t xml:space="preserve">cat</w:t>
+      </w:r>
+      <w:r>
+        <w:rPr>
+          <w:rStyle w:val="NormalTok"/>
+        </w:rPr>
+        <w:t xml:space="preserve">(</w:t>
+      </w:r>
+      <w:r>
+        <w:rPr>
+          <w:rStyle w:val="StringTok"/>
+        </w:rPr>
+        <w:t xml:space="preserve">""</w:t>
+      </w:r>
+      <w:r>
+        <w:rPr>
+          <w:rStyle w:val="NormalTok"/>
+        </w:rPr>
+        <w:t xml:space="preserve">)</w:t>
+      </w:r>
+      <w:r>
+        <w:br/>
+      </w:r>
+      <w:r>
+        <w:rPr>
+          <w:rStyle w:val="NormalTok"/>
+        </w:rPr>
+        <w:t xml:space="preserve">  } </w:t>
+      </w:r>
+    </w:p>
+    <w:bookmarkEnd w:id="58"/>
+    <w:bookmarkStart w:id="59" w:name="misc.-air-sealing-and-insulation"/>
+    <w:p>
+      <w:pPr>
+        <w:pStyle w:val="Heading3"/>
+      </w:pPr>
+      <w:r>
+        <w:t xml:space="preserve">4.18 Misc. Air Sealing and Insulation</w:t>
+      </w:r>
+    </w:p>
+    <w:p>
+      <w:pPr>
+        <w:pStyle w:val="FirstParagraph"/>
+      </w:pPr>
+      <w:r>
+        <w:rPr>
+          <w:i/>
+          <w:iCs/>
+        </w:rPr>
+        <w:t xml:space="preserve">Problem</w:t>
+      </w:r>
+    </w:p>
+    <w:p>
+      <w:pPr>
+        <w:pStyle w:val="BodyText"/>
+      </w:pPr>
       <w:r>
         <w:rPr>
           <w:b/>
           <w:bCs/>
         </w:rPr>
-        <w:t xml:space="preserve"> </w:t>
+        <w:t xml:space="preserve">Need a description for the problem</w:t>
       </w:r>
     </w:p>
     <w:p>
@@ -4894,43 +5660,254 @@
         <w:pStyle w:val="BodyText"/>
       </w:pPr>
       <w:r>
-        <w:t xml:space="preserve">Air sealing the air leaks we identified around the living areas of your house can be a DIY solution to lower energy use, or an insulation contractor can seal the leaks when they come to your house for a larger project. Please address any moisture concerns before undertaking significant air sealing efforts.</w:t>
-      </w:r>
-    </w:p>
-    <w:p>
-      <w:pPr>
-        <w:pStyle w:val="BodyText"/>
-      </w:pPr>
+        <w:t xml:space="preserve">Air seal and insulate [** insert auditor description - bay window, bulkhead door, chase, kneewall, anything else that is unique to the home and not otherwise covered in another recommendation]</w:t>
+      </w:r>
       <w:r>
         <w:rPr>
           <w:i/>
           <w:iCs/>
         </w:rPr>
-        <w:t xml:space="preserve">Estimated Cost/Benefits/Incentives</w:t>
-      </w:r>
-    </w:p>
-    <w:p>
-      <w:pPr>
-        <w:pStyle w:val="BodyText"/>
-      </w:pPr>
-      <w:r>
-        <w:t xml:space="preserve">Air sealing and insulating ductwork is eligible for a non-refundable federal tax credit (</w:t>
-      </w:r>
-      <w:r>
-        <w:t xml:space="preserve">“Energy Efficient Home Improvement Credit”</w:t>
-      </w:r>
-      <w:r>
-        <w:t xml:space="preserve">), which can pay for 30% of the project cost, subject to an annual maximum of $1,200 (shared with other home envelope improvements, like attic and basement projects).</w:t>
-      </w:r>
-    </w:p>
-    <w:bookmarkEnd w:id="56"/>
-    <w:bookmarkStart w:id="57" w:name="other-1"/>
+        <w:t xml:space="preserve">Estimated Costs/Benefits/Incentives</w:t>
+      </w:r>
+    </w:p>
+    <w:p>
+      <w:pPr>
+        <w:pStyle w:val="BodyText"/>
+      </w:pPr>
+      <w:r>
+        <w:t xml:space="preserve">As part of a larger insulation project, this work may be eligible for Efficiency Maine rebates and other incentives for insulation work, up to 80% of the overall cost to weatherize your home (subject to a lifetime limit per building).</w:t>
+      </w:r>
+    </w:p>
+    <w:bookmarkEnd w:id="59"/>
+    <w:bookmarkEnd w:id="60"/>
+    <w:bookmarkStart w:id="61" w:name="additional-resources"/>
+    <w:p>
+      <w:pPr>
+        <w:pStyle w:val="Heading2"/>
+      </w:pPr>
+      <w:r>
+        <w:t xml:space="preserve">5 Additional Resources</w:t>
+      </w:r>
+    </w:p>
+    <w:p>
+      <w:pPr>
+        <w:pStyle w:val="FirstParagraph"/>
+      </w:pPr>
+      <w:r>
+        <w:t xml:space="preserve">Many home efficiency upgrades are eligible for Efficiency Maine rebates and federal tax credits. Financial incentives vary based on income level and type of occupancy. An overview of all state rebates and federal tax credits can be found here: https://www.efficiencymaine.com/at-home/.</w:t>
+      </w:r>
+    </w:p>
+    <w:p>
+      <w:pPr>
+        <w:pStyle w:val="BodyText"/>
+      </w:pPr>
+      <w:r>
+        <w:t xml:space="preserve">You can search for Efficiency Maine registered contractors here: https://www.efficiencymaine.com/at-home/vendor-locator/.</w:t>
+      </w:r>
+    </w:p>
+    <w:p>
+      <w:pPr>
+        <w:pStyle w:val="BodyText"/>
+      </w:pPr>
+      <w:r>
+        <w:t xml:space="preserve">We recommend discussing a whole-home plan for insulation and air sealing work in the basement, walls, and attic with contractors to determine how to best sequence the work to take full advantage of the Efficiency Maine rebates (which are subject to lifetime maximums) and nonrefundable federal tax credits (which are subject to annual maximums).</w:t>
+      </w:r>
+    </w:p>
+    <w:p>
+      <w:pPr>
+        <w:pStyle w:val="BodyText"/>
+      </w:pPr>
+      <w:r>
+        <w:t xml:space="preserve">Efficiency Maine also offers home energy loans to help homeowners who are Maine residents pay for energy and related health and safety upgrades. There are no fees, and interest rates for multi-year loans are between 5.99% (max $7,500) and 7.99% (max $25,000), depending on income level. Low- and moderate-income homeowners who borrow the full $7,500 and pay it back over 10 years will pay a monthly cost of $83. There is also a 1-year, 0% APR option. To learn more or apply, call 866-376-2463 or visit https://www.efficiencymaine.com/home-energy-loans/</w:t>
+      </w:r>
+    </w:p>
+    <w:bookmarkEnd w:id="61"/>
+    <w:bookmarkStart w:id="80" w:name="section-four-tests"/>
+    <w:p>
+      <w:pPr>
+        <w:pStyle w:val="Heading2"/>
+      </w:pPr>
+      <w:r>
+        <w:t xml:space="preserve">6 Section Four Tests</w:t>
+      </w:r>
+    </w:p>
+    <w:bookmarkStart w:id="62" w:name="furnaceboiler-tune-up-1"/>
     <w:p>
       <w:pPr>
         <w:pStyle w:val="Heading3"/>
       </w:pPr>
       <w:r>
-        <w:t xml:space="preserve">4.16 Other 1</w:t>
+        <w:t xml:space="preserve">6.1 Furnace/Boiler Tune-up</w:t>
+      </w:r>
+    </w:p>
+    <w:bookmarkEnd w:id="62"/>
+    <w:bookmarkStart w:id="63" w:name="high-efficiency-shower-heads-1"/>
+    <w:p>
+      <w:pPr>
+        <w:pStyle w:val="Heading3"/>
+      </w:pPr>
+      <w:r>
+        <w:t xml:space="preserve">6.2 High-efficiency Shower Head(s)</w:t>
+      </w:r>
+    </w:p>
+    <w:bookmarkEnd w:id="63"/>
+    <w:bookmarkStart w:id="64" w:name="windowdressers"/>
+    <w:p>
+      <w:pPr>
+        <w:pStyle w:val="Heading3"/>
+      </w:pPr>
+      <w:r>
+        <w:t xml:space="preserve">6.3 WindowDressers</w:t>
+      </w:r>
+    </w:p>
+    <w:bookmarkEnd w:id="64"/>
+    <w:bookmarkStart w:id="65" w:name="freezer-1"/>
+    <w:p>
+      <w:pPr>
+        <w:pStyle w:val="Heading3"/>
+      </w:pPr>
+      <w:r>
+        <w:t xml:space="preserve">6.4 Freezer</w:t>
+      </w:r>
+    </w:p>
+    <w:bookmarkEnd w:id="65"/>
+    <w:bookmarkStart w:id="66" w:name="induction-stoveoven-1"/>
+    <w:p>
+      <w:pPr>
+        <w:pStyle w:val="Heading3"/>
+      </w:pPr>
+      <w:r>
+        <w:t xml:space="preserve">6.5 Induction Stove/Oven</w:t>
+      </w:r>
+    </w:p>
+    <w:bookmarkEnd w:id="66"/>
+    <w:bookmarkStart w:id="67" w:name="bathroom-exhaust-fans-1"/>
+    <w:p>
+      <w:pPr>
+        <w:pStyle w:val="Heading3"/>
+      </w:pPr>
+      <w:r>
+        <w:t xml:space="preserve">6.6 Bathroom Exhaust Fan(s)</w:t>
+      </w:r>
+    </w:p>
+    <w:bookmarkEnd w:id="67"/>
+    <w:bookmarkStart w:id="68" w:name="kitchen-exhaust-fan"/>
+    <w:p>
+      <w:pPr>
+        <w:pStyle w:val="Heading3"/>
+      </w:pPr>
+      <w:r>
+        <w:t xml:space="preserve">6.7 Kitchen Exhaust Fan</w:t>
+      </w:r>
+    </w:p>
+    <w:bookmarkEnd w:id="68"/>
+    <w:bookmarkStart w:id="69" w:name="vapor-barrier-1"/>
+    <w:p>
+      <w:pPr>
+        <w:pStyle w:val="Heading3"/>
+      </w:pPr>
+      <w:r>
+        <w:t xml:space="preserve">6.8 Vapor Barrier</w:t>
+      </w:r>
+    </w:p>
+    <w:bookmarkEnd w:id="69"/>
+    <w:bookmarkStart w:id="70" w:name="spray-foam-basementcrawlspace-walls"/>
+    <w:p>
+      <w:pPr>
+        <w:pStyle w:val="Heading3"/>
+      </w:pPr>
+      <w:r>
+        <w:t xml:space="preserve">6.9 Spray Foam Basement/Crawlspace Walls</w:t>
+      </w:r>
+    </w:p>
+    <w:bookmarkEnd w:id="70"/>
+    <w:bookmarkStart w:id="71" w:name="attic-air-sealing-and-insulation"/>
+    <w:p>
+      <w:pPr>
+        <w:pStyle w:val="Heading3"/>
+      </w:pPr>
+      <w:r>
+        <w:t xml:space="preserve">6.10 Attic Air Sealing and Insulation</w:t>
+      </w:r>
+    </w:p>
+    <w:bookmarkEnd w:id="71"/>
+    <w:bookmarkStart w:id="72" w:name="blown-in-cellulose-wall-insulation"/>
+    <w:p>
+      <w:pPr>
+        <w:pStyle w:val="Heading3"/>
+      </w:pPr>
+      <w:r>
+        <w:t xml:space="preserve">6.11 Blown-in Cellulose Wall Insulation</w:t>
+      </w:r>
+    </w:p>
+    <w:bookmarkEnd w:id="72"/>
+    <w:bookmarkStart w:id="73" w:name="continuous-exterior-wall-insulation-1"/>
+    <w:p>
+      <w:pPr>
+        <w:pStyle w:val="Heading3"/>
+      </w:pPr>
+      <w:r>
+        <w:t xml:space="preserve">6.12 Continuous Exterior Wall Insulation</w:t>
+      </w:r>
+    </w:p>
+    <w:bookmarkEnd w:id="73"/>
+    <w:bookmarkStart w:id="74" w:name="electrical-panel-upgrade-1"/>
+    <w:p>
+      <w:pPr>
+        <w:pStyle w:val="Heading3"/>
+      </w:pPr>
+      <w:r>
+        <w:t xml:space="preserve">6.13 Electrical Panel Upgrade</w:t>
+      </w:r>
+    </w:p>
+    <w:bookmarkEnd w:id="74"/>
+    <w:bookmarkStart w:id="75" w:name="whole-house-surge-protection-1"/>
+    <w:p>
+      <w:pPr>
+        <w:pStyle w:val="Heading3"/>
+      </w:pPr>
+      <w:r>
+        <w:t xml:space="preserve">6.14 Whole-House Surge Protection</w:t>
+      </w:r>
+    </w:p>
+    <w:bookmarkEnd w:id="75"/>
+    <w:bookmarkStart w:id="76" w:name="pipe-insulation-1"/>
+    <w:p>
+      <w:pPr>
+        <w:pStyle w:val="Heading3"/>
+      </w:pPr>
+      <w:r>
+        <w:t xml:space="preserve">6.15 Pipe Insulation</w:t>
+      </w:r>
+    </w:p>
+    <w:bookmarkEnd w:id="76"/>
+    <w:bookmarkStart w:id="77" w:name="diy-air-sealing-1"/>
+    <w:p>
+      <w:pPr>
+        <w:pStyle w:val="Heading3"/>
+      </w:pPr>
+      <w:r>
+        <w:t xml:space="preserve">6.16 DIY Air Sealing</w:t>
+      </w:r>
+    </w:p>
+    <w:bookmarkEnd w:id="77"/>
+    <w:bookmarkStart w:id="78" w:name="other-1-1"/>
+    <w:p>
+      <w:pPr>
+        <w:pStyle w:val="Heading3"/>
+      </w:pPr>
+      <w:r>
+        <w:t xml:space="preserve">6.17 Other 1</w:t>
+      </w:r>
+    </w:p>
+    <w:bookmarkEnd w:id="78"/>
+    <w:bookmarkStart w:id="79" w:name="misc.-air-sealing-and-insulation-1"/>
+    <w:p>
+      <w:pPr>
+        <w:pStyle w:val="Heading3"/>
+      </w:pPr>
+      <w:r>
+        <w:t xml:space="preserve">6.18 Misc. Air Sealing and Insulation</w:t>
       </w:r>
     </w:p>
     <w:p>
@@ -4938,1097 +5915,23 @@
         <w:pStyle w:val="FirstParagraph"/>
       </w:pPr>
       <w:r>
-        <w:rPr>
-          <w:i/>
-          <w:iCs/>
-        </w:rPr>
-        <w:t xml:space="preserve">Problem</w:t>
-      </w:r>
-    </w:p>
-    <w:p>
-      <w:pPr>
-        <w:pStyle w:val="BodyText"/>
-      </w:pPr>
-      <w:r>
-        <w:rPr>
-          <w:i/>
-          <w:iCs/>
-        </w:rPr>
-        <w:t xml:space="preserve">Recommendation</w:t>
-      </w:r>
-    </w:p>
-    <w:p>
-      <w:pPr>
-        <w:pStyle w:val="BodyText"/>
-      </w:pPr>
-      <w:r>
-        <w:t xml:space="preserve">Upgrade your electrical panel to add whole-house surge protection. This will help to protect your heat pumps, heat pump water heater, refrigerator, well pump, and other electronics from damage due to lightning or other electrical surges.</w:t>
-      </w:r>
-    </w:p>
-    <w:p>
-      <w:pPr>
-        <w:pStyle w:val="BodyText"/>
-      </w:pPr>
-      <w:r>
-        <w:rPr>
-          <w:i/>
-          <w:iCs/>
-        </w:rPr>
-        <w:t xml:space="preserve">Estimated Cost/Benefits/Incentives</w:t>
-      </w:r>
-    </w:p>
-    <w:p>
-      <w:pPr>
-        <w:pStyle w:val="BodyText"/>
-      </w:pPr>
-      <w:r>
-        <w:rPr>
-          <w:b/>
-          <w:bCs/>
-        </w:rPr>
-        <w:t xml:space="preserve">Auditor to describe. Primary residence</w:t>
-      </w:r>
-    </w:p>
-    <w:bookmarkEnd w:id="57"/>
-    <w:bookmarkStart w:id="58" w:name="other-2"/>
-    <w:p>
-      <w:pPr>
-        <w:pStyle w:val="Heading3"/>
-      </w:pPr>
-      <w:r>
-        <w:t xml:space="preserve">4.17 Other 2</w:t>
-      </w:r>
-    </w:p>
-    <w:p>
-      <w:pPr>
-        <w:pStyle w:val="FirstParagraph"/>
-      </w:pPr>
-      <w:r>
-        <w:rPr>
-          <w:i/>
-          <w:iCs/>
-        </w:rPr>
-        <w:t xml:space="preserve">Problem</w:t>
-      </w:r>
-    </w:p>
-    <w:p>
-      <w:pPr>
-        <w:pStyle w:val="BodyText"/>
-      </w:pPr>
-      <w:r>
-        <w:rPr>
-          <w:i/>
-          <w:iCs/>
-        </w:rPr>
-        <w:t xml:space="preserve">Recommendation</w:t>
-      </w:r>
-    </w:p>
-    <w:p>
-      <w:pPr>
-        <w:pStyle w:val="BodyText"/>
-      </w:pPr>
-      <w:r>
-        <w:t xml:space="preserve">TYPE HERE 2</w:t>
-      </w:r>
-    </w:p>
-    <w:p>
-      <w:pPr>
-        <w:pStyle w:val="BodyText"/>
-      </w:pPr>
-      <w:r>
-        <w:rPr>
-          <w:i/>
-          <w:iCs/>
-        </w:rPr>
-        <w:t xml:space="preserve">Estimated Cost/Benefits/Incentives</w:t>
-      </w:r>
-    </w:p>
-    <w:p>
-      <w:pPr>
-        <w:pStyle w:val="BodyText"/>
-      </w:pPr>
-      <w:r>
-        <w:rPr>
-          <w:b/>
-          <w:bCs/>
-        </w:rPr>
-        <w:t xml:space="preserve">Auditor to describe. Primary residence</w:t>
-      </w:r>
-    </w:p>
-    <w:p>
-      <w:pPr>
-        <w:pStyle w:val="SourceCode"/>
-      </w:pPr>
-      <w:r>
-        <w:rPr>
-          <w:rStyle w:val="NormalTok"/>
-        </w:rPr>
+        <w:t xml:space="preserve">[1]</w:t>
+      </w:r>
+      <w:r>
         <w:t xml:space="preserve"> </w:t>
       </w:r>
       <w:r>
-        <w:rPr>
-          <w:rStyle w:val="CommentTok"/>
-        </w:rPr>
-        <w:t xml:space="preserve">#| label: other 3 recommendation</w:t>
-      </w:r>
-      <w:r>
-        <w:br/>
-      </w:r>
-      <w:r>
-        <w:rPr>
-          <w:rStyle w:val="NormalTok"/>
-        </w:rPr>
-        <w:t xml:space="preserve"> </w:t>
-      </w:r>
-      <w:r>
-        <w:rPr>
-          <w:rStyle w:val="CommentTok"/>
-        </w:rPr>
-        <w:t xml:space="preserve">#| echo: false</w:t>
-      </w:r>
-      <w:r>
-        <w:br/>
-      </w:r>
-      <w:r>
-        <w:rPr>
-          <w:rStyle w:val="NormalTok"/>
-        </w:rPr>
-        <w:t xml:space="preserve"> </w:t>
-      </w:r>
-      <w:r>
-        <w:rPr>
-          <w:rStyle w:val="CommentTok"/>
-        </w:rPr>
-        <w:t xml:space="preserve">#| results: asis</w:t>
-      </w:r>
-      <w:r>
-        <w:br/>
-      </w:r>
-      <w:r>
-        <w:br/>
-      </w:r>
-      <w:r>
-        <w:br/>
-      </w:r>
-      <w:r>
-        <w:rPr>
-          <w:rStyle w:val="ControlFlowTok"/>
-        </w:rPr>
-        <w:t xml:space="preserve">if</w:t>
-      </w:r>
-      <w:r>
-        <w:rPr>
-          <w:rStyle w:val="NormalTok"/>
-        </w:rPr>
-        <w:t xml:space="preserve">( other_3 </w:t>
-      </w:r>
-      <w:r>
-        <w:rPr>
-          <w:rStyle w:val="SpecialCharTok"/>
-        </w:rPr>
-        <w:t xml:space="preserve">==</w:t>
-      </w:r>
-      <w:r>
-        <w:rPr>
-          <w:rStyle w:val="NormalTok"/>
-        </w:rPr>
-        <w:t xml:space="preserve"> </w:t>
-      </w:r>
-      <w:r>
-        <w:rPr>
-          <w:rStyle w:val="ConstantTok"/>
-        </w:rPr>
-        <w:t xml:space="preserve">TRUE</w:t>
-      </w:r>
-      <w:r>
-        <w:rPr>
-          <w:rStyle w:val="NormalTok"/>
-        </w:rPr>
-        <w:t xml:space="preserve">){</w:t>
-      </w:r>
-      <w:r>
-        <w:br/>
-      </w:r>
-      <w:r>
-        <w:rPr>
-          <w:rStyle w:val="NormalTok"/>
-        </w:rPr>
-        <w:t xml:space="preserve">  </w:t>
-      </w:r>
-      <w:r>
-        <w:rPr>
-          <w:rStyle w:val="FunctionTok"/>
-        </w:rPr>
-        <w:t xml:space="preserve">cat</w:t>
-      </w:r>
-      <w:r>
-        <w:rPr>
-          <w:rStyle w:val="NormalTok"/>
-        </w:rPr>
-        <w:t xml:space="preserve">(</w:t>
-      </w:r>
-      <w:r>
-        <w:rPr>
-          <w:rStyle w:val="StringTok"/>
-        </w:rPr>
-        <w:t xml:space="preserve">"### Other 3</w:t>
-      </w:r>
-      <w:r>
-        <w:br/>
-      </w:r>
-      <w:r>
-        <w:rPr>
-          <w:rStyle w:val="StringTok"/>
-        </w:rPr>
-        <w:t xml:space="preserve">  </w:t>
-      </w:r>
-      <w:r>
-        <w:br/>
-      </w:r>
-      <w:r>
-        <w:rPr>
-          <w:rStyle w:val="StringTok"/>
-        </w:rPr>
-        <w:t xml:space="preserve">*Problem*</w:t>
-      </w:r>
-      <w:r>
-        <w:br/>
-      </w:r>
-      <w:r>
-        <w:br/>
-      </w:r>
-      <w:r>
-        <w:rPr>
-          <w:rStyle w:val="StringTok"/>
-        </w:rPr>
-        <w:t xml:space="preserve">*Recommendation*</w:t>
-      </w:r>
-      <w:r>
-        <w:br/>
-      </w:r>
-      <w:r>
-        <w:br/>
-      </w:r>
-      <w:r>
-        <w:rPr>
-          <w:rStyle w:val="StringTok"/>
-        </w:rPr>
-        <w:t xml:space="preserve">"</w:t>
-      </w:r>
-      <w:r>
-        <w:rPr>
-          <w:rStyle w:val="NormalTok"/>
-        </w:rPr>
-        <w:t xml:space="preserve">)</w:t>
-      </w:r>
-      <w:r>
-        <w:br/>
-      </w:r>
-      <w:r>
-        <w:rPr>
-          <w:rStyle w:val="NormalTok"/>
-        </w:rPr>
+        <w:t xml:space="preserve">“)</w:t>
+      </w:r>
+      <w:r>
         <w:t xml:space="preserve">}</w:t>
       </w:r>
       <w:r>
-        <w:rPr>
-          <w:rStyle w:val="ControlFlowTok"/>
-        </w:rPr>
-        <w:t xml:space="preserve">else</w:t>
-      </w:r>
-      <w:r>
-        <w:rPr>
-          <w:rStyle w:val="NormalTok"/>
-        </w:rPr>
-        <w:t xml:space="preserve">{</w:t>
-      </w:r>
-      <w:r>
-        <w:br/>
-      </w:r>
-      <w:r>
-        <w:rPr>
-          <w:rStyle w:val="NormalTok"/>
-        </w:rPr>
-        <w:t xml:space="preserve">  </w:t>
-      </w:r>
-      <w:r>
-        <w:rPr>
-          <w:rStyle w:val="FunctionTok"/>
-        </w:rPr>
-        <w:t xml:space="preserve">cat</w:t>
-      </w:r>
-      <w:r>
-        <w:rPr>
-          <w:rStyle w:val="NormalTok"/>
-        </w:rPr>
-        <w:t xml:space="preserve">(</w:t>
-      </w:r>
-      <w:r>
-        <w:rPr>
-          <w:rStyle w:val="StringTok"/>
-        </w:rPr>
-        <w:t xml:space="preserve">""</w:t>
-      </w:r>
-      <w:r>
-        <w:rPr>
-          <w:rStyle w:val="NormalTok"/>
-        </w:rPr>
-        <w:t xml:space="preserve">)</w:t>
-      </w:r>
-      <w:r>
-        <w:br/>
-      </w:r>
-      <w:r>
-        <w:rPr>
-          <w:rStyle w:val="NormalTok"/>
-        </w:rPr>
-        <w:t xml:space="preserve">}</w:t>
-      </w:r>
-      <w:r>
-        <w:br/>
-      </w:r>
-      <w:r>
-        <w:br/>
-      </w:r>
-      <w:r>
-        <w:rPr>
-          <w:rStyle w:val="ControlFlowTok"/>
-        </w:rPr>
-        <w:t xml:space="preserve">if</w:t>
-      </w:r>
-      <w:r>
-        <w:rPr>
-          <w:rStyle w:val="NormalTok"/>
-        </w:rPr>
-        <w:t xml:space="preserve">(other_3 </w:t>
-      </w:r>
-      <w:r>
-        <w:rPr>
-          <w:rStyle w:val="SpecialCharTok"/>
-        </w:rPr>
-        <w:t xml:space="preserve">==</w:t>
-      </w:r>
-      <w:r>
-        <w:rPr>
-          <w:rStyle w:val="NormalTok"/>
-        </w:rPr>
-        <w:t xml:space="preserve"> </w:t>
-      </w:r>
-      <w:r>
-        <w:rPr>
-          <w:rStyle w:val="ConstantTok"/>
-        </w:rPr>
-        <w:t xml:space="preserve">TRUE</w:t>
-      </w:r>
-      <w:r>
-        <w:rPr>
-          <w:rStyle w:val="NormalTok"/>
-        </w:rPr>
-        <w:t xml:space="preserve">){</w:t>
-      </w:r>
-      <w:r>
-        <w:br/>
-      </w:r>
-      <w:r>
-        <w:rPr>
-          <w:rStyle w:val="NormalTok"/>
-        </w:rPr>
-        <w:t xml:space="preserve">  </w:t>
-      </w:r>
-      <w:r>
-        <w:rPr>
-          <w:rStyle w:val="FunctionTok"/>
-        </w:rPr>
-        <w:t xml:space="preserve">cat</w:t>
-      </w:r>
-      <w:r>
-        <w:rPr>
-          <w:rStyle w:val="NormalTok"/>
-        </w:rPr>
-        <w:t xml:space="preserve">(a_other_3</w:t>
-      </w:r>
-      <w:r>
-        <w:rPr>
-          <w:rStyle w:val="SpecialCharTok"/>
-        </w:rPr>
-        <w:t xml:space="preserve">$</w:t>
-      </w:r>
-      <w:r>
-        <w:rPr>
-          <w:rStyle w:val="NormalTok"/>
-        </w:rPr>
-        <w:t xml:space="preserve">Description</w:t>
-      </w:r>
-      <w:r>
-        <w:br/>
-      </w:r>
-      <w:r>
-        <w:rPr>
-          <w:rStyle w:val="NormalTok"/>
-        </w:rPr>
-        <w:t xml:space="preserve">    </w:t>
-      </w:r>
-      <w:r>
-        <w:br/>
-      </w:r>
-      <w:r>
-        <w:rPr>
-          <w:rStyle w:val="NormalTok"/>
-        </w:rPr>
-        <w:t xml:space="preserve">  )</w:t>
-      </w:r>
-      <w:r>
-        <w:br/>
-      </w:r>
-      <w:r>
-        <w:rPr>
-          <w:rStyle w:val="NormalTok"/>
-        </w:rPr>
-        <w:t xml:space="preserve">}</w:t>
-      </w:r>
-      <w:r>
-        <w:rPr>
-          <w:rStyle w:val="ControlFlowTok"/>
-        </w:rPr>
-        <w:t xml:space="preserve">else</w:t>
-      </w:r>
-      <w:r>
-        <w:rPr>
-          <w:rStyle w:val="NormalTok"/>
-        </w:rPr>
-        <w:t xml:space="preserve">{</w:t>
-      </w:r>
-      <w:r>
-        <w:br/>
-      </w:r>
-      <w:r>
-        <w:rPr>
-          <w:rStyle w:val="NormalTok"/>
-        </w:rPr>
-        <w:t xml:space="preserve">  </w:t>
-      </w:r>
-      <w:r>
-        <w:rPr>
-          <w:rStyle w:val="FunctionTok"/>
-        </w:rPr>
-        <w:t xml:space="preserve">cat</w:t>
-      </w:r>
-      <w:r>
-        <w:rPr>
-          <w:rStyle w:val="NormalTok"/>
-        </w:rPr>
-        <w:t xml:space="preserve">(</w:t>
-      </w:r>
-      <w:r>
-        <w:rPr>
-          <w:rStyle w:val="StringTok"/>
-        </w:rPr>
-        <w:t xml:space="preserve">""</w:t>
-      </w:r>
-      <w:r>
-        <w:rPr>
-          <w:rStyle w:val="NormalTok"/>
-        </w:rPr>
-        <w:t xml:space="preserve">)</w:t>
-      </w:r>
-      <w:r>
-        <w:br/>
-      </w:r>
-      <w:r>
-        <w:rPr>
-          <w:rStyle w:val="NormalTok"/>
-        </w:rPr>
-        <w:t xml:space="preserve">  }</w:t>
-      </w:r>
-      <w:r>
-        <w:br/>
-      </w:r>
-      <w:r>
-        <w:br/>
-      </w:r>
-      <w:r>
-        <w:rPr>
-          <w:rStyle w:val="ControlFlowTok"/>
-        </w:rPr>
-        <w:t xml:space="preserve">if</w:t>
-      </w:r>
-      <w:r>
-        <w:rPr>
-          <w:rStyle w:val="NormalTok"/>
-        </w:rPr>
-        <w:t xml:space="preserve">(other_3 </w:t>
-      </w:r>
-      <w:r>
-        <w:rPr>
-          <w:rStyle w:val="SpecialCharTok"/>
-        </w:rPr>
-        <w:t xml:space="preserve">==</w:t>
-      </w:r>
-      <w:r>
-        <w:rPr>
-          <w:rStyle w:val="NormalTok"/>
-        </w:rPr>
-        <w:t xml:space="preserve"> </w:t>
-      </w:r>
-      <w:r>
-        <w:rPr>
-          <w:rStyle w:val="ConstantTok"/>
-        </w:rPr>
-        <w:t xml:space="preserve">TRUE</w:t>
-      </w:r>
-      <w:r>
-        <w:rPr>
-          <w:rStyle w:val="NormalTok"/>
-        </w:rPr>
-        <w:t xml:space="preserve">){</w:t>
-      </w:r>
-      <w:r>
-        <w:br/>
-      </w:r>
-      <w:r>
-        <w:rPr>
-          <w:rStyle w:val="NormalTok"/>
-        </w:rPr>
-        <w:t xml:space="preserve">  </w:t>
-      </w:r>
-      <w:r>
-        <w:rPr>
-          <w:rStyle w:val="FunctionTok"/>
-        </w:rPr>
-        <w:t xml:space="preserve">cat</w:t>
-      </w:r>
-      <w:r>
-        <w:rPr>
-          <w:rStyle w:val="NormalTok"/>
-        </w:rPr>
-        <w:t xml:space="preserve">(</w:t>
-      </w:r>
-      <w:r>
-        <w:rPr>
-          <w:rStyle w:val="StringTok"/>
-        </w:rPr>
-        <w:t xml:space="preserve">"</w:t>
-      </w:r>
-      <w:r>
-        <w:br/>
-      </w:r>
-      <w:r>
-        <w:br/>
-      </w:r>
-      <w:r>
-        <w:rPr>
-          <w:rStyle w:val="StringTok"/>
-        </w:rPr>
-        <w:t xml:space="preserve">*Estimated Cost/Benefits/Incentives*</w:t>
-      </w:r>
-      <w:r>
-        <w:br/>
-      </w:r>
-      <w:r>
-        <w:br/>
-      </w:r>
-      <w:r>
-        <w:rPr>
-          <w:rStyle w:val="StringTok"/>
-        </w:rPr>
-        <w:t xml:space="preserve">"</w:t>
-      </w:r>
-      <w:r>
-        <w:rPr>
-          <w:rStyle w:val="NormalTok"/>
-        </w:rPr>
-        <w:t xml:space="preserve">, auto_other_3_estimates</w:t>
-      </w:r>
-      <w:r>
-        <w:rPr>
-          <w:rStyle w:val="SpecialCharTok"/>
-        </w:rPr>
-        <w:t xml:space="preserve">$</w:t>
-      </w:r>
-      <w:r>
-        <w:rPr>
-          <w:rStyle w:val="NormalTok"/>
-        </w:rPr>
-        <w:t xml:space="preserve">Description)</w:t>
-      </w:r>
-      <w:r>
-        <w:br/>
-      </w:r>
-      <w:r>
-        <w:rPr>
-          <w:rStyle w:val="NormalTok"/>
-        </w:rPr>
-        <w:t xml:space="preserve">}</w:t>
-      </w:r>
-      <w:r>
-        <w:rPr>
-          <w:rStyle w:val="ControlFlowTok"/>
-        </w:rPr>
-        <w:t xml:space="preserve">else</w:t>
-      </w:r>
-      <w:r>
-        <w:rPr>
-          <w:rStyle w:val="NormalTok"/>
-        </w:rPr>
-        <w:t xml:space="preserve">{</w:t>
-      </w:r>
-      <w:r>
-        <w:br/>
-      </w:r>
-      <w:r>
-        <w:rPr>
-          <w:rStyle w:val="NormalTok"/>
-        </w:rPr>
-        <w:t xml:space="preserve">  </w:t>
-      </w:r>
-      <w:r>
-        <w:rPr>
-          <w:rStyle w:val="FunctionTok"/>
-        </w:rPr>
-        <w:t xml:space="preserve">cat</w:t>
-      </w:r>
-      <w:r>
-        <w:rPr>
-          <w:rStyle w:val="NormalTok"/>
-        </w:rPr>
-        <w:t xml:space="preserve">(</w:t>
-      </w:r>
-      <w:r>
-        <w:rPr>
-          <w:rStyle w:val="StringTok"/>
-        </w:rPr>
-        <w:t xml:space="preserve">""</w:t>
-      </w:r>
-      <w:r>
-        <w:rPr>
-          <w:rStyle w:val="NormalTok"/>
-        </w:rPr>
-        <w:t xml:space="preserve">)</w:t>
-      </w:r>
-      <w:r>
-        <w:br/>
-      </w:r>
-      <w:r>
-        <w:rPr>
-          <w:rStyle w:val="NormalTok"/>
-        </w:rPr>
-        <w:t xml:space="preserve">  } </w:t>
-      </w:r>
-    </w:p>
-    <w:bookmarkEnd w:id="58"/>
-    <w:bookmarkStart w:id="59" w:name="misc.-air-sealing-and-insulation"/>
-    <w:p>
-      <w:pPr>
-        <w:pStyle w:val="Heading3"/>
-      </w:pPr>
-      <w:r>
-        <w:t xml:space="preserve">4.18 Misc. Air Sealing and Insulation</w:t>
-      </w:r>
-    </w:p>
-    <w:p>
-      <w:pPr>
-        <w:pStyle w:val="FirstParagraph"/>
-      </w:pPr>
-      <w:r>
-        <w:rPr>
-          <w:i/>
-          <w:iCs/>
-        </w:rPr>
-        <w:t xml:space="preserve">Problem</w:t>
-      </w:r>
-    </w:p>
-    <w:p>
-      <w:pPr>
-        <w:pStyle w:val="BodyText"/>
-      </w:pPr>
-      <w:r>
-        <w:rPr>
-          <w:b/>
-          <w:bCs/>
-        </w:rPr>
-        <w:t xml:space="preserve">Need a description for the problem</w:t>
-      </w:r>
-    </w:p>
-    <w:p>
-      <w:pPr>
-        <w:pStyle w:val="BodyText"/>
-      </w:pPr>
-      <w:r>
-        <w:rPr>
-          <w:i/>
-          <w:iCs/>
-        </w:rPr>
-        <w:t xml:space="preserve">Recommendation</w:t>
-      </w:r>
-    </w:p>
-    <w:p>
-      <w:pPr>
-        <w:pStyle w:val="BodyText"/>
-      </w:pPr>
-      <w:r>
-        <w:t xml:space="preserve">Air seal and insulate [** insert auditor description - bay window, bulkhead door, chase, kneewall, anything else that is unique to the home and not otherwise covered in another recommendation]</w:t>
-      </w:r>
-      <w:r>
-        <w:rPr>
-          <w:i/>
-          <w:iCs/>
-        </w:rPr>
-        <w:t xml:space="preserve">Estimated Costs/Benefits/Incentives</w:t>
-      </w:r>
-    </w:p>
-    <w:p>
-      <w:pPr>
-        <w:pStyle w:val="BodyText"/>
-      </w:pPr>
-      <w:r>
-        <w:t xml:space="preserve">As part of a larger insulation project, this work may be eligible for Efficiency Maine rebates and other incentives for insulation work, up to 80% of the overall cost to weatherize your home (subject to a lifetime limit per building).</w:t>
-      </w:r>
-    </w:p>
-    <w:bookmarkEnd w:id="59"/>
-    <w:bookmarkStart w:id="60" w:name="replace-windows"/>
-    <w:p>
-      <w:pPr>
-        <w:pStyle w:val="Heading3"/>
-      </w:pPr>
-      <w:r>
-        <w:t xml:space="preserve">4.19 Replace Windows</w:t>
-      </w:r>
-    </w:p>
-    <w:p>
-      <w:pPr>
-        <w:pStyle w:val="FirstParagraph"/>
-      </w:pPr>
-      <w:r>
-        <w:rPr>
-          <w:i/>
-          <w:iCs/>
-        </w:rPr>
-        <w:t xml:space="preserve">Problem</w:t>
-      </w:r>
-    </w:p>
-    <w:p>
-      <w:pPr>
-        <w:pStyle w:val="BodyText"/>
-      </w:pPr>
-      <w:r>
-        <w:rPr>
-          <w:b/>
-          <w:bCs/>
-        </w:rPr>
-        <w:t xml:space="preserve">Need to get the description of the problem</w:t>
-      </w:r>
-    </w:p>
-    <w:p>
-      <w:pPr>
-        <w:pStyle w:val="BodyText"/>
-      </w:pPr>
-      <w:r>
-        <w:rPr>
-          <w:i/>
-          <w:iCs/>
-        </w:rPr>
-        <w:t xml:space="preserve">Recommendation</w:t>
-      </w:r>
-    </w:p>
-    <w:p>
-      <w:pPr>
-        <w:pStyle w:val="BodyText"/>
-      </w:pPr>
-      <w:r>
-        <w:t xml:space="preserve">Replace single-paned windows with double- or triple-paned windows and ensure the frames are airsealed. We recommend installing windows that are Energy Star certified for</w:t>
-      </w:r>
-      <w:r>
-        <w:t xml:space="preserve"> </w:t>
-      </w:r>
-      <w:r>
-        <w:t xml:space="preserve">‘Northern’</w:t>
-      </w:r>
-      <w:r>
-        <w:t xml:space="preserve"> </w:t>
-      </w:r>
-      <w:r>
-        <w:t xml:space="preserve">climate.</w:t>
-      </w:r>
-      <w:r>
-        <w:rPr>
-          <w:i/>
-          <w:iCs/>
-        </w:rPr>
-        <w:t xml:space="preserve">Estimated Costs/Benefits/Incentives</w:t>
-      </w:r>
-    </w:p>
-    <w:p>
-      <w:pPr>
-        <w:pStyle w:val="BodyText"/>
-      </w:pPr>
-      <w:r>
-        <w:t xml:space="preserve">New windows are eligible for a nonrefundable federal tax credit of 30% of the cost of the window units up to $600, subject to an annual maximum benefit of $1,200 (shared with other home envelope improvements, like attic and basement insulation).</w:t>
-      </w:r>
-    </w:p>
-    <w:bookmarkEnd w:id="60"/>
-    <w:bookmarkEnd w:id="61"/>
-    <w:bookmarkStart w:id="62" w:name="additional-resources"/>
-    <w:p>
-      <w:pPr>
-        <w:pStyle w:val="Heading2"/>
-      </w:pPr>
-      <w:r>
-        <w:t xml:space="preserve">5 Additional Resources</w:t>
-      </w:r>
-    </w:p>
-    <w:p>
-      <w:pPr>
-        <w:pStyle w:val="FirstParagraph"/>
-      </w:pPr>
-      <w:r>
-        <w:t xml:space="preserve">Many home efficiency upgrades are eligible for Efficiency Maine rebates and federal tax credits. Financial incentives vary based on income level and type of occupancy. An overview of all state rebates and federal tax credits can be found here: https://www.efficiencymaine.com/at-home/.</w:t>
-      </w:r>
-    </w:p>
-    <w:p>
-      <w:pPr>
-        <w:pStyle w:val="BodyText"/>
-      </w:pPr>
-      <w:r>
-        <w:t xml:space="preserve">You can search for Efficiency Maine registered contractors here: https://www.efficiencymaine.com/at-home/vendor-locator/.</w:t>
-      </w:r>
-    </w:p>
-    <w:p>
-      <w:pPr>
-        <w:pStyle w:val="BodyText"/>
-      </w:pPr>
-      <w:r>
-        <w:t xml:space="preserve">We recommend discussing a whole-home plan for insulation and air sealing work in the basement, walls, and attic with contractors to determine how to best sequence the work to take full advantage of the Efficiency Maine rebates (which are subject to lifetime maximums) and nonrefundable federal tax credits (which are subject to annual maximums).</w:t>
-      </w:r>
-    </w:p>
-    <w:p>
-      <w:pPr>
-        <w:pStyle w:val="BodyText"/>
-      </w:pPr>
-      <w:r>
-        <w:t xml:space="preserve">Efficiency Maine also offers home energy loans to help homeowners who are Maine residents pay for energy and related health and safety upgrades. There are no fees, and interest rates for multi-year loans are between 5.99% (max $7,500) and 7.99% (max $25,000), depending on income level. Low- and moderate-income homeowners who borrow the full $7,500 and pay it back over 10 years will pay a monthly cost of $83. There is also a 1-year, 0% APR option. To learn more or apply, call 866-376-2463 or visit https://www.efficiencymaine.com/home-energy-loans/</w:t>
-      </w:r>
-    </w:p>
-    <w:bookmarkEnd w:id="62"/>
-    <w:bookmarkStart w:id="82" w:name="section-four-tests"/>
-    <w:p>
-      <w:pPr>
-        <w:pStyle w:val="Heading2"/>
-      </w:pPr>
-      <w:r>
-        <w:t xml:space="preserve">6 Section Four Tests</w:t>
-      </w:r>
-    </w:p>
-    <w:bookmarkStart w:id="63" w:name="replace-windows-1"/>
-    <w:p>
-      <w:pPr>
-        <w:pStyle w:val="Heading3"/>
-      </w:pPr>
-      <w:r>
-        <w:t xml:space="preserve">6.1 Replace Windows</w:t>
-      </w:r>
-    </w:p>
-    <w:bookmarkEnd w:id="63"/>
-    <w:bookmarkStart w:id="64" w:name="misc.-air-sealing-and-insulation-1"/>
-    <w:p>
-      <w:pPr>
-        <w:pStyle w:val="Heading3"/>
-      </w:pPr>
-      <w:r>
-        <w:t xml:space="preserve">6.2 Misc. Air Sealing and Insulation</w:t>
-      </w:r>
-    </w:p>
-    <w:bookmarkEnd w:id="64"/>
-    <w:bookmarkStart w:id="65" w:name="diy-air-sealing-1"/>
-    <w:p>
-      <w:pPr>
-        <w:pStyle w:val="Heading3"/>
-      </w:pPr>
-      <w:r>
-        <w:t xml:space="preserve">6.3 DIY Air Sealing</w:t>
-      </w:r>
-    </w:p>
-    <w:bookmarkEnd w:id="65"/>
-    <w:bookmarkStart w:id="66" w:name="pipe-insulation-1"/>
-    <w:p>
-      <w:pPr>
-        <w:pStyle w:val="Heading3"/>
-      </w:pPr>
-      <w:r>
-        <w:t xml:space="preserve">6.4 Pipe Insulation</w:t>
-      </w:r>
-    </w:p>
-    <w:bookmarkEnd w:id="66"/>
-    <w:bookmarkStart w:id="67" w:name="whole-house-surge-protection-1"/>
-    <w:p>
-      <w:pPr>
-        <w:pStyle w:val="Heading3"/>
-      </w:pPr>
-      <w:r>
-        <w:t xml:space="preserve">6.5 Whole-House Surge Protection</w:t>
-      </w:r>
-    </w:p>
-    <w:bookmarkEnd w:id="67"/>
-    <w:bookmarkStart w:id="68" w:name="air-source-heat-pump-1"/>
-    <w:p>
-      <w:pPr>
-        <w:pStyle w:val="Heading3"/>
-      </w:pPr>
-      <w:r>
-        <w:t xml:space="preserve">6.6 Air Source Heat Pump</w:t>
-      </w:r>
-    </w:p>
-    <w:bookmarkEnd w:id="68"/>
-    <w:bookmarkStart w:id="69" w:name="electrical-panel-upgrade-1"/>
-    <w:p>
-      <w:pPr>
-        <w:pStyle w:val="Heading3"/>
-      </w:pPr>
-      <w:r>
-        <w:t xml:space="preserve">6.7 Electrical Panel Upgrade</w:t>
-      </w:r>
-    </w:p>
-    <w:bookmarkEnd w:id="69"/>
-    <w:bookmarkStart w:id="70" w:name="continuous-exterior-wall-insulation-1"/>
-    <w:p>
-      <w:pPr>
-        <w:pStyle w:val="Heading3"/>
-      </w:pPr>
-      <w:r>
-        <w:t xml:space="preserve">6.8 Continuous Exterior Wall Insulation</w:t>
-      </w:r>
-    </w:p>
-    <w:bookmarkEnd w:id="70"/>
-    <w:bookmarkStart w:id="71" w:name="blown-in-cellulose-wall-insulation"/>
-    <w:p>
-      <w:pPr>
-        <w:pStyle w:val="Heading3"/>
-      </w:pPr>
-      <w:r>
-        <w:t xml:space="preserve">6.9 Blown-in Cellulose Wall Insulation</w:t>
-      </w:r>
-    </w:p>
-    <w:bookmarkEnd w:id="71"/>
-    <w:bookmarkStart w:id="72" w:name="attic-air-sealing-and-insulation"/>
-    <w:p>
-      <w:pPr>
-        <w:pStyle w:val="Heading3"/>
-      </w:pPr>
-      <w:r>
-        <w:t xml:space="preserve">6.10 Attic Air Sealing and Insulation</w:t>
-      </w:r>
-    </w:p>
-    <w:bookmarkEnd w:id="72"/>
-    <w:bookmarkStart w:id="73" w:name="kitchen-exhaust-fan"/>
-    <w:p>
-      <w:pPr>
-        <w:pStyle w:val="Heading3"/>
-      </w:pPr>
-      <w:r>
-        <w:t xml:space="preserve">6.11 Kitchen Exhaust Fan</w:t>
-      </w:r>
-    </w:p>
-    <w:bookmarkEnd w:id="73"/>
-    <w:bookmarkStart w:id="74" w:name="bathroom-exhaust-fans-1"/>
-    <w:p>
-      <w:pPr>
-        <w:pStyle w:val="Heading3"/>
-      </w:pPr>
-      <w:r>
-        <w:t xml:space="preserve">6.12 Bathroom Exhaust Fan(s)</w:t>
-      </w:r>
-    </w:p>
-    <w:bookmarkEnd w:id="74"/>
-    <w:bookmarkStart w:id="75" w:name="gutters-1"/>
-    <w:p>
-      <w:pPr>
-        <w:pStyle w:val="Heading3"/>
-      </w:pPr>
-      <w:r>
-        <w:t xml:space="preserve">6.13 Gutters</w:t>
-      </w:r>
-    </w:p>
-    <w:bookmarkEnd w:id="75"/>
-    <w:bookmarkStart w:id="76" w:name="refrigerator-1"/>
-    <w:p>
-      <w:pPr>
-        <w:pStyle w:val="Heading3"/>
-      </w:pPr>
-      <w:r>
-        <w:t xml:space="preserve">6.14 Refrigerator</w:t>
-      </w:r>
-    </w:p>
-    <w:bookmarkEnd w:id="76"/>
-    <w:bookmarkStart w:id="77" w:name="windowdressers"/>
-    <w:p>
-      <w:pPr>
-        <w:pStyle w:val="Heading3"/>
-      </w:pPr>
-      <w:r>
-        <w:t xml:space="preserve">6.15 WindowDressers</w:t>
-      </w:r>
-    </w:p>
-    <w:bookmarkEnd w:id="77"/>
-    <w:bookmarkStart w:id="78" w:name="high-efficiency-shower-heads-1"/>
-    <w:p>
-      <w:pPr>
-        <w:pStyle w:val="Heading3"/>
-      </w:pPr>
-      <w:r>
-        <w:t xml:space="preserve">6.16 High-efficiency Shower Head(s)</w:t>
-      </w:r>
-    </w:p>
-    <w:bookmarkEnd w:id="78"/>
-    <w:bookmarkStart w:id="79" w:name="furnaceboiler-tune-up-1"/>
-    <w:p>
-      <w:pPr>
-        <w:pStyle w:val="Heading3"/>
-      </w:pPr>
-      <w:r>
-        <w:t xml:space="preserve">6.17 Furnace/Boiler Tune-up</w:t>
+        <w:t xml:space="preserve"># cat(”</w:t>
       </w:r>
     </w:p>
     <w:bookmarkEnd w:id="79"/>
-    <w:bookmarkStart w:id="80" w:name="other-2-1"/>
-    <w:p>
-      <w:pPr>
-        <w:pStyle w:val="Heading3"/>
-      </w:pPr>
-      <w:r>
-        <w:t xml:space="preserve">6.18 Other 2</w:t>
-      </w:r>
-    </w:p>
     <w:bookmarkEnd w:id="80"/>
-    <w:bookmarkStart w:id="81" w:name="other-1-1"/>
-    <w:p>
-      <w:pPr>
-        <w:pStyle w:val="Heading3"/>
-      </w:pPr>
-      <w:r>
-        <w:t xml:space="preserve">6.19 Other 1</w:t>
-      </w:r>
-    </w:p>
-    <w:p>
-      <w:pPr>
-        <w:pStyle w:val="FirstParagraph"/>
-      </w:pPr>
-      <w:r>
-        <w:t xml:space="preserve">[1]</w:t>
-      </w:r>
-      <w:r>
-        <w:t xml:space="preserve"> </w:t>
-      </w:r>
-      <w:r>
-        <w:t xml:space="preserve">“)</w:t>
-      </w:r>
-      <w:r>
-        <w:t xml:space="preserve">}</w:t>
-      </w:r>
-      <w:r>
-        <w:t xml:space="preserve"># cat(”</w:t>
-      </w:r>
-    </w:p>
-    <w:bookmarkEnd w:id="81"/>
-    <w:bookmarkEnd w:id="82"/>
     <w:sectPr>
       <w:footerReference r:id="rId9" w:type="default"/>
       <w:pgSz w:h="15840" w:w="12240"/>

</xml_diff>

<commit_message>
generated report for Judi Lim
</commit_message>
<xml_diff>
--- a/Quarto_report/Audit_Report.docx
+++ b/Quarto_report/Audit_Report.docx
@@ -15,31 +15,31 @@
         <w:pStyle w:val="FirstParagraph"/>
       </w:pPr>
       <w:r>
-        <w:t xml:space="preserve">Homeowner(s): Dan Fernald, Katy Fernald</w:t>
-      </w:r>
-    </w:p>
-    <w:p>
-      <w:pPr>
-        <w:pStyle w:val="BodyText"/>
-      </w:pPr>
-      <w:r>
-        <w:t xml:space="preserve">Address: 16 Mosswood Rd Islesford, ME 04646</w:t>
-      </w:r>
-    </w:p>
-    <w:p>
-      <w:pPr>
-        <w:pStyle w:val="BodyText"/>
-      </w:pPr>
-      <w:r>
-        <w:t xml:space="preserve">Owner Contact: islesfordartists@gmail.com, (207) 244-3145</w:t>
-      </w:r>
-    </w:p>
-    <w:p>
-      <w:pPr>
-        <w:pStyle w:val="BodyText"/>
-      </w:pPr>
-      <w:r>
-        <w:t xml:space="preserve">Auditors: David Gibson, Pema Lhundrup, Mabon Young, Rashmi Mohan</w:t>
+        <w:t xml:space="preserve">Homeowner(s): Judi Lim</w:t>
+      </w:r>
+    </w:p>
+    <w:p>
+      <w:pPr>
+        <w:pStyle w:val="BodyText"/>
+      </w:pPr>
+      <w:r>
+        <w:t xml:space="preserve">Address: 443 Cranberry Road, Cranberry Isles, 04625</w:t>
+      </w:r>
+    </w:p>
+    <w:p>
+      <w:pPr>
+        <w:pStyle w:val="BodyText"/>
+      </w:pPr>
+      <w:r>
+        <w:t xml:space="preserve">Owner Contact: NA</w:t>
+      </w:r>
+    </w:p>
+    <w:p>
+      <w:pPr>
+        <w:pStyle w:val="BodyText"/>
+      </w:pPr>
+      <w:r>
+        <w:t xml:space="preserve">Auditors: Uriel Orozco Brenes, Zoe Duni</w:t>
       </w:r>
     </w:p>
     <w:p>
@@ -55,7 +55,7 @@
         <w:pStyle w:val="BodyText"/>
       </w:pPr>
       <w:r>
-        <w:t xml:space="preserve">Report Date: June 24, 2025</w:t>
+        <w:t xml:space="preserve">Report Date: June 25, 2025</w:t>
       </w:r>
     </w:p>
     <w:p>
@@ -70,7 +70,7 @@
         <w:pStyle w:val="FirstParagraph"/>
       </w:pPr>
       <w:r>
-        <w:t xml:space="preserve">We conducted an energy assessment of your home on 6/23/2025. This report will tell you what we did, what we found, and what we suggest for your home. These suggestions include information on incentives and financing to make improvements more affordable.</w:t>
+        <w:t xml:space="preserve">We conducted an energy assessment of your home on 7/30/2024. This report will tell you what we did, what we found, and what we suggest for your home. These suggestions include information on incentives and financing to make improvements more affordable.</w:t>
       </w:r>
     </w:p>
     <w:p>
@@ -234,7 +234,7 @@
         <w:pStyle w:val="FirstParagraph"/>
       </w:pPr>
       <w:r>
-        <w:t xml:space="preserve">We assessed combustion appliances that burn fossil fuels such as propane, heating oil, or kerosene. These include furnaces, boilers, water heaters, and gas ovens. We visually inspected the combustion appliance(s) in your home, as well as conducted combustion safety tests. This included measuring for carbon monoxide and testing that flue gases are properly exhausting from the home. We also performed gas leak detection tests on your propane appliance(s).</w:t>
+        <w:t xml:space="preserve">We assessed combustion appliances that burn fossil fuels such as propane, heating oil, or kerosene. These include furnaces, boilers, water heaters, and gas ovens. We visually inspected the combustion appliance(s) in your home, but we were unable to perform combustion safety tests.</w:t>
       </w:r>
     </w:p>
     <w:bookmarkEnd w:id="27"/>
@@ -344,31 +344,31 @@
                 <w:rFonts w:ascii="Calibri" w:hAnsi="Calibri"/>
                 <w:sz w:val="20"/>
               </w:rPr>
-              <w:t xml:space="default">Furnace/Boiler Tune-up</w:t>
-            </w:r>
-          </w:p>
-        </w:tc>
-        <w:tc>
-          <w:tcPr>
-            <w:tcBorders>
-              <w:top w:val="single" w:space="0" w:color="D3D3D3"/>
-              <w:bottom w:val="single" w:space="0" w:color="D3D3D3"/>
-              <w:start w:val="single" w:space="0" w:color="D3D3D3"/>
-              <w:end w:val="single" w:space="0" w:color="D3D3D3"/>
-            </w:tcBorders>
-          </w:tcPr>
-          <w:p>
-            <w:pPr>
-              <w:spacing w:before="0" w:after="60"/>
-              <w:keepNext/>
-              <w:jc w:val="start"/>
-            </w:pPr>
-            <w:r>
-              <w:rPr>
-                <w:rFonts w:ascii="Calibri" w:hAnsi="Calibri"/>
-                <w:sz w:val="20"/>
-              </w:rPr>
-              <w:t xml:space="default">Have the furnace/boiler and flue inspected and adjusted by a licensed professional. This should be available from your fuel delivery company.</w:t>
+              <w:t xml:space="default">WindowDressers</w:t>
+            </w:r>
+          </w:p>
+        </w:tc>
+        <w:tc>
+          <w:tcPr>
+            <w:tcBorders>
+              <w:top w:val="single" w:space="0" w:color="D3D3D3"/>
+              <w:bottom w:val="single" w:space="0" w:color="D3D3D3"/>
+              <w:start w:val="single" w:space="0" w:color="D3D3D3"/>
+              <w:end w:val="single" w:space="0" w:color="D3D3D3"/>
+            </w:tcBorders>
+          </w:tcPr>
+          <w:p>
+            <w:pPr>
+              <w:spacing w:before="0" w:after="60"/>
+              <w:keepNext/>
+              <w:jc w:val="start"/>
+            </w:pPr>
+            <w:r>
+              <w:rPr>
+                <w:rFonts w:ascii="Calibri" w:hAnsi="Calibri"/>
+                <w:sz w:val="20"/>
+              </w:rPr>
+              <w:t xml:space="default">WindowDressers are insulating window inserts that help air-seal windows and reduce heat loss and gain.</w:t>
             </w:r>
           </w:p>
         </w:tc>
@@ -397,31 +397,31 @@
                 <w:rFonts w:ascii="Calibri" w:hAnsi="Calibri"/>
                 <w:sz w:val="20"/>
               </w:rPr>
-              <w:t xml:space="default">High-efficiency Shower Head(s)</w:t>
-            </w:r>
-          </w:p>
-        </w:tc>
-        <w:tc>
-          <w:tcPr>
-            <w:tcBorders>
-              <w:top w:val="single" w:space="0" w:color="D3D3D3"/>
-              <w:bottom w:val="single" w:space="0" w:color="D3D3D3"/>
-              <w:start w:val="single" w:space="0" w:color="D3D3D3"/>
-              <w:end w:val="single" w:space="0" w:color="D3D3D3"/>
-            </w:tcBorders>
-          </w:tcPr>
-          <w:p>
-            <w:pPr>
-              <w:spacing w:before="0" w:after="60"/>
-              <w:keepNext/>
-              <w:jc w:val="start"/>
-            </w:pPr>
-            <w:r>
-              <w:rPr>
-                <w:rFonts w:ascii="Calibri" w:hAnsi="Calibri"/>
-                <w:sz w:val="20"/>
-              </w:rPr>
-              <w:t xml:space="default">Install high-efficiency shower heads to reduce the amount of water and energy to heat the water used when showering.</w:t>
+              <w:t xml:space="default">LEDs</w:t>
+            </w:r>
+          </w:p>
+        </w:tc>
+        <w:tc>
+          <w:tcPr>
+            <w:tcBorders>
+              <w:top w:val="single" w:space="0" w:color="D3D3D3"/>
+              <w:bottom w:val="single" w:space="0" w:color="D3D3D3"/>
+              <w:start w:val="single" w:space="0" w:color="D3D3D3"/>
+              <w:end w:val="single" w:space="0" w:color="D3D3D3"/>
+            </w:tcBorders>
+          </w:tcPr>
+          <w:p>
+            <w:pPr>
+              <w:spacing w:before="0" w:after="60"/>
+              <w:keepNext/>
+              <w:jc w:val="start"/>
+            </w:pPr>
+            <w:r>
+              <w:rPr>
+                <w:rFonts w:ascii="Calibri" w:hAnsi="Calibri"/>
+                <w:sz w:val="20"/>
+              </w:rPr>
+              <w:t xml:space="default">Switch your light bulbs to LED light bulbs. LEDs use 80% less energy than incandescent light bulbs which can significantly reduce your electricity bill.</w:t>
             </w:r>
           </w:p>
         </w:tc>
@@ -450,31 +450,31 @@
                 <w:rFonts w:ascii="Calibri" w:hAnsi="Calibri"/>
                 <w:sz w:val="20"/>
               </w:rPr>
-              <w:t xml:space="default">WindowDressers</w:t>
-            </w:r>
-          </w:p>
-        </w:tc>
-        <w:tc>
-          <w:tcPr>
-            <w:tcBorders>
-              <w:top w:val="single" w:space="0" w:color="D3D3D3"/>
-              <w:bottom w:val="single" w:space="0" w:color="D3D3D3"/>
-              <w:start w:val="single" w:space="0" w:color="D3D3D3"/>
-              <w:end w:val="single" w:space="0" w:color="D3D3D3"/>
-            </w:tcBorders>
-          </w:tcPr>
-          <w:p>
-            <w:pPr>
-              <w:spacing w:before="0" w:after="60"/>
-              <w:keepNext/>
-              <w:jc w:val="start"/>
-            </w:pPr>
-            <w:r>
-              <w:rPr>
-                <w:rFonts w:ascii="Calibri" w:hAnsi="Calibri"/>
-                <w:sz w:val="20"/>
-              </w:rPr>
-              <w:t xml:space="default">WindowDressers are insulating window inserts that help air-seal windows and reduce heat loss and gain.</w:t>
+              <w:t xml:space="default">High-efficiency Shower Head(s)</w:t>
+            </w:r>
+          </w:p>
+        </w:tc>
+        <w:tc>
+          <w:tcPr>
+            <w:tcBorders>
+              <w:top w:val="single" w:space="0" w:color="D3D3D3"/>
+              <w:bottom w:val="single" w:space="0" w:color="D3D3D3"/>
+              <w:start w:val="single" w:space="0" w:color="D3D3D3"/>
+              <w:end w:val="single" w:space="0" w:color="D3D3D3"/>
+            </w:tcBorders>
+          </w:tcPr>
+          <w:p>
+            <w:pPr>
+              <w:spacing w:before="0" w:after="60"/>
+              <w:keepNext/>
+              <w:jc w:val="start"/>
+            </w:pPr>
+            <w:r>
+              <w:rPr>
+                <w:rFonts w:ascii="Calibri" w:hAnsi="Calibri"/>
+                <w:sz w:val="20"/>
+              </w:rPr>
+              <w:t xml:space="default">Install high-efficiency shower heads to reduce the amount of water and energy to heat the water used when showering.</w:t>
             </w:r>
           </w:p>
         </w:tc>
@@ -503,31 +503,31 @@
                 <w:rFonts w:ascii="Calibri" w:hAnsi="Calibri"/>
                 <w:sz w:val="20"/>
               </w:rPr>
-              <w:t xml:space="default">Freezer</w:t>
-            </w:r>
-          </w:p>
-        </w:tc>
-        <w:tc>
-          <w:tcPr>
-            <w:tcBorders>
-              <w:top w:val="single" w:space="0" w:color="D3D3D3"/>
-              <w:bottom w:val="single" w:space="0" w:color="D3D3D3"/>
-              <w:start w:val="single" w:space="0" w:color="D3D3D3"/>
-              <w:end w:val="single" w:space="0" w:color="D3D3D3"/>
-            </w:tcBorders>
-          </w:tcPr>
-          <w:p>
-            <w:pPr>
-              <w:spacing w:before="0" w:after="60"/>
-              <w:keepNext/>
-              <w:jc w:val="start"/>
-            </w:pPr>
-            <w:r>
-              <w:rPr>
-                <w:rFonts w:ascii="Calibri" w:hAnsi="Calibri"/>
-                <w:sz w:val="20"/>
-              </w:rPr>
-              <w:t xml:space="default">Replace your freezer with a new, EnergyStar certified freezer. Look at the Energy Guide label to compare the energy use of new freezers.</w:t>
+              <w:t xml:space="default">Gutters</w:t>
+            </w:r>
+          </w:p>
+        </w:tc>
+        <w:tc>
+          <w:tcPr>
+            <w:tcBorders>
+              <w:top w:val="single" w:space="0" w:color="D3D3D3"/>
+              <w:bottom w:val="single" w:space="0" w:color="D3D3D3"/>
+              <w:start w:val="single" w:space="0" w:color="D3D3D3"/>
+              <w:end w:val="single" w:space="0" w:color="D3D3D3"/>
+            </w:tcBorders>
+          </w:tcPr>
+          <w:p>
+            <w:pPr>
+              <w:spacing w:before="0" w:after="60"/>
+              <w:keepNext/>
+              <w:jc w:val="start"/>
+            </w:pPr>
+            <w:r>
+              <w:rPr>
+                <w:rFonts w:ascii="Calibri" w:hAnsi="Calibri"/>
+                <w:sz w:val="20"/>
+              </w:rPr>
+              <w:t xml:space="default">Install gutters and downspouts that divert water at least six feet away from the foundation and to where the ground slopes away from the house.</w:t>
             </w:r>
           </w:p>
         </w:tc>
@@ -556,31 +556,31 @@
                 <w:rFonts w:ascii="Calibri" w:hAnsi="Calibri"/>
                 <w:sz w:val="20"/>
               </w:rPr>
-              <w:t xml:space="default">Induction Stove/Oven</w:t>
-            </w:r>
-          </w:p>
-        </w:tc>
-        <w:tc>
-          <w:tcPr>
-            <w:tcBorders>
-              <w:top w:val="single" w:space="0" w:color="D3D3D3"/>
-              <w:bottom w:val="single" w:space="0" w:color="D3D3D3"/>
-              <w:start w:val="single" w:space="0" w:color="D3D3D3"/>
-              <w:end w:val="single" w:space="0" w:color="D3D3D3"/>
-            </w:tcBorders>
-          </w:tcPr>
-          <w:p>
-            <w:pPr>
-              <w:spacing w:before="0" w:after="60"/>
-              <w:keepNext/>
-              <w:jc w:val="start"/>
-            </w:pPr>
-            <w:r>
-              <w:rPr>
-                <w:rFonts w:ascii="Calibri" w:hAnsi="Calibri"/>
-                <w:sz w:val="20"/>
-              </w:rPr>
-              <w:t xml:space="default">Induction cooking appliances are more efficient and safer than electric or gas ones. There is no risk of carbon monoxide or other harmful combustion gases, and the surface doesn’t heat up without a pot or pan on it.</w:t>
+              <w:t xml:space="default">Bathroom Exhaust Fan(s)</w:t>
+            </w:r>
+          </w:p>
+        </w:tc>
+        <w:tc>
+          <w:tcPr>
+            <w:tcBorders>
+              <w:top w:val="single" w:space="0" w:color="D3D3D3"/>
+              <w:bottom w:val="single" w:space="0" w:color="D3D3D3"/>
+              <w:start w:val="single" w:space="0" w:color="D3D3D3"/>
+              <w:end w:val="single" w:space="0" w:color="D3D3D3"/>
+            </w:tcBorders>
+          </w:tcPr>
+          <w:p>
+            <w:pPr>
+              <w:spacing w:before="0" w:after="60"/>
+              <w:keepNext/>
+              <w:jc w:val="start"/>
+            </w:pPr>
+            <w:r>
+              <w:rPr>
+                <w:rFonts w:ascii="Calibri" w:hAnsi="Calibri"/>
+                <w:sz w:val="20"/>
+              </w:rPr>
+              <w:t xml:space="default">Install bathroom exhaust fans in all bathrooms that do not have them. These should be rated for at least 80 cubic feet per minute (CFM) if there is a shower. We recommend the Panasonic Whisper series or similar fans that don’t create excess noise.</w:t>
             </w:r>
           </w:p>
         </w:tc>
@@ -609,31 +609,31 @@
                 <w:rFonts w:ascii="Calibri" w:hAnsi="Calibri"/>
                 <w:sz w:val="20"/>
               </w:rPr>
-              <w:t xml:space="default">Bathroom Exhaust Fan(s)</w:t>
-            </w:r>
-          </w:p>
-        </w:tc>
-        <w:tc>
-          <w:tcPr>
-            <w:tcBorders>
-              <w:top w:val="single" w:space="0" w:color="D3D3D3"/>
-              <w:bottom w:val="single" w:space="0" w:color="D3D3D3"/>
-              <w:start w:val="single" w:space="0" w:color="D3D3D3"/>
-              <w:end w:val="single" w:space="0" w:color="D3D3D3"/>
-            </w:tcBorders>
-          </w:tcPr>
-          <w:p>
-            <w:pPr>
-              <w:spacing w:before="0" w:after="60"/>
-              <w:keepNext/>
-              <w:jc w:val="start"/>
-            </w:pPr>
-            <w:r>
-              <w:rPr>
-                <w:rFonts w:ascii="Calibri" w:hAnsi="Calibri"/>
-                <w:sz w:val="20"/>
-              </w:rPr>
-              <w:t xml:space="default">Install bathroom exhaust fans in all bathrooms that do not have them. These should be rated for at least 80 cubic feet per minute (CFM) if there is a shower. We recommend the Panasonic Whisper series or similar fans that don’t create excess noise.</w:t>
+              <w:t xml:space="default">Kitchen Exhaust Fan</w:t>
+            </w:r>
+          </w:p>
+        </w:tc>
+        <w:tc>
+          <w:tcPr>
+            <w:tcBorders>
+              <w:top w:val="single" w:space="0" w:color="D3D3D3"/>
+              <w:bottom w:val="single" w:space="0" w:color="D3D3D3"/>
+              <w:start w:val="single" w:space="0" w:color="D3D3D3"/>
+              <w:end w:val="single" w:space="0" w:color="D3D3D3"/>
+            </w:tcBorders>
+          </w:tcPr>
+          <w:p>
+            <w:pPr>
+              <w:spacing w:before="0" w:after="60"/>
+              <w:keepNext/>
+              <w:jc w:val="start"/>
+            </w:pPr>
+            <w:r>
+              <w:rPr>
+                <w:rFonts w:ascii="Calibri" w:hAnsi="Calibri"/>
+                <w:sz w:val="20"/>
+              </w:rPr>
+              <w:t xml:space="default">Install a kitchen exhaust fan to remove cooking fumes and moisture from your home. The fan should be rated for at least 100 cubic feet per minute. A kitchen fan should be ducted to the outdoors. If the ductwork will run through the attic, it should be installed before the attic is air-sealed and insulated.</w:t>
             </w:r>
           </w:p>
         </w:tc>
@@ -662,31 +662,31 @@
                 <w:rFonts w:ascii="Calibri" w:hAnsi="Calibri"/>
                 <w:sz w:val="20"/>
               </w:rPr>
-              <w:t xml:space="default">Kitchen Exhaust Fan</w:t>
-            </w:r>
-          </w:p>
-        </w:tc>
-        <w:tc>
-          <w:tcPr>
-            <w:tcBorders>
-              <w:top w:val="single" w:space="0" w:color="D3D3D3"/>
-              <w:bottom w:val="single" w:space="0" w:color="D3D3D3"/>
-              <w:start w:val="single" w:space="0" w:color="D3D3D3"/>
-              <w:end w:val="single" w:space="0" w:color="D3D3D3"/>
-            </w:tcBorders>
-          </w:tcPr>
-          <w:p>
-            <w:pPr>
-              <w:spacing w:before="0" w:after="60"/>
-              <w:keepNext/>
-              <w:jc w:val="start"/>
-            </w:pPr>
-            <w:r>
-              <w:rPr>
-                <w:rFonts w:ascii="Calibri" w:hAnsi="Calibri"/>
-                <w:sz w:val="20"/>
-              </w:rPr>
-              <w:t xml:space="default">Install a kitchen exhaust fan to remove cooking fumes and moisture from your home. The fan should be rated for at least 100 cubic feet per minute. A kitchen fan should be ducted to the outdoors. If the ductwork will run through the attic, it should be installed before the attic is air-sealed and insulated.</w:t>
+              <w:t xml:space="default">Induction Stove/Oven</w:t>
+            </w:r>
+          </w:p>
+        </w:tc>
+        <w:tc>
+          <w:tcPr>
+            <w:tcBorders>
+              <w:top w:val="single" w:space="0" w:color="D3D3D3"/>
+              <w:bottom w:val="single" w:space="0" w:color="D3D3D3"/>
+              <w:start w:val="single" w:space="0" w:color="D3D3D3"/>
+              <w:end w:val="single" w:space="0" w:color="D3D3D3"/>
+            </w:tcBorders>
+          </w:tcPr>
+          <w:p>
+            <w:pPr>
+              <w:spacing w:before="0" w:after="60"/>
+              <w:keepNext/>
+              <w:jc w:val="start"/>
+            </w:pPr>
+            <w:r>
+              <w:rPr>
+                <w:rFonts w:ascii="Calibri" w:hAnsi="Calibri"/>
+                <w:sz w:val="20"/>
+              </w:rPr>
+              <w:t xml:space="default">Induction cooking appliances are more efficient and safer than electric or gas ones. There is no risk of carbon monoxide or other harmful combustion gases, and the surface doesn’t heat up without a pot or pan on it.</w:t>
             </w:r>
           </w:p>
         </w:tc>
@@ -715,31 +715,31 @@
                 <w:rFonts w:ascii="Calibri" w:hAnsi="Calibri"/>
                 <w:sz w:val="20"/>
               </w:rPr>
-              <w:t xml:space="default">Vapor Barrier</w:t>
-            </w:r>
-          </w:p>
-        </w:tc>
-        <w:tc>
-          <w:tcPr>
-            <w:tcBorders>
-              <w:top w:val="single" w:space="0" w:color="D3D3D3"/>
-              <w:bottom w:val="single" w:space="0" w:color="D3D3D3"/>
-              <w:start w:val="single" w:space="0" w:color="D3D3D3"/>
-              <w:end w:val="single" w:space="0" w:color="D3D3D3"/>
-            </w:tcBorders>
-          </w:tcPr>
-          <w:p>
-            <w:pPr>
-              <w:spacing w:before="0" w:after="60"/>
-              <w:keepNext/>
-              <w:jc w:val="start"/>
-            </w:pPr>
-            <w:r>
-              <w:rPr>
-                <w:rFonts w:ascii="Calibri" w:hAnsi="Calibri"/>
-                <w:sz w:val="20"/>
-              </w:rPr>
-              <w:t xml:space="default">Install a vapor barrier on the basement floor to stop moisture from entering the basement and house.</w:t>
+              <w:t xml:space="default">Attic Air Sealing and Insulation</w:t>
+            </w:r>
+          </w:p>
+        </w:tc>
+        <w:tc>
+          <w:tcPr>
+            <w:tcBorders>
+              <w:top w:val="single" w:space="0" w:color="D3D3D3"/>
+              <w:bottom w:val="single" w:space="0" w:color="D3D3D3"/>
+              <w:start w:val="single" w:space="0" w:color="D3D3D3"/>
+              <w:end w:val="single" w:space="0" w:color="D3D3D3"/>
+            </w:tcBorders>
+          </w:tcPr>
+          <w:p>
+            <w:pPr>
+              <w:spacing w:before="0" w:after="60"/>
+              <w:keepNext/>
+              <w:jc w:val="start"/>
+            </w:pPr>
+            <w:r>
+              <w:rPr>
+                <w:rFonts w:ascii="Calibri" w:hAnsi="Calibri"/>
+                <w:sz w:val="20"/>
+              </w:rPr>
+              <w:t xml:space="default">Air seal the attic and insulate it to at least R-60 (18 inches of loose-fill cellulose insulation).</w:t>
             </w:r>
           </w:p>
         </w:tc>
@@ -768,31 +768,31 @@
                 <w:rFonts w:ascii="Calibri" w:hAnsi="Calibri"/>
                 <w:sz w:val="20"/>
               </w:rPr>
-              <w:t xml:space="default">Spray Foam Basement/Crawlspace Walls</w:t>
-            </w:r>
-          </w:p>
-        </w:tc>
-        <w:tc>
-          <w:tcPr>
-            <w:tcBorders>
-              <w:top w:val="single" w:space="0" w:color="D3D3D3"/>
-              <w:bottom w:val="single" w:space="0" w:color="D3D3D3"/>
-              <w:start w:val="single" w:space="0" w:color="D3D3D3"/>
-              <w:end w:val="single" w:space="0" w:color="D3D3D3"/>
-            </w:tcBorders>
-          </w:tcPr>
-          <w:p>
-            <w:pPr>
-              <w:spacing w:before="0" w:after="60"/>
-              <w:keepNext/>
-              <w:jc w:val="start"/>
-            </w:pPr>
-            <w:r>
-              <w:rPr>
-                <w:rFonts w:ascii="Calibri" w:hAnsi="Calibri"/>
-                <w:sz w:val="20"/>
-              </w:rPr>
-              <w:t xml:space="default">Install spray foam on the basement/crawlspace walls to prevent moisture infiltration and reduce heat loss.</w:t>
+              <w:t xml:space="default">Vapor Barrier</w:t>
+            </w:r>
+          </w:p>
+        </w:tc>
+        <w:tc>
+          <w:tcPr>
+            <w:tcBorders>
+              <w:top w:val="single" w:space="0" w:color="D3D3D3"/>
+              <w:bottom w:val="single" w:space="0" w:color="D3D3D3"/>
+              <w:start w:val="single" w:space="0" w:color="D3D3D3"/>
+              <w:end w:val="single" w:space="0" w:color="D3D3D3"/>
+            </w:tcBorders>
+          </w:tcPr>
+          <w:p>
+            <w:pPr>
+              <w:spacing w:before="0" w:after="60"/>
+              <w:keepNext/>
+              <w:jc w:val="start"/>
+            </w:pPr>
+            <w:r>
+              <w:rPr>
+                <w:rFonts w:ascii="Calibri" w:hAnsi="Calibri"/>
+                <w:sz w:val="20"/>
+              </w:rPr>
+              <w:t xml:space="default">Install a vapor barrier on the basement floor to stop moisture from entering the basement and house.</w:t>
             </w:r>
           </w:p>
         </w:tc>
@@ -821,31 +821,31 @@
                 <w:rFonts w:ascii="Calibri" w:hAnsi="Calibri"/>
                 <w:sz w:val="20"/>
               </w:rPr>
-              <w:t xml:space="default">Attic Air Sealing and Insulation</w:t>
-            </w:r>
-          </w:p>
-        </w:tc>
-        <w:tc>
-          <w:tcPr>
-            <w:tcBorders>
-              <w:top w:val="single" w:space="0" w:color="D3D3D3"/>
-              <w:bottom w:val="single" w:space="0" w:color="D3D3D3"/>
-              <w:start w:val="single" w:space="0" w:color="D3D3D3"/>
-              <w:end w:val="single" w:space="0" w:color="D3D3D3"/>
-            </w:tcBorders>
-          </w:tcPr>
-          <w:p>
-            <w:pPr>
-              <w:spacing w:before="0" w:after="60"/>
-              <w:keepNext/>
-              <w:jc w:val="start"/>
-            </w:pPr>
-            <w:r>
-              <w:rPr>
-                <w:rFonts w:ascii="Calibri" w:hAnsi="Calibri"/>
-                <w:sz w:val="20"/>
-              </w:rPr>
-              <w:t xml:space="default">Air seal the attic and insulate it to at least R-60 (18 inches of loose-fill cellulose insulation).</w:t>
+              <w:t xml:space="default">Spray Foam Basement/Crawlspace Walls</w:t>
+            </w:r>
+          </w:p>
+        </w:tc>
+        <w:tc>
+          <w:tcPr>
+            <w:tcBorders>
+              <w:top w:val="single" w:space="0" w:color="D3D3D3"/>
+              <w:bottom w:val="single" w:space="0" w:color="D3D3D3"/>
+              <w:start w:val="single" w:space="0" w:color="D3D3D3"/>
+              <w:end w:val="single" w:space="0" w:color="D3D3D3"/>
+            </w:tcBorders>
+          </w:tcPr>
+          <w:p>
+            <w:pPr>
+              <w:spacing w:before="0" w:after="60"/>
+              <w:keepNext/>
+              <w:jc w:val="start"/>
+            </w:pPr>
+            <w:r>
+              <w:rPr>
+                <w:rFonts w:ascii="Calibri" w:hAnsi="Calibri"/>
+                <w:sz w:val="20"/>
+              </w:rPr>
+              <w:t xml:space="default">Install spray foam on the basement/crawlspace walls to prevent moisture infiltration and reduce heat loss.</w:t>
             </w:r>
           </w:p>
         </w:tc>
@@ -874,31 +874,31 @@
                 <w:rFonts w:ascii="Calibri" w:hAnsi="Calibri"/>
                 <w:sz w:val="20"/>
               </w:rPr>
-              <w:t xml:space="default">Blown-in Cellulose Wall Insulation</w:t>
-            </w:r>
-          </w:p>
-        </w:tc>
-        <w:tc>
-          <w:tcPr>
-            <w:tcBorders>
-              <w:top w:val="single" w:space="0" w:color="D3D3D3"/>
-              <w:bottom w:val="single" w:space="0" w:color="D3D3D3"/>
-              <w:start w:val="single" w:space="0" w:color="D3D3D3"/>
-              <w:end w:val="single" w:space="0" w:color="D3D3D3"/>
-            </w:tcBorders>
-          </w:tcPr>
-          <w:p>
-            <w:pPr>
-              <w:spacing w:before="0" w:after="60"/>
-              <w:keepNext/>
-              <w:jc w:val="start"/>
-            </w:pPr>
-            <w:r>
-              <w:rPr>
-                <w:rFonts w:ascii="Calibri" w:hAnsi="Calibri"/>
-                <w:sz w:val="20"/>
-              </w:rPr>
-              <w:t xml:space="default">Insulate the wall stud cavities with dense packed, blown-in cellulose insulation.</w:t>
+              <w:t xml:space="default">Electrical Panel Upgrade</w:t>
+            </w:r>
+          </w:p>
+        </w:tc>
+        <w:tc>
+          <w:tcPr>
+            <w:tcBorders>
+              <w:top w:val="single" w:space="0" w:color="D3D3D3"/>
+              <w:bottom w:val="single" w:space="0" w:color="D3D3D3"/>
+              <w:start w:val="single" w:space="0" w:color="D3D3D3"/>
+              <w:end w:val="single" w:space="0" w:color="D3D3D3"/>
+            </w:tcBorders>
+          </w:tcPr>
+          <w:p>
+            <w:pPr>
+              <w:spacing w:before="0" w:after="60"/>
+              <w:keepNext/>
+              <w:jc w:val="start"/>
+            </w:pPr>
+            <w:r>
+              <w:rPr>
+                <w:rFonts w:ascii="Calibri" w:hAnsi="Calibri"/>
+                <w:sz w:val="20"/>
+              </w:rPr>
+              <w:t xml:space="default">Consult with an electrician about replacing your existing electrical panel with a 200 amp panel as you add electrical appliances to your home.</w:t>
             </w:r>
           </w:p>
         </w:tc>
@@ -927,349 +927,31 @@
                 <w:rFonts w:ascii="Calibri" w:hAnsi="Calibri"/>
                 <w:sz w:val="20"/>
               </w:rPr>
-              <w:t xml:space="default">Continuous Exterior Wall Insulation</w:t>
-            </w:r>
-          </w:p>
-        </w:tc>
-        <w:tc>
-          <w:tcPr>
-            <w:tcBorders>
-              <w:top w:val="single" w:space="0" w:color="D3D3D3"/>
-              <w:bottom w:val="single" w:space="0" w:color="D3D3D3"/>
-              <w:start w:val="single" w:space="0" w:color="D3D3D3"/>
-              <w:end w:val="single" w:space="0" w:color="D3D3D3"/>
-            </w:tcBorders>
-          </w:tcPr>
-          <w:p>
-            <w:pPr>
-              <w:spacing w:before="0" w:after="60"/>
-              <w:keepNext/>
-              <w:jc w:val="start"/>
-            </w:pPr>
-            <w:r>
-              <w:rPr>
-                <w:rFonts w:ascii="Calibri" w:hAnsi="Calibri"/>
-                <w:sz w:val="20"/>
-              </w:rPr>
-              <w:t xml:space="default">Add a continuous layer of insulation and potentially replace the air and moisture barrier once it becomes time to replace the siding.</w:t>
-            </w:r>
-          </w:p>
-        </w:tc>
-      </w:tr>
-      <w:tr>
-        <w:trPr>
-          <w:cantSplit/>
-        </w:trPr>
-        <w:tc>
-          <w:tcPr>
-            <w:tcBorders>
-              <w:top w:val="single" w:space="0" w:color="D3D3D3"/>
-              <w:bottom w:val="single" w:space="0" w:color="D3D3D3"/>
-              <w:start w:val="single" w:space="0" w:color="D3D3D3"/>
-              <w:end w:val="single" w:space="0" w:color="D3D3D3"/>
-            </w:tcBorders>
-          </w:tcPr>
-          <w:p>
-            <w:pPr>
-              <w:spacing w:before="0" w:after="60"/>
-              <w:keepNext/>
-              <w:jc w:val="start"/>
-            </w:pPr>
-            <w:r>
-              <w:rPr>
-                <w:rFonts w:ascii="Calibri" w:hAnsi="Calibri"/>
-                <w:sz w:val="20"/>
-              </w:rPr>
-              <w:t xml:space="default">Electrical Panel Upgrade</w:t>
-            </w:r>
-          </w:p>
-        </w:tc>
-        <w:tc>
-          <w:tcPr>
-            <w:tcBorders>
-              <w:top w:val="single" w:space="0" w:color="D3D3D3"/>
-              <w:bottom w:val="single" w:space="0" w:color="D3D3D3"/>
-              <w:start w:val="single" w:space="0" w:color="D3D3D3"/>
-              <w:end w:val="single" w:space="0" w:color="D3D3D3"/>
-            </w:tcBorders>
-          </w:tcPr>
-          <w:p>
-            <w:pPr>
-              <w:spacing w:before="0" w:after="60"/>
-              <w:keepNext/>
-              <w:jc w:val="start"/>
-            </w:pPr>
-            <w:r>
-              <w:rPr>
-                <w:rFonts w:ascii="Calibri" w:hAnsi="Calibri"/>
-                <w:sz w:val="20"/>
-              </w:rPr>
-              <w:t xml:space="default">Consult with an electrician about replacing your existing electrical panel with a 200 amp panel as you add electrical appliances to your home.</w:t>
-            </w:r>
-          </w:p>
-        </w:tc>
-      </w:tr>
-      <w:tr>
-        <w:trPr>
-          <w:cantSplit/>
-        </w:trPr>
-        <w:tc>
-          <w:tcPr>
-            <w:tcBorders>
-              <w:top w:val="single" w:space="0" w:color="D3D3D3"/>
-              <w:bottom w:val="single" w:space="0" w:color="D3D3D3"/>
-              <w:start w:val="single" w:space="0" w:color="D3D3D3"/>
-              <w:end w:val="single" w:space="0" w:color="D3D3D3"/>
-            </w:tcBorders>
-          </w:tcPr>
-          <w:p>
-            <w:pPr>
-              <w:spacing w:before="0" w:after="60"/>
-              <w:keepNext/>
-              <w:jc w:val="start"/>
-            </w:pPr>
-            <w:r>
-              <w:rPr>
-                <w:rFonts w:ascii="Calibri" w:hAnsi="Calibri"/>
-                <w:sz w:val="20"/>
-              </w:rPr>
-              <w:t xml:space="default">Whole-House Surge Protection</w:t>
-            </w:r>
-          </w:p>
-        </w:tc>
-        <w:tc>
-          <w:tcPr>
-            <w:tcBorders>
-              <w:top w:val="single" w:space="0" w:color="D3D3D3"/>
-              <w:bottom w:val="single" w:space="0" w:color="D3D3D3"/>
-              <w:start w:val="single" w:space="0" w:color="D3D3D3"/>
-              <w:end w:val="single" w:space="0" w:color="D3D3D3"/>
-            </w:tcBorders>
-          </w:tcPr>
-          <w:p>
-            <w:pPr>
-              <w:spacing w:before="0" w:after="60"/>
-              <w:keepNext/>
-              <w:jc w:val="start"/>
-            </w:pPr>
-            <w:r>
-              <w:rPr>
-                <w:rFonts w:ascii="Calibri" w:hAnsi="Calibri"/>
-                <w:sz w:val="20"/>
-              </w:rPr>
-              <w:t xml:space="default">Upgrade your electrical panel to add whole-house surge protection.</w:t>
-            </w:r>
-          </w:p>
-        </w:tc>
-      </w:tr>
-      <w:tr>
-        <w:trPr>
-          <w:cantSplit/>
-        </w:trPr>
-        <w:tc>
-          <w:tcPr>
-            <w:tcBorders>
-              <w:top w:val="single" w:space="0" w:color="D3D3D3"/>
-              <w:bottom w:val="single" w:space="0" w:color="D3D3D3"/>
-              <w:start w:val="single" w:space="0" w:color="D3D3D3"/>
-              <w:end w:val="single" w:space="0" w:color="D3D3D3"/>
-            </w:tcBorders>
-          </w:tcPr>
-          <w:p>
-            <w:pPr>
-              <w:spacing w:before="0" w:after="60"/>
-              <w:keepNext/>
-              <w:jc w:val="start"/>
-            </w:pPr>
-            <w:r>
-              <w:rPr>
-                <w:rFonts w:ascii="Calibri" w:hAnsi="Calibri"/>
-                <w:sz w:val="20"/>
-              </w:rPr>
-              <w:t xml:space="default">Pipe Insulation</w:t>
-            </w:r>
-          </w:p>
-        </w:tc>
-        <w:tc>
-          <w:tcPr>
-            <w:tcBorders>
-              <w:top w:val="single" w:space="0" w:color="D3D3D3"/>
-              <w:bottom w:val="single" w:space="0" w:color="D3D3D3"/>
-              <w:start w:val="single" w:space="0" w:color="D3D3D3"/>
-              <w:end w:val="single" w:space="0" w:color="D3D3D3"/>
-            </w:tcBorders>
-          </w:tcPr>
-          <w:p>
-            <w:pPr>
-              <w:spacing w:before="0" w:after="60"/>
-              <w:keepNext/>
-              <w:jc w:val="start"/>
-            </w:pPr>
-            <w:r>
-              <w:rPr>
-                <w:rFonts w:ascii="Calibri" w:hAnsi="Calibri"/>
-                <w:sz w:val="20"/>
-              </w:rPr>
-              <w:t xml:space="default">Insulate both hot and cold water pipes that are uninsulated in the basement/crawlspace. This will save energy and prevent condensation.</w:t>
-            </w:r>
-          </w:p>
-        </w:tc>
-      </w:tr>
-      <w:tr>
-        <w:trPr>
-          <w:cantSplit/>
-        </w:trPr>
-        <w:tc>
-          <w:tcPr>
-            <w:tcBorders>
-              <w:top w:val="single" w:space="0" w:color="D3D3D3"/>
-              <w:bottom w:val="single" w:space="0" w:color="D3D3D3"/>
-              <w:start w:val="single" w:space="0" w:color="D3D3D3"/>
-              <w:end w:val="single" w:space="0" w:color="D3D3D3"/>
-            </w:tcBorders>
-          </w:tcPr>
-          <w:p>
-            <w:pPr>
-              <w:spacing w:before="0" w:after="60"/>
-              <w:keepNext/>
-              <w:jc w:val="start"/>
-            </w:pPr>
-            <w:r>
-              <w:rPr>
-                <w:rFonts w:ascii="Calibri" w:hAnsi="Calibri"/>
-                <w:sz w:val="20"/>
-              </w:rPr>
-              <w:t xml:space="default">DIY Air Sealing</w:t>
-            </w:r>
-          </w:p>
-        </w:tc>
-        <w:tc>
-          <w:tcPr>
-            <w:tcBorders>
-              <w:top w:val="single" w:space="0" w:color="D3D3D3"/>
-              <w:bottom w:val="single" w:space="0" w:color="D3D3D3"/>
-              <w:start w:val="single" w:space="0" w:color="D3D3D3"/>
-              <w:end w:val="single" w:space="0" w:color="D3D3D3"/>
-            </w:tcBorders>
-          </w:tcPr>
-          <w:p>
-            <w:pPr>
-              <w:spacing w:before="0" w:after="60"/>
-              <w:keepNext/>
-              <w:jc w:val="start"/>
-            </w:pPr>
-            <w:r>
-              <w:rPr>
-                <w:rFonts w:ascii="Calibri" w:hAnsi="Calibri"/>
-                <w:sz w:val="20"/>
-              </w:rPr>
-              <w:t xml:space="default">Seal easy-to-access air leaks and weatherstrip exterior doors.</w:t>
-            </w:r>
-          </w:p>
-        </w:tc>
-      </w:tr>
-      <w:tr>
-        <w:trPr>
-          <w:cantSplit/>
-        </w:trPr>
-        <w:tc>
-          <w:tcPr>
-            <w:tcBorders>
-              <w:top w:val="single" w:space="0" w:color="D3D3D3"/>
-              <w:bottom w:val="single" w:space="0" w:color="D3D3D3"/>
-              <w:start w:val="single" w:space="0" w:color="D3D3D3"/>
-              <w:end w:val="single" w:space="0" w:color="D3D3D3"/>
-            </w:tcBorders>
-          </w:tcPr>
-          <w:p>
-            <w:pPr>
-              <w:spacing w:before="0" w:after="60"/>
-              <w:keepNext/>
-              <w:jc w:val="start"/>
-            </w:pPr>
-            <w:r>
-              <w:rPr>
-                <w:rFonts w:ascii="Calibri" w:hAnsi="Calibri"/>
-                <w:sz w:val="20"/>
-              </w:rPr>
-              <w:t xml:space="default">Other 1</w:t>
-            </w:r>
-          </w:p>
-        </w:tc>
-        <w:tc>
-          <w:tcPr>
-            <w:tcBorders>
-              <w:top w:val="single" w:space="0" w:color="D3D3D3"/>
-              <w:bottom w:val="single" w:space="0" w:color="D3D3D3"/>
-              <w:start w:val="single" w:space="0" w:color="D3D3D3"/>
-              <w:end w:val="single" w:space="0" w:color="D3D3D3"/>
-            </w:tcBorders>
-          </w:tcPr>
-          <w:p>
-            <w:pPr>
-              <w:spacing w:before="0" w:after="60"/>
-              <w:keepNext/>
-              <w:jc w:val="start"/>
-            </w:pPr>
-            <w:r>
-              <w:rPr>
-                <w:rFonts w:ascii="Calibri" w:hAnsi="Calibri"/>
-                <w:sz w:val="20"/>
-              </w:rPr>
-              <w:t xml:space="default">TYPE HERE 1</w:t>
-            </w:r>
-          </w:p>
-        </w:tc>
-      </w:tr>
-      <w:tr>
-        <w:trPr>
-          <w:cantSplit/>
-        </w:trPr>
-        <w:tc>
-          <w:tcPr>
-            <w:tcBorders>
-              <w:top w:val="single" w:space="0" w:color="D3D3D3"/>
-              <w:bottom w:val="single" w:space="0" w:color="D3D3D3"/>
-              <w:start w:val="single" w:space="0" w:color="D3D3D3"/>
-              <w:end w:val="single" w:space="0" w:color="D3D3D3"/>
-            </w:tcBorders>
-          </w:tcPr>
-          <w:p>
-            <w:pPr>
-              <w:spacing w:before="0" w:after="60"/>
-              <w:keepNext/>
-              <w:jc w:val="start"/>
-            </w:pPr>
-            <w:r>
-              <w:rPr>
-                <w:rFonts w:ascii="Calibri" w:hAnsi="Calibri"/>
-                <w:sz w:val="20"/>
-              </w:rPr>
-              <w:t xml:space="default">Misc. Air Sealing and Insulation</w:t>
-            </w:r>
-          </w:p>
-        </w:tc>
-        <w:tc>
-          <w:tcPr>
-            <w:tcBorders>
-              <w:top w:val="single" w:space="0" w:color="D3D3D3"/>
-              <w:bottom w:val="single" w:space="0" w:color="D3D3D3"/>
-              <w:start w:val="single" w:space="0" w:color="D3D3D3"/>
-              <w:end w:val="single" w:space="0" w:color="D3D3D3"/>
-            </w:tcBorders>
-          </w:tcPr>
-          <w:p>
-            <w:pPr>
-              <w:spacing w:before="0" w:after="60"/>
-              <w:keepNext/>
-              <w:jc w:val="start"/>
-            </w:pPr>
-            <w:r>
-              <w:rPr>
-                <w:rFonts w:ascii="Calibri" w:hAnsi="Calibri"/>
-                <w:sz w:val="20"/>
-              </w:rPr>
-              <w:t xml:space="default">Air seal and insulate [** insert auditor description - bay window, bulkhead door, chase, kneewall, anything else that is unique to the home and not otherwise covered in another recommendation]</w:t>
+              <w:t xml:space="default">Air Source Heat Pump</w:t>
+            </w:r>
+          </w:p>
+        </w:tc>
+        <w:tc>
+          <w:tcPr>
+            <w:tcBorders>
+              <w:top w:val="single" w:space="0" w:color="D3D3D3"/>
+              <w:bottom w:val="single" w:space="0" w:color="D3D3D3"/>
+              <w:start w:val="single" w:space="0" w:color="D3D3D3"/>
+              <w:end w:val="single" w:space="0" w:color="D3D3D3"/>
+            </w:tcBorders>
+          </w:tcPr>
+          <w:p>
+            <w:pPr>
+              <w:spacing w:before="0" w:after="60"/>
+              <w:keepNext/>
+              <w:jc w:val="start"/>
+            </w:pPr>
+            <w:r>
+              <w:rPr>
+                <w:rFonts w:ascii="Calibri" w:hAnsi="Calibri"/>
+                <w:sz w:val="20"/>
+              </w:rPr>
+              <w:t xml:space="default">Install air source heat pumps for heating and cooling and whole-house surge protection.</w:t>
             </w:r>
           </w:p>
         </w:tc>
@@ -1354,7 +1036,7 @@
                 <w:rFonts w:ascii="Calibri" w:hAnsi="Calibri"/>
                 <w:sz w:val="20"/>
               </w:rPr>
-              <w:t xml:space="default">1907</w:t>
+              <w:t xml:space="default">1799-1840</w:t>
             </w:r>
           </w:p>
         </w:tc>
@@ -1407,7 +1089,7 @@
                 <w:rFonts w:ascii="Calibri" w:hAnsi="Calibri"/>
                 <w:sz w:val="20"/>
               </w:rPr>
-              <w:t xml:space="default">Walk in basement</w:t>
+              <w:t xml:space="default">Walk in basement, Slab, Post/Piers, open to the outside</w:t>
             </w:r>
           </w:p>
         </w:tc>
@@ -1460,7 +1142,7 @@
                 <w:rFonts w:ascii="Calibri" w:hAnsi="Calibri"/>
                 <w:sz w:val="20"/>
               </w:rPr>
-              <w:t xml:space="default">Loose Cellulose , 3 inches</w:t>
+              <w:t xml:space="default">Uninsulated , NA inches</w:t>
             </w:r>
           </w:p>
         </w:tc>
@@ -1566,7 +1248,7 @@
                 <w:rFonts w:ascii="Calibri" w:hAnsi="Calibri"/>
                 <w:sz w:val="20"/>
               </w:rPr>
-              <w:t xml:space="default">2458</w:t>
+              <w:t xml:space="default">3229</w:t>
             </w:r>
           </w:p>
         </w:tc>
@@ -1619,7 +1301,7 @@
                 <w:rFonts w:ascii="Calibri" w:hAnsi="Calibri"/>
                 <w:sz w:val="20"/>
               </w:rPr>
-              <w:t xml:space="default">21760</w:t>
+              <w:t xml:space="default">29061</w:t>
             </w:r>
           </w:p>
         </w:tc>
@@ -1748,7 +1430,7 @@
                 <w:rFonts w:ascii="Calibri" w:hAnsi="Calibri"/>
                 <w:sz w:val="20"/>
               </w:rPr>
-              <w:t xml:space="default">NA</w:t>
+              <w:t xml:space="default">10</w:t>
             </w:r>
           </w:p>
         </w:tc>
@@ -1801,7 +1483,7 @@
                 <w:rFonts w:ascii="Calibri" w:hAnsi="Calibri"/>
                 <w:sz w:val="20"/>
               </w:rPr>
-              <w:t xml:space="default">North/South</w:t>
+              <w:t xml:space="default">NA</w:t>
             </w:r>
           </w:p>
         </w:tc>
@@ -1854,7 +1536,7 @@
                 <w:rFonts w:ascii="Calibri" w:hAnsi="Calibri"/>
                 <w:sz w:val="20"/>
               </w:rPr>
-              <w:t xml:space="default">Asphalt Shingles, Standing Seam Metal, Synthetic Slate Tilein faircondition. Gallery connection has full standing seam, main house has a combination of shingles and standing seam, all in fairly good condition</w:t>
+              <w:t xml:space="default">Asphalt Shinglesin faircondition. NA</w:t>
             </w:r>
           </w:p>
         </w:tc>
@@ -1907,7 +1589,7 @@
                 <w:rFonts w:ascii="Calibri" w:hAnsi="Calibri"/>
                 <w:sz w:val="20"/>
               </w:rPr>
-              <w:t xml:space="default">Current moisture control strategies: gutters, ground slopes away from foundation. These were in fair condition .Some water damage marks around gutters on intersecting sections, ground does not slope away from all parts of the house. Many plants also are planted around the house that assist with moisture control.</w:t>
+              <w:t xml:space="default">Current moisture control strategies: NA. These were in NA condition .NA</w:t>
             </w:r>
           </w:p>
         </w:tc>
@@ -1960,7 +1642,7 @@
                 <w:rFonts w:ascii="Calibri" w:hAnsi="Calibri"/>
                 <w:sz w:val="20"/>
               </w:rPr>
-              <w:t xml:space="default">Combination of wood shingles and siding in fair condition. Siding shows signs of weathering and aging, some sections have water damage marks, otherwise in good condition and intact</w:t>
+              <w:t xml:space="default">vinyl siding in excellent condition. NA</w:t>
             </w:r>
           </w:p>
         </w:tc>
@@ -2013,7 +1695,7 @@
                 <w:rFonts w:ascii="Calibri" w:hAnsi="Calibri"/>
                 <w:sz w:val="20"/>
               </w:rPr>
-              <w:t xml:space="default">There are 1 insulated wood exterior doors. In fair condition, totaling 18 square feet.Furthermore there are 1 glass door wood exterior doors. In fair condition, totaling 18.5 square feet. Moreover there are 1 insulated wood exterior doors. In fair condition, totaling 18 square feet.</w:t>
+              <w:t xml:space="default">There are no exterior doors</w:t>
             </w:r>
           </w:p>
         </w:tc>
@@ -2066,7 +1748,7 @@
                 <w:rFonts w:ascii="Calibri" w:hAnsi="Calibri"/>
                 <w:sz w:val="20"/>
               </w:rPr>
-              <w:t xml:space="default">There are 16 double paned wood windows. In fair condition, totaling 169 square feet. Moreover there are 6 double paned wood windows. In excellent condition, totaling 98 square feet.</w:t>
+              <w:t xml:space="default">There are no exterior windows</w:t>
             </w:r>
           </w:p>
         </w:tc>
@@ -2142,7 +1824,7 @@
                 <w:rFonts w:ascii="Calibri" w:hAnsi="Calibri"/>
                 <w:sz w:val="20"/>
               </w:rPr>
-              <w:t xml:space="default">The framing type of the home is balloon framing, which means the wall cavities extend the full height of the building (from the foundation to the roof). Often the wall cavities are interconnected with the floor and ceiling cavities. This framing type can create connected passageways for air to leave the house and rodents to enter the house. There is Batts of Fiberglass, Loose Cellulose insulation 4 inches thick in NA condition. Insulation depth and quality unknown, could not access wall cavity. Some thermal cam images show inconsistent insulation on second floor</w:t>
+              <w:t xml:space="default">NAThere is Batts of Fiberglass insulation 6 inches thick in NA condition. The quality of the insulation was not confirmed, but the homeowner expressed it was difficult to insulate the antique section.</w:t>
             </w:r>
           </w:p>
         </w:tc>
@@ -2301,7 +1983,7 @@
                 <w:rFonts w:ascii="Calibri" w:hAnsi="Calibri"/>
                 <w:sz w:val="20"/>
               </w:rPr>
-              <w:t xml:space="default">Main fridge/freezer used 0.23 kWh in 135 minutes. Basement upright freezer used 0.32 kWh in 182 minutes. Kitchen has gas stove and range, recirculating fan but no exhaust fan</w:t>
+              <w:t xml:space="default">NA used NA kWh in NA minutes. NA used NA kWh in NA minutes. NA</w:t>
             </w:r>
           </w:p>
         </w:tc>
@@ -2409,7 +2091,7 @@
                 <w:rFonts w:ascii="Calibri" w:hAnsi="Calibri"/>
                 <w:sz w:val="20"/>
               </w:rPr>
-              <w:t xml:space="default">3383</w:t>
+              <w:t xml:space="default">NA</w:t>
             </w:r>
           </w:p>
         </w:tc>
@@ -2486,7 +2168,7 @@
                 <w:rFonts w:ascii="Calibri" w:hAnsi="Calibri"/>
                 <w:sz w:val="20"/>
               </w:rPr>
-              <w:t xml:space="default">9.3</w:t>
+              <w:t xml:space="default">NA</w:t>
             </w:r>
           </w:p>
         </w:tc>
@@ -2563,7 +2245,7 @@
                 <w:rFonts w:ascii="Calibri" w:hAnsi="Calibri"/>
                 <w:sz w:val="20"/>
               </w:rPr>
-              <w:t xml:space="default">338.3 under natural conditions. TEST</w:t>
+              <w:t xml:space="default">NA under natural conditions. TEST</w:t>
             </w:r>
           </w:p>
         </w:tc>
@@ -2640,7 +2322,7 @@
                 <w:rFonts w:ascii="Calibri" w:hAnsi="Calibri"/>
                 <w:sz w:val="20"/>
               </w:rPr>
-              <w:t xml:space="default">0.5</w:t>
+              <w:t xml:space="default">NA</w:t>
             </w:r>
           </w:p>
         </w:tc>
@@ -2848,7 +2530,7 @@
                 <w:rFonts w:ascii="Calibri" w:hAnsi="Calibri"/>
                 <w:sz w:val="20"/>
               </w:rPr>
-              <w:t xml:space="default">Loose Cellulose</w:t>
+              <w:t xml:space="default">Uninsulated</w:t>
             </w:r>
           </w:p>
         </w:tc>
@@ -2901,7 +2583,7 @@
                 <w:rFonts w:ascii="Calibri" w:hAnsi="Calibri"/>
                 <w:sz w:val="20"/>
               </w:rPr>
-              <w:t xml:space="default">Partially</w:t>
+              <w:t xml:space="default">NA</w:t>
             </w:r>
           </w:p>
         </w:tc>
@@ -2954,7 +2636,7 @@
                 <w:rFonts w:ascii="Calibri" w:hAnsi="Calibri"/>
                 <w:sz w:val="20"/>
               </w:rPr>
-              <w:t xml:space="default">There is Yesair sealing. Air sealing behind rafters, inconsistent but primarily above additions</w:t>
+              <w:t xml:space="default">There is Noair sealing. NA</w:t>
             </w:r>
           </w:p>
         </w:tc>
@@ -3007,7 +2689,7 @@
                 <w:rFonts w:ascii="Calibri" w:hAnsi="Calibri"/>
                 <w:sz w:val="20"/>
               </w:rPr>
-              <w:t xml:space="default">Cellulose has badly settled, depth under floor varies. Wall cavities have been dense packed, but have also settled to varying degrees. No NA</w:t>
+              <w:t xml:space="default">NA No NA</w:t>
             </w:r>
           </w:p>
         </w:tc>
@@ -3348,7 +3030,7 @@
                 <w:rFonts w:ascii="Calibri" w:hAnsi="Calibri"/>
                 <w:sz w:val="20"/>
               </w:rPr>
-              <w:t xml:space="default">Appliances not insulated, Ducts/pipes partially insulated</w:t>
+              <w:t xml:space="default">NA</w:t>
             </w:r>
           </w:p>
         </w:tc>
@@ -3401,7 +3083,7 @@
                 <w:rFonts w:ascii="Calibri" w:hAnsi="Calibri"/>
                 <w:sz w:val="20"/>
               </w:rPr>
-              <w:t xml:space="default">dehumidifierin faircondition. Some water damage marks around gutters on intersecting sections, ground does not slope away from all parts of the house. Many plants also are planted around the house that assist with moisture control.</w:t>
+              <w:t xml:space="default">NAin poorcondition. NA</w:t>
             </w:r>
           </w:p>
         </w:tc>
@@ -3507,7 +3189,7 @@
                 <w:rFonts w:ascii="Calibri" w:hAnsi="Calibri"/>
                 <w:sz w:val="20"/>
               </w:rPr>
-              <w:t xml:space="default">There is NANA</w:t>
+              <w:t xml:space="default">There is moistureThe basement is damp and the field stone foundation is coming apart in some sections.</w:t>
             </w:r>
           </w:p>
         </w:tc>
@@ -3583,7 +3265,7 @@
                 <w:rFonts w:ascii="Calibri" w:hAnsi="Calibri"/>
                 <w:sz w:val="20"/>
               </w:rPr>
-              <w:t xml:space="default">The electrical panel has and amperage of 100. There are 0 unused breaker spaces. NA</w:t>
+              <w:t xml:space="default">The electrical panel has and amperage of NA. There are NA unused breaker spaces. NA</w:t>
             </w:r>
           </w:p>
         </w:tc>
@@ -3710,7 +3392,7 @@
     </w:tbl>
     <w:bookmarkEnd w:id="40"/>
     <w:bookmarkEnd w:id="41"/>
-    <w:bookmarkStart w:id="60" w:name="recommendations"/>
+    <w:bookmarkStart w:id="54" w:name="recommendations"/>
     <w:p>
       <w:pPr>
         <w:pStyle w:val="Heading2"/>
@@ -3727,13 +3409,13 @@
         <w:t xml:space="preserve">These recommendations are organized from the least expensive/most cost-effective and easiest interventions to ones that are more challenging to implement.</w:t>
       </w:r>
     </w:p>
-    <w:bookmarkStart w:id="42" w:name="furnaceboiler-tune-up"/>
+    <w:bookmarkStart w:id="42" w:name="high-efficiency-shower-heads"/>
     <w:p>
       <w:pPr>
         <w:pStyle w:val="Heading3"/>
       </w:pPr>
       <w:r>
-        <w:t xml:space="preserve">4.1 Furnace/Boiler Tune up</w:t>
+        <w:t xml:space="preserve">4.1 High efficiency shower head(s)</w:t>
       </w:r>
     </w:p>
     <w:p>
@@ -3753,6 +3435,776 @@
         <w:pStyle w:val="BodyText"/>
       </w:pPr>
       <w:r>
+        <w:t xml:space="preserve">Your shower heads use more water and energy than high-efficiency shower heads, thus costing you more money than necessary. Older shower heads use 2.5 gallons or more every minute, which wastes thousands of gallons of water each year and costs you money for every extra gallon of water heated.</w:t>
+      </w:r>
+    </w:p>
+    <w:p>
+      <w:pPr>
+        <w:pStyle w:val="BodyText"/>
+      </w:pPr>
+      <w:r>
+        <w:rPr>
+          <w:i/>
+          <w:iCs/>
+        </w:rPr>
+        <w:t xml:space="preserve">Recommendation</w:t>
+      </w:r>
+    </w:p>
+    <w:p>
+      <w:pPr>
+        <w:pStyle w:val="BodyText"/>
+      </w:pPr>
+      <w:r>
+        <w:t xml:space="preserve">Install high-efficiency shower heads to reduce the amount of water and energy to heat the water used when showering. We recommend 1.5 gallon per minute shower heads that will save a gallon or more of water for every minute spent in the shower.</w:t>
+      </w:r>
+      <w:r>
+        <w:t xml:space="preserve"> </w:t>
+      </w:r>
+      <w:r>
+        <w:rPr>
+          <w:i/>
+          <w:iCs/>
+        </w:rPr>
+        <w:t xml:space="preserve">Estimated Cost/Benefits/Incentives</w:t>
+      </w:r>
+    </w:p>
+    <w:p>
+      <w:pPr>
+        <w:pStyle w:val="BodyText"/>
+      </w:pPr>
+      <w:r>
+        <w:t xml:space="preserve">A typical family will save ~10,000 gallons of water per year and over $100 per year in water heating costs. We provide these for free and have several styles for you to choose from; contact us for some if we did not give you any during the audit.</w:t>
+      </w:r>
+    </w:p>
+    <w:bookmarkEnd w:id="42"/>
+    <w:bookmarkStart w:id="43" w:name="leds"/>
+    <w:p>
+      <w:pPr>
+        <w:pStyle w:val="Heading3"/>
+      </w:pPr>
+      <w:r>
+        <w:t xml:space="preserve">4.2 LEDs</w:t>
+      </w:r>
+    </w:p>
+    <w:p>
+      <w:pPr>
+        <w:pStyle w:val="FirstParagraph"/>
+      </w:pPr>
+      <w:r>
+        <w:rPr>
+          <w:i/>
+          <w:iCs/>
+        </w:rPr>
+        <w:t xml:space="preserve">Problem</w:t>
+      </w:r>
+    </w:p>
+    <w:p>
+      <w:pPr>
+        <w:pStyle w:val="BodyText"/>
+      </w:pPr>
+      <w:r>
+        <w:t xml:space="preserve">Your lighting uses more energy than LED bulbs would. Halogen and incandescent light bulbs use 5-8x more energy than LEDs. This requires significantly more electricity and costs a lot.</w:t>
+      </w:r>
+    </w:p>
+    <w:p>
+      <w:pPr>
+        <w:pStyle w:val="BodyText"/>
+      </w:pPr>
+      <w:r>
+        <w:rPr>
+          <w:i/>
+          <w:iCs/>
+        </w:rPr>
+        <w:t xml:space="preserve">Recommendation</w:t>
+      </w:r>
+    </w:p>
+    <w:p>
+      <w:pPr>
+        <w:pStyle w:val="BodyText"/>
+      </w:pPr>
+      <w:r>
+        <w:t xml:space="preserve">Switch your light bulbs to LED light bulbs. LEDs use 80% less energy than incandescent light bulbs which can significantly reduce your electricity bill.</w:t>
+      </w:r>
+    </w:p>
+    <w:p>
+      <w:pPr>
+        <w:pStyle w:val="BodyText"/>
+      </w:pPr>
+      <w:r>
+        <w:rPr>
+          <w:i/>
+          <w:iCs/>
+        </w:rPr>
+        <w:t xml:space="preserve">Estimated Cost/Benefits/Incentives</w:t>
+      </w:r>
+    </w:p>
+    <w:p>
+      <w:pPr>
+        <w:pStyle w:val="BodyText"/>
+      </w:pPr>
+      <w:r>
+        <w:t xml:space="preserve">We provide free LED light bulbs; contact us for some if we did not give you any during the audit. Depending on usage, LEDs can save more than $50 a year.</w:t>
+      </w:r>
+    </w:p>
+    <w:bookmarkEnd w:id="43"/>
+    <w:bookmarkStart w:id="44" w:name="window-dressers"/>
+    <w:p>
+      <w:pPr>
+        <w:pStyle w:val="Heading3"/>
+      </w:pPr>
+      <w:r>
+        <w:t xml:space="preserve">4.3 Window Dressers</w:t>
+      </w:r>
+    </w:p>
+    <w:p>
+      <w:pPr>
+        <w:pStyle w:val="FirstParagraph"/>
+      </w:pPr>
+      <w:r>
+        <w:rPr>
+          <w:i/>
+          <w:iCs/>
+        </w:rPr>
+        <w:t xml:space="preserve">Problem</w:t>
+      </w:r>
+    </w:p>
+    <w:p>
+      <w:pPr>
+        <w:pStyle w:val="BodyText"/>
+      </w:pPr>
+      <w:r>
+        <w:t xml:space="preserve">Your windows are a source of heat loss, reduce your comfort due to cold surface temperatures, and may also cause moisture condensation or frost in the winter.</w:t>
+      </w:r>
+    </w:p>
+    <w:p>
+      <w:pPr>
+        <w:pStyle w:val="BodyText"/>
+      </w:pPr>
+      <w:r>
+        <w:rPr>
+          <w:i/>
+          <w:iCs/>
+        </w:rPr>
+        <w:t xml:space="preserve">Recommendation</w:t>
+      </w:r>
+    </w:p>
+    <w:p>
+      <w:pPr>
+        <w:pStyle w:val="BodyText"/>
+      </w:pPr>
+      <w:r>
+        <w:t xml:space="preserve">WindowDressers are insulating window inserts that help air-seal windows and reduce heat loss and gain. WindowDressers are transparent and let in light while stopping drafts. Each insert is made of a custom-made pine frame wrapped on each side with tightly sealed, clear polyolefin film, creating an airspace between the two layers for additional insulation. The insert is finished with a compressible foam weather seal. The foam allows enough give for the inserts to be easily slid into place in the fall and removed in the spring while holding firmly enough to provide a tight, friction-based seal. The inserts are installed inside your existing window frame with no fasteners required and last 5-10 years. They are most effective in the winter, but depending on the window’s exposure, they can sometimes be used in the summer to keep the house cooler.</w:t>
+      </w:r>
+      <w:r>
+        <w:t xml:space="preserve"> </w:t>
+      </w:r>
+      <w:r>
+        <w:rPr>
+          <w:i/>
+          <w:iCs/>
+        </w:rPr>
+        <w:t xml:space="preserve">Estimated Cost/Benefits/Incentives</w:t>
+      </w:r>
+    </w:p>
+    <w:p>
+      <w:pPr>
+        <w:pStyle w:val="BodyText"/>
+      </w:pPr>
+      <w:r>
+        <w:t xml:space="preserve">Insulating window inserts save 5-10% of your heating costs at less than 1/10th the cost of replacement windows. The overall project cost will depend on the number and size of window inserts. Example prices for the 2024 season were: small (20 x 36”) - $36 for natural pine frame, $46 for white; medium (30 x 52”) - $50 for natural pine frame, $64 for white; large (44 x 68”) - $67 for natural pine frame, $88 for white. Adjusted pricing for lower-income households is available from WindowDressers upon request. If plastic is damaged, it can be replaced for $15.</w:t>
+      </w:r>
+    </w:p>
+    <w:p>
+      <w:pPr>
+        <w:pStyle w:val="BodyText"/>
+      </w:pPr>
+      <w:r>
+        <w:t xml:space="preserve">Households that order inserts are expected to participate in the Community Build where the inserts are made. You can sign up for a 4-hour shift and learn the simple steps in the insert-building process (no previous experience required, no power tools). Each job has</w:t>
+      </w:r>
+      <w:r>
+        <w:t xml:space="preserve"> </w:t>
+      </w:r>
+      <w:r>
+        <w:t xml:space="preserve">“jigs”</w:t>
+      </w:r>
+      <w:r>
+        <w:t xml:space="preserve"> </w:t>
+      </w:r>
+      <w:r>
+        <w:t xml:space="preserve">that make the job easier to do and ensure uniform quality. You will be trained at the beginning of your shift on how to do your task. Volunteering for multiple shifts is encouraged! Mid-shift snacks and a meal are provided to all participants.</w:t>
+      </w:r>
+    </w:p>
+    <w:p>
+      <w:pPr>
+        <w:pStyle w:val="BodyText"/>
+      </w:pPr>
+      <w:r>
+        <w:t xml:space="preserve">If you would like to participate, please contact us so we can discuss how the program works and which windows you’d like inserts for.</w:t>
+      </w:r>
+    </w:p>
+    <w:bookmarkEnd w:id="44"/>
+    <w:bookmarkStart w:id="45" w:name="induction-stoveoven"/>
+    <w:p>
+      <w:pPr>
+        <w:pStyle w:val="Heading3"/>
+      </w:pPr>
+      <w:r>
+        <w:t xml:space="preserve">4.4 Induction Stove/Oven</w:t>
+      </w:r>
+    </w:p>
+    <w:p>
+      <w:pPr>
+        <w:pStyle w:val="FirstParagraph"/>
+      </w:pPr>
+      <w:r>
+        <w:rPr>
+          <w:i/>
+          <w:iCs/>
+        </w:rPr>
+        <w:t xml:space="preserve">Problem</w:t>
+      </w:r>
+    </w:p>
+    <w:p>
+      <w:pPr>
+        <w:pStyle w:val="BodyText"/>
+      </w:pPr>
+      <w:r>
+        <w:t xml:space="preserve">Your gas range has the potential to release propane, carbon monoxide, and combustion gases into your house. Gas ranges are also inefficient at transferring heat to your food at 32% efficiency, compared to 85% efficiency for induction cooktops.</w:t>
+      </w:r>
+    </w:p>
+    <w:p>
+      <w:pPr>
+        <w:pStyle w:val="BodyText"/>
+      </w:pPr>
+      <w:r>
+        <w:rPr>
+          <w:i/>
+          <w:iCs/>
+        </w:rPr>
+        <w:t xml:space="preserve">Recommendation</w:t>
+      </w:r>
+    </w:p>
+    <w:p>
+      <w:pPr>
+        <w:pStyle w:val="BodyText"/>
+      </w:pPr>
+      <w:r>
+        <w:t xml:space="preserve">Induction cooking appliances are more efficient and safer than electric or gas ones. There is no risk of carbon monoxide or other harmful combustion gases, and the surface doesn’t heat up without a pot or pan on it.</w:t>
+      </w:r>
+    </w:p>
+    <w:p>
+      <w:pPr>
+        <w:pStyle w:val="BodyText"/>
+      </w:pPr>
+      <w:r>
+        <w:rPr>
+          <w:i/>
+          <w:iCs/>
+        </w:rPr>
+        <w:t xml:space="preserve">Estimated Cost/Benefits/Incentives</w:t>
+      </w:r>
+    </w:p>
+    <w:p>
+      <w:pPr>
+        <w:pStyle w:val="BodyText"/>
+      </w:pPr>
+      <w:r>
+        <w:t xml:space="preserve">Currently, Efficiency Maine does not offer a rebate for induction stoves. If you’re interested in trying out induction cooking but don’t want to replace your kitchen stove, consider buying a portable induction cooktop, which costs less than $100.</w:t>
+      </w:r>
+    </w:p>
+    <w:bookmarkEnd w:id="45"/>
+    <w:bookmarkStart w:id="46" w:name="gutters"/>
+    <w:p>
+      <w:pPr>
+        <w:pStyle w:val="Heading3"/>
+      </w:pPr>
+      <w:r>
+        <w:t xml:space="preserve">4.5 Gutters</w:t>
+      </w:r>
+    </w:p>
+    <w:p>
+      <w:pPr>
+        <w:pStyle w:val="FirstParagraph"/>
+      </w:pPr>
+      <w:r>
+        <w:rPr>
+          <w:i/>
+          <w:iCs/>
+        </w:rPr>
+        <w:t xml:space="preserve">Problem</w:t>
+      </w:r>
+    </w:p>
+    <w:p>
+      <w:pPr>
+        <w:pStyle w:val="BodyText"/>
+      </w:pPr>
+      <w:r>
+        <w:t xml:space="preserve">The house has no gutters, so water runs off your roof and directly onto the ground next to your house. Water that splashes off the ground can damage the exterior of your house. Runoff that is absorbed into the ground can seep into the basement/crawlspace, causing moisture issues there and throughout your house.</w:t>
+      </w:r>
+    </w:p>
+    <w:p>
+      <w:pPr>
+        <w:pStyle w:val="BodyText"/>
+      </w:pPr>
+      <w:r>
+        <w:rPr>
+          <w:i/>
+          <w:iCs/>
+        </w:rPr>
+        <w:t xml:space="preserve">Recommendation</w:t>
+      </w:r>
+    </w:p>
+    <w:p>
+      <w:pPr>
+        <w:pStyle w:val="BodyText"/>
+      </w:pPr>
+      <w:r>
+        <w:t xml:space="preserve">Install gutters and downspouts that divert water at least six feet away from the foundation and to where the ground slopes away from the house.</w:t>
+      </w:r>
+    </w:p>
+    <w:p>
+      <w:pPr>
+        <w:pStyle w:val="BodyText"/>
+      </w:pPr>
+      <w:r>
+        <w:rPr>
+          <w:i/>
+          <w:iCs/>
+        </w:rPr>
+        <w:t xml:space="preserve">Estimated Cost/Benefits/Incentives</w:t>
+      </w:r>
+    </w:p>
+    <w:p>
+      <w:pPr>
+        <w:pStyle w:val="BodyText"/>
+      </w:pPr>
+      <w:r>
+        <w:t xml:space="preserve">Adding gutters would mitigate moisture damage and save you from having to replace/fix other parts of the house.</w:t>
+      </w:r>
+    </w:p>
+    <w:bookmarkEnd w:id="46"/>
+    <w:bookmarkStart w:id="47" w:name="bathroom-exhaust-fans"/>
+    <w:p>
+      <w:pPr>
+        <w:pStyle w:val="Heading3"/>
+      </w:pPr>
+      <w:r>
+        <w:t xml:space="preserve">4.6 Bathroom exhaust fan(s)</w:t>
+      </w:r>
+    </w:p>
+    <w:p>
+      <w:pPr>
+        <w:pStyle w:val="FirstParagraph"/>
+      </w:pPr>
+      <w:r>
+        <w:rPr>
+          <w:i/>
+          <w:iCs/>
+        </w:rPr>
+        <w:t xml:space="preserve">Problem</w:t>
+      </w:r>
+    </w:p>
+    <w:p>
+      <w:pPr>
+        <w:pStyle w:val="BodyText"/>
+      </w:pPr>
+      <w:r>
+        <w:t xml:space="preserve">Currently, there is no bathroom exhaust fan, so moisture from the shower, toilet, and sink remains in the house, which can cause moisture issues such as mold.</w:t>
+      </w:r>
+    </w:p>
+    <w:p>
+      <w:pPr>
+        <w:pStyle w:val="BodyText"/>
+      </w:pPr>
+      <w:r>
+        <w:rPr>
+          <w:i/>
+          <w:iCs/>
+        </w:rPr>
+        <w:t xml:space="preserve">Recommendation</w:t>
+      </w:r>
+    </w:p>
+    <w:p>
+      <w:pPr>
+        <w:pStyle w:val="BodyText"/>
+      </w:pPr>
+      <w:r>
+        <w:t xml:space="preserve">Install bathroom exhaust fans in all bathrooms that do not have them. These should be rated for at least 80 cubic feet per minute (CFM) if there is a shower. We recommend the Panasonic Whisper series or similar fans that don’t create excess noise. If the ductwork will run through the attic, it should be installed before the attic is air-sealed and insulated. The fan needs to be ducted outside, so it does not add moisture into the attic.</w:t>
+      </w:r>
+    </w:p>
+    <w:p>
+      <w:pPr>
+        <w:pStyle w:val="BodyText"/>
+      </w:pPr>
+      <w:r>
+        <w:rPr>
+          <w:i/>
+          <w:iCs/>
+        </w:rPr>
+        <w:t xml:space="preserve">Estimated Cost/Benefits/Incentives</w:t>
+      </w:r>
+    </w:p>
+    <w:p>
+      <w:pPr>
+        <w:pStyle w:val="BodyText"/>
+      </w:pPr>
+      <w:r>
+        <w:t xml:space="preserve">The typical fan is around $130 plus the cost of installation.</w:t>
+      </w:r>
+    </w:p>
+    <w:bookmarkEnd w:id="47"/>
+    <w:bookmarkStart w:id="48" w:name="kitchen-exhaust-fans"/>
+    <w:p>
+      <w:pPr>
+        <w:pStyle w:val="Heading3"/>
+      </w:pPr>
+      <w:r>
+        <w:t xml:space="preserve">4.7 Kitchen exhaust fan(s)</w:t>
+      </w:r>
+    </w:p>
+    <w:p>
+      <w:pPr>
+        <w:pStyle w:val="FirstParagraph"/>
+      </w:pPr>
+      <w:r>
+        <w:rPr>
+          <w:i/>
+          <w:iCs/>
+        </w:rPr>
+        <w:t xml:space="preserve">Problem</w:t>
+      </w:r>
+    </w:p>
+    <w:p>
+      <w:pPr>
+        <w:pStyle w:val="BodyText"/>
+      </w:pPr>
+      <w:r>
+        <w:t xml:space="preserve">Currently, there is no kitchen exhaust fan, so fumes, smoke, and moisture from cooking stay in the house which can cause health concerns.</w:t>
+      </w:r>
+    </w:p>
+    <w:p>
+      <w:pPr>
+        <w:pStyle w:val="BodyText"/>
+      </w:pPr>
+      <w:r>
+        <w:rPr>
+          <w:i/>
+          <w:iCs/>
+        </w:rPr>
+        <w:t xml:space="preserve">Recommendation</w:t>
+      </w:r>
+    </w:p>
+    <w:p>
+      <w:pPr>
+        <w:pStyle w:val="BodyText"/>
+      </w:pPr>
+      <w:r>
+        <w:t xml:space="preserve">Install a kitchen exhaust fan to remove cooking fumes and moisture from your home. The fan should be rated for at least 100 cubic feet per minute. A kitchen fan should be ducted to the outdoors. If the ductwork will run through the attic, it should be installed before the attic is air-sealed and insulated.</w:t>
+      </w:r>
+    </w:p>
+    <w:p>
+      <w:pPr>
+        <w:pStyle w:val="BodyText"/>
+      </w:pPr>
+      <w:r>
+        <w:rPr>
+          <w:i/>
+          <w:iCs/>
+        </w:rPr>
+        <w:t xml:space="preserve">Estimated Cost/Benefits/Incentives</w:t>
+      </w:r>
+    </w:p>
+    <w:p>
+      <w:pPr>
+        <w:pStyle w:val="BodyText"/>
+      </w:pPr>
+      <w:r>
+        <w:t xml:space="preserve">Kitchen range hoods typically cost $150 or more; installation costs depend on the complexity of the exhaust ducting.</w:t>
+      </w:r>
+    </w:p>
+    <w:bookmarkEnd w:id="48"/>
+    <w:bookmarkStart w:id="49" w:name="vapor-barrier"/>
+    <w:p>
+      <w:pPr>
+        <w:pStyle w:val="Heading3"/>
+      </w:pPr>
+      <w:r>
+        <w:t xml:space="preserve">4.8 Vapor Barrier</w:t>
+      </w:r>
+    </w:p>
+    <w:p>
+      <w:pPr>
+        <w:pStyle w:val="FirstParagraph"/>
+      </w:pPr>
+      <w:r>
+        <w:rPr>
+          <w:i/>
+          <w:iCs/>
+        </w:rPr>
+        <w:t xml:space="preserve">Problem</w:t>
+      </w:r>
+    </w:p>
+    <w:p>
+      <w:pPr>
+        <w:pStyle w:val="BodyText"/>
+      </w:pPr>
+      <w:r>
+        <w:t xml:space="preserve">There is excess moisture in the basement/crawlspace, which is evaporating out of the ground. This moisture can enter the house and cause mold, mildew, rot, and air quality issues.</w:t>
+      </w:r>
+    </w:p>
+    <w:p>
+      <w:pPr>
+        <w:pStyle w:val="BodyText"/>
+      </w:pPr>
+      <w:r>
+        <w:rPr>
+          <w:i/>
+          <w:iCs/>
+        </w:rPr>
+        <w:t xml:space="preserve">Recommendation</w:t>
+      </w:r>
+    </w:p>
+    <w:p>
+      <w:pPr>
+        <w:pStyle w:val="BodyText"/>
+      </w:pPr>
+      <w:r>
+        <w:t xml:space="preserve">Install a vapor barrier on the basement floor to stop moisture from entering the basement and house. Vapor barriers typically consist of either reinforced plastic sheeting or EPDM rubber membrane over a</w:t>
+      </w:r>
+      <w:r>
+        <w:t xml:space="preserve"> </w:t>
+      </w:r>
+      <w:r>
+        <w:t xml:space="preserve">‘dimple mat’</w:t>
+      </w:r>
+      <w:r>
+        <w:t xml:space="preserve"> </w:t>
+      </w:r>
+      <w:r>
+        <w:t xml:space="preserve">that allows for drainage below the vapor barrier and prevents rocks from puncturing it. If the basement/crawlspace walls are going to be spray foamed, we recommend the foam go all the way to the floor and overlap the vapor barrier to create a continuous air and moisture barrier.</w:t>
+      </w:r>
+    </w:p>
+    <w:p>
+      <w:pPr>
+        <w:pStyle w:val="BodyText"/>
+      </w:pPr>
+      <w:r>
+        <w:rPr>
+          <w:i/>
+          <w:iCs/>
+        </w:rPr>
+        <w:t xml:space="preserve">Estimated Cost/Benefits/Incentives</w:t>
+      </w:r>
+    </w:p>
+    <w:p>
+      <w:pPr>
+        <w:pStyle w:val="BodyText"/>
+      </w:pPr>
+      <w:r>
+        <w:t xml:space="preserve">Efficiency Maine rebates will cover vapor barriers up to 25% of a weatherization project cost, if done as part of a larger insulation project. Most insulation companies can install spray foam and vapor barriers together. Efficiency Maine rebates and other incentives for insulation work can fund up to 80% of the overall cost to weatherize your home (subject to a lifetime limit per building), up to $9,200 when combined with nonrefundable federal tax credits. You can call them at 866-376-2463 (Monday to Friday, 8:00 am to 5:00 pm) or visit their webpage about insulation rebates: https://www.efficiencymaine.com/at-home/insulation-rebates/</w:t>
+      </w:r>
+    </w:p>
+    <w:bookmarkEnd w:id="49"/>
+    <w:bookmarkStart w:id="50" w:name="spray-foam-basement-walls"/>
+    <w:p>
+      <w:pPr>
+        <w:pStyle w:val="Heading3"/>
+      </w:pPr>
+      <w:r>
+        <w:t xml:space="preserve">4.9 Spray foam Basement Walls</w:t>
+      </w:r>
+    </w:p>
+    <w:p>
+      <w:pPr>
+        <w:pStyle w:val="FirstParagraph"/>
+      </w:pPr>
+      <w:r>
+        <w:rPr>
+          <w:i/>
+          <w:iCs/>
+        </w:rPr>
+        <w:t xml:space="preserve">Problem</w:t>
+      </w:r>
+    </w:p>
+    <w:p>
+      <w:pPr>
+        <w:pStyle w:val="BodyText"/>
+      </w:pPr>
+      <w:r>
+        <w:t xml:space="preserve">The basement/crawlspace is uninsulated and used for mechanical equipment and plumbing. The walls are porous and allow moisture into the house and rapidly conduct heat out of the space.</w:t>
+      </w:r>
+    </w:p>
+    <w:p>
+      <w:pPr>
+        <w:pStyle w:val="BodyText"/>
+      </w:pPr>
+      <w:r>
+        <w:rPr>
+          <w:i/>
+          <w:iCs/>
+        </w:rPr>
+        <w:t xml:space="preserve">Recommendation</w:t>
+      </w:r>
+    </w:p>
+    <w:p>
+      <w:pPr>
+        <w:pStyle w:val="BodyText"/>
+      </w:pPr>
+      <w:r>
+        <w:t xml:space="preserve">Install spray foam on the basement/crawlspace walls to prevent moisture infiltration and reduce heat loss. In older homes, most heat loss is due to air leakage. Air sealing is particularly important in the basement or crawlspace (and attic). As warm air rises and leaks out the top of your home, cold air is pulled in at the bottom. This is called the</w:t>
+      </w:r>
+      <w:r>
+        <w:t xml:space="preserve"> </w:t>
+      </w:r>
+      <w:r>
+        <w:t xml:space="preserve">‘stack effect’</w:t>
+      </w:r>
+      <w:r>
+        <w:t xml:space="preserve">, and is more pronounced in taller homes. Thus, air sealing is necessary anywhere gaps allow air to move into your house through the basement/crawlspace.</w:t>
+      </w:r>
+    </w:p>
+    <w:p>
+      <w:pPr>
+        <w:pStyle w:val="BodyText"/>
+      </w:pPr>
+      <w:r>
+        <w:t xml:space="preserve">Spray foam should be applied 2-3 inches thick on the walls to seal and insulate them. It is often ideal to install a vapor barrier at the same time as the spray foam insulation. Spray foam generally requires a layer of intumescent (fire-rated) paint over it to meet fire code.</w:t>
+      </w:r>
+    </w:p>
+    <w:p>
+      <w:pPr>
+        <w:pStyle w:val="BodyText"/>
+      </w:pPr>
+      <w:r>
+        <w:rPr>
+          <w:i/>
+          <w:iCs/>
+        </w:rPr>
+        <w:t xml:space="preserve">Estimated Cost/Benefits/Incentives</w:t>
+      </w:r>
+    </w:p>
+    <w:p>
+      <w:pPr>
+        <w:pStyle w:val="BodyText"/>
+      </w:pPr>
+      <w:r>
+        <w:t xml:space="preserve">Installation of spray foam insulation will cost around $5-7 per square foot. Efficiency Maine rebates and other incentives for insulation work can fund up to 80% of the project cost (subject to a lifetime limit per building), up to $9,200 when combined with nonrefundable federal tax credits. You can call them at 866-376-2463 (Monday to Friday, 8:00 am to 5:00 pm) or visit their webpage about insulation rebates: https://www.efficiencymaine.com/at-home/insulation-rebates/</w:t>
+      </w:r>
+    </w:p>
+    <w:bookmarkEnd w:id="50"/>
+    <w:bookmarkStart w:id="51" w:name="attic-insulation-and-air-sealing"/>
+    <w:p>
+      <w:pPr>
+        <w:pStyle w:val="Heading3"/>
+      </w:pPr>
+      <w:r>
+        <w:t xml:space="preserve">4.10 Attic Insulation and Air Sealing</w:t>
+      </w:r>
+    </w:p>
+    <w:p>
+      <w:pPr>
+        <w:pStyle w:val="FirstParagraph"/>
+      </w:pPr>
+      <w:r>
+        <w:rPr>
+          <w:i/>
+          <w:iCs/>
+        </w:rPr>
+        <w:t xml:space="preserve">Problem</w:t>
+      </w:r>
+    </w:p>
+    <w:p>
+      <w:pPr>
+        <w:pStyle w:val="BodyText"/>
+      </w:pPr>
+      <w:r>
+        <w:t xml:space="preserve">The attic is uninsulated or is missing insulation and the attic could also benefit from air-sealing. These upgrades will reduce draftiness and heat loss in the winter and heat gain in the summer.</w:t>
+      </w:r>
+    </w:p>
+    <w:p>
+      <w:pPr>
+        <w:pStyle w:val="BodyText"/>
+      </w:pPr>
+      <w:r>
+        <w:rPr>
+          <w:i/>
+          <w:iCs/>
+        </w:rPr>
+        <w:t xml:space="preserve">Recommendation</w:t>
+      </w:r>
+    </w:p>
+    <w:p>
+      <w:pPr>
+        <w:pStyle w:val="BodyText"/>
+      </w:pPr>
+      <w:r>
+        <w:t xml:space="preserve">Air seal the attic and insulate it to at least R-60 (18 inches of loose-fill cellulose insulation). COA has been installing 24 inches (R-80) of cellulose insulation in attics on our campus. Before the attic is insulated, ensure that any needed bathroom and kitchen fans are installed and that all fans are properly vented to the outside.</w:t>
+      </w:r>
+    </w:p>
+    <w:p>
+      <w:pPr>
+        <w:pStyle w:val="BodyText"/>
+      </w:pPr>
+      <w:r>
+        <w:t xml:space="preserve">In older homes, most heat loss is due to air leakage. Air sealing is particularly important in the attic (and basement or crawlspace). As warm air rises and leaks out the top of your home, cold air is pulled in at the bottom. This is called the</w:t>
+      </w:r>
+      <w:r>
+        <w:t xml:space="preserve"> </w:t>
+      </w:r>
+      <w:r>
+        <w:t xml:space="preserve">‘stack effect’</w:t>
+      </w:r>
+      <w:r>
+        <w:t xml:space="preserve">, and is more pronounced in taller homes. Thus, air sealing is necessary anywhere gaps allow air to move between your house and the attic. This typically includes gaps around the chimney, electrical penetrations, and wall top plates.</w:t>
+      </w:r>
+    </w:p>
+    <w:p>
+      <w:pPr>
+        <w:pStyle w:val="BodyText"/>
+      </w:pPr>
+      <w:r>
+        <w:rPr>
+          <w:i/>
+          <w:iCs/>
+        </w:rPr>
+        <w:t xml:space="preserve">Estimated Cost/Benefits/Incentives</w:t>
+      </w:r>
+    </w:p>
+    <w:p>
+      <w:pPr>
+        <w:pStyle w:val="BodyText"/>
+      </w:pPr>
+      <w:r>
+        <w:t xml:space="preserve">Efficiency Maine rebates and other incentives for insulation work can fund up to 80% of the overall cost to weatherize your home (subject to a lifetime limit per building), up to $9,200 when combined with nonrefundable federal tax credits. You can call them at 866-376-2463 (Monday to Friday, 8:00 am to 5:00 pm) or visit their webpage about insulation rebates: https://www.efficiencymaine.com/at-home/insulation-rebates/</w:t>
+      </w:r>
+    </w:p>
+    <w:bookmarkEnd w:id="51"/>
+    <w:bookmarkStart w:id="52" w:name="electrical-panel-upgrade"/>
+    <w:p>
+      <w:pPr>
+        <w:pStyle w:val="Heading3"/>
+      </w:pPr>
+      <w:r>
+        <w:t xml:space="preserve">4.11 Electrical Panel Upgrade</w:t>
+      </w:r>
+    </w:p>
+    <w:p>
+      <w:pPr>
+        <w:pStyle w:val="FirstParagraph"/>
+      </w:pPr>
+      <w:r>
+        <w:rPr>
+          <w:i/>
+          <w:iCs/>
+        </w:rPr>
+        <w:t xml:space="preserve">Problem</w:t>
+      </w:r>
+    </w:p>
+    <w:p>
+      <w:pPr>
+        <w:pStyle w:val="BodyText"/>
+      </w:pPr>
+      <w:r>
         <w:rPr>
           <w:b/>
           <w:bCs/>
@@ -3777,7 +4229,7 @@
         <w:pStyle w:val="BodyText"/>
       </w:pPr>
       <w:r>
-        <w:t xml:space="preserve">Have the furnace/boiler and flue inspected and adjusted by a licensed professional. This should be available from your fuel delivery company.</w:t>
+        <w:t xml:space="preserve">Consult with an electrician about replacing your existing electrical panel with a 200 amp panel as you add electrical appliances to your home. It may become necessary to increase the capacity to address potential safety hazards. An electrician can determine whether or not a panel upgrade is necessary based on your current and anticipated usage.</w:t>
       </w:r>
     </w:p>
     <w:p>
@@ -3797,17 +4249,17 @@
         <w:pStyle w:val="BodyText"/>
       </w:pPr>
       <w:r>
-        <w:t xml:space="preserve">A tune-up can improve the efficiency of your furnace/boiler, confirm that it is exhausting properly, and identify areas of concern before they become urgent. If you have a service contract with your fuel delivery company, an annual tune-up is usually included.</w:t>
-      </w:r>
-    </w:p>
-    <w:bookmarkEnd w:id="42"/>
-    <w:bookmarkStart w:id="43" w:name="high-efficiency-shower-heads"/>
+        <w:t xml:space="preserve">Costs of electrical components needed to support residential energy upgrades – including panels, sub-panels, branch circuits, and feeders – qualify for a 30% nonrefundable tax credit (up to $600 per item) if they have a capacity of 200 amps or more. An electrical panel upgrades also provides a good opportunity for an electrician to install whole-house surge protection, which costs $100-$400. Here are some options: https://www.popularmechanics.com/home/interior-projects/g43140886/best-whole-house-surge-protectors/</w:t>
+      </w:r>
+    </w:p>
+    <w:bookmarkEnd w:id="52"/>
+    <w:bookmarkStart w:id="53" w:name="air-source-heat-pump"/>
     <w:p>
       <w:pPr>
         <w:pStyle w:val="Heading3"/>
       </w:pPr>
       <w:r>
-        <w:t xml:space="preserve">4.2 High efficiency shower head(s)</w:t>
+        <w:t xml:space="preserve">4.12 Air Source Heat Pump</w:t>
       </w:r>
     </w:p>
     <w:p>
@@ -3827,7 +4279,7 @@
         <w:pStyle w:val="BodyText"/>
       </w:pPr>
       <w:r>
-        <w:t xml:space="preserve">Your shower heads use more water and energy than high-efficiency shower heads, thus costing you more money than necessary. Older shower heads use 2.5 gallons or more every minute, which wastes thousands of gallons of water each year and costs you money for every extra gallon of water heated.</w:t>
+        <w:t xml:space="preserve">Combustion heating equipment is expensive, inefficient, and has the potential to release harmful combustion gases like carbon monoxide into the home.</w:t>
       </w:r>
     </w:p>
     <w:p>
@@ -3847,11 +4299,13 @@
         <w:pStyle w:val="BodyText"/>
       </w:pPr>
       <w:r>
-        <w:t xml:space="preserve">Install high-efficiency shower heads to reduce the amount of water and energy to heat the water used when showering. We recommend 1.5 gallon per minute shower heads that will save a gallon or more of water for every minute spent in the shower.</w:t>
-      </w:r>
-      <w:r>
-        <w:t xml:space="preserve"> </w:t>
-      </w:r>
+        <w:t xml:space="preserve">Install air source heat pumps for heating and cooling and whole-house surge protection. Air source heat pumps can be up to 300% efficient and heat, cool, and dehumidify your house. A qualified installer will help determine what size system to install and where. Whole-house surge protection will protect your appliances and heat pumps from being damaged by an electrical surge.</w:t>
+      </w:r>
+    </w:p>
+    <w:p>
+      <w:pPr>
+        <w:pStyle w:val="BodyText"/>
+      </w:pPr>
       <w:r>
         <w:rPr>
           <w:i/>
@@ -3865,17 +4319,731 @@
         <w:pStyle w:val="BodyText"/>
       </w:pPr>
       <w:r>
-        <w:t xml:space="preserve">A typical family will save ~10,000 gallons of water per year and over $100 per year in water heating costs. We provide these for free and have several styles for you to choose from; contact us for some if we did not give you any during the audit.</w:t>
-      </w:r>
-    </w:p>
-    <w:bookmarkEnd w:id="43"/>
-    <w:bookmarkStart w:id="44" w:name="window-dressers"/>
+        <w:t xml:space="preserve">Efficiency Maine rebates can fund $1,000 to $3,000 per unit up to a lifetime limit per housing unit for $3,000 to $9,000 (depending on income level) to install heat pumps. The rebate can be combined with a nonrefundable federal tax credit of 30% of the remaining cost of the unit and labor, subject to an annual maximum benefit of $2,000 (shared with other energy property, like a heat pump water heater). You can call Efficiency Maine at 866-376-2463 (Monday to Friday, 8:00 am to 5:00 pm) or visit their website: https://www.efficiencymaine.com/at-home/residential-heat-pump-incentives/</w:t>
+      </w:r>
+    </w:p>
+    <w:p>
+      <w:pPr>
+        <w:pStyle w:val="SourceCode"/>
+      </w:pPr>
+      <w:r>
+        <w:rPr>
+          <w:rStyle w:val="NormalTok"/>
+        </w:rPr>
+        <w:t xml:space="preserve"> </w:t>
+      </w:r>
+      <w:r>
+        <w:rPr>
+          <w:rStyle w:val="CommentTok"/>
+        </w:rPr>
+        <w:t xml:space="preserve">#| label: other 3 recommendation</w:t>
+      </w:r>
+      <w:r>
+        <w:br/>
+      </w:r>
+      <w:r>
+        <w:rPr>
+          <w:rStyle w:val="NormalTok"/>
+        </w:rPr>
+        <w:t xml:space="preserve"> </w:t>
+      </w:r>
+      <w:r>
+        <w:rPr>
+          <w:rStyle w:val="CommentTok"/>
+        </w:rPr>
+        <w:t xml:space="preserve">#| echo: false</w:t>
+      </w:r>
+      <w:r>
+        <w:br/>
+      </w:r>
+      <w:r>
+        <w:rPr>
+          <w:rStyle w:val="NormalTok"/>
+        </w:rPr>
+        <w:t xml:space="preserve"> </w:t>
+      </w:r>
+      <w:r>
+        <w:rPr>
+          <w:rStyle w:val="CommentTok"/>
+        </w:rPr>
+        <w:t xml:space="preserve">#| results: asis</w:t>
+      </w:r>
+      <w:r>
+        <w:br/>
+      </w:r>
+      <w:r>
+        <w:br/>
+      </w:r>
+      <w:r>
+        <w:br/>
+      </w:r>
+      <w:r>
+        <w:rPr>
+          <w:rStyle w:val="ControlFlowTok"/>
+        </w:rPr>
+        <w:t xml:space="preserve">if</w:t>
+      </w:r>
+      <w:r>
+        <w:rPr>
+          <w:rStyle w:val="NormalTok"/>
+        </w:rPr>
+        <w:t xml:space="preserve">( other_3 </w:t>
+      </w:r>
+      <w:r>
+        <w:rPr>
+          <w:rStyle w:val="SpecialCharTok"/>
+        </w:rPr>
+        <w:t xml:space="preserve">==</w:t>
+      </w:r>
+      <w:r>
+        <w:rPr>
+          <w:rStyle w:val="NormalTok"/>
+        </w:rPr>
+        <w:t xml:space="preserve"> </w:t>
+      </w:r>
+      <w:r>
+        <w:rPr>
+          <w:rStyle w:val="ConstantTok"/>
+        </w:rPr>
+        <w:t xml:space="preserve">TRUE</w:t>
+      </w:r>
+      <w:r>
+        <w:rPr>
+          <w:rStyle w:val="NormalTok"/>
+        </w:rPr>
+        <w:t xml:space="preserve">){</w:t>
+      </w:r>
+      <w:r>
+        <w:br/>
+      </w:r>
+      <w:r>
+        <w:rPr>
+          <w:rStyle w:val="NormalTok"/>
+        </w:rPr>
+        <w:t xml:space="preserve">  </w:t>
+      </w:r>
+      <w:r>
+        <w:rPr>
+          <w:rStyle w:val="FunctionTok"/>
+        </w:rPr>
+        <w:t xml:space="preserve">cat</w:t>
+      </w:r>
+      <w:r>
+        <w:rPr>
+          <w:rStyle w:val="NormalTok"/>
+        </w:rPr>
+        <w:t xml:space="preserve">(</w:t>
+      </w:r>
+      <w:r>
+        <w:rPr>
+          <w:rStyle w:val="StringTok"/>
+        </w:rPr>
+        <w:t xml:space="preserve">"### Other 3</w:t>
+      </w:r>
+      <w:r>
+        <w:br/>
+      </w:r>
+      <w:r>
+        <w:rPr>
+          <w:rStyle w:val="StringTok"/>
+        </w:rPr>
+        <w:t xml:space="preserve">  </w:t>
+      </w:r>
+      <w:r>
+        <w:br/>
+      </w:r>
+      <w:r>
+        <w:rPr>
+          <w:rStyle w:val="StringTok"/>
+        </w:rPr>
+        <w:t xml:space="preserve">*Problem*</w:t>
+      </w:r>
+      <w:r>
+        <w:br/>
+      </w:r>
+      <w:r>
+        <w:br/>
+      </w:r>
+      <w:r>
+        <w:rPr>
+          <w:rStyle w:val="StringTok"/>
+        </w:rPr>
+        <w:t xml:space="preserve">*Recommendation*</w:t>
+      </w:r>
+      <w:r>
+        <w:br/>
+      </w:r>
+      <w:r>
+        <w:br/>
+      </w:r>
+      <w:r>
+        <w:rPr>
+          <w:rStyle w:val="StringTok"/>
+        </w:rPr>
+        <w:t xml:space="preserve">"</w:t>
+      </w:r>
+      <w:r>
+        <w:rPr>
+          <w:rStyle w:val="NormalTok"/>
+        </w:rPr>
+        <w:t xml:space="preserve">)</w:t>
+      </w:r>
+      <w:r>
+        <w:br/>
+      </w:r>
+      <w:r>
+        <w:rPr>
+          <w:rStyle w:val="NormalTok"/>
+        </w:rPr>
+        <w:t xml:space="preserve">}</w:t>
+      </w:r>
+      <w:r>
+        <w:rPr>
+          <w:rStyle w:val="ControlFlowTok"/>
+        </w:rPr>
+        <w:t xml:space="preserve">else</w:t>
+      </w:r>
+      <w:r>
+        <w:rPr>
+          <w:rStyle w:val="NormalTok"/>
+        </w:rPr>
+        <w:t xml:space="preserve">{</w:t>
+      </w:r>
+      <w:r>
+        <w:br/>
+      </w:r>
+      <w:r>
+        <w:rPr>
+          <w:rStyle w:val="NormalTok"/>
+        </w:rPr>
+        <w:t xml:space="preserve">  </w:t>
+      </w:r>
+      <w:r>
+        <w:rPr>
+          <w:rStyle w:val="FunctionTok"/>
+        </w:rPr>
+        <w:t xml:space="preserve">cat</w:t>
+      </w:r>
+      <w:r>
+        <w:rPr>
+          <w:rStyle w:val="NormalTok"/>
+        </w:rPr>
+        <w:t xml:space="preserve">(</w:t>
+      </w:r>
+      <w:r>
+        <w:rPr>
+          <w:rStyle w:val="StringTok"/>
+        </w:rPr>
+        <w:t xml:space="preserve">""</w:t>
+      </w:r>
+      <w:r>
+        <w:rPr>
+          <w:rStyle w:val="NormalTok"/>
+        </w:rPr>
+        <w:t xml:space="preserve">)</w:t>
+      </w:r>
+      <w:r>
+        <w:br/>
+      </w:r>
+      <w:r>
+        <w:rPr>
+          <w:rStyle w:val="NormalTok"/>
+        </w:rPr>
+        <w:t xml:space="preserve">}</w:t>
+      </w:r>
+      <w:r>
+        <w:br/>
+      </w:r>
+      <w:r>
+        <w:br/>
+      </w:r>
+      <w:r>
+        <w:rPr>
+          <w:rStyle w:val="ControlFlowTok"/>
+        </w:rPr>
+        <w:t xml:space="preserve">if</w:t>
+      </w:r>
+      <w:r>
+        <w:rPr>
+          <w:rStyle w:val="NormalTok"/>
+        </w:rPr>
+        <w:t xml:space="preserve">(other_3 </w:t>
+      </w:r>
+      <w:r>
+        <w:rPr>
+          <w:rStyle w:val="SpecialCharTok"/>
+        </w:rPr>
+        <w:t xml:space="preserve">==</w:t>
+      </w:r>
+      <w:r>
+        <w:rPr>
+          <w:rStyle w:val="NormalTok"/>
+        </w:rPr>
+        <w:t xml:space="preserve"> </w:t>
+      </w:r>
+      <w:r>
+        <w:rPr>
+          <w:rStyle w:val="ConstantTok"/>
+        </w:rPr>
+        <w:t xml:space="preserve">TRUE</w:t>
+      </w:r>
+      <w:r>
+        <w:rPr>
+          <w:rStyle w:val="NormalTok"/>
+        </w:rPr>
+        <w:t xml:space="preserve">){</w:t>
+      </w:r>
+      <w:r>
+        <w:br/>
+      </w:r>
+      <w:r>
+        <w:rPr>
+          <w:rStyle w:val="NormalTok"/>
+        </w:rPr>
+        <w:t xml:space="preserve">  </w:t>
+      </w:r>
+      <w:r>
+        <w:rPr>
+          <w:rStyle w:val="FunctionTok"/>
+        </w:rPr>
+        <w:t xml:space="preserve">cat</w:t>
+      </w:r>
+      <w:r>
+        <w:rPr>
+          <w:rStyle w:val="NormalTok"/>
+        </w:rPr>
+        <w:t xml:space="preserve">(a_other_3</w:t>
+      </w:r>
+      <w:r>
+        <w:rPr>
+          <w:rStyle w:val="SpecialCharTok"/>
+        </w:rPr>
+        <w:t xml:space="preserve">$</w:t>
+      </w:r>
+      <w:r>
+        <w:rPr>
+          <w:rStyle w:val="NormalTok"/>
+        </w:rPr>
+        <w:t xml:space="preserve">Description</w:t>
+      </w:r>
+      <w:r>
+        <w:br/>
+      </w:r>
+      <w:r>
+        <w:rPr>
+          <w:rStyle w:val="NormalTok"/>
+        </w:rPr>
+        <w:t xml:space="preserve">    </w:t>
+      </w:r>
+      <w:r>
+        <w:br/>
+      </w:r>
+      <w:r>
+        <w:rPr>
+          <w:rStyle w:val="NormalTok"/>
+        </w:rPr>
+        <w:t xml:space="preserve">  )</w:t>
+      </w:r>
+      <w:r>
+        <w:br/>
+      </w:r>
+      <w:r>
+        <w:rPr>
+          <w:rStyle w:val="NormalTok"/>
+        </w:rPr>
+        <w:t xml:space="preserve">}</w:t>
+      </w:r>
+      <w:r>
+        <w:rPr>
+          <w:rStyle w:val="ControlFlowTok"/>
+        </w:rPr>
+        <w:t xml:space="preserve">else</w:t>
+      </w:r>
+      <w:r>
+        <w:rPr>
+          <w:rStyle w:val="NormalTok"/>
+        </w:rPr>
+        <w:t xml:space="preserve">{</w:t>
+      </w:r>
+      <w:r>
+        <w:br/>
+      </w:r>
+      <w:r>
+        <w:rPr>
+          <w:rStyle w:val="NormalTok"/>
+        </w:rPr>
+        <w:t xml:space="preserve">  </w:t>
+      </w:r>
+      <w:r>
+        <w:rPr>
+          <w:rStyle w:val="FunctionTok"/>
+        </w:rPr>
+        <w:t xml:space="preserve">cat</w:t>
+      </w:r>
+      <w:r>
+        <w:rPr>
+          <w:rStyle w:val="NormalTok"/>
+        </w:rPr>
+        <w:t xml:space="preserve">(</w:t>
+      </w:r>
+      <w:r>
+        <w:rPr>
+          <w:rStyle w:val="StringTok"/>
+        </w:rPr>
+        <w:t xml:space="preserve">""</w:t>
+      </w:r>
+      <w:r>
+        <w:rPr>
+          <w:rStyle w:val="NormalTok"/>
+        </w:rPr>
+        <w:t xml:space="preserve">)</w:t>
+      </w:r>
+      <w:r>
+        <w:br/>
+      </w:r>
+      <w:r>
+        <w:rPr>
+          <w:rStyle w:val="NormalTok"/>
+        </w:rPr>
+        <w:t xml:space="preserve">  }</w:t>
+      </w:r>
+      <w:r>
+        <w:br/>
+      </w:r>
+      <w:r>
+        <w:br/>
+      </w:r>
+      <w:r>
+        <w:rPr>
+          <w:rStyle w:val="ControlFlowTok"/>
+        </w:rPr>
+        <w:t xml:space="preserve">if</w:t>
+      </w:r>
+      <w:r>
+        <w:rPr>
+          <w:rStyle w:val="NormalTok"/>
+        </w:rPr>
+        <w:t xml:space="preserve">(other_3 </w:t>
+      </w:r>
+      <w:r>
+        <w:rPr>
+          <w:rStyle w:val="SpecialCharTok"/>
+        </w:rPr>
+        <w:t xml:space="preserve">==</w:t>
+      </w:r>
+      <w:r>
+        <w:rPr>
+          <w:rStyle w:val="NormalTok"/>
+        </w:rPr>
+        <w:t xml:space="preserve"> </w:t>
+      </w:r>
+      <w:r>
+        <w:rPr>
+          <w:rStyle w:val="ConstantTok"/>
+        </w:rPr>
+        <w:t xml:space="preserve">TRUE</w:t>
+      </w:r>
+      <w:r>
+        <w:rPr>
+          <w:rStyle w:val="NormalTok"/>
+        </w:rPr>
+        <w:t xml:space="preserve">){</w:t>
+      </w:r>
+      <w:r>
+        <w:br/>
+      </w:r>
+      <w:r>
+        <w:rPr>
+          <w:rStyle w:val="NormalTok"/>
+        </w:rPr>
+        <w:t xml:space="preserve">  </w:t>
+      </w:r>
+      <w:r>
+        <w:rPr>
+          <w:rStyle w:val="FunctionTok"/>
+        </w:rPr>
+        <w:t xml:space="preserve">cat</w:t>
+      </w:r>
+      <w:r>
+        <w:rPr>
+          <w:rStyle w:val="NormalTok"/>
+        </w:rPr>
+        <w:t xml:space="preserve">(</w:t>
+      </w:r>
+      <w:r>
+        <w:rPr>
+          <w:rStyle w:val="StringTok"/>
+        </w:rPr>
+        <w:t xml:space="preserve">"</w:t>
+      </w:r>
+      <w:r>
+        <w:br/>
+      </w:r>
+      <w:r>
+        <w:br/>
+      </w:r>
+      <w:r>
+        <w:rPr>
+          <w:rStyle w:val="StringTok"/>
+        </w:rPr>
+        <w:t xml:space="preserve">*Estimated Cost/Benefits/Incentives*</w:t>
+      </w:r>
+      <w:r>
+        <w:br/>
+      </w:r>
+      <w:r>
+        <w:br/>
+      </w:r>
+      <w:r>
+        <w:rPr>
+          <w:rStyle w:val="StringTok"/>
+        </w:rPr>
+        <w:t xml:space="preserve">"</w:t>
+      </w:r>
+      <w:r>
+        <w:rPr>
+          <w:rStyle w:val="NormalTok"/>
+        </w:rPr>
+        <w:t xml:space="preserve">, auto_other_3_estimates</w:t>
+      </w:r>
+      <w:r>
+        <w:rPr>
+          <w:rStyle w:val="SpecialCharTok"/>
+        </w:rPr>
+        <w:t xml:space="preserve">$</w:t>
+      </w:r>
+      <w:r>
+        <w:rPr>
+          <w:rStyle w:val="NormalTok"/>
+        </w:rPr>
+        <w:t xml:space="preserve">Description)</w:t>
+      </w:r>
+      <w:r>
+        <w:br/>
+      </w:r>
+      <w:r>
+        <w:rPr>
+          <w:rStyle w:val="NormalTok"/>
+        </w:rPr>
+        <w:t xml:space="preserve">}</w:t>
+      </w:r>
+      <w:r>
+        <w:rPr>
+          <w:rStyle w:val="ControlFlowTok"/>
+        </w:rPr>
+        <w:t xml:space="preserve">else</w:t>
+      </w:r>
+      <w:r>
+        <w:rPr>
+          <w:rStyle w:val="NormalTok"/>
+        </w:rPr>
+        <w:t xml:space="preserve">{</w:t>
+      </w:r>
+      <w:r>
+        <w:br/>
+      </w:r>
+      <w:r>
+        <w:rPr>
+          <w:rStyle w:val="NormalTok"/>
+        </w:rPr>
+        <w:t xml:space="preserve">  </w:t>
+      </w:r>
+      <w:r>
+        <w:rPr>
+          <w:rStyle w:val="FunctionTok"/>
+        </w:rPr>
+        <w:t xml:space="preserve">cat</w:t>
+      </w:r>
+      <w:r>
+        <w:rPr>
+          <w:rStyle w:val="NormalTok"/>
+        </w:rPr>
+        <w:t xml:space="preserve">(</w:t>
+      </w:r>
+      <w:r>
+        <w:rPr>
+          <w:rStyle w:val="StringTok"/>
+        </w:rPr>
+        <w:t xml:space="preserve">""</w:t>
+      </w:r>
+      <w:r>
+        <w:rPr>
+          <w:rStyle w:val="NormalTok"/>
+        </w:rPr>
+        <w:t xml:space="preserve">)</w:t>
+      </w:r>
+      <w:r>
+        <w:br/>
+      </w:r>
+      <w:r>
+        <w:rPr>
+          <w:rStyle w:val="NormalTok"/>
+        </w:rPr>
+        <w:t xml:space="preserve">  } </w:t>
+      </w:r>
+    </w:p>
+    <w:bookmarkEnd w:id="53"/>
+    <w:bookmarkEnd w:id="54"/>
+    <w:bookmarkStart w:id="55" w:name="additional-resources"/>
+    <w:p>
+      <w:pPr>
+        <w:pStyle w:val="Heading2"/>
+      </w:pPr>
+      <w:r>
+        <w:t xml:space="preserve">5 Additional Resources</w:t>
+      </w:r>
+    </w:p>
+    <w:p>
+      <w:pPr>
+        <w:pStyle w:val="FirstParagraph"/>
+      </w:pPr>
+      <w:r>
+        <w:t xml:space="preserve">Many home efficiency upgrades are eligible for Efficiency Maine rebates and federal tax credits. Financial incentives vary based on income level and type of occupancy. An overview of all state rebates and federal tax credits can be found here: https://www.efficiencymaine.com/at-home/.</w:t>
+      </w:r>
+    </w:p>
+    <w:p>
+      <w:pPr>
+        <w:pStyle w:val="BodyText"/>
+      </w:pPr>
+      <w:r>
+        <w:t xml:space="preserve">You can search for Efficiency Maine registered contractors here: https://www.efficiencymaine.com/at-home/vendor-locator/.</w:t>
+      </w:r>
+    </w:p>
+    <w:p>
+      <w:pPr>
+        <w:pStyle w:val="BodyText"/>
+      </w:pPr>
+      <w:r>
+        <w:t xml:space="preserve">We recommend discussing a whole-home plan for insulation and air sealing work in the basement, walls, and attic with contractors to determine how to best sequence the work to take full advantage of the Efficiency Maine rebates (which are subject to lifetime maximums) and nonrefundable federal tax credits (which are subject to annual maximums).</w:t>
+      </w:r>
+    </w:p>
+    <w:bookmarkEnd w:id="55"/>
+    <w:bookmarkStart w:id="68" w:name="section-four-tests"/>
+    <w:p>
+      <w:pPr>
+        <w:pStyle w:val="Heading2"/>
+      </w:pPr>
+      <w:r>
+        <w:t xml:space="preserve">6 Section Four Tests</w:t>
+      </w:r>
+    </w:p>
+    <w:bookmarkStart w:id="56" w:name="windowdressers"/>
     <w:p>
       <w:pPr>
         <w:pStyle w:val="Heading3"/>
       </w:pPr>
       <w:r>
-        <w:t xml:space="preserve">4.3 Window Dressers</w:t>
+        <w:t xml:space="preserve">6.1 WindowDressers</w:t>
+      </w:r>
+    </w:p>
+    <w:bookmarkEnd w:id="56"/>
+    <w:bookmarkStart w:id="57" w:name="leds-1"/>
+    <w:p>
+      <w:pPr>
+        <w:pStyle w:val="Heading3"/>
+      </w:pPr>
+      <w:r>
+        <w:t xml:space="preserve">6.2 LEDs</w:t>
+      </w:r>
+    </w:p>
+    <w:bookmarkEnd w:id="57"/>
+    <w:bookmarkStart w:id="58" w:name="high-efficiency-shower-heads-1"/>
+    <w:p>
+      <w:pPr>
+        <w:pStyle w:val="Heading3"/>
+      </w:pPr>
+      <w:r>
+        <w:t xml:space="preserve">6.3 High-efficiency Shower Head(s)</w:t>
+      </w:r>
+    </w:p>
+    <w:bookmarkEnd w:id="58"/>
+    <w:bookmarkStart w:id="59" w:name="gutters-1"/>
+    <w:p>
+      <w:pPr>
+        <w:pStyle w:val="Heading3"/>
+      </w:pPr>
+      <w:r>
+        <w:t xml:space="preserve">6.4 Gutters</w:t>
+      </w:r>
+    </w:p>
+    <w:bookmarkEnd w:id="59"/>
+    <w:bookmarkStart w:id="60" w:name="bathroom-exhaust-fans-1"/>
+    <w:p>
+      <w:pPr>
+        <w:pStyle w:val="Heading3"/>
+      </w:pPr>
+      <w:r>
+        <w:t xml:space="preserve">6.5 Bathroom Exhaust Fan(s)</w:t>
+      </w:r>
+    </w:p>
+    <w:bookmarkEnd w:id="60"/>
+    <w:bookmarkStart w:id="61" w:name="kitchen-exhaust-fan"/>
+    <w:p>
+      <w:pPr>
+        <w:pStyle w:val="Heading3"/>
+      </w:pPr>
+      <w:r>
+        <w:t xml:space="preserve">6.6 Kitchen Exhaust Fan</w:t>
+      </w:r>
+    </w:p>
+    <w:bookmarkEnd w:id="61"/>
+    <w:bookmarkStart w:id="62" w:name="induction-stoveoven-1"/>
+    <w:p>
+      <w:pPr>
+        <w:pStyle w:val="Heading3"/>
+      </w:pPr>
+      <w:r>
+        <w:t xml:space="preserve">6.7 Induction Stove/Oven</w:t>
+      </w:r>
+    </w:p>
+    <w:bookmarkEnd w:id="62"/>
+    <w:bookmarkStart w:id="63" w:name="attic-air-sealing-and-insulation"/>
+    <w:p>
+      <w:pPr>
+        <w:pStyle w:val="Heading3"/>
+      </w:pPr>
+      <w:r>
+        <w:t xml:space="preserve">6.8 Attic Air Sealing and Insulation</w:t>
+      </w:r>
+    </w:p>
+    <w:bookmarkEnd w:id="63"/>
+    <w:bookmarkStart w:id="64" w:name="vapor-barrier-1"/>
+    <w:p>
+      <w:pPr>
+        <w:pStyle w:val="Heading3"/>
+      </w:pPr>
+      <w:r>
+        <w:t xml:space="preserve">6.9 Vapor Barrier</w:t>
+      </w:r>
+    </w:p>
+    <w:bookmarkEnd w:id="64"/>
+    <w:bookmarkStart w:id="65" w:name="spray-foam-basementcrawlspace-walls"/>
+    <w:p>
+      <w:pPr>
+        <w:pStyle w:val="Heading3"/>
+      </w:pPr>
+      <w:r>
+        <w:t xml:space="preserve">6.10 Spray Foam Basement/Crawlspace Walls</w:t>
+      </w:r>
+    </w:p>
+    <w:bookmarkEnd w:id="65"/>
+    <w:bookmarkStart w:id="66" w:name="electrical-panel-upgrade-1"/>
+    <w:p>
+      <w:pPr>
+        <w:pStyle w:val="Heading3"/>
+      </w:pPr>
+      <w:r>
+        <w:t xml:space="preserve">6.11 Electrical Panel Upgrade</w:t>
+      </w:r>
+    </w:p>
+    <w:bookmarkEnd w:id="66"/>
+    <w:bookmarkStart w:id="67" w:name="air-source-heat-pump-1"/>
+    <w:p>
+      <w:pPr>
+        <w:pStyle w:val="Heading3"/>
+      </w:pPr>
+      <w:r>
+        <w:t xml:space="preserve">6.12 Air Source Heat Pump</w:t>
       </w:r>
     </w:p>
     <w:p>
@@ -3883,2055 +5051,23 @@
         <w:pStyle w:val="FirstParagraph"/>
       </w:pPr>
       <w:r>
-        <w:rPr>
-          <w:i/>
-          <w:iCs/>
-        </w:rPr>
-        <w:t xml:space="preserve">Problem</w:t>
-      </w:r>
-    </w:p>
-    <w:p>
-      <w:pPr>
-        <w:pStyle w:val="BodyText"/>
-      </w:pPr>
-      <w:r>
-        <w:t xml:space="preserve">Your windows are a source of heat loss, reduce your comfort due to cold surface temperatures, and may also cause moisture condensation or frost in the winter.</w:t>
-      </w:r>
-    </w:p>
-    <w:p>
-      <w:pPr>
-        <w:pStyle w:val="BodyText"/>
-      </w:pPr>
-      <w:r>
-        <w:rPr>
-          <w:i/>
-          <w:iCs/>
-        </w:rPr>
-        <w:t xml:space="preserve">Recommendation</w:t>
-      </w:r>
-    </w:p>
-    <w:p>
-      <w:pPr>
-        <w:pStyle w:val="BodyText"/>
-      </w:pPr>
-      <w:r>
-        <w:t xml:space="preserve">WindowDressers are insulating window inserts that help air-seal windows and reduce heat loss and gain. WindowDressers are transparent and let in light while stopping drafts. Each insert is made of a custom-made pine frame wrapped on each side with tightly sealed, clear polyolefin film, creating an airspace between the two layers for additional insulation. The insert is finished with a compressible foam weather seal. The foam allows enough give for the inserts to be easily slid into place in the fall and removed in the spring while holding firmly enough to provide a tight, friction-based seal. The inserts are installed inside your existing window frame with no fasteners required and last 5-10 years. They are most effective in the winter, but depending on the window’s exposure, they can sometimes be used in the summer to keep the house cooler.</w:t>
+        <w:t xml:space="preserve">[1]</w:t>
       </w:r>
       <w:r>
         <w:t xml:space="preserve"> </w:t>
       </w:r>
       <w:r>
-        <w:rPr>
-          <w:i/>
-          <w:iCs/>
-        </w:rPr>
-        <w:t xml:space="preserve">Estimated Cost/Benefits/Incentives</w:t>
-      </w:r>
-    </w:p>
-    <w:p>
-      <w:pPr>
-        <w:pStyle w:val="BodyText"/>
-      </w:pPr>
-      <w:r>
-        <w:t xml:space="preserve">Insulating window inserts save 5-10% of your heating costs at less than 1/10th the cost of replacement windows. The overall project cost will depend on the number and size of window inserts. Example prices for the 2024 season were: small (20 x 36”) - $36 for natural pine frame, $46 for white; medium (30 x 52”) - $50 for natural pine frame, $64 for white; large (44 x 68”) - $67 for natural pine frame, $88 for white. Adjusted pricing for lower-income households is available from WindowDressers upon request. If plastic is damaged, it can be replaced for $15.</w:t>
-      </w:r>
-    </w:p>
-    <w:p>
-      <w:pPr>
-        <w:pStyle w:val="BodyText"/>
-      </w:pPr>
-      <w:r>
-        <w:t xml:space="preserve">Households that order inserts are expected to participate in the Community Build where the inserts are made. You can sign up for a 4-hour shift and learn the simple steps in the insert-building process (no previous experience required, no power tools). Each job has</w:t>
-      </w:r>
-      <w:r>
-        <w:t xml:space="preserve"> </w:t>
-      </w:r>
-      <w:r>
-        <w:t xml:space="preserve">“jigs”</w:t>
-      </w:r>
-      <w:r>
-        <w:t xml:space="preserve"> </w:t>
-      </w:r>
-      <w:r>
-        <w:t xml:space="preserve">that make the job easier to do and ensure uniform quality. You will be trained at the beginning of your shift on how to do your task. Volunteering for multiple shifts is encouraged! Mid-shift snacks and a meal are provided to all participants.</w:t>
-      </w:r>
-    </w:p>
-    <w:p>
-      <w:pPr>
-        <w:pStyle w:val="BodyText"/>
-      </w:pPr>
-      <w:r>
-        <w:t xml:space="preserve">If you would like to participate, please contact us so we can discuss how the program works and which windows you’d like inserts for.</w:t>
-      </w:r>
-    </w:p>
-    <w:bookmarkEnd w:id="44"/>
-    <w:bookmarkStart w:id="45" w:name="freezer"/>
-    <w:p>
-      <w:pPr>
-        <w:pStyle w:val="Heading3"/>
-      </w:pPr>
-      <w:r>
-        <w:t xml:space="preserve">4.4 Freezer</w:t>
-      </w:r>
-    </w:p>
-    <w:p>
-      <w:pPr>
-        <w:pStyle w:val="FirstParagraph"/>
-      </w:pPr>
-      <w:r>
-        <w:rPr>
-          <w:i/>
-          <w:iCs/>
-        </w:rPr>
-        <w:t xml:space="preserve">Problem</w:t>
-      </w:r>
-    </w:p>
-    <w:p>
-      <w:pPr>
-        <w:pStyle w:val="BodyText"/>
-      </w:pPr>
-      <w:r>
-        <w:t xml:space="preserve">Your freezer uses more energy than newer models. Consider how the cost of running the freezer compares to the benefits of keeping it on.</w:t>
-      </w:r>
-    </w:p>
-    <w:p>
-      <w:pPr>
-        <w:pStyle w:val="BodyText"/>
-      </w:pPr>
-      <w:r>
-        <w:rPr>
-          <w:b/>
-          <w:bCs/>
-        </w:rPr>
-        <w:t xml:space="preserve">Ideally, the auditor notes the annual energy consumption (kWh) of the existing freezer compared to a new model of similar size</w:t>
-      </w:r>
-    </w:p>
-    <w:p>
-      <w:pPr>
-        <w:pStyle w:val="BodyText"/>
-      </w:pPr>
-      <w:r>
-        <w:rPr>
-          <w:i/>
-          <w:iCs/>
-        </w:rPr>
-        <w:t xml:space="preserve">Recommendation</w:t>
-      </w:r>
-    </w:p>
-    <w:p>
-      <w:pPr>
-        <w:pStyle w:val="BodyText"/>
-      </w:pPr>
-      <w:r>
-        <w:t xml:space="preserve">Replace your freezer with a new, EnergyStar certified freezer. Look at the Energy Guide label to compare the energy use of new freezers.</w:t>
-      </w:r>
-    </w:p>
-    <w:p>
-      <w:pPr>
-        <w:pStyle w:val="BodyText"/>
-      </w:pPr>
-      <w:r>
-        <w:rPr>
-          <w:i/>
-          <w:iCs/>
-        </w:rPr>
-        <w:t xml:space="preserve">Estimated Cost/Benefits/Incentives</w:t>
-      </w:r>
-    </w:p>
-    <w:p>
-      <w:pPr>
-        <w:pStyle w:val="BodyText"/>
-      </w:pPr>
-      <w:r>
-        <w:t xml:space="preserve">If you are able to afford the upfront cost of purchasing a new freezer, you will recoup significant savings in the long run. Whenever you need to buy a new appliance, consider EnergyStar certified models, which use electricity and are cheaper to run.</w:t>
-      </w:r>
-    </w:p>
-    <w:p>
-      <w:pPr>
-        <w:pStyle w:val="BodyText"/>
-      </w:pPr>
-      <w:r>
-        <w:rPr>
-          <w:b/>
-          <w:bCs/>
-        </w:rPr>
-        <w:t xml:space="preserve">Ideally, auditor locates similar volume freezer online to calculate monthly savings and payback period compared to kill-a-watt meter reading for current freezer.</w:t>
-      </w:r>
-      <w:r>
-        <w:rPr>
-          <w:b/>
-          <w:bCs/>
-        </w:rPr>
-        <w:t xml:space="preserve"> </w:t>
-      </w:r>
-      <w:r>
-        <w:rPr>
-          <w:b/>
-          <w:bCs/>
-        </w:rPr>
-        <w:t xml:space="preserve">“This example freezer would save $XX in electricity each month and pay for itself within XX months.”</w:t>
-      </w:r>
-    </w:p>
-    <w:bookmarkEnd w:id="45"/>
-    <w:bookmarkStart w:id="46" w:name="induction-stoveoven"/>
-    <w:p>
-      <w:pPr>
-        <w:pStyle w:val="Heading3"/>
-      </w:pPr>
-      <w:r>
-        <w:t xml:space="preserve">4.5 Induction Stove/Oven</w:t>
-      </w:r>
-    </w:p>
-    <w:p>
-      <w:pPr>
-        <w:pStyle w:val="FirstParagraph"/>
-      </w:pPr>
-      <w:r>
-        <w:rPr>
-          <w:i/>
-          <w:iCs/>
-        </w:rPr>
-        <w:t xml:space="preserve">Problem</w:t>
-      </w:r>
-    </w:p>
-    <w:p>
-      <w:pPr>
-        <w:pStyle w:val="BodyText"/>
-      </w:pPr>
-      <w:r>
-        <w:t xml:space="preserve">Your gas range has the potential to release propane, carbon monoxide, and combustion gases into your house. Gas ranges are also inefficient at transferring heat to your food at 32% efficiency, compared to 85% efficiency for induction cooktops.</w:t>
-      </w:r>
-    </w:p>
-    <w:p>
-      <w:pPr>
-        <w:pStyle w:val="BodyText"/>
-      </w:pPr>
-      <w:r>
-        <w:rPr>
-          <w:i/>
-          <w:iCs/>
-        </w:rPr>
-        <w:t xml:space="preserve">Recommendation</w:t>
-      </w:r>
-    </w:p>
-    <w:p>
-      <w:pPr>
-        <w:pStyle w:val="BodyText"/>
-      </w:pPr>
-      <w:r>
-        <w:t xml:space="preserve">Induction cooking appliances are more efficient and safer than electric or gas ones. There is no risk of carbon monoxide or other harmful combustion gases, and the surface doesn’t heat up without a pot or pan on it.</w:t>
-      </w:r>
-    </w:p>
-    <w:p>
-      <w:pPr>
-        <w:pStyle w:val="BodyText"/>
-      </w:pPr>
-      <w:r>
-        <w:rPr>
-          <w:i/>
-          <w:iCs/>
-        </w:rPr>
-        <w:t xml:space="preserve">Estimated Cost/Benefits/Incentives</w:t>
-      </w:r>
-    </w:p>
-    <w:p>
-      <w:pPr>
-        <w:pStyle w:val="BodyText"/>
-      </w:pPr>
-      <w:r>
-        <w:t xml:space="preserve">Currently, Efficiency Maine does not offer a rebate for induction stoves. If you’re interested in trying out induction cooking but don’t want to replace your kitchen stove, consider buying a portable induction cooktop, which costs less than $100.</w:t>
-      </w:r>
-    </w:p>
-    <w:bookmarkEnd w:id="46"/>
-    <w:bookmarkStart w:id="47" w:name="bathroom-exhaust-fans"/>
-    <w:p>
-      <w:pPr>
-        <w:pStyle w:val="Heading3"/>
-      </w:pPr>
-      <w:r>
-        <w:t xml:space="preserve">4.6 Bathroom exhaust fan(s)</w:t>
-      </w:r>
-    </w:p>
-    <w:p>
-      <w:pPr>
-        <w:pStyle w:val="FirstParagraph"/>
-      </w:pPr>
-      <w:r>
-        <w:rPr>
-          <w:i/>
-          <w:iCs/>
-        </w:rPr>
-        <w:t xml:space="preserve">Problem</w:t>
-      </w:r>
-    </w:p>
-    <w:p>
-      <w:pPr>
-        <w:pStyle w:val="BodyText"/>
-      </w:pPr>
-      <w:r>
-        <w:t xml:space="preserve">Currently, there is no bathroom exhaust fan, so moisture from the shower, toilet, and sink remains in the house, which can cause moisture issues such as mold.</w:t>
-      </w:r>
-    </w:p>
-    <w:p>
-      <w:pPr>
-        <w:pStyle w:val="BodyText"/>
-      </w:pPr>
-      <w:r>
-        <w:rPr>
-          <w:i/>
-          <w:iCs/>
-        </w:rPr>
-        <w:t xml:space="preserve">Recommendation</w:t>
-      </w:r>
-    </w:p>
-    <w:p>
-      <w:pPr>
-        <w:pStyle w:val="BodyText"/>
-      </w:pPr>
-      <w:r>
-        <w:t xml:space="preserve">Install bathroom exhaust fans in all bathrooms that do not have them. These should be rated for at least 80 cubic feet per minute (CFM) if there is a shower. We recommend the Panasonic Whisper series or similar fans that don’t create excess noise. If the ductwork will run through the attic, it should be installed before the attic is air-sealed and insulated. The fan needs to be ducted outside, so it does not add moisture into the attic.</w:t>
-      </w:r>
-    </w:p>
-    <w:p>
-      <w:pPr>
-        <w:pStyle w:val="BodyText"/>
-      </w:pPr>
-      <w:r>
-        <w:rPr>
-          <w:i/>
-          <w:iCs/>
-        </w:rPr>
-        <w:t xml:space="preserve">Estimated Cost/Benefits/Incentives</w:t>
-      </w:r>
-    </w:p>
-    <w:p>
-      <w:pPr>
-        <w:pStyle w:val="BodyText"/>
-      </w:pPr>
-      <w:r>
-        <w:t xml:space="preserve">The typical fan is around $130 plus the cost of installation.</w:t>
-      </w:r>
-    </w:p>
-    <w:bookmarkEnd w:id="47"/>
-    <w:bookmarkStart w:id="48" w:name="kitchen-exhaust-fans"/>
-    <w:p>
-      <w:pPr>
-        <w:pStyle w:val="Heading3"/>
-      </w:pPr>
-      <w:r>
-        <w:t xml:space="preserve">4.7 Kitchen exhaust fan(s)</w:t>
-      </w:r>
-    </w:p>
-    <w:p>
-      <w:pPr>
-        <w:pStyle w:val="FirstParagraph"/>
-      </w:pPr>
-      <w:r>
-        <w:rPr>
-          <w:i/>
-          <w:iCs/>
-        </w:rPr>
-        <w:t xml:space="preserve">Problem</w:t>
-      </w:r>
-    </w:p>
-    <w:p>
-      <w:pPr>
-        <w:pStyle w:val="BodyText"/>
-      </w:pPr>
-      <w:r>
-        <w:t xml:space="preserve">Currently, there is no kitchen exhaust fan, so fumes, smoke, and moisture from cooking stay in the house which can cause health concerns.</w:t>
-      </w:r>
-    </w:p>
-    <w:p>
-      <w:pPr>
-        <w:pStyle w:val="BodyText"/>
-      </w:pPr>
-      <w:r>
-        <w:rPr>
-          <w:i/>
-          <w:iCs/>
-        </w:rPr>
-        <w:t xml:space="preserve">Recommendation</w:t>
-      </w:r>
-    </w:p>
-    <w:p>
-      <w:pPr>
-        <w:pStyle w:val="BodyText"/>
-      </w:pPr>
-      <w:r>
-        <w:t xml:space="preserve">Install a kitchen exhaust fan to remove cooking fumes and moisture from your home. The fan should be rated for at least 100 cubic feet per minute. A kitchen fan should be ducted to the outdoors. If the ductwork will run through the attic, it should be installed before the attic is air-sealed and insulated. A kitchen fan should be ducted to the outdoors. If the ductwork will run through the attic, it should be installed before the attic is air-sealed and insulated.</w:t>
-      </w:r>
-    </w:p>
-    <w:p>
-      <w:pPr>
-        <w:pStyle w:val="BodyText"/>
-      </w:pPr>
-      <w:r>
-        <w:rPr>
-          <w:i/>
-          <w:iCs/>
-        </w:rPr>
-        <w:t xml:space="preserve">Estimated Cost/Benefits/Incentives</w:t>
-      </w:r>
-    </w:p>
-    <w:p>
-      <w:pPr>
-        <w:pStyle w:val="BodyText"/>
-      </w:pPr>
-      <w:r>
-        <w:t xml:space="preserve">Kitchen range hoods typically cost $150 or more; installation costs depend on the complexity of the exhaust ducting.</w:t>
-      </w:r>
-    </w:p>
-    <w:bookmarkEnd w:id="48"/>
-    <w:bookmarkStart w:id="49" w:name="vapor-barrier"/>
-    <w:p>
-      <w:pPr>
-        <w:pStyle w:val="Heading3"/>
-      </w:pPr>
-      <w:r>
-        <w:t xml:space="preserve">4.8 Vapor Barrier</w:t>
-      </w:r>
-    </w:p>
-    <w:p>
-      <w:pPr>
-        <w:pStyle w:val="FirstParagraph"/>
-      </w:pPr>
-      <w:r>
-        <w:rPr>
-          <w:i/>
-          <w:iCs/>
-        </w:rPr>
-        <w:t xml:space="preserve">Problem</w:t>
-      </w:r>
-    </w:p>
-    <w:p>
-      <w:pPr>
-        <w:pStyle w:val="BodyText"/>
-      </w:pPr>
-      <w:r>
-        <w:t xml:space="preserve">There is excess moisture in the basement/crawlspace, which is evaporating out of the ground. This moisture can enter the house and cause mold, mildew, rot, and air quality issues.</w:t>
-      </w:r>
-    </w:p>
-    <w:p>
-      <w:pPr>
-        <w:pStyle w:val="BodyText"/>
-      </w:pPr>
-      <w:r>
-        <w:rPr>
-          <w:i/>
-          <w:iCs/>
-        </w:rPr>
-        <w:t xml:space="preserve">Recommendation</w:t>
-      </w:r>
-    </w:p>
-    <w:p>
-      <w:pPr>
-        <w:pStyle w:val="BodyText"/>
-      </w:pPr>
-      <w:r>
-        <w:t xml:space="preserve">Install a vapor barrier on the basement floor to stop moisture from entering the basement and house. Vapor barriers typically consist of either reinforced plastic sheeting or EPDM rubber membrane over a</w:t>
-      </w:r>
-      <w:r>
-        <w:t xml:space="preserve"> </w:t>
-      </w:r>
-      <w:r>
-        <w:t xml:space="preserve">‘dimple mat’</w:t>
-      </w:r>
-      <w:r>
-        <w:t xml:space="preserve"> </w:t>
-      </w:r>
-      <w:r>
-        <w:t xml:space="preserve">that allows for drainage below the vapor barrier and prevents rocks from puncturing it. If the basement/crawlspace walls are going to be spray foamed, we recommend the foam go all the way to the floor and overlap the vapor barrier to create a continuous air and moisture barrier.</w:t>
-      </w:r>
-    </w:p>
-    <w:p>
-      <w:pPr>
-        <w:pStyle w:val="BodyText"/>
-      </w:pPr>
-      <w:r>
-        <w:rPr>
-          <w:i/>
-          <w:iCs/>
-        </w:rPr>
-        <w:t xml:space="preserve">Estimated Cost/Benefits/Incentives</w:t>
-      </w:r>
-    </w:p>
-    <w:p>
-      <w:pPr>
-        <w:pStyle w:val="BodyText"/>
-      </w:pPr>
-      <w:r>
-        <w:t xml:space="preserve">Efficiency Maine rebates will cover vapor barriers up to 25% of a weatherization project cost, if done as part of a larger insulation project. Most insulation companies can install spray foam and vapor barriers together. Efficiency Maine rebates and other incentives for insulation work can fund up to 80% of the overall cost to weatherize your home (subject to a lifetime limit per building), up to $9,200 when combined with nonrefundable federal tax credits. You can call them at 866-376-2463 (Monday to Friday, 8:00 am to 5:00 pm) or visit their webpage about insulation rebates: https://www.efficiencymaine.com/at-home/insulation-rebates/</w:t>
-      </w:r>
-    </w:p>
-    <w:bookmarkEnd w:id="49"/>
-    <w:bookmarkStart w:id="50" w:name="spray-foam-basement-walls"/>
-    <w:p>
-      <w:pPr>
-        <w:pStyle w:val="Heading3"/>
-      </w:pPr>
-      <w:r>
-        <w:t xml:space="preserve">4.9 Spray foam Basement Walls</w:t>
-      </w:r>
-    </w:p>
-    <w:p>
-      <w:pPr>
-        <w:pStyle w:val="FirstParagraph"/>
-      </w:pPr>
-      <w:r>
-        <w:rPr>
-          <w:i/>
-          <w:iCs/>
-        </w:rPr>
-        <w:t xml:space="preserve">Problem</w:t>
-      </w:r>
-    </w:p>
-    <w:p>
-      <w:pPr>
-        <w:pStyle w:val="BodyText"/>
-      </w:pPr>
-      <w:r>
-        <w:t xml:space="preserve">The basement/crawlspace is uninsulated and used for mechanical equipment and plumbing. The walls are porous and allow moisture into the house and rapidly conduct heat out of the space.</w:t>
-      </w:r>
-    </w:p>
-    <w:p>
-      <w:pPr>
-        <w:pStyle w:val="BodyText"/>
-      </w:pPr>
-      <w:r>
-        <w:rPr>
-          <w:i/>
-          <w:iCs/>
-        </w:rPr>
-        <w:t xml:space="preserve">Recommendation</w:t>
-      </w:r>
-    </w:p>
-    <w:p>
-      <w:pPr>
-        <w:pStyle w:val="BodyText"/>
-      </w:pPr>
-      <w:r>
-        <w:t xml:space="preserve">Install spray foam on the basement/crawlspace walls to prevent moisture infiltration and reduce heat loss. In older homes, most heat loss is due to air leakage. Air sealing is particularly important in the basement or crawlspace (and attic). As warm air rises and leaks out the top of your home, cold air is pulled in at the bottom. This is called the</w:t>
-      </w:r>
-      <w:r>
-        <w:t xml:space="preserve"> </w:t>
-      </w:r>
-      <w:r>
-        <w:t xml:space="preserve">‘stack effect’</w:t>
-      </w:r>
-      <w:r>
-        <w:t xml:space="preserve">, and is more pronounced in taller homes. Thus, air sealing is necessary anywhere gaps allow air to move into your house through the basement/crawlspace.</w:t>
-      </w:r>
-    </w:p>
-    <w:p>
-      <w:pPr>
-        <w:pStyle w:val="BodyText"/>
-      </w:pPr>
-      <w:r>
-        <w:t xml:space="preserve">Spray foam should be applied 2-3 inches thick on the walls to seal and insulate them. It is often ideal to install a vapor barrier at the same time as the spray foam insulation. Spray foam generally requires a layer of intumescent (fire-rated) paint over it to meet fire code.</w:t>
-      </w:r>
-    </w:p>
-    <w:p>
-      <w:pPr>
-        <w:pStyle w:val="BodyText"/>
-      </w:pPr>
-      <w:r>
-        <w:rPr>
-          <w:i/>
-          <w:iCs/>
-        </w:rPr>
-        <w:t xml:space="preserve">Estimated Cost/Benefits/Incentives</w:t>
-      </w:r>
-    </w:p>
-    <w:p>
-      <w:pPr>
-        <w:pStyle w:val="BodyText"/>
-      </w:pPr>
-      <w:r>
-        <w:t xml:space="preserve">Installation of spray foam insulation will cost around $5-7 per square foot. Efficiency Maine rebates and other incentives for insulation work can fund up to 80% of the project cost (subject to a lifetime limit per building), up to $9,200 when combined with nonrefundable federal tax credits. You can call them at 866-376-2463 (Monday to Friday, 8:00 am to 5:00 pm) or visit their webpage about insulation rebates: https://www.efficiencymaine.com/at-home/insulation-rebates/</w:t>
-      </w:r>
-    </w:p>
-    <w:bookmarkEnd w:id="50"/>
-    <w:bookmarkStart w:id="51" w:name="attic-insulation-and-air-sealing"/>
-    <w:p>
-      <w:pPr>
-        <w:pStyle w:val="Heading3"/>
-      </w:pPr>
-      <w:r>
-        <w:t xml:space="preserve">4.10 Attic Insulation and Air Sealing</w:t>
-      </w:r>
-    </w:p>
-    <w:p>
-      <w:pPr>
-        <w:pStyle w:val="FirstParagraph"/>
-      </w:pPr>
-      <w:r>
-        <w:rPr>
-          <w:i/>
-          <w:iCs/>
-        </w:rPr>
-        <w:t xml:space="preserve">Problem</w:t>
-      </w:r>
-    </w:p>
-    <w:p>
-      <w:pPr>
-        <w:pStyle w:val="BodyText"/>
-      </w:pPr>
-      <w:r>
-        <w:t xml:space="preserve">The attic is uninsulated or is missing insulation and the attic could also benefit from air-sealing. These upgrades will reduce draftiness and heat loss in the winter and heat gain in the summer.</w:t>
-      </w:r>
-    </w:p>
-    <w:p>
-      <w:pPr>
-        <w:pStyle w:val="BodyText"/>
-      </w:pPr>
-      <w:r>
-        <w:rPr>
-          <w:i/>
-          <w:iCs/>
-        </w:rPr>
-        <w:t xml:space="preserve">Recommendation</w:t>
-      </w:r>
-    </w:p>
-    <w:p>
-      <w:pPr>
-        <w:pStyle w:val="BodyText"/>
-      </w:pPr>
-      <w:r>
-        <w:t xml:space="preserve">Air seal the attic and insulate it to at least R-60 (18 inches of loose-fill cellulose insulation). COA has been installing 24 inches (R-80) of cellulose insulation in attics on our campus. Before the attic is insulated, ensure that any needed bathroom and kitchen fans are installed and that all fans are properly vented to the outside.</w:t>
-      </w:r>
-    </w:p>
-    <w:p>
-      <w:pPr>
-        <w:pStyle w:val="BodyText"/>
-      </w:pPr>
-      <w:r>
-        <w:t xml:space="preserve">In older homes, most heat loss is due to air leakage. Air sealing is particularly important in the attic (and basement or crawlspace). As warm air rises and leaks out the top of your home, cold air is pulled in at the bottom. This is called the</w:t>
-      </w:r>
-      <w:r>
-        <w:t xml:space="preserve"> </w:t>
-      </w:r>
-      <w:r>
-        <w:t xml:space="preserve">‘stack effect’</w:t>
-      </w:r>
-      <w:r>
-        <w:t xml:space="preserve">, and is more pronounced in taller homes. Thus, air sealing is necessary anywhere gaps allow air to move between your house and the attic. This typically includes gaps around the chimney, electrical penetrations, and wall top plates.</w:t>
-      </w:r>
-    </w:p>
-    <w:p>
-      <w:pPr>
-        <w:pStyle w:val="BodyText"/>
-      </w:pPr>
-      <w:r>
-        <w:rPr>
-          <w:i/>
-          <w:iCs/>
-        </w:rPr>
-        <w:t xml:space="preserve">Estimated Cost/Benefits/Incentives</w:t>
-      </w:r>
-    </w:p>
-    <w:p>
-      <w:pPr>
-        <w:pStyle w:val="BodyText"/>
-      </w:pPr>
-      <w:r>
-        <w:t xml:space="preserve">Efficiency Maine rebates and other incentives for insulation work can fund up to 80% of the overall cost to weatherize your home (subject to a lifetime limit per building), up to $9,200 when combined with nonrefundable federal tax credits. You can call them at 866-376-2463 (Monday to Friday, 8:00 am to 5:00 pm) or visit their webpage about insulation rebates: https://www.efficiencymaine.com/at-home/insulation-rebates/</w:t>
-      </w:r>
-    </w:p>
-    <w:bookmarkEnd w:id="51"/>
-    <w:bookmarkStart w:id="52" w:name="blow-in-cellulose-wall-insulation"/>
-    <w:p>
-      <w:pPr>
-        <w:pStyle w:val="Heading3"/>
-      </w:pPr>
-      <w:r>
-        <w:t xml:space="preserve">4.11 Blow-in cellulose wall insulation</w:t>
-      </w:r>
-    </w:p>
-    <w:p>
-      <w:pPr>
-        <w:pStyle w:val="FirstParagraph"/>
-      </w:pPr>
-      <w:r>
-        <w:rPr>
-          <w:i/>
-          <w:iCs/>
-        </w:rPr>
-        <w:t xml:space="preserve">Problem</w:t>
-      </w:r>
-    </w:p>
-    <w:p>
-      <w:pPr>
-        <w:pStyle w:val="BodyText"/>
-      </w:pPr>
-      <w:r>
-        <w:t xml:space="preserve">The walls of the house are uninsulated, which is a significant source of heat loss.</w:t>
-      </w:r>
-    </w:p>
-    <w:p>
-      <w:pPr>
-        <w:pStyle w:val="BodyText"/>
-      </w:pPr>
-      <w:r>
-        <w:rPr>
-          <w:i/>
-          <w:iCs/>
-        </w:rPr>
-        <w:t xml:space="preserve">Recommendation</w:t>
-      </w:r>
-    </w:p>
-    <w:p>
-      <w:pPr>
-        <w:pStyle w:val="BodyText"/>
-      </w:pPr>
-      <w:r>
-        <w:t xml:space="preserve">Insulate the wall stud cavities with dense packed, blown-in cellulose insulation. In balloon-framed homes, this can often be done from the attic, otherwise it can be done by drilling holes into the wall cavities from either the inside or outside.</w:t>
-      </w:r>
-      <w:r>
-        <w:t xml:space="preserve"> </w:t>
-      </w:r>
-      <w:r>
-        <w:rPr>
-          <w:i/>
-          <w:iCs/>
-        </w:rPr>
-        <w:t xml:space="preserve">Estimated Cost/Benefits/Incentives</w:t>
-      </w:r>
-    </w:p>
-    <w:p>
-      <w:pPr>
-        <w:pStyle w:val="BodyText"/>
-      </w:pPr>
-      <w:r>
-        <w:t xml:space="preserve">Efficiency Maine rebates and other incentives for insulation work can fund up to 80% of the overall cost to weatherize your home (subject to a lifetime limit per building), up to $9,200 when combined with nonrefundable federal tax credits. You can call them at 866-376-2463 (Monday to Friday, 8:00 am to 5:00 pm) or visit their webpage about insulation rebates: https://www.efficiencymaine.com/at-home/insulation-rebates/</w:t>
-      </w:r>
-    </w:p>
-    <w:bookmarkEnd w:id="52"/>
-    <w:bookmarkStart w:id="53" w:name="continuous-exterior-wall-insulation"/>
-    <w:p>
-      <w:pPr>
-        <w:pStyle w:val="Heading3"/>
-      </w:pPr>
-      <w:r>
-        <w:t xml:space="preserve">4.12 Continuous exterior wall insulation</w:t>
-      </w:r>
-    </w:p>
-    <w:p>
-      <w:pPr>
-        <w:pStyle w:val="FirstParagraph"/>
-      </w:pPr>
-      <w:r>
-        <w:rPr>
-          <w:i/>
-          <w:iCs/>
-        </w:rPr>
-        <w:t xml:space="preserve">Problem</w:t>
-      </w:r>
-    </w:p>
-    <w:p>
-      <w:pPr>
-        <w:pStyle w:val="BodyText"/>
-      </w:pPr>
-      <w:r>
-        <w:t xml:space="preserve">There isn’t continuous insulation between the siding and the exterior walls of the house. Continuous insulation helps create a complete thermal boundary for your house, and it is now an energy code requirement for new houses.</w:t>
-      </w:r>
-    </w:p>
-    <w:p>
-      <w:pPr>
-        <w:pStyle w:val="BodyText"/>
-      </w:pPr>
-      <w:r>
-        <w:rPr>
-          <w:i/>
-          <w:iCs/>
-        </w:rPr>
-        <w:t xml:space="preserve">Recommendation</w:t>
-      </w:r>
-    </w:p>
-    <w:p>
-      <w:pPr>
-        <w:pStyle w:val="BodyText"/>
-      </w:pPr>
-      <w:r>
-        <w:t xml:space="preserve">Add a continuous layer of insulation and potentially replace the air and moisture barrier once it becomes time to replace the siding. Add continuous insulation (R-6 or more) under the new siding to keep the house warmer in the winter and cooler in the summer. We recommend TimberHP TimberBoard insulation (produced in Madison, Maine) or Rockwool Comfortboard, but foam board can also be used. Before installing exterior insulation, the contractor can check if insulation is needed between the interior wall studs.</w:t>
-      </w:r>
-    </w:p>
-    <w:p>
-      <w:pPr>
-        <w:pStyle w:val="BodyText"/>
-      </w:pPr>
-      <w:r>
-        <w:rPr>
-          <w:i/>
-          <w:iCs/>
-        </w:rPr>
-        <w:t xml:space="preserve">Estimated Cost/Benefits/Incentives</w:t>
-      </w:r>
-    </w:p>
-    <w:p>
-      <w:pPr>
-        <w:pStyle w:val="BodyText"/>
-      </w:pPr>
-      <w:r>
-        <w:t xml:space="preserve">Efficiency Maine rebates and other incentives for insulation work can fund up to 80% of the overall cost to weatherize your home (subject to a lifetime limit per building), up to $9,200 when combined with nonrefundable federal tax credits. You can call them at 866-376-2463 (Monday to Friday, 8:00 am to 5:00 pm) or visit their webpage about insulation rebates: https://www.efficiencymaine.com/at-home/insulation-rebates/</w:t>
-      </w:r>
-    </w:p>
-    <w:bookmarkEnd w:id="53"/>
-    <w:bookmarkStart w:id="54" w:name="electrical-panel-upgrade"/>
-    <w:p>
-      <w:pPr>
-        <w:pStyle w:val="Heading3"/>
-      </w:pPr>
-      <w:r>
-        <w:t xml:space="preserve">4.13 Electrical Panel Upgrade</w:t>
-      </w:r>
-    </w:p>
-    <w:p>
-      <w:pPr>
-        <w:pStyle w:val="FirstParagraph"/>
-      </w:pPr>
-      <w:r>
-        <w:rPr>
-          <w:i/>
-          <w:iCs/>
-        </w:rPr>
-        <w:t xml:space="preserve">Problem</w:t>
-      </w:r>
-    </w:p>
-    <w:p>
-      <w:pPr>
-        <w:pStyle w:val="BodyText"/>
-      </w:pPr>
-      <w:r>
-        <w:rPr>
-          <w:b/>
-          <w:bCs/>
-        </w:rPr>
-        <w:t xml:space="preserve">Auditor to describe</w:t>
-      </w:r>
-    </w:p>
-    <w:p>
-      <w:pPr>
-        <w:pStyle w:val="BodyText"/>
-      </w:pPr>
-      <w:r>
-        <w:rPr>
-          <w:i/>
-          <w:iCs/>
-        </w:rPr>
-        <w:t xml:space="preserve">Recommendation</w:t>
-      </w:r>
-    </w:p>
-    <w:p>
-      <w:pPr>
-        <w:pStyle w:val="BodyText"/>
-      </w:pPr>
-      <w:r>
-        <w:t xml:space="preserve">Consult with an electrician about replacing your existing electrical panel with a 200 amp panel as you add electrical appliances to your home. It may become necessary to increase the capacity to address potential safety hazards. An electrician can determine whether or not a panel upgrade is necessary based on your current and anticipated usage.</w:t>
-      </w:r>
-    </w:p>
-    <w:p>
-      <w:pPr>
-        <w:pStyle w:val="BodyText"/>
-      </w:pPr>
-      <w:r>
-        <w:rPr>
-          <w:i/>
-          <w:iCs/>
-        </w:rPr>
-        <w:t xml:space="preserve">Estimated Cost/Benefits/Incentives</w:t>
-      </w:r>
-    </w:p>
-    <w:p>
-      <w:pPr>
-        <w:pStyle w:val="BodyText"/>
-      </w:pPr>
-      <w:r>
-        <w:t xml:space="preserve">Costs of electrical components needed to support residential energy upgrades – including panels, sub-panels, branch circuits, and feeders – qualify for a 30% nonrefundable tax credit (up to $600 per item) if they have a capacity of 200 amps or more. An electrical panel upgrades also provides a good opportunity for an electrician to install whole-house surge protection, which costs $100-$400. Here are some options: https://www.popularmechanics.com/home/interior-projects/g43140886/best-whole-house-surge-protectors/</w:t>
-      </w:r>
-    </w:p>
-    <w:bookmarkEnd w:id="54"/>
-    <w:bookmarkStart w:id="55" w:name="pipe-insulation"/>
-    <w:p>
-      <w:pPr>
-        <w:pStyle w:val="Heading3"/>
-      </w:pPr>
-      <w:r>
-        <w:t xml:space="preserve">4.14 Pipe Insulation</w:t>
-      </w:r>
-    </w:p>
-    <w:p>
-      <w:pPr>
-        <w:pStyle w:val="FirstParagraph"/>
-      </w:pPr>
-      <w:r>
-        <w:rPr>
-          <w:i/>
-          <w:iCs/>
-        </w:rPr>
-        <w:t xml:space="preserve">Problem</w:t>
-      </w:r>
-    </w:p>
-    <w:p>
-      <w:pPr>
-        <w:pStyle w:val="BodyText"/>
-      </w:pPr>
-      <w:r>
-        <w:t xml:space="preserve">Uninsulated water pipes are responsible for heat loss and excess moisture (from condensation) in your basement/crawlspace.</w:t>
-      </w:r>
-    </w:p>
-    <w:p>
-      <w:pPr>
-        <w:pStyle w:val="BodyText"/>
-      </w:pPr>
-      <w:r>
-        <w:rPr>
-          <w:i/>
-          <w:iCs/>
-        </w:rPr>
-        <w:t xml:space="preserve">Recommendation</w:t>
-      </w:r>
-    </w:p>
-    <w:p>
-      <w:pPr>
-        <w:pStyle w:val="BodyText"/>
-      </w:pPr>
-      <w:r>
-        <w:t xml:space="preserve">Insulate both hot and cold water pipes that are uninsulated in the basement/crawlspace. This will save energy and prevent condensation. We recommend foam pipe insulation made of polyethylene or neoprene.</w:t>
-      </w:r>
-    </w:p>
-    <w:p>
-      <w:pPr>
-        <w:pStyle w:val="BodyText"/>
-      </w:pPr>
-      <w:r>
-        <w:rPr>
-          <w:i/>
-          <w:iCs/>
-        </w:rPr>
-        <w:t xml:space="preserve">Estimated Cost/Benefits/Incentives</w:t>
-      </w:r>
-    </w:p>
-    <w:p>
-      <w:pPr>
-        <w:pStyle w:val="BodyText"/>
-      </w:pPr>
-      <w:r>
-        <w:t xml:space="preserve">Insulating water pipes can save 2%-4% on hot water bills and increase the temperature of the water while reducing the time it takes for hot water to reach your tap. Materials cost around $100-200, depending on the length of pipe to insulate. Many people find this to be an easy project to do themselves.</w:t>
-      </w:r>
-    </w:p>
-    <w:bookmarkEnd w:id="55"/>
-    <w:bookmarkStart w:id="56" w:name="whole-house-surge-protection"/>
-    <w:p>
-      <w:pPr>
-        <w:pStyle w:val="Heading3"/>
-      </w:pPr>
-      <w:r>
-        <w:t xml:space="preserve">4.15 Whole House Surge Protection</w:t>
-      </w:r>
-    </w:p>
-    <w:p>
-      <w:pPr>
-        <w:pStyle w:val="FirstParagraph"/>
-      </w:pPr>
-      <w:r>
-        <w:rPr>
-          <w:i/>
-          <w:iCs/>
-        </w:rPr>
-        <w:t xml:space="preserve">Problem</w:t>
-      </w:r>
-    </w:p>
-    <w:p>
-      <w:pPr>
-        <w:pStyle w:val="BodyText"/>
-      </w:pPr>
-      <w:r>
-        <w:t xml:space="preserve">Your house does not have whole-house surge protection. This will protect your large electrical appliances from damage in the case of an electrical surge. Heat pumps, heat pump water heaters, and other electronics are particularly sensitive to electrical surges.</w:t>
-      </w:r>
-    </w:p>
-    <w:p>
-      <w:pPr>
-        <w:pStyle w:val="BodyText"/>
-      </w:pPr>
-      <w:r>
-        <w:rPr>
-          <w:i/>
-          <w:iCs/>
-        </w:rPr>
-        <w:t xml:space="preserve">Recommendation</w:t>
-      </w:r>
-    </w:p>
-    <w:p>
-      <w:pPr>
-        <w:pStyle w:val="BodyText"/>
-      </w:pPr>
-      <w:r>
-        <w:t xml:space="preserve">Seal easy-to-access air leaks and weatherstrip exterior doors. In older homes, most heat loss is due to air leakage. WindowDressers insulating window inserts can also help reduce air leakage.</w:t>
-      </w:r>
-      <w:r>
-        <w:t xml:space="preserve"> </w:t>
-      </w:r>
-      <w:r>
-        <w:rPr>
-          <w:i/>
-          <w:iCs/>
-        </w:rPr>
-        <w:t xml:space="preserve">Estimated Cost/Benefits/Incentives</w:t>
-      </w:r>
-    </w:p>
-    <w:p>
-      <w:pPr>
-        <w:pStyle w:val="BodyText"/>
-      </w:pPr>
-      <w:r>
-        <w:t xml:space="preserve">The device costs $100-$400 and needs to be installed by an electrician. Here are some options: https://www.popularmechanics.com/home/interior-projects/g43140886/best-whole-house-surge-protectors/</w:t>
-      </w:r>
-    </w:p>
-    <w:bookmarkEnd w:id="56"/>
-    <w:bookmarkStart w:id="57" w:name="diy-air-sealing"/>
-    <w:p>
-      <w:pPr>
-        <w:pStyle w:val="Heading3"/>
-      </w:pPr>
-      <w:r>
-        <w:t xml:space="preserve">4.16 DIY Air Sealing</w:t>
-      </w:r>
-    </w:p>
-    <w:p>
-      <w:pPr>
-        <w:pStyle w:val="FirstParagraph"/>
-      </w:pPr>
-      <w:r>
-        <w:rPr>
-          <w:i/>
-          <w:iCs/>
-        </w:rPr>
-        <w:t xml:space="preserve">Problem</w:t>
-      </w:r>
-    </w:p>
-    <w:p>
-      <w:pPr>
-        <w:pStyle w:val="BodyText"/>
-      </w:pPr>
-      <w:r>
-        <w:t xml:space="preserve">During the blower door test, we noted sources of air leakage in the living areas of your house.</w:t>
-      </w:r>
-    </w:p>
-    <w:p>
-      <w:pPr>
-        <w:pStyle w:val="BodyText"/>
-      </w:pPr>
-      <w:r>
-        <w:rPr>
-          <w:b/>
-          <w:bCs/>
-        </w:rPr>
-        <w:t xml:space="preserve">Auditor to detail customized findings.</w:t>
-      </w:r>
-      <w:r>
-        <w:rPr>
-          <w:b/>
-          <w:bCs/>
-        </w:rPr>
-        <w:t xml:space="preserve"> </w:t>
-      </w:r>
-    </w:p>
-    <w:p>
-      <w:pPr>
-        <w:pStyle w:val="BodyText"/>
-      </w:pPr>
-      <w:r>
-        <w:rPr>
-          <w:i/>
-          <w:iCs/>
-        </w:rPr>
-        <w:t xml:space="preserve">Recommendation</w:t>
-      </w:r>
-    </w:p>
-    <w:p>
-      <w:pPr>
-        <w:pStyle w:val="BodyText"/>
-      </w:pPr>
-      <w:r>
-        <w:t xml:space="preserve">Air sealing the air leaks we identified around the living areas of your house can be a DIY solution to lower energy use, or an insulation contractor can seal the leaks when they come to your house for a larger project. Please address any moisture concerns before undertaking significant air sealing efforts.</w:t>
-      </w:r>
-    </w:p>
-    <w:p>
-      <w:pPr>
-        <w:pStyle w:val="BodyText"/>
-      </w:pPr>
-      <w:r>
-        <w:rPr>
-          <w:i/>
-          <w:iCs/>
-        </w:rPr>
-        <w:t xml:space="preserve">Estimated Cost/Benefits/Incentives</w:t>
-      </w:r>
-    </w:p>
-    <w:p>
-      <w:pPr>
-        <w:pStyle w:val="BodyText"/>
-      </w:pPr>
-      <w:r>
-        <w:t xml:space="preserve">Air sealing and insulating ductwork is eligible for a non-refundable federal tax credit (</w:t>
-      </w:r>
-      <w:r>
-        <w:t xml:space="preserve">“Energy Efficient Home Improvement Credit”</w:t>
-      </w:r>
-      <w:r>
-        <w:t xml:space="preserve">), which can pay for 30% of the project cost, subject to an annual maximum of $1,200 (shared with other home envelope improvements, like attic and basement projects).</w:t>
-      </w:r>
-    </w:p>
-    <w:bookmarkEnd w:id="57"/>
-    <w:bookmarkStart w:id="58" w:name="other-1"/>
-    <w:p>
-      <w:pPr>
-        <w:pStyle w:val="Heading3"/>
-      </w:pPr>
-      <w:r>
-        <w:t xml:space="preserve">4.17 Other 1</w:t>
-      </w:r>
-    </w:p>
-    <w:p>
-      <w:pPr>
-        <w:pStyle w:val="FirstParagraph"/>
-      </w:pPr>
-      <w:r>
-        <w:rPr>
-          <w:i/>
-          <w:iCs/>
-        </w:rPr>
-        <w:t xml:space="preserve">Problem</w:t>
-      </w:r>
-    </w:p>
-    <w:p>
-      <w:pPr>
-        <w:pStyle w:val="BodyText"/>
-      </w:pPr>
-      <w:r>
-        <w:rPr>
-          <w:i/>
-          <w:iCs/>
-        </w:rPr>
-        <w:t xml:space="preserve">Recommendation</w:t>
-      </w:r>
-    </w:p>
-    <w:p>
-      <w:pPr>
-        <w:pStyle w:val="BodyText"/>
-      </w:pPr>
-      <w:r>
-        <w:t xml:space="preserve">Upgrade your electrical panel to add whole-house surge protection. This will help to protect your heat pumps, heat pump water heater, refrigerator, well pump, and other electronics from damage due to lightning or other electrical surges.</w:t>
-      </w:r>
-    </w:p>
-    <w:p>
-      <w:pPr>
-        <w:pStyle w:val="BodyText"/>
-      </w:pPr>
-      <w:r>
-        <w:rPr>
-          <w:i/>
-          <w:iCs/>
-        </w:rPr>
-        <w:t xml:space="preserve">Estimated Cost/Benefits/Incentives</w:t>
-      </w:r>
-    </w:p>
-    <w:p>
-      <w:pPr>
-        <w:pStyle w:val="BodyText"/>
-      </w:pPr>
-      <w:r>
-        <w:rPr>
-          <w:b/>
-          <w:bCs/>
-        </w:rPr>
-        <w:t xml:space="preserve">Auditor to describe. Primary residence</w:t>
-      </w:r>
-    </w:p>
-    <w:p>
-      <w:pPr>
-        <w:pStyle w:val="SourceCode"/>
-      </w:pPr>
-      <w:r>
-        <w:rPr>
-          <w:rStyle w:val="NormalTok"/>
-        </w:rPr>
-        <w:t xml:space="preserve"> </w:t>
-      </w:r>
-      <w:r>
-        <w:rPr>
-          <w:rStyle w:val="CommentTok"/>
-        </w:rPr>
-        <w:t xml:space="preserve">#| label: other 3 recommendation</w:t>
-      </w:r>
-      <w:r>
-        <w:br/>
-      </w:r>
-      <w:r>
-        <w:rPr>
-          <w:rStyle w:val="NormalTok"/>
-        </w:rPr>
-        <w:t xml:space="preserve"> </w:t>
-      </w:r>
-      <w:r>
-        <w:rPr>
-          <w:rStyle w:val="CommentTok"/>
-        </w:rPr>
-        <w:t xml:space="preserve">#| echo: false</w:t>
-      </w:r>
-      <w:r>
-        <w:br/>
-      </w:r>
-      <w:r>
-        <w:rPr>
-          <w:rStyle w:val="NormalTok"/>
-        </w:rPr>
-        <w:t xml:space="preserve"> </w:t>
-      </w:r>
-      <w:r>
-        <w:rPr>
-          <w:rStyle w:val="CommentTok"/>
-        </w:rPr>
-        <w:t xml:space="preserve">#| results: asis</w:t>
-      </w:r>
-      <w:r>
-        <w:br/>
-      </w:r>
-      <w:r>
-        <w:br/>
-      </w:r>
-      <w:r>
-        <w:br/>
-      </w:r>
-      <w:r>
-        <w:rPr>
-          <w:rStyle w:val="ControlFlowTok"/>
-        </w:rPr>
-        <w:t xml:space="preserve">if</w:t>
-      </w:r>
-      <w:r>
-        <w:rPr>
-          <w:rStyle w:val="NormalTok"/>
-        </w:rPr>
-        <w:t xml:space="preserve">( other_3 </w:t>
-      </w:r>
-      <w:r>
-        <w:rPr>
-          <w:rStyle w:val="SpecialCharTok"/>
-        </w:rPr>
-        <w:t xml:space="preserve">==</w:t>
-      </w:r>
-      <w:r>
-        <w:rPr>
-          <w:rStyle w:val="NormalTok"/>
-        </w:rPr>
-        <w:t xml:space="preserve"> </w:t>
-      </w:r>
-      <w:r>
-        <w:rPr>
-          <w:rStyle w:val="ConstantTok"/>
-        </w:rPr>
-        <w:t xml:space="preserve">TRUE</w:t>
-      </w:r>
-      <w:r>
-        <w:rPr>
-          <w:rStyle w:val="NormalTok"/>
-        </w:rPr>
-        <w:t xml:space="preserve">){</w:t>
-      </w:r>
-      <w:r>
-        <w:br/>
-      </w:r>
-      <w:r>
-        <w:rPr>
-          <w:rStyle w:val="NormalTok"/>
-        </w:rPr>
-        <w:t xml:space="preserve">  </w:t>
-      </w:r>
-      <w:r>
-        <w:rPr>
-          <w:rStyle w:val="FunctionTok"/>
-        </w:rPr>
-        <w:t xml:space="preserve">cat</w:t>
-      </w:r>
-      <w:r>
-        <w:rPr>
-          <w:rStyle w:val="NormalTok"/>
-        </w:rPr>
-        <w:t xml:space="preserve">(</w:t>
-      </w:r>
-      <w:r>
-        <w:rPr>
-          <w:rStyle w:val="StringTok"/>
-        </w:rPr>
-        <w:t xml:space="preserve">"### Other 3</w:t>
-      </w:r>
-      <w:r>
-        <w:br/>
-      </w:r>
-      <w:r>
-        <w:rPr>
-          <w:rStyle w:val="StringTok"/>
-        </w:rPr>
-        <w:t xml:space="preserve">  </w:t>
-      </w:r>
-      <w:r>
-        <w:br/>
-      </w:r>
-      <w:r>
-        <w:rPr>
-          <w:rStyle w:val="StringTok"/>
-        </w:rPr>
-        <w:t xml:space="preserve">*Problem*</w:t>
-      </w:r>
-      <w:r>
-        <w:br/>
-      </w:r>
-      <w:r>
-        <w:br/>
-      </w:r>
-      <w:r>
-        <w:rPr>
-          <w:rStyle w:val="StringTok"/>
-        </w:rPr>
-        <w:t xml:space="preserve">*Recommendation*</w:t>
-      </w:r>
-      <w:r>
-        <w:br/>
-      </w:r>
-      <w:r>
-        <w:br/>
-      </w:r>
-      <w:r>
-        <w:rPr>
-          <w:rStyle w:val="StringTok"/>
-        </w:rPr>
-        <w:t xml:space="preserve">"</w:t>
-      </w:r>
-      <w:r>
-        <w:rPr>
-          <w:rStyle w:val="NormalTok"/>
-        </w:rPr>
-        <w:t xml:space="preserve">)</w:t>
-      </w:r>
-      <w:r>
-        <w:br/>
-      </w:r>
-      <w:r>
-        <w:rPr>
-          <w:rStyle w:val="NormalTok"/>
-        </w:rPr>
+        <w:t xml:space="preserve">“)</w:t>
+      </w:r>
+      <w:r>
         <w:t xml:space="preserve">}</w:t>
       </w:r>
       <w:r>
-        <w:rPr>
-          <w:rStyle w:val="ControlFlowTok"/>
-        </w:rPr>
-        <w:t xml:space="preserve">else</w:t>
-      </w:r>
-      <w:r>
-        <w:rPr>
-          <w:rStyle w:val="NormalTok"/>
-        </w:rPr>
-        <w:t xml:space="preserve">{</w:t>
-      </w:r>
-      <w:r>
-        <w:br/>
-      </w:r>
-      <w:r>
-        <w:rPr>
-          <w:rStyle w:val="NormalTok"/>
-        </w:rPr>
-        <w:t xml:space="preserve">  </w:t>
-      </w:r>
-      <w:r>
-        <w:rPr>
-          <w:rStyle w:val="FunctionTok"/>
-        </w:rPr>
-        <w:t xml:space="preserve">cat</w:t>
-      </w:r>
-      <w:r>
-        <w:rPr>
-          <w:rStyle w:val="NormalTok"/>
-        </w:rPr>
-        <w:t xml:space="preserve">(</w:t>
-      </w:r>
-      <w:r>
-        <w:rPr>
-          <w:rStyle w:val="StringTok"/>
-        </w:rPr>
-        <w:t xml:space="preserve">""</w:t>
-      </w:r>
-      <w:r>
-        <w:rPr>
-          <w:rStyle w:val="NormalTok"/>
-        </w:rPr>
-        <w:t xml:space="preserve">)</w:t>
-      </w:r>
-      <w:r>
-        <w:br/>
-      </w:r>
-      <w:r>
-        <w:rPr>
-          <w:rStyle w:val="NormalTok"/>
-        </w:rPr>
-        <w:t xml:space="preserve">}</w:t>
-      </w:r>
-      <w:r>
-        <w:br/>
-      </w:r>
-      <w:r>
-        <w:br/>
-      </w:r>
-      <w:r>
-        <w:rPr>
-          <w:rStyle w:val="ControlFlowTok"/>
-        </w:rPr>
-        <w:t xml:space="preserve">if</w:t>
-      </w:r>
-      <w:r>
-        <w:rPr>
-          <w:rStyle w:val="NormalTok"/>
-        </w:rPr>
-        <w:t xml:space="preserve">(other_3 </w:t>
-      </w:r>
-      <w:r>
-        <w:rPr>
-          <w:rStyle w:val="SpecialCharTok"/>
-        </w:rPr>
-        <w:t xml:space="preserve">==</w:t>
-      </w:r>
-      <w:r>
-        <w:rPr>
-          <w:rStyle w:val="NormalTok"/>
-        </w:rPr>
-        <w:t xml:space="preserve"> </w:t>
-      </w:r>
-      <w:r>
-        <w:rPr>
-          <w:rStyle w:val="ConstantTok"/>
-        </w:rPr>
-        <w:t xml:space="preserve">TRUE</w:t>
-      </w:r>
-      <w:r>
-        <w:rPr>
-          <w:rStyle w:val="NormalTok"/>
-        </w:rPr>
-        <w:t xml:space="preserve">){</w:t>
-      </w:r>
-      <w:r>
-        <w:br/>
-      </w:r>
-      <w:r>
-        <w:rPr>
-          <w:rStyle w:val="NormalTok"/>
-        </w:rPr>
-        <w:t xml:space="preserve">  </w:t>
-      </w:r>
-      <w:r>
-        <w:rPr>
-          <w:rStyle w:val="FunctionTok"/>
-        </w:rPr>
-        <w:t xml:space="preserve">cat</w:t>
-      </w:r>
-      <w:r>
-        <w:rPr>
-          <w:rStyle w:val="NormalTok"/>
-        </w:rPr>
-        <w:t xml:space="preserve">(a_other_3</w:t>
-      </w:r>
-      <w:r>
-        <w:rPr>
-          <w:rStyle w:val="SpecialCharTok"/>
-        </w:rPr>
-        <w:t xml:space="preserve">$</w:t>
-      </w:r>
-      <w:r>
-        <w:rPr>
-          <w:rStyle w:val="NormalTok"/>
-        </w:rPr>
-        <w:t xml:space="preserve">Description</w:t>
-      </w:r>
-      <w:r>
-        <w:br/>
-      </w:r>
-      <w:r>
-        <w:rPr>
-          <w:rStyle w:val="NormalTok"/>
-        </w:rPr>
-        <w:t xml:space="preserve">    </w:t>
-      </w:r>
-      <w:r>
-        <w:br/>
-      </w:r>
-      <w:r>
-        <w:rPr>
-          <w:rStyle w:val="NormalTok"/>
-        </w:rPr>
-        <w:t xml:space="preserve">  )</w:t>
-      </w:r>
-      <w:r>
-        <w:br/>
-      </w:r>
-      <w:r>
-        <w:rPr>
-          <w:rStyle w:val="NormalTok"/>
-        </w:rPr>
-        <w:t xml:space="preserve">}</w:t>
-      </w:r>
-      <w:r>
-        <w:rPr>
-          <w:rStyle w:val="ControlFlowTok"/>
-        </w:rPr>
-        <w:t xml:space="preserve">else</w:t>
-      </w:r>
-      <w:r>
-        <w:rPr>
-          <w:rStyle w:val="NormalTok"/>
-        </w:rPr>
-        <w:t xml:space="preserve">{</w:t>
-      </w:r>
-      <w:r>
-        <w:br/>
-      </w:r>
-      <w:r>
-        <w:rPr>
-          <w:rStyle w:val="NormalTok"/>
-        </w:rPr>
-        <w:t xml:space="preserve">  </w:t>
-      </w:r>
-      <w:r>
-        <w:rPr>
-          <w:rStyle w:val="FunctionTok"/>
-        </w:rPr>
-        <w:t xml:space="preserve">cat</w:t>
-      </w:r>
-      <w:r>
-        <w:rPr>
-          <w:rStyle w:val="NormalTok"/>
-        </w:rPr>
-        <w:t xml:space="preserve">(</w:t>
-      </w:r>
-      <w:r>
-        <w:rPr>
-          <w:rStyle w:val="StringTok"/>
-        </w:rPr>
-        <w:t xml:space="preserve">""</w:t>
-      </w:r>
-      <w:r>
-        <w:rPr>
-          <w:rStyle w:val="NormalTok"/>
-        </w:rPr>
-        <w:t xml:space="preserve">)</w:t>
-      </w:r>
-      <w:r>
-        <w:br/>
-      </w:r>
-      <w:r>
-        <w:rPr>
-          <w:rStyle w:val="NormalTok"/>
-        </w:rPr>
-        <w:t xml:space="preserve">  }</w:t>
-      </w:r>
-      <w:r>
-        <w:br/>
-      </w:r>
-      <w:r>
-        <w:br/>
-      </w:r>
-      <w:r>
-        <w:rPr>
-          <w:rStyle w:val="ControlFlowTok"/>
-        </w:rPr>
-        <w:t xml:space="preserve">if</w:t>
-      </w:r>
-      <w:r>
-        <w:rPr>
-          <w:rStyle w:val="NormalTok"/>
-        </w:rPr>
-        <w:t xml:space="preserve">(other_3 </w:t>
-      </w:r>
-      <w:r>
-        <w:rPr>
-          <w:rStyle w:val="SpecialCharTok"/>
-        </w:rPr>
-        <w:t xml:space="preserve">==</w:t>
-      </w:r>
-      <w:r>
-        <w:rPr>
-          <w:rStyle w:val="NormalTok"/>
-        </w:rPr>
-        <w:t xml:space="preserve"> </w:t>
-      </w:r>
-      <w:r>
-        <w:rPr>
-          <w:rStyle w:val="ConstantTok"/>
-        </w:rPr>
-        <w:t xml:space="preserve">TRUE</w:t>
-      </w:r>
-      <w:r>
-        <w:rPr>
-          <w:rStyle w:val="NormalTok"/>
-        </w:rPr>
-        <w:t xml:space="preserve">){</w:t>
-      </w:r>
-      <w:r>
-        <w:br/>
-      </w:r>
-      <w:r>
-        <w:rPr>
-          <w:rStyle w:val="NormalTok"/>
-        </w:rPr>
-        <w:t xml:space="preserve">  </w:t>
-      </w:r>
-      <w:r>
-        <w:rPr>
-          <w:rStyle w:val="FunctionTok"/>
-        </w:rPr>
-        <w:t xml:space="preserve">cat</w:t>
-      </w:r>
-      <w:r>
-        <w:rPr>
-          <w:rStyle w:val="NormalTok"/>
-        </w:rPr>
-        <w:t xml:space="preserve">(</w:t>
-      </w:r>
-      <w:r>
-        <w:rPr>
-          <w:rStyle w:val="StringTok"/>
-        </w:rPr>
-        <w:t xml:space="preserve">"</w:t>
-      </w:r>
-      <w:r>
-        <w:br/>
-      </w:r>
-      <w:r>
-        <w:br/>
-      </w:r>
-      <w:r>
-        <w:rPr>
-          <w:rStyle w:val="StringTok"/>
-        </w:rPr>
-        <w:t xml:space="preserve">*Estimated Cost/Benefits/Incentives*</w:t>
-      </w:r>
-      <w:r>
-        <w:br/>
-      </w:r>
-      <w:r>
-        <w:br/>
-      </w:r>
-      <w:r>
-        <w:rPr>
-          <w:rStyle w:val="StringTok"/>
-        </w:rPr>
-        <w:t xml:space="preserve">"</w:t>
-      </w:r>
-      <w:r>
-        <w:rPr>
-          <w:rStyle w:val="NormalTok"/>
-        </w:rPr>
-        <w:t xml:space="preserve">, auto_other_3_estimates</w:t>
-      </w:r>
-      <w:r>
-        <w:rPr>
-          <w:rStyle w:val="SpecialCharTok"/>
-        </w:rPr>
-        <w:t xml:space="preserve">$</w:t>
-      </w:r>
-      <w:r>
-        <w:rPr>
-          <w:rStyle w:val="NormalTok"/>
-        </w:rPr>
-        <w:t xml:space="preserve">Description)</w:t>
-      </w:r>
-      <w:r>
-        <w:br/>
-      </w:r>
-      <w:r>
-        <w:rPr>
-          <w:rStyle w:val="NormalTok"/>
-        </w:rPr>
-        <w:t xml:space="preserve">}</w:t>
-      </w:r>
-      <w:r>
-        <w:rPr>
-          <w:rStyle w:val="ControlFlowTok"/>
-        </w:rPr>
-        <w:t xml:space="preserve">else</w:t>
-      </w:r>
-      <w:r>
-        <w:rPr>
-          <w:rStyle w:val="NormalTok"/>
-        </w:rPr>
-        <w:t xml:space="preserve">{</w:t>
-      </w:r>
-      <w:r>
-        <w:br/>
-      </w:r>
-      <w:r>
-        <w:rPr>
-          <w:rStyle w:val="NormalTok"/>
-        </w:rPr>
-        <w:t xml:space="preserve">  </w:t>
-      </w:r>
-      <w:r>
-        <w:rPr>
-          <w:rStyle w:val="FunctionTok"/>
-        </w:rPr>
-        <w:t xml:space="preserve">cat</w:t>
-      </w:r>
-      <w:r>
-        <w:rPr>
-          <w:rStyle w:val="NormalTok"/>
-        </w:rPr>
-        <w:t xml:space="preserve">(</w:t>
-      </w:r>
-      <w:r>
-        <w:rPr>
-          <w:rStyle w:val="StringTok"/>
-        </w:rPr>
-        <w:t xml:space="preserve">""</w:t>
-      </w:r>
-      <w:r>
-        <w:rPr>
-          <w:rStyle w:val="NormalTok"/>
-        </w:rPr>
-        <w:t xml:space="preserve">)</w:t>
-      </w:r>
-      <w:r>
-        <w:br/>
-      </w:r>
-      <w:r>
-        <w:rPr>
-          <w:rStyle w:val="NormalTok"/>
-        </w:rPr>
-        <w:t xml:space="preserve">  } </w:t>
-      </w:r>
-    </w:p>
-    <w:bookmarkEnd w:id="58"/>
-    <w:bookmarkStart w:id="59" w:name="misc.-air-sealing-and-insulation"/>
-    <w:p>
-      <w:pPr>
-        <w:pStyle w:val="Heading3"/>
-      </w:pPr>
-      <w:r>
-        <w:t xml:space="preserve">4.18 Misc. Air Sealing and Insulation</w:t>
-      </w:r>
-    </w:p>
-    <w:p>
-      <w:pPr>
-        <w:pStyle w:val="FirstParagraph"/>
-      </w:pPr>
-      <w:r>
-        <w:rPr>
-          <w:i/>
-          <w:iCs/>
-        </w:rPr>
-        <w:t xml:space="preserve">Problem</w:t>
-      </w:r>
-    </w:p>
-    <w:p>
-      <w:pPr>
-        <w:pStyle w:val="BodyText"/>
-      </w:pPr>
-      <w:r>
-        <w:rPr>
-          <w:b/>
-          <w:bCs/>
-        </w:rPr>
-        <w:t xml:space="preserve">Need a description for the problem</w:t>
-      </w:r>
-    </w:p>
-    <w:p>
-      <w:pPr>
-        <w:pStyle w:val="BodyText"/>
-      </w:pPr>
-      <w:r>
-        <w:rPr>
-          <w:i/>
-          <w:iCs/>
-        </w:rPr>
-        <w:t xml:space="preserve">Recommendation</w:t>
-      </w:r>
-    </w:p>
-    <w:p>
-      <w:pPr>
-        <w:pStyle w:val="BodyText"/>
-      </w:pPr>
-      <w:r>
-        <w:t xml:space="preserve">Air seal and insulate [** insert auditor description - bay window, bulkhead door, chase, kneewall, anything else that is unique to the home and not otherwise covered in another recommendation]</w:t>
-      </w:r>
-      <w:r>
-        <w:rPr>
-          <w:i/>
-          <w:iCs/>
-        </w:rPr>
-        <w:t xml:space="preserve">Estimated Costs/Benefits/Incentives</w:t>
-      </w:r>
-    </w:p>
-    <w:p>
-      <w:pPr>
-        <w:pStyle w:val="BodyText"/>
-      </w:pPr>
-      <w:r>
-        <w:t xml:space="preserve">As part of a larger insulation project, this work may be eligible for Efficiency Maine rebates and other incentives for insulation work, up to 80% of the overall cost to weatherize your home (subject to a lifetime limit per building).</w:t>
-      </w:r>
-    </w:p>
-    <w:bookmarkEnd w:id="59"/>
-    <w:bookmarkEnd w:id="60"/>
-    <w:bookmarkStart w:id="61" w:name="additional-resources"/>
-    <w:p>
-      <w:pPr>
-        <w:pStyle w:val="Heading2"/>
-      </w:pPr>
-      <w:r>
-        <w:t xml:space="preserve">5 Additional Resources</w:t>
-      </w:r>
-    </w:p>
-    <w:p>
-      <w:pPr>
-        <w:pStyle w:val="FirstParagraph"/>
-      </w:pPr>
-      <w:r>
-        <w:t xml:space="preserve">Many home efficiency upgrades are eligible for Efficiency Maine rebates and federal tax credits. Financial incentives vary based on income level and type of occupancy. An overview of all state rebates and federal tax credits can be found here: https://www.efficiencymaine.com/at-home/.</w:t>
-      </w:r>
-    </w:p>
-    <w:p>
-      <w:pPr>
-        <w:pStyle w:val="BodyText"/>
-      </w:pPr>
-      <w:r>
-        <w:t xml:space="preserve">You can search for Efficiency Maine registered contractors here: https://www.efficiencymaine.com/at-home/vendor-locator/.</w:t>
-      </w:r>
-    </w:p>
-    <w:p>
-      <w:pPr>
-        <w:pStyle w:val="BodyText"/>
-      </w:pPr>
-      <w:r>
-        <w:t xml:space="preserve">We recommend discussing a whole-home plan for insulation and air sealing work in the basement, walls, and attic with contractors to determine how to best sequence the work to take full advantage of the Efficiency Maine rebates (which are subject to lifetime maximums) and nonrefundable federal tax credits (which are subject to annual maximums).</w:t>
-      </w:r>
-    </w:p>
-    <w:p>
-      <w:pPr>
-        <w:pStyle w:val="BodyText"/>
-      </w:pPr>
-      <w:r>
-        <w:t xml:space="preserve">Efficiency Maine also offers home energy loans to help homeowners who are Maine residents pay for energy and related health and safety upgrades. There are no fees, and interest rates for multi-year loans are between 5.99% (max $7,500) and 7.99% (max $25,000), depending on income level. Low- and moderate-income homeowners who borrow the full $7,500 and pay it back over 10 years will pay a monthly cost of $83. There is also a 1-year, 0% APR option. To learn more or apply, call 866-376-2463 or visit https://www.efficiencymaine.com/home-energy-loans/</w:t>
-      </w:r>
-    </w:p>
-    <w:bookmarkEnd w:id="61"/>
-    <w:bookmarkStart w:id="80" w:name="section-four-tests"/>
-    <w:p>
-      <w:pPr>
-        <w:pStyle w:val="Heading2"/>
-      </w:pPr>
-      <w:r>
-        <w:t xml:space="preserve">6 Section Four Tests</w:t>
-      </w:r>
-    </w:p>
-    <w:bookmarkStart w:id="62" w:name="furnaceboiler-tune-up-1"/>
-    <w:p>
-      <w:pPr>
-        <w:pStyle w:val="Heading3"/>
-      </w:pPr>
-      <w:r>
-        <w:t xml:space="preserve">6.1 Furnace/Boiler Tune-up</w:t>
-      </w:r>
-    </w:p>
-    <w:bookmarkEnd w:id="62"/>
-    <w:bookmarkStart w:id="63" w:name="high-efficiency-shower-heads-1"/>
-    <w:p>
-      <w:pPr>
-        <w:pStyle w:val="Heading3"/>
-      </w:pPr>
-      <w:r>
-        <w:t xml:space="preserve">6.2 High-efficiency Shower Head(s)</w:t>
-      </w:r>
-    </w:p>
-    <w:bookmarkEnd w:id="63"/>
-    <w:bookmarkStart w:id="64" w:name="windowdressers"/>
-    <w:p>
-      <w:pPr>
-        <w:pStyle w:val="Heading3"/>
-      </w:pPr>
-      <w:r>
-        <w:t xml:space="preserve">6.3 WindowDressers</w:t>
-      </w:r>
-    </w:p>
-    <w:bookmarkEnd w:id="64"/>
-    <w:bookmarkStart w:id="65" w:name="freezer-1"/>
-    <w:p>
-      <w:pPr>
-        <w:pStyle w:val="Heading3"/>
-      </w:pPr>
-      <w:r>
-        <w:t xml:space="preserve">6.4 Freezer</w:t>
-      </w:r>
-    </w:p>
-    <w:bookmarkEnd w:id="65"/>
-    <w:bookmarkStart w:id="66" w:name="induction-stoveoven-1"/>
-    <w:p>
-      <w:pPr>
-        <w:pStyle w:val="Heading3"/>
-      </w:pPr>
-      <w:r>
-        <w:t xml:space="preserve">6.5 Induction Stove/Oven</w:t>
-      </w:r>
-    </w:p>
-    <w:bookmarkEnd w:id="66"/>
-    <w:bookmarkStart w:id="67" w:name="bathroom-exhaust-fans-1"/>
-    <w:p>
-      <w:pPr>
-        <w:pStyle w:val="Heading3"/>
-      </w:pPr>
-      <w:r>
-        <w:t xml:space="preserve">6.6 Bathroom Exhaust Fan(s)</w:t>
+        <w:t xml:space="preserve"># cat(”</w:t>
       </w:r>
     </w:p>
     <w:bookmarkEnd w:id="67"/>
-    <w:bookmarkStart w:id="68" w:name="kitchen-exhaust-fan"/>
-    <w:p>
-      <w:pPr>
-        <w:pStyle w:val="Heading3"/>
-      </w:pPr>
-      <w:r>
-        <w:t xml:space="preserve">6.7 Kitchen Exhaust Fan</w:t>
-      </w:r>
-    </w:p>
     <w:bookmarkEnd w:id="68"/>
-    <w:bookmarkStart w:id="69" w:name="vapor-barrier-1"/>
-    <w:p>
-      <w:pPr>
-        <w:pStyle w:val="Heading3"/>
-      </w:pPr>
-      <w:r>
-        <w:t xml:space="preserve">6.8 Vapor Barrier</w:t>
-      </w:r>
-    </w:p>
-    <w:bookmarkEnd w:id="69"/>
-    <w:bookmarkStart w:id="70" w:name="spray-foam-basementcrawlspace-walls"/>
-    <w:p>
-      <w:pPr>
-        <w:pStyle w:val="Heading3"/>
-      </w:pPr>
-      <w:r>
-        <w:t xml:space="preserve">6.9 Spray Foam Basement/Crawlspace Walls</w:t>
-      </w:r>
-    </w:p>
-    <w:bookmarkEnd w:id="70"/>
-    <w:bookmarkStart w:id="71" w:name="attic-air-sealing-and-insulation"/>
-    <w:p>
-      <w:pPr>
-        <w:pStyle w:val="Heading3"/>
-      </w:pPr>
-      <w:r>
-        <w:t xml:space="preserve">6.10 Attic Air Sealing and Insulation</w:t>
-      </w:r>
-    </w:p>
-    <w:bookmarkEnd w:id="71"/>
-    <w:bookmarkStart w:id="72" w:name="blown-in-cellulose-wall-insulation"/>
-    <w:p>
-      <w:pPr>
-        <w:pStyle w:val="Heading3"/>
-      </w:pPr>
-      <w:r>
-        <w:t xml:space="preserve">6.11 Blown-in Cellulose Wall Insulation</w:t>
-      </w:r>
-    </w:p>
-    <w:bookmarkEnd w:id="72"/>
-    <w:bookmarkStart w:id="73" w:name="continuous-exterior-wall-insulation-1"/>
-    <w:p>
-      <w:pPr>
-        <w:pStyle w:val="Heading3"/>
-      </w:pPr>
-      <w:r>
-        <w:t xml:space="preserve">6.12 Continuous Exterior Wall Insulation</w:t>
-      </w:r>
-    </w:p>
-    <w:bookmarkEnd w:id="73"/>
-    <w:bookmarkStart w:id="74" w:name="electrical-panel-upgrade-1"/>
-    <w:p>
-      <w:pPr>
-        <w:pStyle w:val="Heading3"/>
-      </w:pPr>
-      <w:r>
-        <w:t xml:space="preserve">6.13 Electrical Panel Upgrade</w:t>
-      </w:r>
-    </w:p>
-    <w:bookmarkEnd w:id="74"/>
-    <w:bookmarkStart w:id="75" w:name="whole-house-surge-protection-1"/>
-    <w:p>
-      <w:pPr>
-        <w:pStyle w:val="Heading3"/>
-      </w:pPr>
-      <w:r>
-        <w:t xml:space="preserve">6.14 Whole-House Surge Protection</w:t>
-      </w:r>
-    </w:p>
-    <w:bookmarkEnd w:id="75"/>
-    <w:bookmarkStart w:id="76" w:name="pipe-insulation-1"/>
-    <w:p>
-      <w:pPr>
-        <w:pStyle w:val="Heading3"/>
-      </w:pPr>
-      <w:r>
-        <w:t xml:space="preserve">6.15 Pipe Insulation</w:t>
-      </w:r>
-    </w:p>
-    <w:bookmarkEnd w:id="76"/>
-    <w:bookmarkStart w:id="77" w:name="diy-air-sealing-1"/>
-    <w:p>
-      <w:pPr>
-        <w:pStyle w:val="Heading3"/>
-      </w:pPr>
-      <w:r>
-        <w:t xml:space="preserve">6.16 DIY Air Sealing</w:t>
-      </w:r>
-    </w:p>
-    <w:bookmarkEnd w:id="77"/>
-    <w:bookmarkStart w:id="78" w:name="other-1-1"/>
-    <w:p>
-      <w:pPr>
-        <w:pStyle w:val="Heading3"/>
-      </w:pPr>
-      <w:r>
-        <w:t xml:space="preserve">6.17 Other 1</w:t>
-      </w:r>
-    </w:p>
-    <w:bookmarkEnd w:id="78"/>
-    <w:bookmarkStart w:id="79" w:name="misc.-air-sealing-and-insulation-1"/>
-    <w:p>
-      <w:pPr>
-        <w:pStyle w:val="Heading3"/>
-      </w:pPr>
-      <w:r>
-        <w:t xml:space="preserve">6.18 Misc. Air Sealing and Insulation</w:t>
-      </w:r>
-    </w:p>
-    <w:p>
-      <w:pPr>
-        <w:pStyle w:val="FirstParagraph"/>
-      </w:pPr>
-      <w:r>
-        <w:t xml:space="preserve">[1]</w:t>
-      </w:r>
-      <w:r>
-        <w:t xml:space="preserve"> </w:t>
-      </w:r>
-      <w:r>
-        <w:t xml:space="preserve">“)</w:t>
-      </w:r>
-      <w:r>
-        <w:t xml:space="preserve">}</w:t>
-      </w:r>
-      <w:r>
-        <w:t xml:space="preserve"># cat(”</w:t>
-      </w:r>
-    </w:p>
-    <w:bookmarkEnd w:id="79"/>
-    <w:bookmarkEnd w:id="80"/>
     <w:sectPr>
       <w:footerReference r:id="rId9" w:type="default"/>
       <w:pgSz w:h="15840" w:w="12240"/>

</xml_diff>

<commit_message>
Render Ladies Aid audit report
</commit_message>
<xml_diff>
--- a/Quarto_report/Audit_Report.docx
+++ b/Quarto_report/Audit_Report.docx
@@ -15,15 +15,15 @@
         <w:pStyle w:val="FirstParagraph"/>
       </w:pPr>
       <w:r>
-        <w:t xml:space="preserve">Homeowner(s): Judi Lim</w:t>
-      </w:r>
-    </w:p>
-    <w:p>
-      <w:pPr>
-        <w:pStyle w:val="BodyText"/>
-      </w:pPr>
-      <w:r>
-        <w:t xml:space="preserve">Address: 443 Cranberry Road, Cranberry Isles, 04625</w:t>
+        <w:t xml:space="preserve">Homeowner(s): Ladies Aid, Barbara Myers</w:t>
+      </w:r>
+    </w:p>
+    <w:p>
+      <w:pPr>
+        <w:pStyle w:val="BodyText"/>
+      </w:pPr>
+      <w:r>
+        <w:t xml:space="preserve">Address: 177 Cranberry Rd, Cranberry Isles Maine, 04625</w:t>
       </w:r>
     </w:p>
     <w:p>
@@ -39,7 +39,7 @@
         <w:pStyle w:val="BodyText"/>
       </w:pPr>
       <w:r>
-        <w:t xml:space="preserve">Auditors: Uriel Orozco Brenes, Zoe Duni</w:t>
+        <w:t xml:space="preserve">Auditors: Adler Garner, Emerson Bedell, Helen Lloyd, Nicole Grohoski, Zoe Duni</w:t>
       </w:r>
     </w:p>
     <w:p>
@@ -55,7 +55,7 @@
         <w:pStyle w:val="BodyText"/>
       </w:pPr>
       <w:r>
-        <w:t xml:space="preserve">Report Date: June 25, 2025</w:t>
+        <w:t xml:space="preserve">Report Date: June 26, 2025</w:t>
       </w:r>
     </w:p>
     <w:p>
@@ -70,7 +70,7 @@
         <w:pStyle w:val="FirstParagraph"/>
       </w:pPr>
       <w:r>
-        <w:t xml:space="preserve">We conducted an energy assessment of your home on 7/30/2024. This report will tell you what we did, what we found, and what we suggest for your home. These suggestions include information on incentives and financing to make improvements more affordable.</w:t>
+        <w:t xml:space="preserve">We conducted an energy assessment of your home on 5/26/2024. This report will tell you what we did, what we found, and what we suggest for your home. These suggestions include information on incentives and financing to make improvements more affordable.</w:t>
       </w:r>
     </w:p>
     <w:p>
@@ -234,7 +234,7 @@
         <w:pStyle w:val="FirstParagraph"/>
       </w:pPr>
       <w:r>
-        <w:t xml:space="preserve">We assessed combustion appliances that burn fossil fuels such as propane, heating oil, or kerosene. These include furnaces, boilers, water heaters, and gas ovens. We visually inspected the combustion appliance(s) in your home, but we were unable to perform combustion safety tests.</w:t>
+        <w:t xml:space="preserve">We assessed combustion appliances that burn fossil fuels such as propane, heating oil, or kerosene. These include furnaces, boilers, water heaters, and gas ovens. We visually inspected the combustion appliance(s) in your home, but we were unable to perform combustion safety tests. We also performed gas leak detection tests on your propane appliance(s).</w:t>
       </w:r>
     </w:p>
     <w:bookmarkEnd w:id="27"/>
@@ -344,31 +344,31 @@
                 <w:rFonts w:ascii="Calibri" w:hAnsi="Calibri"/>
                 <w:sz w:val="20"/>
               </w:rPr>
-              <w:t xml:space="default">WindowDressers</w:t>
-            </w:r>
-          </w:p>
-        </w:tc>
-        <w:tc>
-          <w:tcPr>
-            <w:tcBorders>
-              <w:top w:val="single" w:space="0" w:color="D3D3D3"/>
-              <w:bottom w:val="single" w:space="0" w:color="D3D3D3"/>
-              <w:start w:val="single" w:space="0" w:color="D3D3D3"/>
-              <w:end w:val="single" w:space="0" w:color="D3D3D3"/>
-            </w:tcBorders>
-          </w:tcPr>
-          <w:p>
-            <w:pPr>
-              <w:spacing w:before="0" w:after="60"/>
-              <w:keepNext/>
-              <w:jc w:val="start"/>
-            </w:pPr>
-            <w:r>
-              <w:rPr>
-                <w:rFonts w:ascii="Calibri" w:hAnsi="Calibri"/>
-                <w:sz w:val="20"/>
-              </w:rPr>
-              <w:t xml:space="default">WindowDressers are insulating window inserts that help air-seal windows and reduce heat loss and gain.</w:t>
+              <w:t xml:space="default">Attic Air Sealing and Insulation</w:t>
+            </w:r>
+          </w:p>
+        </w:tc>
+        <w:tc>
+          <w:tcPr>
+            <w:tcBorders>
+              <w:top w:val="single" w:space="0" w:color="D3D3D3"/>
+              <w:bottom w:val="single" w:space="0" w:color="D3D3D3"/>
+              <w:start w:val="single" w:space="0" w:color="D3D3D3"/>
+              <w:end w:val="single" w:space="0" w:color="D3D3D3"/>
+            </w:tcBorders>
+          </w:tcPr>
+          <w:p>
+            <w:pPr>
+              <w:spacing w:before="0" w:after="60"/>
+              <w:keepNext/>
+              <w:jc w:val="start"/>
+            </w:pPr>
+            <w:r>
+              <w:rPr>
+                <w:rFonts w:ascii="Calibri" w:hAnsi="Calibri"/>
+                <w:sz w:val="20"/>
+              </w:rPr>
+              <w:t xml:space="default">Air seal the attic and insulate it to at least R-60 (18 inches of loose-fill cellulose insulation).</w:t>
             </w:r>
           </w:p>
         </w:tc>
@@ -397,31 +397,31 @@
                 <w:rFonts w:ascii="Calibri" w:hAnsi="Calibri"/>
                 <w:sz w:val="20"/>
               </w:rPr>
-              <w:t xml:space="default">LEDs</w:t>
-            </w:r>
-          </w:p>
-        </w:tc>
-        <w:tc>
-          <w:tcPr>
-            <w:tcBorders>
-              <w:top w:val="single" w:space="0" w:color="D3D3D3"/>
-              <w:bottom w:val="single" w:space="0" w:color="D3D3D3"/>
-              <w:start w:val="single" w:space="0" w:color="D3D3D3"/>
-              <w:end w:val="single" w:space="0" w:color="D3D3D3"/>
-            </w:tcBorders>
-          </w:tcPr>
-          <w:p>
-            <w:pPr>
-              <w:spacing w:before="0" w:after="60"/>
-              <w:keepNext/>
-              <w:jc w:val="start"/>
-            </w:pPr>
-            <w:r>
-              <w:rPr>
-                <w:rFonts w:ascii="Calibri" w:hAnsi="Calibri"/>
-                <w:sz w:val="20"/>
-              </w:rPr>
-              <w:t xml:space="default">Switch your light bulbs to LED light bulbs. LEDs use 80% less energy than incandescent light bulbs which can significantly reduce your electricity bill.</w:t>
+              <w:t xml:space="default">Blown-in Cellulose Wall Insulation</w:t>
+            </w:r>
+          </w:p>
+        </w:tc>
+        <w:tc>
+          <w:tcPr>
+            <w:tcBorders>
+              <w:top w:val="single" w:space="0" w:color="D3D3D3"/>
+              <w:bottom w:val="single" w:space="0" w:color="D3D3D3"/>
+              <w:start w:val="single" w:space="0" w:color="D3D3D3"/>
+              <w:end w:val="single" w:space="0" w:color="D3D3D3"/>
+            </w:tcBorders>
+          </w:tcPr>
+          <w:p>
+            <w:pPr>
+              <w:spacing w:before="0" w:after="60"/>
+              <w:keepNext/>
+              <w:jc w:val="start"/>
+            </w:pPr>
+            <w:r>
+              <w:rPr>
+                <w:rFonts w:ascii="Calibri" w:hAnsi="Calibri"/>
+                <w:sz w:val="20"/>
+              </w:rPr>
+              <w:t xml:space="default">Insulate the wall stud cavities with dense packed, blown-in cellulose insulation.</w:t>
             </w:r>
           </w:p>
         </w:tc>
@@ -450,31 +450,31 @@
                 <w:rFonts w:ascii="Calibri" w:hAnsi="Calibri"/>
                 <w:sz w:val="20"/>
               </w:rPr>
-              <w:t xml:space="default">High-efficiency Shower Head(s)</w:t>
-            </w:r>
-          </w:p>
-        </w:tc>
-        <w:tc>
-          <w:tcPr>
-            <w:tcBorders>
-              <w:top w:val="single" w:space="0" w:color="D3D3D3"/>
-              <w:bottom w:val="single" w:space="0" w:color="D3D3D3"/>
-              <w:start w:val="single" w:space="0" w:color="D3D3D3"/>
-              <w:end w:val="single" w:space="0" w:color="D3D3D3"/>
-            </w:tcBorders>
-          </w:tcPr>
-          <w:p>
-            <w:pPr>
-              <w:spacing w:before="0" w:after="60"/>
-              <w:keepNext/>
-              <w:jc w:val="start"/>
-            </w:pPr>
-            <w:r>
-              <w:rPr>
-                <w:rFonts w:ascii="Calibri" w:hAnsi="Calibri"/>
-                <w:sz w:val="20"/>
-              </w:rPr>
-              <w:t xml:space="default">Install high-efficiency shower heads to reduce the amount of water and energy to heat the water used when showering.</w:t>
+              <w:t xml:space="default">Gutters</w:t>
+            </w:r>
+          </w:p>
+        </w:tc>
+        <w:tc>
+          <w:tcPr>
+            <w:tcBorders>
+              <w:top w:val="single" w:space="0" w:color="D3D3D3"/>
+              <w:bottom w:val="single" w:space="0" w:color="D3D3D3"/>
+              <w:start w:val="single" w:space="0" w:color="D3D3D3"/>
+              <w:end w:val="single" w:space="0" w:color="D3D3D3"/>
+            </w:tcBorders>
+          </w:tcPr>
+          <w:p>
+            <w:pPr>
+              <w:spacing w:before="0" w:after="60"/>
+              <w:keepNext/>
+              <w:jc w:val="start"/>
+            </w:pPr>
+            <w:r>
+              <w:rPr>
+                <w:rFonts w:ascii="Calibri" w:hAnsi="Calibri"/>
+                <w:sz w:val="20"/>
+              </w:rPr>
+              <w:t xml:space="default">Install gutters and downspouts that divert water at least six feet away from the foundation and to where the ground slopes away from the house.</w:t>
             </w:r>
           </w:p>
         </w:tc>
@@ -503,31 +503,31 @@
                 <w:rFonts w:ascii="Calibri" w:hAnsi="Calibri"/>
                 <w:sz w:val="20"/>
               </w:rPr>
-              <w:t xml:space="default">Gutters</w:t>
-            </w:r>
-          </w:p>
-        </w:tc>
-        <w:tc>
-          <w:tcPr>
-            <w:tcBorders>
-              <w:top w:val="single" w:space="0" w:color="D3D3D3"/>
-              <w:bottom w:val="single" w:space="0" w:color="D3D3D3"/>
-              <w:start w:val="single" w:space="0" w:color="D3D3D3"/>
-              <w:end w:val="single" w:space="0" w:color="D3D3D3"/>
-            </w:tcBorders>
-          </w:tcPr>
-          <w:p>
-            <w:pPr>
-              <w:spacing w:before="0" w:after="60"/>
-              <w:keepNext/>
-              <w:jc w:val="start"/>
-            </w:pPr>
-            <w:r>
-              <w:rPr>
-                <w:rFonts w:ascii="Calibri" w:hAnsi="Calibri"/>
-                <w:sz w:val="20"/>
-              </w:rPr>
-              <w:t xml:space="default">Install gutters and downspouts that divert water at least six feet away from the foundation and to where the ground slopes away from the house.</w:t>
+              <w:t xml:space="default">WindowDressers</w:t>
+            </w:r>
+          </w:p>
+        </w:tc>
+        <w:tc>
+          <w:tcPr>
+            <w:tcBorders>
+              <w:top w:val="single" w:space="0" w:color="D3D3D3"/>
+              <w:bottom w:val="single" w:space="0" w:color="D3D3D3"/>
+              <w:start w:val="single" w:space="0" w:color="D3D3D3"/>
+              <w:end w:val="single" w:space="0" w:color="D3D3D3"/>
+            </w:tcBorders>
+          </w:tcPr>
+          <w:p>
+            <w:pPr>
+              <w:spacing w:before="0" w:after="60"/>
+              <w:keepNext/>
+              <w:jc w:val="start"/>
+            </w:pPr>
+            <w:r>
+              <w:rPr>
+                <w:rFonts w:ascii="Calibri" w:hAnsi="Calibri"/>
+                <w:sz w:val="20"/>
+              </w:rPr>
+              <w:t xml:space="default">WindowDressers are insulating window inserts that help air-seal windows and reduce heat loss and gain.</w:t>
             </w:r>
           </w:p>
         </w:tc>
@@ -556,31 +556,31 @@
                 <w:rFonts w:ascii="Calibri" w:hAnsi="Calibri"/>
                 <w:sz w:val="20"/>
               </w:rPr>
-              <w:t xml:space="default">Bathroom Exhaust Fan(s)</w:t>
-            </w:r>
-          </w:p>
-        </w:tc>
-        <w:tc>
-          <w:tcPr>
-            <w:tcBorders>
-              <w:top w:val="single" w:space="0" w:color="D3D3D3"/>
-              <w:bottom w:val="single" w:space="0" w:color="D3D3D3"/>
-              <w:start w:val="single" w:space="0" w:color="D3D3D3"/>
-              <w:end w:val="single" w:space="0" w:color="D3D3D3"/>
-            </w:tcBorders>
-          </w:tcPr>
-          <w:p>
-            <w:pPr>
-              <w:spacing w:before="0" w:after="60"/>
-              <w:keepNext/>
-              <w:jc w:val="start"/>
-            </w:pPr>
-            <w:r>
-              <w:rPr>
-                <w:rFonts w:ascii="Calibri" w:hAnsi="Calibri"/>
-                <w:sz w:val="20"/>
-              </w:rPr>
-              <w:t xml:space="default">Install bathroom exhaust fans in all bathrooms that do not have them. These should be rated for at least 80 cubic feet per minute (CFM) if there is a shower. We recommend the Panasonic Whisper series or similar fans that don’t create excess noise.</w:t>
+              <w:t xml:space="default">Electrical Panel Upgrade</w:t>
+            </w:r>
+          </w:p>
+        </w:tc>
+        <w:tc>
+          <w:tcPr>
+            <w:tcBorders>
+              <w:top w:val="single" w:space="0" w:color="D3D3D3"/>
+              <w:bottom w:val="single" w:space="0" w:color="D3D3D3"/>
+              <w:start w:val="single" w:space="0" w:color="D3D3D3"/>
+              <w:end w:val="single" w:space="0" w:color="D3D3D3"/>
+            </w:tcBorders>
+          </w:tcPr>
+          <w:p>
+            <w:pPr>
+              <w:spacing w:before="0" w:after="60"/>
+              <w:keepNext/>
+              <w:jc w:val="start"/>
+            </w:pPr>
+            <w:r>
+              <w:rPr>
+                <w:rFonts w:ascii="Calibri" w:hAnsi="Calibri"/>
+                <w:sz w:val="20"/>
+              </w:rPr>
+              <w:t xml:space="default">Consult with an electrician about replacing your existing electrical panel with a 200 amp panel as you add electrical appliances to your home.</w:t>
             </w:r>
           </w:p>
         </w:tc>
@@ -609,31 +609,31 @@
                 <w:rFonts w:ascii="Calibri" w:hAnsi="Calibri"/>
                 <w:sz w:val="20"/>
               </w:rPr>
-              <w:t xml:space="default">Kitchen Exhaust Fan</w:t>
-            </w:r>
-          </w:p>
-        </w:tc>
-        <w:tc>
-          <w:tcPr>
-            <w:tcBorders>
-              <w:top w:val="single" w:space="0" w:color="D3D3D3"/>
-              <w:bottom w:val="single" w:space="0" w:color="D3D3D3"/>
-              <w:start w:val="single" w:space="0" w:color="D3D3D3"/>
-              <w:end w:val="single" w:space="0" w:color="D3D3D3"/>
-            </w:tcBorders>
-          </w:tcPr>
-          <w:p>
-            <w:pPr>
-              <w:spacing w:before="0" w:after="60"/>
-              <w:keepNext/>
-              <w:jc w:val="start"/>
-            </w:pPr>
-            <w:r>
-              <w:rPr>
-                <w:rFonts w:ascii="Calibri" w:hAnsi="Calibri"/>
-                <w:sz w:val="20"/>
-              </w:rPr>
-              <w:t xml:space="default">Install a kitchen exhaust fan to remove cooking fumes and moisture from your home. The fan should be rated for at least 100 cubic feet per minute. A kitchen fan should be ducted to the outdoors. If the ductwork will run through the attic, it should be installed before the attic is air-sealed and insulated.</w:t>
+              <w:t xml:space="default">Air Source Heat Pump</w:t>
+            </w:r>
+          </w:p>
+        </w:tc>
+        <w:tc>
+          <w:tcPr>
+            <w:tcBorders>
+              <w:top w:val="single" w:space="0" w:color="D3D3D3"/>
+              <w:bottom w:val="single" w:space="0" w:color="D3D3D3"/>
+              <w:start w:val="single" w:space="0" w:color="D3D3D3"/>
+              <w:end w:val="single" w:space="0" w:color="D3D3D3"/>
+            </w:tcBorders>
+          </w:tcPr>
+          <w:p>
+            <w:pPr>
+              <w:spacing w:before="0" w:after="60"/>
+              <w:keepNext/>
+              <w:jc w:val="start"/>
+            </w:pPr>
+            <w:r>
+              <w:rPr>
+                <w:rFonts w:ascii="Calibri" w:hAnsi="Calibri"/>
+                <w:sz w:val="20"/>
+              </w:rPr>
+              <w:t xml:space="default">Install air source heat pumps for heating and cooling and whole-house surge protection.</w:t>
             </w:r>
           </w:p>
         </w:tc>
@@ -662,31 +662,31 @@
                 <w:rFonts w:ascii="Calibri" w:hAnsi="Calibri"/>
                 <w:sz w:val="20"/>
               </w:rPr>
-              <w:t xml:space="default">Induction Stove/Oven</w:t>
-            </w:r>
-          </w:p>
-        </w:tc>
-        <w:tc>
-          <w:tcPr>
-            <w:tcBorders>
-              <w:top w:val="single" w:space="0" w:color="D3D3D3"/>
-              <w:bottom w:val="single" w:space="0" w:color="D3D3D3"/>
-              <w:start w:val="single" w:space="0" w:color="D3D3D3"/>
-              <w:end w:val="single" w:space="0" w:color="D3D3D3"/>
-            </w:tcBorders>
-          </w:tcPr>
-          <w:p>
-            <w:pPr>
-              <w:spacing w:before="0" w:after="60"/>
-              <w:keepNext/>
-              <w:jc w:val="start"/>
-            </w:pPr>
-            <w:r>
-              <w:rPr>
-                <w:rFonts w:ascii="Calibri" w:hAnsi="Calibri"/>
-                <w:sz w:val="20"/>
-              </w:rPr>
-              <w:t xml:space="default">Induction cooking appliances are more efficient and safer than electric or gas ones. There is no risk of carbon monoxide or other harmful combustion gases, and the surface doesn’t heat up without a pot or pan on it.</w:t>
+              <w:t xml:space="default">Continuous Exterior Wall Insulation</w:t>
+            </w:r>
+          </w:p>
+        </w:tc>
+        <w:tc>
+          <w:tcPr>
+            <w:tcBorders>
+              <w:top w:val="single" w:space="0" w:color="D3D3D3"/>
+              <w:bottom w:val="single" w:space="0" w:color="D3D3D3"/>
+              <w:start w:val="single" w:space="0" w:color="D3D3D3"/>
+              <w:end w:val="single" w:space="0" w:color="D3D3D3"/>
+            </w:tcBorders>
+          </w:tcPr>
+          <w:p>
+            <w:pPr>
+              <w:spacing w:before="0" w:after="60"/>
+              <w:keepNext/>
+              <w:jc w:val="start"/>
+            </w:pPr>
+            <w:r>
+              <w:rPr>
+                <w:rFonts w:ascii="Calibri" w:hAnsi="Calibri"/>
+                <w:sz w:val="20"/>
+              </w:rPr>
+              <w:t xml:space="default">Add a continuous layer of insulation and potentially replace the air and moisture barrier once it becomes time to replace the siding.</w:t>
             </w:r>
           </w:p>
         </w:tc>
@@ -715,31 +715,31 @@
                 <w:rFonts w:ascii="Calibri" w:hAnsi="Calibri"/>
                 <w:sz w:val="20"/>
               </w:rPr>
-              <w:t xml:space="default">Attic Air Sealing and Insulation</w:t>
-            </w:r>
-          </w:p>
-        </w:tc>
-        <w:tc>
-          <w:tcPr>
-            <w:tcBorders>
-              <w:top w:val="single" w:space="0" w:color="D3D3D3"/>
-              <w:bottom w:val="single" w:space="0" w:color="D3D3D3"/>
-              <w:start w:val="single" w:space="0" w:color="D3D3D3"/>
-              <w:end w:val="single" w:space="0" w:color="D3D3D3"/>
-            </w:tcBorders>
-          </w:tcPr>
-          <w:p>
-            <w:pPr>
-              <w:spacing w:before="0" w:after="60"/>
-              <w:keepNext/>
-              <w:jc w:val="start"/>
-            </w:pPr>
-            <w:r>
-              <w:rPr>
-                <w:rFonts w:ascii="Calibri" w:hAnsi="Calibri"/>
-                <w:sz w:val="20"/>
-              </w:rPr>
-              <w:t xml:space="default">Air seal the attic and insulate it to at least R-60 (18 inches of loose-fill cellulose insulation).</w:t>
+              <w:t xml:space="default">Spray Foam Basement/Crawlspace Walls</w:t>
+            </w:r>
+          </w:p>
+        </w:tc>
+        <w:tc>
+          <w:tcPr>
+            <w:tcBorders>
+              <w:top w:val="single" w:space="0" w:color="D3D3D3"/>
+              <w:bottom w:val="single" w:space="0" w:color="D3D3D3"/>
+              <w:start w:val="single" w:space="0" w:color="D3D3D3"/>
+              <w:end w:val="single" w:space="0" w:color="D3D3D3"/>
+            </w:tcBorders>
+          </w:tcPr>
+          <w:p>
+            <w:pPr>
+              <w:spacing w:before="0" w:after="60"/>
+              <w:keepNext/>
+              <w:jc w:val="start"/>
+            </w:pPr>
+            <w:r>
+              <w:rPr>
+                <w:rFonts w:ascii="Calibri" w:hAnsi="Calibri"/>
+                <w:sz w:val="20"/>
+              </w:rPr>
+              <w:t xml:space="default">Install spray foam on the basement/crawlspace walls to prevent moisture infiltration and reduce heat loss.</w:t>
             </w:r>
           </w:p>
         </w:tc>
@@ -821,31 +821,31 @@
                 <w:rFonts w:ascii="Calibri" w:hAnsi="Calibri"/>
                 <w:sz w:val="20"/>
               </w:rPr>
-              <w:t xml:space="default">Spray Foam Basement/Crawlspace Walls</w:t>
-            </w:r>
-          </w:p>
-        </w:tc>
-        <w:tc>
-          <w:tcPr>
-            <w:tcBorders>
-              <w:top w:val="single" w:space="0" w:color="D3D3D3"/>
-              <w:bottom w:val="single" w:space="0" w:color="D3D3D3"/>
-              <w:start w:val="single" w:space="0" w:color="D3D3D3"/>
-              <w:end w:val="single" w:space="0" w:color="D3D3D3"/>
-            </w:tcBorders>
-          </w:tcPr>
-          <w:p>
-            <w:pPr>
-              <w:spacing w:before="0" w:after="60"/>
-              <w:keepNext/>
-              <w:jc w:val="start"/>
-            </w:pPr>
-            <w:r>
-              <w:rPr>
-                <w:rFonts w:ascii="Calibri" w:hAnsi="Calibri"/>
-                <w:sz w:val="20"/>
-              </w:rPr>
-              <w:t xml:space="default">Install spray foam on the basement/crawlspace walls to prevent moisture infiltration and reduce heat loss.</w:t>
+              <w:t xml:space="default">Heat Pump Water Heater</w:t>
+            </w:r>
+          </w:p>
+        </w:tc>
+        <w:tc>
+          <w:tcPr>
+            <w:tcBorders>
+              <w:top w:val="single" w:space="0" w:color="D3D3D3"/>
+              <w:bottom w:val="single" w:space="0" w:color="D3D3D3"/>
+              <w:start w:val="single" w:space="0" w:color="D3D3D3"/>
+              <w:end w:val="single" w:space="0" w:color="D3D3D3"/>
+            </w:tcBorders>
+          </w:tcPr>
+          <w:p>
+            <w:pPr>
+              <w:spacing w:before="0" w:after="60"/>
+              <w:keepNext/>
+              <w:jc w:val="start"/>
+            </w:pPr>
+            <w:r>
+              <w:rPr>
+                <w:rFonts w:ascii="Calibri" w:hAnsi="Calibri"/>
+                <w:sz w:val="20"/>
+              </w:rPr>
+              <w:t xml:space="default">Install a heat pump water heater to provide your hot water for cooking and bathing. This is the most efficient way to heat water and will save hundreds of dollars a year compared to electric resistance, heating oil, or propane hot water. It will also help to dehumidify while it's running. If your current water heater burns oil or propane, this will also remove a source of combustion gases from your home.</w:t>
             </w:r>
           </w:p>
         </w:tc>
@@ -874,31 +874,31 @@
                 <w:rFonts w:ascii="Calibri" w:hAnsi="Calibri"/>
                 <w:sz w:val="20"/>
               </w:rPr>
-              <w:t xml:space="default">Electrical Panel Upgrade</w:t>
-            </w:r>
-          </w:p>
-        </w:tc>
-        <w:tc>
-          <w:tcPr>
-            <w:tcBorders>
-              <w:top w:val="single" w:space="0" w:color="D3D3D3"/>
-              <w:bottom w:val="single" w:space="0" w:color="D3D3D3"/>
-              <w:start w:val="single" w:space="0" w:color="D3D3D3"/>
-              <w:end w:val="single" w:space="0" w:color="D3D3D3"/>
-            </w:tcBorders>
-          </w:tcPr>
-          <w:p>
-            <w:pPr>
-              <w:spacing w:before="0" w:after="60"/>
-              <w:keepNext/>
-              <w:jc w:val="start"/>
-            </w:pPr>
-            <w:r>
-              <w:rPr>
-                <w:rFonts w:ascii="Calibri" w:hAnsi="Calibri"/>
-                <w:sz w:val="20"/>
-              </w:rPr>
-              <w:t xml:space="default">Consult with an electrician about replacing your existing electrical panel with a 200 amp panel as you add electrical appliances to your home.</w:t>
+              <w:t xml:space="default">Solar</w:t>
+            </w:r>
+          </w:p>
+        </w:tc>
+        <w:tc>
+          <w:tcPr>
+            <w:tcBorders>
+              <w:top w:val="single" w:space="0" w:color="D3D3D3"/>
+              <w:bottom w:val="single" w:space="0" w:color="D3D3D3"/>
+              <w:start w:val="single" w:space="0" w:color="D3D3D3"/>
+              <w:end w:val="single" w:space="0" w:color="D3D3D3"/>
+            </w:tcBorders>
+          </w:tcPr>
+          <w:p>
+            <w:pPr>
+              <w:spacing w:before="0" w:after="60"/>
+              <w:keepNext/>
+              <w:jc w:val="start"/>
+            </w:pPr>
+            <w:r>
+              <w:rPr>
+                <w:rFonts w:ascii="Calibri" w:hAnsi="Calibri"/>
+                <w:sz w:val="20"/>
+              </w:rPr>
+              <w:t xml:space="default">Rooftop solar can supply most or all of your home electrical demands. Contact a solar company for pricing and details specific to your home.</w:t>
             </w:r>
           </w:p>
         </w:tc>
@@ -927,31 +927,31 @@
                 <w:rFonts w:ascii="Calibri" w:hAnsi="Calibri"/>
                 <w:sz w:val="20"/>
               </w:rPr>
-              <w:t xml:space="default">Air Source Heat Pump</w:t>
-            </w:r>
-          </w:p>
-        </w:tc>
-        <w:tc>
-          <w:tcPr>
-            <w:tcBorders>
-              <w:top w:val="single" w:space="0" w:color="D3D3D3"/>
-              <w:bottom w:val="single" w:space="0" w:color="D3D3D3"/>
-              <w:start w:val="single" w:space="0" w:color="D3D3D3"/>
-              <w:end w:val="single" w:space="0" w:color="D3D3D3"/>
-            </w:tcBorders>
-          </w:tcPr>
-          <w:p>
-            <w:pPr>
-              <w:spacing w:before="0" w:after="60"/>
-              <w:keepNext/>
-              <w:jc w:val="start"/>
-            </w:pPr>
-            <w:r>
-              <w:rPr>
-                <w:rFonts w:ascii="Calibri" w:hAnsi="Calibri"/>
-                <w:sz w:val="20"/>
-              </w:rPr>
-              <w:t xml:space="default">Install air source heat pumps for heating and cooling and whole-house surge protection.</w:t>
+              <w:t xml:space="default">EV+Charger</w:t>
+            </w:r>
+          </w:p>
+        </w:tc>
+        <w:tc>
+          <w:tcPr>
+            <w:tcBorders>
+              <w:top w:val="single" w:space="0" w:color="D3D3D3"/>
+              <w:bottom w:val="single" w:space="0" w:color="D3D3D3"/>
+              <w:start w:val="single" w:space="0" w:color="D3D3D3"/>
+              <w:end w:val="single" w:space="0" w:color="D3D3D3"/>
+            </w:tcBorders>
+          </w:tcPr>
+          <w:p>
+            <w:pPr>
+              <w:spacing w:before="0" w:after="60"/>
+              <w:keepNext/>
+              <w:jc w:val="start"/>
+            </w:pPr>
+            <w:r>
+              <w:rPr>
+                <w:rFonts w:ascii="Calibri" w:hAnsi="Calibri"/>
+                <w:sz w:val="20"/>
+              </w:rPr>
+              <w:t xml:space="default">An electric vehicle will eliminate your gas costs and reduce fossil fuel dependence. A 2020 study by Consumer Reports found that lifetime ownership costs were significantly lower for EVs, saving between $6,000 - $10,000 over their lifetimes.</w:t>
             </w:r>
           </w:p>
         </w:tc>
@@ -1036,7 +1036,7 @@
                 <w:rFonts w:ascii="Calibri" w:hAnsi="Calibri"/>
                 <w:sz w:val="20"/>
               </w:rPr>
-              <w:t xml:space="default">1799-1840</w:t>
+              <w:t xml:space="default">1800</w:t>
             </w:r>
           </w:p>
         </w:tc>
@@ -1089,7 +1089,7 @@
                 <w:rFonts w:ascii="Calibri" w:hAnsi="Calibri"/>
                 <w:sz w:val="20"/>
               </w:rPr>
-              <w:t xml:space="default">Walk in basement, Slab, Post/Piers, open to the outside</w:t>
+              <w:t xml:space="default">Crawl space</w:t>
             </w:r>
           </w:p>
         </w:tc>
@@ -1142,7 +1142,7 @@
                 <w:rFonts w:ascii="Calibri" w:hAnsi="Calibri"/>
                 <w:sz w:val="20"/>
               </w:rPr>
-              <w:t xml:space="default">Uninsulated , NA inches</w:t>
+              <w:t xml:space="default">Batts of Fiberglass , 5 inches</w:t>
             </w:r>
           </w:p>
         </w:tc>
@@ -1195,7 +1195,7 @@
                 <w:rFonts w:ascii="Calibri" w:hAnsi="Calibri"/>
                 <w:sz w:val="20"/>
               </w:rPr>
-              <w:t xml:space="default">2</w:t>
+              <w:t xml:space="default">1</w:t>
             </w:r>
           </w:p>
         </w:tc>
@@ -1248,7 +1248,7 @@
                 <w:rFonts w:ascii="Calibri" w:hAnsi="Calibri"/>
                 <w:sz w:val="20"/>
               </w:rPr>
-              <w:t xml:space="default">3229</w:t>
+              <w:t xml:space="default">2086</w:t>
             </w:r>
           </w:p>
         </w:tc>
@@ -1301,7 +1301,7 @@
                 <w:rFonts w:ascii="Calibri" w:hAnsi="Calibri"/>
                 <w:sz w:val="20"/>
               </w:rPr>
-              <w:t xml:space="default">29061</w:t>
+              <w:t xml:space="default">17176</w:t>
             </w:r>
           </w:p>
         </w:tc>
@@ -1483,7 +1483,7 @@
                 <w:rFonts w:ascii="Calibri" w:hAnsi="Calibri"/>
                 <w:sz w:val="20"/>
               </w:rPr>
-              <w:t xml:space="default">NA</w:t>
+              <w:t xml:space="default">Northeast/Southwest</w:t>
             </w:r>
           </w:p>
         </w:tc>
@@ -1536,7 +1536,7 @@
                 <w:rFonts w:ascii="Calibri" w:hAnsi="Calibri"/>
                 <w:sz w:val="20"/>
               </w:rPr>
-              <w:t xml:space="default">Asphalt Shinglesin faircondition. NA</w:t>
+              <w:t xml:space="default">Asphalt Shinglesin faircondition. Some of the shingles are flipped up but overall fine.</w:t>
             </w:r>
           </w:p>
         </w:tc>
@@ -1589,7 +1589,7 @@
                 <w:rFonts w:ascii="Calibri" w:hAnsi="Calibri"/>
                 <w:sz w:val="20"/>
               </w:rPr>
-              <w:t xml:space="default">Current moisture control strategies: NA. These were in NA condition .NA</w:t>
+              <w:t xml:space="default">Current moisture control strategies: gutters. These were in poor condition .Only on some sides of the building partially.</w:t>
             </w:r>
           </w:p>
         </w:tc>
@@ -1642,7 +1642,7 @@
                 <w:rFonts w:ascii="Calibri" w:hAnsi="Calibri"/>
                 <w:sz w:val="20"/>
               </w:rPr>
-              <w:t xml:space="default">vinyl siding in excellent condition. NA</w:t>
+              <w:t xml:space="default">wood shingles in fair condition. Some of the siding has recently been replaced and some is old with water damage or moss growing on it.</w:t>
             </w:r>
           </w:p>
         </w:tc>
@@ -1695,7 +1695,7 @@
                 <w:rFonts w:ascii="Calibri" w:hAnsi="Calibri"/>
                 <w:sz w:val="20"/>
               </w:rPr>
-              <w:t xml:space="default">There are no exterior doors</w:t>
+              <w:t xml:space="default">There are 3 insulated wood exterior doors. In fair condition, totaling 53 square feet.</w:t>
             </w:r>
           </w:p>
         </w:tc>
@@ -1748,7 +1748,7 @@
                 <w:rFonts w:ascii="Calibri" w:hAnsi="Calibri"/>
                 <w:sz w:val="20"/>
               </w:rPr>
-              <w:t xml:space="default">There are no exterior windows</w:t>
+              <w:t xml:space="default">There are 8 single paned wood windows. In fair condition, totaling 54 square feet. Moreover there are 7 double paned wood windows. In fair condition, totaling 81 square feet.</w:t>
             </w:r>
           </w:p>
         </w:tc>
@@ -1824,7 +1824,7 @@
                 <w:rFonts w:ascii="Calibri" w:hAnsi="Calibri"/>
                 <w:sz w:val="20"/>
               </w:rPr>
-              <w:t xml:space="default">NAThere is Batts of Fiberglass insulation 6 inches thick in NA condition. The quality of the insulation was not confirmed, but the homeowner expressed it was difficult to insulate the antique section.</w:t>
+              <w:t xml:space="default">The framing type of the home is balloon framing, which means the wall cavities extend the full height of the building (from the foundation to the roof). Often the wall cavities are interconnected with the floor and ceiling cavities. This framing type can create connected passageways for air to leave the house and rodents to enter the house. There is UNKNOWN insulation NA inches thick in NA condition. NA</w:t>
             </w:r>
           </w:p>
         </w:tc>
@@ -1877,7 +1877,7 @@
                 <w:rFonts w:ascii="Calibri" w:hAnsi="Calibri"/>
                 <w:sz w:val="20"/>
               </w:rPr>
-              <w:t xml:space="default">NA</w:t>
+              <w:t xml:space="default">Two large sliding doors on either side of the main hall that have cavities that go straight to the attic.</w:t>
             </w:r>
           </w:p>
         </w:tc>
@@ -1930,7 +1930,7 @@
                 <w:rFonts w:ascii="Calibri" w:hAnsi="Calibri"/>
                 <w:sz w:val="20"/>
               </w:rPr>
-              <w:t xml:space="default">NA</w:t>
+              <w:t xml:space="default">Small electric heater in the wall.</w:t>
             </w:r>
           </w:p>
         </w:tc>
@@ -1983,7 +1983,7 @@
                 <w:rFonts w:ascii="Calibri" w:hAnsi="Calibri"/>
                 <w:sz w:val="20"/>
               </w:rPr>
-              <w:t xml:space="default">NA used NA kWh in NA minutes. NA used NA kWh in NA minutes. NA</w:t>
+              <w:t xml:space="default">Fridge used 8.9 kWh in 60 minutes. Deep Fridge used 1.8 kWh in 60 minutes. Industrial vent hood and gas range. Also, a wood cook stove.</w:t>
             </w:r>
           </w:p>
         </w:tc>
@@ -2091,7 +2091,7 @@
                 <w:rFonts w:ascii="Calibri" w:hAnsi="Calibri"/>
                 <w:sz w:val="20"/>
               </w:rPr>
-              <w:t xml:space="default">NA</w:t>
+              <w:t xml:space="default">2126</w:t>
             </w:r>
           </w:p>
         </w:tc>
@@ -2168,7 +2168,7 @@
                 <w:rFonts w:ascii="Calibri" w:hAnsi="Calibri"/>
                 <w:sz w:val="20"/>
               </w:rPr>
-              <w:t xml:space="default">NA</w:t>
+              <w:t xml:space="default">7.4</w:t>
             </w:r>
           </w:p>
         </w:tc>
@@ -2245,7 +2245,7 @@
                 <w:rFonts w:ascii="Calibri" w:hAnsi="Calibri"/>
                 <w:sz w:val="20"/>
               </w:rPr>
-              <w:t xml:space="default">NA under natural conditions. TEST</w:t>
+              <w:t xml:space="default">212.6 under natural conditions. TEST</w:t>
             </w:r>
           </w:p>
         </w:tc>
@@ -2322,7 +2322,7 @@
                 <w:rFonts w:ascii="Calibri" w:hAnsi="Calibri"/>
                 <w:sz w:val="20"/>
               </w:rPr>
-              <w:t xml:space="default">NA</w:t>
+              <w:t xml:space="default">0.4</w:t>
             </w:r>
           </w:p>
         </w:tc>
@@ -2404,7 +2404,13 @@
         <w:pStyle w:val="BodyText"/>
       </w:pPr>
       <w:r>
-        <w:t xml:space="preserve">Using a thermal imaging camera, we looked for major air leakage locations and thermal bridging, where heat is bypassing the insulation. There was evidence of ….</w:t>
+        <w:t xml:space="preserve">Using a thermal imaging camera, we looked for major air leakage locations and thermal bridging. Thermal bridging occurs when heat enters or leaves a house through material that lets heat through more easily than the house’s insulation. This often occurs with wall studs and ceiling joists.</w:t>
+      </w:r>
+      <w:r>
+        <w:t xml:space="preserve"> </w:t>
+      </w:r>
+      <w:r>
+        <w:t xml:space="preserve">We conducted the audit in the summer, when the air outside the house is hotter than inside the house. Therefore, the warmer (red, orange and yellow) areas in the thermal pictures below show where air leakage is taking place as these are the areas where hot air from the outside is being pulled into the cooler house.</w:t>
       </w:r>
     </w:p>
     <w:bookmarkEnd w:id="36"/>
@@ -2477,7 +2483,7 @@
                 <w:rFonts w:ascii="Calibri" w:hAnsi="Calibri"/>
                 <w:sz w:val="20"/>
               </w:rPr>
-              <w:t xml:space="default">NA</w:t>
+              <w:t xml:space="default">2086</w:t>
             </w:r>
           </w:p>
         </w:tc>
@@ -2530,7 +2536,7 @@
                 <w:rFonts w:ascii="Calibri" w:hAnsi="Calibri"/>
                 <w:sz w:val="20"/>
               </w:rPr>
-              <w:t xml:space="default">Uninsulated</w:t>
+              <w:t xml:space="default">Batts of Fiberglass</w:t>
             </w:r>
           </w:p>
         </w:tc>
@@ -2583,7 +2589,7 @@
                 <w:rFonts w:ascii="Calibri" w:hAnsi="Calibri"/>
                 <w:sz w:val="20"/>
               </w:rPr>
-              <w:t xml:space="default">NA</w:t>
+              <w:t xml:space="default">Partially</w:t>
             </w:r>
           </w:p>
         </w:tc>
@@ -2689,7 +2695,7 @@
                 <w:rFonts w:ascii="Calibri" w:hAnsi="Calibri"/>
                 <w:sz w:val="20"/>
               </w:rPr>
-              <w:t xml:space="default">NA No NA</w:t>
+              <w:t xml:space="default">The attic is only partially insulated. Yes NA</w:t>
             </w:r>
           </w:p>
         </w:tc>
@@ -2742,7 +2748,7 @@
                 <w:rFonts w:ascii="Calibri" w:hAnsi="Calibri"/>
                 <w:sz w:val="20"/>
               </w:rPr>
-              <w:t xml:space="default">NA</w:t>
+              <w:t xml:space="default">Yes</w:t>
             </w:r>
           </w:p>
         </w:tc>
@@ -2924,7 +2930,7 @@
                 <w:rFonts w:ascii="Calibri" w:hAnsi="Calibri"/>
                 <w:sz w:val="20"/>
               </w:rPr>
-              <w:t xml:space="default">Uninsulated</w:t>
+              <w:t xml:space="default">Batts of Fiberglass</w:t>
             </w:r>
           </w:p>
         </w:tc>
@@ -2977,7 +2983,7 @@
                 <w:rFonts w:ascii="Calibri" w:hAnsi="Calibri"/>
                 <w:sz w:val="20"/>
               </w:rPr>
-              <w:t xml:space="default">NANA</w:t>
+              <w:t xml:space="default">PoorThe insulation is along the floor joists however it is only in some parts and is falling out. It is effectively uninsulated.</w:t>
             </w:r>
           </w:p>
         </w:tc>
@@ -3030,7 +3036,7 @@
                 <w:rFonts w:ascii="Calibri" w:hAnsi="Calibri"/>
                 <w:sz w:val="20"/>
               </w:rPr>
-              <w:t xml:space="default">NA</w:t>
+              <w:t xml:space="default">Appliances not insulated, Ducts/pipes not insulated</w:t>
             </w:r>
           </w:p>
         </w:tc>
@@ -3083,7 +3089,7 @@
                 <w:rFonts w:ascii="Calibri" w:hAnsi="Calibri"/>
                 <w:sz w:val="20"/>
               </w:rPr>
-              <w:t xml:space="default">NAin poorcondition. NA</w:t>
+              <w:t xml:space="default">NAin NAcondition. Only on some sides of the building partially.</w:t>
             </w:r>
           </w:p>
         </w:tc>
@@ -3189,7 +3195,7 @@
                 <w:rFonts w:ascii="Calibri" w:hAnsi="Calibri"/>
                 <w:sz w:val="20"/>
               </w:rPr>
-              <w:t xml:space="default">There is moistureThe basement is damp and the field stone foundation is coming apart in some sections.</w:t>
+              <w:t xml:space="default">There is NANA</w:t>
             </w:r>
           </w:p>
         </w:tc>
@@ -3265,7 +3271,7 @@
                 <w:rFonts w:ascii="Calibri" w:hAnsi="Calibri"/>
                 <w:sz w:val="20"/>
               </w:rPr>
-              <w:t xml:space="default">The electrical panel has and amperage of NA. There are NA unused breaker spaces. NA</w:t>
+              <w:t xml:space="default">The electrical panel has and amperage of 200. There are 0 unused breaker spaces. NA</w:t>
             </w:r>
           </w:p>
         </w:tc>
@@ -3409,13 +3415,13 @@
         <w:t xml:space="preserve">These recommendations are organized from the least expensive/most cost-effective and easiest interventions to ones that are more challenging to implement.</w:t>
       </w:r>
     </w:p>
-    <w:bookmarkStart w:id="42" w:name="high-efficiency-shower-heads"/>
+    <w:bookmarkStart w:id="42" w:name="window-dressers"/>
     <w:p>
       <w:pPr>
         <w:pStyle w:val="Heading3"/>
       </w:pPr>
       <w:r>
-        <w:t xml:space="preserve">4.1 High efficiency shower head(s)</w:t>
+        <w:t xml:space="preserve">4.1 Window Dressers</w:t>
       </w:r>
     </w:p>
     <w:p>
@@ -3435,7 +3441,7 @@
         <w:pStyle w:val="BodyText"/>
       </w:pPr>
       <w:r>
-        <w:t xml:space="preserve">Your shower heads use more water and energy than high-efficiency shower heads, thus costing you more money than necessary. Older shower heads use 2.5 gallons or more every minute, which wastes thousands of gallons of water each year and costs you money for every extra gallon of water heated.</w:t>
+        <w:t xml:space="preserve">Your windows are a source of heat loss, reduce your comfort due to cold surface temperatures, and may also cause moisture condensation or frost in the winter.</w:t>
       </w:r>
     </w:p>
     <w:p>
@@ -3455,7 +3461,7 @@
         <w:pStyle w:val="BodyText"/>
       </w:pPr>
       <w:r>
-        <w:t xml:space="preserve">Install high-efficiency shower heads to reduce the amount of water and energy to heat the water used when showering. We recommend 1.5 gallon per minute shower heads that will save a gallon or more of water for every minute spent in the shower.</w:t>
+        <w:t xml:space="preserve">WindowDressers are insulating window inserts that help air-seal windows and reduce heat loss and gain. WindowDressers are transparent and let in light while stopping drafts. Each insert is made of a custom-made pine frame wrapped on each side with tightly sealed, clear polyolefin film, creating an airspace between the two layers for additional insulation. The insert is finished with a compressible foam weather seal. The foam allows enough give for the inserts to be easily slid into place in the fall and removed in the spring while holding firmly enough to provide a tight, friction-based seal. The inserts are installed inside your existing window frame with no fasteners required and last 5-10 years. They are most effective in the winter, but depending on the window’s exposure, they can sometimes be used in the summer to keep the house cooler.</w:t>
       </w:r>
       <w:r>
         <w:t xml:space="preserve"> </w:t>
@@ -3473,17 +3479,45 @@
         <w:pStyle w:val="BodyText"/>
       </w:pPr>
       <w:r>
-        <w:t xml:space="preserve">A typical family will save ~10,000 gallons of water per year and over $100 per year in water heating costs. We provide these for free and have several styles for you to choose from; contact us for some if we did not give you any during the audit.</w:t>
+        <w:t xml:space="preserve">Insulating window inserts save 5-10% of your heating costs at less than 1/10th the cost of replacement windows. The overall project cost will depend on the number and size of window inserts. Example prices for the 2024 season were: small (20 x 36”) - $36 for natural pine frame, $46 for white; medium (30 x 52”) - $50 for natural pine frame, $64 for white; large (44 x 68”) - $67 for natural pine frame, $88 for white. Adjusted pricing for lower-income households is available from WindowDressers upon request. If plastic is damaged, it can be replaced for $15.</w:t>
+      </w:r>
+    </w:p>
+    <w:p>
+      <w:pPr>
+        <w:pStyle w:val="BodyText"/>
+      </w:pPr>
+      <w:r>
+        <w:t xml:space="preserve">Households that order inserts are expected to participate in the Community Build where the inserts are made. You can sign up for a 4-hour shift and learn the simple steps in the insert-building process (no previous experience required, no power tools). Each job has</w:t>
+      </w:r>
+      <w:r>
+        <w:t xml:space="preserve"> </w:t>
+      </w:r>
+      <w:r>
+        <w:t xml:space="preserve">“jigs”</w:t>
+      </w:r>
+      <w:r>
+        <w:t xml:space="preserve"> </w:t>
+      </w:r>
+      <w:r>
+        <w:t xml:space="preserve">that make the job easier to do and ensure uniform quality. You will be trained at the beginning of your shift on how to do your task. Volunteering for multiple shifts is encouraged! Mid-shift snacks and a meal are provided to all participants.</w:t>
+      </w:r>
+    </w:p>
+    <w:p>
+      <w:pPr>
+        <w:pStyle w:val="BodyText"/>
+      </w:pPr>
+      <w:r>
+        <w:t xml:space="preserve">If you would like to participate, please contact us so we can discuss how the program works and which windows you’d like inserts for.</w:t>
       </w:r>
     </w:p>
     <w:bookmarkEnd w:id="42"/>
-    <w:bookmarkStart w:id="43" w:name="leds"/>
+    <w:bookmarkStart w:id="43" w:name="heat-pump-water-heater"/>
     <w:p>
       <w:pPr>
         <w:pStyle w:val="Heading3"/>
       </w:pPr>
       <w:r>
-        <w:t xml:space="preserve">4.2 LEDs</w:t>
+        <w:t xml:space="preserve">4.2 Heat Pump Water Heater</w:t>
       </w:r>
     </w:p>
     <w:p>
@@ -3503,7 +3537,11 @@
         <w:pStyle w:val="BodyText"/>
       </w:pPr>
       <w:r>
-        <w:t xml:space="preserve">Your lighting uses more energy than LED bulbs would. Halogen and incandescent light bulbs use 5-8x more energy than LEDs. This requires significantly more electricity and costs a lot.</w:t>
+        <w:rPr>
+          <w:b/>
+          <w:bCs/>
+        </w:rPr>
+        <w:t xml:space="preserve">Auditor to describe depending on what their current system is</w:t>
       </w:r>
     </w:p>
     <w:p>
@@ -3523,7 +3561,7 @@
         <w:pStyle w:val="BodyText"/>
       </w:pPr>
       <w:r>
-        <w:t xml:space="preserve">Switch your light bulbs to LED light bulbs. LEDs use 80% less energy than incandescent light bulbs which can significantly reduce your electricity bill.</w:t>
+        <w:t xml:space="preserve">Install a heat pump water heater to provide your hot water for cooking and bathing. This is the most efficient way to heat water and will save hundreds of dollars a year compared to electric resistance, heating oil, or propane hot water. It will also help to dehumidify while it’s running. If your current water heater burns oil or propane, this will also remove a source of combustion gases from your home. We also recommend setting the temperature on the water heater at 130°F for more efficient operation.</w:t>
       </w:r>
     </w:p>
     <w:p>
@@ -3543,17 +3581,17 @@
         <w:pStyle w:val="BodyText"/>
       </w:pPr>
       <w:r>
-        <w:t xml:space="preserve">We provide free LED light bulbs; contact us for some if we did not give you any during the audit. Depending on usage, LEDs can save more than $50 a year.</w:t>
+        <w:t xml:space="preserve">A heat pump water heater uses 70% less electricity than a standard electric water heater. Efficiency Maine offers a rebate of up to $950, making the equipment cost as little as $400 plus installation. The rebate can be combined with a nonrefundable federal tax credit of 30% of the remaining cost of the unit and labor, subject to an annual maximum benefit of $2,000 (shared with other energy property, like heat pumps). For more information, you can call Efficiency Maine at 866-376-2463 (Monday to Friday, 8:00 am to 5:00 pm) or visit their website: https://www.efficiencymaine.com/at-home/heat-pump-water-heater-program/</w:t>
       </w:r>
     </w:p>
     <w:bookmarkEnd w:id="43"/>
-    <w:bookmarkStart w:id="44" w:name="window-dressers"/>
+    <w:bookmarkStart w:id="44" w:name="gutters"/>
     <w:p>
       <w:pPr>
         <w:pStyle w:val="Heading3"/>
       </w:pPr>
       <w:r>
-        <w:t xml:space="preserve">4.3 Window Dressers</w:t>
+        <w:t xml:space="preserve">4.3 Gutters</w:t>
       </w:r>
     </w:p>
     <w:p>
@@ -3573,7 +3611,7 @@
         <w:pStyle w:val="BodyText"/>
       </w:pPr>
       <w:r>
-        <w:t xml:space="preserve">Your windows are a source of heat loss, reduce your comfort due to cold surface temperatures, and may also cause moisture condensation or frost in the winter.</w:t>
+        <w:t xml:space="preserve">The house has no gutters, so water runs off your roof and directly onto the ground next to your house. Water that splashes off the ground can damage the exterior of your house. Runoff that is absorbed into the ground can seep into the basement/crawlspace, causing moisture issues there and throughout your house.</w:t>
       </w:r>
     </w:p>
     <w:p>
@@ -3593,11 +3631,13 @@
         <w:pStyle w:val="BodyText"/>
       </w:pPr>
       <w:r>
-        <w:t xml:space="preserve">WindowDressers are insulating window inserts that help air-seal windows and reduce heat loss and gain. WindowDressers are transparent and let in light while stopping drafts. Each insert is made of a custom-made pine frame wrapped on each side with tightly sealed, clear polyolefin film, creating an airspace between the two layers for additional insulation. The insert is finished with a compressible foam weather seal. The foam allows enough give for the inserts to be easily slid into place in the fall and removed in the spring while holding firmly enough to provide a tight, friction-based seal. The inserts are installed inside your existing window frame with no fasteners required and last 5-10 years. They are most effective in the winter, but depending on the window’s exposure, they can sometimes be used in the summer to keep the house cooler.</w:t>
-      </w:r>
-      <w:r>
-        <w:t xml:space="preserve"> </w:t>
-      </w:r>
+        <w:t xml:space="preserve">Install gutters and downspouts that divert water at least six feet away from the foundation and to where the ground slopes away from the house.</w:t>
+      </w:r>
+    </w:p>
+    <w:p>
+      <w:pPr>
+        <w:pStyle w:val="BodyText"/>
+      </w:pPr>
       <w:r>
         <w:rPr>
           <w:i/>
@@ -3611,45 +3651,17 @@
         <w:pStyle w:val="BodyText"/>
       </w:pPr>
       <w:r>
-        <w:t xml:space="preserve">Insulating window inserts save 5-10% of your heating costs at less than 1/10th the cost of replacement windows. The overall project cost will depend on the number and size of window inserts. Example prices for the 2024 season were: small (20 x 36”) - $36 for natural pine frame, $46 for white; medium (30 x 52”) - $50 for natural pine frame, $64 for white; large (44 x 68”) - $67 for natural pine frame, $88 for white. Adjusted pricing for lower-income households is available from WindowDressers upon request. If plastic is damaged, it can be replaced for $15.</w:t>
-      </w:r>
-    </w:p>
-    <w:p>
-      <w:pPr>
-        <w:pStyle w:val="BodyText"/>
-      </w:pPr>
-      <w:r>
-        <w:t xml:space="preserve">Households that order inserts are expected to participate in the Community Build where the inserts are made. You can sign up for a 4-hour shift and learn the simple steps in the insert-building process (no previous experience required, no power tools). Each job has</w:t>
-      </w:r>
-      <w:r>
-        <w:t xml:space="preserve"> </w:t>
-      </w:r>
-      <w:r>
-        <w:t xml:space="preserve">“jigs”</w:t>
-      </w:r>
-      <w:r>
-        <w:t xml:space="preserve"> </w:t>
-      </w:r>
-      <w:r>
-        <w:t xml:space="preserve">that make the job easier to do and ensure uniform quality. You will be trained at the beginning of your shift on how to do your task. Volunteering for multiple shifts is encouraged! Mid-shift snacks and a meal are provided to all participants.</w:t>
-      </w:r>
-    </w:p>
-    <w:p>
-      <w:pPr>
-        <w:pStyle w:val="BodyText"/>
-      </w:pPr>
-      <w:r>
-        <w:t xml:space="preserve">If you would like to participate, please contact us so we can discuss how the program works and which windows you’d like inserts for.</w:t>
+        <w:t xml:space="preserve">Adding gutters would mitigate moisture damage and save you from having to replace/fix other parts of the house.</w:t>
       </w:r>
     </w:p>
     <w:bookmarkEnd w:id="44"/>
-    <w:bookmarkStart w:id="45" w:name="induction-stoveoven"/>
+    <w:bookmarkStart w:id="45" w:name="vapor-barrier"/>
     <w:p>
       <w:pPr>
         <w:pStyle w:val="Heading3"/>
       </w:pPr>
       <w:r>
-        <w:t xml:space="preserve">4.4 Induction Stove/Oven</w:t>
+        <w:t xml:space="preserve">4.4 Vapor Barrier</w:t>
       </w:r>
     </w:p>
     <w:p>
@@ -3669,7 +3681,7 @@
         <w:pStyle w:val="BodyText"/>
       </w:pPr>
       <w:r>
-        <w:t xml:space="preserve">Your gas range has the potential to release propane, carbon monoxide, and combustion gases into your house. Gas ranges are also inefficient at transferring heat to your food at 32% efficiency, compared to 85% efficiency for induction cooktops.</w:t>
+        <w:t xml:space="preserve">There is excess moisture in the basement/crawlspace, which is evaporating out of the ground. This moisture can enter the house and cause mold, mildew, rot, and air quality issues.</w:t>
       </w:r>
     </w:p>
     <w:p>
@@ -3689,7 +3701,19 @@
         <w:pStyle w:val="BodyText"/>
       </w:pPr>
       <w:r>
-        <w:t xml:space="preserve">Induction cooking appliances are more efficient and safer than electric or gas ones. There is no risk of carbon monoxide or other harmful combustion gases, and the surface doesn’t heat up without a pot or pan on it.</w:t>
+        <w:t xml:space="preserve">Install a vapor barrier on the basement floor to stop moisture from entering the basement and house. Vapor barriers typically consist of either reinforced plastic sheeting or EPDM rubber membrane over a</w:t>
+      </w:r>
+      <w:r>
+        <w:t xml:space="preserve"> </w:t>
+      </w:r>
+      <w:r>
+        <w:t xml:space="preserve">‘dimple mat’</w:t>
+      </w:r>
+      <w:r>
+        <w:t xml:space="preserve"> </w:t>
+      </w:r>
+      <w:r>
+        <w:t xml:space="preserve">that allows for drainage below the vapor barrier and prevents rocks from puncturing it. If the basement/crawlspace walls are going to be spray foamed, we recommend the foam go all the way to the floor and overlap the vapor barrier to create a continuous air and moisture barrier.</w:t>
       </w:r>
     </w:p>
     <w:p>
@@ -3709,17 +3733,17 @@
         <w:pStyle w:val="BodyText"/>
       </w:pPr>
       <w:r>
-        <w:t xml:space="preserve">Currently, Efficiency Maine does not offer a rebate for induction stoves. If you’re interested in trying out induction cooking but don’t want to replace your kitchen stove, consider buying a portable induction cooktop, which costs less than $100.</w:t>
+        <w:t xml:space="preserve">Efficiency Maine rebates will cover vapor barriers up to 25% of a weatherization project cost, if done as part of a larger insulation project. Most insulation companies can install spray foam and vapor barriers together. Efficiency Maine rebates and other incentives for insulation work can fund up to 80% of the overall cost to weatherize your home (subject to a lifetime limit per building), up to $9,200 when combined with nonrefundable federal tax credits. You can call them at 866-376-2463 (Monday to Friday, 8:00 am to 5:00 pm) or visit their webpage about insulation rebates: https://www.efficiencymaine.com/at-home/insulation-rebates/</w:t>
       </w:r>
     </w:p>
     <w:bookmarkEnd w:id="45"/>
-    <w:bookmarkStart w:id="46" w:name="gutters"/>
+    <w:bookmarkStart w:id="46" w:name="spray-foam-basement-walls"/>
     <w:p>
       <w:pPr>
         <w:pStyle w:val="Heading3"/>
       </w:pPr>
       <w:r>
-        <w:t xml:space="preserve">4.5 Gutters</w:t>
+        <w:t xml:space="preserve">4.5 Spray foam Basement Walls</w:t>
       </w:r>
     </w:p>
     <w:p>
@@ -3739,7 +3763,7 @@
         <w:pStyle w:val="BodyText"/>
       </w:pPr>
       <w:r>
-        <w:t xml:space="preserve">The house has no gutters, so water runs off your roof and directly onto the ground next to your house. Water that splashes off the ground can damage the exterior of your house. Runoff that is absorbed into the ground can seep into the basement/crawlspace, causing moisture issues there and throughout your house.</w:t>
+        <w:t xml:space="preserve">The basement/crawlspace is uninsulated and used for mechanical equipment and plumbing. The walls are porous and allow moisture into the house and rapidly conduct heat out of the space.</w:t>
       </w:r>
     </w:p>
     <w:p>
@@ -3759,7 +3783,24 @@
         <w:pStyle w:val="BodyText"/>
       </w:pPr>
       <w:r>
-        <w:t xml:space="preserve">Install gutters and downspouts that divert water at least six feet away from the foundation and to where the ground slopes away from the house.</w:t>
+        <w:t xml:space="preserve">Install spray foam on the basement/crawlspace walls to prevent moisture infiltration and reduce heat loss. In older homes, most heat loss is due to air leakage. Air sealing is particularly important in the basement or crawlspace (and attic). As warm air rises and leaks out the top of your home, cold air is pulled in at the bottom. This is called the</w:t>
+      </w:r>
+      <w:r>
+        <w:t xml:space="preserve"> </w:t>
+      </w:r>
+      <w:r>
+        <w:t xml:space="preserve">‘stack effect’</w:t>
+      </w:r>
+      <w:r>
+        <w:t xml:space="preserve">, and is more pronounced in taller homes. Thus, air sealing is necessary anywhere gaps allow air to move into your house through the basement/crawlspace.</w:t>
+      </w:r>
+    </w:p>
+    <w:p>
+      <w:pPr>
+        <w:pStyle w:val="BodyText"/>
+      </w:pPr>
+      <w:r>
+        <w:t xml:space="preserve">Spray foam should be applied 2-3 inches thick on the walls to seal and insulate them. It is often ideal to install a vapor barrier at the same time as the spray foam insulation. Spray foam generally requires a layer of intumescent (fire-rated) paint over it to meet fire code.</w:t>
       </w:r>
     </w:p>
     <w:p>
@@ -3779,17 +3820,17 @@
         <w:pStyle w:val="BodyText"/>
       </w:pPr>
       <w:r>
-        <w:t xml:space="preserve">Adding gutters would mitigate moisture damage and save you from having to replace/fix other parts of the house.</w:t>
+        <w:t xml:space="preserve">Installation of spray foam insulation will cost around $5-7 per square foot. Efficiency Maine rebates and other incentives for insulation work can fund up to 80% of the project cost (subject to a lifetime limit per building), up to $9,200 when combined with nonrefundable federal tax credits. You can call them at 866-376-2463 (Monday to Friday, 8:00 am to 5:00 pm) or visit their webpage about insulation rebates: https://www.efficiencymaine.com/at-home/insulation-rebates/</w:t>
       </w:r>
     </w:p>
     <w:bookmarkEnd w:id="46"/>
-    <w:bookmarkStart w:id="47" w:name="bathroom-exhaust-fans"/>
+    <w:bookmarkStart w:id="47" w:name="attic-insulation-and-air-sealing"/>
     <w:p>
       <w:pPr>
         <w:pStyle w:val="Heading3"/>
       </w:pPr>
       <w:r>
-        <w:t xml:space="preserve">4.6 Bathroom exhaust fan(s)</w:t>
+        <w:t xml:space="preserve">4.6 Attic Insulation and Air Sealing</w:t>
       </w:r>
     </w:p>
     <w:p>
@@ -3809,7 +3850,7 @@
         <w:pStyle w:val="BodyText"/>
       </w:pPr>
       <w:r>
-        <w:t xml:space="preserve">Currently, there is no bathroom exhaust fan, so moisture from the shower, toilet, and sink remains in the house, which can cause moisture issues such as mold.</w:t>
+        <w:t xml:space="preserve">The attic is uninsulated or is missing insulation and the attic could also benefit from air-sealing. These upgrades will reduce draftiness and heat loss in the winter and heat gain in the summer.</w:t>
       </w:r>
     </w:p>
     <w:p>
@@ -3829,7 +3870,24 @@
         <w:pStyle w:val="BodyText"/>
       </w:pPr>
       <w:r>
-        <w:t xml:space="preserve">Install bathroom exhaust fans in all bathrooms that do not have them. These should be rated for at least 80 cubic feet per minute (CFM) if there is a shower. We recommend the Panasonic Whisper series or similar fans that don’t create excess noise. If the ductwork will run through the attic, it should be installed before the attic is air-sealed and insulated. The fan needs to be ducted outside, so it does not add moisture into the attic.</w:t>
+        <w:t xml:space="preserve">Air seal the attic and insulate it to at least R-60 (18 inches of loose-fill cellulose insulation). COA has been installing 24 inches (R-80) of cellulose insulation in attics on our campus. Before the attic is insulated, ensure that any needed bathroom and kitchen fans are installed and that all fans are properly vented to the outside.</w:t>
+      </w:r>
+    </w:p>
+    <w:p>
+      <w:pPr>
+        <w:pStyle w:val="BodyText"/>
+      </w:pPr>
+      <w:r>
+        <w:t xml:space="preserve">In older homes, most heat loss is due to air leakage. Air sealing is particularly important in the attic (and basement or crawlspace). As warm air rises and leaks out the top of your home, cold air is pulled in at the bottom. This is called the</w:t>
+      </w:r>
+      <w:r>
+        <w:t xml:space="preserve"> </w:t>
+      </w:r>
+      <w:r>
+        <w:t xml:space="preserve">‘stack effect’</w:t>
+      </w:r>
+      <w:r>
+        <w:t xml:space="preserve">, and is more pronounced in taller homes. Thus, air sealing is necessary anywhere gaps allow air to move between your house and the attic. This typically includes gaps around the chimney, electrical penetrations, and wall top plates.</w:t>
       </w:r>
     </w:p>
     <w:p>
@@ -3849,17 +3907,17 @@
         <w:pStyle w:val="BodyText"/>
       </w:pPr>
       <w:r>
-        <w:t xml:space="preserve">The typical fan is around $130 plus the cost of installation.</w:t>
+        <w:t xml:space="preserve">Efficiency Maine rebates and other incentives for insulation work can fund up to 80% of the overall cost to weatherize your home (subject to a lifetime limit per building), up to $9,200 when combined with nonrefundable federal tax credits. You can call them at 866-376-2463 (Monday to Friday, 8:00 am to 5:00 pm) or visit their webpage about insulation rebates: https://www.efficiencymaine.com/at-home/insulation-rebates/</w:t>
       </w:r>
     </w:p>
     <w:bookmarkEnd w:id="47"/>
-    <w:bookmarkStart w:id="48" w:name="kitchen-exhaust-fans"/>
+    <w:bookmarkStart w:id="48" w:name="blow-in-cellulose-wall-insulation"/>
     <w:p>
       <w:pPr>
         <w:pStyle w:val="Heading3"/>
       </w:pPr>
       <w:r>
-        <w:t xml:space="preserve">4.7 Kitchen exhaust fan(s)</w:t>
+        <w:t xml:space="preserve">4.7 Blow-in cellulose wall insulation</w:t>
       </w:r>
     </w:p>
     <w:p>
@@ -3879,7 +3937,7 @@
         <w:pStyle w:val="BodyText"/>
       </w:pPr>
       <w:r>
-        <w:t xml:space="preserve">Currently, there is no kitchen exhaust fan, so fumes, smoke, and moisture from cooking stay in the house which can cause health concerns.</w:t>
+        <w:t xml:space="preserve">The walls of the house are uninsulated, which is a significant source of heat loss.</w:t>
       </w:r>
     </w:p>
     <w:p>
@@ -3899,13 +3957,11 @@
         <w:pStyle w:val="BodyText"/>
       </w:pPr>
       <w:r>
-        <w:t xml:space="preserve">Install a kitchen exhaust fan to remove cooking fumes and moisture from your home. The fan should be rated for at least 100 cubic feet per minute. A kitchen fan should be ducted to the outdoors. If the ductwork will run through the attic, it should be installed before the attic is air-sealed and insulated.</w:t>
-      </w:r>
-    </w:p>
-    <w:p>
-      <w:pPr>
-        <w:pStyle w:val="BodyText"/>
-      </w:pPr>
+        <w:t xml:space="preserve">Insulate the wall stud cavities with dense packed, blown-in cellulose insulation. In balloon-framed homes, this can often be done from the attic, otherwise it can be done by drilling holes into the wall cavities from either the inside or outside.</w:t>
+      </w:r>
+      <w:r>
+        <w:t xml:space="preserve"> </w:t>
+      </w:r>
       <w:r>
         <w:rPr>
           <w:i/>
@@ -3919,17 +3975,17 @@
         <w:pStyle w:val="BodyText"/>
       </w:pPr>
       <w:r>
-        <w:t xml:space="preserve">Kitchen range hoods typically cost $150 or more; installation costs depend on the complexity of the exhaust ducting.</w:t>
+        <w:t xml:space="preserve">Efficiency Maine rebates and other incentives for insulation work can fund up to 80% of the overall cost to weatherize your home (subject to a lifetime limit per building), up to $9,200 when combined with nonrefundable federal tax credits. You can call them at 866-376-2463 (Monday to Friday, 8:00 am to 5:00 pm) or visit their webpage about insulation rebates: https://www.efficiencymaine.com/at-home/insulation-rebates/</w:t>
       </w:r>
     </w:p>
     <w:bookmarkEnd w:id="48"/>
-    <w:bookmarkStart w:id="49" w:name="vapor-barrier"/>
+    <w:bookmarkStart w:id="49" w:name="continuous-exterior-wall-insulation"/>
     <w:p>
       <w:pPr>
         <w:pStyle w:val="Heading3"/>
       </w:pPr>
       <w:r>
-        <w:t xml:space="preserve">4.8 Vapor Barrier</w:t>
+        <w:t xml:space="preserve">4.8 Continuous exterior wall insulation</w:t>
       </w:r>
     </w:p>
     <w:p>
@@ -3949,7 +4005,7 @@
         <w:pStyle w:val="BodyText"/>
       </w:pPr>
       <w:r>
-        <w:t xml:space="preserve">There is excess moisture in the basement/crawlspace, which is evaporating out of the ground. This moisture can enter the house and cause mold, mildew, rot, and air quality issues.</w:t>
+        <w:t xml:space="preserve">There isn’t continuous insulation between the siding and the exterior walls of the house. Continuous insulation helps create a complete thermal boundary for your house, and it is now an energy code requirement for new houses.</w:t>
       </w:r>
     </w:p>
     <w:p>
@@ -3969,19 +4025,7 @@
         <w:pStyle w:val="BodyText"/>
       </w:pPr>
       <w:r>
-        <w:t xml:space="preserve">Install a vapor barrier on the basement floor to stop moisture from entering the basement and house. Vapor barriers typically consist of either reinforced plastic sheeting or EPDM rubber membrane over a</w:t>
-      </w:r>
-      <w:r>
-        <w:t xml:space="preserve"> </w:t>
-      </w:r>
-      <w:r>
-        <w:t xml:space="preserve">‘dimple mat’</w:t>
-      </w:r>
-      <w:r>
-        <w:t xml:space="preserve"> </w:t>
-      </w:r>
-      <w:r>
-        <w:t xml:space="preserve">that allows for drainage below the vapor barrier and prevents rocks from puncturing it. If the basement/crawlspace walls are going to be spray foamed, we recommend the foam go all the way to the floor and overlap the vapor barrier to create a continuous air and moisture barrier.</w:t>
+        <w:t xml:space="preserve">Add a continuous layer of insulation and potentially replace the air and moisture barrier once it becomes time to replace the siding. Add continuous insulation (R-6 or more) under the new siding to keep the house warmer in the winter and cooler in the summer. We recommend TimberHP TimberBoard insulation (produced in Madison, Maine) or Rockwool Comfortboard, but foam board can also be used. Before installing exterior insulation, the contractor can check if insulation is needed between the interior wall studs.</w:t>
       </w:r>
     </w:p>
     <w:p>
@@ -4001,17 +4045,17 @@
         <w:pStyle w:val="BodyText"/>
       </w:pPr>
       <w:r>
-        <w:t xml:space="preserve">Efficiency Maine rebates will cover vapor barriers up to 25% of a weatherization project cost, if done as part of a larger insulation project. Most insulation companies can install spray foam and vapor barriers together. Efficiency Maine rebates and other incentives for insulation work can fund up to 80% of the overall cost to weatherize your home (subject to a lifetime limit per building), up to $9,200 when combined with nonrefundable federal tax credits. You can call them at 866-376-2463 (Monday to Friday, 8:00 am to 5:00 pm) or visit their webpage about insulation rebates: https://www.efficiencymaine.com/at-home/insulation-rebates/</w:t>
+        <w:t xml:space="preserve">Efficiency Maine rebates and other incentives for insulation work can fund up to 80% of the overall cost to weatherize your home (subject to a lifetime limit per building), up to $9,200 when combined with nonrefundable federal tax credits. You can call them at 866-376-2463 (Monday to Friday, 8:00 am to 5:00 pm) or visit their webpage about insulation rebates: https://www.efficiencymaine.com/at-home/insulation-rebates/</w:t>
       </w:r>
     </w:p>
     <w:bookmarkEnd w:id="49"/>
-    <w:bookmarkStart w:id="50" w:name="spray-foam-basement-walls"/>
+    <w:bookmarkStart w:id="50" w:name="electrical-panel-upgrade"/>
     <w:p>
       <w:pPr>
         <w:pStyle w:val="Heading3"/>
       </w:pPr>
       <w:r>
-        <w:t xml:space="preserve">4.9 Spray foam Basement Walls</w:t>
+        <w:t xml:space="preserve">4.9 Electrical Panel Upgrade</w:t>
       </w:r>
     </w:p>
     <w:p>
@@ -4031,7 +4075,11 @@
         <w:pStyle w:val="BodyText"/>
       </w:pPr>
       <w:r>
-        <w:t xml:space="preserve">The basement/crawlspace is uninsulated and used for mechanical equipment and plumbing. The walls are porous and allow moisture into the house and rapidly conduct heat out of the space.</w:t>
+        <w:rPr>
+          <w:b/>
+          <w:bCs/>
+        </w:rPr>
+        <w:t xml:space="preserve">Auditor to describe</w:t>
       </w:r>
     </w:p>
     <w:p>
@@ -4051,24 +4099,7 @@
         <w:pStyle w:val="BodyText"/>
       </w:pPr>
       <w:r>
-        <w:t xml:space="preserve">Install spray foam on the basement/crawlspace walls to prevent moisture infiltration and reduce heat loss. In older homes, most heat loss is due to air leakage. Air sealing is particularly important in the basement or crawlspace (and attic). As warm air rises and leaks out the top of your home, cold air is pulled in at the bottom. This is called the</w:t>
-      </w:r>
-      <w:r>
-        <w:t xml:space="preserve"> </w:t>
-      </w:r>
-      <w:r>
-        <w:t xml:space="preserve">‘stack effect’</w:t>
-      </w:r>
-      <w:r>
-        <w:t xml:space="preserve">, and is more pronounced in taller homes. Thus, air sealing is necessary anywhere gaps allow air to move into your house through the basement/crawlspace.</w:t>
-      </w:r>
-    </w:p>
-    <w:p>
-      <w:pPr>
-        <w:pStyle w:val="BodyText"/>
-      </w:pPr>
-      <w:r>
-        <w:t xml:space="preserve">Spray foam should be applied 2-3 inches thick on the walls to seal and insulate them. It is often ideal to install a vapor barrier at the same time as the spray foam insulation. Spray foam generally requires a layer of intumescent (fire-rated) paint over it to meet fire code.</w:t>
+        <w:t xml:space="preserve">Consult with an electrician about replacing your existing electrical panel with a 200 amp panel as you add electrical appliances to your home. It may become necessary to increase the capacity to address potential safety hazards. An electrician can determine whether or not a panel upgrade is necessary based on your current and anticipated usage.</w:t>
       </w:r>
     </w:p>
     <w:p>
@@ -4088,17 +4119,17 @@
         <w:pStyle w:val="BodyText"/>
       </w:pPr>
       <w:r>
-        <w:t xml:space="preserve">Installation of spray foam insulation will cost around $5-7 per square foot. Efficiency Maine rebates and other incentives for insulation work can fund up to 80% of the project cost (subject to a lifetime limit per building), up to $9,200 when combined with nonrefundable federal tax credits. You can call them at 866-376-2463 (Monday to Friday, 8:00 am to 5:00 pm) or visit their webpage about insulation rebates: https://www.efficiencymaine.com/at-home/insulation-rebates/</w:t>
+        <w:t xml:space="preserve">Costs of electrical components needed to support residential energy upgrades – including panels, sub-panels, branch circuits, and feeders – qualify for a 30% nonrefundable tax credit (up to $600 per item) if they have a capacity of 200 amps or more. An electrical panel upgrades also provides a good opportunity for an electrician to install whole-house surge protection, which costs $100-$400. Here are some options: https://www.popularmechanics.com/home/interior-projects/g43140886/best-whole-house-surge-protectors/</w:t>
       </w:r>
     </w:p>
     <w:bookmarkEnd w:id="50"/>
-    <w:bookmarkStart w:id="51" w:name="attic-insulation-and-air-sealing"/>
+    <w:bookmarkStart w:id="51" w:name="air-source-heat-pump"/>
     <w:p>
       <w:pPr>
         <w:pStyle w:val="Heading3"/>
       </w:pPr>
       <w:r>
-        <w:t xml:space="preserve">4.10 Attic Insulation and Air Sealing</w:t>
+        <w:t xml:space="preserve">4.10 Air Source Heat Pump</w:t>
       </w:r>
     </w:p>
     <w:p>
@@ -4118,7 +4149,7 @@
         <w:pStyle w:val="BodyText"/>
       </w:pPr>
       <w:r>
-        <w:t xml:space="preserve">The attic is uninsulated or is missing insulation and the attic could also benefit from air-sealing. These upgrades will reduce draftiness and heat loss in the winter and heat gain in the summer.</w:t>
+        <w:t xml:space="preserve">Combustion heating equipment is expensive, inefficient, and has the potential to release harmful combustion gases like carbon monoxide into the home.</w:t>
       </w:r>
     </w:p>
     <w:p>
@@ -4138,24 +4169,7 @@
         <w:pStyle w:val="BodyText"/>
       </w:pPr>
       <w:r>
-        <w:t xml:space="preserve">Air seal the attic and insulate it to at least R-60 (18 inches of loose-fill cellulose insulation). COA has been installing 24 inches (R-80) of cellulose insulation in attics on our campus. Before the attic is insulated, ensure that any needed bathroom and kitchen fans are installed and that all fans are properly vented to the outside.</w:t>
-      </w:r>
-    </w:p>
-    <w:p>
-      <w:pPr>
-        <w:pStyle w:val="BodyText"/>
-      </w:pPr>
-      <w:r>
-        <w:t xml:space="preserve">In older homes, most heat loss is due to air leakage. Air sealing is particularly important in the attic (and basement or crawlspace). As warm air rises and leaks out the top of your home, cold air is pulled in at the bottom. This is called the</w:t>
-      </w:r>
-      <w:r>
-        <w:t xml:space="preserve"> </w:t>
-      </w:r>
-      <w:r>
-        <w:t xml:space="preserve">‘stack effect’</w:t>
-      </w:r>
-      <w:r>
-        <w:t xml:space="preserve">, and is more pronounced in taller homes. Thus, air sealing is necessary anywhere gaps allow air to move between your house and the attic. This typically includes gaps around the chimney, electrical penetrations, and wall top plates.</w:t>
+        <w:t xml:space="preserve">Install air source heat pumps for heating and cooling and whole-house surge protection. Air source heat pumps can be up to 300% efficient and heat, cool, and dehumidify your house. A qualified installer will help determine what size system to install and where. Whole-house surge protection will protect your appliances and heat pumps from being damaged by an electrical surge.</w:t>
       </w:r>
     </w:p>
     <w:p>
@@ -4175,17 +4189,17 @@
         <w:pStyle w:val="BodyText"/>
       </w:pPr>
       <w:r>
-        <w:t xml:space="preserve">Efficiency Maine rebates and other incentives for insulation work can fund up to 80% of the overall cost to weatherize your home (subject to a lifetime limit per building), up to $9,200 when combined with nonrefundable federal tax credits. You can call them at 866-376-2463 (Monday to Friday, 8:00 am to 5:00 pm) or visit their webpage about insulation rebates: https://www.efficiencymaine.com/at-home/insulation-rebates/</w:t>
+        <w:t xml:space="preserve">Efficiency Maine rebates can fund $1,000 to $3,000 per unit up to a lifetime limit per housing unit for $3,000 to $9,000 (depending on income level) to install heat pumps. The rebate can be combined with a nonrefundable federal tax credit of 30% of the remaining cost of the unit and labor, subject to an annual maximum benefit of $2,000 (shared with other energy property, like a heat pump water heater). You can call Efficiency Maine at 866-376-2463 (Monday to Friday, 8:00 am to 5:00 pm) or visit their website: https://www.efficiencymaine.com/at-home/residential-heat-pump-incentives/</w:t>
       </w:r>
     </w:p>
     <w:bookmarkEnd w:id="51"/>
-    <w:bookmarkStart w:id="52" w:name="electrical-panel-upgrade"/>
+    <w:bookmarkStart w:id="52" w:name="electric-vehicle-and-charger"/>
     <w:p>
       <w:pPr>
         <w:pStyle w:val="Heading3"/>
       </w:pPr>
       <w:r>
-        <w:t xml:space="preserve">4.11 Electrical Panel Upgrade</w:t>
+        <w:t xml:space="preserve">4.11 Electric Vehicle and charger</w:t>
       </w:r>
     </w:p>
     <w:p>
@@ -4205,11 +4219,81 @@
         <w:pStyle w:val="BodyText"/>
       </w:pPr>
       <w:r>
+        <w:t xml:space="preserve">Transportation, and particularly personal vehicles, are the leading cause of emissions in Maine. When you are planning to purchase a new vehicle, please consider a plug-in hybrid or all-electric vehicle.</w:t>
+      </w:r>
+    </w:p>
+    <w:p>
+      <w:pPr>
+        <w:pStyle w:val="BodyText"/>
+      </w:pPr>
+      <w:r>
+        <w:rPr>
+          <w:i/>
+          <w:iCs/>
+        </w:rPr>
+        <w:t xml:space="preserve">Recommendation</w:t>
+      </w:r>
+    </w:p>
+    <w:p>
+      <w:pPr>
+        <w:pStyle w:val="BodyText"/>
+      </w:pPr>
+      <w:r>
+        <w:t xml:space="preserve">An electric vehicle will eliminate your gas costs and reduce fossil fuel dependence. A 2020 study by Consumer Reports found that lifetime ownership costs were significantly lower for EVs, saving between $6,000 - $10,000 over their lifetimes.</w:t>
+      </w:r>
+    </w:p>
+    <w:p>
+      <w:pPr>
+        <w:pStyle w:val="BodyText"/>
+      </w:pPr>
+      <w:r>
+        <w:rPr>
+          <w:i/>
+          <w:iCs/>
+        </w:rPr>
+        <w:t xml:space="preserve">Estimated Cost/Benefits/Incentives</w:t>
+      </w:r>
+    </w:p>
+    <w:p>
+      <w:pPr>
+        <w:pStyle w:val="BodyText"/>
+      </w:pPr>
+      <w:r>
+        <w:t xml:space="preserve">You can review current state and federal financial incentives for electric vehicles here: https://www.electricforall.org/rebates-incentives/</w:t>
+      </w:r>
+    </w:p>
+    <w:bookmarkEnd w:id="52"/>
+    <w:bookmarkStart w:id="53" w:name="solar"/>
+    <w:p>
+      <w:pPr>
+        <w:pStyle w:val="Heading3"/>
+      </w:pPr>
+      <w:r>
+        <w:t xml:space="preserve">4.12 Solar</w:t>
+      </w:r>
+    </w:p>
+    <w:p>
+      <w:pPr>
+        <w:pStyle w:val="FirstParagraph"/>
+      </w:pPr>
+      <w:r>
+        <w:rPr>
+          <w:i/>
+          <w:iCs/>
+        </w:rPr>
+        <w:t xml:space="preserve">Problem</w:t>
+      </w:r>
+    </w:p>
+    <w:p>
+      <w:pPr>
+        <w:pStyle w:val="BodyText"/>
+      </w:pPr>
+      <w:r>
         <w:rPr>
           <w:b/>
           <w:bCs/>
         </w:rPr>
-        <w:t xml:space="preserve">Auditor to describe</w:t>
+        <w:t xml:space="preserve">Auditor to describe (or remove this section)</w:t>
       </w:r>
     </w:p>
     <w:p>
@@ -4229,7 +4313,7 @@
         <w:pStyle w:val="BodyText"/>
       </w:pPr>
       <w:r>
-        <w:t xml:space="preserve">Consult with an electrician about replacing your existing electrical panel with a 200 amp panel as you add electrical appliances to your home. It may become necessary to increase the capacity to address potential safety hazards. An electrician can determine whether or not a panel upgrade is necessary based on your current and anticipated usage.</w:t>
+        <w:t xml:space="preserve">Rooftop solar can supply most or all of your home electrical demands. Contact a solar company for pricing and details specific to your home.</w:t>
       </w:r>
     </w:p>
     <w:p>
@@ -4249,77 +4333,15 @@
         <w:pStyle w:val="BodyText"/>
       </w:pPr>
       <w:r>
-        <w:t xml:space="preserve">Costs of electrical components needed to support residential energy upgrades – including panels, sub-panels, branch circuits, and feeders – qualify for a 30% nonrefundable tax credit (up to $600 per item) if they have a capacity of 200 amps or more. An electrical panel upgrades also provides a good opportunity for an electrician to install whole-house surge protection, which costs $100-$400. Here are some options: https://www.popularmechanics.com/home/interior-projects/g43140886/best-whole-house-surge-protectors/</w:t>
-      </w:r>
-    </w:p>
-    <w:bookmarkEnd w:id="52"/>
-    <w:bookmarkStart w:id="53" w:name="air-source-heat-pump"/>
-    <w:p>
-      <w:pPr>
-        <w:pStyle w:val="Heading3"/>
-      </w:pPr>
-      <w:r>
-        <w:t xml:space="preserve">4.12 Air Source Heat Pump</w:t>
-      </w:r>
-    </w:p>
-    <w:p>
-      <w:pPr>
-        <w:pStyle w:val="FirstParagraph"/>
-      </w:pPr>
-      <w:r>
-        <w:rPr>
-          <w:i/>
-          <w:iCs/>
-        </w:rPr>
-        <w:t xml:space="preserve">Problem</w:t>
-      </w:r>
-    </w:p>
-    <w:p>
-      <w:pPr>
-        <w:pStyle w:val="BodyText"/>
-      </w:pPr>
-      <w:r>
-        <w:t xml:space="preserve">Combustion heating equipment is expensive, inefficient, and has the potential to release harmful combustion gases like carbon monoxide into the home.</w:t>
-      </w:r>
-    </w:p>
-    <w:p>
-      <w:pPr>
-        <w:pStyle w:val="BodyText"/>
-      </w:pPr>
-      <w:r>
-        <w:rPr>
-          <w:i/>
-          <w:iCs/>
-        </w:rPr>
-        <w:t xml:space="preserve">Recommendation</w:t>
-      </w:r>
-    </w:p>
-    <w:p>
-      <w:pPr>
-        <w:pStyle w:val="BodyText"/>
-      </w:pPr>
-      <w:r>
-        <w:t xml:space="preserve">Install air source heat pumps for heating and cooling and whole-house surge protection. Air source heat pumps can be up to 300% efficient and heat, cool, and dehumidify your house. A qualified installer will help determine what size system to install and where. Whole-house surge protection will protect your appliances and heat pumps from being damaged by an electrical surge.</w:t>
-      </w:r>
-    </w:p>
-    <w:p>
-      <w:pPr>
-        <w:pStyle w:val="BodyText"/>
-      </w:pPr>
-      <w:r>
-        <w:rPr>
-          <w:i/>
-          <w:iCs/>
-        </w:rPr>
-        <w:t xml:space="preserve">Estimated Cost/Benefits/Incentives</w:t>
-      </w:r>
-    </w:p>
-    <w:p>
-      <w:pPr>
-        <w:pStyle w:val="BodyText"/>
-      </w:pPr>
-      <w:r>
-        <w:t xml:space="preserve">Efficiency Maine rebates can fund $1,000 to $3,000 per unit up to a lifetime limit per housing unit for $3,000 to $9,000 (depending on income level) to install heat pumps. The rebate can be combined with a nonrefundable federal tax credit of 30% of the remaining cost of the unit and labor, subject to an annual maximum benefit of $2,000 (shared with other energy property, like a heat pump water heater). You can call Efficiency Maine at 866-376-2463 (Monday to Friday, 8:00 am to 5:00 pm) or visit their website: https://www.efficiencymaine.com/at-home/residential-heat-pump-incentives/</w:t>
+        <w:t xml:space="preserve">There is a 30% nonrefundable federal tax credit and financing options are available. Battery backup is needed for solar to work during a power outage. Information on the federal tax credit: https://www.energy.gov/sites/default/files/2023-03/Homeowners_Guide_to_the_Federal_Tax_Credit_for_Solar_PV.pdf</w:t>
+      </w:r>
+    </w:p>
+    <w:p>
+      <w:pPr>
+        <w:pStyle w:val="BodyText"/>
+      </w:pPr>
+      <w:r>
+        <w:t xml:space="preserve">The State of Maine is working on a solar and battery funding initiative for low-income and disadvantaged Maine households. It is still in the planning stages, but you can find more information here: https://www.maine.gov/energy/initiatives/infrastructure/solar-for-all</w:t>
       </w:r>
     </w:p>
     <w:p>
@@ -4927,83 +4949,83 @@
         <w:t xml:space="preserve">6 Section Four Tests</w:t>
       </w:r>
     </w:p>
-    <w:bookmarkStart w:id="56" w:name="windowdressers"/>
+    <w:bookmarkStart w:id="56" w:name="attic-air-sealing-and-insulation"/>
     <w:p>
       <w:pPr>
         <w:pStyle w:val="Heading3"/>
       </w:pPr>
       <w:r>
-        <w:t xml:space="preserve">6.1 WindowDressers</w:t>
+        <w:t xml:space="preserve">6.1 Attic Air Sealing and Insulation</w:t>
       </w:r>
     </w:p>
     <w:bookmarkEnd w:id="56"/>
-    <w:bookmarkStart w:id="57" w:name="leds-1"/>
+    <w:bookmarkStart w:id="57" w:name="blown-in-cellulose-wall-insulation"/>
     <w:p>
       <w:pPr>
         <w:pStyle w:val="Heading3"/>
       </w:pPr>
       <w:r>
-        <w:t xml:space="preserve">6.2 LEDs</w:t>
+        <w:t xml:space="preserve">6.2 Blown-in Cellulose Wall Insulation</w:t>
       </w:r>
     </w:p>
     <w:bookmarkEnd w:id="57"/>
-    <w:bookmarkStart w:id="58" w:name="high-efficiency-shower-heads-1"/>
+    <w:bookmarkStart w:id="58" w:name="gutters-1"/>
     <w:p>
       <w:pPr>
         <w:pStyle w:val="Heading3"/>
       </w:pPr>
       <w:r>
-        <w:t xml:space="preserve">6.3 High-efficiency Shower Head(s)</w:t>
+        <w:t xml:space="preserve">6.3 Gutters</w:t>
       </w:r>
     </w:p>
     <w:bookmarkEnd w:id="58"/>
-    <w:bookmarkStart w:id="59" w:name="gutters-1"/>
+    <w:bookmarkStart w:id="59" w:name="windowdressers"/>
     <w:p>
       <w:pPr>
         <w:pStyle w:val="Heading3"/>
       </w:pPr>
       <w:r>
-        <w:t xml:space="preserve">6.4 Gutters</w:t>
+        <w:t xml:space="preserve">6.4 WindowDressers</w:t>
       </w:r>
     </w:p>
     <w:bookmarkEnd w:id="59"/>
-    <w:bookmarkStart w:id="60" w:name="bathroom-exhaust-fans-1"/>
+    <w:bookmarkStart w:id="60" w:name="electrical-panel-upgrade-1"/>
     <w:p>
       <w:pPr>
         <w:pStyle w:val="Heading3"/>
       </w:pPr>
       <w:r>
-        <w:t xml:space="preserve">6.5 Bathroom Exhaust Fan(s)</w:t>
+        <w:t xml:space="preserve">6.5 Electrical Panel Upgrade</w:t>
       </w:r>
     </w:p>
     <w:bookmarkEnd w:id="60"/>
-    <w:bookmarkStart w:id="61" w:name="kitchen-exhaust-fan"/>
+    <w:bookmarkStart w:id="61" w:name="air-source-heat-pump-1"/>
     <w:p>
       <w:pPr>
         <w:pStyle w:val="Heading3"/>
       </w:pPr>
       <w:r>
-        <w:t xml:space="preserve">6.6 Kitchen Exhaust Fan</w:t>
+        <w:t xml:space="preserve">6.6 Air Source Heat Pump</w:t>
       </w:r>
     </w:p>
     <w:bookmarkEnd w:id="61"/>
-    <w:bookmarkStart w:id="62" w:name="induction-stoveoven-1"/>
+    <w:bookmarkStart w:id="62" w:name="continuous-exterior-wall-insulation-1"/>
     <w:p>
       <w:pPr>
         <w:pStyle w:val="Heading3"/>
       </w:pPr>
       <w:r>
-        <w:t xml:space="preserve">6.7 Induction Stove/Oven</w:t>
+        <w:t xml:space="preserve">6.7 Continuous Exterior Wall Insulation</w:t>
       </w:r>
     </w:p>
     <w:bookmarkEnd w:id="62"/>
-    <w:bookmarkStart w:id="63" w:name="attic-air-sealing-and-insulation"/>
+    <w:bookmarkStart w:id="63" w:name="spray-foam-basementcrawlspace-walls"/>
     <w:p>
       <w:pPr>
         <w:pStyle w:val="Heading3"/>
       </w:pPr>
       <w:r>
-        <w:t xml:space="preserve">6.8 Attic Air Sealing and Insulation</w:t>
+        <w:t xml:space="preserve">6.8 Spray Foam Basement/Crawlspace Walls</w:t>
       </w:r>
     </w:p>
     <w:bookmarkEnd w:id="63"/>
@@ -5017,33 +5039,33 @@
       </w:r>
     </w:p>
     <w:bookmarkEnd w:id="64"/>
-    <w:bookmarkStart w:id="65" w:name="spray-foam-basementcrawlspace-walls"/>
+    <w:bookmarkStart w:id="65" w:name="heat-pump-water-heater-1"/>
     <w:p>
       <w:pPr>
         <w:pStyle w:val="Heading3"/>
       </w:pPr>
       <w:r>
-        <w:t xml:space="preserve">6.10 Spray Foam Basement/Crawlspace Walls</w:t>
+        <w:t xml:space="preserve">6.10 Heat Pump Water Heater</w:t>
       </w:r>
     </w:p>
     <w:bookmarkEnd w:id="65"/>
-    <w:bookmarkStart w:id="66" w:name="electrical-panel-upgrade-1"/>
+    <w:bookmarkStart w:id="66" w:name="solar-1"/>
     <w:p>
       <w:pPr>
         <w:pStyle w:val="Heading3"/>
       </w:pPr>
       <w:r>
-        <w:t xml:space="preserve">6.11 Electrical Panel Upgrade</w:t>
+        <w:t xml:space="preserve">6.11 Solar</w:t>
       </w:r>
     </w:p>
     <w:bookmarkEnd w:id="66"/>
-    <w:bookmarkStart w:id="67" w:name="air-source-heat-pump-1"/>
+    <w:bookmarkStart w:id="67" w:name="evcharger"/>
     <w:p>
       <w:pPr>
         <w:pStyle w:val="Heading3"/>
       </w:pPr>
       <w:r>
-        <w:t xml:space="preserve">6.12 Air Source Heat Pump</w:t>
+        <w:t xml:space="preserve">6.12 EV+Charger</w:t>
       </w:r>
     </w:p>
     <w:p>

</xml_diff>

<commit_message>
Render Ben Spurling report
</commit_message>
<xml_diff>
--- a/Quarto_report/Audit_Report.docx
+++ b/Quarto_report/Audit_Report.docx
@@ -15,31 +15,31 @@
         <w:pStyle w:val="FirstParagraph"/>
       </w:pPr>
       <w:r>
-        <w:t xml:space="preserve">Homeowner(s): Ladies Aid, Barbara Myers</w:t>
-      </w:r>
-    </w:p>
-    <w:p>
-      <w:pPr>
-        <w:pStyle w:val="BodyText"/>
-      </w:pPr>
-      <w:r>
-        <w:t xml:space="preserve">Address: 177 Cranberry Rd, Cranberry Isles Maine, 04625</w:t>
-      </w:r>
-    </w:p>
-    <w:p>
-      <w:pPr>
-        <w:pStyle w:val="BodyText"/>
-      </w:pPr>
-      <w:r>
-        <w:t xml:space="preserve">Owner Contact: NA</w:t>
-      </w:r>
-    </w:p>
-    <w:p>
-      <w:pPr>
-        <w:pStyle w:val="BodyText"/>
-      </w:pPr>
-      <w:r>
-        <w:t xml:space="preserve">Auditors: Adler Garner, Emerson Bedell, Helen Lloyd, Nicole Grohoski, Zoe Duni</w:t>
+        <w:t xml:space="preserve">Homeowner(s): Ben Sumner</w:t>
+      </w:r>
+    </w:p>
+    <w:p>
+      <w:pPr>
+        <w:pStyle w:val="BodyText"/>
+      </w:pPr>
+      <w:r>
+        <w:t xml:space="preserve">Address: 5 Elwood Spurling Ln, Cranberry Isles, ME, 04625</w:t>
+      </w:r>
+    </w:p>
+    <w:p>
+      <w:pPr>
+        <w:pStyle w:val="BodyText"/>
+      </w:pPr>
+      <w:r>
+        <w:t xml:space="preserve">Owner Contact: ben.sumner@protonmail.com, (207) 664-8364</w:t>
+      </w:r>
+    </w:p>
+    <w:p>
+      <w:pPr>
+        <w:pStyle w:val="BodyText"/>
+      </w:pPr>
+      <w:r>
+        <w:t xml:space="preserve">Auditors: Pilot program team (Nicole, Zoe, Alder, Uriel)</w:t>
       </w:r>
     </w:p>
     <w:p>
@@ -55,7 +55,7 @@
         <w:pStyle w:val="BodyText"/>
       </w:pPr>
       <w:r>
-        <w:t xml:space="preserve">Report Date: June 26, 2025</w:t>
+        <w:t xml:space="preserve">Report Date: June 27, 2025</w:t>
       </w:r>
     </w:p>
     <w:p>
@@ -70,7 +70,7 @@
         <w:pStyle w:val="FirstParagraph"/>
       </w:pPr>
       <w:r>
-        <w:t xml:space="preserve">We conducted an energy assessment of your home on 5/26/2024. This report will tell you what we did, what we found, and what we suggest for your home. These suggestions include information on incentives and financing to make improvements more affordable.</w:t>
+        <w:t xml:space="preserve">We conducted an energy assessment of your home on 9/5/2024. This report will tell you what we did, what we found, and what we suggest for your home. These suggestions include information on incentives and financing to make improvements more affordable.</w:t>
       </w:r>
     </w:p>
     <w:p>
@@ -234,7 +234,7 @@
         <w:pStyle w:val="FirstParagraph"/>
       </w:pPr>
       <w:r>
-        <w:t xml:space="preserve">We assessed combustion appliances that burn fossil fuels such as propane, heating oil, or kerosene. These include furnaces, boilers, water heaters, and gas ovens. We visually inspected the combustion appliance(s) in your home, but we were unable to perform combustion safety tests. We also performed gas leak detection tests on your propane appliance(s).</w:t>
+        <w:t xml:space="preserve">We assessed combustion appliances that burn fossil fuels such as propane, heating oil, or kerosene. These include furnaces, boilers, water heaters, and gas ovens. We visually inspected the combustion appliance(s) in your home, but we were unable to perform combustion safety tests.</w:t>
       </w:r>
     </w:p>
     <w:bookmarkEnd w:id="27"/>
@@ -344,31 +344,31 @@
                 <w:rFonts w:ascii="Calibri" w:hAnsi="Calibri"/>
                 <w:sz w:val="20"/>
               </w:rPr>
-              <w:t xml:space="default">Attic Air Sealing and Insulation</w:t>
-            </w:r>
-          </w:p>
-        </w:tc>
-        <w:tc>
-          <w:tcPr>
-            <w:tcBorders>
-              <w:top w:val="single" w:space="0" w:color="D3D3D3"/>
-              <w:bottom w:val="single" w:space="0" w:color="D3D3D3"/>
-              <w:start w:val="single" w:space="0" w:color="D3D3D3"/>
-              <w:end w:val="single" w:space="0" w:color="D3D3D3"/>
-            </w:tcBorders>
-          </w:tcPr>
-          <w:p>
-            <w:pPr>
-              <w:spacing w:before="0" w:after="60"/>
-              <w:keepNext/>
-              <w:jc w:val="start"/>
-            </w:pPr>
-            <w:r>
-              <w:rPr>
-                <w:rFonts w:ascii="Calibri" w:hAnsi="Calibri"/>
-                <w:sz w:val="20"/>
-              </w:rPr>
-              <w:t xml:space="default">Air seal the attic and insulate it to at least R-60 (18 inches of loose-fill cellulose insulation).</w:t>
+              <w:t xml:space="default">Furnace/Boiler Tune-up</w:t>
+            </w:r>
+          </w:p>
+        </w:tc>
+        <w:tc>
+          <w:tcPr>
+            <w:tcBorders>
+              <w:top w:val="single" w:space="0" w:color="D3D3D3"/>
+              <w:bottom w:val="single" w:space="0" w:color="D3D3D3"/>
+              <w:start w:val="single" w:space="0" w:color="D3D3D3"/>
+              <w:end w:val="single" w:space="0" w:color="D3D3D3"/>
+            </w:tcBorders>
+          </w:tcPr>
+          <w:p>
+            <w:pPr>
+              <w:spacing w:before="0" w:after="60"/>
+              <w:keepNext/>
+              <w:jc w:val="start"/>
+            </w:pPr>
+            <w:r>
+              <w:rPr>
+                <w:rFonts w:ascii="Calibri" w:hAnsi="Calibri"/>
+                <w:sz w:val="20"/>
+              </w:rPr>
+              <w:t xml:space="default">Have the furnace/boiler and flue inspected and adjusted by a licensed professional. This should be available from your fuel delivery company.</w:t>
             </w:r>
           </w:p>
         </w:tc>
@@ -397,31 +397,31 @@
                 <w:rFonts w:ascii="Calibri" w:hAnsi="Calibri"/>
                 <w:sz w:val="20"/>
               </w:rPr>
-              <w:t xml:space="default">Blown-in Cellulose Wall Insulation</w:t>
-            </w:r>
-          </w:p>
-        </w:tc>
-        <w:tc>
-          <w:tcPr>
-            <w:tcBorders>
-              <w:top w:val="single" w:space="0" w:color="D3D3D3"/>
-              <w:bottom w:val="single" w:space="0" w:color="D3D3D3"/>
-              <w:start w:val="single" w:space="0" w:color="D3D3D3"/>
-              <w:end w:val="single" w:space="0" w:color="D3D3D3"/>
-            </w:tcBorders>
-          </w:tcPr>
-          <w:p>
-            <w:pPr>
-              <w:spacing w:before="0" w:after="60"/>
-              <w:keepNext/>
-              <w:jc w:val="start"/>
-            </w:pPr>
-            <w:r>
-              <w:rPr>
-                <w:rFonts w:ascii="Calibri" w:hAnsi="Calibri"/>
-                <w:sz w:val="20"/>
-              </w:rPr>
-              <w:t xml:space="default">Insulate the wall stud cavities with dense packed, blown-in cellulose insulation.</w:t>
+              <w:t xml:space="default">High-efficiency Shower Head(s)</w:t>
+            </w:r>
+          </w:p>
+        </w:tc>
+        <w:tc>
+          <w:tcPr>
+            <w:tcBorders>
+              <w:top w:val="single" w:space="0" w:color="D3D3D3"/>
+              <w:bottom w:val="single" w:space="0" w:color="D3D3D3"/>
+              <w:start w:val="single" w:space="0" w:color="D3D3D3"/>
+              <w:end w:val="single" w:space="0" w:color="D3D3D3"/>
+            </w:tcBorders>
+          </w:tcPr>
+          <w:p>
+            <w:pPr>
+              <w:spacing w:before="0" w:after="60"/>
+              <w:keepNext/>
+              <w:jc w:val="start"/>
+            </w:pPr>
+            <w:r>
+              <w:rPr>
+                <w:rFonts w:ascii="Calibri" w:hAnsi="Calibri"/>
+                <w:sz w:val="20"/>
+              </w:rPr>
+              <w:t xml:space="default">Install high-efficiency shower heads to reduce the amount of water and energy to heat the water used when showering.</w:t>
             </w:r>
           </w:p>
         </w:tc>
@@ -450,31 +450,31 @@
                 <w:rFonts w:ascii="Calibri" w:hAnsi="Calibri"/>
                 <w:sz w:val="20"/>
               </w:rPr>
-              <w:t xml:space="default">Gutters</w:t>
-            </w:r>
-          </w:p>
-        </w:tc>
-        <w:tc>
-          <w:tcPr>
-            <w:tcBorders>
-              <w:top w:val="single" w:space="0" w:color="D3D3D3"/>
-              <w:bottom w:val="single" w:space="0" w:color="D3D3D3"/>
-              <w:start w:val="single" w:space="0" w:color="D3D3D3"/>
-              <w:end w:val="single" w:space="0" w:color="D3D3D3"/>
-            </w:tcBorders>
-          </w:tcPr>
-          <w:p>
-            <w:pPr>
-              <w:spacing w:before="0" w:after="60"/>
-              <w:keepNext/>
-              <w:jc w:val="start"/>
-            </w:pPr>
-            <w:r>
-              <w:rPr>
-                <w:rFonts w:ascii="Calibri" w:hAnsi="Calibri"/>
-                <w:sz w:val="20"/>
-              </w:rPr>
-              <w:t xml:space="default">Install gutters and downspouts that divert water at least six feet away from the foundation and to where the ground slopes away from the house.</w:t>
+              <w:t xml:space="default">LEDs</w:t>
+            </w:r>
+          </w:p>
+        </w:tc>
+        <w:tc>
+          <w:tcPr>
+            <w:tcBorders>
+              <w:top w:val="single" w:space="0" w:color="D3D3D3"/>
+              <w:bottom w:val="single" w:space="0" w:color="D3D3D3"/>
+              <w:start w:val="single" w:space="0" w:color="D3D3D3"/>
+              <w:end w:val="single" w:space="0" w:color="D3D3D3"/>
+            </w:tcBorders>
+          </w:tcPr>
+          <w:p>
+            <w:pPr>
+              <w:spacing w:before="0" w:after="60"/>
+              <w:keepNext/>
+              <w:jc w:val="start"/>
+            </w:pPr>
+            <w:r>
+              <w:rPr>
+                <w:rFonts w:ascii="Calibri" w:hAnsi="Calibri"/>
+                <w:sz w:val="20"/>
+              </w:rPr>
+              <w:t xml:space="default">Switch your light bulbs to LED light bulbs. LEDs use 80% less energy than incandescent light bulbs which can significantly reduce your electricity bill.</w:t>
             </w:r>
           </w:p>
         </w:tc>
@@ -556,31 +556,31 @@
                 <w:rFonts w:ascii="Calibri" w:hAnsi="Calibri"/>
                 <w:sz w:val="20"/>
               </w:rPr>
-              <w:t xml:space="default">Electrical Panel Upgrade</w:t>
-            </w:r>
-          </w:p>
-        </w:tc>
-        <w:tc>
-          <w:tcPr>
-            <w:tcBorders>
-              <w:top w:val="single" w:space="0" w:color="D3D3D3"/>
-              <w:bottom w:val="single" w:space="0" w:color="D3D3D3"/>
-              <w:start w:val="single" w:space="0" w:color="D3D3D3"/>
-              <w:end w:val="single" w:space="0" w:color="D3D3D3"/>
-            </w:tcBorders>
-          </w:tcPr>
-          <w:p>
-            <w:pPr>
-              <w:spacing w:before="0" w:after="60"/>
-              <w:keepNext/>
-              <w:jc w:val="start"/>
-            </w:pPr>
-            <w:r>
-              <w:rPr>
-                <w:rFonts w:ascii="Calibri" w:hAnsi="Calibri"/>
-                <w:sz w:val="20"/>
-              </w:rPr>
-              <w:t xml:space="default">Consult with an electrician about replacing your existing electrical panel with a 200 amp panel as you add electrical appliances to your home.</w:t>
+              <w:t xml:space="default">Heat Pump Water Heater</w:t>
+            </w:r>
+          </w:p>
+        </w:tc>
+        <w:tc>
+          <w:tcPr>
+            <w:tcBorders>
+              <w:top w:val="single" w:space="0" w:color="D3D3D3"/>
+              <w:bottom w:val="single" w:space="0" w:color="D3D3D3"/>
+              <w:start w:val="single" w:space="0" w:color="D3D3D3"/>
+              <w:end w:val="single" w:space="0" w:color="D3D3D3"/>
+            </w:tcBorders>
+          </w:tcPr>
+          <w:p>
+            <w:pPr>
+              <w:spacing w:before="0" w:after="60"/>
+              <w:keepNext/>
+              <w:jc w:val="start"/>
+            </w:pPr>
+            <w:r>
+              <w:rPr>
+                <w:rFonts w:ascii="Calibri" w:hAnsi="Calibri"/>
+                <w:sz w:val="20"/>
+              </w:rPr>
+              <w:t xml:space="default">Install a heat pump water heater to provide your hot water for cooking and bathing. This is the most efficient way to heat water and will save hundreds of dollars a year compared to electric resistance, heating oil, or propane hot water. It will also help to dehumidify while it's running. If your current water heater burns oil or propane, this will also remove a source of combustion gases from your home.</w:t>
             </w:r>
           </w:p>
         </w:tc>
@@ -609,31 +609,31 @@
                 <w:rFonts w:ascii="Calibri" w:hAnsi="Calibri"/>
                 <w:sz w:val="20"/>
               </w:rPr>
-              <w:t xml:space="default">Air Source Heat Pump</w:t>
-            </w:r>
-          </w:p>
-        </w:tc>
-        <w:tc>
-          <w:tcPr>
-            <w:tcBorders>
-              <w:top w:val="single" w:space="0" w:color="D3D3D3"/>
-              <w:bottom w:val="single" w:space="0" w:color="D3D3D3"/>
-              <w:start w:val="single" w:space="0" w:color="D3D3D3"/>
-              <w:end w:val="single" w:space="0" w:color="D3D3D3"/>
-            </w:tcBorders>
-          </w:tcPr>
-          <w:p>
-            <w:pPr>
-              <w:spacing w:before="0" w:after="60"/>
-              <w:keepNext/>
-              <w:jc w:val="start"/>
-            </w:pPr>
-            <w:r>
-              <w:rPr>
-                <w:rFonts w:ascii="Calibri" w:hAnsi="Calibri"/>
-                <w:sz w:val="20"/>
-              </w:rPr>
-              <w:t xml:space="default">Install air source heat pumps for heating and cooling and whole-house surge protection.</w:t>
+              <w:t xml:space="default">Gutters</w:t>
+            </w:r>
+          </w:p>
+        </w:tc>
+        <w:tc>
+          <w:tcPr>
+            <w:tcBorders>
+              <w:top w:val="single" w:space="0" w:color="D3D3D3"/>
+              <w:bottom w:val="single" w:space="0" w:color="D3D3D3"/>
+              <w:start w:val="single" w:space="0" w:color="D3D3D3"/>
+              <w:end w:val="single" w:space="0" w:color="D3D3D3"/>
+            </w:tcBorders>
+          </w:tcPr>
+          <w:p>
+            <w:pPr>
+              <w:spacing w:before="0" w:after="60"/>
+              <w:keepNext/>
+              <w:jc w:val="start"/>
+            </w:pPr>
+            <w:r>
+              <w:rPr>
+                <w:rFonts w:ascii="Calibri" w:hAnsi="Calibri"/>
+                <w:sz w:val="20"/>
+              </w:rPr>
+              <w:t xml:space="default">Install gutters and downspouts that divert water at least six feet away from the foundation and to where the ground slopes away from the house.</w:t>
             </w:r>
           </w:p>
         </w:tc>
@@ -662,31 +662,31 @@
                 <w:rFonts w:ascii="Calibri" w:hAnsi="Calibri"/>
                 <w:sz w:val="20"/>
               </w:rPr>
-              <w:t xml:space="default">Continuous Exterior Wall Insulation</w:t>
-            </w:r>
-          </w:p>
-        </w:tc>
-        <w:tc>
-          <w:tcPr>
-            <w:tcBorders>
-              <w:top w:val="single" w:space="0" w:color="D3D3D3"/>
-              <w:bottom w:val="single" w:space="0" w:color="D3D3D3"/>
-              <w:start w:val="single" w:space="0" w:color="D3D3D3"/>
-              <w:end w:val="single" w:space="0" w:color="D3D3D3"/>
-            </w:tcBorders>
-          </w:tcPr>
-          <w:p>
-            <w:pPr>
-              <w:spacing w:before="0" w:after="60"/>
-              <w:keepNext/>
-              <w:jc w:val="start"/>
-            </w:pPr>
-            <w:r>
-              <w:rPr>
-                <w:rFonts w:ascii="Calibri" w:hAnsi="Calibri"/>
-                <w:sz w:val="20"/>
-              </w:rPr>
-              <w:t xml:space="default">Add a continuous layer of insulation and potentially replace the air and moisture barrier once it becomes time to replace the siding.</w:t>
+              <w:t xml:space="default">Bathroom Exhaust Fan(s)</w:t>
+            </w:r>
+          </w:p>
+        </w:tc>
+        <w:tc>
+          <w:tcPr>
+            <w:tcBorders>
+              <w:top w:val="single" w:space="0" w:color="D3D3D3"/>
+              <w:bottom w:val="single" w:space="0" w:color="D3D3D3"/>
+              <w:start w:val="single" w:space="0" w:color="D3D3D3"/>
+              <w:end w:val="single" w:space="0" w:color="D3D3D3"/>
+            </w:tcBorders>
+          </w:tcPr>
+          <w:p>
+            <w:pPr>
+              <w:spacing w:before="0" w:after="60"/>
+              <w:keepNext/>
+              <w:jc w:val="start"/>
+            </w:pPr>
+            <w:r>
+              <w:rPr>
+                <w:rFonts w:ascii="Calibri" w:hAnsi="Calibri"/>
+                <w:sz w:val="20"/>
+              </w:rPr>
+              <w:t xml:space="default">Install bathroom exhaust fans in all bathrooms that do not have them. These should be rated for at least 80 cubic feet per minute (CFM) if there is a shower. We recommend the Panasonic Whisper series or similar fans that don’t create excess noise.</w:t>
             </w:r>
           </w:p>
         </w:tc>
@@ -715,31 +715,31 @@
                 <w:rFonts w:ascii="Calibri" w:hAnsi="Calibri"/>
                 <w:sz w:val="20"/>
               </w:rPr>
-              <w:t xml:space="default">Spray Foam Basement/Crawlspace Walls</w:t>
-            </w:r>
-          </w:p>
-        </w:tc>
-        <w:tc>
-          <w:tcPr>
-            <w:tcBorders>
-              <w:top w:val="single" w:space="0" w:color="D3D3D3"/>
-              <w:bottom w:val="single" w:space="0" w:color="D3D3D3"/>
-              <w:start w:val="single" w:space="0" w:color="D3D3D3"/>
-              <w:end w:val="single" w:space="0" w:color="D3D3D3"/>
-            </w:tcBorders>
-          </w:tcPr>
-          <w:p>
-            <w:pPr>
-              <w:spacing w:before="0" w:after="60"/>
-              <w:keepNext/>
-              <w:jc w:val="start"/>
-            </w:pPr>
-            <w:r>
-              <w:rPr>
-                <w:rFonts w:ascii="Calibri" w:hAnsi="Calibri"/>
-                <w:sz w:val="20"/>
-              </w:rPr>
-              <w:t xml:space="default">Install spray foam on the basement/crawlspace walls to prevent moisture infiltration and reduce heat loss.</w:t>
+              <w:t xml:space="default">Kitchen Exhaust Fan</w:t>
+            </w:r>
+          </w:p>
+        </w:tc>
+        <w:tc>
+          <w:tcPr>
+            <w:tcBorders>
+              <w:top w:val="single" w:space="0" w:color="D3D3D3"/>
+              <w:bottom w:val="single" w:space="0" w:color="D3D3D3"/>
+              <w:start w:val="single" w:space="0" w:color="D3D3D3"/>
+              <w:end w:val="single" w:space="0" w:color="D3D3D3"/>
+            </w:tcBorders>
+          </w:tcPr>
+          <w:p>
+            <w:pPr>
+              <w:spacing w:before="0" w:after="60"/>
+              <w:keepNext/>
+              <w:jc w:val="start"/>
+            </w:pPr>
+            <w:r>
+              <w:rPr>
+                <w:rFonts w:ascii="Calibri" w:hAnsi="Calibri"/>
+                <w:sz w:val="20"/>
+              </w:rPr>
+              <w:t xml:space="default">Install a kitchen exhaust fan to remove cooking fumes and moisture from your home. The fan should be rated for at least 100 cubic feet per minute. A kitchen fan should be ducted to the outdoors. If the ductwork will run through the attic, it should be installed before the attic is air-sealed and insulated.</w:t>
             </w:r>
           </w:p>
         </w:tc>
@@ -821,31 +821,31 @@
                 <w:rFonts w:ascii="Calibri" w:hAnsi="Calibri"/>
                 <w:sz w:val="20"/>
               </w:rPr>
-              <w:t xml:space="default">Heat Pump Water Heater</w:t>
-            </w:r>
-          </w:p>
-        </w:tc>
-        <w:tc>
-          <w:tcPr>
-            <w:tcBorders>
-              <w:top w:val="single" w:space="0" w:color="D3D3D3"/>
-              <w:bottom w:val="single" w:space="0" w:color="D3D3D3"/>
-              <w:start w:val="single" w:space="0" w:color="D3D3D3"/>
-              <w:end w:val="single" w:space="0" w:color="D3D3D3"/>
-            </w:tcBorders>
-          </w:tcPr>
-          <w:p>
-            <w:pPr>
-              <w:spacing w:before="0" w:after="60"/>
-              <w:keepNext/>
-              <w:jc w:val="start"/>
-            </w:pPr>
-            <w:r>
-              <w:rPr>
-                <w:rFonts w:ascii="Calibri" w:hAnsi="Calibri"/>
-                <w:sz w:val="20"/>
-              </w:rPr>
-              <w:t xml:space="default">Install a heat pump water heater to provide your hot water for cooking and bathing. This is the most efficient way to heat water and will save hundreds of dollars a year compared to electric resistance, heating oil, or propane hot water. It will also help to dehumidify while it's running. If your current water heater burns oil or propane, this will also remove a source of combustion gases from your home.</w:t>
+              <w:t xml:space="default">Spray Foam Basement/Crawlspace Walls</w:t>
+            </w:r>
+          </w:p>
+        </w:tc>
+        <w:tc>
+          <w:tcPr>
+            <w:tcBorders>
+              <w:top w:val="single" w:space="0" w:color="D3D3D3"/>
+              <w:bottom w:val="single" w:space="0" w:color="D3D3D3"/>
+              <w:start w:val="single" w:space="0" w:color="D3D3D3"/>
+              <w:end w:val="single" w:space="0" w:color="D3D3D3"/>
+            </w:tcBorders>
+          </w:tcPr>
+          <w:p>
+            <w:pPr>
+              <w:spacing w:before="0" w:after="60"/>
+              <w:keepNext/>
+              <w:jc w:val="start"/>
+            </w:pPr>
+            <w:r>
+              <w:rPr>
+                <w:rFonts w:ascii="Calibri" w:hAnsi="Calibri"/>
+                <w:sz w:val="20"/>
+              </w:rPr>
+              <w:t xml:space="default">Install spray foam on the basement/crawlspace walls to prevent moisture infiltration and reduce heat loss.</w:t>
             </w:r>
           </w:p>
         </w:tc>
@@ -874,31 +874,31 @@
                 <w:rFonts w:ascii="Calibri" w:hAnsi="Calibri"/>
                 <w:sz w:val="20"/>
               </w:rPr>
-              <w:t xml:space="default">Solar</w:t>
-            </w:r>
-          </w:p>
-        </w:tc>
-        <w:tc>
-          <w:tcPr>
-            <w:tcBorders>
-              <w:top w:val="single" w:space="0" w:color="D3D3D3"/>
-              <w:bottom w:val="single" w:space="0" w:color="D3D3D3"/>
-              <w:start w:val="single" w:space="0" w:color="D3D3D3"/>
-              <w:end w:val="single" w:space="0" w:color="D3D3D3"/>
-            </w:tcBorders>
-          </w:tcPr>
-          <w:p>
-            <w:pPr>
-              <w:spacing w:before="0" w:after="60"/>
-              <w:keepNext/>
-              <w:jc w:val="start"/>
-            </w:pPr>
-            <w:r>
-              <w:rPr>
-                <w:rFonts w:ascii="Calibri" w:hAnsi="Calibri"/>
-                <w:sz w:val="20"/>
-              </w:rPr>
-              <w:t xml:space="default">Rooftop solar can supply most or all of your home electrical demands. Contact a solar company for pricing and details specific to your home.</w:t>
+              <w:t xml:space="default">Attic Air Sealing and Insulation</w:t>
+            </w:r>
+          </w:p>
+        </w:tc>
+        <w:tc>
+          <w:tcPr>
+            <w:tcBorders>
+              <w:top w:val="single" w:space="0" w:color="D3D3D3"/>
+              <w:bottom w:val="single" w:space="0" w:color="D3D3D3"/>
+              <w:start w:val="single" w:space="0" w:color="D3D3D3"/>
+              <w:end w:val="single" w:space="0" w:color="D3D3D3"/>
+            </w:tcBorders>
+          </w:tcPr>
+          <w:p>
+            <w:pPr>
+              <w:spacing w:before="0" w:after="60"/>
+              <w:keepNext/>
+              <w:jc w:val="start"/>
+            </w:pPr>
+            <w:r>
+              <w:rPr>
+                <w:rFonts w:ascii="Calibri" w:hAnsi="Calibri"/>
+                <w:sz w:val="20"/>
+              </w:rPr>
+              <w:t xml:space="default">Air seal the attic and insulate it to at least R-60 (18 inches of loose-fill cellulose insulation).</w:t>
             </w:r>
           </w:p>
         </w:tc>
@@ -927,31 +927,243 @@
                 <w:rFonts w:ascii="Calibri" w:hAnsi="Calibri"/>
                 <w:sz w:val="20"/>
               </w:rPr>
-              <w:t xml:space="default">EV+Charger</w:t>
-            </w:r>
-          </w:p>
-        </w:tc>
-        <w:tc>
-          <w:tcPr>
-            <w:tcBorders>
-              <w:top w:val="single" w:space="0" w:color="D3D3D3"/>
-              <w:bottom w:val="single" w:space="0" w:color="D3D3D3"/>
-              <w:start w:val="single" w:space="0" w:color="D3D3D3"/>
-              <w:end w:val="single" w:space="0" w:color="D3D3D3"/>
-            </w:tcBorders>
-          </w:tcPr>
-          <w:p>
-            <w:pPr>
-              <w:spacing w:before="0" w:after="60"/>
-              <w:keepNext/>
-              <w:jc w:val="start"/>
-            </w:pPr>
-            <w:r>
-              <w:rPr>
-                <w:rFonts w:ascii="Calibri" w:hAnsi="Calibri"/>
-                <w:sz w:val="20"/>
-              </w:rPr>
-              <w:t xml:space="default">An electric vehicle will eliminate your gas costs and reduce fossil fuel dependence. A 2020 study by Consumer Reports found that lifetime ownership costs were significantly lower for EVs, saving between $6,000 - $10,000 over their lifetimes.</w:t>
+              <w:t xml:space="default">Blown-in Cellulose Wall Insulation</w:t>
+            </w:r>
+          </w:p>
+        </w:tc>
+        <w:tc>
+          <w:tcPr>
+            <w:tcBorders>
+              <w:top w:val="single" w:space="0" w:color="D3D3D3"/>
+              <w:bottom w:val="single" w:space="0" w:color="D3D3D3"/>
+              <w:start w:val="single" w:space="0" w:color="D3D3D3"/>
+              <w:end w:val="single" w:space="0" w:color="D3D3D3"/>
+            </w:tcBorders>
+          </w:tcPr>
+          <w:p>
+            <w:pPr>
+              <w:spacing w:before="0" w:after="60"/>
+              <w:keepNext/>
+              <w:jc w:val="start"/>
+            </w:pPr>
+            <w:r>
+              <w:rPr>
+                <w:rFonts w:ascii="Calibri" w:hAnsi="Calibri"/>
+                <w:sz w:val="20"/>
+              </w:rPr>
+              <w:t xml:space="default">Insulate the wall stud cavities with dense packed, blown-in cellulose insulation.</w:t>
+            </w:r>
+          </w:p>
+        </w:tc>
+      </w:tr>
+      <w:tr>
+        <w:trPr>
+          <w:cantSplit/>
+        </w:trPr>
+        <w:tc>
+          <w:tcPr>
+            <w:tcBorders>
+              <w:top w:val="single" w:space="0" w:color="D3D3D3"/>
+              <w:bottom w:val="single" w:space="0" w:color="D3D3D3"/>
+              <w:start w:val="single" w:space="0" w:color="D3D3D3"/>
+              <w:end w:val="single" w:space="0" w:color="D3D3D3"/>
+            </w:tcBorders>
+          </w:tcPr>
+          <w:p>
+            <w:pPr>
+              <w:spacing w:before="0" w:after="60"/>
+              <w:keepNext/>
+              <w:jc w:val="start"/>
+            </w:pPr>
+            <w:r>
+              <w:rPr>
+                <w:rFonts w:ascii="Calibri" w:hAnsi="Calibri"/>
+                <w:sz w:val="20"/>
+              </w:rPr>
+              <w:t xml:space="default">Continuous Exterior Wall Insulation</w:t>
+            </w:r>
+          </w:p>
+        </w:tc>
+        <w:tc>
+          <w:tcPr>
+            <w:tcBorders>
+              <w:top w:val="single" w:space="0" w:color="D3D3D3"/>
+              <w:bottom w:val="single" w:space="0" w:color="D3D3D3"/>
+              <w:start w:val="single" w:space="0" w:color="D3D3D3"/>
+              <w:end w:val="single" w:space="0" w:color="D3D3D3"/>
+            </w:tcBorders>
+          </w:tcPr>
+          <w:p>
+            <w:pPr>
+              <w:spacing w:before="0" w:after="60"/>
+              <w:keepNext/>
+              <w:jc w:val="start"/>
+            </w:pPr>
+            <w:r>
+              <w:rPr>
+                <w:rFonts w:ascii="Calibri" w:hAnsi="Calibri"/>
+                <w:sz w:val="20"/>
+              </w:rPr>
+              <w:t xml:space="default">Add a continuous layer of insulation and potentially replace the air and moisture barrier once it becomes time to replace the siding.</w:t>
+            </w:r>
+          </w:p>
+        </w:tc>
+      </w:tr>
+      <w:tr>
+        <w:trPr>
+          <w:cantSplit/>
+        </w:trPr>
+        <w:tc>
+          <w:tcPr>
+            <w:tcBorders>
+              <w:top w:val="single" w:space="0" w:color="D3D3D3"/>
+              <w:bottom w:val="single" w:space="0" w:color="D3D3D3"/>
+              <w:start w:val="single" w:space="0" w:color="D3D3D3"/>
+              <w:end w:val="single" w:space="0" w:color="D3D3D3"/>
+            </w:tcBorders>
+          </w:tcPr>
+          <w:p>
+            <w:pPr>
+              <w:spacing w:before="0" w:after="60"/>
+              <w:keepNext/>
+              <w:jc w:val="start"/>
+            </w:pPr>
+            <w:r>
+              <w:rPr>
+                <w:rFonts w:ascii="Calibri" w:hAnsi="Calibri"/>
+                <w:sz w:val="20"/>
+              </w:rPr>
+              <w:t xml:space="default">Pipe Insulation</w:t>
+            </w:r>
+          </w:p>
+        </w:tc>
+        <w:tc>
+          <w:tcPr>
+            <w:tcBorders>
+              <w:top w:val="single" w:space="0" w:color="D3D3D3"/>
+              <w:bottom w:val="single" w:space="0" w:color="D3D3D3"/>
+              <w:start w:val="single" w:space="0" w:color="D3D3D3"/>
+              <w:end w:val="single" w:space="0" w:color="D3D3D3"/>
+            </w:tcBorders>
+          </w:tcPr>
+          <w:p>
+            <w:pPr>
+              <w:spacing w:before="0" w:after="60"/>
+              <w:keepNext/>
+              <w:jc w:val="start"/>
+            </w:pPr>
+            <w:r>
+              <w:rPr>
+                <w:rFonts w:ascii="Calibri" w:hAnsi="Calibri"/>
+                <w:sz w:val="20"/>
+              </w:rPr>
+              <w:t xml:space="default">Insulate both hot and cold water pipes that are uninsulated in the basement/crawlspace. This will save energy and prevent condensation.</w:t>
+            </w:r>
+          </w:p>
+        </w:tc>
+      </w:tr>
+      <w:tr>
+        <w:trPr>
+          <w:cantSplit/>
+        </w:trPr>
+        <w:tc>
+          <w:tcPr>
+            <w:tcBorders>
+              <w:top w:val="single" w:space="0" w:color="D3D3D3"/>
+              <w:bottom w:val="single" w:space="0" w:color="D3D3D3"/>
+              <w:start w:val="single" w:space="0" w:color="D3D3D3"/>
+              <w:end w:val="single" w:space="0" w:color="D3D3D3"/>
+            </w:tcBorders>
+          </w:tcPr>
+          <w:p>
+            <w:pPr>
+              <w:spacing w:before="0" w:after="60"/>
+              <w:keepNext/>
+              <w:jc w:val="start"/>
+            </w:pPr>
+            <w:r>
+              <w:rPr>
+                <w:rFonts w:ascii="Calibri" w:hAnsi="Calibri"/>
+                <w:sz w:val="20"/>
+              </w:rPr>
+              <w:t xml:space="default">DIY Air Sealing</w:t>
+            </w:r>
+          </w:p>
+        </w:tc>
+        <w:tc>
+          <w:tcPr>
+            <w:tcBorders>
+              <w:top w:val="single" w:space="0" w:color="D3D3D3"/>
+              <w:bottom w:val="single" w:space="0" w:color="D3D3D3"/>
+              <w:start w:val="single" w:space="0" w:color="D3D3D3"/>
+              <w:end w:val="single" w:space="0" w:color="D3D3D3"/>
+            </w:tcBorders>
+          </w:tcPr>
+          <w:p>
+            <w:pPr>
+              <w:spacing w:before="0" w:after="60"/>
+              <w:keepNext/>
+              <w:jc w:val="start"/>
+            </w:pPr>
+            <w:r>
+              <w:rPr>
+                <w:rFonts w:ascii="Calibri" w:hAnsi="Calibri"/>
+                <w:sz w:val="20"/>
+              </w:rPr>
+              <w:t xml:space="default">Seal easy-to-access air leaks and weatherstrip exterior doors.</w:t>
+            </w:r>
+          </w:p>
+        </w:tc>
+      </w:tr>
+      <w:tr>
+        <w:trPr>
+          <w:cantSplit/>
+        </w:trPr>
+        <w:tc>
+          <w:tcPr>
+            <w:tcBorders>
+              <w:top w:val="single" w:space="0" w:color="D3D3D3"/>
+              <w:bottom w:val="single" w:space="0" w:color="D3D3D3"/>
+              <w:start w:val="single" w:space="0" w:color="D3D3D3"/>
+              <w:end w:val="single" w:space="0" w:color="D3D3D3"/>
+            </w:tcBorders>
+          </w:tcPr>
+          <w:p>
+            <w:pPr>
+              <w:spacing w:before="0" w:after="60"/>
+              <w:keepNext/>
+              <w:jc w:val="start"/>
+            </w:pPr>
+            <w:r>
+              <w:rPr>
+                <w:rFonts w:ascii="Calibri" w:hAnsi="Calibri"/>
+                <w:sz w:val="20"/>
+              </w:rPr>
+              <w:t xml:space="default">Ductwork Air Sealing and Insulation</w:t>
+            </w:r>
+          </w:p>
+        </w:tc>
+        <w:tc>
+          <w:tcPr>
+            <w:tcBorders>
+              <w:top w:val="single" w:space="0" w:color="D3D3D3"/>
+              <w:bottom w:val="single" w:space="0" w:color="D3D3D3"/>
+              <w:start w:val="single" w:space="0" w:color="D3D3D3"/>
+              <w:end w:val="single" w:space="0" w:color="D3D3D3"/>
+            </w:tcBorders>
+          </w:tcPr>
+          <w:p>
+            <w:pPr>
+              <w:spacing w:before="0" w:after="60"/>
+              <w:keepNext/>
+              <w:jc w:val="start"/>
+            </w:pPr>
+            <w:r>
+              <w:rPr>
+                <w:rFonts w:ascii="Calibri" w:hAnsi="Calibri"/>
+                <w:sz w:val="20"/>
+              </w:rPr>
+              <w:t xml:space="default">Air seal and insulate all of the supply and return ductwork running through the basement/crawlspace.</w:t>
             </w:r>
           </w:p>
         </w:tc>
@@ -1036,7 +1248,7 @@
                 <w:rFonts w:ascii="Calibri" w:hAnsi="Calibri"/>
                 <w:sz w:val="20"/>
               </w:rPr>
-              <w:t xml:space="default">1800</w:t>
+              <w:t xml:space="default">NA</w:t>
             </w:r>
           </w:p>
         </w:tc>
@@ -1089,7 +1301,7 @@
                 <w:rFonts w:ascii="Calibri" w:hAnsi="Calibri"/>
                 <w:sz w:val="20"/>
               </w:rPr>
-              <w:t xml:space="default">Crawl space</w:t>
+              <w:t xml:space="default">Walk in basement</w:t>
             </w:r>
           </w:p>
         </w:tc>
@@ -1142,7 +1354,7 @@
                 <w:rFonts w:ascii="Calibri" w:hAnsi="Calibri"/>
                 <w:sz w:val="20"/>
               </w:rPr>
-              <w:t xml:space="default">Batts of Fiberglass , 5 inches</w:t>
+              <w:t xml:space="default">Batts of Fiberglass , 1 inches</w:t>
             </w:r>
           </w:p>
         </w:tc>
@@ -1195,7 +1407,7 @@
                 <w:rFonts w:ascii="Calibri" w:hAnsi="Calibri"/>
                 <w:sz w:val="20"/>
               </w:rPr>
-              <w:t xml:space="default">1</w:t>
+              <w:t xml:space="default">2</w:t>
             </w:r>
           </w:p>
         </w:tc>
@@ -1248,7 +1460,7 @@
                 <w:rFonts w:ascii="Calibri" w:hAnsi="Calibri"/>
                 <w:sz w:val="20"/>
               </w:rPr>
-              <w:t xml:space="default">2086</w:t>
+              <w:t xml:space="default">NA</w:t>
             </w:r>
           </w:p>
         </w:tc>
@@ -1301,7 +1513,7 @@
                 <w:rFonts w:ascii="Calibri" w:hAnsi="Calibri"/>
                 <w:sz w:val="20"/>
               </w:rPr>
-              <w:t xml:space="default">17176</w:t>
+              <w:t xml:space="default">NA</w:t>
             </w:r>
           </w:p>
         </w:tc>
@@ -1430,7 +1642,7 @@
                 <w:rFonts w:ascii="Calibri" w:hAnsi="Calibri"/>
                 <w:sz w:val="20"/>
               </w:rPr>
-              <w:t xml:space="default">10</w:t>
+              <w:t xml:space="default">NA</w:t>
             </w:r>
           </w:p>
         </w:tc>
@@ -1483,7 +1695,7 @@
                 <w:rFonts w:ascii="Calibri" w:hAnsi="Calibri"/>
                 <w:sz w:val="20"/>
               </w:rPr>
-              <w:t xml:space="default">Northeast/Southwest</w:t>
+              <w:t xml:space="default">North/South</w:t>
             </w:r>
           </w:p>
         </w:tc>
@@ -1536,7 +1748,7 @@
                 <w:rFonts w:ascii="Calibri" w:hAnsi="Calibri"/>
                 <w:sz w:val="20"/>
               </w:rPr>
-              <w:t xml:space="default">Asphalt Shinglesin faircondition. Some of the shingles are flipped up but overall fine.</w:t>
+              <w:t xml:space="default">Asphalt Shinglesin faircondition. Most of the roof is in good condition, but there are a few places where shingles are lifting up.</w:t>
             </w:r>
           </w:p>
         </w:tc>
@@ -1589,7 +1801,7 @@
                 <w:rFonts w:ascii="Calibri" w:hAnsi="Calibri"/>
                 <w:sz w:val="20"/>
               </w:rPr>
-              <w:t xml:space="default">Current moisture control strategies: gutters. These were in poor condition .Only on some sides of the building partially.</w:t>
+              <w:t xml:space="default">Current moisture control strategies: NA. These were in NA condition .NA</w:t>
             </w:r>
           </w:p>
         </w:tc>
@@ -1642,7 +1854,7 @@
                 <w:rFonts w:ascii="Calibri" w:hAnsi="Calibri"/>
                 <w:sz w:val="20"/>
               </w:rPr>
-              <w:t xml:space="default">wood shingles in fair condition. Some of the siding has recently been replaced and some is old with water damage or moss growing on it.</w:t>
+              <w:t xml:space="default">wood shingles in poor condition. Severe weathering and water damage on all siding, many broken shingles</w:t>
             </w:r>
           </w:p>
         </w:tc>
@@ -1695,7 +1907,7 @@
                 <w:rFonts w:ascii="Calibri" w:hAnsi="Calibri"/>
                 <w:sz w:val="20"/>
               </w:rPr>
-              <w:t xml:space="default">There are 3 insulated wood exterior doors. In fair condition, totaling 53 square feet.</w:t>
+              <w:t xml:space="default">There are no exterior doors</w:t>
             </w:r>
           </w:p>
         </w:tc>
@@ -1748,7 +1960,7 @@
                 <w:rFonts w:ascii="Calibri" w:hAnsi="Calibri"/>
                 <w:sz w:val="20"/>
               </w:rPr>
-              <w:t xml:space="default">There are 8 single paned wood windows. In fair condition, totaling 54 square feet. Moreover there are 7 double paned wood windows. In fair condition, totaling 81 square feet.</w:t>
+              <w:t xml:space="default">There are no exterior windows</w:t>
             </w:r>
           </w:p>
         </w:tc>
@@ -1824,7 +2036,7 @@
                 <w:rFonts w:ascii="Calibri" w:hAnsi="Calibri"/>
                 <w:sz w:val="20"/>
               </w:rPr>
-              <w:t xml:space="default">The framing type of the home is balloon framing, which means the wall cavities extend the full height of the building (from the foundation to the roof). Often the wall cavities are interconnected with the floor and ceiling cavities. This framing type can create connected passageways for air to leave the house and rodents to enter the house. There is UNKNOWN insulation NA inches thick in NA condition. NA</w:t>
+              <w:t xml:space="default">NAThere is Batts of Fiberglass insulation NA inches thick in NA condition. NA</w:t>
             </w:r>
           </w:p>
         </w:tc>
@@ -1877,7 +2089,7 @@
                 <w:rFonts w:ascii="Calibri" w:hAnsi="Calibri"/>
                 <w:sz w:val="20"/>
               </w:rPr>
-              <w:t xml:space="default">Two large sliding doors on either side of the main hall that have cavities that go straight to the attic.</w:t>
+              <w:t xml:space="default">NA</w:t>
             </w:r>
           </w:p>
         </w:tc>
@@ -1930,7 +2142,7 @@
                 <w:rFonts w:ascii="Calibri" w:hAnsi="Calibri"/>
                 <w:sz w:val="20"/>
               </w:rPr>
-              <w:t xml:space="default">Small electric heater in the wall.</w:t>
+              <w:t xml:space="default">NA</w:t>
             </w:r>
           </w:p>
         </w:tc>
@@ -1983,7 +2195,7 @@
                 <w:rFonts w:ascii="Calibri" w:hAnsi="Calibri"/>
                 <w:sz w:val="20"/>
               </w:rPr>
-              <w:t xml:space="default">Fridge used 8.9 kWh in 60 minutes. Deep Fridge used 1.8 kWh in 60 minutes. Industrial vent hood and gas range. Also, a wood cook stove.</w:t>
+              <w:t xml:space="default">NA used NA kWh in NA minutes. NA used NA kWh in NA minutes. NA</w:t>
             </w:r>
           </w:p>
         </w:tc>
@@ -2091,7 +2303,7 @@
                 <w:rFonts w:ascii="Calibri" w:hAnsi="Calibri"/>
                 <w:sz w:val="20"/>
               </w:rPr>
-              <w:t xml:space="default">2126</w:t>
+              <w:t xml:space="default">2288</w:t>
             </w:r>
           </w:p>
         </w:tc>
@@ -2168,7 +2380,7 @@
                 <w:rFonts w:ascii="Calibri" w:hAnsi="Calibri"/>
                 <w:sz w:val="20"/>
               </w:rPr>
-              <w:t xml:space="default">7.4</w:t>
+              <w:t xml:space="default">NA</w:t>
             </w:r>
           </w:p>
         </w:tc>
@@ -2245,7 +2457,7 @@
                 <w:rFonts w:ascii="Calibri" w:hAnsi="Calibri"/>
                 <w:sz w:val="20"/>
               </w:rPr>
-              <w:t xml:space="default">212.6 under natural conditions. TEST</w:t>
+              <w:t xml:space="default">228.8 under natural conditions. TEST</w:t>
             </w:r>
           </w:p>
         </w:tc>
@@ -2322,7 +2534,7 @@
                 <w:rFonts w:ascii="Calibri" w:hAnsi="Calibri"/>
                 <w:sz w:val="20"/>
               </w:rPr>
-              <w:t xml:space="default">0.4</w:t>
+              <w:t xml:space="default">NA</w:t>
             </w:r>
           </w:p>
         </w:tc>
@@ -2483,7 +2695,7 @@
                 <w:rFonts w:ascii="Calibri" w:hAnsi="Calibri"/>
                 <w:sz w:val="20"/>
               </w:rPr>
-              <w:t xml:space="default">2086</w:t>
+              <w:t xml:space="default">NA</w:t>
             </w:r>
           </w:p>
         </w:tc>
@@ -2695,7 +2907,7 @@
                 <w:rFonts w:ascii="Calibri" w:hAnsi="Calibri"/>
                 <w:sz w:val="20"/>
               </w:rPr>
-              <w:t xml:space="default">The attic is only partially insulated. Yes NA</w:t>
+              <w:t xml:space="default">Attic insulation is very inconsistent and falling away from roof ridge at many points No NA</w:t>
             </w:r>
           </w:p>
         </w:tc>
@@ -2748,7 +2960,7 @@
                 <w:rFonts w:ascii="Calibri" w:hAnsi="Calibri"/>
                 <w:sz w:val="20"/>
               </w:rPr>
-              <w:t xml:space="default">Yes</w:t>
+              <w:t xml:space="default">NA</w:t>
             </w:r>
           </w:p>
         </w:tc>
@@ -2930,7 +3142,7 @@
                 <w:rFonts w:ascii="Calibri" w:hAnsi="Calibri"/>
                 <w:sz w:val="20"/>
               </w:rPr>
-              <w:t xml:space="default">Batts of Fiberglass</w:t>
+              <w:t xml:space="default">Uninsulated</w:t>
             </w:r>
           </w:p>
         </w:tc>
@@ -2983,7 +3195,7 @@
                 <w:rFonts w:ascii="Calibri" w:hAnsi="Calibri"/>
                 <w:sz w:val="20"/>
               </w:rPr>
-              <w:t xml:space="default">PoorThe insulation is along the floor joists however it is only in some parts and is falling out. It is effectively uninsulated.</w:t>
+              <w:t xml:space="default">NANA</w:t>
             </w:r>
           </w:p>
         </w:tc>
@@ -3036,7 +3248,7 @@
                 <w:rFonts w:ascii="Calibri" w:hAnsi="Calibri"/>
                 <w:sz w:val="20"/>
               </w:rPr>
-              <w:t xml:space="default">Appliances not insulated, Ducts/pipes not insulated</w:t>
+              <w:t xml:space="default">Appliances not insulated, Ducts/pipes partially insulated</w:t>
             </w:r>
           </w:p>
         </w:tc>
@@ -3089,7 +3301,7 @@
                 <w:rFonts w:ascii="Calibri" w:hAnsi="Calibri"/>
                 <w:sz w:val="20"/>
               </w:rPr>
-              <w:t xml:space="default">NAin NAcondition. Only on some sides of the building partially.</w:t>
+              <w:t xml:space="default">NAin NAcondition. NA</w:t>
             </w:r>
           </w:p>
         </w:tc>
@@ -3142,7 +3354,7 @@
                 <w:rFonts w:ascii="Calibri" w:hAnsi="Calibri"/>
                 <w:sz w:val="20"/>
               </w:rPr>
-              <w:t xml:space="default">NoNA</w:t>
+              <w:t xml:space="default">YesExhaust duct is very long and has some parts that are sagging, creating sharp turns</w:t>
             </w:r>
           </w:p>
         </w:tc>
@@ -3195,7 +3407,7 @@
                 <w:rFonts w:ascii="Calibri" w:hAnsi="Calibri"/>
                 <w:sz w:val="20"/>
               </w:rPr>
-              <w:t xml:space="default">There is NANA</w:t>
+              <w:t xml:space="default">There is moistureMoisture marks along most walls, mold on floor and wall next to well pressure tank and oil tank</w:t>
             </w:r>
           </w:p>
         </w:tc>
@@ -3271,7 +3483,7 @@
                 <w:rFonts w:ascii="Calibri" w:hAnsi="Calibri"/>
                 <w:sz w:val="20"/>
               </w:rPr>
-              <w:t xml:space="default">The electrical panel has and amperage of 200. There are 0 unused breaker spaces. NA</w:t>
+              <w:t xml:space="default">The electrical panel has and amperage of 200. There are 11 unused breaker spaces. NA</w:t>
             </w:r>
           </w:p>
         </w:tc>
@@ -3398,7 +3610,7 @@
     </w:tbl>
     <w:bookmarkEnd w:id="40"/>
     <w:bookmarkEnd w:id="41"/>
-    <w:bookmarkStart w:id="54" w:name="recommendations"/>
+    <w:bookmarkStart w:id="58" w:name="recommendations"/>
     <w:p>
       <w:pPr>
         <w:pStyle w:val="Heading2"/>
@@ -3415,13 +3627,13 @@
         <w:t xml:space="preserve">These recommendations are organized from the least expensive/most cost-effective and easiest interventions to ones that are more challenging to implement.</w:t>
       </w:r>
     </w:p>
-    <w:bookmarkStart w:id="42" w:name="window-dressers"/>
+    <w:bookmarkStart w:id="42" w:name="furnaceboiler-tune-up"/>
     <w:p>
       <w:pPr>
         <w:pStyle w:val="Heading3"/>
       </w:pPr>
       <w:r>
-        <w:t xml:space="preserve">4.1 Window Dressers</w:t>
+        <w:t xml:space="preserve">4.1 Furnace/Boiler Tune up</w:t>
       </w:r>
     </w:p>
     <w:p>
@@ -3441,7 +3653,11 @@
         <w:pStyle w:val="BodyText"/>
       </w:pPr>
       <w:r>
-        <w:t xml:space="preserve">Your windows are a source of heat loss, reduce your comfort due to cold surface temperatures, and may also cause moisture condensation or frost in the winter.</w:t>
+        <w:rPr>
+          <w:b/>
+          <w:bCs/>
+        </w:rPr>
+        <w:t xml:space="preserve">Auditor to describe</w:t>
       </w:r>
     </w:p>
     <w:p>
@@ -3461,11 +3677,13 @@
         <w:pStyle w:val="BodyText"/>
       </w:pPr>
       <w:r>
-        <w:t xml:space="preserve">WindowDressers are insulating window inserts that help air-seal windows and reduce heat loss and gain. WindowDressers are transparent and let in light while stopping drafts. Each insert is made of a custom-made pine frame wrapped on each side with tightly sealed, clear polyolefin film, creating an airspace between the two layers for additional insulation. The insert is finished with a compressible foam weather seal. The foam allows enough give for the inserts to be easily slid into place in the fall and removed in the spring while holding firmly enough to provide a tight, friction-based seal. The inserts are installed inside your existing window frame with no fasteners required and last 5-10 years. They are most effective in the winter, but depending on the window’s exposure, they can sometimes be used in the summer to keep the house cooler.</w:t>
-      </w:r>
-      <w:r>
-        <w:t xml:space="preserve"> </w:t>
-      </w:r>
+        <w:t xml:space="preserve">Have the furnace/boiler and flue inspected and adjusted by a licensed professional. This should be available from your fuel delivery company.</w:t>
+      </w:r>
+    </w:p>
+    <w:p>
+      <w:pPr>
+        <w:pStyle w:val="BodyText"/>
+      </w:pPr>
       <w:r>
         <w:rPr>
           <w:i/>
@@ -3479,45 +3697,17 @@
         <w:pStyle w:val="BodyText"/>
       </w:pPr>
       <w:r>
-        <w:t xml:space="preserve">Insulating window inserts save 5-10% of your heating costs at less than 1/10th the cost of replacement windows. The overall project cost will depend on the number and size of window inserts. Example prices for the 2024 season were: small (20 x 36”) - $36 for natural pine frame, $46 for white; medium (30 x 52”) - $50 for natural pine frame, $64 for white; large (44 x 68”) - $67 for natural pine frame, $88 for white. Adjusted pricing for lower-income households is available from WindowDressers upon request. If plastic is damaged, it can be replaced for $15.</w:t>
-      </w:r>
-    </w:p>
-    <w:p>
-      <w:pPr>
-        <w:pStyle w:val="BodyText"/>
-      </w:pPr>
-      <w:r>
-        <w:t xml:space="preserve">Households that order inserts are expected to participate in the Community Build where the inserts are made. You can sign up for a 4-hour shift and learn the simple steps in the insert-building process (no previous experience required, no power tools). Each job has</w:t>
-      </w:r>
-      <w:r>
-        <w:t xml:space="preserve"> </w:t>
-      </w:r>
-      <w:r>
-        <w:t xml:space="preserve">“jigs”</w:t>
-      </w:r>
-      <w:r>
-        <w:t xml:space="preserve"> </w:t>
-      </w:r>
-      <w:r>
-        <w:t xml:space="preserve">that make the job easier to do and ensure uniform quality. You will be trained at the beginning of your shift on how to do your task. Volunteering for multiple shifts is encouraged! Mid-shift snacks and a meal are provided to all participants.</w:t>
-      </w:r>
-    </w:p>
-    <w:p>
-      <w:pPr>
-        <w:pStyle w:val="BodyText"/>
-      </w:pPr>
-      <w:r>
-        <w:t xml:space="preserve">If you would like to participate, please contact us so we can discuss how the program works and which windows you’d like inserts for.</w:t>
+        <w:t xml:space="preserve">A tune-up can improve the efficiency of your furnace/boiler, confirm that it is exhausting properly, and identify areas of concern before they become urgent. If you have a service contract with your fuel delivery company, an annual tune-up is usually included.</w:t>
       </w:r>
     </w:p>
     <w:bookmarkEnd w:id="42"/>
-    <w:bookmarkStart w:id="43" w:name="heat-pump-water-heater"/>
+    <w:bookmarkStart w:id="43" w:name="high-efficiency-shower-heads"/>
     <w:p>
       <w:pPr>
         <w:pStyle w:val="Heading3"/>
       </w:pPr>
       <w:r>
-        <w:t xml:space="preserve">4.2 Heat Pump Water Heater</w:t>
+        <w:t xml:space="preserve">4.2 High efficiency shower head(s)</w:t>
       </w:r>
     </w:p>
     <w:p>
@@ -3537,6 +3727,240 @@
         <w:pStyle w:val="BodyText"/>
       </w:pPr>
       <w:r>
+        <w:t xml:space="preserve">Your shower heads use more water and energy than high-efficiency shower heads, thus costing you more money than necessary. Older shower heads use 2.5 gallons or more every minute, which wastes thousands of gallons of water each year and costs you money for every extra gallon of water heated.</w:t>
+      </w:r>
+    </w:p>
+    <w:p>
+      <w:pPr>
+        <w:pStyle w:val="BodyText"/>
+      </w:pPr>
+      <w:r>
+        <w:rPr>
+          <w:i/>
+          <w:iCs/>
+        </w:rPr>
+        <w:t xml:space="preserve">Recommendation</w:t>
+      </w:r>
+    </w:p>
+    <w:p>
+      <w:pPr>
+        <w:pStyle w:val="BodyText"/>
+      </w:pPr>
+      <w:r>
+        <w:t xml:space="preserve">Install high-efficiency shower heads to reduce the amount of water and energy to heat the water used when showering. We recommend 1.5 gallon per minute shower heads that will save a gallon or more of water for every minute spent in the shower.</w:t>
+      </w:r>
+      <w:r>
+        <w:t xml:space="preserve"> </w:t>
+      </w:r>
+      <w:r>
+        <w:rPr>
+          <w:i/>
+          <w:iCs/>
+        </w:rPr>
+        <w:t xml:space="preserve">Estimated Cost/Benefits/Incentives</w:t>
+      </w:r>
+    </w:p>
+    <w:p>
+      <w:pPr>
+        <w:pStyle w:val="BodyText"/>
+      </w:pPr>
+      <w:r>
+        <w:t xml:space="preserve">A typical family will save ~10,000 gallons of water per year and over $100 per year in water heating costs. We provide these for free and have several styles for you to choose from; contact us for some if we did not give you any during the audit.</w:t>
+      </w:r>
+    </w:p>
+    <w:bookmarkEnd w:id="43"/>
+    <w:bookmarkStart w:id="44" w:name="leds"/>
+    <w:p>
+      <w:pPr>
+        <w:pStyle w:val="Heading3"/>
+      </w:pPr>
+      <w:r>
+        <w:t xml:space="preserve">4.3 LEDs</w:t>
+      </w:r>
+    </w:p>
+    <w:p>
+      <w:pPr>
+        <w:pStyle w:val="FirstParagraph"/>
+      </w:pPr>
+      <w:r>
+        <w:rPr>
+          <w:i/>
+          <w:iCs/>
+        </w:rPr>
+        <w:t xml:space="preserve">Problem</w:t>
+      </w:r>
+    </w:p>
+    <w:p>
+      <w:pPr>
+        <w:pStyle w:val="BodyText"/>
+      </w:pPr>
+      <w:r>
+        <w:t xml:space="preserve">Your lighting uses more energy than LED bulbs would. Halogen and incandescent light bulbs use 5-8x more energy than LEDs. This requires significantly more electricity and costs a lot.</w:t>
+      </w:r>
+    </w:p>
+    <w:p>
+      <w:pPr>
+        <w:pStyle w:val="BodyText"/>
+      </w:pPr>
+      <w:r>
+        <w:rPr>
+          <w:i/>
+          <w:iCs/>
+        </w:rPr>
+        <w:t xml:space="preserve">Recommendation</w:t>
+      </w:r>
+    </w:p>
+    <w:p>
+      <w:pPr>
+        <w:pStyle w:val="BodyText"/>
+      </w:pPr>
+      <w:r>
+        <w:t xml:space="preserve">Switch your light bulbs to LED light bulbs. LEDs use 80% less energy than incandescent light bulbs which can significantly reduce your electricity bill.</w:t>
+      </w:r>
+    </w:p>
+    <w:p>
+      <w:pPr>
+        <w:pStyle w:val="BodyText"/>
+      </w:pPr>
+      <w:r>
+        <w:rPr>
+          <w:i/>
+          <w:iCs/>
+        </w:rPr>
+        <w:t xml:space="preserve">Estimated Cost/Benefits/Incentives</w:t>
+      </w:r>
+    </w:p>
+    <w:p>
+      <w:pPr>
+        <w:pStyle w:val="BodyText"/>
+      </w:pPr>
+      <w:r>
+        <w:t xml:space="preserve">We provide free LED light bulbs; contact us for some if we did not give you any during the audit. Depending on usage, LEDs can save more than $50 a year.</w:t>
+      </w:r>
+    </w:p>
+    <w:bookmarkEnd w:id="44"/>
+    <w:bookmarkStart w:id="45" w:name="window-dressers"/>
+    <w:p>
+      <w:pPr>
+        <w:pStyle w:val="Heading3"/>
+      </w:pPr>
+      <w:r>
+        <w:t xml:space="preserve">4.4 Window Dressers</w:t>
+      </w:r>
+    </w:p>
+    <w:p>
+      <w:pPr>
+        <w:pStyle w:val="FirstParagraph"/>
+      </w:pPr>
+      <w:r>
+        <w:rPr>
+          <w:i/>
+          <w:iCs/>
+        </w:rPr>
+        <w:t xml:space="preserve">Problem</w:t>
+      </w:r>
+    </w:p>
+    <w:p>
+      <w:pPr>
+        <w:pStyle w:val="BodyText"/>
+      </w:pPr>
+      <w:r>
+        <w:t xml:space="preserve">Your windows are a source of heat loss, reduce your comfort due to cold surface temperatures, and may also cause moisture condensation or frost in the winter.</w:t>
+      </w:r>
+    </w:p>
+    <w:p>
+      <w:pPr>
+        <w:pStyle w:val="BodyText"/>
+      </w:pPr>
+      <w:r>
+        <w:rPr>
+          <w:i/>
+          <w:iCs/>
+        </w:rPr>
+        <w:t xml:space="preserve">Recommendation</w:t>
+      </w:r>
+    </w:p>
+    <w:p>
+      <w:pPr>
+        <w:pStyle w:val="BodyText"/>
+      </w:pPr>
+      <w:r>
+        <w:t xml:space="preserve">WindowDressers are insulating window inserts that help air-seal windows and reduce heat loss and gain. WindowDressers are transparent and let in light while stopping drafts. Each insert is made of a custom-made pine frame wrapped on each side with tightly sealed, clear polyolefin film, creating an airspace between the two layers for additional insulation. The insert is finished with a compressible foam weather seal. The foam allows enough give for the inserts to be easily slid into place in the fall and removed in the spring while holding firmly enough to provide a tight, friction-based seal. The inserts are installed inside your existing window frame with no fasteners required and last 5-10 years. They are most effective in the winter, but depending on the window’s exposure, they can sometimes be used in the summer to keep the house cooler.</w:t>
+      </w:r>
+      <w:r>
+        <w:t xml:space="preserve"> </w:t>
+      </w:r>
+      <w:r>
+        <w:rPr>
+          <w:i/>
+          <w:iCs/>
+        </w:rPr>
+        <w:t xml:space="preserve">Estimated Cost/Benefits/Incentives</w:t>
+      </w:r>
+    </w:p>
+    <w:p>
+      <w:pPr>
+        <w:pStyle w:val="BodyText"/>
+      </w:pPr>
+      <w:r>
+        <w:t xml:space="preserve">Insulating window inserts save 5-10% of your heating costs at less than 1/10th the cost of replacement windows. The overall project cost will depend on the number and size of window inserts. Example prices for the 2024 season were: small (20 x 36”) - $36 for natural pine frame, $46 for white; medium (30 x 52”) - $50 for natural pine frame, $64 for white; large (44 x 68”) - $67 for natural pine frame, $88 for white. Adjusted pricing for lower-income households is available from WindowDressers upon request. If plastic is damaged, it can be replaced for $15.</w:t>
+      </w:r>
+    </w:p>
+    <w:p>
+      <w:pPr>
+        <w:pStyle w:val="BodyText"/>
+      </w:pPr>
+      <w:r>
+        <w:t xml:space="preserve">Households that order inserts are expected to participate in the Community Build where the inserts are made. You can sign up for a 4-hour shift and learn the simple steps in the insert-building process (no previous experience required, no power tools). Each job has</w:t>
+      </w:r>
+      <w:r>
+        <w:t xml:space="preserve"> </w:t>
+      </w:r>
+      <w:r>
+        <w:t xml:space="preserve">“jigs”</w:t>
+      </w:r>
+      <w:r>
+        <w:t xml:space="preserve"> </w:t>
+      </w:r>
+      <w:r>
+        <w:t xml:space="preserve">that make the job easier to do and ensure uniform quality. You will be trained at the beginning of your shift on how to do your task. Volunteering for multiple shifts is encouraged! Mid-shift snacks and a meal are provided to all participants.</w:t>
+      </w:r>
+    </w:p>
+    <w:p>
+      <w:pPr>
+        <w:pStyle w:val="BodyText"/>
+      </w:pPr>
+      <w:r>
+        <w:t xml:space="preserve">If you would like to participate, please contact us so we can discuss how the program works and which windows you’d like inserts for.</w:t>
+      </w:r>
+    </w:p>
+    <w:bookmarkEnd w:id="45"/>
+    <w:bookmarkStart w:id="46" w:name="heat-pump-water-heater"/>
+    <w:p>
+      <w:pPr>
+        <w:pStyle w:val="Heading3"/>
+      </w:pPr>
+      <w:r>
+        <w:t xml:space="preserve">4.5 Heat Pump Water Heater</w:t>
+      </w:r>
+    </w:p>
+    <w:p>
+      <w:pPr>
+        <w:pStyle w:val="FirstParagraph"/>
+      </w:pPr>
+      <w:r>
+        <w:rPr>
+          <w:i/>
+          <w:iCs/>
+        </w:rPr>
+        <w:t xml:space="preserve">Problem</w:t>
+      </w:r>
+    </w:p>
+    <w:p>
+      <w:pPr>
+        <w:pStyle w:val="BodyText"/>
+      </w:pPr>
+      <w:r>
         <w:rPr>
           <w:b/>
           <w:bCs/>
@@ -3584,14 +4008,14 @@
         <w:t xml:space="preserve">A heat pump water heater uses 70% less electricity than a standard electric water heater. Efficiency Maine offers a rebate of up to $950, making the equipment cost as little as $400 plus installation. The rebate can be combined with a nonrefundable federal tax credit of 30% of the remaining cost of the unit and labor, subject to an annual maximum benefit of $2,000 (shared with other energy property, like heat pumps). For more information, you can call Efficiency Maine at 866-376-2463 (Monday to Friday, 8:00 am to 5:00 pm) or visit their website: https://www.efficiencymaine.com/at-home/heat-pump-water-heater-program/</w:t>
       </w:r>
     </w:p>
-    <w:bookmarkEnd w:id="43"/>
-    <w:bookmarkStart w:id="44" w:name="gutters"/>
+    <w:bookmarkEnd w:id="46"/>
+    <w:bookmarkStart w:id="47" w:name="gutters"/>
     <w:p>
       <w:pPr>
         <w:pStyle w:val="Heading3"/>
       </w:pPr>
       <w:r>
-        <w:t xml:space="preserve">4.3 Gutters</w:t>
+        <w:t xml:space="preserve">4.6 Gutters</w:t>
       </w:r>
     </w:p>
     <w:p>
@@ -3654,14 +4078,14 @@
         <w:t xml:space="preserve">Adding gutters would mitigate moisture damage and save you from having to replace/fix other parts of the house.</w:t>
       </w:r>
     </w:p>
-    <w:bookmarkEnd w:id="44"/>
-    <w:bookmarkStart w:id="45" w:name="vapor-barrier"/>
+    <w:bookmarkEnd w:id="47"/>
+    <w:bookmarkStart w:id="48" w:name="bathroom-exhaust-fans"/>
     <w:p>
       <w:pPr>
         <w:pStyle w:val="Heading3"/>
       </w:pPr>
       <w:r>
-        <w:t xml:space="preserve">4.4 Vapor Barrier</w:t>
+        <w:t xml:space="preserve">4.7 Bathroom exhaust fan(s)</w:t>
       </w:r>
     </w:p>
     <w:p>
@@ -3681,7 +4105,7 @@
         <w:pStyle w:val="BodyText"/>
       </w:pPr>
       <w:r>
-        <w:t xml:space="preserve">There is excess moisture in the basement/crawlspace, which is evaporating out of the ground. This moisture can enter the house and cause mold, mildew, rot, and air quality issues.</w:t>
+        <w:t xml:space="preserve">Currently, there is no bathroom exhaust fan, so moisture from the shower, toilet, and sink remains in the house, which can cause moisture issues such as mold.</w:t>
       </w:r>
     </w:p>
     <w:p>
@@ -3701,19 +4125,7 @@
         <w:pStyle w:val="BodyText"/>
       </w:pPr>
       <w:r>
-        <w:t xml:space="preserve">Install a vapor barrier on the basement floor to stop moisture from entering the basement and house. Vapor barriers typically consist of either reinforced plastic sheeting or EPDM rubber membrane over a</w:t>
-      </w:r>
-      <w:r>
-        <w:t xml:space="preserve"> </w:t>
-      </w:r>
-      <w:r>
-        <w:t xml:space="preserve">‘dimple mat’</w:t>
-      </w:r>
-      <w:r>
-        <w:t xml:space="preserve"> </w:t>
-      </w:r>
-      <w:r>
-        <w:t xml:space="preserve">that allows for drainage below the vapor barrier and prevents rocks from puncturing it. If the basement/crawlspace walls are going to be spray foamed, we recommend the foam go all the way to the floor and overlap the vapor barrier to create a continuous air and moisture barrier.</w:t>
+        <w:t xml:space="preserve">Install bathroom exhaust fans in all bathrooms that do not have them. These should be rated for at least 80 cubic feet per minute (CFM) if there is a shower. We recommend the Panasonic Whisper series or similar fans that don’t create excess noise. If the ductwork will run through the attic, it should be installed before the attic is air-sealed and insulated. The fan needs to be ducted outside, so it does not add moisture into the attic.</w:t>
       </w:r>
     </w:p>
     <w:p>
@@ -3733,17 +4145,17 @@
         <w:pStyle w:val="BodyText"/>
       </w:pPr>
       <w:r>
-        <w:t xml:space="preserve">Efficiency Maine rebates will cover vapor barriers up to 25% of a weatherization project cost, if done as part of a larger insulation project. Most insulation companies can install spray foam and vapor barriers together. Efficiency Maine rebates and other incentives for insulation work can fund up to 80% of the overall cost to weatherize your home (subject to a lifetime limit per building), up to $9,200 when combined with nonrefundable federal tax credits. You can call them at 866-376-2463 (Monday to Friday, 8:00 am to 5:00 pm) or visit their webpage about insulation rebates: https://www.efficiencymaine.com/at-home/insulation-rebates/</w:t>
-      </w:r>
-    </w:p>
-    <w:bookmarkEnd w:id="45"/>
-    <w:bookmarkStart w:id="46" w:name="spray-foam-basement-walls"/>
+        <w:t xml:space="preserve">The typical fan is around $130 plus the cost of installation.</w:t>
+      </w:r>
+    </w:p>
+    <w:bookmarkEnd w:id="48"/>
+    <w:bookmarkStart w:id="49" w:name="kitchen-exhaust-fans"/>
     <w:p>
       <w:pPr>
         <w:pStyle w:val="Heading3"/>
       </w:pPr>
       <w:r>
-        <w:t xml:space="preserve">4.5 Spray foam Basement Walls</w:t>
+        <w:t xml:space="preserve">4.8 Kitchen exhaust fan(s)</w:t>
       </w:r>
     </w:p>
     <w:p>
@@ -3763,7 +4175,7 @@
         <w:pStyle w:val="BodyText"/>
       </w:pPr>
       <w:r>
-        <w:t xml:space="preserve">The basement/crawlspace is uninsulated and used for mechanical equipment and plumbing. The walls are porous and allow moisture into the house and rapidly conduct heat out of the space.</w:t>
+        <w:t xml:space="preserve">Currently, there is no kitchen exhaust fan, so fumes, smoke, and moisture from cooking stay in the house which can cause health concerns.</w:t>
       </w:r>
     </w:p>
     <w:p>
@@ -3783,24 +4195,7 @@
         <w:pStyle w:val="BodyText"/>
       </w:pPr>
       <w:r>
-        <w:t xml:space="preserve">Install spray foam on the basement/crawlspace walls to prevent moisture infiltration and reduce heat loss. In older homes, most heat loss is due to air leakage. Air sealing is particularly important in the basement or crawlspace (and attic). As warm air rises and leaks out the top of your home, cold air is pulled in at the bottom. This is called the</w:t>
-      </w:r>
-      <w:r>
-        <w:t xml:space="preserve"> </w:t>
-      </w:r>
-      <w:r>
-        <w:t xml:space="preserve">‘stack effect’</w:t>
-      </w:r>
-      <w:r>
-        <w:t xml:space="preserve">, and is more pronounced in taller homes. Thus, air sealing is necessary anywhere gaps allow air to move into your house through the basement/crawlspace.</w:t>
-      </w:r>
-    </w:p>
-    <w:p>
-      <w:pPr>
-        <w:pStyle w:val="BodyText"/>
-      </w:pPr>
-      <w:r>
-        <w:t xml:space="preserve">Spray foam should be applied 2-3 inches thick on the walls to seal and insulate them. It is often ideal to install a vapor barrier at the same time as the spray foam insulation. Spray foam generally requires a layer of intumescent (fire-rated) paint over it to meet fire code.</w:t>
+        <w:t xml:space="preserve">Install a kitchen exhaust fan to remove cooking fumes and moisture from your home. The fan should be rated for at least 100 cubic feet per minute. A kitchen fan should be ducted to the outdoors. If the ductwork will run through the attic, it should be installed before the attic is air-sealed and insulated.</w:t>
       </w:r>
     </w:p>
     <w:p>
@@ -3820,17 +4215,17 @@
         <w:pStyle w:val="BodyText"/>
       </w:pPr>
       <w:r>
-        <w:t xml:space="preserve">Installation of spray foam insulation will cost around $5-7 per square foot. Efficiency Maine rebates and other incentives for insulation work can fund up to 80% of the project cost (subject to a lifetime limit per building), up to $9,200 when combined with nonrefundable federal tax credits. You can call them at 866-376-2463 (Monday to Friday, 8:00 am to 5:00 pm) or visit their webpage about insulation rebates: https://www.efficiencymaine.com/at-home/insulation-rebates/</w:t>
-      </w:r>
-    </w:p>
-    <w:bookmarkEnd w:id="46"/>
-    <w:bookmarkStart w:id="47" w:name="attic-insulation-and-air-sealing"/>
+        <w:t xml:space="preserve">Kitchen range hoods typically cost $150 or more; installation costs depend on the complexity of the exhaust ducting.</w:t>
+      </w:r>
+    </w:p>
+    <w:bookmarkEnd w:id="49"/>
+    <w:bookmarkStart w:id="50" w:name="vapor-barrier"/>
     <w:p>
       <w:pPr>
         <w:pStyle w:val="Heading3"/>
       </w:pPr>
       <w:r>
-        <w:t xml:space="preserve">4.6 Attic Insulation and Air Sealing</w:t>
+        <w:t xml:space="preserve">4.9 Vapor Barrier</w:t>
       </w:r>
     </w:p>
     <w:p>
@@ -3850,7 +4245,7 @@
         <w:pStyle w:val="BodyText"/>
       </w:pPr>
       <w:r>
-        <w:t xml:space="preserve">The attic is uninsulated or is missing insulation and the attic could also benefit from air-sealing. These upgrades will reduce draftiness and heat loss in the winter and heat gain in the summer.</w:t>
+        <w:t xml:space="preserve">There is excess moisture in the basement/crawlspace, which is evaporating out of the ground. This moisture can enter the house and cause mold, mildew, rot, and air quality issues.</w:t>
       </w:r>
     </w:p>
     <w:p>
@@ -3870,24 +4265,19 @@
         <w:pStyle w:val="BodyText"/>
       </w:pPr>
       <w:r>
-        <w:t xml:space="preserve">Air seal the attic and insulate it to at least R-60 (18 inches of loose-fill cellulose insulation). COA has been installing 24 inches (R-80) of cellulose insulation in attics on our campus. Before the attic is insulated, ensure that any needed bathroom and kitchen fans are installed and that all fans are properly vented to the outside.</w:t>
-      </w:r>
-    </w:p>
-    <w:p>
-      <w:pPr>
-        <w:pStyle w:val="BodyText"/>
-      </w:pPr>
-      <w:r>
-        <w:t xml:space="preserve">In older homes, most heat loss is due to air leakage. Air sealing is particularly important in the attic (and basement or crawlspace). As warm air rises and leaks out the top of your home, cold air is pulled in at the bottom. This is called the</w:t>
+        <w:t xml:space="preserve">Install a vapor barrier on the basement floor to stop moisture from entering the basement and house. Vapor barriers typically consist of either reinforced plastic sheeting or EPDM rubber membrane over a</w:t>
       </w:r>
       <w:r>
         <w:t xml:space="preserve"> </w:t>
       </w:r>
       <w:r>
-        <w:t xml:space="preserve">‘stack effect’</w:t>
-      </w:r>
-      <w:r>
-        <w:t xml:space="preserve">, and is more pronounced in taller homes. Thus, air sealing is necessary anywhere gaps allow air to move between your house and the attic. This typically includes gaps around the chimney, electrical penetrations, and wall top plates.</w:t>
+        <w:t xml:space="preserve">‘dimple mat’</w:t>
+      </w:r>
+      <w:r>
+        <w:t xml:space="preserve"> </w:t>
+      </w:r>
+      <w:r>
+        <w:t xml:space="preserve">that allows for drainage below the vapor barrier and prevents rocks from puncturing it. If the basement/crawlspace walls are going to be spray foamed, we recommend the foam go all the way to the floor and overlap the vapor barrier to create a continuous air and moisture barrier.</w:t>
       </w:r>
     </w:p>
     <w:p>
@@ -3907,17 +4297,17 @@
         <w:pStyle w:val="BodyText"/>
       </w:pPr>
       <w:r>
-        <w:t xml:space="preserve">Efficiency Maine rebates and other incentives for insulation work can fund up to 80% of the overall cost to weatherize your home (subject to a lifetime limit per building), up to $9,200 when combined with nonrefundable federal tax credits. You can call them at 866-376-2463 (Monday to Friday, 8:00 am to 5:00 pm) or visit their webpage about insulation rebates: https://www.efficiencymaine.com/at-home/insulation-rebates/</w:t>
-      </w:r>
-    </w:p>
-    <w:bookmarkEnd w:id="47"/>
-    <w:bookmarkStart w:id="48" w:name="blow-in-cellulose-wall-insulation"/>
+        <w:t xml:space="preserve">Efficiency Maine rebates will cover vapor barriers up to 25% of a weatherization project cost, if done as part of a larger insulation project. Most insulation companies can install spray foam and vapor barriers together. Efficiency Maine rebates and other incentives for insulation work can fund up to 80% of the overall cost to weatherize your home (subject to a lifetime limit per building), up to $9,200 when combined with nonrefundable federal tax credits. You can call them at 866-376-2463 (Monday to Friday, 8:00 am to 5:00 pm) or visit their webpage about insulation rebates: https://www.efficiencymaine.com/at-home/insulation-rebates/</w:t>
+      </w:r>
+    </w:p>
+    <w:bookmarkEnd w:id="50"/>
+    <w:bookmarkStart w:id="51" w:name="spray-foam-basement-walls"/>
     <w:p>
       <w:pPr>
         <w:pStyle w:val="Heading3"/>
       </w:pPr>
       <w:r>
-        <w:t xml:space="preserve">4.7 Blow-in cellulose wall insulation</w:t>
+        <w:t xml:space="preserve">4.10 Spray foam Basement Walls</w:t>
       </w:r>
     </w:p>
     <w:p>
@@ -3937,7 +4327,7 @@
         <w:pStyle w:val="BodyText"/>
       </w:pPr>
       <w:r>
-        <w:t xml:space="preserve">The walls of the house are uninsulated, which is a significant source of heat loss.</w:t>
+        <w:t xml:space="preserve">The basement/crawlspace is uninsulated and used for mechanical equipment and plumbing. The walls are porous and allow moisture into the house and rapidly conduct heat out of the space.</w:t>
       </w:r>
     </w:p>
     <w:p>
@@ -3957,11 +4347,30 @@
         <w:pStyle w:val="BodyText"/>
       </w:pPr>
       <w:r>
-        <w:t xml:space="preserve">Insulate the wall stud cavities with dense packed, blown-in cellulose insulation. In balloon-framed homes, this can often be done from the attic, otherwise it can be done by drilling holes into the wall cavities from either the inside or outside.</w:t>
+        <w:t xml:space="preserve">Install spray foam on the basement/crawlspace walls to prevent moisture infiltration and reduce heat loss. In older homes, most heat loss is due to air leakage. Air sealing is particularly important in the basement or crawlspace (and attic). As warm air rises and leaks out the top of your home, cold air is pulled in at the bottom. This is called the</w:t>
       </w:r>
       <w:r>
         <w:t xml:space="preserve"> </w:t>
       </w:r>
+      <w:r>
+        <w:t xml:space="preserve">‘stack effect’</w:t>
+      </w:r>
+      <w:r>
+        <w:t xml:space="preserve">, and is more pronounced in taller homes. Thus, air sealing is necessary anywhere gaps allow air to move into your house through the basement/crawlspace.</w:t>
+      </w:r>
+    </w:p>
+    <w:p>
+      <w:pPr>
+        <w:pStyle w:val="BodyText"/>
+      </w:pPr>
+      <w:r>
+        <w:t xml:space="preserve">Spray foam should be applied 2-3 inches thick on the walls to seal and insulate them. It is often ideal to install a vapor barrier at the same time as the spray foam insulation. Spray foam generally requires a layer of intumescent (fire-rated) paint over it to meet fire code.</w:t>
+      </w:r>
+    </w:p>
+    <w:p>
+      <w:pPr>
+        <w:pStyle w:val="BodyText"/>
+      </w:pPr>
       <w:r>
         <w:rPr>
           <w:i/>
@@ -3975,17 +4384,17 @@
         <w:pStyle w:val="BodyText"/>
       </w:pPr>
       <w:r>
-        <w:t xml:space="preserve">Efficiency Maine rebates and other incentives for insulation work can fund up to 80% of the overall cost to weatherize your home (subject to a lifetime limit per building), up to $9,200 when combined with nonrefundable federal tax credits. You can call them at 866-376-2463 (Monday to Friday, 8:00 am to 5:00 pm) or visit their webpage about insulation rebates: https://www.efficiencymaine.com/at-home/insulation-rebates/</w:t>
-      </w:r>
-    </w:p>
-    <w:bookmarkEnd w:id="48"/>
-    <w:bookmarkStart w:id="49" w:name="continuous-exterior-wall-insulation"/>
+        <w:t xml:space="preserve">Installation of spray foam insulation will cost around $5-7 per square foot. Efficiency Maine rebates and other incentives for insulation work can fund up to 80% of the project cost (subject to a lifetime limit per building), up to $9,200 when combined with nonrefundable federal tax credits. You can call them at 866-376-2463 (Monday to Friday, 8:00 am to 5:00 pm) or visit their webpage about insulation rebates: https://www.efficiencymaine.com/at-home/insulation-rebates/</w:t>
+      </w:r>
+    </w:p>
+    <w:bookmarkEnd w:id="51"/>
+    <w:bookmarkStart w:id="52" w:name="attic-insulation-and-air-sealing"/>
     <w:p>
       <w:pPr>
         <w:pStyle w:val="Heading3"/>
       </w:pPr>
       <w:r>
-        <w:t xml:space="preserve">4.8 Continuous exterior wall insulation</w:t>
+        <w:t xml:space="preserve">4.11 Attic Insulation and Air Sealing</w:t>
       </w:r>
     </w:p>
     <w:p>
@@ -4005,7 +4414,7 @@
         <w:pStyle w:val="BodyText"/>
       </w:pPr>
       <w:r>
-        <w:t xml:space="preserve">There isn’t continuous insulation between the siding and the exterior walls of the house. Continuous insulation helps create a complete thermal boundary for your house, and it is now an energy code requirement for new houses.</w:t>
+        <w:t xml:space="preserve">The attic is uninsulated or is missing insulation and the attic could also benefit from air-sealing. These upgrades will reduce draftiness and heat loss in the winter and heat gain in the summer.</w:t>
       </w:r>
     </w:p>
     <w:p>
@@ -4025,7 +4434,24 @@
         <w:pStyle w:val="BodyText"/>
       </w:pPr>
       <w:r>
-        <w:t xml:space="preserve">Add a continuous layer of insulation and potentially replace the air and moisture barrier once it becomes time to replace the siding. Add continuous insulation (R-6 or more) under the new siding to keep the house warmer in the winter and cooler in the summer. We recommend TimberHP TimberBoard insulation (produced in Madison, Maine) or Rockwool Comfortboard, but foam board can also be used. Before installing exterior insulation, the contractor can check if insulation is needed between the interior wall studs.</w:t>
+        <w:t xml:space="preserve">Air seal the attic and insulate it to at least R-60 (18 inches of loose-fill cellulose insulation). COA has been installing 24 inches (R-80) of cellulose insulation in attics on our campus. Before the attic is insulated, ensure that any needed bathroom and kitchen fans are installed and that all fans are properly vented to the outside.</w:t>
+      </w:r>
+    </w:p>
+    <w:p>
+      <w:pPr>
+        <w:pStyle w:val="BodyText"/>
+      </w:pPr>
+      <w:r>
+        <w:t xml:space="preserve">In older homes, most heat loss is due to air leakage. Air sealing is particularly important in the attic (and basement or crawlspace). As warm air rises and leaks out the top of your home, cold air is pulled in at the bottom. This is called the</w:t>
+      </w:r>
+      <w:r>
+        <w:t xml:space="preserve"> </w:t>
+      </w:r>
+      <w:r>
+        <w:t xml:space="preserve">‘stack effect’</w:t>
+      </w:r>
+      <w:r>
+        <w:t xml:space="preserve">, and is more pronounced in taller homes. Thus, air sealing is necessary anywhere gaps allow air to move between your house and the attic. This typically includes gaps around the chimney, electrical penetrations, and wall top plates.</w:t>
       </w:r>
     </w:p>
     <w:p>
@@ -4048,14 +4474,14 @@
         <w:t xml:space="preserve">Efficiency Maine rebates and other incentives for insulation work can fund up to 80% of the overall cost to weatherize your home (subject to a lifetime limit per building), up to $9,200 when combined with nonrefundable federal tax credits. You can call them at 866-376-2463 (Monday to Friday, 8:00 am to 5:00 pm) or visit their webpage about insulation rebates: https://www.efficiencymaine.com/at-home/insulation-rebates/</w:t>
       </w:r>
     </w:p>
-    <w:bookmarkEnd w:id="49"/>
-    <w:bookmarkStart w:id="50" w:name="electrical-panel-upgrade"/>
+    <w:bookmarkEnd w:id="52"/>
+    <w:bookmarkStart w:id="53" w:name="blow-in-cellulose-wall-insulation"/>
     <w:p>
       <w:pPr>
         <w:pStyle w:val="Heading3"/>
       </w:pPr>
       <w:r>
-        <w:t xml:space="preserve">4.9 Electrical Panel Upgrade</w:t>
+        <w:t xml:space="preserve">4.12 Blow-in cellulose wall insulation</w:t>
       </w:r>
     </w:p>
     <w:p>
@@ -4075,11 +4501,234 @@
         <w:pStyle w:val="BodyText"/>
       </w:pPr>
       <w:r>
+        <w:t xml:space="preserve">The walls of the house are uninsulated, which is a significant source of heat loss.</w:t>
+      </w:r>
+    </w:p>
+    <w:p>
+      <w:pPr>
+        <w:pStyle w:val="BodyText"/>
+      </w:pPr>
+      <w:r>
+        <w:rPr>
+          <w:i/>
+          <w:iCs/>
+        </w:rPr>
+        <w:t xml:space="preserve">Recommendation</w:t>
+      </w:r>
+    </w:p>
+    <w:p>
+      <w:pPr>
+        <w:pStyle w:val="BodyText"/>
+      </w:pPr>
+      <w:r>
+        <w:t xml:space="preserve">Insulate the wall stud cavities with dense packed, blown-in cellulose insulation. In balloon-framed homes, this can often be done from the attic, otherwise it can be done by drilling holes into the wall cavities from either the inside or outside.</w:t>
+      </w:r>
+      <w:r>
+        <w:t xml:space="preserve"> </w:t>
+      </w:r>
+      <w:r>
+        <w:rPr>
+          <w:i/>
+          <w:iCs/>
+        </w:rPr>
+        <w:t xml:space="preserve">Estimated Cost/Benefits/Incentives</w:t>
+      </w:r>
+    </w:p>
+    <w:p>
+      <w:pPr>
+        <w:pStyle w:val="BodyText"/>
+      </w:pPr>
+      <w:r>
+        <w:t xml:space="preserve">Efficiency Maine rebates and other incentives for insulation work can fund up to 80% of the overall cost to weatherize your home (subject to a lifetime limit per building), up to $9,200 when combined with nonrefundable federal tax credits. You can call them at 866-376-2463 (Monday to Friday, 8:00 am to 5:00 pm) or visit their webpage about insulation rebates: https://www.efficiencymaine.com/at-home/insulation-rebates/</w:t>
+      </w:r>
+    </w:p>
+    <w:bookmarkEnd w:id="53"/>
+    <w:bookmarkStart w:id="54" w:name="continuous-exterior-wall-insulation"/>
+    <w:p>
+      <w:pPr>
+        <w:pStyle w:val="Heading3"/>
+      </w:pPr>
+      <w:r>
+        <w:t xml:space="preserve">4.13 Continuous exterior wall insulation</w:t>
+      </w:r>
+    </w:p>
+    <w:p>
+      <w:pPr>
+        <w:pStyle w:val="FirstParagraph"/>
+      </w:pPr>
+      <w:r>
+        <w:rPr>
+          <w:i/>
+          <w:iCs/>
+        </w:rPr>
+        <w:t xml:space="preserve">Problem</w:t>
+      </w:r>
+    </w:p>
+    <w:p>
+      <w:pPr>
+        <w:pStyle w:val="BodyText"/>
+      </w:pPr>
+      <w:r>
+        <w:t xml:space="preserve">There isn’t continuous insulation between the siding and the exterior walls of the house. Continuous insulation helps create a complete thermal boundary for your house, and it is now an energy code requirement for new houses.</w:t>
+      </w:r>
+    </w:p>
+    <w:p>
+      <w:pPr>
+        <w:pStyle w:val="BodyText"/>
+      </w:pPr>
+      <w:r>
+        <w:rPr>
+          <w:i/>
+          <w:iCs/>
+        </w:rPr>
+        <w:t xml:space="preserve">Recommendation</w:t>
+      </w:r>
+    </w:p>
+    <w:p>
+      <w:pPr>
+        <w:pStyle w:val="BodyText"/>
+      </w:pPr>
+      <w:r>
+        <w:t xml:space="preserve">Add a continuous layer of insulation and potentially replace the air and moisture barrier once it becomes time to replace the siding. Add continuous insulation (R-6 or more) under the new siding to keep the house warmer in the winter and cooler in the summer. We recommend TimberHP TimberBoard insulation (produced in Madison, Maine) or Rockwool Comfortboard, but foam board can also be used. Before installing exterior insulation, the contractor can check if insulation is needed between the interior wall studs.</w:t>
+      </w:r>
+    </w:p>
+    <w:p>
+      <w:pPr>
+        <w:pStyle w:val="BodyText"/>
+      </w:pPr>
+      <w:r>
+        <w:rPr>
+          <w:i/>
+          <w:iCs/>
+        </w:rPr>
+        <w:t xml:space="preserve">Estimated Cost/Benefits/Incentives</w:t>
+      </w:r>
+    </w:p>
+    <w:p>
+      <w:pPr>
+        <w:pStyle w:val="BodyText"/>
+      </w:pPr>
+      <w:r>
+        <w:t xml:space="preserve">Efficiency Maine rebates and other incentives for insulation work can fund up to 80% of the overall cost to weatherize your home (subject to a lifetime limit per building), up to $9,200 when combined with nonrefundable federal tax credits. You can call them at 866-376-2463 (Monday to Friday, 8:00 am to 5:00 pm) or visit their webpage about insulation rebates: https://www.efficiencymaine.com/at-home/insulation-rebates/</w:t>
+      </w:r>
+    </w:p>
+    <w:bookmarkEnd w:id="54"/>
+    <w:bookmarkStart w:id="55" w:name="pipe-insulation"/>
+    <w:p>
+      <w:pPr>
+        <w:pStyle w:val="Heading3"/>
+      </w:pPr>
+      <w:r>
+        <w:t xml:space="preserve">4.14 Pipe Insulation</w:t>
+      </w:r>
+    </w:p>
+    <w:p>
+      <w:pPr>
+        <w:pStyle w:val="FirstParagraph"/>
+      </w:pPr>
+      <w:r>
+        <w:rPr>
+          <w:i/>
+          <w:iCs/>
+        </w:rPr>
+        <w:t xml:space="preserve">Problem</w:t>
+      </w:r>
+    </w:p>
+    <w:p>
+      <w:pPr>
+        <w:pStyle w:val="BodyText"/>
+      </w:pPr>
+      <w:r>
+        <w:t xml:space="preserve">Uninsulated water pipes are responsible for heat loss and excess moisture (from condensation) in your basement/crawlspace.</w:t>
+      </w:r>
+    </w:p>
+    <w:p>
+      <w:pPr>
+        <w:pStyle w:val="BodyText"/>
+      </w:pPr>
+      <w:r>
+        <w:rPr>
+          <w:i/>
+          <w:iCs/>
+        </w:rPr>
+        <w:t xml:space="preserve">Recommendation</w:t>
+      </w:r>
+    </w:p>
+    <w:p>
+      <w:pPr>
+        <w:pStyle w:val="BodyText"/>
+      </w:pPr>
+      <w:r>
+        <w:t xml:space="preserve">Insulate both hot and cold water pipes that are uninsulated in the basement/crawlspace. This will save energy and prevent condensation. We recommend foam pipe insulation made of polyethylene or neoprene.</w:t>
+      </w:r>
+    </w:p>
+    <w:p>
+      <w:pPr>
+        <w:pStyle w:val="BodyText"/>
+      </w:pPr>
+      <w:r>
+        <w:rPr>
+          <w:i/>
+          <w:iCs/>
+        </w:rPr>
+        <w:t xml:space="preserve">Estimated Cost/Benefits/Incentives</w:t>
+      </w:r>
+    </w:p>
+    <w:p>
+      <w:pPr>
+        <w:pStyle w:val="BodyText"/>
+      </w:pPr>
+      <w:r>
+        <w:t xml:space="preserve">Insulating water pipes can save 2%-4% on hot water bills and increase the temperature of the water while reducing the time it takes for hot water to reach your tap. Materials cost around $100-200, depending on the length of pipe to insulate. Many people find this to be an easy project to do themselves.</w:t>
+      </w:r>
+    </w:p>
+    <w:bookmarkEnd w:id="55"/>
+    <w:bookmarkStart w:id="56" w:name="diy-air-sealing"/>
+    <w:p>
+      <w:pPr>
+        <w:pStyle w:val="Heading3"/>
+      </w:pPr>
+      <w:r>
+        <w:t xml:space="preserve">4.15 DIY Air Sealing</w:t>
+      </w:r>
+    </w:p>
+    <w:p>
+      <w:pPr>
+        <w:pStyle w:val="FirstParagraph"/>
+      </w:pPr>
+      <w:r>
+        <w:rPr>
+          <w:i/>
+          <w:iCs/>
+        </w:rPr>
+        <w:t xml:space="preserve">Problem</w:t>
+      </w:r>
+    </w:p>
+    <w:p>
+      <w:pPr>
+        <w:pStyle w:val="BodyText"/>
+      </w:pPr>
+      <w:r>
+        <w:t xml:space="preserve">During the blower door test, we noted sources of air leakage in the living areas of your house.</w:t>
+      </w:r>
+    </w:p>
+    <w:p>
+      <w:pPr>
+        <w:pStyle w:val="BodyText"/>
+      </w:pPr>
+      <w:r>
         <w:rPr>
           <w:b/>
           <w:bCs/>
         </w:rPr>
-        <w:t xml:space="preserve">Auditor to describe</w:t>
+        <w:t xml:space="preserve">Auditor to detail customized findings.</w:t>
+      </w:r>
+      <w:r>
+        <w:rPr>
+          <w:b/>
+          <w:bCs/>
+        </w:rPr>
+        <w:t xml:space="preserve"> </w:t>
       </w:r>
     </w:p>
     <w:p>
@@ -4099,7 +4748,7 @@
         <w:pStyle w:val="BodyText"/>
       </w:pPr>
       <w:r>
-        <w:t xml:space="preserve">Consult with an electrician about replacing your existing electrical panel with a 200 amp panel as you add electrical appliances to your home. It may become necessary to increase the capacity to address potential safety hazards. An electrician can determine whether or not a panel upgrade is necessary based on your current and anticipated usage.</w:t>
+        <w:t xml:space="preserve">Air sealing the air leaks we identified around the living areas of your house can be a DIY solution to lower energy use, or an insulation contractor can seal the leaks when they come to your house for a larger project. Please address any moisture concerns before undertaking significant air sealing efforts.</w:t>
       </w:r>
     </w:p>
     <w:p>
@@ -4119,17 +4768,583 @@
         <w:pStyle w:val="BodyText"/>
       </w:pPr>
       <w:r>
-        <w:t xml:space="preserve">Costs of electrical components needed to support residential energy upgrades – including panels, sub-panels, branch circuits, and feeders – qualify for a 30% nonrefundable tax credit (up to $600 per item) if they have a capacity of 200 amps or more. An electrical panel upgrades also provides a good opportunity for an electrician to install whole-house surge protection, which costs $100-$400. Here are some options: https://www.popularmechanics.com/home/interior-projects/g43140886/best-whole-house-surge-protectors/</w:t>
-      </w:r>
-    </w:p>
-    <w:bookmarkEnd w:id="50"/>
-    <w:bookmarkStart w:id="51" w:name="air-source-heat-pump"/>
+        <w:t xml:space="preserve">Air sealing and insulating ductwork is eligible for a non-refundable federal tax credit (</w:t>
+      </w:r>
+      <w:r>
+        <w:t xml:space="preserve">“Energy Efficient Home Improvement Credit”</w:t>
+      </w:r>
+      <w:r>
+        <w:t xml:space="preserve">), which can pay for 30% of the project cost, subject to an annual maximum of $1,200 (shared with other home envelope improvements, like attic and basement projects).</w:t>
+      </w:r>
+    </w:p>
+    <w:p>
+      <w:pPr>
+        <w:pStyle w:val="SourceCode"/>
+      </w:pPr>
+      <w:r>
+        <w:rPr>
+          <w:rStyle w:val="NormalTok"/>
+        </w:rPr>
+        <w:t xml:space="preserve"> </w:t>
+      </w:r>
+      <w:r>
+        <w:rPr>
+          <w:rStyle w:val="CommentTok"/>
+        </w:rPr>
+        <w:t xml:space="preserve">#| label: other 3 recommendation</w:t>
+      </w:r>
+      <w:r>
+        <w:br/>
+      </w:r>
+      <w:r>
+        <w:rPr>
+          <w:rStyle w:val="NormalTok"/>
+        </w:rPr>
+        <w:t xml:space="preserve"> </w:t>
+      </w:r>
+      <w:r>
+        <w:rPr>
+          <w:rStyle w:val="CommentTok"/>
+        </w:rPr>
+        <w:t xml:space="preserve">#| echo: false</w:t>
+      </w:r>
+      <w:r>
+        <w:br/>
+      </w:r>
+      <w:r>
+        <w:rPr>
+          <w:rStyle w:val="NormalTok"/>
+        </w:rPr>
+        <w:t xml:space="preserve"> </w:t>
+      </w:r>
+      <w:r>
+        <w:rPr>
+          <w:rStyle w:val="CommentTok"/>
+        </w:rPr>
+        <w:t xml:space="preserve">#| results: asis</w:t>
+      </w:r>
+      <w:r>
+        <w:br/>
+      </w:r>
+      <w:r>
+        <w:br/>
+      </w:r>
+      <w:r>
+        <w:br/>
+      </w:r>
+      <w:r>
+        <w:rPr>
+          <w:rStyle w:val="ControlFlowTok"/>
+        </w:rPr>
+        <w:t xml:space="preserve">if</w:t>
+      </w:r>
+      <w:r>
+        <w:rPr>
+          <w:rStyle w:val="NormalTok"/>
+        </w:rPr>
+        <w:t xml:space="preserve">( other_3 </w:t>
+      </w:r>
+      <w:r>
+        <w:rPr>
+          <w:rStyle w:val="SpecialCharTok"/>
+        </w:rPr>
+        <w:t xml:space="preserve">==</w:t>
+      </w:r>
+      <w:r>
+        <w:rPr>
+          <w:rStyle w:val="NormalTok"/>
+        </w:rPr>
+        <w:t xml:space="preserve"> </w:t>
+      </w:r>
+      <w:r>
+        <w:rPr>
+          <w:rStyle w:val="ConstantTok"/>
+        </w:rPr>
+        <w:t xml:space="preserve">TRUE</w:t>
+      </w:r>
+      <w:r>
+        <w:rPr>
+          <w:rStyle w:val="NormalTok"/>
+        </w:rPr>
+        <w:t xml:space="preserve">){</w:t>
+      </w:r>
+      <w:r>
+        <w:br/>
+      </w:r>
+      <w:r>
+        <w:rPr>
+          <w:rStyle w:val="NormalTok"/>
+        </w:rPr>
+        <w:t xml:space="preserve">  </w:t>
+      </w:r>
+      <w:r>
+        <w:rPr>
+          <w:rStyle w:val="FunctionTok"/>
+        </w:rPr>
+        <w:t xml:space="preserve">cat</w:t>
+      </w:r>
+      <w:r>
+        <w:rPr>
+          <w:rStyle w:val="NormalTok"/>
+        </w:rPr>
+        <w:t xml:space="preserve">(</w:t>
+      </w:r>
+      <w:r>
+        <w:rPr>
+          <w:rStyle w:val="StringTok"/>
+        </w:rPr>
+        <w:t xml:space="preserve">"### Other 3</w:t>
+      </w:r>
+      <w:r>
+        <w:br/>
+      </w:r>
+      <w:r>
+        <w:rPr>
+          <w:rStyle w:val="StringTok"/>
+        </w:rPr>
+        <w:t xml:space="preserve">  </w:t>
+      </w:r>
+      <w:r>
+        <w:br/>
+      </w:r>
+      <w:r>
+        <w:rPr>
+          <w:rStyle w:val="StringTok"/>
+        </w:rPr>
+        <w:t xml:space="preserve">*Problem*</w:t>
+      </w:r>
+      <w:r>
+        <w:br/>
+      </w:r>
+      <w:r>
+        <w:br/>
+      </w:r>
+      <w:r>
+        <w:rPr>
+          <w:rStyle w:val="StringTok"/>
+        </w:rPr>
+        <w:t xml:space="preserve">*Recommendation*</w:t>
+      </w:r>
+      <w:r>
+        <w:br/>
+      </w:r>
+      <w:r>
+        <w:br/>
+      </w:r>
+      <w:r>
+        <w:rPr>
+          <w:rStyle w:val="StringTok"/>
+        </w:rPr>
+        <w:t xml:space="preserve">"</w:t>
+      </w:r>
+      <w:r>
+        <w:rPr>
+          <w:rStyle w:val="NormalTok"/>
+        </w:rPr>
+        <w:t xml:space="preserve">)</w:t>
+      </w:r>
+      <w:r>
+        <w:br/>
+      </w:r>
+      <w:r>
+        <w:rPr>
+          <w:rStyle w:val="NormalTok"/>
+        </w:rPr>
+        <w:t xml:space="preserve">}</w:t>
+      </w:r>
+      <w:r>
+        <w:rPr>
+          <w:rStyle w:val="ControlFlowTok"/>
+        </w:rPr>
+        <w:t xml:space="preserve">else</w:t>
+      </w:r>
+      <w:r>
+        <w:rPr>
+          <w:rStyle w:val="NormalTok"/>
+        </w:rPr>
+        <w:t xml:space="preserve">{</w:t>
+      </w:r>
+      <w:r>
+        <w:br/>
+      </w:r>
+      <w:r>
+        <w:rPr>
+          <w:rStyle w:val="NormalTok"/>
+        </w:rPr>
+        <w:t xml:space="preserve">  </w:t>
+      </w:r>
+      <w:r>
+        <w:rPr>
+          <w:rStyle w:val="FunctionTok"/>
+        </w:rPr>
+        <w:t xml:space="preserve">cat</w:t>
+      </w:r>
+      <w:r>
+        <w:rPr>
+          <w:rStyle w:val="NormalTok"/>
+        </w:rPr>
+        <w:t xml:space="preserve">(</w:t>
+      </w:r>
+      <w:r>
+        <w:rPr>
+          <w:rStyle w:val="StringTok"/>
+        </w:rPr>
+        <w:t xml:space="preserve">""</w:t>
+      </w:r>
+      <w:r>
+        <w:rPr>
+          <w:rStyle w:val="NormalTok"/>
+        </w:rPr>
+        <w:t xml:space="preserve">)</w:t>
+      </w:r>
+      <w:r>
+        <w:br/>
+      </w:r>
+      <w:r>
+        <w:rPr>
+          <w:rStyle w:val="NormalTok"/>
+        </w:rPr>
+        <w:t xml:space="preserve">}</w:t>
+      </w:r>
+      <w:r>
+        <w:br/>
+      </w:r>
+      <w:r>
+        <w:br/>
+      </w:r>
+      <w:r>
+        <w:rPr>
+          <w:rStyle w:val="ControlFlowTok"/>
+        </w:rPr>
+        <w:t xml:space="preserve">if</w:t>
+      </w:r>
+      <w:r>
+        <w:rPr>
+          <w:rStyle w:val="NormalTok"/>
+        </w:rPr>
+        <w:t xml:space="preserve">(other_3 </w:t>
+      </w:r>
+      <w:r>
+        <w:rPr>
+          <w:rStyle w:val="SpecialCharTok"/>
+        </w:rPr>
+        <w:t xml:space="preserve">==</w:t>
+      </w:r>
+      <w:r>
+        <w:rPr>
+          <w:rStyle w:val="NormalTok"/>
+        </w:rPr>
+        <w:t xml:space="preserve"> </w:t>
+      </w:r>
+      <w:r>
+        <w:rPr>
+          <w:rStyle w:val="ConstantTok"/>
+        </w:rPr>
+        <w:t xml:space="preserve">TRUE</w:t>
+      </w:r>
+      <w:r>
+        <w:rPr>
+          <w:rStyle w:val="NormalTok"/>
+        </w:rPr>
+        <w:t xml:space="preserve">){</w:t>
+      </w:r>
+      <w:r>
+        <w:br/>
+      </w:r>
+      <w:r>
+        <w:rPr>
+          <w:rStyle w:val="NormalTok"/>
+        </w:rPr>
+        <w:t xml:space="preserve">  </w:t>
+      </w:r>
+      <w:r>
+        <w:rPr>
+          <w:rStyle w:val="FunctionTok"/>
+        </w:rPr>
+        <w:t xml:space="preserve">cat</w:t>
+      </w:r>
+      <w:r>
+        <w:rPr>
+          <w:rStyle w:val="NormalTok"/>
+        </w:rPr>
+        <w:t xml:space="preserve">(a_other_3</w:t>
+      </w:r>
+      <w:r>
+        <w:rPr>
+          <w:rStyle w:val="SpecialCharTok"/>
+        </w:rPr>
+        <w:t xml:space="preserve">$</w:t>
+      </w:r>
+      <w:r>
+        <w:rPr>
+          <w:rStyle w:val="NormalTok"/>
+        </w:rPr>
+        <w:t xml:space="preserve">Description</w:t>
+      </w:r>
+      <w:r>
+        <w:br/>
+      </w:r>
+      <w:r>
+        <w:rPr>
+          <w:rStyle w:val="NormalTok"/>
+        </w:rPr>
+        <w:t xml:space="preserve">    </w:t>
+      </w:r>
+      <w:r>
+        <w:br/>
+      </w:r>
+      <w:r>
+        <w:rPr>
+          <w:rStyle w:val="NormalTok"/>
+        </w:rPr>
+        <w:t xml:space="preserve">  )</w:t>
+      </w:r>
+      <w:r>
+        <w:br/>
+      </w:r>
+      <w:r>
+        <w:rPr>
+          <w:rStyle w:val="NormalTok"/>
+        </w:rPr>
+        <w:t xml:space="preserve">}</w:t>
+      </w:r>
+      <w:r>
+        <w:rPr>
+          <w:rStyle w:val="ControlFlowTok"/>
+        </w:rPr>
+        <w:t xml:space="preserve">else</w:t>
+      </w:r>
+      <w:r>
+        <w:rPr>
+          <w:rStyle w:val="NormalTok"/>
+        </w:rPr>
+        <w:t xml:space="preserve">{</w:t>
+      </w:r>
+      <w:r>
+        <w:br/>
+      </w:r>
+      <w:r>
+        <w:rPr>
+          <w:rStyle w:val="NormalTok"/>
+        </w:rPr>
+        <w:t xml:space="preserve">  </w:t>
+      </w:r>
+      <w:r>
+        <w:rPr>
+          <w:rStyle w:val="FunctionTok"/>
+        </w:rPr>
+        <w:t xml:space="preserve">cat</w:t>
+      </w:r>
+      <w:r>
+        <w:rPr>
+          <w:rStyle w:val="NormalTok"/>
+        </w:rPr>
+        <w:t xml:space="preserve">(</w:t>
+      </w:r>
+      <w:r>
+        <w:rPr>
+          <w:rStyle w:val="StringTok"/>
+        </w:rPr>
+        <w:t xml:space="preserve">""</w:t>
+      </w:r>
+      <w:r>
+        <w:rPr>
+          <w:rStyle w:val="NormalTok"/>
+        </w:rPr>
+        <w:t xml:space="preserve">)</w:t>
+      </w:r>
+      <w:r>
+        <w:br/>
+      </w:r>
+      <w:r>
+        <w:rPr>
+          <w:rStyle w:val="NormalTok"/>
+        </w:rPr>
+        <w:t xml:space="preserve">  }</w:t>
+      </w:r>
+      <w:r>
+        <w:br/>
+      </w:r>
+      <w:r>
+        <w:br/>
+      </w:r>
+      <w:r>
+        <w:rPr>
+          <w:rStyle w:val="ControlFlowTok"/>
+        </w:rPr>
+        <w:t xml:space="preserve">if</w:t>
+      </w:r>
+      <w:r>
+        <w:rPr>
+          <w:rStyle w:val="NormalTok"/>
+        </w:rPr>
+        <w:t xml:space="preserve">(other_3 </w:t>
+      </w:r>
+      <w:r>
+        <w:rPr>
+          <w:rStyle w:val="SpecialCharTok"/>
+        </w:rPr>
+        <w:t xml:space="preserve">==</w:t>
+      </w:r>
+      <w:r>
+        <w:rPr>
+          <w:rStyle w:val="NormalTok"/>
+        </w:rPr>
+        <w:t xml:space="preserve"> </w:t>
+      </w:r>
+      <w:r>
+        <w:rPr>
+          <w:rStyle w:val="ConstantTok"/>
+        </w:rPr>
+        <w:t xml:space="preserve">TRUE</w:t>
+      </w:r>
+      <w:r>
+        <w:rPr>
+          <w:rStyle w:val="NormalTok"/>
+        </w:rPr>
+        <w:t xml:space="preserve">){</w:t>
+      </w:r>
+      <w:r>
+        <w:br/>
+      </w:r>
+      <w:r>
+        <w:rPr>
+          <w:rStyle w:val="NormalTok"/>
+        </w:rPr>
+        <w:t xml:space="preserve">  </w:t>
+      </w:r>
+      <w:r>
+        <w:rPr>
+          <w:rStyle w:val="FunctionTok"/>
+        </w:rPr>
+        <w:t xml:space="preserve">cat</w:t>
+      </w:r>
+      <w:r>
+        <w:rPr>
+          <w:rStyle w:val="NormalTok"/>
+        </w:rPr>
+        <w:t xml:space="preserve">(</w:t>
+      </w:r>
+      <w:r>
+        <w:rPr>
+          <w:rStyle w:val="StringTok"/>
+        </w:rPr>
+        <w:t xml:space="preserve">"</w:t>
+      </w:r>
+      <w:r>
+        <w:br/>
+      </w:r>
+      <w:r>
+        <w:br/>
+      </w:r>
+      <w:r>
+        <w:rPr>
+          <w:rStyle w:val="StringTok"/>
+        </w:rPr>
+        <w:t xml:space="preserve">*Estimated Cost/Benefits/Incentives*</w:t>
+      </w:r>
+      <w:r>
+        <w:br/>
+      </w:r>
+      <w:r>
+        <w:br/>
+      </w:r>
+      <w:r>
+        <w:rPr>
+          <w:rStyle w:val="StringTok"/>
+        </w:rPr>
+        <w:t xml:space="preserve">"</w:t>
+      </w:r>
+      <w:r>
+        <w:rPr>
+          <w:rStyle w:val="NormalTok"/>
+        </w:rPr>
+        <w:t xml:space="preserve">, auto_other_3_estimates</w:t>
+      </w:r>
+      <w:r>
+        <w:rPr>
+          <w:rStyle w:val="SpecialCharTok"/>
+        </w:rPr>
+        <w:t xml:space="preserve">$</w:t>
+      </w:r>
+      <w:r>
+        <w:rPr>
+          <w:rStyle w:val="NormalTok"/>
+        </w:rPr>
+        <w:t xml:space="preserve">Description)</w:t>
+      </w:r>
+      <w:r>
+        <w:br/>
+      </w:r>
+      <w:r>
+        <w:rPr>
+          <w:rStyle w:val="NormalTok"/>
+        </w:rPr>
+        <w:t xml:space="preserve">}</w:t>
+      </w:r>
+      <w:r>
+        <w:rPr>
+          <w:rStyle w:val="ControlFlowTok"/>
+        </w:rPr>
+        <w:t xml:space="preserve">else</w:t>
+      </w:r>
+      <w:r>
+        <w:rPr>
+          <w:rStyle w:val="NormalTok"/>
+        </w:rPr>
+        <w:t xml:space="preserve">{</w:t>
+      </w:r>
+      <w:r>
+        <w:br/>
+      </w:r>
+      <w:r>
+        <w:rPr>
+          <w:rStyle w:val="NormalTok"/>
+        </w:rPr>
+        <w:t xml:space="preserve">  </w:t>
+      </w:r>
+      <w:r>
+        <w:rPr>
+          <w:rStyle w:val="FunctionTok"/>
+        </w:rPr>
+        <w:t xml:space="preserve">cat</w:t>
+      </w:r>
+      <w:r>
+        <w:rPr>
+          <w:rStyle w:val="NormalTok"/>
+        </w:rPr>
+        <w:t xml:space="preserve">(</w:t>
+      </w:r>
+      <w:r>
+        <w:rPr>
+          <w:rStyle w:val="StringTok"/>
+        </w:rPr>
+        <w:t xml:space="preserve">""</w:t>
+      </w:r>
+      <w:r>
+        <w:rPr>
+          <w:rStyle w:val="NormalTok"/>
+        </w:rPr>
+        <w:t xml:space="preserve">)</w:t>
+      </w:r>
+      <w:r>
+        <w:br/>
+      </w:r>
+      <w:r>
+        <w:rPr>
+          <w:rStyle w:val="NormalTok"/>
+        </w:rPr>
+        <w:t xml:space="preserve">  } </w:t>
+      </w:r>
+    </w:p>
+    <w:bookmarkEnd w:id="56"/>
+    <w:bookmarkStart w:id="57" w:name="ductwork-air-sealing-and-insulation"/>
     <w:p>
       <w:pPr>
         <w:pStyle w:val="Heading3"/>
       </w:pPr>
       <w:r>
-        <w:t xml:space="preserve">4.10 Air Source Heat Pump</w:t>
+        <w:t xml:space="preserve">4.16 Ductwork Air Sealing and Insulation</w:t>
       </w:r>
     </w:p>
     <w:p>
@@ -4149,7 +5364,7 @@
         <w:pStyle w:val="BodyText"/>
       </w:pPr>
       <w:r>
-        <w:t xml:space="preserve">Combustion heating equipment is expensive, inefficient, and has the potential to release harmful combustion gases like carbon monoxide into the home.</w:t>
+        <w:t xml:space="preserve">The furnace supply ductwork running through the basement would be more efficient if it were air sealed and insulated. The heated air from the furnace loses a lot of heat to the surroundings on its way to the living space.</w:t>
       </w:r>
     </w:p>
     <w:p>
@@ -4169,37 +5384,240 @@
         <w:pStyle w:val="BodyText"/>
       </w:pPr>
       <w:r>
-        <w:t xml:space="preserve">Install air source heat pumps for heating and cooling and whole-house surge protection. Air source heat pumps can be up to 300% efficient and heat, cool, and dehumidify your house. A qualified installer will help determine what size system to install and where. Whole-house surge protection will protect your appliances and heat pumps from being damaged by an electrical surge.</w:t>
-      </w:r>
-    </w:p>
-    <w:p>
-      <w:pPr>
-        <w:pStyle w:val="BodyText"/>
-      </w:pPr>
+        <w:t xml:space="preserve">Air seal and insulate all of the supply and return ductwork running through the basement/crawlspace. Air sealing should be completed first, and can be done with either UL 181 foil-faced tape, duct mastic, or by hiring a contractor that has equipment to Aeroseal the ductwork (https://aeroseal.com/find-a-pro/). For insulation, we recommend using foil-faced fiberglass batts. Foil-faced bubble wrap can also be used. It is important to air seal the ducts properly before insulating. Otherwise, the heat will bypass the insulation, making the insulation ineffective.</w:t>
+      </w:r>
       <w:r>
         <w:rPr>
           <w:i/>
           <w:iCs/>
         </w:rPr>
-        <w:t xml:space="preserve">Estimated Cost/Benefits/Incentives</w:t>
-      </w:r>
-    </w:p>
-    <w:p>
-      <w:pPr>
-        <w:pStyle w:val="BodyText"/>
-      </w:pPr>
-      <w:r>
-        <w:t xml:space="preserve">Efficiency Maine rebates can fund $1,000 to $3,000 per unit up to a lifetime limit per housing unit for $3,000 to $9,000 (depending on income level) to install heat pumps. The rebate can be combined with a nonrefundable federal tax credit of 30% of the remaining cost of the unit and labor, subject to an annual maximum benefit of $2,000 (shared with other energy property, like a heat pump water heater). You can call Efficiency Maine at 866-376-2463 (Monday to Friday, 8:00 am to 5:00 pm) or visit their website: https://www.efficiencymaine.com/at-home/residential-heat-pump-incentives/</w:t>
-      </w:r>
-    </w:p>
-    <w:bookmarkEnd w:id="51"/>
-    <w:bookmarkStart w:id="52" w:name="electric-vehicle-and-charger"/>
+        <w:t xml:space="preserve">Estimated Costs/Benefits/Incentives</w:t>
+      </w:r>
+    </w:p>
+    <w:p>
+      <w:pPr>
+        <w:pStyle w:val="BodyText"/>
+      </w:pPr>
+      <w:r>
+        <w:t xml:space="preserve">Air sealing and insulating ductwork is eligible for a non-refundable federal tax credit (</w:t>
+      </w:r>
+      <w:r>
+        <w:t xml:space="preserve">“Energy Efficient Home Improvement Credit”</w:t>
+      </w:r>
+      <w:r>
+        <w:t xml:space="preserve">), which can pay for 30% of the project cost, subject to an annual maximum of $1,200 (shared with other home envelope improvements, like attic and basement projects).</w:t>
+      </w:r>
+    </w:p>
+    <w:bookmarkEnd w:id="57"/>
+    <w:bookmarkEnd w:id="58"/>
+    <w:bookmarkStart w:id="59" w:name="additional-resources"/>
+    <w:p>
+      <w:pPr>
+        <w:pStyle w:val="Heading2"/>
+      </w:pPr>
+      <w:r>
+        <w:t xml:space="preserve">5 Additional Resources</w:t>
+      </w:r>
+    </w:p>
+    <w:p>
+      <w:pPr>
+        <w:pStyle w:val="FirstParagraph"/>
+      </w:pPr>
+      <w:r>
+        <w:t xml:space="preserve">Many home efficiency upgrades are eligible for Efficiency Maine rebates and federal tax credits. Financial incentives vary based on income level and type of occupancy. An overview of all state rebates and federal tax credits can be found here: https://www.efficiencymaine.com/at-home/.</w:t>
+      </w:r>
+    </w:p>
+    <w:p>
+      <w:pPr>
+        <w:pStyle w:val="BodyText"/>
+      </w:pPr>
+      <w:r>
+        <w:t xml:space="preserve">You can search for Efficiency Maine registered contractors here: https://www.efficiencymaine.com/at-home/vendor-locator/.</w:t>
+      </w:r>
+    </w:p>
+    <w:p>
+      <w:pPr>
+        <w:pStyle w:val="BodyText"/>
+      </w:pPr>
+      <w:r>
+        <w:t xml:space="preserve">We recommend discussing a whole-home plan for insulation and air sealing work in the basement, walls, and attic with contractors to determine how to best sequence the work to take full advantage of the Efficiency Maine rebates (which are subject to lifetime maximums) and nonrefundable federal tax credits (which are subject to annual maximums).</w:t>
+      </w:r>
+    </w:p>
+    <w:p>
+      <w:pPr>
+        <w:pStyle w:val="BodyText"/>
+      </w:pPr>
+      <w:r>
+        <w:t xml:space="preserve">Efficiency Maine also offers home energy loans to help homeowners who are Maine residents pay for energy and related health and safety upgrades. There are no fees, and interest rates for multi-year loans are between 5.99% (max $7,500) and 7.99% (max $25,000), depending on income level. Low- and moderate-income homeowners who borrow the full $7,500 and pay it back over 10 years will pay a monthly cost of $83. There is also a 1-year, 0% APR option. To learn more or apply, call 866-376-2463 or visit https://www.efficiencymaine.com/home-energy-loans/</w:t>
+      </w:r>
+    </w:p>
+    <w:bookmarkEnd w:id="59"/>
+    <w:bookmarkStart w:id="76" w:name="section-four-tests"/>
+    <w:p>
+      <w:pPr>
+        <w:pStyle w:val="Heading2"/>
+      </w:pPr>
+      <w:r>
+        <w:t xml:space="preserve">6 Section Four Tests</w:t>
+      </w:r>
+    </w:p>
+    <w:bookmarkStart w:id="60" w:name="furnaceboiler-tune-up-1"/>
     <w:p>
       <w:pPr>
         <w:pStyle w:val="Heading3"/>
       </w:pPr>
       <w:r>
-        <w:t xml:space="preserve">4.11 Electric Vehicle and charger</w:t>
+        <w:t xml:space="preserve">6.1 Furnace/Boiler Tune-up</w:t>
+      </w:r>
+    </w:p>
+    <w:bookmarkEnd w:id="60"/>
+    <w:bookmarkStart w:id="61" w:name="high-efficiency-shower-heads-1"/>
+    <w:p>
+      <w:pPr>
+        <w:pStyle w:val="Heading3"/>
+      </w:pPr>
+      <w:r>
+        <w:t xml:space="preserve">6.2 High-efficiency Shower Head(s)</w:t>
+      </w:r>
+    </w:p>
+    <w:bookmarkEnd w:id="61"/>
+    <w:bookmarkStart w:id="62" w:name="leds-1"/>
+    <w:p>
+      <w:pPr>
+        <w:pStyle w:val="Heading3"/>
+      </w:pPr>
+      <w:r>
+        <w:t xml:space="preserve">6.3 LEDs</w:t>
+      </w:r>
+    </w:p>
+    <w:bookmarkEnd w:id="62"/>
+    <w:bookmarkStart w:id="63" w:name="windowdressers"/>
+    <w:p>
+      <w:pPr>
+        <w:pStyle w:val="Heading3"/>
+      </w:pPr>
+      <w:r>
+        <w:t xml:space="preserve">6.4 WindowDressers</w:t>
+      </w:r>
+    </w:p>
+    <w:bookmarkEnd w:id="63"/>
+    <w:bookmarkStart w:id="64" w:name="heat-pump-water-heater-1"/>
+    <w:p>
+      <w:pPr>
+        <w:pStyle w:val="Heading3"/>
+      </w:pPr>
+      <w:r>
+        <w:t xml:space="preserve">6.5 Heat Pump Water Heater</w:t>
+      </w:r>
+    </w:p>
+    <w:bookmarkEnd w:id="64"/>
+    <w:bookmarkStart w:id="65" w:name="gutters-1"/>
+    <w:p>
+      <w:pPr>
+        <w:pStyle w:val="Heading3"/>
+      </w:pPr>
+      <w:r>
+        <w:t xml:space="preserve">6.6 Gutters</w:t>
+      </w:r>
+    </w:p>
+    <w:bookmarkEnd w:id="65"/>
+    <w:bookmarkStart w:id="66" w:name="bathroom-exhaust-fans-1"/>
+    <w:p>
+      <w:pPr>
+        <w:pStyle w:val="Heading3"/>
+      </w:pPr>
+      <w:r>
+        <w:t xml:space="preserve">6.7 Bathroom Exhaust Fan(s)</w:t>
+      </w:r>
+    </w:p>
+    <w:bookmarkEnd w:id="66"/>
+    <w:bookmarkStart w:id="67" w:name="kitchen-exhaust-fan"/>
+    <w:p>
+      <w:pPr>
+        <w:pStyle w:val="Heading3"/>
+      </w:pPr>
+      <w:r>
+        <w:t xml:space="preserve">6.8 Kitchen Exhaust Fan</w:t>
+      </w:r>
+    </w:p>
+    <w:bookmarkEnd w:id="67"/>
+    <w:bookmarkStart w:id="68" w:name="vapor-barrier-1"/>
+    <w:p>
+      <w:pPr>
+        <w:pStyle w:val="Heading3"/>
+      </w:pPr>
+      <w:r>
+        <w:t xml:space="preserve">6.9 Vapor Barrier</w:t>
+      </w:r>
+    </w:p>
+    <w:bookmarkEnd w:id="68"/>
+    <w:bookmarkStart w:id="69" w:name="spray-foam-basementcrawlspace-walls"/>
+    <w:p>
+      <w:pPr>
+        <w:pStyle w:val="Heading3"/>
+      </w:pPr>
+      <w:r>
+        <w:t xml:space="preserve">6.10 Spray Foam Basement/Crawlspace Walls</w:t>
+      </w:r>
+    </w:p>
+    <w:bookmarkEnd w:id="69"/>
+    <w:bookmarkStart w:id="70" w:name="attic-air-sealing-and-insulation"/>
+    <w:p>
+      <w:pPr>
+        <w:pStyle w:val="Heading3"/>
+      </w:pPr>
+      <w:r>
+        <w:t xml:space="preserve">6.11 Attic Air Sealing and Insulation</w:t>
+      </w:r>
+    </w:p>
+    <w:bookmarkEnd w:id="70"/>
+    <w:bookmarkStart w:id="71" w:name="blown-in-cellulose-wall-insulation"/>
+    <w:p>
+      <w:pPr>
+        <w:pStyle w:val="Heading3"/>
+      </w:pPr>
+      <w:r>
+        <w:t xml:space="preserve">6.12 Blown-in Cellulose Wall Insulation</w:t>
+      </w:r>
+    </w:p>
+    <w:bookmarkEnd w:id="71"/>
+    <w:bookmarkStart w:id="72" w:name="continuous-exterior-wall-insulation-1"/>
+    <w:p>
+      <w:pPr>
+        <w:pStyle w:val="Heading3"/>
+      </w:pPr>
+      <w:r>
+        <w:t xml:space="preserve">6.13 Continuous Exterior Wall Insulation</w:t>
+      </w:r>
+    </w:p>
+    <w:bookmarkEnd w:id="72"/>
+    <w:bookmarkStart w:id="73" w:name="pipe-insulation-1"/>
+    <w:p>
+      <w:pPr>
+        <w:pStyle w:val="Heading3"/>
+      </w:pPr>
+      <w:r>
+        <w:t xml:space="preserve">6.14 Pipe Insulation</w:t>
+      </w:r>
+    </w:p>
+    <w:bookmarkEnd w:id="73"/>
+    <w:bookmarkStart w:id="74" w:name="diy-air-sealing-1"/>
+    <w:p>
+      <w:pPr>
+        <w:pStyle w:val="Heading3"/>
+      </w:pPr>
+      <w:r>
+        <w:t xml:space="preserve">6.15 DIY Air Sealing</w:t>
+      </w:r>
+    </w:p>
+    <w:bookmarkEnd w:id="74"/>
+    <w:bookmarkStart w:id="75" w:name="ductwork-air-sealing-and-insulation-1"/>
+    <w:p>
+      <w:pPr>
+        <w:pStyle w:val="Heading3"/>
+      </w:pPr>
+      <w:r>
+        <w:t xml:space="preserve">6.16 Ductwork Air Sealing and Insulation</w:t>
       </w:r>
     </w:p>
     <w:p>
@@ -4207,889 +5625,23 @@
         <w:pStyle w:val="FirstParagraph"/>
       </w:pPr>
       <w:r>
-        <w:rPr>
-          <w:i/>
-          <w:iCs/>
-        </w:rPr>
-        <w:t xml:space="preserve">Problem</w:t>
-      </w:r>
-    </w:p>
-    <w:p>
-      <w:pPr>
-        <w:pStyle w:val="BodyText"/>
-      </w:pPr>
-      <w:r>
-        <w:t xml:space="preserve">Transportation, and particularly personal vehicles, are the leading cause of emissions in Maine. When you are planning to purchase a new vehicle, please consider a plug-in hybrid or all-electric vehicle.</w:t>
-      </w:r>
-    </w:p>
-    <w:p>
-      <w:pPr>
-        <w:pStyle w:val="BodyText"/>
-      </w:pPr>
-      <w:r>
-        <w:rPr>
-          <w:i/>
-          <w:iCs/>
-        </w:rPr>
-        <w:t xml:space="preserve">Recommendation</w:t>
-      </w:r>
-    </w:p>
-    <w:p>
-      <w:pPr>
-        <w:pStyle w:val="BodyText"/>
-      </w:pPr>
-      <w:r>
-        <w:t xml:space="preserve">An electric vehicle will eliminate your gas costs and reduce fossil fuel dependence. A 2020 study by Consumer Reports found that lifetime ownership costs were significantly lower for EVs, saving between $6,000 - $10,000 over their lifetimes.</w:t>
-      </w:r>
-    </w:p>
-    <w:p>
-      <w:pPr>
-        <w:pStyle w:val="BodyText"/>
-      </w:pPr>
-      <w:r>
-        <w:rPr>
-          <w:i/>
-          <w:iCs/>
-        </w:rPr>
-        <w:t xml:space="preserve">Estimated Cost/Benefits/Incentives</w:t>
-      </w:r>
-    </w:p>
-    <w:p>
-      <w:pPr>
-        <w:pStyle w:val="BodyText"/>
-      </w:pPr>
-      <w:r>
-        <w:t xml:space="preserve">You can review current state and federal financial incentives for electric vehicles here: https://www.electricforall.org/rebates-incentives/</w:t>
-      </w:r>
-    </w:p>
-    <w:bookmarkEnd w:id="52"/>
-    <w:bookmarkStart w:id="53" w:name="solar"/>
-    <w:p>
-      <w:pPr>
-        <w:pStyle w:val="Heading3"/>
-      </w:pPr>
-      <w:r>
-        <w:t xml:space="preserve">4.12 Solar</w:t>
-      </w:r>
-    </w:p>
-    <w:p>
-      <w:pPr>
-        <w:pStyle w:val="FirstParagraph"/>
-      </w:pPr>
-      <w:r>
-        <w:rPr>
-          <w:i/>
-          <w:iCs/>
-        </w:rPr>
-        <w:t xml:space="preserve">Problem</w:t>
-      </w:r>
-    </w:p>
-    <w:p>
-      <w:pPr>
-        <w:pStyle w:val="BodyText"/>
-      </w:pPr>
-      <w:r>
-        <w:rPr>
-          <w:b/>
-          <w:bCs/>
-        </w:rPr>
-        <w:t xml:space="preserve">Auditor to describe (or remove this section)</w:t>
-      </w:r>
-    </w:p>
-    <w:p>
-      <w:pPr>
-        <w:pStyle w:val="BodyText"/>
-      </w:pPr>
-      <w:r>
-        <w:rPr>
-          <w:i/>
-          <w:iCs/>
-        </w:rPr>
-        <w:t xml:space="preserve">Recommendation</w:t>
-      </w:r>
-    </w:p>
-    <w:p>
-      <w:pPr>
-        <w:pStyle w:val="BodyText"/>
-      </w:pPr>
-      <w:r>
-        <w:t xml:space="preserve">Rooftop solar can supply most or all of your home electrical demands. Contact a solar company for pricing and details specific to your home.</w:t>
-      </w:r>
-    </w:p>
-    <w:p>
-      <w:pPr>
-        <w:pStyle w:val="BodyText"/>
-      </w:pPr>
-      <w:r>
-        <w:rPr>
-          <w:i/>
-          <w:iCs/>
-        </w:rPr>
-        <w:t xml:space="preserve">Estimated Cost/Benefits/Incentives</w:t>
-      </w:r>
-    </w:p>
-    <w:p>
-      <w:pPr>
-        <w:pStyle w:val="BodyText"/>
-      </w:pPr>
-      <w:r>
-        <w:t xml:space="preserve">There is a 30% nonrefundable federal tax credit and financing options are available. Battery backup is needed for solar to work during a power outage. Information on the federal tax credit: https://www.energy.gov/sites/default/files/2023-03/Homeowners_Guide_to_the_Federal_Tax_Credit_for_Solar_PV.pdf</w:t>
-      </w:r>
-    </w:p>
-    <w:p>
-      <w:pPr>
-        <w:pStyle w:val="BodyText"/>
-      </w:pPr>
-      <w:r>
-        <w:t xml:space="preserve">The State of Maine is working on a solar and battery funding initiative for low-income and disadvantaged Maine households. It is still in the planning stages, but you can find more information here: https://www.maine.gov/energy/initiatives/infrastructure/solar-for-all</w:t>
-      </w:r>
-    </w:p>
-    <w:p>
-      <w:pPr>
-        <w:pStyle w:val="SourceCode"/>
-      </w:pPr>
-      <w:r>
-        <w:rPr>
-          <w:rStyle w:val="NormalTok"/>
-        </w:rPr>
+        <w:t xml:space="preserve">[1]</w:t>
+      </w:r>
+      <w:r>
         <w:t xml:space="preserve"> </w:t>
       </w:r>
       <w:r>
-        <w:rPr>
-          <w:rStyle w:val="CommentTok"/>
-        </w:rPr>
-        <w:t xml:space="preserve">#| label: other 3 recommendation</w:t>
-      </w:r>
-      <w:r>
-        <w:br/>
-      </w:r>
-      <w:r>
-        <w:rPr>
-          <w:rStyle w:val="NormalTok"/>
-        </w:rPr>
-        <w:t xml:space="preserve"> </w:t>
-      </w:r>
-      <w:r>
-        <w:rPr>
-          <w:rStyle w:val="CommentTok"/>
-        </w:rPr>
-        <w:t xml:space="preserve">#| echo: false</w:t>
-      </w:r>
-      <w:r>
-        <w:br/>
-      </w:r>
-      <w:r>
-        <w:rPr>
-          <w:rStyle w:val="NormalTok"/>
-        </w:rPr>
-        <w:t xml:space="preserve"> </w:t>
-      </w:r>
-      <w:r>
-        <w:rPr>
-          <w:rStyle w:val="CommentTok"/>
-        </w:rPr>
-        <w:t xml:space="preserve">#| results: asis</w:t>
-      </w:r>
-      <w:r>
-        <w:br/>
-      </w:r>
-      <w:r>
-        <w:br/>
-      </w:r>
-      <w:r>
-        <w:br/>
-      </w:r>
-      <w:r>
-        <w:rPr>
-          <w:rStyle w:val="ControlFlowTok"/>
-        </w:rPr>
-        <w:t xml:space="preserve">if</w:t>
-      </w:r>
-      <w:r>
-        <w:rPr>
-          <w:rStyle w:val="NormalTok"/>
-        </w:rPr>
-        <w:t xml:space="preserve">( other_3 </w:t>
-      </w:r>
-      <w:r>
-        <w:rPr>
-          <w:rStyle w:val="SpecialCharTok"/>
-        </w:rPr>
-        <w:t xml:space="preserve">==</w:t>
-      </w:r>
-      <w:r>
-        <w:rPr>
-          <w:rStyle w:val="NormalTok"/>
-        </w:rPr>
-        <w:t xml:space="preserve"> </w:t>
-      </w:r>
-      <w:r>
-        <w:rPr>
-          <w:rStyle w:val="ConstantTok"/>
-        </w:rPr>
-        <w:t xml:space="preserve">TRUE</w:t>
-      </w:r>
-      <w:r>
-        <w:rPr>
-          <w:rStyle w:val="NormalTok"/>
-        </w:rPr>
-        <w:t xml:space="preserve">){</w:t>
-      </w:r>
-      <w:r>
-        <w:br/>
-      </w:r>
-      <w:r>
-        <w:rPr>
-          <w:rStyle w:val="NormalTok"/>
-        </w:rPr>
-        <w:t xml:space="preserve">  </w:t>
-      </w:r>
-      <w:r>
-        <w:rPr>
-          <w:rStyle w:val="FunctionTok"/>
-        </w:rPr>
-        <w:t xml:space="preserve">cat</w:t>
-      </w:r>
-      <w:r>
-        <w:rPr>
-          <w:rStyle w:val="NormalTok"/>
-        </w:rPr>
-        <w:t xml:space="preserve">(</w:t>
-      </w:r>
-      <w:r>
-        <w:rPr>
-          <w:rStyle w:val="StringTok"/>
-        </w:rPr>
-        <w:t xml:space="preserve">"### Other 3</w:t>
-      </w:r>
-      <w:r>
-        <w:br/>
-      </w:r>
-      <w:r>
-        <w:rPr>
-          <w:rStyle w:val="StringTok"/>
-        </w:rPr>
-        <w:t xml:space="preserve">  </w:t>
-      </w:r>
-      <w:r>
-        <w:br/>
-      </w:r>
-      <w:r>
-        <w:rPr>
-          <w:rStyle w:val="StringTok"/>
-        </w:rPr>
-        <w:t xml:space="preserve">*Problem*</w:t>
-      </w:r>
-      <w:r>
-        <w:br/>
-      </w:r>
-      <w:r>
-        <w:br/>
-      </w:r>
-      <w:r>
-        <w:rPr>
-          <w:rStyle w:val="StringTok"/>
-        </w:rPr>
-        <w:t xml:space="preserve">*Recommendation*</w:t>
-      </w:r>
-      <w:r>
-        <w:br/>
-      </w:r>
-      <w:r>
-        <w:br/>
-      </w:r>
-      <w:r>
-        <w:rPr>
-          <w:rStyle w:val="StringTok"/>
-        </w:rPr>
-        <w:t xml:space="preserve">"</w:t>
-      </w:r>
-      <w:r>
-        <w:rPr>
-          <w:rStyle w:val="NormalTok"/>
-        </w:rPr>
-        <w:t xml:space="preserve">)</w:t>
-      </w:r>
-      <w:r>
-        <w:br/>
-      </w:r>
-      <w:r>
-        <w:rPr>
-          <w:rStyle w:val="NormalTok"/>
-        </w:rPr>
+        <w:t xml:space="preserve">“)</w:t>
+      </w:r>
+      <w:r>
         <w:t xml:space="preserve">}</w:t>
       </w:r>
       <w:r>
-        <w:rPr>
-          <w:rStyle w:val="ControlFlowTok"/>
-        </w:rPr>
-        <w:t xml:space="preserve">else</w:t>
-      </w:r>
-      <w:r>
-        <w:rPr>
-          <w:rStyle w:val="NormalTok"/>
-        </w:rPr>
-        <w:t xml:space="preserve">{</w:t>
-      </w:r>
-      <w:r>
-        <w:br/>
-      </w:r>
-      <w:r>
-        <w:rPr>
-          <w:rStyle w:val="NormalTok"/>
-        </w:rPr>
-        <w:t xml:space="preserve">  </w:t>
-      </w:r>
-      <w:r>
-        <w:rPr>
-          <w:rStyle w:val="FunctionTok"/>
-        </w:rPr>
-        <w:t xml:space="preserve">cat</w:t>
-      </w:r>
-      <w:r>
-        <w:rPr>
-          <w:rStyle w:val="NormalTok"/>
-        </w:rPr>
-        <w:t xml:space="preserve">(</w:t>
-      </w:r>
-      <w:r>
-        <w:rPr>
-          <w:rStyle w:val="StringTok"/>
-        </w:rPr>
-        <w:t xml:space="preserve">""</w:t>
-      </w:r>
-      <w:r>
-        <w:rPr>
-          <w:rStyle w:val="NormalTok"/>
-        </w:rPr>
-        <w:t xml:space="preserve">)</w:t>
-      </w:r>
-      <w:r>
-        <w:br/>
-      </w:r>
-      <w:r>
-        <w:rPr>
-          <w:rStyle w:val="NormalTok"/>
-        </w:rPr>
-        <w:t xml:space="preserve">}</w:t>
-      </w:r>
-      <w:r>
-        <w:br/>
-      </w:r>
-      <w:r>
-        <w:br/>
-      </w:r>
-      <w:r>
-        <w:rPr>
-          <w:rStyle w:val="ControlFlowTok"/>
-        </w:rPr>
-        <w:t xml:space="preserve">if</w:t>
-      </w:r>
-      <w:r>
-        <w:rPr>
-          <w:rStyle w:val="NormalTok"/>
-        </w:rPr>
-        <w:t xml:space="preserve">(other_3 </w:t>
-      </w:r>
-      <w:r>
-        <w:rPr>
-          <w:rStyle w:val="SpecialCharTok"/>
-        </w:rPr>
-        <w:t xml:space="preserve">==</w:t>
-      </w:r>
-      <w:r>
-        <w:rPr>
-          <w:rStyle w:val="NormalTok"/>
-        </w:rPr>
-        <w:t xml:space="preserve"> </w:t>
-      </w:r>
-      <w:r>
-        <w:rPr>
-          <w:rStyle w:val="ConstantTok"/>
-        </w:rPr>
-        <w:t xml:space="preserve">TRUE</w:t>
-      </w:r>
-      <w:r>
-        <w:rPr>
-          <w:rStyle w:val="NormalTok"/>
-        </w:rPr>
-        <w:t xml:space="preserve">){</w:t>
-      </w:r>
-      <w:r>
-        <w:br/>
-      </w:r>
-      <w:r>
-        <w:rPr>
-          <w:rStyle w:val="NormalTok"/>
-        </w:rPr>
-        <w:t xml:space="preserve">  </w:t>
-      </w:r>
-      <w:r>
-        <w:rPr>
-          <w:rStyle w:val="FunctionTok"/>
-        </w:rPr>
-        <w:t xml:space="preserve">cat</w:t>
-      </w:r>
-      <w:r>
-        <w:rPr>
-          <w:rStyle w:val="NormalTok"/>
-        </w:rPr>
-        <w:t xml:space="preserve">(a_other_3</w:t>
-      </w:r>
-      <w:r>
-        <w:rPr>
-          <w:rStyle w:val="SpecialCharTok"/>
-        </w:rPr>
-        <w:t xml:space="preserve">$</w:t>
-      </w:r>
-      <w:r>
-        <w:rPr>
-          <w:rStyle w:val="NormalTok"/>
-        </w:rPr>
-        <w:t xml:space="preserve">Description</w:t>
-      </w:r>
-      <w:r>
-        <w:br/>
-      </w:r>
-      <w:r>
-        <w:rPr>
-          <w:rStyle w:val="NormalTok"/>
-        </w:rPr>
-        <w:t xml:space="preserve">    </w:t>
-      </w:r>
-      <w:r>
-        <w:br/>
-      </w:r>
-      <w:r>
-        <w:rPr>
-          <w:rStyle w:val="NormalTok"/>
-        </w:rPr>
-        <w:t xml:space="preserve">  )</w:t>
-      </w:r>
-      <w:r>
-        <w:br/>
-      </w:r>
-      <w:r>
-        <w:rPr>
-          <w:rStyle w:val="NormalTok"/>
-        </w:rPr>
-        <w:t xml:space="preserve">}</w:t>
-      </w:r>
-      <w:r>
-        <w:rPr>
-          <w:rStyle w:val="ControlFlowTok"/>
-        </w:rPr>
-        <w:t xml:space="preserve">else</w:t>
-      </w:r>
-      <w:r>
-        <w:rPr>
-          <w:rStyle w:val="NormalTok"/>
-        </w:rPr>
-        <w:t xml:space="preserve">{</w:t>
-      </w:r>
-      <w:r>
-        <w:br/>
-      </w:r>
-      <w:r>
-        <w:rPr>
-          <w:rStyle w:val="NormalTok"/>
-        </w:rPr>
-        <w:t xml:space="preserve">  </w:t>
-      </w:r>
-      <w:r>
-        <w:rPr>
-          <w:rStyle w:val="FunctionTok"/>
-        </w:rPr>
-        <w:t xml:space="preserve">cat</w:t>
-      </w:r>
-      <w:r>
-        <w:rPr>
-          <w:rStyle w:val="NormalTok"/>
-        </w:rPr>
-        <w:t xml:space="preserve">(</w:t>
-      </w:r>
-      <w:r>
-        <w:rPr>
-          <w:rStyle w:val="StringTok"/>
-        </w:rPr>
-        <w:t xml:space="preserve">""</w:t>
-      </w:r>
-      <w:r>
-        <w:rPr>
-          <w:rStyle w:val="NormalTok"/>
-        </w:rPr>
-        <w:t xml:space="preserve">)</w:t>
-      </w:r>
-      <w:r>
-        <w:br/>
-      </w:r>
-      <w:r>
-        <w:rPr>
-          <w:rStyle w:val="NormalTok"/>
-        </w:rPr>
-        <w:t xml:space="preserve">  }</w:t>
-      </w:r>
-      <w:r>
-        <w:br/>
-      </w:r>
-      <w:r>
-        <w:br/>
-      </w:r>
-      <w:r>
-        <w:rPr>
-          <w:rStyle w:val="ControlFlowTok"/>
-        </w:rPr>
-        <w:t xml:space="preserve">if</w:t>
-      </w:r>
-      <w:r>
-        <w:rPr>
-          <w:rStyle w:val="NormalTok"/>
-        </w:rPr>
-        <w:t xml:space="preserve">(other_3 </w:t>
-      </w:r>
-      <w:r>
-        <w:rPr>
-          <w:rStyle w:val="SpecialCharTok"/>
-        </w:rPr>
-        <w:t xml:space="preserve">==</w:t>
-      </w:r>
-      <w:r>
-        <w:rPr>
-          <w:rStyle w:val="NormalTok"/>
-        </w:rPr>
-        <w:t xml:space="preserve"> </w:t>
-      </w:r>
-      <w:r>
-        <w:rPr>
-          <w:rStyle w:val="ConstantTok"/>
-        </w:rPr>
-        <w:t xml:space="preserve">TRUE</w:t>
-      </w:r>
-      <w:r>
-        <w:rPr>
-          <w:rStyle w:val="NormalTok"/>
-        </w:rPr>
-        <w:t xml:space="preserve">){</w:t>
-      </w:r>
-      <w:r>
-        <w:br/>
-      </w:r>
-      <w:r>
-        <w:rPr>
-          <w:rStyle w:val="NormalTok"/>
-        </w:rPr>
-        <w:t xml:space="preserve">  </w:t>
-      </w:r>
-      <w:r>
-        <w:rPr>
-          <w:rStyle w:val="FunctionTok"/>
-        </w:rPr>
-        <w:t xml:space="preserve">cat</w:t>
-      </w:r>
-      <w:r>
-        <w:rPr>
-          <w:rStyle w:val="NormalTok"/>
-        </w:rPr>
-        <w:t xml:space="preserve">(</w:t>
-      </w:r>
-      <w:r>
-        <w:rPr>
-          <w:rStyle w:val="StringTok"/>
-        </w:rPr>
-        <w:t xml:space="preserve">"</w:t>
-      </w:r>
-      <w:r>
-        <w:br/>
-      </w:r>
-      <w:r>
-        <w:br/>
-      </w:r>
-      <w:r>
-        <w:rPr>
-          <w:rStyle w:val="StringTok"/>
-        </w:rPr>
-        <w:t xml:space="preserve">*Estimated Cost/Benefits/Incentives*</w:t>
-      </w:r>
-      <w:r>
-        <w:br/>
-      </w:r>
-      <w:r>
-        <w:br/>
-      </w:r>
-      <w:r>
-        <w:rPr>
-          <w:rStyle w:val="StringTok"/>
-        </w:rPr>
-        <w:t xml:space="preserve">"</w:t>
-      </w:r>
-      <w:r>
-        <w:rPr>
-          <w:rStyle w:val="NormalTok"/>
-        </w:rPr>
-        <w:t xml:space="preserve">, auto_other_3_estimates</w:t>
-      </w:r>
-      <w:r>
-        <w:rPr>
-          <w:rStyle w:val="SpecialCharTok"/>
-        </w:rPr>
-        <w:t xml:space="preserve">$</w:t>
-      </w:r>
-      <w:r>
-        <w:rPr>
-          <w:rStyle w:val="NormalTok"/>
-        </w:rPr>
-        <w:t xml:space="preserve">Description)</w:t>
-      </w:r>
-      <w:r>
-        <w:br/>
-      </w:r>
-      <w:r>
-        <w:rPr>
-          <w:rStyle w:val="NormalTok"/>
-        </w:rPr>
-        <w:t xml:space="preserve">}</w:t>
-      </w:r>
-      <w:r>
-        <w:rPr>
-          <w:rStyle w:val="ControlFlowTok"/>
-        </w:rPr>
-        <w:t xml:space="preserve">else</w:t>
-      </w:r>
-      <w:r>
-        <w:rPr>
-          <w:rStyle w:val="NormalTok"/>
-        </w:rPr>
-        <w:t xml:space="preserve">{</w:t>
-      </w:r>
-      <w:r>
-        <w:br/>
-      </w:r>
-      <w:r>
-        <w:rPr>
-          <w:rStyle w:val="NormalTok"/>
-        </w:rPr>
-        <w:t xml:space="preserve">  </w:t>
-      </w:r>
-      <w:r>
-        <w:rPr>
-          <w:rStyle w:val="FunctionTok"/>
-        </w:rPr>
-        <w:t xml:space="preserve">cat</w:t>
-      </w:r>
-      <w:r>
-        <w:rPr>
-          <w:rStyle w:val="NormalTok"/>
-        </w:rPr>
-        <w:t xml:space="preserve">(</w:t>
-      </w:r>
-      <w:r>
-        <w:rPr>
-          <w:rStyle w:val="StringTok"/>
-        </w:rPr>
-        <w:t xml:space="preserve">""</w:t>
-      </w:r>
-      <w:r>
-        <w:rPr>
-          <w:rStyle w:val="NormalTok"/>
-        </w:rPr>
-        <w:t xml:space="preserve">)</w:t>
-      </w:r>
-      <w:r>
-        <w:br/>
-      </w:r>
-      <w:r>
-        <w:rPr>
-          <w:rStyle w:val="NormalTok"/>
-        </w:rPr>
-        <w:t xml:space="preserve">  } </w:t>
-      </w:r>
-    </w:p>
-    <w:bookmarkEnd w:id="53"/>
-    <w:bookmarkEnd w:id="54"/>
-    <w:bookmarkStart w:id="55" w:name="additional-resources"/>
-    <w:p>
-      <w:pPr>
-        <w:pStyle w:val="Heading2"/>
-      </w:pPr>
-      <w:r>
-        <w:t xml:space="preserve">5 Additional Resources</w:t>
-      </w:r>
-    </w:p>
-    <w:p>
-      <w:pPr>
-        <w:pStyle w:val="FirstParagraph"/>
-      </w:pPr>
-      <w:r>
-        <w:t xml:space="preserve">Many home efficiency upgrades are eligible for Efficiency Maine rebates and federal tax credits. Financial incentives vary based on income level and type of occupancy. An overview of all state rebates and federal tax credits can be found here: https://www.efficiencymaine.com/at-home/.</w:t>
-      </w:r>
-    </w:p>
-    <w:p>
-      <w:pPr>
-        <w:pStyle w:val="BodyText"/>
-      </w:pPr>
-      <w:r>
-        <w:t xml:space="preserve">You can search for Efficiency Maine registered contractors here: https://www.efficiencymaine.com/at-home/vendor-locator/.</w:t>
-      </w:r>
-    </w:p>
-    <w:p>
-      <w:pPr>
-        <w:pStyle w:val="BodyText"/>
-      </w:pPr>
-      <w:r>
-        <w:t xml:space="preserve">We recommend discussing a whole-home plan for insulation and air sealing work in the basement, walls, and attic with contractors to determine how to best sequence the work to take full advantage of the Efficiency Maine rebates (which are subject to lifetime maximums) and nonrefundable federal tax credits (which are subject to annual maximums).</w:t>
-      </w:r>
-    </w:p>
-    <w:bookmarkEnd w:id="55"/>
-    <w:bookmarkStart w:id="68" w:name="section-four-tests"/>
-    <w:p>
-      <w:pPr>
-        <w:pStyle w:val="Heading2"/>
-      </w:pPr>
-      <w:r>
-        <w:t xml:space="preserve">6 Section Four Tests</w:t>
-      </w:r>
-    </w:p>
-    <w:bookmarkStart w:id="56" w:name="attic-air-sealing-and-insulation"/>
-    <w:p>
-      <w:pPr>
-        <w:pStyle w:val="Heading3"/>
-      </w:pPr>
-      <w:r>
-        <w:t xml:space="preserve">6.1 Attic Air Sealing and Insulation</w:t>
-      </w:r>
-    </w:p>
-    <w:bookmarkEnd w:id="56"/>
-    <w:bookmarkStart w:id="57" w:name="blown-in-cellulose-wall-insulation"/>
-    <w:p>
-      <w:pPr>
-        <w:pStyle w:val="Heading3"/>
-      </w:pPr>
-      <w:r>
-        <w:t xml:space="preserve">6.2 Blown-in Cellulose Wall Insulation</w:t>
-      </w:r>
-    </w:p>
-    <w:bookmarkEnd w:id="57"/>
-    <w:bookmarkStart w:id="58" w:name="gutters-1"/>
-    <w:p>
-      <w:pPr>
-        <w:pStyle w:val="Heading3"/>
-      </w:pPr>
-      <w:r>
-        <w:t xml:space="preserve">6.3 Gutters</w:t>
-      </w:r>
-    </w:p>
-    <w:bookmarkEnd w:id="58"/>
-    <w:bookmarkStart w:id="59" w:name="windowdressers"/>
-    <w:p>
-      <w:pPr>
-        <w:pStyle w:val="Heading3"/>
-      </w:pPr>
-      <w:r>
-        <w:t xml:space="preserve">6.4 WindowDressers</w:t>
-      </w:r>
-    </w:p>
-    <w:bookmarkEnd w:id="59"/>
-    <w:bookmarkStart w:id="60" w:name="electrical-panel-upgrade-1"/>
-    <w:p>
-      <w:pPr>
-        <w:pStyle w:val="Heading3"/>
-      </w:pPr>
-      <w:r>
-        <w:t xml:space="preserve">6.5 Electrical Panel Upgrade</w:t>
-      </w:r>
-    </w:p>
-    <w:bookmarkEnd w:id="60"/>
-    <w:bookmarkStart w:id="61" w:name="air-source-heat-pump-1"/>
-    <w:p>
-      <w:pPr>
-        <w:pStyle w:val="Heading3"/>
-      </w:pPr>
-      <w:r>
-        <w:t xml:space="preserve">6.6 Air Source Heat Pump</w:t>
-      </w:r>
-    </w:p>
-    <w:bookmarkEnd w:id="61"/>
-    <w:bookmarkStart w:id="62" w:name="continuous-exterior-wall-insulation-1"/>
-    <w:p>
-      <w:pPr>
-        <w:pStyle w:val="Heading3"/>
-      </w:pPr>
-      <w:r>
-        <w:t xml:space="preserve">6.7 Continuous Exterior Wall Insulation</w:t>
-      </w:r>
-    </w:p>
-    <w:bookmarkEnd w:id="62"/>
-    <w:bookmarkStart w:id="63" w:name="spray-foam-basementcrawlspace-walls"/>
-    <w:p>
-      <w:pPr>
-        <w:pStyle w:val="Heading3"/>
-      </w:pPr>
-      <w:r>
-        <w:t xml:space="preserve">6.8 Spray Foam Basement/Crawlspace Walls</w:t>
-      </w:r>
-    </w:p>
-    <w:bookmarkEnd w:id="63"/>
-    <w:bookmarkStart w:id="64" w:name="vapor-barrier-1"/>
-    <w:p>
-      <w:pPr>
-        <w:pStyle w:val="Heading3"/>
-      </w:pPr>
-      <w:r>
-        <w:t xml:space="preserve">6.9 Vapor Barrier</w:t>
-      </w:r>
-    </w:p>
-    <w:bookmarkEnd w:id="64"/>
-    <w:bookmarkStart w:id="65" w:name="heat-pump-water-heater-1"/>
-    <w:p>
-      <w:pPr>
-        <w:pStyle w:val="Heading3"/>
-      </w:pPr>
-      <w:r>
-        <w:t xml:space="preserve">6.10 Heat Pump Water Heater</w:t>
-      </w:r>
-    </w:p>
-    <w:bookmarkEnd w:id="65"/>
-    <w:bookmarkStart w:id="66" w:name="solar-1"/>
-    <w:p>
-      <w:pPr>
-        <w:pStyle w:val="Heading3"/>
-      </w:pPr>
-      <w:r>
-        <w:t xml:space="preserve">6.11 Solar</w:t>
-      </w:r>
-    </w:p>
-    <w:bookmarkEnd w:id="66"/>
-    <w:bookmarkStart w:id="67" w:name="evcharger"/>
-    <w:p>
-      <w:pPr>
-        <w:pStyle w:val="Heading3"/>
-      </w:pPr>
-      <w:r>
-        <w:t xml:space="preserve">6.12 EV+Charger</w:t>
-      </w:r>
-    </w:p>
-    <w:p>
-      <w:pPr>
-        <w:pStyle w:val="FirstParagraph"/>
-      </w:pPr>
-      <w:r>
-        <w:t xml:space="preserve">[1]</w:t>
-      </w:r>
-      <w:r>
-        <w:t xml:space="preserve"> </w:t>
-      </w:r>
-      <w:r>
-        <w:t xml:space="preserve">“)</w:t>
-      </w:r>
-      <w:r>
-        <w:t xml:space="preserve">}</w:t>
-      </w:r>
-      <w:r>
         <w:t xml:space="preserve"># cat(”</w:t>
       </w:r>
     </w:p>
-    <w:bookmarkEnd w:id="67"/>
-    <w:bookmarkEnd w:id="68"/>
+    <w:bookmarkEnd w:id="75"/>
+    <w:bookmarkEnd w:id="76"/>
     <w:sectPr>
       <w:footerReference r:id="rId9" w:type="default"/>
       <w:pgSz w:h="15840" w:w="12240"/>

</xml_diff>

<commit_message>
render Mary Day report
</commit_message>
<xml_diff>
--- a/Quarto_report/Audit_Report.docx
+++ b/Quarto_report/Audit_Report.docx
@@ -15,7 +15,7 @@
         <w:pStyle w:val="FirstParagraph"/>
       </w:pPr>
       <w:r>
-        <w:t xml:space="preserve">Homeowner(s): Ben Sumner</w:t>
+        <w:t xml:space="preserve">Homeowner(s): Mary Day</w:t>
       </w:r>
     </w:p>
     <w:p>
@@ -23,7 +23,7 @@
         <w:pStyle w:val="BodyText"/>
       </w:pPr>
       <w:r>
-        <w:t xml:space="preserve">Address: 5 Elwood Spurling Ln, Cranberry Isles, ME, 04625</w:t>
+        <w:t xml:space="preserve">Address: 207 Harding Point Rd, Cranberry Isles, ME 04625</w:t>
       </w:r>
     </w:p>
     <w:p>
@@ -31,7 +31,7 @@
         <w:pStyle w:val="BodyText"/>
       </w:pPr>
       <w:r>
-        <w:t xml:space="preserve">Owner Contact: ben.sumner@protonmail.com, (207) 664-8364</w:t>
+        <w:t xml:space="preserve">Owner Contact: cfgday@hotmail.com, (703) 472-4929</w:t>
       </w:r>
     </w:p>
     <w:p>
@@ -39,7 +39,7 @@
         <w:pStyle w:val="BodyText"/>
       </w:pPr>
       <w:r>
-        <w:t xml:space="preserve">Auditors: Pilot program team (Nicole, Zoe, Alder, Uriel)</w:t>
+        <w:t xml:space="preserve">Auditors: Nicole Grohoski, Adler Garner, Uriel Orozco Brenes</w:t>
       </w:r>
     </w:p>
     <w:p>
@@ -55,7 +55,7 @@
         <w:pStyle w:val="BodyText"/>
       </w:pPr>
       <w:r>
-        <w:t xml:space="preserve">Report Date: June 27, 2025</w:t>
+        <w:t xml:space="preserve">Report Date: June 30, 2025</w:t>
       </w:r>
     </w:p>
     <w:p>
@@ -70,7 +70,7 @@
         <w:pStyle w:val="FirstParagraph"/>
       </w:pPr>
       <w:r>
-        <w:t xml:space="preserve">We conducted an energy assessment of your home on 9/5/2024. This report will tell you what we did, what we found, and what we suggest for your home. These suggestions include information on incentives and financing to make improvements more affordable.</w:t>
+        <w:t xml:space="preserve">We conducted an energy assessment of your home on 8/6/2024. This report will tell you what we did, what we found, and what we suggest for your home. These suggestions include information on incentives and financing to make improvements more affordable.</w:t>
       </w:r>
     </w:p>
     <w:p>
@@ -234,7 +234,7 @@
         <w:pStyle w:val="FirstParagraph"/>
       </w:pPr>
       <w:r>
-        <w:t xml:space="preserve">We assessed combustion appliances that burn fossil fuels such as propane, heating oil, or kerosene. These include furnaces, boilers, water heaters, and gas ovens. We visually inspected the combustion appliance(s) in your home, but we were unable to perform combustion safety tests.</w:t>
+        <w:t xml:space="preserve">We assessed combustion appliances that burn fossil fuels such as propane, heating oil, or kerosene. These include furnaces, boilers, water heaters, and gas ovens. We visually inspected the combustion appliance(s) in your home, but we were unable to perform combustion safety tests. We also performed gas leak detection tests on your propane appliance(s).</w:t>
       </w:r>
     </w:p>
     <w:bookmarkEnd w:id="27"/>
@@ -344,31 +344,31 @@
                 <w:rFonts w:ascii="Calibri" w:hAnsi="Calibri"/>
                 <w:sz w:val="20"/>
               </w:rPr>
-              <w:t xml:space="default">Furnace/Boiler Tune-up</w:t>
-            </w:r>
-          </w:p>
-        </w:tc>
-        <w:tc>
-          <w:tcPr>
-            <w:tcBorders>
-              <w:top w:val="single" w:space="0" w:color="D3D3D3"/>
-              <w:bottom w:val="single" w:space="0" w:color="D3D3D3"/>
-              <w:start w:val="single" w:space="0" w:color="D3D3D3"/>
-              <w:end w:val="single" w:space="0" w:color="D3D3D3"/>
-            </w:tcBorders>
-          </w:tcPr>
-          <w:p>
-            <w:pPr>
-              <w:spacing w:before="0" w:after="60"/>
-              <w:keepNext/>
-              <w:jc w:val="start"/>
-            </w:pPr>
-            <w:r>
-              <w:rPr>
-                <w:rFonts w:ascii="Calibri" w:hAnsi="Calibri"/>
-                <w:sz w:val="20"/>
-              </w:rPr>
-              <w:t xml:space="default">Have the furnace/boiler and flue inspected and adjusted by a licensed professional. This should be available from your fuel delivery company.</w:t>
+              <w:t xml:space="default">High-efficiency Shower Head(s)</w:t>
+            </w:r>
+          </w:p>
+        </w:tc>
+        <w:tc>
+          <w:tcPr>
+            <w:tcBorders>
+              <w:top w:val="single" w:space="0" w:color="D3D3D3"/>
+              <w:bottom w:val="single" w:space="0" w:color="D3D3D3"/>
+              <w:start w:val="single" w:space="0" w:color="D3D3D3"/>
+              <w:end w:val="single" w:space="0" w:color="D3D3D3"/>
+            </w:tcBorders>
+          </w:tcPr>
+          <w:p>
+            <w:pPr>
+              <w:spacing w:before="0" w:after="60"/>
+              <w:keepNext/>
+              <w:jc w:val="start"/>
+            </w:pPr>
+            <w:r>
+              <w:rPr>
+                <w:rFonts w:ascii="Calibri" w:hAnsi="Calibri"/>
+                <w:sz w:val="20"/>
+              </w:rPr>
+              <w:t xml:space="default">Install high-efficiency shower heads to reduce the amount of water and energy to heat the water used when showering.</w:t>
             </w:r>
           </w:p>
         </w:tc>
@@ -397,31 +397,31 @@
                 <w:rFonts w:ascii="Calibri" w:hAnsi="Calibri"/>
                 <w:sz w:val="20"/>
               </w:rPr>
-              <w:t xml:space="default">High-efficiency Shower Head(s)</w:t>
-            </w:r>
-          </w:p>
-        </w:tc>
-        <w:tc>
-          <w:tcPr>
-            <w:tcBorders>
-              <w:top w:val="single" w:space="0" w:color="D3D3D3"/>
-              <w:bottom w:val="single" w:space="0" w:color="D3D3D3"/>
-              <w:start w:val="single" w:space="0" w:color="D3D3D3"/>
-              <w:end w:val="single" w:space="0" w:color="D3D3D3"/>
-            </w:tcBorders>
-          </w:tcPr>
-          <w:p>
-            <w:pPr>
-              <w:spacing w:before="0" w:after="60"/>
-              <w:keepNext/>
-              <w:jc w:val="start"/>
-            </w:pPr>
-            <w:r>
-              <w:rPr>
-                <w:rFonts w:ascii="Calibri" w:hAnsi="Calibri"/>
-                <w:sz w:val="20"/>
-              </w:rPr>
-              <w:t xml:space="default">Install high-efficiency shower heads to reduce the amount of water and energy to heat the water used when showering.</w:t>
+              <w:t xml:space="default">LEDs</w:t>
+            </w:r>
+          </w:p>
+        </w:tc>
+        <w:tc>
+          <w:tcPr>
+            <w:tcBorders>
+              <w:top w:val="single" w:space="0" w:color="D3D3D3"/>
+              <w:bottom w:val="single" w:space="0" w:color="D3D3D3"/>
+              <w:start w:val="single" w:space="0" w:color="D3D3D3"/>
+              <w:end w:val="single" w:space="0" w:color="D3D3D3"/>
+            </w:tcBorders>
+          </w:tcPr>
+          <w:p>
+            <w:pPr>
+              <w:spacing w:before="0" w:after="60"/>
+              <w:keepNext/>
+              <w:jc w:val="start"/>
+            </w:pPr>
+            <w:r>
+              <w:rPr>
+                <w:rFonts w:ascii="Calibri" w:hAnsi="Calibri"/>
+                <w:sz w:val="20"/>
+              </w:rPr>
+              <w:t xml:space="default">Switch your light bulbs to LED light bulbs. LEDs use 80% less energy than incandescent light bulbs which can significantly reduce your electricity bill.</w:t>
             </w:r>
           </w:p>
         </w:tc>
@@ -450,31 +450,31 @@
                 <w:rFonts w:ascii="Calibri" w:hAnsi="Calibri"/>
                 <w:sz w:val="20"/>
               </w:rPr>
-              <w:t xml:space="default">LEDs</w:t>
-            </w:r>
-          </w:p>
-        </w:tc>
-        <w:tc>
-          <w:tcPr>
-            <w:tcBorders>
-              <w:top w:val="single" w:space="0" w:color="D3D3D3"/>
-              <w:bottom w:val="single" w:space="0" w:color="D3D3D3"/>
-              <w:start w:val="single" w:space="0" w:color="D3D3D3"/>
-              <w:end w:val="single" w:space="0" w:color="D3D3D3"/>
-            </w:tcBorders>
-          </w:tcPr>
-          <w:p>
-            <w:pPr>
-              <w:spacing w:before="0" w:after="60"/>
-              <w:keepNext/>
-              <w:jc w:val="start"/>
-            </w:pPr>
-            <w:r>
-              <w:rPr>
-                <w:rFonts w:ascii="Calibri" w:hAnsi="Calibri"/>
-                <w:sz w:val="20"/>
-              </w:rPr>
-              <w:t xml:space="default">Switch your light bulbs to LED light bulbs. LEDs use 80% less energy than incandescent light bulbs which can significantly reduce your electricity bill.</w:t>
+              <w:t xml:space="default">WindowDressers</w:t>
+            </w:r>
+          </w:p>
+        </w:tc>
+        <w:tc>
+          <w:tcPr>
+            <w:tcBorders>
+              <w:top w:val="single" w:space="0" w:color="D3D3D3"/>
+              <w:bottom w:val="single" w:space="0" w:color="D3D3D3"/>
+              <w:start w:val="single" w:space="0" w:color="D3D3D3"/>
+              <w:end w:val="single" w:space="0" w:color="D3D3D3"/>
+            </w:tcBorders>
+          </w:tcPr>
+          <w:p>
+            <w:pPr>
+              <w:spacing w:before="0" w:after="60"/>
+              <w:keepNext/>
+              <w:jc w:val="start"/>
+            </w:pPr>
+            <w:r>
+              <w:rPr>
+                <w:rFonts w:ascii="Calibri" w:hAnsi="Calibri"/>
+                <w:sz w:val="20"/>
+              </w:rPr>
+              <w:t xml:space="default">WindowDressers are insulating window inserts that help air-seal windows and reduce heat loss and gain.</w:t>
             </w:r>
           </w:p>
         </w:tc>
@@ -503,31 +503,31 @@
                 <w:rFonts w:ascii="Calibri" w:hAnsi="Calibri"/>
                 <w:sz w:val="20"/>
               </w:rPr>
-              <w:t xml:space="default">WindowDressers</w:t>
-            </w:r>
-          </w:p>
-        </w:tc>
-        <w:tc>
-          <w:tcPr>
-            <w:tcBorders>
-              <w:top w:val="single" w:space="0" w:color="D3D3D3"/>
-              <w:bottom w:val="single" w:space="0" w:color="D3D3D3"/>
-              <w:start w:val="single" w:space="0" w:color="D3D3D3"/>
-              <w:end w:val="single" w:space="0" w:color="D3D3D3"/>
-            </w:tcBorders>
-          </w:tcPr>
-          <w:p>
-            <w:pPr>
-              <w:spacing w:before="0" w:after="60"/>
-              <w:keepNext/>
-              <w:jc w:val="start"/>
-            </w:pPr>
-            <w:r>
-              <w:rPr>
-                <w:rFonts w:ascii="Calibri" w:hAnsi="Calibri"/>
-                <w:sz w:val="20"/>
-              </w:rPr>
-              <w:t xml:space="default">WindowDressers are insulating window inserts that help air-seal windows and reduce heat loss and gain.</w:t>
+              <w:t xml:space="default">Bathroom Exhaust Fan(s)</w:t>
+            </w:r>
+          </w:p>
+        </w:tc>
+        <w:tc>
+          <w:tcPr>
+            <w:tcBorders>
+              <w:top w:val="single" w:space="0" w:color="D3D3D3"/>
+              <w:bottom w:val="single" w:space="0" w:color="D3D3D3"/>
+              <w:start w:val="single" w:space="0" w:color="D3D3D3"/>
+              <w:end w:val="single" w:space="0" w:color="D3D3D3"/>
+            </w:tcBorders>
+          </w:tcPr>
+          <w:p>
+            <w:pPr>
+              <w:spacing w:before="0" w:after="60"/>
+              <w:keepNext/>
+              <w:jc w:val="start"/>
+            </w:pPr>
+            <w:r>
+              <w:rPr>
+                <w:rFonts w:ascii="Calibri" w:hAnsi="Calibri"/>
+                <w:sz w:val="20"/>
+              </w:rPr>
+              <w:t xml:space="default">Install bathroom exhaust fans in all bathrooms that do not have them. These should be rated for at least 80 cubic feet per minute (CFM) if there is a shower. We recommend the Panasonic Whisper series or similar fans that don’t create excess noise.</w:t>
             </w:r>
           </w:p>
         </w:tc>
@@ -556,31 +556,31 @@
                 <w:rFonts w:ascii="Calibri" w:hAnsi="Calibri"/>
                 <w:sz w:val="20"/>
               </w:rPr>
-              <w:t xml:space="default">Heat Pump Water Heater</w:t>
-            </w:r>
-          </w:p>
-        </w:tc>
-        <w:tc>
-          <w:tcPr>
-            <w:tcBorders>
-              <w:top w:val="single" w:space="0" w:color="D3D3D3"/>
-              <w:bottom w:val="single" w:space="0" w:color="D3D3D3"/>
-              <w:start w:val="single" w:space="0" w:color="D3D3D3"/>
-              <w:end w:val="single" w:space="0" w:color="D3D3D3"/>
-            </w:tcBorders>
-          </w:tcPr>
-          <w:p>
-            <w:pPr>
-              <w:spacing w:before="0" w:after="60"/>
-              <w:keepNext/>
-              <w:jc w:val="start"/>
-            </w:pPr>
-            <w:r>
-              <w:rPr>
-                <w:rFonts w:ascii="Calibri" w:hAnsi="Calibri"/>
-                <w:sz w:val="20"/>
-              </w:rPr>
-              <w:t xml:space="default">Install a heat pump water heater to provide your hot water for cooking and bathing. This is the most efficient way to heat water and will save hundreds of dollars a year compared to electric resistance, heating oil, or propane hot water. It will also help to dehumidify while it's running. If your current water heater burns oil or propane, this will also remove a source of combustion gases from your home.</w:t>
+              <w:t xml:space="default">Kitchen Exhaust Fan</w:t>
+            </w:r>
+          </w:p>
+        </w:tc>
+        <w:tc>
+          <w:tcPr>
+            <w:tcBorders>
+              <w:top w:val="single" w:space="0" w:color="D3D3D3"/>
+              <w:bottom w:val="single" w:space="0" w:color="D3D3D3"/>
+              <w:start w:val="single" w:space="0" w:color="D3D3D3"/>
+              <w:end w:val="single" w:space="0" w:color="D3D3D3"/>
+            </w:tcBorders>
+          </w:tcPr>
+          <w:p>
+            <w:pPr>
+              <w:spacing w:before="0" w:after="60"/>
+              <w:keepNext/>
+              <w:jc w:val="start"/>
+            </w:pPr>
+            <w:r>
+              <w:rPr>
+                <w:rFonts w:ascii="Calibri" w:hAnsi="Calibri"/>
+                <w:sz w:val="20"/>
+              </w:rPr>
+              <w:t xml:space="default">Install a kitchen exhaust fan to remove cooking fumes and moisture from your home. The fan should be rated for at least 100 cubic feet per minute. A kitchen fan should be ducted to the outdoors. If the ductwork will run through the attic, it should be installed before the attic is air-sealed and insulated.</w:t>
             </w:r>
           </w:p>
         </w:tc>
@@ -609,31 +609,31 @@
                 <w:rFonts w:ascii="Calibri" w:hAnsi="Calibri"/>
                 <w:sz w:val="20"/>
               </w:rPr>
-              <w:t xml:space="default">Gutters</w:t>
-            </w:r>
-          </w:p>
-        </w:tc>
-        <w:tc>
-          <w:tcPr>
-            <w:tcBorders>
-              <w:top w:val="single" w:space="0" w:color="D3D3D3"/>
-              <w:bottom w:val="single" w:space="0" w:color="D3D3D3"/>
-              <w:start w:val="single" w:space="0" w:color="D3D3D3"/>
-              <w:end w:val="single" w:space="0" w:color="D3D3D3"/>
-            </w:tcBorders>
-          </w:tcPr>
-          <w:p>
-            <w:pPr>
-              <w:spacing w:before="0" w:after="60"/>
-              <w:keepNext/>
-              <w:jc w:val="start"/>
-            </w:pPr>
-            <w:r>
-              <w:rPr>
-                <w:rFonts w:ascii="Calibri" w:hAnsi="Calibri"/>
-                <w:sz w:val="20"/>
-              </w:rPr>
-              <w:t xml:space="default">Install gutters and downspouts that divert water at least six feet away from the foundation and to where the ground slopes away from the house.</w:t>
+              <w:t xml:space="default">Vapor Barrier</w:t>
+            </w:r>
+          </w:p>
+        </w:tc>
+        <w:tc>
+          <w:tcPr>
+            <w:tcBorders>
+              <w:top w:val="single" w:space="0" w:color="D3D3D3"/>
+              <w:bottom w:val="single" w:space="0" w:color="D3D3D3"/>
+              <w:start w:val="single" w:space="0" w:color="D3D3D3"/>
+              <w:end w:val="single" w:space="0" w:color="D3D3D3"/>
+            </w:tcBorders>
+          </w:tcPr>
+          <w:p>
+            <w:pPr>
+              <w:spacing w:before="0" w:after="60"/>
+              <w:keepNext/>
+              <w:jc w:val="start"/>
+            </w:pPr>
+            <w:r>
+              <w:rPr>
+                <w:rFonts w:ascii="Calibri" w:hAnsi="Calibri"/>
+                <w:sz w:val="20"/>
+              </w:rPr>
+              <w:t xml:space="default">Install a vapor barrier on the basement floor to stop moisture from entering the basement and house.</w:t>
             </w:r>
           </w:p>
         </w:tc>
@@ -662,31 +662,31 @@
                 <w:rFonts w:ascii="Calibri" w:hAnsi="Calibri"/>
                 <w:sz w:val="20"/>
               </w:rPr>
-              <w:t xml:space="default">Bathroom Exhaust Fan(s)</w:t>
-            </w:r>
-          </w:p>
-        </w:tc>
-        <w:tc>
-          <w:tcPr>
-            <w:tcBorders>
-              <w:top w:val="single" w:space="0" w:color="D3D3D3"/>
-              <w:bottom w:val="single" w:space="0" w:color="D3D3D3"/>
-              <w:start w:val="single" w:space="0" w:color="D3D3D3"/>
-              <w:end w:val="single" w:space="0" w:color="D3D3D3"/>
-            </w:tcBorders>
-          </w:tcPr>
-          <w:p>
-            <w:pPr>
-              <w:spacing w:before="0" w:after="60"/>
-              <w:keepNext/>
-              <w:jc w:val="start"/>
-            </w:pPr>
-            <w:r>
-              <w:rPr>
-                <w:rFonts w:ascii="Calibri" w:hAnsi="Calibri"/>
-                <w:sz w:val="20"/>
-              </w:rPr>
-              <w:t xml:space="default">Install bathroom exhaust fans in all bathrooms that do not have them. These should be rated for at least 80 cubic feet per minute (CFM) if there is a shower. We recommend the Panasonic Whisper series or similar fans that don’t create excess noise.</w:t>
+              <w:t xml:space="default">Spray Foam Basement/Crawlspace Walls</w:t>
+            </w:r>
+          </w:p>
+        </w:tc>
+        <w:tc>
+          <w:tcPr>
+            <w:tcBorders>
+              <w:top w:val="single" w:space="0" w:color="D3D3D3"/>
+              <w:bottom w:val="single" w:space="0" w:color="D3D3D3"/>
+              <w:start w:val="single" w:space="0" w:color="D3D3D3"/>
+              <w:end w:val="single" w:space="0" w:color="D3D3D3"/>
+            </w:tcBorders>
+          </w:tcPr>
+          <w:p>
+            <w:pPr>
+              <w:spacing w:before="0" w:after="60"/>
+              <w:keepNext/>
+              <w:jc w:val="start"/>
+            </w:pPr>
+            <w:r>
+              <w:rPr>
+                <w:rFonts w:ascii="Calibri" w:hAnsi="Calibri"/>
+                <w:sz w:val="20"/>
+              </w:rPr>
+              <w:t xml:space="default">Install spray foam on the basement/crawlspace walls to prevent moisture infiltration and reduce heat loss.</w:t>
             </w:r>
           </w:p>
         </w:tc>
@@ -715,31 +715,31 @@
                 <w:rFonts w:ascii="Calibri" w:hAnsi="Calibri"/>
                 <w:sz w:val="20"/>
               </w:rPr>
-              <w:t xml:space="default">Kitchen Exhaust Fan</w:t>
-            </w:r>
-          </w:p>
-        </w:tc>
-        <w:tc>
-          <w:tcPr>
-            <w:tcBorders>
-              <w:top w:val="single" w:space="0" w:color="D3D3D3"/>
-              <w:bottom w:val="single" w:space="0" w:color="D3D3D3"/>
-              <w:start w:val="single" w:space="0" w:color="D3D3D3"/>
-              <w:end w:val="single" w:space="0" w:color="D3D3D3"/>
-            </w:tcBorders>
-          </w:tcPr>
-          <w:p>
-            <w:pPr>
-              <w:spacing w:before="0" w:after="60"/>
-              <w:keepNext/>
-              <w:jc w:val="start"/>
-            </w:pPr>
-            <w:r>
-              <w:rPr>
-                <w:rFonts w:ascii="Calibri" w:hAnsi="Calibri"/>
-                <w:sz w:val="20"/>
-              </w:rPr>
-              <w:t xml:space="default">Install a kitchen exhaust fan to remove cooking fumes and moisture from your home. The fan should be rated for at least 100 cubic feet per minute. A kitchen fan should be ducted to the outdoors. If the ductwork will run through the attic, it should be installed before the attic is air-sealed and insulated.</w:t>
+              <w:t xml:space="default">Attic Air Sealing and Insulation</w:t>
+            </w:r>
+          </w:p>
+        </w:tc>
+        <w:tc>
+          <w:tcPr>
+            <w:tcBorders>
+              <w:top w:val="single" w:space="0" w:color="D3D3D3"/>
+              <w:bottom w:val="single" w:space="0" w:color="D3D3D3"/>
+              <w:start w:val="single" w:space="0" w:color="D3D3D3"/>
+              <w:end w:val="single" w:space="0" w:color="D3D3D3"/>
+            </w:tcBorders>
+          </w:tcPr>
+          <w:p>
+            <w:pPr>
+              <w:spacing w:before="0" w:after="60"/>
+              <w:keepNext/>
+              <w:jc w:val="start"/>
+            </w:pPr>
+            <w:r>
+              <w:rPr>
+                <w:rFonts w:ascii="Calibri" w:hAnsi="Calibri"/>
+                <w:sz w:val="20"/>
+              </w:rPr>
+              <w:t xml:space="default">Air seal the attic and insulate it to at least R-60 (18 inches of loose-fill cellulose insulation).</w:t>
             </w:r>
           </w:p>
         </w:tc>
@@ -768,31 +768,31 @@
                 <w:rFonts w:ascii="Calibri" w:hAnsi="Calibri"/>
                 <w:sz w:val="20"/>
               </w:rPr>
-              <w:t xml:space="default">Vapor Barrier</w:t>
-            </w:r>
-          </w:p>
-        </w:tc>
-        <w:tc>
-          <w:tcPr>
-            <w:tcBorders>
-              <w:top w:val="single" w:space="0" w:color="D3D3D3"/>
-              <w:bottom w:val="single" w:space="0" w:color="D3D3D3"/>
-              <w:start w:val="single" w:space="0" w:color="D3D3D3"/>
-              <w:end w:val="single" w:space="0" w:color="D3D3D3"/>
-            </w:tcBorders>
-          </w:tcPr>
-          <w:p>
-            <w:pPr>
-              <w:spacing w:before="0" w:after="60"/>
-              <w:keepNext/>
-              <w:jc w:val="start"/>
-            </w:pPr>
-            <w:r>
-              <w:rPr>
-                <w:rFonts w:ascii="Calibri" w:hAnsi="Calibri"/>
-                <w:sz w:val="20"/>
-              </w:rPr>
-              <w:t xml:space="default">Install a vapor barrier on the basement floor to stop moisture from entering the basement and house.</w:t>
+              <w:t xml:space="default">Blown-in Cellulose Wall Insulation</w:t>
+            </w:r>
+          </w:p>
+        </w:tc>
+        <w:tc>
+          <w:tcPr>
+            <w:tcBorders>
+              <w:top w:val="single" w:space="0" w:color="D3D3D3"/>
+              <w:bottom w:val="single" w:space="0" w:color="D3D3D3"/>
+              <w:start w:val="single" w:space="0" w:color="D3D3D3"/>
+              <w:end w:val="single" w:space="0" w:color="D3D3D3"/>
+            </w:tcBorders>
+          </w:tcPr>
+          <w:p>
+            <w:pPr>
+              <w:spacing w:before="0" w:after="60"/>
+              <w:keepNext/>
+              <w:jc w:val="start"/>
+            </w:pPr>
+            <w:r>
+              <w:rPr>
+                <w:rFonts w:ascii="Calibri" w:hAnsi="Calibri"/>
+                <w:sz w:val="20"/>
+              </w:rPr>
+              <w:t xml:space="default">Insulate the wall stud cavities with dense packed, blown-in cellulose insulation.</w:t>
             </w:r>
           </w:p>
         </w:tc>
@@ -821,31 +821,31 @@
                 <w:rFonts w:ascii="Calibri" w:hAnsi="Calibri"/>
                 <w:sz w:val="20"/>
               </w:rPr>
-              <w:t xml:space="default">Spray Foam Basement/Crawlspace Walls</w:t>
-            </w:r>
-          </w:p>
-        </w:tc>
-        <w:tc>
-          <w:tcPr>
-            <w:tcBorders>
-              <w:top w:val="single" w:space="0" w:color="D3D3D3"/>
-              <w:bottom w:val="single" w:space="0" w:color="D3D3D3"/>
-              <w:start w:val="single" w:space="0" w:color="D3D3D3"/>
-              <w:end w:val="single" w:space="0" w:color="D3D3D3"/>
-            </w:tcBorders>
-          </w:tcPr>
-          <w:p>
-            <w:pPr>
-              <w:spacing w:before="0" w:after="60"/>
-              <w:keepNext/>
-              <w:jc w:val="start"/>
-            </w:pPr>
-            <w:r>
-              <w:rPr>
-                <w:rFonts w:ascii="Calibri" w:hAnsi="Calibri"/>
-                <w:sz w:val="20"/>
-              </w:rPr>
-              <w:t xml:space="default">Install spray foam on the basement/crawlspace walls to prevent moisture infiltration and reduce heat loss.</w:t>
+              <w:t xml:space="default">Continuous Exterior Wall Insulation</w:t>
+            </w:r>
+          </w:p>
+        </w:tc>
+        <w:tc>
+          <w:tcPr>
+            <w:tcBorders>
+              <w:top w:val="single" w:space="0" w:color="D3D3D3"/>
+              <w:bottom w:val="single" w:space="0" w:color="D3D3D3"/>
+              <w:start w:val="single" w:space="0" w:color="D3D3D3"/>
+              <w:end w:val="single" w:space="0" w:color="D3D3D3"/>
+            </w:tcBorders>
+          </w:tcPr>
+          <w:p>
+            <w:pPr>
+              <w:spacing w:before="0" w:after="60"/>
+              <w:keepNext/>
+              <w:jc w:val="start"/>
+            </w:pPr>
+            <w:r>
+              <w:rPr>
+                <w:rFonts w:ascii="Calibri" w:hAnsi="Calibri"/>
+                <w:sz w:val="20"/>
+              </w:rPr>
+              <w:t xml:space="default">Add a continuous layer of insulation and potentially replace the air and moisture barrier once it becomes time to replace the siding.</w:t>
             </w:r>
           </w:p>
         </w:tc>
@@ -874,31 +874,31 @@
                 <w:rFonts w:ascii="Calibri" w:hAnsi="Calibri"/>
                 <w:sz w:val="20"/>
               </w:rPr>
-              <w:t xml:space="default">Attic Air Sealing and Insulation</w:t>
-            </w:r>
-          </w:p>
-        </w:tc>
-        <w:tc>
-          <w:tcPr>
-            <w:tcBorders>
-              <w:top w:val="single" w:space="0" w:color="D3D3D3"/>
-              <w:bottom w:val="single" w:space="0" w:color="D3D3D3"/>
-              <w:start w:val="single" w:space="0" w:color="D3D3D3"/>
-              <w:end w:val="single" w:space="0" w:color="D3D3D3"/>
-            </w:tcBorders>
-          </w:tcPr>
-          <w:p>
-            <w:pPr>
-              <w:spacing w:before="0" w:after="60"/>
-              <w:keepNext/>
-              <w:jc w:val="start"/>
-            </w:pPr>
-            <w:r>
-              <w:rPr>
-                <w:rFonts w:ascii="Calibri" w:hAnsi="Calibri"/>
-                <w:sz w:val="20"/>
-              </w:rPr>
-              <w:t xml:space="default">Air seal the attic and insulate it to at least R-60 (18 inches of loose-fill cellulose insulation).</w:t>
+              <w:t xml:space="default">Air Source Heat Pump</w:t>
+            </w:r>
+          </w:p>
+        </w:tc>
+        <w:tc>
+          <w:tcPr>
+            <w:tcBorders>
+              <w:top w:val="single" w:space="0" w:color="D3D3D3"/>
+              <w:bottom w:val="single" w:space="0" w:color="D3D3D3"/>
+              <w:start w:val="single" w:space="0" w:color="D3D3D3"/>
+              <w:end w:val="single" w:space="0" w:color="D3D3D3"/>
+            </w:tcBorders>
+          </w:tcPr>
+          <w:p>
+            <w:pPr>
+              <w:spacing w:before="0" w:after="60"/>
+              <w:keepNext/>
+              <w:jc w:val="start"/>
+            </w:pPr>
+            <w:r>
+              <w:rPr>
+                <w:rFonts w:ascii="Calibri" w:hAnsi="Calibri"/>
+                <w:sz w:val="20"/>
+              </w:rPr>
+              <w:t xml:space="default">Install air source heat pumps for heating and cooling and whole-house surge protection.</w:t>
             </w:r>
           </w:p>
         </w:tc>
@@ -927,112 +927,6 @@
                 <w:rFonts w:ascii="Calibri" w:hAnsi="Calibri"/>
                 <w:sz w:val="20"/>
               </w:rPr>
-              <w:t xml:space="default">Blown-in Cellulose Wall Insulation</w:t>
-            </w:r>
-          </w:p>
-        </w:tc>
-        <w:tc>
-          <w:tcPr>
-            <w:tcBorders>
-              <w:top w:val="single" w:space="0" w:color="D3D3D3"/>
-              <w:bottom w:val="single" w:space="0" w:color="D3D3D3"/>
-              <w:start w:val="single" w:space="0" w:color="D3D3D3"/>
-              <w:end w:val="single" w:space="0" w:color="D3D3D3"/>
-            </w:tcBorders>
-          </w:tcPr>
-          <w:p>
-            <w:pPr>
-              <w:spacing w:before="0" w:after="60"/>
-              <w:keepNext/>
-              <w:jc w:val="start"/>
-            </w:pPr>
-            <w:r>
-              <w:rPr>
-                <w:rFonts w:ascii="Calibri" w:hAnsi="Calibri"/>
-                <w:sz w:val="20"/>
-              </w:rPr>
-              <w:t xml:space="default">Insulate the wall stud cavities with dense packed, blown-in cellulose insulation.</w:t>
-            </w:r>
-          </w:p>
-        </w:tc>
-      </w:tr>
-      <w:tr>
-        <w:trPr>
-          <w:cantSplit/>
-        </w:trPr>
-        <w:tc>
-          <w:tcPr>
-            <w:tcBorders>
-              <w:top w:val="single" w:space="0" w:color="D3D3D3"/>
-              <w:bottom w:val="single" w:space="0" w:color="D3D3D3"/>
-              <w:start w:val="single" w:space="0" w:color="D3D3D3"/>
-              <w:end w:val="single" w:space="0" w:color="D3D3D3"/>
-            </w:tcBorders>
-          </w:tcPr>
-          <w:p>
-            <w:pPr>
-              <w:spacing w:before="0" w:after="60"/>
-              <w:keepNext/>
-              <w:jc w:val="start"/>
-            </w:pPr>
-            <w:r>
-              <w:rPr>
-                <w:rFonts w:ascii="Calibri" w:hAnsi="Calibri"/>
-                <w:sz w:val="20"/>
-              </w:rPr>
-              <w:t xml:space="default">Continuous Exterior Wall Insulation</w:t>
-            </w:r>
-          </w:p>
-        </w:tc>
-        <w:tc>
-          <w:tcPr>
-            <w:tcBorders>
-              <w:top w:val="single" w:space="0" w:color="D3D3D3"/>
-              <w:bottom w:val="single" w:space="0" w:color="D3D3D3"/>
-              <w:start w:val="single" w:space="0" w:color="D3D3D3"/>
-              <w:end w:val="single" w:space="0" w:color="D3D3D3"/>
-            </w:tcBorders>
-          </w:tcPr>
-          <w:p>
-            <w:pPr>
-              <w:spacing w:before="0" w:after="60"/>
-              <w:keepNext/>
-              <w:jc w:val="start"/>
-            </w:pPr>
-            <w:r>
-              <w:rPr>
-                <w:rFonts w:ascii="Calibri" w:hAnsi="Calibri"/>
-                <w:sz w:val="20"/>
-              </w:rPr>
-              <w:t xml:space="default">Add a continuous layer of insulation and potentially replace the air and moisture barrier once it becomes time to replace the siding.</w:t>
-            </w:r>
-          </w:p>
-        </w:tc>
-      </w:tr>
-      <w:tr>
-        <w:trPr>
-          <w:cantSplit/>
-        </w:trPr>
-        <w:tc>
-          <w:tcPr>
-            <w:tcBorders>
-              <w:top w:val="single" w:space="0" w:color="D3D3D3"/>
-              <w:bottom w:val="single" w:space="0" w:color="D3D3D3"/>
-              <w:start w:val="single" w:space="0" w:color="D3D3D3"/>
-              <w:end w:val="single" w:space="0" w:color="D3D3D3"/>
-            </w:tcBorders>
-          </w:tcPr>
-          <w:p>
-            <w:pPr>
-              <w:spacing w:before="0" w:after="60"/>
-              <w:keepNext/>
-              <w:jc w:val="start"/>
-            </w:pPr>
-            <w:r>
-              <w:rPr>
-                <w:rFonts w:ascii="Calibri" w:hAnsi="Calibri"/>
-                <w:sz w:val="20"/>
-              </w:rPr>
               <w:t xml:space="default">Pipe Insulation</w:t>
             </w:r>
           </w:p>
@@ -1058,112 +952,6 @@
                 <w:sz w:val="20"/>
               </w:rPr>
               <w:t xml:space="default">Insulate both hot and cold water pipes that are uninsulated in the basement/crawlspace. This will save energy and prevent condensation.</w:t>
-            </w:r>
-          </w:p>
-        </w:tc>
-      </w:tr>
-      <w:tr>
-        <w:trPr>
-          <w:cantSplit/>
-        </w:trPr>
-        <w:tc>
-          <w:tcPr>
-            <w:tcBorders>
-              <w:top w:val="single" w:space="0" w:color="D3D3D3"/>
-              <w:bottom w:val="single" w:space="0" w:color="D3D3D3"/>
-              <w:start w:val="single" w:space="0" w:color="D3D3D3"/>
-              <w:end w:val="single" w:space="0" w:color="D3D3D3"/>
-            </w:tcBorders>
-          </w:tcPr>
-          <w:p>
-            <w:pPr>
-              <w:spacing w:before="0" w:after="60"/>
-              <w:keepNext/>
-              <w:jc w:val="start"/>
-            </w:pPr>
-            <w:r>
-              <w:rPr>
-                <w:rFonts w:ascii="Calibri" w:hAnsi="Calibri"/>
-                <w:sz w:val="20"/>
-              </w:rPr>
-              <w:t xml:space="default">DIY Air Sealing</w:t>
-            </w:r>
-          </w:p>
-        </w:tc>
-        <w:tc>
-          <w:tcPr>
-            <w:tcBorders>
-              <w:top w:val="single" w:space="0" w:color="D3D3D3"/>
-              <w:bottom w:val="single" w:space="0" w:color="D3D3D3"/>
-              <w:start w:val="single" w:space="0" w:color="D3D3D3"/>
-              <w:end w:val="single" w:space="0" w:color="D3D3D3"/>
-            </w:tcBorders>
-          </w:tcPr>
-          <w:p>
-            <w:pPr>
-              <w:spacing w:before="0" w:after="60"/>
-              <w:keepNext/>
-              <w:jc w:val="start"/>
-            </w:pPr>
-            <w:r>
-              <w:rPr>
-                <w:rFonts w:ascii="Calibri" w:hAnsi="Calibri"/>
-                <w:sz w:val="20"/>
-              </w:rPr>
-              <w:t xml:space="default">Seal easy-to-access air leaks and weatherstrip exterior doors.</w:t>
-            </w:r>
-          </w:p>
-        </w:tc>
-      </w:tr>
-      <w:tr>
-        <w:trPr>
-          <w:cantSplit/>
-        </w:trPr>
-        <w:tc>
-          <w:tcPr>
-            <w:tcBorders>
-              <w:top w:val="single" w:space="0" w:color="D3D3D3"/>
-              <w:bottom w:val="single" w:space="0" w:color="D3D3D3"/>
-              <w:start w:val="single" w:space="0" w:color="D3D3D3"/>
-              <w:end w:val="single" w:space="0" w:color="D3D3D3"/>
-            </w:tcBorders>
-          </w:tcPr>
-          <w:p>
-            <w:pPr>
-              <w:spacing w:before="0" w:after="60"/>
-              <w:keepNext/>
-              <w:jc w:val="start"/>
-            </w:pPr>
-            <w:r>
-              <w:rPr>
-                <w:rFonts w:ascii="Calibri" w:hAnsi="Calibri"/>
-                <w:sz w:val="20"/>
-              </w:rPr>
-              <w:t xml:space="default">Ductwork Air Sealing and Insulation</w:t>
-            </w:r>
-          </w:p>
-        </w:tc>
-        <w:tc>
-          <w:tcPr>
-            <w:tcBorders>
-              <w:top w:val="single" w:space="0" w:color="D3D3D3"/>
-              <w:bottom w:val="single" w:space="0" w:color="D3D3D3"/>
-              <w:start w:val="single" w:space="0" w:color="D3D3D3"/>
-              <w:end w:val="single" w:space="0" w:color="D3D3D3"/>
-            </w:tcBorders>
-          </w:tcPr>
-          <w:p>
-            <w:pPr>
-              <w:spacing w:before="0" w:after="60"/>
-              <w:keepNext/>
-              <w:jc w:val="start"/>
-            </w:pPr>
-            <w:r>
-              <w:rPr>
-                <w:rFonts w:ascii="Calibri" w:hAnsi="Calibri"/>
-                <w:sz w:val="20"/>
-              </w:rPr>
-              <w:t xml:space="default">Air seal and insulate all of the supply and return ductwork running through the basement/crawlspace.</w:t>
             </w:r>
           </w:p>
         </w:tc>
@@ -1248,7 +1036,7 @@
                 <w:rFonts w:ascii="Calibri" w:hAnsi="Calibri"/>
                 <w:sz w:val="20"/>
               </w:rPr>
-              <w:t xml:space="default">NA</w:t>
+              <w:t xml:space="default">1920</w:t>
             </w:r>
           </w:p>
         </w:tc>
@@ -1354,7 +1142,7 @@
                 <w:rFonts w:ascii="Calibri" w:hAnsi="Calibri"/>
                 <w:sz w:val="20"/>
               </w:rPr>
-              <w:t xml:space="default">Batts of Fiberglass , 1 inches</w:t>
+              <w:t xml:space="default">Batts of Fiberglass , 3.5 inches</w:t>
             </w:r>
           </w:p>
         </w:tc>
@@ -1642,7 +1430,7 @@
                 <w:rFonts w:ascii="Calibri" w:hAnsi="Calibri"/>
                 <w:sz w:val="20"/>
               </w:rPr>
-              <w:t xml:space="default">NA</w:t>
+              <w:t xml:space="default">10</w:t>
             </w:r>
           </w:p>
         </w:tc>
@@ -1695,7 +1483,7 @@
                 <w:rFonts w:ascii="Calibri" w:hAnsi="Calibri"/>
                 <w:sz w:val="20"/>
               </w:rPr>
-              <w:t xml:space="default">North/South</w:t>
+              <w:t xml:space="default">NA</w:t>
             </w:r>
           </w:p>
         </w:tc>
@@ -1748,7 +1536,7 @@
                 <w:rFonts w:ascii="Calibri" w:hAnsi="Calibri"/>
                 <w:sz w:val="20"/>
               </w:rPr>
-              <w:t xml:space="default">Asphalt Shinglesin faircondition. Most of the roof is in good condition, but there are a few places where shingles are lifting up.</w:t>
+              <w:t xml:space="default">Asphalt Shinglesin excellentcondition. NA</w:t>
             </w:r>
           </w:p>
         </w:tc>
@@ -1801,7 +1589,7 @@
                 <w:rFonts w:ascii="Calibri" w:hAnsi="Calibri"/>
                 <w:sz w:val="20"/>
               </w:rPr>
-              <w:t xml:space="default">Current moisture control strategies: NA. These were in NA condition .NA</w:t>
+              <w:t xml:space="default">Current moisture control strategies: gutters, ground slopes away from foundation, sump pump. These were in excellent condition .NA</w:t>
             </w:r>
           </w:p>
         </w:tc>
@@ -1854,7 +1642,7 @@
                 <w:rFonts w:ascii="Calibri" w:hAnsi="Calibri"/>
                 <w:sz w:val="20"/>
               </w:rPr>
-              <w:t xml:space="default">wood shingles in poor condition. Severe weathering and water damage on all siding, many broken shingles</w:t>
+              <w:t xml:space="default">wood siding in excellent condition. NA</w:t>
             </w:r>
           </w:p>
         </w:tc>
@@ -2036,7 +1824,7 @@
                 <w:rFonts w:ascii="Calibri" w:hAnsi="Calibri"/>
                 <w:sz w:val="20"/>
               </w:rPr>
-              <w:t xml:space="default">NAThere is Batts of Fiberglass insulation NA inches thick in NA condition. NA</w:t>
+              <w:t xml:space="default">The framing type of the home is balloon framing, which means the wall cavities extend the full height of the building (from the foundation to the roof). Often the wall cavities are interconnected with the floor and ceiling cavities. This framing type can create connected passageways for air to leave the house and rodents to enter the house. There is unknown insulation NA inches thick in NA condition. NA</w:t>
             </w:r>
           </w:p>
         </w:tc>
@@ -2142,7 +1930,7 @@
                 <w:rFonts w:ascii="Calibri" w:hAnsi="Calibri"/>
                 <w:sz w:val="20"/>
               </w:rPr>
-              <w:t xml:space="default">NA</w:t>
+              <w:t xml:space="default">there are no bathroom exhaust fans, which might contribute to mold problems</w:t>
             </w:r>
           </w:p>
         </w:tc>
@@ -2195,7 +1983,7 @@
                 <w:rFonts w:ascii="Calibri" w:hAnsi="Calibri"/>
                 <w:sz w:val="20"/>
               </w:rPr>
-              <w:t xml:space="default">NA used NA kWh in NA minutes. NA used NA kWh in NA minutes. NA</w:t>
+              <w:t xml:space="default">NA used NA kWh in NA minutes. NA used NA kWh in NA minutes. there is a recirculating exhaust fan in the kitchen and an electric stove</w:t>
             </w:r>
           </w:p>
         </w:tc>
@@ -2303,7 +2091,7 @@
                 <w:rFonts w:ascii="Calibri" w:hAnsi="Calibri"/>
                 <w:sz w:val="20"/>
               </w:rPr>
-              <w:t xml:space="default">2288</w:t>
+              <w:t xml:space="default">3103</w:t>
             </w:r>
           </w:p>
         </w:tc>
@@ -2457,7 +2245,7 @@
                 <w:rFonts w:ascii="Calibri" w:hAnsi="Calibri"/>
                 <w:sz w:val="20"/>
               </w:rPr>
-              <w:t xml:space="default">228.8 under natural conditions. TEST</w:t>
+              <w:t xml:space="default">310.3 under natural conditions. TEST</w:t>
             </w:r>
           </w:p>
         </w:tc>
@@ -2907,7 +2695,7 @@
                 <w:rFonts w:ascii="Calibri" w:hAnsi="Calibri"/>
                 <w:sz w:val="20"/>
               </w:rPr>
-              <w:t xml:space="default">Attic insulation is very inconsistent and falling away from roof ridge at many points No NA</w:t>
+              <w:t xml:space="default">There is evidence of rodent activity in the attic. Some of the fiberglass batts are dirty and have been pulled apart by rodents, reducing their insulation value. There are some areas where the fiberglass batts are 6 inches thick. No NA</w:t>
             </w:r>
           </w:p>
         </w:tc>
@@ -2960,7 +2748,7 @@
                 <w:rFonts w:ascii="Calibri" w:hAnsi="Calibri"/>
                 <w:sz w:val="20"/>
               </w:rPr>
-              <w:t xml:space="default">NA</w:t>
+              <w:t xml:space="default">No</w:t>
             </w:r>
           </w:p>
         </w:tc>
@@ -3248,7 +3036,7 @@
                 <w:rFonts w:ascii="Calibri" w:hAnsi="Calibri"/>
                 <w:sz w:val="20"/>
               </w:rPr>
-              <w:t xml:space="default">Appliances not insulated, Ducts/pipes partially insulated</w:t>
+              <w:t xml:space="default">Appliances not insulated, Ducts/pipes not insulated</w:t>
             </w:r>
           </w:p>
         </w:tc>
@@ -3301,7 +3089,7 @@
                 <w:rFonts w:ascii="Calibri" w:hAnsi="Calibri"/>
                 <w:sz w:val="20"/>
               </w:rPr>
-              <w:t xml:space="default">NAin NAcondition. NA</w:t>
+              <w:t xml:space="default">sump pumpin faircondition. NA</w:t>
             </w:r>
           </w:p>
         </w:tc>
@@ -3354,7 +3142,7 @@
                 <w:rFonts w:ascii="Calibri" w:hAnsi="Calibri"/>
                 <w:sz w:val="20"/>
               </w:rPr>
-              <w:t xml:space="default">YesExhaust duct is very long and has some parts that are sagging, creating sharp turns</w:t>
+              <w:t xml:space="default">NoNA</w:t>
             </w:r>
           </w:p>
         </w:tc>
@@ -3407,7 +3195,7 @@
                 <w:rFonts w:ascii="Calibri" w:hAnsi="Calibri"/>
                 <w:sz w:val="20"/>
               </w:rPr>
-              <w:t xml:space="default">There is moistureMoisture marks along most walls, mold on floor and wall next to well pressure tank and oil tank</w:t>
+              <w:t xml:space="default">There is moistureThe homeowner mentioned flooding in the basement whenever it rains.</w:t>
             </w:r>
           </w:p>
         </w:tc>
@@ -3483,7 +3271,7 @@
                 <w:rFonts w:ascii="Calibri" w:hAnsi="Calibri"/>
                 <w:sz w:val="20"/>
               </w:rPr>
-              <w:t xml:space="default">The electrical panel has and amperage of 200. There are 11 unused breaker spaces. NA</w:t>
+              <w:t xml:space="default">The electrical panel has and amperage of 200. There are 15 unused breaker spaces. NA</w:t>
             </w:r>
           </w:p>
         </w:tc>
@@ -3595,7 +3383,7 @@
             <w:pPr>
               <w:spacing w:before="0" w:after="60"/>
               <w:keepNext/>
-              <w:jc w:val="start"/>
+              <w:jc w:val="end"/>
             </w:pPr>
             <w:r>
               <w:rPr>
@@ -3603,6 +3391,309 @@
                 <w:sz w:val="20"/>
               </w:rPr>
               <w:t xml:space="default">Cost (USD)</w:t>
+            </w:r>
+          </w:p>
+        </w:tc>
+      </w:tr>
+      <w:tr>
+        <w:trPr>
+          <w:cantSplit/>
+        </w:trPr>
+        <w:tc>
+          <w:tcPr>
+            <w:tcBorders>
+              <w:top w:val="single" w:space="0" w:color="D3D3D3"/>
+              <w:bottom w:val="single" w:space="0" w:color="D3D3D3"/>
+              <w:start w:val="single" w:space="0" w:color="D3D3D3"/>
+              <w:end w:val="single" w:space="0" w:color="D3D3D3"/>
+            </w:tcBorders>
+          </w:tcPr>
+          <w:p>
+            <w:pPr>
+              <w:spacing w:before="0" w:after="60"/>
+              <w:keepNext/>
+              <w:jc w:val="start"/>
+            </w:pPr>
+            <w:r>
+              <w:rPr>
+                <w:rFonts w:ascii="Calibri" w:hAnsi="Calibri"/>
+                <w:sz w:val="20"/>
+              </w:rPr>
+              <w:t xml:space="default">Heating oil</w:t>
+            </w:r>
+          </w:p>
+        </w:tc>
+        <w:tc>
+          <w:tcPr>
+            <w:tcBorders>
+              <w:top w:val="single" w:space="0" w:color="D3D3D3"/>
+              <w:bottom w:val="single" w:space="0" w:color="D3D3D3"/>
+              <w:start w:val="single" w:space="0" w:color="D3D3D3"/>
+              <w:end w:val="single" w:space="0" w:color="D3D3D3"/>
+            </w:tcBorders>
+          </w:tcPr>
+          <w:p>
+            <w:pPr>
+              <w:spacing w:before="0" w:after="60"/>
+              <w:keepNext/>
+              <w:jc w:val="start"/>
+            </w:pPr>
+            <w:r>
+              <w:rPr>
+                <w:rFonts w:ascii="Calibri" w:hAnsi="Calibri"/>
+                <w:sz w:val="20"/>
+              </w:rPr>
+              <w:t xml:space="default">NA</w:t>
+            </w:r>
+          </w:p>
+        </w:tc>
+        <w:tc>
+          <w:tcPr>
+            <w:tcBorders>
+              <w:top w:val="single" w:space="0" w:color="D3D3D3"/>
+              <w:bottom w:val="single" w:space="0" w:color="D3D3D3"/>
+              <w:start w:val="single" w:space="0" w:color="D3D3D3"/>
+              <w:end w:val="single" w:space="0" w:color="D3D3D3"/>
+            </w:tcBorders>
+          </w:tcPr>
+          <w:p>
+            <w:pPr>
+              <w:spacing w:before="0" w:after="60"/>
+              <w:keepNext/>
+              <w:jc w:val="start"/>
+            </w:pPr>
+            <w:r>
+              <w:rPr>
+                <w:rFonts w:ascii="Calibri" w:hAnsi="Calibri"/>
+                <w:sz w:val="20"/>
+              </w:rPr>
+              <w:t xml:space="default">cost_in_dollars_heating_oil</w:t>
+            </w:r>
+          </w:p>
+        </w:tc>
+        <w:tc>
+          <w:tcPr>
+            <w:tcBorders>
+              <w:top w:val="single" w:space="0" w:color="D3D3D3"/>
+              <w:bottom w:val="single" w:space="0" w:color="D3D3D3"/>
+              <w:start w:val="single" w:space="0" w:color="D3D3D3"/>
+              <w:end w:val="single" w:space="0" w:color="D3D3D3"/>
+            </w:tcBorders>
+          </w:tcPr>
+          <w:p>
+            <w:pPr>
+              <w:spacing w:before="0" w:after="60"/>
+              <w:keepNext/>
+              <w:jc w:val="end"/>
+            </w:pPr>
+            <w:r>
+              <w:rPr>
+                <w:rFonts w:ascii="Calibri" w:hAnsi="Calibri"/>
+                <w:sz w:val="20"/>
+              </w:rPr>
+              <w:t xml:space="default">3414.41</w:t>
+            </w:r>
+          </w:p>
+        </w:tc>
+      </w:tr>
+      <w:tr>
+        <w:trPr>
+          <w:cantSplit/>
+        </w:trPr>
+        <w:tc>
+          <w:tcPr>
+            <w:tcBorders>
+              <w:top w:val="single" w:space="0" w:color="D3D3D3"/>
+              <w:bottom w:val="single" w:space="0" w:color="D3D3D3"/>
+              <w:start w:val="single" w:space="0" w:color="D3D3D3"/>
+              <w:end w:val="single" w:space="0" w:color="D3D3D3"/>
+            </w:tcBorders>
+          </w:tcPr>
+          <w:p>
+            <w:pPr>
+              <w:spacing w:before="0" w:after="60"/>
+              <w:keepNext/>
+              <w:jc w:val="start"/>
+            </w:pPr>
+            <w:r>
+              <w:rPr>
+                <w:rFonts w:ascii="Calibri" w:hAnsi="Calibri"/>
+                <w:sz w:val="20"/>
+              </w:rPr>
+              <w:t xml:space="default">Propane</w:t>
+            </w:r>
+          </w:p>
+        </w:tc>
+        <w:tc>
+          <w:tcPr>
+            <w:tcBorders>
+              <w:top w:val="single" w:space="0" w:color="D3D3D3"/>
+              <w:bottom w:val="single" w:space="0" w:color="D3D3D3"/>
+              <w:start w:val="single" w:space="0" w:color="D3D3D3"/>
+              <w:end w:val="single" w:space="0" w:color="D3D3D3"/>
+            </w:tcBorders>
+          </w:tcPr>
+          <w:p>
+            <w:pPr>
+              <w:spacing w:before="0" w:after="60"/>
+              <w:keepNext/>
+              <w:jc w:val="start"/>
+            </w:pPr>
+            <w:r>
+              <w:rPr>
+                <w:rFonts w:ascii="Calibri" w:hAnsi="Calibri"/>
+                <w:sz w:val="20"/>
+              </w:rPr>
+              <w:t xml:space="default">NA</w:t>
+            </w:r>
+          </w:p>
+        </w:tc>
+        <w:tc>
+          <w:tcPr>
+            <w:tcBorders>
+              <w:top w:val="single" w:space="0" w:color="D3D3D3"/>
+              <w:bottom w:val="single" w:space="0" w:color="D3D3D3"/>
+              <w:start w:val="single" w:space="0" w:color="D3D3D3"/>
+              <w:end w:val="single" w:space="0" w:color="D3D3D3"/>
+            </w:tcBorders>
+          </w:tcPr>
+          <w:p>
+            <w:pPr>
+              <w:spacing w:before="0" w:after="60"/>
+              <w:keepNext/>
+              <w:jc w:val="start"/>
+            </w:pPr>
+            <w:r>
+              <w:rPr>
+                <w:rFonts w:ascii="Calibri" w:hAnsi="Calibri"/>
+                <w:sz w:val="20"/>
+              </w:rPr>
+              <w:t xml:space="default">cost_in_dollars_propane</w:t>
+            </w:r>
+          </w:p>
+        </w:tc>
+        <w:tc>
+          <w:tcPr>
+            <w:tcBorders>
+              <w:top w:val="single" w:space="0" w:color="D3D3D3"/>
+              <w:bottom w:val="single" w:space="0" w:color="D3D3D3"/>
+              <w:start w:val="single" w:space="0" w:color="D3D3D3"/>
+              <w:end w:val="single" w:space="0" w:color="D3D3D3"/>
+            </w:tcBorders>
+          </w:tcPr>
+          <w:p>
+            <w:pPr>
+              <w:spacing w:before="0" w:after="60"/>
+              <w:keepNext/>
+              <w:jc w:val="end"/>
+            </w:pPr>
+            <w:r>
+              <w:rPr>
+                <w:rFonts w:ascii="Calibri" w:hAnsi="Calibri"/>
+                <w:sz w:val="20"/>
+              </w:rPr>
+              <w:t xml:space="default">404.11</w:t>
+            </w:r>
+          </w:p>
+        </w:tc>
+      </w:tr>
+      <w:tr>
+        <w:trPr>
+          <w:cantSplit/>
+        </w:trPr>
+        <w:tc>
+          <w:tcPr>
+            <w:tcBorders>
+              <w:top w:val="single" w:space="0" w:color="D3D3D3"/>
+              <w:bottom w:val="single" w:space="0" w:color="D3D3D3"/>
+              <w:start w:val="single" w:space="0" w:color="D3D3D3"/>
+              <w:end w:val="single" w:space="0" w:color="D3D3D3"/>
+            </w:tcBorders>
+          </w:tcPr>
+          <w:p>
+            <w:pPr>
+              <w:spacing w:before="0" w:after="60"/>
+              <w:keepNext/>
+              <w:jc w:val="start"/>
+            </w:pPr>
+            <w:r>
+              <w:rPr>
+                <w:rFonts w:ascii="Calibri" w:hAnsi="Calibri"/>
+                <w:sz w:val="20"/>
+              </w:rPr>
+              <w:t xml:space="default">Electricity</w:t>
+            </w:r>
+          </w:p>
+        </w:tc>
+        <w:tc>
+          <w:tcPr>
+            <w:tcBorders>
+              <w:top w:val="single" w:space="0" w:color="D3D3D3"/>
+              <w:bottom w:val="single" w:space="0" w:color="D3D3D3"/>
+              <w:start w:val="single" w:space="0" w:color="D3D3D3"/>
+              <w:end w:val="single" w:space="0" w:color="D3D3D3"/>
+            </w:tcBorders>
+          </w:tcPr>
+          <w:p>
+            <w:pPr>
+              <w:spacing w:before="0" w:after="60"/>
+              <w:keepNext/>
+              <w:jc w:val="start"/>
+            </w:pPr>
+            <w:r>
+              <w:rPr>
+                <w:rFonts w:ascii="Calibri" w:hAnsi="Calibri"/>
+                <w:sz w:val="20"/>
+              </w:rPr>
+              <w:t xml:space="default">NA</w:t>
+            </w:r>
+          </w:p>
+        </w:tc>
+        <w:tc>
+          <w:tcPr>
+            <w:tcBorders>
+              <w:top w:val="single" w:space="0" w:color="D3D3D3"/>
+              <w:bottom w:val="single" w:space="0" w:color="D3D3D3"/>
+              <w:start w:val="single" w:space="0" w:color="D3D3D3"/>
+              <w:end w:val="single" w:space="0" w:color="D3D3D3"/>
+            </w:tcBorders>
+          </w:tcPr>
+          <w:p>
+            <w:pPr>
+              <w:spacing w:before="0" w:after="60"/>
+              <w:keepNext/>
+              <w:jc w:val="start"/>
+            </w:pPr>
+            <w:r>
+              <w:rPr>
+                <w:rFonts w:ascii="Calibri" w:hAnsi="Calibri"/>
+                <w:sz w:val="20"/>
+              </w:rPr>
+              <w:t xml:space="default">cost_in_dollars_electricity</w:t>
+            </w:r>
+          </w:p>
+        </w:tc>
+        <w:tc>
+          <w:tcPr>
+            <w:tcBorders>
+              <w:top w:val="single" w:space="0" w:color="D3D3D3"/>
+              <w:bottom w:val="single" w:space="0" w:color="D3D3D3"/>
+              <w:start w:val="single" w:space="0" w:color="D3D3D3"/>
+              <w:end w:val="single" w:space="0" w:color="D3D3D3"/>
+            </w:tcBorders>
+          </w:tcPr>
+          <w:p>
+            <w:pPr>
+              <w:spacing w:before="0" w:after="60"/>
+              <w:keepNext/>
+              <w:jc w:val="end"/>
+            </w:pPr>
+            <w:r>
+              <w:rPr>
+                <w:rFonts w:ascii="Calibri" w:hAnsi="Calibri"/>
+                <w:sz w:val="20"/>
+              </w:rPr>
+              <w:t xml:space="default">1162.02</w:t>
             </w:r>
           </w:p>
         </w:tc>
@@ -3610,7 +3701,7 @@
     </w:tbl>
     <w:bookmarkEnd w:id="40"/>
     <w:bookmarkEnd w:id="41"/>
-    <w:bookmarkStart w:id="58" w:name="recommendations"/>
+    <w:bookmarkStart w:id="54" w:name="recommendations"/>
     <w:p>
       <w:pPr>
         <w:pStyle w:val="Heading2"/>
@@ -3627,13 +3718,13 @@
         <w:t xml:space="preserve">These recommendations are organized from the least expensive/most cost-effective and easiest interventions to ones that are more challenging to implement.</w:t>
       </w:r>
     </w:p>
-    <w:bookmarkStart w:id="42" w:name="furnaceboiler-tune-up"/>
+    <w:bookmarkStart w:id="42" w:name="high-efficiency-shower-heads"/>
     <w:p>
       <w:pPr>
         <w:pStyle w:val="Heading3"/>
       </w:pPr>
       <w:r>
-        <w:t xml:space="preserve">4.1 Furnace/Boiler Tune up</w:t>
+        <w:t xml:space="preserve">4.1 High efficiency shower head(s)</w:t>
       </w:r>
     </w:p>
     <w:p>
@@ -3653,23 +3744,209 @@
         <w:pStyle w:val="BodyText"/>
       </w:pPr>
       <w:r>
+        <w:t xml:space="preserve">Your shower heads use more water and energy than high-efficiency shower heads, thus costing you more money than necessary. Older shower heads use 2.5 gallons or more every minute, which wastes thousands of gallons of water each year and costs you money for every extra gallon of water heated.</w:t>
+      </w:r>
+    </w:p>
+    <w:p>
+      <w:pPr>
+        <w:pStyle w:val="BodyText"/>
+      </w:pPr>
+      <w:r>
+        <w:rPr>
+          <w:i/>
+          <w:iCs/>
+        </w:rPr>
+        <w:t xml:space="preserve">Recommendation</w:t>
+      </w:r>
+    </w:p>
+    <w:p>
+      <w:pPr>
+        <w:pStyle w:val="BodyText"/>
+      </w:pPr>
+      <w:r>
+        <w:t xml:space="preserve">Install high-efficiency shower heads to reduce the amount of water and energy to heat the water used when showering. We recommend 1.5 gallon per minute shower heads that will save a gallon or more of water for every minute spent in the shower.</w:t>
+      </w:r>
+      <w:r>
+        <w:t xml:space="preserve"> </w:t>
+      </w:r>
+      <w:r>
+        <w:rPr>
+          <w:i/>
+          <w:iCs/>
+        </w:rPr>
+        <w:t xml:space="preserve">Estimated Cost/Benefits/Incentives</w:t>
+      </w:r>
+    </w:p>
+    <w:p>
+      <w:pPr>
+        <w:pStyle w:val="BodyText"/>
+      </w:pPr>
+      <w:r>
+        <w:t xml:space="preserve">A typical family will save ~10,000 gallons of water per year and over $100 per year in water heating costs. We provide these for free and have several styles for you to choose from; contact us for some if we did not give you any during the audit.</w:t>
+      </w:r>
+    </w:p>
+    <w:bookmarkEnd w:id="42"/>
+    <w:bookmarkStart w:id="43" w:name="leds"/>
+    <w:p>
+      <w:pPr>
+        <w:pStyle w:val="Heading3"/>
+      </w:pPr>
+      <w:r>
+        <w:t xml:space="preserve">4.2 LEDs</w:t>
+      </w:r>
+    </w:p>
+    <w:p>
+      <w:pPr>
+        <w:pStyle w:val="FirstParagraph"/>
+      </w:pPr>
+      <w:r>
+        <w:rPr>
+          <w:i/>
+          <w:iCs/>
+        </w:rPr>
+        <w:t xml:space="preserve">Problem</w:t>
+      </w:r>
+    </w:p>
+    <w:p>
+      <w:pPr>
+        <w:pStyle w:val="BodyText"/>
+      </w:pPr>
+      <w:r>
+        <w:t xml:space="preserve">Your lighting uses more energy than LED bulbs would. Halogen and incandescent light bulbs use 5-8x more energy than LEDs. This requires significantly more electricity and costs a lot.</w:t>
+      </w:r>
+    </w:p>
+    <w:p>
+      <w:pPr>
+        <w:pStyle w:val="BodyText"/>
+      </w:pPr>
+      <w:r>
+        <w:rPr>
+          <w:i/>
+          <w:iCs/>
+        </w:rPr>
+        <w:t xml:space="preserve">Recommendation</w:t>
+      </w:r>
+    </w:p>
+    <w:p>
+      <w:pPr>
+        <w:pStyle w:val="BodyText"/>
+      </w:pPr>
+      <w:r>
+        <w:t xml:space="preserve">Switch your light bulbs to LED light bulbs. LEDs use 80% less energy than incandescent light bulbs which can significantly reduce your electricity bill.</w:t>
+      </w:r>
+    </w:p>
+    <w:p>
+      <w:pPr>
+        <w:pStyle w:val="BodyText"/>
+      </w:pPr>
+      <w:r>
+        <w:rPr>
+          <w:i/>
+          <w:iCs/>
+        </w:rPr>
+        <w:t xml:space="preserve">Estimated Cost/Benefits/Incentives</w:t>
+      </w:r>
+    </w:p>
+    <w:p>
+      <w:pPr>
+        <w:pStyle w:val="BodyText"/>
+      </w:pPr>
+      <w:r>
+        <w:t xml:space="preserve">We provide free LED light bulbs; contact us for some if we did not give you any during the audit. Depending on usage, LEDs can save more than $50 a year.</w:t>
+      </w:r>
+    </w:p>
+    <w:bookmarkEnd w:id="43"/>
+    <w:bookmarkStart w:id="44" w:name="window-dressers"/>
+    <w:p>
+      <w:pPr>
+        <w:pStyle w:val="Heading3"/>
+      </w:pPr>
+      <w:r>
+        <w:t xml:space="preserve">4.3 Window Dressers</w:t>
+      </w:r>
+    </w:p>
+    <w:p>
+      <w:pPr>
+        <w:pStyle w:val="FirstParagraph"/>
+      </w:pPr>
+      <w:r>
+        <w:rPr>
+          <w:i/>
+          <w:iCs/>
+        </w:rPr>
+        <w:t xml:space="preserve">Problem</w:t>
+      </w:r>
+    </w:p>
+    <w:p>
+      <w:pPr>
+        <w:pStyle w:val="BodyText"/>
+      </w:pPr>
+      <w:r>
+        <w:t xml:space="preserve">Your windows are a source of heat loss, reduce your comfort due to cold surface temperatures, and may also cause moisture condensation or frost in the winter.</w:t>
+      </w:r>
+    </w:p>
+    <w:p>
+      <w:pPr>
+        <w:pStyle w:val="BodyText"/>
+      </w:pPr>
+      <w:r>
+        <w:rPr>
+          <w:i/>
+          <w:iCs/>
+        </w:rPr>
+        <w:t xml:space="preserve">Recommendation</w:t>
+      </w:r>
+    </w:p>
+    <w:p>
+      <w:pPr>
+        <w:pStyle w:val="BodyText"/>
+      </w:pPr>
+      <w:r>
+        <w:t xml:space="preserve">WindowDressers are insulating window inserts that help air-seal windows and reduce heat loss and gain. WindowDressers are transparent and let in light while stopping drafts. Each insert is made of a custom-made pine frame wrapped on each side with tightly sealed, clear polyolefin film, creating an airspace between the two layers for additional insulation. The insert is finished with a compressible foam weather seal. The foam allows enough give for the inserts to be easily slid into place in the fall and removed in the spring while holding firmly enough to provide a tight, friction-based seal. The inserts are installed inside your existing window frame with no fasteners required and last 5-10 years. They are most effective in the winter, but depending on the window’s exposure, they can sometimes be used in the summer to keep the house cooler.</w:t>
+      </w:r>
+      <w:r>
+        <w:t xml:space="preserve"> </w:t>
+      </w:r>
+      <w:r>
+        <w:rPr>
+          <w:i/>
+          <w:iCs/>
+        </w:rPr>
+        <w:t xml:space="preserve">Estimated Cost/Benefits/Incentives</w:t>
+      </w:r>
+    </w:p>
+    <w:p>
+      <w:pPr>
+        <w:pStyle w:val="BodyText"/>
+      </w:pPr>
+      <w:r>
         <w:rPr>
           <w:b/>
           <w:bCs/>
         </w:rPr>
-        <w:t xml:space="preserve">Auditor to describe</w:t>
-      </w:r>
-    </w:p>
-    <w:p>
-      <w:pPr>
-        <w:pStyle w:val="BodyText"/>
+        <w:t xml:space="preserve">Reconsider this recommendation</w:t>
+      </w:r>
+    </w:p>
+    <w:bookmarkEnd w:id="44"/>
+    <w:bookmarkStart w:id="45" w:name="bathroom-exhaust-fans"/>
+    <w:p>
+      <w:pPr>
+        <w:pStyle w:val="Heading3"/>
+      </w:pPr>
+      <w:r>
+        <w:t xml:space="preserve">4.4 Bathroom exhaust fan(s)</w:t>
+      </w:r>
+    </w:p>
+    <w:p>
+      <w:pPr>
+        <w:pStyle w:val="FirstParagraph"/>
       </w:pPr>
       <w:r>
         <w:rPr>
           <w:i/>
           <w:iCs/>
         </w:rPr>
-        <w:t xml:space="preserve">Recommendation</w:t>
+        <w:t xml:space="preserve">Problem</w:t>
       </w:r>
     </w:p>
     <w:p>
@@ -3677,7 +3954,7 @@
         <w:pStyle w:val="BodyText"/>
       </w:pPr>
       <w:r>
-        <w:t xml:space="preserve">Have the furnace/boiler and flue inspected and adjusted by a licensed professional. This should be available from your fuel delivery company.</w:t>
+        <w:t xml:space="preserve">Currently, there is no bathroom exhaust fan, so moisture from the shower, toilet, and sink remains in the house, which can cause moisture issues such as mold.</w:t>
       </w:r>
     </w:p>
     <w:p>
@@ -3689,7 +3966,7 @@
           <w:i/>
           <w:iCs/>
         </w:rPr>
-        <w:t xml:space="preserve">Estimated Cost/Benefits/Incentives</w:t>
+        <w:t xml:space="preserve">Recommendation</w:t>
       </w:r>
     </w:p>
     <w:p>
@@ -3697,29 +3974,19 @@
         <w:pStyle w:val="BodyText"/>
       </w:pPr>
       <w:r>
-        <w:t xml:space="preserve">A tune-up can improve the efficiency of your furnace/boiler, confirm that it is exhausting properly, and identify areas of concern before they become urgent. If you have a service contract with your fuel delivery company, an annual tune-up is usually included.</w:t>
-      </w:r>
-    </w:p>
-    <w:bookmarkEnd w:id="42"/>
-    <w:bookmarkStart w:id="43" w:name="high-efficiency-shower-heads"/>
-    <w:p>
-      <w:pPr>
-        <w:pStyle w:val="Heading3"/>
-      </w:pPr>
-      <w:r>
-        <w:t xml:space="preserve">4.2 High efficiency shower head(s)</w:t>
-      </w:r>
-    </w:p>
-    <w:p>
-      <w:pPr>
-        <w:pStyle w:val="FirstParagraph"/>
+        <w:t xml:space="preserve">Install bathroom exhaust fans in all bathrooms that do not have them. These should be rated for at least 80 cubic feet per minute (CFM) if there is a shower. We recommend the Panasonic Whisper series or similar fans that don’t create excess noise. If the ductwork will run through the attic, it should be installed before the attic is air-sealed and insulated. The fan needs to be ducted outside, so it does not add moisture into the attic.</w:t>
+      </w:r>
+    </w:p>
+    <w:p>
+      <w:pPr>
+        <w:pStyle w:val="BodyText"/>
       </w:pPr>
       <w:r>
         <w:rPr>
           <w:i/>
           <w:iCs/>
         </w:rPr>
-        <w:t xml:space="preserve">Problem</w:t>
+        <w:t xml:space="preserve">Estimated Cost/Benefits/Incentives</w:t>
       </w:r>
     </w:p>
     <w:p>
@@ -3727,19 +3994,29 @@
         <w:pStyle w:val="BodyText"/>
       </w:pPr>
       <w:r>
-        <w:t xml:space="preserve">Your shower heads use more water and energy than high-efficiency shower heads, thus costing you more money than necessary. Older shower heads use 2.5 gallons or more every minute, which wastes thousands of gallons of water each year and costs you money for every extra gallon of water heated.</w:t>
-      </w:r>
-    </w:p>
-    <w:p>
-      <w:pPr>
-        <w:pStyle w:val="BodyText"/>
+        <w:t xml:space="preserve">The typical fan is around $130 plus the cost of installation.</w:t>
+      </w:r>
+    </w:p>
+    <w:bookmarkEnd w:id="45"/>
+    <w:bookmarkStart w:id="46" w:name="kitchen-exhaust-fans"/>
+    <w:p>
+      <w:pPr>
+        <w:pStyle w:val="Heading3"/>
+      </w:pPr>
+      <w:r>
+        <w:t xml:space="preserve">4.5 Kitchen exhaust fan(s)</w:t>
+      </w:r>
+    </w:p>
+    <w:p>
+      <w:pPr>
+        <w:pStyle w:val="FirstParagraph"/>
       </w:pPr>
       <w:r>
         <w:rPr>
           <w:i/>
           <w:iCs/>
         </w:rPr>
-        <w:t xml:space="preserve">Recommendation</w:t>
+        <w:t xml:space="preserve">Problem</w:t>
       </w:r>
     </w:p>
     <w:p>
@@ -3747,17 +4024,19 @@
         <w:pStyle w:val="BodyText"/>
       </w:pPr>
       <w:r>
-        <w:t xml:space="preserve">Install high-efficiency shower heads to reduce the amount of water and energy to heat the water used when showering. We recommend 1.5 gallon per minute shower heads that will save a gallon or more of water for every minute spent in the shower.</w:t>
-      </w:r>
-      <w:r>
-        <w:t xml:space="preserve"> </w:t>
-      </w:r>
+        <w:t xml:space="preserve">Currently, there is no kitchen exhaust fan, so fumes, smoke, and moisture from cooking stay in the house which can cause health concerns.</w:t>
+      </w:r>
+    </w:p>
+    <w:p>
+      <w:pPr>
+        <w:pStyle w:val="BodyText"/>
+      </w:pPr>
       <w:r>
         <w:rPr>
           <w:i/>
           <w:iCs/>
         </w:rPr>
-        <w:t xml:space="preserve">Estimated Cost/Benefits/Incentives</w:t>
+        <w:t xml:space="preserve">Recommendation</w:t>
       </w:r>
     </w:p>
     <w:p>
@@ -3765,29 +4044,19 @@
         <w:pStyle w:val="BodyText"/>
       </w:pPr>
       <w:r>
-        <w:t xml:space="preserve">A typical family will save ~10,000 gallons of water per year and over $100 per year in water heating costs. We provide these for free and have several styles for you to choose from; contact us for some if we did not give you any during the audit.</w:t>
-      </w:r>
-    </w:p>
-    <w:bookmarkEnd w:id="43"/>
-    <w:bookmarkStart w:id="44" w:name="leds"/>
-    <w:p>
-      <w:pPr>
-        <w:pStyle w:val="Heading3"/>
-      </w:pPr>
-      <w:r>
-        <w:t xml:space="preserve">4.3 LEDs</w:t>
-      </w:r>
-    </w:p>
-    <w:p>
-      <w:pPr>
-        <w:pStyle w:val="FirstParagraph"/>
+        <w:t xml:space="preserve">Install a kitchen exhaust fan to remove cooking fumes and moisture from your home. The fan should be rated for at least 100 cubic feet per minute. A kitchen fan should be ducted to the outdoors. If the ductwork will run through the attic, it should be installed before the attic is air-sealed and insulated.</w:t>
+      </w:r>
+    </w:p>
+    <w:p>
+      <w:pPr>
+        <w:pStyle w:val="BodyText"/>
       </w:pPr>
       <w:r>
         <w:rPr>
           <w:i/>
           <w:iCs/>
         </w:rPr>
-        <w:t xml:space="preserve">Problem</w:t>
+        <w:t xml:space="preserve">Estimated Cost/Benefits/Incentives</w:t>
       </w:r>
     </w:p>
     <w:p>
@@ -3795,19 +4064,29 @@
         <w:pStyle w:val="BodyText"/>
       </w:pPr>
       <w:r>
-        <w:t xml:space="preserve">Your lighting uses more energy than LED bulbs would. Halogen and incandescent light bulbs use 5-8x more energy than LEDs. This requires significantly more electricity and costs a lot.</w:t>
-      </w:r>
-    </w:p>
-    <w:p>
-      <w:pPr>
-        <w:pStyle w:val="BodyText"/>
+        <w:t xml:space="preserve">Kitchen range hoods typically cost $150 or more; installation costs depend on the complexity of the exhaust ducting.</w:t>
+      </w:r>
+    </w:p>
+    <w:bookmarkEnd w:id="46"/>
+    <w:bookmarkStart w:id="47" w:name="vapor-barrier"/>
+    <w:p>
+      <w:pPr>
+        <w:pStyle w:val="Heading3"/>
+      </w:pPr>
+      <w:r>
+        <w:t xml:space="preserve">4.6 Vapor Barrier</w:t>
+      </w:r>
+    </w:p>
+    <w:p>
+      <w:pPr>
+        <w:pStyle w:val="FirstParagraph"/>
       </w:pPr>
       <w:r>
         <w:rPr>
           <w:i/>
           <w:iCs/>
         </w:rPr>
-        <w:t xml:space="preserve">Recommendation</w:t>
+        <w:t xml:space="preserve">Problem</w:t>
       </w:r>
     </w:p>
     <w:p>
@@ -3815,7 +4094,7 @@
         <w:pStyle w:val="BodyText"/>
       </w:pPr>
       <w:r>
-        <w:t xml:space="preserve">Switch your light bulbs to LED light bulbs. LEDs use 80% less energy than incandescent light bulbs which can significantly reduce your electricity bill.</w:t>
+        <w:t xml:space="preserve">There is excess moisture in the basement/crawlspace, which is evaporating out of the ground. This moisture can enter the house and cause mold, mildew, rot, and air quality issues.</w:t>
       </w:r>
     </w:p>
     <w:p>
@@ -3827,7 +4106,7 @@
           <w:i/>
           <w:iCs/>
         </w:rPr>
-        <w:t xml:space="preserve">Estimated Cost/Benefits/Incentives</w:t>
+        <w:t xml:space="preserve">Recommendation</w:t>
       </w:r>
     </w:p>
     <w:p>
@@ -3835,29 +4114,31 @@
         <w:pStyle w:val="BodyText"/>
       </w:pPr>
       <w:r>
-        <w:t xml:space="preserve">We provide free LED light bulbs; contact us for some if we did not give you any during the audit. Depending on usage, LEDs can save more than $50 a year.</w:t>
-      </w:r>
-    </w:p>
-    <w:bookmarkEnd w:id="44"/>
-    <w:bookmarkStart w:id="45" w:name="window-dressers"/>
-    <w:p>
-      <w:pPr>
-        <w:pStyle w:val="Heading3"/>
-      </w:pPr>
-      <w:r>
-        <w:t xml:space="preserve">4.4 Window Dressers</w:t>
-      </w:r>
-    </w:p>
-    <w:p>
-      <w:pPr>
-        <w:pStyle w:val="FirstParagraph"/>
+        <w:t xml:space="preserve">Install a vapor barrier on the basement floor to stop moisture from entering the basement and house. Vapor barriers typically consist of either reinforced plastic sheeting or EPDM rubber membrane over a</w:t>
+      </w:r>
+      <w:r>
+        <w:t xml:space="preserve"> </w:t>
+      </w:r>
+      <w:r>
+        <w:t xml:space="preserve">‘dimple mat’</w:t>
+      </w:r>
+      <w:r>
+        <w:t xml:space="preserve"> </w:t>
+      </w:r>
+      <w:r>
+        <w:t xml:space="preserve">that allows for drainage below the vapor barrier and prevents rocks from puncturing it. If the basement/crawlspace walls are going to be spray foamed, we recommend the foam go all the way to the floor and overlap the vapor barrier to create a continuous air and moisture barrier.</w:t>
+      </w:r>
+    </w:p>
+    <w:p>
+      <w:pPr>
+        <w:pStyle w:val="BodyText"/>
       </w:pPr>
       <w:r>
         <w:rPr>
           <w:i/>
           <w:iCs/>
         </w:rPr>
-        <w:t xml:space="preserve">Problem</w:t>
+        <w:t xml:space="preserve">Estimated Cost/Benefits/Incentives</w:t>
       </w:r>
     </w:p>
     <w:p>
@@ -3865,19 +4146,29 @@
         <w:pStyle w:val="BodyText"/>
       </w:pPr>
       <w:r>
-        <w:t xml:space="preserve">Your windows are a source of heat loss, reduce your comfort due to cold surface temperatures, and may also cause moisture condensation or frost in the winter.</w:t>
-      </w:r>
-    </w:p>
-    <w:p>
-      <w:pPr>
-        <w:pStyle w:val="BodyText"/>
+        <w:t xml:space="preserve">Insulation projects are not eligible for federal or state funding in second homes that are not heated year round.</w:t>
+      </w:r>
+    </w:p>
+    <w:bookmarkEnd w:id="47"/>
+    <w:bookmarkStart w:id="48" w:name="spray-foam-basement-walls"/>
+    <w:p>
+      <w:pPr>
+        <w:pStyle w:val="Heading3"/>
+      </w:pPr>
+      <w:r>
+        <w:t xml:space="preserve">4.7 Spray foam Basement Walls</w:t>
+      </w:r>
+    </w:p>
+    <w:p>
+      <w:pPr>
+        <w:pStyle w:val="FirstParagraph"/>
       </w:pPr>
       <w:r>
         <w:rPr>
           <w:i/>
           <w:iCs/>
         </w:rPr>
-        <w:t xml:space="preserve">Recommendation</w:t>
+        <w:t xml:space="preserve">Problem</w:t>
       </w:r>
     </w:p>
     <w:p>
@@ -3885,17 +4176,19 @@
         <w:pStyle w:val="BodyText"/>
       </w:pPr>
       <w:r>
-        <w:t xml:space="preserve">WindowDressers are insulating window inserts that help air-seal windows and reduce heat loss and gain. WindowDressers are transparent and let in light while stopping drafts. Each insert is made of a custom-made pine frame wrapped on each side with tightly sealed, clear polyolefin film, creating an airspace between the two layers for additional insulation. The insert is finished with a compressible foam weather seal. The foam allows enough give for the inserts to be easily slid into place in the fall and removed in the spring while holding firmly enough to provide a tight, friction-based seal. The inserts are installed inside your existing window frame with no fasteners required and last 5-10 years. They are most effective in the winter, but depending on the window’s exposure, they can sometimes be used in the summer to keep the house cooler.</w:t>
-      </w:r>
-      <w:r>
-        <w:t xml:space="preserve"> </w:t>
-      </w:r>
+        <w:t xml:space="preserve">The basement/crawlspace is uninsulated and used for mechanical equipment and plumbing. The walls are porous and allow moisture into the house and rapidly conduct heat out of the space.</w:t>
+      </w:r>
+    </w:p>
+    <w:p>
+      <w:pPr>
+        <w:pStyle w:val="BodyText"/>
+      </w:pPr>
       <w:r>
         <w:rPr>
           <w:i/>
           <w:iCs/>
         </w:rPr>
-        <w:t xml:space="preserve">Estimated Cost/Benefits/Incentives</w:t>
+        <w:t xml:space="preserve">Recommendation</w:t>
       </w:r>
     </w:p>
     <w:p>
@@ -3903,7 +4196,16 @@
         <w:pStyle w:val="BodyText"/>
       </w:pPr>
       <w:r>
-        <w:t xml:space="preserve">Insulating window inserts save 5-10% of your heating costs at less than 1/10th the cost of replacement windows. The overall project cost will depend on the number and size of window inserts. Example prices for the 2024 season were: small (20 x 36”) - $36 for natural pine frame, $46 for white; medium (30 x 52”) - $50 for natural pine frame, $64 for white; large (44 x 68”) - $67 for natural pine frame, $88 for white. Adjusted pricing for lower-income households is available from WindowDressers upon request. If plastic is damaged, it can be replaced for $15.</w:t>
+        <w:t xml:space="preserve">Install spray foam on the basement/crawlspace walls to prevent moisture infiltration and reduce heat loss. In older homes, most heat loss is due to air leakage. Air sealing is particularly important in the basement or crawlspace (and attic). As warm air rises and leaks out the top of your home, cold air is pulled in at the bottom. This is called the</w:t>
+      </w:r>
+      <w:r>
+        <w:t xml:space="preserve"> </w:t>
+      </w:r>
+      <w:r>
+        <w:t xml:space="preserve">‘stack effect’</w:t>
+      </w:r>
+      <w:r>
+        <w:t xml:space="preserve">, and is more pronounced in taller homes. Thus, air sealing is necessary anywhere gaps allow air to move into your house through the basement/crawlspace.</w:t>
       </w:r>
     </w:p>
     <w:p>
@@ -3911,49 +4213,19 @@
         <w:pStyle w:val="BodyText"/>
       </w:pPr>
       <w:r>
-        <w:t xml:space="preserve">Households that order inserts are expected to participate in the Community Build where the inserts are made. You can sign up for a 4-hour shift and learn the simple steps in the insert-building process (no previous experience required, no power tools). Each job has</w:t>
-      </w:r>
-      <w:r>
-        <w:t xml:space="preserve"> </w:t>
-      </w:r>
-      <w:r>
-        <w:t xml:space="preserve">“jigs”</w:t>
-      </w:r>
-      <w:r>
-        <w:t xml:space="preserve"> </w:t>
-      </w:r>
-      <w:r>
-        <w:t xml:space="preserve">that make the job easier to do and ensure uniform quality. You will be trained at the beginning of your shift on how to do your task. Volunteering for multiple shifts is encouraged! Mid-shift snacks and a meal are provided to all participants.</w:t>
+        <w:t xml:space="preserve">Spray foam should be applied 2-3 inches thick on the walls to seal and insulate them. It is often ideal to install a vapor barrier at the same time as the spray foam insulation. Spray foam generally requires a layer of intumescent (fire-rated) paint over it to meet fire code.</w:t>
       </w:r>
     </w:p>
     <w:p>
       <w:pPr>
         <w:pStyle w:val="BodyText"/>
-      </w:pPr>
-      <w:r>
-        <w:t xml:space="preserve">If you would like to participate, please contact us so we can discuss how the program works and which windows you’d like inserts for.</w:t>
-      </w:r>
-    </w:p>
-    <w:bookmarkEnd w:id="45"/>
-    <w:bookmarkStart w:id="46" w:name="heat-pump-water-heater"/>
-    <w:p>
-      <w:pPr>
-        <w:pStyle w:val="Heading3"/>
-      </w:pPr>
-      <w:r>
-        <w:t xml:space="preserve">4.5 Heat Pump Water Heater</w:t>
-      </w:r>
-    </w:p>
-    <w:p>
-      <w:pPr>
-        <w:pStyle w:val="FirstParagraph"/>
       </w:pPr>
       <w:r>
         <w:rPr>
           <w:i/>
           <w:iCs/>
         </w:rPr>
-        <w:t xml:space="preserve">Problem</w:t>
+        <w:t xml:space="preserve">Estimated Cost/Benefits/Incentives</w:t>
       </w:r>
     </w:p>
     <w:p>
@@ -3961,23 +4233,29 @@
         <w:pStyle w:val="BodyText"/>
       </w:pPr>
       <w:r>
-        <w:rPr>
-          <w:b/>
-          <w:bCs/>
-        </w:rPr>
-        <w:t xml:space="preserve">Auditor to describe depending on what their current system is</w:t>
-      </w:r>
-    </w:p>
-    <w:p>
-      <w:pPr>
-        <w:pStyle w:val="BodyText"/>
+        <w:t xml:space="preserve">Insulation projects are not eligible for federal or state funding in second homes that are not heated year round.</w:t>
+      </w:r>
+    </w:p>
+    <w:bookmarkEnd w:id="48"/>
+    <w:bookmarkStart w:id="49" w:name="attic-insulation-and-air-sealing"/>
+    <w:p>
+      <w:pPr>
+        <w:pStyle w:val="Heading3"/>
+      </w:pPr>
+      <w:r>
+        <w:t xml:space="preserve">4.8 Attic Insulation and Air Sealing</w:t>
+      </w:r>
+    </w:p>
+    <w:p>
+      <w:pPr>
+        <w:pStyle w:val="FirstParagraph"/>
       </w:pPr>
       <w:r>
         <w:rPr>
           <w:i/>
           <w:iCs/>
         </w:rPr>
-        <w:t xml:space="preserve">Recommendation</w:t>
+        <w:t xml:space="preserve">Problem</w:t>
       </w:r>
     </w:p>
     <w:p>
@@ -3985,7 +4263,7 @@
         <w:pStyle w:val="BodyText"/>
       </w:pPr>
       <w:r>
-        <w:t xml:space="preserve">Install a heat pump water heater to provide your hot water for cooking and bathing. This is the most efficient way to heat water and will save hundreds of dollars a year compared to electric resistance, heating oil, or propane hot water. It will also help to dehumidify while it’s running. If your current water heater burns oil or propane, this will also remove a source of combustion gases from your home. We also recommend setting the temperature on the water heater at 130°F for more efficient operation.</w:t>
+        <w:t xml:space="preserve">The attic is uninsulated or is missing insulation and the attic could also benefit from air-sealing. These upgrades will reduce draftiness and heat loss in the winter and heat gain in the summer.</w:t>
       </w:r>
     </w:p>
     <w:p>
@@ -3997,7 +4275,7 @@
           <w:i/>
           <w:iCs/>
         </w:rPr>
-        <w:t xml:space="preserve">Estimated Cost/Benefits/Incentives</w:t>
+        <w:t xml:space="preserve">Recommendation</w:t>
       </w:r>
     </w:p>
     <w:p>
@@ -4005,29 +4283,36 @@
         <w:pStyle w:val="BodyText"/>
       </w:pPr>
       <w:r>
-        <w:t xml:space="preserve">A heat pump water heater uses 70% less electricity than a standard electric water heater. Efficiency Maine offers a rebate of up to $950, making the equipment cost as little as $400 plus installation. The rebate can be combined with a nonrefundable federal tax credit of 30% of the remaining cost of the unit and labor, subject to an annual maximum benefit of $2,000 (shared with other energy property, like heat pumps). For more information, you can call Efficiency Maine at 866-376-2463 (Monday to Friday, 8:00 am to 5:00 pm) or visit their website: https://www.efficiencymaine.com/at-home/heat-pump-water-heater-program/</w:t>
-      </w:r>
-    </w:p>
-    <w:bookmarkEnd w:id="46"/>
-    <w:bookmarkStart w:id="47" w:name="gutters"/>
-    <w:p>
-      <w:pPr>
-        <w:pStyle w:val="Heading3"/>
-      </w:pPr>
-      <w:r>
-        <w:t xml:space="preserve">4.6 Gutters</w:t>
-      </w:r>
-    </w:p>
-    <w:p>
-      <w:pPr>
-        <w:pStyle w:val="FirstParagraph"/>
+        <w:t xml:space="preserve">Air seal the attic and insulate it to at least R-60 (18 inches of loose-fill cellulose insulation). COA has been installing 24 inches (R-80) of cellulose insulation in attics on our campus. Before the attic is insulated, ensure that any needed bathroom and kitchen fans are installed and that all fans are properly vented to the outside.</w:t>
+      </w:r>
+    </w:p>
+    <w:p>
+      <w:pPr>
+        <w:pStyle w:val="BodyText"/>
+      </w:pPr>
+      <w:r>
+        <w:t xml:space="preserve">In older homes, most heat loss is due to air leakage. Air sealing is particularly important in the attic (and basement or crawlspace). As warm air rises and leaks out the top of your home, cold air is pulled in at the bottom. This is called the</w:t>
+      </w:r>
+      <w:r>
+        <w:t xml:space="preserve"> </w:t>
+      </w:r>
+      <w:r>
+        <w:t xml:space="preserve">‘stack effect’</w:t>
+      </w:r>
+      <w:r>
+        <w:t xml:space="preserve">, and is more pronounced in taller homes. Thus, air sealing is necessary anywhere gaps allow air to move between your house and the attic. This typically includes gaps around the chimney, electrical penetrations, and wall top plates.</w:t>
+      </w:r>
+    </w:p>
+    <w:p>
+      <w:pPr>
+        <w:pStyle w:val="BodyText"/>
       </w:pPr>
       <w:r>
         <w:rPr>
           <w:i/>
           <w:iCs/>
         </w:rPr>
-        <w:t xml:space="preserve">Problem</w:t>
+        <w:t xml:space="preserve">Estimated Cost/Benefits/Incentives</w:t>
       </w:r>
     </w:p>
     <w:p>
@@ -4035,19 +4320,29 @@
         <w:pStyle w:val="BodyText"/>
       </w:pPr>
       <w:r>
-        <w:t xml:space="preserve">The house has no gutters, so water runs off your roof and directly onto the ground next to your house. Water that splashes off the ground can damage the exterior of your house. Runoff that is absorbed into the ground can seep into the basement/crawlspace, causing moisture issues there and throughout your house.</w:t>
-      </w:r>
-    </w:p>
-    <w:p>
-      <w:pPr>
-        <w:pStyle w:val="BodyText"/>
+        <w:t xml:space="preserve">Insulation projects are not eligible for federal or state funding in second homes that are not heated year round.</w:t>
+      </w:r>
+    </w:p>
+    <w:bookmarkEnd w:id="49"/>
+    <w:bookmarkStart w:id="50" w:name="blow-in-cellulose-wall-insulation"/>
+    <w:p>
+      <w:pPr>
+        <w:pStyle w:val="Heading3"/>
+      </w:pPr>
+      <w:r>
+        <w:t xml:space="preserve">4.9 Blow-in cellulose wall insulation</w:t>
+      </w:r>
+    </w:p>
+    <w:p>
+      <w:pPr>
+        <w:pStyle w:val="FirstParagraph"/>
       </w:pPr>
       <w:r>
         <w:rPr>
           <w:i/>
           <w:iCs/>
         </w:rPr>
-        <w:t xml:space="preserve">Recommendation</w:t>
+        <w:t xml:space="preserve">Problem</w:t>
       </w:r>
     </w:p>
     <w:p>
@@ -4055,7 +4350,7 @@
         <w:pStyle w:val="BodyText"/>
       </w:pPr>
       <w:r>
-        <w:t xml:space="preserve">Install gutters and downspouts that divert water at least six feet away from the foundation and to where the ground slopes away from the house.</w:t>
+        <w:t xml:space="preserve">The walls of the house are uninsulated, which is a significant source of heat loss.</w:t>
       </w:r>
     </w:p>
     <w:p>
@@ -4067,7 +4362,7 @@
           <w:i/>
           <w:iCs/>
         </w:rPr>
-        <w:t xml:space="preserve">Estimated Cost/Benefits/Incentives</w:t>
+        <w:t xml:space="preserve">Recommendation</w:t>
       </w:r>
     </w:p>
     <w:p>
@@ -4075,29 +4370,17 @@
         <w:pStyle w:val="BodyText"/>
       </w:pPr>
       <w:r>
-        <w:t xml:space="preserve">Adding gutters would mitigate moisture damage and save you from having to replace/fix other parts of the house.</w:t>
-      </w:r>
-    </w:p>
-    <w:bookmarkEnd w:id="47"/>
-    <w:bookmarkStart w:id="48" w:name="bathroom-exhaust-fans"/>
-    <w:p>
-      <w:pPr>
-        <w:pStyle w:val="Heading3"/>
-      </w:pPr>
-      <w:r>
-        <w:t xml:space="preserve">4.7 Bathroom exhaust fan(s)</w:t>
-      </w:r>
-    </w:p>
-    <w:p>
-      <w:pPr>
-        <w:pStyle w:val="FirstParagraph"/>
-      </w:pPr>
+        <w:t xml:space="preserve">Insulate the wall stud cavities with dense packed, blown-in cellulose insulation. In balloon-framed homes, this can often be done from the attic, otherwise it can be done by drilling holes into the wall cavities from either the inside or outside.</w:t>
+      </w:r>
+      <w:r>
+        <w:t xml:space="preserve"> </w:t>
+      </w:r>
       <w:r>
         <w:rPr>
           <w:i/>
           <w:iCs/>
         </w:rPr>
-        <w:t xml:space="preserve">Problem</w:t>
+        <w:t xml:space="preserve">Estimated Cost/Benefits/Incentives</w:t>
       </w:r>
     </w:p>
     <w:p>
@@ -4105,19 +4388,29 @@
         <w:pStyle w:val="BodyText"/>
       </w:pPr>
       <w:r>
-        <w:t xml:space="preserve">Currently, there is no bathroom exhaust fan, so moisture from the shower, toilet, and sink remains in the house, which can cause moisture issues such as mold.</w:t>
-      </w:r>
-    </w:p>
-    <w:p>
-      <w:pPr>
-        <w:pStyle w:val="BodyText"/>
+        <w:t xml:space="preserve">Insulation projects are not eligible for federal or state funding in second homes that are not heated year round.</w:t>
+      </w:r>
+    </w:p>
+    <w:bookmarkEnd w:id="50"/>
+    <w:bookmarkStart w:id="51" w:name="continuous-exterior-wall-insulation"/>
+    <w:p>
+      <w:pPr>
+        <w:pStyle w:val="Heading3"/>
+      </w:pPr>
+      <w:r>
+        <w:t xml:space="preserve">4.10 Continuous exterior wall insulation</w:t>
+      </w:r>
+    </w:p>
+    <w:p>
+      <w:pPr>
+        <w:pStyle w:val="FirstParagraph"/>
       </w:pPr>
       <w:r>
         <w:rPr>
           <w:i/>
           <w:iCs/>
         </w:rPr>
-        <w:t xml:space="preserve">Recommendation</w:t>
+        <w:t xml:space="preserve">Problem</w:t>
       </w:r>
     </w:p>
     <w:p>
@@ -4125,7 +4418,7 @@
         <w:pStyle w:val="BodyText"/>
       </w:pPr>
       <w:r>
-        <w:t xml:space="preserve">Install bathroom exhaust fans in all bathrooms that do not have them. These should be rated for at least 80 cubic feet per minute (CFM) if there is a shower. We recommend the Panasonic Whisper series or similar fans that don’t create excess noise. If the ductwork will run through the attic, it should be installed before the attic is air-sealed and insulated. The fan needs to be ducted outside, so it does not add moisture into the attic.</w:t>
+        <w:t xml:space="preserve">There isn’t continuous insulation between the siding and the exterior walls of the house. Continuous insulation helps create a complete thermal boundary for your house, and it is now an energy code requirement for new houses.</w:t>
       </w:r>
     </w:p>
     <w:p>
@@ -4137,7 +4430,7 @@
           <w:i/>
           <w:iCs/>
         </w:rPr>
-        <w:t xml:space="preserve">Estimated Cost/Benefits/Incentives</w:t>
+        <w:t xml:space="preserve">Recommendation</w:t>
       </w:r>
     </w:p>
     <w:p>
@@ -4145,29 +4438,19 @@
         <w:pStyle w:val="BodyText"/>
       </w:pPr>
       <w:r>
-        <w:t xml:space="preserve">The typical fan is around $130 plus the cost of installation.</w:t>
-      </w:r>
-    </w:p>
-    <w:bookmarkEnd w:id="48"/>
-    <w:bookmarkStart w:id="49" w:name="kitchen-exhaust-fans"/>
-    <w:p>
-      <w:pPr>
-        <w:pStyle w:val="Heading3"/>
-      </w:pPr>
-      <w:r>
-        <w:t xml:space="preserve">4.8 Kitchen exhaust fan(s)</w:t>
-      </w:r>
-    </w:p>
-    <w:p>
-      <w:pPr>
-        <w:pStyle w:val="FirstParagraph"/>
+        <w:t xml:space="preserve">Add a continuous layer of insulation and potentially replace the air and moisture barrier once it becomes time to replace the siding. Add continuous insulation (R-6 or more) under the new siding to keep the house warmer in the winter and cooler in the summer. We recommend TimberHP TimberBoard insulation (produced in Madison, Maine) or Rockwool Comfortboard, but foam board can also be used. Before installing exterior insulation, the contractor can check if insulation is needed between the interior wall studs.</w:t>
+      </w:r>
+    </w:p>
+    <w:p>
+      <w:pPr>
+        <w:pStyle w:val="BodyText"/>
       </w:pPr>
       <w:r>
         <w:rPr>
           <w:i/>
           <w:iCs/>
         </w:rPr>
-        <w:t xml:space="preserve">Problem</w:t>
+        <w:t xml:space="preserve">Estimated Cost/Benefits/Incentives</w:t>
       </w:r>
     </w:p>
     <w:p>
@@ -4175,19 +4458,29 @@
         <w:pStyle w:val="BodyText"/>
       </w:pPr>
       <w:r>
-        <w:t xml:space="preserve">Currently, there is no kitchen exhaust fan, so fumes, smoke, and moisture from cooking stay in the house which can cause health concerns.</w:t>
-      </w:r>
-    </w:p>
-    <w:p>
-      <w:pPr>
-        <w:pStyle w:val="BodyText"/>
+        <w:t xml:space="preserve">Insulation projects are not eligible for federal or state funding in second homes that are not heated year round.</w:t>
+      </w:r>
+    </w:p>
+    <w:bookmarkEnd w:id="51"/>
+    <w:bookmarkStart w:id="52" w:name="air-source-heat-pump"/>
+    <w:p>
+      <w:pPr>
+        <w:pStyle w:val="Heading3"/>
+      </w:pPr>
+      <w:r>
+        <w:t xml:space="preserve">4.11 Air Source Heat Pump</w:t>
+      </w:r>
+    </w:p>
+    <w:p>
+      <w:pPr>
+        <w:pStyle w:val="FirstParagraph"/>
       </w:pPr>
       <w:r>
         <w:rPr>
           <w:i/>
           <w:iCs/>
         </w:rPr>
-        <w:t xml:space="preserve">Recommendation</w:t>
+        <w:t xml:space="preserve">Problem</w:t>
       </w:r>
     </w:p>
     <w:p>
@@ -4195,7 +4488,7 @@
         <w:pStyle w:val="BodyText"/>
       </w:pPr>
       <w:r>
-        <w:t xml:space="preserve">Install a kitchen exhaust fan to remove cooking fumes and moisture from your home. The fan should be rated for at least 100 cubic feet per minute. A kitchen fan should be ducted to the outdoors. If the ductwork will run through the attic, it should be installed before the attic is air-sealed and insulated.</w:t>
+        <w:t xml:space="preserve">Combustion heating equipment is expensive, inefficient, and has the potential to release harmful combustion gases like carbon monoxide into the home.</w:t>
       </w:r>
     </w:p>
     <w:p>
@@ -4207,7 +4500,7 @@
           <w:i/>
           <w:iCs/>
         </w:rPr>
-        <w:t xml:space="preserve">Estimated Cost/Benefits/Incentives</w:t>
+        <w:t xml:space="preserve">Recommendation</w:t>
       </w:r>
     </w:p>
     <w:p>
@@ -4215,29 +4508,19 @@
         <w:pStyle w:val="BodyText"/>
       </w:pPr>
       <w:r>
-        <w:t xml:space="preserve">Kitchen range hoods typically cost $150 or more; installation costs depend on the complexity of the exhaust ducting.</w:t>
-      </w:r>
-    </w:p>
-    <w:bookmarkEnd w:id="49"/>
-    <w:bookmarkStart w:id="50" w:name="vapor-barrier"/>
-    <w:p>
-      <w:pPr>
-        <w:pStyle w:val="Heading3"/>
-      </w:pPr>
-      <w:r>
-        <w:t xml:space="preserve">4.9 Vapor Barrier</w:t>
-      </w:r>
-    </w:p>
-    <w:p>
-      <w:pPr>
-        <w:pStyle w:val="FirstParagraph"/>
+        <w:t xml:space="preserve">Install air source heat pumps for heating and cooling and whole-house surge protection. Air source heat pumps can be up to 300% efficient and heat, cool, and dehumidify your house. A qualified installer will help determine what size system to install and where. Whole-house surge protection will protect your appliances and heat pumps from being damaged by an electrical surge.</w:t>
+      </w:r>
+    </w:p>
+    <w:p>
+      <w:pPr>
+        <w:pStyle w:val="BodyText"/>
       </w:pPr>
       <w:r>
         <w:rPr>
           <w:i/>
           <w:iCs/>
         </w:rPr>
-        <w:t xml:space="preserve">Problem</w:t>
+        <w:t xml:space="preserve">Estimated Cost/Benefits/Incentives</w:t>
       </w:r>
     </w:p>
     <w:p>
@@ -4245,19 +4528,29 @@
         <w:pStyle w:val="BodyText"/>
       </w:pPr>
       <w:r>
-        <w:t xml:space="preserve">There is excess moisture in the basement/crawlspace, which is evaporating out of the ground. This moisture can enter the house and cause mold, mildew, rot, and air quality issues.</w:t>
-      </w:r>
-    </w:p>
-    <w:p>
-      <w:pPr>
-        <w:pStyle w:val="BodyText"/>
+        <w:t xml:space="preserve">Efficiency Maine rebates can fund $1,000 per unit up to a lifetime limit per housing unit for $3,000 (depending on income level) to install heat pumps in second homes. The rebate can be combined with a nonrefundable federal tax credit of 30% of the remaining cost of the unit and labor, subject to an annual maximum benefit of $2,000 (shared with other energy property, like a heat pump water heater). You can call Efficiency Maine at 866-376-2463 (Monday to Friday, 8:00 am to 5:00 pm) or visit their website: https://www.efficiencymaine.com/at-home/residential-heat-pump-incentives/</w:t>
+      </w:r>
+    </w:p>
+    <w:bookmarkEnd w:id="52"/>
+    <w:bookmarkStart w:id="53" w:name="pipe-insulation"/>
+    <w:p>
+      <w:pPr>
+        <w:pStyle w:val="Heading3"/>
+      </w:pPr>
+      <w:r>
+        <w:t xml:space="preserve">4.12 Pipe Insulation</w:t>
+      </w:r>
+    </w:p>
+    <w:p>
+      <w:pPr>
+        <w:pStyle w:val="FirstParagraph"/>
       </w:pPr>
       <w:r>
         <w:rPr>
           <w:i/>
           <w:iCs/>
         </w:rPr>
-        <w:t xml:space="preserve">Recommendation</w:t>
+        <w:t xml:space="preserve">Problem</w:t>
       </w:r>
     </w:p>
     <w:p>
@@ -4265,19 +4558,7 @@
         <w:pStyle w:val="BodyText"/>
       </w:pPr>
       <w:r>
-        <w:t xml:space="preserve">Install a vapor barrier on the basement floor to stop moisture from entering the basement and house. Vapor barriers typically consist of either reinforced plastic sheeting or EPDM rubber membrane over a</w:t>
-      </w:r>
-      <w:r>
-        <w:t xml:space="preserve"> </w:t>
-      </w:r>
-      <w:r>
-        <w:t xml:space="preserve">‘dimple mat’</w:t>
-      </w:r>
-      <w:r>
-        <w:t xml:space="preserve"> </w:t>
-      </w:r>
-      <w:r>
-        <w:t xml:space="preserve">that allows for drainage below the vapor barrier and prevents rocks from puncturing it. If the basement/crawlspace walls are going to be spray foamed, we recommend the foam go all the way to the floor and overlap the vapor barrier to create a continuous air and moisture barrier.</w:t>
+        <w:t xml:space="preserve">Uninsulated water pipes are responsible for heat loss and excess moisture (from condensation) in your basement/crawlspace.</w:t>
       </w:r>
     </w:p>
     <w:p>
@@ -4289,7 +4570,7 @@
           <w:i/>
           <w:iCs/>
         </w:rPr>
-        <w:t xml:space="preserve">Estimated Cost/Benefits/Incentives</w:t>
+        <w:t xml:space="preserve">Recommendation</w:t>
       </w:r>
     </w:p>
     <w:p>
@@ -4297,29 +4578,19 @@
         <w:pStyle w:val="BodyText"/>
       </w:pPr>
       <w:r>
-        <w:t xml:space="preserve">Efficiency Maine rebates will cover vapor barriers up to 25% of a weatherization project cost, if done as part of a larger insulation project. Most insulation companies can install spray foam and vapor barriers together. Efficiency Maine rebates and other incentives for insulation work can fund up to 80% of the overall cost to weatherize your home (subject to a lifetime limit per building), up to $9,200 when combined with nonrefundable federal tax credits. You can call them at 866-376-2463 (Monday to Friday, 8:00 am to 5:00 pm) or visit their webpage about insulation rebates: https://www.efficiencymaine.com/at-home/insulation-rebates/</w:t>
-      </w:r>
-    </w:p>
-    <w:bookmarkEnd w:id="50"/>
-    <w:bookmarkStart w:id="51" w:name="spray-foam-basement-walls"/>
-    <w:p>
-      <w:pPr>
-        <w:pStyle w:val="Heading3"/>
-      </w:pPr>
-      <w:r>
-        <w:t xml:space="preserve">4.10 Spray foam Basement Walls</w:t>
-      </w:r>
-    </w:p>
-    <w:p>
-      <w:pPr>
-        <w:pStyle w:val="FirstParagraph"/>
+        <w:t xml:space="preserve">Insulate both hot and cold water pipes that are uninsulated in the basement/crawlspace. This will save energy and prevent condensation. We recommend foam pipe insulation made of polyethylene or neoprene.</w:t>
+      </w:r>
+    </w:p>
+    <w:p>
+      <w:pPr>
+        <w:pStyle w:val="BodyText"/>
       </w:pPr>
       <w:r>
         <w:rPr>
           <w:i/>
           <w:iCs/>
         </w:rPr>
-        <w:t xml:space="preserve">Problem</w:t>
+        <w:t xml:space="preserve">Estimated Cost/Benefits/Incentives</w:t>
       </w:r>
     </w:p>
     <w:p>
@@ -4327,7 +4598,586 @@
         <w:pStyle w:val="BodyText"/>
       </w:pPr>
       <w:r>
-        <w:t xml:space="preserve">The basement/crawlspace is uninsulated and used for mechanical equipment and plumbing. The walls are porous and allow moisture into the house and rapidly conduct heat out of the space.</w:t>
+        <w:t xml:space="preserve">Insulating water pipes can save 2%-4% on hot water bills and increase the temperature of the water while reducing the time it takes for hot water to reach your tap. Materials cost around $100-200, depending on the length of pipe to insulate. Many people find this to be an easy project to do themselves.</w:t>
+      </w:r>
+    </w:p>
+    <w:p>
+      <w:pPr>
+        <w:pStyle w:val="SourceCode"/>
+      </w:pPr>
+      <w:r>
+        <w:rPr>
+          <w:rStyle w:val="NormalTok"/>
+        </w:rPr>
+        <w:t xml:space="preserve"> </w:t>
+      </w:r>
+      <w:r>
+        <w:rPr>
+          <w:rStyle w:val="CommentTok"/>
+        </w:rPr>
+        <w:t xml:space="preserve">#| label: other 3 recommendation</w:t>
+      </w:r>
+      <w:r>
+        <w:br/>
+      </w:r>
+      <w:r>
+        <w:rPr>
+          <w:rStyle w:val="NormalTok"/>
+        </w:rPr>
+        <w:t xml:space="preserve"> </w:t>
+      </w:r>
+      <w:r>
+        <w:rPr>
+          <w:rStyle w:val="CommentTok"/>
+        </w:rPr>
+        <w:t xml:space="preserve">#| echo: false</w:t>
+      </w:r>
+      <w:r>
+        <w:br/>
+      </w:r>
+      <w:r>
+        <w:rPr>
+          <w:rStyle w:val="NormalTok"/>
+        </w:rPr>
+        <w:t xml:space="preserve"> </w:t>
+      </w:r>
+      <w:r>
+        <w:rPr>
+          <w:rStyle w:val="CommentTok"/>
+        </w:rPr>
+        <w:t xml:space="preserve">#| results: asis</w:t>
+      </w:r>
+      <w:r>
+        <w:br/>
+      </w:r>
+      <w:r>
+        <w:br/>
+      </w:r>
+      <w:r>
+        <w:br/>
+      </w:r>
+      <w:r>
+        <w:rPr>
+          <w:rStyle w:val="ControlFlowTok"/>
+        </w:rPr>
+        <w:t xml:space="preserve">if</w:t>
+      </w:r>
+      <w:r>
+        <w:rPr>
+          <w:rStyle w:val="NormalTok"/>
+        </w:rPr>
+        <w:t xml:space="preserve">( other_3 </w:t>
+      </w:r>
+      <w:r>
+        <w:rPr>
+          <w:rStyle w:val="SpecialCharTok"/>
+        </w:rPr>
+        <w:t xml:space="preserve">==</w:t>
+      </w:r>
+      <w:r>
+        <w:rPr>
+          <w:rStyle w:val="NormalTok"/>
+        </w:rPr>
+        <w:t xml:space="preserve"> </w:t>
+      </w:r>
+      <w:r>
+        <w:rPr>
+          <w:rStyle w:val="ConstantTok"/>
+        </w:rPr>
+        <w:t xml:space="preserve">TRUE</w:t>
+      </w:r>
+      <w:r>
+        <w:rPr>
+          <w:rStyle w:val="NormalTok"/>
+        </w:rPr>
+        <w:t xml:space="preserve">){</w:t>
+      </w:r>
+      <w:r>
+        <w:br/>
+      </w:r>
+      <w:r>
+        <w:rPr>
+          <w:rStyle w:val="NormalTok"/>
+        </w:rPr>
+        <w:t xml:space="preserve">  </w:t>
+      </w:r>
+      <w:r>
+        <w:rPr>
+          <w:rStyle w:val="FunctionTok"/>
+        </w:rPr>
+        <w:t xml:space="preserve">cat</w:t>
+      </w:r>
+      <w:r>
+        <w:rPr>
+          <w:rStyle w:val="NormalTok"/>
+        </w:rPr>
+        <w:t xml:space="preserve">(</w:t>
+      </w:r>
+      <w:r>
+        <w:rPr>
+          <w:rStyle w:val="StringTok"/>
+        </w:rPr>
+        <w:t xml:space="preserve">"### Other 3</w:t>
+      </w:r>
+      <w:r>
+        <w:br/>
+      </w:r>
+      <w:r>
+        <w:rPr>
+          <w:rStyle w:val="StringTok"/>
+        </w:rPr>
+        <w:t xml:space="preserve">  </w:t>
+      </w:r>
+      <w:r>
+        <w:br/>
+      </w:r>
+      <w:r>
+        <w:rPr>
+          <w:rStyle w:val="StringTok"/>
+        </w:rPr>
+        <w:t xml:space="preserve">*Problem*</w:t>
+      </w:r>
+      <w:r>
+        <w:br/>
+      </w:r>
+      <w:r>
+        <w:br/>
+      </w:r>
+      <w:r>
+        <w:rPr>
+          <w:rStyle w:val="StringTok"/>
+        </w:rPr>
+        <w:t xml:space="preserve">*Recommendation*</w:t>
+      </w:r>
+      <w:r>
+        <w:br/>
+      </w:r>
+      <w:r>
+        <w:br/>
+      </w:r>
+      <w:r>
+        <w:rPr>
+          <w:rStyle w:val="StringTok"/>
+        </w:rPr>
+        <w:t xml:space="preserve">"</w:t>
+      </w:r>
+      <w:r>
+        <w:rPr>
+          <w:rStyle w:val="NormalTok"/>
+        </w:rPr>
+        <w:t xml:space="preserve">)</w:t>
+      </w:r>
+      <w:r>
+        <w:br/>
+      </w:r>
+      <w:r>
+        <w:rPr>
+          <w:rStyle w:val="NormalTok"/>
+        </w:rPr>
+        <w:t xml:space="preserve">}</w:t>
+      </w:r>
+      <w:r>
+        <w:rPr>
+          <w:rStyle w:val="ControlFlowTok"/>
+        </w:rPr>
+        <w:t xml:space="preserve">else</w:t>
+      </w:r>
+      <w:r>
+        <w:rPr>
+          <w:rStyle w:val="NormalTok"/>
+        </w:rPr>
+        <w:t xml:space="preserve">{</w:t>
+      </w:r>
+      <w:r>
+        <w:br/>
+      </w:r>
+      <w:r>
+        <w:rPr>
+          <w:rStyle w:val="NormalTok"/>
+        </w:rPr>
+        <w:t xml:space="preserve">  </w:t>
+      </w:r>
+      <w:r>
+        <w:rPr>
+          <w:rStyle w:val="FunctionTok"/>
+        </w:rPr>
+        <w:t xml:space="preserve">cat</w:t>
+      </w:r>
+      <w:r>
+        <w:rPr>
+          <w:rStyle w:val="NormalTok"/>
+        </w:rPr>
+        <w:t xml:space="preserve">(</w:t>
+      </w:r>
+      <w:r>
+        <w:rPr>
+          <w:rStyle w:val="StringTok"/>
+        </w:rPr>
+        <w:t xml:space="preserve">""</w:t>
+      </w:r>
+      <w:r>
+        <w:rPr>
+          <w:rStyle w:val="NormalTok"/>
+        </w:rPr>
+        <w:t xml:space="preserve">)</w:t>
+      </w:r>
+      <w:r>
+        <w:br/>
+      </w:r>
+      <w:r>
+        <w:rPr>
+          <w:rStyle w:val="NormalTok"/>
+        </w:rPr>
+        <w:t xml:space="preserve">}</w:t>
+      </w:r>
+      <w:r>
+        <w:br/>
+      </w:r>
+      <w:r>
+        <w:br/>
+      </w:r>
+      <w:r>
+        <w:rPr>
+          <w:rStyle w:val="ControlFlowTok"/>
+        </w:rPr>
+        <w:t xml:space="preserve">if</w:t>
+      </w:r>
+      <w:r>
+        <w:rPr>
+          <w:rStyle w:val="NormalTok"/>
+        </w:rPr>
+        <w:t xml:space="preserve">(other_3 </w:t>
+      </w:r>
+      <w:r>
+        <w:rPr>
+          <w:rStyle w:val="SpecialCharTok"/>
+        </w:rPr>
+        <w:t xml:space="preserve">==</w:t>
+      </w:r>
+      <w:r>
+        <w:rPr>
+          <w:rStyle w:val="NormalTok"/>
+        </w:rPr>
+        <w:t xml:space="preserve"> </w:t>
+      </w:r>
+      <w:r>
+        <w:rPr>
+          <w:rStyle w:val="ConstantTok"/>
+        </w:rPr>
+        <w:t xml:space="preserve">TRUE</w:t>
+      </w:r>
+      <w:r>
+        <w:rPr>
+          <w:rStyle w:val="NormalTok"/>
+        </w:rPr>
+        <w:t xml:space="preserve">){</w:t>
+      </w:r>
+      <w:r>
+        <w:br/>
+      </w:r>
+      <w:r>
+        <w:rPr>
+          <w:rStyle w:val="NormalTok"/>
+        </w:rPr>
+        <w:t xml:space="preserve">  </w:t>
+      </w:r>
+      <w:r>
+        <w:rPr>
+          <w:rStyle w:val="FunctionTok"/>
+        </w:rPr>
+        <w:t xml:space="preserve">cat</w:t>
+      </w:r>
+      <w:r>
+        <w:rPr>
+          <w:rStyle w:val="NormalTok"/>
+        </w:rPr>
+        <w:t xml:space="preserve">(a_other_3</w:t>
+      </w:r>
+      <w:r>
+        <w:rPr>
+          <w:rStyle w:val="SpecialCharTok"/>
+        </w:rPr>
+        <w:t xml:space="preserve">$</w:t>
+      </w:r>
+      <w:r>
+        <w:rPr>
+          <w:rStyle w:val="NormalTok"/>
+        </w:rPr>
+        <w:t xml:space="preserve">Description</w:t>
+      </w:r>
+      <w:r>
+        <w:br/>
+      </w:r>
+      <w:r>
+        <w:rPr>
+          <w:rStyle w:val="NormalTok"/>
+        </w:rPr>
+        <w:t xml:space="preserve">    </w:t>
+      </w:r>
+      <w:r>
+        <w:br/>
+      </w:r>
+      <w:r>
+        <w:rPr>
+          <w:rStyle w:val="NormalTok"/>
+        </w:rPr>
+        <w:t xml:space="preserve">  )</w:t>
+      </w:r>
+      <w:r>
+        <w:br/>
+      </w:r>
+      <w:r>
+        <w:rPr>
+          <w:rStyle w:val="NormalTok"/>
+        </w:rPr>
+        <w:t xml:space="preserve">}</w:t>
+      </w:r>
+      <w:r>
+        <w:rPr>
+          <w:rStyle w:val="ControlFlowTok"/>
+        </w:rPr>
+        <w:t xml:space="preserve">else</w:t>
+      </w:r>
+      <w:r>
+        <w:rPr>
+          <w:rStyle w:val="NormalTok"/>
+        </w:rPr>
+        <w:t xml:space="preserve">{</w:t>
+      </w:r>
+      <w:r>
+        <w:br/>
+      </w:r>
+      <w:r>
+        <w:rPr>
+          <w:rStyle w:val="NormalTok"/>
+        </w:rPr>
+        <w:t xml:space="preserve">  </w:t>
+      </w:r>
+      <w:r>
+        <w:rPr>
+          <w:rStyle w:val="FunctionTok"/>
+        </w:rPr>
+        <w:t xml:space="preserve">cat</w:t>
+      </w:r>
+      <w:r>
+        <w:rPr>
+          <w:rStyle w:val="NormalTok"/>
+        </w:rPr>
+        <w:t xml:space="preserve">(</w:t>
+      </w:r>
+      <w:r>
+        <w:rPr>
+          <w:rStyle w:val="StringTok"/>
+        </w:rPr>
+        <w:t xml:space="preserve">""</w:t>
+      </w:r>
+      <w:r>
+        <w:rPr>
+          <w:rStyle w:val="NormalTok"/>
+        </w:rPr>
+        <w:t xml:space="preserve">)</w:t>
+      </w:r>
+      <w:r>
+        <w:br/>
+      </w:r>
+      <w:r>
+        <w:rPr>
+          <w:rStyle w:val="NormalTok"/>
+        </w:rPr>
+        <w:t xml:space="preserve">  }</w:t>
+      </w:r>
+      <w:r>
+        <w:br/>
+      </w:r>
+      <w:r>
+        <w:br/>
+      </w:r>
+      <w:r>
+        <w:rPr>
+          <w:rStyle w:val="ControlFlowTok"/>
+        </w:rPr>
+        <w:t xml:space="preserve">if</w:t>
+      </w:r>
+      <w:r>
+        <w:rPr>
+          <w:rStyle w:val="NormalTok"/>
+        </w:rPr>
+        <w:t xml:space="preserve">(other_3 </w:t>
+      </w:r>
+      <w:r>
+        <w:rPr>
+          <w:rStyle w:val="SpecialCharTok"/>
+        </w:rPr>
+        <w:t xml:space="preserve">==</w:t>
+      </w:r>
+      <w:r>
+        <w:rPr>
+          <w:rStyle w:val="NormalTok"/>
+        </w:rPr>
+        <w:t xml:space="preserve"> </w:t>
+      </w:r>
+      <w:r>
+        <w:rPr>
+          <w:rStyle w:val="ConstantTok"/>
+        </w:rPr>
+        <w:t xml:space="preserve">TRUE</w:t>
+      </w:r>
+      <w:r>
+        <w:rPr>
+          <w:rStyle w:val="NormalTok"/>
+        </w:rPr>
+        <w:t xml:space="preserve">){</w:t>
+      </w:r>
+      <w:r>
+        <w:br/>
+      </w:r>
+      <w:r>
+        <w:rPr>
+          <w:rStyle w:val="NormalTok"/>
+        </w:rPr>
+        <w:t xml:space="preserve">  </w:t>
+      </w:r>
+      <w:r>
+        <w:rPr>
+          <w:rStyle w:val="FunctionTok"/>
+        </w:rPr>
+        <w:t xml:space="preserve">cat</w:t>
+      </w:r>
+      <w:r>
+        <w:rPr>
+          <w:rStyle w:val="NormalTok"/>
+        </w:rPr>
+        <w:t xml:space="preserve">(</w:t>
+      </w:r>
+      <w:r>
+        <w:rPr>
+          <w:rStyle w:val="StringTok"/>
+        </w:rPr>
+        <w:t xml:space="preserve">"</w:t>
+      </w:r>
+      <w:r>
+        <w:br/>
+      </w:r>
+      <w:r>
+        <w:br/>
+      </w:r>
+      <w:r>
+        <w:rPr>
+          <w:rStyle w:val="StringTok"/>
+        </w:rPr>
+        <w:t xml:space="preserve">*Estimated Cost/Benefits/Incentives*</w:t>
+      </w:r>
+      <w:r>
+        <w:br/>
+      </w:r>
+      <w:r>
+        <w:br/>
+      </w:r>
+      <w:r>
+        <w:rPr>
+          <w:rStyle w:val="StringTok"/>
+        </w:rPr>
+        <w:t xml:space="preserve">"</w:t>
+      </w:r>
+      <w:r>
+        <w:rPr>
+          <w:rStyle w:val="NormalTok"/>
+        </w:rPr>
+        <w:t xml:space="preserve">, auto_other_3_estimates</w:t>
+      </w:r>
+      <w:r>
+        <w:rPr>
+          <w:rStyle w:val="SpecialCharTok"/>
+        </w:rPr>
+        <w:t xml:space="preserve">$</w:t>
+      </w:r>
+      <w:r>
+        <w:rPr>
+          <w:rStyle w:val="NormalTok"/>
+        </w:rPr>
+        <w:t xml:space="preserve">Description)</w:t>
+      </w:r>
+      <w:r>
+        <w:br/>
+      </w:r>
+      <w:r>
+        <w:rPr>
+          <w:rStyle w:val="NormalTok"/>
+        </w:rPr>
+        <w:t xml:space="preserve">}</w:t>
+      </w:r>
+      <w:r>
+        <w:rPr>
+          <w:rStyle w:val="ControlFlowTok"/>
+        </w:rPr>
+        <w:t xml:space="preserve">else</w:t>
+      </w:r>
+      <w:r>
+        <w:rPr>
+          <w:rStyle w:val="NormalTok"/>
+        </w:rPr>
+        <w:t xml:space="preserve">{</w:t>
+      </w:r>
+      <w:r>
+        <w:br/>
+      </w:r>
+      <w:r>
+        <w:rPr>
+          <w:rStyle w:val="NormalTok"/>
+        </w:rPr>
+        <w:t xml:space="preserve">  </w:t>
+      </w:r>
+      <w:r>
+        <w:rPr>
+          <w:rStyle w:val="FunctionTok"/>
+        </w:rPr>
+        <w:t xml:space="preserve">cat</w:t>
+      </w:r>
+      <w:r>
+        <w:rPr>
+          <w:rStyle w:val="NormalTok"/>
+        </w:rPr>
+        <w:t xml:space="preserve">(</w:t>
+      </w:r>
+      <w:r>
+        <w:rPr>
+          <w:rStyle w:val="StringTok"/>
+        </w:rPr>
+        <w:t xml:space="preserve">""</w:t>
+      </w:r>
+      <w:r>
+        <w:rPr>
+          <w:rStyle w:val="NormalTok"/>
+        </w:rPr>
+        <w:t xml:space="preserve">)</w:t>
+      </w:r>
+      <w:r>
+        <w:br/>
+      </w:r>
+      <w:r>
+        <w:rPr>
+          <w:rStyle w:val="NormalTok"/>
+        </w:rPr>
+        <w:t xml:space="preserve">  } </w:t>
+      </w:r>
+    </w:p>
+    <w:bookmarkEnd w:id="53"/>
+    <w:bookmarkEnd w:id="54"/>
+    <w:bookmarkStart w:id="55" w:name="additional-resources"/>
+    <w:p>
+      <w:pPr>
+        <w:pStyle w:val="Heading2"/>
+      </w:pPr>
+      <w:r>
+        <w:t xml:space="preserve">5 Additional Resources</w:t>
+      </w:r>
+    </w:p>
+    <w:p>
+      <w:pPr>
+        <w:pStyle w:val="FirstParagraph"/>
+      </w:pPr>
+      <w:r>
+        <w:t xml:space="preserve">Many home efficiency upgrades are eligible for Efficiency Maine rebates and federal tax credits. Financial incentives vary based on income level and type of occupancy. An overview of all state rebates and federal tax credits can be found here: https://www.efficiencymaine.com/at-home/.</w:t>
       </w:r>
     </w:p>
     <w:p>
@@ -4335,11 +5185,7 @@
         <w:pStyle w:val="BodyText"/>
       </w:pPr>
       <w:r>
-        <w:rPr>
-          <w:i/>
-          <w:iCs/>
-        </w:rPr>
-        <w:t xml:space="preserve">Recommendation</w:t>
+        <w:t xml:space="preserve">You can search for Efficiency Maine registered contractors here: https://www.efficiencymaine.com/at-home/vendor-locator/.</w:t>
       </w:r>
     </w:p>
     <w:p>
@@ -4347,1301 +5193,160 @@
         <w:pStyle w:val="BodyText"/>
       </w:pPr>
       <w:r>
-        <w:t xml:space="preserve">Install spray foam on the basement/crawlspace walls to prevent moisture infiltration and reduce heat loss. In older homes, most heat loss is due to air leakage. Air sealing is particularly important in the basement or crawlspace (and attic). As warm air rises and leaks out the top of your home, cold air is pulled in at the bottom. This is called the</w:t>
+        <w:t xml:space="preserve">We recommend discussing a whole-home plan for insulation and air sealing work in the basement, walls, and attic with contractors to determine how to best sequence the work to take full advantage of the Efficiency Maine rebates (which are subject to lifetime maximums) and nonrefundable federal tax credits (which are subject to annual maximums).</w:t>
+      </w:r>
+    </w:p>
+    <w:bookmarkEnd w:id="55"/>
+    <w:bookmarkStart w:id="68" w:name="section-four-tests"/>
+    <w:p>
+      <w:pPr>
+        <w:pStyle w:val="Heading2"/>
+      </w:pPr>
+      <w:r>
+        <w:t xml:space="preserve">6 Section Four Tests</w:t>
+      </w:r>
+    </w:p>
+    <w:bookmarkStart w:id="56" w:name="high-efficiency-shower-heads-1"/>
+    <w:p>
+      <w:pPr>
+        <w:pStyle w:val="Heading3"/>
+      </w:pPr>
+      <w:r>
+        <w:t xml:space="preserve">6.1 High-efficiency Shower Head(s)</w:t>
+      </w:r>
+    </w:p>
+    <w:bookmarkEnd w:id="56"/>
+    <w:bookmarkStart w:id="57" w:name="leds-1"/>
+    <w:p>
+      <w:pPr>
+        <w:pStyle w:val="Heading3"/>
+      </w:pPr>
+      <w:r>
+        <w:t xml:space="preserve">6.2 LEDs</w:t>
+      </w:r>
+    </w:p>
+    <w:bookmarkEnd w:id="57"/>
+    <w:bookmarkStart w:id="58" w:name="windowdressers"/>
+    <w:p>
+      <w:pPr>
+        <w:pStyle w:val="Heading3"/>
+      </w:pPr>
+      <w:r>
+        <w:t xml:space="preserve">6.3 WindowDressers</w:t>
+      </w:r>
+    </w:p>
+    <w:bookmarkEnd w:id="58"/>
+    <w:bookmarkStart w:id="59" w:name="bathroom-exhaust-fans-1"/>
+    <w:p>
+      <w:pPr>
+        <w:pStyle w:val="Heading3"/>
+      </w:pPr>
+      <w:r>
+        <w:t xml:space="preserve">6.4 Bathroom Exhaust Fan(s)</w:t>
+      </w:r>
+    </w:p>
+    <w:bookmarkEnd w:id="59"/>
+    <w:bookmarkStart w:id="60" w:name="kitchen-exhaust-fan"/>
+    <w:p>
+      <w:pPr>
+        <w:pStyle w:val="Heading3"/>
+      </w:pPr>
+      <w:r>
+        <w:t xml:space="preserve">6.5 Kitchen Exhaust Fan</w:t>
+      </w:r>
+    </w:p>
+    <w:bookmarkEnd w:id="60"/>
+    <w:bookmarkStart w:id="61" w:name="vapor-barrier-1"/>
+    <w:p>
+      <w:pPr>
+        <w:pStyle w:val="Heading3"/>
+      </w:pPr>
+      <w:r>
+        <w:t xml:space="preserve">6.6 Vapor Barrier</w:t>
+      </w:r>
+    </w:p>
+    <w:bookmarkEnd w:id="61"/>
+    <w:bookmarkStart w:id="62" w:name="spray-foam-basementcrawlspace-walls"/>
+    <w:p>
+      <w:pPr>
+        <w:pStyle w:val="Heading3"/>
+      </w:pPr>
+      <w:r>
+        <w:t xml:space="preserve">6.7 Spray Foam Basement/Crawlspace Walls</w:t>
+      </w:r>
+    </w:p>
+    <w:bookmarkEnd w:id="62"/>
+    <w:bookmarkStart w:id="63" w:name="attic-air-sealing-and-insulation"/>
+    <w:p>
+      <w:pPr>
+        <w:pStyle w:val="Heading3"/>
+      </w:pPr>
+      <w:r>
+        <w:t xml:space="preserve">6.8 Attic Air Sealing and Insulation</w:t>
+      </w:r>
+    </w:p>
+    <w:bookmarkEnd w:id="63"/>
+    <w:bookmarkStart w:id="64" w:name="blown-in-cellulose-wall-insulation"/>
+    <w:p>
+      <w:pPr>
+        <w:pStyle w:val="Heading3"/>
+      </w:pPr>
+      <w:r>
+        <w:t xml:space="preserve">6.9 Blown-in Cellulose Wall Insulation</w:t>
+      </w:r>
+    </w:p>
+    <w:bookmarkEnd w:id="64"/>
+    <w:bookmarkStart w:id="65" w:name="continuous-exterior-wall-insulation-1"/>
+    <w:p>
+      <w:pPr>
+        <w:pStyle w:val="Heading3"/>
+      </w:pPr>
+      <w:r>
+        <w:t xml:space="preserve">6.10 Continuous Exterior Wall Insulation</w:t>
+      </w:r>
+    </w:p>
+    <w:bookmarkEnd w:id="65"/>
+    <w:bookmarkStart w:id="66" w:name="air-source-heat-pump-1"/>
+    <w:p>
+      <w:pPr>
+        <w:pStyle w:val="Heading3"/>
+      </w:pPr>
+      <w:r>
+        <w:t xml:space="preserve">6.11 Air Source Heat Pump</w:t>
+      </w:r>
+    </w:p>
+    <w:bookmarkEnd w:id="66"/>
+    <w:bookmarkStart w:id="67" w:name="pipe-insulation-1"/>
+    <w:p>
+      <w:pPr>
+        <w:pStyle w:val="Heading3"/>
+      </w:pPr>
+      <w:r>
+        <w:t xml:space="preserve">6.12 Pipe Insulation</w:t>
+      </w:r>
+    </w:p>
+    <w:p>
+      <w:pPr>
+        <w:pStyle w:val="FirstParagraph"/>
+      </w:pPr>
+      <w:r>
+        <w:t xml:space="preserve">[1]</w:t>
       </w:r>
       <w:r>
         <w:t xml:space="preserve"> </w:t>
       </w:r>
       <w:r>
-        <w:t xml:space="preserve">‘stack effect’</w:t>
-      </w:r>
-      <w:r>
-        <w:t xml:space="preserve">, and is more pronounced in taller homes. Thus, air sealing is necessary anywhere gaps allow air to move into your house through the basement/crawlspace.</w:t>
-      </w:r>
-    </w:p>
-    <w:p>
-      <w:pPr>
-        <w:pStyle w:val="BodyText"/>
-      </w:pPr>
-      <w:r>
-        <w:t xml:space="preserve">Spray foam should be applied 2-3 inches thick on the walls to seal and insulate them. It is often ideal to install a vapor barrier at the same time as the spray foam insulation. Spray foam generally requires a layer of intumescent (fire-rated) paint over it to meet fire code.</w:t>
-      </w:r>
-    </w:p>
-    <w:p>
-      <w:pPr>
-        <w:pStyle w:val="BodyText"/>
-      </w:pPr>
-      <w:r>
-        <w:rPr>
-          <w:i/>
-          <w:iCs/>
-        </w:rPr>
-        <w:t xml:space="preserve">Estimated Cost/Benefits/Incentives</w:t>
-      </w:r>
-    </w:p>
-    <w:p>
-      <w:pPr>
-        <w:pStyle w:val="BodyText"/>
-      </w:pPr>
-      <w:r>
-        <w:t xml:space="preserve">Installation of spray foam insulation will cost around $5-7 per square foot. Efficiency Maine rebates and other incentives for insulation work can fund up to 80% of the project cost (subject to a lifetime limit per building), up to $9,200 when combined with nonrefundable federal tax credits. You can call them at 866-376-2463 (Monday to Friday, 8:00 am to 5:00 pm) or visit their webpage about insulation rebates: https://www.efficiencymaine.com/at-home/insulation-rebates/</w:t>
-      </w:r>
-    </w:p>
-    <w:bookmarkEnd w:id="51"/>
-    <w:bookmarkStart w:id="52" w:name="attic-insulation-and-air-sealing"/>
-    <w:p>
-      <w:pPr>
-        <w:pStyle w:val="Heading3"/>
-      </w:pPr>
-      <w:r>
-        <w:t xml:space="preserve">4.11 Attic Insulation and Air Sealing</w:t>
-      </w:r>
-    </w:p>
-    <w:p>
-      <w:pPr>
-        <w:pStyle w:val="FirstParagraph"/>
-      </w:pPr>
-      <w:r>
-        <w:rPr>
-          <w:i/>
-          <w:iCs/>
-        </w:rPr>
-        <w:t xml:space="preserve">Problem</w:t>
-      </w:r>
-    </w:p>
-    <w:p>
-      <w:pPr>
-        <w:pStyle w:val="BodyText"/>
-      </w:pPr>
-      <w:r>
-        <w:t xml:space="preserve">The attic is uninsulated or is missing insulation and the attic could also benefit from air-sealing. These upgrades will reduce draftiness and heat loss in the winter and heat gain in the summer.</w:t>
-      </w:r>
-    </w:p>
-    <w:p>
-      <w:pPr>
-        <w:pStyle w:val="BodyText"/>
-      </w:pPr>
-      <w:r>
-        <w:rPr>
-          <w:i/>
-          <w:iCs/>
-        </w:rPr>
-        <w:t xml:space="preserve">Recommendation</w:t>
-      </w:r>
-    </w:p>
-    <w:p>
-      <w:pPr>
-        <w:pStyle w:val="BodyText"/>
-      </w:pPr>
-      <w:r>
-        <w:t xml:space="preserve">Air seal the attic and insulate it to at least R-60 (18 inches of loose-fill cellulose insulation). COA has been installing 24 inches (R-80) of cellulose insulation in attics on our campus. Before the attic is insulated, ensure that any needed bathroom and kitchen fans are installed and that all fans are properly vented to the outside.</w:t>
-      </w:r>
-    </w:p>
-    <w:p>
-      <w:pPr>
-        <w:pStyle w:val="BodyText"/>
-      </w:pPr>
-      <w:r>
-        <w:t xml:space="preserve">In older homes, most heat loss is due to air leakage. Air sealing is particularly important in the attic (and basement or crawlspace). As warm air rises and leaks out the top of your home, cold air is pulled in at the bottom. This is called the</w:t>
-      </w:r>
-      <w:r>
-        <w:t xml:space="preserve"> </w:t>
-      </w:r>
-      <w:r>
-        <w:t xml:space="preserve">‘stack effect’</w:t>
-      </w:r>
-      <w:r>
-        <w:t xml:space="preserve">, and is more pronounced in taller homes. Thus, air sealing is necessary anywhere gaps allow air to move between your house and the attic. This typically includes gaps around the chimney, electrical penetrations, and wall top plates.</w:t>
-      </w:r>
-    </w:p>
-    <w:p>
-      <w:pPr>
-        <w:pStyle w:val="BodyText"/>
-      </w:pPr>
-      <w:r>
-        <w:rPr>
-          <w:i/>
-          <w:iCs/>
-        </w:rPr>
-        <w:t xml:space="preserve">Estimated Cost/Benefits/Incentives</w:t>
-      </w:r>
-    </w:p>
-    <w:p>
-      <w:pPr>
-        <w:pStyle w:val="BodyText"/>
-      </w:pPr>
-      <w:r>
-        <w:t xml:space="preserve">Efficiency Maine rebates and other incentives for insulation work can fund up to 80% of the overall cost to weatherize your home (subject to a lifetime limit per building), up to $9,200 when combined with nonrefundable federal tax credits. You can call them at 866-376-2463 (Monday to Friday, 8:00 am to 5:00 pm) or visit their webpage about insulation rebates: https://www.efficiencymaine.com/at-home/insulation-rebates/</w:t>
-      </w:r>
-    </w:p>
-    <w:bookmarkEnd w:id="52"/>
-    <w:bookmarkStart w:id="53" w:name="blow-in-cellulose-wall-insulation"/>
-    <w:p>
-      <w:pPr>
-        <w:pStyle w:val="Heading3"/>
-      </w:pPr>
-      <w:r>
-        <w:t xml:space="preserve">4.12 Blow-in cellulose wall insulation</w:t>
-      </w:r>
-    </w:p>
-    <w:p>
-      <w:pPr>
-        <w:pStyle w:val="FirstParagraph"/>
-      </w:pPr>
-      <w:r>
-        <w:rPr>
-          <w:i/>
-          <w:iCs/>
-        </w:rPr>
-        <w:t xml:space="preserve">Problem</w:t>
-      </w:r>
-    </w:p>
-    <w:p>
-      <w:pPr>
-        <w:pStyle w:val="BodyText"/>
-      </w:pPr>
-      <w:r>
-        <w:t xml:space="preserve">The walls of the house are uninsulated, which is a significant source of heat loss.</w:t>
-      </w:r>
-    </w:p>
-    <w:p>
-      <w:pPr>
-        <w:pStyle w:val="BodyText"/>
-      </w:pPr>
-      <w:r>
-        <w:rPr>
-          <w:i/>
-          <w:iCs/>
-        </w:rPr>
-        <w:t xml:space="preserve">Recommendation</w:t>
-      </w:r>
-    </w:p>
-    <w:p>
-      <w:pPr>
-        <w:pStyle w:val="BodyText"/>
-      </w:pPr>
-      <w:r>
-        <w:t xml:space="preserve">Insulate the wall stud cavities with dense packed, blown-in cellulose insulation. In balloon-framed homes, this can often be done from the attic, otherwise it can be done by drilling holes into the wall cavities from either the inside or outside.</w:t>
-      </w:r>
-      <w:r>
-        <w:t xml:space="preserve"> </w:t>
-      </w:r>
-      <w:r>
-        <w:rPr>
-          <w:i/>
-          <w:iCs/>
-        </w:rPr>
-        <w:t xml:space="preserve">Estimated Cost/Benefits/Incentives</w:t>
-      </w:r>
-    </w:p>
-    <w:p>
-      <w:pPr>
-        <w:pStyle w:val="BodyText"/>
-      </w:pPr>
-      <w:r>
-        <w:t xml:space="preserve">Efficiency Maine rebates and other incentives for insulation work can fund up to 80% of the overall cost to weatherize your home (subject to a lifetime limit per building), up to $9,200 when combined with nonrefundable federal tax credits. You can call them at 866-376-2463 (Monday to Friday, 8:00 am to 5:00 pm) or visit their webpage about insulation rebates: https://www.efficiencymaine.com/at-home/insulation-rebates/</w:t>
-      </w:r>
-    </w:p>
-    <w:bookmarkEnd w:id="53"/>
-    <w:bookmarkStart w:id="54" w:name="continuous-exterior-wall-insulation"/>
-    <w:p>
-      <w:pPr>
-        <w:pStyle w:val="Heading3"/>
-      </w:pPr>
-      <w:r>
-        <w:t xml:space="preserve">4.13 Continuous exterior wall insulation</w:t>
-      </w:r>
-    </w:p>
-    <w:p>
-      <w:pPr>
-        <w:pStyle w:val="FirstParagraph"/>
-      </w:pPr>
-      <w:r>
-        <w:rPr>
-          <w:i/>
-          <w:iCs/>
-        </w:rPr>
-        <w:t xml:space="preserve">Problem</w:t>
-      </w:r>
-    </w:p>
-    <w:p>
-      <w:pPr>
-        <w:pStyle w:val="BodyText"/>
-      </w:pPr>
-      <w:r>
-        <w:t xml:space="preserve">There isn’t continuous insulation between the siding and the exterior walls of the house. Continuous insulation helps create a complete thermal boundary for your house, and it is now an energy code requirement for new houses.</w:t>
-      </w:r>
-    </w:p>
-    <w:p>
-      <w:pPr>
-        <w:pStyle w:val="BodyText"/>
-      </w:pPr>
-      <w:r>
-        <w:rPr>
-          <w:i/>
-          <w:iCs/>
-        </w:rPr>
-        <w:t xml:space="preserve">Recommendation</w:t>
-      </w:r>
-    </w:p>
-    <w:p>
-      <w:pPr>
-        <w:pStyle w:val="BodyText"/>
-      </w:pPr>
-      <w:r>
-        <w:t xml:space="preserve">Add a continuous layer of insulation and potentially replace the air and moisture barrier once it becomes time to replace the siding. Add continuous insulation (R-6 or more) under the new siding to keep the house warmer in the winter and cooler in the summer. We recommend TimberHP TimberBoard insulation (produced in Madison, Maine) or Rockwool Comfortboard, but foam board can also be used. Before installing exterior insulation, the contractor can check if insulation is needed between the interior wall studs.</w:t>
-      </w:r>
-    </w:p>
-    <w:p>
-      <w:pPr>
-        <w:pStyle w:val="BodyText"/>
-      </w:pPr>
-      <w:r>
-        <w:rPr>
-          <w:i/>
-          <w:iCs/>
-        </w:rPr>
-        <w:t xml:space="preserve">Estimated Cost/Benefits/Incentives</w:t>
-      </w:r>
-    </w:p>
-    <w:p>
-      <w:pPr>
-        <w:pStyle w:val="BodyText"/>
-      </w:pPr>
-      <w:r>
-        <w:t xml:space="preserve">Efficiency Maine rebates and other incentives for insulation work can fund up to 80% of the overall cost to weatherize your home (subject to a lifetime limit per building), up to $9,200 when combined with nonrefundable federal tax credits. You can call them at 866-376-2463 (Monday to Friday, 8:00 am to 5:00 pm) or visit their webpage about insulation rebates: https://www.efficiencymaine.com/at-home/insulation-rebates/</w:t>
-      </w:r>
-    </w:p>
-    <w:bookmarkEnd w:id="54"/>
-    <w:bookmarkStart w:id="55" w:name="pipe-insulation"/>
-    <w:p>
-      <w:pPr>
-        <w:pStyle w:val="Heading3"/>
-      </w:pPr>
-      <w:r>
-        <w:t xml:space="preserve">4.14 Pipe Insulation</w:t>
-      </w:r>
-    </w:p>
-    <w:p>
-      <w:pPr>
-        <w:pStyle w:val="FirstParagraph"/>
-      </w:pPr>
-      <w:r>
-        <w:rPr>
-          <w:i/>
-          <w:iCs/>
-        </w:rPr>
-        <w:t xml:space="preserve">Problem</w:t>
-      </w:r>
-    </w:p>
-    <w:p>
-      <w:pPr>
-        <w:pStyle w:val="BodyText"/>
-      </w:pPr>
-      <w:r>
-        <w:t xml:space="preserve">Uninsulated water pipes are responsible for heat loss and excess moisture (from condensation) in your basement/crawlspace.</w:t>
-      </w:r>
-    </w:p>
-    <w:p>
-      <w:pPr>
-        <w:pStyle w:val="BodyText"/>
-      </w:pPr>
-      <w:r>
-        <w:rPr>
-          <w:i/>
-          <w:iCs/>
-        </w:rPr>
-        <w:t xml:space="preserve">Recommendation</w:t>
-      </w:r>
-    </w:p>
-    <w:p>
-      <w:pPr>
-        <w:pStyle w:val="BodyText"/>
-      </w:pPr>
-      <w:r>
-        <w:t xml:space="preserve">Insulate both hot and cold water pipes that are uninsulated in the basement/crawlspace. This will save energy and prevent condensation. We recommend foam pipe insulation made of polyethylene or neoprene.</w:t>
-      </w:r>
-    </w:p>
-    <w:p>
-      <w:pPr>
-        <w:pStyle w:val="BodyText"/>
-      </w:pPr>
-      <w:r>
-        <w:rPr>
-          <w:i/>
-          <w:iCs/>
-        </w:rPr>
-        <w:t xml:space="preserve">Estimated Cost/Benefits/Incentives</w:t>
-      </w:r>
-    </w:p>
-    <w:p>
-      <w:pPr>
-        <w:pStyle w:val="BodyText"/>
-      </w:pPr>
-      <w:r>
-        <w:t xml:space="preserve">Insulating water pipes can save 2%-4% on hot water bills and increase the temperature of the water while reducing the time it takes for hot water to reach your tap. Materials cost around $100-200, depending on the length of pipe to insulate. Many people find this to be an easy project to do themselves.</w:t>
-      </w:r>
-    </w:p>
-    <w:bookmarkEnd w:id="55"/>
-    <w:bookmarkStart w:id="56" w:name="diy-air-sealing"/>
-    <w:p>
-      <w:pPr>
-        <w:pStyle w:val="Heading3"/>
-      </w:pPr>
-      <w:r>
-        <w:t xml:space="preserve">4.15 DIY Air Sealing</w:t>
-      </w:r>
-    </w:p>
-    <w:p>
-      <w:pPr>
-        <w:pStyle w:val="FirstParagraph"/>
-      </w:pPr>
-      <w:r>
-        <w:rPr>
-          <w:i/>
-          <w:iCs/>
-        </w:rPr>
-        <w:t xml:space="preserve">Problem</w:t>
-      </w:r>
-    </w:p>
-    <w:p>
-      <w:pPr>
-        <w:pStyle w:val="BodyText"/>
-      </w:pPr>
-      <w:r>
-        <w:t xml:space="preserve">During the blower door test, we noted sources of air leakage in the living areas of your house.</w:t>
-      </w:r>
-    </w:p>
-    <w:p>
-      <w:pPr>
-        <w:pStyle w:val="BodyText"/>
-      </w:pPr>
-      <w:r>
-        <w:rPr>
-          <w:b/>
-          <w:bCs/>
-        </w:rPr>
-        <w:t xml:space="preserve">Auditor to detail customized findings.</w:t>
-      </w:r>
-      <w:r>
-        <w:rPr>
-          <w:b/>
-          <w:bCs/>
-        </w:rPr>
-        <w:t xml:space="preserve"> </w:t>
-      </w:r>
-    </w:p>
-    <w:p>
-      <w:pPr>
-        <w:pStyle w:val="BodyText"/>
-      </w:pPr>
-      <w:r>
-        <w:rPr>
-          <w:i/>
-          <w:iCs/>
-        </w:rPr>
-        <w:t xml:space="preserve">Recommendation</w:t>
-      </w:r>
-    </w:p>
-    <w:p>
-      <w:pPr>
-        <w:pStyle w:val="BodyText"/>
-      </w:pPr>
-      <w:r>
-        <w:t xml:space="preserve">Air sealing the air leaks we identified around the living areas of your house can be a DIY solution to lower energy use, or an insulation contractor can seal the leaks when they come to your house for a larger project. Please address any moisture concerns before undertaking significant air sealing efforts.</w:t>
-      </w:r>
-    </w:p>
-    <w:p>
-      <w:pPr>
-        <w:pStyle w:val="BodyText"/>
-      </w:pPr>
-      <w:r>
-        <w:rPr>
-          <w:i/>
-          <w:iCs/>
-        </w:rPr>
-        <w:t xml:space="preserve">Estimated Cost/Benefits/Incentives</w:t>
-      </w:r>
-    </w:p>
-    <w:p>
-      <w:pPr>
-        <w:pStyle w:val="BodyText"/>
-      </w:pPr>
-      <w:r>
-        <w:t xml:space="preserve">Air sealing and insulating ductwork is eligible for a non-refundable federal tax credit (</w:t>
-      </w:r>
-      <w:r>
-        <w:t xml:space="preserve">“Energy Efficient Home Improvement Credit”</w:t>
-      </w:r>
-      <w:r>
-        <w:t xml:space="preserve">), which can pay for 30% of the project cost, subject to an annual maximum of $1,200 (shared with other home envelope improvements, like attic and basement projects).</w:t>
-      </w:r>
-    </w:p>
-    <w:p>
-      <w:pPr>
-        <w:pStyle w:val="SourceCode"/>
-      </w:pPr>
-      <w:r>
-        <w:rPr>
-          <w:rStyle w:val="NormalTok"/>
-        </w:rPr>
-        <w:t xml:space="preserve"> </w:t>
-      </w:r>
-      <w:r>
-        <w:rPr>
-          <w:rStyle w:val="CommentTok"/>
-        </w:rPr>
-        <w:t xml:space="preserve">#| label: other 3 recommendation</w:t>
-      </w:r>
-      <w:r>
-        <w:br/>
-      </w:r>
-      <w:r>
-        <w:rPr>
-          <w:rStyle w:val="NormalTok"/>
-        </w:rPr>
-        <w:t xml:space="preserve"> </w:t>
-      </w:r>
-      <w:r>
-        <w:rPr>
-          <w:rStyle w:val="CommentTok"/>
-        </w:rPr>
-        <w:t xml:space="preserve">#| echo: false</w:t>
-      </w:r>
-      <w:r>
-        <w:br/>
-      </w:r>
-      <w:r>
-        <w:rPr>
-          <w:rStyle w:val="NormalTok"/>
-        </w:rPr>
-        <w:t xml:space="preserve"> </w:t>
-      </w:r>
-      <w:r>
-        <w:rPr>
-          <w:rStyle w:val="CommentTok"/>
-        </w:rPr>
-        <w:t xml:space="preserve">#| results: asis</w:t>
-      </w:r>
-      <w:r>
-        <w:br/>
-      </w:r>
-      <w:r>
-        <w:br/>
-      </w:r>
-      <w:r>
-        <w:br/>
-      </w:r>
-      <w:r>
-        <w:rPr>
-          <w:rStyle w:val="ControlFlowTok"/>
-        </w:rPr>
-        <w:t xml:space="preserve">if</w:t>
-      </w:r>
-      <w:r>
-        <w:rPr>
-          <w:rStyle w:val="NormalTok"/>
-        </w:rPr>
-        <w:t xml:space="preserve">( other_3 </w:t>
-      </w:r>
-      <w:r>
-        <w:rPr>
-          <w:rStyle w:val="SpecialCharTok"/>
-        </w:rPr>
-        <w:t xml:space="preserve">==</w:t>
-      </w:r>
-      <w:r>
-        <w:rPr>
-          <w:rStyle w:val="NormalTok"/>
-        </w:rPr>
-        <w:t xml:space="preserve"> </w:t>
-      </w:r>
-      <w:r>
-        <w:rPr>
-          <w:rStyle w:val="ConstantTok"/>
-        </w:rPr>
-        <w:t xml:space="preserve">TRUE</w:t>
-      </w:r>
-      <w:r>
-        <w:rPr>
-          <w:rStyle w:val="NormalTok"/>
-        </w:rPr>
-        <w:t xml:space="preserve">){</w:t>
-      </w:r>
-      <w:r>
-        <w:br/>
-      </w:r>
-      <w:r>
-        <w:rPr>
-          <w:rStyle w:val="NormalTok"/>
-        </w:rPr>
-        <w:t xml:space="preserve">  </w:t>
-      </w:r>
-      <w:r>
-        <w:rPr>
-          <w:rStyle w:val="FunctionTok"/>
-        </w:rPr>
-        <w:t xml:space="preserve">cat</w:t>
-      </w:r>
-      <w:r>
-        <w:rPr>
-          <w:rStyle w:val="NormalTok"/>
-        </w:rPr>
-        <w:t xml:space="preserve">(</w:t>
-      </w:r>
-      <w:r>
-        <w:rPr>
-          <w:rStyle w:val="StringTok"/>
-        </w:rPr>
-        <w:t xml:space="preserve">"### Other 3</w:t>
-      </w:r>
-      <w:r>
-        <w:br/>
-      </w:r>
-      <w:r>
-        <w:rPr>
-          <w:rStyle w:val="StringTok"/>
-        </w:rPr>
-        <w:t xml:space="preserve">  </w:t>
-      </w:r>
-      <w:r>
-        <w:br/>
-      </w:r>
-      <w:r>
-        <w:rPr>
-          <w:rStyle w:val="StringTok"/>
-        </w:rPr>
-        <w:t xml:space="preserve">*Problem*</w:t>
-      </w:r>
-      <w:r>
-        <w:br/>
-      </w:r>
-      <w:r>
-        <w:br/>
-      </w:r>
-      <w:r>
-        <w:rPr>
-          <w:rStyle w:val="StringTok"/>
-        </w:rPr>
-        <w:t xml:space="preserve">*Recommendation*</w:t>
-      </w:r>
-      <w:r>
-        <w:br/>
-      </w:r>
-      <w:r>
-        <w:br/>
-      </w:r>
-      <w:r>
-        <w:rPr>
-          <w:rStyle w:val="StringTok"/>
-        </w:rPr>
-        <w:t xml:space="preserve">"</w:t>
-      </w:r>
-      <w:r>
-        <w:rPr>
-          <w:rStyle w:val="NormalTok"/>
-        </w:rPr>
-        <w:t xml:space="preserve">)</w:t>
-      </w:r>
-      <w:r>
-        <w:br/>
-      </w:r>
-      <w:r>
-        <w:rPr>
-          <w:rStyle w:val="NormalTok"/>
-        </w:rPr>
+        <w:t xml:space="preserve">“)</w:t>
+      </w:r>
+      <w:r>
         <w:t xml:space="preserve">}</w:t>
       </w:r>
       <w:r>
-        <w:rPr>
-          <w:rStyle w:val="ControlFlowTok"/>
-        </w:rPr>
-        <w:t xml:space="preserve">else</w:t>
-      </w:r>
-      <w:r>
-        <w:rPr>
-          <w:rStyle w:val="NormalTok"/>
-        </w:rPr>
-        <w:t xml:space="preserve">{</w:t>
-      </w:r>
-      <w:r>
-        <w:br/>
-      </w:r>
-      <w:r>
-        <w:rPr>
-          <w:rStyle w:val="NormalTok"/>
-        </w:rPr>
-        <w:t xml:space="preserve">  </w:t>
-      </w:r>
-      <w:r>
-        <w:rPr>
-          <w:rStyle w:val="FunctionTok"/>
-        </w:rPr>
-        <w:t xml:space="preserve">cat</w:t>
-      </w:r>
-      <w:r>
-        <w:rPr>
-          <w:rStyle w:val="NormalTok"/>
-        </w:rPr>
-        <w:t xml:space="preserve">(</w:t>
-      </w:r>
-      <w:r>
-        <w:rPr>
-          <w:rStyle w:val="StringTok"/>
-        </w:rPr>
-        <w:t xml:space="preserve">""</w:t>
-      </w:r>
-      <w:r>
-        <w:rPr>
-          <w:rStyle w:val="NormalTok"/>
-        </w:rPr>
-        <w:t xml:space="preserve">)</w:t>
-      </w:r>
-      <w:r>
-        <w:br/>
-      </w:r>
-      <w:r>
-        <w:rPr>
-          <w:rStyle w:val="NormalTok"/>
-        </w:rPr>
-        <w:t xml:space="preserve">}</w:t>
-      </w:r>
-      <w:r>
-        <w:br/>
-      </w:r>
-      <w:r>
-        <w:br/>
-      </w:r>
-      <w:r>
-        <w:rPr>
-          <w:rStyle w:val="ControlFlowTok"/>
-        </w:rPr>
-        <w:t xml:space="preserve">if</w:t>
-      </w:r>
-      <w:r>
-        <w:rPr>
-          <w:rStyle w:val="NormalTok"/>
-        </w:rPr>
-        <w:t xml:space="preserve">(other_3 </w:t>
-      </w:r>
-      <w:r>
-        <w:rPr>
-          <w:rStyle w:val="SpecialCharTok"/>
-        </w:rPr>
-        <w:t xml:space="preserve">==</w:t>
-      </w:r>
-      <w:r>
-        <w:rPr>
-          <w:rStyle w:val="NormalTok"/>
-        </w:rPr>
-        <w:t xml:space="preserve"> </w:t>
-      </w:r>
-      <w:r>
-        <w:rPr>
-          <w:rStyle w:val="ConstantTok"/>
-        </w:rPr>
-        <w:t xml:space="preserve">TRUE</w:t>
-      </w:r>
-      <w:r>
-        <w:rPr>
-          <w:rStyle w:val="NormalTok"/>
-        </w:rPr>
-        <w:t xml:space="preserve">){</w:t>
-      </w:r>
-      <w:r>
-        <w:br/>
-      </w:r>
-      <w:r>
-        <w:rPr>
-          <w:rStyle w:val="NormalTok"/>
-        </w:rPr>
-        <w:t xml:space="preserve">  </w:t>
-      </w:r>
-      <w:r>
-        <w:rPr>
-          <w:rStyle w:val="FunctionTok"/>
-        </w:rPr>
-        <w:t xml:space="preserve">cat</w:t>
-      </w:r>
-      <w:r>
-        <w:rPr>
-          <w:rStyle w:val="NormalTok"/>
-        </w:rPr>
-        <w:t xml:space="preserve">(a_other_3</w:t>
-      </w:r>
-      <w:r>
-        <w:rPr>
-          <w:rStyle w:val="SpecialCharTok"/>
-        </w:rPr>
-        <w:t xml:space="preserve">$</w:t>
-      </w:r>
-      <w:r>
-        <w:rPr>
-          <w:rStyle w:val="NormalTok"/>
-        </w:rPr>
-        <w:t xml:space="preserve">Description</w:t>
-      </w:r>
-      <w:r>
-        <w:br/>
-      </w:r>
-      <w:r>
-        <w:rPr>
-          <w:rStyle w:val="NormalTok"/>
-        </w:rPr>
-        <w:t xml:space="preserve">    </w:t>
-      </w:r>
-      <w:r>
-        <w:br/>
-      </w:r>
-      <w:r>
-        <w:rPr>
-          <w:rStyle w:val="NormalTok"/>
-        </w:rPr>
-        <w:t xml:space="preserve">  )</w:t>
-      </w:r>
-      <w:r>
-        <w:br/>
-      </w:r>
-      <w:r>
-        <w:rPr>
-          <w:rStyle w:val="NormalTok"/>
-        </w:rPr>
-        <w:t xml:space="preserve">}</w:t>
-      </w:r>
-      <w:r>
-        <w:rPr>
-          <w:rStyle w:val="ControlFlowTok"/>
-        </w:rPr>
-        <w:t xml:space="preserve">else</w:t>
-      </w:r>
-      <w:r>
-        <w:rPr>
-          <w:rStyle w:val="NormalTok"/>
-        </w:rPr>
-        <w:t xml:space="preserve">{</w:t>
-      </w:r>
-      <w:r>
-        <w:br/>
-      </w:r>
-      <w:r>
-        <w:rPr>
-          <w:rStyle w:val="NormalTok"/>
-        </w:rPr>
-        <w:t xml:space="preserve">  </w:t>
-      </w:r>
-      <w:r>
-        <w:rPr>
-          <w:rStyle w:val="FunctionTok"/>
-        </w:rPr>
-        <w:t xml:space="preserve">cat</w:t>
-      </w:r>
-      <w:r>
-        <w:rPr>
-          <w:rStyle w:val="NormalTok"/>
-        </w:rPr>
-        <w:t xml:space="preserve">(</w:t>
-      </w:r>
-      <w:r>
-        <w:rPr>
-          <w:rStyle w:val="StringTok"/>
-        </w:rPr>
-        <w:t xml:space="preserve">""</w:t>
-      </w:r>
-      <w:r>
-        <w:rPr>
-          <w:rStyle w:val="NormalTok"/>
-        </w:rPr>
-        <w:t xml:space="preserve">)</w:t>
-      </w:r>
-      <w:r>
-        <w:br/>
-      </w:r>
-      <w:r>
-        <w:rPr>
-          <w:rStyle w:val="NormalTok"/>
-        </w:rPr>
-        <w:t xml:space="preserve">  }</w:t>
-      </w:r>
-      <w:r>
-        <w:br/>
-      </w:r>
-      <w:r>
-        <w:br/>
-      </w:r>
-      <w:r>
-        <w:rPr>
-          <w:rStyle w:val="ControlFlowTok"/>
-        </w:rPr>
-        <w:t xml:space="preserve">if</w:t>
-      </w:r>
-      <w:r>
-        <w:rPr>
-          <w:rStyle w:val="NormalTok"/>
-        </w:rPr>
-        <w:t xml:space="preserve">(other_3 </w:t>
-      </w:r>
-      <w:r>
-        <w:rPr>
-          <w:rStyle w:val="SpecialCharTok"/>
-        </w:rPr>
-        <w:t xml:space="preserve">==</w:t>
-      </w:r>
-      <w:r>
-        <w:rPr>
-          <w:rStyle w:val="NormalTok"/>
-        </w:rPr>
-        <w:t xml:space="preserve"> </w:t>
-      </w:r>
-      <w:r>
-        <w:rPr>
-          <w:rStyle w:val="ConstantTok"/>
-        </w:rPr>
-        <w:t xml:space="preserve">TRUE</w:t>
-      </w:r>
-      <w:r>
-        <w:rPr>
-          <w:rStyle w:val="NormalTok"/>
-        </w:rPr>
-        <w:t xml:space="preserve">){</w:t>
-      </w:r>
-      <w:r>
-        <w:br/>
-      </w:r>
-      <w:r>
-        <w:rPr>
-          <w:rStyle w:val="NormalTok"/>
-        </w:rPr>
-        <w:t xml:space="preserve">  </w:t>
-      </w:r>
-      <w:r>
-        <w:rPr>
-          <w:rStyle w:val="FunctionTok"/>
-        </w:rPr>
-        <w:t xml:space="preserve">cat</w:t>
-      </w:r>
-      <w:r>
-        <w:rPr>
-          <w:rStyle w:val="NormalTok"/>
-        </w:rPr>
-        <w:t xml:space="preserve">(</w:t>
-      </w:r>
-      <w:r>
-        <w:rPr>
-          <w:rStyle w:val="StringTok"/>
-        </w:rPr>
-        <w:t xml:space="preserve">"</w:t>
-      </w:r>
-      <w:r>
-        <w:br/>
-      </w:r>
-      <w:r>
-        <w:br/>
-      </w:r>
-      <w:r>
-        <w:rPr>
-          <w:rStyle w:val="StringTok"/>
-        </w:rPr>
-        <w:t xml:space="preserve">*Estimated Cost/Benefits/Incentives*</w:t>
-      </w:r>
-      <w:r>
-        <w:br/>
-      </w:r>
-      <w:r>
-        <w:br/>
-      </w:r>
-      <w:r>
-        <w:rPr>
-          <w:rStyle w:val="StringTok"/>
-        </w:rPr>
-        <w:t xml:space="preserve">"</w:t>
-      </w:r>
-      <w:r>
-        <w:rPr>
-          <w:rStyle w:val="NormalTok"/>
-        </w:rPr>
-        <w:t xml:space="preserve">, auto_other_3_estimates</w:t>
-      </w:r>
-      <w:r>
-        <w:rPr>
-          <w:rStyle w:val="SpecialCharTok"/>
-        </w:rPr>
-        <w:t xml:space="preserve">$</w:t>
-      </w:r>
-      <w:r>
-        <w:rPr>
-          <w:rStyle w:val="NormalTok"/>
-        </w:rPr>
-        <w:t xml:space="preserve">Description)</w:t>
-      </w:r>
-      <w:r>
-        <w:br/>
-      </w:r>
-      <w:r>
-        <w:rPr>
-          <w:rStyle w:val="NormalTok"/>
-        </w:rPr>
-        <w:t xml:space="preserve">}</w:t>
-      </w:r>
-      <w:r>
-        <w:rPr>
-          <w:rStyle w:val="ControlFlowTok"/>
-        </w:rPr>
-        <w:t xml:space="preserve">else</w:t>
-      </w:r>
-      <w:r>
-        <w:rPr>
-          <w:rStyle w:val="NormalTok"/>
-        </w:rPr>
-        <w:t xml:space="preserve">{</w:t>
-      </w:r>
-      <w:r>
-        <w:br/>
-      </w:r>
-      <w:r>
-        <w:rPr>
-          <w:rStyle w:val="NormalTok"/>
-        </w:rPr>
-        <w:t xml:space="preserve">  </w:t>
-      </w:r>
-      <w:r>
-        <w:rPr>
-          <w:rStyle w:val="FunctionTok"/>
-        </w:rPr>
-        <w:t xml:space="preserve">cat</w:t>
-      </w:r>
-      <w:r>
-        <w:rPr>
-          <w:rStyle w:val="NormalTok"/>
-        </w:rPr>
-        <w:t xml:space="preserve">(</w:t>
-      </w:r>
-      <w:r>
-        <w:rPr>
-          <w:rStyle w:val="StringTok"/>
-        </w:rPr>
-        <w:t xml:space="preserve">""</w:t>
-      </w:r>
-      <w:r>
-        <w:rPr>
-          <w:rStyle w:val="NormalTok"/>
-        </w:rPr>
-        <w:t xml:space="preserve">)</w:t>
-      </w:r>
-      <w:r>
-        <w:br/>
-      </w:r>
-      <w:r>
-        <w:rPr>
-          <w:rStyle w:val="NormalTok"/>
-        </w:rPr>
-        <w:t xml:space="preserve">  } </w:t>
-      </w:r>
-    </w:p>
-    <w:bookmarkEnd w:id="56"/>
-    <w:bookmarkStart w:id="57" w:name="ductwork-air-sealing-and-insulation"/>
-    <w:p>
-      <w:pPr>
-        <w:pStyle w:val="Heading3"/>
-      </w:pPr>
-      <w:r>
-        <w:t xml:space="preserve">4.16 Ductwork Air Sealing and Insulation</w:t>
-      </w:r>
-    </w:p>
-    <w:p>
-      <w:pPr>
-        <w:pStyle w:val="FirstParagraph"/>
-      </w:pPr>
-      <w:r>
-        <w:rPr>
-          <w:i/>
-          <w:iCs/>
-        </w:rPr>
-        <w:t xml:space="preserve">Problem</w:t>
-      </w:r>
-    </w:p>
-    <w:p>
-      <w:pPr>
-        <w:pStyle w:val="BodyText"/>
-      </w:pPr>
-      <w:r>
-        <w:t xml:space="preserve">The furnace supply ductwork running through the basement would be more efficient if it were air sealed and insulated. The heated air from the furnace loses a lot of heat to the surroundings on its way to the living space.</w:t>
-      </w:r>
-    </w:p>
-    <w:p>
-      <w:pPr>
-        <w:pStyle w:val="BodyText"/>
-      </w:pPr>
-      <w:r>
-        <w:rPr>
-          <w:i/>
-          <w:iCs/>
-        </w:rPr>
-        <w:t xml:space="preserve">Recommendation</w:t>
-      </w:r>
-    </w:p>
-    <w:p>
-      <w:pPr>
-        <w:pStyle w:val="BodyText"/>
-      </w:pPr>
-      <w:r>
-        <w:t xml:space="preserve">Air seal and insulate all of the supply and return ductwork running through the basement/crawlspace. Air sealing should be completed first, and can be done with either UL 181 foil-faced tape, duct mastic, or by hiring a contractor that has equipment to Aeroseal the ductwork (https://aeroseal.com/find-a-pro/). For insulation, we recommend using foil-faced fiberglass batts. Foil-faced bubble wrap can also be used. It is important to air seal the ducts properly before insulating. Otherwise, the heat will bypass the insulation, making the insulation ineffective.</w:t>
-      </w:r>
-      <w:r>
-        <w:rPr>
-          <w:i/>
-          <w:iCs/>
-        </w:rPr>
-        <w:t xml:space="preserve">Estimated Costs/Benefits/Incentives</w:t>
-      </w:r>
-    </w:p>
-    <w:p>
-      <w:pPr>
-        <w:pStyle w:val="BodyText"/>
-      </w:pPr>
-      <w:r>
-        <w:t xml:space="preserve">Air sealing and insulating ductwork is eligible for a non-refundable federal tax credit (</w:t>
-      </w:r>
-      <w:r>
-        <w:t xml:space="preserve">“Energy Efficient Home Improvement Credit”</w:t>
-      </w:r>
-      <w:r>
-        <w:t xml:space="preserve">), which can pay for 30% of the project cost, subject to an annual maximum of $1,200 (shared with other home envelope improvements, like attic and basement projects).</w:t>
-      </w:r>
-    </w:p>
-    <w:bookmarkEnd w:id="57"/>
-    <w:bookmarkEnd w:id="58"/>
-    <w:bookmarkStart w:id="59" w:name="additional-resources"/>
-    <w:p>
-      <w:pPr>
-        <w:pStyle w:val="Heading2"/>
-      </w:pPr>
-      <w:r>
-        <w:t xml:space="preserve">5 Additional Resources</w:t>
-      </w:r>
-    </w:p>
-    <w:p>
-      <w:pPr>
-        <w:pStyle w:val="FirstParagraph"/>
-      </w:pPr>
-      <w:r>
-        <w:t xml:space="preserve">Many home efficiency upgrades are eligible for Efficiency Maine rebates and federal tax credits. Financial incentives vary based on income level and type of occupancy. An overview of all state rebates and federal tax credits can be found here: https://www.efficiencymaine.com/at-home/.</w:t>
-      </w:r>
-    </w:p>
-    <w:p>
-      <w:pPr>
-        <w:pStyle w:val="BodyText"/>
-      </w:pPr>
-      <w:r>
-        <w:t xml:space="preserve">You can search for Efficiency Maine registered contractors here: https://www.efficiencymaine.com/at-home/vendor-locator/.</w:t>
-      </w:r>
-    </w:p>
-    <w:p>
-      <w:pPr>
-        <w:pStyle w:val="BodyText"/>
-      </w:pPr>
-      <w:r>
-        <w:t xml:space="preserve">We recommend discussing a whole-home plan for insulation and air sealing work in the basement, walls, and attic with contractors to determine how to best sequence the work to take full advantage of the Efficiency Maine rebates (which are subject to lifetime maximums) and nonrefundable federal tax credits (which are subject to annual maximums).</w:t>
-      </w:r>
-    </w:p>
-    <w:p>
-      <w:pPr>
-        <w:pStyle w:val="BodyText"/>
-      </w:pPr>
-      <w:r>
-        <w:t xml:space="preserve">Efficiency Maine also offers home energy loans to help homeowners who are Maine residents pay for energy and related health and safety upgrades. There are no fees, and interest rates for multi-year loans are between 5.99% (max $7,500) and 7.99% (max $25,000), depending on income level. Low- and moderate-income homeowners who borrow the full $7,500 and pay it back over 10 years will pay a monthly cost of $83. There is also a 1-year, 0% APR option. To learn more or apply, call 866-376-2463 or visit https://www.efficiencymaine.com/home-energy-loans/</w:t>
-      </w:r>
-    </w:p>
-    <w:bookmarkEnd w:id="59"/>
-    <w:bookmarkStart w:id="76" w:name="section-four-tests"/>
-    <w:p>
-      <w:pPr>
-        <w:pStyle w:val="Heading2"/>
-      </w:pPr>
-      <w:r>
-        <w:t xml:space="preserve">6 Section Four Tests</w:t>
-      </w:r>
-    </w:p>
-    <w:bookmarkStart w:id="60" w:name="furnaceboiler-tune-up-1"/>
-    <w:p>
-      <w:pPr>
-        <w:pStyle w:val="Heading3"/>
-      </w:pPr>
-      <w:r>
-        <w:t xml:space="preserve">6.1 Furnace/Boiler Tune-up</w:t>
-      </w:r>
-    </w:p>
-    <w:bookmarkEnd w:id="60"/>
-    <w:bookmarkStart w:id="61" w:name="high-efficiency-shower-heads-1"/>
-    <w:p>
-      <w:pPr>
-        <w:pStyle w:val="Heading3"/>
-      </w:pPr>
-      <w:r>
-        <w:t xml:space="preserve">6.2 High-efficiency Shower Head(s)</w:t>
-      </w:r>
-    </w:p>
-    <w:bookmarkEnd w:id="61"/>
-    <w:bookmarkStart w:id="62" w:name="leds-1"/>
-    <w:p>
-      <w:pPr>
-        <w:pStyle w:val="Heading3"/>
-      </w:pPr>
-      <w:r>
-        <w:t xml:space="preserve">6.3 LEDs</w:t>
-      </w:r>
-    </w:p>
-    <w:bookmarkEnd w:id="62"/>
-    <w:bookmarkStart w:id="63" w:name="windowdressers"/>
-    <w:p>
-      <w:pPr>
-        <w:pStyle w:val="Heading3"/>
-      </w:pPr>
-      <w:r>
-        <w:t xml:space="preserve">6.4 WindowDressers</w:t>
-      </w:r>
-    </w:p>
-    <w:bookmarkEnd w:id="63"/>
-    <w:bookmarkStart w:id="64" w:name="heat-pump-water-heater-1"/>
-    <w:p>
-      <w:pPr>
-        <w:pStyle w:val="Heading3"/>
-      </w:pPr>
-      <w:r>
-        <w:t xml:space="preserve">6.5 Heat Pump Water Heater</w:t>
-      </w:r>
-    </w:p>
-    <w:bookmarkEnd w:id="64"/>
-    <w:bookmarkStart w:id="65" w:name="gutters-1"/>
-    <w:p>
-      <w:pPr>
-        <w:pStyle w:val="Heading3"/>
-      </w:pPr>
-      <w:r>
-        <w:t xml:space="preserve">6.6 Gutters</w:t>
-      </w:r>
-    </w:p>
-    <w:bookmarkEnd w:id="65"/>
-    <w:bookmarkStart w:id="66" w:name="bathroom-exhaust-fans-1"/>
-    <w:p>
-      <w:pPr>
-        <w:pStyle w:val="Heading3"/>
-      </w:pPr>
-      <w:r>
-        <w:t xml:space="preserve">6.7 Bathroom Exhaust Fan(s)</w:t>
-      </w:r>
-    </w:p>
-    <w:bookmarkEnd w:id="66"/>
-    <w:bookmarkStart w:id="67" w:name="kitchen-exhaust-fan"/>
-    <w:p>
-      <w:pPr>
-        <w:pStyle w:val="Heading3"/>
-      </w:pPr>
-      <w:r>
-        <w:t xml:space="preserve">6.8 Kitchen Exhaust Fan</w:t>
+        <w:t xml:space="preserve"># cat(”</w:t>
       </w:r>
     </w:p>
     <w:bookmarkEnd w:id="67"/>
-    <w:bookmarkStart w:id="68" w:name="vapor-barrier-1"/>
-    <w:p>
-      <w:pPr>
-        <w:pStyle w:val="Heading3"/>
-      </w:pPr>
-      <w:r>
-        <w:t xml:space="preserve">6.9 Vapor Barrier</w:t>
-      </w:r>
-    </w:p>
     <w:bookmarkEnd w:id="68"/>
-    <w:bookmarkStart w:id="69" w:name="spray-foam-basementcrawlspace-walls"/>
-    <w:p>
-      <w:pPr>
-        <w:pStyle w:val="Heading3"/>
-      </w:pPr>
-      <w:r>
-        <w:t xml:space="preserve">6.10 Spray Foam Basement/Crawlspace Walls</w:t>
-      </w:r>
-    </w:p>
-    <w:bookmarkEnd w:id="69"/>
-    <w:bookmarkStart w:id="70" w:name="attic-air-sealing-and-insulation"/>
-    <w:p>
-      <w:pPr>
-        <w:pStyle w:val="Heading3"/>
-      </w:pPr>
-      <w:r>
-        <w:t xml:space="preserve">6.11 Attic Air Sealing and Insulation</w:t>
-      </w:r>
-    </w:p>
-    <w:bookmarkEnd w:id="70"/>
-    <w:bookmarkStart w:id="71" w:name="blown-in-cellulose-wall-insulation"/>
-    <w:p>
-      <w:pPr>
-        <w:pStyle w:val="Heading3"/>
-      </w:pPr>
-      <w:r>
-        <w:t xml:space="preserve">6.12 Blown-in Cellulose Wall Insulation</w:t>
-      </w:r>
-    </w:p>
-    <w:bookmarkEnd w:id="71"/>
-    <w:bookmarkStart w:id="72" w:name="continuous-exterior-wall-insulation-1"/>
-    <w:p>
-      <w:pPr>
-        <w:pStyle w:val="Heading3"/>
-      </w:pPr>
-      <w:r>
-        <w:t xml:space="preserve">6.13 Continuous Exterior Wall Insulation</w:t>
-      </w:r>
-    </w:p>
-    <w:bookmarkEnd w:id="72"/>
-    <w:bookmarkStart w:id="73" w:name="pipe-insulation-1"/>
-    <w:p>
-      <w:pPr>
-        <w:pStyle w:val="Heading3"/>
-      </w:pPr>
-      <w:r>
-        <w:t xml:space="preserve">6.14 Pipe Insulation</w:t>
-      </w:r>
-    </w:p>
-    <w:bookmarkEnd w:id="73"/>
-    <w:bookmarkStart w:id="74" w:name="diy-air-sealing-1"/>
-    <w:p>
-      <w:pPr>
-        <w:pStyle w:val="Heading3"/>
-      </w:pPr>
-      <w:r>
-        <w:t xml:space="preserve">6.15 DIY Air Sealing</w:t>
-      </w:r>
-    </w:p>
-    <w:bookmarkEnd w:id="74"/>
-    <w:bookmarkStart w:id="75" w:name="ductwork-air-sealing-and-insulation-1"/>
-    <w:p>
-      <w:pPr>
-        <w:pStyle w:val="Heading3"/>
-      </w:pPr>
-      <w:r>
-        <w:t xml:space="preserve">6.16 Ductwork Air Sealing and Insulation</w:t>
-      </w:r>
-    </w:p>
-    <w:p>
-      <w:pPr>
-        <w:pStyle w:val="FirstParagraph"/>
-      </w:pPr>
-      <w:r>
-        <w:t xml:space="preserve">[1]</w:t>
-      </w:r>
-      <w:r>
-        <w:t xml:space="preserve"> </w:t>
-      </w:r>
-      <w:r>
-        <w:t xml:space="preserve">“)</w:t>
-      </w:r>
-      <w:r>
-        <w:t xml:space="preserve">}</w:t>
-      </w:r>
-      <w:r>
-        <w:t xml:space="preserve"># cat(”</w:t>
-      </w:r>
-    </w:p>
-    <w:bookmarkEnd w:id="75"/>
-    <w:bookmarkEnd w:id="76"/>
     <w:sectPr>
       <w:footerReference r:id="rId9" w:type="default"/>
       <w:pgSz w:h="15840" w:w="12240"/>

</xml_diff>

<commit_message>
Re-render Susan report with CFM50
</commit_message>
<xml_diff>
--- a/Quarto_report/Audit_Report.docx
+++ b/Quarto_report/Audit_Report.docx
@@ -2197,7 +2197,7 @@
                 <w:rFonts w:ascii="Calibri" w:hAnsi="Calibri"/>
                 <w:sz w:val="20"/>
               </w:rPr>
-              <w:t xml:space="default">NA</w:t>
+              <w:t xml:space="default">5744</w:t>
             </w:r>
           </w:p>
         </w:tc>
@@ -2351,7 +2351,7 @@
                 <w:rFonts w:ascii="Calibri" w:hAnsi="Calibri"/>
                 <w:sz w:val="20"/>
               </w:rPr>
-              <w:t xml:space="default">NA under natural conditions. TEST</w:t>
+              <w:t xml:space="default">574.4 under natural conditions. TEST</w:t>
             </w:r>
           </w:p>
         </w:tc>
@@ -4608,16 +4608,6 @@
       </w:r>
     </w:p>
     <w:bookmarkEnd w:id="57"/>
-    <w:bookmarkStart w:id="58" w:name="section-four-tests"/>
-    <w:p>
-      <w:pPr>
-        <w:pStyle w:val="Heading2"/>
-      </w:pPr>
-      <w:r>
-        <w:t xml:space="preserve">6 Section Four Tests</w:t>
-      </w:r>
-    </w:p>
-    <w:bookmarkEnd w:id="58"/>
     <w:sectPr>
       <w:footerReference r:id="rId9" w:type="default"/>
       <w:pgSz w:h="15840" w:w="12240"/>

</xml_diff>

<commit_message>
Render Sharon Morrell audit report
</commit_message>
<xml_diff>
--- a/Quarto_report/Audit_Report.docx
+++ b/Quarto_report/Audit_Report.docx
@@ -15,31 +15,31 @@
         <w:pStyle w:val="FirstParagraph"/>
       </w:pPr>
       <w:r>
-        <w:t xml:space="preserve">Homeowner(s): Denise Altvater</w:t>
-      </w:r>
-    </w:p>
-    <w:p>
-      <w:pPr>
-        <w:pStyle w:val="BodyText"/>
-      </w:pPr>
-      <w:r>
-        <w:t xml:space="preserve">Address: 16 Loone Lane, Robbinston, ME 04671</w:t>
-      </w:r>
-    </w:p>
-    <w:p>
-      <w:pPr>
-        <w:pStyle w:val="BodyText"/>
-      </w:pPr>
-      <w:r>
-        <w:t xml:space="preserve">Owner Contact: (207) 214-6383</w:t>
-      </w:r>
-    </w:p>
-    <w:p>
-      <w:pPr>
-        <w:pStyle w:val="BodyText"/>
-      </w:pPr>
-      <w:r>
-        <w:t xml:space="preserve">Auditors: Helen Lloyd, Tyler Hebert, Raquel Longfellow</w:t>
+        <w:t xml:space="preserve">Homeowner(s): Sharon Morrell</w:t>
+      </w:r>
+    </w:p>
+    <w:p>
+      <w:pPr>
+        <w:pStyle w:val="BodyText"/>
+      </w:pPr>
+      <w:r>
+        <w:t xml:space="preserve">Address: 300 Cranberry Road, Cranberry Isles, ME 04625</w:t>
+      </w:r>
+    </w:p>
+    <w:p>
+      <w:pPr>
+        <w:pStyle w:val="BodyText"/>
+      </w:pPr>
+      <w:r>
+        <w:t xml:space="preserve">Owner Contact: akmjem@yahoo.com, (717) 275-2993</w:t>
+      </w:r>
+    </w:p>
+    <w:p>
+      <w:pPr>
+        <w:pStyle w:val="BodyText"/>
+      </w:pPr>
+      <w:r>
+        <w:t xml:space="preserve">Auditors: Rashmi Mohan, Pema Lhundrup, Mabon Young</w:t>
       </w:r>
     </w:p>
     <w:p>
@@ -55,7 +55,7 @@
         <w:pStyle w:val="BodyText"/>
       </w:pPr>
       <w:r>
-        <w:t xml:space="preserve">Report Date: July 2, 2025</w:t>
+        <w:t xml:space="preserve">Report Date: July 3, 2025</w:t>
       </w:r>
     </w:p>
     <w:p>
@@ -70,7 +70,7 @@
         <w:pStyle w:val="FirstParagraph"/>
       </w:pPr>
       <w:r>
-        <w:t xml:space="preserve">We conducted an energy assessment of your home on 7/1/2025. This report will tell you what we did, what we found, and what we suggest for your home. These suggestions include information on incentives and financing to make improvements more affordable.</w:t>
+        <w:t xml:space="preserve">We conducted an energy assessment of your home on 7/3/2025. This report will tell you what we did, what we found, and what we suggest for your home. These suggestions include information on incentives and financing to make improvements more affordable.</w:t>
       </w:r>
     </w:p>
     <w:p>
@@ -397,31 +397,31 @@
                 <w:rFonts w:ascii="Calibri" w:hAnsi="Calibri"/>
                 <w:sz w:val="20"/>
               </w:rPr>
-              <w:t xml:space="default">LEDs</w:t>
-            </w:r>
-          </w:p>
-        </w:tc>
-        <w:tc>
-          <w:tcPr>
-            <w:tcBorders>
-              <w:top w:val="single" w:space="0" w:color="D3D3D3"/>
-              <w:bottom w:val="single" w:space="0" w:color="D3D3D3"/>
-              <w:start w:val="single" w:space="0" w:color="D3D3D3"/>
-              <w:end w:val="single" w:space="0" w:color="D3D3D3"/>
-            </w:tcBorders>
-          </w:tcPr>
-          <w:p>
-            <w:pPr>
-              <w:spacing w:before="0" w:after="60"/>
-              <w:keepNext/>
-              <w:jc w:val="start"/>
-            </w:pPr>
-            <w:r>
-              <w:rPr>
-                <w:rFonts w:ascii="Calibri" w:hAnsi="Calibri"/>
-                <w:sz w:val="20"/>
-              </w:rPr>
-              <w:t xml:space="default">Switch your light bulbs to LED light bulbs. LEDs use 80% less energy than incandescent light bulbs which can significantly reduce your electricity bill.</w:t>
+              <w:t xml:space="default">WindowDressers</w:t>
+            </w:r>
+          </w:p>
+        </w:tc>
+        <w:tc>
+          <w:tcPr>
+            <w:tcBorders>
+              <w:top w:val="single" w:space="0" w:color="D3D3D3"/>
+              <w:bottom w:val="single" w:space="0" w:color="D3D3D3"/>
+              <w:start w:val="single" w:space="0" w:color="D3D3D3"/>
+              <w:end w:val="single" w:space="0" w:color="D3D3D3"/>
+            </w:tcBorders>
+          </w:tcPr>
+          <w:p>
+            <w:pPr>
+              <w:spacing w:before="0" w:after="60"/>
+              <w:keepNext/>
+              <w:jc w:val="start"/>
+            </w:pPr>
+            <w:r>
+              <w:rPr>
+                <w:rFonts w:ascii="Calibri" w:hAnsi="Calibri"/>
+                <w:sz w:val="20"/>
+              </w:rPr>
+              <w:t xml:space="default">WindowDressers are insulating window inserts that help air-seal windows and reduce heat loss and gain.</w:t>
             </w:r>
           </w:p>
         </w:tc>
@@ -450,31 +450,31 @@
                 <w:rFonts w:ascii="Calibri" w:hAnsi="Calibri"/>
                 <w:sz w:val="20"/>
               </w:rPr>
-              <w:t xml:space="default">WindowDressers</w:t>
-            </w:r>
-          </w:p>
-        </w:tc>
-        <w:tc>
-          <w:tcPr>
-            <w:tcBorders>
-              <w:top w:val="single" w:space="0" w:color="D3D3D3"/>
-              <w:bottom w:val="single" w:space="0" w:color="D3D3D3"/>
-              <w:start w:val="single" w:space="0" w:color="D3D3D3"/>
-              <w:end w:val="single" w:space="0" w:color="D3D3D3"/>
-            </w:tcBorders>
-          </w:tcPr>
-          <w:p>
-            <w:pPr>
-              <w:spacing w:before="0" w:after="60"/>
-              <w:keepNext/>
-              <w:jc w:val="start"/>
-            </w:pPr>
-            <w:r>
-              <w:rPr>
-                <w:rFonts w:ascii="Calibri" w:hAnsi="Calibri"/>
-                <w:sz w:val="20"/>
-              </w:rPr>
-              <w:t xml:space="default">WindowDressers are insulating window inserts that help air-seal windows and reduce heat loss and gain.</w:t>
+              <w:t xml:space="default">Induction Stove/Oven</w:t>
+            </w:r>
+          </w:p>
+        </w:tc>
+        <w:tc>
+          <w:tcPr>
+            <w:tcBorders>
+              <w:top w:val="single" w:space="0" w:color="D3D3D3"/>
+              <w:bottom w:val="single" w:space="0" w:color="D3D3D3"/>
+              <w:start w:val="single" w:space="0" w:color="D3D3D3"/>
+              <w:end w:val="single" w:space="0" w:color="D3D3D3"/>
+            </w:tcBorders>
+          </w:tcPr>
+          <w:p>
+            <w:pPr>
+              <w:spacing w:before="0" w:after="60"/>
+              <w:keepNext/>
+              <w:jc w:val="start"/>
+            </w:pPr>
+            <w:r>
+              <w:rPr>
+                <w:rFonts w:ascii="Calibri" w:hAnsi="Calibri"/>
+                <w:sz w:val="20"/>
+              </w:rPr>
+              <w:t xml:space="default">Induction cooking appliances are more efficient and safer than electric or gas ones. There is no risk of carbon monoxide or other harmful combustion gases, and the surface doesn’t heat up without a pot or pan on it.</w:t>
             </w:r>
           </w:p>
         </w:tc>
@@ -874,31 +874,31 @@
                 <w:rFonts w:ascii="Calibri" w:hAnsi="Calibri"/>
                 <w:sz w:val="20"/>
               </w:rPr>
-              <w:t xml:space="default">Electrical Panel Upgrade</w:t>
-            </w:r>
-          </w:p>
-        </w:tc>
-        <w:tc>
-          <w:tcPr>
-            <w:tcBorders>
-              <w:top w:val="single" w:space="0" w:color="D3D3D3"/>
-              <w:bottom w:val="single" w:space="0" w:color="D3D3D3"/>
-              <w:start w:val="single" w:space="0" w:color="D3D3D3"/>
-              <w:end w:val="single" w:space="0" w:color="D3D3D3"/>
-            </w:tcBorders>
-          </w:tcPr>
-          <w:p>
-            <w:pPr>
-              <w:spacing w:before="0" w:after="60"/>
-              <w:keepNext/>
-              <w:jc w:val="start"/>
-            </w:pPr>
-            <w:r>
-              <w:rPr>
-                <w:rFonts w:ascii="Calibri" w:hAnsi="Calibri"/>
-                <w:sz w:val="20"/>
-              </w:rPr>
-              <w:t xml:space="default">Consult with an electrician about replacing your existing electrical panel with a 200 amp panel as you add electrical appliances to your home.</w:t>
+              <w:t xml:space="default">Air Source Heat Pump</w:t>
+            </w:r>
+          </w:p>
+        </w:tc>
+        <w:tc>
+          <w:tcPr>
+            <w:tcBorders>
+              <w:top w:val="single" w:space="0" w:color="D3D3D3"/>
+              <w:bottom w:val="single" w:space="0" w:color="D3D3D3"/>
+              <w:start w:val="single" w:space="0" w:color="D3D3D3"/>
+              <w:end w:val="single" w:space="0" w:color="D3D3D3"/>
+            </w:tcBorders>
+          </w:tcPr>
+          <w:p>
+            <w:pPr>
+              <w:spacing w:before="0" w:after="60"/>
+              <w:keepNext/>
+              <w:jc w:val="start"/>
+            </w:pPr>
+            <w:r>
+              <w:rPr>
+                <w:rFonts w:ascii="Calibri" w:hAnsi="Calibri"/>
+                <w:sz w:val="20"/>
+              </w:rPr>
+              <w:t xml:space="default">Install air source heat pumps for heating and cooling and whole-house surge protection.</w:t>
             </w:r>
           </w:p>
         </w:tc>
@@ -927,31 +927,31 @@
                 <w:rFonts w:ascii="Calibri" w:hAnsi="Calibri"/>
                 <w:sz w:val="20"/>
               </w:rPr>
-              <w:t xml:space="default">Air Source Heat Pump</w:t>
-            </w:r>
-          </w:p>
-        </w:tc>
-        <w:tc>
-          <w:tcPr>
-            <w:tcBorders>
-              <w:top w:val="single" w:space="0" w:color="D3D3D3"/>
-              <w:bottom w:val="single" w:space="0" w:color="D3D3D3"/>
-              <w:start w:val="single" w:space="0" w:color="D3D3D3"/>
-              <w:end w:val="single" w:space="0" w:color="D3D3D3"/>
-            </w:tcBorders>
-          </w:tcPr>
-          <w:p>
-            <w:pPr>
-              <w:spacing w:before="0" w:after="60"/>
-              <w:keepNext/>
-              <w:jc w:val="start"/>
-            </w:pPr>
-            <w:r>
-              <w:rPr>
-                <w:rFonts w:ascii="Calibri" w:hAnsi="Calibri"/>
-                <w:sz w:val="20"/>
-              </w:rPr>
-              <w:t xml:space="default">Install air source heat pumps for heating and cooling and whole-house surge protection.</w:t>
+              <w:t xml:space="default">Whole-House Surge Protection</w:t>
+            </w:r>
+          </w:p>
+        </w:tc>
+        <w:tc>
+          <w:tcPr>
+            <w:tcBorders>
+              <w:top w:val="single" w:space="0" w:color="D3D3D3"/>
+              <w:bottom w:val="single" w:space="0" w:color="D3D3D3"/>
+              <w:start w:val="single" w:space="0" w:color="D3D3D3"/>
+              <w:end w:val="single" w:space="0" w:color="D3D3D3"/>
+            </w:tcBorders>
+          </w:tcPr>
+          <w:p>
+            <w:pPr>
+              <w:spacing w:before="0" w:after="60"/>
+              <w:keepNext/>
+              <w:jc w:val="start"/>
+            </w:pPr>
+            <w:r>
+              <w:rPr>
+                <w:rFonts w:ascii="Calibri" w:hAnsi="Calibri"/>
+                <w:sz w:val="20"/>
+              </w:rPr>
+              <w:t xml:space="default">Upgrade your electrical panel to add whole-house surge protection.</w:t>
             </w:r>
           </w:p>
         </w:tc>
@@ -980,31 +980,31 @@
                 <w:rFonts w:ascii="Calibri" w:hAnsi="Calibri"/>
                 <w:sz w:val="20"/>
               </w:rPr>
-              <w:t xml:space="default">Solar</w:t>
-            </w:r>
-          </w:p>
-        </w:tc>
-        <w:tc>
-          <w:tcPr>
-            <w:tcBorders>
-              <w:top w:val="single" w:space="0" w:color="D3D3D3"/>
-              <w:bottom w:val="single" w:space="0" w:color="D3D3D3"/>
-              <w:start w:val="single" w:space="0" w:color="D3D3D3"/>
-              <w:end w:val="single" w:space="0" w:color="D3D3D3"/>
-            </w:tcBorders>
-          </w:tcPr>
-          <w:p>
-            <w:pPr>
-              <w:spacing w:before="0" w:after="60"/>
-              <w:keepNext/>
-              <w:jc w:val="start"/>
-            </w:pPr>
-            <w:r>
-              <w:rPr>
-                <w:rFonts w:ascii="Calibri" w:hAnsi="Calibri"/>
-                <w:sz w:val="20"/>
-              </w:rPr>
-              <w:t xml:space="default">Rooftop solar can supply most or all of your home electrical demands. Contact a solar company for pricing and details specific to your home.</w:t>
+              <w:t xml:space="default">Blown-in Cellulose Wall Insulation</w:t>
+            </w:r>
+          </w:p>
+        </w:tc>
+        <w:tc>
+          <w:tcPr>
+            <w:tcBorders>
+              <w:top w:val="single" w:space="0" w:color="D3D3D3"/>
+              <w:bottom w:val="single" w:space="0" w:color="D3D3D3"/>
+              <w:start w:val="single" w:space="0" w:color="D3D3D3"/>
+              <w:end w:val="single" w:space="0" w:color="D3D3D3"/>
+            </w:tcBorders>
+          </w:tcPr>
+          <w:p>
+            <w:pPr>
+              <w:spacing w:before="0" w:after="60"/>
+              <w:keepNext/>
+              <w:jc w:val="start"/>
+            </w:pPr>
+            <w:r>
+              <w:rPr>
+                <w:rFonts w:ascii="Calibri" w:hAnsi="Calibri"/>
+                <w:sz w:val="20"/>
+              </w:rPr>
+              <w:t xml:space="default">Insulate the wall stud cavities with dense packed, blown-in cellulose insulation.</w:t>
             </w:r>
           </w:p>
         </w:tc>
@@ -1033,31 +1033,31 @@
                 <w:rFonts w:ascii="Calibri" w:hAnsi="Calibri"/>
                 <w:sz w:val="20"/>
               </w:rPr>
-              <w:t xml:space="default">Whole-House Surge Protection</w:t>
-            </w:r>
-          </w:p>
-        </w:tc>
-        <w:tc>
-          <w:tcPr>
-            <w:tcBorders>
-              <w:top w:val="single" w:space="0" w:color="D3D3D3"/>
-              <w:bottom w:val="single" w:space="0" w:color="D3D3D3"/>
-              <w:start w:val="single" w:space="0" w:color="D3D3D3"/>
-              <w:end w:val="single" w:space="0" w:color="D3D3D3"/>
-            </w:tcBorders>
-          </w:tcPr>
-          <w:p>
-            <w:pPr>
-              <w:spacing w:before="0" w:after="60"/>
-              <w:keepNext/>
-              <w:jc w:val="start"/>
-            </w:pPr>
-            <w:r>
-              <w:rPr>
-                <w:rFonts w:ascii="Calibri" w:hAnsi="Calibri"/>
-                <w:sz w:val="20"/>
-              </w:rPr>
-              <w:t xml:space="default">Upgrade your electrical panel to add whole-house surge protection.</w:t>
+              <w:t xml:space="default">Solar</w:t>
+            </w:r>
+          </w:p>
+        </w:tc>
+        <w:tc>
+          <w:tcPr>
+            <w:tcBorders>
+              <w:top w:val="single" w:space="0" w:color="D3D3D3"/>
+              <w:bottom w:val="single" w:space="0" w:color="D3D3D3"/>
+              <w:start w:val="single" w:space="0" w:color="D3D3D3"/>
+              <w:end w:val="single" w:space="0" w:color="D3D3D3"/>
+            </w:tcBorders>
+          </w:tcPr>
+          <w:p>
+            <w:pPr>
+              <w:spacing w:before="0" w:after="60"/>
+              <w:keepNext/>
+              <w:jc w:val="start"/>
+            </w:pPr>
+            <w:r>
+              <w:rPr>
+                <w:rFonts w:ascii="Calibri" w:hAnsi="Calibri"/>
+                <w:sz w:val="20"/>
+              </w:rPr>
+              <w:t xml:space="default">Rooftop solar can supply most or all of your home electrical demands. Contact a solar company for pricing and details specific to your home.</w:t>
             </w:r>
           </w:p>
         </w:tc>
@@ -1086,190 +1086,31 @@
                 <w:rFonts w:ascii="Calibri" w:hAnsi="Calibri"/>
                 <w:sz w:val="20"/>
               </w:rPr>
-              <w:t xml:space="default">Pipe Insulation</w:t>
-            </w:r>
-          </w:p>
-        </w:tc>
-        <w:tc>
-          <w:tcPr>
-            <w:tcBorders>
-              <w:top w:val="single" w:space="0" w:color="D3D3D3"/>
-              <w:bottom w:val="single" w:space="0" w:color="D3D3D3"/>
-              <w:start w:val="single" w:space="0" w:color="D3D3D3"/>
-              <w:end w:val="single" w:space="0" w:color="D3D3D3"/>
-            </w:tcBorders>
-          </w:tcPr>
-          <w:p>
-            <w:pPr>
-              <w:spacing w:before="0" w:after="60"/>
-              <w:keepNext/>
-              <w:jc w:val="start"/>
-            </w:pPr>
-            <w:r>
-              <w:rPr>
-                <w:rFonts w:ascii="Calibri" w:hAnsi="Calibri"/>
-                <w:sz w:val="20"/>
-              </w:rPr>
-              <w:t xml:space="default">Insulate both hot and cold water pipes that are uninsulated in the basement/crawlspace. This will save energy and prevent condensation.</w:t>
-            </w:r>
-          </w:p>
-        </w:tc>
-      </w:tr>
-      <w:tr>
-        <w:trPr>
-          <w:cantSplit/>
-        </w:trPr>
-        <w:tc>
-          <w:tcPr>
-            <w:tcBorders>
-              <w:top w:val="single" w:space="0" w:color="D3D3D3"/>
-              <w:bottom w:val="single" w:space="0" w:color="D3D3D3"/>
-              <w:start w:val="single" w:space="0" w:color="D3D3D3"/>
-              <w:end w:val="single" w:space="0" w:color="D3D3D3"/>
-            </w:tcBorders>
-          </w:tcPr>
-          <w:p>
-            <w:pPr>
-              <w:spacing w:before="0" w:after="60"/>
-              <w:keepNext/>
-              <w:jc w:val="start"/>
-            </w:pPr>
-            <w:r>
-              <w:rPr>
-                <w:rFonts w:ascii="Calibri" w:hAnsi="Calibri"/>
-                <w:sz w:val="20"/>
-              </w:rPr>
-              <w:t xml:space="default">DIY Air Sealing</w:t>
-            </w:r>
-          </w:p>
-        </w:tc>
-        <w:tc>
-          <w:tcPr>
-            <w:tcBorders>
-              <w:top w:val="single" w:space="0" w:color="D3D3D3"/>
-              <w:bottom w:val="single" w:space="0" w:color="D3D3D3"/>
-              <w:start w:val="single" w:space="0" w:color="D3D3D3"/>
-              <w:end w:val="single" w:space="0" w:color="D3D3D3"/>
-            </w:tcBorders>
-          </w:tcPr>
-          <w:p>
-            <w:pPr>
-              <w:spacing w:before="0" w:after="60"/>
-              <w:keepNext/>
-              <w:jc w:val="start"/>
-            </w:pPr>
-            <w:r>
-              <w:rPr>
-                <w:rFonts w:ascii="Calibri" w:hAnsi="Calibri"/>
-                <w:sz w:val="20"/>
-              </w:rPr>
-              <w:t xml:space="default">Seal easy-to-access air leaks and weatherstrip exterior doors.</w:t>
-            </w:r>
-          </w:p>
-        </w:tc>
-      </w:tr>
-      <w:tr>
-        <w:trPr>
-          <w:cantSplit/>
-        </w:trPr>
-        <w:tc>
-          <w:tcPr>
-            <w:tcBorders>
-              <w:top w:val="single" w:space="0" w:color="D3D3D3"/>
-              <w:bottom w:val="single" w:space="0" w:color="D3D3D3"/>
-              <w:start w:val="single" w:space="0" w:color="D3D3D3"/>
-              <w:end w:val="single" w:space="0" w:color="D3D3D3"/>
-            </w:tcBorders>
-          </w:tcPr>
-          <w:p>
-            <w:pPr>
-              <w:spacing w:before="0" w:after="60"/>
-              <w:keepNext/>
-              <w:jc w:val="start"/>
-            </w:pPr>
-            <w:r>
-              <w:rPr>
-                <w:rFonts w:ascii="Calibri" w:hAnsi="Calibri"/>
-                <w:sz w:val="20"/>
-              </w:rPr>
-              <w:t xml:space="default">Replace Doors</w:t>
-            </w:r>
-          </w:p>
-        </w:tc>
-        <w:tc>
-          <w:tcPr>
-            <w:tcBorders>
-              <w:top w:val="single" w:space="0" w:color="D3D3D3"/>
-              <w:bottom w:val="single" w:space="0" w:color="D3D3D3"/>
-              <w:start w:val="single" w:space="0" w:color="D3D3D3"/>
-              <w:end w:val="single" w:space="0" w:color="D3D3D3"/>
-            </w:tcBorders>
-          </w:tcPr>
-          <w:p>
-            <w:pPr>
-              <w:spacing w:before="0" w:after="60"/>
-              <w:keepNext/>
-              <w:jc w:val="start"/>
-            </w:pPr>
-            <w:r>
-              <w:rPr>
-                <w:rFonts w:ascii="Calibri" w:hAnsi="Calibri"/>
-                <w:sz w:val="20"/>
-              </w:rPr>
-              <w:t xml:space="default">Replace uninsulated exterior doors and ensure new doors are insulated and properly weatherstripped. We recommend installing doors that are Energy Star certified for 'Northern' climate.</w:t>
-            </w:r>
-          </w:p>
-        </w:tc>
-      </w:tr>
-      <w:tr>
-        <w:trPr>
-          <w:cantSplit/>
-        </w:trPr>
-        <w:tc>
-          <w:tcPr>
-            <w:tcBorders>
-              <w:top w:val="single" w:space="0" w:color="D3D3D3"/>
-              <w:bottom w:val="single" w:space="0" w:color="D3D3D3"/>
-              <w:start w:val="single" w:space="0" w:color="D3D3D3"/>
-              <w:end w:val="single" w:space="0" w:color="D3D3D3"/>
-            </w:tcBorders>
-          </w:tcPr>
-          <w:p>
-            <w:pPr>
-              <w:spacing w:before="0" w:after="60"/>
-              <w:keepNext/>
-              <w:jc w:val="start"/>
-            </w:pPr>
-            <w:r>
-              <w:rPr>
-                <w:rFonts w:ascii="Calibri" w:hAnsi="Calibri"/>
-                <w:sz w:val="20"/>
-              </w:rPr>
-              <w:t xml:space="default">Other 1</w:t>
-            </w:r>
-          </w:p>
-        </w:tc>
-        <w:tc>
-          <w:tcPr>
-            <w:tcBorders>
-              <w:top w:val="single" w:space="0" w:color="D3D3D3"/>
-              <w:bottom w:val="single" w:space="0" w:color="D3D3D3"/>
-              <w:start w:val="single" w:space="0" w:color="D3D3D3"/>
-              <w:end w:val="single" w:space="0" w:color="D3D3D3"/>
-            </w:tcBorders>
-          </w:tcPr>
-          <w:p>
-            <w:pPr>
-              <w:spacing w:before="0" w:after="60"/>
-              <w:keepNext/>
-              <w:jc w:val="start"/>
-            </w:pPr>
-            <w:r>
-              <w:rPr>
-                <w:rFonts w:ascii="Calibri" w:hAnsi="Calibri"/>
-                <w:sz w:val="20"/>
-              </w:rPr>
-              <w:t xml:space="default">TYPE HERE 1</w:t>
+              <w:t xml:space="default">Electrical Panel Upgrade</w:t>
+            </w:r>
+          </w:p>
+        </w:tc>
+        <w:tc>
+          <w:tcPr>
+            <w:tcBorders>
+              <w:top w:val="single" w:space="0" w:color="D3D3D3"/>
+              <w:bottom w:val="single" w:space="0" w:color="D3D3D3"/>
+              <w:start w:val="single" w:space="0" w:color="D3D3D3"/>
+              <w:end w:val="single" w:space="0" w:color="D3D3D3"/>
+            </w:tcBorders>
+          </w:tcPr>
+          <w:p>
+            <w:pPr>
+              <w:spacing w:before="0" w:after="60"/>
+              <w:keepNext/>
+              <w:jc w:val="start"/>
+            </w:pPr>
+            <w:r>
+              <w:rPr>
+                <w:rFonts w:ascii="Calibri" w:hAnsi="Calibri"/>
+                <w:sz w:val="20"/>
+              </w:rPr>
+              <w:t xml:space="default">Consult with an electrician about replacing your existing electrical panel with a 200 amp panel as you add electrical appliances to your home.</w:t>
             </w:r>
           </w:p>
         </w:tc>
@@ -1354,7 +1195,7 @@
                 <w:rFonts w:ascii="Calibri" w:hAnsi="Calibri"/>
                 <w:sz w:val="20"/>
               </w:rPr>
-              <w:t xml:space="default">2010</w:t>
+              <w:t xml:space="default">1980s</w:t>
             </w:r>
           </w:p>
         </w:tc>
@@ -1407,7 +1248,7 @@
                 <w:rFonts w:ascii="Calibri" w:hAnsi="Calibri"/>
                 <w:sz w:val="20"/>
               </w:rPr>
-              <w:t xml:space="default">Crawlspace, Slab, Post/Piers, open to the outside</w:t>
+              <w:t xml:space="default">Crawlspace</w:t>
             </w:r>
           </w:p>
         </w:tc>
@@ -1460,7 +1301,7 @@
                 <w:rFonts w:ascii="Calibri" w:hAnsi="Calibri"/>
                 <w:sz w:val="20"/>
               </w:rPr>
-              <w:t xml:space="default">Batts of Fiberglass , 10 inches</w:t>
+              <w:t xml:space="default">Batts of Fiberglass , 5 inches</w:t>
             </w:r>
           </w:p>
         </w:tc>
@@ -1513,7 +1354,7 @@
                 <w:rFonts w:ascii="Calibri" w:hAnsi="Calibri"/>
                 <w:sz w:val="20"/>
               </w:rPr>
-              <w:t xml:space="default">2</w:t>
+              <w:t xml:space="default">1</w:t>
             </w:r>
           </w:p>
         </w:tc>
@@ -1566,7 +1407,7 @@
                 <w:rFonts w:ascii="Calibri" w:hAnsi="Calibri"/>
                 <w:sz w:val="20"/>
               </w:rPr>
-              <w:t xml:space="default">1251</w:t>
+              <w:t xml:space="default">NA</w:t>
             </w:r>
           </w:p>
         </w:tc>
@@ -1619,7 +1460,7 @@
                 <w:rFonts w:ascii="Calibri" w:hAnsi="Calibri"/>
                 <w:sz w:val="20"/>
               </w:rPr>
-              <w:t xml:space="default">11562</w:t>
+              <w:t xml:space="default">NA</w:t>
             </w:r>
           </w:p>
         </w:tc>
@@ -1672,7 +1513,7 @@
                 <w:rFonts w:ascii="Calibri" w:hAnsi="Calibri"/>
                 <w:sz w:val="20"/>
               </w:rPr>
-              <w:t xml:space="default">1, living space after monitor heater tested</w:t>
+              <w:t xml:space="default">0</w:t>
             </w:r>
           </w:p>
         </w:tc>
@@ -1748,7 +1589,7 @@
                 <w:rFonts w:ascii="Calibri" w:hAnsi="Calibri"/>
                 <w:sz w:val="20"/>
               </w:rPr>
-              <w:t xml:space="default">1</w:t>
+              <w:t xml:space="default">40</w:t>
             </w:r>
           </w:p>
         </w:tc>
@@ -1801,7 +1642,7 @@
                 <w:rFonts w:ascii="Calibri" w:hAnsi="Calibri"/>
                 <w:sz w:val="20"/>
               </w:rPr>
-              <w:t xml:space="default">Northeast/Southwest</w:t>
+              <w:t xml:space="default">North/South</w:t>
             </w:r>
           </w:p>
         </w:tc>
@@ -1854,7 +1695,7 @@
                 <w:rFonts w:ascii="Calibri" w:hAnsi="Calibri"/>
                 <w:sz w:val="20"/>
               </w:rPr>
-              <w:t xml:space="default">corrugated metal roofin excellentcondition. NA</w:t>
+              <w:t xml:space="default">Asphalt Shinglesin faircondition. NA</w:t>
             </w:r>
           </w:p>
         </w:tc>
@@ -1907,7 +1748,7 @@
                 <w:rFonts w:ascii="Calibri" w:hAnsi="Calibri"/>
                 <w:sz w:val="20"/>
               </w:rPr>
-              <w:t xml:space="default">Current moisture control strategies: large overhangs, drain around foundation. These were in fair condition .NA</w:t>
+              <w:t xml:space="default">Current moisture control strategies: gutters, ground slopes away from foundation, sump pump, native shrubery. These were in fair condition .Gutters were only present on the south side of the house.</w:t>
             </w:r>
           </w:p>
         </w:tc>
@@ -1960,7 +1801,7 @@
                 <w:rFonts w:ascii="Calibri" w:hAnsi="Calibri"/>
                 <w:sz w:val="20"/>
               </w:rPr>
-              <w:t xml:space="default">wood siding in fair condition. paint peeling off mostly on the side facing the lake</w:t>
+              <w:t xml:space="default">wood shingles in fair condition. NA</w:t>
             </w:r>
           </w:p>
         </w:tc>
@@ -2013,7 +1854,7 @@
                 <w:rFonts w:ascii="Calibri" w:hAnsi="Calibri"/>
                 <w:sz w:val="20"/>
               </w:rPr>
-              <w:t xml:space="default">There are 1 insulated fiberglass exterior doors. In fair condition, totaling 20 square feet.</w:t>
+              <w:t xml:space="default">There are 2 hollow fiberglass exterior doors. In fair condition, totaling 38.9 square feet.</w:t>
             </w:r>
           </w:p>
         </w:tc>
@@ -2066,7 +1907,7 @@
                 <w:rFonts w:ascii="Calibri" w:hAnsi="Calibri"/>
                 <w:sz w:val="20"/>
               </w:rPr>
-              <w:t xml:space="default">There are 2 single paned wood windows. In fair condition, totaling 6.4 square feet. Moreover there are 10 double paned fiberglass windows. In fair condition, totaling 925 square feet.</w:t>
+              <w:t xml:space="default">There are 12 double paned vinyl windows. In fair condition, totaling 133.62 square feet.</w:t>
             </w:r>
           </w:p>
         </w:tc>
@@ -2142,7 +1983,7 @@
                 <w:rFonts w:ascii="Calibri" w:hAnsi="Calibri"/>
                 <w:sz w:val="20"/>
               </w:rPr>
-              <w:t xml:space="default">The framing type of the home is platform framing, which means that wall cavities do not extend the full height of the building and are instead separated by floors. There is Batts of Fiberglass insulation 4 inches thick in poor condition. NA</w:t>
+              <w:t xml:space="default">The framing type of the home is platform framing, which means that wall cavities do not extend the full height of the building and are instead separated by floors. There is Batts of Fiberglass insulation 3 inches thick in NA condition. We were unable to determine the condition of the wall insulation.</w:t>
             </w:r>
           </w:p>
         </w:tc>
@@ -2248,7 +2089,7 @@
                 <w:rFonts w:ascii="Calibri" w:hAnsi="Calibri"/>
                 <w:sz w:val="20"/>
               </w:rPr>
-              <w:t xml:space="default">NA</w:t>
+              <w:t xml:space="default">There is no bathroom exhaust fan, which causes mold and moisture issues. The resident runs a fan in the bathroom to keep it dry.</w:t>
             </w:r>
           </w:p>
         </w:tc>
@@ -2301,7 +2142,7 @@
                 <w:rFonts w:ascii="Calibri" w:hAnsi="Calibri"/>
                 <w:sz w:val="20"/>
               </w:rPr>
-              <w:t xml:space="default">NA used NA kWh in NA minutes. NA used NA kWh in NA minutes. NA</w:t>
+              <w:t xml:space="default">Refrigerator used 0.05 kWh in 87 minutes. NA used NA kWh in NA minutes. The stove is electric, but the oven does not work.</w:t>
             </w:r>
           </w:p>
         </w:tc>
@@ -2409,7 +2250,7 @@
                 <w:rFonts w:ascii="Calibri" w:hAnsi="Calibri"/>
                 <w:sz w:val="20"/>
               </w:rPr>
-              <w:t xml:space="default">2300</w:t>
+              <w:t xml:space="default">1346</w:t>
             </w:r>
           </w:p>
         </w:tc>
@@ -2486,7 +2327,7 @@
                 <w:rFonts w:ascii="Calibri" w:hAnsi="Calibri"/>
                 <w:sz w:val="20"/>
               </w:rPr>
-              <w:t xml:space="default">11.9</w:t>
+              <w:t xml:space="default">NA</w:t>
             </w:r>
           </w:p>
         </w:tc>
@@ -2563,7 +2404,7 @@
                 <w:rFonts w:ascii="Calibri" w:hAnsi="Calibri"/>
                 <w:sz w:val="20"/>
               </w:rPr>
-              <w:t xml:space="default">230 under natural conditions. TEST</w:t>
+              <w:t xml:space="default">134.6 under natural conditions. TEST</w:t>
             </w:r>
           </w:p>
         </w:tc>
@@ -2640,7 +2481,7 @@
                 <w:rFonts w:ascii="Calibri" w:hAnsi="Calibri"/>
                 <w:sz w:val="20"/>
               </w:rPr>
-              <w:t xml:space="default">0.9</w:t>
+              <w:t xml:space="default">NA</w:t>
             </w:r>
           </w:p>
         </w:tc>
@@ -2803,7 +2644,7 @@
                 <w:rFonts w:ascii="Calibri" w:hAnsi="Calibri"/>
                 <w:sz w:val="20"/>
               </w:rPr>
-              <w:t xml:space="default">NA</w:t>
+              <w:t xml:space="default">720</w:t>
             </w:r>
           </w:p>
         </w:tc>
@@ -2909,7 +2750,7 @@
                 <w:rFonts w:ascii="Calibri" w:hAnsi="Calibri"/>
                 <w:sz w:val="20"/>
               </w:rPr>
-              <w:t xml:space="default">NA</w:t>
+              <w:t xml:space="default">Fair</w:t>
             </w:r>
           </w:p>
         </w:tc>
@@ -2962,7 +2803,7 @@
                 <w:rFonts w:ascii="Calibri" w:hAnsi="Calibri"/>
                 <w:sz w:val="20"/>
               </w:rPr>
-              <w:t xml:space="default">There is NAair sealing. NA</w:t>
+              <w:t xml:space="default">There is Yesair sealing. There is air-sealing around the woodstove chimney.</w:t>
             </w:r>
           </w:p>
         </w:tc>
@@ -3015,7 +2856,7 @@
                 <w:rFonts w:ascii="Calibri" w:hAnsi="Calibri"/>
                 <w:sz w:val="20"/>
               </w:rPr>
-              <w:t xml:space="default">original batts from 2010s No NA</w:t>
+              <w:t xml:space="default">Some of the batts of fiberglass are lifting up a bit, and there is space to add more insulation. No NA</w:t>
             </w:r>
           </w:p>
         </w:tc>
@@ -3068,7 +2909,7 @@
                 <w:rFonts w:ascii="Calibri" w:hAnsi="Calibri"/>
                 <w:sz w:val="20"/>
               </w:rPr>
-              <w:t xml:space="default">Yes</w:t>
+              <w:t xml:space="default">No</w:t>
             </w:r>
           </w:p>
         </w:tc>
@@ -3197,7 +3038,7 @@
                 <w:rFonts w:ascii="Calibri" w:hAnsi="Calibri"/>
                 <w:sz w:val="20"/>
               </w:rPr>
-              <w:t xml:space="default">190</w:t>
+              <w:t xml:space="default">720</w:t>
             </w:r>
           </w:p>
         </w:tc>
@@ -3250,7 +3091,7 @@
                 <w:rFonts w:ascii="Calibri" w:hAnsi="Calibri"/>
                 <w:sz w:val="20"/>
               </w:rPr>
-              <w:t xml:space="default">NANA</w:t>
+              <w:t xml:space="default">NAThere is a lot of moisture in the crawlspace, and there is a very damp batt of insulation.</w:t>
             </w:r>
           </w:p>
         </w:tc>
@@ -3356,7 +3197,7 @@
                 <w:rFonts w:ascii="Calibri" w:hAnsi="Calibri"/>
                 <w:sz w:val="20"/>
               </w:rPr>
-              <w:t xml:space="default">NA</w:t>
+              <w:t xml:space="default">No appliances</w:t>
             </w:r>
           </w:p>
         </w:tc>
@@ -3409,7 +3250,7 @@
                 <w:rFonts w:ascii="Calibri" w:hAnsi="Calibri"/>
                 <w:sz w:val="20"/>
               </w:rPr>
-              <w:t xml:space="default">NAin NAcondition. NA</w:t>
+              <w:t xml:space="default">sump pumpin poorcondition. Gutters were only present on the south side of the house.</w:t>
             </w:r>
           </w:p>
         </w:tc>
@@ -3591,7 +3432,7 @@
                 <w:rFonts w:ascii="Calibri" w:hAnsi="Calibri"/>
                 <w:sz w:val="20"/>
               </w:rPr>
-              <w:t xml:space="default">The electrical panel has and amperage of 100. There are 9 unused breaker spaces. 2 broken spaces, was tripping a lot so homeowner had another line put in which seems to have solved the problem</w:t>
+              <w:t xml:space="default">The electrical panel has and amperage of 200. There are 0 unused breaker spaces. NA</w:t>
             </w:r>
           </w:p>
         </w:tc>
@@ -3718,7 +3559,7 @@
     </w:tbl>
     <w:bookmarkEnd w:id="40"/>
     <w:bookmarkEnd w:id="41"/>
-    <w:bookmarkStart w:id="60" w:name="recommendations"/>
+    <w:bookmarkStart w:id="57" w:name="recommendations"/>
     <w:p>
       <w:pPr>
         <w:pStyle w:val="Heading2"/>
@@ -3799,17 +3640,17 @@
         <w:pStyle w:val="BodyText"/>
       </w:pPr>
       <w:r>
-        <w:t xml:space="preserve">A typical family will save ~10,000 gallons of water per year and over $100 per year in water heating costs. We provide these for free and have several styles for you to choose from; contact us for some if we did not give you any during the audit.</w:t>
+        <w:t xml:space="preserve">A typical family will save ~10,000 gallons of water per year and over $100 per year in water heating costs. We provide these for free; contact us for some if we did not give you any during the audit.</w:t>
       </w:r>
     </w:p>
     <w:bookmarkEnd w:id="42"/>
-    <w:bookmarkStart w:id="43" w:name="leds"/>
+    <w:bookmarkStart w:id="43" w:name="window-dressers"/>
     <w:p>
       <w:pPr>
         <w:pStyle w:val="Heading3"/>
       </w:pPr>
       <w:r>
-        <w:t xml:space="preserve">4.2 LEDs</w:t>
+        <w:t xml:space="preserve">4.2 Window Dressers</w:t>
       </w:r>
     </w:p>
     <w:p>
@@ -3829,7 +3670,7 @@
         <w:pStyle w:val="BodyText"/>
       </w:pPr>
       <w:r>
-        <w:t xml:space="preserve">Your lighting uses more energy than LED bulbs would. Halogen and incandescent light bulbs use 5-8x more energy than LEDs. This requires significantly more electricity and costs a lot.</w:t>
+        <w:t xml:space="preserve">Your windows are a source of heat loss, reduce your comfort due to cold surface temperatures, and may also cause moisture condensation or frost in the winter.</w:t>
       </w:r>
     </w:p>
     <w:p>
@@ -3849,13 +3690,11 @@
         <w:pStyle w:val="BodyText"/>
       </w:pPr>
       <w:r>
-        <w:t xml:space="preserve">Switch your light bulbs to LED light bulbs. LEDs use 80% less energy than incandescent light bulbs which can significantly reduce your electricity bill.</w:t>
-      </w:r>
-    </w:p>
-    <w:p>
-      <w:pPr>
-        <w:pStyle w:val="BodyText"/>
-      </w:pPr>
+        <w:t xml:space="preserve">WindowDressers are insulating window inserts that help air-seal windows and reduce heat loss and gain. WindowDressers are transparent and let in light while stopping drafts. Each insert is made of a custom-made pine frame wrapped on each side with tightly sealed, clear polyolefin film, creating an airspace between the two layers for additional insulation. The insert is finished with a compressible foam weather seal. The foam allows enough give for the inserts to be easily slid into place in the fall and removed in the spring while holding firmly enough to provide a tight, friction-based seal. The inserts are installed inside your existing window frame with no fasteners required and last 5-10 years. They are most effective in the winter, but depending on the window’s exposure, they can sometimes be used in the summer to keep the house cooler.</w:t>
+      </w:r>
+      <w:r>
+        <w:t xml:space="preserve"> </w:t>
+      </w:r>
       <w:r>
         <w:rPr>
           <w:i/>
@@ -3869,17 +3708,45 @@
         <w:pStyle w:val="BodyText"/>
       </w:pPr>
       <w:r>
-        <w:t xml:space="preserve">We provide free LED light bulbs; contact us for some if we did not give you any during the audit. Depending on usage, LEDs can save more than $50 a year.</w:t>
+        <w:t xml:space="preserve">Insulating window inserts save 5-10% of your heating costs at less than 1/10th the cost of replacement windows. The overall project cost will depend on the number and size of window inserts. Example prices for the 2024 season were: small (20 x 36”) - $36 for natural pine frame, $46 for white; medium (30 x 52”) - $50 for natural pine frame, $64 for white; large (44 x 68”) - $67 for natural pine frame, $88 for white. Adjusted pricing for lower-income households is available from WindowDressers upon request. If plastic is damaged, it can be replaced for $15.</w:t>
+      </w:r>
+    </w:p>
+    <w:p>
+      <w:pPr>
+        <w:pStyle w:val="BodyText"/>
+      </w:pPr>
+      <w:r>
+        <w:t xml:space="preserve">Households that order inserts are expected to participate in the Community Build where the inserts are made. You can sign up for a 4-hour shift and learn the simple steps in the insert-building process (no previous experience required, no power tools). Each job has</w:t>
+      </w:r>
+      <w:r>
+        <w:t xml:space="preserve"> </w:t>
+      </w:r>
+      <w:r>
+        <w:t xml:space="preserve">“jigs”</w:t>
+      </w:r>
+      <w:r>
+        <w:t xml:space="preserve"> </w:t>
+      </w:r>
+      <w:r>
+        <w:t xml:space="preserve">that make the job easier to do and ensure uniform quality. You will be trained at the beginning of your shift on how to do your task. Volunteering for multiple shifts is encouraged! Mid-shift snacks and a meal are provided to all participants.</w:t>
+      </w:r>
+    </w:p>
+    <w:p>
+      <w:pPr>
+        <w:pStyle w:val="BodyText"/>
+      </w:pPr>
+      <w:r>
+        <w:t xml:space="preserve">If you would like to participate, please contact us so we can discuss how the program works and which windows you’d like inserts for.</w:t>
       </w:r>
     </w:p>
     <w:bookmarkEnd w:id="43"/>
-    <w:bookmarkStart w:id="44" w:name="window-dressers"/>
+    <w:bookmarkStart w:id="44" w:name="induction-stoveoven"/>
     <w:p>
       <w:pPr>
         <w:pStyle w:val="Heading3"/>
       </w:pPr>
       <w:r>
-        <w:t xml:space="preserve">4.3 Window Dressers</w:t>
+        <w:t xml:space="preserve">4.3 Induction Stove/Oven</w:t>
       </w:r>
     </w:p>
     <w:p>
@@ -3899,7 +3766,7 @@
         <w:pStyle w:val="BodyText"/>
       </w:pPr>
       <w:r>
-        <w:t xml:space="preserve">Your windows are a source of heat loss, reduce your comfort due to cold surface temperatures, and may also cause moisture condensation or frost in the winter.</w:t>
+        <w:t xml:space="preserve">Your gas range has the potential to release propane, carbon monoxide, and combustion gases into your house. Gas ranges are also inefficient at transferring heat to your food at 32% efficiency, compared to 85% efficiency for induction cooktops.</w:t>
       </w:r>
     </w:p>
     <w:p>
@@ -3919,11 +3786,13 @@
         <w:pStyle w:val="BodyText"/>
       </w:pPr>
       <w:r>
-        <w:t xml:space="preserve">WindowDressers are insulating window inserts that help air-seal windows and reduce heat loss and gain. WindowDressers are transparent and let in light while stopping drafts. Each insert is made of a custom-made pine frame wrapped on each side with tightly sealed, clear polyolefin film, creating an airspace between the two layers for additional insulation. The insert is finished with a compressible foam weather seal. The foam allows enough give for the inserts to be easily slid into place in the fall and removed in the spring while holding firmly enough to provide a tight, friction-based seal. The inserts are installed inside your existing window frame with no fasteners required and last 5-10 years. They are most effective in the winter, but depending on the window’s exposure, they can sometimes be used in the summer to keep the house cooler.</w:t>
-      </w:r>
-      <w:r>
-        <w:t xml:space="preserve"> </w:t>
-      </w:r>
+        <w:t xml:space="preserve">Induction cooking appliances are more efficient and safer than electric or gas ones. There is no risk of carbon monoxide or other harmful combustion gases, and the surface doesn’t heat up without a pot or pan on it.</w:t>
+      </w:r>
+    </w:p>
+    <w:p>
+      <w:pPr>
+        <w:pStyle w:val="BodyText"/>
+      </w:pPr>
       <w:r>
         <w:rPr>
           <w:i/>
@@ -3937,35 +3806,7 @@
         <w:pStyle w:val="BodyText"/>
       </w:pPr>
       <w:r>
-        <w:t xml:space="preserve">Insulating window inserts save 5-10% of your heating costs at less than 1/10th the cost of replacement windows. The overall project cost will depend on the number and size of window inserts. Example prices for the 2024 season were: small (20 x 36”) - $36 for natural pine frame, $46 for white; medium (30 x 52”) - $50 for natural pine frame, $64 for white; large (44 x 68”) - $67 for natural pine frame, $88 for white. Adjusted pricing for lower-income households is available from WindowDressers upon request. If plastic is damaged, it can be replaced for $15.</w:t>
-      </w:r>
-    </w:p>
-    <w:p>
-      <w:pPr>
-        <w:pStyle w:val="BodyText"/>
-      </w:pPr>
-      <w:r>
-        <w:t xml:space="preserve">Households that order inserts are expected to participate in the Community Build where the inserts are made. You can sign up for a 4-hour shift and learn the simple steps in the insert-building process (no previous experience required, no power tools). Each job has</w:t>
-      </w:r>
-      <w:r>
-        <w:t xml:space="preserve"> </w:t>
-      </w:r>
-      <w:r>
-        <w:t xml:space="preserve">“jigs”</w:t>
-      </w:r>
-      <w:r>
-        <w:t xml:space="preserve"> </w:t>
-      </w:r>
-      <w:r>
-        <w:t xml:space="preserve">that make the job easier to do and ensure uniform quality. You will be trained at the beginning of your shift on how to do your task. Volunteering for multiple shifts is encouraged! Mid-shift snacks and a meal are provided to all participants.</w:t>
-      </w:r>
-    </w:p>
-    <w:p>
-      <w:pPr>
-        <w:pStyle w:val="BodyText"/>
-      </w:pPr>
-      <w:r>
-        <w:t xml:space="preserve">If you would like to participate, please contact us so we can discuss how the program works and which windows you’d like inserts for.</w:t>
+        <w:t xml:space="preserve">Currently, Efficiency Maine does not offer a rebate for induction stoves. If you’re interested in trying out induction cooking but don’t want to replace your kitchen stove, consider buying a portable induction cooktop, which costs less than $100.</w:t>
       </w:r>
     </w:p>
     <w:bookmarkEnd w:id="44"/>
@@ -4435,13 +4276,13 @@
       </w:r>
     </w:p>
     <w:bookmarkEnd w:id="50"/>
-    <w:bookmarkStart w:id="51" w:name="continuous-exterior-wall-insulation"/>
+    <w:bookmarkStart w:id="51" w:name="blow-in-cellulose-wall-insulation"/>
     <w:p>
       <w:pPr>
         <w:pStyle w:val="Heading3"/>
       </w:pPr>
       <w:r>
-        <w:t xml:space="preserve">4.10 Continuous exterior wall insulation</w:t>
+        <w:t xml:space="preserve">4.10 Blow-in cellulose wall insulation</w:t>
       </w:r>
     </w:p>
     <w:p>
@@ -4461,7 +4302,7 @@
         <w:pStyle w:val="BodyText"/>
       </w:pPr>
       <w:r>
-        <w:t xml:space="preserve">There isn’t continuous insulation between the siding and the exterior walls of the house. Continuous insulation helps create a complete thermal boundary for your house, and it is now an energy code requirement for new houses.</w:t>
+        <w:t xml:space="preserve">The walls of the house are uninsulated, which is a significant source of heat loss.</w:t>
       </w:r>
     </w:p>
     <w:p>
@@ -4481,13 +4322,11 @@
         <w:pStyle w:val="BodyText"/>
       </w:pPr>
       <w:r>
-        <w:t xml:space="preserve">Add a continuous layer of insulation and potentially replace the air and moisture barrier once it becomes time to replace the siding. Add continuous insulation (R-6 or more) under the new siding to keep the house warmer in the winter and cooler in the summer. We recommend TimberHP TimberBoard insulation (produced in Madison, Maine) or Rockwool Comfortboard, but foam board can also be used. Before installing exterior insulation, the contractor can check if insulation is needed between the interior wall studs.</w:t>
-      </w:r>
-    </w:p>
-    <w:p>
-      <w:pPr>
-        <w:pStyle w:val="BodyText"/>
-      </w:pPr>
+        <w:t xml:space="preserve">Insulate the wall stud cavities with dense packed, blown-in cellulose insulation. In balloon-framed homes, this can often be done from the attic, otherwise it can be done by drilling holes into the wall cavities from either the inside or outside.</w:t>
+      </w:r>
+      <w:r>
+        <w:t xml:space="preserve"> </w:t>
+      </w:r>
       <w:r>
         <w:rPr>
           <w:i/>
@@ -4505,13 +4344,13 @@
       </w:r>
     </w:p>
     <w:bookmarkEnd w:id="51"/>
-    <w:bookmarkStart w:id="52" w:name="electrical-panel-upgrade"/>
+    <w:bookmarkStart w:id="52" w:name="continuous-exterior-wall-insulation"/>
     <w:p>
       <w:pPr>
         <w:pStyle w:val="Heading3"/>
       </w:pPr>
       <w:r>
-        <w:t xml:space="preserve">4.11 Electrical Panel Upgrade</w:t>
+        <w:t xml:space="preserve">4.11 Continuous exterior wall insulation</w:t>
       </w:r>
     </w:p>
     <w:p>
@@ -4531,6 +4370,76 @@
         <w:pStyle w:val="BodyText"/>
       </w:pPr>
       <w:r>
+        <w:t xml:space="preserve">There isn’t continuous insulation between the siding and the exterior walls of the house. Continuous insulation helps create a complete thermal boundary for your house, and it is now an energy code requirement for new houses.</w:t>
+      </w:r>
+    </w:p>
+    <w:p>
+      <w:pPr>
+        <w:pStyle w:val="BodyText"/>
+      </w:pPr>
+      <w:r>
+        <w:rPr>
+          <w:i/>
+          <w:iCs/>
+        </w:rPr>
+        <w:t xml:space="preserve">Recommendation</w:t>
+      </w:r>
+    </w:p>
+    <w:p>
+      <w:pPr>
+        <w:pStyle w:val="BodyText"/>
+      </w:pPr>
+      <w:r>
+        <w:t xml:space="preserve">Add a continuous layer of insulation and potentially replace the air and moisture barrier once it becomes time to replace the siding. Add continuous insulation (R-6 or more) under the new siding to keep the house warmer in the winter and cooler in the summer. We recommend TimberHP TimberBoard insulation (produced in Madison, Maine) or Rockwool Comfortboard, but foam board can also be used. Before installing exterior insulation, the contractor can check if insulation is needed between the interior wall studs.</w:t>
+      </w:r>
+    </w:p>
+    <w:p>
+      <w:pPr>
+        <w:pStyle w:val="BodyText"/>
+      </w:pPr>
+      <w:r>
+        <w:rPr>
+          <w:i/>
+          <w:iCs/>
+        </w:rPr>
+        <w:t xml:space="preserve">Estimated Cost/Benefits/Incentives</w:t>
+      </w:r>
+    </w:p>
+    <w:p>
+      <w:pPr>
+        <w:pStyle w:val="BodyText"/>
+      </w:pPr>
+      <w:r>
+        <w:t xml:space="preserve">Efficiency Maine rebates and other incentives for insulation work can fund up to 80% of the overall cost to weatherize your home (subject to a lifetime limit per building), up to $9,200 when combined with nonrefundable federal tax credits. You can call them at 866-376-2463 (Monday to Friday, 8:00 am to 5:00 pm) or visit their webpage about insulation rebates: https://www.efficiencymaine.com/at-home/insulation-rebates/</w:t>
+      </w:r>
+    </w:p>
+    <w:bookmarkEnd w:id="52"/>
+    <w:bookmarkStart w:id="53" w:name="electrical-panel-upgrade"/>
+    <w:p>
+      <w:pPr>
+        <w:pStyle w:val="Heading3"/>
+      </w:pPr>
+      <w:r>
+        <w:t xml:space="preserve">4.12 Electrical Panel Upgrade</w:t>
+      </w:r>
+    </w:p>
+    <w:p>
+      <w:pPr>
+        <w:pStyle w:val="FirstParagraph"/>
+      </w:pPr>
+      <w:r>
+        <w:rPr>
+          <w:i/>
+          <w:iCs/>
+        </w:rPr>
+        <w:t xml:space="preserve">Problem</w:t>
+      </w:r>
+    </w:p>
+    <w:p>
+      <w:pPr>
+        <w:pStyle w:val="BodyText"/>
+      </w:pPr>
+      <w:r>
         <w:rPr>
           <w:b/>
           <w:bCs/>
@@ -4578,14 +4487,14 @@
         <w:t xml:space="preserve">Costs of electrical components needed to support residential energy upgrades – including panels, sub-panels, branch circuits, and feeders – qualify for a 30% nonrefundable tax credit (up to $600 per item) if they have a capacity of 200 amps or more. An electrical panel upgrades also provides a good opportunity for an electrician to install whole-house surge protection, which costs $100-$400. Here are some options: https://www.popularmechanics.com/home/interior-projects/g43140886/best-whole-house-surge-protectors/</w:t>
       </w:r>
     </w:p>
-    <w:bookmarkEnd w:id="52"/>
-    <w:bookmarkStart w:id="53" w:name="air-source-heat-pump"/>
+    <w:bookmarkEnd w:id="53"/>
+    <w:bookmarkStart w:id="54" w:name="air-source-heat-pump"/>
     <w:p>
       <w:pPr>
         <w:pStyle w:val="Heading3"/>
       </w:pPr>
       <w:r>
-        <w:t xml:space="preserve">4.12 Air Source Heat Pump</w:t>
+        <w:t xml:space="preserve">4.13 Air Source Heat Pump</w:t>
       </w:r>
     </w:p>
     <w:p>
@@ -4648,14 +4557,14 @@
         <w:t xml:space="preserve">Efficiency Maine rebates can fund $1,000 to $3,000 per unit up to a lifetime limit per housing unit for $3,000 to $9,000 (depending on income level) to install heat pumps. The rebate can be combined with a nonrefundable federal tax credit of 30% of the remaining cost of the unit and labor, subject to an annual maximum benefit of $2,000 (shared with other energy property, like a heat pump water heater). You can call Efficiency Maine at 866-376-2463 (Monday to Friday, 8:00 am to 5:00 pm) or visit their website: https://www.efficiencymaine.com/at-home/residential-heat-pump-incentives/</w:t>
       </w:r>
     </w:p>
-    <w:bookmarkEnd w:id="53"/>
-    <w:bookmarkStart w:id="54" w:name="solar"/>
+    <w:bookmarkEnd w:id="54"/>
+    <w:bookmarkStart w:id="55" w:name="solar"/>
     <w:p>
       <w:pPr>
         <w:pStyle w:val="Heading3"/>
       </w:pPr>
       <w:r>
-        <w:t xml:space="preserve">4.13 Solar</w:t>
+        <w:t xml:space="preserve">4.14 Solar</w:t>
       </w:r>
     </w:p>
     <w:p>
@@ -4730,14 +4639,14 @@
         <w:t xml:space="preserve">The State of Maine is working on a solar and battery funding initiative for low-income and disadvantaged Maine households. It is still in the planning stages, but you can find more information here: https://www.maine.gov/energy/initiatives/infrastructure/solar-for-all</w:t>
       </w:r>
     </w:p>
-    <w:bookmarkEnd w:id="54"/>
-    <w:bookmarkStart w:id="55" w:name="pipe-insulation"/>
+    <w:bookmarkEnd w:id="55"/>
+    <w:bookmarkStart w:id="56" w:name="whole-house-surge-protection"/>
     <w:p>
       <w:pPr>
         <w:pStyle w:val="Heading3"/>
       </w:pPr>
       <w:r>
-        <w:t xml:space="preserve">4.14 Pipe Insulation</w:t>
+        <w:t xml:space="preserve">4.15 Whole House Surge Protection</w:t>
       </w:r>
     </w:p>
     <w:p>
@@ -4757,7 +4666,7 @@
         <w:pStyle w:val="BodyText"/>
       </w:pPr>
       <w:r>
-        <w:t xml:space="preserve">Uninsulated water pipes are responsible for heat loss and excess moisture (from condensation) in your basement/crawlspace.</w:t>
+        <w:t xml:space="preserve">Your house does not have whole-house surge protection. This will protect your large electrical appliances from damage in the case of an electrical surge. Heat pumps, heat pump water heaters, and other electronics are particularly sensitive to electrical surges.</w:t>
       </w:r>
     </w:p>
     <w:p>
@@ -4777,13 +4686,11 @@
         <w:pStyle w:val="BodyText"/>
       </w:pPr>
       <w:r>
-        <w:t xml:space="preserve">Insulate both hot and cold water pipes that are uninsulated in the basement/crawlspace. This will save energy and prevent condensation. We recommend foam pipe insulation made of polyethylene or neoprene.</w:t>
-      </w:r>
-    </w:p>
-    <w:p>
-      <w:pPr>
-        <w:pStyle w:val="BodyText"/>
-      </w:pPr>
+        <w:t xml:space="preserve">Seal easy-to-access air leaks and weatherstrip exterior doors. In older homes, most heat loss is due to air leakage. WindowDressers insulating window inserts can also help reduce air leakage.</w:t>
+      </w:r>
+      <w:r>
+        <w:t xml:space="preserve"> </w:t>
+      </w:r>
       <w:r>
         <w:rPr>
           <w:i/>
@@ -4797,17 +4704,18 @@
         <w:pStyle w:val="BodyText"/>
       </w:pPr>
       <w:r>
-        <w:t xml:space="preserve">Insulating water pipes can save 2%-4% on hot water bills and increase the temperature of the water while reducing the time it takes for hot water to reach your tap. Materials cost around $100-200, depending on the length of pipe to insulate. Many people find this to be an easy project to do themselves.</w:t>
-      </w:r>
-    </w:p>
-    <w:bookmarkEnd w:id="55"/>
-    <w:bookmarkStart w:id="56" w:name="whole-house-surge-protection"/>
-    <w:p>
-      <w:pPr>
-        <w:pStyle w:val="Heading3"/>
-      </w:pPr>
-      <w:r>
-        <w:t xml:space="preserve">4.15 Whole House Surge Protection</w:t>
+        <w:t xml:space="preserve">The device costs $100-$400 and needs to be installed by an electrician. Here are some options: https://www.popularmechanics.com/home/interior-projects/g43140886/best-whole-house-surge-protectors/</w:t>
+      </w:r>
+    </w:p>
+    <w:bookmarkEnd w:id="56"/>
+    <w:bookmarkEnd w:id="57"/>
+    <w:bookmarkStart w:id="58" w:name="additional-resources"/>
+    <w:p>
+      <w:pPr>
+        <w:pStyle w:val="Heading2"/>
+      </w:pPr>
+      <w:r>
+        <w:t xml:space="preserve">5 Additional Resources</w:t>
       </w:r>
     </w:p>
     <w:p>
@@ -4815,345 +4723,34 @@
         <w:pStyle w:val="FirstParagraph"/>
       </w:pPr>
       <w:r>
-        <w:rPr>
-          <w:i/>
-          <w:iCs/>
-        </w:rPr>
-        <w:t xml:space="preserve">Problem</w:t>
-      </w:r>
-    </w:p>
-    <w:p>
-      <w:pPr>
-        <w:pStyle w:val="BodyText"/>
-      </w:pPr>
-      <w:r>
-        <w:t xml:space="preserve">Your house does not have whole-house surge protection. This will protect your large electrical appliances from damage in the case of an electrical surge. Heat pumps, heat pump water heaters, and other electronics are particularly sensitive to electrical surges.</w:t>
-      </w:r>
-    </w:p>
-    <w:p>
-      <w:pPr>
-        <w:pStyle w:val="BodyText"/>
-      </w:pPr>
-      <w:r>
-        <w:rPr>
-          <w:i/>
-          <w:iCs/>
-        </w:rPr>
-        <w:t xml:space="preserve">Recommendation</w:t>
-      </w:r>
-    </w:p>
-    <w:p>
-      <w:pPr>
-        <w:pStyle w:val="BodyText"/>
-      </w:pPr>
-      <w:r>
-        <w:t xml:space="preserve">Seal easy-to-access air leaks and weatherstrip exterior doors. In older homes, most heat loss is due to air leakage. WindowDressers insulating window inserts can also help reduce air leakage.</w:t>
-      </w:r>
-      <w:r>
-        <w:t xml:space="preserve"> </w:t>
-      </w:r>
-      <w:r>
-        <w:rPr>
-          <w:i/>
-          <w:iCs/>
-        </w:rPr>
-        <w:t xml:space="preserve">Estimated Cost/Benefits/Incentives</w:t>
-      </w:r>
-    </w:p>
-    <w:p>
-      <w:pPr>
-        <w:pStyle w:val="BodyText"/>
-      </w:pPr>
-      <w:r>
-        <w:t xml:space="preserve">The device costs $100-$400 and needs to be installed by an electrician. Here are some options: https://www.popularmechanics.com/home/interior-projects/g43140886/best-whole-house-surge-protectors/</w:t>
-      </w:r>
-    </w:p>
-    <w:bookmarkEnd w:id="56"/>
-    <w:bookmarkStart w:id="57" w:name="diy-air-sealing"/>
-    <w:p>
-      <w:pPr>
-        <w:pStyle w:val="Heading3"/>
-      </w:pPr>
-      <w:r>
-        <w:t xml:space="preserve">4.16 DIY Air Sealing</w:t>
-      </w:r>
-    </w:p>
-    <w:p>
-      <w:pPr>
-        <w:pStyle w:val="FirstParagraph"/>
-      </w:pPr>
-      <w:r>
-        <w:rPr>
-          <w:i/>
-          <w:iCs/>
-        </w:rPr>
-        <w:t xml:space="preserve">Problem</w:t>
-      </w:r>
-    </w:p>
-    <w:p>
-      <w:pPr>
-        <w:pStyle w:val="BodyText"/>
-      </w:pPr>
-      <w:r>
-        <w:t xml:space="preserve">During the blower door test, we noted sources of air leakage in the living areas of your house.</w:t>
-      </w:r>
-    </w:p>
-    <w:p>
-      <w:pPr>
-        <w:pStyle w:val="BodyText"/>
-      </w:pPr>
-      <w:r>
-        <w:rPr>
-          <w:b/>
-          <w:bCs/>
-        </w:rPr>
-        <w:t xml:space="preserve">Auditor to detail customized findings.</w:t>
-      </w:r>
-      <w:r>
-        <w:rPr>
-          <w:b/>
-          <w:bCs/>
-        </w:rPr>
-        <w:t xml:space="preserve"> </w:t>
-      </w:r>
-    </w:p>
-    <w:p>
-      <w:pPr>
-        <w:pStyle w:val="BodyText"/>
-      </w:pPr>
-      <w:r>
-        <w:rPr>
-          <w:i/>
-          <w:iCs/>
-        </w:rPr>
-        <w:t xml:space="preserve">Recommendation</w:t>
-      </w:r>
-    </w:p>
-    <w:p>
-      <w:pPr>
-        <w:pStyle w:val="BodyText"/>
-      </w:pPr>
-      <w:r>
-        <w:t xml:space="preserve">Air sealing the air leaks we identified around the living areas of your house can be a DIY solution to lower energy use, or an insulation contractor can seal the leaks when they come to your house for a larger project. Please address any moisture concerns before undertaking significant air sealing efforts.</w:t>
-      </w:r>
-    </w:p>
-    <w:p>
-      <w:pPr>
-        <w:pStyle w:val="BodyText"/>
-      </w:pPr>
-      <w:r>
-        <w:rPr>
-          <w:i/>
-          <w:iCs/>
-        </w:rPr>
-        <w:t xml:space="preserve">Estimated Cost/Benefits/Incentives</w:t>
-      </w:r>
-    </w:p>
-    <w:p>
-      <w:pPr>
-        <w:pStyle w:val="BodyText"/>
-      </w:pPr>
-      <w:r>
-        <w:t xml:space="preserve">Air sealing and insulating ductwork is eligible for a non-refundable federal tax credit (</w:t>
-      </w:r>
-      <w:r>
-        <w:t xml:space="preserve">“Energy Efficient Home Improvement Credit”</w:t>
-      </w:r>
-      <w:r>
-        <w:t xml:space="preserve">), which can pay for 30% of the project cost, subject to an annual maximum of $1,200 (shared with other home envelope improvements, like attic and basement projects).</w:t>
-      </w:r>
-    </w:p>
-    <w:bookmarkEnd w:id="57"/>
-    <w:bookmarkStart w:id="58" w:name="other-1"/>
-    <w:p>
-      <w:pPr>
-        <w:pStyle w:val="Heading3"/>
-      </w:pPr>
-      <w:r>
-        <w:t xml:space="preserve">4.17 Other 1</w:t>
-      </w:r>
-    </w:p>
-    <w:p>
-      <w:pPr>
-        <w:pStyle w:val="FirstParagraph"/>
-      </w:pPr>
-      <w:r>
-        <w:rPr>
-          <w:i/>
-          <w:iCs/>
-        </w:rPr>
-        <w:t xml:space="preserve">Problem</w:t>
-      </w:r>
-    </w:p>
-    <w:p>
-      <w:pPr>
-        <w:pStyle w:val="BodyText"/>
-      </w:pPr>
-      <w:r>
-        <w:rPr>
-          <w:i/>
-          <w:iCs/>
-        </w:rPr>
-        <w:t xml:space="preserve">Recommendation</w:t>
-      </w:r>
-    </w:p>
-    <w:p>
-      <w:pPr>
-        <w:pStyle w:val="BodyText"/>
-      </w:pPr>
-      <w:r>
-        <w:t xml:space="preserve">Upgrade your electrical panel to add whole-house surge protection. This will help to protect your heat pumps, heat pump water heater, refrigerator, well pump, and other electronics from damage due to lightning or other electrical surges.</w:t>
-      </w:r>
-    </w:p>
-    <w:p>
-      <w:pPr>
-        <w:pStyle w:val="BodyText"/>
-      </w:pPr>
-      <w:r>
-        <w:rPr>
-          <w:i/>
-          <w:iCs/>
-        </w:rPr>
-        <w:t xml:space="preserve">Estimated Cost/Benefits/Incentives</w:t>
-      </w:r>
-    </w:p>
-    <w:p>
-      <w:pPr>
-        <w:pStyle w:val="BodyText"/>
-      </w:pPr>
-      <w:r>
-        <w:rPr>
-          <w:b/>
-          <w:bCs/>
-        </w:rPr>
-        <w:t xml:space="preserve">Auditor to describe. Primary residence</w:t>
+        <w:t xml:space="preserve">Many home efficiency upgrades are eligible for Efficiency Maine rebates and federal tax credits. Financial incentives vary based on income level and type of occupancy. An overview of all state rebates and federal tax credits can be found here: https://www.efficiencymaine.com/at-home/.</w:t>
+      </w:r>
+    </w:p>
+    <w:p>
+      <w:pPr>
+        <w:pStyle w:val="BodyText"/>
+      </w:pPr>
+      <w:r>
+        <w:t xml:space="preserve">You can search for Efficiency Maine registered contractors here: https://www.efficiencymaine.com/at-home/vendor-locator/.</w:t>
+      </w:r>
+    </w:p>
+    <w:p>
+      <w:pPr>
+        <w:pStyle w:val="BodyText"/>
+      </w:pPr>
+      <w:r>
+        <w:t xml:space="preserve">We recommend discussing a whole-home plan for insulation and air sealing work in the basement, walls, and attic with contractors to determine how to best sequence the work to take full advantage of the Efficiency Maine rebates (which are subject to lifetime maximums) and nonrefundable federal tax credits (which are subject to annual maximums).</w:t>
+      </w:r>
+    </w:p>
+    <w:p>
+      <w:pPr>
+        <w:pStyle w:val="BodyText"/>
+      </w:pPr>
+      <w:r>
+        <w:t xml:space="preserve">Efficiency Maine also offers home energy loans to help homeowners who are Maine residents pay for energy and related health and safety upgrades. There are no fees, and interest rates for multi-year loans are between 5.99% (max $7,500) and 7.99% (max $25,000), depending on income level. Low- and moderate-income homeowners who borrow the full $7,500 and pay it back over 10 years will pay a monthly cost of $83. There is also a 1-year, 0% APR option. To learn more or apply, call 866-376-2463 or visit https://www.efficiencymaine.com/home-energy-loans/</w:t>
       </w:r>
     </w:p>
     <w:bookmarkEnd w:id="58"/>
-    <w:bookmarkStart w:id="59" w:name="replace-doors"/>
-    <w:p>
-      <w:pPr>
-        <w:pStyle w:val="Heading3"/>
-      </w:pPr>
-      <w:r>
-        <w:t xml:space="preserve">4.18 Replace Doors</w:t>
-      </w:r>
-    </w:p>
-    <w:p>
-      <w:pPr>
-        <w:pStyle w:val="FirstParagraph"/>
-      </w:pPr>
-      <w:r>
-        <w:rPr>
-          <w:i/>
-          <w:iCs/>
-        </w:rPr>
-        <w:t xml:space="preserve">Problem</w:t>
-      </w:r>
-    </w:p>
-    <w:p>
-      <w:pPr>
-        <w:pStyle w:val="BodyText"/>
-      </w:pPr>
-      <w:r>
-        <w:rPr>
-          <w:b/>
-          <w:bCs/>
-        </w:rPr>
-        <w:t xml:space="preserve">Need to get the description of the problem</w:t>
-      </w:r>
-    </w:p>
-    <w:p>
-      <w:pPr>
-        <w:pStyle w:val="BodyText"/>
-      </w:pPr>
-      <w:r>
-        <w:rPr>
-          <w:i/>
-          <w:iCs/>
-        </w:rPr>
-        <w:t xml:space="preserve">Recommendation</w:t>
-      </w:r>
-    </w:p>
-    <w:p>
-      <w:pPr>
-        <w:pStyle w:val="BodyText"/>
-      </w:pPr>
-      <w:r>
-        <w:t xml:space="preserve">Replace uninsulated exterior doors and ensure new doors are insulated and properly weatherstripped. We recommend installing doors that are Energy Star certified for</w:t>
-      </w:r>
-      <w:r>
-        <w:t xml:space="preserve"> </w:t>
-      </w:r>
-      <w:r>
-        <w:t xml:space="preserve">‘Northern’</w:t>
-      </w:r>
-      <w:r>
-        <w:t xml:space="preserve"> </w:t>
-      </w:r>
-      <w:r>
-        <w:t xml:space="preserve">climate.</w:t>
-      </w:r>
-      <w:r>
-        <w:rPr>
-          <w:i/>
-          <w:iCs/>
-        </w:rPr>
-        <w:t xml:space="preserve">Estimated Costs/Benefits/Incentives</w:t>
-      </w:r>
-    </w:p>
-    <w:p>
-      <w:pPr>
-        <w:pStyle w:val="BodyText"/>
-      </w:pPr>
-      <w:r>
-        <w:t xml:space="preserve">New doors are eligible for a nonrefundable federal tax credit of 30% of the cost of the door units up to $250 per door and $500 total, subject to an annual maximum benefit of $1,200 (shared with other home envelope improvements, like attic and basement insulation).</w:t>
-      </w:r>
-    </w:p>
-    <w:bookmarkEnd w:id="59"/>
-    <w:bookmarkEnd w:id="60"/>
-    <w:bookmarkStart w:id="61" w:name="additional-resources"/>
-    <w:p>
-      <w:pPr>
-        <w:pStyle w:val="Heading2"/>
-      </w:pPr>
-      <w:r>
-        <w:t xml:space="preserve">5 Additional Resources</w:t>
-      </w:r>
-    </w:p>
-    <w:p>
-      <w:pPr>
-        <w:pStyle w:val="FirstParagraph"/>
-      </w:pPr>
-      <w:r>
-        <w:t xml:space="preserve">Many home efficiency upgrades are eligible for Efficiency Maine rebates and federal tax credits. Financial incentives vary based on income level and type of occupancy. An overview of all state rebates and federal tax credits can be found here: https://www.efficiencymaine.com/at-home/.</w:t>
-      </w:r>
-    </w:p>
-    <w:p>
-      <w:pPr>
-        <w:pStyle w:val="BodyText"/>
-      </w:pPr>
-      <w:r>
-        <w:t xml:space="preserve">You can search for Efficiency Maine registered contractors here: https://www.efficiencymaine.com/at-home/vendor-locator/.</w:t>
-      </w:r>
-    </w:p>
-    <w:p>
-      <w:pPr>
-        <w:pStyle w:val="BodyText"/>
-      </w:pPr>
-      <w:r>
-        <w:t xml:space="preserve">We recommend discussing a whole-home plan for insulation and air sealing work in the basement, walls, and attic with contractors to determine how to best sequence the work to take full advantage of the Efficiency Maine rebates (which are subject to lifetime maximums) and nonrefundable federal tax credits (which are subject to annual maximums).</w:t>
-      </w:r>
-    </w:p>
-    <w:p>
-      <w:pPr>
-        <w:pStyle w:val="BodyText"/>
-      </w:pPr>
-      <w:r>
-        <w:t xml:space="preserve">Efficiency Maine also offers home energy loans to help homeowners who are Maine residents pay for energy and related health and safety upgrades. There are no fees, and interest rates for multi-year loans are between 5.99% (max $7,500) and 7.99% (max $25,000), depending on income level. Low- and moderate-income homeowners who borrow the full $7,500 and pay it back over 10 years will pay a monthly cost of $83. There is also a 1-year, 0% APR option. To learn more or apply, call 866-376-2463 or visit https://www.efficiencymaine.com/home-energy-loans/</w:t>
-      </w:r>
-    </w:p>
-    <w:bookmarkEnd w:id="61"/>
     <w:sectPr>
       <w:footerReference r:id="rId9" w:type="default"/>
       <w:pgSz w:h="15840" w:w="12240"/>

</xml_diff>

<commit_message>
Re-render Sharon Morrell report
</commit_message>
<xml_diff>
--- a/Quarto_report/Audit_Report.docx
+++ b/Quarto_report/Audit_Report.docx
@@ -15,23 +15,23 @@
         <w:pStyle w:val="FirstParagraph"/>
       </w:pPr>
       <w:r>
-        <w:t xml:space="preserve">Homeowner(s): Cezar Ferreira</w:t>
-      </w:r>
-    </w:p>
-    <w:p>
-      <w:pPr>
-        <w:pStyle w:val="BodyText"/>
-      </w:pPr>
-      <w:r>
-        <w:t xml:space="preserve">Address: 300 B Cranberry Road 04635 Cranberry Isles Maine</w:t>
-      </w:r>
-    </w:p>
-    <w:p>
-      <w:pPr>
-        <w:pStyle w:val="BodyText"/>
-      </w:pPr>
-      <w:r>
-        <w:t xml:space="preserve">Owner Contact: akmjem@yahoo.com, 7172752993</w:t>
+        <w:t xml:space="preserve">Homeowner(s): Sharon Morrell</w:t>
+      </w:r>
+    </w:p>
+    <w:p>
+      <w:pPr>
+        <w:pStyle w:val="BodyText"/>
+      </w:pPr>
+      <w:r>
+        <w:t xml:space="preserve">Address: 300 Cranberry Road, Cranberry Isles, ME 04625</w:t>
+      </w:r>
+    </w:p>
+    <w:p>
+      <w:pPr>
+        <w:pStyle w:val="BodyText"/>
+      </w:pPr>
+      <w:r>
+        <w:t xml:space="preserve">Owner Contact: akmjem@yahoo.com, (717) 275-2993</w:t>
       </w:r>
     </w:p>
     <w:p>
@@ -344,31 +344,31 @@
                 <w:rFonts w:ascii="Calibri" w:hAnsi="Calibri"/>
                 <w:sz w:val="20"/>
               </w:rPr>
-              <w:t xml:space="default">WindowDressers</w:t>
-            </w:r>
-          </w:p>
-        </w:tc>
-        <w:tc>
-          <w:tcPr>
-            <w:tcBorders>
-              <w:top w:val="single" w:space="0" w:color="D3D3D3"/>
-              <w:bottom w:val="single" w:space="0" w:color="D3D3D3"/>
-              <w:start w:val="single" w:space="0" w:color="D3D3D3"/>
-              <w:end w:val="single" w:space="0" w:color="D3D3D3"/>
-            </w:tcBorders>
-          </w:tcPr>
-          <w:p>
-            <w:pPr>
-              <w:spacing w:before="0" w:after="60"/>
-              <w:keepNext/>
-              <w:jc w:val="start"/>
-            </w:pPr>
-            <w:r>
-              <w:rPr>
-                <w:rFonts w:ascii="Calibri" w:hAnsi="Calibri"/>
-                <w:sz w:val="20"/>
-              </w:rPr>
-              <w:t xml:space="default">WindowDressers are insulating window inserts that help air-seal windows and reduce heat loss and gain.</w:t>
+              <w:t xml:space="default">High-efficiency Shower Head(s)</w:t>
+            </w:r>
+          </w:p>
+        </w:tc>
+        <w:tc>
+          <w:tcPr>
+            <w:tcBorders>
+              <w:top w:val="single" w:space="0" w:color="D3D3D3"/>
+              <w:bottom w:val="single" w:space="0" w:color="D3D3D3"/>
+              <w:start w:val="single" w:space="0" w:color="D3D3D3"/>
+              <w:end w:val="single" w:space="0" w:color="D3D3D3"/>
+            </w:tcBorders>
+          </w:tcPr>
+          <w:p>
+            <w:pPr>
+              <w:spacing w:before="0" w:after="60"/>
+              <w:keepNext/>
+              <w:jc w:val="start"/>
+            </w:pPr>
+            <w:r>
+              <w:rPr>
+                <w:rFonts w:ascii="Calibri" w:hAnsi="Calibri"/>
+                <w:sz w:val="20"/>
+              </w:rPr>
+              <w:t xml:space="default">Install high-efficiency shower heads to reduce the amount of water and energy to heat the water used when showering.</w:t>
             </w:r>
           </w:p>
         </w:tc>
@@ -397,31 +397,31 @@
                 <w:rFonts w:ascii="Calibri" w:hAnsi="Calibri"/>
                 <w:sz w:val="20"/>
               </w:rPr>
-              <w:t xml:space="default">Vapor Barrier</w:t>
-            </w:r>
-          </w:p>
-        </w:tc>
-        <w:tc>
-          <w:tcPr>
-            <w:tcBorders>
-              <w:top w:val="single" w:space="0" w:color="D3D3D3"/>
-              <w:bottom w:val="single" w:space="0" w:color="D3D3D3"/>
-              <w:start w:val="single" w:space="0" w:color="D3D3D3"/>
-              <w:end w:val="single" w:space="0" w:color="D3D3D3"/>
-            </w:tcBorders>
-          </w:tcPr>
-          <w:p>
-            <w:pPr>
-              <w:spacing w:before="0" w:after="60"/>
-              <w:keepNext/>
-              <w:jc w:val="start"/>
-            </w:pPr>
-            <w:r>
-              <w:rPr>
-                <w:rFonts w:ascii="Calibri" w:hAnsi="Calibri"/>
-                <w:sz w:val="20"/>
-              </w:rPr>
-              <w:t xml:space="default">Install a vapor barrier on the basement floor to stop moisture from entering the basement and house.</w:t>
+              <w:t xml:space="default">WindowDressers</w:t>
+            </w:r>
+          </w:p>
+        </w:tc>
+        <w:tc>
+          <w:tcPr>
+            <w:tcBorders>
+              <w:top w:val="single" w:space="0" w:color="D3D3D3"/>
+              <w:bottom w:val="single" w:space="0" w:color="D3D3D3"/>
+              <w:start w:val="single" w:space="0" w:color="D3D3D3"/>
+              <w:end w:val="single" w:space="0" w:color="D3D3D3"/>
+            </w:tcBorders>
+          </w:tcPr>
+          <w:p>
+            <w:pPr>
+              <w:spacing w:before="0" w:after="60"/>
+              <w:keepNext/>
+              <w:jc w:val="start"/>
+            </w:pPr>
+            <w:r>
+              <w:rPr>
+                <w:rFonts w:ascii="Calibri" w:hAnsi="Calibri"/>
+                <w:sz w:val="20"/>
+              </w:rPr>
+              <w:t xml:space="default">WindowDressers are insulating window inserts that help air-seal windows and reduce heat loss and gain.</w:t>
             </w:r>
           </w:p>
         </w:tc>
@@ -450,31 +450,31 @@
                 <w:rFonts w:ascii="Calibri" w:hAnsi="Calibri"/>
                 <w:sz w:val="20"/>
               </w:rPr>
-              <w:t xml:space="default">LEDs</w:t>
-            </w:r>
-          </w:p>
-        </w:tc>
-        <w:tc>
-          <w:tcPr>
-            <w:tcBorders>
-              <w:top w:val="single" w:space="0" w:color="D3D3D3"/>
-              <w:bottom w:val="single" w:space="0" w:color="D3D3D3"/>
-              <w:start w:val="single" w:space="0" w:color="D3D3D3"/>
-              <w:end w:val="single" w:space="0" w:color="D3D3D3"/>
-            </w:tcBorders>
-          </w:tcPr>
-          <w:p>
-            <w:pPr>
-              <w:spacing w:before="0" w:after="60"/>
-              <w:keepNext/>
-              <w:jc w:val="start"/>
-            </w:pPr>
-            <w:r>
-              <w:rPr>
-                <w:rFonts w:ascii="Calibri" w:hAnsi="Calibri"/>
-                <w:sz w:val="20"/>
-              </w:rPr>
-              <w:t xml:space="default">Switch your light bulbs to LED light bulbs. LEDs use 80% less energy than incandescent light bulbs, which can significantly reduce your electricity bill.</w:t>
+              <w:t xml:space="default">Induction Stove/Oven</w:t>
+            </w:r>
+          </w:p>
+        </w:tc>
+        <w:tc>
+          <w:tcPr>
+            <w:tcBorders>
+              <w:top w:val="single" w:space="0" w:color="D3D3D3"/>
+              <w:bottom w:val="single" w:space="0" w:color="D3D3D3"/>
+              <w:start w:val="single" w:space="0" w:color="D3D3D3"/>
+              <w:end w:val="single" w:space="0" w:color="D3D3D3"/>
+            </w:tcBorders>
+          </w:tcPr>
+          <w:p>
+            <w:pPr>
+              <w:spacing w:before="0" w:after="60"/>
+              <w:keepNext/>
+              <w:jc w:val="start"/>
+            </w:pPr>
+            <w:r>
+              <w:rPr>
+                <w:rFonts w:ascii="Calibri" w:hAnsi="Calibri"/>
+                <w:sz w:val="20"/>
+              </w:rPr>
+              <w:t xml:space="default">Induction cooking appliances are more efficient and safer than electric or gas ones. There is no risk of carbon monoxide or other harmful combustion gases, and the surface doesn’t heat up without a pot or pan on it.</w:t>
             </w:r>
           </w:p>
         </w:tc>
@@ -503,31 +503,31 @@
                 <w:rFonts w:ascii="Calibri" w:hAnsi="Calibri"/>
                 <w:sz w:val="20"/>
               </w:rPr>
-              <w:t xml:space="default">Whole-House Surge Protection</w:t>
-            </w:r>
-          </w:p>
-        </w:tc>
-        <w:tc>
-          <w:tcPr>
-            <w:tcBorders>
-              <w:top w:val="single" w:space="0" w:color="D3D3D3"/>
-              <w:bottom w:val="single" w:space="0" w:color="D3D3D3"/>
-              <w:start w:val="single" w:space="0" w:color="D3D3D3"/>
-              <w:end w:val="single" w:space="0" w:color="D3D3D3"/>
-            </w:tcBorders>
-          </w:tcPr>
-          <w:p>
-            <w:pPr>
-              <w:spacing w:before="0" w:after="60"/>
-              <w:keepNext/>
-              <w:jc w:val="start"/>
-            </w:pPr>
-            <w:r>
-              <w:rPr>
-                <w:rFonts w:ascii="Calibri" w:hAnsi="Calibri"/>
-                <w:sz w:val="20"/>
-              </w:rPr>
-              <w:t xml:space="default">Upgrade your electrical panel to add whole-house surge protection.</w:t>
+              <w:t xml:space="default">Gutters</w:t>
+            </w:r>
+          </w:p>
+        </w:tc>
+        <w:tc>
+          <w:tcPr>
+            <w:tcBorders>
+              <w:top w:val="single" w:space="0" w:color="D3D3D3"/>
+              <w:bottom w:val="single" w:space="0" w:color="D3D3D3"/>
+              <w:start w:val="single" w:space="0" w:color="D3D3D3"/>
+              <w:end w:val="single" w:space="0" w:color="D3D3D3"/>
+            </w:tcBorders>
+          </w:tcPr>
+          <w:p>
+            <w:pPr>
+              <w:spacing w:before="0" w:after="60"/>
+              <w:keepNext/>
+              <w:jc w:val="start"/>
+            </w:pPr>
+            <w:r>
+              <w:rPr>
+                <w:rFonts w:ascii="Calibri" w:hAnsi="Calibri"/>
+                <w:sz w:val="20"/>
+              </w:rPr>
+              <w:t xml:space="default">Install gutters and downspouts that divert water at least six feet away from the foundation and to where the ground slopes away from the house.</w:t>
             </w:r>
           </w:p>
         </w:tc>
@@ -556,31 +556,31 @@
                 <w:rFonts w:ascii="Calibri" w:hAnsi="Calibri"/>
                 <w:sz w:val="20"/>
               </w:rPr>
-              <w:t xml:space="default">High-efficiency Shower Head(s)</w:t>
-            </w:r>
-          </w:p>
-        </w:tc>
-        <w:tc>
-          <w:tcPr>
-            <w:tcBorders>
-              <w:top w:val="single" w:space="0" w:color="D3D3D3"/>
-              <w:bottom w:val="single" w:space="0" w:color="D3D3D3"/>
-              <w:start w:val="single" w:space="0" w:color="D3D3D3"/>
-              <w:end w:val="single" w:space="0" w:color="D3D3D3"/>
-            </w:tcBorders>
-          </w:tcPr>
-          <w:p>
-            <w:pPr>
-              <w:spacing w:before="0" w:after="60"/>
-              <w:keepNext/>
-              <w:jc w:val="start"/>
-            </w:pPr>
-            <w:r>
-              <w:rPr>
-                <w:rFonts w:ascii="Calibri" w:hAnsi="Calibri"/>
-                <w:sz w:val="20"/>
-              </w:rPr>
-              <w:t xml:space="default">Install high-efficiency shower heads to reduce the amount of water and energy to heat the water used when showering.</w:t>
+              <w:t xml:space="default">Bathroom Exhaust Fan(s)</w:t>
+            </w:r>
+          </w:p>
+        </w:tc>
+        <w:tc>
+          <w:tcPr>
+            <w:tcBorders>
+              <w:top w:val="single" w:space="0" w:color="D3D3D3"/>
+              <w:bottom w:val="single" w:space="0" w:color="D3D3D3"/>
+              <w:start w:val="single" w:space="0" w:color="D3D3D3"/>
+              <w:end w:val="single" w:space="0" w:color="D3D3D3"/>
+            </w:tcBorders>
+          </w:tcPr>
+          <w:p>
+            <w:pPr>
+              <w:spacing w:before="0" w:after="60"/>
+              <w:keepNext/>
+              <w:jc w:val="start"/>
+            </w:pPr>
+            <w:r>
+              <w:rPr>
+                <w:rFonts w:ascii="Calibri" w:hAnsi="Calibri"/>
+                <w:sz w:val="20"/>
+              </w:rPr>
+              <w:t xml:space="default">Install bathroom exhaust fans in all bathrooms that do not have them. These should be rated for at least 80 cubic feet per minute (CFM) if there is a shower. We recommend the Panasonic Whisper series or similar fans that don’t create excess noise.</w:t>
             </w:r>
           </w:p>
         </w:tc>
@@ -609,31 +609,31 @@
                 <w:rFonts w:ascii="Calibri" w:hAnsi="Calibri"/>
                 <w:sz w:val="20"/>
               </w:rPr>
-              <w:t xml:space="default">Gutters</w:t>
-            </w:r>
-          </w:p>
-        </w:tc>
-        <w:tc>
-          <w:tcPr>
-            <w:tcBorders>
-              <w:top w:val="single" w:space="0" w:color="D3D3D3"/>
-              <w:bottom w:val="single" w:space="0" w:color="D3D3D3"/>
-              <w:start w:val="single" w:space="0" w:color="D3D3D3"/>
-              <w:end w:val="single" w:space="0" w:color="D3D3D3"/>
-            </w:tcBorders>
-          </w:tcPr>
-          <w:p>
-            <w:pPr>
-              <w:spacing w:before="0" w:after="60"/>
-              <w:keepNext/>
-              <w:jc w:val="start"/>
-            </w:pPr>
-            <w:r>
-              <w:rPr>
-                <w:rFonts w:ascii="Calibri" w:hAnsi="Calibri"/>
-                <w:sz w:val="20"/>
-              </w:rPr>
-              <w:t xml:space="default">Install gutters and downspouts that divert water at least six feet away from the foundation and to where the ground slopes away from the house.</w:t>
+              <w:t xml:space="default">Kitchen Exhaust Fan</w:t>
+            </w:r>
+          </w:p>
+        </w:tc>
+        <w:tc>
+          <w:tcPr>
+            <w:tcBorders>
+              <w:top w:val="single" w:space="0" w:color="D3D3D3"/>
+              <w:bottom w:val="single" w:space="0" w:color="D3D3D3"/>
+              <w:start w:val="single" w:space="0" w:color="D3D3D3"/>
+              <w:end w:val="single" w:space="0" w:color="D3D3D3"/>
+            </w:tcBorders>
+          </w:tcPr>
+          <w:p>
+            <w:pPr>
+              <w:spacing w:before="0" w:after="60"/>
+              <w:keepNext/>
+              <w:jc w:val="start"/>
+            </w:pPr>
+            <w:r>
+              <w:rPr>
+                <w:rFonts w:ascii="Calibri" w:hAnsi="Calibri"/>
+                <w:sz w:val="20"/>
+              </w:rPr>
+              <w:t xml:space="default">Install a kitchen exhaust fan to remove cooking fumes and moisture from your home. The fan should be rated for at least 100 cubic feet per minute. A kitchen fan should be ducted to the outdoors. If the ductwork will run through the attic, it should be installed before the attic is air-sealed and insulated.</w:t>
             </w:r>
           </w:p>
         </w:tc>
@@ -662,31 +662,31 @@
                 <w:rFonts w:ascii="Calibri" w:hAnsi="Calibri"/>
                 <w:sz w:val="20"/>
               </w:rPr>
-              <w:t xml:space="default">Bathroom Exhaust Fan(s)</w:t>
-            </w:r>
-          </w:p>
-        </w:tc>
-        <w:tc>
-          <w:tcPr>
-            <w:tcBorders>
-              <w:top w:val="single" w:space="0" w:color="D3D3D3"/>
-              <w:bottom w:val="single" w:space="0" w:color="D3D3D3"/>
-              <w:start w:val="single" w:space="0" w:color="D3D3D3"/>
-              <w:end w:val="single" w:space="0" w:color="D3D3D3"/>
-            </w:tcBorders>
-          </w:tcPr>
-          <w:p>
-            <w:pPr>
-              <w:spacing w:before="0" w:after="60"/>
-              <w:keepNext/>
-              <w:jc w:val="start"/>
-            </w:pPr>
-            <w:r>
-              <w:rPr>
-                <w:rFonts w:ascii="Calibri" w:hAnsi="Calibri"/>
-                <w:sz w:val="20"/>
-              </w:rPr>
-              <w:t xml:space="default">Install bathroom exhaust fans in all bathrooms that do not have them. These should be rated for at least 80 cubic feet per minute (CFM) if there is a shower. We recommend the Panasonic Whisper series or similar fans that don’t create excess noise.</w:t>
+              <w:t xml:space="default">Vapor Barrier</w:t>
+            </w:r>
+          </w:p>
+        </w:tc>
+        <w:tc>
+          <w:tcPr>
+            <w:tcBorders>
+              <w:top w:val="single" w:space="0" w:color="D3D3D3"/>
+              <w:bottom w:val="single" w:space="0" w:color="D3D3D3"/>
+              <w:start w:val="single" w:space="0" w:color="D3D3D3"/>
+              <w:end w:val="single" w:space="0" w:color="D3D3D3"/>
+            </w:tcBorders>
+          </w:tcPr>
+          <w:p>
+            <w:pPr>
+              <w:spacing w:before="0" w:after="60"/>
+              <w:keepNext/>
+              <w:jc w:val="start"/>
+            </w:pPr>
+            <w:r>
+              <w:rPr>
+                <w:rFonts w:ascii="Calibri" w:hAnsi="Calibri"/>
+                <w:sz w:val="20"/>
+              </w:rPr>
+              <w:t xml:space="default">Install a vapor barrier on the basement floor to stop moisture from entering the basement and house.</w:t>
             </w:r>
           </w:p>
         </w:tc>
@@ -715,31 +715,31 @@
                 <w:rFonts w:ascii="Calibri" w:hAnsi="Calibri"/>
                 <w:sz w:val="20"/>
               </w:rPr>
-              <w:t xml:space="default">Kitchen Exhaust Fan</w:t>
-            </w:r>
-          </w:p>
-        </w:tc>
-        <w:tc>
-          <w:tcPr>
-            <w:tcBorders>
-              <w:top w:val="single" w:space="0" w:color="D3D3D3"/>
-              <w:bottom w:val="single" w:space="0" w:color="D3D3D3"/>
-              <w:start w:val="single" w:space="0" w:color="D3D3D3"/>
-              <w:end w:val="single" w:space="0" w:color="D3D3D3"/>
-            </w:tcBorders>
-          </w:tcPr>
-          <w:p>
-            <w:pPr>
-              <w:spacing w:before="0" w:after="60"/>
-              <w:keepNext/>
-              <w:jc w:val="start"/>
-            </w:pPr>
-            <w:r>
-              <w:rPr>
-                <w:rFonts w:ascii="Calibri" w:hAnsi="Calibri"/>
-                <w:sz w:val="20"/>
-              </w:rPr>
-              <w:t xml:space="default">Install a kitchen exhaust fan to remove cooking fumes and moisture from your home. The fan should be rated for at least 100 cubic feet per minute. A kitchen fan should be ducted to the outdoors. If the ductwork will run through the attic, it should be installed before the attic is air-sealed and insulated.</w:t>
+              <w:t xml:space="default">Spray Foam Basement/Crawlspace Walls</w:t>
+            </w:r>
+          </w:p>
+        </w:tc>
+        <w:tc>
+          <w:tcPr>
+            <w:tcBorders>
+              <w:top w:val="single" w:space="0" w:color="D3D3D3"/>
+              <w:bottom w:val="single" w:space="0" w:color="D3D3D3"/>
+              <w:start w:val="single" w:space="0" w:color="D3D3D3"/>
+              <w:end w:val="single" w:space="0" w:color="D3D3D3"/>
+            </w:tcBorders>
+          </w:tcPr>
+          <w:p>
+            <w:pPr>
+              <w:spacing w:before="0" w:after="60"/>
+              <w:keepNext/>
+              <w:jc w:val="start"/>
+            </w:pPr>
+            <w:r>
+              <w:rPr>
+                <w:rFonts w:ascii="Calibri" w:hAnsi="Calibri"/>
+                <w:sz w:val="20"/>
+              </w:rPr>
+              <w:t xml:space="default">Install spray foam on the basement/crawlspace walls to prevent moisture infiltration and reduce heat loss.</w:t>
             </w:r>
           </w:p>
         </w:tc>
@@ -768,31 +768,31 @@
                 <w:rFonts w:ascii="Calibri" w:hAnsi="Calibri"/>
                 <w:sz w:val="20"/>
               </w:rPr>
-              <w:t xml:space="default">Spray Foam Basement/Crawlspace Walls</w:t>
-            </w:r>
-          </w:p>
-        </w:tc>
-        <w:tc>
-          <w:tcPr>
-            <w:tcBorders>
-              <w:top w:val="single" w:space="0" w:color="D3D3D3"/>
-              <w:bottom w:val="single" w:space="0" w:color="D3D3D3"/>
-              <w:start w:val="single" w:space="0" w:color="D3D3D3"/>
-              <w:end w:val="single" w:space="0" w:color="D3D3D3"/>
-            </w:tcBorders>
-          </w:tcPr>
-          <w:p>
-            <w:pPr>
-              <w:spacing w:before="0" w:after="60"/>
-              <w:keepNext/>
-              <w:jc w:val="start"/>
-            </w:pPr>
-            <w:r>
-              <w:rPr>
-                <w:rFonts w:ascii="Calibri" w:hAnsi="Calibri"/>
-                <w:sz w:val="20"/>
-              </w:rPr>
-              <w:t xml:space="default">Install spray foam on the basement/crawlspace walls to prevent moisture infiltration and reduce heat loss.</w:t>
+              <w:t xml:space="default">Attic Air Sealing and Insulation</w:t>
+            </w:r>
+          </w:p>
+        </w:tc>
+        <w:tc>
+          <w:tcPr>
+            <w:tcBorders>
+              <w:top w:val="single" w:space="0" w:color="D3D3D3"/>
+              <w:bottom w:val="single" w:space="0" w:color="D3D3D3"/>
+              <w:start w:val="single" w:space="0" w:color="D3D3D3"/>
+              <w:end w:val="single" w:space="0" w:color="D3D3D3"/>
+            </w:tcBorders>
+          </w:tcPr>
+          <w:p>
+            <w:pPr>
+              <w:spacing w:before="0" w:after="60"/>
+              <w:keepNext/>
+              <w:jc w:val="start"/>
+            </w:pPr>
+            <w:r>
+              <w:rPr>
+                <w:rFonts w:ascii="Calibri" w:hAnsi="Calibri"/>
+                <w:sz w:val="20"/>
+              </w:rPr>
+              <w:t xml:space="default">Air seal the attic and insulate it to at least R-60 (18 inches of loose-fill cellulose insulation).</w:t>
             </w:r>
           </w:p>
         </w:tc>
@@ -821,31 +821,31 @@
                 <w:rFonts w:ascii="Calibri" w:hAnsi="Calibri"/>
                 <w:sz w:val="20"/>
               </w:rPr>
-              <w:t xml:space="default">Electrical Panel Upgrade</w:t>
-            </w:r>
-          </w:p>
-        </w:tc>
-        <w:tc>
-          <w:tcPr>
-            <w:tcBorders>
-              <w:top w:val="single" w:space="0" w:color="D3D3D3"/>
-              <w:bottom w:val="single" w:space="0" w:color="D3D3D3"/>
-              <w:start w:val="single" w:space="0" w:color="D3D3D3"/>
-              <w:end w:val="single" w:space="0" w:color="D3D3D3"/>
-            </w:tcBorders>
-          </w:tcPr>
-          <w:p>
-            <w:pPr>
-              <w:spacing w:before="0" w:after="60"/>
-              <w:keepNext/>
-              <w:jc w:val="start"/>
-            </w:pPr>
-            <w:r>
-              <w:rPr>
-                <w:rFonts w:ascii="Calibri" w:hAnsi="Calibri"/>
-                <w:sz w:val="20"/>
-              </w:rPr>
-              <w:t xml:space="default">Consult with an electrician about replacing your existing electrical panel with a 200 amp panel as you add electrical appliances to your home.</w:t>
+              <w:t xml:space="default">Continuous Exterior Wall Insulation</w:t>
+            </w:r>
+          </w:p>
+        </w:tc>
+        <w:tc>
+          <w:tcPr>
+            <w:tcBorders>
+              <w:top w:val="single" w:space="0" w:color="D3D3D3"/>
+              <w:bottom w:val="single" w:space="0" w:color="D3D3D3"/>
+              <w:start w:val="single" w:space="0" w:color="D3D3D3"/>
+              <w:end w:val="single" w:space="0" w:color="D3D3D3"/>
+            </w:tcBorders>
+          </w:tcPr>
+          <w:p>
+            <w:pPr>
+              <w:spacing w:before="0" w:after="60"/>
+              <w:keepNext/>
+              <w:jc w:val="start"/>
+            </w:pPr>
+            <w:r>
+              <w:rPr>
+                <w:rFonts w:ascii="Calibri" w:hAnsi="Calibri"/>
+                <w:sz w:val="20"/>
+              </w:rPr>
+              <w:t xml:space="default">Add a continuous layer of insulation and potentially replace the air and moisture barrier once it becomes time to replace the siding.</w:t>
             </w:r>
           </w:p>
         </w:tc>
@@ -927,31 +927,31 @@
                 <w:rFonts w:ascii="Calibri" w:hAnsi="Calibri"/>
                 <w:sz w:val="20"/>
               </w:rPr>
-              <w:t xml:space="default">Solar</w:t>
-            </w:r>
-          </w:p>
-        </w:tc>
-        <w:tc>
-          <w:tcPr>
-            <w:tcBorders>
-              <w:top w:val="single" w:space="0" w:color="D3D3D3"/>
-              <w:bottom w:val="single" w:space="0" w:color="D3D3D3"/>
-              <w:start w:val="single" w:space="0" w:color="D3D3D3"/>
-              <w:end w:val="single" w:space="0" w:color="D3D3D3"/>
-            </w:tcBorders>
-          </w:tcPr>
-          <w:p>
-            <w:pPr>
-              <w:spacing w:before="0" w:after="60"/>
-              <w:keepNext/>
-              <w:jc w:val="start"/>
-            </w:pPr>
-            <w:r>
-              <w:rPr>
-                <w:rFonts w:ascii="Calibri" w:hAnsi="Calibri"/>
-                <w:sz w:val="20"/>
-              </w:rPr>
-              <w:t xml:space="default">Rooftop solar can supply most or all of your home electrical demands. Contact a solar company for pricing and details specific to your home.</w:t>
+              <w:t xml:space="default">Whole-House Surge Protection</w:t>
+            </w:r>
+          </w:p>
+        </w:tc>
+        <w:tc>
+          <w:tcPr>
+            <w:tcBorders>
+              <w:top w:val="single" w:space="0" w:color="D3D3D3"/>
+              <w:bottom w:val="single" w:space="0" w:color="D3D3D3"/>
+              <w:start w:val="single" w:space="0" w:color="D3D3D3"/>
+              <w:end w:val="single" w:space="0" w:color="D3D3D3"/>
+            </w:tcBorders>
+          </w:tcPr>
+          <w:p>
+            <w:pPr>
+              <w:spacing w:before="0" w:after="60"/>
+              <w:keepNext/>
+              <w:jc w:val="start"/>
+            </w:pPr>
+            <w:r>
+              <w:rPr>
+                <w:rFonts w:ascii="Calibri" w:hAnsi="Calibri"/>
+                <w:sz w:val="20"/>
+              </w:rPr>
+              <w:t xml:space="default">Upgrade your electrical panel to add whole-house surge protection.</w:t>
             </w:r>
           </w:p>
         </w:tc>
@@ -980,31 +980,31 @@
                 <w:rFonts w:ascii="Calibri" w:hAnsi="Calibri"/>
                 <w:sz w:val="20"/>
               </w:rPr>
-              <w:t xml:space="default">Attic Air Sealing and Insulation</w:t>
-            </w:r>
-          </w:p>
-        </w:tc>
-        <w:tc>
-          <w:tcPr>
-            <w:tcBorders>
-              <w:top w:val="single" w:space="0" w:color="D3D3D3"/>
-              <w:bottom w:val="single" w:space="0" w:color="D3D3D3"/>
-              <w:start w:val="single" w:space="0" w:color="D3D3D3"/>
-              <w:end w:val="single" w:space="0" w:color="D3D3D3"/>
-            </w:tcBorders>
-          </w:tcPr>
-          <w:p>
-            <w:pPr>
-              <w:spacing w:before="0" w:after="60"/>
-              <w:keepNext/>
-              <w:jc w:val="start"/>
-            </w:pPr>
-            <w:r>
-              <w:rPr>
-                <w:rFonts w:ascii="Calibri" w:hAnsi="Calibri"/>
-                <w:sz w:val="20"/>
-              </w:rPr>
-              <w:t xml:space="default">Air seal the attic and insulate it to at least R-60 (18 inches of loose-fill cellulose insulation).</w:t>
+              <w:t xml:space="default">Blown-in Cellulose Wall Insulation</w:t>
+            </w:r>
+          </w:p>
+        </w:tc>
+        <w:tc>
+          <w:tcPr>
+            <w:tcBorders>
+              <w:top w:val="single" w:space="0" w:color="D3D3D3"/>
+              <w:bottom w:val="single" w:space="0" w:color="D3D3D3"/>
+              <w:start w:val="single" w:space="0" w:color="D3D3D3"/>
+              <w:end w:val="single" w:space="0" w:color="D3D3D3"/>
+            </w:tcBorders>
+          </w:tcPr>
+          <w:p>
+            <w:pPr>
+              <w:spacing w:before="0" w:after="60"/>
+              <w:keepNext/>
+              <w:jc w:val="start"/>
+            </w:pPr>
+            <w:r>
+              <w:rPr>
+                <w:rFonts w:ascii="Calibri" w:hAnsi="Calibri"/>
+                <w:sz w:val="20"/>
+              </w:rPr>
+              <w:t xml:space="default">Insulate the wall stud cavities with dense packed, blown-in cellulose insulation.</w:t>
             </w:r>
           </w:p>
         </w:tc>
@@ -1033,31 +1033,31 @@
                 <w:rFonts w:ascii="Calibri" w:hAnsi="Calibri"/>
                 <w:sz w:val="20"/>
               </w:rPr>
-              <w:t xml:space="default">Blown-in Cellulose Wall Insulation</w:t>
-            </w:r>
-          </w:p>
-        </w:tc>
-        <w:tc>
-          <w:tcPr>
-            <w:tcBorders>
-              <w:top w:val="single" w:space="0" w:color="D3D3D3"/>
-              <w:bottom w:val="single" w:space="0" w:color="D3D3D3"/>
-              <w:start w:val="single" w:space="0" w:color="D3D3D3"/>
-              <w:end w:val="single" w:space="0" w:color="D3D3D3"/>
-            </w:tcBorders>
-          </w:tcPr>
-          <w:p>
-            <w:pPr>
-              <w:spacing w:before="0" w:after="60"/>
-              <w:keepNext/>
-              <w:jc w:val="start"/>
-            </w:pPr>
-            <w:r>
-              <w:rPr>
-                <w:rFonts w:ascii="Calibri" w:hAnsi="Calibri"/>
-                <w:sz w:val="20"/>
-              </w:rPr>
-              <w:t xml:space="default">Insulate the wall stud cavities with dense packed, blown-in cellulose insulation.</w:t>
+              <w:t xml:space="default">Solar</w:t>
+            </w:r>
+          </w:p>
+        </w:tc>
+        <w:tc>
+          <w:tcPr>
+            <w:tcBorders>
+              <w:top w:val="single" w:space="0" w:color="D3D3D3"/>
+              <w:bottom w:val="single" w:space="0" w:color="D3D3D3"/>
+              <w:start w:val="single" w:space="0" w:color="D3D3D3"/>
+              <w:end w:val="single" w:space="0" w:color="D3D3D3"/>
+            </w:tcBorders>
+          </w:tcPr>
+          <w:p>
+            <w:pPr>
+              <w:spacing w:before="0" w:after="60"/>
+              <w:keepNext/>
+              <w:jc w:val="start"/>
+            </w:pPr>
+            <w:r>
+              <w:rPr>
+                <w:rFonts w:ascii="Calibri" w:hAnsi="Calibri"/>
+                <w:sz w:val="20"/>
+              </w:rPr>
+              <w:t xml:space="default">Rooftop solar can supply most or all of your home electrical demands. Contact a solar company for pricing and details specific to your home.</w:t>
             </w:r>
           </w:p>
         </w:tc>
@@ -1086,190 +1086,31 @@
                 <w:rFonts w:ascii="Calibri" w:hAnsi="Calibri"/>
                 <w:sz w:val="20"/>
               </w:rPr>
-              <w:t xml:space="default">Continuous Exterior Wall Insulation</w:t>
-            </w:r>
-          </w:p>
-        </w:tc>
-        <w:tc>
-          <w:tcPr>
-            <w:tcBorders>
-              <w:top w:val="single" w:space="0" w:color="D3D3D3"/>
-              <w:bottom w:val="single" w:space="0" w:color="D3D3D3"/>
-              <w:start w:val="single" w:space="0" w:color="D3D3D3"/>
-              <w:end w:val="single" w:space="0" w:color="D3D3D3"/>
-            </w:tcBorders>
-          </w:tcPr>
-          <w:p>
-            <w:pPr>
-              <w:spacing w:before="0" w:after="60"/>
-              <w:keepNext/>
-              <w:jc w:val="start"/>
-            </w:pPr>
-            <w:r>
-              <w:rPr>
-                <w:rFonts w:ascii="Calibri" w:hAnsi="Calibri"/>
-                <w:sz w:val="20"/>
-              </w:rPr>
-              <w:t xml:space="default">Add a continuous layer of insulation and potentially replace the air and moisture barrier once it becomes time to replace the siding.</w:t>
-            </w:r>
-          </w:p>
-        </w:tc>
-      </w:tr>
-      <w:tr>
-        <w:trPr>
-          <w:cantSplit/>
-        </w:trPr>
-        <w:tc>
-          <w:tcPr>
-            <w:tcBorders>
-              <w:top w:val="single" w:space="0" w:color="D3D3D3"/>
-              <w:bottom w:val="single" w:space="0" w:color="D3D3D3"/>
-              <w:start w:val="single" w:space="0" w:color="D3D3D3"/>
-              <w:end w:val="single" w:space="0" w:color="D3D3D3"/>
-            </w:tcBorders>
-          </w:tcPr>
-          <w:p>
-            <w:pPr>
-              <w:spacing w:before="0" w:after="60"/>
-              <w:keepNext/>
-              <w:jc w:val="start"/>
-            </w:pPr>
-            <w:r>
-              <w:rPr>
-                <w:rFonts w:ascii="Calibri" w:hAnsi="Calibri"/>
-                <w:sz w:val="20"/>
-              </w:rPr>
-              <w:t xml:space="default">EV+Charger</w:t>
-            </w:r>
-          </w:p>
-        </w:tc>
-        <w:tc>
-          <w:tcPr>
-            <w:tcBorders>
-              <w:top w:val="single" w:space="0" w:color="D3D3D3"/>
-              <w:bottom w:val="single" w:space="0" w:color="D3D3D3"/>
-              <w:start w:val="single" w:space="0" w:color="D3D3D3"/>
-              <w:end w:val="single" w:space="0" w:color="D3D3D3"/>
-            </w:tcBorders>
-          </w:tcPr>
-          <w:p>
-            <w:pPr>
-              <w:spacing w:before="0" w:after="60"/>
-              <w:keepNext/>
-              <w:jc w:val="start"/>
-            </w:pPr>
-            <w:r>
-              <w:rPr>
-                <w:rFonts w:ascii="Calibri" w:hAnsi="Calibri"/>
-                <w:sz w:val="20"/>
-              </w:rPr>
-              <w:t xml:space="default">An electric vehicle will eliminate your gas costs and reduce fossil fuel dependence. A 2020 study by Consumer Reports found that lifetime ownership costs were significantly lower for EVs, saving between $6,000 - $10,000 over their lifetimes.</w:t>
-            </w:r>
-          </w:p>
-        </w:tc>
-      </w:tr>
-      <w:tr>
-        <w:trPr>
-          <w:cantSplit/>
-        </w:trPr>
-        <w:tc>
-          <w:tcPr>
-            <w:tcBorders>
-              <w:top w:val="single" w:space="0" w:color="D3D3D3"/>
-              <w:bottom w:val="single" w:space="0" w:color="D3D3D3"/>
-              <w:start w:val="single" w:space="0" w:color="D3D3D3"/>
-              <w:end w:val="single" w:space="0" w:color="D3D3D3"/>
-            </w:tcBorders>
-          </w:tcPr>
-          <w:p>
-            <w:pPr>
-              <w:spacing w:before="0" w:after="60"/>
-              <w:keepNext/>
-              <w:jc w:val="start"/>
-            </w:pPr>
-            <w:r>
-              <w:rPr>
-                <w:rFonts w:ascii="Calibri" w:hAnsi="Calibri"/>
-                <w:sz w:val="20"/>
-              </w:rPr>
-              <w:t xml:space="default">Pipe Insulation</w:t>
-            </w:r>
-          </w:p>
-        </w:tc>
-        <w:tc>
-          <w:tcPr>
-            <w:tcBorders>
-              <w:top w:val="single" w:space="0" w:color="D3D3D3"/>
-              <w:bottom w:val="single" w:space="0" w:color="D3D3D3"/>
-              <w:start w:val="single" w:space="0" w:color="D3D3D3"/>
-              <w:end w:val="single" w:space="0" w:color="D3D3D3"/>
-            </w:tcBorders>
-          </w:tcPr>
-          <w:p>
-            <w:pPr>
-              <w:spacing w:before="0" w:after="60"/>
-              <w:keepNext/>
-              <w:jc w:val="start"/>
-            </w:pPr>
-            <w:r>
-              <w:rPr>
-                <w:rFonts w:ascii="Calibri" w:hAnsi="Calibri"/>
-                <w:sz w:val="20"/>
-              </w:rPr>
-              <w:t xml:space="default">Insulate both hot and cold water pipes that are uninsulated in the basement/crawlspace. This will save energy and prevent condensation.</w:t>
-            </w:r>
-          </w:p>
-        </w:tc>
-      </w:tr>
-      <w:tr>
-        <w:trPr>
-          <w:cantSplit/>
-        </w:trPr>
-        <w:tc>
-          <w:tcPr>
-            <w:tcBorders>
-              <w:top w:val="single" w:space="0" w:color="D3D3D3"/>
-              <w:bottom w:val="single" w:space="0" w:color="D3D3D3"/>
-              <w:start w:val="single" w:space="0" w:color="D3D3D3"/>
-              <w:end w:val="single" w:space="0" w:color="D3D3D3"/>
-            </w:tcBorders>
-          </w:tcPr>
-          <w:p>
-            <w:pPr>
-              <w:spacing w:before="0" w:after="60"/>
-              <w:keepNext/>
-              <w:jc w:val="start"/>
-            </w:pPr>
-            <w:r>
-              <w:rPr>
-                <w:rFonts w:ascii="Calibri" w:hAnsi="Calibri"/>
-                <w:sz w:val="20"/>
-              </w:rPr>
-              <w:t xml:space="default">DIY Air Sealing</w:t>
-            </w:r>
-          </w:p>
-        </w:tc>
-        <w:tc>
-          <w:tcPr>
-            <w:tcBorders>
-              <w:top w:val="single" w:space="0" w:color="D3D3D3"/>
-              <w:bottom w:val="single" w:space="0" w:color="D3D3D3"/>
-              <w:start w:val="single" w:space="0" w:color="D3D3D3"/>
-              <w:end w:val="single" w:space="0" w:color="D3D3D3"/>
-            </w:tcBorders>
-          </w:tcPr>
-          <w:p>
-            <w:pPr>
-              <w:spacing w:before="0" w:after="60"/>
-              <w:keepNext/>
-              <w:jc w:val="start"/>
-            </w:pPr>
-            <w:r>
-              <w:rPr>
-                <w:rFonts w:ascii="Calibri" w:hAnsi="Calibri"/>
-                <w:sz w:val="20"/>
-              </w:rPr>
-              <w:t xml:space="default">Seal easy-to-access air leaks and weatherstrip exterior doors.</w:t>
+              <w:t xml:space="default">Electrical Panel Upgrade</w:t>
+            </w:r>
+          </w:p>
+        </w:tc>
+        <w:tc>
+          <w:tcPr>
+            <w:tcBorders>
+              <w:top w:val="single" w:space="0" w:color="D3D3D3"/>
+              <w:bottom w:val="single" w:space="0" w:color="D3D3D3"/>
+              <w:start w:val="single" w:space="0" w:color="D3D3D3"/>
+              <w:end w:val="single" w:space="0" w:color="D3D3D3"/>
+            </w:tcBorders>
+          </w:tcPr>
+          <w:p>
+            <w:pPr>
+              <w:spacing w:before="0" w:after="60"/>
+              <w:keepNext/>
+              <w:jc w:val="start"/>
+            </w:pPr>
+            <w:r>
+              <w:rPr>
+                <w:rFonts w:ascii="Calibri" w:hAnsi="Calibri"/>
+                <w:sz w:val="20"/>
+              </w:rPr>
+              <w:t xml:space="default">Consult with an electrician about replacing your existing electrical panel with a 200 amp panel as you add electrical appliances to your home.</w:t>
             </w:r>
           </w:p>
         </w:tc>
@@ -1460,7 +1301,7 @@
                 <w:rFonts w:ascii="Calibri" w:hAnsi="Calibri"/>
                 <w:sz w:val="20"/>
               </w:rPr>
-              <w:t xml:space="default">NA , NA inches</w:t>
+              <w:t xml:space="default">Batts of Fiberglass , 5 inches</w:t>
             </w:r>
           </w:p>
         </w:tc>
@@ -1566,7 +1407,7 @@
                 <w:rFonts w:ascii="Calibri" w:hAnsi="Calibri"/>
                 <w:sz w:val="20"/>
               </w:rPr>
-              <w:t xml:space="default">130</w:t>
+              <w:t xml:space="default">NA</w:t>
             </w:r>
           </w:p>
         </w:tc>
@@ -1619,7 +1460,7 @@
                 <w:rFonts w:ascii="Calibri" w:hAnsi="Calibri"/>
                 <w:sz w:val="20"/>
               </w:rPr>
-              <w:t xml:space="default">2817</w:t>
+              <w:t xml:space="default">NA</w:t>
             </w:r>
           </w:p>
         </w:tc>
@@ -1854,7 +1695,7 @@
                 <w:rFonts w:ascii="Calibri" w:hAnsi="Calibri"/>
                 <w:sz w:val="20"/>
               </w:rPr>
-              <w:t xml:space="default">Asphalt Shinglesin poorcondition. Moss growing on the roof</w:t>
+              <w:t xml:space="default">Asphalt Shinglesin faircondition. NA</w:t>
             </w:r>
           </w:p>
         </w:tc>
@@ -1907,7 +1748,7 @@
                 <w:rFonts w:ascii="Calibri" w:hAnsi="Calibri"/>
                 <w:sz w:val="20"/>
               </w:rPr>
-              <w:t xml:space="default">Current moisture control strategies: NA. These were in NA condition .NA</w:t>
+              <w:t xml:space="default">Current moisture control strategies: gutters, ground slopes away from foundation, sump pump, native shrubery. These were in fair condition .Gutters were only present on the south side of the house.</w:t>
             </w:r>
           </w:p>
         </w:tc>
@@ -1960,7 +1801,7 @@
                 <w:rFonts w:ascii="Calibri" w:hAnsi="Calibri"/>
                 <w:sz w:val="20"/>
               </w:rPr>
-              <w:t xml:space="default">brick in fair condition. There was damage where ht roof tilt was unsupported by gutters</w:t>
+              <w:t xml:space="default">wood shingles in fair condition. NA</w:t>
             </w:r>
           </w:p>
         </w:tc>
@@ -2013,7 +1854,7 @@
                 <w:rFonts w:ascii="Calibri" w:hAnsi="Calibri"/>
                 <w:sz w:val="20"/>
               </w:rPr>
-              <w:t xml:space="default">There are 1 hollow fiberglass exterior doors. In fair condition, totaling 1 square feet.</w:t>
+              <w:t xml:space="default">There are 2 hollow fiberglass exterior doors. In fair condition, totaling 38.9 square feet.</w:t>
             </w:r>
           </w:p>
         </w:tc>
@@ -2066,7 +1907,7 @@
                 <w:rFonts w:ascii="Calibri" w:hAnsi="Calibri"/>
                 <w:sz w:val="20"/>
               </w:rPr>
-              <w:t xml:space="default">There are 15 double paned vinyl windows. In fair condition, totaling 15 square feet.</w:t>
+              <w:t xml:space="default">There are 12 double paned vinyl windows. In fair condition, totaling 133.62 square feet.</w:t>
             </w:r>
           </w:p>
         </w:tc>
@@ -2142,7 +1983,7 @@
                 <w:rFonts w:ascii="Calibri" w:hAnsi="Calibri"/>
                 <w:sz w:val="20"/>
               </w:rPr>
-              <w:t xml:space="default">The framing type of the home is balloon framing, which means the wall cavities extend the full height of the building (from the foundation to the roof). Often the wall cavities are interconnected with the floor and ceiling cavities. This framing type can create connected passageways for air to leave the house and rodents to enter the house. There is NA insulation NA inches thick in NA condition. NA</w:t>
+              <w:t xml:space="default">The framing type of the home is platform framing, which means that wall cavities do not extend the full height of the building and are instead separated by floors. There is Batts of Fiberglass insulation 3 inches thick in NA condition. We were unable to determine the condition of the wall insulation.</w:t>
             </w:r>
           </w:p>
         </w:tc>
@@ -2248,7 +2089,7 @@
                 <w:rFonts w:ascii="Calibri" w:hAnsi="Calibri"/>
                 <w:sz w:val="20"/>
               </w:rPr>
-              <w:t xml:space="default">NA</w:t>
+              <w:t xml:space="default">There is no bathroom exhaust fan, which causes mold and moisture issues. The resident runs a fan in the bathroom to keep it dry.</w:t>
             </w:r>
           </w:p>
         </w:tc>
@@ -2301,7 +2142,7 @@
                 <w:rFonts w:ascii="Calibri" w:hAnsi="Calibri"/>
                 <w:sz w:val="20"/>
               </w:rPr>
-              <w:t xml:space="default">Fridge used 0.03 kWh in 73 minutes. NA used NA kWh in NA minutes. NA</w:t>
+              <w:t xml:space="default">Refrigerator used 0.05 kWh in 87 minutes. NA used NA kWh in NA minutes. The stove is electric, but the oven does not work.</w:t>
             </w:r>
           </w:p>
         </w:tc>
@@ -2409,7 +2250,7 @@
                 <w:rFonts w:ascii="Calibri" w:hAnsi="Calibri"/>
                 <w:sz w:val="20"/>
               </w:rPr>
-              <w:t xml:space="default">1411</w:t>
+              <w:t xml:space="default">1346</w:t>
             </w:r>
           </w:p>
         </w:tc>
@@ -2486,7 +2327,7 @@
                 <w:rFonts w:ascii="Calibri" w:hAnsi="Calibri"/>
                 <w:sz w:val="20"/>
               </w:rPr>
-              <w:t xml:space="default">30.1</w:t>
+              <w:t xml:space="default">NA</w:t>
             </w:r>
           </w:p>
         </w:tc>
@@ -2563,7 +2404,7 @@
                 <w:rFonts w:ascii="Calibri" w:hAnsi="Calibri"/>
                 <w:sz w:val="20"/>
               </w:rPr>
-              <w:t xml:space="default">141.1 under natural conditions. TEST</w:t>
+              <w:t xml:space="default">134.6 under natural conditions. TEST</w:t>
             </w:r>
           </w:p>
         </w:tc>
@@ -2640,7 +2481,7 @@
                 <w:rFonts w:ascii="Calibri" w:hAnsi="Calibri"/>
                 <w:sz w:val="20"/>
               </w:rPr>
-              <w:t xml:space="default">1.4</w:t>
+              <w:t xml:space="default">NA</w:t>
             </w:r>
           </w:p>
         </w:tc>
@@ -2803,7 +2644,7 @@
                 <w:rFonts w:ascii="Calibri" w:hAnsi="Calibri"/>
                 <w:sz w:val="20"/>
               </w:rPr>
-              <w:t xml:space="default">No attic access</w:t>
+              <w:t xml:space="default">720</w:t>
             </w:r>
           </w:p>
         </w:tc>
@@ -2856,7 +2697,7 @@
                 <w:rFonts w:ascii="Calibri" w:hAnsi="Calibri"/>
                 <w:sz w:val="20"/>
               </w:rPr>
-              <w:t xml:space="default">NA</w:t>
+              <w:t xml:space="default">Batts of Fiberglass</w:t>
             </w:r>
           </w:p>
         </w:tc>
@@ -2909,7 +2750,7 @@
                 <w:rFonts w:ascii="Calibri" w:hAnsi="Calibri"/>
                 <w:sz w:val="20"/>
               </w:rPr>
-              <w:t xml:space="default">NA</w:t>
+              <w:t xml:space="default">Fair</w:t>
             </w:r>
           </w:p>
         </w:tc>
@@ -2962,7 +2803,7 @@
                 <w:rFonts w:ascii="Calibri" w:hAnsi="Calibri"/>
                 <w:sz w:val="20"/>
               </w:rPr>
-              <w:t xml:space="default">There is NAair sealing. NA</w:t>
+              <w:t xml:space="default">There is Yesair sealing. There is air-sealing around the woodstove chimney.</w:t>
             </w:r>
           </w:p>
         </w:tc>
@@ -3015,7 +2856,7 @@
                 <w:rFonts w:ascii="Calibri" w:hAnsi="Calibri"/>
                 <w:sz w:val="20"/>
               </w:rPr>
-              <w:t xml:space="default">NA No NA</w:t>
+              <w:t xml:space="default">Some of the batts of fiberglass are lifting up a bit, and there is space to add more insulation. No NA</w:t>
             </w:r>
           </w:p>
         </w:tc>
@@ -3068,7 +2909,7 @@
                 <w:rFonts w:ascii="Calibri" w:hAnsi="Calibri"/>
                 <w:sz w:val="20"/>
               </w:rPr>
-              <w:t xml:space="default">NA</w:t>
+              <w:t xml:space="default">No</w:t>
             </w:r>
           </w:p>
         </w:tc>
@@ -3197,7 +3038,7 @@
                 <w:rFonts w:ascii="Calibri" w:hAnsi="Calibri"/>
                 <w:sz w:val="20"/>
               </w:rPr>
-              <w:t xml:space="default">NA</w:t>
+              <w:t xml:space="default">720</w:t>
             </w:r>
           </w:p>
         </w:tc>
@@ -3250,7 +3091,7 @@
                 <w:rFonts w:ascii="Calibri" w:hAnsi="Calibri"/>
                 <w:sz w:val="20"/>
               </w:rPr>
-              <w:t xml:space="default">PoorNon existent</w:t>
+              <w:t xml:space="default">NAThere is a lot of moisture in the crawlspace, and there is a very damp batt of insulation.</w:t>
             </w:r>
           </w:p>
         </w:tc>
@@ -3303,7 +3144,7 @@
                 <w:rFonts w:ascii="Calibri" w:hAnsi="Calibri"/>
                 <w:sz w:val="20"/>
               </w:rPr>
-              <w:t xml:space="default">NA</w:t>
+              <w:t xml:space="default">Uninsulated</w:t>
             </w:r>
           </w:p>
         </w:tc>
@@ -3356,7 +3197,7 @@
                 <w:rFonts w:ascii="Calibri" w:hAnsi="Calibri"/>
                 <w:sz w:val="20"/>
               </w:rPr>
-              <w:t xml:space="default">Ducts/pipes not insulated</w:t>
+              <w:t xml:space="default">No appliances</w:t>
             </w:r>
           </w:p>
         </w:tc>
@@ -3409,7 +3250,7 @@
                 <w:rFonts w:ascii="Calibri" w:hAnsi="Calibri"/>
                 <w:sz w:val="20"/>
               </w:rPr>
-              <w:t xml:space="default">Weird pipein poorcondition. NA</w:t>
+              <w:t xml:space="default">sump pumpin poorcondition. Gutters were only present on the south side of the house.</w:t>
             </w:r>
           </w:p>
         </w:tc>
@@ -3515,7 +3356,7 @@
                 <w:rFonts w:ascii="Calibri" w:hAnsi="Calibri"/>
                 <w:sz w:val="20"/>
               </w:rPr>
-              <w:t xml:space="default">There is moistureExtremely wet no vapor barrier</w:t>
+              <w:t xml:space="default">There is NANA</w:t>
             </w:r>
           </w:p>
         </w:tc>
@@ -3591,7 +3432,7 @@
                 <w:rFonts w:ascii="Calibri" w:hAnsi="Calibri"/>
                 <w:sz w:val="20"/>
               </w:rPr>
-              <w:t xml:space="default">The electrical panel has and amperage of 40. There are 9 unused breaker spaces. NA</w:t>
+              <w:t xml:space="default">The electrical panel has and amperage of 200. There are 0 unused breaker spaces. NA</w:t>
             </w:r>
           </w:p>
         </w:tc>
@@ -3718,7 +3559,7 @@
     </w:tbl>
     <w:bookmarkEnd w:id="40"/>
     <w:bookmarkEnd w:id="41"/>
-    <w:bookmarkStart w:id="60" w:name="recommendations"/>
+    <w:bookmarkStart w:id="57" w:name="recommendations"/>
     <w:p>
       <w:pPr>
         <w:pStyle w:val="Heading2"/>
@@ -3803,13 +3644,13 @@
       </w:r>
     </w:p>
     <w:bookmarkEnd w:id="42"/>
-    <w:bookmarkStart w:id="43" w:name="leds"/>
+    <w:bookmarkStart w:id="43" w:name="window-dressers"/>
     <w:p>
       <w:pPr>
         <w:pStyle w:val="Heading3"/>
       </w:pPr>
       <w:r>
-        <w:t xml:space="preserve">4.2 LEDs</w:t>
+        <w:t xml:space="preserve">4.2 Window Dressers</w:t>
       </w:r>
     </w:p>
     <w:p>
@@ -3829,7 +3670,7 @@
         <w:pStyle w:val="BodyText"/>
       </w:pPr>
       <w:r>
-        <w:t xml:space="preserve">Your lighting uses more energy than LED bulbs would. Halogen and incandescent light bulbs use 5-8x more energy than LEDs. This requires significantly more electricity and costs a lot.</w:t>
+        <w:t xml:space="preserve">Your windows are a source of heat loss, reduce your comfort due to cold surface temperatures, and may also cause moisture condensation or frost in the winter.</w:t>
       </w:r>
     </w:p>
     <w:p>
@@ -3849,13 +3690,11 @@
         <w:pStyle w:val="BodyText"/>
       </w:pPr>
       <w:r>
-        <w:t xml:space="preserve">Switch your light bulbs to LED light bulbs. LEDs use 80% less energy than incandescent light bulbs, which can significantly reduce your electricity bill.</w:t>
-      </w:r>
-    </w:p>
-    <w:p>
-      <w:pPr>
-        <w:pStyle w:val="BodyText"/>
-      </w:pPr>
+        <w:t xml:space="preserve">WindowDressers are insulating window inserts that help air-seal windows and reduce heat loss and gain. WindowDressers are transparent and let in light while stopping drafts. Each insert is made of a custom-made pine frame wrapped on each side with tightly sealed, clear polyolefin film, creating an airspace between the two layers for additional insulation. The insert is finished with a compressible foam weather seal. The foam allows enough give for the inserts to be easily slid into place in the fall and removed in the spring while holding firmly enough to provide a tight, friction-based seal. The inserts are installed inside your existing window frame with no fasteners required and last 5-10 years. They are most effective in the winter, but depending on the window’s exposure, they can sometimes be used in the summer to keep the house cooler.</w:t>
+      </w:r>
+      <w:r>
+        <w:t xml:space="preserve"> </w:t>
+      </w:r>
       <w:r>
         <w:rPr>
           <w:i/>
@@ -3869,17 +3708,45 @@
         <w:pStyle w:val="BodyText"/>
       </w:pPr>
       <w:r>
-        <w:t xml:space="preserve">We provide free LED light bulbs; contact us for some if we did not give you any during the audit. Depending on usage, LEDs can save more than $50 a year.</w:t>
+        <w:t xml:space="preserve">Insulating window inserts save 5-10% of your heating costs at less than 1/10th the cost of replacement windows. The overall project cost will depend on the number and size of window inserts. Example prices for the 2024 season were: small (20 x 36”) - $36 for natural pine frame, $46 for white; medium (30 x 52”) - $50 for natural pine frame, $64 for white; large (44 x 68”) - $67 for natural pine frame, $88 for white. Adjusted pricing for lower-income households is available from WindowDressers upon request. If plastic is damaged, it can be replaced for $15.</w:t>
+      </w:r>
+    </w:p>
+    <w:p>
+      <w:pPr>
+        <w:pStyle w:val="BodyText"/>
+      </w:pPr>
+      <w:r>
+        <w:t xml:space="preserve">Households that order inserts are expected to participate in the Community Build where the inserts are made. You can sign up for a 4-hour shift and learn the simple steps in the insert-building process (no previous experience required, no power tools). Each job has</w:t>
+      </w:r>
+      <w:r>
+        <w:t xml:space="preserve"> </w:t>
+      </w:r>
+      <w:r>
+        <w:t xml:space="preserve">“jigs”</w:t>
+      </w:r>
+      <w:r>
+        <w:t xml:space="preserve"> </w:t>
+      </w:r>
+      <w:r>
+        <w:t xml:space="preserve">that make the job easier to do and ensure uniform quality. You will be trained at the beginning of your shift on how to do your task. Volunteering for multiple shifts is encouraged! Mid-shift snacks and a meal are provided to all participants.</w:t>
+      </w:r>
+    </w:p>
+    <w:p>
+      <w:pPr>
+        <w:pStyle w:val="BodyText"/>
+      </w:pPr>
+      <w:r>
+        <w:t xml:space="preserve">If you would like to participate, please contact us so we can discuss how the program works and which windows you’d like inserts for.</w:t>
       </w:r>
     </w:p>
     <w:bookmarkEnd w:id="43"/>
-    <w:bookmarkStart w:id="44" w:name="window-dressers"/>
+    <w:bookmarkStart w:id="44" w:name="induction-stoveoven"/>
     <w:p>
       <w:pPr>
         <w:pStyle w:val="Heading3"/>
       </w:pPr>
       <w:r>
-        <w:t xml:space="preserve">4.3 Window Dressers</w:t>
+        <w:t xml:space="preserve">4.3 Induction Stove/Oven</w:t>
       </w:r>
     </w:p>
     <w:p>
@@ -3899,7 +3766,7 @@
         <w:pStyle w:val="BodyText"/>
       </w:pPr>
       <w:r>
-        <w:t xml:space="preserve">Your windows are a source of heat loss, reduce your comfort due to cold surface temperatures, and may also cause moisture condensation or frost in the winter.</w:t>
+        <w:t xml:space="preserve">Your gas range has the potential to release propane, carbon monoxide, and combustion gases into your house. Gas ranges are also inefficient at transferring heat to your food at 32% efficiency, compared to 85% efficiency for induction cooktops.</w:t>
       </w:r>
     </w:p>
     <w:p>
@@ -3919,11 +3786,13 @@
         <w:pStyle w:val="BodyText"/>
       </w:pPr>
       <w:r>
-        <w:t xml:space="preserve">WindowDressers are insulating window inserts that help air-seal windows and reduce heat loss and gain. WindowDressers are transparent and let in light while stopping drafts. Each insert is made of a custom-made pine frame wrapped on each side with tightly sealed, clear polyolefin film, creating an airspace between the two layers for additional insulation. The insert is finished with a compressible foam weather seal. The foam allows enough give for the inserts to be easily slid into place in the fall and removed in the spring while holding firmly enough to provide a tight, friction-based seal. The inserts are installed inside your existing window frame with no fasteners required and last 5-10 years. They are most effective in the winter, but depending on the window’s exposure, they can sometimes be used in the summer to keep the house cooler.</w:t>
-      </w:r>
-      <w:r>
-        <w:t xml:space="preserve"> </w:t>
-      </w:r>
+        <w:t xml:space="preserve">Induction cooking appliances are more efficient and safer than electric or gas ones. There is no risk of carbon monoxide or other harmful combustion gases, and the surface doesn’t heat up without a pot or pan on it.</w:t>
+      </w:r>
+    </w:p>
+    <w:p>
+      <w:pPr>
+        <w:pStyle w:val="BodyText"/>
+      </w:pPr>
       <w:r>
         <w:rPr>
           <w:i/>
@@ -3937,35 +3806,7 @@
         <w:pStyle w:val="BodyText"/>
       </w:pPr>
       <w:r>
-        <w:t xml:space="preserve">Insulating window inserts save 5-10% of your heating costs at less than 1/10th the cost of replacement windows. The overall project cost will depend on the number and size of window inserts. Example prices for the 2024 season were: small (20 x 36”) - $36 for natural pine frame, $46 for white; medium (30 x 52”) - $50 for natural pine frame, $64 for white; large (44 x 68”) - $67 for natural pine frame, $88 for white. Adjusted pricing for lower-income households is available from WindowDressers upon request. If plastic is damaged, it can be replaced for $15.</w:t>
-      </w:r>
-    </w:p>
-    <w:p>
-      <w:pPr>
-        <w:pStyle w:val="BodyText"/>
-      </w:pPr>
-      <w:r>
-        <w:t xml:space="preserve">Households that order inserts are expected to participate in the Community Build where the inserts are made. You can sign up for a 4-hour shift and learn the simple steps in the insert-building process (no previous experience required, no power tools). Each job has</w:t>
-      </w:r>
-      <w:r>
-        <w:t xml:space="preserve"> </w:t>
-      </w:r>
-      <w:r>
-        <w:t xml:space="preserve">“jigs”</w:t>
-      </w:r>
-      <w:r>
-        <w:t xml:space="preserve"> </w:t>
-      </w:r>
-      <w:r>
-        <w:t xml:space="preserve">that make the job easier to do and ensure uniform quality. You will be trained at the beginning of your shift on how to do your task. Volunteering for multiple shifts is encouraged! Mid-shift snacks and a meal are provided to all participants.</w:t>
-      </w:r>
-    </w:p>
-    <w:p>
-      <w:pPr>
-        <w:pStyle w:val="BodyText"/>
-      </w:pPr>
-      <w:r>
-        <w:t xml:space="preserve">If you would like to participate, please contact us so we can discuss how the program works and which windows you’d like inserts for.</w:t>
+        <w:t xml:space="preserve">Currently, Efficiency Maine does not offer a rebate for induction stoves. If you’re interested in trying out induction cooking but don’t want to replace your kitchen stove, consider buying a portable induction cooktop, which costs less than $100.</w:t>
       </w:r>
     </w:p>
     <w:bookmarkEnd w:id="44"/>
@@ -4717,13 +4558,13 @@
       </w:r>
     </w:p>
     <w:bookmarkEnd w:id="54"/>
-    <w:bookmarkStart w:id="55" w:name="electric-vehicle-and-charger"/>
+    <w:bookmarkStart w:id="55" w:name="solar"/>
     <w:p>
       <w:pPr>
         <w:pStyle w:val="Heading3"/>
       </w:pPr>
       <w:r>
-        <w:t xml:space="preserve">4.14 Electric Vehicle and charger</w:t>
+        <w:t xml:space="preserve">4.14 Solar</w:t>
       </w:r>
     </w:p>
     <w:p>
@@ -4743,7 +4584,11 @@
         <w:pStyle w:val="BodyText"/>
       </w:pPr>
       <w:r>
-        <w:t xml:space="preserve">Transportation, and particularly personal vehicles, are the leading cause of emissions in Maine. When you are planning to purchase a new vehicle, please consider a plug-in hybrid or all-electric vehicle.</w:t>
+        <w:rPr>
+          <w:b/>
+          <w:bCs/>
+        </w:rPr>
+        <w:t xml:space="preserve">Auditor to describe (or remove this section)</w:t>
       </w:r>
     </w:p>
     <w:p>
@@ -4763,7 +4608,7 @@
         <w:pStyle w:val="BodyText"/>
       </w:pPr>
       <w:r>
-        <w:t xml:space="preserve">An electric vehicle will eliminate your gas costs and reduce fossil fuel dependence. A 2020 study by Consumer Reports found that lifetime ownership costs were significantly lower for EVs, saving between $6,000 - $10,000 over their lifetimes.</w:t>
+        <w:t xml:space="preserve">Rooftop solar can supply most or all of your home electrical demands. Contact a solar company for pricing and details specific to your home.</w:t>
       </w:r>
     </w:p>
     <w:p>
@@ -4783,17 +4628,25 @@
         <w:pStyle w:val="BodyText"/>
       </w:pPr>
       <w:r>
-        <w:t xml:space="preserve">You can review current state and federal financial incentives for electric vehicles here: https://www.electricforall.org/rebates-incentives/</w:t>
+        <w:t xml:space="preserve">There is a 30% nonrefundable federal tax credit and financing options are available. Battery backup is needed for solar to work during a power outage. Information on the federal tax credit: https://www.energy.gov/sites/default/files/2023-03/Homeowners_Guide_to_the_Federal_Tax_Credit_for_Solar_PV.pdf</w:t>
+      </w:r>
+    </w:p>
+    <w:p>
+      <w:pPr>
+        <w:pStyle w:val="BodyText"/>
+      </w:pPr>
+      <w:r>
+        <w:t xml:space="preserve">The State of Maine is working on a solar and battery funding initiative for low-income and disadvantaged Maine households. It is still in the planning stages, but you can find more information here: https://www.maine.gov/energy/initiatives/infrastructure/solar-for-all</w:t>
       </w:r>
     </w:p>
     <w:bookmarkEnd w:id="55"/>
-    <w:bookmarkStart w:id="56" w:name="solar"/>
+    <w:bookmarkStart w:id="56" w:name="whole-house-surge-protection"/>
     <w:p>
       <w:pPr>
         <w:pStyle w:val="Heading3"/>
       </w:pPr>
       <w:r>
-        <w:t xml:space="preserve">4.15 Solar</w:t>
+        <w:t xml:space="preserve">4.15 Whole House Surge Protection</w:t>
       </w:r>
     </w:p>
     <w:p>
@@ -4813,11 +4666,7 @@
         <w:pStyle w:val="BodyText"/>
       </w:pPr>
       <w:r>
-        <w:rPr>
-          <w:b/>
-          <w:bCs/>
-        </w:rPr>
-        <w:t xml:space="preserve">Auditor to describe (or remove this section)</w:t>
+        <w:t xml:space="preserve">Your house does not have whole-house surge protection. This will protect your large electrical appliances from damage in the case of an electrical surge. Heat pumps, heat pump water heaters, and other electronics are particularly sensitive to electrical surges.</w:t>
       </w:r>
     </w:p>
     <w:p>
@@ -4837,13 +4686,11 @@
         <w:pStyle w:val="BodyText"/>
       </w:pPr>
       <w:r>
-        <w:t xml:space="preserve">Rooftop solar can supply most or all of your home electrical demands. Contact a solar company for pricing and details specific to your home.</w:t>
-      </w:r>
-    </w:p>
-    <w:p>
-      <w:pPr>
-        <w:pStyle w:val="BodyText"/>
-      </w:pPr>
+        <w:t xml:space="preserve">Seal easy-to-access air leaks and weatherstrip exterior doors. In older homes, most heat loss is due to air leakage. WindowDressers insulating window inserts can also help reduce air leakage.</w:t>
+      </w:r>
+      <w:r>
+        <w:t xml:space="preserve"> </w:t>
+      </w:r>
       <w:r>
         <w:rPr>
           <w:i/>
@@ -4857,25 +4704,18 @@
         <w:pStyle w:val="BodyText"/>
       </w:pPr>
       <w:r>
-        <w:t xml:space="preserve">There is a 30% nonrefundable federal tax credit and financing options are available. Battery backup is needed for solar to work during a power outage. Information on the federal tax credit: https://www.energy.gov/sites/default/files/2023-03/Homeowners_Guide_to_the_Federal_Tax_Credit_for_Solar_PV.pdf</w:t>
-      </w:r>
-    </w:p>
-    <w:p>
-      <w:pPr>
-        <w:pStyle w:val="BodyText"/>
-      </w:pPr>
-      <w:r>
-        <w:t xml:space="preserve">The State of Maine is working on a solar and battery funding initiative for low-income and disadvantaged Maine households. It is still in the planning stages, but you can find more information here: https://www.maine.gov/energy/initiatives/infrastructure/solar-for-all</w:t>
+        <w:t xml:space="preserve">The device costs $100-$400 and needs to be installed by an electrician. Here are some options: https://www.popularmechanics.com/home/interior-projects/g43140886/best-whole-house-surge-protectors/</w:t>
       </w:r>
     </w:p>
     <w:bookmarkEnd w:id="56"/>
-    <w:bookmarkStart w:id="57" w:name="pipe-insulation"/>
-    <w:p>
-      <w:pPr>
-        <w:pStyle w:val="Heading3"/>
-      </w:pPr>
-      <w:r>
-        <w:t xml:space="preserve">4.16 Pipe Insulation</w:t>
+    <w:bookmarkEnd w:id="57"/>
+    <w:bookmarkStart w:id="58" w:name="additional-resources"/>
+    <w:p>
+      <w:pPr>
+        <w:pStyle w:val="Heading2"/>
+      </w:pPr>
+      <w:r>
+        <w:t xml:space="preserve">5 Additional Resources</w:t>
       </w:r>
     </w:p>
     <w:p>
@@ -4883,268 +4723,34 @@
         <w:pStyle w:val="FirstParagraph"/>
       </w:pPr>
       <w:r>
-        <w:rPr>
-          <w:i/>
-          <w:iCs/>
-        </w:rPr>
-        <w:t xml:space="preserve">Problem</w:t>
-      </w:r>
-    </w:p>
-    <w:p>
-      <w:pPr>
-        <w:pStyle w:val="BodyText"/>
-      </w:pPr>
-      <w:r>
-        <w:t xml:space="preserve">Uninsulated water pipes are responsible for heat loss and excess moisture (from condensation) in your basement/crawlspace.</w:t>
-      </w:r>
-    </w:p>
-    <w:p>
-      <w:pPr>
-        <w:pStyle w:val="BodyText"/>
-      </w:pPr>
-      <w:r>
-        <w:rPr>
-          <w:i/>
-          <w:iCs/>
-        </w:rPr>
-        <w:t xml:space="preserve">Recommendation</w:t>
-      </w:r>
-    </w:p>
-    <w:p>
-      <w:pPr>
-        <w:pStyle w:val="BodyText"/>
-      </w:pPr>
-      <w:r>
-        <w:t xml:space="preserve">Insulate both hot and cold water pipes that are uninsulated in the basement/crawlspace. This will save energy and prevent condensation. We recommend foam pipe insulation made of polyethylene or neoprene.</w:t>
-      </w:r>
-    </w:p>
-    <w:p>
-      <w:pPr>
-        <w:pStyle w:val="BodyText"/>
-      </w:pPr>
-      <w:r>
-        <w:rPr>
-          <w:i/>
-          <w:iCs/>
-        </w:rPr>
-        <w:t xml:space="preserve">Estimated Cost/Benefits/Incentives</w:t>
-      </w:r>
-    </w:p>
-    <w:p>
-      <w:pPr>
-        <w:pStyle w:val="BodyText"/>
-      </w:pPr>
-      <w:r>
-        <w:t xml:space="preserve">Insulating water pipes can save 2%-4% on hot water bills and increase the temperature of the water while reducing the time it takes for hot water to reach your tap. Materials cost around $100-200, depending on the length of pipe to insulate. Many people find this to be an easy project to do themselves.</w:t>
-      </w:r>
-    </w:p>
-    <w:bookmarkEnd w:id="57"/>
-    <w:bookmarkStart w:id="58" w:name="whole-house-surge-protection"/>
-    <w:p>
-      <w:pPr>
-        <w:pStyle w:val="Heading3"/>
-      </w:pPr>
-      <w:r>
-        <w:t xml:space="preserve">4.17 Whole House Surge Protection</w:t>
-      </w:r>
-    </w:p>
-    <w:p>
-      <w:pPr>
-        <w:pStyle w:val="FirstParagraph"/>
-      </w:pPr>
-      <w:r>
-        <w:rPr>
-          <w:i/>
-          <w:iCs/>
-        </w:rPr>
-        <w:t xml:space="preserve">Problem</w:t>
-      </w:r>
-    </w:p>
-    <w:p>
-      <w:pPr>
-        <w:pStyle w:val="BodyText"/>
-      </w:pPr>
-      <w:r>
-        <w:t xml:space="preserve">Your house does not have whole-house surge protection. This will protect your large electrical appliances from damage in the case of an electrical surge. Heat pumps, heat pump water heaters, and other electronics are particularly sensitive to electrical surges.</w:t>
-      </w:r>
-    </w:p>
-    <w:p>
-      <w:pPr>
-        <w:pStyle w:val="BodyText"/>
-      </w:pPr>
-      <w:r>
-        <w:rPr>
-          <w:i/>
-          <w:iCs/>
-        </w:rPr>
-        <w:t xml:space="preserve">Recommendation</w:t>
-      </w:r>
-    </w:p>
-    <w:p>
-      <w:pPr>
-        <w:pStyle w:val="BodyText"/>
-      </w:pPr>
-      <w:r>
-        <w:t xml:space="preserve">Seal easy-to-access air leaks and weatherstrip exterior doors. In older homes, most heat loss is due to air leakage. WindowDressers insulating window inserts can also help reduce air leakage.</w:t>
-      </w:r>
-      <w:r>
-        <w:t xml:space="preserve"> </w:t>
-      </w:r>
-      <w:r>
-        <w:rPr>
-          <w:i/>
-          <w:iCs/>
-        </w:rPr>
-        <w:t xml:space="preserve">Estimated Cost/Benefits/Incentives</w:t>
-      </w:r>
-    </w:p>
-    <w:p>
-      <w:pPr>
-        <w:pStyle w:val="BodyText"/>
-      </w:pPr>
-      <w:r>
-        <w:t xml:space="preserve">The device costs $100-$400 and needs to be installed by an electrician. Here are some options: https://www.popularmechanics.com/home/interior-projects/g43140886/best-whole-house-surge-protectors/</w:t>
+        <w:t xml:space="preserve">Many home efficiency upgrades are eligible for Efficiency Maine rebates and federal tax credits. Financial incentives vary based on income level and type of occupancy. An overview of all state rebates and federal tax credits can be found here: https://www.efficiencymaine.com/at-home/.</w:t>
+      </w:r>
+    </w:p>
+    <w:p>
+      <w:pPr>
+        <w:pStyle w:val="BodyText"/>
+      </w:pPr>
+      <w:r>
+        <w:t xml:space="preserve">You can search for Efficiency Maine registered contractors here: https://www.efficiencymaine.com/at-home/vendor-locator/.</w:t>
+      </w:r>
+    </w:p>
+    <w:p>
+      <w:pPr>
+        <w:pStyle w:val="BodyText"/>
+      </w:pPr>
+      <w:r>
+        <w:t xml:space="preserve">We recommend discussing a whole-home plan for insulation and air sealing work in the basement, walls, and attic with contractors to determine how to best sequence the work to take full advantage of the Efficiency Maine rebates (which are subject to lifetime maximums) and nonrefundable federal tax credits (which are subject to annual maximums).</w:t>
+      </w:r>
+    </w:p>
+    <w:p>
+      <w:pPr>
+        <w:pStyle w:val="BodyText"/>
+      </w:pPr>
+      <w:r>
+        <w:t xml:space="preserve">Efficiency Maine also offers home energy loans to help homeowners who are Maine residents pay for energy and related health and safety upgrades. There are no fees, and interest rates for multi-year loans are between 5.99% (max $7,500) and 7.99% (max $25,000), depending on income level. Low- and moderate-income homeowners who borrow the full $7,500 and pay it back over 10 years will pay a monthly cost of $83. There is also a 1-year, 0% APR option. To learn more or apply, call 866-376-2463 or visit https://www.efficiencymaine.com/home-energy-loans/</w:t>
       </w:r>
     </w:p>
     <w:bookmarkEnd w:id="58"/>
-    <w:bookmarkStart w:id="59" w:name="diy-air-sealing"/>
-    <w:p>
-      <w:pPr>
-        <w:pStyle w:val="Heading3"/>
-      </w:pPr>
-      <w:r>
-        <w:t xml:space="preserve">4.18 DIY Air Sealing</w:t>
-      </w:r>
-    </w:p>
-    <w:p>
-      <w:pPr>
-        <w:pStyle w:val="FirstParagraph"/>
-      </w:pPr>
-      <w:r>
-        <w:rPr>
-          <w:i/>
-          <w:iCs/>
-        </w:rPr>
-        <w:t xml:space="preserve">Problem</w:t>
-      </w:r>
-    </w:p>
-    <w:p>
-      <w:pPr>
-        <w:pStyle w:val="BodyText"/>
-      </w:pPr>
-      <w:r>
-        <w:t xml:space="preserve">During the blower door test, we noted sources of air leakage in the living areas of your house.</w:t>
-      </w:r>
-    </w:p>
-    <w:p>
-      <w:pPr>
-        <w:pStyle w:val="BodyText"/>
-      </w:pPr>
-      <w:r>
-        <w:rPr>
-          <w:b/>
-          <w:bCs/>
-        </w:rPr>
-        <w:t xml:space="preserve">Auditor to detail customized findings.</w:t>
-      </w:r>
-      <w:r>
-        <w:rPr>
-          <w:b/>
-          <w:bCs/>
-        </w:rPr>
-        <w:t xml:space="preserve"> </w:t>
-      </w:r>
-    </w:p>
-    <w:p>
-      <w:pPr>
-        <w:pStyle w:val="BodyText"/>
-      </w:pPr>
-      <w:r>
-        <w:rPr>
-          <w:i/>
-          <w:iCs/>
-        </w:rPr>
-        <w:t xml:space="preserve">Recommendation</w:t>
-      </w:r>
-    </w:p>
-    <w:p>
-      <w:pPr>
-        <w:pStyle w:val="BodyText"/>
-      </w:pPr>
-      <w:r>
-        <w:t xml:space="preserve">Air sealing the air leaks we identified around the living areas of your house can be a DIY solution to lower energy use, or an insulation contractor can seal the leaks when they come to your house for a larger project. Please address any moisture concerns before undertaking significant air sealing efforts.</w:t>
-      </w:r>
-    </w:p>
-    <w:p>
-      <w:pPr>
-        <w:pStyle w:val="BodyText"/>
-      </w:pPr>
-      <w:r>
-        <w:rPr>
-          <w:i/>
-          <w:iCs/>
-        </w:rPr>
-        <w:t xml:space="preserve">Estimated Cost/Benefits/Incentives</w:t>
-      </w:r>
-    </w:p>
-    <w:p>
-      <w:pPr>
-        <w:pStyle w:val="BodyText"/>
-      </w:pPr>
-      <w:r>
-        <w:t xml:space="preserve">Air sealing and insulating ductwork is eligible for a non-refundable federal tax credit (</w:t>
-      </w:r>
-      <w:r>
-        <w:t xml:space="preserve">“Energy Efficient Home Improvement Credit”</w:t>
-      </w:r>
-      <w:r>
-        <w:t xml:space="preserve">), which can pay for 30% of the project cost, subject to an annual maximum of $1,200 (shared with other home envelope improvements, like attic and basement projects).</w:t>
-      </w:r>
-    </w:p>
-    <w:bookmarkEnd w:id="59"/>
-    <w:bookmarkEnd w:id="60"/>
-    <w:bookmarkStart w:id="61" w:name="additional-resources"/>
-    <w:p>
-      <w:pPr>
-        <w:pStyle w:val="Heading2"/>
-      </w:pPr>
-      <w:r>
-        <w:t xml:space="preserve">5 Additional Resources</w:t>
-      </w:r>
-    </w:p>
-    <w:p>
-      <w:pPr>
-        <w:pStyle w:val="FirstParagraph"/>
-      </w:pPr>
-      <w:r>
-        <w:t xml:space="preserve">Many home efficiency upgrades are eligible for Efficiency Maine rebates and federal tax credits. Financial incentives vary based on income level and type of occupancy. An overview of all state rebates and federal tax credits can be found here: https://www.efficiencymaine.com/at-home/.</w:t>
-      </w:r>
-    </w:p>
-    <w:p>
-      <w:pPr>
-        <w:pStyle w:val="BodyText"/>
-      </w:pPr>
-      <w:r>
-        <w:t xml:space="preserve">You can search for Efficiency Maine registered contractors here: https://www.efficiencymaine.com/at-home/vendor-locator/.</w:t>
-      </w:r>
-    </w:p>
-    <w:p>
-      <w:pPr>
-        <w:pStyle w:val="BodyText"/>
-      </w:pPr>
-      <w:r>
-        <w:t xml:space="preserve">We recommend discussing a whole-home plan for insulation and air sealing work in the basement, walls, and attic with contractors to determine how to best sequence the work to take full advantage of the Efficiency Maine rebates (which are subject to lifetime maximums) and nonrefundable federal tax credits (which are subject to annual maximums).</w:t>
-      </w:r>
-    </w:p>
-    <w:p>
-      <w:pPr>
-        <w:pStyle w:val="BodyText"/>
-      </w:pPr>
-      <w:r>
-        <w:t xml:space="preserve">Efficiency Maine also offers home energy loans to help homeowners who are Maine residents pay for energy and related health and safety upgrades. There are no fees, and interest rates for multi-year loans are between 5.99% (max $7,500) and 7.99% (max $25,000), depending on income level. Low- and moderate-income homeowners who borrow the full $7,500 and pay it back over 10 years will pay a monthly cost of $83. There is also a 1-year, 0% APR option. To learn more or apply, call 866-376-2463 or visit https://www.efficiencymaine.com/home-energy-loans/</w:t>
-      </w:r>
-    </w:p>
-    <w:bookmarkEnd w:id="61"/>
     <w:sectPr>
       <w:footerReference r:id="rId9" w:type="default"/>
       <w:pgSz w:h="15840" w:w="12240"/>

</xml_diff>

<commit_message>
Re-re-render Sharon Morrell audit report
</commit_message>
<xml_diff>
--- a/Quarto_report/Audit_Report.docx
+++ b/Quarto_report/Audit_Report.docx
@@ -1407,7 +1407,7 @@
                 <w:rFonts w:ascii="Calibri" w:hAnsi="Calibri"/>
                 <w:sz w:val="20"/>
               </w:rPr>
-              <w:t xml:space="default">NA</w:t>
+              <w:t xml:space="default">720</w:t>
             </w:r>
           </w:p>
         </w:tc>
@@ -1460,7 +1460,7 @@
                 <w:rFonts w:ascii="Calibri" w:hAnsi="Calibri"/>
                 <w:sz w:val="20"/>
               </w:rPr>
-              <w:t xml:space="default">NA</w:t>
+              <w:t xml:space="default">5587</w:t>
             </w:r>
           </w:p>
         </w:tc>
@@ -2327,7 +2327,7 @@
                 <w:rFonts w:ascii="Calibri" w:hAnsi="Calibri"/>
                 <w:sz w:val="20"/>
               </w:rPr>
-              <w:t xml:space="default">NA</w:t>
+              <w:t xml:space="default">14.5</w:t>
             </w:r>
           </w:p>
         </w:tc>
@@ -2481,7 +2481,7 @@
                 <w:rFonts w:ascii="Calibri" w:hAnsi="Calibri"/>
                 <w:sz w:val="20"/>
               </w:rPr>
-              <w:t xml:space="default">NA</w:t>
+              <w:t xml:space="default">0.8</w:t>
             </w:r>
           </w:p>
         </w:tc>

</xml_diff>

<commit_message>
Render Ben Sumner ACHNatural graph
</commit_message>
<xml_diff>
--- a/Quarto_report/Audit_Report.docx
+++ b/Quarto_report/Audit_Report.docx
@@ -15,31 +15,31 @@
         <w:pStyle w:val="FirstParagraph"/>
       </w:pPr>
       <w:r>
-        <w:t xml:space="preserve">Homeowner(s): Sharon Morrell</w:t>
-      </w:r>
-    </w:p>
-    <w:p>
-      <w:pPr>
-        <w:pStyle w:val="BodyText"/>
-      </w:pPr>
-      <w:r>
-        <w:t xml:space="preserve">Address: 300 Cranberry Road, Cranberry Isles, ME 04625</w:t>
-      </w:r>
-    </w:p>
-    <w:p>
-      <w:pPr>
-        <w:pStyle w:val="BodyText"/>
-      </w:pPr>
-      <w:r>
-        <w:t xml:space="preserve">Owner Contact: akmjem@yahoo.com, (717) 275-2993</w:t>
-      </w:r>
-    </w:p>
-    <w:p>
-      <w:pPr>
-        <w:pStyle w:val="BodyText"/>
-      </w:pPr>
-      <w:r>
-        <w:t xml:space="preserve">Auditors: Rashmi Mohan, Pema Lhundrup, Mabon Young</w:t>
+        <w:t xml:space="preserve">Homeowner(s): Ben Sumner</w:t>
+      </w:r>
+    </w:p>
+    <w:p>
+      <w:pPr>
+        <w:pStyle w:val="BodyText"/>
+      </w:pPr>
+      <w:r>
+        <w:t xml:space="preserve">Address: 5 Elwood Spurling Ln, Cranberry Isles, ME, 04625</w:t>
+      </w:r>
+    </w:p>
+    <w:p>
+      <w:pPr>
+        <w:pStyle w:val="BodyText"/>
+      </w:pPr>
+      <w:r>
+        <w:t xml:space="preserve">Owner Contact: ben.sumner@protonmail.com, (207) 664-8364</w:t>
+      </w:r>
+    </w:p>
+    <w:p>
+      <w:pPr>
+        <w:pStyle w:val="BodyText"/>
+      </w:pPr>
+      <w:r>
+        <w:t xml:space="preserve">Auditors: Pilot program team (Nicole, Zoe, Alder, Uriel)</w:t>
       </w:r>
     </w:p>
     <w:p>
@@ -55,7 +55,7 @@
         <w:pStyle w:val="BodyText"/>
       </w:pPr>
       <w:r>
-        <w:t xml:space="preserve">Report Date: July 3, 2025</w:t>
+        <w:t xml:space="preserve">Report Date: July 10, 2025</w:t>
       </w:r>
     </w:p>
     <w:p>
@@ -70,7 +70,7 @@
         <w:pStyle w:val="FirstParagraph"/>
       </w:pPr>
       <w:r>
-        <w:t xml:space="preserve">We conducted an energy assessment of your home on 7/3/2025. This report will tell you what we did, what we found, and what we suggest for your home. These suggestions include information on incentives and financing to make improvements more affordable.</w:t>
+        <w:t xml:space="preserve">We conducted an energy assessment of your home on 9/5/2024. This report will tell you what we did, what we found, and what we suggest for your home. These suggestions include information on incentives and financing to make improvements more affordable.</w:t>
       </w:r>
     </w:p>
     <w:p>
@@ -344,31 +344,31 @@
                 <w:rFonts w:ascii="Calibri" w:hAnsi="Calibri"/>
                 <w:sz w:val="20"/>
               </w:rPr>
-              <w:t xml:space="default">High-efficiency Shower Head(s)</w:t>
-            </w:r>
-          </w:p>
-        </w:tc>
-        <w:tc>
-          <w:tcPr>
-            <w:tcBorders>
-              <w:top w:val="single" w:space="0" w:color="D3D3D3"/>
-              <w:bottom w:val="single" w:space="0" w:color="D3D3D3"/>
-              <w:start w:val="single" w:space="0" w:color="D3D3D3"/>
-              <w:end w:val="single" w:space="0" w:color="D3D3D3"/>
-            </w:tcBorders>
-          </w:tcPr>
-          <w:p>
-            <w:pPr>
-              <w:spacing w:before="0" w:after="60"/>
-              <w:keepNext/>
-              <w:jc w:val="start"/>
-            </w:pPr>
-            <w:r>
-              <w:rPr>
-                <w:rFonts w:ascii="Calibri" w:hAnsi="Calibri"/>
-                <w:sz w:val="20"/>
-              </w:rPr>
-              <w:t xml:space="default">Install high-efficiency shower heads to reduce the amount of water and energy to heat the water used when showering.</w:t>
+              <w:t xml:space="default">Furnace/Boiler Tune-up</w:t>
+            </w:r>
+          </w:p>
+        </w:tc>
+        <w:tc>
+          <w:tcPr>
+            <w:tcBorders>
+              <w:top w:val="single" w:space="0" w:color="D3D3D3"/>
+              <w:bottom w:val="single" w:space="0" w:color="D3D3D3"/>
+              <w:start w:val="single" w:space="0" w:color="D3D3D3"/>
+              <w:end w:val="single" w:space="0" w:color="D3D3D3"/>
+            </w:tcBorders>
+          </w:tcPr>
+          <w:p>
+            <w:pPr>
+              <w:spacing w:before="0" w:after="60"/>
+              <w:keepNext/>
+              <w:jc w:val="start"/>
+            </w:pPr>
+            <w:r>
+              <w:rPr>
+                <w:rFonts w:ascii="Calibri" w:hAnsi="Calibri"/>
+                <w:sz w:val="20"/>
+              </w:rPr>
+              <w:t xml:space="default">Have the furnace/boiler and flue inspected and adjusted by a licensed professional. This should be available from your fuel delivery company.</w:t>
             </w:r>
           </w:p>
         </w:tc>
@@ -397,31 +397,31 @@
                 <w:rFonts w:ascii="Calibri" w:hAnsi="Calibri"/>
                 <w:sz w:val="20"/>
               </w:rPr>
-              <w:t xml:space="default">WindowDressers</w:t>
-            </w:r>
-          </w:p>
-        </w:tc>
-        <w:tc>
-          <w:tcPr>
-            <w:tcBorders>
-              <w:top w:val="single" w:space="0" w:color="D3D3D3"/>
-              <w:bottom w:val="single" w:space="0" w:color="D3D3D3"/>
-              <w:start w:val="single" w:space="0" w:color="D3D3D3"/>
-              <w:end w:val="single" w:space="0" w:color="D3D3D3"/>
-            </w:tcBorders>
-          </w:tcPr>
-          <w:p>
-            <w:pPr>
-              <w:spacing w:before="0" w:after="60"/>
-              <w:keepNext/>
-              <w:jc w:val="start"/>
-            </w:pPr>
-            <w:r>
-              <w:rPr>
-                <w:rFonts w:ascii="Calibri" w:hAnsi="Calibri"/>
-                <w:sz w:val="20"/>
-              </w:rPr>
-              <w:t xml:space="default">WindowDressers are insulating window inserts that help air-seal windows and reduce heat loss and gain.</w:t>
+              <w:t xml:space="default">High-efficiency Shower Head(s)</w:t>
+            </w:r>
+          </w:p>
+        </w:tc>
+        <w:tc>
+          <w:tcPr>
+            <w:tcBorders>
+              <w:top w:val="single" w:space="0" w:color="D3D3D3"/>
+              <w:bottom w:val="single" w:space="0" w:color="D3D3D3"/>
+              <w:start w:val="single" w:space="0" w:color="D3D3D3"/>
+              <w:end w:val="single" w:space="0" w:color="D3D3D3"/>
+            </w:tcBorders>
+          </w:tcPr>
+          <w:p>
+            <w:pPr>
+              <w:spacing w:before="0" w:after="60"/>
+              <w:keepNext/>
+              <w:jc w:val="start"/>
+            </w:pPr>
+            <w:r>
+              <w:rPr>
+                <w:rFonts w:ascii="Calibri" w:hAnsi="Calibri"/>
+                <w:sz w:val="20"/>
+              </w:rPr>
+              <w:t xml:space="default">Install high-efficiency shower heads to reduce the amount of water and energy to heat the water used when showering.</w:t>
             </w:r>
           </w:p>
         </w:tc>
@@ -450,31 +450,31 @@
                 <w:rFonts w:ascii="Calibri" w:hAnsi="Calibri"/>
                 <w:sz w:val="20"/>
               </w:rPr>
-              <w:t xml:space="default">Induction Stove/Oven</w:t>
-            </w:r>
-          </w:p>
-        </w:tc>
-        <w:tc>
-          <w:tcPr>
-            <w:tcBorders>
-              <w:top w:val="single" w:space="0" w:color="D3D3D3"/>
-              <w:bottom w:val="single" w:space="0" w:color="D3D3D3"/>
-              <w:start w:val="single" w:space="0" w:color="D3D3D3"/>
-              <w:end w:val="single" w:space="0" w:color="D3D3D3"/>
-            </w:tcBorders>
-          </w:tcPr>
-          <w:p>
-            <w:pPr>
-              <w:spacing w:before="0" w:after="60"/>
-              <w:keepNext/>
-              <w:jc w:val="start"/>
-            </w:pPr>
-            <w:r>
-              <w:rPr>
-                <w:rFonts w:ascii="Calibri" w:hAnsi="Calibri"/>
-                <w:sz w:val="20"/>
-              </w:rPr>
-              <w:t xml:space="default">Induction cooking appliances are more efficient and safer than electric or gas ones. There is no risk of carbon monoxide or other harmful combustion gases, and the surface doesn’t heat up without a pot or pan on it.</w:t>
+              <w:t xml:space="default">LEDs</w:t>
+            </w:r>
+          </w:p>
+        </w:tc>
+        <w:tc>
+          <w:tcPr>
+            <w:tcBorders>
+              <w:top w:val="single" w:space="0" w:color="D3D3D3"/>
+              <w:bottom w:val="single" w:space="0" w:color="D3D3D3"/>
+              <w:start w:val="single" w:space="0" w:color="D3D3D3"/>
+              <w:end w:val="single" w:space="0" w:color="D3D3D3"/>
+            </w:tcBorders>
+          </w:tcPr>
+          <w:p>
+            <w:pPr>
+              <w:spacing w:before="0" w:after="60"/>
+              <w:keepNext/>
+              <w:jc w:val="start"/>
+            </w:pPr>
+            <w:r>
+              <w:rPr>
+                <w:rFonts w:ascii="Calibri" w:hAnsi="Calibri"/>
+                <w:sz w:val="20"/>
+              </w:rPr>
+              <w:t xml:space="default">Switch your light bulbs to LED light bulbs. LEDs use 80% less energy than incandescent light bulbs, which can significantly reduce your electricity bill.</w:t>
             </w:r>
           </w:p>
         </w:tc>
@@ -503,31 +503,31 @@
                 <w:rFonts w:ascii="Calibri" w:hAnsi="Calibri"/>
                 <w:sz w:val="20"/>
               </w:rPr>
-              <w:t xml:space="default">Gutters</w:t>
-            </w:r>
-          </w:p>
-        </w:tc>
-        <w:tc>
-          <w:tcPr>
-            <w:tcBorders>
-              <w:top w:val="single" w:space="0" w:color="D3D3D3"/>
-              <w:bottom w:val="single" w:space="0" w:color="D3D3D3"/>
-              <w:start w:val="single" w:space="0" w:color="D3D3D3"/>
-              <w:end w:val="single" w:space="0" w:color="D3D3D3"/>
-            </w:tcBorders>
-          </w:tcPr>
-          <w:p>
-            <w:pPr>
-              <w:spacing w:before="0" w:after="60"/>
-              <w:keepNext/>
-              <w:jc w:val="start"/>
-            </w:pPr>
-            <w:r>
-              <w:rPr>
-                <w:rFonts w:ascii="Calibri" w:hAnsi="Calibri"/>
-                <w:sz w:val="20"/>
-              </w:rPr>
-              <w:t xml:space="default">Install gutters and downspouts that divert water at least six feet away from the foundation and to where the ground slopes away from the house.</w:t>
+              <w:t xml:space="default">WindowDressers</w:t>
+            </w:r>
+          </w:p>
+        </w:tc>
+        <w:tc>
+          <w:tcPr>
+            <w:tcBorders>
+              <w:top w:val="single" w:space="0" w:color="D3D3D3"/>
+              <w:bottom w:val="single" w:space="0" w:color="D3D3D3"/>
+              <w:start w:val="single" w:space="0" w:color="D3D3D3"/>
+              <w:end w:val="single" w:space="0" w:color="D3D3D3"/>
+            </w:tcBorders>
+          </w:tcPr>
+          <w:p>
+            <w:pPr>
+              <w:spacing w:before="0" w:after="60"/>
+              <w:keepNext/>
+              <w:jc w:val="start"/>
+            </w:pPr>
+            <w:r>
+              <w:rPr>
+                <w:rFonts w:ascii="Calibri" w:hAnsi="Calibri"/>
+                <w:sz w:val="20"/>
+              </w:rPr>
+              <w:t xml:space="default">WindowDressers are insulating window inserts that help air-seal windows and reduce heat loss and gain.</w:t>
             </w:r>
           </w:p>
         </w:tc>
@@ -556,31 +556,31 @@
                 <w:rFonts w:ascii="Calibri" w:hAnsi="Calibri"/>
                 <w:sz w:val="20"/>
               </w:rPr>
-              <w:t xml:space="default">Bathroom Exhaust Fan(s)</w:t>
-            </w:r>
-          </w:p>
-        </w:tc>
-        <w:tc>
-          <w:tcPr>
-            <w:tcBorders>
-              <w:top w:val="single" w:space="0" w:color="D3D3D3"/>
-              <w:bottom w:val="single" w:space="0" w:color="D3D3D3"/>
-              <w:start w:val="single" w:space="0" w:color="D3D3D3"/>
-              <w:end w:val="single" w:space="0" w:color="D3D3D3"/>
-            </w:tcBorders>
-          </w:tcPr>
-          <w:p>
-            <w:pPr>
-              <w:spacing w:before="0" w:after="60"/>
-              <w:keepNext/>
-              <w:jc w:val="start"/>
-            </w:pPr>
-            <w:r>
-              <w:rPr>
-                <w:rFonts w:ascii="Calibri" w:hAnsi="Calibri"/>
-                <w:sz w:val="20"/>
-              </w:rPr>
-              <w:t xml:space="default">Install bathroom exhaust fans in all bathrooms that do not have them. These should be rated for at least 80 cubic feet per minute (CFM) if there is a shower. We recommend the Panasonic Whisper series or similar fans that don’t create excess noise.</w:t>
+              <w:t xml:space="default">Heat Pump Water Heater</w:t>
+            </w:r>
+          </w:p>
+        </w:tc>
+        <w:tc>
+          <w:tcPr>
+            <w:tcBorders>
+              <w:top w:val="single" w:space="0" w:color="D3D3D3"/>
+              <w:bottom w:val="single" w:space="0" w:color="D3D3D3"/>
+              <w:start w:val="single" w:space="0" w:color="D3D3D3"/>
+              <w:end w:val="single" w:space="0" w:color="D3D3D3"/>
+            </w:tcBorders>
+          </w:tcPr>
+          <w:p>
+            <w:pPr>
+              <w:spacing w:before="0" w:after="60"/>
+              <w:keepNext/>
+              <w:jc w:val="start"/>
+            </w:pPr>
+            <w:r>
+              <w:rPr>
+                <w:rFonts w:ascii="Calibri" w:hAnsi="Calibri"/>
+                <w:sz w:val="20"/>
+              </w:rPr>
+              <w:t xml:space="default">Install a heat pump water heater to provide your hot water for cooking and bathing. This is the most efficient way to heat water and will save hundreds of dollars a year compared to electric resistance, heating oil, or propane hot water. It will also help to dehumidify while it's running. If your current water heater burns oil or propane, this will also remove a source of combustion gases from your home.</w:t>
             </w:r>
           </w:p>
         </w:tc>
@@ -609,31 +609,31 @@
                 <w:rFonts w:ascii="Calibri" w:hAnsi="Calibri"/>
                 <w:sz w:val="20"/>
               </w:rPr>
-              <w:t xml:space="default">Kitchen Exhaust Fan</w:t>
-            </w:r>
-          </w:p>
-        </w:tc>
-        <w:tc>
-          <w:tcPr>
-            <w:tcBorders>
-              <w:top w:val="single" w:space="0" w:color="D3D3D3"/>
-              <w:bottom w:val="single" w:space="0" w:color="D3D3D3"/>
-              <w:start w:val="single" w:space="0" w:color="D3D3D3"/>
-              <w:end w:val="single" w:space="0" w:color="D3D3D3"/>
-            </w:tcBorders>
-          </w:tcPr>
-          <w:p>
-            <w:pPr>
-              <w:spacing w:before="0" w:after="60"/>
-              <w:keepNext/>
-              <w:jc w:val="start"/>
-            </w:pPr>
-            <w:r>
-              <w:rPr>
-                <w:rFonts w:ascii="Calibri" w:hAnsi="Calibri"/>
-                <w:sz w:val="20"/>
-              </w:rPr>
-              <w:t xml:space="default">Install a kitchen exhaust fan to remove cooking fumes and moisture from your home. The fan should be rated for at least 100 cubic feet per minute. A kitchen fan should be ducted to the outdoors. If the ductwork will run through the attic, it should be installed before the attic is air-sealed and insulated.</w:t>
+              <w:t xml:space="default">Gutters</w:t>
+            </w:r>
+          </w:p>
+        </w:tc>
+        <w:tc>
+          <w:tcPr>
+            <w:tcBorders>
+              <w:top w:val="single" w:space="0" w:color="D3D3D3"/>
+              <w:bottom w:val="single" w:space="0" w:color="D3D3D3"/>
+              <w:start w:val="single" w:space="0" w:color="D3D3D3"/>
+              <w:end w:val="single" w:space="0" w:color="D3D3D3"/>
+            </w:tcBorders>
+          </w:tcPr>
+          <w:p>
+            <w:pPr>
+              <w:spacing w:before="0" w:after="60"/>
+              <w:keepNext/>
+              <w:jc w:val="start"/>
+            </w:pPr>
+            <w:r>
+              <w:rPr>
+                <w:rFonts w:ascii="Calibri" w:hAnsi="Calibri"/>
+                <w:sz w:val="20"/>
+              </w:rPr>
+              <w:t xml:space="default">Install gutters and downspouts that divert water at least six feet away from the foundation and to where the ground slopes away from the house.</w:t>
             </w:r>
           </w:p>
         </w:tc>
@@ -662,31 +662,31 @@
                 <w:rFonts w:ascii="Calibri" w:hAnsi="Calibri"/>
                 <w:sz w:val="20"/>
               </w:rPr>
-              <w:t xml:space="default">Vapor Barrier</w:t>
-            </w:r>
-          </w:p>
-        </w:tc>
-        <w:tc>
-          <w:tcPr>
-            <w:tcBorders>
-              <w:top w:val="single" w:space="0" w:color="D3D3D3"/>
-              <w:bottom w:val="single" w:space="0" w:color="D3D3D3"/>
-              <w:start w:val="single" w:space="0" w:color="D3D3D3"/>
-              <w:end w:val="single" w:space="0" w:color="D3D3D3"/>
-            </w:tcBorders>
-          </w:tcPr>
-          <w:p>
-            <w:pPr>
-              <w:spacing w:before="0" w:after="60"/>
-              <w:keepNext/>
-              <w:jc w:val="start"/>
-            </w:pPr>
-            <w:r>
-              <w:rPr>
-                <w:rFonts w:ascii="Calibri" w:hAnsi="Calibri"/>
-                <w:sz w:val="20"/>
-              </w:rPr>
-              <w:t xml:space="default">Install a vapor barrier on the basement floor to stop moisture from entering the basement and house.</w:t>
+              <w:t xml:space="default">Bathroom Exhaust Fan(s)</w:t>
+            </w:r>
+          </w:p>
+        </w:tc>
+        <w:tc>
+          <w:tcPr>
+            <w:tcBorders>
+              <w:top w:val="single" w:space="0" w:color="D3D3D3"/>
+              <w:bottom w:val="single" w:space="0" w:color="D3D3D3"/>
+              <w:start w:val="single" w:space="0" w:color="D3D3D3"/>
+              <w:end w:val="single" w:space="0" w:color="D3D3D3"/>
+            </w:tcBorders>
+          </w:tcPr>
+          <w:p>
+            <w:pPr>
+              <w:spacing w:before="0" w:after="60"/>
+              <w:keepNext/>
+              <w:jc w:val="start"/>
+            </w:pPr>
+            <w:r>
+              <w:rPr>
+                <w:rFonts w:ascii="Calibri" w:hAnsi="Calibri"/>
+                <w:sz w:val="20"/>
+              </w:rPr>
+              <w:t xml:space="default">Install bathroom exhaust fans in all bathrooms that do not have them. These should be rated for at least 80 cubic feet per minute (CFM) if there is a shower. We recommend the Panasonic Whisper series or similar fans that don’t create excess noise.</w:t>
             </w:r>
           </w:p>
         </w:tc>
@@ -715,31 +715,31 @@
                 <w:rFonts w:ascii="Calibri" w:hAnsi="Calibri"/>
                 <w:sz w:val="20"/>
               </w:rPr>
-              <w:t xml:space="default">Spray Foam Basement/Crawlspace Walls</w:t>
-            </w:r>
-          </w:p>
-        </w:tc>
-        <w:tc>
-          <w:tcPr>
-            <w:tcBorders>
-              <w:top w:val="single" w:space="0" w:color="D3D3D3"/>
-              <w:bottom w:val="single" w:space="0" w:color="D3D3D3"/>
-              <w:start w:val="single" w:space="0" w:color="D3D3D3"/>
-              <w:end w:val="single" w:space="0" w:color="D3D3D3"/>
-            </w:tcBorders>
-          </w:tcPr>
-          <w:p>
-            <w:pPr>
-              <w:spacing w:before="0" w:after="60"/>
-              <w:keepNext/>
-              <w:jc w:val="start"/>
-            </w:pPr>
-            <w:r>
-              <w:rPr>
-                <w:rFonts w:ascii="Calibri" w:hAnsi="Calibri"/>
-                <w:sz w:val="20"/>
-              </w:rPr>
-              <w:t xml:space="default">Install spray foam on the basement/crawlspace walls to prevent moisture infiltration and reduce heat loss.</w:t>
+              <w:t xml:space="default">Kitchen Exhaust Fan</w:t>
+            </w:r>
+          </w:p>
+        </w:tc>
+        <w:tc>
+          <w:tcPr>
+            <w:tcBorders>
+              <w:top w:val="single" w:space="0" w:color="D3D3D3"/>
+              <w:bottom w:val="single" w:space="0" w:color="D3D3D3"/>
+              <w:start w:val="single" w:space="0" w:color="D3D3D3"/>
+              <w:end w:val="single" w:space="0" w:color="D3D3D3"/>
+            </w:tcBorders>
+          </w:tcPr>
+          <w:p>
+            <w:pPr>
+              <w:spacing w:before="0" w:after="60"/>
+              <w:keepNext/>
+              <w:jc w:val="start"/>
+            </w:pPr>
+            <w:r>
+              <w:rPr>
+                <w:rFonts w:ascii="Calibri" w:hAnsi="Calibri"/>
+                <w:sz w:val="20"/>
+              </w:rPr>
+              <w:t xml:space="default">Install a kitchen exhaust fan to remove cooking fumes and moisture from your home. The fan should be rated for at least 100 cubic feet per minute. A kitchen fan should be ducted to the outdoors. If the ductwork will run through the attic, it should be installed before the attic is air-sealed and insulated.</w:t>
             </w:r>
           </w:p>
         </w:tc>
@@ -768,31 +768,31 @@
                 <w:rFonts w:ascii="Calibri" w:hAnsi="Calibri"/>
                 <w:sz w:val="20"/>
               </w:rPr>
-              <w:t xml:space="default">Attic Air Sealing and Insulation</w:t>
-            </w:r>
-          </w:p>
-        </w:tc>
-        <w:tc>
-          <w:tcPr>
-            <w:tcBorders>
-              <w:top w:val="single" w:space="0" w:color="D3D3D3"/>
-              <w:bottom w:val="single" w:space="0" w:color="D3D3D3"/>
-              <w:start w:val="single" w:space="0" w:color="D3D3D3"/>
-              <w:end w:val="single" w:space="0" w:color="D3D3D3"/>
-            </w:tcBorders>
-          </w:tcPr>
-          <w:p>
-            <w:pPr>
-              <w:spacing w:before="0" w:after="60"/>
-              <w:keepNext/>
-              <w:jc w:val="start"/>
-            </w:pPr>
-            <w:r>
-              <w:rPr>
-                <w:rFonts w:ascii="Calibri" w:hAnsi="Calibri"/>
-                <w:sz w:val="20"/>
-              </w:rPr>
-              <w:t xml:space="default">Air seal the attic and insulate it to at least R-60 (18 inches of loose-fill cellulose insulation).</w:t>
+              <w:t xml:space="default">Vapor Barrier</w:t>
+            </w:r>
+          </w:p>
+        </w:tc>
+        <w:tc>
+          <w:tcPr>
+            <w:tcBorders>
+              <w:top w:val="single" w:space="0" w:color="D3D3D3"/>
+              <w:bottom w:val="single" w:space="0" w:color="D3D3D3"/>
+              <w:start w:val="single" w:space="0" w:color="D3D3D3"/>
+              <w:end w:val="single" w:space="0" w:color="D3D3D3"/>
+            </w:tcBorders>
+          </w:tcPr>
+          <w:p>
+            <w:pPr>
+              <w:spacing w:before="0" w:after="60"/>
+              <w:keepNext/>
+              <w:jc w:val="start"/>
+            </w:pPr>
+            <w:r>
+              <w:rPr>
+                <w:rFonts w:ascii="Calibri" w:hAnsi="Calibri"/>
+                <w:sz w:val="20"/>
+              </w:rPr>
+              <w:t xml:space="default">Install a vapor barrier on the basement floor to stop moisture from entering the basement and house.</w:t>
             </w:r>
           </w:p>
         </w:tc>
@@ -821,31 +821,31 @@
                 <w:rFonts w:ascii="Calibri" w:hAnsi="Calibri"/>
                 <w:sz w:val="20"/>
               </w:rPr>
-              <w:t xml:space="default">Continuous Exterior Wall Insulation</w:t>
-            </w:r>
-          </w:p>
-        </w:tc>
-        <w:tc>
-          <w:tcPr>
-            <w:tcBorders>
-              <w:top w:val="single" w:space="0" w:color="D3D3D3"/>
-              <w:bottom w:val="single" w:space="0" w:color="D3D3D3"/>
-              <w:start w:val="single" w:space="0" w:color="D3D3D3"/>
-              <w:end w:val="single" w:space="0" w:color="D3D3D3"/>
-            </w:tcBorders>
-          </w:tcPr>
-          <w:p>
-            <w:pPr>
-              <w:spacing w:before="0" w:after="60"/>
-              <w:keepNext/>
-              <w:jc w:val="start"/>
-            </w:pPr>
-            <w:r>
-              <w:rPr>
-                <w:rFonts w:ascii="Calibri" w:hAnsi="Calibri"/>
-                <w:sz w:val="20"/>
-              </w:rPr>
-              <w:t xml:space="default">Add a continuous layer of insulation and potentially replace the air and moisture barrier once it becomes time to replace the siding.</w:t>
+              <w:t xml:space="default">Spray Foam Basement/Crawlspace Walls</w:t>
+            </w:r>
+          </w:p>
+        </w:tc>
+        <w:tc>
+          <w:tcPr>
+            <w:tcBorders>
+              <w:top w:val="single" w:space="0" w:color="D3D3D3"/>
+              <w:bottom w:val="single" w:space="0" w:color="D3D3D3"/>
+              <w:start w:val="single" w:space="0" w:color="D3D3D3"/>
+              <w:end w:val="single" w:space="0" w:color="D3D3D3"/>
+            </w:tcBorders>
+          </w:tcPr>
+          <w:p>
+            <w:pPr>
+              <w:spacing w:before="0" w:after="60"/>
+              <w:keepNext/>
+              <w:jc w:val="start"/>
+            </w:pPr>
+            <w:r>
+              <w:rPr>
+                <w:rFonts w:ascii="Calibri" w:hAnsi="Calibri"/>
+                <w:sz w:val="20"/>
+              </w:rPr>
+              <w:t xml:space="default">Install spray foam on the basement/crawlspace walls to prevent moisture infiltration and reduce heat loss.</w:t>
             </w:r>
           </w:p>
         </w:tc>
@@ -874,31 +874,31 @@
                 <w:rFonts w:ascii="Calibri" w:hAnsi="Calibri"/>
                 <w:sz w:val="20"/>
               </w:rPr>
-              <w:t xml:space="default">Air Source Heat Pump</w:t>
-            </w:r>
-          </w:p>
-        </w:tc>
-        <w:tc>
-          <w:tcPr>
-            <w:tcBorders>
-              <w:top w:val="single" w:space="0" w:color="D3D3D3"/>
-              <w:bottom w:val="single" w:space="0" w:color="D3D3D3"/>
-              <w:start w:val="single" w:space="0" w:color="D3D3D3"/>
-              <w:end w:val="single" w:space="0" w:color="D3D3D3"/>
-            </w:tcBorders>
-          </w:tcPr>
-          <w:p>
-            <w:pPr>
-              <w:spacing w:before="0" w:after="60"/>
-              <w:keepNext/>
-              <w:jc w:val="start"/>
-            </w:pPr>
-            <w:r>
-              <w:rPr>
-                <w:rFonts w:ascii="Calibri" w:hAnsi="Calibri"/>
-                <w:sz w:val="20"/>
-              </w:rPr>
-              <w:t xml:space="default">Install air source heat pumps for heating and cooling and whole-house surge protection.</w:t>
+              <w:t xml:space="default">Attic Air Sealing and Insulation</w:t>
+            </w:r>
+          </w:p>
+        </w:tc>
+        <w:tc>
+          <w:tcPr>
+            <w:tcBorders>
+              <w:top w:val="single" w:space="0" w:color="D3D3D3"/>
+              <w:bottom w:val="single" w:space="0" w:color="D3D3D3"/>
+              <w:start w:val="single" w:space="0" w:color="D3D3D3"/>
+              <w:end w:val="single" w:space="0" w:color="D3D3D3"/>
+            </w:tcBorders>
+          </w:tcPr>
+          <w:p>
+            <w:pPr>
+              <w:spacing w:before="0" w:after="60"/>
+              <w:keepNext/>
+              <w:jc w:val="start"/>
+            </w:pPr>
+            <w:r>
+              <w:rPr>
+                <w:rFonts w:ascii="Calibri" w:hAnsi="Calibri"/>
+                <w:sz w:val="20"/>
+              </w:rPr>
+              <w:t xml:space="default">Air seal the attic and insulate it to at least R-60 (18 inches of loose-fill cellulose insulation).</w:t>
             </w:r>
           </w:p>
         </w:tc>
@@ -927,31 +927,31 @@
                 <w:rFonts w:ascii="Calibri" w:hAnsi="Calibri"/>
                 <w:sz w:val="20"/>
               </w:rPr>
-              <w:t xml:space="default">Whole-House Surge Protection</w:t>
-            </w:r>
-          </w:p>
-        </w:tc>
-        <w:tc>
-          <w:tcPr>
-            <w:tcBorders>
-              <w:top w:val="single" w:space="0" w:color="D3D3D3"/>
-              <w:bottom w:val="single" w:space="0" w:color="D3D3D3"/>
-              <w:start w:val="single" w:space="0" w:color="D3D3D3"/>
-              <w:end w:val="single" w:space="0" w:color="D3D3D3"/>
-            </w:tcBorders>
-          </w:tcPr>
-          <w:p>
-            <w:pPr>
-              <w:spacing w:before="0" w:after="60"/>
-              <w:keepNext/>
-              <w:jc w:val="start"/>
-            </w:pPr>
-            <w:r>
-              <w:rPr>
-                <w:rFonts w:ascii="Calibri" w:hAnsi="Calibri"/>
-                <w:sz w:val="20"/>
-              </w:rPr>
-              <w:t xml:space="default">Upgrade your electrical panel to add whole-house surge protection.</w:t>
+              <w:t xml:space="default">Blown-in Cellulose Wall Insulation</w:t>
+            </w:r>
+          </w:p>
+        </w:tc>
+        <w:tc>
+          <w:tcPr>
+            <w:tcBorders>
+              <w:top w:val="single" w:space="0" w:color="D3D3D3"/>
+              <w:bottom w:val="single" w:space="0" w:color="D3D3D3"/>
+              <w:start w:val="single" w:space="0" w:color="D3D3D3"/>
+              <w:end w:val="single" w:space="0" w:color="D3D3D3"/>
+            </w:tcBorders>
+          </w:tcPr>
+          <w:p>
+            <w:pPr>
+              <w:spacing w:before="0" w:after="60"/>
+              <w:keepNext/>
+              <w:jc w:val="start"/>
+            </w:pPr>
+            <w:r>
+              <w:rPr>
+                <w:rFonts w:ascii="Calibri" w:hAnsi="Calibri"/>
+                <w:sz w:val="20"/>
+              </w:rPr>
+              <w:t xml:space="default">Insulate the wall stud cavities with dense packed, blown-in cellulose insulation.</w:t>
             </w:r>
           </w:p>
         </w:tc>
@@ -980,31 +980,31 @@
                 <w:rFonts w:ascii="Calibri" w:hAnsi="Calibri"/>
                 <w:sz w:val="20"/>
               </w:rPr>
-              <w:t xml:space="default">Blown-in Cellulose Wall Insulation</w:t>
-            </w:r>
-          </w:p>
-        </w:tc>
-        <w:tc>
-          <w:tcPr>
-            <w:tcBorders>
-              <w:top w:val="single" w:space="0" w:color="D3D3D3"/>
-              <w:bottom w:val="single" w:space="0" w:color="D3D3D3"/>
-              <w:start w:val="single" w:space="0" w:color="D3D3D3"/>
-              <w:end w:val="single" w:space="0" w:color="D3D3D3"/>
-            </w:tcBorders>
-          </w:tcPr>
-          <w:p>
-            <w:pPr>
-              <w:spacing w:before="0" w:after="60"/>
-              <w:keepNext/>
-              <w:jc w:val="start"/>
-            </w:pPr>
-            <w:r>
-              <w:rPr>
-                <w:rFonts w:ascii="Calibri" w:hAnsi="Calibri"/>
-                <w:sz w:val="20"/>
-              </w:rPr>
-              <w:t xml:space="default">Insulate the wall stud cavities with dense packed, blown-in cellulose insulation.</w:t>
+              <w:t xml:space="default">Continuous Exterior Wall Insulation</w:t>
+            </w:r>
+          </w:p>
+        </w:tc>
+        <w:tc>
+          <w:tcPr>
+            <w:tcBorders>
+              <w:top w:val="single" w:space="0" w:color="D3D3D3"/>
+              <w:bottom w:val="single" w:space="0" w:color="D3D3D3"/>
+              <w:start w:val="single" w:space="0" w:color="D3D3D3"/>
+              <w:end w:val="single" w:space="0" w:color="D3D3D3"/>
+            </w:tcBorders>
+          </w:tcPr>
+          <w:p>
+            <w:pPr>
+              <w:spacing w:before="0" w:after="60"/>
+              <w:keepNext/>
+              <w:jc w:val="start"/>
+            </w:pPr>
+            <w:r>
+              <w:rPr>
+                <w:rFonts w:ascii="Calibri" w:hAnsi="Calibri"/>
+                <w:sz w:val="20"/>
+              </w:rPr>
+              <w:t xml:space="default">Add a continuous layer of insulation and potentially replace the air and moisture barrier once it becomes time to replace the siding.</w:t>
             </w:r>
           </w:p>
         </w:tc>
@@ -1033,31 +1033,31 @@
                 <w:rFonts w:ascii="Calibri" w:hAnsi="Calibri"/>
                 <w:sz w:val="20"/>
               </w:rPr>
-              <w:t xml:space="default">Solar</w:t>
-            </w:r>
-          </w:p>
-        </w:tc>
-        <w:tc>
-          <w:tcPr>
-            <w:tcBorders>
-              <w:top w:val="single" w:space="0" w:color="D3D3D3"/>
-              <w:bottom w:val="single" w:space="0" w:color="D3D3D3"/>
-              <w:start w:val="single" w:space="0" w:color="D3D3D3"/>
-              <w:end w:val="single" w:space="0" w:color="D3D3D3"/>
-            </w:tcBorders>
-          </w:tcPr>
-          <w:p>
-            <w:pPr>
-              <w:spacing w:before="0" w:after="60"/>
-              <w:keepNext/>
-              <w:jc w:val="start"/>
-            </w:pPr>
-            <w:r>
-              <w:rPr>
-                <w:rFonts w:ascii="Calibri" w:hAnsi="Calibri"/>
-                <w:sz w:val="20"/>
-              </w:rPr>
-              <w:t xml:space="default">Rooftop solar can supply most or all of your home electrical demands. Contact a solar company for pricing and details specific to your home.</w:t>
+              <w:t xml:space="default">Pipe Insulation</w:t>
+            </w:r>
+          </w:p>
+        </w:tc>
+        <w:tc>
+          <w:tcPr>
+            <w:tcBorders>
+              <w:top w:val="single" w:space="0" w:color="D3D3D3"/>
+              <w:bottom w:val="single" w:space="0" w:color="D3D3D3"/>
+              <w:start w:val="single" w:space="0" w:color="D3D3D3"/>
+              <w:end w:val="single" w:space="0" w:color="D3D3D3"/>
+            </w:tcBorders>
+          </w:tcPr>
+          <w:p>
+            <w:pPr>
+              <w:spacing w:before="0" w:after="60"/>
+              <w:keepNext/>
+              <w:jc w:val="start"/>
+            </w:pPr>
+            <w:r>
+              <w:rPr>
+                <w:rFonts w:ascii="Calibri" w:hAnsi="Calibri"/>
+                <w:sz w:val="20"/>
+              </w:rPr>
+              <w:t xml:space="default">Insulate both hot and cold water pipes that are uninsulated in the basement/crawlspace. This will save energy and prevent condensation.</w:t>
             </w:r>
           </w:p>
         </w:tc>
@@ -1086,31 +1086,84 @@
                 <w:rFonts w:ascii="Calibri" w:hAnsi="Calibri"/>
                 <w:sz w:val="20"/>
               </w:rPr>
-              <w:t xml:space="default">Electrical Panel Upgrade</w:t>
-            </w:r>
-          </w:p>
-        </w:tc>
-        <w:tc>
-          <w:tcPr>
-            <w:tcBorders>
-              <w:top w:val="single" w:space="0" w:color="D3D3D3"/>
-              <w:bottom w:val="single" w:space="0" w:color="D3D3D3"/>
-              <w:start w:val="single" w:space="0" w:color="D3D3D3"/>
-              <w:end w:val="single" w:space="0" w:color="D3D3D3"/>
-            </w:tcBorders>
-          </w:tcPr>
-          <w:p>
-            <w:pPr>
-              <w:spacing w:before="0" w:after="60"/>
-              <w:keepNext/>
-              <w:jc w:val="start"/>
-            </w:pPr>
-            <w:r>
-              <w:rPr>
-                <w:rFonts w:ascii="Calibri" w:hAnsi="Calibri"/>
-                <w:sz w:val="20"/>
-              </w:rPr>
-              <w:t xml:space="default">Consult with an electrician about replacing your existing electrical panel with a 200 amp panel as you add electrical appliances to your home.</w:t>
+              <w:t xml:space="default">DIY Air Sealing</w:t>
+            </w:r>
+          </w:p>
+        </w:tc>
+        <w:tc>
+          <w:tcPr>
+            <w:tcBorders>
+              <w:top w:val="single" w:space="0" w:color="D3D3D3"/>
+              <w:bottom w:val="single" w:space="0" w:color="D3D3D3"/>
+              <w:start w:val="single" w:space="0" w:color="D3D3D3"/>
+              <w:end w:val="single" w:space="0" w:color="D3D3D3"/>
+            </w:tcBorders>
+          </w:tcPr>
+          <w:p>
+            <w:pPr>
+              <w:spacing w:before="0" w:after="60"/>
+              <w:keepNext/>
+              <w:jc w:val="start"/>
+            </w:pPr>
+            <w:r>
+              <w:rPr>
+                <w:rFonts w:ascii="Calibri" w:hAnsi="Calibri"/>
+                <w:sz w:val="20"/>
+              </w:rPr>
+              <w:t xml:space="default">Seal easy-to-access air leaks and weatherstrip exterior doors.</w:t>
+            </w:r>
+          </w:p>
+        </w:tc>
+      </w:tr>
+      <w:tr>
+        <w:trPr>
+          <w:cantSplit/>
+        </w:trPr>
+        <w:tc>
+          <w:tcPr>
+            <w:tcBorders>
+              <w:top w:val="single" w:space="0" w:color="D3D3D3"/>
+              <w:bottom w:val="single" w:space="0" w:color="D3D3D3"/>
+              <w:start w:val="single" w:space="0" w:color="D3D3D3"/>
+              <w:end w:val="single" w:space="0" w:color="D3D3D3"/>
+            </w:tcBorders>
+          </w:tcPr>
+          <w:p>
+            <w:pPr>
+              <w:spacing w:before="0" w:after="60"/>
+              <w:keepNext/>
+              <w:jc w:val="start"/>
+            </w:pPr>
+            <w:r>
+              <w:rPr>
+                <w:rFonts w:ascii="Calibri" w:hAnsi="Calibri"/>
+                <w:sz w:val="20"/>
+              </w:rPr>
+              <w:t xml:space="default">Ductwork Air Sealing and Insulation</w:t>
+            </w:r>
+          </w:p>
+        </w:tc>
+        <w:tc>
+          <w:tcPr>
+            <w:tcBorders>
+              <w:top w:val="single" w:space="0" w:color="D3D3D3"/>
+              <w:bottom w:val="single" w:space="0" w:color="D3D3D3"/>
+              <w:start w:val="single" w:space="0" w:color="D3D3D3"/>
+              <w:end w:val="single" w:space="0" w:color="D3D3D3"/>
+            </w:tcBorders>
+          </w:tcPr>
+          <w:p>
+            <w:pPr>
+              <w:spacing w:before="0" w:after="60"/>
+              <w:keepNext/>
+              <w:jc w:val="start"/>
+            </w:pPr>
+            <w:r>
+              <w:rPr>
+                <w:rFonts w:ascii="Calibri" w:hAnsi="Calibri"/>
+                <w:sz w:val="20"/>
+              </w:rPr>
+              <w:t xml:space="default">Air seal and insulate all of the supply and return ductwork running through the basement/crawlspace.</w:t>
             </w:r>
           </w:p>
         </w:tc>
@@ -1195,7 +1248,7 @@
                 <w:rFonts w:ascii="Calibri" w:hAnsi="Calibri"/>
                 <w:sz w:val="20"/>
               </w:rPr>
-              <w:t xml:space="default">1980s</w:t>
+              <w:t xml:space="default">NA</w:t>
             </w:r>
           </w:p>
         </w:tc>
@@ -1248,7 +1301,7 @@
                 <w:rFonts w:ascii="Calibri" w:hAnsi="Calibri"/>
                 <w:sz w:val="20"/>
               </w:rPr>
-              <w:t xml:space="default">Crawlspace</w:t>
+              <w:t xml:space="default">Walk in basement</w:t>
             </w:r>
           </w:p>
         </w:tc>
@@ -1301,7 +1354,7 @@
                 <w:rFonts w:ascii="Calibri" w:hAnsi="Calibri"/>
                 <w:sz w:val="20"/>
               </w:rPr>
-              <w:t xml:space="default">Batts of Fiberglass , 5 inches</w:t>
+              <w:t xml:space="default">Batts of Fiberglass , 1 inches</w:t>
             </w:r>
           </w:p>
         </w:tc>
@@ -1354,7 +1407,7 @@
                 <w:rFonts w:ascii="Calibri" w:hAnsi="Calibri"/>
                 <w:sz w:val="20"/>
               </w:rPr>
-              <w:t xml:space="default">1</w:t>
+              <w:t xml:space="default">2</w:t>
             </w:r>
           </w:p>
         </w:tc>
@@ -1407,7 +1460,7 @@
                 <w:rFonts w:ascii="Calibri" w:hAnsi="Calibri"/>
                 <w:sz w:val="20"/>
               </w:rPr>
-              <w:t xml:space="default">720</w:t>
+              <w:t xml:space="default">NA</w:t>
             </w:r>
           </w:p>
         </w:tc>
@@ -1460,7 +1513,7 @@
                 <w:rFonts w:ascii="Calibri" w:hAnsi="Calibri"/>
                 <w:sz w:val="20"/>
               </w:rPr>
-              <w:t xml:space="default">5587</w:t>
+              <w:t xml:space="default">NA</w:t>
             </w:r>
           </w:p>
         </w:tc>
@@ -1589,7 +1642,7 @@
                 <w:rFonts w:ascii="Calibri" w:hAnsi="Calibri"/>
                 <w:sz w:val="20"/>
               </w:rPr>
-              <w:t xml:space="default">40</w:t>
+              <w:t xml:space="default">NA</w:t>
             </w:r>
           </w:p>
         </w:tc>
@@ -1695,7 +1748,7 @@
                 <w:rFonts w:ascii="Calibri" w:hAnsi="Calibri"/>
                 <w:sz w:val="20"/>
               </w:rPr>
-              <w:t xml:space="default">Asphalt Shinglesin faircondition. NA</w:t>
+              <w:t xml:space="default">Asphalt Shinglesin faircondition. Most of the roof is in good condition, but there are a few places where shingles are lifting up.</w:t>
             </w:r>
           </w:p>
         </w:tc>
@@ -1748,7 +1801,7 @@
                 <w:rFonts w:ascii="Calibri" w:hAnsi="Calibri"/>
                 <w:sz w:val="20"/>
               </w:rPr>
-              <w:t xml:space="default">Current moisture control strategies: gutters, ground slopes away from foundation, sump pump, native shrubery. These were in fair condition .Gutters were only present on the south side of the house.</w:t>
+              <w:t xml:space="default">Current moisture control strategies: NA. These were in NA condition .NA</w:t>
             </w:r>
           </w:p>
         </w:tc>
@@ -1801,7 +1854,7 @@
                 <w:rFonts w:ascii="Calibri" w:hAnsi="Calibri"/>
                 <w:sz w:val="20"/>
               </w:rPr>
-              <w:t xml:space="default">wood shingles in fair condition. NA</w:t>
+              <w:t xml:space="default">wood shingles in poor condition. Severe weathering and water damage on all siding, many broken shingles</w:t>
             </w:r>
           </w:p>
         </w:tc>
@@ -1854,7 +1907,7 @@
                 <w:rFonts w:ascii="Calibri" w:hAnsi="Calibri"/>
                 <w:sz w:val="20"/>
               </w:rPr>
-              <w:t xml:space="default">There are 2 hollow fiberglass exterior doors. In fair condition, totaling 38.9 square feet.</w:t>
+              <w:t xml:space="default">There are no exterior doors</w:t>
             </w:r>
           </w:p>
         </w:tc>
@@ -1907,7 +1960,7 @@
                 <w:rFonts w:ascii="Calibri" w:hAnsi="Calibri"/>
                 <w:sz w:val="20"/>
               </w:rPr>
-              <w:t xml:space="default">There are 12 double paned vinyl windows. In fair condition, totaling 133.62 square feet.</w:t>
+              <w:t xml:space="default">There are no exterior windows</w:t>
             </w:r>
           </w:p>
         </w:tc>
@@ -1983,7 +2036,7 @@
                 <w:rFonts w:ascii="Calibri" w:hAnsi="Calibri"/>
                 <w:sz w:val="20"/>
               </w:rPr>
-              <w:t xml:space="default">The framing type of the home is platform framing, which means that wall cavities do not extend the full height of the building and are instead separated by floors. There is Batts of Fiberglass insulation 3 inches thick in NA condition. We were unable to determine the condition of the wall insulation.</w:t>
+              <w:t xml:space="default">NAThere is Batts of Fiberglass insulation NA inches thick in NA condition. NA</w:t>
             </w:r>
           </w:p>
         </w:tc>
@@ -2089,7 +2142,7 @@
                 <w:rFonts w:ascii="Calibri" w:hAnsi="Calibri"/>
                 <w:sz w:val="20"/>
               </w:rPr>
-              <w:t xml:space="default">There is no bathroom exhaust fan, which causes mold and moisture issues. The resident runs a fan in the bathroom to keep it dry.</w:t>
+              <w:t xml:space="default">NA</w:t>
             </w:r>
           </w:p>
         </w:tc>
@@ -2142,7 +2195,7 @@
                 <w:rFonts w:ascii="Calibri" w:hAnsi="Calibri"/>
                 <w:sz w:val="20"/>
               </w:rPr>
-              <w:t xml:space="default">Refrigerator used 0.05 kWh in 87 minutes. NA used NA kWh in NA minutes. The stove is electric, but the oven does not work.</w:t>
+              <w:t xml:space="default">NA used NA kWh in NA minutes. NA used NA kWh in NA minutes. NA</w:t>
             </w:r>
           </w:p>
         </w:tc>
@@ -2250,7 +2303,7 @@
                 <w:rFonts w:ascii="Calibri" w:hAnsi="Calibri"/>
                 <w:sz w:val="20"/>
               </w:rPr>
-              <w:t xml:space="default">1346</w:t>
+              <w:t xml:space="default">2288</w:t>
             </w:r>
           </w:p>
         </w:tc>
@@ -2327,7 +2380,7 @@
                 <w:rFonts w:ascii="Calibri" w:hAnsi="Calibri"/>
                 <w:sz w:val="20"/>
               </w:rPr>
-              <w:t xml:space="default">14.5</w:t>
+              <w:t xml:space="default">NA</w:t>
             </w:r>
           </w:p>
         </w:tc>
@@ -2404,7 +2457,7 @@
                 <w:rFonts w:ascii="Calibri" w:hAnsi="Calibri"/>
                 <w:sz w:val="20"/>
               </w:rPr>
-              <w:t xml:space="default">134.6 under natural conditions. TEST</w:t>
+              <w:t xml:space="default">228.8 under natural conditions. TEST</w:t>
             </w:r>
           </w:p>
         </w:tc>
@@ -2481,7 +2534,7 @@
                 <w:rFonts w:ascii="Calibri" w:hAnsi="Calibri"/>
                 <w:sz w:val="20"/>
               </w:rPr>
-              <w:t xml:space="default">0.8</w:t>
+              <w:t xml:space="default">NA</w:t>
             </w:r>
           </w:p>
         </w:tc>
@@ -2644,7 +2697,7 @@
                 <w:rFonts w:ascii="Calibri" w:hAnsi="Calibri"/>
                 <w:sz w:val="20"/>
               </w:rPr>
-              <w:t xml:space="default">720</w:t>
+              <w:t xml:space="default">NA</w:t>
             </w:r>
           </w:p>
         </w:tc>
@@ -2750,7 +2803,7 @@
                 <w:rFonts w:ascii="Calibri" w:hAnsi="Calibri"/>
                 <w:sz w:val="20"/>
               </w:rPr>
-              <w:t xml:space="default">Fair</w:t>
+              <w:t xml:space="default">Partially</w:t>
             </w:r>
           </w:p>
         </w:tc>
@@ -2803,7 +2856,7 @@
                 <w:rFonts w:ascii="Calibri" w:hAnsi="Calibri"/>
                 <w:sz w:val="20"/>
               </w:rPr>
-              <w:t xml:space="default">There is Yesair sealing. There is air-sealing around the woodstove chimney.</w:t>
+              <w:t xml:space="default">There is Noair sealing. NA</w:t>
             </w:r>
           </w:p>
         </w:tc>
@@ -2856,7 +2909,7 @@
                 <w:rFonts w:ascii="Calibri" w:hAnsi="Calibri"/>
                 <w:sz w:val="20"/>
               </w:rPr>
-              <w:t xml:space="default">Some of the batts of fiberglass are lifting up a bit, and there is space to add more insulation. No NA</w:t>
+              <w:t xml:space="default">Attic insulation is very inconsistent and falling away from roof ridge at many points No NA</w:t>
             </w:r>
           </w:p>
         </w:tc>
@@ -2909,7 +2962,7 @@
                 <w:rFonts w:ascii="Calibri" w:hAnsi="Calibri"/>
                 <w:sz w:val="20"/>
               </w:rPr>
-              <w:t xml:space="default">No</w:t>
+              <w:t xml:space="default">NA</w:t>
             </w:r>
           </w:p>
         </w:tc>
@@ -3038,7 +3091,7 @@
                 <w:rFonts w:ascii="Calibri" w:hAnsi="Calibri"/>
                 <w:sz w:val="20"/>
               </w:rPr>
-              <w:t xml:space="default">720</w:t>
+              <w:t xml:space="default">NA</w:t>
             </w:r>
           </w:p>
         </w:tc>
@@ -3091,7 +3144,7 @@
                 <w:rFonts w:ascii="Calibri" w:hAnsi="Calibri"/>
                 <w:sz w:val="20"/>
               </w:rPr>
-              <w:t xml:space="default">NAThere is a lot of moisture in the crawlspace, and there is a very damp batt of insulation.</w:t>
+              <w:t xml:space="default">NANA</w:t>
             </w:r>
           </w:p>
         </w:tc>
@@ -3197,7 +3250,7 @@
                 <w:rFonts w:ascii="Calibri" w:hAnsi="Calibri"/>
                 <w:sz w:val="20"/>
               </w:rPr>
-              <w:t xml:space="default">No appliances</w:t>
+              <w:t xml:space="default">Appliances not insulated, Ducts/pipes partially insulated</w:t>
             </w:r>
           </w:p>
         </w:tc>
@@ -3250,7 +3303,7 @@
                 <w:rFonts w:ascii="Calibri" w:hAnsi="Calibri"/>
                 <w:sz w:val="20"/>
               </w:rPr>
-              <w:t xml:space="default">sump pumpin poorcondition. Gutters were only present on the south side of the house.</w:t>
+              <w:t xml:space="default">NAin NAcondition. NA</w:t>
             </w:r>
           </w:p>
         </w:tc>
@@ -3303,7 +3356,7 @@
                 <w:rFonts w:ascii="Calibri" w:hAnsi="Calibri"/>
                 <w:sz w:val="20"/>
               </w:rPr>
-              <w:t xml:space="default">NoNA</w:t>
+              <w:t xml:space="default">YesExhaust duct is very long and has some parts that are sagging, creating sharp turns</w:t>
             </w:r>
           </w:p>
         </w:tc>
@@ -3356,7 +3409,7 @@
                 <w:rFonts w:ascii="Calibri" w:hAnsi="Calibri"/>
                 <w:sz w:val="20"/>
               </w:rPr>
-              <w:t xml:space="default">There is NANA</w:t>
+              <w:t xml:space="default">There is moistureMoisture marks along most walls, mold on floor and wall next to well pressure tank and oil tank</w:t>
             </w:r>
           </w:p>
         </w:tc>
@@ -3432,7 +3485,7 @@
                 <w:rFonts w:ascii="Calibri" w:hAnsi="Calibri"/>
                 <w:sz w:val="20"/>
               </w:rPr>
-              <w:t xml:space="default">The electrical panel has and amperage of 200. There are 0 unused breaker spaces. NA</w:t>
+              <w:t xml:space="default">The electrical panel has and amperage of 200. There are 11 unused breaker spaces. NA</w:t>
             </w:r>
           </w:p>
         </w:tc>
@@ -3559,7 +3612,7 @@
     </w:tbl>
     <w:bookmarkEnd w:id="40"/>
     <w:bookmarkEnd w:id="41"/>
-    <w:bookmarkStart w:id="57" w:name="recommendations"/>
+    <w:bookmarkStart w:id="58" w:name="recommendations"/>
     <w:p>
       <w:pPr>
         <w:pStyle w:val="Heading2"/>
@@ -3576,13 +3629,13 @@
         <w:t xml:space="preserve">These recommendations are organized from the least expensive/most cost-effective and easiest interventions to ones that are more challenging to implement.</w:t>
       </w:r>
     </w:p>
-    <w:bookmarkStart w:id="42" w:name="high-efficiency-shower-heads"/>
+    <w:bookmarkStart w:id="42" w:name="furnaceboiler-tune-up"/>
     <w:p>
       <w:pPr>
         <w:pStyle w:val="Heading3"/>
       </w:pPr>
       <w:r>
-        <w:t xml:space="preserve">4.1 High efficiency shower head(s)</w:t>
+        <w:t xml:space="preserve">4.1 Furnace/Boiler Tune up</w:t>
       </w:r>
     </w:p>
     <w:p>
@@ -3602,7 +3655,11 @@
         <w:pStyle w:val="BodyText"/>
       </w:pPr>
       <w:r>
-        <w:t xml:space="preserve">Your shower heads use more water and energy than high-efficiency shower heads, thus costing you more money than necessary. Older shower heads use 2.5 gallons or more every minute, which wastes thousands of gallons of water each year and costs you money for every extra gallon of water heated.</w:t>
+        <w:rPr>
+          <w:b/>
+          <w:bCs/>
+        </w:rPr>
+        <w:t xml:space="preserve">Auditor to describe</w:t>
       </w:r>
     </w:p>
     <w:p>
@@ -3622,11 +3679,13 @@
         <w:pStyle w:val="BodyText"/>
       </w:pPr>
       <w:r>
-        <w:t xml:space="preserve">Install high-efficiency shower heads to reduce the amount of water and energy to heat the water used when showering. We recommend 1.5 gallon per minute shower heads that will save a gallon or more of water for every minute spent in the shower.</w:t>
-      </w:r>
-      <w:r>
-        <w:t xml:space="preserve"> </w:t>
-      </w:r>
+        <w:t xml:space="preserve">Have the furnace/boiler and flue inspected and adjusted by a licensed professional. This should be available from your fuel delivery company.</w:t>
+      </w:r>
+    </w:p>
+    <w:p>
+      <w:pPr>
+        <w:pStyle w:val="BodyText"/>
+      </w:pPr>
       <w:r>
         <w:rPr>
           <w:i/>
@@ -3640,17 +3699,17 @@
         <w:pStyle w:val="BodyText"/>
       </w:pPr>
       <w:r>
-        <w:t xml:space="preserve">A typical family will save ~10,000 gallons of water per year and over $100 per year in water heating costs. We provide these for free; contact us for some if we did not give you any during the audit.</w:t>
+        <w:t xml:space="preserve">A tune-up can improve the efficiency of your furnace/boiler, confirm that it is exhausting properly, and identify areas of concern before they become urgent. If you have a service contract with your fuel delivery company, an annual tune-up is usually included.</w:t>
       </w:r>
     </w:p>
     <w:bookmarkEnd w:id="42"/>
-    <w:bookmarkStart w:id="43" w:name="window-dressers"/>
+    <w:bookmarkStart w:id="43" w:name="high-efficiency-shower-heads"/>
     <w:p>
       <w:pPr>
         <w:pStyle w:val="Heading3"/>
       </w:pPr>
       <w:r>
-        <w:t xml:space="preserve">4.2 Window Dressers</w:t>
+        <w:t xml:space="preserve">4.2 High efficiency shower head(s)</w:t>
       </w:r>
     </w:p>
     <w:p>
@@ -3670,7 +3729,7 @@
         <w:pStyle w:val="BodyText"/>
       </w:pPr>
       <w:r>
-        <w:t xml:space="preserve">Your windows are a source of heat loss, reduce your comfort due to cold surface temperatures, and may also cause moisture condensation or frost in the winter.</w:t>
+        <w:t xml:space="preserve">Your shower heads use more water and energy than high-efficiency shower heads, thus costing you more money than necessary. Older shower heads use 2.5 gallons or more every minute, which wastes thousands of gallons of water each year and costs you money for every extra gallon of water heated.</w:t>
       </w:r>
     </w:p>
     <w:p>
@@ -3690,7 +3749,7 @@
         <w:pStyle w:val="BodyText"/>
       </w:pPr>
       <w:r>
-        <w:t xml:space="preserve">WindowDressers are insulating window inserts that help air-seal windows and reduce heat loss and gain. WindowDressers are transparent and let in light while stopping drafts. Each insert is made of a custom-made pine frame wrapped on each side with tightly sealed, clear polyolefin film, creating an airspace between the two layers for additional insulation. The insert is finished with a compressible foam weather seal. The foam allows enough give for the inserts to be easily slid into place in the fall and removed in the spring while holding firmly enough to provide a tight, friction-based seal. The inserts are installed inside your existing window frame with no fasteners required and last 5-10 years. They are most effective in the winter, but depending on the window’s exposure, they can sometimes be used in the summer to keep the house cooler.</w:t>
+        <w:t xml:space="preserve">Install high-efficiency shower heads to reduce the amount of water and energy to heat the water used when showering. We recommend 1.5 gallon per minute shower heads that will save a gallon or more of water for every minute spent in the shower.</w:t>
       </w:r>
       <w:r>
         <w:t xml:space="preserve"> </w:t>
@@ -3708,45 +3767,17 @@
         <w:pStyle w:val="BodyText"/>
       </w:pPr>
       <w:r>
-        <w:t xml:space="preserve">Insulating window inserts save 5-10% of your heating costs at less than 1/10th the cost of replacement windows. The overall project cost will depend on the number and size of window inserts. Example prices for the 2024 season were: small (20 x 36”) - $36 for natural pine frame, $46 for white; medium (30 x 52”) - $50 for natural pine frame, $64 for white; large (44 x 68”) - $67 for natural pine frame, $88 for white. Adjusted pricing for lower-income households is available from WindowDressers upon request. If plastic is damaged, it can be replaced for $15.</w:t>
-      </w:r>
-    </w:p>
-    <w:p>
-      <w:pPr>
-        <w:pStyle w:val="BodyText"/>
-      </w:pPr>
-      <w:r>
-        <w:t xml:space="preserve">Households that order inserts are expected to participate in the Community Build where the inserts are made. You can sign up for a 4-hour shift and learn the simple steps in the insert-building process (no previous experience required, no power tools). Each job has</w:t>
-      </w:r>
-      <w:r>
-        <w:t xml:space="preserve"> </w:t>
-      </w:r>
-      <w:r>
-        <w:t xml:space="preserve">“jigs”</w:t>
-      </w:r>
-      <w:r>
-        <w:t xml:space="preserve"> </w:t>
-      </w:r>
-      <w:r>
-        <w:t xml:space="preserve">that make the job easier to do and ensure uniform quality. You will be trained at the beginning of your shift on how to do your task. Volunteering for multiple shifts is encouraged! Mid-shift snacks and a meal are provided to all participants.</w:t>
-      </w:r>
-    </w:p>
-    <w:p>
-      <w:pPr>
-        <w:pStyle w:val="BodyText"/>
-      </w:pPr>
-      <w:r>
-        <w:t xml:space="preserve">If you would like to participate, please contact us so we can discuss how the program works and which windows you’d like inserts for.</w:t>
+        <w:t xml:space="preserve">A typical family will save ~10,000 gallons of water per year and over $100 per year in water heating costs. We provide these for free; contact us for some if we did not give you any during the audit.</w:t>
       </w:r>
     </w:p>
     <w:bookmarkEnd w:id="43"/>
-    <w:bookmarkStart w:id="44" w:name="induction-stoveoven"/>
+    <w:bookmarkStart w:id="44" w:name="leds"/>
     <w:p>
       <w:pPr>
         <w:pStyle w:val="Heading3"/>
       </w:pPr>
       <w:r>
-        <w:t xml:space="preserve">4.3 Induction Stove/Oven</w:t>
+        <w:t xml:space="preserve">4.3 LEDs</w:t>
       </w:r>
     </w:p>
     <w:p>
@@ -3766,7 +3797,7 @@
         <w:pStyle w:val="BodyText"/>
       </w:pPr>
       <w:r>
-        <w:t xml:space="preserve">Your gas range has the potential to release propane, carbon monoxide, and combustion gases into your house. Gas ranges are also inefficient at transferring heat to your food at 32% efficiency, compared to 85% efficiency for induction cooktops.</w:t>
+        <w:t xml:space="preserve">Your lighting uses more energy than LED bulbs would. Halogen and incandescent light bulbs use 5-8x more energy than LEDs. This requires significantly more electricity and costs a lot.</w:t>
       </w:r>
     </w:p>
     <w:p>
@@ -3786,7 +3817,7 @@
         <w:pStyle w:val="BodyText"/>
       </w:pPr>
       <w:r>
-        <w:t xml:space="preserve">Induction cooking appliances are more efficient and safer than electric or gas ones. There is no risk of carbon monoxide or other harmful combustion gases, and the surface doesn’t heat up without a pot or pan on it.</w:t>
+        <w:t xml:space="preserve">Switch your light bulbs to LED light bulbs. LEDs use 80% less energy than incandescent light bulbs, which can significantly reduce your electricity bill.</w:t>
       </w:r>
     </w:p>
     <w:p>
@@ -3806,17 +3837,17 @@
         <w:pStyle w:val="BodyText"/>
       </w:pPr>
       <w:r>
-        <w:t xml:space="preserve">Currently, Efficiency Maine does not offer a rebate for induction stoves. If you’re interested in trying out induction cooking but don’t want to replace your kitchen stove, consider buying a portable induction cooktop, which costs less than $100.</w:t>
+        <w:t xml:space="preserve">We provide free LED light bulbs; contact us for some if we did not give you any during the audit. Depending on usage, LEDs can save more than $50 a year.</w:t>
       </w:r>
     </w:p>
     <w:bookmarkEnd w:id="44"/>
-    <w:bookmarkStart w:id="45" w:name="gutters"/>
+    <w:bookmarkStart w:id="45" w:name="window-dressers"/>
     <w:p>
       <w:pPr>
         <w:pStyle w:val="Heading3"/>
       </w:pPr>
       <w:r>
-        <w:t xml:space="preserve">4.4 Gutters</w:t>
+        <w:t xml:space="preserve">4.4 Window Dressers</w:t>
       </w:r>
     </w:p>
     <w:p>
@@ -3836,7 +3867,7 @@
         <w:pStyle w:val="BodyText"/>
       </w:pPr>
       <w:r>
-        <w:t xml:space="preserve">The house has no gutters, so water runs off your roof and directly onto the ground next to your house. Water that splashes off the ground can damage the exterior of your house. Runoff that is absorbed into the ground can seep into the basement/crawlspace, causing moisture issues there and throughout your house.</w:t>
+        <w:t xml:space="preserve">Your windows are a source of heat loss, reduce your comfort due to cold surface temperatures, and may also cause moisture condensation or frost in the winter.</w:t>
       </w:r>
     </w:p>
     <w:p>
@@ -3856,13 +3887,11 @@
         <w:pStyle w:val="BodyText"/>
       </w:pPr>
       <w:r>
-        <w:t xml:space="preserve">Install gutters and downspouts that divert water at least six feet away from the foundation and to where the ground slopes away from the house.</w:t>
-      </w:r>
-    </w:p>
-    <w:p>
-      <w:pPr>
-        <w:pStyle w:val="BodyText"/>
-      </w:pPr>
+        <w:t xml:space="preserve">WindowDressers are insulating window inserts that help air-seal windows and reduce heat loss and gain. WindowDressers are transparent and let in light while stopping drafts. Each insert is made of a custom-made pine frame wrapped on each side with tightly sealed, clear polyolefin film, creating an airspace between the two layers for additional insulation. The insert is finished with a compressible foam weather seal. The foam allows enough give for the inserts to be easily slid into place in the fall and removed in the spring while holding firmly enough to provide a tight, friction-based seal. The inserts are installed inside your existing window frame with no fasteners required and last 5-10 years. They are most effective in the winter, but depending on the window’s exposure, they can sometimes be used in the summer to keep the house cooler.</w:t>
+      </w:r>
+      <w:r>
+        <w:t xml:space="preserve"> </w:t>
+      </w:r>
       <w:r>
         <w:rPr>
           <w:i/>
@@ -3876,17 +3905,45 @@
         <w:pStyle w:val="BodyText"/>
       </w:pPr>
       <w:r>
-        <w:t xml:space="preserve">Adding gutters would mitigate moisture damage and save you from having to replace/fix other parts of the house.</w:t>
+        <w:t xml:space="preserve">Insulating window inserts save 5-10% of your heating costs at less than 1/10th the cost of replacement windows. The overall project cost will depend on the number and size of window inserts. Example prices for the 2024 season were: small (20 x 36”) - $36 for natural pine frame, $46 for white; medium (30 x 52”) - $50 for natural pine frame, $64 for white; large (44 x 68”) - $67 for natural pine frame, $88 for white. Adjusted pricing for lower-income households is available from WindowDressers upon request. If plastic is damaged, it can be replaced for $15.</w:t>
+      </w:r>
+    </w:p>
+    <w:p>
+      <w:pPr>
+        <w:pStyle w:val="BodyText"/>
+      </w:pPr>
+      <w:r>
+        <w:t xml:space="preserve">Households that order inserts are expected to participate in the Community Build where the inserts are made. You can sign up for a 4-hour shift and learn the simple steps in the insert-building process (no previous experience required, no power tools). Each job has</w:t>
+      </w:r>
+      <w:r>
+        <w:t xml:space="preserve"> </w:t>
+      </w:r>
+      <w:r>
+        <w:t xml:space="preserve">“jigs”</w:t>
+      </w:r>
+      <w:r>
+        <w:t xml:space="preserve"> </w:t>
+      </w:r>
+      <w:r>
+        <w:t xml:space="preserve">that make the job easier to do and ensure uniform quality. You will be trained at the beginning of your shift on how to do your task. Volunteering for multiple shifts is encouraged! Mid-shift snacks and a meal are provided to all participants.</w:t>
+      </w:r>
+    </w:p>
+    <w:p>
+      <w:pPr>
+        <w:pStyle w:val="BodyText"/>
+      </w:pPr>
+      <w:r>
+        <w:t xml:space="preserve">If you would like to participate, please contact us so we can discuss how the program works and which windows you’d like inserts for.</w:t>
       </w:r>
     </w:p>
     <w:bookmarkEnd w:id="45"/>
-    <w:bookmarkStart w:id="46" w:name="bathroom-exhaust-fans"/>
+    <w:bookmarkStart w:id="46" w:name="heat-pump-water-heater"/>
     <w:p>
       <w:pPr>
         <w:pStyle w:val="Heading3"/>
       </w:pPr>
       <w:r>
-        <w:t xml:space="preserve">4.5 Bathroom exhaust fan(s)</w:t>
+        <w:t xml:space="preserve">4.5 Heat Pump Water Heater</w:t>
       </w:r>
     </w:p>
     <w:p>
@@ -3906,7 +3963,11 @@
         <w:pStyle w:val="BodyText"/>
       </w:pPr>
       <w:r>
-        <w:t xml:space="preserve">Currently, there is no bathroom exhaust fan, so moisture from the shower, toilet, and sink remains in the house, which can cause moisture issues such as mold.</w:t>
+        <w:rPr>
+          <w:b/>
+          <w:bCs/>
+        </w:rPr>
+        <w:t xml:space="preserve">Auditor to describe depending on what their current system is</w:t>
       </w:r>
     </w:p>
     <w:p>
@@ -3926,7 +3987,7 @@
         <w:pStyle w:val="BodyText"/>
       </w:pPr>
       <w:r>
-        <w:t xml:space="preserve">Install bathroom exhaust fans in all bathrooms that do not have them. These should be rated for at least 80 cubic feet per minute (CFM) if there is a shower. We recommend the Panasonic Whisper series or similar fans that don’t create excess noise. If the ductwork will run through the attic, it should be installed before the attic is air-sealed and insulated. The fan needs to be ducted outside, so it does not add moisture into the attic.</w:t>
+        <w:t xml:space="preserve">Install a heat pump water heater to provide your hot water for cooking and bathing. This is the most efficient way to heat water and will save hundreds of dollars a year compared to electric resistance, heating oil, or propane hot water. It will also help to dehumidify while it’s running. If your current water heater burns oil or propane, this will also remove a source of combustion gases from your home. We also recommend setting the temperature on the water heater at 130°F for more efficient operation.</w:t>
       </w:r>
     </w:p>
     <w:p>
@@ -3946,17 +4007,17 @@
         <w:pStyle w:val="BodyText"/>
       </w:pPr>
       <w:r>
-        <w:t xml:space="preserve">The typical fan is around $130 plus the cost of installation.</w:t>
+        <w:t xml:space="preserve">A heat pump water heater uses 70% less electricity than a standard electric water heater. Efficiency Maine offers a rebate of up to $950, making the equipment cost as little as $400 plus installation. The rebate can be combined with a nonrefundable federal tax credit of 30% of the remaining cost of the unit and labor, subject to an annual maximum benefit of $2,000 (shared with other energy property, like heat pumps). For more information, you can call Efficiency Maine at 866-376-2463 (Monday to Friday, 8:00 am to 5:00 pm) or visit their website: https://www.efficiencymaine.com/at-home/heat-pump-water-heater-program/</w:t>
       </w:r>
     </w:p>
     <w:bookmarkEnd w:id="46"/>
-    <w:bookmarkStart w:id="47" w:name="kitchen-exhaust-fans"/>
+    <w:bookmarkStart w:id="47" w:name="gutters"/>
     <w:p>
       <w:pPr>
         <w:pStyle w:val="Heading3"/>
       </w:pPr>
       <w:r>
-        <w:t xml:space="preserve">4.6 Kitchen exhaust fan(s)</w:t>
+        <w:t xml:space="preserve">4.6 Gutters</w:t>
       </w:r>
     </w:p>
     <w:p>
@@ -3976,7 +4037,7 @@
         <w:pStyle w:val="BodyText"/>
       </w:pPr>
       <w:r>
-        <w:t xml:space="preserve">Currently, there is no kitchen exhaust fan, so fumes, smoke, and moisture from cooking stay in the house which can cause health concerns.</w:t>
+        <w:t xml:space="preserve">The house has no gutters, so water runs off your roof and directly onto the ground next to your house. Water that splashes off the ground can damage the exterior of your house. Runoff that is absorbed into the ground can seep into the basement/crawlspace, causing moisture issues there and throughout your house.</w:t>
       </w:r>
     </w:p>
     <w:p>
@@ -3996,7 +4057,7 @@
         <w:pStyle w:val="BodyText"/>
       </w:pPr>
       <w:r>
-        <w:t xml:space="preserve">Install a kitchen exhaust fan to remove cooking fumes and moisture from your home. The fan should be rated for at least 100 cubic feet per minute. A kitchen fan should be ducted to the outdoors. If the ductwork will run through the attic, it should be installed before the attic is air-sealed and insulated.</w:t>
+        <w:t xml:space="preserve">Install gutters and downspouts that divert water at least six feet away from the foundation and to where the ground slopes away from the house.</w:t>
       </w:r>
     </w:p>
     <w:p>
@@ -4016,17 +4077,17 @@
         <w:pStyle w:val="BodyText"/>
       </w:pPr>
       <w:r>
-        <w:t xml:space="preserve">Kitchen range hoods typically cost $150 or more; installation costs depend on the complexity of the exhaust ducting.</w:t>
+        <w:t xml:space="preserve">Adding gutters would mitigate moisture damage and save you from having to replace/fix other parts of the house.</w:t>
       </w:r>
     </w:p>
     <w:bookmarkEnd w:id="47"/>
-    <w:bookmarkStart w:id="48" w:name="vapor-barrier"/>
+    <w:bookmarkStart w:id="48" w:name="bathroom-exhaust-fans"/>
     <w:p>
       <w:pPr>
         <w:pStyle w:val="Heading3"/>
       </w:pPr>
       <w:r>
-        <w:t xml:space="preserve">4.7 Vapor Barrier</w:t>
+        <w:t xml:space="preserve">4.7 Bathroom exhaust fan(s)</w:t>
       </w:r>
     </w:p>
     <w:p>
@@ -4046,7 +4107,7 @@
         <w:pStyle w:val="BodyText"/>
       </w:pPr>
       <w:r>
-        <w:t xml:space="preserve">There is excess moisture in the basement/crawlspace, which is evaporating out of the ground. This moisture can enter the house and cause mold, mildew, rot, and air quality issues.</w:t>
+        <w:t xml:space="preserve">Currently, there is no bathroom exhaust fan, so moisture from the shower, toilet, and sink remains in the house, which can cause moisture issues such as mold.</w:t>
       </w:r>
     </w:p>
     <w:p>
@@ -4066,19 +4127,7 @@
         <w:pStyle w:val="BodyText"/>
       </w:pPr>
       <w:r>
-        <w:t xml:space="preserve">Install a vapor barrier on the basement floor to stop moisture from entering the basement and house. Vapor barriers typically consist of either reinforced plastic sheeting or EPDM rubber membrane over a</w:t>
-      </w:r>
-      <w:r>
-        <w:t xml:space="preserve"> </w:t>
-      </w:r>
-      <w:r>
-        <w:t xml:space="preserve">‘dimple mat’</w:t>
-      </w:r>
-      <w:r>
-        <w:t xml:space="preserve"> </w:t>
-      </w:r>
-      <w:r>
-        <w:t xml:space="preserve">that allows for drainage below the vapor barrier and prevents rocks from puncturing it. If the basement/crawlspace walls are going to be spray foamed, we recommend the foam go all the way to the floor and overlap the vapor barrier to create a continuous air and moisture barrier.</w:t>
+        <w:t xml:space="preserve">Install bathroom exhaust fans in all bathrooms that do not have them. These should be rated for at least 80 cubic feet per minute (CFM) if there is a shower. We recommend the Panasonic Whisper series or similar fans that don’t create excess noise. If the ductwork will run through the attic, it should be installed before the attic is air-sealed and insulated. The fan needs to be ducted outside, so it does not add moisture into the attic.</w:t>
       </w:r>
     </w:p>
     <w:p>
@@ -4098,17 +4147,17 @@
         <w:pStyle w:val="BodyText"/>
       </w:pPr>
       <w:r>
-        <w:t xml:space="preserve">Efficiency Maine rebates will cover vapor barriers up to 25% of a weatherization project cost, if done as part of a larger insulation project. Most insulation companies can install spray foam and vapor barriers together. Efficiency Maine rebates and other incentives for insulation work can fund up to 80% of the overall cost to weatherize your home (subject to a lifetime limit per building), up to $9,200 when combined with nonrefundable federal tax credits. You can call them at 866-376-2463 (Monday to Friday, 8:00 am to 5:00 pm) or visit their webpage about insulation rebates: https://www.efficiencymaine.com/at-home/insulation-rebates/</w:t>
+        <w:t xml:space="preserve">The typical fan is around $130 plus the cost of installation.</w:t>
       </w:r>
     </w:p>
     <w:bookmarkEnd w:id="48"/>
-    <w:bookmarkStart w:id="49" w:name="spray-foam-basement-walls"/>
+    <w:bookmarkStart w:id="49" w:name="kitchen-exhaust-fans"/>
     <w:p>
       <w:pPr>
         <w:pStyle w:val="Heading3"/>
       </w:pPr>
       <w:r>
-        <w:t xml:space="preserve">4.8 Spray foam Basement Walls</w:t>
+        <w:t xml:space="preserve">4.8 Kitchen exhaust fan(s)</w:t>
       </w:r>
     </w:p>
     <w:p>
@@ -4128,7 +4177,7 @@
         <w:pStyle w:val="BodyText"/>
       </w:pPr>
       <w:r>
-        <w:t xml:space="preserve">The basement/crawlspace is uninsulated and used for mechanical equipment and plumbing. The walls are porous and allow moisture into the house and rapidly conduct heat out of the space.</w:t>
+        <w:t xml:space="preserve">Currently, there is no kitchen exhaust fan, so fumes, smoke, and moisture from cooking stay in the house which can cause health concerns.</w:t>
       </w:r>
     </w:p>
     <w:p>
@@ -4148,24 +4197,7 @@
         <w:pStyle w:val="BodyText"/>
       </w:pPr>
       <w:r>
-        <w:t xml:space="preserve">Install spray foam on the basement/crawlspace walls to prevent moisture infiltration and reduce heat loss. In older homes, most heat loss is due to air leakage. Air sealing is particularly important in the basement or crawlspace (and attic). As warm air rises and leaks out the top of your home, cold air is pulled in at the bottom. This is called the</w:t>
-      </w:r>
-      <w:r>
-        <w:t xml:space="preserve"> </w:t>
-      </w:r>
-      <w:r>
-        <w:t xml:space="preserve">‘stack effect’</w:t>
-      </w:r>
-      <w:r>
-        <w:t xml:space="preserve">, and is more pronounced in taller homes. Thus, air sealing is necessary anywhere gaps allow air to move into your house through the basement/crawlspace.</w:t>
-      </w:r>
-    </w:p>
-    <w:p>
-      <w:pPr>
-        <w:pStyle w:val="BodyText"/>
-      </w:pPr>
-      <w:r>
-        <w:t xml:space="preserve">Spray foam should be applied 2-3 inches thick on the walls to seal and insulate them. It is often ideal to install a vapor barrier at the same time as the spray foam insulation. Spray foam generally requires a layer of intumescent (fire-rated) paint over it to meet fire code.</w:t>
+        <w:t xml:space="preserve">Install a kitchen exhaust fan to remove cooking fumes and moisture from your home. The fan should be rated for at least 100 cubic feet per minute. A kitchen fan should be ducted to the outdoors. If the ductwork will run through the attic, it should be installed before the attic is air-sealed and insulated.</w:t>
       </w:r>
     </w:p>
     <w:p>
@@ -4185,17 +4217,17 @@
         <w:pStyle w:val="BodyText"/>
       </w:pPr>
       <w:r>
-        <w:t xml:space="preserve">Installation of spray foam insulation will cost around $5-7 per square foot. Efficiency Maine rebates and other incentives for insulation work can fund up to 80% of the project cost (subject to a lifetime limit per building), up to $9,200 when combined with nonrefundable federal tax credits. You can call them at 866-376-2463 (Monday to Friday, 8:00 am to 5:00 pm) or visit their webpage about insulation rebates: https://www.efficiencymaine.com/at-home/insulation-rebates/</w:t>
+        <w:t xml:space="preserve">Kitchen range hoods typically cost $150 or more; installation costs depend on the complexity of the exhaust ducting.</w:t>
       </w:r>
     </w:p>
     <w:bookmarkEnd w:id="49"/>
-    <w:bookmarkStart w:id="50" w:name="attic-insulation-and-air-sealing"/>
+    <w:bookmarkStart w:id="50" w:name="vapor-barrier"/>
     <w:p>
       <w:pPr>
         <w:pStyle w:val="Heading3"/>
       </w:pPr>
       <w:r>
-        <w:t xml:space="preserve">4.9 Attic Insulation and Air Sealing</w:t>
+        <w:t xml:space="preserve">4.9 Vapor Barrier</w:t>
       </w:r>
     </w:p>
     <w:p>
@@ -4215,7 +4247,7 @@
         <w:pStyle w:val="BodyText"/>
       </w:pPr>
       <w:r>
-        <w:t xml:space="preserve">The attic is uninsulated or is missing insulation and the attic could also benefit from air-sealing. These upgrades will reduce draftiness and heat loss in the winter and heat gain in the summer.</w:t>
+        <w:t xml:space="preserve">There is excess moisture in the basement/crawlspace, which is evaporating out of the ground. This moisture can enter the house and cause mold, mildew, rot, and air quality issues.</w:t>
       </w:r>
     </w:p>
     <w:p>
@@ -4235,24 +4267,19 @@
         <w:pStyle w:val="BodyText"/>
       </w:pPr>
       <w:r>
-        <w:t xml:space="preserve">Air seal the attic and insulate it to at least R-60 (18 inches of loose-fill cellulose insulation). COA has been installing 24 inches (R-80) of cellulose insulation in attics on our campus. Before the attic is insulated, ensure that any needed bathroom and kitchen fans are installed and that all fans are properly vented to the outside.</w:t>
-      </w:r>
-    </w:p>
-    <w:p>
-      <w:pPr>
-        <w:pStyle w:val="BodyText"/>
-      </w:pPr>
-      <w:r>
-        <w:t xml:space="preserve">In older homes, most heat loss is due to air leakage. Air sealing is particularly important in the attic (and basement or crawlspace). As warm air rises and leaks out the top of your home, cold air is pulled in at the bottom. This is called the</w:t>
+        <w:t xml:space="preserve">Install a vapor barrier on the basement floor to stop moisture from entering the basement and house. Vapor barriers typically consist of either reinforced plastic sheeting or EPDM rubber membrane over a</w:t>
       </w:r>
       <w:r>
         <w:t xml:space="preserve"> </w:t>
       </w:r>
       <w:r>
-        <w:t xml:space="preserve">‘stack effect’</w:t>
-      </w:r>
-      <w:r>
-        <w:t xml:space="preserve">, and is more pronounced in taller homes. Thus, air sealing is necessary anywhere gaps allow air to move between your house and the attic. This typically includes gaps around the chimney, electrical penetrations, and wall top plates.</w:t>
+        <w:t xml:space="preserve">‘dimple mat’</w:t>
+      </w:r>
+      <w:r>
+        <w:t xml:space="preserve"> </w:t>
+      </w:r>
+      <w:r>
+        <w:t xml:space="preserve">that allows for drainage below the vapor barrier and prevents rocks from puncturing it. If the basement/crawlspace walls are going to be spray foamed, we recommend the foam go all the way to the floor and overlap the vapor barrier to create a continuous air and moisture barrier.</w:t>
       </w:r>
     </w:p>
     <w:p>
@@ -4272,17 +4299,17 @@
         <w:pStyle w:val="BodyText"/>
       </w:pPr>
       <w:r>
-        <w:t xml:space="preserve">Efficiency Maine rebates and other incentives for insulation work can fund up to 80% of the overall cost to weatherize your home (subject to a lifetime limit per building), up to $9,200 when combined with nonrefundable federal tax credits. You can call them at 866-376-2463 (Monday to Friday, 8:00 am to 5:00 pm) or visit their webpage about insulation rebates: https://www.efficiencymaine.com/at-home/insulation-rebates/</w:t>
+        <w:t xml:space="preserve">Efficiency Maine rebates will cover vapor barriers up to 25% of a weatherization project cost, if done as part of a larger insulation project. Most insulation companies can install spray foam and vapor barriers together. Efficiency Maine rebates and other incentives for insulation work can fund up to 80% of the overall cost to weatherize your home (subject to a lifetime limit per building), up to $9,200 when combined with nonrefundable federal tax credits. You can call them at 866-376-2463 (Monday to Friday, 8:00 am to 5:00 pm) or visit their webpage about insulation rebates: https://www.efficiencymaine.com/at-home/insulation-rebates/</w:t>
       </w:r>
     </w:p>
     <w:bookmarkEnd w:id="50"/>
-    <w:bookmarkStart w:id="51" w:name="blow-in-cellulose-wall-insulation"/>
+    <w:bookmarkStart w:id="51" w:name="spray-foam-basement-walls"/>
     <w:p>
       <w:pPr>
         <w:pStyle w:val="Heading3"/>
       </w:pPr>
       <w:r>
-        <w:t xml:space="preserve">4.10 Blow-in cellulose wall insulation</w:t>
+        <w:t xml:space="preserve">4.10 Spray foam Basement Walls</w:t>
       </w:r>
     </w:p>
     <w:p>
@@ -4302,7 +4329,7 @@
         <w:pStyle w:val="BodyText"/>
       </w:pPr>
       <w:r>
-        <w:t xml:space="preserve">The walls of the house are uninsulated, which is a significant source of heat loss.</w:t>
+        <w:t xml:space="preserve">The basement/crawlspace is uninsulated and used for mechanical equipment and plumbing. The walls are porous and allow moisture into the house and rapidly conduct heat out of the space.</w:t>
       </w:r>
     </w:p>
     <w:p>
@@ -4322,11 +4349,30 @@
         <w:pStyle w:val="BodyText"/>
       </w:pPr>
       <w:r>
-        <w:t xml:space="preserve">Insulate the wall stud cavities with dense packed, blown-in cellulose insulation. In balloon-framed homes, this can often be done from the attic, otherwise it can be done by drilling holes into the wall cavities from either the inside or outside.</w:t>
+        <w:t xml:space="preserve">Install spray foam on the basement/crawlspace walls to prevent moisture infiltration and reduce heat loss. In older homes, most heat loss is due to air leakage. Air sealing is particularly important in the basement or crawlspace (and attic). As warm air rises and leaks out the top of your home, cold air is pulled in at the bottom. This is called the</w:t>
       </w:r>
       <w:r>
         <w:t xml:space="preserve"> </w:t>
       </w:r>
+      <w:r>
+        <w:t xml:space="preserve">‘stack effect’</w:t>
+      </w:r>
+      <w:r>
+        <w:t xml:space="preserve">, and is more pronounced in taller homes. Thus, air sealing is necessary anywhere gaps allow air to move into your house through the basement/crawlspace.</w:t>
+      </w:r>
+    </w:p>
+    <w:p>
+      <w:pPr>
+        <w:pStyle w:val="BodyText"/>
+      </w:pPr>
+      <w:r>
+        <w:t xml:space="preserve">Spray foam should be applied 2-3 inches thick on the walls to seal and insulate them. It is often ideal to install a vapor barrier at the same time as the spray foam insulation. Spray foam generally requires a layer of intumescent (fire-rated) paint over it to meet fire code.</w:t>
+      </w:r>
+    </w:p>
+    <w:p>
+      <w:pPr>
+        <w:pStyle w:val="BodyText"/>
+      </w:pPr>
       <w:r>
         <w:rPr>
           <w:i/>
@@ -4340,17 +4386,17 @@
         <w:pStyle w:val="BodyText"/>
       </w:pPr>
       <w:r>
-        <w:t xml:space="preserve">Efficiency Maine rebates and other incentives for insulation work can fund up to 80% of the overall cost to weatherize your home (subject to a lifetime limit per building), up to $9,200 when combined with nonrefundable federal tax credits. You can call them at 866-376-2463 (Monday to Friday, 8:00 am to 5:00 pm) or visit their webpage about insulation rebates: https://www.efficiencymaine.com/at-home/insulation-rebates/</w:t>
+        <w:t xml:space="preserve">Installation of spray foam insulation will cost around $5-7 per square foot. Efficiency Maine rebates and other incentives for insulation work can fund up to 80% of the project cost (subject to a lifetime limit per building), up to $9,200 when combined with nonrefundable federal tax credits. You can call them at 866-376-2463 (Monday to Friday, 8:00 am to 5:00 pm) or visit their webpage about insulation rebates: https://www.efficiencymaine.com/at-home/insulation-rebates/</w:t>
       </w:r>
     </w:p>
     <w:bookmarkEnd w:id="51"/>
-    <w:bookmarkStart w:id="52" w:name="continuous-exterior-wall-insulation"/>
+    <w:bookmarkStart w:id="52" w:name="attic-insulation-and-air-sealing"/>
     <w:p>
       <w:pPr>
         <w:pStyle w:val="Heading3"/>
       </w:pPr>
       <w:r>
-        <w:t xml:space="preserve">4.11 Continuous exterior wall insulation</w:t>
+        <w:t xml:space="preserve">4.11 Attic Insulation and Air Sealing</w:t>
       </w:r>
     </w:p>
     <w:p>
@@ -4370,7 +4416,7 @@
         <w:pStyle w:val="BodyText"/>
       </w:pPr>
       <w:r>
-        <w:t xml:space="preserve">There isn’t continuous insulation between the siding and the exterior walls of the house. Continuous insulation helps create a complete thermal boundary for your house, and it is now an energy code requirement for new houses.</w:t>
+        <w:t xml:space="preserve">The attic is uninsulated or is missing insulation and the attic could also benefit from air-sealing. These upgrades will reduce draftiness and heat loss in the winter and heat gain in the summer.</w:t>
       </w:r>
     </w:p>
     <w:p>
@@ -4390,7 +4436,24 @@
         <w:pStyle w:val="BodyText"/>
       </w:pPr>
       <w:r>
-        <w:t xml:space="preserve">Add a continuous layer of insulation and potentially replace the air and moisture barrier once it becomes time to replace the siding. Add continuous insulation (R-6 or more) under the new siding to keep the house warmer in the winter and cooler in the summer. We recommend TimberHP TimberBoard insulation (produced in Madison, Maine) or Rockwool Comfortboard, but foam board can also be used. Before installing exterior insulation, the contractor can check if insulation is needed between the interior wall studs.</w:t>
+        <w:t xml:space="preserve">Air seal the attic and insulate it to at least R-60 (18 inches of loose-fill cellulose insulation). COA has been installing 24 inches (R-80) of cellulose insulation in attics on our campus. Before the attic is insulated, ensure that any needed bathroom and kitchen fans are installed and that all fans are properly vented to the outside.</w:t>
+      </w:r>
+    </w:p>
+    <w:p>
+      <w:pPr>
+        <w:pStyle w:val="BodyText"/>
+      </w:pPr>
+      <w:r>
+        <w:t xml:space="preserve">In older homes, most heat loss is due to air leakage. Air sealing is particularly important in the attic (and basement or crawlspace). As warm air rises and leaks out the top of your home, cold air is pulled in at the bottom. This is called the</w:t>
+      </w:r>
+      <w:r>
+        <w:t xml:space="preserve"> </w:t>
+      </w:r>
+      <w:r>
+        <w:t xml:space="preserve">‘stack effect’</w:t>
+      </w:r>
+      <w:r>
+        <w:t xml:space="preserve">, and is more pronounced in taller homes. Thus, air sealing is necessary anywhere gaps allow air to move between your house and the attic. This typically includes gaps around the chimney, electrical penetrations, and wall top plates.</w:t>
       </w:r>
     </w:p>
     <w:p>
@@ -4414,13 +4477,13 @@
       </w:r>
     </w:p>
     <w:bookmarkEnd w:id="52"/>
-    <w:bookmarkStart w:id="53" w:name="electrical-panel-upgrade"/>
+    <w:bookmarkStart w:id="53" w:name="blow-in-cellulose-wall-insulation"/>
     <w:p>
       <w:pPr>
         <w:pStyle w:val="Heading3"/>
       </w:pPr>
       <w:r>
-        <w:t xml:space="preserve">4.12 Electrical Panel Upgrade</w:t>
+        <w:t xml:space="preserve">4.12 Blow-in cellulose wall insulation</w:t>
       </w:r>
     </w:p>
     <w:p>
@@ -4440,11 +4503,7 @@
         <w:pStyle w:val="BodyText"/>
       </w:pPr>
       <w:r>
-        <w:rPr>
-          <w:b/>
-          <w:bCs/>
-        </w:rPr>
-        <w:t xml:space="preserve">Auditor to describe</w:t>
+        <w:t xml:space="preserve">The walls of the house are uninsulated, which is a significant source of heat loss.</w:t>
       </w:r>
     </w:p>
     <w:p>
@@ -4464,13 +4523,11 @@
         <w:pStyle w:val="BodyText"/>
       </w:pPr>
       <w:r>
-        <w:t xml:space="preserve">Consult with an electrician about replacing your existing electrical panel with a 200 amp panel as you add electrical appliances to your home. It may become necessary to increase the capacity to address potential safety hazards. An electrician can determine whether or not a panel upgrade is necessary based on your current and anticipated usage.</w:t>
-      </w:r>
-    </w:p>
-    <w:p>
-      <w:pPr>
-        <w:pStyle w:val="BodyText"/>
-      </w:pPr>
+        <w:t xml:space="preserve">Insulate the wall stud cavities with dense packed, blown-in cellulose insulation. In balloon-framed homes, this can often be done from the attic, otherwise it can be done by drilling holes into the wall cavities from either the inside or outside.</w:t>
+      </w:r>
+      <w:r>
+        <w:t xml:space="preserve"> </w:t>
+      </w:r>
       <w:r>
         <w:rPr>
           <w:i/>
@@ -4484,17 +4541,17 @@
         <w:pStyle w:val="BodyText"/>
       </w:pPr>
       <w:r>
-        <w:t xml:space="preserve">Costs of electrical components needed to support residential energy upgrades – including panels, sub-panels, branch circuits, and feeders – qualify for a 30% nonrefundable tax credit (up to $600 per item) if they have a capacity of 200 amps or more. An electrical panel upgrades also provides a good opportunity for an electrician to install whole-house surge protection, which costs $100-$400. Here are some options: https://www.popularmechanics.com/home/interior-projects/g43140886/best-whole-house-surge-protectors/</w:t>
+        <w:t xml:space="preserve">Efficiency Maine rebates and other incentives for insulation work can fund up to 80% of the overall cost to weatherize your home (subject to a lifetime limit per building), up to $9,200 when combined with nonrefundable federal tax credits. You can call them at 866-376-2463 (Monday to Friday, 8:00 am to 5:00 pm) or visit their webpage about insulation rebates: https://www.efficiencymaine.com/at-home/insulation-rebates/</w:t>
       </w:r>
     </w:p>
     <w:bookmarkEnd w:id="53"/>
-    <w:bookmarkStart w:id="54" w:name="air-source-heat-pump"/>
+    <w:bookmarkStart w:id="54" w:name="continuous-exterior-wall-insulation"/>
     <w:p>
       <w:pPr>
         <w:pStyle w:val="Heading3"/>
       </w:pPr>
       <w:r>
-        <w:t xml:space="preserve">4.13 Air Source Heat Pump</w:t>
+        <w:t xml:space="preserve">4.13 Continuous exterior wall insulation</w:t>
       </w:r>
     </w:p>
     <w:p>
@@ -4514,7 +4571,7 @@
         <w:pStyle w:val="BodyText"/>
       </w:pPr>
       <w:r>
-        <w:t xml:space="preserve">Combustion heating equipment is expensive, inefficient, and has the potential to release harmful combustion gases like carbon monoxide into the home.</w:t>
+        <w:t xml:space="preserve">There isn’t continuous insulation between the siding and the exterior walls of the house. Continuous insulation helps create a complete thermal boundary for your house, and it is now an energy code requirement for new houses.</w:t>
       </w:r>
     </w:p>
     <w:p>
@@ -4534,7 +4591,7 @@
         <w:pStyle w:val="BodyText"/>
       </w:pPr>
       <w:r>
-        <w:t xml:space="preserve">Install air source heat pumps for heating and cooling and whole-house surge protection. Air source heat pumps can be up to 300% efficient and heat, cool, and dehumidify your house. A qualified installer will help determine what size system to install and where. Whole-house surge protection will protect your appliances and heat pumps from being damaged by an electrical surge.</w:t>
+        <w:t xml:space="preserve">Add a continuous layer of insulation and potentially replace the air and moisture barrier once it becomes time to replace the siding. Add continuous insulation (R-6 or more) under the new siding to keep the house warmer in the winter and cooler in the summer. We recommend TimberHP TimberBoard insulation (produced in Madison, Maine) or Rockwool Comfortboard, but foam board can also be used. Before installing exterior insulation, the contractor can check if insulation is needed between the interior wall studs.</w:t>
       </w:r>
     </w:p>
     <w:p>
@@ -4554,17 +4611,17 @@
         <w:pStyle w:val="BodyText"/>
       </w:pPr>
       <w:r>
-        <w:t xml:space="preserve">Efficiency Maine rebates can fund $1,000 to $3,000 per unit up to a lifetime limit per housing unit for $3,000 to $9,000 (depending on income level) to install heat pumps. The rebate can be combined with a nonrefundable federal tax credit of 30% of the remaining cost of the unit and labor, subject to an annual maximum benefit of $2,000 (shared with other energy property, like a heat pump water heater). You can call Efficiency Maine at 866-376-2463 (Monday to Friday, 8:00 am to 5:00 pm) or visit their website: https://www.efficiencymaine.com/at-home/residential-heat-pump-incentives/</w:t>
+        <w:t xml:space="preserve">Efficiency Maine rebates and other incentives for insulation work can fund up to 80% of the overall cost to weatherize your home (subject to a lifetime limit per building), up to $9,200 when combined with nonrefundable federal tax credits. You can call them at 866-376-2463 (Monday to Friday, 8:00 am to 5:00 pm) or visit their webpage about insulation rebates: https://www.efficiencymaine.com/at-home/insulation-rebates/</w:t>
       </w:r>
     </w:p>
     <w:bookmarkEnd w:id="54"/>
-    <w:bookmarkStart w:id="55" w:name="solar"/>
+    <w:bookmarkStart w:id="55" w:name="pipe-insulation"/>
     <w:p>
       <w:pPr>
         <w:pStyle w:val="Heading3"/>
       </w:pPr>
       <w:r>
-        <w:t xml:space="preserve">4.14 Solar</w:t>
+        <w:t xml:space="preserve">4.14 Pipe Insulation</w:t>
       </w:r>
     </w:p>
     <w:p>
@@ -4584,11 +4641,7 @@
         <w:pStyle w:val="BodyText"/>
       </w:pPr>
       <w:r>
-        <w:rPr>
-          <w:b/>
-          <w:bCs/>
-        </w:rPr>
-        <w:t xml:space="preserve">Auditor to describe (or remove this section)</w:t>
+        <w:t xml:space="preserve">Uninsulated water pipes are responsible for heat loss and excess moisture (from condensation) in your basement/crawlspace.</w:t>
       </w:r>
     </w:p>
     <w:p>
@@ -4608,7 +4661,7 @@
         <w:pStyle w:val="BodyText"/>
       </w:pPr>
       <w:r>
-        <w:t xml:space="preserve">Rooftop solar can supply most or all of your home electrical demands. Contact a solar company for pricing and details specific to your home.</w:t>
+        <w:t xml:space="preserve">Insulate both hot and cold water pipes that are uninsulated in the basement/crawlspace. This will save energy and prevent condensation. We recommend foam pipe insulation made of polyethylene or neoprene.</w:t>
       </w:r>
     </w:p>
     <w:p>
@@ -4628,25 +4681,17 @@
         <w:pStyle w:val="BodyText"/>
       </w:pPr>
       <w:r>
-        <w:t xml:space="preserve">There is a 30% nonrefundable federal tax credit and financing options are available. Battery backup is needed for solar to work during a power outage. Information on the federal tax credit: https://www.energy.gov/sites/default/files/2023-03/Homeowners_Guide_to_the_Federal_Tax_Credit_for_Solar_PV.pdf</w:t>
-      </w:r>
-    </w:p>
-    <w:p>
-      <w:pPr>
-        <w:pStyle w:val="BodyText"/>
-      </w:pPr>
-      <w:r>
-        <w:t xml:space="preserve">The State of Maine is working on a solar and battery funding initiative for low-income and disadvantaged Maine households. It is still in the planning stages, but you can find more information here: https://www.maine.gov/energy/initiatives/infrastructure/solar-for-all</w:t>
+        <w:t xml:space="preserve">Insulating water pipes can save 2%-4% on hot water bills and increase the temperature of the water while reducing the time it takes for hot water to reach your tap. Materials cost around $100-200, depending on the length of pipe to insulate. Many people find this to be an easy project to do themselves.</w:t>
       </w:r>
     </w:p>
     <w:bookmarkEnd w:id="55"/>
-    <w:bookmarkStart w:id="56" w:name="whole-house-surge-protection"/>
+    <w:bookmarkStart w:id="56" w:name="diy-air-sealing"/>
     <w:p>
       <w:pPr>
         <w:pStyle w:val="Heading3"/>
       </w:pPr>
       <w:r>
-        <w:t xml:space="preserve">4.15 Whole House Surge Protection</w:t>
+        <w:t xml:space="preserve">4.15 DIY Air Sealing</w:t>
       </w:r>
     </w:p>
     <w:p>
@@ -4666,7 +4711,26 @@
         <w:pStyle w:val="BodyText"/>
       </w:pPr>
       <w:r>
-        <w:t xml:space="preserve">Your house does not have whole-house surge protection. This will protect your large electrical appliances from damage in the case of an electrical surge. Heat pumps, heat pump water heaters, and other electronics are particularly sensitive to electrical surges.</w:t>
+        <w:t xml:space="preserve">During the blower door test, we noted sources of air leakage in the living areas of your house.</w:t>
+      </w:r>
+    </w:p>
+    <w:p>
+      <w:pPr>
+        <w:pStyle w:val="BodyText"/>
+      </w:pPr>
+      <w:r>
+        <w:rPr>
+          <w:b/>
+          <w:bCs/>
+        </w:rPr>
+        <w:t xml:space="preserve">Auditor to detail customized findings.</w:t>
+      </w:r>
+      <w:r>
+        <w:rPr>
+          <w:b/>
+          <w:bCs/>
+        </w:rPr>
+        <w:t xml:space="preserve"> </w:t>
       </w:r>
     </w:p>
     <w:p>
@@ -4686,11 +4750,13 @@
         <w:pStyle w:val="BodyText"/>
       </w:pPr>
       <w:r>
-        <w:t xml:space="preserve">Seal easy-to-access air leaks and weatherstrip exterior doors. In older homes, most heat loss is due to air leakage. WindowDressers insulating window inserts can also help reduce air leakage.</w:t>
-      </w:r>
-      <w:r>
-        <w:t xml:space="preserve"> </w:t>
-      </w:r>
+        <w:t xml:space="preserve">Air sealing the air leaks we identified around the living areas of your house can be a DIY solution to lower energy use, or an insulation contractor can seal the leaks when they come to your house for a larger project. Please address any moisture concerns before undertaking significant air sealing efforts.</w:t>
+      </w:r>
+    </w:p>
+    <w:p>
+      <w:pPr>
+        <w:pStyle w:val="BodyText"/>
+      </w:pPr>
       <w:r>
         <w:rPr>
           <w:i/>
@@ -4704,12 +4770,89 @@
         <w:pStyle w:val="BodyText"/>
       </w:pPr>
       <w:r>
-        <w:t xml:space="preserve">The device costs $100-$400 and needs to be installed by an electrician. Here are some options: https://www.popularmechanics.com/home/interior-projects/g43140886/best-whole-house-surge-protectors/</w:t>
+        <w:t xml:space="preserve">Air sealing and insulating ductwork is eligible for a non-refundable federal tax credit (</w:t>
+      </w:r>
+      <w:r>
+        <w:t xml:space="preserve">“Energy Efficient Home Improvement Credit”</w:t>
+      </w:r>
+      <w:r>
+        <w:t xml:space="preserve">), which can pay for 30% of the project cost, subject to an annual maximum of $1,200 (shared with other home envelope improvements, like attic and basement projects).</w:t>
       </w:r>
     </w:p>
     <w:bookmarkEnd w:id="56"/>
+    <w:bookmarkStart w:id="57" w:name="ductwork-air-sealing-and-insulation"/>
+    <w:p>
+      <w:pPr>
+        <w:pStyle w:val="Heading3"/>
+      </w:pPr>
+      <w:r>
+        <w:t xml:space="preserve">4.16 Ductwork Air Sealing and Insulation</w:t>
+      </w:r>
+    </w:p>
+    <w:p>
+      <w:pPr>
+        <w:pStyle w:val="FirstParagraph"/>
+      </w:pPr>
+      <w:r>
+        <w:rPr>
+          <w:i/>
+          <w:iCs/>
+        </w:rPr>
+        <w:t xml:space="preserve">Problem</w:t>
+      </w:r>
+    </w:p>
+    <w:p>
+      <w:pPr>
+        <w:pStyle w:val="BodyText"/>
+      </w:pPr>
+      <w:r>
+        <w:t xml:space="preserve">The furnace supply ductwork running through the basement would be more efficient if it were air sealed and insulated. The heated air from the furnace loses a lot of heat to the surroundings on its way to the living space.</w:t>
+      </w:r>
+    </w:p>
+    <w:p>
+      <w:pPr>
+        <w:pStyle w:val="BodyText"/>
+      </w:pPr>
+      <w:r>
+        <w:rPr>
+          <w:i/>
+          <w:iCs/>
+        </w:rPr>
+        <w:t xml:space="preserve">Recommendation</w:t>
+      </w:r>
+    </w:p>
+    <w:p>
+      <w:pPr>
+        <w:pStyle w:val="BodyText"/>
+      </w:pPr>
+      <w:r>
+        <w:t xml:space="preserve">Air seal and insulate all of the supply and return ductwork running through the basement/crawlspace. Air sealing should be completed first, and can be done with either UL 181 foil-faced tape, duct mastic, or by hiring a contractor that has equipment to Aeroseal the ductwork (https://aeroseal.com/find-a-pro/). For insulation, we recommend using foil-faced fiberglass batts. Foil-faced bubble wrap can also be used. It is important to air seal the ducts properly before insulating. Otherwise, the heat will bypass the insulation, making the insulation ineffective.</w:t>
+      </w:r>
+      <w:r>
+        <w:rPr>
+          <w:i/>
+          <w:iCs/>
+        </w:rPr>
+        <w:t xml:space="preserve">Estimated Costs/Benefits/Incentives</w:t>
+      </w:r>
+    </w:p>
+    <w:p>
+      <w:pPr>
+        <w:pStyle w:val="BodyText"/>
+      </w:pPr>
+      <w:r>
+        <w:t xml:space="preserve">Air sealing and insulating ductwork is eligible for a non-refundable federal tax credit (</w:t>
+      </w:r>
+      <w:r>
+        <w:t xml:space="preserve">“Energy Efficient Home Improvement Credit”</w:t>
+      </w:r>
+      <w:r>
+        <w:t xml:space="preserve">), which can pay for 30% of the project cost, subject to an annual maximum of $1,200 (shared with other home envelope improvements, like attic and basement projects).</w:t>
+      </w:r>
+    </w:p>
     <w:bookmarkEnd w:id="57"/>
-    <w:bookmarkStart w:id="58" w:name="additional-resources"/>
+    <w:bookmarkEnd w:id="58"/>
+    <w:bookmarkStart w:id="59" w:name="additional-resources"/>
     <w:p>
       <w:pPr>
         <w:pStyle w:val="Heading2"/>
@@ -4750,7 +4893,7 @@
         <w:t xml:space="preserve">Efficiency Maine also offers home energy loans to help homeowners who are Maine residents pay for energy and related health and safety upgrades. There are no fees, and interest rates for multi-year loans are between 5.99% (max $7,500) and 7.99% (max $25,000), depending on income level. Low- and moderate-income homeowners who borrow the full $7,500 and pay it back over 10 years will pay a monthly cost of $83. There is also a 1-year, 0% APR option. To learn more or apply, call 866-376-2463 or visit https://www.efficiencymaine.com/home-energy-loans/</w:t>
       </w:r>
     </w:p>
-    <w:bookmarkEnd w:id="58"/>
+    <w:bookmarkEnd w:id="59"/>
     <w:sectPr>
       <w:footerReference r:id="rId9" w:type="default"/>
       <w:pgSz w:h="15840" w:w="12240"/>

</xml_diff>

<commit_message>
Render 178 Cranberry Rd report
</commit_message>
<xml_diff>
--- a/Quarto_report/Audit_Report.docx
+++ b/Quarto_report/Audit_Report.docx
@@ -15,31 +15,31 @@
         <w:pStyle w:val="FirstParagraph"/>
       </w:pPr>
       <w:r>
-        <w:t xml:space="preserve">Homeowner(s): Ben Sumner</w:t>
-      </w:r>
-    </w:p>
-    <w:p>
-      <w:pPr>
-        <w:pStyle w:val="BodyText"/>
-      </w:pPr>
-      <w:r>
-        <w:t xml:space="preserve">Address: 5 Elwood Spurling Ln, Cranberry Isles, ME, 04625</w:t>
-      </w:r>
-    </w:p>
-    <w:p>
-      <w:pPr>
-        <w:pStyle w:val="BodyText"/>
-      </w:pPr>
-      <w:r>
-        <w:t xml:space="preserve">Owner Contact: ben.sumner@protonmail.com, (207) 664-8364</w:t>
-      </w:r>
-    </w:p>
-    <w:p>
-      <w:pPr>
-        <w:pStyle w:val="BodyText"/>
-      </w:pPr>
-      <w:r>
-        <w:t xml:space="preserve">Auditors: Pilot program team (Nicole, Zoe, Alder, Uriel)</w:t>
+        <w:t xml:space="preserve">Homeowner(s): Don Weinreich, Barbara Weinreich</w:t>
+      </w:r>
+    </w:p>
+    <w:p>
+      <w:pPr>
+        <w:pStyle w:val="BodyText"/>
+      </w:pPr>
+      <w:r>
+        <w:t xml:space="preserve">Address: 178 Cranberry Road, Cranberry Isle Me, 04625</w:t>
+      </w:r>
+    </w:p>
+    <w:p>
+      <w:pPr>
+        <w:pStyle w:val="BodyText"/>
+      </w:pPr>
+      <w:r>
+        <w:t xml:space="preserve">Owner Contact: NA</w:t>
+      </w:r>
+    </w:p>
+    <w:p>
+      <w:pPr>
+        <w:pStyle w:val="BodyText"/>
+      </w:pPr>
+      <w:r>
+        <w:t xml:space="preserve">Auditors: Uriel Orozco Brenes, Zoe Duni</w:t>
       </w:r>
     </w:p>
     <w:p>
@@ -70,7 +70,7 @@
         <w:pStyle w:val="FirstParagraph"/>
       </w:pPr>
       <w:r>
-        <w:t xml:space="preserve">We conducted an energy assessment of your home on 9/5/2024. This report will tell you what we did, what we found, and what we suggest for your home. These suggestions include information on incentives and financing to make improvements more affordable.</w:t>
+        <w:t xml:space="preserve">We conducted an energy assessment of your home on 7/17/2024. This report will tell you what we did, what we found, and what we suggest for your home. These suggestions include information on incentives and financing to make improvements more affordable.</w:t>
       </w:r>
     </w:p>
     <w:p>
@@ -344,31 +344,31 @@
                 <w:rFonts w:ascii="Calibri" w:hAnsi="Calibri"/>
                 <w:sz w:val="20"/>
               </w:rPr>
-              <w:t xml:space="default">Furnace/Boiler Tune-up</w:t>
-            </w:r>
-          </w:p>
-        </w:tc>
-        <w:tc>
-          <w:tcPr>
-            <w:tcBorders>
-              <w:top w:val="single" w:space="0" w:color="D3D3D3"/>
-              <w:bottom w:val="single" w:space="0" w:color="D3D3D3"/>
-              <w:start w:val="single" w:space="0" w:color="D3D3D3"/>
-              <w:end w:val="single" w:space="0" w:color="D3D3D3"/>
-            </w:tcBorders>
-          </w:tcPr>
-          <w:p>
-            <w:pPr>
-              <w:spacing w:before="0" w:after="60"/>
-              <w:keepNext/>
-              <w:jc w:val="start"/>
-            </w:pPr>
-            <w:r>
-              <w:rPr>
-                <w:rFonts w:ascii="Calibri" w:hAnsi="Calibri"/>
-                <w:sz w:val="20"/>
-              </w:rPr>
-              <w:t xml:space="default">Have the furnace/boiler and flue inspected and adjusted by a licensed professional. This should be available from your fuel delivery company.</w:t>
+              <w:t xml:space="default">WindowDressers</w:t>
+            </w:r>
+          </w:p>
+        </w:tc>
+        <w:tc>
+          <w:tcPr>
+            <w:tcBorders>
+              <w:top w:val="single" w:space="0" w:color="D3D3D3"/>
+              <w:bottom w:val="single" w:space="0" w:color="D3D3D3"/>
+              <w:start w:val="single" w:space="0" w:color="D3D3D3"/>
+              <w:end w:val="single" w:space="0" w:color="D3D3D3"/>
+            </w:tcBorders>
+          </w:tcPr>
+          <w:p>
+            <w:pPr>
+              <w:spacing w:before="0" w:after="60"/>
+              <w:keepNext/>
+              <w:jc w:val="start"/>
+            </w:pPr>
+            <w:r>
+              <w:rPr>
+                <w:rFonts w:ascii="Calibri" w:hAnsi="Calibri"/>
+                <w:sz w:val="20"/>
+              </w:rPr>
+              <w:t xml:space="default">WindowDressers are insulating window inserts that help air-seal windows and reduce heat loss and gain.</w:t>
             </w:r>
           </w:p>
         </w:tc>
@@ -397,31 +397,31 @@
                 <w:rFonts w:ascii="Calibri" w:hAnsi="Calibri"/>
                 <w:sz w:val="20"/>
               </w:rPr>
-              <w:t xml:space="default">High-efficiency Shower Head(s)</w:t>
-            </w:r>
-          </w:p>
-        </w:tc>
-        <w:tc>
-          <w:tcPr>
-            <w:tcBorders>
-              <w:top w:val="single" w:space="0" w:color="D3D3D3"/>
-              <w:bottom w:val="single" w:space="0" w:color="D3D3D3"/>
-              <w:start w:val="single" w:space="0" w:color="D3D3D3"/>
-              <w:end w:val="single" w:space="0" w:color="D3D3D3"/>
-            </w:tcBorders>
-          </w:tcPr>
-          <w:p>
-            <w:pPr>
-              <w:spacing w:before="0" w:after="60"/>
-              <w:keepNext/>
-              <w:jc w:val="start"/>
-            </w:pPr>
-            <w:r>
-              <w:rPr>
-                <w:rFonts w:ascii="Calibri" w:hAnsi="Calibri"/>
-                <w:sz w:val="20"/>
-              </w:rPr>
-              <w:t xml:space="default">Install high-efficiency shower heads to reduce the amount of water and energy to heat the water used when showering.</w:t>
+              <w:t xml:space="default">Gutters</w:t>
+            </w:r>
+          </w:p>
+        </w:tc>
+        <w:tc>
+          <w:tcPr>
+            <w:tcBorders>
+              <w:top w:val="single" w:space="0" w:color="D3D3D3"/>
+              <w:bottom w:val="single" w:space="0" w:color="D3D3D3"/>
+              <w:start w:val="single" w:space="0" w:color="D3D3D3"/>
+              <w:end w:val="single" w:space="0" w:color="D3D3D3"/>
+            </w:tcBorders>
+          </w:tcPr>
+          <w:p>
+            <w:pPr>
+              <w:spacing w:before="0" w:after="60"/>
+              <w:keepNext/>
+              <w:jc w:val="start"/>
+            </w:pPr>
+            <w:r>
+              <w:rPr>
+                <w:rFonts w:ascii="Calibri" w:hAnsi="Calibri"/>
+                <w:sz w:val="20"/>
+              </w:rPr>
+              <w:t xml:space="default">Install gutters and downspouts that divert water at least six feet away from the foundation and to where the ground slopes away from the house.</w:t>
             </w:r>
           </w:p>
         </w:tc>
@@ -503,31 +503,31 @@
                 <w:rFonts w:ascii="Calibri" w:hAnsi="Calibri"/>
                 <w:sz w:val="20"/>
               </w:rPr>
-              <w:t xml:space="default">WindowDressers</w:t>
-            </w:r>
-          </w:p>
-        </w:tc>
-        <w:tc>
-          <w:tcPr>
-            <w:tcBorders>
-              <w:top w:val="single" w:space="0" w:color="D3D3D3"/>
-              <w:bottom w:val="single" w:space="0" w:color="D3D3D3"/>
-              <w:start w:val="single" w:space="0" w:color="D3D3D3"/>
-              <w:end w:val="single" w:space="0" w:color="D3D3D3"/>
-            </w:tcBorders>
-          </w:tcPr>
-          <w:p>
-            <w:pPr>
-              <w:spacing w:before="0" w:after="60"/>
-              <w:keepNext/>
-              <w:jc w:val="start"/>
-            </w:pPr>
-            <w:r>
-              <w:rPr>
-                <w:rFonts w:ascii="Calibri" w:hAnsi="Calibri"/>
-                <w:sz w:val="20"/>
-              </w:rPr>
-              <w:t xml:space="default">WindowDressers are insulating window inserts that help air-seal windows and reduce heat loss and gain.</w:t>
+              <w:t xml:space="default">High-efficiency Shower Head(s)</w:t>
+            </w:r>
+          </w:p>
+        </w:tc>
+        <w:tc>
+          <w:tcPr>
+            <w:tcBorders>
+              <w:top w:val="single" w:space="0" w:color="D3D3D3"/>
+              <w:bottom w:val="single" w:space="0" w:color="D3D3D3"/>
+              <w:start w:val="single" w:space="0" w:color="D3D3D3"/>
+              <w:end w:val="single" w:space="0" w:color="D3D3D3"/>
+            </w:tcBorders>
+          </w:tcPr>
+          <w:p>
+            <w:pPr>
+              <w:spacing w:before="0" w:after="60"/>
+              <w:keepNext/>
+              <w:jc w:val="start"/>
+            </w:pPr>
+            <w:r>
+              <w:rPr>
+                <w:rFonts w:ascii="Calibri" w:hAnsi="Calibri"/>
+                <w:sz w:val="20"/>
+              </w:rPr>
+              <w:t xml:space="default">Install high-efficiency shower heads to reduce the amount of water and energy to heat the water used when showering.</w:t>
             </w:r>
           </w:p>
         </w:tc>
@@ -556,31 +556,31 @@
                 <w:rFonts w:ascii="Calibri" w:hAnsi="Calibri"/>
                 <w:sz w:val="20"/>
               </w:rPr>
-              <w:t xml:space="default">Heat Pump Water Heater</w:t>
-            </w:r>
-          </w:p>
-        </w:tc>
-        <w:tc>
-          <w:tcPr>
-            <w:tcBorders>
-              <w:top w:val="single" w:space="0" w:color="D3D3D3"/>
-              <w:bottom w:val="single" w:space="0" w:color="D3D3D3"/>
-              <w:start w:val="single" w:space="0" w:color="D3D3D3"/>
-              <w:end w:val="single" w:space="0" w:color="D3D3D3"/>
-            </w:tcBorders>
-          </w:tcPr>
-          <w:p>
-            <w:pPr>
-              <w:spacing w:before="0" w:after="60"/>
-              <w:keepNext/>
-              <w:jc w:val="start"/>
-            </w:pPr>
-            <w:r>
-              <w:rPr>
-                <w:rFonts w:ascii="Calibri" w:hAnsi="Calibri"/>
-                <w:sz w:val="20"/>
-              </w:rPr>
-              <w:t xml:space="default">Install a heat pump water heater to provide your hot water for cooking and bathing. This is the most efficient way to heat water and will save hundreds of dollars a year compared to electric resistance, heating oil, or propane hot water. It will also help to dehumidify while it's running. If your current water heater burns oil or propane, this will also remove a source of combustion gases from your home.</w:t>
+              <w:t xml:space="default">Refrigerator</w:t>
+            </w:r>
+          </w:p>
+        </w:tc>
+        <w:tc>
+          <w:tcPr>
+            <w:tcBorders>
+              <w:top w:val="single" w:space="0" w:color="D3D3D3"/>
+              <w:bottom w:val="single" w:space="0" w:color="D3D3D3"/>
+              <w:start w:val="single" w:space="0" w:color="D3D3D3"/>
+              <w:end w:val="single" w:space="0" w:color="D3D3D3"/>
+            </w:tcBorders>
+          </w:tcPr>
+          <w:p>
+            <w:pPr>
+              <w:spacing w:before="0" w:after="60"/>
+              <w:keepNext/>
+              <w:jc w:val="start"/>
+            </w:pPr>
+            <w:r>
+              <w:rPr>
+                <w:rFonts w:ascii="Calibri" w:hAnsi="Calibri"/>
+                <w:sz w:val="20"/>
+              </w:rPr>
+              <w:t xml:space="default">Replace your refrigerator with a new, EnergyStar-certified fridge. Look at the Energy Guide label to compare the energy use of new refrigerators.</w:t>
             </w:r>
           </w:p>
         </w:tc>
@@ -609,31 +609,31 @@
                 <w:rFonts w:ascii="Calibri" w:hAnsi="Calibri"/>
                 <w:sz w:val="20"/>
               </w:rPr>
-              <w:t xml:space="default">Gutters</w:t>
-            </w:r>
-          </w:p>
-        </w:tc>
-        <w:tc>
-          <w:tcPr>
-            <w:tcBorders>
-              <w:top w:val="single" w:space="0" w:color="D3D3D3"/>
-              <w:bottom w:val="single" w:space="0" w:color="D3D3D3"/>
-              <w:start w:val="single" w:space="0" w:color="D3D3D3"/>
-              <w:end w:val="single" w:space="0" w:color="D3D3D3"/>
-            </w:tcBorders>
-          </w:tcPr>
-          <w:p>
-            <w:pPr>
-              <w:spacing w:before="0" w:after="60"/>
-              <w:keepNext/>
-              <w:jc w:val="start"/>
-            </w:pPr>
-            <w:r>
-              <w:rPr>
-                <w:rFonts w:ascii="Calibri" w:hAnsi="Calibri"/>
-                <w:sz w:val="20"/>
-              </w:rPr>
-              <w:t xml:space="default">Install gutters and downspouts that divert water at least six feet away from the foundation and to where the ground slopes away from the house.</w:t>
+              <w:t xml:space="default">Bathroom Exhaust Fan(s)</w:t>
+            </w:r>
+          </w:p>
+        </w:tc>
+        <w:tc>
+          <w:tcPr>
+            <w:tcBorders>
+              <w:top w:val="single" w:space="0" w:color="D3D3D3"/>
+              <w:bottom w:val="single" w:space="0" w:color="D3D3D3"/>
+              <w:start w:val="single" w:space="0" w:color="D3D3D3"/>
+              <w:end w:val="single" w:space="0" w:color="D3D3D3"/>
+            </w:tcBorders>
+          </w:tcPr>
+          <w:p>
+            <w:pPr>
+              <w:spacing w:before="0" w:after="60"/>
+              <w:keepNext/>
+              <w:jc w:val="start"/>
+            </w:pPr>
+            <w:r>
+              <w:rPr>
+                <w:rFonts w:ascii="Calibri" w:hAnsi="Calibri"/>
+                <w:sz w:val="20"/>
+              </w:rPr>
+              <w:t xml:space="default">Install bathroom exhaust fans in all bathrooms that do not have them. These should be rated for at least 80 cubic feet per minute (CFM) if there is a shower. We recommend the Panasonic Whisper series or similar fans that don’t create excess noise.</w:t>
             </w:r>
           </w:p>
         </w:tc>
@@ -662,31 +662,31 @@
                 <w:rFonts w:ascii="Calibri" w:hAnsi="Calibri"/>
                 <w:sz w:val="20"/>
               </w:rPr>
-              <w:t xml:space="default">Bathroom Exhaust Fan(s)</w:t>
-            </w:r>
-          </w:p>
-        </w:tc>
-        <w:tc>
-          <w:tcPr>
-            <w:tcBorders>
-              <w:top w:val="single" w:space="0" w:color="D3D3D3"/>
-              <w:bottom w:val="single" w:space="0" w:color="D3D3D3"/>
-              <w:start w:val="single" w:space="0" w:color="D3D3D3"/>
-              <w:end w:val="single" w:space="0" w:color="D3D3D3"/>
-            </w:tcBorders>
-          </w:tcPr>
-          <w:p>
-            <w:pPr>
-              <w:spacing w:before="0" w:after="60"/>
-              <w:keepNext/>
-              <w:jc w:val="start"/>
-            </w:pPr>
-            <w:r>
-              <w:rPr>
-                <w:rFonts w:ascii="Calibri" w:hAnsi="Calibri"/>
-                <w:sz w:val="20"/>
-              </w:rPr>
-              <w:t xml:space="default">Install bathroom exhaust fans in all bathrooms that do not have them. These should be rated for at least 80 cubic feet per minute (CFM) if there is a shower. We recommend the Panasonic Whisper series or similar fans that don’t create excess noise.</w:t>
+              <w:t xml:space="default">Kitchen Exhaust Fan</w:t>
+            </w:r>
+          </w:p>
+        </w:tc>
+        <w:tc>
+          <w:tcPr>
+            <w:tcBorders>
+              <w:top w:val="single" w:space="0" w:color="D3D3D3"/>
+              <w:bottom w:val="single" w:space="0" w:color="D3D3D3"/>
+              <w:start w:val="single" w:space="0" w:color="D3D3D3"/>
+              <w:end w:val="single" w:space="0" w:color="D3D3D3"/>
+            </w:tcBorders>
+          </w:tcPr>
+          <w:p>
+            <w:pPr>
+              <w:spacing w:before="0" w:after="60"/>
+              <w:keepNext/>
+              <w:jc w:val="start"/>
+            </w:pPr>
+            <w:r>
+              <w:rPr>
+                <w:rFonts w:ascii="Calibri" w:hAnsi="Calibri"/>
+                <w:sz w:val="20"/>
+              </w:rPr>
+              <w:t xml:space="default">Install a kitchen exhaust fan to remove cooking fumes and moisture from your home. The fan should be rated for at least 100 cubic feet per minute. A kitchen fan should be ducted to the outdoors. If the ductwork will run through the attic, it should be installed before the attic is air-sealed and insulated.</w:t>
             </w:r>
           </w:p>
         </w:tc>
@@ -715,31 +715,31 @@
                 <w:rFonts w:ascii="Calibri" w:hAnsi="Calibri"/>
                 <w:sz w:val="20"/>
               </w:rPr>
-              <w:t xml:space="default">Kitchen Exhaust Fan</w:t>
-            </w:r>
-          </w:p>
-        </w:tc>
-        <w:tc>
-          <w:tcPr>
-            <w:tcBorders>
-              <w:top w:val="single" w:space="0" w:color="D3D3D3"/>
-              <w:bottom w:val="single" w:space="0" w:color="D3D3D3"/>
-              <w:start w:val="single" w:space="0" w:color="D3D3D3"/>
-              <w:end w:val="single" w:space="0" w:color="D3D3D3"/>
-            </w:tcBorders>
-          </w:tcPr>
-          <w:p>
-            <w:pPr>
-              <w:spacing w:before="0" w:after="60"/>
-              <w:keepNext/>
-              <w:jc w:val="start"/>
-            </w:pPr>
-            <w:r>
-              <w:rPr>
-                <w:rFonts w:ascii="Calibri" w:hAnsi="Calibri"/>
-                <w:sz w:val="20"/>
-              </w:rPr>
-              <w:t xml:space="default">Install a kitchen exhaust fan to remove cooking fumes and moisture from your home. The fan should be rated for at least 100 cubic feet per minute. A kitchen fan should be ducted to the outdoors. If the ductwork will run through the attic, it should be installed before the attic is air-sealed and insulated.</w:t>
+              <w:t xml:space="default">Attic Air Sealing and Insulation</w:t>
+            </w:r>
+          </w:p>
+        </w:tc>
+        <w:tc>
+          <w:tcPr>
+            <w:tcBorders>
+              <w:top w:val="single" w:space="0" w:color="D3D3D3"/>
+              <w:bottom w:val="single" w:space="0" w:color="D3D3D3"/>
+              <w:start w:val="single" w:space="0" w:color="D3D3D3"/>
+              <w:end w:val="single" w:space="0" w:color="D3D3D3"/>
+            </w:tcBorders>
+          </w:tcPr>
+          <w:p>
+            <w:pPr>
+              <w:spacing w:before="0" w:after="60"/>
+              <w:keepNext/>
+              <w:jc w:val="start"/>
+            </w:pPr>
+            <w:r>
+              <w:rPr>
+                <w:rFonts w:ascii="Calibri" w:hAnsi="Calibri"/>
+                <w:sz w:val="20"/>
+              </w:rPr>
+              <w:t xml:space="default">Air seal the attic and insulate it to at least R-60 (18 inches of loose-fill cellulose insulation).</w:t>
             </w:r>
           </w:p>
         </w:tc>
@@ -768,31 +768,31 @@
                 <w:rFonts w:ascii="Calibri" w:hAnsi="Calibri"/>
                 <w:sz w:val="20"/>
               </w:rPr>
-              <w:t xml:space="default">Vapor Barrier</w:t>
-            </w:r>
-          </w:p>
-        </w:tc>
-        <w:tc>
-          <w:tcPr>
-            <w:tcBorders>
-              <w:top w:val="single" w:space="0" w:color="D3D3D3"/>
-              <w:bottom w:val="single" w:space="0" w:color="D3D3D3"/>
-              <w:start w:val="single" w:space="0" w:color="D3D3D3"/>
-              <w:end w:val="single" w:space="0" w:color="D3D3D3"/>
-            </w:tcBorders>
-          </w:tcPr>
-          <w:p>
-            <w:pPr>
-              <w:spacing w:before="0" w:after="60"/>
-              <w:keepNext/>
-              <w:jc w:val="start"/>
-            </w:pPr>
-            <w:r>
-              <w:rPr>
-                <w:rFonts w:ascii="Calibri" w:hAnsi="Calibri"/>
-                <w:sz w:val="20"/>
-              </w:rPr>
-              <w:t xml:space="default">Install a vapor barrier on the basement floor to stop moisture from entering the basement and house.</w:t>
+              <w:t xml:space="default">Blown-in Cellulose Wall Insulation</w:t>
+            </w:r>
+          </w:p>
+        </w:tc>
+        <w:tc>
+          <w:tcPr>
+            <w:tcBorders>
+              <w:top w:val="single" w:space="0" w:color="D3D3D3"/>
+              <w:bottom w:val="single" w:space="0" w:color="D3D3D3"/>
+              <w:start w:val="single" w:space="0" w:color="D3D3D3"/>
+              <w:end w:val="single" w:space="0" w:color="D3D3D3"/>
+            </w:tcBorders>
+          </w:tcPr>
+          <w:p>
+            <w:pPr>
+              <w:spacing w:before="0" w:after="60"/>
+              <w:keepNext/>
+              <w:jc w:val="start"/>
+            </w:pPr>
+            <w:r>
+              <w:rPr>
+                <w:rFonts w:ascii="Calibri" w:hAnsi="Calibri"/>
+                <w:sz w:val="20"/>
+              </w:rPr>
+              <w:t xml:space="default">Insulate the wall stud cavities with dense packed, blown-in cellulose insulation.</w:t>
             </w:r>
           </w:p>
         </w:tc>
@@ -821,349 +821,31 @@
                 <w:rFonts w:ascii="Calibri" w:hAnsi="Calibri"/>
                 <w:sz w:val="20"/>
               </w:rPr>
-              <w:t xml:space="default">Spray Foam Basement/Crawlspace Walls</w:t>
-            </w:r>
-          </w:p>
-        </w:tc>
-        <w:tc>
-          <w:tcPr>
-            <w:tcBorders>
-              <w:top w:val="single" w:space="0" w:color="D3D3D3"/>
-              <w:bottom w:val="single" w:space="0" w:color="D3D3D3"/>
-              <w:start w:val="single" w:space="0" w:color="D3D3D3"/>
-              <w:end w:val="single" w:space="0" w:color="D3D3D3"/>
-            </w:tcBorders>
-          </w:tcPr>
-          <w:p>
-            <w:pPr>
-              <w:spacing w:before="0" w:after="60"/>
-              <w:keepNext/>
-              <w:jc w:val="start"/>
-            </w:pPr>
-            <w:r>
-              <w:rPr>
-                <w:rFonts w:ascii="Calibri" w:hAnsi="Calibri"/>
-                <w:sz w:val="20"/>
-              </w:rPr>
-              <w:t xml:space="default">Install spray foam on the basement/crawlspace walls to prevent moisture infiltration and reduce heat loss.</w:t>
-            </w:r>
-          </w:p>
-        </w:tc>
-      </w:tr>
-      <w:tr>
-        <w:trPr>
-          <w:cantSplit/>
-        </w:trPr>
-        <w:tc>
-          <w:tcPr>
-            <w:tcBorders>
-              <w:top w:val="single" w:space="0" w:color="D3D3D3"/>
-              <w:bottom w:val="single" w:space="0" w:color="D3D3D3"/>
-              <w:start w:val="single" w:space="0" w:color="D3D3D3"/>
-              <w:end w:val="single" w:space="0" w:color="D3D3D3"/>
-            </w:tcBorders>
-          </w:tcPr>
-          <w:p>
-            <w:pPr>
-              <w:spacing w:before="0" w:after="60"/>
-              <w:keepNext/>
-              <w:jc w:val="start"/>
-            </w:pPr>
-            <w:r>
-              <w:rPr>
-                <w:rFonts w:ascii="Calibri" w:hAnsi="Calibri"/>
-                <w:sz w:val="20"/>
-              </w:rPr>
-              <w:t xml:space="default">Attic Air Sealing and Insulation</w:t>
-            </w:r>
-          </w:p>
-        </w:tc>
-        <w:tc>
-          <w:tcPr>
-            <w:tcBorders>
-              <w:top w:val="single" w:space="0" w:color="D3D3D3"/>
-              <w:bottom w:val="single" w:space="0" w:color="D3D3D3"/>
-              <w:start w:val="single" w:space="0" w:color="D3D3D3"/>
-              <w:end w:val="single" w:space="0" w:color="D3D3D3"/>
-            </w:tcBorders>
-          </w:tcPr>
-          <w:p>
-            <w:pPr>
-              <w:spacing w:before="0" w:after="60"/>
-              <w:keepNext/>
-              <w:jc w:val="start"/>
-            </w:pPr>
-            <w:r>
-              <w:rPr>
-                <w:rFonts w:ascii="Calibri" w:hAnsi="Calibri"/>
-                <w:sz w:val="20"/>
-              </w:rPr>
-              <w:t xml:space="default">Air seal the attic and insulate it to at least R-60 (18 inches of loose-fill cellulose insulation).</w:t>
-            </w:r>
-          </w:p>
-        </w:tc>
-      </w:tr>
-      <w:tr>
-        <w:trPr>
-          <w:cantSplit/>
-        </w:trPr>
-        <w:tc>
-          <w:tcPr>
-            <w:tcBorders>
-              <w:top w:val="single" w:space="0" w:color="D3D3D3"/>
-              <w:bottom w:val="single" w:space="0" w:color="D3D3D3"/>
-              <w:start w:val="single" w:space="0" w:color="D3D3D3"/>
-              <w:end w:val="single" w:space="0" w:color="D3D3D3"/>
-            </w:tcBorders>
-          </w:tcPr>
-          <w:p>
-            <w:pPr>
-              <w:spacing w:before="0" w:after="60"/>
-              <w:keepNext/>
-              <w:jc w:val="start"/>
-            </w:pPr>
-            <w:r>
-              <w:rPr>
-                <w:rFonts w:ascii="Calibri" w:hAnsi="Calibri"/>
-                <w:sz w:val="20"/>
-              </w:rPr>
-              <w:t xml:space="default">Blown-in Cellulose Wall Insulation</w:t>
-            </w:r>
-          </w:p>
-        </w:tc>
-        <w:tc>
-          <w:tcPr>
-            <w:tcBorders>
-              <w:top w:val="single" w:space="0" w:color="D3D3D3"/>
-              <w:bottom w:val="single" w:space="0" w:color="D3D3D3"/>
-              <w:start w:val="single" w:space="0" w:color="D3D3D3"/>
-              <w:end w:val="single" w:space="0" w:color="D3D3D3"/>
-            </w:tcBorders>
-          </w:tcPr>
-          <w:p>
-            <w:pPr>
-              <w:spacing w:before="0" w:after="60"/>
-              <w:keepNext/>
-              <w:jc w:val="start"/>
-            </w:pPr>
-            <w:r>
-              <w:rPr>
-                <w:rFonts w:ascii="Calibri" w:hAnsi="Calibri"/>
-                <w:sz w:val="20"/>
-              </w:rPr>
-              <w:t xml:space="default">Insulate the wall stud cavities with dense packed, blown-in cellulose insulation.</w:t>
-            </w:r>
-          </w:p>
-        </w:tc>
-      </w:tr>
-      <w:tr>
-        <w:trPr>
-          <w:cantSplit/>
-        </w:trPr>
-        <w:tc>
-          <w:tcPr>
-            <w:tcBorders>
-              <w:top w:val="single" w:space="0" w:color="D3D3D3"/>
-              <w:bottom w:val="single" w:space="0" w:color="D3D3D3"/>
-              <w:start w:val="single" w:space="0" w:color="D3D3D3"/>
-              <w:end w:val="single" w:space="0" w:color="D3D3D3"/>
-            </w:tcBorders>
-          </w:tcPr>
-          <w:p>
-            <w:pPr>
-              <w:spacing w:before="0" w:after="60"/>
-              <w:keepNext/>
-              <w:jc w:val="start"/>
-            </w:pPr>
-            <w:r>
-              <w:rPr>
-                <w:rFonts w:ascii="Calibri" w:hAnsi="Calibri"/>
-                <w:sz w:val="20"/>
-              </w:rPr>
-              <w:t xml:space="default">Continuous Exterior Wall Insulation</w:t>
-            </w:r>
-          </w:p>
-        </w:tc>
-        <w:tc>
-          <w:tcPr>
-            <w:tcBorders>
-              <w:top w:val="single" w:space="0" w:color="D3D3D3"/>
-              <w:bottom w:val="single" w:space="0" w:color="D3D3D3"/>
-              <w:start w:val="single" w:space="0" w:color="D3D3D3"/>
-              <w:end w:val="single" w:space="0" w:color="D3D3D3"/>
-            </w:tcBorders>
-          </w:tcPr>
-          <w:p>
-            <w:pPr>
-              <w:spacing w:before="0" w:after="60"/>
-              <w:keepNext/>
-              <w:jc w:val="start"/>
-            </w:pPr>
-            <w:r>
-              <w:rPr>
-                <w:rFonts w:ascii="Calibri" w:hAnsi="Calibri"/>
-                <w:sz w:val="20"/>
-              </w:rPr>
-              <w:t xml:space="default">Add a continuous layer of insulation and potentially replace the air and moisture barrier once it becomes time to replace the siding.</w:t>
-            </w:r>
-          </w:p>
-        </w:tc>
-      </w:tr>
-      <w:tr>
-        <w:trPr>
-          <w:cantSplit/>
-        </w:trPr>
-        <w:tc>
-          <w:tcPr>
-            <w:tcBorders>
-              <w:top w:val="single" w:space="0" w:color="D3D3D3"/>
-              <w:bottom w:val="single" w:space="0" w:color="D3D3D3"/>
-              <w:start w:val="single" w:space="0" w:color="D3D3D3"/>
-              <w:end w:val="single" w:space="0" w:color="D3D3D3"/>
-            </w:tcBorders>
-          </w:tcPr>
-          <w:p>
-            <w:pPr>
-              <w:spacing w:before="0" w:after="60"/>
-              <w:keepNext/>
-              <w:jc w:val="start"/>
-            </w:pPr>
-            <w:r>
-              <w:rPr>
-                <w:rFonts w:ascii="Calibri" w:hAnsi="Calibri"/>
-                <w:sz w:val="20"/>
-              </w:rPr>
-              <w:t xml:space="default">Pipe Insulation</w:t>
-            </w:r>
-          </w:p>
-        </w:tc>
-        <w:tc>
-          <w:tcPr>
-            <w:tcBorders>
-              <w:top w:val="single" w:space="0" w:color="D3D3D3"/>
-              <w:bottom w:val="single" w:space="0" w:color="D3D3D3"/>
-              <w:start w:val="single" w:space="0" w:color="D3D3D3"/>
-              <w:end w:val="single" w:space="0" w:color="D3D3D3"/>
-            </w:tcBorders>
-          </w:tcPr>
-          <w:p>
-            <w:pPr>
-              <w:spacing w:before="0" w:after="60"/>
-              <w:keepNext/>
-              <w:jc w:val="start"/>
-            </w:pPr>
-            <w:r>
-              <w:rPr>
-                <w:rFonts w:ascii="Calibri" w:hAnsi="Calibri"/>
-                <w:sz w:val="20"/>
-              </w:rPr>
-              <w:t xml:space="default">Insulate both hot and cold water pipes that are uninsulated in the basement/crawlspace. This will save energy and prevent condensation.</w:t>
-            </w:r>
-          </w:p>
-        </w:tc>
-      </w:tr>
-      <w:tr>
-        <w:trPr>
-          <w:cantSplit/>
-        </w:trPr>
-        <w:tc>
-          <w:tcPr>
-            <w:tcBorders>
-              <w:top w:val="single" w:space="0" w:color="D3D3D3"/>
-              <w:bottom w:val="single" w:space="0" w:color="D3D3D3"/>
-              <w:start w:val="single" w:space="0" w:color="D3D3D3"/>
-              <w:end w:val="single" w:space="0" w:color="D3D3D3"/>
-            </w:tcBorders>
-          </w:tcPr>
-          <w:p>
-            <w:pPr>
-              <w:spacing w:before="0" w:after="60"/>
-              <w:keepNext/>
-              <w:jc w:val="start"/>
-            </w:pPr>
-            <w:r>
-              <w:rPr>
-                <w:rFonts w:ascii="Calibri" w:hAnsi="Calibri"/>
-                <w:sz w:val="20"/>
-              </w:rPr>
-              <w:t xml:space="default">DIY Air Sealing</w:t>
-            </w:r>
-          </w:p>
-        </w:tc>
-        <w:tc>
-          <w:tcPr>
-            <w:tcBorders>
-              <w:top w:val="single" w:space="0" w:color="D3D3D3"/>
-              <w:bottom w:val="single" w:space="0" w:color="D3D3D3"/>
-              <w:start w:val="single" w:space="0" w:color="D3D3D3"/>
-              <w:end w:val="single" w:space="0" w:color="D3D3D3"/>
-            </w:tcBorders>
-          </w:tcPr>
-          <w:p>
-            <w:pPr>
-              <w:spacing w:before="0" w:after="60"/>
-              <w:keepNext/>
-              <w:jc w:val="start"/>
-            </w:pPr>
-            <w:r>
-              <w:rPr>
-                <w:rFonts w:ascii="Calibri" w:hAnsi="Calibri"/>
-                <w:sz w:val="20"/>
-              </w:rPr>
-              <w:t xml:space="default">Seal easy-to-access air leaks and weatherstrip exterior doors.</w:t>
-            </w:r>
-          </w:p>
-        </w:tc>
-      </w:tr>
-      <w:tr>
-        <w:trPr>
-          <w:cantSplit/>
-        </w:trPr>
-        <w:tc>
-          <w:tcPr>
-            <w:tcBorders>
-              <w:top w:val="single" w:space="0" w:color="D3D3D3"/>
-              <w:bottom w:val="single" w:space="0" w:color="D3D3D3"/>
-              <w:start w:val="single" w:space="0" w:color="D3D3D3"/>
-              <w:end w:val="single" w:space="0" w:color="D3D3D3"/>
-            </w:tcBorders>
-          </w:tcPr>
-          <w:p>
-            <w:pPr>
-              <w:spacing w:before="0" w:after="60"/>
-              <w:keepNext/>
-              <w:jc w:val="start"/>
-            </w:pPr>
-            <w:r>
-              <w:rPr>
-                <w:rFonts w:ascii="Calibri" w:hAnsi="Calibri"/>
-                <w:sz w:val="20"/>
-              </w:rPr>
-              <w:t xml:space="default">Ductwork Air Sealing and Insulation</w:t>
-            </w:r>
-          </w:p>
-        </w:tc>
-        <w:tc>
-          <w:tcPr>
-            <w:tcBorders>
-              <w:top w:val="single" w:space="0" w:color="D3D3D3"/>
-              <w:bottom w:val="single" w:space="0" w:color="D3D3D3"/>
-              <w:start w:val="single" w:space="0" w:color="D3D3D3"/>
-              <w:end w:val="single" w:space="0" w:color="D3D3D3"/>
-            </w:tcBorders>
-          </w:tcPr>
-          <w:p>
-            <w:pPr>
-              <w:spacing w:before="0" w:after="60"/>
-              <w:keepNext/>
-              <w:jc w:val="start"/>
-            </w:pPr>
-            <w:r>
-              <w:rPr>
-                <w:rFonts w:ascii="Calibri" w:hAnsi="Calibri"/>
-                <w:sz w:val="20"/>
-              </w:rPr>
-              <w:t xml:space="default">Air seal and insulate all of the supply and return ductwork running through the basement/crawlspace.</w:t>
+              <w:t xml:space="default">Air Source Heat Pump</w:t>
+            </w:r>
+          </w:p>
+        </w:tc>
+        <w:tc>
+          <w:tcPr>
+            <w:tcBorders>
+              <w:top w:val="single" w:space="0" w:color="D3D3D3"/>
+              <w:bottom w:val="single" w:space="0" w:color="D3D3D3"/>
+              <w:start w:val="single" w:space="0" w:color="D3D3D3"/>
+              <w:end w:val="single" w:space="0" w:color="D3D3D3"/>
+            </w:tcBorders>
+          </w:tcPr>
+          <w:p>
+            <w:pPr>
+              <w:spacing w:before="0" w:after="60"/>
+              <w:keepNext/>
+              <w:jc w:val="start"/>
+            </w:pPr>
+            <w:r>
+              <w:rPr>
+                <w:rFonts w:ascii="Calibri" w:hAnsi="Calibri"/>
+                <w:sz w:val="20"/>
+              </w:rPr>
+              <w:t xml:space="default">Install air source heat pumps for heating and cooling and whole-house surge protection.</w:t>
             </w:r>
           </w:p>
         </w:tc>
@@ -1248,7 +930,7 @@
                 <w:rFonts w:ascii="Calibri" w:hAnsi="Calibri"/>
                 <w:sz w:val="20"/>
               </w:rPr>
-              <w:t xml:space="default">NA</w:t>
+              <w:t xml:space="default">1870</w:t>
             </w:r>
           </w:p>
         </w:tc>
@@ -1301,7 +983,7 @@
                 <w:rFonts w:ascii="Calibri" w:hAnsi="Calibri"/>
                 <w:sz w:val="20"/>
               </w:rPr>
-              <w:t xml:space="default">Walk in basement</w:t>
+              <w:t xml:space="default">Slab</w:t>
             </w:r>
           </w:p>
         </w:tc>
@@ -1354,7 +1036,7 @@
                 <w:rFonts w:ascii="Calibri" w:hAnsi="Calibri"/>
                 <w:sz w:val="20"/>
               </w:rPr>
-              <w:t xml:space="default">Batts of Fiberglass , 1 inches</w:t>
+              <w:t xml:space="default">Batts of Fiberglass, Uninsulated , NA inches</w:t>
             </w:r>
           </w:p>
         </w:tc>
@@ -1460,7 +1142,7 @@
                 <w:rFonts w:ascii="Calibri" w:hAnsi="Calibri"/>
                 <w:sz w:val="20"/>
               </w:rPr>
-              <w:t xml:space="default">NA</w:t>
+              <w:t xml:space="default">1344</w:t>
             </w:r>
           </w:p>
         </w:tc>
@@ -1513,7 +1195,7 @@
                 <w:rFonts w:ascii="Calibri" w:hAnsi="Calibri"/>
                 <w:sz w:val="20"/>
               </w:rPr>
-              <w:t xml:space="default">13380</w:t>
+              <w:t xml:space="default">10032</w:t>
             </w:r>
           </w:p>
         </w:tc>
@@ -1566,7 +1248,7 @@
                 <w:rFonts w:ascii="Calibri" w:hAnsi="Calibri"/>
                 <w:sz w:val="20"/>
               </w:rPr>
-              <w:t xml:space="default">0</w:t>
+              <w:t xml:space="default">NA</w:t>
             </w:r>
           </w:p>
         </w:tc>
@@ -1642,7 +1324,7 @@
                 <w:rFonts w:ascii="Calibri" w:hAnsi="Calibri"/>
                 <w:sz w:val="20"/>
               </w:rPr>
-              <w:t xml:space="default">NA</w:t>
+              <w:t xml:space="default">16</w:t>
             </w:r>
           </w:p>
         </w:tc>
@@ -1695,7 +1377,7 @@
                 <w:rFonts w:ascii="Calibri" w:hAnsi="Calibri"/>
                 <w:sz w:val="20"/>
               </w:rPr>
-              <w:t xml:space="default">North/South</w:t>
+              <w:t xml:space="default">Northwest/Southeast</w:t>
             </w:r>
           </w:p>
         </w:tc>
@@ -1748,7 +1430,7 @@
                 <w:rFonts w:ascii="Calibri" w:hAnsi="Calibri"/>
                 <w:sz w:val="20"/>
               </w:rPr>
-              <w:t xml:space="default">Asphalt Shinglesin faircondition. Most of the roof is in good condition, but there are a few places where shingles are lifting up.</w:t>
+              <w:t xml:space="default">Asphalt Shinglesin poorcondition. There is evidence of mold on the roof.</w:t>
             </w:r>
           </w:p>
         </w:tc>
@@ -1801,7 +1483,7 @@
                 <w:rFonts w:ascii="Calibri" w:hAnsi="Calibri"/>
                 <w:sz w:val="20"/>
               </w:rPr>
-              <w:t xml:space="default">Current moisture control strategies: NA. These were in NA condition .NA</w:t>
+              <w:t xml:space="default">Current moisture control strategies: gutters. These were in poor condition .The gutters are most likely still allowing water to reach the home and some parts are disconnected.</w:t>
             </w:r>
           </w:p>
         </w:tc>
@@ -1854,7 +1536,7 @@
                 <w:rFonts w:ascii="Calibri" w:hAnsi="Calibri"/>
                 <w:sz w:val="20"/>
               </w:rPr>
-              <w:t xml:space="default">wood shingles in poor condition. Severe weathering and water damage on all siding, many broken shingles</w:t>
+              <w:t xml:space="default">wood shingles in poor condition. There is evidence of moisture on the siding.</w:t>
             </w:r>
           </w:p>
         </w:tc>
@@ -1907,7 +1589,7 @@
                 <w:rFonts w:ascii="Calibri" w:hAnsi="Calibri"/>
                 <w:sz w:val="20"/>
               </w:rPr>
-              <w:t xml:space="default">There are no exterior doors</w:t>
+              <w:t xml:space="default">There are 2 hollow wood exterior doors. In poor condition, totaling 0 square feet.</w:t>
             </w:r>
           </w:p>
         </w:tc>
@@ -2036,7 +1718,7 @@
                 <w:rFonts w:ascii="Calibri" w:hAnsi="Calibri"/>
                 <w:sz w:val="20"/>
               </w:rPr>
-              <w:t xml:space="default">NAThere is Batts of Fiberglass insulation NA inches thick in NA condition. NA</w:t>
+              <w:t xml:space="default">The framing type of the home is balloon framing, which means the wall cavities extend the full height of the building (from the foundation to the roof). Often the wall cavities are interconnected with the floor and ceiling cavities. This framing type can create connected passageways for air to leave the house and rodents to enter the house. There is Batts of Fiberglass, Uninsulated insulation NA inches thick in NA condition. The addition is insulated with fiberglass batts, while the rest of the home is uninsulated.</w:t>
             </w:r>
           </w:p>
         </w:tc>
@@ -2089,7 +1771,7 @@
                 <w:rFonts w:ascii="Calibri" w:hAnsi="Calibri"/>
                 <w:sz w:val="20"/>
               </w:rPr>
-              <w:t xml:space="default">NA</w:t>
+              <w:t xml:space="default">The kitchen woodstove is not in use.</w:t>
             </w:r>
           </w:p>
         </w:tc>
@@ -2195,7 +1877,7 @@
                 <w:rFonts w:ascii="Calibri" w:hAnsi="Calibri"/>
                 <w:sz w:val="20"/>
               </w:rPr>
-              <w:t xml:space="default">NA used NA kWh in NA minutes. NA used NA kWh in NA minutes. NA</w:t>
+              <w:t xml:space="default">NA used NA kWh in NA minutes. NA used NA kWh in NA minutes. There is a small door that leads to some storage space under the stairs.</w:t>
             </w:r>
           </w:p>
         </w:tc>
@@ -2303,7 +1985,7 @@
                 <w:rFonts w:ascii="Calibri" w:hAnsi="Calibri"/>
                 <w:sz w:val="20"/>
               </w:rPr>
-              <w:t xml:space="default">2288</w:t>
+              <w:t xml:space="default">4085</w:t>
             </w:r>
           </w:p>
         </w:tc>
@@ -2380,7 +2062,7 @@
                 <w:rFonts w:ascii="Calibri" w:hAnsi="Calibri"/>
                 <w:sz w:val="20"/>
               </w:rPr>
-              <w:t xml:space="default">10.3</w:t>
+              <w:t xml:space="default">24.4</w:t>
             </w:r>
           </w:p>
         </w:tc>
@@ -2457,7 +2139,7 @@
                 <w:rFonts w:ascii="Calibri" w:hAnsi="Calibri"/>
                 <w:sz w:val="20"/>
               </w:rPr>
-              <w:t xml:space="default">228.8 under natural conditions. TEST</w:t>
+              <w:t xml:space="default">408.5 under natural conditions. TEST</w:t>
             </w:r>
           </w:p>
         </w:tc>
@@ -2534,7 +2216,7 @@
                 <w:rFonts w:ascii="Calibri" w:hAnsi="Calibri"/>
                 <w:sz w:val="20"/>
               </w:rPr>
-              <w:t xml:space="default">0.7</w:t>
+              <w:t xml:space="default">1.7</w:t>
             </w:r>
           </w:p>
         </w:tc>
@@ -2750,7 +2432,7 @@
                 <w:rFonts w:ascii="Calibri" w:hAnsi="Calibri"/>
                 <w:sz w:val="20"/>
               </w:rPr>
-              <w:t xml:space="default">Batts of Fiberglass</w:t>
+              <w:t xml:space="default">Batts of Fiberglass, Uninsulated</w:t>
             </w:r>
           </w:p>
         </w:tc>
@@ -2909,7 +2591,7 @@
                 <w:rFonts w:ascii="Calibri" w:hAnsi="Calibri"/>
                 <w:sz w:val="20"/>
               </w:rPr>
-              <w:t xml:space="default">Attic insulation is very inconsistent and falling away from roof ridge at many points No NA</w:t>
+              <w:t xml:space="default">There are two attics- the one for the original part of the house and the one above the addition. The former is uninsulated, has mold at the ridge, and has an unsealed chimney. The latter is insulated with R-11 fiberglass batts that are broken and bent to accommodate the small size of the attic and there is limited air sealing. Yes There is mold at the ridge in the attic that is part of the original home.</w:t>
             </w:r>
           </w:p>
         </w:tc>
@@ -3197,7 +2879,7 @@
                 <w:rFonts w:ascii="Calibri" w:hAnsi="Calibri"/>
                 <w:sz w:val="20"/>
               </w:rPr>
-              <w:t xml:space="default">Uninsulated</w:t>
+              <w:t xml:space="default">NA</w:t>
             </w:r>
           </w:p>
         </w:tc>
@@ -3303,7 +2985,7 @@
                 <w:rFonts w:ascii="Calibri" w:hAnsi="Calibri"/>
                 <w:sz w:val="20"/>
               </w:rPr>
-              <w:t xml:space="default">NAin NAcondition. NA</w:t>
+              <w:t xml:space="default">NAin NAcondition. The gutters are most likely still allowing water to reach the home and some parts are disconnected.</w:t>
             </w:r>
           </w:p>
         </w:tc>
@@ -3356,7 +3038,7 @@
                 <w:rFonts w:ascii="Calibri" w:hAnsi="Calibri"/>
                 <w:sz w:val="20"/>
               </w:rPr>
-              <w:t xml:space="default">YesExhaust duct is very long and has some parts that are sagging, creating sharp turns</w:t>
+              <w:t xml:space="default">NoNA</w:t>
             </w:r>
           </w:p>
         </w:tc>
@@ -3409,7 +3091,7 @@
                 <w:rFonts w:ascii="Calibri" w:hAnsi="Calibri"/>
                 <w:sz w:val="20"/>
               </w:rPr>
-              <w:t xml:space="default">There is moistureMoisture marks along most walls, mold on floor and wall next to well pressure tank and oil tank</w:t>
+              <w:t xml:space="default">There is NANA</w:t>
             </w:r>
           </w:p>
         </w:tc>
@@ -3485,7 +3167,7 @@
                 <w:rFonts w:ascii="Calibri" w:hAnsi="Calibri"/>
                 <w:sz w:val="20"/>
               </w:rPr>
-              <w:t xml:space="default">The electrical panel has and amperage of 200. There are 11 unused breaker spaces. NA</w:t>
+              <w:t xml:space="default">The electrical panel has and amperage of 200. There are 13 unused breaker spaces. NA</w:t>
             </w:r>
           </w:p>
         </w:tc>
@@ -3612,7 +3294,7 @@
     </w:tbl>
     <w:bookmarkEnd w:id="40"/>
     <w:bookmarkEnd w:id="41"/>
-    <w:bookmarkStart w:id="58" w:name="recommendations"/>
+    <w:bookmarkStart w:id="52" w:name="recommendations"/>
     <w:p>
       <w:pPr>
         <w:pStyle w:val="Heading2"/>
@@ -3629,13 +3311,13 @@
         <w:t xml:space="preserve">These recommendations are organized from the least expensive/most cost-effective and easiest interventions to ones that are more challenging to implement.</w:t>
       </w:r>
     </w:p>
-    <w:bookmarkStart w:id="42" w:name="furnaceboiler-tune-up"/>
+    <w:bookmarkStart w:id="42" w:name="high-efficiency-shower-heads"/>
     <w:p>
       <w:pPr>
         <w:pStyle w:val="Heading3"/>
       </w:pPr>
       <w:r>
-        <w:t xml:space="preserve">4.1 Furnace/Boiler Tune up</w:t>
+        <w:t xml:space="preserve">4.1 High efficiency shower head(s)</w:t>
       </w:r>
     </w:p>
     <w:p>
@@ -3655,11 +3337,7 @@
         <w:pStyle w:val="BodyText"/>
       </w:pPr>
       <w:r>
-        <w:rPr>
-          <w:b/>
-          <w:bCs/>
-        </w:rPr>
-        <w:t xml:space="preserve">Auditor to describe</w:t>
+        <w:t xml:space="preserve">Your shower heads use more water and energy than high-efficiency shower heads, thus costing you more money than necessary. Older shower heads use 2.5 gallons or more every minute, which wastes thousands of gallons of water each year and costs you money for every extra gallon of water heated.</w:t>
       </w:r>
     </w:p>
     <w:p>
@@ -3679,13 +3357,11 @@
         <w:pStyle w:val="BodyText"/>
       </w:pPr>
       <w:r>
-        <w:t xml:space="preserve">Have the furnace/boiler and flue inspected and adjusted by a licensed professional. This should be available from your fuel delivery company.</w:t>
-      </w:r>
-    </w:p>
-    <w:p>
-      <w:pPr>
-        <w:pStyle w:val="BodyText"/>
-      </w:pPr>
+        <w:t xml:space="preserve">Install high-efficiency shower heads to reduce the amount of water and energy to heat the water used when showering. We recommend 1.5 gallon per minute shower heads that will save a gallon or more of water for every minute spent in the shower.</w:t>
+      </w:r>
+      <w:r>
+        <w:t xml:space="preserve"> </w:t>
+      </w:r>
       <w:r>
         <w:rPr>
           <w:i/>
@@ -3699,17 +3375,17 @@
         <w:pStyle w:val="BodyText"/>
       </w:pPr>
       <w:r>
-        <w:t xml:space="preserve">A tune-up can improve the efficiency of your furnace/boiler, confirm that it is exhausting properly, and identify areas of concern before they become urgent. If you have a service contract with your fuel delivery company, an annual tune-up is usually included.</w:t>
+        <w:t xml:space="preserve">A typical family will save ~10,000 gallons of water per year and over $100 per year in water heating costs. We provide these for free; contact us for some if we did not give you any during the audit.</w:t>
       </w:r>
     </w:p>
     <w:bookmarkEnd w:id="42"/>
-    <w:bookmarkStart w:id="43" w:name="high-efficiency-shower-heads"/>
+    <w:bookmarkStart w:id="43" w:name="leds"/>
     <w:p>
       <w:pPr>
         <w:pStyle w:val="Heading3"/>
       </w:pPr>
       <w:r>
-        <w:t xml:space="preserve">4.2 High efficiency shower head(s)</w:t>
+        <w:t xml:space="preserve">4.2 LEDs</w:t>
       </w:r>
     </w:p>
     <w:p>
@@ -3729,7 +3405,7 @@
         <w:pStyle w:val="BodyText"/>
       </w:pPr>
       <w:r>
-        <w:t xml:space="preserve">Your shower heads use more water and energy than high-efficiency shower heads, thus costing you more money than necessary. Older shower heads use 2.5 gallons or more every minute, which wastes thousands of gallons of water each year and costs you money for every extra gallon of water heated.</w:t>
+        <w:t xml:space="preserve">Your lighting uses more energy than LED bulbs would. Halogen and incandescent light bulbs use 5-8x more energy than LEDs. This requires significantly more electricity and costs a lot.</w:t>
       </w:r>
     </w:p>
     <w:p>
@@ -3749,11 +3425,13 @@
         <w:pStyle w:val="BodyText"/>
       </w:pPr>
       <w:r>
-        <w:t xml:space="preserve">Install high-efficiency shower heads to reduce the amount of water and energy to heat the water used when showering. We recommend 1.5 gallon per minute shower heads that will save a gallon or more of water for every minute spent in the shower.</w:t>
-      </w:r>
-      <w:r>
-        <w:t xml:space="preserve"> </w:t>
-      </w:r>
+        <w:t xml:space="preserve">Switch your light bulbs to LED light bulbs. LEDs use 80% less energy than incandescent light bulbs, which can significantly reduce your electricity bill.</w:t>
+      </w:r>
+    </w:p>
+    <w:p>
+      <w:pPr>
+        <w:pStyle w:val="BodyText"/>
+      </w:pPr>
       <w:r>
         <w:rPr>
           <w:i/>
@@ -3767,17 +3445,17 @@
         <w:pStyle w:val="BodyText"/>
       </w:pPr>
       <w:r>
-        <w:t xml:space="preserve">A typical family will save ~10,000 gallons of water per year and over $100 per year in water heating costs. We provide these for free; contact us for some if we did not give you any during the audit.</w:t>
+        <w:t xml:space="preserve">We provide free LED light bulbs; contact us for some if we did not give you any during the audit. Depending on usage, LEDs can save more than $50 a year.</w:t>
       </w:r>
     </w:p>
     <w:bookmarkEnd w:id="43"/>
-    <w:bookmarkStart w:id="44" w:name="leds"/>
+    <w:bookmarkStart w:id="44" w:name="window-dressers"/>
     <w:p>
       <w:pPr>
         <w:pStyle w:val="Heading3"/>
       </w:pPr>
       <w:r>
-        <w:t xml:space="preserve">4.3 LEDs</w:t>
+        <w:t xml:space="preserve">4.3 Window Dressers</w:t>
       </w:r>
     </w:p>
     <w:p>
@@ -3797,7 +3475,7 @@
         <w:pStyle w:val="BodyText"/>
       </w:pPr>
       <w:r>
-        <w:t xml:space="preserve">Your lighting uses more energy than LED bulbs would. Halogen and incandescent light bulbs use 5-8x more energy than LEDs. This requires significantly more electricity and costs a lot.</w:t>
+        <w:t xml:space="preserve">Your windows are a source of heat loss, reduce your comfort due to cold surface temperatures, and may also cause moisture condensation or frost in the winter.</w:t>
       </w:r>
     </w:p>
     <w:p>
@@ -3817,13 +3495,11 @@
         <w:pStyle w:val="BodyText"/>
       </w:pPr>
       <w:r>
-        <w:t xml:space="preserve">Switch your light bulbs to LED light bulbs. LEDs use 80% less energy than incandescent light bulbs, which can significantly reduce your electricity bill.</w:t>
-      </w:r>
-    </w:p>
-    <w:p>
-      <w:pPr>
-        <w:pStyle w:val="BodyText"/>
-      </w:pPr>
+        <w:t xml:space="preserve">WindowDressers are insulating window inserts that help air-seal windows and reduce heat loss and gain. WindowDressers are transparent and let in light while stopping drafts. Each insert is made of a custom-made pine frame wrapped on each side with tightly sealed, clear polyolefin film, creating an airspace between the two layers for additional insulation. The insert is finished with a compressible foam weather seal. The foam allows enough give for the inserts to be easily slid into place in the fall and removed in the spring while holding firmly enough to provide a tight, friction-based seal. The inserts are installed inside your existing window frame with no fasteners required and last 5-10 years. They are most effective in the winter, but depending on the window’s exposure, they can sometimes be used in the summer to keep the house cooler.</w:t>
+      </w:r>
+      <w:r>
+        <w:t xml:space="preserve"> </w:t>
+      </w:r>
       <w:r>
         <w:rPr>
           <w:i/>
@@ -3837,17 +3513,21 @@
         <w:pStyle w:val="BodyText"/>
       </w:pPr>
       <w:r>
-        <w:t xml:space="preserve">We provide free LED light bulbs; contact us for some if we did not give you any during the audit. Depending on usage, LEDs can save more than $50 a year.</w:t>
+        <w:rPr>
+          <w:b/>
+          <w:bCs/>
+        </w:rPr>
+        <w:t xml:space="preserve">Reconsider this recommendation</w:t>
       </w:r>
     </w:p>
     <w:bookmarkEnd w:id="44"/>
-    <w:bookmarkStart w:id="45" w:name="window-dressers"/>
+    <w:bookmarkStart w:id="45" w:name="refrigerator"/>
     <w:p>
       <w:pPr>
         <w:pStyle w:val="Heading3"/>
       </w:pPr>
       <w:r>
-        <w:t xml:space="preserve">4.4 Window Dressers</w:t>
+        <w:t xml:space="preserve">4.4 Refrigerator</w:t>
       </w:r>
     </w:p>
     <w:p>
@@ -3867,7 +3547,19 @@
         <w:pStyle w:val="BodyText"/>
       </w:pPr>
       <w:r>
-        <w:t xml:space="preserve">Your windows are a source of heat loss, reduce your comfort due to cold surface temperatures, and may also cause moisture condensation or frost in the winter.</w:t>
+        <w:t xml:space="preserve">Your refrigerator uses more energy than newer models.</w:t>
+      </w:r>
+    </w:p>
+    <w:p>
+      <w:pPr>
+        <w:pStyle w:val="BodyText"/>
+      </w:pPr>
+      <w:r>
+        <w:rPr>
+          <w:b/>
+          <w:bCs/>
+        </w:rPr>
+        <w:t xml:space="preserve">Ideally, the auditor notes the annual energy consumption (kWh) of the existing fridge compared to a new model of similar size</w:t>
       </w:r>
     </w:p>
     <w:p>
@@ -3887,11 +3579,13 @@
         <w:pStyle w:val="BodyText"/>
       </w:pPr>
       <w:r>
-        <w:t xml:space="preserve">WindowDressers are insulating window inserts that help air-seal windows and reduce heat loss and gain. WindowDressers are transparent and let in light while stopping drafts. Each insert is made of a custom-made pine frame wrapped on each side with tightly sealed, clear polyolefin film, creating an airspace between the two layers for additional insulation. The insert is finished with a compressible foam weather seal. The foam allows enough give for the inserts to be easily slid into place in the fall and removed in the spring while holding firmly enough to provide a tight, friction-based seal. The inserts are installed inside your existing window frame with no fasteners required and last 5-10 years. They are most effective in the winter, but depending on the window’s exposure, they can sometimes be used in the summer to keep the house cooler.</w:t>
-      </w:r>
-      <w:r>
-        <w:t xml:space="preserve"> </w:t>
-      </w:r>
+        <w:t xml:space="preserve">Replace your refrigerator with a new, EnergyStar-certified fridge. Look at the Energy Guide label to compare the energy use of new refrigerators.</w:t>
+      </w:r>
+    </w:p>
+    <w:p>
+      <w:pPr>
+        <w:pStyle w:val="BodyText"/>
+      </w:pPr>
       <w:r>
         <w:rPr>
           <w:i/>
@@ -3905,45 +3599,29 @@
         <w:pStyle w:val="BodyText"/>
       </w:pPr>
       <w:r>
-        <w:t xml:space="preserve">Insulating window inserts save 5-10% of your heating costs at less than 1/10th the cost of replacement windows. The overall project cost will depend on the number and size of window inserts. Example prices for the 2024 season were: small (20 x 36”) - $36 for natural pine frame, $46 for white; medium (30 x 52”) - $50 for natural pine frame, $64 for white; large (44 x 68”) - $67 for natural pine frame, $88 for white. Adjusted pricing for lower-income households is available from WindowDressers upon request. If plastic is damaged, it can be replaced for $15.</w:t>
-      </w:r>
-    </w:p>
-    <w:p>
-      <w:pPr>
-        <w:pStyle w:val="BodyText"/>
-      </w:pPr>
-      <w:r>
-        <w:t xml:space="preserve">Households that order inserts are expected to participate in the Community Build where the inserts are made. You can sign up for a 4-hour shift and learn the simple steps in the insert-building process (no previous experience required, no power tools). Each job has</w:t>
-      </w:r>
-      <w:r>
-        <w:t xml:space="preserve"> </w:t>
-      </w:r>
-      <w:r>
-        <w:t xml:space="preserve">“jigs”</w:t>
-      </w:r>
-      <w:r>
-        <w:t xml:space="preserve"> </w:t>
-      </w:r>
-      <w:r>
-        <w:t xml:space="preserve">that make the job easier to do and ensure uniform quality. You will be trained at the beginning of your shift on how to do your task. Volunteering for multiple shifts is encouraged! Mid-shift snacks and a meal are provided to all participants.</w:t>
-      </w:r>
-    </w:p>
-    <w:p>
-      <w:pPr>
-        <w:pStyle w:val="BodyText"/>
-      </w:pPr>
-      <w:r>
-        <w:t xml:space="preserve">If you would like to participate, please contact us so we can discuss how the program works and which windows you’d like inserts for.</w:t>
+        <w:t xml:space="preserve">If you are able to afford the upfront cost of purchasing a new refrigerator, you will recoup significant savings in the long run. Whenever you need to buy a new appliance, consider EnergyStar certified models, which use less energy and are cheaper to run. Remember, it doesn’t save energy if you relocate your existing refrigerator to the basement or garage and continue using it.</w:t>
+      </w:r>
+    </w:p>
+    <w:p>
+      <w:pPr>
+        <w:pStyle w:val="BodyText"/>
+      </w:pPr>
+      <w:r>
+        <w:rPr>
+          <w:b/>
+          <w:bCs/>
+        </w:rPr>
+        <w:t xml:space="preserve">Ideally, auditor locates similar volume fridge online to calculate monthly savings and payback period compared to kill-a-watt meter reading for current refrigerator. “This example refrigerator would save $XX in electricity each month and pay for itself within XX months</w:t>
       </w:r>
     </w:p>
     <w:bookmarkEnd w:id="45"/>
-    <w:bookmarkStart w:id="46" w:name="heat-pump-water-heater"/>
+    <w:bookmarkStart w:id="46" w:name="gutters"/>
     <w:p>
       <w:pPr>
         <w:pStyle w:val="Heading3"/>
       </w:pPr>
       <w:r>
-        <w:t xml:space="preserve">4.5 Heat Pump Water Heater</w:t>
+        <w:t xml:space="preserve">4.5 Gutters</w:t>
       </w:r>
     </w:p>
     <w:p>
@@ -3963,11 +3641,7 @@
         <w:pStyle w:val="BodyText"/>
       </w:pPr>
       <w:r>
-        <w:rPr>
-          <w:b/>
-          <w:bCs/>
-        </w:rPr>
-        <w:t xml:space="preserve">Auditor to describe depending on what their current system is</w:t>
+        <w:t xml:space="preserve">The house has no gutters, so water runs off your roof and directly onto the ground next to your house. Water that splashes off the ground can damage the exterior of your house. Runoff that is absorbed into the ground can seep into the basement/crawlspace, causing moisture issues there and throughout your house.</w:t>
       </w:r>
     </w:p>
     <w:p>
@@ -3987,7 +3661,7 @@
         <w:pStyle w:val="BodyText"/>
       </w:pPr>
       <w:r>
-        <w:t xml:space="preserve">Install a heat pump water heater to provide your hot water for cooking and bathing. This is the most efficient way to heat water and will save hundreds of dollars a year compared to electric resistance, heating oil, or propane hot water. It will also help to dehumidify while it’s running. If your current water heater burns oil or propane, this will also remove a source of combustion gases from your home. We also recommend setting the temperature on the water heater at 130°F for more efficient operation.</w:t>
+        <w:t xml:space="preserve">Install gutters and downspouts that divert water at least six feet away from the foundation and to where the ground slopes away from the house.</w:t>
       </w:r>
     </w:p>
     <w:p>
@@ -4007,17 +3681,17 @@
         <w:pStyle w:val="BodyText"/>
       </w:pPr>
       <w:r>
-        <w:t xml:space="preserve">A heat pump water heater uses 70% less electricity than a standard electric water heater. Efficiency Maine offers a rebate of up to $950, making the equipment cost as little as $400 plus installation. The rebate can be combined with a nonrefundable federal tax credit of 30% of the remaining cost of the unit and labor, subject to an annual maximum benefit of $2,000 (shared with other energy property, like heat pumps). For more information, you can call Efficiency Maine at 866-376-2463 (Monday to Friday, 8:00 am to 5:00 pm) or visit their website: https://www.efficiencymaine.com/at-home/heat-pump-water-heater-program/</w:t>
+        <w:t xml:space="preserve">Adding gutters would mitigate moisture damage and save you from having to replace/fix other parts of the house.</w:t>
       </w:r>
     </w:p>
     <w:bookmarkEnd w:id="46"/>
-    <w:bookmarkStart w:id="47" w:name="gutters"/>
+    <w:bookmarkStart w:id="47" w:name="bathroom-exhaust-fans"/>
     <w:p>
       <w:pPr>
         <w:pStyle w:val="Heading3"/>
       </w:pPr>
       <w:r>
-        <w:t xml:space="preserve">4.6 Gutters</w:t>
+        <w:t xml:space="preserve">4.6 Bathroom exhaust fan(s)</w:t>
       </w:r>
     </w:p>
     <w:p>
@@ -4037,7 +3711,7 @@
         <w:pStyle w:val="BodyText"/>
       </w:pPr>
       <w:r>
-        <w:t xml:space="preserve">The house has no gutters, so water runs off your roof and directly onto the ground next to your house. Water that splashes off the ground can damage the exterior of your house. Runoff that is absorbed into the ground can seep into the basement/crawlspace, causing moisture issues there and throughout your house.</w:t>
+        <w:t xml:space="preserve">Currently, there is no bathroom exhaust fan, so moisture from the shower, toilet, and sink remains in the house, which can cause moisture issues such as mold.</w:t>
       </w:r>
     </w:p>
     <w:p>
@@ -4057,7 +3731,7 @@
         <w:pStyle w:val="BodyText"/>
       </w:pPr>
       <w:r>
-        <w:t xml:space="preserve">Install gutters and downspouts that divert water at least six feet away from the foundation and to where the ground slopes away from the house.</w:t>
+        <w:t xml:space="preserve">Install bathroom exhaust fans in all bathrooms that do not have them. These should be rated for at least 80 cubic feet per minute (CFM) if there is a shower. We recommend the Panasonic Whisper series or similar fans that don’t create excess noise. If the ductwork will run through the attic, it should be installed before the attic is air-sealed and insulated. The fan needs to be ducted outside, so it does not add moisture into the attic.</w:t>
       </w:r>
     </w:p>
     <w:p>
@@ -4077,17 +3751,17 @@
         <w:pStyle w:val="BodyText"/>
       </w:pPr>
       <w:r>
-        <w:t xml:space="preserve">Adding gutters would mitigate moisture damage and save you from having to replace/fix other parts of the house.</w:t>
+        <w:t xml:space="preserve">The typical fan is around $130 plus the cost of installation.</w:t>
       </w:r>
     </w:p>
     <w:bookmarkEnd w:id="47"/>
-    <w:bookmarkStart w:id="48" w:name="bathroom-exhaust-fans"/>
+    <w:bookmarkStart w:id="48" w:name="kitchen-exhaust-fans"/>
     <w:p>
       <w:pPr>
         <w:pStyle w:val="Heading3"/>
       </w:pPr>
       <w:r>
-        <w:t xml:space="preserve">4.7 Bathroom exhaust fan(s)</w:t>
+        <w:t xml:space="preserve">4.7 Kitchen exhaust fan(s)</w:t>
       </w:r>
     </w:p>
     <w:p>
@@ -4107,7 +3781,7 @@
         <w:pStyle w:val="BodyText"/>
       </w:pPr>
       <w:r>
-        <w:t xml:space="preserve">Currently, there is no bathroom exhaust fan, so moisture from the shower, toilet, and sink remains in the house, which can cause moisture issues such as mold.</w:t>
+        <w:t xml:space="preserve">Currently, there is no kitchen exhaust fan, so fumes, smoke, and moisture from cooking stay in the house which can cause health concerns.</w:t>
       </w:r>
     </w:p>
     <w:p>
@@ -4127,7 +3801,7 @@
         <w:pStyle w:val="BodyText"/>
       </w:pPr>
       <w:r>
-        <w:t xml:space="preserve">Install bathroom exhaust fans in all bathrooms that do not have them. These should be rated for at least 80 cubic feet per minute (CFM) if there is a shower. We recommend the Panasonic Whisper series or similar fans that don’t create excess noise. If the ductwork will run through the attic, it should be installed before the attic is air-sealed and insulated. The fan needs to be ducted outside, so it does not add moisture into the attic.</w:t>
+        <w:t xml:space="preserve">Install a kitchen exhaust fan to remove cooking fumes and moisture from your home. The fan should be rated for at least 100 cubic feet per minute. A kitchen fan should be ducted to the outdoors. If the ductwork will run through the attic, it should be installed before the attic is air-sealed and insulated.</w:t>
       </w:r>
     </w:p>
     <w:p>
@@ -4147,17 +3821,17 @@
         <w:pStyle w:val="BodyText"/>
       </w:pPr>
       <w:r>
-        <w:t xml:space="preserve">The typical fan is around $130 plus the cost of installation.</w:t>
+        <w:t xml:space="preserve">Kitchen range hoods typically cost $150 or more; installation costs depend on the complexity of the exhaust ducting.</w:t>
       </w:r>
     </w:p>
     <w:bookmarkEnd w:id="48"/>
-    <w:bookmarkStart w:id="49" w:name="kitchen-exhaust-fans"/>
+    <w:bookmarkStart w:id="49" w:name="attic-insulation-and-air-sealing"/>
     <w:p>
       <w:pPr>
         <w:pStyle w:val="Heading3"/>
       </w:pPr>
       <w:r>
-        <w:t xml:space="preserve">4.8 Kitchen exhaust fan(s)</w:t>
+        <w:t xml:space="preserve">4.8 Attic Insulation and Air Sealing</w:t>
       </w:r>
     </w:p>
     <w:p>
@@ -4177,7 +3851,7 @@
         <w:pStyle w:val="BodyText"/>
       </w:pPr>
       <w:r>
-        <w:t xml:space="preserve">Currently, there is no kitchen exhaust fan, so fumes, smoke, and moisture from cooking stay in the house which can cause health concerns.</w:t>
+        <w:t xml:space="preserve">The attic is uninsulated or is missing insulation and the attic could also benefit from air-sealing. These upgrades will reduce draftiness and heat loss in the winter and heat gain in the summer.</w:t>
       </w:r>
     </w:p>
     <w:p>
@@ -4197,7 +3871,24 @@
         <w:pStyle w:val="BodyText"/>
       </w:pPr>
       <w:r>
-        <w:t xml:space="preserve">Install a kitchen exhaust fan to remove cooking fumes and moisture from your home. The fan should be rated for at least 100 cubic feet per minute. A kitchen fan should be ducted to the outdoors. If the ductwork will run through the attic, it should be installed before the attic is air-sealed and insulated.</w:t>
+        <w:t xml:space="preserve">Air seal the attic and insulate it to at least R-60 (18 inches of loose-fill cellulose insulation). COA has been installing 24 inches (R-80) of cellulose insulation in attics on our campus. Before the attic is insulated, ensure that any needed bathroom and kitchen fans are installed and that all fans are properly vented to the outside.</w:t>
+      </w:r>
+    </w:p>
+    <w:p>
+      <w:pPr>
+        <w:pStyle w:val="BodyText"/>
+      </w:pPr>
+      <w:r>
+        <w:t xml:space="preserve">In older homes, most heat loss is due to air leakage. Air sealing is particularly important in the attic (and basement or crawlspace). As warm air rises and leaks out the top of your home, cold air is pulled in at the bottom. This is called the</w:t>
+      </w:r>
+      <w:r>
+        <w:t xml:space="preserve"> </w:t>
+      </w:r>
+      <w:r>
+        <w:t xml:space="preserve">‘stack effect’</w:t>
+      </w:r>
+      <w:r>
+        <w:t xml:space="preserve">, and is more pronounced in taller homes. Thus, air sealing is necessary anywhere gaps allow air to move between your house and the attic. This typically includes gaps around the chimney, electrical penetrations, and wall top plates.</w:t>
       </w:r>
     </w:p>
     <w:p>
@@ -4217,17 +3908,17 @@
         <w:pStyle w:val="BodyText"/>
       </w:pPr>
       <w:r>
-        <w:t xml:space="preserve">Kitchen range hoods typically cost $150 or more; installation costs depend on the complexity of the exhaust ducting.</w:t>
+        <w:t xml:space="preserve">Insulation projects are not eligible for federal or state funding in second homes that are not heated year round.</w:t>
       </w:r>
     </w:p>
     <w:bookmarkEnd w:id="49"/>
-    <w:bookmarkStart w:id="50" w:name="vapor-barrier"/>
+    <w:bookmarkStart w:id="50" w:name="blow-in-cellulose-wall-insulation"/>
     <w:p>
       <w:pPr>
         <w:pStyle w:val="Heading3"/>
       </w:pPr>
       <w:r>
-        <w:t xml:space="preserve">4.9 Vapor Barrier</w:t>
+        <w:t xml:space="preserve">4.9 Blow-in cellulose wall insulation</w:t>
       </w:r>
     </w:p>
     <w:p>
@@ -4247,7 +3938,7 @@
         <w:pStyle w:val="BodyText"/>
       </w:pPr>
       <w:r>
-        <w:t xml:space="preserve">There is excess moisture in the basement/crawlspace, which is evaporating out of the ground. This moisture can enter the house and cause mold, mildew, rot, and air quality issues.</w:t>
+        <w:t xml:space="preserve">The walls of the house are uninsulated, which is a significant source of heat loss.</w:t>
       </w:r>
     </w:p>
     <w:p>
@@ -4267,25 +3958,11 @@
         <w:pStyle w:val="BodyText"/>
       </w:pPr>
       <w:r>
-        <w:t xml:space="preserve">Install a vapor barrier on the basement floor to stop moisture from entering the basement and house. Vapor barriers typically consist of either reinforced plastic sheeting or EPDM rubber membrane over a</w:t>
+        <w:t xml:space="preserve">Insulate the wall stud cavities with dense packed, blown-in cellulose insulation. In balloon-framed homes, this can often be done from the attic, otherwise it can be done by drilling holes into the wall cavities from either the inside or outside.</w:t>
       </w:r>
       <w:r>
         <w:t xml:space="preserve"> </w:t>
       </w:r>
-      <w:r>
-        <w:t xml:space="preserve">‘dimple mat’</w:t>
-      </w:r>
-      <w:r>
-        <w:t xml:space="preserve"> </w:t>
-      </w:r>
-      <w:r>
-        <w:t xml:space="preserve">that allows for drainage below the vapor barrier and prevents rocks from puncturing it. If the basement/crawlspace walls are going to be spray foamed, we recommend the foam go all the way to the floor and overlap the vapor barrier to create a continuous air and moisture barrier.</w:t>
-      </w:r>
-    </w:p>
-    <w:p>
-      <w:pPr>
-        <w:pStyle w:val="BodyText"/>
-      </w:pPr>
       <w:r>
         <w:rPr>
           <w:i/>
@@ -4299,17 +3976,17 @@
         <w:pStyle w:val="BodyText"/>
       </w:pPr>
       <w:r>
-        <w:t xml:space="preserve">Efficiency Maine rebates will cover vapor barriers up to 25% of a weatherization project cost, if done as part of a larger insulation project. Most insulation companies can install spray foam and vapor barriers together. Efficiency Maine rebates and other incentives for insulation work can fund up to 80% of the overall cost to weatherize your home (subject to a lifetime limit per building), up to $9,200 when combined with nonrefundable federal tax credits. You can call them at 866-376-2463 (Monday to Friday, 8:00 am to 5:00 pm) or visit their webpage about insulation rebates: https://www.efficiencymaine.com/at-home/insulation-rebates/</w:t>
+        <w:t xml:space="preserve">Insulation projects are not eligible for federal or state funding in second homes that are not heated year round.</w:t>
       </w:r>
     </w:p>
     <w:bookmarkEnd w:id="50"/>
-    <w:bookmarkStart w:id="51" w:name="spray-foam-basement-walls"/>
+    <w:bookmarkStart w:id="51" w:name="air-source-heat-pump"/>
     <w:p>
       <w:pPr>
         <w:pStyle w:val="Heading3"/>
       </w:pPr>
       <w:r>
-        <w:t xml:space="preserve">4.10 Spray foam Basement Walls</w:t>
+        <w:t xml:space="preserve">4.10 Air Source Heat Pump</w:t>
       </w:r>
     </w:p>
     <w:p>
@@ -4329,7 +4006,7 @@
         <w:pStyle w:val="BodyText"/>
       </w:pPr>
       <w:r>
-        <w:t xml:space="preserve">The basement/crawlspace is uninsulated and used for mechanical equipment and plumbing. The walls are porous and allow moisture into the house and rapidly conduct heat out of the space.</w:t>
+        <w:t xml:space="preserve">Combustion heating equipment is expensive, inefficient, and has the potential to release harmful combustion gases like carbon monoxide into the home.</w:t>
       </w:r>
     </w:p>
     <w:p>
@@ -4349,24 +4026,7 @@
         <w:pStyle w:val="BodyText"/>
       </w:pPr>
       <w:r>
-        <w:t xml:space="preserve">Install spray foam on the basement/crawlspace walls to prevent moisture infiltration and reduce heat loss. In older homes, most heat loss is due to air leakage. Air sealing is particularly important in the basement or crawlspace (and attic). As warm air rises and leaks out the top of your home, cold air is pulled in at the bottom. This is called the</w:t>
-      </w:r>
-      <w:r>
-        <w:t xml:space="preserve"> </w:t>
-      </w:r>
-      <w:r>
-        <w:t xml:space="preserve">‘stack effect’</w:t>
-      </w:r>
-      <w:r>
-        <w:t xml:space="preserve">, and is more pronounced in taller homes. Thus, air sealing is necessary anywhere gaps allow air to move into your house through the basement/crawlspace.</w:t>
-      </w:r>
-    </w:p>
-    <w:p>
-      <w:pPr>
-        <w:pStyle w:val="BodyText"/>
-      </w:pPr>
-      <w:r>
-        <w:t xml:space="preserve">Spray foam should be applied 2-3 inches thick on the walls to seal and insulate them. It is often ideal to install a vapor barrier at the same time as the spray foam insulation. Spray foam generally requires a layer of intumescent (fire-rated) paint over it to meet fire code.</w:t>
+        <w:t xml:space="preserve">Install air source heat pumps for heating and cooling and whole-house surge protection. Air source heat pumps can be up to 300% efficient and heat, cool, and dehumidify your house. A qualified installer will help determine what size system to install and where. Whole-house surge protection will protect your appliances and heat pumps from being damaged by an electrical surge.</w:t>
       </w:r>
     </w:p>
     <w:p>
@@ -4386,17 +4046,18 @@
         <w:pStyle w:val="BodyText"/>
       </w:pPr>
       <w:r>
-        <w:t xml:space="preserve">Installation of spray foam insulation will cost around $5-7 per square foot. Efficiency Maine rebates and other incentives for insulation work can fund up to 80% of the project cost (subject to a lifetime limit per building), up to $9,200 when combined with nonrefundable federal tax credits. You can call them at 866-376-2463 (Monday to Friday, 8:00 am to 5:00 pm) or visit their webpage about insulation rebates: https://www.efficiencymaine.com/at-home/insulation-rebates/</w:t>
+        <w:t xml:space="preserve">Efficiency Maine rebates can fund $1,000 per unit up to a lifetime limit per housing unit for $3,000 (depending on income level) to install heat pumps in second homes. The rebate can be combined with a nonrefundable federal tax credit of 30% of the remaining cost of the unit and labor, subject to an annual maximum benefit of $2,000 (shared with other energy property, like a heat pump water heater). You can call Efficiency Maine at 866-376-2463 (Monday to Friday, 8:00 am to 5:00 pm) or visit their website: https://www.efficiencymaine.com/at-home/residential-heat-pump-incentives/</w:t>
       </w:r>
     </w:p>
     <w:bookmarkEnd w:id="51"/>
-    <w:bookmarkStart w:id="52" w:name="attic-insulation-and-air-sealing"/>
-    <w:p>
-      <w:pPr>
-        <w:pStyle w:val="Heading3"/>
-      </w:pPr>
-      <w:r>
-        <w:t xml:space="preserve">4.11 Attic Insulation and Air Sealing</w:t>
+    <w:bookmarkEnd w:id="52"/>
+    <w:bookmarkStart w:id="53" w:name="additional-resources"/>
+    <w:p>
+      <w:pPr>
+        <w:pStyle w:val="Heading2"/>
+      </w:pPr>
+      <w:r>
+        <w:t xml:space="preserve">5 Additional Resources</w:t>
       </w:r>
     </w:p>
     <w:p>
@@ -4404,496 +4065,26 @@
         <w:pStyle w:val="FirstParagraph"/>
       </w:pPr>
       <w:r>
-        <w:rPr>
-          <w:i/>
-          <w:iCs/>
-        </w:rPr>
-        <w:t xml:space="preserve">Problem</w:t>
-      </w:r>
-    </w:p>
-    <w:p>
-      <w:pPr>
-        <w:pStyle w:val="BodyText"/>
-      </w:pPr>
-      <w:r>
-        <w:t xml:space="preserve">The attic is uninsulated or is missing insulation and the attic could also benefit from air-sealing. These upgrades will reduce draftiness and heat loss in the winter and heat gain in the summer.</w:t>
-      </w:r>
-    </w:p>
-    <w:p>
-      <w:pPr>
-        <w:pStyle w:val="BodyText"/>
-      </w:pPr>
-      <w:r>
-        <w:rPr>
-          <w:i/>
-          <w:iCs/>
-        </w:rPr>
-        <w:t xml:space="preserve">Recommendation</w:t>
-      </w:r>
-    </w:p>
-    <w:p>
-      <w:pPr>
-        <w:pStyle w:val="BodyText"/>
-      </w:pPr>
-      <w:r>
-        <w:t xml:space="preserve">Air seal the attic and insulate it to at least R-60 (18 inches of loose-fill cellulose insulation). COA has been installing 24 inches (R-80) of cellulose insulation in attics on our campus. Before the attic is insulated, ensure that any needed bathroom and kitchen fans are installed and that all fans are properly vented to the outside.</w:t>
-      </w:r>
-    </w:p>
-    <w:p>
-      <w:pPr>
-        <w:pStyle w:val="BodyText"/>
-      </w:pPr>
-      <w:r>
-        <w:t xml:space="preserve">In older homes, most heat loss is due to air leakage. Air sealing is particularly important in the attic (and basement or crawlspace). As warm air rises and leaks out the top of your home, cold air is pulled in at the bottom. This is called the</w:t>
-      </w:r>
-      <w:r>
-        <w:t xml:space="preserve"> </w:t>
-      </w:r>
-      <w:r>
-        <w:t xml:space="preserve">‘stack effect’</w:t>
-      </w:r>
-      <w:r>
-        <w:t xml:space="preserve">, and is more pronounced in taller homes. Thus, air sealing is necessary anywhere gaps allow air to move between your house and the attic. This typically includes gaps around the chimney, electrical penetrations, and wall top plates.</w:t>
-      </w:r>
-    </w:p>
-    <w:p>
-      <w:pPr>
-        <w:pStyle w:val="BodyText"/>
-      </w:pPr>
-      <w:r>
-        <w:rPr>
-          <w:i/>
-          <w:iCs/>
-        </w:rPr>
-        <w:t xml:space="preserve">Estimated Cost/Benefits/Incentives</w:t>
-      </w:r>
-    </w:p>
-    <w:p>
-      <w:pPr>
-        <w:pStyle w:val="BodyText"/>
-      </w:pPr>
-      <w:r>
-        <w:t xml:space="preserve">Efficiency Maine rebates and other incentives for insulation work can fund up to 80% of the overall cost to weatherize your home (subject to a lifetime limit per building), up to $9,200 when combined with nonrefundable federal tax credits. You can call them at 866-376-2463 (Monday to Friday, 8:00 am to 5:00 pm) or visit their webpage about insulation rebates: https://www.efficiencymaine.com/at-home/insulation-rebates/</w:t>
-      </w:r>
-    </w:p>
-    <w:bookmarkEnd w:id="52"/>
-    <w:bookmarkStart w:id="53" w:name="blow-in-cellulose-wall-insulation"/>
-    <w:p>
-      <w:pPr>
-        <w:pStyle w:val="Heading3"/>
-      </w:pPr>
-      <w:r>
-        <w:t xml:space="preserve">4.12 Blow-in cellulose wall insulation</w:t>
-      </w:r>
-    </w:p>
-    <w:p>
-      <w:pPr>
-        <w:pStyle w:val="FirstParagraph"/>
-      </w:pPr>
-      <w:r>
-        <w:rPr>
-          <w:i/>
-          <w:iCs/>
-        </w:rPr>
-        <w:t xml:space="preserve">Problem</w:t>
-      </w:r>
-    </w:p>
-    <w:p>
-      <w:pPr>
-        <w:pStyle w:val="BodyText"/>
-      </w:pPr>
-      <w:r>
-        <w:t xml:space="preserve">The walls of the house are uninsulated, which is a significant source of heat loss.</w:t>
-      </w:r>
-    </w:p>
-    <w:p>
-      <w:pPr>
-        <w:pStyle w:val="BodyText"/>
-      </w:pPr>
-      <w:r>
-        <w:rPr>
-          <w:i/>
-          <w:iCs/>
-        </w:rPr>
-        <w:t xml:space="preserve">Recommendation</w:t>
-      </w:r>
-    </w:p>
-    <w:p>
-      <w:pPr>
-        <w:pStyle w:val="BodyText"/>
-      </w:pPr>
-      <w:r>
-        <w:t xml:space="preserve">Insulate the wall stud cavities with dense packed, blown-in cellulose insulation. In balloon-framed homes, this can often be done from the attic, otherwise it can be done by drilling holes into the wall cavities from either the inside or outside.</w:t>
-      </w:r>
-      <w:r>
-        <w:t xml:space="preserve"> </w:t>
-      </w:r>
-      <w:r>
-        <w:rPr>
-          <w:i/>
-          <w:iCs/>
-        </w:rPr>
-        <w:t xml:space="preserve">Estimated Cost/Benefits/Incentives</w:t>
-      </w:r>
-    </w:p>
-    <w:p>
-      <w:pPr>
-        <w:pStyle w:val="BodyText"/>
-      </w:pPr>
-      <w:r>
-        <w:t xml:space="preserve">Efficiency Maine rebates and other incentives for insulation work can fund up to 80% of the overall cost to weatherize your home (subject to a lifetime limit per building), up to $9,200 when combined with nonrefundable federal tax credits. You can call them at 866-376-2463 (Monday to Friday, 8:00 am to 5:00 pm) or visit their webpage about insulation rebates: https://www.efficiencymaine.com/at-home/insulation-rebates/</w:t>
+        <w:t xml:space="preserve">Many home efficiency upgrades are eligible for Efficiency Maine rebates and federal tax credits. Financial incentives vary based on income level and type of occupancy. An overview of all state rebates and federal tax credits can be found here: https://www.efficiencymaine.com/at-home/.</w:t>
+      </w:r>
+    </w:p>
+    <w:p>
+      <w:pPr>
+        <w:pStyle w:val="BodyText"/>
+      </w:pPr>
+      <w:r>
+        <w:t xml:space="preserve">You can search for Efficiency Maine registered contractors here: https://www.efficiencymaine.com/at-home/vendor-locator/.</w:t>
+      </w:r>
+    </w:p>
+    <w:p>
+      <w:pPr>
+        <w:pStyle w:val="BodyText"/>
+      </w:pPr>
+      <w:r>
+        <w:t xml:space="preserve">We recommend discussing a whole-home plan for insulation and air sealing work in the basement, walls, and attic with contractors to determine how to best sequence the work to take full advantage of the Efficiency Maine rebates (which are subject to lifetime maximums) and nonrefundable federal tax credits (which are subject to annual maximums).</w:t>
       </w:r>
     </w:p>
     <w:bookmarkEnd w:id="53"/>
-    <w:bookmarkStart w:id="54" w:name="continuous-exterior-wall-insulation"/>
-    <w:p>
-      <w:pPr>
-        <w:pStyle w:val="Heading3"/>
-      </w:pPr>
-      <w:r>
-        <w:t xml:space="preserve">4.13 Continuous exterior wall insulation</w:t>
-      </w:r>
-    </w:p>
-    <w:p>
-      <w:pPr>
-        <w:pStyle w:val="FirstParagraph"/>
-      </w:pPr>
-      <w:r>
-        <w:rPr>
-          <w:i/>
-          <w:iCs/>
-        </w:rPr>
-        <w:t xml:space="preserve">Problem</w:t>
-      </w:r>
-    </w:p>
-    <w:p>
-      <w:pPr>
-        <w:pStyle w:val="BodyText"/>
-      </w:pPr>
-      <w:r>
-        <w:t xml:space="preserve">There isn’t continuous insulation between the siding and the exterior walls of the house. Continuous insulation helps create a complete thermal boundary for your house, and it is now an energy code requirement for new houses.</w:t>
-      </w:r>
-    </w:p>
-    <w:p>
-      <w:pPr>
-        <w:pStyle w:val="BodyText"/>
-      </w:pPr>
-      <w:r>
-        <w:rPr>
-          <w:i/>
-          <w:iCs/>
-        </w:rPr>
-        <w:t xml:space="preserve">Recommendation</w:t>
-      </w:r>
-    </w:p>
-    <w:p>
-      <w:pPr>
-        <w:pStyle w:val="BodyText"/>
-      </w:pPr>
-      <w:r>
-        <w:t xml:space="preserve">Add a continuous layer of insulation and potentially replace the air and moisture barrier once it becomes time to replace the siding. Add continuous insulation (R-6 or more) under the new siding to keep the house warmer in the winter and cooler in the summer. We recommend TimberHP TimberBoard insulation (produced in Madison, Maine) or Rockwool Comfortboard, but foam board can also be used. Before installing exterior insulation, the contractor can check if insulation is needed between the interior wall studs.</w:t>
-      </w:r>
-    </w:p>
-    <w:p>
-      <w:pPr>
-        <w:pStyle w:val="BodyText"/>
-      </w:pPr>
-      <w:r>
-        <w:rPr>
-          <w:i/>
-          <w:iCs/>
-        </w:rPr>
-        <w:t xml:space="preserve">Estimated Cost/Benefits/Incentives</w:t>
-      </w:r>
-    </w:p>
-    <w:p>
-      <w:pPr>
-        <w:pStyle w:val="BodyText"/>
-      </w:pPr>
-      <w:r>
-        <w:t xml:space="preserve">Efficiency Maine rebates and other incentives for insulation work can fund up to 80% of the overall cost to weatherize your home (subject to a lifetime limit per building), up to $9,200 when combined with nonrefundable federal tax credits. You can call them at 866-376-2463 (Monday to Friday, 8:00 am to 5:00 pm) or visit their webpage about insulation rebates: https://www.efficiencymaine.com/at-home/insulation-rebates/</w:t>
-      </w:r>
-    </w:p>
-    <w:bookmarkEnd w:id="54"/>
-    <w:bookmarkStart w:id="55" w:name="pipe-insulation"/>
-    <w:p>
-      <w:pPr>
-        <w:pStyle w:val="Heading3"/>
-      </w:pPr>
-      <w:r>
-        <w:t xml:space="preserve">4.14 Pipe Insulation</w:t>
-      </w:r>
-    </w:p>
-    <w:p>
-      <w:pPr>
-        <w:pStyle w:val="FirstParagraph"/>
-      </w:pPr>
-      <w:r>
-        <w:rPr>
-          <w:i/>
-          <w:iCs/>
-        </w:rPr>
-        <w:t xml:space="preserve">Problem</w:t>
-      </w:r>
-    </w:p>
-    <w:p>
-      <w:pPr>
-        <w:pStyle w:val="BodyText"/>
-      </w:pPr>
-      <w:r>
-        <w:t xml:space="preserve">Uninsulated water pipes are responsible for heat loss and excess moisture (from condensation) in your basement/crawlspace.</w:t>
-      </w:r>
-    </w:p>
-    <w:p>
-      <w:pPr>
-        <w:pStyle w:val="BodyText"/>
-      </w:pPr>
-      <w:r>
-        <w:rPr>
-          <w:i/>
-          <w:iCs/>
-        </w:rPr>
-        <w:t xml:space="preserve">Recommendation</w:t>
-      </w:r>
-    </w:p>
-    <w:p>
-      <w:pPr>
-        <w:pStyle w:val="BodyText"/>
-      </w:pPr>
-      <w:r>
-        <w:t xml:space="preserve">Insulate both hot and cold water pipes that are uninsulated in the basement/crawlspace. This will save energy and prevent condensation. We recommend foam pipe insulation made of polyethylene or neoprene.</w:t>
-      </w:r>
-    </w:p>
-    <w:p>
-      <w:pPr>
-        <w:pStyle w:val="BodyText"/>
-      </w:pPr>
-      <w:r>
-        <w:rPr>
-          <w:i/>
-          <w:iCs/>
-        </w:rPr>
-        <w:t xml:space="preserve">Estimated Cost/Benefits/Incentives</w:t>
-      </w:r>
-    </w:p>
-    <w:p>
-      <w:pPr>
-        <w:pStyle w:val="BodyText"/>
-      </w:pPr>
-      <w:r>
-        <w:t xml:space="preserve">Insulating water pipes can save 2%-4% on hot water bills and increase the temperature of the water while reducing the time it takes for hot water to reach your tap. Materials cost around $100-200, depending on the length of pipe to insulate. Many people find this to be an easy project to do themselves.</w:t>
-      </w:r>
-    </w:p>
-    <w:bookmarkEnd w:id="55"/>
-    <w:bookmarkStart w:id="56" w:name="diy-air-sealing"/>
-    <w:p>
-      <w:pPr>
-        <w:pStyle w:val="Heading3"/>
-      </w:pPr>
-      <w:r>
-        <w:t xml:space="preserve">4.15 DIY Air Sealing</w:t>
-      </w:r>
-    </w:p>
-    <w:p>
-      <w:pPr>
-        <w:pStyle w:val="FirstParagraph"/>
-      </w:pPr>
-      <w:r>
-        <w:rPr>
-          <w:i/>
-          <w:iCs/>
-        </w:rPr>
-        <w:t xml:space="preserve">Problem</w:t>
-      </w:r>
-    </w:p>
-    <w:p>
-      <w:pPr>
-        <w:pStyle w:val="BodyText"/>
-      </w:pPr>
-      <w:r>
-        <w:t xml:space="preserve">During the blower door test, we noted sources of air leakage in the living areas of your house.</w:t>
-      </w:r>
-    </w:p>
-    <w:p>
-      <w:pPr>
-        <w:pStyle w:val="BodyText"/>
-      </w:pPr>
-      <w:r>
-        <w:rPr>
-          <w:b/>
-          <w:bCs/>
-        </w:rPr>
-        <w:t xml:space="preserve">Auditor to detail customized findings.</w:t>
-      </w:r>
-      <w:r>
-        <w:rPr>
-          <w:b/>
-          <w:bCs/>
-        </w:rPr>
-        <w:t xml:space="preserve"> </w:t>
-      </w:r>
-    </w:p>
-    <w:p>
-      <w:pPr>
-        <w:pStyle w:val="BodyText"/>
-      </w:pPr>
-      <w:r>
-        <w:rPr>
-          <w:i/>
-          <w:iCs/>
-        </w:rPr>
-        <w:t xml:space="preserve">Recommendation</w:t>
-      </w:r>
-    </w:p>
-    <w:p>
-      <w:pPr>
-        <w:pStyle w:val="BodyText"/>
-      </w:pPr>
-      <w:r>
-        <w:t xml:space="preserve">Air sealing the air leaks we identified around the living areas of your house can be a DIY solution to lower energy use, or an insulation contractor can seal the leaks when they come to your house for a larger project. Please address any moisture concerns before undertaking significant air sealing efforts.</w:t>
-      </w:r>
-    </w:p>
-    <w:p>
-      <w:pPr>
-        <w:pStyle w:val="BodyText"/>
-      </w:pPr>
-      <w:r>
-        <w:rPr>
-          <w:i/>
-          <w:iCs/>
-        </w:rPr>
-        <w:t xml:space="preserve">Estimated Cost/Benefits/Incentives</w:t>
-      </w:r>
-    </w:p>
-    <w:p>
-      <w:pPr>
-        <w:pStyle w:val="BodyText"/>
-      </w:pPr>
-      <w:r>
-        <w:t xml:space="preserve">Air sealing and insulating ductwork is eligible for a non-refundable federal tax credit (</w:t>
-      </w:r>
-      <w:r>
-        <w:t xml:space="preserve">“Energy Efficient Home Improvement Credit”</w:t>
-      </w:r>
-      <w:r>
-        <w:t xml:space="preserve">), which can pay for 30% of the project cost, subject to an annual maximum of $1,200 (shared with other home envelope improvements, like attic and basement projects).</w:t>
-      </w:r>
-    </w:p>
-    <w:bookmarkEnd w:id="56"/>
-    <w:bookmarkStart w:id="57" w:name="ductwork-air-sealing-and-insulation"/>
-    <w:p>
-      <w:pPr>
-        <w:pStyle w:val="Heading3"/>
-      </w:pPr>
-      <w:r>
-        <w:t xml:space="preserve">4.16 Ductwork Air Sealing and Insulation</w:t>
-      </w:r>
-    </w:p>
-    <w:p>
-      <w:pPr>
-        <w:pStyle w:val="FirstParagraph"/>
-      </w:pPr>
-      <w:r>
-        <w:rPr>
-          <w:i/>
-          <w:iCs/>
-        </w:rPr>
-        <w:t xml:space="preserve">Problem</w:t>
-      </w:r>
-    </w:p>
-    <w:p>
-      <w:pPr>
-        <w:pStyle w:val="BodyText"/>
-      </w:pPr>
-      <w:r>
-        <w:t xml:space="preserve">The furnace supply ductwork running through the basement would be more efficient if it were air sealed and insulated. The heated air from the furnace loses a lot of heat to the surroundings on its way to the living space.</w:t>
-      </w:r>
-    </w:p>
-    <w:p>
-      <w:pPr>
-        <w:pStyle w:val="BodyText"/>
-      </w:pPr>
-      <w:r>
-        <w:rPr>
-          <w:i/>
-          <w:iCs/>
-        </w:rPr>
-        <w:t xml:space="preserve">Recommendation</w:t>
-      </w:r>
-    </w:p>
-    <w:p>
-      <w:pPr>
-        <w:pStyle w:val="BodyText"/>
-      </w:pPr>
-      <w:r>
-        <w:t xml:space="preserve">Air seal and insulate all of the supply and return ductwork running through the basement/crawlspace. Air sealing should be completed first, and can be done with either UL 181 foil-faced tape, duct mastic, or by hiring a contractor that has equipment to Aeroseal the ductwork (https://aeroseal.com/find-a-pro/). For insulation, we recommend using foil-faced fiberglass batts. Foil-faced bubble wrap can also be used. It is important to air seal the ducts properly before insulating. Otherwise, the heat will bypass the insulation, making the insulation ineffective.</w:t>
-      </w:r>
-      <w:r>
-        <w:rPr>
-          <w:i/>
-          <w:iCs/>
-        </w:rPr>
-        <w:t xml:space="preserve">Estimated Costs/Benefits/Incentives</w:t>
-      </w:r>
-    </w:p>
-    <w:p>
-      <w:pPr>
-        <w:pStyle w:val="BodyText"/>
-      </w:pPr>
-      <w:r>
-        <w:t xml:space="preserve">Air sealing and insulating ductwork is eligible for a non-refundable federal tax credit (</w:t>
-      </w:r>
-      <w:r>
-        <w:t xml:space="preserve">“Energy Efficient Home Improvement Credit”</w:t>
-      </w:r>
-      <w:r>
-        <w:t xml:space="preserve">), which can pay for 30% of the project cost, subject to an annual maximum of $1,200 (shared with other home envelope improvements, like attic and basement projects).</w:t>
-      </w:r>
-    </w:p>
-    <w:bookmarkEnd w:id="57"/>
-    <w:bookmarkEnd w:id="58"/>
-    <w:bookmarkStart w:id="59" w:name="additional-resources"/>
-    <w:p>
-      <w:pPr>
-        <w:pStyle w:val="Heading2"/>
-      </w:pPr>
-      <w:r>
-        <w:t xml:space="preserve">5 Additional Resources</w:t>
-      </w:r>
-    </w:p>
-    <w:p>
-      <w:pPr>
-        <w:pStyle w:val="FirstParagraph"/>
-      </w:pPr>
-      <w:r>
-        <w:t xml:space="preserve">Many home efficiency upgrades are eligible for Efficiency Maine rebates and federal tax credits. Financial incentives vary based on income level and type of occupancy. An overview of all state rebates and federal tax credits can be found here: https://www.efficiencymaine.com/at-home/.</w:t>
-      </w:r>
-    </w:p>
-    <w:p>
-      <w:pPr>
-        <w:pStyle w:val="BodyText"/>
-      </w:pPr>
-      <w:r>
-        <w:t xml:space="preserve">You can search for Efficiency Maine registered contractors here: https://www.efficiencymaine.com/at-home/vendor-locator/.</w:t>
-      </w:r>
-    </w:p>
-    <w:p>
-      <w:pPr>
-        <w:pStyle w:val="BodyText"/>
-      </w:pPr>
-      <w:r>
-        <w:t xml:space="preserve">We recommend discussing a whole-home plan for insulation and air sealing work in the basement, walls, and attic with contractors to determine how to best sequence the work to take full advantage of the Efficiency Maine rebates (which are subject to lifetime maximums) and nonrefundable federal tax credits (which are subject to annual maximums).</w:t>
-      </w:r>
-    </w:p>
-    <w:p>
-      <w:pPr>
-        <w:pStyle w:val="BodyText"/>
-      </w:pPr>
-      <w:r>
-        <w:t xml:space="preserve">Efficiency Maine also offers home energy loans to help homeowners who are Maine residents pay for energy and related health and safety upgrades. There are no fees, and interest rates for multi-year loans are between 5.99% (max $7,500) and 7.99% (max $25,000), depending on income level. Low- and moderate-income homeowners who borrow the full $7,500 and pay it back over 10 years will pay a monthly cost of $83. There is also a 1-year, 0% APR option. To learn more or apply, call 866-376-2463 or visit https://www.efficiencymaine.com/home-energy-loans/</w:t>
-      </w:r>
-    </w:p>
-    <w:bookmarkEnd w:id="59"/>
     <w:sectPr>
       <w:footerReference r:id="rId9" w:type="default"/>
       <w:pgSz w:h="15840" w:w="12240"/>

</xml_diff>

<commit_message>
change standard formatting and language
</commit_message>
<xml_diff>
--- a/Quarto_report/Audit_Report.docx
+++ b/Quarto_report/Audit_Report.docx
@@ -15,47 +15,107 @@
         <w:pStyle w:val="FirstParagraph"/>
       </w:pPr>
       <w:r>
-        <w:t xml:space="preserve">Homeowner(s): Don Weinreich, Barbara Weinreich</w:t>
-      </w:r>
-    </w:p>
-    <w:p>
-      <w:pPr>
-        <w:pStyle w:val="BodyText"/>
-      </w:pPr>
-      <w:r>
-        <w:t xml:space="preserve">Address: 178 Cranberry Road, Cranberry Isle Me, 04625</w:t>
-      </w:r>
-    </w:p>
-    <w:p>
-      <w:pPr>
-        <w:pStyle w:val="BodyText"/>
-      </w:pPr>
-      <w:r>
-        <w:t xml:space="preserve">Owner Contact: NA</w:t>
-      </w:r>
-    </w:p>
-    <w:p>
-      <w:pPr>
-        <w:pStyle w:val="BodyText"/>
-      </w:pPr>
-      <w:r>
-        <w:t xml:space="preserve">Auditors: Uriel Orozco Brenes, Zoe Duni</w:t>
-      </w:r>
-    </w:p>
-    <w:p>
-      <w:pPr>
-        <w:pStyle w:val="BodyText"/>
-      </w:pPr>
-      <w:r>
-        <w:t xml:space="preserve">Contact: David Gibson, dgibson@coa.edu, (802) 266-0301</w:t>
-      </w:r>
-    </w:p>
-    <w:p>
-      <w:pPr>
-        <w:pStyle w:val="BodyText"/>
-      </w:pPr>
-      <w:r>
-        <w:t xml:space="preserve">Report Date: July 10, 2025</w:t>
+        <w:rPr>
+          <w:b/>
+          <w:bCs/>
+        </w:rPr>
+        <w:t xml:space="preserve">Homeowner(s):</w:t>
+      </w:r>
+      <w:r>
+        <w:t xml:space="preserve"> </w:t>
+      </w:r>
+      <w:r>
+        <w:t xml:space="preserve">Don Weinreich, Barbara Weinreich</w:t>
+      </w:r>
+    </w:p>
+    <w:p>
+      <w:pPr>
+        <w:pStyle w:val="BodyText"/>
+      </w:pPr>
+      <w:r>
+        <w:rPr>
+          <w:b/>
+          <w:bCs/>
+        </w:rPr>
+        <w:t xml:space="preserve">Address:</w:t>
+      </w:r>
+      <w:r>
+        <w:t xml:space="preserve"> </w:t>
+      </w:r>
+      <w:r>
+        <w:t xml:space="preserve">178 Cranberry Road, Cranberry Isle Me, 04625</w:t>
+      </w:r>
+    </w:p>
+    <w:p>
+      <w:pPr>
+        <w:pStyle w:val="BodyText"/>
+      </w:pPr>
+      <w:r>
+        <w:rPr>
+          <w:b/>
+          <w:bCs/>
+        </w:rPr>
+        <w:t xml:space="preserve">Owner Contact:</w:t>
+      </w:r>
+      <w:r>
+        <w:t xml:space="preserve"> </w:t>
+      </w:r>
+      <w:r>
+        <w:t xml:space="preserve">NA</w:t>
+      </w:r>
+    </w:p>
+    <w:p>
+      <w:pPr>
+        <w:pStyle w:val="BodyText"/>
+      </w:pPr>
+      <w:r>
+        <w:rPr>
+          <w:b/>
+          <w:bCs/>
+        </w:rPr>
+        <w:t xml:space="preserve">Auditors:</w:t>
+      </w:r>
+      <w:r>
+        <w:t xml:space="preserve"> </w:t>
+      </w:r>
+      <w:r>
+        <w:t xml:space="preserve">Uriel Orozco Brenes, Zoe Duni</w:t>
+      </w:r>
+    </w:p>
+    <w:p>
+      <w:pPr>
+        <w:pStyle w:val="BodyText"/>
+      </w:pPr>
+      <w:r>
+        <w:rPr>
+          <w:b/>
+          <w:bCs/>
+        </w:rPr>
+        <w:t xml:space="preserve">Contact:</w:t>
+      </w:r>
+      <w:r>
+        <w:t xml:space="preserve"> </w:t>
+      </w:r>
+      <w:r>
+        <w:t xml:space="preserve">David Gibson, dgibson@coa.edu, (802) 266-0301</w:t>
+      </w:r>
+    </w:p>
+    <w:p>
+      <w:pPr>
+        <w:pStyle w:val="BodyText"/>
+      </w:pPr>
+      <w:r>
+        <w:rPr>
+          <w:b/>
+          <w:bCs/>
+        </w:rPr>
+        <w:t xml:space="preserve">Report Date:</w:t>
+      </w:r>
+      <w:r>
+        <w:t xml:space="preserve"> </w:t>
+      </w:r>
+      <w:r>
+        <w:t xml:space="preserve">July 10, 2025</w:t>
       </w:r>
     </w:p>
     <w:p>
@@ -1065,7 +1125,7 @@
                 <w:rFonts w:ascii="Calibri" w:hAnsi="Calibri"/>
                 <w:sz w:val="20"/>
               </w:rPr>
-              <w:t xml:space="default">Number of floors</w:t>
+              <w:t xml:space="default">Number of floors:</w:t>
             </w:r>
           </w:p>
         </w:tc>
@@ -1718,7 +1778,7 @@
                 <w:rFonts w:ascii="Calibri" w:hAnsi="Calibri"/>
                 <w:sz w:val="20"/>
               </w:rPr>
-              <w:t xml:space="default">The framing type of the home is balloon framing, which means the wall cavities extend the full height of the building (from the foundation to the roof). Often the wall cavities are interconnected with the floor and ceiling cavities. This framing type can create connected passageways for air to leave the house and rodents to enter the house. There is Batts of Fiberglass, Uninsulated insulation NA inches thick in NA condition. The addition is insulated with fiberglass batts, while the rest of the home is uninsulated.</w:t>
+              <w:t xml:space="default">The house has balloon framing, which means the wall cavities extend the full height of the building (from the foundation to the roof). These wall cavities are often interconnected with the floor and ceiling cavities. This framing type can create connected passageways for air to leave the house and rodents to enter the house. There is Batts of Fiberglass, Uninsulated insulation NA inches thick in NA condition. The addition is insulated with fiberglass batts, while the rest of the home is uninsulated.</w:t>
             </w:r>
           </w:p>
         </w:tc>
@@ -2298,6 +2358,18 @@
         <w:pStyle w:val="BodyText"/>
       </w:pPr>
       <w:r>
+        <w:rPr>
+          <w:i/>
+          <w:iCs/>
+        </w:rPr>
+        <w:t xml:space="preserve">Your house compared to standards</w:t>
+      </w:r>
+    </w:p>
+    <w:p>
+      <w:pPr>
+        <w:pStyle w:val="BodyText"/>
+      </w:pPr>
+      <w:r>
         <w:t xml:space="preserve">Using a thermal imaging camera, we looked for major air leakage locations and thermal bridging. Thermal bridging occurs when heat enters or leaves a house through material that lets heat through more easily than the house’s insulation. This often occurs with wall studs and ceiling joists.</w:t>
       </w:r>
     </w:p>
@@ -2355,7 +2427,7 @@
                 <w:rFonts w:ascii="Calibri" w:hAnsi="Calibri"/>
                 <w:sz w:val="20"/>
               </w:rPr>
-              <w:t xml:space="default">Area (sq ft):</w:t>
+              <w:t xml:space="default">Area:</w:t>
             </w:r>
           </w:p>
         </w:tc>
@@ -2749,7 +2821,7 @@
                 <w:rFonts w:ascii="Calibri" w:hAnsi="Calibri"/>
                 <w:sz w:val="20"/>
               </w:rPr>
-              <w:t xml:space="default">Area (sq ft):</w:t>
+              <w:t xml:space="default">Area:</w:t>
             </w:r>
           </w:p>
         </w:tc>

</xml_diff>

<commit_message>
Change formatting and wording for sections 3.1 and 3.2 ; add page breaks
</commit_message>
<xml_diff>
--- a/Quarto_report/Audit_Report.docx
+++ b/Quarto_report/Audit_Report.docx
@@ -115,7 +115,7 @@
         <w:t xml:space="preserve"> </w:t>
       </w:r>
       <w:r>
-        <w:t xml:space="preserve">July 10, 2025</w:t>
+        <w:t xml:space="preserve">July 11, 2025</w:t>
       </w:r>
     </w:p>
     <w:p>
@@ -188,6 +188,11 @@
       </w:r>
     </w:p>
     <w:p>
+      <w:r>
+        <w:br w:type="page"/>
+      </w:r>
+    </w:p>
+    <w:p>
       <w:pPr>
         <w:pStyle w:val="BodyText"/>
       </w:pPr>
@@ -199,6 +204,11 @@
         <w:t xml:space="preserve">Add here the table of content: in Word go to references and add table of content, in Docs go to the insert and on the bottom add the table of context</w:t>
       </w:r>
     </w:p>
+    <w:p>
+      <w:r>
+        <w:br w:type="page"/>
+      </w:r>
+    </w:p>
     <w:bookmarkStart w:id="28" w:name="summary-of-your-audit"/>
     <w:p>
       <w:pPr>
@@ -295,6 +305,11 @@
       </w:pPr>
       <w:r>
         <w:t xml:space="preserve">We assessed combustion appliances that burn fossil fuels such as propane, heating oil, or kerosene. These include furnaces, boilers, water heaters, and gas ovens. We visually inspected the combustion appliance(s) in your home, but we were unable to perform combustion safety tests. We also performed gas leak detection tests on your propane appliance(s).</w:t>
+      </w:r>
+    </w:p>
+    <w:p>
+      <w:r>
+        <w:br w:type="page"/>
       </w:r>
     </w:p>
     <w:bookmarkEnd w:id="27"/>
@@ -1441,6 +1456,11 @@
         </w:tc>
       </w:tr>
     </w:tbl>
+    <w:p>
+      <w:r>
+        <w:br w:type="page"/>
+      </w:r>
+    </w:p>
     <w:bookmarkEnd w:id="29"/>
     <w:bookmarkStart w:id="41" w:name="what-we-found"/>
     <w:p>
@@ -1489,7 +1509,7 @@
             <w:pPr>
               <w:spacing w:before="0" w:after="60"/>
               <w:keepNext/>
-              <w:jc w:val="start"/>
+              <w:jc w:val="center"/>
             </w:pPr>
             <w:r>
               <w:rPr>
@@ -1542,7 +1562,7 @@
             <w:pPr>
               <w:spacing w:before="0" w:after="60"/>
               <w:keepNext/>
-              <w:jc w:val="start"/>
+              <w:jc w:val="center"/>
             </w:pPr>
             <w:r>
               <w:rPr>
@@ -1595,7 +1615,7 @@
             <w:pPr>
               <w:spacing w:before="0" w:after="60"/>
               <w:keepNext/>
-              <w:jc w:val="start"/>
+              <w:jc w:val="center"/>
             </w:pPr>
             <w:r>
               <w:rPr>
@@ -1648,7 +1668,7 @@
             <w:pPr>
               <w:spacing w:before="0" w:after="60"/>
               <w:keepNext/>
-              <w:jc w:val="start"/>
+              <w:jc w:val="center"/>
             </w:pPr>
             <w:r>
               <w:rPr>
@@ -1701,7 +1721,7 @@
             <w:pPr>
               <w:spacing w:before="0" w:after="60"/>
               <w:keepNext/>
-              <w:jc w:val="start"/>
+              <w:jc w:val="center"/>
             </w:pPr>
             <w:r>
               <w:rPr>
@@ -1732,7 +1752,7 @@
                 <w:rFonts w:ascii="Calibri" w:hAnsi="Calibri"/>
                 <w:sz w:val="20"/>
               </w:rPr>
-              <w:t xml:space="default">1535</w:t>
+              <w:t xml:space="default">1,535 ft²</w:t>
             </w:r>
           </w:p>
         </w:tc>
@@ -1754,7 +1774,7 @@
             <w:pPr>
               <w:spacing w:before="0" w:after="60"/>
               <w:keepNext/>
-              <w:jc w:val="start"/>
+              <w:jc w:val="center"/>
             </w:pPr>
             <w:r>
               <w:rPr>
@@ -1785,7 +1805,7 @@
                 <w:rFonts w:ascii="Calibri" w:hAnsi="Calibri"/>
                 <w:sz w:val="20"/>
               </w:rPr>
-              <w:t xml:space="default">11863</w:t>
+              <w:t xml:space="default">11,863 ft³</w:t>
             </w:r>
           </w:p>
         </w:tc>
@@ -1807,7 +1827,7 @@
             <w:pPr>
               <w:spacing w:before="0" w:after="60"/>
               <w:keepNext/>
-              <w:jc w:val="start"/>
+              <w:jc w:val="center"/>
             </w:pPr>
             <w:r>
               <w:rPr>
@@ -2020,7 +2040,7 @@
                 <w:rFonts w:ascii="Calibri" w:hAnsi="Calibri"/>
                 <w:sz w:val="20"/>
               </w:rPr>
-              <w:t xml:space="default">Asphalt Shinglesin NAcondition. The shingles show clear signs of age and weathering. They have not begun to fly away during wind events.</w:t>
+              <w:t xml:space="default">The house has a Asphalt Shingles roof.The roof is in NA condition. The shingles show clear signs of age and weathering. They have not begun to fly away during wind events.</w:t>
             </w:r>
           </w:p>
         </w:tc>
@@ -2073,7 +2093,7 @@
                 <w:rFonts w:ascii="Calibri" w:hAnsi="Calibri"/>
                 <w:sz w:val="20"/>
               </w:rPr>
-              <w:t xml:space="default">Current moisture control strategies: NA. These were in NA condition .NA</w:t>
+              <w:t xml:space="default">The house has the following moisture control strategies: NA. These were in NA condition. NA</w:t>
             </w:r>
           </w:p>
         </w:tc>
@@ -2126,7 +2146,7 @@
                 <w:rFonts w:ascii="Calibri" w:hAnsi="Calibri"/>
                 <w:sz w:val="20"/>
               </w:rPr>
-              <w:t xml:space="default">vinyl siding in fair condition. The siding is in good condition in most areas. There are some spots that have had cracks or breaks in the material.</w:t>
+              <w:t xml:space="default">The house has vinyl siding. The siding is in fair condition. The siding is in good condition in most areas. There are some spots that have had cracks or breaks in the material.</w:t>
             </w:r>
           </w:p>
         </w:tc>
@@ -4096,6 +4116,11 @@
         </w:tc>
       </w:tr>
     </w:tbl>
+    <w:p>
+      <w:r>
+        <w:br w:type="page"/>
+      </w:r>
+    </w:p>
     <w:bookmarkEnd w:id="40"/>
     <w:bookmarkEnd w:id="41"/>
     <w:bookmarkStart w:id="62" w:name="recommendations"/>
@@ -5597,6 +5622,11 @@
       </w:pPr>
       <w:r>
         <w:t xml:space="preserve">As part of a larger insulation project, this work may be eligible for Efficiency Maine rebates and other incentives for insulation work, up to 80% of the overall cost to weatherize your home (subject to a lifetime limit per building).</w:t>
+      </w:r>
+    </w:p>
+    <w:p>
+      <w:r>
+        <w:br w:type="page"/>
       </w:r>
     </w:p>
     <w:bookmarkEnd w:id="61"/>

</xml_diff>

<commit_message>
Change exterior doors and windows phrasing
</commit_message>
<xml_diff>
--- a/Quarto_report/Audit_Report.docx
+++ b/Quarto_report/Audit_Report.docx
@@ -2199,7 +2199,7 @@
                 <w:rFonts w:ascii="Calibri" w:hAnsi="Calibri"/>
                 <w:sz w:val="20"/>
               </w:rPr>
-              <w:t xml:space="default">There are 2 hollow fiberglass exterior doors. In excellent condition, totaling 37 square feet.</w:t>
+              <w:t xml:space="default">There are 2 hollow fiberglass exterior doors. These are in excellent condition, they have a total area of 37 ft².</w:t>
             </w:r>
           </w:p>
         </w:tc>
@@ -2252,7 +2252,7 @@
                 <w:rFonts w:ascii="Calibri" w:hAnsi="Calibri"/>
                 <w:sz w:val="20"/>
               </w:rPr>
-              <w:t xml:space="default">There are 13 double paned wood windows. In fair condition, they have a total area of 148 ft².</w:t>
+              <w:t xml:space="default">There are 13 double paned wood windows. These are in fair condition, they have a total area of 148 ft².</w:t>
             </w:r>
           </w:p>
         </w:tc>

</xml_diff>

<commit_message>
Fix and simplify blower door calculations
</commit_message>
<xml_diff>
--- a/Quarto_report/Audit_Report.docx
+++ b/Quarto_report/Audit_Report.docx
@@ -2672,7 +2672,7 @@
                 <w:rFonts w:ascii="Calibri" w:hAnsi="Calibri"/>
                 <w:sz w:val="20"/>
               </w:rPr>
-              <w:t xml:space="default">6.3</w:t>
+              <w:t xml:space="default">6</w:t>
             </w:r>
           </w:p>
         </w:tc>
@@ -2749,31 +2749,31 @@
                 <w:rFonts w:ascii="Calibri" w:hAnsi="Calibri"/>
                 <w:sz w:val="20"/>
               </w:rPr>
-              <w:t xml:space="default">125 under natural conditions. TEST</w:t>
-            </w:r>
-          </w:p>
-        </w:tc>
-        <w:tc>
-          <w:tcPr>
-            <w:tcBorders>
-              <w:top w:val="single" w:space="0" w:color="D3D3D3"/>
-              <w:bottom w:val="single" w:space="0" w:color="D3D3D3"/>
-              <w:start w:val="single" w:space="0" w:color="D3D3D3"/>
-              <w:end w:val="single" w:space="0" w:color="D3D3D3"/>
-            </w:tcBorders>
-          </w:tcPr>
-          <w:p>
-            <w:pPr>
-              <w:spacing w:before="0" w:after="60"/>
-              <w:keepNext/>
-              <w:jc w:val="start"/>
-            </w:pPr>
-            <w:r>
-              <w:rPr>
-                <w:rFonts w:ascii="Calibri" w:hAnsi="Calibri"/>
-                <w:sz w:val="20"/>
-              </w:rPr>
-              <w:t xml:space="default">This is the area (in square inches) equivalent to all of the air leaks in the house combined.</w:t>
+              <w:t xml:space="default">125 in²</w:t>
+            </w:r>
+          </w:p>
+        </w:tc>
+        <w:tc>
+          <w:tcPr>
+            <w:tcBorders>
+              <w:top w:val="single" w:space="0" w:color="D3D3D3"/>
+              <w:bottom w:val="single" w:space="0" w:color="D3D3D3"/>
+              <w:start w:val="single" w:space="0" w:color="D3D3D3"/>
+              <w:end w:val="single" w:space="0" w:color="D3D3D3"/>
+            </w:tcBorders>
+          </w:tcPr>
+          <w:p>
+            <w:pPr>
+              <w:spacing w:before="0" w:after="60"/>
+              <w:keepNext/>
+              <w:jc w:val="start"/>
+            </w:pPr>
+            <w:r>
+              <w:rPr>
+                <w:rFonts w:ascii="Calibri" w:hAnsi="Calibri"/>
+                <w:sz w:val="20"/>
+              </w:rPr>
+              <w:t xml:space="default">This is the area equivalent to all of the air leaks in the house combined.</w:t>
             </w:r>
           </w:p>
         </w:tc>

</xml_diff>

<commit_message>
Edit and expand attic section
</commit_message>
<xml_diff>
--- a/Quarto_report/Audit_Report.docx
+++ b/Quarto_report/Audit_Report.docx
@@ -2928,7 +2928,7 @@
         <w:pStyle w:val="BodyText"/>
       </w:pPr>
       <w:r>
-        <w:t xml:space="preserve">We conducted the audit in the summer, when the air outside the house is hotter than inside the house. Therefore, the warmer (red, orange, and yellow) areas in the thermal pictures below show where air leakage is taking place, as these are the areas where hot air from the outside is being pulled into the cooler house.</w:t>
+        <w:t xml:space="preserve">We conducted the audit in the summer, when the air outside the house is hotter than inside the house. Therefore, the warmer (red, orange, and yellow) areas in the thermal pictures below show where air leakage and thermal bridgin are taking place, as these are the areas where hot air and heat from the outside are being pulled into the cooler house.</w:t>
       </w:r>
     </w:p>
     <w:bookmarkEnd w:id="36"/>
@@ -2970,7 +2970,7 @@
             <w:pPr>
               <w:spacing w:before="0" w:after="60"/>
               <w:keepNext/>
-              <w:jc w:val="start"/>
+              <w:jc w:val="center"/>
             </w:pPr>
             <w:r>
               <w:rPr>
@@ -3001,7 +3001,7 @@
                 <w:rFonts w:ascii="Calibri" w:hAnsi="Calibri"/>
                 <w:sz w:val="20"/>
               </w:rPr>
-              <w:t xml:space="default">586.5</w:t>
+              <w:t xml:space="default">586.5 ft²</w:t>
             </w:r>
           </w:p>
         </w:tc>
@@ -3023,38 +3023,38 @@
             <w:pPr>
               <w:spacing w:before="0" w:after="60"/>
               <w:keepNext/>
-              <w:jc w:val="start"/>
-            </w:pPr>
-            <w:r>
-              <w:rPr>
-                <w:rFonts w:ascii="Calibri" w:hAnsi="Calibri"/>
-                <w:sz w:val="20"/>
-              </w:rPr>
-              <w:t xml:space="default">Insulation type:</w:t>
-            </w:r>
-          </w:p>
-        </w:tc>
-        <w:tc>
-          <w:tcPr>
-            <w:tcBorders>
-              <w:top w:val="single" w:space="0" w:color="D3D3D3"/>
-              <w:bottom w:val="single" w:space="0" w:color="D3D3D3"/>
-              <w:start w:val="single" w:space="0" w:color="D3D3D3"/>
-              <w:end w:val="single" w:space="0" w:color="D3D3D3"/>
-            </w:tcBorders>
-          </w:tcPr>
-          <w:p>
-            <w:pPr>
-              <w:spacing w:before="0" w:after="60"/>
-              <w:keepNext/>
-              <w:jc w:val="start"/>
-            </w:pPr>
-            <w:r>
-              <w:rPr>
-                <w:rFonts w:ascii="Calibri" w:hAnsi="Calibri"/>
-                <w:sz w:val="20"/>
-              </w:rPr>
-              <w:t xml:space="default">Batts of Fiberglass</w:t>
+              <w:jc w:val="center"/>
+            </w:pPr>
+            <w:r>
+              <w:rPr>
+                <w:rFonts w:ascii="Calibri" w:hAnsi="Calibri"/>
+                <w:sz w:val="20"/>
+              </w:rPr>
+              <w:t xml:space="default">Insulation Type:</w:t>
+            </w:r>
+          </w:p>
+        </w:tc>
+        <w:tc>
+          <w:tcPr>
+            <w:tcBorders>
+              <w:top w:val="single" w:space="0" w:color="D3D3D3"/>
+              <w:bottom w:val="single" w:space="0" w:color="D3D3D3"/>
+              <w:start w:val="single" w:space="0" w:color="D3D3D3"/>
+              <w:end w:val="single" w:space="0" w:color="D3D3D3"/>
+            </w:tcBorders>
+          </w:tcPr>
+          <w:p>
+            <w:pPr>
+              <w:spacing w:before="0" w:after="60"/>
+              <w:keepNext/>
+              <w:jc w:val="start"/>
+            </w:pPr>
+            <w:r>
+              <w:rPr>
+                <w:rFonts w:ascii="Calibri" w:hAnsi="Calibri"/>
+                <w:sz w:val="20"/>
+              </w:rPr>
+              <w:t xml:space="default">The attic is insulated with Batts of Fiberglass insulation. The insulation is 9 inches thick.</w:t>
             </w:r>
           </w:p>
         </w:tc>
@@ -3076,7 +3076,7 @@
             <w:pPr>
               <w:spacing w:before="0" w:after="60"/>
               <w:keepNext/>
-              <w:jc w:val="start"/>
+              <w:jc w:val="center"/>
             </w:pPr>
             <w:r>
               <w:rPr>
@@ -3129,38 +3129,38 @@
             <w:pPr>
               <w:spacing w:before="0" w:after="60"/>
               <w:keepNext/>
-              <w:jc w:val="start"/>
-            </w:pPr>
-            <w:r>
-              <w:rPr>
-                <w:rFonts w:ascii="Calibri" w:hAnsi="Calibri"/>
-                <w:sz w:val="20"/>
-              </w:rPr>
-              <w:t xml:space="default">Air sealing:</w:t>
-            </w:r>
-          </w:p>
-        </w:tc>
-        <w:tc>
-          <w:tcPr>
-            <w:tcBorders>
-              <w:top w:val="single" w:space="0" w:color="D3D3D3"/>
-              <w:bottom w:val="single" w:space="0" w:color="D3D3D3"/>
-              <w:start w:val="single" w:space="0" w:color="D3D3D3"/>
-              <w:end w:val="single" w:space="0" w:color="D3D3D3"/>
-            </w:tcBorders>
-          </w:tcPr>
-          <w:p>
-            <w:pPr>
-              <w:spacing w:before="0" w:after="60"/>
-              <w:keepNext/>
-              <w:jc w:val="start"/>
-            </w:pPr>
-            <w:r>
-              <w:rPr>
-                <w:rFonts w:ascii="Calibri" w:hAnsi="Calibri"/>
-                <w:sz w:val="20"/>
-              </w:rPr>
-              <w:t xml:space="default">There is Noair sealing. NA</w:t>
+              <w:jc w:val="center"/>
+            </w:pPr>
+            <w:r>
+              <w:rPr>
+                <w:rFonts w:ascii="Calibri" w:hAnsi="Calibri"/>
+                <w:sz w:val="20"/>
+              </w:rPr>
+              <w:t xml:space="default">R-value</w:t>
+            </w:r>
+          </w:p>
+        </w:tc>
+        <w:tc>
+          <w:tcPr>
+            <w:tcBorders>
+              <w:top w:val="single" w:space="0" w:color="D3D3D3"/>
+              <w:bottom w:val="single" w:space="0" w:color="D3D3D3"/>
+              <w:start w:val="single" w:space="0" w:color="D3D3D3"/>
+              <w:end w:val="single" w:space="0" w:color="D3D3D3"/>
+            </w:tcBorders>
+          </w:tcPr>
+          <w:p>
+            <w:pPr>
+              <w:spacing w:before="0" w:after="60"/>
+              <w:keepNext/>
+              <w:jc w:val="start"/>
+            </w:pPr>
+            <w:r>
+              <w:rPr>
+                <w:rFonts w:ascii="Calibri" w:hAnsi="Calibri"/>
+                <w:sz w:val="20"/>
+              </w:rPr>
+              <w:t xml:space="default">NA</w:t>
             </w:r>
           </w:p>
         </w:tc>
@@ -3182,38 +3182,38 @@
             <w:pPr>
               <w:spacing w:before="0" w:after="60"/>
               <w:keepNext/>
-              <w:jc w:val="start"/>
-            </w:pPr>
-            <w:r>
-              <w:rPr>
-                <w:rFonts w:ascii="Calibri" w:hAnsi="Calibri"/>
-                <w:sz w:val="20"/>
-              </w:rPr>
-              <w:t xml:space="default">Other observations:</w:t>
-            </w:r>
-          </w:p>
-        </w:tc>
-        <w:tc>
-          <w:tcPr>
-            <w:tcBorders>
-              <w:top w:val="single" w:space="0" w:color="D3D3D3"/>
-              <w:bottom w:val="single" w:space="0" w:color="D3D3D3"/>
-              <w:start w:val="single" w:space="0" w:color="D3D3D3"/>
-              <w:end w:val="single" w:space="0" w:color="D3D3D3"/>
-            </w:tcBorders>
-          </w:tcPr>
-          <w:p>
-            <w:pPr>
-              <w:spacing w:before="0" w:after="60"/>
-              <w:keepNext/>
-              <w:jc w:val="start"/>
-            </w:pPr>
-            <w:r>
-              <w:rPr>
-                <w:rFonts w:ascii="Calibri" w:hAnsi="Calibri"/>
-                <w:sz w:val="20"/>
-              </w:rPr>
-              <w:t xml:space="default">The attic is mostly insulated, some spots have poorly installed fiberglass batts or lack insulation completely. Rodents have begun eating away at the insulation. The chimney is not air sealed, and opens up into an open cavity that is uninsulated. No NA</w:t>
+              <w:jc w:val="center"/>
+            </w:pPr>
+            <w:r>
+              <w:rPr>
+                <w:rFonts w:ascii="Calibri" w:hAnsi="Calibri"/>
+                <w:sz w:val="20"/>
+              </w:rPr>
+              <w:t xml:space="default">Attic Hatch</w:t>
+            </w:r>
+          </w:p>
+        </w:tc>
+        <w:tc>
+          <w:tcPr>
+            <w:tcBorders>
+              <w:top w:val="single" w:space="0" w:color="D3D3D3"/>
+              <w:bottom w:val="single" w:space="0" w:color="D3D3D3"/>
+              <w:start w:val="single" w:space="0" w:color="D3D3D3"/>
+              <w:end w:val="single" w:space="0" w:color="D3D3D3"/>
+            </w:tcBorders>
+          </w:tcPr>
+          <w:p>
+            <w:pPr>
+              <w:spacing w:before="0" w:after="60"/>
+              <w:keepNext/>
+              <w:jc w:val="start"/>
+            </w:pPr>
+            <w:r>
+              <w:rPr>
+                <w:rFonts w:ascii="Calibri" w:hAnsi="Calibri"/>
+                <w:sz w:val="20"/>
+              </w:rPr>
+              <w:t xml:space="default">NA</w:t>
             </w:r>
           </w:p>
         </w:tc>
@@ -3235,38 +3235,38 @@
             <w:pPr>
               <w:spacing w:before="0" w:after="60"/>
               <w:keepNext/>
-              <w:jc w:val="start"/>
-            </w:pPr>
-            <w:r>
-              <w:rPr>
-                <w:rFonts w:ascii="Calibri" w:hAnsi="Calibri"/>
-                <w:sz w:val="20"/>
-              </w:rPr>
-              <w:t xml:space="default">Ventilation:</w:t>
-            </w:r>
-          </w:p>
-        </w:tc>
-        <w:tc>
-          <w:tcPr>
-            <w:tcBorders>
-              <w:top w:val="single" w:space="0" w:color="D3D3D3"/>
-              <w:bottom w:val="single" w:space="0" w:color="D3D3D3"/>
-              <w:start w:val="single" w:space="0" w:color="D3D3D3"/>
-              <w:end w:val="single" w:space="0" w:color="D3D3D3"/>
-            </w:tcBorders>
-          </w:tcPr>
-          <w:p>
-            <w:pPr>
-              <w:spacing w:before="0" w:after="60"/>
-              <w:keepNext/>
-              <w:jc w:val="start"/>
-            </w:pPr>
-            <w:r>
-              <w:rPr>
-                <w:rFonts w:ascii="Calibri" w:hAnsi="Calibri"/>
-                <w:sz w:val="20"/>
-              </w:rPr>
-              <w:t xml:space="default">No</w:t>
+              <w:jc w:val="center"/>
+            </w:pPr>
+            <w:r>
+              <w:rPr>
+                <w:rFonts w:ascii="Calibri" w:hAnsi="Calibri"/>
+                <w:sz w:val="20"/>
+              </w:rPr>
+              <w:t xml:space="default">Air sealing:</w:t>
+            </w:r>
+          </w:p>
+        </w:tc>
+        <w:tc>
+          <w:tcPr>
+            <w:tcBorders>
+              <w:top w:val="single" w:space="0" w:color="D3D3D3"/>
+              <w:bottom w:val="single" w:space="0" w:color="D3D3D3"/>
+              <w:start w:val="single" w:space="0" w:color="D3D3D3"/>
+              <w:end w:val="single" w:space="0" w:color="D3D3D3"/>
+            </w:tcBorders>
+          </w:tcPr>
+          <w:p>
+            <w:pPr>
+              <w:spacing w:before="0" w:after="60"/>
+              <w:keepNext/>
+              <w:jc w:val="start"/>
+            </w:pPr>
+            <w:r>
+              <w:rPr>
+                <w:rFonts w:ascii="Calibri" w:hAnsi="Calibri"/>
+                <w:sz w:val="20"/>
+              </w:rPr>
+              <w:t xml:space="default">The attic is not air sealed. NA</w:t>
             </w:r>
           </w:p>
         </w:tc>
@@ -3288,7 +3288,113 @@
             <w:pPr>
               <w:spacing w:before="0" w:after="60"/>
               <w:keepNext/>
-              <w:jc w:val="start"/>
+              <w:jc w:val="center"/>
+            </w:pPr>
+            <w:r>
+              <w:rPr>
+                <w:rFonts w:ascii="Calibri" w:hAnsi="Calibri"/>
+                <w:sz w:val="20"/>
+              </w:rPr>
+              <w:t xml:space="default">Ventilation:</w:t>
+            </w:r>
+          </w:p>
+        </w:tc>
+        <w:tc>
+          <w:tcPr>
+            <w:tcBorders>
+              <w:top w:val="single" w:space="0" w:color="D3D3D3"/>
+              <w:bottom w:val="single" w:space="0" w:color="D3D3D3"/>
+              <w:start w:val="single" w:space="0" w:color="D3D3D3"/>
+              <w:end w:val="single" w:space="0" w:color="D3D3D3"/>
+            </w:tcBorders>
+          </w:tcPr>
+          <w:p>
+            <w:pPr>
+              <w:spacing w:before="0" w:after="60"/>
+              <w:keepNext/>
+              <w:jc w:val="start"/>
+            </w:pPr>
+            <w:r>
+              <w:rPr>
+                <w:rFonts w:ascii="Calibri" w:hAnsi="Calibri"/>
+                <w:sz w:val="20"/>
+              </w:rPr>
+              <w:t xml:space="default">The attic is ventilated by Ridge. Attic ventilation is important to keep the attic space and insulation dry and in good condition.</w:t>
+            </w:r>
+          </w:p>
+        </w:tc>
+      </w:tr>
+      <w:tr>
+        <w:trPr>
+          <w:cantSplit/>
+        </w:trPr>
+        <w:tc>
+          <w:tcPr>
+            <w:tcBorders>
+              <w:top w:val="single" w:space="0" w:color="D3D3D3"/>
+              <w:bottom w:val="single" w:space="0" w:color="D3D3D3"/>
+              <w:start w:val="single" w:space="0" w:color="D3D3D3"/>
+              <w:end w:val="single" w:space="0" w:color="D3D3D3"/>
+            </w:tcBorders>
+          </w:tcPr>
+          <w:p>
+            <w:pPr>
+              <w:spacing w:before="0" w:after="60"/>
+              <w:keepNext/>
+              <w:jc w:val="center"/>
+            </w:pPr>
+            <w:r>
+              <w:rPr>
+                <w:rFonts w:ascii="Calibri" w:hAnsi="Calibri"/>
+                <w:sz w:val="20"/>
+              </w:rPr>
+              <w:t xml:space="default">Exhaust Ducts</w:t>
+            </w:r>
+          </w:p>
+        </w:tc>
+        <w:tc>
+          <w:tcPr>
+            <w:tcBorders>
+              <w:top w:val="single" w:space="0" w:color="D3D3D3"/>
+              <w:bottom w:val="single" w:space="0" w:color="D3D3D3"/>
+              <w:start w:val="single" w:space="0" w:color="D3D3D3"/>
+              <w:end w:val="single" w:space="0" w:color="D3D3D3"/>
+            </w:tcBorders>
+          </w:tcPr>
+          <w:p>
+            <w:pPr>
+              <w:spacing w:before="0" w:after="60"/>
+              <w:keepNext/>
+              <w:jc w:val="start"/>
+            </w:pPr>
+            <w:r>
+              <w:rPr>
+                <w:rFonts w:ascii="Calibri" w:hAnsi="Calibri"/>
+                <w:sz w:val="20"/>
+              </w:rPr>
+              <w:t xml:space="default">NA</w:t>
+            </w:r>
+          </w:p>
+        </w:tc>
+      </w:tr>
+      <w:tr>
+        <w:trPr>
+          <w:cantSplit/>
+        </w:trPr>
+        <w:tc>
+          <w:tcPr>
+            <w:tcBorders>
+              <w:top w:val="single" w:space="0" w:color="D3D3D3"/>
+              <w:bottom w:val="single" w:space="0" w:color="D3D3D3"/>
+              <w:start w:val="single" w:space="0" w:color="D3D3D3"/>
+              <w:end w:val="single" w:space="0" w:color="D3D3D3"/>
+            </w:tcBorders>
+          </w:tcPr>
+          <w:p>
+            <w:pPr>
+              <w:spacing w:before="0" w:after="60"/>
+              <w:keepNext/>
+              <w:jc w:val="center"/>
             </w:pPr>
             <w:r>
               <w:rPr>
@@ -3319,7 +3425,60 @@
                 <w:rFonts w:ascii="Calibri" w:hAnsi="Calibri"/>
                 <w:sz w:val="20"/>
               </w:rPr>
-              <w:t xml:space="default">No</w:t>
+              <w:t xml:space="default">No. NA</w:t>
+            </w:r>
+          </w:p>
+        </w:tc>
+      </w:tr>
+      <w:tr>
+        <w:trPr>
+          <w:cantSplit/>
+        </w:trPr>
+        <w:tc>
+          <w:tcPr>
+            <w:tcBorders>
+              <w:top w:val="single" w:space="0" w:color="D3D3D3"/>
+              <w:bottom w:val="single" w:space="0" w:color="D3D3D3"/>
+              <w:start w:val="single" w:space="0" w:color="D3D3D3"/>
+              <w:end w:val="single" w:space="0" w:color="D3D3D3"/>
+            </w:tcBorders>
+          </w:tcPr>
+          <w:p>
+            <w:pPr>
+              <w:spacing w:before="0" w:after="60"/>
+              <w:keepNext/>
+              <w:jc w:val="center"/>
+            </w:pPr>
+            <w:r>
+              <w:rPr>
+                <w:rFonts w:ascii="Calibri" w:hAnsi="Calibri"/>
+                <w:sz w:val="20"/>
+              </w:rPr>
+              <w:t xml:space="default">Other observations:</w:t>
+            </w:r>
+          </w:p>
+        </w:tc>
+        <w:tc>
+          <w:tcPr>
+            <w:tcBorders>
+              <w:top w:val="single" w:space="0" w:color="D3D3D3"/>
+              <w:bottom w:val="single" w:space="0" w:color="D3D3D3"/>
+              <w:start w:val="single" w:space="0" w:color="D3D3D3"/>
+              <w:end w:val="single" w:space="0" w:color="D3D3D3"/>
+            </w:tcBorders>
+          </w:tcPr>
+          <w:p>
+            <w:pPr>
+              <w:spacing w:before="0" w:after="60"/>
+              <w:keepNext/>
+              <w:jc w:val="start"/>
+            </w:pPr>
+            <w:r>
+              <w:rPr>
+                <w:rFonts w:ascii="Calibri" w:hAnsi="Calibri"/>
+                <w:sz w:val="20"/>
+              </w:rPr>
+              <w:t xml:space="default">The attic is mostly insulated, some spots have poorly installed fiberglass batts or lack insulation completely. Rodents have begun eating away at the insulation. The chimney is not air sealed, and opens up into an open cavity that is uninsulated. No NA</w:t>
             </w:r>
           </w:p>
         </w:tc>

</xml_diff>

<commit_message>
Add in comments about air leakage, clean up code
</commit_message>
<xml_diff>
--- a/Quarto_report/Audit_Report.docx
+++ b/Quarto_report/Audit_Report.docx
@@ -2851,6 +2851,83 @@
                 <w:sz w:val="20"/>
               </w:rPr>
               <w:t xml:space="default">Accounting for the volume of the home, this means that the house exchanges 50% of its air every hour. Over one day, the house goes through 12 complete air changes.</w:t>
+            </w:r>
+          </w:p>
+        </w:tc>
+      </w:tr>
+      <w:tr>
+        <w:trPr>
+          <w:cantSplit/>
+        </w:trPr>
+        <w:tc>
+          <w:tcPr>
+            <w:tcBorders>
+              <w:top w:val="single" w:space="0" w:color="D3D3D3"/>
+              <w:bottom w:val="single" w:space="0" w:color="D3D3D3"/>
+              <w:start w:val="single" w:space="0" w:color="D3D3D3"/>
+              <w:end w:val="single" w:space="0" w:color="D3D3D3"/>
+            </w:tcBorders>
+          </w:tcPr>
+          <w:p>
+            <w:pPr>
+              <w:spacing w:before="0" w:after="60"/>
+              <w:keepNext/>
+              <w:jc w:val="start"/>
+            </w:pPr>
+            <w:r>
+              <w:rPr>
+                <w:rFonts w:ascii="Calibri" w:hAnsi="Calibri"/>
+                <w:sz w:val="20"/>
+              </w:rPr>
+              <w:t xml:space="default">Comments About Air Leakage:</w:t>
+            </w:r>
+          </w:p>
+        </w:tc>
+        <w:tc>
+          <w:tcPr>
+            <w:tcBorders>
+              <w:top w:val="single" w:space="0" w:color="D3D3D3"/>
+              <w:bottom w:val="single" w:space="0" w:color="D3D3D3"/>
+              <w:start w:val="single" w:space="0" w:color="D3D3D3"/>
+              <w:end w:val="single" w:space="0" w:color="D3D3D3"/>
+            </w:tcBorders>
+          </w:tcPr>
+          <w:p>
+            <w:pPr>
+              <w:spacing w:before="0" w:after="60"/>
+              <w:keepNext/>
+              <w:jc w:val="start"/>
+            </w:pPr>
+            <w:r>
+              <w:rPr>
+                <w:rFonts w:ascii="Calibri" w:hAnsi="Calibri"/>
+                <w:sz w:val="20"/>
+              </w:rPr>
+              <w:t xml:space="default">NA</w:t>
+            </w:r>
+          </w:p>
+        </w:tc>
+        <w:tc>
+          <w:tcPr>
+            <w:tcBorders>
+              <w:top w:val="single" w:space="0" w:color="D3D3D3"/>
+              <w:bottom w:val="single" w:space="0" w:color="D3D3D3"/>
+              <w:start w:val="single" w:space="0" w:color="D3D3D3"/>
+              <w:end w:val="single" w:space="0" w:color="D3D3D3"/>
+            </w:tcBorders>
+          </w:tcPr>
+          <w:p>
+            <w:pPr>
+              <w:spacing w:before="0" w:after="60"/>
+              <w:keepNext/>
+              <w:jc w:val="start"/>
+            </w:pPr>
+            <w:r>
+              <w:rPr>
+                <w:rFonts w:ascii="Calibri" w:hAnsi="Calibri"/>
+                <w:sz w:val="20"/>
+              </w:rPr>
+              <w:t xml:space="default">Move somewhere else in this section, just putting it here for now so it makes it into the report.</w:t>
             </w:r>
           </w:p>
         </w:tc>

</xml_diff>

<commit_message>
Edit basement / crawlspace table, format code
</commit_message>
<xml_diff>
--- a/Quarto_report/Audit_Report.docx
+++ b/Quarto_report/Audit_Report.docx
@@ -3631,7 +3631,7 @@
                 <w:rFonts w:ascii="Calibri" w:hAnsi="Calibri"/>
                 <w:sz w:val="20"/>
               </w:rPr>
-              <w:t xml:space="default">890</w:t>
+              <w:t xml:space="default">890 ft²</w:t>
             </w:r>
           </w:p>
         </w:tc>
@@ -3660,31 +3660,31 @@
                 <w:rFonts w:ascii="Calibri" w:hAnsi="Calibri"/>
                 <w:sz w:val="20"/>
               </w:rPr>
-              <w:t xml:space="default">Insulation condition:</w:t>
-            </w:r>
-          </w:p>
-        </w:tc>
-        <w:tc>
-          <w:tcPr>
-            <w:tcBorders>
-              <w:top w:val="single" w:space="0" w:color="D3D3D3"/>
-              <w:bottom w:val="single" w:space="0" w:color="D3D3D3"/>
-              <w:start w:val="single" w:space="0" w:color="D3D3D3"/>
-              <w:end w:val="single" w:space="0" w:color="D3D3D3"/>
-            </w:tcBorders>
-          </w:tcPr>
-          <w:p>
-            <w:pPr>
-              <w:spacing w:before="0" w:after="60"/>
-              <w:keepNext/>
-              <w:jc w:val="start"/>
-            </w:pPr>
-            <w:r>
-              <w:rPr>
-                <w:rFonts w:ascii="Calibri" w:hAnsi="Calibri"/>
-                <w:sz w:val="20"/>
-              </w:rPr>
-              <w:t xml:space="default">FairThe crawlspace has 2" foam board insulation on the interior walls, as well as 4" fiberglass batts in the rim joists.</w:t>
+              <w:t xml:space="default">Wall Area:</w:t>
+            </w:r>
+          </w:p>
+        </w:tc>
+        <w:tc>
+          <w:tcPr>
+            <w:tcBorders>
+              <w:top w:val="single" w:space="0" w:color="D3D3D3"/>
+              <w:bottom w:val="single" w:space="0" w:color="D3D3D3"/>
+              <w:start w:val="single" w:space="0" w:color="D3D3D3"/>
+              <w:end w:val="single" w:space="0" w:color="D3D3D3"/>
+            </w:tcBorders>
+          </w:tcPr>
+          <w:p>
+            <w:pPr>
+              <w:spacing w:before="0" w:after="60"/>
+              <w:keepNext/>
+              <w:jc w:val="start"/>
+            </w:pPr>
+            <w:r>
+              <w:rPr>
+                <w:rFonts w:ascii="Calibri" w:hAnsi="Calibri"/>
+                <w:sz w:val="20"/>
+              </w:rPr>
+              <w:t xml:space="default">360 ft²</w:t>
             </w:r>
           </w:p>
         </w:tc>
@@ -3713,31 +3713,31 @@
                 <w:rFonts w:ascii="Calibri" w:hAnsi="Calibri"/>
                 <w:sz w:val="20"/>
               </w:rPr>
-              <w:t xml:space="default">Insulation type:</w:t>
-            </w:r>
-          </w:p>
-        </w:tc>
-        <w:tc>
-          <w:tcPr>
-            <w:tcBorders>
-              <w:top w:val="single" w:space="0" w:color="D3D3D3"/>
-              <w:bottom w:val="single" w:space="0" w:color="D3D3D3"/>
-              <w:start w:val="single" w:space="0" w:color="D3D3D3"/>
-              <w:end w:val="single" w:space="0" w:color="D3D3D3"/>
-            </w:tcBorders>
-          </w:tcPr>
-          <w:p>
-            <w:pPr>
-              <w:spacing w:before="0" w:after="60"/>
-              <w:keepNext/>
-              <w:jc w:val="start"/>
-            </w:pPr>
-            <w:r>
-              <w:rPr>
-                <w:rFonts w:ascii="Calibri" w:hAnsi="Calibri"/>
-                <w:sz w:val="20"/>
-              </w:rPr>
-              <w:t xml:space="default">Batts of Fiberglass, Rigid foam board</w:t>
+              <w:t xml:space="default">Insulation Type:</w:t>
+            </w:r>
+          </w:p>
+        </w:tc>
+        <w:tc>
+          <w:tcPr>
+            <w:tcBorders>
+              <w:top w:val="single" w:space="0" w:color="D3D3D3"/>
+              <w:bottom w:val="single" w:space="0" w:color="D3D3D3"/>
+              <w:start w:val="single" w:space="0" w:color="D3D3D3"/>
+              <w:end w:val="single" w:space="0" w:color="D3D3D3"/>
+            </w:tcBorders>
+          </w:tcPr>
+          <w:p>
+            <w:pPr>
+              <w:spacing w:before="0" w:after="60"/>
+              <w:keepNext/>
+              <w:jc w:val="start"/>
+            </w:pPr>
+            <w:r>
+              <w:rPr>
+                <w:rFonts w:ascii="Calibri" w:hAnsi="Calibri"/>
+                <w:sz w:val="20"/>
+              </w:rPr>
+              <w:t xml:space="default">The **basement / crawlspace** is insulated with Batts of Fiberglass, Rigid foam board insulation. The insulation is NA inches thick.</w:t>
             </w:r>
           </w:p>
         </w:tc>
@@ -3766,31 +3766,31 @@
                 <w:rFonts w:ascii="Calibri" w:hAnsi="Calibri"/>
                 <w:sz w:val="20"/>
               </w:rPr>
-              <w:t xml:space="default">Insulation of appliances:</w:t>
-            </w:r>
-          </w:p>
-        </w:tc>
-        <w:tc>
-          <w:tcPr>
-            <w:tcBorders>
-              <w:top w:val="single" w:space="0" w:color="D3D3D3"/>
-              <w:bottom w:val="single" w:space="0" w:color="D3D3D3"/>
-              <w:start w:val="single" w:space="0" w:color="D3D3D3"/>
-              <w:end w:val="single" w:space="0" w:color="D3D3D3"/>
-            </w:tcBorders>
-          </w:tcPr>
-          <w:p>
-            <w:pPr>
-              <w:spacing w:before="0" w:after="60"/>
-              <w:keepNext/>
-              <w:jc w:val="start"/>
-            </w:pPr>
-            <w:r>
-              <w:rPr>
-                <w:rFonts w:ascii="Calibri" w:hAnsi="Calibri"/>
-                <w:sz w:val="20"/>
-              </w:rPr>
-              <w:t xml:space="default">Appliances not insulated, Ducts/pipes not insulated</w:t>
+              <w:t xml:space="default">Insulation Condition:</w:t>
+            </w:r>
+          </w:p>
+        </w:tc>
+        <w:tc>
+          <w:tcPr>
+            <w:tcBorders>
+              <w:top w:val="single" w:space="0" w:color="D3D3D3"/>
+              <w:bottom w:val="single" w:space="0" w:color="D3D3D3"/>
+              <w:start w:val="single" w:space="0" w:color="D3D3D3"/>
+              <w:end w:val="single" w:space="0" w:color="D3D3D3"/>
+            </w:tcBorders>
+          </w:tcPr>
+          <w:p>
+            <w:pPr>
+              <w:spacing w:before="0" w:after="60"/>
+              <w:keepNext/>
+              <w:jc w:val="start"/>
+            </w:pPr>
+            <w:r>
+              <w:rPr>
+                <w:rFonts w:ascii="Calibri" w:hAnsi="Calibri"/>
+                <w:sz w:val="20"/>
+              </w:rPr>
+              <w:t xml:space="default">The insulation is in Fair condition. The crawlspace has 2" foam board insulation on the interior walls, as well as 4" fiberglass batts in the rim joists.</w:t>
             </w:r>
           </w:p>
         </w:tc>
@@ -3819,31 +3819,31 @@
                 <w:rFonts w:ascii="Calibri" w:hAnsi="Calibri"/>
                 <w:sz w:val="20"/>
               </w:rPr>
-              <w:t xml:space="default">Moisture Control:</w:t>
-            </w:r>
-          </w:p>
-        </w:tc>
-        <w:tc>
-          <w:tcPr>
-            <w:tcBorders>
-              <w:top w:val="single" w:space="0" w:color="D3D3D3"/>
-              <w:bottom w:val="single" w:space="0" w:color="D3D3D3"/>
-              <w:start w:val="single" w:space="0" w:color="D3D3D3"/>
-              <w:end w:val="single" w:space="0" w:color="D3D3D3"/>
-            </w:tcBorders>
-          </w:tcPr>
-          <w:p>
-            <w:pPr>
-              <w:spacing w:before="0" w:after="60"/>
-              <w:keepNext/>
-              <w:jc w:val="start"/>
-            </w:pPr>
-            <w:r>
-              <w:rPr>
-                <w:rFonts w:ascii="Calibri" w:hAnsi="Calibri"/>
-                <w:sz w:val="20"/>
-              </w:rPr>
-              <w:t xml:space="default">NAin NAcondition. NA</w:t>
+              <w:t xml:space="default">R-Value:</w:t>
+            </w:r>
+          </w:p>
+        </w:tc>
+        <w:tc>
+          <w:tcPr>
+            <w:tcBorders>
+              <w:top w:val="single" w:space="0" w:color="D3D3D3"/>
+              <w:bottom w:val="single" w:space="0" w:color="D3D3D3"/>
+              <w:start w:val="single" w:space="0" w:color="D3D3D3"/>
+              <w:end w:val="single" w:space="0" w:color="D3D3D3"/>
+            </w:tcBorders>
+          </w:tcPr>
+          <w:p>
+            <w:pPr>
+              <w:spacing w:before="0" w:after="60"/>
+              <w:keepNext/>
+              <w:jc w:val="start"/>
+            </w:pPr>
+            <w:r>
+              <w:rPr>
+                <w:rFonts w:ascii="Calibri" w:hAnsi="Calibri"/>
+                <w:sz w:val="20"/>
+              </w:rPr>
+              <w:t xml:space="default">The thickness and condition of the insulation gives the insulation an R-value of R-DECIDE per inch. This gives the **basement / crawlspace** a total R-value of R-CALCULATE.</w:t>
             </w:r>
           </w:p>
         </w:tc>
@@ -3872,31 +3872,31 @@
                 <w:rFonts w:ascii="Calibri" w:hAnsi="Calibri"/>
                 <w:sz w:val="20"/>
               </w:rPr>
-              <w:t xml:space="default">Ducts:</w:t>
-            </w:r>
-          </w:p>
-        </w:tc>
-        <w:tc>
-          <w:tcPr>
-            <w:tcBorders>
-              <w:top w:val="single" w:space="0" w:color="D3D3D3"/>
-              <w:bottom w:val="single" w:space="0" w:color="D3D3D3"/>
-              <w:start w:val="single" w:space="0" w:color="D3D3D3"/>
-              <w:end w:val="single" w:space="0" w:color="D3D3D3"/>
-            </w:tcBorders>
-          </w:tcPr>
-          <w:p>
-            <w:pPr>
-              <w:spacing w:before="0" w:after="60"/>
-              <w:keepNext/>
-              <w:jc w:val="start"/>
-            </w:pPr>
-            <w:r>
-              <w:rPr>
-                <w:rFonts w:ascii="Calibri" w:hAnsi="Calibri"/>
-                <w:sz w:val="20"/>
-              </w:rPr>
-              <w:t xml:space="default">NoNA</w:t>
+              <w:t xml:space="default">Moisture Control:</w:t>
+            </w:r>
+          </w:p>
+        </w:tc>
+        <w:tc>
+          <w:tcPr>
+            <w:tcBorders>
+              <w:top w:val="single" w:space="0" w:color="D3D3D3"/>
+              <w:bottom w:val="single" w:space="0" w:color="D3D3D3"/>
+              <w:start w:val="single" w:space="0" w:color="D3D3D3"/>
+              <w:end w:val="single" w:space="0" w:color="D3D3D3"/>
+            </w:tcBorders>
+          </w:tcPr>
+          <w:p>
+            <w:pPr>
+              <w:spacing w:before="0" w:after="60"/>
+              <w:keepNext/>
+              <w:jc w:val="start"/>
+            </w:pPr>
+            <w:r>
+              <w:rPr>
+                <w:rFonts w:ascii="Calibri" w:hAnsi="Calibri"/>
+                <w:sz w:val="20"/>
+              </w:rPr>
+              <w:t xml:space="default">There is NA to control moisture. These are in NA condition. NA. Moisture control is important as moisture in the **basement / crawlspace** evaporates into the house where it can cause moisture damage such as mold. It is also important to protect appliances in the **basement / crawlspace**.</w:t>
             </w:r>
           </w:p>
         </w:tc>
@@ -3925,7 +3925,113 @@
                 <w:rFonts w:ascii="Calibri" w:hAnsi="Calibri"/>
                 <w:sz w:val="20"/>
               </w:rPr>
-              <w:t xml:space="default">Other observations:</w:t>
+              <w:t xml:space="default">Appliance Insulation:</w:t>
+            </w:r>
+          </w:p>
+        </w:tc>
+        <w:tc>
+          <w:tcPr>
+            <w:tcBorders>
+              <w:top w:val="single" w:space="0" w:color="D3D3D3"/>
+              <w:bottom w:val="single" w:space="0" w:color="D3D3D3"/>
+              <w:start w:val="single" w:space="0" w:color="D3D3D3"/>
+              <w:end w:val="single" w:space="0" w:color="D3D3D3"/>
+            </w:tcBorders>
+          </w:tcPr>
+          <w:p>
+            <w:pPr>
+              <w:spacing w:before="0" w:after="60"/>
+              <w:keepNext/>
+              <w:jc w:val="start"/>
+            </w:pPr>
+            <w:r>
+              <w:rPr>
+                <w:rFonts w:ascii="Calibri" w:hAnsi="Calibri"/>
+                <w:sz w:val="20"/>
+              </w:rPr>
+              <w:t xml:space="default">The Appliances not insulated, Ducts/pipes not insulated DELETE WHAT DOESN'T APPLY. Insulating ductwork is important to prevent the air from losing heat as it travels through it. Insulating both hot and cold water pipes is important to stop the water from losing heat as it travels through the pipes and to prevent condensation. Uninsulated **ductwork / pipes** increase your heating bill.</w:t>
+            </w:r>
+          </w:p>
+        </w:tc>
+      </w:tr>
+      <w:tr>
+        <w:trPr>
+          <w:cantSplit/>
+        </w:trPr>
+        <w:tc>
+          <w:tcPr>
+            <w:tcBorders>
+              <w:top w:val="single" w:space="0" w:color="D3D3D3"/>
+              <w:bottom w:val="single" w:space="0" w:color="D3D3D3"/>
+              <w:start w:val="single" w:space="0" w:color="D3D3D3"/>
+              <w:end w:val="single" w:space="0" w:color="D3D3D3"/>
+            </w:tcBorders>
+          </w:tcPr>
+          <w:p>
+            <w:pPr>
+              <w:spacing w:before="0" w:after="60"/>
+              <w:keepNext/>
+              <w:jc w:val="start"/>
+            </w:pPr>
+            <w:r>
+              <w:rPr>
+                <w:rFonts w:ascii="Calibri" w:hAnsi="Calibri"/>
+                <w:sz w:val="20"/>
+              </w:rPr>
+              <w:t xml:space="default">Ducts:</w:t>
+            </w:r>
+          </w:p>
+        </w:tc>
+        <w:tc>
+          <w:tcPr>
+            <w:tcBorders>
+              <w:top w:val="single" w:space="0" w:color="D3D3D3"/>
+              <w:bottom w:val="single" w:space="0" w:color="D3D3D3"/>
+              <w:start w:val="single" w:space="0" w:color="D3D3D3"/>
+              <w:end w:val="single" w:space="0" w:color="D3D3D3"/>
+            </w:tcBorders>
+          </w:tcPr>
+          <w:p>
+            <w:pPr>
+              <w:spacing w:before="0" w:after="60"/>
+              <w:keepNext/>
+              <w:jc w:val="start"/>
+            </w:pPr>
+            <w:r>
+              <w:rPr>
+                <w:rFonts w:ascii="Calibri" w:hAnsi="Calibri"/>
+                <w:sz w:val="20"/>
+              </w:rPr>
+              <w:t xml:space="default">No in the **basement / crawlspace**. NA</w:t>
+            </w:r>
+          </w:p>
+        </w:tc>
+      </w:tr>
+      <w:tr>
+        <w:trPr>
+          <w:cantSplit/>
+        </w:trPr>
+        <w:tc>
+          <w:tcPr>
+            <w:tcBorders>
+              <w:top w:val="single" w:space="0" w:color="D3D3D3"/>
+              <w:bottom w:val="single" w:space="0" w:color="D3D3D3"/>
+              <w:start w:val="single" w:space="0" w:color="D3D3D3"/>
+              <w:end w:val="single" w:space="0" w:color="D3D3D3"/>
+            </w:tcBorders>
+          </w:tcPr>
+          <w:p>
+            <w:pPr>
+              <w:spacing w:before="0" w:after="60"/>
+              <w:keepNext/>
+              <w:jc w:val="start"/>
+            </w:pPr>
+            <w:r>
+              <w:rPr>
+                <w:rFonts w:ascii="Calibri" w:hAnsi="Calibri"/>
+                <w:sz w:val="20"/>
+              </w:rPr>
+              <w:t xml:space="default">Other Observations:</w:t>
             </w:r>
           </w:p>
         </w:tc>

</xml_diff>

<commit_message>
Expand appliances section, make minor changes to basement section
</commit_message>
<xml_diff>
--- a/Quarto_report/Audit_Report.docx
+++ b/Quarto_report/Audit_Report.docx
@@ -115,7 +115,7 @@
         <w:t xml:space="preserve"> </w:t>
       </w:r>
       <w:r>
-        <w:t xml:space="preserve">July 11, 2025</w:t>
+        <w:t xml:space="preserve">July 14, 2025</w:t>
       </w:r>
     </w:p>
     <w:p>
@@ -4107,7 +4107,7 @@
                 <w:rFonts w:ascii="Calibri" w:hAnsi="Calibri"/>
                 <w:sz w:val="20"/>
               </w:rPr>
-              <w:t xml:space="default">Electrical panel:</w:t>
+              <w:t xml:space="default">Electrical Panel:</w:t>
             </w:r>
           </w:p>
         </w:tc>
@@ -4132,6 +4132,271 @@
                 <w:sz w:val="20"/>
               </w:rPr>
               <w:t xml:space="default">The electrical panel has and amperage of 100. There are 0 unused breaker spaces. The homeowner has a full panel and is in fine condition.</w:t>
+            </w:r>
+          </w:p>
+        </w:tc>
+      </w:tr>
+      <w:tr>
+        <w:trPr>
+          <w:cantSplit/>
+        </w:trPr>
+        <w:tc>
+          <w:tcPr>
+            <w:tcBorders>
+              <w:top w:val="single" w:space="0" w:color="D3D3D3"/>
+              <w:bottom w:val="single" w:space="0" w:color="D3D3D3"/>
+              <w:start w:val="single" w:space="0" w:color="D3D3D3"/>
+              <w:end w:val="single" w:space="0" w:color="D3D3D3"/>
+            </w:tcBorders>
+          </w:tcPr>
+          <w:p>
+            <w:pPr>
+              <w:spacing w:before="0" w:after="60"/>
+              <w:keepNext/>
+              <w:jc w:val="start"/>
+            </w:pPr>
+            <w:r>
+              <w:rPr>
+                <w:rFonts w:ascii="Calibri" w:hAnsi="Calibri"/>
+                <w:sz w:val="20"/>
+              </w:rPr>
+              <w:t xml:space="default">Appliance 1:</w:t>
+            </w:r>
+          </w:p>
+        </w:tc>
+        <w:tc>
+          <w:tcPr>
+            <w:tcBorders>
+              <w:top w:val="single" w:space="0" w:color="D3D3D3"/>
+              <w:bottom w:val="single" w:space="0" w:color="D3D3D3"/>
+              <w:start w:val="single" w:space="0" w:color="D3D3D3"/>
+              <w:end w:val="single" w:space="0" w:color="D3D3D3"/>
+            </w:tcBorders>
+          </w:tcPr>
+          <w:p>
+            <w:pPr>
+              <w:spacing w:before="0" w:after="60"/>
+              <w:keepNext/>
+              <w:jc w:val="start"/>
+            </w:pPr>
+            <w:r>
+              <w:rPr>
+                <w:rFonts w:ascii="Calibri" w:hAnsi="Calibri"/>
+                <w:sz w:val="20"/>
+              </w:rPr>
+              <w:t xml:space="default">Boiler</w:t>
+            </w:r>
+          </w:p>
+        </w:tc>
+      </w:tr>
+      <w:tr>
+        <w:trPr>
+          <w:cantSplit/>
+        </w:trPr>
+        <w:tc>
+          <w:tcPr>
+            <w:tcBorders>
+              <w:top w:val="single" w:space="0" w:color="D3D3D3"/>
+              <w:bottom w:val="single" w:space="0" w:color="D3D3D3"/>
+              <w:start w:val="single" w:space="0" w:color="D3D3D3"/>
+              <w:end w:val="single" w:space="0" w:color="D3D3D3"/>
+            </w:tcBorders>
+          </w:tcPr>
+          <w:p>
+            <w:pPr>
+              <w:spacing w:before="0" w:after="60"/>
+              <w:keepNext/>
+              <w:jc w:val="start"/>
+            </w:pPr>
+            <w:r>
+              <w:rPr>
+                <w:rFonts w:ascii="Calibri" w:hAnsi="Calibri"/>
+                <w:sz w:val="20"/>
+              </w:rPr>
+              <w:t xml:space="default">Appliance 2:</w:t>
+            </w:r>
+          </w:p>
+        </w:tc>
+        <w:tc>
+          <w:tcPr>
+            <w:tcBorders>
+              <w:top w:val="single" w:space="0" w:color="D3D3D3"/>
+              <w:bottom w:val="single" w:space="0" w:color="D3D3D3"/>
+              <w:start w:val="single" w:space="0" w:color="D3D3D3"/>
+              <w:end w:val="single" w:space="0" w:color="D3D3D3"/>
+            </w:tcBorders>
+          </w:tcPr>
+          <w:p>
+            <w:pPr>
+              <w:spacing w:before="0" w:after="60"/>
+              <w:keepNext/>
+              <w:jc w:val="start"/>
+            </w:pPr>
+            <w:r>
+              <w:rPr>
+                <w:rFonts w:ascii="Calibri" w:hAnsi="Calibri"/>
+                <w:sz w:val="20"/>
+              </w:rPr>
+              <w:t xml:space="default">Propane Unvented Wall Heater</w:t>
+            </w:r>
+          </w:p>
+        </w:tc>
+      </w:tr>
+      <w:tr>
+        <w:trPr>
+          <w:cantSplit/>
+        </w:trPr>
+        <w:tc>
+          <w:tcPr>
+            <w:tcBorders>
+              <w:top w:val="single" w:space="0" w:color="D3D3D3"/>
+              <w:bottom w:val="single" w:space="0" w:color="D3D3D3"/>
+              <w:start w:val="single" w:space="0" w:color="D3D3D3"/>
+              <w:end w:val="single" w:space="0" w:color="D3D3D3"/>
+            </w:tcBorders>
+          </w:tcPr>
+          <w:p>
+            <w:pPr>
+              <w:spacing w:before="0" w:after="60"/>
+              <w:keepNext/>
+              <w:jc w:val="start"/>
+            </w:pPr>
+            <w:r>
+              <w:rPr>
+                <w:rFonts w:ascii="Calibri" w:hAnsi="Calibri"/>
+                <w:sz w:val="20"/>
+              </w:rPr>
+              <w:t xml:space="default">Appliance 3:</w:t>
+            </w:r>
+          </w:p>
+        </w:tc>
+        <w:tc>
+          <w:tcPr>
+            <w:tcBorders>
+              <w:top w:val="single" w:space="0" w:color="D3D3D3"/>
+              <w:bottom w:val="single" w:space="0" w:color="D3D3D3"/>
+              <w:start w:val="single" w:space="0" w:color="D3D3D3"/>
+              <w:end w:val="single" w:space="0" w:color="D3D3D3"/>
+            </w:tcBorders>
+          </w:tcPr>
+          <w:p>
+            <w:pPr>
+              <w:spacing w:before="0" w:after="60"/>
+              <w:keepNext/>
+              <w:jc w:val="start"/>
+            </w:pPr>
+            <w:r>
+              <w:rPr>
+                <w:rFonts w:ascii="Calibri" w:hAnsi="Calibri"/>
+                <w:sz w:val="20"/>
+              </w:rPr>
+              <w:t xml:space="default">Gas Oven</w:t>
+            </w:r>
+          </w:p>
+        </w:tc>
+      </w:tr>
+      <w:tr>
+        <w:trPr>
+          <w:cantSplit/>
+        </w:trPr>
+        <w:tc>
+          <w:tcPr>
+            <w:tcBorders>
+              <w:top w:val="single" w:space="0" w:color="D3D3D3"/>
+              <w:bottom w:val="single" w:space="0" w:color="D3D3D3"/>
+              <w:start w:val="single" w:space="0" w:color="D3D3D3"/>
+              <w:end w:val="single" w:space="0" w:color="D3D3D3"/>
+            </w:tcBorders>
+          </w:tcPr>
+          <w:p>
+            <w:pPr>
+              <w:spacing w:before="0" w:after="60"/>
+              <w:keepNext/>
+              <w:jc w:val="start"/>
+            </w:pPr>
+            <w:r>
+              <w:rPr>
+                <w:rFonts w:ascii="Calibri" w:hAnsi="Calibri"/>
+                <w:sz w:val="20"/>
+              </w:rPr>
+              <w:t xml:space="default">Other Combustion Appliances:</w:t>
+            </w:r>
+          </w:p>
+        </w:tc>
+        <w:tc>
+          <w:tcPr>
+            <w:tcBorders>
+              <w:top w:val="single" w:space="0" w:color="D3D3D3"/>
+              <w:bottom w:val="single" w:space="0" w:color="D3D3D3"/>
+              <w:start w:val="single" w:space="0" w:color="D3D3D3"/>
+              <w:end w:val="single" w:space="0" w:color="D3D3D3"/>
+            </w:tcBorders>
+          </w:tcPr>
+          <w:p>
+            <w:pPr>
+              <w:spacing w:before="0" w:after="60"/>
+              <w:keepNext/>
+              <w:jc w:val="start"/>
+            </w:pPr>
+            <w:r>
+              <w:rPr>
+                <w:rFonts w:ascii="Calibri" w:hAnsi="Calibri"/>
+                <w:sz w:val="20"/>
+              </w:rPr>
+              <w:t xml:space="default">Gas Dryer</w:t>
+            </w:r>
+          </w:p>
+        </w:tc>
+      </w:tr>
+      <w:tr>
+        <w:trPr>
+          <w:cantSplit/>
+        </w:trPr>
+        <w:tc>
+          <w:tcPr>
+            <w:tcBorders>
+              <w:top w:val="single" w:space="0" w:color="D3D3D3"/>
+              <w:bottom w:val="single" w:space="0" w:color="D3D3D3"/>
+              <w:start w:val="single" w:space="0" w:color="D3D3D3"/>
+              <w:end w:val="single" w:space="0" w:color="D3D3D3"/>
+            </w:tcBorders>
+          </w:tcPr>
+          <w:p>
+            <w:pPr>
+              <w:spacing w:before="0" w:after="60"/>
+              <w:keepNext/>
+              <w:jc w:val="start"/>
+            </w:pPr>
+            <w:r>
+              <w:rPr>
+                <w:rFonts w:ascii="Calibri" w:hAnsi="Calibri"/>
+                <w:sz w:val="20"/>
+              </w:rPr>
+              <w:t xml:space="default">Other:</w:t>
+            </w:r>
+          </w:p>
+        </w:tc>
+        <w:tc>
+          <w:tcPr>
+            <w:tcBorders>
+              <w:top w:val="single" w:space="0" w:color="D3D3D3"/>
+              <w:bottom w:val="single" w:space="0" w:color="D3D3D3"/>
+              <w:start w:val="single" w:space="0" w:color="D3D3D3"/>
+              <w:end w:val="single" w:space="0" w:color="D3D3D3"/>
+            </w:tcBorders>
+          </w:tcPr>
+          <w:p>
+            <w:pPr>
+              <w:spacing w:before="0" w:after="60"/>
+              <w:keepNext/>
+              <w:jc w:val="start"/>
+            </w:pPr>
+            <w:r>
+              <w:rPr>
+                <w:rFonts w:ascii="Calibri" w:hAnsi="Calibri"/>
+                <w:sz w:val="20"/>
+              </w:rPr>
+              <w:t xml:space="default">**Make rows for all other appliances including fridges, freezers, any combustion appliances that are not included above, electric heating, AC units, ...**</w:t>
             </w:r>
           </w:p>
         </w:tc>

</xml_diff>

<commit_message>
Add detail to appliances section
</commit_message>
<xml_diff>
--- a/Quarto_report/Audit_Report.docx
+++ b/Quarto_report/Audit_Report.docx
@@ -25,7 +25,7 @@
         <w:t xml:space="preserve"> </w:t>
       </w:r>
       <w:r>
-        <w:t xml:space="preserve">Jackie Lola</w:t>
+        <w:t xml:space="preserve">Dan Fernald, Katy Fernald</w:t>
       </w:r>
     </w:p>
     <w:p>
@@ -43,7 +43,7 @@
         <w:t xml:space="preserve"> </w:t>
       </w:r>
       <w:r>
-        <w:t xml:space="preserve">106 Thunder Road Perry, Maine, 04667</w:t>
+        <w:t xml:space="preserve">16 Mosswood Rd Islesford, ME 04646</w:t>
       </w:r>
     </w:p>
     <w:p>
@@ -61,7 +61,7 @@
         <w:t xml:space="preserve"> </w:t>
       </w:r>
       <w:r>
-        <w:t xml:space="preserve">NA</w:t>
+        <w:t xml:space="preserve">islesfordartists@gmail.com, (207) 244-3145</w:t>
       </w:r>
     </w:p>
     <w:p>
@@ -79,7 +79,7 @@
         <w:t xml:space="preserve"> </w:t>
       </w:r>
       <w:r>
-        <w:t xml:space="preserve">Helen Lloyd, Tyler Hebert, Raquel Longfellow</w:t>
+        <w:t xml:space="preserve">David Gibson, Pema Lhundrup, Mabon Young, Rashmi Mohan</w:t>
       </w:r>
     </w:p>
     <w:p>
@@ -130,7 +130,7 @@
         <w:pStyle w:val="FirstParagraph"/>
       </w:pPr>
       <w:r>
-        <w:t xml:space="preserve">We conducted an energy assessment of your home on 7/10/2025. This report will tell you what we did, what we found, and what we suggest for your home. These suggestions include information on incentives and financing to make improvements more affordable.</w:t>
+        <w:t xml:space="preserve">We conducted an energy assessment of your home on 6/23/2025. This report will tell you what we did, what we found, and what we suggest for your home. These suggestions include information on incentives and financing to make improvements more affordable.</w:t>
       </w:r>
     </w:p>
     <w:p>
@@ -304,7 +304,7 @@
         <w:pStyle w:val="FirstParagraph"/>
       </w:pPr>
       <w:r>
-        <w:t xml:space="preserve">We assessed combustion appliances that burn fossil fuels such as propane, heating oil, or kerosene. These include furnaces, boilers, water heaters, and gas ovens. We visually inspected the combustion appliance(s) in your home, but we were unable to perform combustion safety tests. We also performed gas leak detection tests on your propane appliance(s).</w:t>
+        <w:t xml:space="preserve">We assessed combustion appliances that burn fossil fuels such as propane, heating oil, or kerosene. These include furnaces, boilers, water heaters, and gas ovens. We visually inspected the combustion appliance(s) in your home, as well as conducted combustion safety tests. This included measuring for carbon monoxide and testing that flue gases are properly exhausting from the home. We also performed gas leak detection tests on your propane appliance(s).</w:t>
       </w:r>
     </w:p>
     <w:p>
@@ -419,31 +419,31 @@
                 <w:rFonts w:ascii="Calibri" w:hAnsi="Calibri"/>
                 <w:sz w:val="20"/>
               </w:rPr>
-              <w:t xml:space="default">Solar</w:t>
-            </w:r>
-          </w:p>
-        </w:tc>
-        <w:tc>
-          <w:tcPr>
-            <w:tcBorders>
-              <w:top w:val="single" w:space="0" w:color="D3D3D3"/>
-              <w:bottom w:val="single" w:space="0" w:color="D3D3D3"/>
-              <w:start w:val="single" w:space="0" w:color="D3D3D3"/>
-              <w:end w:val="single" w:space="0" w:color="D3D3D3"/>
-            </w:tcBorders>
-          </w:tcPr>
-          <w:p>
-            <w:pPr>
-              <w:spacing w:before="0" w:after="60"/>
-              <w:keepNext/>
-              <w:jc w:val="start"/>
-            </w:pPr>
-            <w:r>
-              <w:rPr>
-                <w:rFonts w:ascii="Calibri" w:hAnsi="Calibri"/>
-                <w:sz w:val="20"/>
-              </w:rPr>
-              <w:t xml:space="default">Rooftop solar can supply most or all of your home electrical demands. Contact a solar company for pricing and details specific to your home.</w:t>
+              <w:t xml:space="default">Furnace/Boiler Tune-up</w:t>
+            </w:r>
+          </w:p>
+        </w:tc>
+        <w:tc>
+          <w:tcPr>
+            <w:tcBorders>
+              <w:top w:val="single" w:space="0" w:color="D3D3D3"/>
+              <w:bottom w:val="single" w:space="0" w:color="D3D3D3"/>
+              <w:start w:val="single" w:space="0" w:color="D3D3D3"/>
+              <w:end w:val="single" w:space="0" w:color="D3D3D3"/>
+            </w:tcBorders>
+          </w:tcPr>
+          <w:p>
+            <w:pPr>
+              <w:spacing w:before="0" w:after="60"/>
+              <w:keepNext/>
+              <w:jc w:val="start"/>
+            </w:pPr>
+            <w:r>
+              <w:rPr>
+                <w:rFonts w:ascii="Calibri" w:hAnsi="Calibri"/>
+                <w:sz w:val="20"/>
+              </w:rPr>
+              <w:t xml:space="default">Have the furnace/boiler and flue inspected and adjusted by a licensed professional. This should be available from your fuel delivery company.</w:t>
             </w:r>
           </w:p>
         </w:tc>
@@ -472,31 +472,31 @@
                 <w:rFonts w:ascii="Calibri" w:hAnsi="Calibri"/>
                 <w:sz w:val="20"/>
               </w:rPr>
-              <w:t xml:space="default">Misc. Air Sealing and Insulation</w:t>
-            </w:r>
-          </w:p>
-        </w:tc>
-        <w:tc>
-          <w:tcPr>
-            <w:tcBorders>
-              <w:top w:val="single" w:space="0" w:color="D3D3D3"/>
-              <w:bottom w:val="single" w:space="0" w:color="D3D3D3"/>
-              <w:start w:val="single" w:space="0" w:color="D3D3D3"/>
-              <w:end w:val="single" w:space="0" w:color="D3D3D3"/>
-            </w:tcBorders>
-          </w:tcPr>
-          <w:p>
-            <w:pPr>
-              <w:spacing w:before="0" w:after="60"/>
-              <w:keepNext/>
-              <w:jc w:val="start"/>
-            </w:pPr>
-            <w:r>
-              <w:rPr>
-                <w:rFonts w:ascii="Calibri" w:hAnsi="Calibri"/>
-                <w:sz w:val="20"/>
-              </w:rPr>
-              <w:t xml:space="default">Air seal and insulate [** insert auditor description - bay window, bulkhead door, chase, kneewall, anything else that is unique to the home and not otherwise covered in another recommendation]</w:t>
+              <w:t xml:space="default">High-efficiency Shower Head(s)</w:t>
+            </w:r>
+          </w:p>
+        </w:tc>
+        <w:tc>
+          <w:tcPr>
+            <w:tcBorders>
+              <w:top w:val="single" w:space="0" w:color="D3D3D3"/>
+              <w:bottom w:val="single" w:space="0" w:color="D3D3D3"/>
+              <w:start w:val="single" w:space="0" w:color="D3D3D3"/>
+              <w:end w:val="single" w:space="0" w:color="D3D3D3"/>
+            </w:tcBorders>
+          </w:tcPr>
+          <w:p>
+            <w:pPr>
+              <w:spacing w:before="0" w:after="60"/>
+              <w:keepNext/>
+              <w:jc w:val="start"/>
+            </w:pPr>
+            <w:r>
+              <w:rPr>
+                <w:rFonts w:ascii="Calibri" w:hAnsi="Calibri"/>
+                <w:sz w:val="20"/>
+              </w:rPr>
+              <w:t xml:space="default">Install high-efficiency shower heads to reduce the amount of water and energy to heat the water used when showering.</w:t>
             </w:r>
           </w:p>
         </w:tc>
@@ -525,31 +525,31 @@
                 <w:rFonts w:ascii="Calibri" w:hAnsi="Calibri"/>
                 <w:sz w:val="20"/>
               </w:rPr>
-              <w:t xml:space="default">Furnace/Boiler Tune-up</w:t>
-            </w:r>
-          </w:p>
-        </w:tc>
-        <w:tc>
-          <w:tcPr>
-            <w:tcBorders>
-              <w:top w:val="single" w:space="0" w:color="D3D3D3"/>
-              <w:bottom w:val="single" w:space="0" w:color="D3D3D3"/>
-              <w:start w:val="single" w:space="0" w:color="D3D3D3"/>
-              <w:end w:val="single" w:space="0" w:color="D3D3D3"/>
-            </w:tcBorders>
-          </w:tcPr>
-          <w:p>
-            <w:pPr>
-              <w:spacing w:before="0" w:after="60"/>
-              <w:keepNext/>
-              <w:jc w:val="start"/>
-            </w:pPr>
-            <w:r>
-              <w:rPr>
-                <w:rFonts w:ascii="Calibri" w:hAnsi="Calibri"/>
-                <w:sz w:val="20"/>
-              </w:rPr>
-              <w:t xml:space="default">Have the furnace/boiler and flue inspected and adjusted by a licensed professional. This should be available from your fuel delivery company.</w:t>
+              <w:t xml:space="default">WindowDressers</w:t>
+            </w:r>
+          </w:p>
+        </w:tc>
+        <w:tc>
+          <w:tcPr>
+            <w:tcBorders>
+              <w:top w:val="single" w:space="0" w:color="D3D3D3"/>
+              <w:bottom w:val="single" w:space="0" w:color="D3D3D3"/>
+              <w:start w:val="single" w:space="0" w:color="D3D3D3"/>
+              <w:end w:val="single" w:space="0" w:color="D3D3D3"/>
+            </w:tcBorders>
+          </w:tcPr>
+          <w:p>
+            <w:pPr>
+              <w:spacing w:before="0" w:after="60"/>
+              <w:keepNext/>
+              <w:jc w:val="start"/>
+            </w:pPr>
+            <w:r>
+              <w:rPr>
+                <w:rFonts w:ascii="Calibri" w:hAnsi="Calibri"/>
+                <w:sz w:val="20"/>
+              </w:rPr>
+              <w:t xml:space="default">WindowDressers are insulating window inserts that help air-seal windows and reduce heat loss and gain.</w:t>
             </w:r>
           </w:p>
         </w:tc>
@@ -578,31 +578,31 @@
                 <w:rFonts w:ascii="Calibri" w:hAnsi="Calibri"/>
                 <w:sz w:val="20"/>
               </w:rPr>
-              <w:t xml:space="default">High-efficiency Shower Head(s)</w:t>
-            </w:r>
-          </w:p>
-        </w:tc>
-        <w:tc>
-          <w:tcPr>
-            <w:tcBorders>
-              <w:top w:val="single" w:space="0" w:color="D3D3D3"/>
-              <w:bottom w:val="single" w:space="0" w:color="D3D3D3"/>
-              <w:start w:val="single" w:space="0" w:color="D3D3D3"/>
-              <w:end w:val="single" w:space="0" w:color="D3D3D3"/>
-            </w:tcBorders>
-          </w:tcPr>
-          <w:p>
-            <w:pPr>
-              <w:spacing w:before="0" w:after="60"/>
-              <w:keepNext/>
-              <w:jc w:val="start"/>
-            </w:pPr>
-            <w:r>
-              <w:rPr>
-                <w:rFonts w:ascii="Calibri" w:hAnsi="Calibri"/>
-                <w:sz w:val="20"/>
-              </w:rPr>
-              <w:t xml:space="default">Install high-efficiency shower heads to reduce the amount of water and energy to heat the water used when showering.</w:t>
+              <w:t xml:space="default">Freezer</w:t>
+            </w:r>
+          </w:p>
+        </w:tc>
+        <w:tc>
+          <w:tcPr>
+            <w:tcBorders>
+              <w:top w:val="single" w:space="0" w:color="D3D3D3"/>
+              <w:bottom w:val="single" w:space="0" w:color="D3D3D3"/>
+              <w:start w:val="single" w:space="0" w:color="D3D3D3"/>
+              <w:end w:val="single" w:space="0" w:color="D3D3D3"/>
+            </w:tcBorders>
+          </w:tcPr>
+          <w:p>
+            <w:pPr>
+              <w:spacing w:before="0" w:after="60"/>
+              <w:keepNext/>
+              <w:jc w:val="start"/>
+            </w:pPr>
+            <w:r>
+              <w:rPr>
+                <w:rFonts w:ascii="Calibri" w:hAnsi="Calibri"/>
+                <w:sz w:val="20"/>
+              </w:rPr>
+              <w:t xml:space="default">Replace your freezer with a new, EnergyStar certified freezer. Look at the Energy Guide label to compare the energy use of new freezers.</w:t>
             </w:r>
           </w:p>
         </w:tc>
@@ -631,31 +631,31 @@
                 <w:rFonts w:ascii="Calibri" w:hAnsi="Calibri"/>
                 <w:sz w:val="20"/>
               </w:rPr>
-              <w:t xml:space="default">LEDs</w:t>
-            </w:r>
-          </w:p>
-        </w:tc>
-        <w:tc>
-          <w:tcPr>
-            <w:tcBorders>
-              <w:top w:val="single" w:space="0" w:color="D3D3D3"/>
-              <w:bottom w:val="single" w:space="0" w:color="D3D3D3"/>
-              <w:start w:val="single" w:space="0" w:color="D3D3D3"/>
-              <w:end w:val="single" w:space="0" w:color="D3D3D3"/>
-            </w:tcBorders>
-          </w:tcPr>
-          <w:p>
-            <w:pPr>
-              <w:spacing w:before="0" w:after="60"/>
-              <w:keepNext/>
-              <w:jc w:val="start"/>
-            </w:pPr>
-            <w:r>
-              <w:rPr>
-                <w:rFonts w:ascii="Calibri" w:hAnsi="Calibri"/>
-                <w:sz w:val="20"/>
-              </w:rPr>
-              <w:t xml:space="default">Switch your light bulbs to LED light bulbs. LEDs use 80% less energy than incandescent light bulbs, which can significantly reduce your electricity bill.</w:t>
+              <w:t xml:space="default">Induction Stove/Oven</w:t>
+            </w:r>
+          </w:p>
+        </w:tc>
+        <w:tc>
+          <w:tcPr>
+            <w:tcBorders>
+              <w:top w:val="single" w:space="0" w:color="D3D3D3"/>
+              <w:bottom w:val="single" w:space="0" w:color="D3D3D3"/>
+              <w:start w:val="single" w:space="0" w:color="D3D3D3"/>
+              <w:end w:val="single" w:space="0" w:color="D3D3D3"/>
+            </w:tcBorders>
+          </w:tcPr>
+          <w:p>
+            <w:pPr>
+              <w:spacing w:before="0" w:after="60"/>
+              <w:keepNext/>
+              <w:jc w:val="start"/>
+            </w:pPr>
+            <w:r>
+              <w:rPr>
+                <w:rFonts w:ascii="Calibri" w:hAnsi="Calibri"/>
+                <w:sz w:val="20"/>
+              </w:rPr>
+              <w:t xml:space="default">Induction cooking appliances are more efficient and safer than electric or gas ones. There is no risk of carbon monoxide or other harmful combustion gases, and the surface doesn’t heat up without a pot or pan on it.</w:t>
             </w:r>
           </w:p>
         </w:tc>
@@ -684,31 +684,31 @@
                 <w:rFonts w:ascii="Calibri" w:hAnsi="Calibri"/>
                 <w:sz w:val="20"/>
               </w:rPr>
-              <w:t xml:space="default">Refrigerator</w:t>
-            </w:r>
-          </w:p>
-        </w:tc>
-        <w:tc>
-          <w:tcPr>
-            <w:tcBorders>
-              <w:top w:val="single" w:space="0" w:color="D3D3D3"/>
-              <w:bottom w:val="single" w:space="0" w:color="D3D3D3"/>
-              <w:start w:val="single" w:space="0" w:color="D3D3D3"/>
-              <w:end w:val="single" w:space="0" w:color="D3D3D3"/>
-            </w:tcBorders>
-          </w:tcPr>
-          <w:p>
-            <w:pPr>
-              <w:spacing w:before="0" w:after="60"/>
-              <w:keepNext/>
-              <w:jc w:val="start"/>
-            </w:pPr>
-            <w:r>
-              <w:rPr>
-                <w:rFonts w:ascii="Calibri" w:hAnsi="Calibri"/>
-                <w:sz w:val="20"/>
-              </w:rPr>
-              <w:t xml:space="default">Replace your refrigerator with a new, EnergyStar-certified fridge. Look at the Energy Guide label to compare the energy use of new refrigerators.</w:t>
+              <w:t xml:space="default">Bathroom Exhaust Fan(s)</w:t>
+            </w:r>
+          </w:p>
+        </w:tc>
+        <w:tc>
+          <w:tcPr>
+            <w:tcBorders>
+              <w:top w:val="single" w:space="0" w:color="D3D3D3"/>
+              <w:bottom w:val="single" w:space="0" w:color="D3D3D3"/>
+              <w:start w:val="single" w:space="0" w:color="D3D3D3"/>
+              <w:end w:val="single" w:space="0" w:color="D3D3D3"/>
+            </w:tcBorders>
+          </w:tcPr>
+          <w:p>
+            <w:pPr>
+              <w:spacing w:before="0" w:after="60"/>
+              <w:keepNext/>
+              <w:jc w:val="start"/>
+            </w:pPr>
+            <w:r>
+              <w:rPr>
+                <w:rFonts w:ascii="Calibri" w:hAnsi="Calibri"/>
+                <w:sz w:val="20"/>
+              </w:rPr>
+              <w:t xml:space="default">Install bathroom exhaust fans in all bathrooms that do not have them. These should be rated for at least 80 cubic feet per minute (CFM) if there is a shower. We recommend the Panasonic Whisper series or similar fans that don’t create excess noise.</w:t>
             </w:r>
           </w:p>
         </w:tc>
@@ -737,31 +737,31 @@
                 <w:rFonts w:ascii="Calibri" w:hAnsi="Calibri"/>
                 <w:sz w:val="20"/>
               </w:rPr>
-              <w:t xml:space="default">Induction Stove/Oven</w:t>
-            </w:r>
-          </w:p>
-        </w:tc>
-        <w:tc>
-          <w:tcPr>
-            <w:tcBorders>
-              <w:top w:val="single" w:space="0" w:color="D3D3D3"/>
-              <w:bottom w:val="single" w:space="0" w:color="D3D3D3"/>
-              <w:start w:val="single" w:space="0" w:color="D3D3D3"/>
-              <w:end w:val="single" w:space="0" w:color="D3D3D3"/>
-            </w:tcBorders>
-          </w:tcPr>
-          <w:p>
-            <w:pPr>
-              <w:spacing w:before="0" w:after="60"/>
-              <w:keepNext/>
-              <w:jc w:val="start"/>
-            </w:pPr>
-            <w:r>
-              <w:rPr>
-                <w:rFonts w:ascii="Calibri" w:hAnsi="Calibri"/>
-                <w:sz w:val="20"/>
-              </w:rPr>
-              <w:t xml:space="default">Induction cooking appliances are more efficient and safer than electric or gas ones. There is no risk of carbon monoxide or other harmful combustion gases, and the surface doesn’t heat up without a pot or pan on it.</w:t>
+              <w:t xml:space="default">Kitchen Exhaust Fan</w:t>
+            </w:r>
+          </w:p>
+        </w:tc>
+        <w:tc>
+          <w:tcPr>
+            <w:tcBorders>
+              <w:top w:val="single" w:space="0" w:color="D3D3D3"/>
+              <w:bottom w:val="single" w:space="0" w:color="D3D3D3"/>
+              <w:start w:val="single" w:space="0" w:color="D3D3D3"/>
+              <w:end w:val="single" w:space="0" w:color="D3D3D3"/>
+            </w:tcBorders>
+          </w:tcPr>
+          <w:p>
+            <w:pPr>
+              <w:spacing w:before="0" w:after="60"/>
+              <w:keepNext/>
+              <w:jc w:val="start"/>
+            </w:pPr>
+            <w:r>
+              <w:rPr>
+                <w:rFonts w:ascii="Calibri" w:hAnsi="Calibri"/>
+                <w:sz w:val="20"/>
+              </w:rPr>
+              <w:t xml:space="default">Install a kitchen exhaust fan to remove cooking fumes and moisture from your home. The fan should be rated for at least 100 cubic feet per minute. A kitchen fan should be ducted to the outdoors. If the ductwork will run through the attic, it should be installed before the attic is air-sealed and insulated.</w:t>
             </w:r>
           </w:p>
         </w:tc>
@@ -790,31 +790,31 @@
                 <w:rFonts w:ascii="Calibri" w:hAnsi="Calibri"/>
                 <w:sz w:val="20"/>
               </w:rPr>
-              <w:t xml:space="default">Gutters</w:t>
-            </w:r>
-          </w:p>
-        </w:tc>
-        <w:tc>
-          <w:tcPr>
-            <w:tcBorders>
-              <w:top w:val="single" w:space="0" w:color="D3D3D3"/>
-              <w:bottom w:val="single" w:space="0" w:color="D3D3D3"/>
-              <w:start w:val="single" w:space="0" w:color="D3D3D3"/>
-              <w:end w:val="single" w:space="0" w:color="D3D3D3"/>
-            </w:tcBorders>
-          </w:tcPr>
-          <w:p>
-            <w:pPr>
-              <w:spacing w:before="0" w:after="60"/>
-              <w:keepNext/>
-              <w:jc w:val="start"/>
-            </w:pPr>
-            <w:r>
-              <w:rPr>
-                <w:rFonts w:ascii="Calibri" w:hAnsi="Calibri"/>
-                <w:sz w:val="20"/>
-              </w:rPr>
-              <w:t xml:space="default">Install gutters and downspouts that divert water at least six feet away from the foundation and to where the ground slopes away from the house.</w:t>
+              <w:t xml:space="default">Vapor Barrier</w:t>
+            </w:r>
+          </w:p>
+        </w:tc>
+        <w:tc>
+          <w:tcPr>
+            <w:tcBorders>
+              <w:top w:val="single" w:space="0" w:color="D3D3D3"/>
+              <w:bottom w:val="single" w:space="0" w:color="D3D3D3"/>
+              <w:start w:val="single" w:space="0" w:color="D3D3D3"/>
+              <w:end w:val="single" w:space="0" w:color="D3D3D3"/>
+            </w:tcBorders>
+          </w:tcPr>
+          <w:p>
+            <w:pPr>
+              <w:spacing w:before="0" w:after="60"/>
+              <w:keepNext/>
+              <w:jc w:val="start"/>
+            </w:pPr>
+            <w:r>
+              <w:rPr>
+                <w:rFonts w:ascii="Calibri" w:hAnsi="Calibri"/>
+                <w:sz w:val="20"/>
+              </w:rPr>
+              <w:t xml:space="default">Install a vapor barrier on the basement floor to stop moisture from entering the basement and house.</w:t>
             </w:r>
           </w:p>
         </w:tc>
@@ -843,31 +843,31 @@
                 <w:rFonts w:ascii="Calibri" w:hAnsi="Calibri"/>
                 <w:sz w:val="20"/>
               </w:rPr>
-              <w:t xml:space="default">Bathroom Exhaust Fan(s)</w:t>
-            </w:r>
-          </w:p>
-        </w:tc>
-        <w:tc>
-          <w:tcPr>
-            <w:tcBorders>
-              <w:top w:val="single" w:space="0" w:color="D3D3D3"/>
-              <w:bottom w:val="single" w:space="0" w:color="D3D3D3"/>
-              <w:start w:val="single" w:space="0" w:color="D3D3D3"/>
-              <w:end w:val="single" w:space="0" w:color="D3D3D3"/>
-            </w:tcBorders>
-          </w:tcPr>
-          <w:p>
-            <w:pPr>
-              <w:spacing w:before="0" w:after="60"/>
-              <w:keepNext/>
-              <w:jc w:val="start"/>
-            </w:pPr>
-            <w:r>
-              <w:rPr>
-                <w:rFonts w:ascii="Calibri" w:hAnsi="Calibri"/>
-                <w:sz w:val="20"/>
-              </w:rPr>
-              <w:t xml:space="default">Install bathroom exhaust fans in all bathrooms that do not have them. These should be rated for at least 80 cubic feet per minute (CFM) if there is a shower. We recommend the Panasonic Whisper series or similar fans that don’t create excess noise.</w:t>
+              <w:t xml:space="default">Spray Foam Basement/Crawlspace Walls</w:t>
+            </w:r>
+          </w:p>
+        </w:tc>
+        <w:tc>
+          <w:tcPr>
+            <w:tcBorders>
+              <w:top w:val="single" w:space="0" w:color="D3D3D3"/>
+              <w:bottom w:val="single" w:space="0" w:color="D3D3D3"/>
+              <w:start w:val="single" w:space="0" w:color="D3D3D3"/>
+              <w:end w:val="single" w:space="0" w:color="D3D3D3"/>
+            </w:tcBorders>
+          </w:tcPr>
+          <w:p>
+            <w:pPr>
+              <w:spacing w:before="0" w:after="60"/>
+              <w:keepNext/>
+              <w:jc w:val="start"/>
+            </w:pPr>
+            <w:r>
+              <w:rPr>
+                <w:rFonts w:ascii="Calibri" w:hAnsi="Calibri"/>
+                <w:sz w:val="20"/>
+              </w:rPr>
+              <w:t xml:space="default">Install spray foam on the basement/crawlspace walls to prevent moisture infiltration and reduce heat loss.</w:t>
             </w:r>
           </w:p>
         </w:tc>
@@ -896,31 +896,31 @@
                 <w:rFonts w:ascii="Calibri" w:hAnsi="Calibri"/>
                 <w:sz w:val="20"/>
               </w:rPr>
-              <w:t xml:space="default">Kitchen Exhaust Fan</w:t>
-            </w:r>
-          </w:p>
-        </w:tc>
-        <w:tc>
-          <w:tcPr>
-            <w:tcBorders>
-              <w:top w:val="single" w:space="0" w:color="D3D3D3"/>
-              <w:bottom w:val="single" w:space="0" w:color="D3D3D3"/>
-              <w:start w:val="single" w:space="0" w:color="D3D3D3"/>
-              <w:end w:val="single" w:space="0" w:color="D3D3D3"/>
-            </w:tcBorders>
-          </w:tcPr>
-          <w:p>
-            <w:pPr>
-              <w:spacing w:before="0" w:after="60"/>
-              <w:keepNext/>
-              <w:jc w:val="start"/>
-            </w:pPr>
-            <w:r>
-              <w:rPr>
-                <w:rFonts w:ascii="Calibri" w:hAnsi="Calibri"/>
-                <w:sz w:val="20"/>
-              </w:rPr>
-              <w:t xml:space="default">Install a kitchen exhaust fan to remove cooking fumes and moisture from your home. The fan should be rated for at least 100 cubic feet per minute. A kitchen fan should be ducted to the outdoors. If the ductwork will run through the attic, it should be installed before the attic is air-sealed and insulated.</w:t>
+              <w:t xml:space="default">Attic Air Sealing and Insulation</w:t>
+            </w:r>
+          </w:p>
+        </w:tc>
+        <w:tc>
+          <w:tcPr>
+            <w:tcBorders>
+              <w:top w:val="single" w:space="0" w:color="D3D3D3"/>
+              <w:bottom w:val="single" w:space="0" w:color="D3D3D3"/>
+              <w:start w:val="single" w:space="0" w:color="D3D3D3"/>
+              <w:end w:val="single" w:space="0" w:color="D3D3D3"/>
+            </w:tcBorders>
+          </w:tcPr>
+          <w:p>
+            <w:pPr>
+              <w:spacing w:before="0" w:after="60"/>
+              <w:keepNext/>
+              <w:jc w:val="start"/>
+            </w:pPr>
+            <w:r>
+              <w:rPr>
+                <w:rFonts w:ascii="Calibri" w:hAnsi="Calibri"/>
+                <w:sz w:val="20"/>
+              </w:rPr>
+              <w:t xml:space="default">Air seal the attic and insulate it to at least R-60 (18 inches of loose-fill cellulose insulation).</w:t>
             </w:r>
           </w:p>
         </w:tc>
@@ -949,31 +949,31 @@
                 <w:rFonts w:ascii="Calibri" w:hAnsi="Calibri"/>
                 <w:sz w:val="20"/>
               </w:rPr>
-              <w:t xml:space="default">Vapor Barrier</w:t>
-            </w:r>
-          </w:p>
-        </w:tc>
-        <w:tc>
-          <w:tcPr>
-            <w:tcBorders>
-              <w:top w:val="single" w:space="0" w:color="D3D3D3"/>
-              <w:bottom w:val="single" w:space="0" w:color="D3D3D3"/>
-              <w:start w:val="single" w:space="0" w:color="D3D3D3"/>
-              <w:end w:val="single" w:space="0" w:color="D3D3D3"/>
-            </w:tcBorders>
-          </w:tcPr>
-          <w:p>
-            <w:pPr>
-              <w:spacing w:before="0" w:after="60"/>
-              <w:keepNext/>
-              <w:jc w:val="start"/>
-            </w:pPr>
-            <w:r>
-              <w:rPr>
-                <w:rFonts w:ascii="Calibri" w:hAnsi="Calibri"/>
-                <w:sz w:val="20"/>
-              </w:rPr>
-              <w:t xml:space="default">Install a vapor barrier on the basement floor to stop moisture from entering the basement and house.</w:t>
+              <w:t xml:space="default">Blown-in Cellulose Wall Insulation</w:t>
+            </w:r>
+          </w:p>
+        </w:tc>
+        <w:tc>
+          <w:tcPr>
+            <w:tcBorders>
+              <w:top w:val="single" w:space="0" w:color="D3D3D3"/>
+              <w:bottom w:val="single" w:space="0" w:color="D3D3D3"/>
+              <w:start w:val="single" w:space="0" w:color="D3D3D3"/>
+              <w:end w:val="single" w:space="0" w:color="D3D3D3"/>
+            </w:tcBorders>
+          </w:tcPr>
+          <w:p>
+            <w:pPr>
+              <w:spacing w:before="0" w:after="60"/>
+              <w:keepNext/>
+              <w:jc w:val="start"/>
+            </w:pPr>
+            <w:r>
+              <w:rPr>
+                <w:rFonts w:ascii="Calibri" w:hAnsi="Calibri"/>
+                <w:sz w:val="20"/>
+              </w:rPr>
+              <w:t xml:space="default">Insulate the wall stud cavities with dense packed, blown-in cellulose insulation.</w:t>
             </w:r>
           </w:p>
         </w:tc>
@@ -1002,31 +1002,31 @@
                 <w:rFonts w:ascii="Calibri" w:hAnsi="Calibri"/>
                 <w:sz w:val="20"/>
               </w:rPr>
-              <w:t xml:space="default">Spray Foam Basement/Crawlspace Walls</w:t>
-            </w:r>
-          </w:p>
-        </w:tc>
-        <w:tc>
-          <w:tcPr>
-            <w:tcBorders>
-              <w:top w:val="single" w:space="0" w:color="D3D3D3"/>
-              <w:bottom w:val="single" w:space="0" w:color="D3D3D3"/>
-              <w:start w:val="single" w:space="0" w:color="D3D3D3"/>
-              <w:end w:val="single" w:space="0" w:color="D3D3D3"/>
-            </w:tcBorders>
-          </w:tcPr>
-          <w:p>
-            <w:pPr>
-              <w:spacing w:before="0" w:after="60"/>
-              <w:keepNext/>
-              <w:jc w:val="start"/>
-            </w:pPr>
-            <w:r>
-              <w:rPr>
-                <w:rFonts w:ascii="Calibri" w:hAnsi="Calibri"/>
-                <w:sz w:val="20"/>
-              </w:rPr>
-              <w:t xml:space="default">Install spray foam on the basement/crawlspace walls to prevent moisture infiltration and reduce heat loss.</w:t>
+              <w:t xml:space="default">Continuous Exterior Wall Insulation</w:t>
+            </w:r>
+          </w:p>
+        </w:tc>
+        <w:tc>
+          <w:tcPr>
+            <w:tcBorders>
+              <w:top w:val="single" w:space="0" w:color="D3D3D3"/>
+              <w:bottom w:val="single" w:space="0" w:color="D3D3D3"/>
+              <w:start w:val="single" w:space="0" w:color="D3D3D3"/>
+              <w:end w:val="single" w:space="0" w:color="D3D3D3"/>
+            </w:tcBorders>
+          </w:tcPr>
+          <w:p>
+            <w:pPr>
+              <w:spacing w:before="0" w:after="60"/>
+              <w:keepNext/>
+              <w:jc w:val="start"/>
+            </w:pPr>
+            <w:r>
+              <w:rPr>
+                <w:rFonts w:ascii="Calibri" w:hAnsi="Calibri"/>
+                <w:sz w:val="20"/>
+              </w:rPr>
+              <w:t xml:space="default">Add a continuous layer of insulation and potentially replace the air and moisture barrier once it becomes time to replace the siding.</w:t>
             </w:r>
           </w:p>
         </w:tc>
@@ -1055,31 +1055,31 @@
                 <w:rFonts w:ascii="Calibri" w:hAnsi="Calibri"/>
                 <w:sz w:val="20"/>
               </w:rPr>
-              <w:t xml:space="default">Attic Air Sealing and Insulation</w:t>
-            </w:r>
-          </w:p>
-        </w:tc>
-        <w:tc>
-          <w:tcPr>
-            <w:tcBorders>
-              <w:top w:val="single" w:space="0" w:color="D3D3D3"/>
-              <w:bottom w:val="single" w:space="0" w:color="D3D3D3"/>
-              <w:start w:val="single" w:space="0" w:color="D3D3D3"/>
-              <w:end w:val="single" w:space="0" w:color="D3D3D3"/>
-            </w:tcBorders>
-          </w:tcPr>
-          <w:p>
-            <w:pPr>
-              <w:spacing w:before="0" w:after="60"/>
-              <w:keepNext/>
-              <w:jc w:val="start"/>
-            </w:pPr>
-            <w:r>
-              <w:rPr>
-                <w:rFonts w:ascii="Calibri" w:hAnsi="Calibri"/>
-                <w:sz w:val="20"/>
-              </w:rPr>
-              <w:t xml:space="default">Air seal the attic and insulate it to at least R-60 (18 inches of loose-fill cellulose insulation).</w:t>
+              <w:t xml:space="default">Electrical Panel Upgrade</w:t>
+            </w:r>
+          </w:p>
+        </w:tc>
+        <w:tc>
+          <w:tcPr>
+            <w:tcBorders>
+              <w:top w:val="single" w:space="0" w:color="D3D3D3"/>
+              <w:bottom w:val="single" w:space="0" w:color="D3D3D3"/>
+              <w:start w:val="single" w:space="0" w:color="D3D3D3"/>
+              <w:end w:val="single" w:space="0" w:color="D3D3D3"/>
+            </w:tcBorders>
+          </w:tcPr>
+          <w:p>
+            <w:pPr>
+              <w:spacing w:before="0" w:after="60"/>
+              <w:keepNext/>
+              <w:jc w:val="start"/>
+            </w:pPr>
+            <w:r>
+              <w:rPr>
+                <w:rFonts w:ascii="Calibri" w:hAnsi="Calibri"/>
+                <w:sz w:val="20"/>
+              </w:rPr>
+              <w:t xml:space="default">Consult with an electrician about replacing your existing electrical panel with a 200 amp panel as you add electrical appliances to your home.</w:t>
             </w:r>
           </w:p>
         </w:tc>
@@ -1108,31 +1108,31 @@
                 <w:rFonts w:ascii="Calibri" w:hAnsi="Calibri"/>
                 <w:sz w:val="20"/>
               </w:rPr>
-              <w:t xml:space="default">Continuous Exterior Wall Insulation</w:t>
-            </w:r>
-          </w:p>
-        </w:tc>
-        <w:tc>
-          <w:tcPr>
-            <w:tcBorders>
-              <w:top w:val="single" w:space="0" w:color="D3D3D3"/>
-              <w:bottom w:val="single" w:space="0" w:color="D3D3D3"/>
-              <w:start w:val="single" w:space="0" w:color="D3D3D3"/>
-              <w:end w:val="single" w:space="0" w:color="D3D3D3"/>
-            </w:tcBorders>
-          </w:tcPr>
-          <w:p>
-            <w:pPr>
-              <w:spacing w:before="0" w:after="60"/>
-              <w:keepNext/>
-              <w:jc w:val="start"/>
-            </w:pPr>
-            <w:r>
-              <w:rPr>
-                <w:rFonts w:ascii="Calibri" w:hAnsi="Calibri"/>
-                <w:sz w:val="20"/>
-              </w:rPr>
-              <w:t xml:space="default">Add a continuous layer of insulation and potentially replace the air and moisture barrier once it becomes time to replace the siding.</w:t>
+              <w:t xml:space="default">Whole-House Surge Protection</w:t>
+            </w:r>
+          </w:p>
+        </w:tc>
+        <w:tc>
+          <w:tcPr>
+            <w:tcBorders>
+              <w:top w:val="single" w:space="0" w:color="D3D3D3"/>
+              <w:bottom w:val="single" w:space="0" w:color="D3D3D3"/>
+              <w:start w:val="single" w:space="0" w:color="D3D3D3"/>
+              <w:end w:val="single" w:space="0" w:color="D3D3D3"/>
+            </w:tcBorders>
+          </w:tcPr>
+          <w:p>
+            <w:pPr>
+              <w:spacing w:before="0" w:after="60"/>
+              <w:keepNext/>
+              <w:jc w:val="start"/>
+            </w:pPr>
+            <w:r>
+              <w:rPr>
+                <w:rFonts w:ascii="Calibri" w:hAnsi="Calibri"/>
+                <w:sz w:val="20"/>
+              </w:rPr>
+              <w:t xml:space="default">Upgrade your electrical panel to add whole-house surge protection.</w:t>
             </w:r>
           </w:p>
         </w:tc>
@@ -1161,31 +1161,31 @@
                 <w:rFonts w:ascii="Calibri" w:hAnsi="Calibri"/>
                 <w:sz w:val="20"/>
               </w:rPr>
-              <w:t xml:space="default">Electrical Panel Upgrade</w:t>
-            </w:r>
-          </w:p>
-        </w:tc>
-        <w:tc>
-          <w:tcPr>
-            <w:tcBorders>
-              <w:top w:val="single" w:space="0" w:color="D3D3D3"/>
-              <w:bottom w:val="single" w:space="0" w:color="D3D3D3"/>
-              <w:start w:val="single" w:space="0" w:color="D3D3D3"/>
-              <w:end w:val="single" w:space="0" w:color="D3D3D3"/>
-            </w:tcBorders>
-          </w:tcPr>
-          <w:p>
-            <w:pPr>
-              <w:spacing w:before="0" w:after="60"/>
-              <w:keepNext/>
-              <w:jc w:val="start"/>
-            </w:pPr>
-            <w:r>
-              <w:rPr>
-                <w:rFonts w:ascii="Calibri" w:hAnsi="Calibri"/>
-                <w:sz w:val="20"/>
-              </w:rPr>
-              <w:t xml:space="default">Consult with an electrician about replacing your existing electrical panel with a 200 amp panel as you add electrical appliances to your home.</w:t>
+              <w:t xml:space="default">Pipe Insulation</w:t>
+            </w:r>
+          </w:p>
+        </w:tc>
+        <w:tc>
+          <w:tcPr>
+            <w:tcBorders>
+              <w:top w:val="single" w:space="0" w:color="D3D3D3"/>
+              <w:bottom w:val="single" w:space="0" w:color="D3D3D3"/>
+              <w:start w:val="single" w:space="0" w:color="D3D3D3"/>
+              <w:end w:val="single" w:space="0" w:color="D3D3D3"/>
+            </w:tcBorders>
+          </w:tcPr>
+          <w:p>
+            <w:pPr>
+              <w:spacing w:before="0" w:after="60"/>
+              <w:keepNext/>
+              <w:jc w:val="start"/>
+            </w:pPr>
+            <w:r>
+              <w:rPr>
+                <w:rFonts w:ascii="Calibri" w:hAnsi="Calibri"/>
+                <w:sz w:val="20"/>
+              </w:rPr>
+              <w:t xml:space="default">Insulate both hot and cold water pipes that are uninsulated in the basement/crawlspace. This will save energy and prevent condensation.</w:t>
             </w:r>
           </w:p>
         </w:tc>
@@ -1214,31 +1214,31 @@
                 <w:rFonts w:ascii="Calibri" w:hAnsi="Calibri"/>
                 <w:sz w:val="20"/>
               </w:rPr>
-              <w:t xml:space="default">Air Source Heat Pump</w:t>
-            </w:r>
-          </w:p>
-        </w:tc>
-        <w:tc>
-          <w:tcPr>
-            <w:tcBorders>
-              <w:top w:val="single" w:space="0" w:color="D3D3D3"/>
-              <w:bottom w:val="single" w:space="0" w:color="D3D3D3"/>
-              <w:start w:val="single" w:space="0" w:color="D3D3D3"/>
-              <w:end w:val="single" w:space="0" w:color="D3D3D3"/>
-            </w:tcBorders>
-          </w:tcPr>
-          <w:p>
-            <w:pPr>
-              <w:spacing w:before="0" w:after="60"/>
-              <w:keepNext/>
-              <w:jc w:val="start"/>
-            </w:pPr>
-            <w:r>
-              <w:rPr>
-                <w:rFonts w:ascii="Calibri" w:hAnsi="Calibri"/>
-                <w:sz w:val="20"/>
-              </w:rPr>
-              <w:t xml:space="default">Install air source heat pumps for heating and cooling and whole-house surge protection.</w:t>
+              <w:t xml:space="default">DIY Air Sealing</w:t>
+            </w:r>
+          </w:p>
+        </w:tc>
+        <w:tc>
+          <w:tcPr>
+            <w:tcBorders>
+              <w:top w:val="single" w:space="0" w:color="D3D3D3"/>
+              <w:bottom w:val="single" w:space="0" w:color="D3D3D3"/>
+              <w:start w:val="single" w:space="0" w:color="D3D3D3"/>
+              <w:end w:val="single" w:space="0" w:color="D3D3D3"/>
+            </w:tcBorders>
+          </w:tcPr>
+          <w:p>
+            <w:pPr>
+              <w:spacing w:before="0" w:after="60"/>
+              <w:keepNext/>
+              <w:jc w:val="start"/>
+            </w:pPr>
+            <w:r>
+              <w:rPr>
+                <w:rFonts w:ascii="Calibri" w:hAnsi="Calibri"/>
+                <w:sz w:val="20"/>
+              </w:rPr>
+              <w:t xml:space="default">Seal easy-to-access air leaks and weatherstrip exterior doors.</w:t>
             </w:r>
           </w:p>
         </w:tc>
@@ -1267,31 +1267,31 @@
                 <w:rFonts w:ascii="Calibri" w:hAnsi="Calibri"/>
                 <w:sz w:val="20"/>
               </w:rPr>
-              <w:t xml:space="default">Whole-House Surge Protection</w:t>
-            </w:r>
-          </w:p>
-        </w:tc>
-        <w:tc>
-          <w:tcPr>
-            <w:tcBorders>
-              <w:top w:val="single" w:space="0" w:color="D3D3D3"/>
-              <w:bottom w:val="single" w:space="0" w:color="D3D3D3"/>
-              <w:start w:val="single" w:space="0" w:color="D3D3D3"/>
-              <w:end w:val="single" w:space="0" w:color="D3D3D3"/>
-            </w:tcBorders>
-          </w:tcPr>
-          <w:p>
-            <w:pPr>
-              <w:spacing w:before="0" w:after="60"/>
-              <w:keepNext/>
-              <w:jc w:val="start"/>
-            </w:pPr>
-            <w:r>
-              <w:rPr>
-                <w:rFonts w:ascii="Calibri" w:hAnsi="Calibri"/>
-                <w:sz w:val="20"/>
-              </w:rPr>
-              <w:t xml:space="default">Upgrade your electrical panel to add whole-house surge protection.</w:t>
+              <w:t xml:space="default">Other 1</w:t>
+            </w:r>
+          </w:p>
+        </w:tc>
+        <w:tc>
+          <w:tcPr>
+            <w:tcBorders>
+              <w:top w:val="single" w:space="0" w:color="D3D3D3"/>
+              <w:bottom w:val="single" w:space="0" w:color="D3D3D3"/>
+              <w:start w:val="single" w:space="0" w:color="D3D3D3"/>
+              <w:end w:val="single" w:space="0" w:color="D3D3D3"/>
+            </w:tcBorders>
+          </w:tcPr>
+          <w:p>
+            <w:pPr>
+              <w:spacing w:before="0" w:after="60"/>
+              <w:keepNext/>
+              <w:jc w:val="start"/>
+            </w:pPr>
+            <w:r>
+              <w:rPr>
+                <w:rFonts w:ascii="Calibri" w:hAnsi="Calibri"/>
+                <w:sz w:val="20"/>
+              </w:rPr>
+              <w:t xml:space="default">TYPE HERE 1</w:t>
             </w:r>
           </w:p>
         </w:tc>
@@ -1320,137 +1320,31 @@
                 <w:rFonts w:ascii="Calibri" w:hAnsi="Calibri"/>
                 <w:sz w:val="20"/>
               </w:rPr>
-              <w:t xml:space="default">Pipe Insulation</w:t>
-            </w:r>
-          </w:p>
-        </w:tc>
-        <w:tc>
-          <w:tcPr>
-            <w:tcBorders>
-              <w:top w:val="single" w:space="0" w:color="D3D3D3"/>
-              <w:bottom w:val="single" w:space="0" w:color="D3D3D3"/>
-              <w:start w:val="single" w:space="0" w:color="D3D3D3"/>
-              <w:end w:val="single" w:space="0" w:color="D3D3D3"/>
-            </w:tcBorders>
-          </w:tcPr>
-          <w:p>
-            <w:pPr>
-              <w:spacing w:before="0" w:after="60"/>
-              <w:keepNext/>
-              <w:jc w:val="start"/>
-            </w:pPr>
-            <w:r>
-              <w:rPr>
-                <w:rFonts w:ascii="Calibri" w:hAnsi="Calibri"/>
-                <w:sz w:val="20"/>
-              </w:rPr>
-              <w:t xml:space="default">Insulate both hot and cold water pipes that are uninsulated in the basement/crawlspace. This will save energy and prevent condensation.</w:t>
-            </w:r>
-          </w:p>
-        </w:tc>
-      </w:tr>
-      <w:tr>
-        <w:trPr>
-          <w:cantSplit/>
-        </w:trPr>
-        <w:tc>
-          <w:tcPr>
-            <w:tcBorders>
-              <w:top w:val="single" w:space="0" w:color="D3D3D3"/>
-              <w:bottom w:val="single" w:space="0" w:color="D3D3D3"/>
-              <w:start w:val="single" w:space="0" w:color="D3D3D3"/>
-              <w:end w:val="single" w:space="0" w:color="D3D3D3"/>
-            </w:tcBorders>
-          </w:tcPr>
-          <w:p>
-            <w:pPr>
-              <w:spacing w:before="0" w:after="60"/>
-              <w:keepNext/>
-              <w:jc w:val="start"/>
-            </w:pPr>
-            <w:r>
-              <w:rPr>
-                <w:rFonts w:ascii="Calibri" w:hAnsi="Calibri"/>
-                <w:sz w:val="20"/>
-              </w:rPr>
-              <w:t xml:space="default">Other 1</w:t>
-            </w:r>
-          </w:p>
-        </w:tc>
-        <w:tc>
-          <w:tcPr>
-            <w:tcBorders>
-              <w:top w:val="single" w:space="0" w:color="D3D3D3"/>
-              <w:bottom w:val="single" w:space="0" w:color="D3D3D3"/>
-              <w:start w:val="single" w:space="0" w:color="D3D3D3"/>
-              <w:end w:val="single" w:space="0" w:color="D3D3D3"/>
-            </w:tcBorders>
-          </w:tcPr>
-          <w:p>
-            <w:pPr>
-              <w:spacing w:before="0" w:after="60"/>
-              <w:keepNext/>
-              <w:jc w:val="start"/>
-            </w:pPr>
-            <w:r>
-              <w:rPr>
-                <w:rFonts w:ascii="Calibri" w:hAnsi="Calibri"/>
-                <w:sz w:val="20"/>
-              </w:rPr>
-              <w:t xml:space="default">TYPE HERE 1</w:t>
-            </w:r>
-          </w:p>
-        </w:tc>
-      </w:tr>
-      <w:tr>
-        <w:trPr>
-          <w:cantSplit/>
-        </w:trPr>
-        <w:tc>
-          <w:tcPr>
-            <w:tcBorders>
-              <w:top w:val="single" w:space="0" w:color="D3D3D3"/>
-              <w:bottom w:val="single" w:space="0" w:color="D3D3D3"/>
-              <w:start w:val="single" w:space="0" w:color="D3D3D3"/>
-              <w:end w:val="single" w:space="0" w:color="D3D3D3"/>
-            </w:tcBorders>
-          </w:tcPr>
-          <w:p>
-            <w:pPr>
-              <w:spacing w:before="0" w:after="60"/>
-              <w:keepNext/>
-              <w:jc w:val="start"/>
-            </w:pPr>
-            <w:r>
-              <w:rPr>
-                <w:rFonts w:ascii="Calibri" w:hAnsi="Calibri"/>
-                <w:sz w:val="20"/>
-              </w:rPr>
-              <w:t xml:space="default">Heat Pump Water Heater</w:t>
-            </w:r>
-          </w:p>
-        </w:tc>
-        <w:tc>
-          <w:tcPr>
-            <w:tcBorders>
-              <w:top w:val="single" w:space="0" w:color="D3D3D3"/>
-              <w:bottom w:val="single" w:space="0" w:color="D3D3D3"/>
-              <w:start w:val="single" w:space="0" w:color="D3D3D3"/>
-              <w:end w:val="single" w:space="0" w:color="D3D3D3"/>
-            </w:tcBorders>
-          </w:tcPr>
-          <w:p>
-            <w:pPr>
-              <w:spacing w:before="0" w:after="60"/>
-              <w:keepNext/>
-              <w:jc w:val="start"/>
-            </w:pPr>
-            <w:r>
-              <w:rPr>
-                <w:rFonts w:ascii="Calibri" w:hAnsi="Calibri"/>
-                <w:sz w:val="20"/>
-              </w:rPr>
-              <w:t xml:space="default">Install a heat pump water heater to provide your hot water for cooking and bathing. This is the most efficient way to heat water and will save hundreds of dollars a year compared to electric resistance, heating oil, or propane hot water. It will also help to dehumidify while it's running. If your current water heater burns oil or propane, this will also remove a source of combustion gases from your home.</w:t>
+              <w:t xml:space="default">Misc. Air Sealing and Insulation</w:t>
+            </w:r>
+          </w:p>
+        </w:tc>
+        <w:tc>
+          <w:tcPr>
+            <w:tcBorders>
+              <w:top w:val="single" w:space="0" w:color="D3D3D3"/>
+              <w:bottom w:val="single" w:space="0" w:color="D3D3D3"/>
+              <w:start w:val="single" w:space="0" w:color="D3D3D3"/>
+              <w:end w:val="single" w:space="0" w:color="D3D3D3"/>
+            </w:tcBorders>
+          </w:tcPr>
+          <w:p>
+            <w:pPr>
+              <w:spacing w:before="0" w:after="60"/>
+              <w:keepNext/>
+              <w:jc w:val="start"/>
+            </w:pPr>
+            <w:r>
+              <w:rPr>
+                <w:rFonts w:ascii="Calibri" w:hAnsi="Calibri"/>
+                <w:sz w:val="20"/>
+              </w:rPr>
+              <w:t xml:space="default">Air seal and insulate [** insert auditor description - bay window, bulkhead door, chase, kneewall, anything else that is unique to the home and not otherwise covered in another recommendation]</w:t>
             </w:r>
           </w:p>
         </w:tc>
@@ -1540,7 +1434,7 @@
                 <w:rFonts w:ascii="Calibri" w:hAnsi="Calibri"/>
                 <w:sz w:val="20"/>
               </w:rPr>
-              <w:t xml:space="default">1992</w:t>
+              <w:t xml:space="default">1907</w:t>
             </w:r>
           </w:p>
         </w:tc>
@@ -1593,7 +1487,7 @@
                 <w:rFonts w:ascii="Calibri" w:hAnsi="Calibri"/>
                 <w:sz w:val="20"/>
               </w:rPr>
-              <w:t xml:space="default">Crawlspace</w:t>
+              <w:t xml:space="default">Walk in basement</w:t>
             </w:r>
           </w:p>
         </w:tc>
@@ -1646,7 +1540,7 @@
                 <w:rFonts w:ascii="Calibri" w:hAnsi="Calibri"/>
                 <w:sz w:val="20"/>
               </w:rPr>
-              <w:t xml:space="default">Batts of Fiberglass , 9 inches</w:t>
+              <w:t xml:space="default">Loose Cellulose , 3 inches</w:t>
             </w:r>
           </w:p>
         </w:tc>
@@ -1752,7 +1646,7 @@
                 <w:rFonts w:ascii="Calibri" w:hAnsi="Calibri"/>
                 <w:sz w:val="20"/>
               </w:rPr>
-              <w:t xml:space="default">1,535 ft²</w:t>
+              <w:t xml:space="default">2,458 ft²</w:t>
             </w:r>
           </w:p>
         </w:tc>
@@ -1805,7 +1699,7 @@
                 <w:rFonts w:ascii="Calibri" w:hAnsi="Calibri"/>
                 <w:sz w:val="20"/>
               </w:rPr>
-              <w:t xml:space="default">11,863 ft³</w:t>
+              <w:t xml:space="default">21,760 ft³</w:t>
             </w:r>
           </w:p>
         </w:tc>
@@ -1934,7 +1828,7 @@
                 <w:rFonts w:ascii="Calibri" w:hAnsi="Calibri"/>
                 <w:sz w:val="20"/>
               </w:rPr>
-              <w:t xml:space="default">15</w:t>
+              <w:t xml:space="default">NA</w:t>
             </w:r>
           </w:p>
         </w:tc>
@@ -1987,7 +1881,7 @@
                 <w:rFonts w:ascii="Calibri" w:hAnsi="Calibri"/>
                 <w:sz w:val="20"/>
               </w:rPr>
-              <w:t xml:space="default">Northeast/Southwest</w:t>
+              <w:t xml:space="default">North/South</w:t>
             </w:r>
           </w:p>
         </w:tc>
@@ -2040,7 +1934,7 @@
                 <w:rFonts w:ascii="Calibri" w:hAnsi="Calibri"/>
                 <w:sz w:val="20"/>
               </w:rPr>
-              <w:t xml:space="default">The house has a Asphalt Shingles roof.The roof is in NA condition. The shingles show clear signs of age and weathering. They have not begun to fly away during wind events.</w:t>
+              <w:t xml:space="default">The house has a Asphalt Shingles, Standing Seam Metal, Synthetic Slate Tile roof.The roof is in fair condition. Gallery connection has full standing seam, main house has a combination of shingles and standing seam, all in fairly good condition</w:t>
             </w:r>
           </w:p>
         </w:tc>
@@ -2093,7 +1987,7 @@
                 <w:rFonts w:ascii="Calibri" w:hAnsi="Calibri"/>
                 <w:sz w:val="20"/>
               </w:rPr>
-              <w:t xml:space="default">The house has the following moisture control strategies: NA. These were in NA condition. NA</w:t>
+              <w:t xml:space="default">The house has the following moisture control strategies: gutters, ground slopes away from foundation. These were in fair condition. Some water damage marks around gutters on intersecting sections, ground does not slope away from all parts of the house. Many plants also are planted around the house that assist with moisture control.</w:t>
             </w:r>
           </w:p>
         </w:tc>
@@ -2146,7 +2040,7 @@
                 <w:rFonts w:ascii="Calibri" w:hAnsi="Calibri"/>
                 <w:sz w:val="20"/>
               </w:rPr>
-              <w:t xml:space="default">The house has vinyl siding. The siding is in fair condition. The siding is in good condition in most areas. There are some spots that have had cracks or breaks in the material.</w:t>
+              <w:t xml:space="default">The house has Combination of wood shingles and siding. The siding is in fair condition. Siding shows signs of weathering and aging, some sections have water damage marks, otherwise in good condition and intact</w:t>
             </w:r>
           </w:p>
         </w:tc>
@@ -2199,7 +2093,7 @@
                 <w:rFonts w:ascii="Calibri" w:hAnsi="Calibri"/>
                 <w:sz w:val="20"/>
               </w:rPr>
-              <w:t xml:space="default">There are 2 hollow fiberglass exterior doors. These are in excellent condition, they have a total area of 37 ft².</w:t>
+              <w:t xml:space="default">There are 1 insulated wood exterior doors. These are in fair condition, they have a total area of 18 ft². There are 1 glass door wood exterior doors. These are in fair condition, they have a total area of 18.5 ft². There are 1 insulated wood exterior doors. These are in fair condition, they have a total area of 18 ft².</w:t>
             </w:r>
           </w:p>
         </w:tc>
@@ -2252,7 +2146,7 @@
                 <w:rFonts w:ascii="Calibri" w:hAnsi="Calibri"/>
                 <w:sz w:val="20"/>
               </w:rPr>
-              <w:t xml:space="default">There are 13 double paned wood windows. These are in fair condition, they have a total area of 148 ft².</w:t>
+              <w:t xml:space="default">There are 16 double paned wood windows. These are in fair condition, they have a total area of 169 ft². Moreover there are 6 double paned wood windows. These are in excellent condition, they have a total area of 98 ft².</w:t>
             </w:r>
           </w:p>
         </w:tc>
@@ -2328,7 +2222,7 @@
                 <w:rFonts w:ascii="Calibri" w:hAnsi="Calibri"/>
                 <w:sz w:val="20"/>
               </w:rPr>
-              <w:t xml:space="default">The house has platform framing, which means that wall cavities do not extend the full height of the building, but are instead separated by floors. The exterior walls are insulated with Batts of Fiberglass insulation. This insulation is 4 inches thick and in fair condition. This gives the exterior walls an R-value of around CALCULATE. A material’s R-value tells us how good it is at stopping heat flow, the bigger the number, the better. For comparison, current Maine building code requires an R-value of at least R-13 with additional continuous insulation of R-10 for exterior walls or R-20 with additional continuous insulation of R-5. The insulation in the walls was installed during the construction of the home.</w:t>
+              <w:t xml:space="default">The house has balloon framing, which means the wall cavities extend the full height of the building (from the foundation to the roof). These wall cavities are often interconnected with the floor and ceiling cavities. This framing type can create connected passageways for air to leave the house and rodents to enter the house. The exterior walls are insulated with Batts of Fiberglass, Loose Cellulose insulation. This insulation is 4 inches thick and in NA condition. This gives the exterior walls an R-value of around CALCULATE. A material’s R-value tells us how good it is at stopping heat flow, the bigger the number, the better. For comparison, current Maine building code requires an R-value of at least R-13 with additional continuous insulation of R-10 for exterior walls or R-20 with additional continuous insulation of R-5. Insulation depth and quality unknown, could not access wall cavity. Some thermal cam images show inconsistent insulation on second floor</w:t>
             </w:r>
           </w:p>
         </w:tc>
@@ -2487,7 +2381,7 @@
                 <w:rFonts w:ascii="Calibri" w:hAnsi="Calibri"/>
                 <w:sz w:val="20"/>
               </w:rPr>
-              <w:t xml:space="default">During the audit we measured the electricity consumption of the Fridge and Freezer Combo. It used NA kWh in NA hours. We thus estimate that it is costing you around $CALCULATE a month to run. This is **comparable to / more expensive than** newer, efficient models. The Chest Freezer used NA kWh in NA hours. We thus estimate that it is costing you around $CALCULATE a month to run. This is **comparable to / more expensive than** newer, efficient models. The dishwasher is on the older side and is too loud for the homeowner's liking.</w:t>
+              <w:t xml:space="default">During the audit we measured the electricity consumption of the Main fridge/freezer. It used 0.23 kWh in 135 hours. We thus estimate that it is costing you around $CALCULATE a month to run. This is **comparable to / more expensive than** newer, efficient models. The Basement upright freezer used 0.32 kWh in 182 hours. We thus estimate that it is costing you around $CALCULATE a month to run. This is **comparable to / more expensive than** newer, efficient models. Kitchen has gas stove and range, recirculating fan but no exhaust fan</w:t>
             </w:r>
           </w:p>
         </w:tc>
@@ -2595,7 +2489,7 @@
                 <w:rFonts w:ascii="Calibri" w:hAnsi="Calibri"/>
                 <w:sz w:val="20"/>
               </w:rPr>
-              <w:t xml:space="default">1250</w:t>
+              <w:t xml:space="default">3383</w:t>
             </w:r>
           </w:p>
         </w:tc>
@@ -2672,7 +2566,7 @@
                 <w:rFonts w:ascii="Calibri" w:hAnsi="Calibri"/>
                 <w:sz w:val="20"/>
               </w:rPr>
-              <w:t xml:space="default">6</w:t>
+              <w:t xml:space="default">9</w:t>
             </w:r>
           </w:p>
         </w:tc>
@@ -2749,7 +2643,7 @@
                 <w:rFonts w:ascii="Calibri" w:hAnsi="Calibri"/>
                 <w:sz w:val="20"/>
               </w:rPr>
-              <w:t xml:space="default">125 in²</w:t>
+              <w:t xml:space="default">338 in²</w:t>
             </w:r>
           </w:p>
         </w:tc>
@@ -2903,7 +2797,7 @@
                 <w:rFonts w:ascii="Calibri" w:hAnsi="Calibri"/>
                 <w:sz w:val="20"/>
               </w:rPr>
-              <w:t xml:space="default">NA</w:t>
+              <w:t xml:space="default">Windows on second floor are badly leaking (some still need to be sealed), all doors somewhat leaky, attic insulation has settled and air travels through cracks in second floor walls and wall seams, attic hatch is not airtight</w:t>
             </w:r>
           </w:p>
         </w:tc>
@@ -3078,7 +2972,7 @@
                 <w:rFonts w:ascii="Calibri" w:hAnsi="Calibri"/>
                 <w:sz w:val="20"/>
               </w:rPr>
-              <w:t xml:space="default">586.5 ft²</w:t>
+              <w:t xml:space="default">NA ft²</w:t>
             </w:r>
           </w:p>
         </w:tc>
@@ -3184,7 +3078,7 @@
                 <w:rFonts w:ascii="Calibri" w:hAnsi="Calibri"/>
                 <w:sz w:val="20"/>
               </w:rPr>
-              <w:t xml:space="default">The attic is insulated with Batts of Fiberglass insulation. The insulation is 9 inches thick.</w:t>
+              <w:t xml:space="default">The attic is insulated with Loose Cellulose insulation. The insulation is 3 inches thick.</w:t>
             </w:r>
           </w:p>
         </w:tc>
@@ -3237,7 +3131,7 @@
                 <w:rFonts w:ascii="Calibri" w:hAnsi="Calibri"/>
                 <w:sz w:val="20"/>
               </w:rPr>
-              <w:t xml:space="default">The insulation is in Fair condition. The attic is mostly insulated, some spots have poorly installed fiberglass batts or lack insulation completely. Rodents have begun eating away at the insulation. The chimney is not air sealed, and opens up into an open cavity that is uninsulated.</w:t>
+              <w:t xml:space="default">The insulation is in Partially condition. Cellulose has badly settled, depth under floor varies. Wall cavities have been dense packed, but have also settled to varying degrees.</w:t>
             </w:r>
           </w:p>
         </w:tc>
@@ -3343,7 +3237,7 @@
                 <w:rFonts w:ascii="Calibri" w:hAnsi="Calibri"/>
                 <w:sz w:val="20"/>
               </w:rPr>
-              <w:t xml:space="default">The attic is not air sealed. NA</w:t>
+              <w:t xml:space="default">The attic is Yes. Air sealing behind rafters, inconsistent but primarily above additions</w:t>
             </w:r>
           </w:p>
         </w:tc>
@@ -3396,7 +3290,7 @@
                 <w:rFonts w:ascii="Calibri" w:hAnsi="Calibri"/>
                 <w:sz w:val="20"/>
               </w:rPr>
-              <w:t xml:space="default">The attic hatch is insulated with Uninsulated, 1/2 plywood insulation that is NA inches thick. The insulation is in NA condition and the hatch is **air sealed / not air sealed**.</w:t>
+              <w:t xml:space="default">The attic hatch is insulated with Foam block insulation that is 1 inches thick. The insulation is in Fair condition and the hatch is **air sealed / not air sealed**.</w:t>
             </w:r>
           </w:p>
         </w:tc>
@@ -3449,7 +3343,7 @@
                 <w:rFonts w:ascii="Calibri" w:hAnsi="Calibri"/>
                 <w:sz w:val="20"/>
               </w:rPr>
-              <w:t xml:space="default">The attic is ventilated by Ridge. Attic ventilation is important to keep the attic space and insulation dry and in good condition.</w:t>
+              <w:t xml:space="default">The attic is ventilated by Gable. Attic ventilation is important to keep the attic space and insulation dry and in good condition.</w:t>
             </w:r>
           </w:p>
         </w:tc>
@@ -3502,7 +3396,7 @@
                 <w:rFonts w:ascii="Calibri" w:hAnsi="Calibri"/>
                 <w:sz w:val="20"/>
               </w:rPr>
-              <w:t xml:space="default">Exhaust ducts from bathroom and kitchen fans are No . Venting exhaust fans to outside is important so that they do not add potentially harmful moisture into the attic space and so they can function properly.</w:t>
+              <w:t xml:space="default">Exhaust ducts from bathroom and kitchen fans are NA . Venting exhaust fans to outside is important so that they do not add potentially harmful moisture into the attic space and so they can function properly.</w:t>
             </w:r>
           </w:p>
         </w:tc>
@@ -3631,7 +3525,7 @@
                 <w:rFonts w:ascii="Calibri" w:hAnsi="Calibri"/>
                 <w:sz w:val="20"/>
               </w:rPr>
-              <w:t xml:space="default">890 ft²</w:t>
+              <w:t xml:space="default">NA ft²</w:t>
             </w:r>
           </w:p>
         </w:tc>
@@ -3684,7 +3578,7 @@
                 <w:rFonts w:ascii="Calibri" w:hAnsi="Calibri"/>
                 <w:sz w:val="20"/>
               </w:rPr>
-              <w:t xml:space="default">360 ft²</w:t>
+              <w:t xml:space="default">NA ft²</w:t>
             </w:r>
           </w:p>
         </w:tc>
@@ -3737,7 +3631,7 @@
                 <w:rFonts w:ascii="Calibri" w:hAnsi="Calibri"/>
                 <w:sz w:val="20"/>
               </w:rPr>
-              <w:t xml:space="default">The **basement / crawlspace** is insulated with Batts of Fiberglass, Rigid foam board insulation. The insulation is NA inches thick.</w:t>
+              <w:t xml:space="default">The **basement / crawlspace** is insulated with Uninsulated insulation. The insulation is NA inches thick.</w:t>
             </w:r>
           </w:p>
         </w:tc>
@@ -3790,7 +3684,7 @@
                 <w:rFonts w:ascii="Calibri" w:hAnsi="Calibri"/>
                 <w:sz w:val="20"/>
               </w:rPr>
-              <w:t xml:space="default">The insulation is in Fair condition. The crawlspace has 2" foam board insulation on the interior walls, as well as 4" fiberglass batts in the rim joists.</w:t>
+              <w:t xml:space="default">The insulation is in NA condition. NA</w:t>
             </w:r>
           </w:p>
         </w:tc>
@@ -3896,7 +3790,7 @@
                 <w:rFonts w:ascii="Calibri" w:hAnsi="Calibri"/>
                 <w:sz w:val="20"/>
               </w:rPr>
-              <w:t xml:space="default">There is NA to control moisture. These are in NA condition. NA. Moisture control is important as moisture in the **basement / crawlspace** evaporates into the house where it can cause moisture damage such as mold. It is also important to protect appliances in the **basement / crawlspace**.</w:t>
+              <w:t xml:space="default">There is dehumidifier to control moisture. These are in fair condition. Some water damage marks around gutters on intersecting sections, ground does not slope away from all parts of the house. Many plants also are planted around the house that assist with moisture control.. Moisture control is important as moisture in the **basement / crawlspace** evaporates into the house where it can cause moisture damage such as mold. It is also important to protect appliances in the **basement / crawlspace**.</w:t>
             </w:r>
           </w:p>
         </w:tc>
@@ -3949,7 +3843,7 @@
                 <w:rFonts w:ascii="Calibri" w:hAnsi="Calibri"/>
                 <w:sz w:val="20"/>
               </w:rPr>
-              <w:t xml:space="default">The Appliances not insulated, Ducts/pipes not insulated DELETE WHAT DOESN'T APPLY. Insulating ductwork is important to prevent the air from losing heat as it travels through it. Insulating both hot and cold water pipes is important to stop the water from losing heat as it travels through the pipes and to prevent condensation. Uninsulated **ductwork / pipes** increase your heating bill.</w:t>
+              <w:t xml:space="default">The Appliances not insulated, Ducts/pipes partially insulated DELETE WHAT DOESN'T APPLY. Insulating ductwork is important to prevent the air from losing heat as it travels through it. Insulating both hot and cold water pipes is important to stop the water from losing heat as it travels through the pipes and to prevent condensation. Uninsulated **ductwork / pipes** increase your heating bill.</w:t>
             </w:r>
           </w:p>
         </w:tc>
@@ -4131,7 +4025,7 @@
                 <w:rFonts w:ascii="Calibri" w:hAnsi="Calibri"/>
                 <w:sz w:val="20"/>
               </w:rPr>
-              <w:t xml:space="default">The electrical panel has and amperage of 100. There are 0 unused breaker spaces. The homeowner has a full panel and is in fine condition.</w:t>
+              <w:t xml:space="default">The electrical panel has an amperage of 100. There are 0 unused breaker spaces. NA</w:t>
             </w:r>
           </w:p>
         </w:tc>
@@ -4184,7 +4078,7 @@
                 <w:rFonts w:ascii="Calibri" w:hAnsi="Calibri"/>
                 <w:sz w:val="20"/>
               </w:rPr>
-              <w:t xml:space="default">The Boiler runs on Heating oil . It is located in the Crawlspace and has Direct ventilation.</w:t>
+              <w:t xml:space="default">The NA runs on Heating oil. It is located in the Basement Workshop and has Atmospheric ventilation. We performed combustion safety tests on this appliance. The appliance Pass the backdrafting test. The backdrafting test verifies that combustion gasses are properly venting to the outside and not entering the living space. The appliance had an efficiency of 84.4% and an air free carbon monoxide reading of 225 parts per million. MAKE COMMENTS ABOUT EFFICIENCY AND CO READING.</w:t>
             </w:r>
           </w:p>
         </w:tc>
@@ -4237,7 +4131,7 @@
                 <w:rFonts w:ascii="Calibri" w:hAnsi="Calibri"/>
                 <w:sz w:val="20"/>
               </w:rPr>
-              <w:t xml:space="default">Propane Unvented Wall Heater</w:t>
+              <w:t xml:space="default">NA</w:t>
             </w:r>
           </w:p>
         </w:tc>
@@ -4290,7 +4184,7 @@
                 <w:rFonts w:ascii="Calibri" w:hAnsi="Calibri"/>
                 <w:sz w:val="20"/>
               </w:rPr>
-              <w:t xml:space="default">Gas Oven</w:t>
+              <w:t xml:space="default">NA</w:t>
             </w:r>
           </w:p>
         </w:tc>
@@ -4343,7 +4237,7 @@
                 <w:rFonts w:ascii="Calibri" w:hAnsi="Calibri"/>
                 <w:sz w:val="20"/>
               </w:rPr>
-              <w:t xml:space="default">Gas Dryer</w:t>
+              <w:t xml:space="default">NA</w:t>
             </w:r>
           </w:p>
         </w:tc>
@@ -4463,7 +4357,7 @@
             <w:pPr>
               <w:spacing w:before="0" w:after="60"/>
               <w:keepNext/>
-              <w:jc w:val="end"/>
+              <w:jc w:val="start"/>
             </w:pPr>
             <w:r>
               <w:rPr>
@@ -4508,7 +4402,7 @@
             <w:pPr>
               <w:spacing w:before="0" w:after="60"/>
               <w:keepNext/>
-              <w:jc w:val="end"/>
+              <w:jc w:val="start"/>
             </w:pPr>
             <w:r>
               <w:rPr>
@@ -4516,208 +4410,6 @@
                 <w:sz w:val="20"/>
               </w:rPr>
               <w:t xml:space="default">Cost (USD)</w:t>
-            </w:r>
-          </w:p>
-        </w:tc>
-      </w:tr>
-      <w:tr>
-        <w:trPr>
-          <w:cantSplit/>
-        </w:trPr>
-        <w:tc>
-          <w:tcPr>
-            <w:tcBorders>
-              <w:top w:val="single" w:space="0" w:color="D3D3D3"/>
-              <w:bottom w:val="single" w:space="0" w:color="D3D3D3"/>
-              <w:start w:val="single" w:space="0" w:color="D3D3D3"/>
-              <w:end w:val="single" w:space="0" w:color="D3D3D3"/>
-            </w:tcBorders>
-          </w:tcPr>
-          <w:p>
-            <w:pPr>
-              <w:spacing w:before="0" w:after="60"/>
-              <w:keepNext/>
-              <w:jc w:val="start"/>
-            </w:pPr>
-            <w:r>
-              <w:rPr>
-                <w:rFonts w:ascii="Calibri" w:hAnsi="Calibri"/>
-                <w:sz w:val="20"/>
-              </w:rPr>
-              <w:t xml:space="default">Propane</w:t>
-            </w:r>
-          </w:p>
-        </w:tc>
-        <w:tc>
-          <w:tcPr>
-            <w:tcBorders>
-              <w:top w:val="single" w:space="0" w:color="D3D3D3"/>
-              <w:bottom w:val="single" w:space="0" w:color="D3D3D3"/>
-              <w:start w:val="single" w:space="0" w:color="D3D3D3"/>
-              <w:end w:val="single" w:space="0" w:color="D3D3D3"/>
-            </w:tcBorders>
-          </w:tcPr>
-          <w:p>
-            <w:pPr>
-              <w:spacing w:before="0" w:after="60"/>
-              <w:keepNext/>
-              <w:jc w:val="end"/>
-            </w:pPr>
-            <w:r>
-              <w:rPr>
-                <w:rFonts w:ascii="Calibri" w:hAnsi="Calibri"/>
-                <w:sz w:val="20"/>
-              </w:rPr>
-              <w:t xml:space="default">302.3</w:t>
-            </w:r>
-          </w:p>
-        </w:tc>
-        <w:tc>
-          <w:tcPr>
-            <w:tcBorders>
-              <w:top w:val="single" w:space="0" w:color="D3D3D3"/>
-              <w:bottom w:val="single" w:space="0" w:color="D3D3D3"/>
-              <w:start w:val="single" w:space="0" w:color="D3D3D3"/>
-              <w:end w:val="single" w:space="0" w:color="D3D3D3"/>
-            </w:tcBorders>
-          </w:tcPr>
-          <w:p>
-            <w:pPr>
-              <w:spacing w:before="0" w:after="60"/>
-              <w:keepNext/>
-              <w:jc w:val="start"/>
-            </w:pPr>
-            <w:r>
-              <w:rPr>
-                <w:rFonts w:ascii="Calibri" w:hAnsi="Calibri"/>
-                <w:sz w:val="20"/>
-              </w:rPr>
-              <w:t xml:space="default">cost_in_dollars_propane</w:t>
-            </w:r>
-          </w:p>
-        </w:tc>
-        <w:tc>
-          <w:tcPr>
-            <w:tcBorders>
-              <w:top w:val="single" w:space="0" w:color="D3D3D3"/>
-              <w:bottom w:val="single" w:space="0" w:color="D3D3D3"/>
-              <w:start w:val="single" w:space="0" w:color="D3D3D3"/>
-              <w:end w:val="single" w:space="0" w:color="D3D3D3"/>
-            </w:tcBorders>
-          </w:tcPr>
-          <w:p>
-            <w:pPr>
-              <w:spacing w:before="0" w:after="60"/>
-              <w:keepNext/>
-              <w:jc w:val="end"/>
-            </w:pPr>
-            <w:r>
-              <w:rPr>
-                <w:rFonts w:ascii="Calibri" w:hAnsi="Calibri"/>
-                <w:sz w:val="20"/>
-              </w:rPr>
-              <w:t xml:space="default">1035.3</w:t>
-            </w:r>
-          </w:p>
-        </w:tc>
-      </w:tr>
-      <w:tr>
-        <w:trPr>
-          <w:cantSplit/>
-        </w:trPr>
-        <w:tc>
-          <w:tcPr>
-            <w:tcBorders>
-              <w:top w:val="single" w:space="0" w:color="D3D3D3"/>
-              <w:bottom w:val="single" w:space="0" w:color="D3D3D3"/>
-              <w:start w:val="single" w:space="0" w:color="D3D3D3"/>
-              <w:end w:val="single" w:space="0" w:color="D3D3D3"/>
-            </w:tcBorders>
-          </w:tcPr>
-          <w:p>
-            <w:pPr>
-              <w:spacing w:before="0" w:after="60"/>
-              <w:keepNext/>
-              <w:jc w:val="start"/>
-            </w:pPr>
-            <w:r>
-              <w:rPr>
-                <w:rFonts w:ascii="Calibri" w:hAnsi="Calibri"/>
-                <w:sz w:val="20"/>
-              </w:rPr>
-              <w:t xml:space="default">Electricity</w:t>
-            </w:r>
-          </w:p>
-        </w:tc>
-        <w:tc>
-          <w:tcPr>
-            <w:tcBorders>
-              <w:top w:val="single" w:space="0" w:color="D3D3D3"/>
-              <w:bottom w:val="single" w:space="0" w:color="D3D3D3"/>
-              <w:start w:val="single" w:space="0" w:color="D3D3D3"/>
-              <w:end w:val="single" w:space="0" w:color="D3D3D3"/>
-            </w:tcBorders>
-          </w:tcPr>
-          <w:p>
-            <w:pPr>
-              <w:spacing w:before="0" w:after="60"/>
-              <w:keepNext/>
-              <w:jc w:val="end"/>
-            </w:pPr>
-            <w:r>
-              <w:rPr>
-                <w:rFonts w:ascii="Calibri" w:hAnsi="Calibri"/>
-                <w:sz w:val="20"/>
-              </w:rPr>
-              <w:t xml:space="default">2700</w:t>
-            </w:r>
-          </w:p>
-        </w:tc>
-        <w:tc>
-          <w:tcPr>
-            <w:tcBorders>
-              <w:top w:val="single" w:space="0" w:color="D3D3D3"/>
-              <w:bottom w:val="single" w:space="0" w:color="D3D3D3"/>
-              <w:start w:val="single" w:space="0" w:color="D3D3D3"/>
-              <w:end w:val="single" w:space="0" w:color="D3D3D3"/>
-            </w:tcBorders>
-          </w:tcPr>
-          <w:p>
-            <w:pPr>
-              <w:spacing w:before="0" w:after="60"/>
-              <w:keepNext/>
-              <w:jc w:val="start"/>
-            </w:pPr>
-            <w:r>
-              <w:rPr>
-                <w:rFonts w:ascii="Calibri" w:hAnsi="Calibri"/>
-                <w:sz w:val="20"/>
-              </w:rPr>
-              <w:t xml:space="default">cost_in_dollars_electricity</w:t>
-            </w:r>
-          </w:p>
-        </w:tc>
-        <w:tc>
-          <w:tcPr>
-            <w:tcBorders>
-              <w:top w:val="single" w:space="0" w:color="D3D3D3"/>
-              <w:bottom w:val="single" w:space="0" w:color="D3D3D3"/>
-              <w:start w:val="single" w:space="0" w:color="D3D3D3"/>
-              <w:end w:val="single" w:space="0" w:color="D3D3D3"/>
-            </w:tcBorders>
-          </w:tcPr>
-          <w:p>
-            <w:pPr>
-              <w:spacing w:before="0" w:after="60"/>
-              <w:keepNext/>
-              <w:jc w:val="end"/>
-            </w:pPr>
-            <w:r>
-              <w:rPr>
-                <w:rFonts w:ascii="Calibri" w:hAnsi="Calibri"/>
-                <w:sz w:val="20"/>
-              </w:rPr>
-              <w:t xml:space="default">259</w:t>
             </w:r>
           </w:p>
         </w:tc>
@@ -4730,7 +4422,7 @@
     </w:p>
     <w:bookmarkEnd w:id="40"/>
     <w:bookmarkEnd w:id="41"/>
-    <w:bookmarkStart w:id="62" w:name="recommendations"/>
+    <w:bookmarkStart w:id="60" w:name="recommendations"/>
     <w:p>
       <w:pPr>
         <w:pStyle w:val="Heading2"/>
@@ -4889,13 +4581,13 @@
       </w:r>
     </w:p>
     <w:bookmarkEnd w:id="43"/>
-    <w:bookmarkStart w:id="44" w:name="leds"/>
+    <w:bookmarkStart w:id="44" w:name="window-dressers"/>
     <w:p>
       <w:pPr>
         <w:pStyle w:val="Heading3"/>
       </w:pPr>
       <w:r>
-        <w:t xml:space="preserve">4.3 LEDs</w:t>
+        <w:t xml:space="preserve">4.3 Window Dressers</w:t>
       </w:r>
     </w:p>
     <w:p>
@@ -4915,7 +4607,7 @@
         <w:pStyle w:val="BodyText"/>
       </w:pPr>
       <w:r>
-        <w:t xml:space="preserve">Your lighting uses more energy than LED bulbs would. Halogen and incandescent light bulbs use 5-8x more energy than LEDs. This requires significantly more electricity and costs a lot.</w:t>
+        <w:t xml:space="preserve">Your windows are a source of heat loss, reduce your comfort due to cold surface temperatures, and may also cause moisture condensation or frost in the winter.</w:t>
       </w:r>
     </w:p>
     <w:p>
@@ -4935,13 +4627,11 @@
         <w:pStyle w:val="BodyText"/>
       </w:pPr>
       <w:r>
-        <w:t xml:space="preserve">Switch your light bulbs to LED light bulbs. LEDs use 80% less energy than incandescent light bulbs, which can significantly reduce your electricity bill.</w:t>
-      </w:r>
-    </w:p>
-    <w:p>
-      <w:pPr>
-        <w:pStyle w:val="BodyText"/>
-      </w:pPr>
+        <w:t xml:space="preserve">WindowDressers are insulating window inserts that help air-seal windows and reduce heat loss and gain. WindowDressers are transparent and let in light while stopping drafts. Each insert is made of a custom-made pine frame wrapped on each side with tightly sealed, clear polyolefin film, creating an airspace between the two layers for additional insulation. The insert is finished with a compressible foam weather seal. The foam allows enough give for the inserts to be easily slid into place in the fall and removed in the spring while holding firmly enough to provide a tight, friction-based seal. The inserts are installed inside your existing window frame with no fasteners required and last 5-10 years. They are most effective in the winter, but depending on the window’s exposure, they can sometimes be used in the summer to keep the house cooler.</w:t>
+      </w:r>
+      <w:r>
+        <w:t xml:space="preserve"> </w:t>
+      </w:r>
       <w:r>
         <w:rPr>
           <w:i/>
@@ -4955,17 +4645,45 @@
         <w:pStyle w:val="BodyText"/>
       </w:pPr>
       <w:r>
-        <w:t xml:space="preserve">We provide free LED light bulbs; contact us for some if we did not give you any during the audit. Depending on usage, LEDs can save more than $50 a year.</w:t>
+        <w:t xml:space="preserve">Insulating window inserts save 5-10% of your heating costs at less than 1/10th the cost of replacement windows. The overall project cost will depend on the number and size of window inserts. Example prices for the 2024 season were: small (20 x 36”) - $36 for natural pine frame, $46 for white; medium (30 x 52”) - $50 for natural pine frame, $64 for white; large (44 x 68”) - $67 for natural pine frame, $88 for white. Adjusted pricing for lower-income households is available from WindowDressers upon request. If plastic is damaged, it can be replaced for $15.</w:t>
+      </w:r>
+    </w:p>
+    <w:p>
+      <w:pPr>
+        <w:pStyle w:val="BodyText"/>
+      </w:pPr>
+      <w:r>
+        <w:t xml:space="preserve">Households that order inserts are expected to participate in the Community Build where the inserts are made. You can sign up for a 4-hour shift and learn the simple steps in the insert-building process (no previous experience required, no power tools). Each job has</w:t>
+      </w:r>
+      <w:r>
+        <w:t xml:space="preserve"> </w:t>
+      </w:r>
+      <w:r>
+        <w:t xml:space="preserve">“jigs”</w:t>
+      </w:r>
+      <w:r>
+        <w:t xml:space="preserve"> </w:t>
+      </w:r>
+      <w:r>
+        <w:t xml:space="preserve">that make the job easier to do and ensure uniform quality. You will be trained at the beginning of your shift on how to do your task. Volunteering for multiple shifts is encouraged! Mid-shift snacks and a meal are provided to all participants.</w:t>
+      </w:r>
+    </w:p>
+    <w:p>
+      <w:pPr>
+        <w:pStyle w:val="BodyText"/>
+      </w:pPr>
+      <w:r>
+        <w:t xml:space="preserve">If you would like to participate, please contact us so we can discuss how the program works and which windows you’d like inserts for.</w:t>
       </w:r>
     </w:p>
     <w:bookmarkEnd w:id="44"/>
-    <w:bookmarkStart w:id="45" w:name="refrigerator"/>
+    <w:bookmarkStart w:id="45" w:name="freezer"/>
     <w:p>
       <w:pPr>
         <w:pStyle w:val="Heading3"/>
       </w:pPr>
       <w:r>
-        <w:t xml:space="preserve">4.4 Refrigerator</w:t>
+        <w:t xml:space="preserve">4.4 Freezer</w:t>
       </w:r>
     </w:p>
     <w:p>
@@ -4985,7 +4703,7 @@
         <w:pStyle w:val="BodyText"/>
       </w:pPr>
       <w:r>
-        <w:t xml:space="preserve">Your refrigerator uses more energy than newer models.</w:t>
+        <w:t xml:space="preserve">Your freezer uses more energy than newer models. Consider how the cost of running the freezer compares to the benefits of keeping it on.</w:t>
       </w:r>
     </w:p>
     <w:p>
@@ -4997,7 +4715,7 @@
           <w:b/>
           <w:bCs/>
         </w:rPr>
-        <w:t xml:space="preserve">Ideally, the auditor notes the annual energy consumption (kWh) of the existing fridge compared to a new model of similar size</w:t>
+        <w:t xml:space="preserve">Ideally, the auditor notes the annual energy consumption (kWh) of the existing freezer compared to a new model of similar size</w:t>
       </w:r>
     </w:p>
     <w:p>
@@ -5017,7 +4735,7 @@
         <w:pStyle w:val="BodyText"/>
       </w:pPr>
       <w:r>
-        <w:t xml:space="preserve">Replace your refrigerator with a new, EnergyStar-certified fridge. Look at the Energy Guide label to compare the energy use of new refrigerators.</w:t>
+        <w:t xml:space="preserve">Replace your freezer with a new, EnergyStar certified freezer. Look at the Energy Guide label to compare the energy use of new freezers.</w:t>
       </w:r>
     </w:p>
     <w:p>
@@ -5037,7 +4755,7 @@
         <w:pStyle w:val="BodyText"/>
       </w:pPr>
       <w:r>
-        <w:t xml:space="preserve">If you are able to afford the upfront cost of purchasing a new refrigerator, you will recoup significant savings in the long run. Whenever you need to buy a new appliance, consider EnergyStar certified models, which use less energy and are cheaper to run. Remember, it doesn’t save energy if you relocate your existing refrigerator to the basement or garage and continue using it.</w:t>
+        <w:t xml:space="preserve">If you are able to afford the upfront cost of purchasing a new freezer, you will recoup significant savings in the long run. Whenever you need to buy a new appliance, consider EnergyStar certified models, which use electricity and are cheaper to run.</w:t>
       </w:r>
     </w:p>
     <w:p>
@@ -5049,7 +4767,21 @@
           <w:b/>
           <w:bCs/>
         </w:rPr>
-        <w:t xml:space="preserve">Ideally, auditor locates similar volume fridge online to calculate monthly savings and payback period compared to kill-a-watt meter reading for current refrigerator. “This example refrigerator would save $XX in electricity each month and pay for itself within XX months</w:t>
+        <w:t xml:space="preserve">Ideally, auditor locates similar volume freezer online to calculate monthly savings and payback period compared to kill-a-watt meter reading for current freezer.</w:t>
+      </w:r>
+      <w:r>
+        <w:rPr>
+          <w:b/>
+          <w:bCs/>
+        </w:rPr>
+        <w:t xml:space="preserve"> </w:t>
+      </w:r>
+      <w:r>
+        <w:rPr>
+          <w:b/>
+          <w:bCs/>
+        </w:rPr>
+        <w:t xml:space="preserve">“This example freezer would save $XX in electricity each month and pay for itself within XX months.”</w:t>
       </w:r>
     </w:p>
     <w:bookmarkEnd w:id="45"/>
@@ -5123,13 +4855,13 @@
       </w:r>
     </w:p>
     <w:bookmarkEnd w:id="46"/>
-    <w:bookmarkStart w:id="47" w:name="heat-pump-water-heater"/>
+    <w:bookmarkStart w:id="47" w:name="bathroom-exhaust-fans"/>
     <w:p>
       <w:pPr>
         <w:pStyle w:val="Heading3"/>
       </w:pPr>
       <w:r>
-        <w:t xml:space="preserve">4.6 Heat Pump Water Heater</w:t>
+        <w:t xml:space="preserve">4.6 Bathroom exhaust fan(s)</w:t>
       </w:r>
     </w:p>
     <w:p>
@@ -5149,11 +4881,7 @@
         <w:pStyle w:val="BodyText"/>
       </w:pPr>
       <w:r>
-        <w:rPr>
-          <w:b/>
-          <w:bCs/>
-        </w:rPr>
-        <w:t xml:space="preserve">Auditor to describe depending on what their current system is</w:t>
+        <w:t xml:space="preserve">Currently, there is no bathroom exhaust fan, so moisture from the shower, toilet, and sink remains in the house, which can cause moisture issues such as mold.</w:t>
       </w:r>
     </w:p>
     <w:p>
@@ -5173,7 +4901,7 @@
         <w:pStyle w:val="BodyText"/>
       </w:pPr>
       <w:r>
-        <w:t xml:space="preserve">Install a heat pump water heater to provide your hot water for cooking and bathing. This is the most efficient way to heat water and will save hundreds of dollars a year compared to electric resistance, heating oil, or propane hot water. It will also help to dehumidify while it’s running. If your current water heater burns oil or propane, this will also remove a source of combustion gases from your home. We also recommend setting the temperature on the water heater at 130°F for more efficient operation.</w:t>
+        <w:t xml:space="preserve">Install bathroom exhaust fans in all bathrooms that do not have them. These should be rated for at least 80 cubic feet per minute (CFM) if there is a shower. We recommend the Panasonic Whisper series or similar fans that don’t create excess noise. If the ductwork will run through the attic, it should be installed before the attic is air-sealed and insulated. The fan needs to be ducted outside, so it does not add moisture into the attic.</w:t>
       </w:r>
     </w:p>
     <w:p>
@@ -5193,17 +4921,17 @@
         <w:pStyle w:val="BodyText"/>
       </w:pPr>
       <w:r>
-        <w:t xml:space="preserve">A heat pump water heater uses 70% less electricity than a standard electric water heater. Efficiency Maine offers a rebate of up to $950, making the equipment cost as little as $400 plus installation. The rebate can be combined with a nonrefundable federal tax credit of 30% of the remaining cost of the unit and labor, subject to an annual maximum benefit of $2,000 (shared with other energy property, like heat pumps). For more information, you can call Efficiency Maine at 866-376-2463 (Monday to Friday, 8:00 am to 5:00 pm) or visit their website: https://www.efficiencymaine.com/at-home/heat-pump-water-heater-program/</w:t>
+        <w:t xml:space="preserve">The typical fan is around $130 plus the cost of installation.</w:t>
       </w:r>
     </w:p>
     <w:bookmarkEnd w:id="47"/>
-    <w:bookmarkStart w:id="48" w:name="gutters"/>
+    <w:bookmarkStart w:id="48" w:name="kitchen-exhaust-fans"/>
     <w:p>
       <w:pPr>
         <w:pStyle w:val="Heading3"/>
       </w:pPr>
       <w:r>
-        <w:t xml:space="preserve">4.7 Gutters</w:t>
+        <w:t xml:space="preserve">4.7 Kitchen exhaust fan(s)</w:t>
       </w:r>
     </w:p>
     <w:p>
@@ -5223,7 +4951,7 @@
         <w:pStyle w:val="BodyText"/>
       </w:pPr>
       <w:r>
-        <w:t xml:space="preserve">The house has no gutters, so water runs off your roof and directly onto the ground next to your house. Water that splashes off the ground can damage the exterior of your house. Runoff that is absorbed into the ground can seep into the basement/crawlspace, causing moisture issues there and throughout your house.</w:t>
+        <w:t xml:space="preserve">Currently, there is no kitchen exhaust fan, so fumes, smoke, and moisture from cooking stay in the house which can cause health concerns.</w:t>
       </w:r>
     </w:p>
     <w:p>
@@ -5243,7 +4971,7 @@
         <w:pStyle w:val="BodyText"/>
       </w:pPr>
       <w:r>
-        <w:t xml:space="preserve">Install gutters and downspouts that divert water at least six feet away from the foundation and to where the ground slopes away from the house.</w:t>
+        <w:t xml:space="preserve">Install a kitchen exhaust fan to remove cooking fumes and moisture from your home. The fan should be rated for at least 100 cubic feet per minute. A kitchen fan should be ducted to the outdoors. If the ductwork will run through the attic, it should be installed before the attic is air-sealed and insulated.</w:t>
       </w:r>
     </w:p>
     <w:p>
@@ -5263,17 +4991,17 @@
         <w:pStyle w:val="BodyText"/>
       </w:pPr>
       <w:r>
-        <w:t xml:space="preserve">Adding gutters would mitigate moisture damage and save you from having to replace/fix other parts of the house.</w:t>
+        <w:t xml:space="preserve">Kitchen range hoods typically cost $150 or more; installation costs depend on the complexity of the exhaust ducting.</w:t>
       </w:r>
     </w:p>
     <w:bookmarkEnd w:id="48"/>
-    <w:bookmarkStart w:id="49" w:name="bathroom-exhaust-fans"/>
+    <w:bookmarkStart w:id="49" w:name="vapor-barrier"/>
     <w:p>
       <w:pPr>
         <w:pStyle w:val="Heading3"/>
       </w:pPr>
       <w:r>
-        <w:t xml:space="preserve">4.8 Bathroom exhaust fan(s)</w:t>
+        <w:t xml:space="preserve">4.8 Vapor Barrier</w:t>
       </w:r>
     </w:p>
     <w:p>
@@ -5293,7 +5021,7 @@
         <w:pStyle w:val="BodyText"/>
       </w:pPr>
       <w:r>
-        <w:t xml:space="preserve">Currently, there is no bathroom exhaust fan, so moisture from the shower, toilet, and sink remains in the house, which can cause moisture issues such as mold.</w:t>
+        <w:t xml:space="preserve">There is excess moisture in the basement/crawlspace, which is evaporating out of the ground. This moisture can enter the house and cause mold, mildew, rot, and air quality issues.</w:t>
       </w:r>
     </w:p>
     <w:p>
@@ -5313,7 +5041,19 @@
         <w:pStyle w:val="BodyText"/>
       </w:pPr>
       <w:r>
-        <w:t xml:space="preserve">Install bathroom exhaust fans in all bathrooms that do not have them. These should be rated for at least 80 cubic feet per minute (CFM) if there is a shower. We recommend the Panasonic Whisper series or similar fans that don’t create excess noise. If the ductwork will run through the attic, it should be installed before the attic is air-sealed and insulated. The fan needs to be ducted outside, so it does not add moisture into the attic.</w:t>
+        <w:t xml:space="preserve">Install a vapor barrier on the basement floor to stop moisture from entering the basement and house. Vapor barriers typically consist of either reinforced plastic sheeting or EPDM rubber membrane over a</w:t>
+      </w:r>
+      <w:r>
+        <w:t xml:space="preserve"> </w:t>
+      </w:r>
+      <w:r>
+        <w:t xml:space="preserve">‘dimple mat’</w:t>
+      </w:r>
+      <w:r>
+        <w:t xml:space="preserve"> </w:t>
+      </w:r>
+      <w:r>
+        <w:t xml:space="preserve">that allows for drainage below the vapor barrier and prevents rocks from puncturing it. If the basement/crawlspace walls are going to be spray foamed, we recommend the foam go all the way to the floor and overlap the vapor barrier to create a continuous air and moisture barrier.</w:t>
       </w:r>
     </w:p>
     <w:p>
@@ -5333,17 +5073,17 @@
         <w:pStyle w:val="BodyText"/>
       </w:pPr>
       <w:r>
-        <w:t xml:space="preserve">The typical fan is around $130 plus the cost of installation.</w:t>
+        <w:t xml:space="preserve">Efficiency Maine rebates will cover vapor barriers up to 25% of a weatherization project cost, if done as part of a larger insulation project. Most insulation companies can install spray foam and vapor barriers together. Efficiency Maine rebates and other incentives for insulation work can fund up to 80% of the overall cost to weatherize your home (subject to a lifetime limit per building), up to $9,200 when combined with nonrefundable federal tax credits. You can call them at 866-376-2463 (Monday to Friday, 8:00 am to 5:00 pm) or visit their webpage about insulation rebates: https://www.efficiencymaine.com/at-home/insulation-rebates/</w:t>
       </w:r>
     </w:p>
     <w:bookmarkEnd w:id="49"/>
-    <w:bookmarkStart w:id="50" w:name="kitchen-exhaust-fans"/>
+    <w:bookmarkStart w:id="50" w:name="spray-foam-basement-walls"/>
     <w:p>
       <w:pPr>
         <w:pStyle w:val="Heading3"/>
       </w:pPr>
       <w:r>
-        <w:t xml:space="preserve">4.9 Kitchen exhaust fan(s)</w:t>
+        <w:t xml:space="preserve">4.9 Spray foam Basement Walls</w:t>
       </w:r>
     </w:p>
     <w:p>
@@ -5363,7 +5103,7 @@
         <w:pStyle w:val="BodyText"/>
       </w:pPr>
       <w:r>
-        <w:t xml:space="preserve">Currently, there is no kitchen exhaust fan, so fumes, smoke, and moisture from cooking stay in the house which can cause health concerns.</w:t>
+        <w:t xml:space="preserve">The basement/crawlspace is uninsulated and used for mechanical equipment and plumbing. The walls are porous and allow moisture into the house and rapidly conduct heat out of the space.</w:t>
       </w:r>
     </w:p>
     <w:p>
@@ -5383,7 +5123,24 @@
         <w:pStyle w:val="BodyText"/>
       </w:pPr>
       <w:r>
-        <w:t xml:space="preserve">Install a kitchen exhaust fan to remove cooking fumes and moisture from your home. The fan should be rated for at least 100 cubic feet per minute. A kitchen fan should be ducted to the outdoors. If the ductwork will run through the attic, it should be installed before the attic is air-sealed and insulated.</w:t>
+        <w:t xml:space="preserve">Install spray foam on the basement/crawlspace walls to prevent moisture infiltration and reduce heat loss. In older homes, most heat loss is due to air leakage. Air sealing is particularly important in the basement or crawlspace (and attic). As warm air rises and leaks out the top of your home, cold air is pulled in at the bottom. This is called the</w:t>
+      </w:r>
+      <w:r>
+        <w:t xml:space="preserve"> </w:t>
+      </w:r>
+      <w:r>
+        <w:t xml:space="preserve">‘stack effect’</w:t>
+      </w:r>
+      <w:r>
+        <w:t xml:space="preserve">, and is more pronounced in taller homes. Thus, air sealing is necessary anywhere gaps allow air to move into your house through the basement/crawlspace.</w:t>
+      </w:r>
+    </w:p>
+    <w:p>
+      <w:pPr>
+        <w:pStyle w:val="BodyText"/>
+      </w:pPr>
+      <w:r>
+        <w:t xml:space="preserve">Spray foam should be applied 2-3 inches thick on the walls to seal and insulate them. It is often ideal to install a vapor barrier at the same time as the spray foam insulation. Spray foam generally requires a layer of intumescent (fire-rated) paint over it to meet fire code.</w:t>
       </w:r>
     </w:p>
     <w:p>
@@ -5403,17 +5160,17 @@
         <w:pStyle w:val="BodyText"/>
       </w:pPr>
       <w:r>
-        <w:t xml:space="preserve">Kitchen range hoods typically cost $150 or more; installation costs depend on the complexity of the exhaust ducting.</w:t>
+        <w:t xml:space="preserve">Installation of spray foam insulation will cost around $5-7 per square foot. Efficiency Maine rebates and other incentives for insulation work can fund up to 80% of the project cost (subject to a lifetime limit per building), up to $9,200 when combined with nonrefundable federal tax credits. You can call them at 866-376-2463 (Monday to Friday, 8:00 am to 5:00 pm) or visit their webpage about insulation rebates: https://www.efficiencymaine.com/at-home/insulation-rebates/</w:t>
       </w:r>
     </w:p>
     <w:bookmarkEnd w:id="50"/>
-    <w:bookmarkStart w:id="51" w:name="vapor-barrier"/>
+    <w:bookmarkStart w:id="51" w:name="attic-insulation-and-air-sealing"/>
     <w:p>
       <w:pPr>
         <w:pStyle w:val="Heading3"/>
       </w:pPr>
       <w:r>
-        <w:t xml:space="preserve">4.10 Vapor Barrier</w:t>
+        <w:t xml:space="preserve">4.10 Attic Insulation and Air Sealing</w:t>
       </w:r>
     </w:p>
     <w:p>
@@ -5433,7 +5190,7 @@
         <w:pStyle w:val="BodyText"/>
       </w:pPr>
       <w:r>
-        <w:t xml:space="preserve">There is excess moisture in the basement/crawlspace, which is evaporating out of the ground. This moisture can enter the house and cause mold, mildew, rot, and air quality issues.</w:t>
+        <w:t xml:space="preserve">The attic is uninsulated or is missing insulation and the attic could also benefit from air-sealing. These upgrades will reduce draftiness and heat loss in the winter and heat gain in the summer.</w:t>
       </w:r>
     </w:p>
     <w:p>
@@ -5453,19 +5210,24 @@
         <w:pStyle w:val="BodyText"/>
       </w:pPr>
       <w:r>
-        <w:t xml:space="preserve">Install a vapor barrier on the basement floor to stop moisture from entering the basement and house. Vapor barriers typically consist of either reinforced plastic sheeting or EPDM rubber membrane over a</w:t>
+        <w:t xml:space="preserve">Air seal the attic and insulate it to at least R-60 (18 inches of loose-fill cellulose insulation). COA has been installing 24 inches (R-80) of cellulose insulation in attics on our campus. Before the attic is insulated, ensure that any needed bathroom and kitchen fans are installed and that all fans are properly vented to the outside.</w:t>
+      </w:r>
+    </w:p>
+    <w:p>
+      <w:pPr>
+        <w:pStyle w:val="BodyText"/>
+      </w:pPr>
+      <w:r>
+        <w:t xml:space="preserve">In older homes, most heat loss is due to air leakage. Air sealing is particularly important in the attic (and basement or crawlspace). As warm air rises and leaks out the top of your home, cold air is pulled in at the bottom. This is called the</w:t>
       </w:r>
       <w:r>
         <w:t xml:space="preserve"> </w:t>
       </w:r>
       <w:r>
-        <w:t xml:space="preserve">‘dimple mat’</w:t>
-      </w:r>
-      <w:r>
-        <w:t xml:space="preserve"> </w:t>
-      </w:r>
-      <w:r>
-        <w:t xml:space="preserve">that allows for drainage below the vapor barrier and prevents rocks from puncturing it. If the basement/crawlspace walls are going to be spray foamed, we recommend the foam go all the way to the floor and overlap the vapor barrier to create a continuous air and moisture barrier.</w:t>
+        <w:t xml:space="preserve">‘stack effect’</w:t>
+      </w:r>
+      <w:r>
+        <w:t xml:space="preserve">, and is more pronounced in taller homes. Thus, air sealing is necessary anywhere gaps allow air to move between your house and the attic. This typically includes gaps around the chimney, electrical penetrations, and wall top plates.</w:t>
       </w:r>
     </w:p>
     <w:p>
@@ -5485,17 +5247,17 @@
         <w:pStyle w:val="BodyText"/>
       </w:pPr>
       <w:r>
-        <w:t xml:space="preserve">Efficiency Maine rebates will cover vapor barriers up to 25% of a weatherization project cost, if done as part of a larger insulation project. Most insulation companies can install spray foam and vapor barriers together. Efficiency Maine rebates and other incentives for insulation work can fund up to 80% of the overall cost to weatherize your home (subject to a lifetime limit per building), up to $9,200 when combined with nonrefundable federal tax credits. You can call them at 866-376-2463 (Monday to Friday, 8:00 am to 5:00 pm) or visit their webpage about insulation rebates: https://www.efficiencymaine.com/at-home/insulation-rebates/</w:t>
+        <w:t xml:space="preserve">Efficiency Maine rebates and other incentives for insulation work can fund up to 80% of the overall cost to weatherize your home (subject to a lifetime limit per building), up to $9,200 when combined with nonrefundable federal tax credits. You can call them at 866-376-2463 (Monday to Friday, 8:00 am to 5:00 pm) or visit their webpage about insulation rebates: https://www.efficiencymaine.com/at-home/insulation-rebates/</w:t>
       </w:r>
     </w:p>
     <w:bookmarkEnd w:id="51"/>
-    <w:bookmarkStart w:id="52" w:name="spray-foam-basement-walls"/>
+    <w:bookmarkStart w:id="52" w:name="blow-in-cellulose-wall-insulation"/>
     <w:p>
       <w:pPr>
         <w:pStyle w:val="Heading3"/>
       </w:pPr>
       <w:r>
-        <w:t xml:space="preserve">4.11 Spray foam Basement Walls</w:t>
+        <w:t xml:space="preserve">4.11 Blow-in cellulose wall insulation</w:t>
       </w:r>
     </w:p>
     <w:p>
@@ -5515,7 +5277,7 @@
         <w:pStyle w:val="BodyText"/>
       </w:pPr>
       <w:r>
-        <w:t xml:space="preserve">The basement/crawlspace is uninsulated and used for mechanical equipment and plumbing. The walls are porous and allow moisture into the house and rapidly conduct heat out of the space.</w:t>
+        <w:t xml:space="preserve">The walls of the house are uninsulated, which is a significant source of heat loss.</w:t>
       </w:r>
     </w:p>
     <w:p>
@@ -5535,30 +5297,11 @@
         <w:pStyle w:val="BodyText"/>
       </w:pPr>
       <w:r>
-        <w:t xml:space="preserve">Install spray foam on the basement/crawlspace walls to prevent moisture infiltration and reduce heat loss. In older homes, most heat loss is due to air leakage. Air sealing is particularly important in the basement or crawlspace (and attic). As warm air rises and leaks out the top of your home, cold air is pulled in at the bottom. This is called the</w:t>
+        <w:t xml:space="preserve">Insulate the wall stud cavities with dense packed, blown-in cellulose insulation. In balloon-framed homes, this can often be done from the attic, otherwise it can be done by drilling holes into the wall cavities from either the inside or outside.</w:t>
       </w:r>
       <w:r>
         <w:t xml:space="preserve"> </w:t>
       </w:r>
-      <w:r>
-        <w:t xml:space="preserve">‘stack effect’</w:t>
-      </w:r>
-      <w:r>
-        <w:t xml:space="preserve">, and is more pronounced in taller homes. Thus, air sealing is necessary anywhere gaps allow air to move into your house through the basement/crawlspace.</w:t>
-      </w:r>
-    </w:p>
-    <w:p>
-      <w:pPr>
-        <w:pStyle w:val="BodyText"/>
-      </w:pPr>
-      <w:r>
-        <w:t xml:space="preserve">Spray foam should be applied 2-3 inches thick on the walls to seal and insulate them. It is often ideal to install a vapor barrier at the same time as the spray foam insulation. Spray foam generally requires a layer of intumescent (fire-rated) paint over it to meet fire code.</w:t>
-      </w:r>
-    </w:p>
-    <w:p>
-      <w:pPr>
-        <w:pStyle w:val="BodyText"/>
-      </w:pPr>
       <w:r>
         <w:rPr>
           <w:i/>
@@ -5572,17 +5315,17 @@
         <w:pStyle w:val="BodyText"/>
       </w:pPr>
       <w:r>
-        <w:t xml:space="preserve">Installation of spray foam insulation will cost around $5-7 per square foot. Efficiency Maine rebates and other incentives for insulation work can fund up to 80% of the project cost (subject to a lifetime limit per building), up to $9,200 when combined with nonrefundable federal tax credits. You can call them at 866-376-2463 (Monday to Friday, 8:00 am to 5:00 pm) or visit their webpage about insulation rebates: https://www.efficiencymaine.com/at-home/insulation-rebates/</w:t>
+        <w:t xml:space="preserve">Efficiency Maine rebates and other incentives for insulation work can fund up to 80% of the overall cost to weatherize your home (subject to a lifetime limit per building), up to $9,200 when combined with nonrefundable federal tax credits. You can call them at 866-376-2463 (Monday to Friday, 8:00 am to 5:00 pm) or visit their webpage about insulation rebates: https://www.efficiencymaine.com/at-home/insulation-rebates/</w:t>
       </w:r>
     </w:p>
     <w:bookmarkEnd w:id="52"/>
-    <w:bookmarkStart w:id="53" w:name="attic-insulation-and-air-sealing"/>
+    <w:bookmarkStart w:id="53" w:name="continuous-exterior-wall-insulation"/>
     <w:p>
       <w:pPr>
         <w:pStyle w:val="Heading3"/>
       </w:pPr>
       <w:r>
-        <w:t xml:space="preserve">4.12 Attic Insulation and Air Sealing</w:t>
+        <w:t xml:space="preserve">4.12 Continuous exterior wall insulation</w:t>
       </w:r>
     </w:p>
     <w:p>
@@ -5602,7 +5345,7 @@
         <w:pStyle w:val="BodyText"/>
       </w:pPr>
       <w:r>
-        <w:t xml:space="preserve">The attic is uninsulated or is missing insulation and the attic could also benefit from air-sealing. These upgrades will reduce draftiness and heat loss in the winter and heat gain in the summer.</w:t>
+        <w:t xml:space="preserve">There isn’t continuous insulation between the siding and the exterior walls of the house. Continuous insulation helps create a complete thermal boundary for your house, and it is now an energy code requirement for new houses.</w:t>
       </w:r>
     </w:p>
     <w:p>
@@ -5622,24 +5365,7 @@
         <w:pStyle w:val="BodyText"/>
       </w:pPr>
       <w:r>
-        <w:t xml:space="preserve">Air seal the attic and insulate it to at least R-60 (18 inches of loose-fill cellulose insulation). COA has been installing 24 inches (R-80) of cellulose insulation in attics on our campus. Before the attic is insulated, ensure that any needed bathroom and kitchen fans are installed and that all fans are properly vented to the outside.</w:t>
-      </w:r>
-    </w:p>
-    <w:p>
-      <w:pPr>
-        <w:pStyle w:val="BodyText"/>
-      </w:pPr>
-      <w:r>
-        <w:t xml:space="preserve">In older homes, most heat loss is due to air leakage. Air sealing is particularly important in the attic (and basement or crawlspace). As warm air rises and leaks out the top of your home, cold air is pulled in at the bottom. This is called the</w:t>
-      </w:r>
-      <w:r>
-        <w:t xml:space="preserve"> </w:t>
-      </w:r>
-      <w:r>
-        <w:t xml:space="preserve">‘stack effect’</w:t>
-      </w:r>
-      <w:r>
-        <w:t xml:space="preserve">, and is more pronounced in taller homes. Thus, air sealing is necessary anywhere gaps allow air to move between your house and the attic. This typically includes gaps around the chimney, electrical penetrations, and wall top plates.</w:t>
+        <w:t xml:space="preserve">Add a continuous layer of insulation and potentially replace the air and moisture barrier once it becomes time to replace the siding. Add continuous insulation (R-6 or more) under the new siding to keep the house warmer in the winter and cooler in the summer. We recommend TimberHP TimberBoard insulation (produced in Madison, Maine) or Rockwool Comfortboard, but foam board can also be used. Before installing exterior insulation, the contractor can check if insulation is needed between the interior wall studs.</w:t>
       </w:r>
     </w:p>
     <w:p>
@@ -5663,13 +5389,13 @@
       </w:r>
     </w:p>
     <w:bookmarkEnd w:id="53"/>
-    <w:bookmarkStart w:id="54" w:name="continuous-exterior-wall-insulation"/>
+    <w:bookmarkStart w:id="54" w:name="electrical-panel-upgrade"/>
     <w:p>
       <w:pPr>
         <w:pStyle w:val="Heading3"/>
       </w:pPr>
       <w:r>
-        <w:t xml:space="preserve">4.13 Continuous exterior wall insulation</w:t>
+        <w:t xml:space="preserve">4.13 Electrical Panel Upgrade</w:t>
       </w:r>
     </w:p>
     <w:p>
@@ -5689,7 +5415,11 @@
         <w:pStyle w:val="BodyText"/>
       </w:pPr>
       <w:r>
-        <w:t xml:space="preserve">There isn’t continuous insulation between the siding and the exterior walls of the house. Continuous insulation helps create a complete thermal boundary for your house, and it is now an energy code requirement for new houses.</w:t>
+        <w:rPr>
+          <w:b/>
+          <w:bCs/>
+        </w:rPr>
+        <w:t xml:space="preserve">Auditor to describe</w:t>
       </w:r>
     </w:p>
     <w:p>
@@ -5709,7 +5439,7 @@
         <w:pStyle w:val="BodyText"/>
       </w:pPr>
       <w:r>
-        <w:t xml:space="preserve">Add a continuous layer of insulation and potentially replace the air and moisture barrier once it becomes time to replace the siding. Add continuous insulation (R-6 or more) under the new siding to keep the house warmer in the winter and cooler in the summer. We recommend TimberHP TimberBoard insulation (produced in Madison, Maine) or Rockwool Comfortboard, but foam board can also be used. Before installing exterior insulation, the contractor can check if insulation is needed between the interior wall studs.</w:t>
+        <w:t xml:space="preserve">Consult with an electrician about replacing your existing electrical panel with a 200 amp panel as you add electrical appliances to your home. It may become necessary to increase the capacity to address potential safety hazards. An electrician can determine whether or not a panel upgrade is necessary based on your current and anticipated usage.</w:t>
       </w:r>
     </w:p>
     <w:p>
@@ -5729,17 +5459,17 @@
         <w:pStyle w:val="BodyText"/>
       </w:pPr>
       <w:r>
-        <w:t xml:space="preserve">Efficiency Maine rebates and other incentives for insulation work can fund up to 80% of the overall cost to weatherize your home (subject to a lifetime limit per building), up to $9,200 when combined with nonrefundable federal tax credits. You can call them at 866-376-2463 (Monday to Friday, 8:00 am to 5:00 pm) or visit their webpage about insulation rebates: https://www.efficiencymaine.com/at-home/insulation-rebates/</w:t>
+        <w:t xml:space="preserve">Costs of electrical components needed to support residential energy upgrades – including panels, sub-panels, branch circuits, and feeders – qualify for a 30% nonrefundable tax credit (up to $600 per item) if they have a capacity of 200 amps or more. An electrical panel upgrades also provides a good opportunity for an electrician to install whole-house surge protection, which costs $100-$400. Here are some options: https://www.popularmechanics.com/home/interior-projects/g43140886/best-whole-house-surge-protectors/</w:t>
       </w:r>
     </w:p>
     <w:bookmarkEnd w:id="54"/>
-    <w:bookmarkStart w:id="55" w:name="electrical-panel-upgrade"/>
+    <w:bookmarkStart w:id="55" w:name="pipe-insulation"/>
     <w:p>
       <w:pPr>
         <w:pStyle w:val="Heading3"/>
       </w:pPr>
       <w:r>
-        <w:t xml:space="preserve">4.14 Electrical Panel Upgrade</w:t>
+        <w:t xml:space="preserve">4.14 Pipe Insulation</w:t>
       </w:r>
     </w:p>
     <w:p>
@@ -5759,11 +5489,7 @@
         <w:pStyle w:val="BodyText"/>
       </w:pPr>
       <w:r>
-        <w:rPr>
-          <w:b/>
-          <w:bCs/>
-        </w:rPr>
-        <w:t xml:space="preserve">Auditor to describe</w:t>
+        <w:t xml:space="preserve">Uninsulated water pipes are responsible for heat loss and excess moisture (from condensation) in your basement/crawlspace.</w:t>
       </w:r>
     </w:p>
     <w:p>
@@ -5783,7 +5509,7 @@
         <w:pStyle w:val="BodyText"/>
       </w:pPr>
       <w:r>
-        <w:t xml:space="preserve">Consult with an electrician about replacing your existing electrical panel with a 200 amp panel as you add electrical appliances to your home. It may become necessary to increase the capacity to address potential safety hazards. An electrician can determine whether or not a panel upgrade is necessary based on your current and anticipated usage.</w:t>
+        <w:t xml:space="preserve">Insulate both hot and cold water pipes that are uninsulated in the basement/crawlspace. This will save energy and prevent condensation. We recommend foam pipe insulation made of polyethylene or neoprene.</w:t>
       </w:r>
     </w:p>
     <w:p>
@@ -5803,17 +5529,17 @@
         <w:pStyle w:val="BodyText"/>
       </w:pPr>
       <w:r>
-        <w:t xml:space="preserve">Costs of electrical components needed to support residential energy upgrades – including panels, sub-panels, branch circuits, and feeders – qualify for a 30% nonrefundable tax credit (up to $600 per item) if they have a capacity of 200 amps or more. An electrical panel upgrades also provides a good opportunity for an electrician to install whole-house surge protection, which costs $100-$400. Here are some options: https://www.popularmechanics.com/home/interior-projects/g43140886/best-whole-house-surge-protectors/</w:t>
+        <w:t xml:space="preserve">Insulating water pipes can save 2%-4% on hot water bills and increase the temperature of the water while reducing the time it takes for hot water to reach your tap. Materials cost around $100-200, depending on the length of pipe to insulate. Many people find this to be an easy project to do themselves.</w:t>
       </w:r>
     </w:p>
     <w:bookmarkEnd w:id="55"/>
-    <w:bookmarkStart w:id="56" w:name="air-source-heat-pump"/>
+    <w:bookmarkStart w:id="56" w:name="whole-house-surge-protection"/>
     <w:p>
       <w:pPr>
         <w:pStyle w:val="Heading3"/>
       </w:pPr>
       <w:r>
-        <w:t xml:space="preserve">4.15 Air Source Heat Pump</w:t>
+        <w:t xml:space="preserve">4.15 Whole House Surge Protection</w:t>
       </w:r>
     </w:p>
     <w:p>
@@ -5833,7 +5559,7 @@
         <w:pStyle w:val="BodyText"/>
       </w:pPr>
       <w:r>
-        <w:t xml:space="preserve">Combustion heating equipment is expensive, inefficient, and has the potential to release harmful combustion gases like carbon monoxide into the home.</w:t>
+        <w:t xml:space="preserve">Your house does not have whole-house surge protection. This will protect your large electrical appliances from damage in the case of an electrical surge. Heat pumps, heat pump water heaters, and other electronics are particularly sensitive to electrical surges.</w:t>
       </w:r>
     </w:p>
     <w:p>
@@ -5853,13 +5579,11 @@
         <w:pStyle w:val="BodyText"/>
       </w:pPr>
       <w:r>
-        <w:t xml:space="preserve">Install air source heat pumps for heating and cooling and whole-house surge protection. Air source heat pumps can be up to 300% efficient and heat, cool, and dehumidify your house. A qualified installer will help determine what size system to install and where. Whole-house surge protection will protect your appliances and heat pumps from being damaged by an electrical surge.</w:t>
-      </w:r>
-    </w:p>
-    <w:p>
-      <w:pPr>
-        <w:pStyle w:val="BodyText"/>
-      </w:pPr>
+        <w:t xml:space="preserve">Seal easy-to-access air leaks and weatherstrip exterior doors. In older homes, most heat loss is due to air leakage. WindowDressers insulating window inserts can also help reduce air leakage.</w:t>
+      </w:r>
+      <w:r>
+        <w:t xml:space="preserve"> </w:t>
+      </w:r>
       <w:r>
         <w:rPr>
           <w:i/>
@@ -5873,17 +5597,17 @@
         <w:pStyle w:val="BodyText"/>
       </w:pPr>
       <w:r>
-        <w:t xml:space="preserve">Efficiency Maine rebates can fund $1,000 to $3,000 per unit up to a lifetime limit per housing unit for $3,000 to $9,000 (depending on income level) to install heat pumps. The rebate can be combined with a nonrefundable federal tax credit of 30% of the remaining cost of the unit and labor, subject to an annual maximum benefit of $2,000 (shared with other energy property, like a heat pump water heater). You can call Efficiency Maine at 866-376-2463 (Monday to Friday, 8:00 am to 5:00 pm) or visit their website: https://www.efficiencymaine.com/at-home/residential-heat-pump-incentives/</w:t>
+        <w:t xml:space="preserve">The device costs $100-$400 and needs to be installed by an electrician. Here are some options: https://www.popularmechanics.com/home/interior-projects/g43140886/best-whole-house-surge-protectors/</w:t>
       </w:r>
     </w:p>
     <w:bookmarkEnd w:id="56"/>
-    <w:bookmarkStart w:id="57" w:name="solar"/>
+    <w:bookmarkStart w:id="57" w:name="diy-air-sealing"/>
     <w:p>
       <w:pPr>
         <w:pStyle w:val="Heading3"/>
       </w:pPr>
       <w:r>
-        <w:t xml:space="preserve">4.16 Solar</w:t>
+        <w:t xml:space="preserve">4.16 DIY Air Sealing</w:t>
       </w:r>
     </w:p>
     <w:p>
@@ -5903,11 +5627,26 @@
         <w:pStyle w:val="BodyText"/>
       </w:pPr>
       <w:r>
+        <w:t xml:space="preserve">During the blower door test, we noted sources of air leakage in the living areas of your house.</w:t>
+      </w:r>
+    </w:p>
+    <w:p>
+      <w:pPr>
+        <w:pStyle w:val="BodyText"/>
+      </w:pPr>
+      <w:r>
         <w:rPr>
           <w:b/>
           <w:bCs/>
         </w:rPr>
-        <w:t xml:space="preserve">Auditor to describe (or remove this section)</w:t>
+        <w:t xml:space="preserve">Auditor to detail customized findings.</w:t>
+      </w:r>
+      <w:r>
+        <w:rPr>
+          <w:b/>
+          <w:bCs/>
+        </w:rPr>
+        <w:t xml:space="preserve"> </w:t>
       </w:r>
     </w:p>
     <w:p>
@@ -5927,7 +5666,7 @@
         <w:pStyle w:val="BodyText"/>
       </w:pPr>
       <w:r>
-        <w:t xml:space="preserve">Rooftop solar can supply most or all of your home electrical demands. Contact a solar company for pricing and details specific to your home.</w:t>
+        <w:t xml:space="preserve">Air sealing the air leaks we identified around the living areas of your house can be a DIY solution to lower energy use, or an insulation contractor can seal the leaks when they come to your house for a larger project. Please address any moisture concerns before undertaking significant air sealing efforts.</w:t>
       </w:r>
     </w:p>
     <w:p>
@@ -5947,25 +5686,23 @@
         <w:pStyle w:val="BodyText"/>
       </w:pPr>
       <w:r>
-        <w:t xml:space="preserve">There is a 30% nonrefundable federal tax credit and financing options are available. Battery backup is needed for solar to work during a power outage. Information on the federal tax credit: https://www.energy.gov/sites/default/files/2023-03/Homeowners_Guide_to_the_Federal_Tax_Credit_for_Solar_PV.pdf.</w:t>
-      </w:r>
-    </w:p>
-    <w:p>
-      <w:pPr>
-        <w:pStyle w:val="BodyText"/>
-      </w:pPr>
-      <w:r>
-        <w:t xml:space="preserve">The State of Maine is working on a solar and battery funding initiative for low-income and disadvantaged Maine households. It is still in the planning stages, but you can find more information here: https://www.maine.gov/energy/initiatives/infrastructure/solar-for-all.</w:t>
+        <w:t xml:space="preserve">Air sealing and insulating ductwork is eligible for a non-refundable federal tax credit (</w:t>
+      </w:r>
+      <w:r>
+        <w:t xml:space="preserve">“Energy Efficient Home Improvement Credit”</w:t>
+      </w:r>
+      <w:r>
+        <w:t xml:space="preserve">), which can pay for 30% of the project cost, subject to an annual maximum of $1,200 (shared with other home envelope improvements, like attic and basement projects).</w:t>
       </w:r>
     </w:p>
     <w:bookmarkEnd w:id="57"/>
-    <w:bookmarkStart w:id="58" w:name="pipe-insulation"/>
+    <w:bookmarkStart w:id="58" w:name="other-1"/>
     <w:p>
       <w:pPr>
         <w:pStyle w:val="Heading3"/>
       </w:pPr>
       <w:r>
-        <w:t xml:space="preserve">4.17 Pipe Insulation</w:t>
+        <w:t xml:space="preserve">4.17 Other 1</w:t>
       </w:r>
     </w:p>
     <w:p>
@@ -5985,14 +5722,6 @@
         <w:pStyle w:val="BodyText"/>
       </w:pPr>
       <w:r>
-        <w:t xml:space="preserve">Uninsulated water pipes are responsible for heat loss and excess moisture (from condensation) in your basement/crawlspace.</w:t>
-      </w:r>
-    </w:p>
-    <w:p>
-      <w:pPr>
-        <w:pStyle w:val="BodyText"/>
-      </w:pPr>
-      <w:r>
         <w:rPr>
           <w:i/>
           <w:iCs/>
@@ -6005,7 +5734,7 @@
         <w:pStyle w:val="BodyText"/>
       </w:pPr>
       <w:r>
-        <w:t xml:space="preserve">Insulate both hot and cold water pipes that are uninsulated in the basement/crawlspace. This will save energy and prevent condensation. We recommend foam pipe insulation made of polyethylene or neoprene.</w:t>
+        <w:t xml:space="preserve">Upgrade your electrical panel to add whole-house surge protection. This will help to protect your heat pumps, heat pump water heater, refrigerator, well pump, and other electronics from damage due to lightning or other electrical surges.</w:t>
       </w:r>
     </w:p>
     <w:p>
@@ -6025,17 +5754,21 @@
         <w:pStyle w:val="BodyText"/>
       </w:pPr>
       <w:r>
-        <w:t xml:space="preserve">Insulating water pipes can save 2%-4% on hot water bills and increase the temperature of the water while reducing the time it takes for hot water to reach your tap. Materials cost around $100-200, depending on the length of pipe to insulate. Many people find this to be an easy project to do themselves.</w:t>
+        <w:rPr>
+          <w:b/>
+          <w:bCs/>
+        </w:rPr>
+        <w:t xml:space="preserve">Auditor to describe. Primary residence</w:t>
       </w:r>
     </w:p>
     <w:bookmarkEnd w:id="58"/>
-    <w:bookmarkStart w:id="59" w:name="whole-house-surge-protection"/>
+    <w:bookmarkStart w:id="59" w:name="misc.-air-sealing-and-insulation"/>
     <w:p>
       <w:pPr>
         <w:pStyle w:val="Heading3"/>
       </w:pPr>
       <w:r>
-        <w:t xml:space="preserve">4.18 Whole House Surge Protection</w:t>
+        <w:t xml:space="preserve">4.18 Misc. Air Sealing and Insulation</w:t>
       </w:r>
     </w:p>
     <w:p>
@@ -6055,7 +5788,11 @@
         <w:pStyle w:val="BodyText"/>
       </w:pPr>
       <w:r>
-        <w:t xml:space="preserve">Your house does not have whole-house surge protection. This will protect your large electrical appliances from damage in the case of an electrical surge. Heat pumps, heat pump water heaters, and other electronics are particularly sensitive to electrical surges.</w:t>
+        <w:rPr>
+          <w:b/>
+          <w:bCs/>
+        </w:rPr>
+        <w:t xml:space="preserve">Need a description for the problem</w:t>
       </w:r>
     </w:p>
     <w:p>
@@ -6075,144 +5812,6 @@
         <w:pStyle w:val="BodyText"/>
       </w:pPr>
       <w:r>
-        <w:t xml:space="preserve">Seal easy-to-access air leaks and weatherstrip exterior doors. In older homes, most heat loss is due to air leakage. WindowDressers insulating window inserts can also help reduce air leakage.</w:t>
-      </w:r>
-      <w:r>
-        <w:t xml:space="preserve"> </w:t>
-      </w:r>
-      <w:r>
-        <w:rPr>
-          <w:i/>
-          <w:iCs/>
-        </w:rPr>
-        <w:t xml:space="preserve">Estimated Cost/Benefits/Incentives</w:t>
-      </w:r>
-    </w:p>
-    <w:p>
-      <w:pPr>
-        <w:pStyle w:val="BodyText"/>
-      </w:pPr>
-      <w:r>
-        <w:t xml:space="preserve">The device costs $100-$400 and needs to be installed by an electrician. Here are some options: https://www.popularmechanics.com/home/interior-projects/g43140886/best-whole-house-surge-protectors/</w:t>
-      </w:r>
-    </w:p>
-    <w:bookmarkEnd w:id="59"/>
-    <w:bookmarkStart w:id="60" w:name="other-1"/>
-    <w:p>
-      <w:pPr>
-        <w:pStyle w:val="Heading3"/>
-      </w:pPr>
-      <w:r>
-        <w:t xml:space="preserve">4.19 Other 1</w:t>
-      </w:r>
-    </w:p>
-    <w:p>
-      <w:pPr>
-        <w:pStyle w:val="FirstParagraph"/>
-      </w:pPr>
-      <w:r>
-        <w:rPr>
-          <w:i/>
-          <w:iCs/>
-        </w:rPr>
-        <w:t xml:space="preserve">Problem</w:t>
-      </w:r>
-    </w:p>
-    <w:p>
-      <w:pPr>
-        <w:pStyle w:val="BodyText"/>
-      </w:pPr>
-      <w:r>
-        <w:rPr>
-          <w:i/>
-          <w:iCs/>
-        </w:rPr>
-        <w:t xml:space="preserve">Recommendation</w:t>
-      </w:r>
-    </w:p>
-    <w:p>
-      <w:pPr>
-        <w:pStyle w:val="BodyText"/>
-      </w:pPr>
-      <w:r>
-        <w:t xml:space="preserve">Upgrade your electrical panel to add whole-house surge protection. This will help to protect your heat pumps, heat pump water heater, refrigerator, well pump, and other electronics from damage due to lightning or other electrical surges.</w:t>
-      </w:r>
-    </w:p>
-    <w:p>
-      <w:pPr>
-        <w:pStyle w:val="BodyText"/>
-      </w:pPr>
-      <w:r>
-        <w:rPr>
-          <w:i/>
-          <w:iCs/>
-        </w:rPr>
-        <w:t xml:space="preserve">Estimated Cost/Benefits/Incentives</w:t>
-      </w:r>
-    </w:p>
-    <w:p>
-      <w:pPr>
-        <w:pStyle w:val="BodyText"/>
-      </w:pPr>
-      <w:r>
-        <w:rPr>
-          <w:b/>
-          <w:bCs/>
-        </w:rPr>
-        <w:t xml:space="preserve">Auditor to describe. Primary residence</w:t>
-      </w:r>
-    </w:p>
-    <w:bookmarkEnd w:id="60"/>
-    <w:bookmarkStart w:id="61" w:name="misc.-air-sealing-and-insulation"/>
-    <w:p>
-      <w:pPr>
-        <w:pStyle w:val="Heading3"/>
-      </w:pPr>
-      <w:r>
-        <w:t xml:space="preserve">4.20 Misc. Air Sealing and Insulation</w:t>
-      </w:r>
-    </w:p>
-    <w:p>
-      <w:pPr>
-        <w:pStyle w:val="FirstParagraph"/>
-      </w:pPr>
-      <w:r>
-        <w:rPr>
-          <w:i/>
-          <w:iCs/>
-        </w:rPr>
-        <w:t xml:space="preserve">Problem</w:t>
-      </w:r>
-    </w:p>
-    <w:p>
-      <w:pPr>
-        <w:pStyle w:val="BodyText"/>
-      </w:pPr>
-      <w:r>
-        <w:rPr>
-          <w:b/>
-          <w:bCs/>
-        </w:rPr>
-        <w:t xml:space="preserve">Need a description for the problem</w:t>
-      </w:r>
-    </w:p>
-    <w:p>
-      <w:pPr>
-        <w:pStyle w:val="BodyText"/>
-      </w:pPr>
-      <w:r>
-        <w:rPr>
-          <w:i/>
-          <w:iCs/>
-        </w:rPr>
-        <w:t xml:space="preserve">Recommendation</w:t>
-      </w:r>
-    </w:p>
-    <w:p>
-      <w:pPr>
-        <w:pStyle w:val="BodyText"/>
-      </w:pPr>
-      <w:r>
         <w:t xml:space="preserve">Air seal and insulate [** insert auditor description - bay window, bulkhead door, chase, kneewall, anything else that is unique to the home and not otherwise covered in another recommendation]</w:t>
       </w:r>
       <w:r>
@@ -6236,50 +5835,50 @@
         <w:br w:type="page"/>
       </w:r>
     </w:p>
+    <w:bookmarkEnd w:id="59"/>
+    <w:bookmarkEnd w:id="60"/>
+    <w:bookmarkStart w:id="61" w:name="additional-resources"/>
+    <w:p>
+      <w:pPr>
+        <w:pStyle w:val="Heading2"/>
+      </w:pPr>
+      <w:r>
+        <w:t xml:space="preserve">5 Additional Resources</w:t>
+      </w:r>
+    </w:p>
+    <w:p>
+      <w:pPr>
+        <w:pStyle w:val="FirstParagraph"/>
+      </w:pPr>
+      <w:r>
+        <w:t xml:space="preserve">Many home efficiency upgrades are eligible for Efficiency Maine rebates and federal tax credits. Financial incentives vary based on income level and type of occupancy. An overview of all state rebates and federal tax credits can be found here: https://www.efficiencymaine.com/at-home/.</w:t>
+      </w:r>
+    </w:p>
+    <w:p>
+      <w:pPr>
+        <w:pStyle w:val="BodyText"/>
+      </w:pPr>
+      <w:r>
+        <w:t xml:space="preserve">You can search for Efficiency Maine registered contractors here: https://www.efficiencymaine.com/at-home/vendor-locator/.</w:t>
+      </w:r>
+    </w:p>
+    <w:p>
+      <w:pPr>
+        <w:pStyle w:val="BodyText"/>
+      </w:pPr>
+      <w:r>
+        <w:t xml:space="preserve">We recommend discussing a whole-home plan for insulation and air sealing work in the basement, walls, and attic with contractors to determine how to best sequence the work to take full advantage of the Efficiency Maine rebates (which are subject to lifetime maximums) and nonrefundable federal tax credits (which are subject to annual maximums).</w:t>
+      </w:r>
+    </w:p>
+    <w:p>
+      <w:pPr>
+        <w:pStyle w:val="BodyText"/>
+      </w:pPr>
+      <w:r>
+        <w:t xml:space="preserve">Efficiency Maine also offers home energy loans to help homeowners who are Maine residents pay for energy and related health and safety upgrades. There are no fees, and interest rates for multi-year loans are between 5.99% (max $7,500) and 7.99% (max $25,000), depending on income level. Low- and moderate-income homeowners who borrow the full $7,500 and pay it back over 10 years will pay a monthly cost of $83. There is also a 1-year, 0% APR option. To learn more or apply, call 866-376-2463 or visit https://www.efficiencymaine.com/home-energy-loans/</w:t>
+      </w:r>
+    </w:p>
     <w:bookmarkEnd w:id="61"/>
-    <w:bookmarkEnd w:id="62"/>
-    <w:bookmarkStart w:id="63" w:name="additional-resources"/>
-    <w:p>
-      <w:pPr>
-        <w:pStyle w:val="Heading2"/>
-      </w:pPr>
-      <w:r>
-        <w:t xml:space="preserve">5 Additional Resources</w:t>
-      </w:r>
-    </w:p>
-    <w:p>
-      <w:pPr>
-        <w:pStyle w:val="FirstParagraph"/>
-      </w:pPr>
-      <w:r>
-        <w:t xml:space="preserve">Many home efficiency upgrades are eligible for Efficiency Maine rebates and federal tax credits. Financial incentives vary based on income level and type of occupancy. An overview of all state rebates and federal tax credits can be found here: https://www.efficiencymaine.com/at-home/.</w:t>
-      </w:r>
-    </w:p>
-    <w:p>
-      <w:pPr>
-        <w:pStyle w:val="BodyText"/>
-      </w:pPr>
-      <w:r>
-        <w:t xml:space="preserve">You can search for Efficiency Maine registered contractors here: https://www.efficiencymaine.com/at-home/vendor-locator/.</w:t>
-      </w:r>
-    </w:p>
-    <w:p>
-      <w:pPr>
-        <w:pStyle w:val="BodyText"/>
-      </w:pPr>
-      <w:r>
-        <w:t xml:space="preserve">We recommend discussing a whole-home plan for insulation and air sealing work in the basement, walls, and attic with contractors to determine how to best sequence the work to take full advantage of the Efficiency Maine rebates (which are subject to lifetime maximums) and nonrefundable federal tax credits (which are subject to annual maximums).</w:t>
-      </w:r>
-    </w:p>
-    <w:p>
-      <w:pPr>
-        <w:pStyle w:val="BodyText"/>
-      </w:pPr>
-      <w:r>
-        <w:t xml:space="preserve">Efficiency Maine also offers home energy loans to help homeowners who are Maine residents pay for energy and related health and safety upgrades. There are no fees, and interest rates for multi-year loans are between 5.99% (max $7,500) and 7.99% (max $25,000), depending on income level. Low- and moderate-income homeowners who borrow the full $7,500 and pay it back over 10 years will pay a monthly cost of $83. There is also a 1-year, 0% APR option. To learn more or apply, call 866-376-2463 or visit https://www.efficiencymaine.com/home-energy-loans/</w:t>
-      </w:r>
-    </w:p>
-    <w:bookmarkEnd w:id="63"/>
     <w:sectPr>
       <w:footerReference r:id="rId9" w:type="default"/>
       <w:pgSz w:h="15840" w:w="12240"/>

</xml_diff>

<commit_message>
Move air leakage comments after infrared pictures
</commit_message>
<xml_diff>
--- a/Quarto_report/Audit_Report.docx
+++ b/Quarto_report/Audit_Report.docx
@@ -25,7 +25,7 @@
         <w:t xml:space="preserve"> </w:t>
       </w:r>
       <w:r>
-        <w:t xml:space="preserve">Dan Fernald, Katy Fernald</w:t>
+        <w:t xml:space="preserve">Cecelia Trydestam</w:t>
       </w:r>
     </w:p>
     <w:p>
@@ -43,7 +43,7 @@
         <w:t xml:space="preserve"> </w:t>
       </w:r>
       <w:r>
-        <w:t xml:space="preserve">16 Mosswood Rd Islesford, ME 04646</w:t>
+        <w:t xml:space="preserve">28 Campbell Finkelstein Dr, Cranberry Isles, ME 04625</w:t>
       </w:r>
     </w:p>
     <w:p>
@@ -61,7 +61,7 @@
         <w:t xml:space="preserve"> </w:t>
       </w:r>
       <w:r>
-        <w:t xml:space="preserve">islesfordartists@gmail.com, (207) 244-3145</w:t>
+        <w:t xml:space="preserve">mostlyharmless@eelcoast.com, (207) 717-9550</w:t>
       </w:r>
     </w:p>
     <w:p>
@@ -79,7 +79,7 @@
         <w:t xml:space="preserve"> </w:t>
       </w:r>
       <w:r>
-        <w:t xml:space="preserve">David Gibson, Pema Lhundrup, Mabon Young, Rashmi Mohan</w:t>
+        <w:t xml:space="preserve">Rashmi Mohan, Pema Lhundrup, Mabon Young</w:t>
       </w:r>
     </w:p>
     <w:p>
@@ -130,7 +130,7 @@
         <w:pStyle w:val="FirstParagraph"/>
       </w:pPr>
       <w:r>
-        <w:t xml:space="preserve">We conducted an energy assessment of your home on 6/23/2025. This report will tell you what we did, what we found, and what we suggest for your home. These suggestions include information on incentives and financing to make improvements more affordable.</w:t>
+        <w:t xml:space="preserve">We conducted an energy assessment of your home on 7/10/2025. This report will tell you what we did, what we found, and what we suggest for your home. These suggestions include information on incentives and financing to make improvements more affordable.</w:t>
       </w:r>
     </w:p>
     <w:p>
@@ -304,7 +304,7 @@
         <w:pStyle w:val="FirstParagraph"/>
       </w:pPr>
       <w:r>
-        <w:t xml:space="preserve">We assessed combustion appliances that burn fossil fuels such as propane, heating oil, or kerosene. These include furnaces, boilers, water heaters, and gas ovens. We visually inspected the combustion appliance(s) in your home, as well as conducted combustion safety tests. This included measuring for carbon monoxide and testing that flue gases are properly exhausting from the home. We also performed gas leak detection tests on your propane appliance(s).</w:t>
+        <w:t xml:space="preserve">We assessed combustion appliances that burn fossil fuels such as propane, heating oil, or kerosene. These include furnaces, boilers, water heaters, and gas ovens. We visually inspected the combustion appliance(s) in your home, but we were unable to perform combustion safety tests. We also performed gas leak detection tests on your propane appliance(s).</w:t>
       </w:r>
     </w:p>
     <w:p>
@@ -419,31 +419,31 @@
                 <w:rFonts w:ascii="Calibri" w:hAnsi="Calibri"/>
                 <w:sz w:val="20"/>
               </w:rPr>
-              <w:t xml:space="default">Furnace/Boiler Tune-up</w:t>
-            </w:r>
-          </w:p>
-        </w:tc>
-        <w:tc>
-          <w:tcPr>
-            <w:tcBorders>
-              <w:top w:val="single" w:space="0" w:color="D3D3D3"/>
-              <w:bottom w:val="single" w:space="0" w:color="D3D3D3"/>
-              <w:start w:val="single" w:space="0" w:color="D3D3D3"/>
-              <w:end w:val="single" w:space="0" w:color="D3D3D3"/>
-            </w:tcBorders>
-          </w:tcPr>
-          <w:p>
-            <w:pPr>
-              <w:spacing w:before="0" w:after="60"/>
-              <w:keepNext/>
-              <w:jc w:val="start"/>
-            </w:pPr>
-            <w:r>
-              <w:rPr>
-                <w:rFonts w:ascii="Calibri" w:hAnsi="Calibri"/>
-                <w:sz w:val="20"/>
-              </w:rPr>
-              <w:t xml:space="default">Have the furnace/boiler and flue inspected and adjusted by a licensed professional. This should be available from your fuel delivery company.</w:t>
+              <w:t xml:space="default">High-efficiency Shower Head(s)</w:t>
+            </w:r>
+          </w:p>
+        </w:tc>
+        <w:tc>
+          <w:tcPr>
+            <w:tcBorders>
+              <w:top w:val="single" w:space="0" w:color="D3D3D3"/>
+              <w:bottom w:val="single" w:space="0" w:color="D3D3D3"/>
+              <w:start w:val="single" w:space="0" w:color="D3D3D3"/>
+              <w:end w:val="single" w:space="0" w:color="D3D3D3"/>
+            </w:tcBorders>
+          </w:tcPr>
+          <w:p>
+            <w:pPr>
+              <w:spacing w:before="0" w:after="60"/>
+              <w:keepNext/>
+              <w:jc w:val="start"/>
+            </w:pPr>
+            <w:r>
+              <w:rPr>
+                <w:rFonts w:ascii="Calibri" w:hAnsi="Calibri"/>
+                <w:sz w:val="20"/>
+              </w:rPr>
+              <w:t xml:space="default">Install high-efficiency shower heads to reduce the amount of water and energy to heat the water used when showering.</w:t>
             </w:r>
           </w:p>
         </w:tc>
@@ -472,31 +472,31 @@
                 <w:rFonts w:ascii="Calibri" w:hAnsi="Calibri"/>
                 <w:sz w:val="20"/>
               </w:rPr>
-              <w:t xml:space="default">High-efficiency Shower Head(s)</w:t>
-            </w:r>
-          </w:p>
-        </w:tc>
-        <w:tc>
-          <w:tcPr>
-            <w:tcBorders>
-              <w:top w:val="single" w:space="0" w:color="D3D3D3"/>
-              <w:bottom w:val="single" w:space="0" w:color="D3D3D3"/>
-              <w:start w:val="single" w:space="0" w:color="D3D3D3"/>
-              <w:end w:val="single" w:space="0" w:color="D3D3D3"/>
-            </w:tcBorders>
-          </w:tcPr>
-          <w:p>
-            <w:pPr>
-              <w:spacing w:before="0" w:after="60"/>
-              <w:keepNext/>
-              <w:jc w:val="start"/>
-            </w:pPr>
-            <w:r>
-              <w:rPr>
-                <w:rFonts w:ascii="Calibri" w:hAnsi="Calibri"/>
-                <w:sz w:val="20"/>
-              </w:rPr>
-              <w:t xml:space="default">Install high-efficiency shower heads to reduce the amount of water and energy to heat the water used when showering.</w:t>
+              <w:t xml:space="default">LEDs</w:t>
+            </w:r>
+          </w:p>
+        </w:tc>
+        <w:tc>
+          <w:tcPr>
+            <w:tcBorders>
+              <w:top w:val="single" w:space="0" w:color="D3D3D3"/>
+              <w:bottom w:val="single" w:space="0" w:color="D3D3D3"/>
+              <w:start w:val="single" w:space="0" w:color="D3D3D3"/>
+              <w:end w:val="single" w:space="0" w:color="D3D3D3"/>
+            </w:tcBorders>
+          </w:tcPr>
+          <w:p>
+            <w:pPr>
+              <w:spacing w:before="0" w:after="60"/>
+              <w:keepNext/>
+              <w:jc w:val="start"/>
+            </w:pPr>
+            <w:r>
+              <w:rPr>
+                <w:rFonts w:ascii="Calibri" w:hAnsi="Calibri"/>
+                <w:sz w:val="20"/>
+              </w:rPr>
+              <w:t xml:space="default">Switch your light bulbs to LED light bulbs. LEDs use 80% less energy than incandescent light bulbs, which can significantly reduce your electricity bill.</w:t>
             </w:r>
           </w:p>
         </w:tc>
@@ -578,31 +578,31 @@
                 <w:rFonts w:ascii="Calibri" w:hAnsi="Calibri"/>
                 <w:sz w:val="20"/>
               </w:rPr>
-              <w:t xml:space="default">Freezer</w:t>
-            </w:r>
-          </w:p>
-        </w:tc>
-        <w:tc>
-          <w:tcPr>
-            <w:tcBorders>
-              <w:top w:val="single" w:space="0" w:color="D3D3D3"/>
-              <w:bottom w:val="single" w:space="0" w:color="D3D3D3"/>
-              <w:start w:val="single" w:space="0" w:color="D3D3D3"/>
-              <w:end w:val="single" w:space="0" w:color="D3D3D3"/>
-            </w:tcBorders>
-          </w:tcPr>
-          <w:p>
-            <w:pPr>
-              <w:spacing w:before="0" w:after="60"/>
-              <w:keepNext/>
-              <w:jc w:val="start"/>
-            </w:pPr>
-            <w:r>
-              <w:rPr>
-                <w:rFonts w:ascii="Calibri" w:hAnsi="Calibri"/>
-                <w:sz w:val="20"/>
-              </w:rPr>
-              <w:t xml:space="default">Replace your freezer with a new, EnergyStar certified freezer. Look at the Energy Guide label to compare the energy use of new freezers.</w:t>
+              <w:t xml:space="default">Refrigerator</w:t>
+            </w:r>
+          </w:p>
+        </w:tc>
+        <w:tc>
+          <w:tcPr>
+            <w:tcBorders>
+              <w:top w:val="single" w:space="0" w:color="D3D3D3"/>
+              <w:bottom w:val="single" w:space="0" w:color="D3D3D3"/>
+              <w:start w:val="single" w:space="0" w:color="D3D3D3"/>
+              <w:end w:val="single" w:space="0" w:color="D3D3D3"/>
+            </w:tcBorders>
+          </w:tcPr>
+          <w:p>
+            <w:pPr>
+              <w:spacing w:before="0" w:after="60"/>
+              <w:keepNext/>
+              <w:jc w:val="start"/>
+            </w:pPr>
+            <w:r>
+              <w:rPr>
+                <w:rFonts w:ascii="Calibri" w:hAnsi="Calibri"/>
+                <w:sz w:val="20"/>
+              </w:rPr>
+              <w:t xml:space="default">Replace your refrigerator with a new, EnergyStar-certified fridge. Look at the Energy Guide label to compare the energy use of new refrigerators.</w:t>
             </w:r>
           </w:p>
         </w:tc>
@@ -684,31 +684,31 @@
                 <w:rFonts w:ascii="Calibri" w:hAnsi="Calibri"/>
                 <w:sz w:val="20"/>
               </w:rPr>
-              <w:t xml:space="default">Bathroom Exhaust Fan(s)</w:t>
-            </w:r>
-          </w:p>
-        </w:tc>
-        <w:tc>
-          <w:tcPr>
-            <w:tcBorders>
-              <w:top w:val="single" w:space="0" w:color="D3D3D3"/>
-              <w:bottom w:val="single" w:space="0" w:color="D3D3D3"/>
-              <w:start w:val="single" w:space="0" w:color="D3D3D3"/>
-              <w:end w:val="single" w:space="0" w:color="D3D3D3"/>
-            </w:tcBorders>
-          </w:tcPr>
-          <w:p>
-            <w:pPr>
-              <w:spacing w:before="0" w:after="60"/>
-              <w:keepNext/>
-              <w:jc w:val="start"/>
-            </w:pPr>
-            <w:r>
-              <w:rPr>
-                <w:rFonts w:ascii="Calibri" w:hAnsi="Calibri"/>
-                <w:sz w:val="20"/>
-              </w:rPr>
-              <w:t xml:space="default">Install bathroom exhaust fans in all bathrooms that do not have them. These should be rated for at least 80 cubic feet per minute (CFM) if there is a shower. We recommend the Panasonic Whisper series or similar fans that don’t create excess noise.</w:t>
+              <w:t xml:space="default">Heat Pump Water Heater</w:t>
+            </w:r>
+          </w:p>
+        </w:tc>
+        <w:tc>
+          <w:tcPr>
+            <w:tcBorders>
+              <w:top w:val="single" w:space="0" w:color="D3D3D3"/>
+              <w:bottom w:val="single" w:space="0" w:color="D3D3D3"/>
+              <w:start w:val="single" w:space="0" w:color="D3D3D3"/>
+              <w:end w:val="single" w:space="0" w:color="D3D3D3"/>
+            </w:tcBorders>
+          </w:tcPr>
+          <w:p>
+            <w:pPr>
+              <w:spacing w:before="0" w:after="60"/>
+              <w:keepNext/>
+              <w:jc w:val="start"/>
+            </w:pPr>
+            <w:r>
+              <w:rPr>
+                <w:rFonts w:ascii="Calibri" w:hAnsi="Calibri"/>
+                <w:sz w:val="20"/>
+              </w:rPr>
+              <w:t xml:space="default">Install a heat pump water heater to provide your hot water for cooking and bathing. This is the most efficient way to heat water and will save hundreds of dollars a year compared to electric resistance, heating oil, or propane hot water. It will also help to dehumidify while it's running. If your current water heater burns oil or propane, this will also remove a source of combustion gases from your home.</w:t>
             </w:r>
           </w:p>
         </w:tc>
@@ -737,31 +737,31 @@
                 <w:rFonts w:ascii="Calibri" w:hAnsi="Calibri"/>
                 <w:sz w:val="20"/>
               </w:rPr>
-              <w:t xml:space="default">Kitchen Exhaust Fan</w:t>
-            </w:r>
-          </w:p>
-        </w:tc>
-        <w:tc>
-          <w:tcPr>
-            <w:tcBorders>
-              <w:top w:val="single" w:space="0" w:color="D3D3D3"/>
-              <w:bottom w:val="single" w:space="0" w:color="D3D3D3"/>
-              <w:start w:val="single" w:space="0" w:color="D3D3D3"/>
-              <w:end w:val="single" w:space="0" w:color="D3D3D3"/>
-            </w:tcBorders>
-          </w:tcPr>
-          <w:p>
-            <w:pPr>
-              <w:spacing w:before="0" w:after="60"/>
-              <w:keepNext/>
-              <w:jc w:val="start"/>
-            </w:pPr>
-            <w:r>
-              <w:rPr>
-                <w:rFonts w:ascii="Calibri" w:hAnsi="Calibri"/>
-                <w:sz w:val="20"/>
-              </w:rPr>
-              <w:t xml:space="default">Install a kitchen exhaust fan to remove cooking fumes and moisture from your home. The fan should be rated for at least 100 cubic feet per minute. A kitchen fan should be ducted to the outdoors. If the ductwork will run through the attic, it should be installed before the attic is air-sealed and insulated.</w:t>
+              <w:t xml:space="default">Gutters</w:t>
+            </w:r>
+          </w:p>
+        </w:tc>
+        <w:tc>
+          <w:tcPr>
+            <w:tcBorders>
+              <w:top w:val="single" w:space="0" w:color="D3D3D3"/>
+              <w:bottom w:val="single" w:space="0" w:color="D3D3D3"/>
+              <w:start w:val="single" w:space="0" w:color="D3D3D3"/>
+              <w:end w:val="single" w:space="0" w:color="D3D3D3"/>
+            </w:tcBorders>
+          </w:tcPr>
+          <w:p>
+            <w:pPr>
+              <w:spacing w:before="0" w:after="60"/>
+              <w:keepNext/>
+              <w:jc w:val="start"/>
+            </w:pPr>
+            <w:r>
+              <w:rPr>
+                <w:rFonts w:ascii="Calibri" w:hAnsi="Calibri"/>
+                <w:sz w:val="20"/>
+              </w:rPr>
+              <w:t xml:space="default">Install gutters and downspouts that divert water at least six feet away from the foundation and to where the ground slopes away from the house.</w:t>
             </w:r>
           </w:p>
         </w:tc>
@@ -790,31 +790,31 @@
                 <w:rFonts w:ascii="Calibri" w:hAnsi="Calibri"/>
                 <w:sz w:val="20"/>
               </w:rPr>
-              <w:t xml:space="default">Vapor Barrier</w:t>
-            </w:r>
-          </w:p>
-        </w:tc>
-        <w:tc>
-          <w:tcPr>
-            <w:tcBorders>
-              <w:top w:val="single" w:space="0" w:color="D3D3D3"/>
-              <w:bottom w:val="single" w:space="0" w:color="D3D3D3"/>
-              <w:start w:val="single" w:space="0" w:color="D3D3D3"/>
-              <w:end w:val="single" w:space="0" w:color="D3D3D3"/>
-            </w:tcBorders>
-          </w:tcPr>
-          <w:p>
-            <w:pPr>
-              <w:spacing w:before="0" w:after="60"/>
-              <w:keepNext/>
-              <w:jc w:val="start"/>
-            </w:pPr>
-            <w:r>
-              <w:rPr>
-                <w:rFonts w:ascii="Calibri" w:hAnsi="Calibri"/>
-                <w:sz w:val="20"/>
-              </w:rPr>
-              <w:t xml:space="default">Install a vapor barrier on the basement floor to stop moisture from entering the basement and house.</w:t>
+              <w:t xml:space="default">Bathroom Exhaust Fan(s)</w:t>
+            </w:r>
+          </w:p>
+        </w:tc>
+        <w:tc>
+          <w:tcPr>
+            <w:tcBorders>
+              <w:top w:val="single" w:space="0" w:color="D3D3D3"/>
+              <w:bottom w:val="single" w:space="0" w:color="D3D3D3"/>
+              <w:start w:val="single" w:space="0" w:color="D3D3D3"/>
+              <w:end w:val="single" w:space="0" w:color="D3D3D3"/>
+            </w:tcBorders>
+          </w:tcPr>
+          <w:p>
+            <w:pPr>
+              <w:spacing w:before="0" w:after="60"/>
+              <w:keepNext/>
+              <w:jc w:val="start"/>
+            </w:pPr>
+            <w:r>
+              <w:rPr>
+                <w:rFonts w:ascii="Calibri" w:hAnsi="Calibri"/>
+                <w:sz w:val="20"/>
+              </w:rPr>
+              <w:t xml:space="default">Install bathroom exhaust fans in all bathrooms that do not have them. These should be rated for at least 80 cubic feet per minute (CFM) if there is a shower. We recommend the Panasonic Whisper series or similar fans that don’t create excess noise.</w:t>
             </w:r>
           </w:p>
         </w:tc>
@@ -843,31 +843,31 @@
                 <w:rFonts w:ascii="Calibri" w:hAnsi="Calibri"/>
                 <w:sz w:val="20"/>
               </w:rPr>
-              <w:t xml:space="default">Spray Foam Basement/Crawlspace Walls</w:t>
-            </w:r>
-          </w:p>
-        </w:tc>
-        <w:tc>
-          <w:tcPr>
-            <w:tcBorders>
-              <w:top w:val="single" w:space="0" w:color="D3D3D3"/>
-              <w:bottom w:val="single" w:space="0" w:color="D3D3D3"/>
-              <w:start w:val="single" w:space="0" w:color="D3D3D3"/>
-              <w:end w:val="single" w:space="0" w:color="D3D3D3"/>
-            </w:tcBorders>
-          </w:tcPr>
-          <w:p>
-            <w:pPr>
-              <w:spacing w:before="0" w:after="60"/>
-              <w:keepNext/>
-              <w:jc w:val="start"/>
-            </w:pPr>
-            <w:r>
-              <w:rPr>
-                <w:rFonts w:ascii="Calibri" w:hAnsi="Calibri"/>
-                <w:sz w:val="20"/>
-              </w:rPr>
-              <w:t xml:space="default">Install spray foam on the basement/crawlspace walls to prevent moisture infiltration and reduce heat loss.</w:t>
+              <w:t xml:space="default">Kitchen Exhaust Fan</w:t>
+            </w:r>
+          </w:p>
+        </w:tc>
+        <w:tc>
+          <w:tcPr>
+            <w:tcBorders>
+              <w:top w:val="single" w:space="0" w:color="D3D3D3"/>
+              <w:bottom w:val="single" w:space="0" w:color="D3D3D3"/>
+              <w:start w:val="single" w:space="0" w:color="D3D3D3"/>
+              <w:end w:val="single" w:space="0" w:color="D3D3D3"/>
+            </w:tcBorders>
+          </w:tcPr>
+          <w:p>
+            <w:pPr>
+              <w:spacing w:before="0" w:after="60"/>
+              <w:keepNext/>
+              <w:jc w:val="start"/>
+            </w:pPr>
+            <w:r>
+              <w:rPr>
+                <w:rFonts w:ascii="Calibri" w:hAnsi="Calibri"/>
+                <w:sz w:val="20"/>
+              </w:rPr>
+              <w:t xml:space="default">Install a kitchen exhaust fan to remove cooking fumes and moisture from your home. The fan should be rated for at least 100 cubic feet per minute. A kitchen fan should be ducted to the outdoors. If the ductwork will run through the attic, it should be installed before the attic is air-sealed and insulated.</w:t>
             </w:r>
           </w:p>
         </w:tc>
@@ -896,31 +896,31 @@
                 <w:rFonts w:ascii="Calibri" w:hAnsi="Calibri"/>
                 <w:sz w:val="20"/>
               </w:rPr>
-              <w:t xml:space="default">Attic Air Sealing and Insulation</w:t>
-            </w:r>
-          </w:p>
-        </w:tc>
-        <w:tc>
-          <w:tcPr>
-            <w:tcBorders>
-              <w:top w:val="single" w:space="0" w:color="D3D3D3"/>
-              <w:bottom w:val="single" w:space="0" w:color="D3D3D3"/>
-              <w:start w:val="single" w:space="0" w:color="D3D3D3"/>
-              <w:end w:val="single" w:space="0" w:color="D3D3D3"/>
-            </w:tcBorders>
-          </w:tcPr>
-          <w:p>
-            <w:pPr>
-              <w:spacing w:before="0" w:after="60"/>
-              <w:keepNext/>
-              <w:jc w:val="start"/>
-            </w:pPr>
-            <w:r>
-              <w:rPr>
-                <w:rFonts w:ascii="Calibri" w:hAnsi="Calibri"/>
-                <w:sz w:val="20"/>
-              </w:rPr>
-              <w:t xml:space="default">Air seal the attic and insulate it to at least R-60 (18 inches of loose-fill cellulose insulation).</w:t>
+              <w:t xml:space="default">Vapor Barrier</w:t>
+            </w:r>
+          </w:p>
+        </w:tc>
+        <w:tc>
+          <w:tcPr>
+            <w:tcBorders>
+              <w:top w:val="single" w:space="0" w:color="D3D3D3"/>
+              <w:bottom w:val="single" w:space="0" w:color="D3D3D3"/>
+              <w:start w:val="single" w:space="0" w:color="D3D3D3"/>
+              <w:end w:val="single" w:space="0" w:color="D3D3D3"/>
+            </w:tcBorders>
+          </w:tcPr>
+          <w:p>
+            <w:pPr>
+              <w:spacing w:before="0" w:after="60"/>
+              <w:keepNext/>
+              <w:jc w:val="start"/>
+            </w:pPr>
+            <w:r>
+              <w:rPr>
+                <w:rFonts w:ascii="Calibri" w:hAnsi="Calibri"/>
+                <w:sz w:val="20"/>
+              </w:rPr>
+              <w:t xml:space="default">Install a vapor barrier on the **basement / crawlspace** floor to stop moisture from entering the basement and house.</w:t>
             </w:r>
           </w:p>
         </w:tc>
@@ -949,31 +949,31 @@
                 <w:rFonts w:ascii="Calibri" w:hAnsi="Calibri"/>
                 <w:sz w:val="20"/>
               </w:rPr>
-              <w:t xml:space="default">Blown-in Cellulose Wall Insulation</w:t>
-            </w:r>
-          </w:p>
-        </w:tc>
-        <w:tc>
-          <w:tcPr>
-            <w:tcBorders>
-              <w:top w:val="single" w:space="0" w:color="D3D3D3"/>
-              <w:bottom w:val="single" w:space="0" w:color="D3D3D3"/>
-              <w:start w:val="single" w:space="0" w:color="D3D3D3"/>
-              <w:end w:val="single" w:space="0" w:color="D3D3D3"/>
-            </w:tcBorders>
-          </w:tcPr>
-          <w:p>
-            <w:pPr>
-              <w:spacing w:before="0" w:after="60"/>
-              <w:keepNext/>
-              <w:jc w:val="start"/>
-            </w:pPr>
-            <w:r>
-              <w:rPr>
-                <w:rFonts w:ascii="Calibri" w:hAnsi="Calibri"/>
-                <w:sz w:val="20"/>
-              </w:rPr>
-              <w:t xml:space="default">Insulate the wall stud cavities with dense packed, blown-in cellulose insulation.</w:t>
+              <w:t xml:space="default">Spray Foam ** Basement / Crawlspace ** Walls</w:t>
+            </w:r>
+          </w:p>
+        </w:tc>
+        <w:tc>
+          <w:tcPr>
+            <w:tcBorders>
+              <w:top w:val="single" w:space="0" w:color="D3D3D3"/>
+              <w:bottom w:val="single" w:space="0" w:color="D3D3D3"/>
+              <w:start w:val="single" w:space="0" w:color="D3D3D3"/>
+              <w:end w:val="single" w:space="0" w:color="D3D3D3"/>
+            </w:tcBorders>
+          </w:tcPr>
+          <w:p>
+            <w:pPr>
+              <w:spacing w:before="0" w:after="60"/>
+              <w:keepNext/>
+              <w:jc w:val="start"/>
+            </w:pPr>
+            <w:r>
+              <w:rPr>
+                <w:rFonts w:ascii="Calibri" w:hAnsi="Calibri"/>
+                <w:sz w:val="20"/>
+              </w:rPr>
+              <w:t xml:space="default">Install spray foam on the **basement / crawlspace** walls to prevent moisture infiltration and reduce heat loss.</w:t>
             </w:r>
           </w:p>
         </w:tc>
@@ -1002,31 +1002,31 @@
                 <w:rFonts w:ascii="Calibri" w:hAnsi="Calibri"/>
                 <w:sz w:val="20"/>
               </w:rPr>
-              <w:t xml:space="default">Continuous Exterior Wall Insulation</w:t>
-            </w:r>
-          </w:p>
-        </w:tc>
-        <w:tc>
-          <w:tcPr>
-            <w:tcBorders>
-              <w:top w:val="single" w:space="0" w:color="D3D3D3"/>
-              <w:bottom w:val="single" w:space="0" w:color="D3D3D3"/>
-              <w:start w:val="single" w:space="0" w:color="D3D3D3"/>
-              <w:end w:val="single" w:space="0" w:color="D3D3D3"/>
-            </w:tcBorders>
-          </w:tcPr>
-          <w:p>
-            <w:pPr>
-              <w:spacing w:before="0" w:after="60"/>
-              <w:keepNext/>
-              <w:jc w:val="start"/>
-            </w:pPr>
-            <w:r>
-              <w:rPr>
-                <w:rFonts w:ascii="Calibri" w:hAnsi="Calibri"/>
-                <w:sz w:val="20"/>
-              </w:rPr>
-              <w:t xml:space="default">Add a continuous layer of insulation and potentially replace the air and moisture barrier once it becomes time to replace the siding.</w:t>
+              <w:t xml:space="default">Attic Air Sealing and Insulation</w:t>
+            </w:r>
+          </w:p>
+        </w:tc>
+        <w:tc>
+          <w:tcPr>
+            <w:tcBorders>
+              <w:top w:val="single" w:space="0" w:color="D3D3D3"/>
+              <w:bottom w:val="single" w:space="0" w:color="D3D3D3"/>
+              <w:start w:val="single" w:space="0" w:color="D3D3D3"/>
+              <w:end w:val="single" w:space="0" w:color="D3D3D3"/>
+            </w:tcBorders>
+          </w:tcPr>
+          <w:p>
+            <w:pPr>
+              <w:spacing w:before="0" w:after="60"/>
+              <w:keepNext/>
+              <w:jc w:val="start"/>
+            </w:pPr>
+            <w:r>
+              <w:rPr>
+                <w:rFonts w:ascii="Calibri" w:hAnsi="Calibri"/>
+                <w:sz w:val="20"/>
+              </w:rPr>
+              <w:t xml:space="default">Air seal the attic and insulate it to at least R-60 (18 inches of loose-fill cellulose insulation).</w:t>
             </w:r>
           </w:p>
         </w:tc>
@@ -1055,31 +1055,31 @@
                 <w:rFonts w:ascii="Calibri" w:hAnsi="Calibri"/>
                 <w:sz w:val="20"/>
               </w:rPr>
-              <w:t xml:space="default">Electrical Panel Upgrade</w:t>
-            </w:r>
-          </w:p>
-        </w:tc>
-        <w:tc>
-          <w:tcPr>
-            <w:tcBorders>
-              <w:top w:val="single" w:space="0" w:color="D3D3D3"/>
-              <w:bottom w:val="single" w:space="0" w:color="D3D3D3"/>
-              <w:start w:val="single" w:space="0" w:color="D3D3D3"/>
-              <w:end w:val="single" w:space="0" w:color="D3D3D3"/>
-            </w:tcBorders>
-          </w:tcPr>
-          <w:p>
-            <w:pPr>
-              <w:spacing w:before="0" w:after="60"/>
-              <w:keepNext/>
-              <w:jc w:val="start"/>
-            </w:pPr>
-            <w:r>
-              <w:rPr>
-                <w:rFonts w:ascii="Calibri" w:hAnsi="Calibri"/>
-                <w:sz w:val="20"/>
-              </w:rPr>
-              <w:t xml:space="default">Consult with an electrician about replacing your existing electrical panel with a 200 amp panel as you add electrical appliances to your home.</w:t>
+              <w:t xml:space="default">Blown-in Cellulose Wall Insulation</w:t>
+            </w:r>
+          </w:p>
+        </w:tc>
+        <w:tc>
+          <w:tcPr>
+            <w:tcBorders>
+              <w:top w:val="single" w:space="0" w:color="D3D3D3"/>
+              <w:bottom w:val="single" w:space="0" w:color="D3D3D3"/>
+              <w:start w:val="single" w:space="0" w:color="D3D3D3"/>
+              <w:end w:val="single" w:space="0" w:color="D3D3D3"/>
+            </w:tcBorders>
+          </w:tcPr>
+          <w:p>
+            <w:pPr>
+              <w:spacing w:before="0" w:after="60"/>
+              <w:keepNext/>
+              <w:jc w:val="start"/>
+            </w:pPr>
+            <w:r>
+              <w:rPr>
+                <w:rFonts w:ascii="Calibri" w:hAnsi="Calibri"/>
+                <w:sz w:val="20"/>
+              </w:rPr>
+              <w:t xml:space="default">Insulate the wall stud cavities with dense packed, blown-in cellulose insulation.</w:t>
             </w:r>
           </w:p>
         </w:tc>
@@ -1108,31 +1108,31 @@
                 <w:rFonts w:ascii="Calibri" w:hAnsi="Calibri"/>
                 <w:sz w:val="20"/>
               </w:rPr>
-              <w:t xml:space="default">Whole-House Surge Protection</w:t>
-            </w:r>
-          </w:p>
-        </w:tc>
-        <w:tc>
-          <w:tcPr>
-            <w:tcBorders>
-              <w:top w:val="single" w:space="0" w:color="D3D3D3"/>
-              <w:bottom w:val="single" w:space="0" w:color="D3D3D3"/>
-              <w:start w:val="single" w:space="0" w:color="D3D3D3"/>
-              <w:end w:val="single" w:space="0" w:color="D3D3D3"/>
-            </w:tcBorders>
-          </w:tcPr>
-          <w:p>
-            <w:pPr>
-              <w:spacing w:before="0" w:after="60"/>
-              <w:keepNext/>
-              <w:jc w:val="start"/>
-            </w:pPr>
-            <w:r>
-              <w:rPr>
-                <w:rFonts w:ascii="Calibri" w:hAnsi="Calibri"/>
-                <w:sz w:val="20"/>
-              </w:rPr>
-              <w:t xml:space="default">Upgrade your electrical panel to add whole-house surge protection.</w:t>
+              <w:t xml:space="default">Continuous Exterior Wall Insulation</w:t>
+            </w:r>
+          </w:p>
+        </w:tc>
+        <w:tc>
+          <w:tcPr>
+            <w:tcBorders>
+              <w:top w:val="single" w:space="0" w:color="D3D3D3"/>
+              <w:bottom w:val="single" w:space="0" w:color="D3D3D3"/>
+              <w:start w:val="single" w:space="0" w:color="D3D3D3"/>
+              <w:end w:val="single" w:space="0" w:color="D3D3D3"/>
+            </w:tcBorders>
+          </w:tcPr>
+          <w:p>
+            <w:pPr>
+              <w:spacing w:before="0" w:after="60"/>
+              <w:keepNext/>
+              <w:jc w:val="start"/>
+            </w:pPr>
+            <w:r>
+              <w:rPr>
+                <w:rFonts w:ascii="Calibri" w:hAnsi="Calibri"/>
+                <w:sz w:val="20"/>
+              </w:rPr>
+              <w:t xml:space="default">Add a continuous layer of insulation and potentially replace the air and moisture barrier once it becomes time to replace the siding.</w:t>
             </w:r>
           </w:p>
         </w:tc>
@@ -1161,31 +1161,31 @@
                 <w:rFonts w:ascii="Calibri" w:hAnsi="Calibri"/>
                 <w:sz w:val="20"/>
               </w:rPr>
-              <w:t xml:space="default">Pipe Insulation</w:t>
-            </w:r>
-          </w:p>
-        </w:tc>
-        <w:tc>
-          <w:tcPr>
-            <w:tcBorders>
-              <w:top w:val="single" w:space="0" w:color="D3D3D3"/>
-              <w:bottom w:val="single" w:space="0" w:color="D3D3D3"/>
-              <w:start w:val="single" w:space="0" w:color="D3D3D3"/>
-              <w:end w:val="single" w:space="0" w:color="D3D3D3"/>
-            </w:tcBorders>
-          </w:tcPr>
-          <w:p>
-            <w:pPr>
-              <w:spacing w:before="0" w:after="60"/>
-              <w:keepNext/>
-              <w:jc w:val="start"/>
-            </w:pPr>
-            <w:r>
-              <w:rPr>
-                <w:rFonts w:ascii="Calibri" w:hAnsi="Calibri"/>
-                <w:sz w:val="20"/>
-              </w:rPr>
-              <w:t xml:space="default">Insulate both hot and cold water pipes that are uninsulated in the basement/crawlspace. This will save energy and prevent condensation.</w:t>
+              <w:t xml:space="default">Electrical Panel Upgrade</w:t>
+            </w:r>
+          </w:p>
+        </w:tc>
+        <w:tc>
+          <w:tcPr>
+            <w:tcBorders>
+              <w:top w:val="single" w:space="0" w:color="D3D3D3"/>
+              <w:bottom w:val="single" w:space="0" w:color="D3D3D3"/>
+              <w:start w:val="single" w:space="0" w:color="D3D3D3"/>
+              <w:end w:val="single" w:space="0" w:color="D3D3D3"/>
+            </w:tcBorders>
+          </w:tcPr>
+          <w:p>
+            <w:pPr>
+              <w:spacing w:before="0" w:after="60"/>
+              <w:keepNext/>
+              <w:jc w:val="start"/>
+            </w:pPr>
+            <w:r>
+              <w:rPr>
+                <w:rFonts w:ascii="Calibri" w:hAnsi="Calibri"/>
+                <w:sz w:val="20"/>
+              </w:rPr>
+              <w:t xml:space="default">Consult with an electrician about replacing your existing electrical panel with a 200 amp panel as you add electrical appliances to your home.</w:t>
             </w:r>
           </w:p>
         </w:tc>
@@ -1214,31 +1214,31 @@
                 <w:rFonts w:ascii="Calibri" w:hAnsi="Calibri"/>
                 <w:sz w:val="20"/>
               </w:rPr>
-              <w:t xml:space="default">DIY Air Sealing</w:t>
-            </w:r>
-          </w:p>
-        </w:tc>
-        <w:tc>
-          <w:tcPr>
-            <w:tcBorders>
-              <w:top w:val="single" w:space="0" w:color="D3D3D3"/>
-              <w:bottom w:val="single" w:space="0" w:color="D3D3D3"/>
-              <w:start w:val="single" w:space="0" w:color="D3D3D3"/>
-              <w:end w:val="single" w:space="0" w:color="D3D3D3"/>
-            </w:tcBorders>
-          </w:tcPr>
-          <w:p>
-            <w:pPr>
-              <w:spacing w:before="0" w:after="60"/>
-              <w:keepNext/>
-              <w:jc w:val="start"/>
-            </w:pPr>
-            <w:r>
-              <w:rPr>
-                <w:rFonts w:ascii="Calibri" w:hAnsi="Calibri"/>
-                <w:sz w:val="20"/>
-              </w:rPr>
-              <w:t xml:space="default">Seal easy-to-access air leaks and weatherstrip exterior doors.</w:t>
+              <w:t xml:space="default">Air Source Heat Pump</w:t>
+            </w:r>
+          </w:p>
+        </w:tc>
+        <w:tc>
+          <w:tcPr>
+            <w:tcBorders>
+              <w:top w:val="single" w:space="0" w:color="D3D3D3"/>
+              <w:bottom w:val="single" w:space="0" w:color="D3D3D3"/>
+              <w:start w:val="single" w:space="0" w:color="D3D3D3"/>
+              <w:end w:val="single" w:space="0" w:color="D3D3D3"/>
+            </w:tcBorders>
+          </w:tcPr>
+          <w:p>
+            <w:pPr>
+              <w:spacing w:before="0" w:after="60"/>
+              <w:keepNext/>
+              <w:jc w:val="start"/>
+            </w:pPr>
+            <w:r>
+              <w:rPr>
+                <w:rFonts w:ascii="Calibri" w:hAnsi="Calibri"/>
+                <w:sz w:val="20"/>
+              </w:rPr>
+              <w:t xml:space="default">Install air source heat pumps for heating and cooling and whole-house surge protection.</w:t>
             </w:r>
           </w:p>
         </w:tc>
@@ -1267,31 +1267,31 @@
                 <w:rFonts w:ascii="Calibri" w:hAnsi="Calibri"/>
                 <w:sz w:val="20"/>
               </w:rPr>
-              <w:t xml:space="default">Other 1</w:t>
-            </w:r>
-          </w:p>
-        </w:tc>
-        <w:tc>
-          <w:tcPr>
-            <w:tcBorders>
-              <w:top w:val="single" w:space="0" w:color="D3D3D3"/>
-              <w:bottom w:val="single" w:space="0" w:color="D3D3D3"/>
-              <w:start w:val="single" w:space="0" w:color="D3D3D3"/>
-              <w:end w:val="single" w:space="0" w:color="D3D3D3"/>
-            </w:tcBorders>
-          </w:tcPr>
-          <w:p>
-            <w:pPr>
-              <w:spacing w:before="0" w:after="60"/>
-              <w:keepNext/>
-              <w:jc w:val="start"/>
-            </w:pPr>
-            <w:r>
-              <w:rPr>
-                <w:rFonts w:ascii="Calibri" w:hAnsi="Calibri"/>
-                <w:sz w:val="20"/>
-              </w:rPr>
-              <w:t xml:space="default">TYPE HERE 1</w:t>
+              <w:t xml:space="default">Solar</w:t>
+            </w:r>
+          </w:p>
+        </w:tc>
+        <w:tc>
+          <w:tcPr>
+            <w:tcBorders>
+              <w:top w:val="single" w:space="0" w:color="D3D3D3"/>
+              <w:bottom w:val="single" w:space="0" w:color="D3D3D3"/>
+              <w:start w:val="single" w:space="0" w:color="D3D3D3"/>
+              <w:end w:val="single" w:space="0" w:color="D3D3D3"/>
+            </w:tcBorders>
+          </w:tcPr>
+          <w:p>
+            <w:pPr>
+              <w:spacing w:before="0" w:after="60"/>
+              <w:keepNext/>
+              <w:jc w:val="start"/>
+            </w:pPr>
+            <w:r>
+              <w:rPr>
+                <w:rFonts w:ascii="Calibri" w:hAnsi="Calibri"/>
+                <w:sz w:val="20"/>
+              </w:rPr>
+              <w:t xml:space="default">Rooftop solar can supply most or all of your home electrical demands. Contact a solar company for pricing and details specific to your home.</w:t>
             </w:r>
           </w:p>
         </w:tc>
@@ -1320,31 +1320,137 @@
                 <w:rFonts w:ascii="Calibri" w:hAnsi="Calibri"/>
                 <w:sz w:val="20"/>
               </w:rPr>
-              <w:t xml:space="default">Misc. Air Sealing and Insulation</w:t>
-            </w:r>
-          </w:p>
-        </w:tc>
-        <w:tc>
-          <w:tcPr>
-            <w:tcBorders>
-              <w:top w:val="single" w:space="0" w:color="D3D3D3"/>
-              <w:bottom w:val="single" w:space="0" w:color="D3D3D3"/>
-              <w:start w:val="single" w:space="0" w:color="D3D3D3"/>
-              <w:end w:val="single" w:space="0" w:color="D3D3D3"/>
-            </w:tcBorders>
-          </w:tcPr>
-          <w:p>
-            <w:pPr>
-              <w:spacing w:before="0" w:after="60"/>
-              <w:keepNext/>
-              <w:jc w:val="start"/>
-            </w:pPr>
-            <w:r>
-              <w:rPr>
-                <w:rFonts w:ascii="Calibri" w:hAnsi="Calibri"/>
-                <w:sz w:val="20"/>
-              </w:rPr>
-              <w:t xml:space="default">Air seal and insulate [** insert auditor description - bay window, bulkhead door, chase, kneewall, anything else that is unique to the home and not otherwise covered in another recommendation]</w:t>
+              <w:t xml:space="default">Whole-House Surge Protection</w:t>
+            </w:r>
+          </w:p>
+        </w:tc>
+        <w:tc>
+          <w:tcPr>
+            <w:tcBorders>
+              <w:top w:val="single" w:space="0" w:color="D3D3D3"/>
+              <w:bottom w:val="single" w:space="0" w:color="D3D3D3"/>
+              <w:start w:val="single" w:space="0" w:color="D3D3D3"/>
+              <w:end w:val="single" w:space="0" w:color="D3D3D3"/>
+            </w:tcBorders>
+          </w:tcPr>
+          <w:p>
+            <w:pPr>
+              <w:spacing w:before="0" w:after="60"/>
+              <w:keepNext/>
+              <w:jc w:val="start"/>
+            </w:pPr>
+            <w:r>
+              <w:rPr>
+                <w:rFonts w:ascii="Calibri" w:hAnsi="Calibri"/>
+                <w:sz w:val="20"/>
+              </w:rPr>
+              <w:t xml:space="default">Upgrade your electrical panel to add whole-house surge protection.</w:t>
+            </w:r>
+          </w:p>
+        </w:tc>
+      </w:tr>
+      <w:tr>
+        <w:trPr>
+          <w:cantSplit/>
+        </w:trPr>
+        <w:tc>
+          <w:tcPr>
+            <w:tcBorders>
+              <w:top w:val="single" w:space="0" w:color="D3D3D3"/>
+              <w:bottom w:val="single" w:space="0" w:color="D3D3D3"/>
+              <w:start w:val="single" w:space="0" w:color="D3D3D3"/>
+              <w:end w:val="single" w:space="0" w:color="D3D3D3"/>
+            </w:tcBorders>
+          </w:tcPr>
+          <w:p>
+            <w:pPr>
+              <w:spacing w:before="0" w:after="60"/>
+              <w:keepNext/>
+              <w:jc w:val="start"/>
+            </w:pPr>
+            <w:r>
+              <w:rPr>
+                <w:rFonts w:ascii="Calibri" w:hAnsi="Calibri"/>
+                <w:sz w:val="20"/>
+              </w:rPr>
+              <w:t xml:space="default">Pipe Insulation</w:t>
+            </w:r>
+          </w:p>
+        </w:tc>
+        <w:tc>
+          <w:tcPr>
+            <w:tcBorders>
+              <w:top w:val="single" w:space="0" w:color="D3D3D3"/>
+              <w:bottom w:val="single" w:space="0" w:color="D3D3D3"/>
+              <w:start w:val="single" w:space="0" w:color="D3D3D3"/>
+              <w:end w:val="single" w:space="0" w:color="D3D3D3"/>
+            </w:tcBorders>
+          </w:tcPr>
+          <w:p>
+            <w:pPr>
+              <w:spacing w:before="0" w:after="60"/>
+              <w:keepNext/>
+              <w:jc w:val="start"/>
+            </w:pPr>
+            <w:r>
+              <w:rPr>
+                <w:rFonts w:ascii="Calibri" w:hAnsi="Calibri"/>
+                <w:sz w:val="20"/>
+              </w:rPr>
+              <w:t xml:space="default">Insulate both hot and cold water pipes that are uninsulated in the **basement / crawlspace**. This will save energy and prevent condensation.</w:t>
+            </w:r>
+          </w:p>
+        </w:tc>
+      </w:tr>
+      <w:tr>
+        <w:trPr>
+          <w:cantSplit/>
+        </w:trPr>
+        <w:tc>
+          <w:tcPr>
+            <w:tcBorders>
+              <w:top w:val="single" w:space="0" w:color="D3D3D3"/>
+              <w:bottom w:val="single" w:space="0" w:color="D3D3D3"/>
+              <w:start w:val="single" w:space="0" w:color="D3D3D3"/>
+              <w:end w:val="single" w:space="0" w:color="D3D3D3"/>
+            </w:tcBorders>
+          </w:tcPr>
+          <w:p>
+            <w:pPr>
+              <w:spacing w:before="0" w:after="60"/>
+              <w:keepNext/>
+              <w:jc w:val="start"/>
+            </w:pPr>
+            <w:r>
+              <w:rPr>
+                <w:rFonts w:ascii="Calibri" w:hAnsi="Calibri"/>
+                <w:sz w:val="20"/>
+              </w:rPr>
+              <w:t xml:space="default">Replace Windows</w:t>
+            </w:r>
+          </w:p>
+        </w:tc>
+        <w:tc>
+          <w:tcPr>
+            <w:tcBorders>
+              <w:top w:val="single" w:space="0" w:color="D3D3D3"/>
+              <w:bottom w:val="single" w:space="0" w:color="D3D3D3"/>
+              <w:start w:val="single" w:space="0" w:color="D3D3D3"/>
+              <w:end w:val="single" w:space="0" w:color="D3D3D3"/>
+            </w:tcBorders>
+          </w:tcPr>
+          <w:p>
+            <w:pPr>
+              <w:spacing w:before="0" w:after="60"/>
+              <w:keepNext/>
+              <w:jc w:val="start"/>
+            </w:pPr>
+            <w:r>
+              <w:rPr>
+                <w:rFonts w:ascii="Calibri" w:hAnsi="Calibri"/>
+                <w:sz w:val="20"/>
+              </w:rPr>
+              <w:t xml:space="default">Replace single-paned windows with double- or triple-paned windows and ensure the frames are airsealed. We recommend installing windows that are Energy Star certified for 'Northern' climate.</w:t>
             </w:r>
           </w:p>
         </w:tc>
@@ -1434,7 +1540,7 @@
                 <w:rFonts w:ascii="Calibri" w:hAnsi="Calibri"/>
                 <w:sz w:val="20"/>
               </w:rPr>
-              <w:t xml:space="default">1907</w:t>
+              <w:t xml:space="default">1910</w:t>
             </w:r>
           </w:p>
         </w:tc>
@@ -1540,7 +1646,7 @@
                 <w:rFonts w:ascii="Calibri" w:hAnsi="Calibri"/>
                 <w:sz w:val="20"/>
               </w:rPr>
-              <w:t xml:space="default">Loose Cellulose , 3 inches</w:t>
+              <w:t xml:space="default">NONE , NA inches</w:t>
             </w:r>
           </w:p>
         </w:tc>
@@ -1646,7 +1752,7 @@
                 <w:rFonts w:ascii="Calibri" w:hAnsi="Calibri"/>
                 <w:sz w:val="20"/>
               </w:rPr>
-              <w:t xml:space="default">2,458 ft²</w:t>
+              <w:t xml:space="default">1,524 ft²</w:t>
             </w:r>
           </w:p>
         </w:tc>
@@ -1699,7 +1805,7 @@
                 <w:rFonts w:ascii="Calibri" w:hAnsi="Calibri"/>
                 <w:sz w:val="20"/>
               </w:rPr>
-              <w:t xml:space="default">21,760 ft³</w:t>
+              <w:t xml:space="default">12,138 ft³</w:t>
             </w:r>
           </w:p>
         </w:tc>
@@ -1934,7 +2040,7 @@
                 <w:rFonts w:ascii="Calibri" w:hAnsi="Calibri"/>
                 <w:sz w:val="20"/>
               </w:rPr>
-              <w:t xml:space="default">The house has a Asphalt Shingles, Standing Seam Metal, Synthetic Slate Tile roof.The roof is in fair condition. Gallery connection has full standing seam, main house has a combination of shingles and standing seam, all in fairly good condition</w:t>
+              <w:t xml:space="default">The house has a Asphalt Shingles roof.The roof is in excellent condition. NA</w:t>
             </w:r>
           </w:p>
         </w:tc>
@@ -1987,7 +2093,7 @@
                 <w:rFonts w:ascii="Calibri" w:hAnsi="Calibri"/>
                 <w:sz w:val="20"/>
               </w:rPr>
-              <w:t xml:space="default">The house has the following moisture control strategies: gutters, ground slopes away from foundation. These were in fair condition. Some water damage marks around gutters on intersecting sections, ground does not slope away from all parts of the house. Many plants also are planted around the house that assist with moisture control.</w:t>
+              <w:t xml:space="default">The house has the following moisture control strategies: ground slopes away from foundation, drainage channels. These were in fair condition. The moisture control strategies seem to not be working. The basement is very moist/humid.</w:t>
             </w:r>
           </w:p>
         </w:tc>
@@ -2040,7 +2146,7 @@
                 <w:rFonts w:ascii="Calibri" w:hAnsi="Calibri"/>
                 <w:sz w:val="20"/>
               </w:rPr>
-              <w:t xml:space="default">The house has Combination of wood shingles and siding. The siding is in fair condition. Siding shows signs of weathering and aging, some sections have water damage marks, otherwise in good condition and intact</w:t>
+              <w:t xml:space="default">The house has wood siding. The siding is in fair condition. There is paint chipping and water damage on the siding.</w:t>
             </w:r>
           </w:p>
         </w:tc>
@@ -2093,7 +2199,7 @@
                 <w:rFonts w:ascii="Calibri" w:hAnsi="Calibri"/>
                 <w:sz w:val="20"/>
               </w:rPr>
-              <w:t xml:space="default">There are 1 insulated wood exterior doors. These are in fair condition, they have a total area of 18 ft². There are 1 glass door wood exterior doors. These are in fair condition, they have a total area of 18.5 ft². There are 1 insulated wood exterior doors. These are in fair condition, they have a total area of 18 ft².</w:t>
+              <w:t xml:space="default">There are 2 insulated wood exterior doors. These are in fair condition, they have a total area of 42 ft².</w:t>
             </w:r>
           </w:p>
         </w:tc>
@@ -2146,7 +2252,7 @@
                 <w:rFonts w:ascii="Calibri" w:hAnsi="Calibri"/>
                 <w:sz w:val="20"/>
               </w:rPr>
-              <w:t xml:space="default">There are 16 double paned wood windows. These are in fair condition, they have a total area of 169 ft². Moreover there are 6 double paned wood windows. These are in excellent condition, they have a total area of 98 ft².</w:t>
+              <w:t xml:space="default">There are 11 single paned wood windows. These are in poor condition, they have a total area of 116.2 ft². Moreover there are 1 double paned wood windows. These are in excellent condition, they have a total area of 35.84 ft².</w:t>
             </w:r>
           </w:p>
         </w:tc>
@@ -2222,7 +2328,7 @@
                 <w:rFonts w:ascii="Calibri" w:hAnsi="Calibri"/>
                 <w:sz w:val="20"/>
               </w:rPr>
-              <w:t xml:space="default">The house has balloon framing, which means the wall cavities extend the full height of the building (from the foundation to the roof). These wall cavities are often interconnected with the floor and ceiling cavities. This framing type can create connected passageways for air to leave the house and rodents to enter the house. The exterior walls are insulated with Batts of Fiberglass, Loose Cellulose insulation. This insulation is 4 inches thick and in NA condition. This gives the exterior walls an R-value of around CALCULATE. A material’s R-value tells us how good it is at stopping heat flow, the bigger the number, the better. For comparison, current Maine building code requires an R-value of at least R-13 with additional continuous insulation of R-10 for exterior walls or R-20 with additional continuous insulation of R-5. Insulation depth and quality unknown, could not access wall cavity. Some thermal cam images show inconsistent insulation on second floor</w:t>
+              <w:t xml:space="default">The house has balloon framing, which means the wall cavities extend the full height of the building (from the foundation to the roof). These wall cavities are often interconnected with the floor and ceiling cavities. This framing type can create connected passageways for air to leave the house and rodents to enter the house. The exterior walls are insulated with Batts of Rockwool insulation. This insulation is 3 inches thick and in excellent condition. This gives the exterior walls an R-value of around CALCULATE. A material’s R-value tells us how good it is at stopping heat flow, the bigger the number, the better. For comparison, current Maine building code requires an R-value of at least R-13 with additional continuous insulation of R-10 for exterior walls or R-20 with additional continuous insulation of R-5. Only the east wall in the living room has been insulated.</w:t>
             </w:r>
           </w:p>
         </w:tc>
@@ -2381,7 +2487,7 @@
                 <w:rFonts w:ascii="Calibri" w:hAnsi="Calibri"/>
                 <w:sz w:val="20"/>
               </w:rPr>
-              <w:t xml:space="default">During the audit we measured the electricity consumption of the Main fridge/freezer. It used 0.23 kWh in 135 hours. We thus estimate that it is costing you around $CALCULATE a month to run. This is **comparable to / more expensive than** newer, efficient models. The Basement upright freezer used 0.32 kWh in 182 hours. We thus estimate that it is costing you around $CALCULATE a month to run. This is **comparable to / more expensive than** newer, efficient models. Kitchen has gas stove and range, recirculating fan but no exhaust fan</w:t>
+              <w:t xml:space="default">During the audit we measured the electricity consumption of the fridge. It used 0.17 kWh in 2.75 hours. We thus estimate that it is costing you around $CALCULATE a month to run. This is **comparable to / more expensive than** newer, efficient models. The NA used NA kWh in NA hours. We thus estimate that it is costing you around $CALCULATE a month to run. This is **comparable to / more expensive than** newer, efficient models. When we tested the gas oven, it measured 459 ppm.</w:t>
             </w:r>
           </w:p>
         </w:tc>
@@ -2489,7 +2595,7 @@
                 <w:rFonts w:ascii="Calibri" w:hAnsi="Calibri"/>
                 <w:sz w:val="20"/>
               </w:rPr>
-              <w:t xml:space="default">3383</w:t>
+              <w:t xml:space="default">4539</w:t>
             </w:r>
           </w:p>
         </w:tc>
@@ -2566,7 +2672,7 @@
                 <w:rFonts w:ascii="Calibri" w:hAnsi="Calibri"/>
                 <w:sz w:val="20"/>
               </w:rPr>
-              <w:t xml:space="default">9</w:t>
+              <w:t xml:space="default">22</w:t>
             </w:r>
           </w:p>
         </w:tc>
@@ -2643,7 +2749,7 @@
                 <w:rFonts w:ascii="Calibri" w:hAnsi="Calibri"/>
                 <w:sz w:val="20"/>
               </w:rPr>
-              <w:t xml:space="default">338 in²</w:t>
+              <w:t xml:space="default">454 in²</w:t>
             </w:r>
           </w:p>
         </w:tc>
@@ -2720,108 +2826,31 @@
                 <w:rFonts w:ascii="Calibri" w:hAnsi="Calibri"/>
                 <w:sz w:val="20"/>
               </w:rPr>
-              <w:t xml:space="default">0.5</w:t>
-            </w:r>
-          </w:p>
-        </w:tc>
-        <w:tc>
-          <w:tcPr>
-            <w:tcBorders>
-              <w:top w:val="single" w:space="0" w:color="D3D3D3"/>
-              <w:bottom w:val="single" w:space="0" w:color="D3D3D3"/>
-              <w:start w:val="single" w:space="0" w:color="D3D3D3"/>
-              <w:end w:val="single" w:space="0" w:color="D3D3D3"/>
-            </w:tcBorders>
-          </w:tcPr>
-          <w:p>
-            <w:pPr>
-              <w:spacing w:before="0" w:after="60"/>
-              <w:keepNext/>
-              <w:jc w:val="start"/>
-            </w:pPr>
-            <w:r>
-              <w:rPr>
-                <w:rFonts w:ascii="Calibri" w:hAnsi="Calibri"/>
-                <w:sz w:val="20"/>
-              </w:rPr>
-              <w:t xml:space="default">Accounting for the volume of the home, this means that the house exchanges 50% of its air every hour. Over one day, the house goes through 12 complete air changes.</w:t>
-            </w:r>
-          </w:p>
-        </w:tc>
-      </w:tr>
-      <w:tr>
-        <w:trPr>
-          <w:cantSplit/>
-        </w:trPr>
-        <w:tc>
-          <w:tcPr>
-            <w:tcBorders>
-              <w:top w:val="single" w:space="0" w:color="D3D3D3"/>
-              <w:bottom w:val="single" w:space="0" w:color="D3D3D3"/>
-              <w:start w:val="single" w:space="0" w:color="D3D3D3"/>
-              <w:end w:val="single" w:space="0" w:color="D3D3D3"/>
-            </w:tcBorders>
-          </w:tcPr>
-          <w:p>
-            <w:pPr>
-              <w:spacing w:before="0" w:after="60"/>
-              <w:keepNext/>
-              <w:jc w:val="start"/>
-            </w:pPr>
-            <w:r>
-              <w:rPr>
-                <w:rFonts w:ascii="Calibri" w:hAnsi="Calibri"/>
-                <w:sz w:val="20"/>
-              </w:rPr>
-              <w:t xml:space="default">Comments About Air Leakage:</w:t>
-            </w:r>
-          </w:p>
-        </w:tc>
-        <w:tc>
-          <w:tcPr>
-            <w:tcBorders>
-              <w:top w:val="single" w:space="0" w:color="D3D3D3"/>
-              <w:bottom w:val="single" w:space="0" w:color="D3D3D3"/>
-              <w:start w:val="single" w:space="0" w:color="D3D3D3"/>
-              <w:end w:val="single" w:space="0" w:color="D3D3D3"/>
-            </w:tcBorders>
-          </w:tcPr>
-          <w:p>
-            <w:pPr>
-              <w:spacing w:before="0" w:after="60"/>
-              <w:keepNext/>
-              <w:jc w:val="start"/>
-            </w:pPr>
-            <w:r>
-              <w:rPr>
-                <w:rFonts w:ascii="Calibri" w:hAnsi="Calibri"/>
-                <w:sz w:val="20"/>
-              </w:rPr>
-              <w:t xml:space="default">Windows on second floor are badly leaking (some still need to be sealed), all doors somewhat leaky, attic insulation has settled and air travels through cracks in second floor walls and wall seams, attic hatch is not airtight</w:t>
-            </w:r>
-          </w:p>
-        </w:tc>
-        <w:tc>
-          <w:tcPr>
-            <w:tcBorders>
-              <w:top w:val="single" w:space="0" w:color="D3D3D3"/>
-              <w:bottom w:val="single" w:space="0" w:color="D3D3D3"/>
-              <w:start w:val="single" w:space="0" w:color="D3D3D3"/>
-              <w:end w:val="single" w:space="0" w:color="D3D3D3"/>
-            </w:tcBorders>
-          </w:tcPr>
-          <w:p>
-            <w:pPr>
-              <w:spacing w:before="0" w:after="60"/>
-              <w:keepNext/>
-              <w:jc w:val="start"/>
-            </w:pPr>
-            <w:r>
-              <w:rPr>
-                <w:rFonts w:ascii="Calibri" w:hAnsi="Calibri"/>
-                <w:sz w:val="20"/>
-              </w:rPr>
-              <w:t xml:space="default">Move somewhere else in this section, just putting it here for now so it makes it into the report.</w:t>
+              <w:t xml:space="default">1.7</w:t>
+            </w:r>
+          </w:p>
+        </w:tc>
+        <w:tc>
+          <w:tcPr>
+            <w:tcBorders>
+              <w:top w:val="single" w:space="0" w:color="D3D3D3"/>
+              <w:bottom w:val="single" w:space="0" w:color="D3D3D3"/>
+              <w:start w:val="single" w:space="0" w:color="D3D3D3"/>
+              <w:end w:val="single" w:space="0" w:color="D3D3D3"/>
+            </w:tcBorders>
+          </w:tcPr>
+          <w:p>
+            <w:pPr>
+              <w:spacing w:before="0" w:after="60"/>
+              <w:keepNext/>
+              <w:jc w:val="start"/>
+            </w:pPr>
+            <w:r>
+              <w:rPr>
+                <w:rFonts w:ascii="Calibri" w:hAnsi="Calibri"/>
+                <w:sz w:val="20"/>
+              </w:rPr>
+              <w:t xml:space="default">Accounting for the volume of the home, this means that the house exchanges 170% of its air every hour. Over one day, the house goes through 41 complete air changes.</w:t>
             </w:r>
           </w:p>
         </w:tc>
@@ -2899,7 +2928,23 @@
         <w:pStyle w:val="BodyText"/>
       </w:pPr>
       <w:r>
-        <w:t xml:space="preserve">We conducted the audit in the summer, when the air outside the house is hotter than inside the house. Therefore, the warmer (red, orange, and yellow) areas in the thermal pictures below show where air leakage and thermal bridgin are taking place, as these are the areas where hot air and heat from the outside are being pulled into the cooler house.</w:t>
+        <w:t xml:space="preserve">We conducted the audit in the summer, when the air outside the house is hotter than inside the house. Therefore, the warmer (red, orange, and yellow) areas in the thermal pictures below show where air leakage and thermal bridging are taking place, as these are the areas where hot air and heat from the outside are being pulled into the cooler house.</w:t>
+      </w:r>
+    </w:p>
+    <w:p>
+      <w:pPr>
+        <w:pStyle w:val="BodyText"/>
+      </w:pPr>
+      <w:r>
+        <w:t xml:space="preserve">ADD INFRARED IMAGES TABLE</w:t>
+      </w:r>
+    </w:p>
+    <w:p>
+      <w:pPr>
+        <w:pStyle w:val="BodyText"/>
+      </w:pPr>
+      <w:r>
+        <w:t xml:space="preserve">When we were conducting the blower door test, the basement, attic, and mudroom doors were blown open.</w:t>
       </w:r>
     </w:p>
     <w:bookmarkEnd w:id="36"/>
@@ -2972,7 +3017,7 @@
                 <w:rFonts w:ascii="Calibri" w:hAnsi="Calibri"/>
                 <w:sz w:val="20"/>
               </w:rPr>
-              <w:t xml:space="default">NA ft²</w:t>
+              <w:t xml:space="default">392 ft²</w:t>
             </w:r>
           </w:p>
         </w:tc>
@@ -3025,7 +3070,7 @@
                 <w:rFonts w:ascii="Calibri" w:hAnsi="Calibri"/>
                 <w:sz w:val="20"/>
               </w:rPr>
-              <w:t xml:space="default">The pitch of the primary roof face is NA degrees.</w:t>
+              <w:t xml:space="default">The pitch of the primary roof face is 84 degrees.</w:t>
             </w:r>
           </w:p>
         </w:tc>
@@ -3078,7 +3123,7 @@
                 <w:rFonts w:ascii="Calibri" w:hAnsi="Calibri"/>
                 <w:sz w:val="20"/>
               </w:rPr>
-              <w:t xml:space="default">The attic is insulated with Loose Cellulose insulation. The insulation is 3 inches thick.</w:t>
+              <w:t xml:space="default">The attic is insulated with NONE insulation. The insulation is NA inches thick.</w:t>
             </w:r>
           </w:p>
         </w:tc>
@@ -3131,7 +3176,7 @@
                 <w:rFonts w:ascii="Calibri" w:hAnsi="Calibri"/>
                 <w:sz w:val="20"/>
               </w:rPr>
-              <w:t xml:space="default">The insulation is in Partially condition. Cellulose has badly settled, depth under floor varies. Wall cavities have been dense packed, but have also settled to varying degrees.</w:t>
+              <w:t xml:space="default">The insulation is in NA condition. NA</w:t>
             </w:r>
           </w:p>
         </w:tc>
@@ -3237,7 +3282,7 @@
                 <w:rFonts w:ascii="Calibri" w:hAnsi="Calibri"/>
                 <w:sz w:val="20"/>
               </w:rPr>
-              <w:t xml:space="default">The attic is Yes. Air sealing behind rafters, inconsistent but primarily above additions</w:t>
+              <w:t xml:space="default">The attic is not air sealed. NA</w:t>
             </w:r>
           </w:p>
         </w:tc>
@@ -3290,7 +3335,7 @@
                 <w:rFonts w:ascii="Calibri" w:hAnsi="Calibri"/>
                 <w:sz w:val="20"/>
               </w:rPr>
-              <w:t xml:space="default">The attic hatch is insulated with Foam block insulation that is 1 inches thick. The insulation is in Fair condition and the hatch is **air sealed / not air sealed**.</w:t>
+              <w:t xml:space="default">The attic hatch is insulated with NONE insulation that is NA inches thick. The insulation is in NA condition and the hatch is **air sealed / not air sealed**.</w:t>
             </w:r>
           </w:p>
         </w:tc>
@@ -3343,7 +3388,7 @@
                 <w:rFonts w:ascii="Calibri" w:hAnsi="Calibri"/>
                 <w:sz w:val="20"/>
               </w:rPr>
-              <w:t xml:space="default">The attic is ventilated by Gable. Attic ventilation is important to keep the attic space and insulation dry and in good condition.</w:t>
+              <w:t xml:space="default">The attic is ventilated by NONE. Attic ventilation is important to keep the attic space and insulation dry and in good condition.</w:t>
             </w:r>
           </w:p>
         </w:tc>
@@ -3449,7 +3494,7 @@
                 <w:rFonts w:ascii="Calibri" w:hAnsi="Calibri"/>
                 <w:sz w:val="20"/>
               </w:rPr>
-              <w:t xml:space="default">No. NA</w:t>
+              <w:t xml:space="default">None. NA</w:t>
             </w:r>
           </w:p>
         </w:tc>
@@ -3525,7 +3570,7 @@
                 <w:rFonts w:ascii="Calibri" w:hAnsi="Calibri"/>
                 <w:sz w:val="20"/>
               </w:rPr>
-              <w:t xml:space="default">NA ft²</w:t>
+              <w:t xml:space="default">741.5 ft²</w:t>
             </w:r>
           </w:p>
         </w:tc>
@@ -3790,7 +3835,7 @@
                 <w:rFonts w:ascii="Calibri" w:hAnsi="Calibri"/>
                 <w:sz w:val="20"/>
               </w:rPr>
-              <w:t xml:space="default">There is dehumidifier to control moisture. These are in fair condition. Some water damage marks around gutters on intersecting sections, ground does not slope away from all parts of the house. Many plants also are planted around the house that assist with moisture control.. Moisture control is important as moisture in the **basement / crawlspace** evaporates into the house where it can cause moisture damage such as mold. It is also important to protect appliances in the **basement / crawlspace**.</w:t>
+              <w:t xml:space="default">There is drainage channel to control moisture. These are in poor condition. The moisture control strategies seem to not be working. The basement is very moist/humid.. Moisture control is important as moisture in the **basement / crawlspace** evaporates into the house where it can cause moisture damage such as mold. It is also important to protect appliances in the **basement / crawlspace**.</w:t>
             </w:r>
           </w:p>
         </w:tc>
@@ -3843,7 +3888,7 @@
                 <w:rFonts w:ascii="Calibri" w:hAnsi="Calibri"/>
                 <w:sz w:val="20"/>
               </w:rPr>
-              <w:t xml:space="default">The Appliances not insulated, Ducts/pipes partially insulated DELETE WHAT DOESN'T APPLY. Insulating ductwork is important to prevent the air from losing heat as it travels through it. Insulating both hot and cold water pipes is important to stop the water from losing heat as it travels through the pipes and to prevent condensation. Uninsulated **ductwork / pipes** increase your heating bill.</w:t>
+              <w:t xml:space="default">The Appliances not insulated DELETE WHAT DOESN'T APPLY. Insulating ductwork is important to prevent the air from losing heat as it travels through it. Insulating both hot and cold water pipes is important to stop the water from losing heat as it travels through the pipes and to prevent condensation. Uninsulated **ductwork / pipes** increase your heating bill.</w:t>
             </w:r>
           </w:p>
         </w:tc>
@@ -3949,7 +3994,7 @@
                 <w:rFonts w:ascii="Calibri" w:hAnsi="Calibri"/>
                 <w:sz w:val="20"/>
               </w:rPr>
-              <w:t xml:space="default">There is NANA</w:t>
+              <w:t xml:space="default">There is moistureThe basement is very damp, and the homeowner complained of moisture problems.</w:t>
             </w:r>
           </w:p>
         </w:tc>
@@ -4025,7 +4070,7 @@
                 <w:rFonts w:ascii="Calibri" w:hAnsi="Calibri"/>
                 <w:sz w:val="20"/>
               </w:rPr>
-              <w:t xml:space="default">The electrical panel has an amperage of 100. There are 0 unused breaker spaces. NA</w:t>
+              <w:t xml:space="default">The electrical panel has an amperage of 100. There are NA unused breaker spaces. NA</w:t>
             </w:r>
           </w:p>
         </w:tc>
@@ -4078,7 +4123,7 @@
                 <w:rFonts w:ascii="Calibri" w:hAnsi="Calibri"/>
                 <w:sz w:val="20"/>
               </w:rPr>
-              <w:t xml:space="default">The NA runs on Heating oil. It is located in the Basement Workshop and has Atmospheric ventilation. We performed combustion safety tests on this appliance. The appliance Pass the backdrafting test. The backdrafting test verifies that combustion gasses are properly venting to the outside and not entering the living space. The appliance had an efficiency of 84.4% and an air free carbon monoxide reading of 225 parts per million. MAKE COMMENTS ABOUT EFFICIENCY AND CO READING.</w:t>
+              <w:t xml:space="default">The NA runs on NA. It is located in the NA and has NA ventilation.</w:t>
             </w:r>
           </w:p>
         </w:tc>
@@ -4422,7 +4467,7 @@
     </w:p>
     <w:bookmarkEnd w:id="40"/>
     <w:bookmarkEnd w:id="41"/>
-    <w:bookmarkStart w:id="60" w:name="recommendations"/>
+    <w:bookmarkStart w:id="62" w:name="recommendations"/>
     <w:p>
       <w:pPr>
         <w:pStyle w:val="Heading2"/>
@@ -4439,13 +4484,13 @@
         <w:t xml:space="preserve">These recommendations are organized from the least expensive/most cost-effective and easiest interventions to ones that are more challenging to implement.</w:t>
       </w:r>
     </w:p>
-    <w:bookmarkStart w:id="42" w:name="furnaceboiler-tune-up"/>
+    <w:bookmarkStart w:id="42" w:name="high-efficiency-shower-heads"/>
     <w:p>
       <w:pPr>
         <w:pStyle w:val="Heading3"/>
       </w:pPr>
       <w:r>
-        <w:t xml:space="preserve">4.1 Furnace/Boiler Tune up</w:t>
+        <w:t xml:space="preserve">4.1 High efficiency shower head(s)</w:t>
       </w:r>
     </w:p>
     <w:p>
@@ -4465,31 +4510,229 @@
         <w:pStyle w:val="BodyText"/>
       </w:pPr>
       <w:r>
+        <w:t xml:space="preserve">Your shower heads use more water and energy than high-efficiency shower heads, thus costing you more money than necessary. Older shower heads use 2.5 gallons or more every minute, which wastes thousands of gallons of water each year and costs you money for every extra gallon of water heated.</w:t>
+      </w:r>
+    </w:p>
+    <w:p>
+      <w:pPr>
+        <w:pStyle w:val="BodyText"/>
+      </w:pPr>
+      <w:r>
+        <w:rPr>
+          <w:i/>
+          <w:iCs/>
+        </w:rPr>
+        <w:t xml:space="preserve">Recommendation</w:t>
+      </w:r>
+    </w:p>
+    <w:p>
+      <w:pPr>
+        <w:pStyle w:val="BodyText"/>
+      </w:pPr>
+      <w:r>
+        <w:t xml:space="preserve">Install high-efficiency shower heads to reduce the amount of water and energy to heat the water used when showering. We recommend 1.5 gallon per minute shower heads that will save a gallon or more of water for every minute spent in the shower.</w:t>
+      </w:r>
+      <w:r>
+        <w:t xml:space="preserve"> </w:t>
+      </w:r>
+      <w:r>
+        <w:rPr>
+          <w:i/>
+          <w:iCs/>
+        </w:rPr>
+        <w:t xml:space="preserve">Estimated Cost/Benefits/Incentives</w:t>
+      </w:r>
+    </w:p>
+    <w:p>
+      <w:pPr>
+        <w:pStyle w:val="BodyText"/>
+      </w:pPr>
+      <w:r>
+        <w:t xml:space="preserve">A typical family will save ~10,000 gallons of water per year and over $100 per year in water heating costs. We provide these for free; contact us for some if we did not give you any during the audit.</w:t>
+      </w:r>
+    </w:p>
+    <w:bookmarkEnd w:id="42"/>
+    <w:bookmarkStart w:id="43" w:name="leds"/>
+    <w:p>
+      <w:pPr>
+        <w:pStyle w:val="Heading3"/>
+      </w:pPr>
+      <w:r>
+        <w:t xml:space="preserve">4.2 LEDs</w:t>
+      </w:r>
+    </w:p>
+    <w:p>
+      <w:pPr>
+        <w:pStyle w:val="FirstParagraph"/>
+      </w:pPr>
+      <w:r>
+        <w:rPr>
+          <w:i/>
+          <w:iCs/>
+        </w:rPr>
+        <w:t xml:space="preserve">Problem</w:t>
+      </w:r>
+    </w:p>
+    <w:p>
+      <w:pPr>
+        <w:pStyle w:val="BodyText"/>
+      </w:pPr>
+      <w:r>
+        <w:t xml:space="preserve">Your lighting uses more energy than LED bulbs would. Halogen and incandescent light bulbs use 5-8x more energy than LEDs. This requires significantly more electricity and costs a lot.</w:t>
+      </w:r>
+    </w:p>
+    <w:p>
+      <w:pPr>
+        <w:pStyle w:val="BodyText"/>
+      </w:pPr>
+      <w:r>
+        <w:rPr>
+          <w:i/>
+          <w:iCs/>
+        </w:rPr>
+        <w:t xml:space="preserve">Recommendation</w:t>
+      </w:r>
+    </w:p>
+    <w:p>
+      <w:pPr>
+        <w:pStyle w:val="BodyText"/>
+      </w:pPr>
+      <w:r>
+        <w:t xml:space="preserve">Switch your light bulbs to LED light bulbs. LEDs use 80% less energy than incandescent light bulbs, which can significantly reduce your electricity bill.</w:t>
+      </w:r>
+    </w:p>
+    <w:p>
+      <w:pPr>
+        <w:pStyle w:val="BodyText"/>
+      </w:pPr>
+      <w:r>
+        <w:rPr>
+          <w:i/>
+          <w:iCs/>
+        </w:rPr>
+        <w:t xml:space="preserve">Estimated Cost/Benefits/Incentives</w:t>
+      </w:r>
+    </w:p>
+    <w:p>
+      <w:pPr>
+        <w:pStyle w:val="BodyText"/>
+      </w:pPr>
+      <w:r>
+        <w:t xml:space="preserve">We provide free LED light bulbs; contact us for some if we did not give you any during the audit. Depending on usage, LEDs can save more than $50 a year.</w:t>
+      </w:r>
+    </w:p>
+    <w:bookmarkEnd w:id="43"/>
+    <w:bookmarkStart w:id="44" w:name="window-dressers"/>
+    <w:p>
+      <w:pPr>
+        <w:pStyle w:val="Heading3"/>
+      </w:pPr>
+      <w:r>
+        <w:t xml:space="preserve">4.3 Window Dressers</w:t>
+      </w:r>
+    </w:p>
+    <w:p>
+      <w:pPr>
+        <w:pStyle w:val="FirstParagraph"/>
+      </w:pPr>
+      <w:r>
+        <w:rPr>
+          <w:i/>
+          <w:iCs/>
+        </w:rPr>
+        <w:t xml:space="preserve">Problem</w:t>
+      </w:r>
+    </w:p>
+    <w:p>
+      <w:pPr>
+        <w:pStyle w:val="BodyText"/>
+      </w:pPr>
+      <w:r>
+        <w:t xml:space="preserve">Your windows are a source of heat loss, reduce your comfort due to cold surface temperatures, and may also cause moisture condensation or frost in the winter.</w:t>
+      </w:r>
+    </w:p>
+    <w:p>
+      <w:pPr>
+        <w:pStyle w:val="BodyText"/>
+      </w:pPr>
+      <w:r>
+        <w:rPr>
+          <w:i/>
+          <w:iCs/>
+        </w:rPr>
+        <w:t xml:space="preserve">Recommendation</w:t>
+      </w:r>
+    </w:p>
+    <w:p>
+      <w:pPr>
+        <w:pStyle w:val="BodyText"/>
+      </w:pPr>
+      <w:r>
+        <w:t xml:space="preserve">WindowDressers are insulating window inserts that help air-seal windows and reduce heat loss and gain. WindowDressers are transparent and let in light while stopping drafts. Each insert is made of a custom-made pine frame wrapped on each side with tightly sealed, clear polyolefin film, creating an airspace between the two layers for additional insulation. The insert is finished with a compressible foam weather seal. The foam allows enough give for the inserts to be easily slid into place in the fall and removed in the spring while holding firmly enough to provide a tight, friction-based seal. The inserts are installed inside your existing window frame with no fasteners required and last 5-10 years. They are most effective in the winter, but depending on the window’s exposure, they can sometimes be used in the summer to keep the house cooler.</w:t>
+      </w:r>
+      <w:r>
+        <w:t xml:space="preserve"> </w:t>
+      </w:r>
+      <w:r>
+        <w:rPr>
+          <w:i/>
+          <w:iCs/>
+        </w:rPr>
+        <w:t xml:space="preserve">Estimated Cost/Benefits/Incentives</w:t>
+      </w:r>
+    </w:p>
+    <w:p>
+      <w:pPr>
+        <w:pStyle w:val="BodyText"/>
+      </w:pPr>
+      <w:r>
         <w:rPr>
           <w:b/>
           <w:bCs/>
         </w:rPr>
-        <w:t xml:space="preserve">Auditor to describe</w:t>
-      </w:r>
-    </w:p>
-    <w:p>
-      <w:pPr>
-        <w:pStyle w:val="BodyText"/>
+        <w:t xml:space="preserve">Reconsider this recommendation</w:t>
+      </w:r>
+    </w:p>
+    <w:bookmarkEnd w:id="44"/>
+    <w:bookmarkStart w:id="45" w:name="refrigerator"/>
+    <w:p>
+      <w:pPr>
+        <w:pStyle w:val="Heading3"/>
+      </w:pPr>
+      <w:r>
+        <w:t xml:space="preserve">4.4 Refrigerator</w:t>
+      </w:r>
+    </w:p>
+    <w:p>
+      <w:pPr>
+        <w:pStyle w:val="FirstParagraph"/>
       </w:pPr>
       <w:r>
         <w:rPr>
           <w:i/>
           <w:iCs/>
         </w:rPr>
-        <w:t xml:space="preserve">Recommendation</w:t>
-      </w:r>
-    </w:p>
-    <w:p>
-      <w:pPr>
-        <w:pStyle w:val="BodyText"/>
-      </w:pPr>
-      <w:r>
-        <w:t xml:space="preserve">Have the furnace/boiler and flue inspected and adjusted by a licensed professional. This should be available from your fuel delivery company.</w:t>
+        <w:t xml:space="preserve">Problem</w:t>
+      </w:r>
+    </w:p>
+    <w:p>
+      <w:pPr>
+        <w:pStyle w:val="BodyText"/>
+      </w:pPr>
+      <w:r>
+        <w:t xml:space="preserve">Your refrigerator uses more energy than newer models.</w:t>
+      </w:r>
+    </w:p>
+    <w:p>
+      <w:pPr>
+        <w:pStyle w:val="BodyText"/>
+      </w:pPr>
+      <w:r>
+        <w:rPr>
+          <w:b/>
+          <w:bCs/>
+        </w:rPr>
+        <w:t xml:space="preserve">Ideally, the auditor notes the annual energy consumption (kWh) of the existing fridge compared to a new model of similar size</w:t>
       </w:r>
     </w:p>
     <w:p>
@@ -4501,200 +4744,212 @@
           <w:i/>
           <w:iCs/>
         </w:rPr>
-        <w:t xml:space="preserve">Estimated Cost/Benefits/Incentives</w:t>
-      </w:r>
-    </w:p>
-    <w:p>
-      <w:pPr>
-        <w:pStyle w:val="BodyText"/>
-      </w:pPr>
-      <w:r>
-        <w:t xml:space="preserve">A tune-up can improve the efficiency of your furnace/boiler, confirm that it is exhausting properly, and identify areas of concern before they become urgent. If you have a service contract with your fuel delivery company, an annual tune-up is usually included.</w:t>
-      </w:r>
-    </w:p>
-    <w:bookmarkEnd w:id="42"/>
-    <w:bookmarkStart w:id="43" w:name="high-efficiency-shower-heads"/>
-    <w:p>
-      <w:pPr>
-        <w:pStyle w:val="Heading3"/>
-      </w:pPr>
-      <w:r>
-        <w:t xml:space="preserve">4.2 High efficiency shower head(s)</w:t>
-      </w:r>
-    </w:p>
-    <w:p>
-      <w:pPr>
-        <w:pStyle w:val="FirstParagraph"/>
+        <w:t xml:space="preserve">Recommendation</w:t>
+      </w:r>
+    </w:p>
+    <w:p>
+      <w:pPr>
+        <w:pStyle w:val="BodyText"/>
+      </w:pPr>
+      <w:r>
+        <w:t xml:space="preserve">Replace your refrigerator with a new, EnergyStar-certified fridge. Look at the Energy Guide label to compare the energy use of new refrigerators.</w:t>
+      </w:r>
+    </w:p>
+    <w:p>
+      <w:pPr>
+        <w:pStyle w:val="BodyText"/>
       </w:pPr>
       <w:r>
         <w:rPr>
           <w:i/>
           <w:iCs/>
         </w:rPr>
-        <w:t xml:space="preserve">Problem</w:t>
-      </w:r>
-    </w:p>
-    <w:p>
-      <w:pPr>
-        <w:pStyle w:val="BodyText"/>
-      </w:pPr>
-      <w:r>
-        <w:t xml:space="preserve">Your shower heads use more water and energy than high-efficiency shower heads, thus costing you more money than necessary. Older shower heads use 2.5 gallons or more every minute, which wastes thousands of gallons of water each year and costs you money for every extra gallon of water heated.</w:t>
-      </w:r>
-    </w:p>
-    <w:p>
-      <w:pPr>
-        <w:pStyle w:val="BodyText"/>
+        <w:t xml:space="preserve">Estimated Cost/Benefits/Incentives</w:t>
+      </w:r>
+    </w:p>
+    <w:p>
+      <w:pPr>
+        <w:pStyle w:val="BodyText"/>
+      </w:pPr>
+      <w:r>
+        <w:t xml:space="preserve">If you are able to afford the upfront cost of purchasing a new refrigerator, you will recoup significant savings in the long run. Whenever you need to buy a new appliance, consider EnergyStar certified models, which use less energy and are cheaper to run. Remember, it doesn’t save energy if you relocate your existing refrigerator to the basement or garage and continue using it.</w:t>
+      </w:r>
+    </w:p>
+    <w:p>
+      <w:pPr>
+        <w:pStyle w:val="BodyText"/>
+      </w:pPr>
+      <w:r>
+        <w:rPr>
+          <w:b/>
+          <w:bCs/>
+        </w:rPr>
+        <w:t xml:space="preserve">Ideally, auditor locates similar volume fridge online to calculate monthly savings and payback period compared to kill-a-watt meter reading for current refrigerator. “This example refrigerator would save $XX in electricity each month and pay for itself within XX months</w:t>
+      </w:r>
+    </w:p>
+    <w:bookmarkEnd w:id="45"/>
+    <w:bookmarkStart w:id="46" w:name="induction-stoveoven"/>
+    <w:p>
+      <w:pPr>
+        <w:pStyle w:val="Heading3"/>
+      </w:pPr>
+      <w:r>
+        <w:t xml:space="preserve">4.5 Induction Stove/Oven</w:t>
+      </w:r>
+    </w:p>
+    <w:p>
+      <w:pPr>
+        <w:pStyle w:val="FirstParagraph"/>
       </w:pPr>
       <w:r>
         <w:rPr>
           <w:i/>
           <w:iCs/>
         </w:rPr>
-        <w:t xml:space="preserve">Recommendation</w:t>
-      </w:r>
-    </w:p>
-    <w:p>
-      <w:pPr>
-        <w:pStyle w:val="BodyText"/>
-      </w:pPr>
-      <w:r>
-        <w:t xml:space="preserve">Install high-efficiency shower heads to reduce the amount of water and energy to heat the water used when showering. We recommend 1.5 gallon per minute shower heads that will save a gallon or more of water for every minute spent in the shower.</w:t>
-      </w:r>
-      <w:r>
-        <w:t xml:space="preserve"> </w:t>
-      </w:r>
+        <w:t xml:space="preserve">Problem</w:t>
+      </w:r>
+    </w:p>
+    <w:p>
+      <w:pPr>
+        <w:pStyle w:val="BodyText"/>
+      </w:pPr>
+      <w:r>
+        <w:t xml:space="preserve">Your gas range has the potential to release propane, carbon monoxide, and combustion gases into your house. Gas ranges are also inefficient at transferring heat to your food at 32% efficiency, compared to 85% efficiency for induction cooktops.</w:t>
+      </w:r>
+    </w:p>
+    <w:p>
+      <w:pPr>
+        <w:pStyle w:val="BodyText"/>
+      </w:pPr>
       <w:r>
         <w:rPr>
           <w:i/>
           <w:iCs/>
         </w:rPr>
-        <w:t xml:space="preserve">Estimated Cost/Benefits/Incentives</w:t>
-      </w:r>
-    </w:p>
-    <w:p>
-      <w:pPr>
-        <w:pStyle w:val="BodyText"/>
-      </w:pPr>
-      <w:r>
-        <w:t xml:space="preserve">A typical family will save ~10,000 gallons of water per year and over $100 per year in water heating costs. We provide these for free; contact us for some if we did not give you any during the audit.</w:t>
-      </w:r>
-    </w:p>
-    <w:bookmarkEnd w:id="43"/>
-    <w:bookmarkStart w:id="44" w:name="window-dressers"/>
-    <w:p>
-      <w:pPr>
-        <w:pStyle w:val="Heading3"/>
-      </w:pPr>
-      <w:r>
-        <w:t xml:space="preserve">4.3 Window Dressers</w:t>
-      </w:r>
-    </w:p>
-    <w:p>
-      <w:pPr>
-        <w:pStyle w:val="FirstParagraph"/>
+        <w:t xml:space="preserve">Recommendation</w:t>
+      </w:r>
+    </w:p>
+    <w:p>
+      <w:pPr>
+        <w:pStyle w:val="BodyText"/>
+      </w:pPr>
+      <w:r>
+        <w:t xml:space="preserve">Induction cooking appliances are more efficient and safer than electric or gas ones. There is no risk of carbon monoxide or other harmful combustion gases, and the surface doesn’t heat up without a pot or pan on it.</w:t>
+      </w:r>
+    </w:p>
+    <w:p>
+      <w:pPr>
+        <w:pStyle w:val="BodyText"/>
       </w:pPr>
       <w:r>
         <w:rPr>
           <w:i/>
           <w:iCs/>
         </w:rPr>
-        <w:t xml:space="preserve">Problem</w:t>
-      </w:r>
-    </w:p>
-    <w:p>
-      <w:pPr>
-        <w:pStyle w:val="BodyText"/>
-      </w:pPr>
-      <w:r>
-        <w:t xml:space="preserve">Your windows are a source of heat loss, reduce your comfort due to cold surface temperatures, and may also cause moisture condensation or frost in the winter.</w:t>
-      </w:r>
-    </w:p>
-    <w:p>
-      <w:pPr>
-        <w:pStyle w:val="BodyText"/>
+        <w:t xml:space="preserve">Estimated Cost/Benefits/Incentives</w:t>
+      </w:r>
+    </w:p>
+    <w:p>
+      <w:pPr>
+        <w:pStyle w:val="BodyText"/>
+      </w:pPr>
+      <w:r>
+        <w:t xml:space="preserve">Currently, Efficiency Maine does not offer a rebate for induction stoves. If you’re interested in trying out induction cooking but don’t want to replace your kitchen stove, consider buying a portable induction cooktop, which costs less than $100.</w:t>
+      </w:r>
+    </w:p>
+    <w:bookmarkEnd w:id="46"/>
+    <w:bookmarkStart w:id="47" w:name="heat-pump-water-heater"/>
+    <w:p>
+      <w:pPr>
+        <w:pStyle w:val="Heading3"/>
+      </w:pPr>
+      <w:r>
+        <w:t xml:space="preserve">4.6 Heat Pump Water Heater</w:t>
+      </w:r>
+    </w:p>
+    <w:p>
+      <w:pPr>
+        <w:pStyle w:val="FirstParagraph"/>
       </w:pPr>
       <w:r>
         <w:rPr>
           <w:i/>
           <w:iCs/>
         </w:rPr>
-        <w:t xml:space="preserve">Recommendation</w:t>
-      </w:r>
-    </w:p>
-    <w:p>
-      <w:pPr>
-        <w:pStyle w:val="BodyText"/>
-      </w:pPr>
-      <w:r>
-        <w:t xml:space="preserve">WindowDressers are insulating window inserts that help air-seal windows and reduce heat loss and gain. WindowDressers are transparent and let in light while stopping drafts. Each insert is made of a custom-made pine frame wrapped on each side with tightly sealed, clear polyolefin film, creating an airspace between the two layers for additional insulation. The insert is finished with a compressible foam weather seal. The foam allows enough give for the inserts to be easily slid into place in the fall and removed in the spring while holding firmly enough to provide a tight, friction-based seal. The inserts are installed inside your existing window frame with no fasteners required and last 5-10 years. They are most effective in the winter, but depending on the window’s exposure, they can sometimes be used in the summer to keep the house cooler.</w:t>
-      </w:r>
-      <w:r>
-        <w:t xml:space="preserve"> </w:t>
-      </w:r>
+        <w:t xml:space="preserve">Problem</w:t>
+      </w:r>
+    </w:p>
+    <w:p>
+      <w:pPr>
+        <w:pStyle w:val="BodyText"/>
+      </w:pPr>
+      <w:r>
+        <w:rPr>
+          <w:b/>
+          <w:bCs/>
+        </w:rPr>
+        <w:t xml:space="preserve">Auditor to describe depending on what their current system is</w:t>
+      </w:r>
+    </w:p>
+    <w:p>
+      <w:pPr>
+        <w:pStyle w:val="BodyText"/>
+      </w:pPr>
       <w:r>
         <w:rPr>
           <w:i/>
           <w:iCs/>
         </w:rPr>
-        <w:t xml:space="preserve">Estimated Cost/Benefits/Incentives</w:t>
-      </w:r>
-    </w:p>
-    <w:p>
-      <w:pPr>
-        <w:pStyle w:val="BodyText"/>
-      </w:pPr>
-      <w:r>
-        <w:t xml:space="preserve">Insulating window inserts save 5-10% of your heating costs at less than 1/10th the cost of replacement windows. The overall project cost will depend on the number and size of window inserts. Example prices for the 2024 season were: small (20 x 36”) - $36 for natural pine frame, $46 for white; medium (30 x 52”) - $50 for natural pine frame, $64 for white; large (44 x 68”) - $67 for natural pine frame, $88 for white. Adjusted pricing for lower-income households is available from WindowDressers upon request. If plastic is damaged, it can be replaced for $15.</w:t>
-      </w:r>
-    </w:p>
-    <w:p>
-      <w:pPr>
-        <w:pStyle w:val="BodyText"/>
-      </w:pPr>
-      <w:r>
-        <w:t xml:space="preserve">Households that order inserts are expected to participate in the Community Build where the inserts are made. You can sign up for a 4-hour shift and learn the simple steps in the insert-building process (no previous experience required, no power tools). Each job has</w:t>
-      </w:r>
-      <w:r>
-        <w:t xml:space="preserve"> </w:t>
-      </w:r>
-      <w:r>
-        <w:t xml:space="preserve">“jigs”</w:t>
-      </w:r>
-      <w:r>
-        <w:t xml:space="preserve"> </w:t>
-      </w:r>
-      <w:r>
-        <w:t xml:space="preserve">that make the job easier to do and ensure uniform quality. You will be trained at the beginning of your shift on how to do your task. Volunteering for multiple shifts is encouraged! Mid-shift snacks and a meal are provided to all participants.</w:t>
-      </w:r>
-    </w:p>
-    <w:p>
-      <w:pPr>
-        <w:pStyle w:val="BodyText"/>
-      </w:pPr>
-      <w:r>
-        <w:t xml:space="preserve">If you would like to participate, please contact us so we can discuss how the program works and which windows you’d like inserts for.</w:t>
-      </w:r>
-    </w:p>
-    <w:bookmarkEnd w:id="44"/>
-    <w:bookmarkStart w:id="45" w:name="freezer"/>
-    <w:p>
-      <w:pPr>
-        <w:pStyle w:val="Heading3"/>
-      </w:pPr>
-      <w:r>
-        <w:t xml:space="preserve">4.4 Freezer</w:t>
-      </w:r>
-    </w:p>
-    <w:p>
-      <w:pPr>
-        <w:pStyle w:val="FirstParagraph"/>
+        <w:t xml:space="preserve">Recommendation</w:t>
+      </w:r>
+    </w:p>
+    <w:p>
+      <w:pPr>
+        <w:pStyle w:val="BodyText"/>
+      </w:pPr>
+      <w:r>
+        <w:t xml:space="preserve">Install a heat pump water heater to provide your hot water for cooking and bathing. This is the most efficient way to heat water and will save hundreds of dollars a year compared to electric resistance, heating oil, or propane hot water. It will also help to dehumidify while it’s running. If your current water heater burns oil or propane, this will also remove a source of combustion gases from your home. We also recommend setting the temperature on the water heater at 130°F for more efficient operation.</w:t>
+      </w:r>
+    </w:p>
+    <w:p>
+      <w:pPr>
+        <w:pStyle w:val="BodyText"/>
       </w:pPr>
       <w:r>
         <w:rPr>
           <w:i/>
           <w:iCs/>
         </w:rPr>
+        <w:t xml:space="preserve">Estimated Cost/Benefits/Incentives</w:t>
+      </w:r>
+    </w:p>
+    <w:p>
+      <w:pPr>
+        <w:pStyle w:val="BodyText"/>
+      </w:pPr>
+      <w:r>
+        <w:t xml:space="preserve">A heat pump water heater uses 70% less electricity than a standard electric water heater. Efficiency Maine offers a rebate of up to $950, making the equipment cost as little as $400 plus installation. The rebate can be combined with a nonrefundable federal tax credit of 30% of the remaining cost of the unit and labor, subject to an annual maximum benefit of $2,000 (shared with other energy property, like heat pumps). For more information, you can call Efficiency Maine at 866-376-2463 (Monday to Friday, 8:00 am to 5:00 pm) or visit their website: https://www.efficiencymaine.com/at-home/heat-pump-water-heater-program/</w:t>
+      </w:r>
+    </w:p>
+    <w:bookmarkEnd w:id="47"/>
+    <w:bookmarkStart w:id="48" w:name="gutters"/>
+    <w:p>
+      <w:pPr>
+        <w:pStyle w:val="Heading3"/>
+      </w:pPr>
+      <w:r>
+        <w:t xml:space="preserve">4.7 Gutters</w:t>
+      </w:r>
+    </w:p>
+    <w:p>
+      <w:pPr>
+        <w:pStyle w:val="FirstParagraph"/>
+      </w:pPr>
+      <w:r>
+        <w:rPr>
+          <w:i/>
+          <w:iCs/>
+        </w:rPr>
         <w:t xml:space="preserve">Problem</w:t>
       </w:r>
     </w:p>
@@ -4703,19 +4958,281 @@
         <w:pStyle w:val="BodyText"/>
       </w:pPr>
       <w:r>
-        <w:t xml:space="preserve">Your freezer uses more energy than newer models. Consider how the cost of running the freezer compares to the benefits of keeping it on.</w:t>
-      </w:r>
-    </w:p>
-    <w:p>
-      <w:pPr>
-        <w:pStyle w:val="BodyText"/>
-      </w:pPr>
+        <w:t xml:space="preserve">The house has no gutters, so water runs off your roof and directly onto the ground next to your house. Water that splashes off the ground can damage the exterior of your house. Runoff that is absorbed into the ground can seep into the basement/crawlspace, causing moisture issues there and throughout your house.</w:t>
+      </w:r>
+    </w:p>
+    <w:p>
+      <w:pPr>
+        <w:pStyle w:val="BodyText"/>
+      </w:pPr>
+      <w:r>
+        <w:rPr>
+          <w:i/>
+          <w:iCs/>
+        </w:rPr>
+        <w:t xml:space="preserve">Recommendation</w:t>
+      </w:r>
+    </w:p>
+    <w:p>
+      <w:pPr>
+        <w:pStyle w:val="BodyText"/>
+      </w:pPr>
+      <w:r>
+        <w:t xml:space="preserve">Install gutters and downspouts that divert water at least six feet away from the foundation and to where the ground slopes away from the house.</w:t>
+      </w:r>
+    </w:p>
+    <w:p>
+      <w:pPr>
+        <w:pStyle w:val="BodyText"/>
+      </w:pPr>
+      <w:r>
+        <w:rPr>
+          <w:i/>
+          <w:iCs/>
+        </w:rPr>
+        <w:t xml:space="preserve">Estimated Cost/Benefits/Incentives</w:t>
+      </w:r>
+    </w:p>
+    <w:p>
+      <w:pPr>
+        <w:pStyle w:val="BodyText"/>
+      </w:pPr>
+      <w:r>
+        <w:t xml:space="preserve">Adding gutters would mitigate moisture damage and save you from having to replace/fix other parts of the house.</w:t>
+      </w:r>
+    </w:p>
+    <w:bookmarkEnd w:id="48"/>
+    <w:bookmarkStart w:id="49" w:name="bathroom-exhaust-fans"/>
+    <w:p>
+      <w:pPr>
+        <w:pStyle w:val="Heading3"/>
+      </w:pPr>
+      <w:r>
+        <w:t xml:space="preserve">4.8 Bathroom exhaust fan(s)</w:t>
+      </w:r>
+    </w:p>
+    <w:p>
+      <w:pPr>
+        <w:pStyle w:val="FirstParagraph"/>
+      </w:pPr>
+      <w:r>
+        <w:rPr>
+          <w:i/>
+          <w:iCs/>
+        </w:rPr>
+        <w:t xml:space="preserve">Problem</w:t>
+      </w:r>
+    </w:p>
+    <w:p>
+      <w:pPr>
+        <w:pStyle w:val="BodyText"/>
+      </w:pPr>
+      <w:r>
+        <w:t xml:space="preserve">Currently, there is no bathroom exhaust fan, so moisture from the shower, toilet, and sink remains in the house, which can cause moisture issues such as mold.</w:t>
+      </w:r>
+    </w:p>
+    <w:p>
+      <w:pPr>
+        <w:pStyle w:val="BodyText"/>
+      </w:pPr>
+      <w:r>
+        <w:rPr>
+          <w:i/>
+          <w:iCs/>
+        </w:rPr>
+        <w:t xml:space="preserve">Recommendation</w:t>
+      </w:r>
+    </w:p>
+    <w:p>
+      <w:pPr>
+        <w:pStyle w:val="BodyText"/>
+      </w:pPr>
+      <w:r>
+        <w:t xml:space="preserve">Install bathroom exhaust fans in all bathrooms that do not have them. These should be rated for at least 80 cubic feet per minute (CFM) if there is a shower. We recommend the Panasonic Whisper series or similar fans that don’t create excess noise. If the ductwork will run through the attic, it should be installed before the attic is air-sealed and insulated. The fan needs to be ducted outside, so it does not add moisture into the attic.</w:t>
+      </w:r>
+    </w:p>
+    <w:p>
+      <w:pPr>
+        <w:pStyle w:val="BodyText"/>
+      </w:pPr>
+      <w:r>
+        <w:rPr>
+          <w:i/>
+          <w:iCs/>
+        </w:rPr>
+        <w:t xml:space="preserve">Estimated Cost/Benefits/Incentives</w:t>
+      </w:r>
+    </w:p>
+    <w:p>
+      <w:pPr>
+        <w:pStyle w:val="BodyText"/>
+      </w:pPr>
+      <w:r>
+        <w:t xml:space="preserve">The typical fan is around $130 plus the cost of installation.</w:t>
+      </w:r>
+    </w:p>
+    <w:bookmarkEnd w:id="49"/>
+    <w:bookmarkStart w:id="50" w:name="kitchen-exhaust-fans"/>
+    <w:p>
+      <w:pPr>
+        <w:pStyle w:val="Heading3"/>
+      </w:pPr>
+      <w:r>
+        <w:t xml:space="preserve">4.9 Kitchen exhaust fan(s)</w:t>
+      </w:r>
+    </w:p>
+    <w:p>
+      <w:pPr>
+        <w:pStyle w:val="FirstParagraph"/>
+      </w:pPr>
+      <w:r>
+        <w:rPr>
+          <w:i/>
+          <w:iCs/>
+        </w:rPr>
+        <w:t xml:space="preserve">Problem</w:t>
+      </w:r>
+    </w:p>
+    <w:p>
+      <w:pPr>
+        <w:pStyle w:val="BodyText"/>
+      </w:pPr>
+      <w:r>
+        <w:t xml:space="preserve">Currently, there is no kitchen exhaust fan, so fumes, smoke, and moisture from cooking stay in the house which can cause health concerns.</w:t>
+      </w:r>
+    </w:p>
+    <w:p>
+      <w:pPr>
+        <w:pStyle w:val="BodyText"/>
+      </w:pPr>
+      <w:r>
+        <w:rPr>
+          <w:i/>
+          <w:iCs/>
+        </w:rPr>
+        <w:t xml:space="preserve">Recommendation</w:t>
+      </w:r>
+    </w:p>
+    <w:p>
+      <w:pPr>
+        <w:pStyle w:val="BodyText"/>
+      </w:pPr>
+      <w:r>
+        <w:t xml:space="preserve">Install a kitchen exhaust fan to remove cooking fumes and moisture from your home. The fan should be rated for at least 100 cubic feet per minute. A kitchen fan should be ducted to the outdoors. If the ductwork will run through the attic, it should be installed before the attic is air-sealed and insulated.</w:t>
+      </w:r>
+    </w:p>
+    <w:p>
+      <w:pPr>
+        <w:pStyle w:val="BodyText"/>
+      </w:pPr>
+      <w:r>
+        <w:rPr>
+          <w:i/>
+          <w:iCs/>
+        </w:rPr>
+        <w:t xml:space="preserve">Estimated Cost/Benefits/Incentives</w:t>
+      </w:r>
+    </w:p>
+    <w:p>
+      <w:pPr>
+        <w:pStyle w:val="BodyText"/>
+      </w:pPr>
+      <w:r>
+        <w:t xml:space="preserve">Kitchen range hoods typically cost $150 or more; installation costs depend on the complexity of the exhaust ducting.</w:t>
+      </w:r>
+    </w:p>
+    <w:bookmarkEnd w:id="50"/>
+    <w:bookmarkStart w:id="51" w:name="vapor-barrier"/>
+    <w:p>
+      <w:pPr>
+        <w:pStyle w:val="Heading3"/>
+      </w:pPr>
+      <w:r>
+        <w:t xml:space="preserve">4.10 Vapor Barrier</w:t>
+      </w:r>
+    </w:p>
+    <w:p>
+      <w:pPr>
+        <w:pStyle w:val="FirstParagraph"/>
+      </w:pPr>
+      <w:r>
+        <w:rPr>
+          <w:i/>
+          <w:iCs/>
+        </w:rPr>
+        <w:t xml:space="preserve">Problem</w:t>
+      </w:r>
+    </w:p>
+    <w:p>
+      <w:pPr>
+        <w:pStyle w:val="BodyText"/>
+      </w:pPr>
+      <w:r>
+        <w:t xml:space="preserve">There is excess moisture in the basement/crawlspace, which is evaporating out of the ground. This moisture can enter the house and cause mold, mildew, rot, and air quality issues.</w:t>
+      </w:r>
+    </w:p>
+    <w:p>
+      <w:pPr>
+        <w:pStyle w:val="BodyText"/>
+      </w:pPr>
+      <w:r>
+        <w:rPr>
+          <w:i/>
+          <w:iCs/>
+        </w:rPr>
+        <w:t xml:space="preserve">Recommendation</w:t>
+      </w:r>
+    </w:p>
+    <w:p>
+      <w:pPr>
+        <w:pStyle w:val="BodyText"/>
+      </w:pPr>
+      <w:r>
+        <w:t xml:space="preserve">Install a vapor barrier on the</w:t>
+      </w:r>
+      <w:r>
+        <w:t xml:space="preserve"> </w:t>
+      </w:r>
       <w:r>
         <w:rPr>
           <w:b/>
           <w:bCs/>
         </w:rPr>
-        <w:t xml:space="preserve">Ideally, the auditor notes the annual energy consumption (kWh) of the existing freezer compared to a new model of similar size</w:t>
+        <w:t xml:space="preserve">basement / crawlspace</w:t>
+      </w:r>
+      <w:r>
+        <w:t xml:space="preserve"> </w:t>
+      </w:r>
+      <w:r>
+        <w:t xml:space="preserve">floor to stop moisture from entering the basement and house. Vapor barriers typically consist of either reinforced plastic sheeting or EPDM rubber membrane over a</w:t>
+      </w:r>
+      <w:r>
+        <w:t xml:space="preserve"> </w:t>
+      </w:r>
+      <w:r>
+        <w:t xml:space="preserve">‘dimple mat’</w:t>
+      </w:r>
+      <w:r>
+        <w:t xml:space="preserve"> </w:t>
+      </w:r>
+      <w:r>
+        <w:t xml:space="preserve">that allows for drainage below the vapor barrier and prevents rocks from puncturing it. If the</w:t>
+      </w:r>
+      <w:r>
+        <w:t xml:space="preserve"> </w:t>
+      </w:r>
+      <w:r>
+        <w:rPr>
+          <w:b/>
+          <w:bCs/>
+        </w:rPr>
+        <w:t xml:space="preserve">basement/crawlspace</w:t>
+      </w:r>
+      <w:r>
+        <w:t xml:space="preserve"> </w:t>
+      </w:r>
+      <w:r>
+        <w:t xml:space="preserve">walls are going to be spray foamed, we recommend the foam go all the way to the floor and overlap the vapor barrier to create a continuous air and moisture barrier.</w:t>
       </w:r>
     </w:p>
     <w:p>
@@ -4727,91 +5244,413 @@
           <w:i/>
           <w:iCs/>
         </w:rPr>
-        <w:t xml:space="preserve">Recommendation</w:t>
-      </w:r>
-    </w:p>
-    <w:p>
-      <w:pPr>
-        <w:pStyle w:val="BodyText"/>
-      </w:pPr>
-      <w:r>
-        <w:t xml:space="preserve">Replace your freezer with a new, EnergyStar certified freezer. Look at the Energy Guide label to compare the energy use of new freezers.</w:t>
-      </w:r>
-    </w:p>
-    <w:p>
-      <w:pPr>
-        <w:pStyle w:val="BodyText"/>
+        <w:t xml:space="preserve">Estimated Cost/Benefits/Incentives</w:t>
+      </w:r>
+    </w:p>
+    <w:p>
+      <w:pPr>
+        <w:pStyle w:val="BodyText"/>
+      </w:pPr>
+      <w:r>
+        <w:t xml:space="preserve">Insulation projects are not eligible for federal or state funding in second homes that are not heated year round.</w:t>
+      </w:r>
+    </w:p>
+    <w:bookmarkEnd w:id="51"/>
+    <w:bookmarkStart w:id="52" w:name="spray-foam-basement-walls"/>
+    <w:p>
+      <w:pPr>
+        <w:pStyle w:val="Heading3"/>
+      </w:pPr>
+      <w:r>
+        <w:t xml:space="preserve">4.11 Spray foam Basement Walls</w:t>
+      </w:r>
+    </w:p>
+    <w:p>
+      <w:pPr>
+        <w:pStyle w:val="FirstParagraph"/>
       </w:pPr>
       <w:r>
         <w:rPr>
           <w:i/>
           <w:iCs/>
         </w:rPr>
-        <w:t xml:space="preserve">Estimated Cost/Benefits/Incentives</w:t>
-      </w:r>
-    </w:p>
-    <w:p>
-      <w:pPr>
-        <w:pStyle w:val="BodyText"/>
-      </w:pPr>
-      <w:r>
-        <w:t xml:space="preserve">If you are able to afford the upfront cost of purchasing a new freezer, you will recoup significant savings in the long run. Whenever you need to buy a new appliance, consider EnergyStar certified models, which use electricity and are cheaper to run.</w:t>
-      </w:r>
-    </w:p>
-    <w:p>
-      <w:pPr>
-        <w:pStyle w:val="BodyText"/>
-      </w:pPr>
+        <w:t xml:space="preserve">Problem</w:t>
+      </w:r>
+    </w:p>
+    <w:p>
+      <w:pPr>
+        <w:pStyle w:val="BodyText"/>
+      </w:pPr>
+      <w:r>
+        <w:t xml:space="preserve">The basement/crawlspace is uninsulated and used for mechanical equipment and plumbing. The walls are porous and allow moisture into the house and rapidly conduct heat out of the space.</w:t>
+      </w:r>
+    </w:p>
+    <w:p>
+      <w:pPr>
+        <w:pStyle w:val="BodyText"/>
+      </w:pPr>
+      <w:r>
+        <w:rPr>
+          <w:i/>
+          <w:iCs/>
+        </w:rPr>
+        <w:t xml:space="preserve">Recommendation</w:t>
+      </w:r>
+    </w:p>
+    <w:p>
+      <w:pPr>
+        <w:pStyle w:val="BodyText"/>
+      </w:pPr>
+      <w:r>
+        <w:t xml:space="preserve">Install spray foam on the</w:t>
+      </w:r>
+      <w:r>
+        <w:t xml:space="preserve"> </w:t>
+      </w:r>
       <w:r>
         <w:rPr>
           <w:b/>
           <w:bCs/>
         </w:rPr>
-        <w:t xml:space="preserve">Ideally, auditor locates similar volume freezer online to calculate monthly savings and payback period compared to kill-a-watt meter reading for current freezer.</w:t>
+        <w:t xml:space="preserve">basement / crawlspace</w:t>
+      </w:r>
+      <w:r>
+        <w:t xml:space="preserve"> </w:t>
+      </w:r>
+      <w:r>
+        <w:t xml:space="preserve">walls to prevent moisture infiltration and reduce heat loss. In older homes, most heat loss is due to air leakage. Air sealing is particularly important in the</w:t>
+      </w:r>
+      <w:r>
+        <w:t xml:space="preserve"> </w:t>
       </w:r>
       <w:r>
         <w:rPr>
           <w:b/>
           <w:bCs/>
         </w:rPr>
+        <w:t xml:space="preserve">basement/crawlspace</w:t>
+      </w:r>
+      <w:r>
         <w:t xml:space="preserve"> </w:t>
       </w:r>
+      <w:r>
+        <w:t xml:space="preserve">(and attic). As warm air rises and leaks out the top of your home, cold air is pulled in at the bottom. This is called the</w:t>
+      </w:r>
+      <w:r>
+        <w:t xml:space="preserve"> </w:t>
+      </w:r>
+      <w:r>
+        <w:t xml:space="preserve">‘stack effect’</w:t>
+      </w:r>
+      <w:r>
+        <w:t xml:space="preserve">, and is more pronounced in taller homes. Thus, air sealing is necessary anywhere gaps allow air to move into your house through the basement/crawlspace.</w:t>
+      </w:r>
+    </w:p>
+    <w:p>
+      <w:pPr>
+        <w:pStyle w:val="BodyText"/>
+      </w:pPr>
+      <w:r>
+        <w:t xml:space="preserve">Spray foam should be applied 2-3 inches thick on the walls to seal and insulate them. It is often ideal to install a vapor barrier at the same time as the spray foam insulation. Spray foam generally requires a layer of intumescent (fire-rated) paint over it to meet fire code.</w:t>
+      </w:r>
+    </w:p>
+    <w:p>
+      <w:pPr>
+        <w:pStyle w:val="BodyText"/>
+      </w:pPr>
+      <w:r>
+        <w:rPr>
+          <w:i/>
+          <w:iCs/>
+        </w:rPr>
+        <w:t xml:space="preserve">Estimated Cost/Benefits/Incentives</w:t>
+      </w:r>
+    </w:p>
+    <w:p>
+      <w:pPr>
+        <w:pStyle w:val="BodyText"/>
+      </w:pPr>
+      <w:r>
+        <w:t xml:space="preserve">Insulation projects are not eligible for federal or state funding in second homes that are not heated year round.</w:t>
+      </w:r>
+    </w:p>
+    <w:bookmarkEnd w:id="52"/>
+    <w:bookmarkStart w:id="53" w:name="attic-insulation-and-air-sealing"/>
+    <w:p>
+      <w:pPr>
+        <w:pStyle w:val="Heading3"/>
+      </w:pPr>
+      <w:r>
+        <w:t xml:space="preserve">4.12 Attic Insulation and Air Sealing</w:t>
+      </w:r>
+    </w:p>
+    <w:p>
+      <w:pPr>
+        <w:pStyle w:val="FirstParagraph"/>
+      </w:pPr>
+      <w:r>
+        <w:rPr>
+          <w:i/>
+          <w:iCs/>
+        </w:rPr>
+        <w:t xml:space="preserve">Problem</w:t>
+      </w:r>
+    </w:p>
+    <w:p>
+      <w:pPr>
+        <w:pStyle w:val="BodyText"/>
+      </w:pPr>
+      <w:r>
+        <w:t xml:space="preserve">The attic is uninsulated or is missing insulation and the attic could also benefit from air-sealing. These upgrades will reduce draftiness and heat loss in the winter and heat gain in the summer.</w:t>
+      </w:r>
+    </w:p>
+    <w:p>
+      <w:pPr>
+        <w:pStyle w:val="BodyText"/>
+      </w:pPr>
+      <w:r>
+        <w:rPr>
+          <w:i/>
+          <w:iCs/>
+        </w:rPr>
+        <w:t xml:space="preserve">Recommendation</w:t>
+      </w:r>
+    </w:p>
+    <w:p>
+      <w:pPr>
+        <w:pStyle w:val="BodyText"/>
+      </w:pPr>
+      <w:r>
+        <w:t xml:space="preserve">Air seal the attic and insulate it to at least R-60 (18 inches of loose-fill cellulose insulation). COA has been installing 24 inches (R-80) of cellulose insulation in attics on our campus. Before the attic is insulated, ensure that any needed bathroom and kitchen fans are installed and that all fans are properly vented to the outside.</w:t>
+      </w:r>
+    </w:p>
+    <w:p>
+      <w:pPr>
+        <w:pStyle w:val="BodyText"/>
+      </w:pPr>
+      <w:r>
+        <w:t xml:space="preserve">In older homes, most heat loss is due to air leakage. Air sealing is particularly important in the attic (and basement or crawlspace). As warm air rises and leaks out the top of your home, cold air is pulled in at the bottom. This is called the</w:t>
+      </w:r>
+      <w:r>
+        <w:t xml:space="preserve"> </w:t>
+      </w:r>
+      <w:r>
+        <w:t xml:space="preserve">‘stack effect’</w:t>
+      </w:r>
+      <w:r>
+        <w:t xml:space="preserve">, and is more pronounced in taller homes. Thus, air sealing is necessary anywhere gaps allow air to move between your house and the attic. This typically includes gaps around the chimney, electrical penetrations, and wall top plates.</w:t>
+      </w:r>
+    </w:p>
+    <w:p>
+      <w:pPr>
+        <w:pStyle w:val="BodyText"/>
+      </w:pPr>
+      <w:r>
+        <w:rPr>
+          <w:i/>
+          <w:iCs/>
+        </w:rPr>
+        <w:t xml:space="preserve">Estimated Cost/Benefits/Incentives</w:t>
+      </w:r>
+    </w:p>
+    <w:p>
+      <w:pPr>
+        <w:pStyle w:val="BodyText"/>
+      </w:pPr>
+      <w:r>
+        <w:t xml:space="preserve">Insulation projects are not eligible for federal or state funding in second homes that are not heated year round.</w:t>
+      </w:r>
+    </w:p>
+    <w:bookmarkEnd w:id="53"/>
+    <w:bookmarkStart w:id="54" w:name="blow-in-cellulose-wall-insulation"/>
+    <w:p>
+      <w:pPr>
+        <w:pStyle w:val="Heading3"/>
+      </w:pPr>
+      <w:r>
+        <w:t xml:space="preserve">4.13 Blow-in cellulose wall insulation</w:t>
+      </w:r>
+    </w:p>
+    <w:p>
+      <w:pPr>
+        <w:pStyle w:val="FirstParagraph"/>
+      </w:pPr>
+      <w:r>
+        <w:rPr>
+          <w:i/>
+          <w:iCs/>
+        </w:rPr>
+        <w:t xml:space="preserve">Problem</w:t>
+      </w:r>
+    </w:p>
+    <w:p>
+      <w:pPr>
+        <w:pStyle w:val="BodyText"/>
+      </w:pPr>
+      <w:r>
+        <w:t xml:space="preserve">The walls of the house are uninsulated, which is a significant source of heat loss.</w:t>
+      </w:r>
+    </w:p>
+    <w:p>
+      <w:pPr>
+        <w:pStyle w:val="BodyText"/>
+      </w:pPr>
+      <w:r>
+        <w:rPr>
+          <w:i/>
+          <w:iCs/>
+        </w:rPr>
+        <w:t xml:space="preserve">Recommendation</w:t>
+      </w:r>
+    </w:p>
+    <w:p>
+      <w:pPr>
+        <w:pStyle w:val="BodyText"/>
+      </w:pPr>
+      <w:r>
+        <w:t xml:space="preserve">Insulate the wall stud cavities with dense packed, blown-in cellulose insulation. In balloon-framed homes, this can often be done from the attic, otherwise it can be done by drilling holes into the wall cavities from either the inside or outside.</w:t>
+      </w:r>
+      <w:r>
+        <w:t xml:space="preserve"> </w:t>
+      </w:r>
+      <w:r>
+        <w:rPr>
+          <w:i/>
+          <w:iCs/>
+        </w:rPr>
+        <w:t xml:space="preserve">Estimated Cost/Benefits/Incentives</w:t>
+      </w:r>
+    </w:p>
+    <w:p>
+      <w:pPr>
+        <w:pStyle w:val="BodyText"/>
+      </w:pPr>
+      <w:r>
+        <w:t xml:space="preserve">Insulation projects are not eligible for federal or state funding in second homes that are not heated year round.</w:t>
+      </w:r>
+    </w:p>
+    <w:bookmarkEnd w:id="54"/>
+    <w:bookmarkStart w:id="55" w:name="continuous-exterior-wall-insulation"/>
+    <w:p>
+      <w:pPr>
+        <w:pStyle w:val="Heading3"/>
+      </w:pPr>
+      <w:r>
+        <w:t xml:space="preserve">4.14 Continuous exterior wall insulation</w:t>
+      </w:r>
+    </w:p>
+    <w:p>
+      <w:pPr>
+        <w:pStyle w:val="FirstParagraph"/>
+      </w:pPr>
+      <w:r>
+        <w:rPr>
+          <w:i/>
+          <w:iCs/>
+        </w:rPr>
+        <w:t xml:space="preserve">Problem</w:t>
+      </w:r>
+    </w:p>
+    <w:p>
+      <w:pPr>
+        <w:pStyle w:val="BodyText"/>
+      </w:pPr>
+      <w:r>
+        <w:t xml:space="preserve">There isn’t continuous insulation between the siding and the exterior walls of the house. Continuous insulation helps create a complete thermal boundary for your house, and it is now an energy code requirement for new houses.</w:t>
+      </w:r>
+    </w:p>
+    <w:p>
+      <w:pPr>
+        <w:pStyle w:val="BodyText"/>
+      </w:pPr>
+      <w:r>
+        <w:rPr>
+          <w:i/>
+          <w:iCs/>
+        </w:rPr>
+        <w:t xml:space="preserve">Recommendation</w:t>
+      </w:r>
+    </w:p>
+    <w:p>
+      <w:pPr>
+        <w:pStyle w:val="BodyText"/>
+      </w:pPr>
+      <w:r>
+        <w:t xml:space="preserve">Add a continuous layer of insulation and potentially replace the air and moisture barrier once it becomes time to replace the siding. Add continuous insulation (R-6 or more) under the new siding to keep the house warmer in the winter and cooler in the summer. We recommend TimberHP TimberBoard insulation (produced in Madison, Maine) or Rockwool Comfortboard, but foam board can also be used. Before installing exterior insulation, the contractor can check if insulation is needed between the interior wall studs.</w:t>
+      </w:r>
+    </w:p>
+    <w:p>
+      <w:pPr>
+        <w:pStyle w:val="BodyText"/>
+      </w:pPr>
+      <w:r>
+        <w:rPr>
+          <w:i/>
+          <w:iCs/>
+        </w:rPr>
+        <w:t xml:space="preserve">Estimated Cost/Benefits/Incentives</w:t>
+      </w:r>
+    </w:p>
+    <w:p>
+      <w:pPr>
+        <w:pStyle w:val="BodyText"/>
+      </w:pPr>
+      <w:r>
+        <w:t xml:space="preserve">Insulation projects are not eligible for federal or state funding in second homes that are not heated year round.</w:t>
+      </w:r>
+    </w:p>
+    <w:bookmarkEnd w:id="55"/>
+    <w:bookmarkStart w:id="56" w:name="electrical-panel-upgrade"/>
+    <w:p>
+      <w:pPr>
+        <w:pStyle w:val="Heading3"/>
+      </w:pPr>
+      <w:r>
+        <w:t xml:space="preserve">4.15 Electrical Panel Upgrade</w:t>
+      </w:r>
+    </w:p>
+    <w:p>
+      <w:pPr>
+        <w:pStyle w:val="FirstParagraph"/>
+      </w:pPr>
+      <w:r>
+        <w:rPr>
+          <w:i/>
+          <w:iCs/>
+        </w:rPr>
+        <w:t xml:space="preserve">Problem</w:t>
+      </w:r>
+    </w:p>
+    <w:p>
+      <w:pPr>
+        <w:pStyle w:val="BodyText"/>
+      </w:pPr>
       <w:r>
         <w:rPr>
           <w:b/>
           <w:bCs/>
         </w:rPr>
-        <w:t xml:space="preserve">“This example freezer would save $XX in electricity each month and pay for itself within XX months.”</w:t>
-      </w:r>
-    </w:p>
-    <w:bookmarkEnd w:id="45"/>
-    <w:bookmarkStart w:id="46" w:name="induction-stoveoven"/>
-    <w:p>
-      <w:pPr>
-        <w:pStyle w:val="Heading3"/>
-      </w:pPr>
-      <w:r>
-        <w:t xml:space="preserve">4.5 Induction Stove/Oven</w:t>
-      </w:r>
-    </w:p>
-    <w:p>
-      <w:pPr>
-        <w:pStyle w:val="FirstParagraph"/>
+        <w:t xml:space="preserve">Auditor to describe</w:t>
+      </w:r>
+    </w:p>
+    <w:p>
+      <w:pPr>
+        <w:pStyle w:val="BodyText"/>
       </w:pPr>
       <w:r>
         <w:rPr>
           <w:i/>
           <w:iCs/>
         </w:rPr>
-        <w:t xml:space="preserve">Problem</w:t>
-      </w:r>
-    </w:p>
-    <w:p>
-      <w:pPr>
-        <w:pStyle w:val="BodyText"/>
-      </w:pPr>
-      <w:r>
-        <w:t xml:space="preserve">Your gas range has the potential to release propane, carbon monoxide, and combustion gases into your house. Gas ranges are also inefficient at transferring heat to your food at 32% efficiency, compared to 85% efficiency for induction cooktops.</w:t>
+        <w:t xml:space="preserve">Recommendation</w:t>
+      </w:r>
+    </w:p>
+    <w:p>
+      <w:pPr>
+        <w:pStyle w:val="BodyText"/>
+      </w:pPr>
+      <w:r>
+        <w:t xml:space="preserve">Consult with an electrician about replacing your existing electrical panel with a 200 amp panel as you add electrical appliances to your home. It may become necessary to increase the capacity to address potential safety hazards. An electrician can determine whether or not a panel upgrade is necessary based on your current and anticipated usage.</w:t>
       </w:r>
     </w:p>
     <w:p>
@@ -4823,65 +5662,65 @@
           <w:i/>
           <w:iCs/>
         </w:rPr>
-        <w:t xml:space="preserve">Recommendation</w:t>
-      </w:r>
-    </w:p>
-    <w:p>
-      <w:pPr>
-        <w:pStyle w:val="BodyText"/>
-      </w:pPr>
-      <w:r>
-        <w:t xml:space="preserve">Induction cooking appliances are more efficient and safer than electric or gas ones. There is no risk of carbon monoxide or other harmful combustion gases, and the surface doesn’t heat up without a pot or pan on it.</w:t>
-      </w:r>
-    </w:p>
-    <w:p>
-      <w:pPr>
-        <w:pStyle w:val="BodyText"/>
+        <w:t xml:space="preserve">Estimated Cost/Benefits/Incentives</w:t>
+      </w:r>
+    </w:p>
+    <w:p>
+      <w:pPr>
+        <w:pStyle w:val="BodyText"/>
+      </w:pPr>
+      <w:r>
+        <w:t xml:space="preserve">Costs of electrical components needed to support residential energy upgrades – including panels, sub-panels, branch circuits, and feeders – qualify for a 30% nonrefundable tax credit (up to $600 per item) if they have a capacity of 200 amps or more. An electrical panel upgrades also provides a good opportunity for an electrician to install whole-house surge protection, which costs $100-$400. Here are some options: https://www.popularmechanics.com/home/interior-projects/g43140886/best-whole-house-surge-protectors/</w:t>
+      </w:r>
+    </w:p>
+    <w:bookmarkEnd w:id="56"/>
+    <w:bookmarkStart w:id="57" w:name="air-source-heat-pump"/>
+    <w:p>
+      <w:pPr>
+        <w:pStyle w:val="Heading3"/>
+      </w:pPr>
+      <w:r>
+        <w:t xml:space="preserve">4.16 Air Source Heat Pump</w:t>
+      </w:r>
+    </w:p>
+    <w:p>
+      <w:pPr>
+        <w:pStyle w:val="FirstParagraph"/>
       </w:pPr>
       <w:r>
         <w:rPr>
           <w:i/>
           <w:iCs/>
         </w:rPr>
-        <w:t xml:space="preserve">Estimated Cost/Benefits/Incentives</w:t>
-      </w:r>
-    </w:p>
-    <w:p>
-      <w:pPr>
-        <w:pStyle w:val="BodyText"/>
-      </w:pPr>
-      <w:r>
-        <w:t xml:space="preserve">Currently, Efficiency Maine does not offer a rebate for induction stoves. If you’re interested in trying out induction cooking but don’t want to replace your kitchen stove, consider buying a portable induction cooktop, which costs less than $100.</w:t>
-      </w:r>
-    </w:p>
-    <w:bookmarkEnd w:id="46"/>
-    <w:bookmarkStart w:id="47" w:name="bathroom-exhaust-fans"/>
-    <w:p>
-      <w:pPr>
-        <w:pStyle w:val="Heading3"/>
-      </w:pPr>
-      <w:r>
-        <w:t xml:space="preserve">4.6 Bathroom exhaust fan(s)</w:t>
-      </w:r>
-    </w:p>
-    <w:p>
-      <w:pPr>
-        <w:pStyle w:val="FirstParagraph"/>
+        <w:t xml:space="preserve">Problem</w:t>
+      </w:r>
+    </w:p>
+    <w:p>
+      <w:pPr>
+        <w:pStyle w:val="BodyText"/>
+      </w:pPr>
+      <w:r>
+        <w:t xml:space="preserve">Combustion heating equipment is expensive, inefficient, and has the potential to release harmful combustion gases like carbon monoxide into the home.</w:t>
+      </w:r>
+    </w:p>
+    <w:p>
+      <w:pPr>
+        <w:pStyle w:val="BodyText"/>
       </w:pPr>
       <w:r>
         <w:rPr>
           <w:i/>
           <w:iCs/>
         </w:rPr>
-        <w:t xml:space="preserve">Problem</w:t>
-      </w:r>
-    </w:p>
-    <w:p>
-      <w:pPr>
-        <w:pStyle w:val="BodyText"/>
-      </w:pPr>
-      <w:r>
-        <w:t xml:space="preserve">Currently, there is no bathroom exhaust fan, so moisture from the shower, toilet, and sink remains in the house, which can cause moisture issues such as mold.</w:t>
+        <w:t xml:space="preserve">Recommendation</w:t>
+      </w:r>
+    </w:p>
+    <w:p>
+      <w:pPr>
+        <w:pStyle w:val="BodyText"/>
+      </w:pPr>
+      <w:r>
+        <w:t xml:space="preserve">Install air source heat pumps for heating and cooling and whole-house surge protection. Air source heat pumps can be up to 300% efficient and heat, cool, and dehumidify your house. A qualified installer will help determine what size system to install and where. Whole-house surge protection will protect your appliances and heat pumps from being damaged by an electrical surge.</w:t>
       </w:r>
     </w:p>
     <w:p>
@@ -4893,65 +5732,69 @@
           <w:i/>
           <w:iCs/>
         </w:rPr>
-        <w:t xml:space="preserve">Recommendation</w:t>
-      </w:r>
-    </w:p>
-    <w:p>
-      <w:pPr>
-        <w:pStyle w:val="BodyText"/>
-      </w:pPr>
-      <w:r>
-        <w:t xml:space="preserve">Install bathroom exhaust fans in all bathrooms that do not have them. These should be rated for at least 80 cubic feet per minute (CFM) if there is a shower. We recommend the Panasonic Whisper series or similar fans that don’t create excess noise. If the ductwork will run through the attic, it should be installed before the attic is air-sealed and insulated. The fan needs to be ducted outside, so it does not add moisture into the attic.</w:t>
-      </w:r>
-    </w:p>
-    <w:p>
-      <w:pPr>
-        <w:pStyle w:val="BodyText"/>
+        <w:t xml:space="preserve">Estimated Cost/Benefits/Incentives</w:t>
+      </w:r>
+    </w:p>
+    <w:p>
+      <w:pPr>
+        <w:pStyle w:val="BodyText"/>
+      </w:pPr>
+      <w:r>
+        <w:t xml:space="preserve">Efficiency Maine rebates can fund $1,000 per unit up to a lifetime limit per housing unit for $3,000 (depending on income level) to install heat pumps in second homes. The rebate can be combined with a nonrefundable federal tax credit of 30% of the remaining cost of the unit and labor, subject to an annual maximum benefit of $2,000 (shared with other energy property, like a heat pump water heater). You can call Efficiency Maine at 866-376-2463 (Monday to Friday, 8:00 am to 5:00 pm) or visit their website: https://www.efficiencymaine.com/at-home/residential-heat-pump-incentives/</w:t>
+      </w:r>
+    </w:p>
+    <w:bookmarkEnd w:id="57"/>
+    <w:bookmarkStart w:id="58" w:name="solar"/>
+    <w:p>
+      <w:pPr>
+        <w:pStyle w:val="Heading3"/>
+      </w:pPr>
+      <w:r>
+        <w:t xml:space="preserve">4.17 Solar</w:t>
+      </w:r>
+    </w:p>
+    <w:p>
+      <w:pPr>
+        <w:pStyle w:val="FirstParagraph"/>
       </w:pPr>
       <w:r>
         <w:rPr>
           <w:i/>
           <w:iCs/>
         </w:rPr>
-        <w:t xml:space="preserve">Estimated Cost/Benefits/Incentives</w:t>
-      </w:r>
-    </w:p>
-    <w:p>
-      <w:pPr>
-        <w:pStyle w:val="BodyText"/>
-      </w:pPr>
-      <w:r>
-        <w:t xml:space="preserve">The typical fan is around $130 plus the cost of installation.</w:t>
-      </w:r>
-    </w:p>
-    <w:bookmarkEnd w:id="47"/>
-    <w:bookmarkStart w:id="48" w:name="kitchen-exhaust-fans"/>
-    <w:p>
-      <w:pPr>
-        <w:pStyle w:val="Heading3"/>
-      </w:pPr>
-      <w:r>
-        <w:t xml:space="preserve">4.7 Kitchen exhaust fan(s)</w:t>
-      </w:r>
-    </w:p>
-    <w:p>
-      <w:pPr>
-        <w:pStyle w:val="FirstParagraph"/>
+        <w:t xml:space="preserve">Problem</w:t>
+      </w:r>
+    </w:p>
+    <w:p>
+      <w:pPr>
+        <w:pStyle w:val="BodyText"/>
+      </w:pPr>
+      <w:r>
+        <w:rPr>
+          <w:b/>
+          <w:bCs/>
+        </w:rPr>
+        <w:t xml:space="preserve">Auditor to describe (or remove this section)</w:t>
+      </w:r>
+    </w:p>
+    <w:p>
+      <w:pPr>
+        <w:pStyle w:val="BodyText"/>
       </w:pPr>
       <w:r>
         <w:rPr>
           <w:i/>
           <w:iCs/>
         </w:rPr>
-        <w:t xml:space="preserve">Problem</w:t>
-      </w:r>
-    </w:p>
-    <w:p>
-      <w:pPr>
-        <w:pStyle w:val="BodyText"/>
-      </w:pPr>
-      <w:r>
-        <w:t xml:space="preserve">Currently, there is no kitchen exhaust fan, so fumes, smoke, and moisture from cooking stay in the house which can cause health concerns.</w:t>
+        <w:t xml:space="preserve">Recommendation</w:t>
+      </w:r>
+    </w:p>
+    <w:p>
+      <w:pPr>
+        <w:pStyle w:val="BodyText"/>
+      </w:pPr>
+      <w:r>
+        <w:t xml:space="preserve">Rooftop solar can supply most or all of your home electrical demands. Contact a solar company for pricing and details specific to your home.</w:t>
       </w:r>
     </w:p>
     <w:p>
@@ -4963,65 +5806,78 @@
           <w:i/>
           <w:iCs/>
         </w:rPr>
-        <w:t xml:space="preserve">Recommendation</w:t>
-      </w:r>
-    </w:p>
-    <w:p>
-      <w:pPr>
-        <w:pStyle w:val="BodyText"/>
-      </w:pPr>
-      <w:r>
-        <w:t xml:space="preserve">Install a kitchen exhaust fan to remove cooking fumes and moisture from your home. The fan should be rated for at least 100 cubic feet per minute. A kitchen fan should be ducted to the outdoors. If the ductwork will run through the attic, it should be installed before the attic is air-sealed and insulated.</w:t>
-      </w:r>
-    </w:p>
-    <w:p>
-      <w:pPr>
-        <w:pStyle w:val="BodyText"/>
+        <w:t xml:space="preserve">Estimated Cost/Benefits/Incentives</w:t>
+      </w:r>
+    </w:p>
+    <w:p>
+      <w:pPr>
+        <w:pStyle w:val="BodyText"/>
+      </w:pPr>
+      <w:r>
+        <w:t xml:space="preserve">There is a 30% nonrefundable federal tax credit if you don’t rent your second home to others. Financing options are available. Battery backup is needed for solar to work during a power outage. Information on the federal tax credit: https://www.energy.gov/sites/default/files/2023-03/Homeowners_Guide_to_the_Federal_Tax_Credit_for_Solar_PV.pdf.</w:t>
+      </w:r>
+    </w:p>
+    <w:bookmarkEnd w:id="58"/>
+    <w:bookmarkStart w:id="59" w:name="pipe-insulation"/>
+    <w:p>
+      <w:pPr>
+        <w:pStyle w:val="Heading3"/>
+      </w:pPr>
+      <w:r>
+        <w:t xml:space="preserve">4.18 Pipe Insulation</w:t>
+      </w:r>
+    </w:p>
+    <w:p>
+      <w:pPr>
+        <w:pStyle w:val="FirstParagraph"/>
       </w:pPr>
       <w:r>
         <w:rPr>
           <w:i/>
           <w:iCs/>
         </w:rPr>
-        <w:t xml:space="preserve">Estimated Cost/Benefits/Incentives</w:t>
-      </w:r>
-    </w:p>
-    <w:p>
-      <w:pPr>
-        <w:pStyle w:val="BodyText"/>
-      </w:pPr>
-      <w:r>
-        <w:t xml:space="preserve">Kitchen range hoods typically cost $150 or more; installation costs depend on the complexity of the exhaust ducting.</w:t>
-      </w:r>
-    </w:p>
-    <w:bookmarkEnd w:id="48"/>
-    <w:bookmarkStart w:id="49" w:name="vapor-barrier"/>
-    <w:p>
-      <w:pPr>
-        <w:pStyle w:val="Heading3"/>
-      </w:pPr>
-      <w:r>
-        <w:t xml:space="preserve">4.8 Vapor Barrier</w:t>
-      </w:r>
-    </w:p>
-    <w:p>
-      <w:pPr>
-        <w:pStyle w:val="FirstParagraph"/>
+        <w:t xml:space="preserve">Problem</w:t>
+      </w:r>
+    </w:p>
+    <w:p>
+      <w:pPr>
+        <w:pStyle w:val="BodyText"/>
+      </w:pPr>
+      <w:r>
+        <w:t xml:space="preserve">Uninsulated water pipes are responsible for heat loss and excess moisture (from condensation) in your basement/crawlspace.</w:t>
+      </w:r>
+    </w:p>
+    <w:p>
+      <w:pPr>
+        <w:pStyle w:val="BodyText"/>
       </w:pPr>
       <w:r>
         <w:rPr>
           <w:i/>
           <w:iCs/>
         </w:rPr>
-        <w:t xml:space="preserve">Problem</w:t>
-      </w:r>
-    </w:p>
-    <w:p>
-      <w:pPr>
-        <w:pStyle w:val="BodyText"/>
-      </w:pPr>
-      <w:r>
-        <w:t xml:space="preserve">There is excess moisture in the basement/crawlspace, which is evaporating out of the ground. This moisture can enter the house and cause mold, mildew, rot, and air quality issues.</w:t>
+        <w:t xml:space="preserve">Recommendation</w:t>
+      </w:r>
+    </w:p>
+    <w:p>
+      <w:pPr>
+        <w:pStyle w:val="BodyText"/>
+      </w:pPr>
+      <w:r>
+        <w:t xml:space="preserve">Insulate both hot and cold water pipes that are uninsulated in the</w:t>
+      </w:r>
+      <w:r>
+        <w:t xml:space="preserve"> </w:t>
+      </w:r>
+      <w:r>
+        <w:rPr>
+          <w:b/>
+          <w:bCs/>
+        </w:rPr>
+        <w:t xml:space="preserve">basement / crawlspace</w:t>
+      </w:r>
+      <w:r>
+        <w:t xml:space="preserve">. This will save energy and prevent condensation. We recommend foam pipe insulation made of polyethylene or neoprene.</w:t>
       </w:r>
     </w:p>
     <w:p>
@@ -5033,231 +5889,180 @@
           <w:i/>
           <w:iCs/>
         </w:rPr>
-        <w:t xml:space="preserve">Recommendation</w:t>
-      </w:r>
-    </w:p>
-    <w:p>
-      <w:pPr>
-        <w:pStyle w:val="BodyText"/>
-      </w:pPr>
-      <w:r>
-        <w:t xml:space="preserve">Install a vapor barrier on the basement floor to stop moisture from entering the basement and house. Vapor barriers typically consist of either reinforced plastic sheeting or EPDM rubber membrane over a</w:t>
-      </w:r>
-      <w:r>
-        <w:t xml:space="preserve"> </w:t>
-      </w:r>
-      <w:r>
-        <w:t xml:space="preserve">‘dimple mat’</w:t>
-      </w:r>
-      <w:r>
-        <w:t xml:space="preserve"> </w:t>
-      </w:r>
-      <w:r>
-        <w:t xml:space="preserve">that allows for drainage below the vapor barrier and prevents rocks from puncturing it. If the basement/crawlspace walls are going to be spray foamed, we recommend the foam go all the way to the floor and overlap the vapor barrier to create a continuous air and moisture barrier.</w:t>
-      </w:r>
-    </w:p>
-    <w:p>
-      <w:pPr>
-        <w:pStyle w:val="BodyText"/>
+        <w:t xml:space="preserve">Estimated Cost/Benefits/Incentives</w:t>
+      </w:r>
+    </w:p>
+    <w:p>
+      <w:pPr>
+        <w:pStyle w:val="BodyText"/>
+      </w:pPr>
+      <w:r>
+        <w:t xml:space="preserve">Insulating water pipes can save 2%-4% on hot water bills and increase the temperature of the water while reducing the time it takes for hot water to reach your tap. Materials cost around $100-200, depending on the length of pipe to insulate. Many people find this to be an easy project to do themselves.</w:t>
+      </w:r>
+    </w:p>
+    <w:bookmarkEnd w:id="59"/>
+    <w:bookmarkStart w:id="60" w:name="whole-house-surge-protection"/>
+    <w:p>
+      <w:pPr>
+        <w:pStyle w:val="Heading3"/>
+      </w:pPr>
+      <w:r>
+        <w:t xml:space="preserve">4.19 Whole House Surge Protection</w:t>
+      </w:r>
+    </w:p>
+    <w:p>
+      <w:pPr>
+        <w:pStyle w:val="FirstParagraph"/>
       </w:pPr>
       <w:r>
         <w:rPr>
           <w:i/>
           <w:iCs/>
         </w:rPr>
-        <w:t xml:space="preserve">Estimated Cost/Benefits/Incentives</w:t>
-      </w:r>
-    </w:p>
-    <w:p>
-      <w:pPr>
-        <w:pStyle w:val="BodyText"/>
-      </w:pPr>
-      <w:r>
-        <w:t xml:space="preserve">Efficiency Maine rebates will cover vapor barriers up to 25% of a weatherization project cost, if done as part of a larger insulation project. Most insulation companies can install spray foam and vapor barriers together. Efficiency Maine rebates and other incentives for insulation work can fund up to 80% of the overall cost to weatherize your home (subject to a lifetime limit per building), up to $9,200 when combined with nonrefundable federal tax credits. You can call them at 866-376-2463 (Monday to Friday, 8:00 am to 5:00 pm) or visit their webpage about insulation rebates: https://www.efficiencymaine.com/at-home/insulation-rebates/</w:t>
-      </w:r>
-    </w:p>
-    <w:bookmarkEnd w:id="49"/>
-    <w:bookmarkStart w:id="50" w:name="spray-foam-basement-walls"/>
-    <w:p>
-      <w:pPr>
-        <w:pStyle w:val="Heading3"/>
-      </w:pPr>
-      <w:r>
-        <w:t xml:space="preserve">4.9 Spray foam Basement Walls</w:t>
-      </w:r>
-    </w:p>
-    <w:p>
-      <w:pPr>
-        <w:pStyle w:val="FirstParagraph"/>
+        <w:t xml:space="preserve">Problem</w:t>
+      </w:r>
+    </w:p>
+    <w:p>
+      <w:pPr>
+        <w:pStyle w:val="BodyText"/>
+      </w:pPr>
+      <w:r>
+        <w:t xml:space="preserve">Your house does not have whole-house surge protection. This will protect your large electrical appliances from damage in the case of an electrical surge. Heat pumps, heat pump water heaters, and other electronics are particularly sensitive to electrical surges.</w:t>
+      </w:r>
+    </w:p>
+    <w:p>
+      <w:pPr>
+        <w:pStyle w:val="BodyText"/>
       </w:pPr>
       <w:r>
         <w:rPr>
           <w:i/>
           <w:iCs/>
         </w:rPr>
-        <w:t xml:space="preserve">Problem</w:t>
-      </w:r>
-    </w:p>
-    <w:p>
-      <w:pPr>
-        <w:pStyle w:val="BodyText"/>
-      </w:pPr>
-      <w:r>
-        <w:t xml:space="preserve">The basement/crawlspace is uninsulated and used for mechanical equipment and plumbing. The walls are porous and allow moisture into the house and rapidly conduct heat out of the space.</w:t>
-      </w:r>
-    </w:p>
-    <w:p>
-      <w:pPr>
-        <w:pStyle w:val="BodyText"/>
-      </w:pPr>
+        <w:t xml:space="preserve">Recommendation</w:t>
+      </w:r>
+    </w:p>
+    <w:p>
+      <w:pPr>
+        <w:pStyle w:val="BodyText"/>
+      </w:pPr>
+      <w:r>
+        <w:t xml:space="preserve">Seal easy-to-access air leaks and weatherstrip exterior doors. In older homes, most heat loss is due to air leakage. WindowDressers insulating window inserts can also help reduce air leakage.</w:t>
+      </w:r>
+      <w:r>
+        <w:t xml:space="preserve"> </w:t>
+      </w:r>
       <w:r>
         <w:rPr>
           <w:i/>
           <w:iCs/>
         </w:rPr>
-        <w:t xml:space="preserve">Recommendation</w:t>
-      </w:r>
-    </w:p>
-    <w:p>
-      <w:pPr>
-        <w:pStyle w:val="BodyText"/>
-      </w:pPr>
-      <w:r>
-        <w:t xml:space="preserve">Install spray foam on the basement/crawlspace walls to prevent moisture infiltration and reduce heat loss. In older homes, most heat loss is due to air leakage. Air sealing is particularly important in the basement or crawlspace (and attic). As warm air rises and leaks out the top of your home, cold air is pulled in at the bottom. This is called the</w:t>
-      </w:r>
-      <w:r>
-        <w:t xml:space="preserve"> </w:t>
-      </w:r>
-      <w:r>
-        <w:t xml:space="preserve">‘stack effect’</w:t>
-      </w:r>
-      <w:r>
-        <w:t xml:space="preserve">, and is more pronounced in taller homes. Thus, air sealing is necessary anywhere gaps allow air to move into your house through the basement/crawlspace.</w:t>
-      </w:r>
-    </w:p>
-    <w:p>
-      <w:pPr>
-        <w:pStyle w:val="BodyText"/>
-      </w:pPr>
-      <w:r>
-        <w:t xml:space="preserve">Spray foam should be applied 2-3 inches thick on the walls to seal and insulate them. It is often ideal to install a vapor barrier at the same time as the spray foam insulation. Spray foam generally requires a layer of intumescent (fire-rated) paint over it to meet fire code.</w:t>
-      </w:r>
-    </w:p>
-    <w:p>
-      <w:pPr>
-        <w:pStyle w:val="BodyText"/>
+        <w:t xml:space="preserve">Estimated Cost/Benefits/Incentives</w:t>
+      </w:r>
+    </w:p>
+    <w:p>
+      <w:pPr>
+        <w:pStyle w:val="BodyText"/>
+      </w:pPr>
+      <w:r>
+        <w:t xml:space="preserve">The device costs $100-$400 and needs to be installed by an electrician. Here are some options: https://www.popularmechanics.com/home/interior-projects/g43140886/best-whole-house-surge-protectors/</w:t>
+      </w:r>
+    </w:p>
+    <w:bookmarkEnd w:id="60"/>
+    <w:bookmarkStart w:id="61" w:name="replace-windows"/>
+    <w:p>
+      <w:pPr>
+        <w:pStyle w:val="Heading3"/>
+      </w:pPr>
+      <w:r>
+        <w:t xml:space="preserve">4.20 Replace Windows</w:t>
+      </w:r>
+    </w:p>
+    <w:p>
+      <w:pPr>
+        <w:pStyle w:val="FirstParagraph"/>
       </w:pPr>
       <w:r>
         <w:rPr>
           <w:i/>
           <w:iCs/>
         </w:rPr>
-        <w:t xml:space="preserve">Estimated Cost/Benefits/Incentives</w:t>
-      </w:r>
-    </w:p>
-    <w:p>
-      <w:pPr>
-        <w:pStyle w:val="BodyText"/>
-      </w:pPr>
-      <w:r>
-        <w:t xml:space="preserve">Installation of spray foam insulation will cost around $5-7 per square foot. Efficiency Maine rebates and other incentives for insulation work can fund up to 80% of the project cost (subject to a lifetime limit per building), up to $9,200 when combined with nonrefundable federal tax credits. You can call them at 866-376-2463 (Monday to Friday, 8:00 am to 5:00 pm) or visit their webpage about insulation rebates: https://www.efficiencymaine.com/at-home/insulation-rebates/</w:t>
-      </w:r>
-    </w:p>
-    <w:bookmarkEnd w:id="50"/>
-    <w:bookmarkStart w:id="51" w:name="attic-insulation-and-air-sealing"/>
-    <w:p>
-      <w:pPr>
-        <w:pStyle w:val="Heading3"/>
-      </w:pPr>
-      <w:r>
-        <w:t xml:space="preserve">4.10 Attic Insulation and Air Sealing</w:t>
-      </w:r>
-    </w:p>
-    <w:p>
-      <w:pPr>
-        <w:pStyle w:val="FirstParagraph"/>
+        <w:t xml:space="preserve">Problem</w:t>
+      </w:r>
+    </w:p>
+    <w:p>
+      <w:pPr>
+        <w:pStyle w:val="BodyText"/>
+      </w:pPr>
+      <w:r>
+        <w:rPr>
+          <w:b/>
+          <w:bCs/>
+        </w:rPr>
+        <w:t xml:space="preserve">Need to get the description of the problem</w:t>
+      </w:r>
+    </w:p>
+    <w:p>
+      <w:pPr>
+        <w:pStyle w:val="BodyText"/>
       </w:pPr>
       <w:r>
         <w:rPr>
           <w:i/>
           <w:iCs/>
         </w:rPr>
-        <w:t xml:space="preserve">Problem</w:t>
-      </w:r>
-    </w:p>
-    <w:p>
-      <w:pPr>
-        <w:pStyle w:val="BodyText"/>
-      </w:pPr>
-      <w:r>
-        <w:t xml:space="preserve">The attic is uninsulated or is missing insulation and the attic could also benefit from air-sealing. These upgrades will reduce draftiness and heat loss in the winter and heat gain in the summer.</w:t>
-      </w:r>
-    </w:p>
-    <w:p>
-      <w:pPr>
-        <w:pStyle w:val="BodyText"/>
-      </w:pPr>
+        <w:t xml:space="preserve">Recommendation</w:t>
+      </w:r>
+    </w:p>
+    <w:p>
+      <w:pPr>
+        <w:pStyle w:val="BodyText"/>
+      </w:pPr>
+      <w:r>
+        <w:t xml:space="preserve">Replace single-paned windows with double- or triple-paned windows and ensure the frames are airsealed. We recommend installing windows that are Energy Star certified for</w:t>
+      </w:r>
+      <w:r>
+        <w:t xml:space="preserve"> </w:t>
+      </w:r>
+      <w:r>
+        <w:t xml:space="preserve">‘Northern’</w:t>
+      </w:r>
+      <w:r>
+        <w:t xml:space="preserve"> </w:t>
+      </w:r>
+      <w:r>
+        <w:t xml:space="preserve">climate.</w:t>
+      </w:r>
       <w:r>
         <w:rPr>
           <w:i/>
           <w:iCs/>
         </w:rPr>
-        <w:t xml:space="preserve">Recommendation</w:t>
-      </w:r>
-    </w:p>
-    <w:p>
-      <w:pPr>
-        <w:pStyle w:val="BodyText"/>
-      </w:pPr>
-      <w:r>
-        <w:t xml:space="preserve">Air seal the attic and insulate it to at least R-60 (18 inches of loose-fill cellulose insulation). COA has been installing 24 inches (R-80) of cellulose insulation in attics on our campus. Before the attic is insulated, ensure that any needed bathroom and kitchen fans are installed and that all fans are properly vented to the outside.</w:t>
-      </w:r>
-    </w:p>
-    <w:p>
-      <w:pPr>
-        <w:pStyle w:val="BodyText"/>
-      </w:pPr>
-      <w:r>
-        <w:t xml:space="preserve">In older homes, most heat loss is due to air leakage. Air sealing is particularly important in the attic (and basement or crawlspace). As warm air rises and leaks out the top of your home, cold air is pulled in at the bottom. This is called the</w:t>
-      </w:r>
-      <w:r>
-        <w:t xml:space="preserve"> </w:t>
-      </w:r>
-      <w:r>
-        <w:t xml:space="preserve">‘stack effect’</w:t>
-      </w:r>
-      <w:r>
-        <w:t xml:space="preserve">, and is more pronounced in taller homes. Thus, air sealing is necessary anywhere gaps allow air to move between your house and the attic. This typically includes gaps around the chimney, electrical penetrations, and wall top plates.</w:t>
-      </w:r>
-    </w:p>
-    <w:p>
-      <w:pPr>
-        <w:pStyle w:val="BodyText"/>
-      </w:pPr>
-      <w:r>
-        <w:rPr>
-          <w:i/>
-          <w:iCs/>
-        </w:rPr>
-        <w:t xml:space="preserve">Estimated Cost/Benefits/Incentives</w:t>
-      </w:r>
-    </w:p>
-    <w:p>
-      <w:pPr>
-        <w:pStyle w:val="BodyText"/>
-      </w:pPr>
-      <w:r>
-        <w:t xml:space="preserve">Efficiency Maine rebates and other incentives for insulation work can fund up to 80% of the overall cost to weatherize your home (subject to a lifetime limit per building), up to $9,200 when combined with nonrefundable federal tax credits. You can call them at 866-376-2463 (Monday to Friday, 8:00 am to 5:00 pm) or visit their webpage about insulation rebates: https://www.efficiencymaine.com/at-home/insulation-rebates/</w:t>
-      </w:r>
-    </w:p>
-    <w:bookmarkEnd w:id="51"/>
-    <w:bookmarkStart w:id="52" w:name="blow-in-cellulose-wall-insulation"/>
-    <w:p>
-      <w:pPr>
-        <w:pStyle w:val="Heading3"/>
-      </w:pPr>
-      <w:r>
-        <w:t xml:space="preserve">4.11 Blow-in cellulose wall insulation</w:t>
+        <w:t xml:space="preserve">Estimated Costs/Benefits/Incentives</w:t>
+      </w:r>
+    </w:p>
+    <w:p>
+      <w:pPr>
+        <w:pStyle w:val="BodyText"/>
+      </w:pPr>
+      <w:r>
+        <w:t xml:space="preserve">New windows are not eligible for federal or state funding in second homes.</w:t>
+      </w:r>
+    </w:p>
+    <w:p>
+      <w:r>
+        <w:br w:type="page"/>
+      </w:r>
+    </w:p>
+    <w:bookmarkEnd w:id="61"/>
+    <w:bookmarkEnd w:id="62"/>
+    <w:bookmarkStart w:id="63" w:name="additional-resources"/>
+    <w:p>
+      <w:pPr>
+        <w:pStyle w:val="Heading2"/>
+      </w:pPr>
+      <w:r>
+        <w:t xml:space="preserve">5 Additional Resources</w:t>
       </w:r>
     </w:p>
     <w:p>
@@ -5265,592 +6070,6 @@
         <w:pStyle w:val="FirstParagraph"/>
       </w:pPr>
       <w:r>
-        <w:rPr>
-          <w:i/>
-          <w:iCs/>
-        </w:rPr>
-        <w:t xml:space="preserve">Problem</w:t>
-      </w:r>
-    </w:p>
-    <w:p>
-      <w:pPr>
-        <w:pStyle w:val="BodyText"/>
-      </w:pPr>
-      <w:r>
-        <w:t xml:space="preserve">The walls of the house are uninsulated, which is a significant source of heat loss.</w:t>
-      </w:r>
-    </w:p>
-    <w:p>
-      <w:pPr>
-        <w:pStyle w:val="BodyText"/>
-      </w:pPr>
-      <w:r>
-        <w:rPr>
-          <w:i/>
-          <w:iCs/>
-        </w:rPr>
-        <w:t xml:space="preserve">Recommendation</w:t>
-      </w:r>
-    </w:p>
-    <w:p>
-      <w:pPr>
-        <w:pStyle w:val="BodyText"/>
-      </w:pPr>
-      <w:r>
-        <w:t xml:space="preserve">Insulate the wall stud cavities with dense packed, blown-in cellulose insulation. In balloon-framed homes, this can often be done from the attic, otherwise it can be done by drilling holes into the wall cavities from either the inside or outside.</w:t>
-      </w:r>
-      <w:r>
-        <w:t xml:space="preserve"> </w:t>
-      </w:r>
-      <w:r>
-        <w:rPr>
-          <w:i/>
-          <w:iCs/>
-        </w:rPr>
-        <w:t xml:space="preserve">Estimated Cost/Benefits/Incentives</w:t>
-      </w:r>
-    </w:p>
-    <w:p>
-      <w:pPr>
-        <w:pStyle w:val="BodyText"/>
-      </w:pPr>
-      <w:r>
-        <w:t xml:space="preserve">Efficiency Maine rebates and other incentives for insulation work can fund up to 80% of the overall cost to weatherize your home (subject to a lifetime limit per building), up to $9,200 when combined with nonrefundable federal tax credits. You can call them at 866-376-2463 (Monday to Friday, 8:00 am to 5:00 pm) or visit their webpage about insulation rebates: https://www.efficiencymaine.com/at-home/insulation-rebates/</w:t>
-      </w:r>
-    </w:p>
-    <w:bookmarkEnd w:id="52"/>
-    <w:bookmarkStart w:id="53" w:name="continuous-exterior-wall-insulation"/>
-    <w:p>
-      <w:pPr>
-        <w:pStyle w:val="Heading3"/>
-      </w:pPr>
-      <w:r>
-        <w:t xml:space="preserve">4.12 Continuous exterior wall insulation</w:t>
-      </w:r>
-    </w:p>
-    <w:p>
-      <w:pPr>
-        <w:pStyle w:val="FirstParagraph"/>
-      </w:pPr>
-      <w:r>
-        <w:rPr>
-          <w:i/>
-          <w:iCs/>
-        </w:rPr>
-        <w:t xml:space="preserve">Problem</w:t>
-      </w:r>
-    </w:p>
-    <w:p>
-      <w:pPr>
-        <w:pStyle w:val="BodyText"/>
-      </w:pPr>
-      <w:r>
-        <w:t xml:space="preserve">There isn’t continuous insulation between the siding and the exterior walls of the house. Continuous insulation helps create a complete thermal boundary for your house, and it is now an energy code requirement for new houses.</w:t>
-      </w:r>
-    </w:p>
-    <w:p>
-      <w:pPr>
-        <w:pStyle w:val="BodyText"/>
-      </w:pPr>
-      <w:r>
-        <w:rPr>
-          <w:i/>
-          <w:iCs/>
-        </w:rPr>
-        <w:t xml:space="preserve">Recommendation</w:t>
-      </w:r>
-    </w:p>
-    <w:p>
-      <w:pPr>
-        <w:pStyle w:val="BodyText"/>
-      </w:pPr>
-      <w:r>
-        <w:t xml:space="preserve">Add a continuous layer of insulation and potentially replace the air and moisture barrier once it becomes time to replace the siding. Add continuous insulation (R-6 or more) under the new siding to keep the house warmer in the winter and cooler in the summer. We recommend TimberHP TimberBoard insulation (produced in Madison, Maine) or Rockwool Comfortboard, but foam board can also be used. Before installing exterior insulation, the contractor can check if insulation is needed between the interior wall studs.</w:t>
-      </w:r>
-    </w:p>
-    <w:p>
-      <w:pPr>
-        <w:pStyle w:val="BodyText"/>
-      </w:pPr>
-      <w:r>
-        <w:rPr>
-          <w:i/>
-          <w:iCs/>
-        </w:rPr>
-        <w:t xml:space="preserve">Estimated Cost/Benefits/Incentives</w:t>
-      </w:r>
-    </w:p>
-    <w:p>
-      <w:pPr>
-        <w:pStyle w:val="BodyText"/>
-      </w:pPr>
-      <w:r>
-        <w:t xml:space="preserve">Efficiency Maine rebates and other incentives for insulation work can fund up to 80% of the overall cost to weatherize your home (subject to a lifetime limit per building), up to $9,200 when combined with nonrefundable federal tax credits. You can call them at 866-376-2463 (Monday to Friday, 8:00 am to 5:00 pm) or visit their webpage about insulation rebates: https://www.efficiencymaine.com/at-home/insulation-rebates/</w:t>
-      </w:r>
-    </w:p>
-    <w:bookmarkEnd w:id="53"/>
-    <w:bookmarkStart w:id="54" w:name="electrical-panel-upgrade"/>
-    <w:p>
-      <w:pPr>
-        <w:pStyle w:val="Heading3"/>
-      </w:pPr>
-      <w:r>
-        <w:t xml:space="preserve">4.13 Electrical Panel Upgrade</w:t>
-      </w:r>
-    </w:p>
-    <w:p>
-      <w:pPr>
-        <w:pStyle w:val="FirstParagraph"/>
-      </w:pPr>
-      <w:r>
-        <w:rPr>
-          <w:i/>
-          <w:iCs/>
-        </w:rPr>
-        <w:t xml:space="preserve">Problem</w:t>
-      </w:r>
-    </w:p>
-    <w:p>
-      <w:pPr>
-        <w:pStyle w:val="BodyText"/>
-      </w:pPr>
-      <w:r>
-        <w:rPr>
-          <w:b/>
-          <w:bCs/>
-        </w:rPr>
-        <w:t xml:space="preserve">Auditor to describe</w:t>
-      </w:r>
-    </w:p>
-    <w:p>
-      <w:pPr>
-        <w:pStyle w:val="BodyText"/>
-      </w:pPr>
-      <w:r>
-        <w:rPr>
-          <w:i/>
-          <w:iCs/>
-        </w:rPr>
-        <w:t xml:space="preserve">Recommendation</w:t>
-      </w:r>
-    </w:p>
-    <w:p>
-      <w:pPr>
-        <w:pStyle w:val="BodyText"/>
-      </w:pPr>
-      <w:r>
-        <w:t xml:space="preserve">Consult with an electrician about replacing your existing electrical panel with a 200 amp panel as you add electrical appliances to your home. It may become necessary to increase the capacity to address potential safety hazards. An electrician can determine whether or not a panel upgrade is necessary based on your current and anticipated usage.</w:t>
-      </w:r>
-    </w:p>
-    <w:p>
-      <w:pPr>
-        <w:pStyle w:val="BodyText"/>
-      </w:pPr>
-      <w:r>
-        <w:rPr>
-          <w:i/>
-          <w:iCs/>
-        </w:rPr>
-        <w:t xml:space="preserve">Estimated Cost/Benefits/Incentives</w:t>
-      </w:r>
-    </w:p>
-    <w:p>
-      <w:pPr>
-        <w:pStyle w:val="BodyText"/>
-      </w:pPr>
-      <w:r>
-        <w:t xml:space="preserve">Costs of electrical components needed to support residential energy upgrades – including panels, sub-panels, branch circuits, and feeders – qualify for a 30% nonrefundable tax credit (up to $600 per item) if they have a capacity of 200 amps or more. An electrical panel upgrades also provides a good opportunity for an electrician to install whole-house surge protection, which costs $100-$400. Here are some options: https://www.popularmechanics.com/home/interior-projects/g43140886/best-whole-house-surge-protectors/</w:t>
-      </w:r>
-    </w:p>
-    <w:bookmarkEnd w:id="54"/>
-    <w:bookmarkStart w:id="55" w:name="pipe-insulation"/>
-    <w:p>
-      <w:pPr>
-        <w:pStyle w:val="Heading3"/>
-      </w:pPr>
-      <w:r>
-        <w:t xml:space="preserve">4.14 Pipe Insulation</w:t>
-      </w:r>
-    </w:p>
-    <w:p>
-      <w:pPr>
-        <w:pStyle w:val="FirstParagraph"/>
-      </w:pPr>
-      <w:r>
-        <w:rPr>
-          <w:i/>
-          <w:iCs/>
-        </w:rPr>
-        <w:t xml:space="preserve">Problem</w:t>
-      </w:r>
-    </w:p>
-    <w:p>
-      <w:pPr>
-        <w:pStyle w:val="BodyText"/>
-      </w:pPr>
-      <w:r>
-        <w:t xml:space="preserve">Uninsulated water pipes are responsible for heat loss and excess moisture (from condensation) in your basement/crawlspace.</w:t>
-      </w:r>
-    </w:p>
-    <w:p>
-      <w:pPr>
-        <w:pStyle w:val="BodyText"/>
-      </w:pPr>
-      <w:r>
-        <w:rPr>
-          <w:i/>
-          <w:iCs/>
-        </w:rPr>
-        <w:t xml:space="preserve">Recommendation</w:t>
-      </w:r>
-    </w:p>
-    <w:p>
-      <w:pPr>
-        <w:pStyle w:val="BodyText"/>
-      </w:pPr>
-      <w:r>
-        <w:t xml:space="preserve">Insulate both hot and cold water pipes that are uninsulated in the basement/crawlspace. This will save energy and prevent condensation. We recommend foam pipe insulation made of polyethylene or neoprene.</w:t>
-      </w:r>
-    </w:p>
-    <w:p>
-      <w:pPr>
-        <w:pStyle w:val="BodyText"/>
-      </w:pPr>
-      <w:r>
-        <w:rPr>
-          <w:i/>
-          <w:iCs/>
-        </w:rPr>
-        <w:t xml:space="preserve">Estimated Cost/Benefits/Incentives</w:t>
-      </w:r>
-    </w:p>
-    <w:p>
-      <w:pPr>
-        <w:pStyle w:val="BodyText"/>
-      </w:pPr>
-      <w:r>
-        <w:t xml:space="preserve">Insulating water pipes can save 2%-4% on hot water bills and increase the temperature of the water while reducing the time it takes for hot water to reach your tap. Materials cost around $100-200, depending on the length of pipe to insulate. Many people find this to be an easy project to do themselves.</w:t>
-      </w:r>
-    </w:p>
-    <w:bookmarkEnd w:id="55"/>
-    <w:bookmarkStart w:id="56" w:name="whole-house-surge-protection"/>
-    <w:p>
-      <w:pPr>
-        <w:pStyle w:val="Heading3"/>
-      </w:pPr>
-      <w:r>
-        <w:t xml:space="preserve">4.15 Whole House Surge Protection</w:t>
-      </w:r>
-    </w:p>
-    <w:p>
-      <w:pPr>
-        <w:pStyle w:val="FirstParagraph"/>
-      </w:pPr>
-      <w:r>
-        <w:rPr>
-          <w:i/>
-          <w:iCs/>
-        </w:rPr>
-        <w:t xml:space="preserve">Problem</w:t>
-      </w:r>
-    </w:p>
-    <w:p>
-      <w:pPr>
-        <w:pStyle w:val="BodyText"/>
-      </w:pPr>
-      <w:r>
-        <w:t xml:space="preserve">Your house does not have whole-house surge protection. This will protect your large electrical appliances from damage in the case of an electrical surge. Heat pumps, heat pump water heaters, and other electronics are particularly sensitive to electrical surges.</w:t>
-      </w:r>
-    </w:p>
-    <w:p>
-      <w:pPr>
-        <w:pStyle w:val="BodyText"/>
-      </w:pPr>
-      <w:r>
-        <w:rPr>
-          <w:i/>
-          <w:iCs/>
-        </w:rPr>
-        <w:t xml:space="preserve">Recommendation</w:t>
-      </w:r>
-    </w:p>
-    <w:p>
-      <w:pPr>
-        <w:pStyle w:val="BodyText"/>
-      </w:pPr>
-      <w:r>
-        <w:t xml:space="preserve">Seal easy-to-access air leaks and weatherstrip exterior doors. In older homes, most heat loss is due to air leakage. WindowDressers insulating window inserts can also help reduce air leakage.</w:t>
-      </w:r>
-      <w:r>
-        <w:t xml:space="preserve"> </w:t>
-      </w:r>
-      <w:r>
-        <w:rPr>
-          <w:i/>
-          <w:iCs/>
-        </w:rPr>
-        <w:t xml:space="preserve">Estimated Cost/Benefits/Incentives</w:t>
-      </w:r>
-    </w:p>
-    <w:p>
-      <w:pPr>
-        <w:pStyle w:val="BodyText"/>
-      </w:pPr>
-      <w:r>
-        <w:t xml:space="preserve">The device costs $100-$400 and needs to be installed by an electrician. Here are some options: https://www.popularmechanics.com/home/interior-projects/g43140886/best-whole-house-surge-protectors/</w:t>
-      </w:r>
-    </w:p>
-    <w:bookmarkEnd w:id="56"/>
-    <w:bookmarkStart w:id="57" w:name="diy-air-sealing"/>
-    <w:p>
-      <w:pPr>
-        <w:pStyle w:val="Heading3"/>
-      </w:pPr>
-      <w:r>
-        <w:t xml:space="preserve">4.16 DIY Air Sealing</w:t>
-      </w:r>
-    </w:p>
-    <w:p>
-      <w:pPr>
-        <w:pStyle w:val="FirstParagraph"/>
-      </w:pPr>
-      <w:r>
-        <w:rPr>
-          <w:i/>
-          <w:iCs/>
-        </w:rPr>
-        <w:t xml:space="preserve">Problem</w:t>
-      </w:r>
-    </w:p>
-    <w:p>
-      <w:pPr>
-        <w:pStyle w:val="BodyText"/>
-      </w:pPr>
-      <w:r>
-        <w:t xml:space="preserve">During the blower door test, we noted sources of air leakage in the living areas of your house.</w:t>
-      </w:r>
-    </w:p>
-    <w:p>
-      <w:pPr>
-        <w:pStyle w:val="BodyText"/>
-      </w:pPr>
-      <w:r>
-        <w:rPr>
-          <w:b/>
-          <w:bCs/>
-        </w:rPr>
-        <w:t xml:space="preserve">Auditor to detail customized findings.</w:t>
-      </w:r>
-      <w:r>
-        <w:rPr>
-          <w:b/>
-          <w:bCs/>
-        </w:rPr>
-        <w:t xml:space="preserve"> </w:t>
-      </w:r>
-    </w:p>
-    <w:p>
-      <w:pPr>
-        <w:pStyle w:val="BodyText"/>
-      </w:pPr>
-      <w:r>
-        <w:rPr>
-          <w:i/>
-          <w:iCs/>
-        </w:rPr>
-        <w:t xml:space="preserve">Recommendation</w:t>
-      </w:r>
-    </w:p>
-    <w:p>
-      <w:pPr>
-        <w:pStyle w:val="BodyText"/>
-      </w:pPr>
-      <w:r>
-        <w:t xml:space="preserve">Air sealing the air leaks we identified around the living areas of your house can be a DIY solution to lower energy use, or an insulation contractor can seal the leaks when they come to your house for a larger project. Please address any moisture concerns before undertaking significant air sealing efforts.</w:t>
-      </w:r>
-    </w:p>
-    <w:p>
-      <w:pPr>
-        <w:pStyle w:val="BodyText"/>
-      </w:pPr>
-      <w:r>
-        <w:rPr>
-          <w:i/>
-          <w:iCs/>
-        </w:rPr>
-        <w:t xml:space="preserve">Estimated Cost/Benefits/Incentives</w:t>
-      </w:r>
-    </w:p>
-    <w:p>
-      <w:pPr>
-        <w:pStyle w:val="BodyText"/>
-      </w:pPr>
-      <w:r>
-        <w:t xml:space="preserve">Air sealing and insulating ductwork is eligible for a non-refundable federal tax credit (</w:t>
-      </w:r>
-      <w:r>
-        <w:t xml:space="preserve">“Energy Efficient Home Improvement Credit”</w:t>
-      </w:r>
-      <w:r>
-        <w:t xml:space="preserve">), which can pay for 30% of the project cost, subject to an annual maximum of $1,200 (shared with other home envelope improvements, like attic and basement projects).</w:t>
-      </w:r>
-    </w:p>
-    <w:bookmarkEnd w:id="57"/>
-    <w:bookmarkStart w:id="58" w:name="other-1"/>
-    <w:p>
-      <w:pPr>
-        <w:pStyle w:val="Heading3"/>
-      </w:pPr>
-      <w:r>
-        <w:t xml:space="preserve">4.17 Other 1</w:t>
-      </w:r>
-    </w:p>
-    <w:p>
-      <w:pPr>
-        <w:pStyle w:val="FirstParagraph"/>
-      </w:pPr>
-      <w:r>
-        <w:rPr>
-          <w:i/>
-          <w:iCs/>
-        </w:rPr>
-        <w:t xml:space="preserve">Problem</w:t>
-      </w:r>
-    </w:p>
-    <w:p>
-      <w:pPr>
-        <w:pStyle w:val="BodyText"/>
-      </w:pPr>
-      <w:r>
-        <w:rPr>
-          <w:i/>
-          <w:iCs/>
-        </w:rPr>
-        <w:t xml:space="preserve">Recommendation</w:t>
-      </w:r>
-    </w:p>
-    <w:p>
-      <w:pPr>
-        <w:pStyle w:val="BodyText"/>
-      </w:pPr>
-      <w:r>
-        <w:t xml:space="preserve">Upgrade your electrical panel to add whole-house surge protection. This will help to protect your heat pumps, heat pump water heater, refrigerator, well pump, and other electronics from damage due to lightning or other electrical surges.</w:t>
-      </w:r>
-    </w:p>
-    <w:p>
-      <w:pPr>
-        <w:pStyle w:val="BodyText"/>
-      </w:pPr>
-      <w:r>
-        <w:rPr>
-          <w:i/>
-          <w:iCs/>
-        </w:rPr>
-        <w:t xml:space="preserve">Estimated Cost/Benefits/Incentives</w:t>
-      </w:r>
-    </w:p>
-    <w:p>
-      <w:pPr>
-        <w:pStyle w:val="BodyText"/>
-      </w:pPr>
-      <w:r>
-        <w:rPr>
-          <w:b/>
-          <w:bCs/>
-        </w:rPr>
-        <w:t xml:space="preserve">Auditor to describe. Primary residence</w:t>
-      </w:r>
-    </w:p>
-    <w:bookmarkEnd w:id="58"/>
-    <w:bookmarkStart w:id="59" w:name="misc.-air-sealing-and-insulation"/>
-    <w:p>
-      <w:pPr>
-        <w:pStyle w:val="Heading3"/>
-      </w:pPr>
-      <w:r>
-        <w:t xml:space="preserve">4.18 Misc. Air Sealing and Insulation</w:t>
-      </w:r>
-    </w:p>
-    <w:p>
-      <w:pPr>
-        <w:pStyle w:val="FirstParagraph"/>
-      </w:pPr>
-      <w:r>
-        <w:rPr>
-          <w:i/>
-          <w:iCs/>
-        </w:rPr>
-        <w:t xml:space="preserve">Problem</w:t>
-      </w:r>
-    </w:p>
-    <w:p>
-      <w:pPr>
-        <w:pStyle w:val="BodyText"/>
-      </w:pPr>
-      <w:r>
-        <w:rPr>
-          <w:b/>
-          <w:bCs/>
-        </w:rPr>
-        <w:t xml:space="preserve">Need a description for the problem</w:t>
-      </w:r>
-    </w:p>
-    <w:p>
-      <w:pPr>
-        <w:pStyle w:val="BodyText"/>
-      </w:pPr>
-      <w:r>
-        <w:rPr>
-          <w:i/>
-          <w:iCs/>
-        </w:rPr>
-        <w:t xml:space="preserve">Recommendation</w:t>
-      </w:r>
-    </w:p>
-    <w:p>
-      <w:pPr>
-        <w:pStyle w:val="BodyText"/>
-      </w:pPr>
-      <w:r>
-        <w:t xml:space="preserve">Air seal and insulate [** insert auditor description - bay window, bulkhead door, chase, kneewall, anything else that is unique to the home and not otherwise covered in another recommendation]</w:t>
-      </w:r>
-      <w:r>
-        <w:rPr>
-          <w:i/>
-          <w:iCs/>
-        </w:rPr>
-        <w:t xml:space="preserve">Estimated Costs/Benefits/Incentives</w:t>
-      </w:r>
-    </w:p>
-    <w:p>
-      <w:pPr>
-        <w:pStyle w:val="BodyText"/>
-      </w:pPr>
-      <w:r>
-        <w:t xml:space="preserve">As part of a larger insulation project, this work may be eligible for Efficiency Maine rebates and other incentives for insulation work, up to 80% of the overall cost to weatherize your home (subject to a lifetime limit per building).</w:t>
-      </w:r>
-    </w:p>
-    <w:p>
-      <w:r>
-        <w:br w:type="page"/>
-      </w:r>
-    </w:p>
-    <w:bookmarkEnd w:id="59"/>
-    <w:bookmarkEnd w:id="60"/>
-    <w:bookmarkStart w:id="61" w:name="additional-resources"/>
-    <w:p>
-      <w:pPr>
-        <w:pStyle w:val="Heading2"/>
-      </w:pPr>
-      <w:r>
-        <w:t xml:space="preserve">5 Additional Resources</w:t>
-      </w:r>
-    </w:p>
-    <w:p>
-      <w:pPr>
-        <w:pStyle w:val="FirstParagraph"/>
-      </w:pPr>
-      <w:r>
         <w:t xml:space="preserve">Many home efficiency upgrades are eligible for Efficiency Maine rebates and federal tax credits. Financial incentives vary based on income level and type of occupancy. An overview of all state rebates and federal tax credits can be found here: https://www.efficiencymaine.com/at-home/.</w:t>
       </w:r>
     </w:p>
@@ -5870,15 +6089,7 @@
         <w:t xml:space="preserve">We recommend discussing a whole-home plan for insulation and air sealing work in the basement, walls, and attic with contractors to determine how to best sequence the work to take full advantage of the Efficiency Maine rebates (which are subject to lifetime maximums) and nonrefundable federal tax credits (which are subject to annual maximums).</w:t>
       </w:r>
     </w:p>
-    <w:p>
-      <w:pPr>
-        <w:pStyle w:val="BodyText"/>
-      </w:pPr>
-      <w:r>
-        <w:t xml:space="preserve">Efficiency Maine also offers home energy loans to help homeowners who are Maine residents pay for energy and related health and safety upgrades. There are no fees, and interest rates for multi-year loans are between 5.99% (max $7,500) and 7.99% (max $25,000), depending on income level. Low- and moderate-income homeowners who borrow the full $7,500 and pay it back over 10 years will pay a monthly cost of $83. There is also a 1-year, 0% APR option. To learn more or apply, call 866-376-2463 or visit https://www.efficiencymaine.com/home-energy-loans/</w:t>
-      </w:r>
-    </w:p>
-    <w:bookmarkEnd w:id="61"/>
+    <w:bookmarkEnd w:id="63"/>
     <w:sectPr>
       <w:footerReference r:id="rId9" w:type="default"/>
       <w:pgSz w:h="15840" w:w="12240"/>

</xml_diff>

<commit_message>
Add page numbers using reference doxc
</commit_message>
<xml_diff>
--- a/Quarto_report/Audit_Report.docx
+++ b/Quarto_report/Audit_Report.docx
@@ -6227,6 +6227,12 @@
     </w:p>
     <w:bookmarkEnd w:id="63"/>
     <w:sectPr>
+      <w:headerReference r:id="rId9" w:type="even"/>
+      <w:headerReference r:id="rId11" w:type="default"/>
+      <w:footerReference r:id="rId14" w:type="even"/>
+      <w:footerReference r:id="rId13" w:type="default"/>
+      <w:headerReference r:id="rId10" w:type="first"/>
+      <w:footerReference r:id="rId12" w:type="first"/>
       <w:pgSz w:h="15840" w:w="12240"/>
       <w:pgMar w:bottom="1440" w:footer="720" w:gutter="0" w:header="720" w:left="1800" w:right="1800" w:top="1440"/>
       <w:cols w:space="720"/>
@@ -6240,6 +6246,90 @@
 <w:comments xmlns:w="http://schemas.openxmlformats.org/wordprocessingml/2006/main" xmlns:m="http://schemas.openxmlformats.org/officeDocument/2006/math" xmlns:r="http://schemas.openxmlformats.org/officeDocument/2006/relationships" xmlns:o="urn:schemas-microsoft-com:office:office" xmlns:v="urn:schemas-microsoft-com:vml" xmlns:w10="urn:schemas-microsoft-com:office:word" xmlns:a="http://schemas.openxmlformats.org/drawingml/2006/main" xmlns:pic="http://schemas.openxmlformats.org/drawingml/2006/picture" xmlns:wp="http://schemas.openxmlformats.org/drawingml/2006/wordprocessingDrawing"/>
 </file>
 
+<file path=word/footer1.xml><?xml version="1.0" encoding="utf-8"?>
+<w:ftr xmlns:wpc="http://schemas.microsoft.com/office/word/2010/wordprocessingCanvas" xmlns:cx="http://schemas.microsoft.com/office/drawing/2014/chartex" xmlns:cx1="http://schemas.microsoft.com/office/drawing/2015/9/8/chartex" xmlns:cx2="http://schemas.microsoft.com/office/drawing/2015/10/21/chartex" xmlns:cx3="http://schemas.microsoft.com/office/drawing/2016/5/9/chartex" xmlns:cx4="http://schemas.microsoft.com/office/drawing/2016/5/10/chartex" xmlns:cx5="http://schemas.microsoft.com/office/drawing/2016/5/11/chartex" xmlns:cx6="http://schemas.microsoft.com/office/drawing/2016/5/12/chartex" xmlns:cx7="http://schemas.microsoft.com/office/drawing/2016/5/13/chartex" xmlns:cx8="http://schemas.microsoft.com/office/drawing/2016/5/14/chartex" xmlns:mc="http://schemas.openxmlformats.org/markup-compatibility/2006" xmlns:aink="http://schemas.microsoft.com/office/drawing/2016/ink" xmlns:am3d="http://schemas.microsoft.com/office/drawing/2017/model3d" xmlns:o="urn:schemas-microsoft-com:office:office" xmlns:oel="http://schemas.microsoft.com/office/2019/extlst" xmlns:r="http://schemas.openxmlformats.org/officeDocument/2006/relationships" xmlns:m="http://schemas.openxmlformats.org/officeDocument/2006/math" xmlns:v="urn:schemas-microsoft-com:vml" xmlns:wp14="http://schemas.microsoft.com/office/word/2010/wordprocessingDrawing" xmlns:wp="http://schemas.openxmlformats.org/drawingml/2006/wordprocessingDrawing" xmlns:w10="urn:schemas-microsoft-com:office:word" xmlns:w="http://schemas.openxmlformats.org/wordprocessingml/2006/main" xmlns:w14="http://schemas.microsoft.com/office/word/2010/wordml" xmlns:w15="http://schemas.microsoft.com/office/word/2012/wordml" xmlns:w16cex="http://schemas.microsoft.com/office/word/2018/wordml/cex" xmlns:w16cid="http://schemas.microsoft.com/office/word/2016/wordml/cid" xmlns:w16="http://schemas.microsoft.com/office/word/2018/wordml" xmlns:w16du="http://schemas.microsoft.com/office/word/2023/wordml/word16du" xmlns:w16sdtdh="http://schemas.microsoft.com/office/word/2020/wordml/sdtdatahash" xmlns:w16sdtfl="http://schemas.microsoft.com/office/word/2024/wordml/sdtformatlock" xmlns:w16se="http://schemas.microsoft.com/office/word/2015/wordml/symex" xmlns:wpg="http://schemas.microsoft.com/office/word/2010/wordprocessingGroup" xmlns:wpi="http://schemas.microsoft.com/office/word/2010/wordprocessingInk" xmlns:wne="http://schemas.microsoft.com/office/word/2006/wordml" xmlns:wps="http://schemas.microsoft.com/office/word/2010/wordprocessingShape" mc:Ignorable="w14 w15 w16se w16cid w16 w16cex w16sdtdh w16sdtfl w16du wp14">
+  <w:p>
+    <w:pPr>
+      <w:pStyle w:val="Footer"/>
+    </w:pPr>
+  </w:p>
+</w:ftr>
+</file>
+
+<file path=word/footer2.xml><?xml version="1.0" encoding="utf-8"?>
+<w:ftr xmlns:wpc="http://schemas.microsoft.com/office/word/2010/wordprocessingCanvas" xmlns:cx="http://schemas.microsoft.com/office/drawing/2014/chartex" xmlns:cx1="http://schemas.microsoft.com/office/drawing/2015/9/8/chartex" xmlns:cx2="http://schemas.microsoft.com/office/drawing/2015/10/21/chartex" xmlns:cx3="http://schemas.microsoft.com/office/drawing/2016/5/9/chartex" xmlns:cx4="http://schemas.microsoft.com/office/drawing/2016/5/10/chartex" xmlns:cx5="http://schemas.microsoft.com/office/drawing/2016/5/11/chartex" xmlns:cx6="http://schemas.microsoft.com/office/drawing/2016/5/12/chartex" xmlns:cx7="http://schemas.microsoft.com/office/drawing/2016/5/13/chartex" xmlns:cx8="http://schemas.microsoft.com/office/drawing/2016/5/14/chartex" xmlns:mc="http://schemas.openxmlformats.org/markup-compatibility/2006" xmlns:aink="http://schemas.microsoft.com/office/drawing/2016/ink" xmlns:am3d="http://schemas.microsoft.com/office/drawing/2017/model3d" xmlns:o="urn:schemas-microsoft-com:office:office" xmlns:oel="http://schemas.microsoft.com/office/2019/extlst" xmlns:r="http://schemas.openxmlformats.org/officeDocument/2006/relationships" xmlns:m="http://schemas.openxmlformats.org/officeDocument/2006/math" xmlns:v="urn:schemas-microsoft-com:vml" xmlns:wp14="http://schemas.microsoft.com/office/word/2010/wordprocessingDrawing" xmlns:wp="http://schemas.openxmlformats.org/drawingml/2006/wordprocessingDrawing" xmlns:w10="urn:schemas-microsoft-com:office:word" xmlns:w="http://schemas.openxmlformats.org/wordprocessingml/2006/main" xmlns:w14="http://schemas.microsoft.com/office/word/2010/wordml" xmlns:w15="http://schemas.microsoft.com/office/word/2012/wordml" xmlns:w16cex="http://schemas.microsoft.com/office/word/2018/wordml/cex" xmlns:w16cid="http://schemas.microsoft.com/office/word/2016/wordml/cid" xmlns:w16="http://schemas.microsoft.com/office/word/2018/wordml" xmlns:w16du="http://schemas.microsoft.com/office/word/2023/wordml/word16du" xmlns:w16sdtdh="http://schemas.microsoft.com/office/word/2020/wordml/sdtdatahash" xmlns:w16sdtfl="http://schemas.microsoft.com/office/word/2024/wordml/sdtformatlock" xmlns:w16se="http://schemas.microsoft.com/office/word/2015/wordml/symex" xmlns:wpg="http://schemas.microsoft.com/office/word/2010/wordprocessingGroup" xmlns:wpi="http://schemas.microsoft.com/office/word/2010/wordprocessingInk" xmlns:wne="http://schemas.microsoft.com/office/word/2006/wordml" xmlns:wps="http://schemas.microsoft.com/office/word/2010/wordprocessingShape" mc:Ignorable="w14 w15 w16se w16cid w16 w16cex w16sdtdh w16sdtfl w16du wp14">
+  <w:sdt>
+    <w:sdtPr>
+      <w:id w:val="-2033486329"/>
+      <w:docPartObj>
+        <w:docPartGallery w:val="Page Numbers (Bottom of Page)"/>
+        <w:docPartUnique/>
+      </w:docPartObj>
+    </w:sdtPr>
+    <w:sdtEndPr>
+      <w:rPr>
+        <w:noProof/>
+      </w:rPr>
+    </w:sdtEndPr>
+    <w:sdtContent>
+      <w:p>
+        <w:pPr>
+          <w:pStyle w:val="Footer"/>
+          <w:jc w:val="right"/>
+        </w:pPr>
+        <w:r>
+          <w:rPr>
+            <w:color w:val="000000" w:themeColor="text1"/>
+          </w:rPr>
+          <w:fldChar w:fldCharType="begin"/>
+        </w:r>
+        <w:r>
+          <w:rPr>
+            <w:color w:val="000000" w:themeColor="text1"/>
+          </w:rPr>
+          <w:instrText xml:space="preserve"> PAGE   \* MERGEFORMAT </w:instrText>
+        </w:r>
+        <w:r>
+          <w:rPr>
+            <w:color w:val="000000" w:themeColor="text1"/>
+          </w:rPr>
+          <w:fldChar w:fldCharType="separate"/>
+        </w:r>
+        <w:r>
+          <w:rPr>
+            <w:noProof/>
+            <w:color w:val="000000" w:themeColor="text1"/>
+          </w:rPr>
+          <w:t>2</w:t>
+        </w:r>
+        <w:r>
+          <w:rPr>
+            <w:noProof/>
+            <w:color w:val="000000" w:themeColor="text1"/>
+          </w:rPr>
+          <w:fldChar w:fldCharType="end"/>
+        </w:r>
+      </w:p>
+    </w:sdtContent>
+  </w:sdt>
+  <w:p>
+    <w:pPr>
+      <w:pStyle w:val="Footer"/>
+    </w:pPr>
+  </w:p>
+</w:ftr>
+</file>
+
+<file path=word/footer3.xml><?xml version="1.0" encoding="utf-8"?>
+<w:ftr xmlns:wpc="http://schemas.microsoft.com/office/word/2010/wordprocessingCanvas" xmlns:cx="http://schemas.microsoft.com/office/drawing/2014/chartex" xmlns:cx1="http://schemas.microsoft.com/office/drawing/2015/9/8/chartex" xmlns:cx2="http://schemas.microsoft.com/office/drawing/2015/10/21/chartex" xmlns:cx3="http://schemas.microsoft.com/office/drawing/2016/5/9/chartex" xmlns:cx4="http://schemas.microsoft.com/office/drawing/2016/5/10/chartex" xmlns:cx5="http://schemas.microsoft.com/office/drawing/2016/5/11/chartex" xmlns:cx6="http://schemas.microsoft.com/office/drawing/2016/5/12/chartex" xmlns:cx7="http://schemas.microsoft.com/office/drawing/2016/5/13/chartex" xmlns:cx8="http://schemas.microsoft.com/office/drawing/2016/5/14/chartex" xmlns:mc="http://schemas.openxmlformats.org/markup-compatibility/2006" xmlns:aink="http://schemas.microsoft.com/office/drawing/2016/ink" xmlns:am3d="http://schemas.microsoft.com/office/drawing/2017/model3d" xmlns:o="urn:schemas-microsoft-com:office:office" xmlns:oel="http://schemas.microsoft.com/office/2019/extlst" xmlns:r="http://schemas.openxmlformats.org/officeDocument/2006/relationships" xmlns:m="http://schemas.openxmlformats.org/officeDocument/2006/math" xmlns:v="urn:schemas-microsoft-com:vml" xmlns:wp14="http://schemas.microsoft.com/office/word/2010/wordprocessingDrawing" xmlns:wp="http://schemas.openxmlformats.org/drawingml/2006/wordprocessingDrawing" xmlns:w10="urn:schemas-microsoft-com:office:word" xmlns:w="http://schemas.openxmlformats.org/wordprocessingml/2006/main" xmlns:w14="http://schemas.microsoft.com/office/word/2010/wordml" xmlns:w15="http://schemas.microsoft.com/office/word/2012/wordml" xmlns:w16cex="http://schemas.microsoft.com/office/word/2018/wordml/cex" xmlns:w16cid="http://schemas.microsoft.com/office/word/2016/wordml/cid" xmlns:w16="http://schemas.microsoft.com/office/word/2018/wordml" xmlns:w16du="http://schemas.microsoft.com/office/word/2023/wordml/word16du" xmlns:w16sdtdh="http://schemas.microsoft.com/office/word/2020/wordml/sdtdatahash" xmlns:w16sdtfl="http://schemas.microsoft.com/office/word/2024/wordml/sdtformatlock" xmlns:w16se="http://schemas.microsoft.com/office/word/2015/wordml/symex" xmlns:wpg="http://schemas.microsoft.com/office/word/2010/wordprocessingGroup" xmlns:wpi="http://schemas.microsoft.com/office/word/2010/wordprocessingInk" xmlns:wne="http://schemas.microsoft.com/office/word/2006/wordml" xmlns:wps="http://schemas.microsoft.com/office/word/2010/wordprocessingShape" mc:Ignorable="w14 w15 w16se w16cid w16 w16cex w16sdtdh w16sdtfl w16du wp14">
+  <w:p>
+    <w:pPr>
+      <w:pStyle w:val="Footer"/>
+    </w:pPr>
+  </w:p>
+</w:ftr>
+</file>
+
 <file path=word/footnotes.xml><?xml version="1.0" encoding="utf-8"?>
 <w:footnotes xmlns:w="http://schemas.openxmlformats.org/wordprocessingml/2006/main" xmlns:m="http://schemas.openxmlformats.org/officeDocument/2006/math" xmlns:r="http://schemas.openxmlformats.org/officeDocument/2006/relationships" xmlns:o="urn:schemas-microsoft-com:office:office" xmlns:v="urn:schemas-microsoft-com:vml" xmlns:w10="urn:schemas-microsoft-com:office:word" xmlns:a="http://schemas.openxmlformats.org/drawingml/2006/main" xmlns:pic="http://schemas.openxmlformats.org/drawingml/2006/picture" xmlns:wp="http://schemas.openxmlformats.org/drawingml/2006/wordprocessingDrawing">
   <w:footnote w:type="continuationSeparator" w:id="0">
@@ -6257,6 +6347,36 @@
     </w:p>
   </w:footnote>
 </w:footnotes>
+</file>
+
+<file path=word/header1.xml><?xml version="1.0" encoding="utf-8"?>
+<w:hdr xmlns:wpc="http://schemas.microsoft.com/office/word/2010/wordprocessingCanvas" xmlns:cx="http://schemas.microsoft.com/office/drawing/2014/chartex" xmlns:cx1="http://schemas.microsoft.com/office/drawing/2015/9/8/chartex" xmlns:cx2="http://schemas.microsoft.com/office/drawing/2015/10/21/chartex" xmlns:cx3="http://schemas.microsoft.com/office/drawing/2016/5/9/chartex" xmlns:cx4="http://schemas.microsoft.com/office/drawing/2016/5/10/chartex" xmlns:cx5="http://schemas.microsoft.com/office/drawing/2016/5/11/chartex" xmlns:cx6="http://schemas.microsoft.com/office/drawing/2016/5/12/chartex" xmlns:cx7="http://schemas.microsoft.com/office/drawing/2016/5/13/chartex" xmlns:cx8="http://schemas.microsoft.com/office/drawing/2016/5/14/chartex" xmlns:mc="http://schemas.openxmlformats.org/markup-compatibility/2006" xmlns:aink="http://schemas.microsoft.com/office/drawing/2016/ink" xmlns:am3d="http://schemas.microsoft.com/office/drawing/2017/model3d" xmlns:o="urn:schemas-microsoft-com:office:office" xmlns:oel="http://schemas.microsoft.com/office/2019/extlst" xmlns:r="http://schemas.openxmlformats.org/officeDocument/2006/relationships" xmlns:m="http://schemas.openxmlformats.org/officeDocument/2006/math" xmlns:v="urn:schemas-microsoft-com:vml" xmlns:wp14="http://schemas.microsoft.com/office/word/2010/wordprocessingDrawing" xmlns:wp="http://schemas.openxmlformats.org/drawingml/2006/wordprocessingDrawing" xmlns:w10="urn:schemas-microsoft-com:office:word" xmlns:w="http://schemas.openxmlformats.org/wordprocessingml/2006/main" xmlns:w14="http://schemas.microsoft.com/office/word/2010/wordml" xmlns:w15="http://schemas.microsoft.com/office/word/2012/wordml" xmlns:w16cex="http://schemas.microsoft.com/office/word/2018/wordml/cex" xmlns:w16cid="http://schemas.microsoft.com/office/word/2016/wordml/cid" xmlns:w16="http://schemas.microsoft.com/office/word/2018/wordml" xmlns:w16du="http://schemas.microsoft.com/office/word/2023/wordml/word16du" xmlns:w16sdtdh="http://schemas.microsoft.com/office/word/2020/wordml/sdtdatahash" xmlns:w16sdtfl="http://schemas.microsoft.com/office/word/2024/wordml/sdtformatlock" xmlns:w16se="http://schemas.microsoft.com/office/word/2015/wordml/symex" xmlns:wpg="http://schemas.microsoft.com/office/word/2010/wordprocessingGroup" xmlns:wpi="http://schemas.microsoft.com/office/word/2010/wordprocessingInk" xmlns:wne="http://schemas.microsoft.com/office/word/2006/wordml" xmlns:wps="http://schemas.microsoft.com/office/word/2010/wordprocessingShape" mc:Ignorable="w14 w15 w16se w16cid w16 w16cex w16sdtdh w16sdtfl w16du wp14">
+  <w:p>
+    <w:pPr>
+      <w:pStyle w:val="Header"/>
+    </w:pPr>
+  </w:p>
+</w:hdr>
+</file>
+
+<file path=word/header2.xml><?xml version="1.0" encoding="utf-8"?>
+<w:hdr xmlns:wpc="http://schemas.microsoft.com/office/word/2010/wordprocessingCanvas" xmlns:cx="http://schemas.microsoft.com/office/drawing/2014/chartex" xmlns:cx1="http://schemas.microsoft.com/office/drawing/2015/9/8/chartex" xmlns:cx2="http://schemas.microsoft.com/office/drawing/2015/10/21/chartex" xmlns:cx3="http://schemas.microsoft.com/office/drawing/2016/5/9/chartex" xmlns:cx4="http://schemas.microsoft.com/office/drawing/2016/5/10/chartex" xmlns:cx5="http://schemas.microsoft.com/office/drawing/2016/5/11/chartex" xmlns:cx6="http://schemas.microsoft.com/office/drawing/2016/5/12/chartex" xmlns:cx7="http://schemas.microsoft.com/office/drawing/2016/5/13/chartex" xmlns:cx8="http://schemas.microsoft.com/office/drawing/2016/5/14/chartex" xmlns:mc="http://schemas.openxmlformats.org/markup-compatibility/2006" xmlns:aink="http://schemas.microsoft.com/office/drawing/2016/ink" xmlns:am3d="http://schemas.microsoft.com/office/drawing/2017/model3d" xmlns:o="urn:schemas-microsoft-com:office:office" xmlns:oel="http://schemas.microsoft.com/office/2019/extlst" xmlns:r="http://schemas.openxmlformats.org/officeDocument/2006/relationships" xmlns:m="http://schemas.openxmlformats.org/officeDocument/2006/math" xmlns:v="urn:schemas-microsoft-com:vml" xmlns:wp14="http://schemas.microsoft.com/office/word/2010/wordprocessingDrawing" xmlns:wp="http://schemas.openxmlformats.org/drawingml/2006/wordprocessingDrawing" xmlns:w10="urn:schemas-microsoft-com:office:word" xmlns:w="http://schemas.openxmlformats.org/wordprocessingml/2006/main" xmlns:w14="http://schemas.microsoft.com/office/word/2010/wordml" xmlns:w15="http://schemas.microsoft.com/office/word/2012/wordml" xmlns:w16cex="http://schemas.microsoft.com/office/word/2018/wordml/cex" xmlns:w16cid="http://schemas.microsoft.com/office/word/2016/wordml/cid" xmlns:w16="http://schemas.microsoft.com/office/word/2018/wordml" xmlns:w16du="http://schemas.microsoft.com/office/word/2023/wordml/word16du" xmlns:w16sdtdh="http://schemas.microsoft.com/office/word/2020/wordml/sdtdatahash" xmlns:w16sdtfl="http://schemas.microsoft.com/office/word/2024/wordml/sdtformatlock" xmlns:w16se="http://schemas.microsoft.com/office/word/2015/wordml/symex" xmlns:wpg="http://schemas.microsoft.com/office/word/2010/wordprocessingGroup" xmlns:wpi="http://schemas.microsoft.com/office/word/2010/wordprocessingInk" xmlns:wne="http://schemas.microsoft.com/office/word/2006/wordml" xmlns:wps="http://schemas.microsoft.com/office/word/2010/wordprocessingShape" mc:Ignorable="w14 w15 w16se w16cid w16 w16cex w16sdtdh w16sdtfl w16du wp14">
+  <w:p>
+    <w:pPr>
+      <w:pStyle w:val="Header"/>
+    </w:pPr>
+  </w:p>
+</w:hdr>
+</file>
+
+<file path=word/header3.xml><?xml version="1.0" encoding="utf-8"?>
+<w:hdr xmlns:wpc="http://schemas.microsoft.com/office/word/2010/wordprocessingCanvas" xmlns:cx="http://schemas.microsoft.com/office/drawing/2014/chartex" xmlns:cx1="http://schemas.microsoft.com/office/drawing/2015/9/8/chartex" xmlns:cx2="http://schemas.microsoft.com/office/drawing/2015/10/21/chartex" xmlns:cx3="http://schemas.microsoft.com/office/drawing/2016/5/9/chartex" xmlns:cx4="http://schemas.microsoft.com/office/drawing/2016/5/10/chartex" xmlns:cx5="http://schemas.microsoft.com/office/drawing/2016/5/11/chartex" xmlns:cx6="http://schemas.microsoft.com/office/drawing/2016/5/12/chartex" xmlns:cx7="http://schemas.microsoft.com/office/drawing/2016/5/13/chartex" xmlns:cx8="http://schemas.microsoft.com/office/drawing/2016/5/14/chartex" xmlns:mc="http://schemas.openxmlformats.org/markup-compatibility/2006" xmlns:aink="http://schemas.microsoft.com/office/drawing/2016/ink" xmlns:am3d="http://schemas.microsoft.com/office/drawing/2017/model3d" xmlns:o="urn:schemas-microsoft-com:office:office" xmlns:oel="http://schemas.microsoft.com/office/2019/extlst" xmlns:r="http://schemas.openxmlformats.org/officeDocument/2006/relationships" xmlns:m="http://schemas.openxmlformats.org/officeDocument/2006/math" xmlns:v="urn:schemas-microsoft-com:vml" xmlns:wp14="http://schemas.microsoft.com/office/word/2010/wordprocessingDrawing" xmlns:wp="http://schemas.openxmlformats.org/drawingml/2006/wordprocessingDrawing" xmlns:w10="urn:schemas-microsoft-com:office:word" xmlns:w="http://schemas.openxmlformats.org/wordprocessingml/2006/main" xmlns:w14="http://schemas.microsoft.com/office/word/2010/wordml" xmlns:w15="http://schemas.microsoft.com/office/word/2012/wordml" xmlns:w16cex="http://schemas.microsoft.com/office/word/2018/wordml/cex" xmlns:w16cid="http://schemas.microsoft.com/office/word/2016/wordml/cid" xmlns:w16="http://schemas.microsoft.com/office/word/2018/wordml" xmlns:w16du="http://schemas.microsoft.com/office/word/2023/wordml/word16du" xmlns:w16sdtdh="http://schemas.microsoft.com/office/word/2020/wordml/sdtdatahash" xmlns:w16sdtfl="http://schemas.microsoft.com/office/word/2024/wordml/sdtformatlock" xmlns:w16se="http://schemas.microsoft.com/office/word/2015/wordml/symex" xmlns:wpg="http://schemas.microsoft.com/office/word/2010/wordprocessingGroup" xmlns:wpi="http://schemas.microsoft.com/office/word/2010/wordprocessingInk" xmlns:wne="http://schemas.microsoft.com/office/word/2006/wordml" xmlns:wps="http://schemas.microsoft.com/office/word/2010/wordprocessingShape" mc:Ignorable="w14 w15 w16se w16cid w16 w16cex w16sdtdh w16sdtfl w16du wp14">
+  <w:p>
+    <w:pPr>
+      <w:pStyle w:val="Header"/>
+    </w:pPr>
+  </w:p>
+</w:hdr>
 </file>
 
 <file path=word/numbering.xml><?xml version="1.0" encoding="utf-8"?>

</xml_diff>

<commit_message>
Make summarry of recs table arial 11 point font with padding, align heading middle
</commit_message>
<xml_diff>
--- a/Quarto_report/Audit_Report.docx
+++ b/Quarto_report/Audit_Report.docx
@@ -331,1126 +331,2323 @@
         <w:t xml:space="preserve">We recommend the following upgrades for your home. Detailed information about these recommendations and financial resources can be found in other sections of this report. These are organized from the least expensive/most cost-effective and easiest interventions to ones that are more challenging to implement.</w:t>
       </w:r>
     </w:p>
-    <w:tbl xmlns:w="http://schemas.openxmlformats.org/wordprocessingml/2006/main" xmlns:wp="http://schemas.openxmlformats.org/drawingml/2006/wordprocessingDrawing" xmlns:r="http://schemas.openxmlformats.org/officeDocument/2006/relationships" xmlns:w14="http://schemas.microsoft.com/office/word/2010/wordml">
+    <w:tbl xmlns:w="http://schemas.openxmlformats.org/wordprocessingml/2006/main" xmlns:r="http://schemas.openxmlformats.org/officeDocument/2006/relationships" xmlns:w14="http://schemas.microsoft.com/office/word/2010/wordml" xmlns:wp="http://schemas.openxmlformats.org/drawingml/2006/wordprocessingDrawing" xmlns:a="http://schemas.openxmlformats.org/drawingml/2006/main" xmlns:pic="http://schemas.openxmlformats.org/drawingml/2006/picture">
       <w:tblPr>
-        <w:tblCellMar>
-          <w:top w:w="0" w:type="dxa"/>
-          <w:bottom w:w="0" w:type="dxa"/>
-          <w:start w:w="60" w:type="dxa"/>
-          <w:end w:w="60" w:type="dxa"/>
-        </w:tblCellMar>
-        <w:tblW w:type="auto" w:w="0"/>
-        <w:tblLook w:firstRow="0" w:lastRow="0" w:firstColumn="0" w:lastColumn="0" w:noHBand="0" w:noVBand="0"/>
+        <w:tblLayout w:type="fixed"/>
         <w:jc w:val="center"/>
+        <w:tblLook w:firstRow="1" w:lastRow="0" w:firstColumn="0" w:lastColumn="0" w:noHBand="0" w:noVBand="1"/>
       </w:tblPr>
+      <w:tblGrid>
+        <w:gridCol w:w="2880"/>
+        <w:gridCol w:w="5760"/>
+      </w:tblGrid>
       <w:tr>
         <w:trPr>
-          <w:cantSplit/>
+          <w:trHeight w:val="360" w:hRule="auto"/>
           <w:tblHeader/>
         </w:trPr>
+        header 1
         <w:tc>
           <w:tcPr>
             <w:tcBorders>
-              <w:top w:val="single" w:sz="16" w:space="0" w:color="D3D3D3"/>
-              <w:bottom w:val="single" w:sz="16" w:space="0" w:color="D3D3D3"/>
-              <w:start w:val="single" w:space="0" w:color="D3D3D3"/>
+              <w:bottom w:val="single" w:sz="12" w:space="0" w:color="666666"/>
+              <w:top w:val="single" w:sz="12" w:space="0" w:color="666666"/>
+              <w:left w:val="none" w:sz="0" w:space="0" w:color="000000"/>
+              <w:right w:val="none" w:sz="0" w:space="0" w:color="000000"/>
             </w:tcBorders>
+            <w:shd w:val="clear" w:color="auto" w:fill="FFFFFF"/>
+            <w:tcMar>
+              <w:top w:w="0" w:type="dxa"/>
+              <w:bottom w:w="0" w:type="dxa"/>
+              <w:left w:w="0" w:type="dxa"/>
+              <w:right w:w="0" w:type="dxa"/>
+            </w:tcMar>
+            <w:vAlign w:val="top"/>
           </w:tcPr>
           <w:p>
             <w:pPr>
-              <w:spacing w:before="0" w:after="60"/>
-              <w:keepNext/>
-              <w:jc w:val="start"/>
+              <w:jc w:val="left"/>
+              <w:pBdr>
+                <w:bottom w:val="none" w:sz="0" w:space="0" w:color="000000"/>
+                <w:top w:val="none" w:sz="0" w:space="0" w:color="000000"/>
+                <w:left w:val="none" w:sz="0" w:space="0" w:color="000000"/>
+                <w:right w:val="none" w:sz="0" w:space="0" w:color="000000"/>
+              </w:pBdr>
+              <w:spacing w:after="100" w:before="100" w:line="240"/>
+              <w:ind w:left="100" w:right="100" w:firstLine="0" w:firstLineChars="0"/>
+              <w:rPr>
+                <w:rFonts w:ascii="Arial" w:hAnsi="Arial" w:eastAsia="Arial" w:cs="Arial"/>
+                <w:i w:val="false"/>
+                <w:b w:val="false"/>
+                <w:u w:val="none"/>
+                <w:sz w:val="22"/>
+                <w:szCs w:val="22"/>
+                <w:color w:val="000000"/>
+              </w:rPr>
             </w:pPr>
-            <w:r>
+            <w:r xmlns:w="http://schemas.openxmlformats.org/wordprocessingml/2006/main" xmlns:wp="http://schemas.openxmlformats.org/drawingml/2006/wordprocessingDrawing" xmlns:r="http://schemas.openxmlformats.org/officeDocument/2006/relationships" xmlns:w14="http://schemas.microsoft.com/office/word/2010/wordml">
               <w:rPr>
-                <w:rFonts w:ascii="Calibri" w:hAnsi="Calibri"/>
-                <w:sz w:val="20"/>
+                <w:rFonts w:ascii="Arial" w:hAnsi="Arial" w:eastAsia="Arial" w:cs="Arial"/>
+                <w:i w:val="false"/>
+                <w:b w:val="false"/>
+                <w:u w:val="none"/>
+                <w:sz w:val="22"/>
+                <w:szCs w:val="22"/>
+                <w:color w:val="000000"/>
               </w:rPr>
-              <w:t xml:space="default">Recommendations</w:t>
+              <w:t xml:space="preserve">Recommendations</w:t>
             </w:r>
           </w:p>
         </w:tc>
         <w:tc>
           <w:tcPr>
             <w:tcBorders>
-              <w:top w:val="single" w:sz="16" w:space="0" w:color="D3D3D3"/>
-              <w:bottom w:val="single" w:sz="16" w:space="0" w:color="D3D3D3"/>
-              <w:end w:val="single" w:space="0" w:color="D3D3D3"/>
+              <w:bottom w:val="single" w:sz="12" w:space="0" w:color="666666"/>
+              <w:top w:val="single" w:sz="12" w:space="0" w:color="666666"/>
+              <w:left w:val="none" w:sz="0" w:space="0" w:color="000000"/>
+              <w:right w:val="none" w:sz="0" w:space="0" w:color="000000"/>
             </w:tcBorders>
+            <w:shd w:val="clear" w:color="auto" w:fill="FFFFFF"/>
+            <w:tcMar>
+              <w:top w:w="0" w:type="dxa"/>
+              <w:bottom w:w="0" w:type="dxa"/>
+              <w:left w:w="0" w:type="dxa"/>
+              <w:right w:w="0" w:type="dxa"/>
+            </w:tcMar>
+            <w:vAlign w:val="top"/>
           </w:tcPr>
           <w:p>
             <w:pPr>
-              <w:spacing w:before="0" w:after="60"/>
-              <w:keepNext/>
-              <w:jc w:val="start"/>
+              <w:jc w:val="left"/>
+              <w:pBdr>
+                <w:bottom w:val="none" w:sz="0" w:space="0" w:color="000000"/>
+                <w:top w:val="none" w:sz="0" w:space="0" w:color="000000"/>
+                <w:left w:val="none" w:sz="0" w:space="0" w:color="000000"/>
+                <w:right w:val="none" w:sz="0" w:space="0" w:color="000000"/>
+              </w:pBdr>
+              <w:spacing w:after="100" w:before="100" w:line="240"/>
+              <w:ind w:left="100" w:right="100" w:firstLine="0" w:firstLineChars="0"/>
+              <w:rPr>
+                <w:rFonts w:ascii="Arial" w:hAnsi="Arial" w:eastAsia="Arial" w:cs="Arial"/>
+                <w:i w:val="false"/>
+                <w:b w:val="false"/>
+                <w:u w:val="none"/>
+                <w:sz w:val="22"/>
+                <w:szCs w:val="22"/>
+                <w:color w:val="000000"/>
+              </w:rPr>
             </w:pPr>
-            <w:r>
+            <w:r xmlns:w="http://schemas.openxmlformats.org/wordprocessingml/2006/main" xmlns:wp="http://schemas.openxmlformats.org/drawingml/2006/wordprocessingDrawing" xmlns:r="http://schemas.openxmlformats.org/officeDocument/2006/relationships" xmlns:w14="http://schemas.microsoft.com/office/word/2010/wordml">
               <w:rPr>
-                <w:rFonts w:ascii="Calibri" w:hAnsi="Calibri"/>
-                <w:sz w:val="20"/>
+                <w:rFonts w:ascii="Arial" w:hAnsi="Arial" w:eastAsia="Arial" w:cs="Arial"/>
+                <w:i w:val="false"/>
+                <w:b w:val="false"/>
+                <w:u w:val="none"/>
+                <w:sz w:val="22"/>
+                <w:szCs w:val="22"/>
+                <w:color w:val="000000"/>
               </w:rPr>
-              <w:t xml:space="default">Description</w:t>
+              <w:t xml:space="preserve">Description</w:t>
             </w:r>
           </w:p>
         </w:tc>
       </w:tr>
       <w:tr>
         <w:trPr>
-          <w:cantSplit/>
+          <w:trHeight w:val="360" w:hRule="auto"/>
         </w:trPr>
+        body 1
         <w:tc>
           <w:tcPr>
             <w:tcBorders>
-              <w:top w:val="single" w:space="0" w:color="D3D3D3"/>
-              <w:bottom w:val="single" w:space="0" w:color="D3D3D3"/>
-              <w:start w:val="single" w:space="0" w:color="D3D3D3"/>
-              <w:end w:val="single" w:space="0" w:color="D3D3D3"/>
+              <w:bottom w:val="none" w:sz="0" w:space="0" w:color="000000"/>
+              <w:top w:val="single" w:sz="12" w:space="0" w:color="666666"/>
+              <w:left w:val="none" w:sz="0" w:space="0" w:color="000000"/>
+              <w:right w:val="none" w:sz="0" w:space="0" w:color="000000"/>
             </w:tcBorders>
+            <w:shd w:val="clear" w:color="auto" w:fill="FFFFFF"/>
+            <w:tcMar>
+              <w:top w:w="0" w:type="dxa"/>
+              <w:bottom w:w="0" w:type="dxa"/>
+              <w:left w:w="0" w:type="dxa"/>
+              <w:right w:w="0" w:type="dxa"/>
+            </w:tcMar>
+            <w:vAlign w:val="top"/>
           </w:tcPr>
           <w:p>
             <w:pPr>
-              <w:spacing w:before="0" w:after="60"/>
-              <w:keepNext/>
-              <w:jc w:val="start"/>
+              <w:jc w:val="left"/>
+              <w:pBdr>
+                <w:bottom w:val="none" w:sz="0" w:space="0" w:color="000000"/>
+                <w:top w:val="none" w:sz="0" w:space="0" w:color="000000"/>
+                <w:left w:val="none" w:sz="0" w:space="0" w:color="000000"/>
+                <w:right w:val="none" w:sz="0" w:space="0" w:color="000000"/>
+              </w:pBdr>
+              <w:spacing w:after="80" w:before="80" w:line="240"/>
+              <w:ind w:left="80" w:right="80" w:firstLine="0" w:firstLineChars="0"/>
+              <w:rPr>
+                <w:rFonts w:ascii="Arial" w:hAnsi="Arial" w:eastAsia="Arial" w:cs="Arial"/>
+                <w:i w:val="false"/>
+                <w:b w:val="false"/>
+                <w:u w:val="none"/>
+                <w:sz w:val="22"/>
+                <w:szCs w:val="22"/>
+                <w:color w:val="000000"/>
+              </w:rPr>
             </w:pPr>
-            <w:r>
+            <w:r xmlns:w="http://schemas.openxmlformats.org/wordprocessingml/2006/main" xmlns:wp="http://schemas.openxmlformats.org/drawingml/2006/wordprocessingDrawing" xmlns:r="http://schemas.openxmlformats.org/officeDocument/2006/relationships" xmlns:w14="http://schemas.microsoft.com/office/word/2010/wordml">
               <w:rPr>
-                <w:rFonts w:ascii="Calibri" w:hAnsi="Calibri"/>
-                <w:sz w:val="20"/>
+                <w:rFonts w:ascii="Arial" w:hAnsi="Arial" w:eastAsia="Arial" w:cs="Arial"/>
+                <w:i w:val="false"/>
+                <w:b w:val="false"/>
+                <w:u w:val="none"/>
+                <w:sz w:val="22"/>
+                <w:szCs w:val="22"/>
+                <w:color w:val="000000"/>
               </w:rPr>
-              <w:t xml:space="default">Solar</w:t>
+              <w:t xml:space="preserve">Solar</w:t>
             </w:r>
           </w:p>
         </w:tc>
         <w:tc>
           <w:tcPr>
             <w:tcBorders>
-              <w:top w:val="single" w:space="0" w:color="D3D3D3"/>
-              <w:bottom w:val="single" w:space="0" w:color="D3D3D3"/>
-              <w:start w:val="single" w:space="0" w:color="D3D3D3"/>
-              <w:end w:val="single" w:space="0" w:color="D3D3D3"/>
+              <w:bottom w:val="none" w:sz="0" w:space="0" w:color="000000"/>
+              <w:top w:val="single" w:sz="12" w:space="0" w:color="666666"/>
+              <w:left w:val="none" w:sz="0" w:space="0" w:color="000000"/>
+              <w:right w:val="none" w:sz="0" w:space="0" w:color="000000"/>
             </w:tcBorders>
+            <w:shd w:val="clear" w:color="auto" w:fill="FFFFFF"/>
+            <w:tcMar>
+              <w:top w:w="0" w:type="dxa"/>
+              <w:bottom w:w="0" w:type="dxa"/>
+              <w:left w:w="0" w:type="dxa"/>
+              <w:right w:w="0" w:type="dxa"/>
+            </w:tcMar>
+            <w:vAlign w:val="top"/>
           </w:tcPr>
           <w:p>
             <w:pPr>
-              <w:spacing w:before="0" w:after="60"/>
-              <w:keepNext/>
-              <w:jc w:val="start"/>
+              <w:jc w:val="left"/>
+              <w:pBdr>
+                <w:bottom w:val="none" w:sz="0" w:space="0" w:color="000000"/>
+                <w:top w:val="none" w:sz="0" w:space="0" w:color="000000"/>
+                <w:left w:val="none" w:sz="0" w:space="0" w:color="000000"/>
+                <w:right w:val="none" w:sz="0" w:space="0" w:color="000000"/>
+              </w:pBdr>
+              <w:spacing w:after="80" w:before="80" w:line="240"/>
+              <w:ind w:left="80" w:right="80" w:firstLine="0" w:firstLineChars="0"/>
+              <w:rPr>
+                <w:rFonts w:ascii="Arial" w:hAnsi="Arial" w:eastAsia="Arial" w:cs="Arial"/>
+                <w:i w:val="false"/>
+                <w:b w:val="false"/>
+                <w:u w:val="none"/>
+                <w:sz w:val="22"/>
+                <w:szCs w:val="22"/>
+                <w:color w:val="000000"/>
+              </w:rPr>
             </w:pPr>
-            <w:r>
+            <w:r xmlns:w="http://schemas.openxmlformats.org/wordprocessingml/2006/main" xmlns:wp="http://schemas.openxmlformats.org/drawingml/2006/wordprocessingDrawing" xmlns:r="http://schemas.openxmlformats.org/officeDocument/2006/relationships" xmlns:w14="http://schemas.microsoft.com/office/word/2010/wordml">
               <w:rPr>
-                <w:rFonts w:ascii="Calibri" w:hAnsi="Calibri"/>
-                <w:sz w:val="20"/>
+                <w:rFonts w:ascii="Arial" w:hAnsi="Arial" w:eastAsia="Arial" w:cs="Arial"/>
+                <w:i w:val="false"/>
+                <w:b w:val="false"/>
+                <w:u w:val="none"/>
+                <w:sz w:val="22"/>
+                <w:szCs w:val="22"/>
+                <w:color w:val="000000"/>
               </w:rPr>
-              <w:t xml:space="default">Rooftop solar can supply most or all of your home electrical demands. Contact a solar company for pricing and details specific to your home.</w:t>
+              <w:t xml:space="preserve">Rooftop solar can supply most or all of your home electrical demands. Contact a solar company for pricing and details specific to your home.</w:t>
             </w:r>
           </w:p>
         </w:tc>
       </w:tr>
       <w:tr>
         <w:trPr>
-          <w:cantSplit/>
+          <w:trHeight w:val="360" w:hRule="auto"/>
         </w:trPr>
+        body 2
         <w:tc>
           <w:tcPr>
             <w:tcBorders>
-              <w:top w:val="single" w:space="0" w:color="D3D3D3"/>
-              <w:bottom w:val="single" w:space="0" w:color="D3D3D3"/>
-              <w:start w:val="single" w:space="0" w:color="D3D3D3"/>
-              <w:end w:val="single" w:space="0" w:color="D3D3D3"/>
+              <w:bottom w:val="none" w:sz="0" w:space="0" w:color="000000"/>
+              <w:top w:val="none" w:sz="0" w:space="0" w:color="000000"/>
+              <w:left w:val="none" w:sz="0" w:space="0" w:color="000000"/>
+              <w:right w:val="none" w:sz="0" w:space="0" w:color="000000"/>
             </w:tcBorders>
+            <w:shd w:val="clear" w:color="auto" w:fill="FFFFFF"/>
+            <w:tcMar>
+              <w:top w:w="0" w:type="dxa"/>
+              <w:bottom w:w="0" w:type="dxa"/>
+              <w:left w:w="0" w:type="dxa"/>
+              <w:right w:w="0" w:type="dxa"/>
+            </w:tcMar>
+            <w:vAlign w:val="top"/>
           </w:tcPr>
           <w:p>
             <w:pPr>
-              <w:spacing w:before="0" w:after="60"/>
-              <w:keepNext/>
-              <w:jc w:val="start"/>
+              <w:jc w:val="left"/>
+              <w:pBdr>
+                <w:bottom w:val="none" w:sz="0" w:space="0" w:color="000000"/>
+                <w:top w:val="none" w:sz="0" w:space="0" w:color="000000"/>
+                <w:left w:val="none" w:sz="0" w:space="0" w:color="000000"/>
+                <w:right w:val="none" w:sz="0" w:space="0" w:color="000000"/>
+              </w:pBdr>
+              <w:spacing w:after="80" w:before="80" w:line="240"/>
+              <w:ind w:left="80" w:right="80" w:firstLine="0" w:firstLineChars="0"/>
+              <w:rPr>
+                <w:rFonts w:ascii="Arial" w:hAnsi="Arial" w:eastAsia="Arial" w:cs="Arial"/>
+                <w:i w:val="false"/>
+                <w:b w:val="false"/>
+                <w:u w:val="none"/>
+                <w:sz w:val="22"/>
+                <w:szCs w:val="22"/>
+                <w:color w:val="000000"/>
+              </w:rPr>
             </w:pPr>
-            <w:r>
+            <w:r xmlns:w="http://schemas.openxmlformats.org/wordprocessingml/2006/main" xmlns:wp="http://schemas.openxmlformats.org/drawingml/2006/wordprocessingDrawing" xmlns:r="http://schemas.openxmlformats.org/officeDocument/2006/relationships" xmlns:w14="http://schemas.microsoft.com/office/word/2010/wordml">
               <w:rPr>
-                <w:rFonts w:ascii="Calibri" w:hAnsi="Calibri"/>
-                <w:sz w:val="20"/>
+                <w:rFonts w:ascii="Arial" w:hAnsi="Arial" w:eastAsia="Arial" w:cs="Arial"/>
+                <w:i w:val="false"/>
+                <w:b w:val="false"/>
+                <w:u w:val="none"/>
+                <w:sz w:val="22"/>
+                <w:szCs w:val="22"/>
+                <w:color w:val="000000"/>
               </w:rPr>
-              <w:t xml:space="default">Misc. Air Sealing and Insulation</w:t>
+              <w:t xml:space="preserve">Misc. Air Sealing and Insulation</w:t>
             </w:r>
           </w:p>
         </w:tc>
         <w:tc>
           <w:tcPr>
             <w:tcBorders>
-              <w:top w:val="single" w:space="0" w:color="D3D3D3"/>
-              <w:bottom w:val="single" w:space="0" w:color="D3D3D3"/>
-              <w:start w:val="single" w:space="0" w:color="D3D3D3"/>
-              <w:end w:val="single" w:space="0" w:color="D3D3D3"/>
+              <w:bottom w:val="none" w:sz="0" w:space="0" w:color="000000"/>
+              <w:top w:val="none" w:sz="0" w:space="0" w:color="000000"/>
+              <w:left w:val="none" w:sz="0" w:space="0" w:color="000000"/>
+              <w:right w:val="none" w:sz="0" w:space="0" w:color="000000"/>
             </w:tcBorders>
+            <w:shd w:val="clear" w:color="auto" w:fill="FFFFFF"/>
+            <w:tcMar>
+              <w:top w:w="0" w:type="dxa"/>
+              <w:bottom w:w="0" w:type="dxa"/>
+              <w:left w:w="0" w:type="dxa"/>
+              <w:right w:w="0" w:type="dxa"/>
+            </w:tcMar>
+            <w:vAlign w:val="top"/>
           </w:tcPr>
           <w:p>
             <w:pPr>
-              <w:spacing w:before="0" w:after="60"/>
-              <w:keepNext/>
-              <w:jc w:val="start"/>
+              <w:jc w:val="left"/>
+              <w:pBdr>
+                <w:bottom w:val="none" w:sz="0" w:space="0" w:color="000000"/>
+                <w:top w:val="none" w:sz="0" w:space="0" w:color="000000"/>
+                <w:left w:val="none" w:sz="0" w:space="0" w:color="000000"/>
+                <w:right w:val="none" w:sz="0" w:space="0" w:color="000000"/>
+              </w:pBdr>
+              <w:spacing w:after="80" w:before="80" w:line="240"/>
+              <w:ind w:left="80" w:right="80" w:firstLine="0" w:firstLineChars="0"/>
+              <w:rPr>
+                <w:rFonts w:ascii="Arial" w:hAnsi="Arial" w:eastAsia="Arial" w:cs="Arial"/>
+                <w:i w:val="false"/>
+                <w:b w:val="false"/>
+                <w:u w:val="none"/>
+                <w:sz w:val="22"/>
+                <w:szCs w:val="22"/>
+                <w:color w:val="000000"/>
+              </w:rPr>
             </w:pPr>
-            <w:r>
+            <w:r xmlns:w="http://schemas.openxmlformats.org/wordprocessingml/2006/main" xmlns:wp="http://schemas.openxmlformats.org/drawingml/2006/wordprocessingDrawing" xmlns:r="http://schemas.openxmlformats.org/officeDocument/2006/relationships" xmlns:w14="http://schemas.microsoft.com/office/word/2010/wordml">
               <w:rPr>
-                <w:rFonts w:ascii="Calibri" w:hAnsi="Calibri"/>
-                <w:sz w:val="20"/>
+                <w:rFonts w:ascii="Arial" w:hAnsi="Arial" w:eastAsia="Arial" w:cs="Arial"/>
+                <w:i w:val="false"/>
+                <w:b w:val="false"/>
+                <w:u w:val="none"/>
+                <w:sz w:val="22"/>
+                <w:szCs w:val="22"/>
+                <w:color w:val="000000"/>
               </w:rPr>
-              <w:t xml:space="default">Air seal and insulate [** insert auditor description - bay window, bulkhead door, chase, kneewall, anything else that is unique to the home and not otherwise covered in another recommendation]</w:t>
+              <w:t xml:space="preserve">Air seal and insulate [** insert auditor description - bay window, bulkhead door, chase, kneewall, anything else that is unique to the home and not otherwise covered in another recommendation]</w:t>
             </w:r>
           </w:p>
         </w:tc>
       </w:tr>
       <w:tr>
         <w:trPr>
-          <w:cantSplit/>
+          <w:trHeight w:val="360" w:hRule="auto"/>
         </w:trPr>
+        body 3
         <w:tc>
           <w:tcPr>
             <w:tcBorders>
-              <w:top w:val="single" w:space="0" w:color="D3D3D3"/>
-              <w:bottom w:val="single" w:space="0" w:color="D3D3D3"/>
-              <w:start w:val="single" w:space="0" w:color="D3D3D3"/>
-              <w:end w:val="single" w:space="0" w:color="D3D3D3"/>
+              <w:bottom w:val="none" w:sz="0" w:space="0" w:color="000000"/>
+              <w:top w:val="none" w:sz="0" w:space="0" w:color="000000"/>
+              <w:left w:val="none" w:sz="0" w:space="0" w:color="000000"/>
+              <w:right w:val="none" w:sz="0" w:space="0" w:color="000000"/>
             </w:tcBorders>
+            <w:shd w:val="clear" w:color="auto" w:fill="FFFFFF"/>
+            <w:tcMar>
+              <w:top w:w="0" w:type="dxa"/>
+              <w:bottom w:w="0" w:type="dxa"/>
+              <w:left w:w="0" w:type="dxa"/>
+              <w:right w:w="0" w:type="dxa"/>
+            </w:tcMar>
+            <w:vAlign w:val="top"/>
           </w:tcPr>
           <w:p>
             <w:pPr>
-              <w:spacing w:before="0" w:after="60"/>
-              <w:keepNext/>
-              <w:jc w:val="start"/>
+              <w:jc w:val="left"/>
+              <w:pBdr>
+                <w:bottom w:val="none" w:sz="0" w:space="0" w:color="000000"/>
+                <w:top w:val="none" w:sz="0" w:space="0" w:color="000000"/>
+                <w:left w:val="none" w:sz="0" w:space="0" w:color="000000"/>
+                <w:right w:val="none" w:sz="0" w:space="0" w:color="000000"/>
+              </w:pBdr>
+              <w:spacing w:after="80" w:before="80" w:line="240"/>
+              <w:ind w:left="80" w:right="80" w:firstLine="0" w:firstLineChars="0"/>
+              <w:rPr>
+                <w:rFonts w:ascii="Arial" w:hAnsi="Arial" w:eastAsia="Arial" w:cs="Arial"/>
+                <w:i w:val="false"/>
+                <w:b w:val="false"/>
+                <w:u w:val="none"/>
+                <w:sz w:val="22"/>
+                <w:szCs w:val="22"/>
+                <w:color w:val="000000"/>
+              </w:rPr>
             </w:pPr>
-            <w:r>
+            <w:r xmlns:w="http://schemas.openxmlformats.org/wordprocessingml/2006/main" xmlns:wp="http://schemas.openxmlformats.org/drawingml/2006/wordprocessingDrawing" xmlns:r="http://schemas.openxmlformats.org/officeDocument/2006/relationships" xmlns:w14="http://schemas.microsoft.com/office/word/2010/wordml">
               <w:rPr>
-                <w:rFonts w:ascii="Calibri" w:hAnsi="Calibri"/>
-                <w:sz w:val="20"/>
+                <w:rFonts w:ascii="Arial" w:hAnsi="Arial" w:eastAsia="Arial" w:cs="Arial"/>
+                <w:i w:val="false"/>
+                <w:b w:val="false"/>
+                <w:u w:val="none"/>
+                <w:sz w:val="22"/>
+                <w:szCs w:val="22"/>
+                <w:color w:val="000000"/>
               </w:rPr>
-              <w:t xml:space="default">Furnace/Boiler Tune-up</w:t>
+              <w:t xml:space="preserve">Furnace/Boiler Tune-up</w:t>
             </w:r>
           </w:p>
         </w:tc>
         <w:tc>
           <w:tcPr>
             <w:tcBorders>
-              <w:top w:val="single" w:space="0" w:color="D3D3D3"/>
-              <w:bottom w:val="single" w:space="0" w:color="D3D3D3"/>
-              <w:start w:val="single" w:space="0" w:color="D3D3D3"/>
-              <w:end w:val="single" w:space="0" w:color="D3D3D3"/>
+              <w:bottom w:val="none" w:sz="0" w:space="0" w:color="000000"/>
+              <w:top w:val="none" w:sz="0" w:space="0" w:color="000000"/>
+              <w:left w:val="none" w:sz="0" w:space="0" w:color="000000"/>
+              <w:right w:val="none" w:sz="0" w:space="0" w:color="000000"/>
             </w:tcBorders>
+            <w:shd w:val="clear" w:color="auto" w:fill="FFFFFF"/>
+            <w:tcMar>
+              <w:top w:w="0" w:type="dxa"/>
+              <w:bottom w:w="0" w:type="dxa"/>
+              <w:left w:w="0" w:type="dxa"/>
+              <w:right w:w="0" w:type="dxa"/>
+            </w:tcMar>
+            <w:vAlign w:val="top"/>
           </w:tcPr>
           <w:p>
             <w:pPr>
-              <w:spacing w:before="0" w:after="60"/>
-              <w:keepNext/>
-              <w:jc w:val="start"/>
+              <w:jc w:val="left"/>
+              <w:pBdr>
+                <w:bottom w:val="none" w:sz="0" w:space="0" w:color="000000"/>
+                <w:top w:val="none" w:sz="0" w:space="0" w:color="000000"/>
+                <w:left w:val="none" w:sz="0" w:space="0" w:color="000000"/>
+                <w:right w:val="none" w:sz="0" w:space="0" w:color="000000"/>
+              </w:pBdr>
+              <w:spacing w:after="80" w:before="80" w:line="240"/>
+              <w:ind w:left="80" w:right="80" w:firstLine="0" w:firstLineChars="0"/>
+              <w:rPr>
+                <w:rFonts w:ascii="Arial" w:hAnsi="Arial" w:eastAsia="Arial" w:cs="Arial"/>
+                <w:i w:val="false"/>
+                <w:b w:val="false"/>
+                <w:u w:val="none"/>
+                <w:sz w:val="22"/>
+                <w:szCs w:val="22"/>
+                <w:color w:val="000000"/>
+              </w:rPr>
             </w:pPr>
-            <w:r>
+            <w:r xmlns:w="http://schemas.openxmlformats.org/wordprocessingml/2006/main" xmlns:wp="http://schemas.openxmlformats.org/drawingml/2006/wordprocessingDrawing" xmlns:r="http://schemas.openxmlformats.org/officeDocument/2006/relationships" xmlns:w14="http://schemas.microsoft.com/office/word/2010/wordml">
               <w:rPr>
-                <w:rFonts w:ascii="Calibri" w:hAnsi="Calibri"/>
-                <w:sz w:val="20"/>
+                <w:rFonts w:ascii="Arial" w:hAnsi="Arial" w:eastAsia="Arial" w:cs="Arial"/>
+                <w:i w:val="false"/>
+                <w:b w:val="false"/>
+                <w:u w:val="none"/>
+                <w:sz w:val="22"/>
+                <w:szCs w:val="22"/>
+                <w:color w:val="000000"/>
               </w:rPr>
-              <w:t xml:space="default">Have the furnace/boiler and flue inspected and adjusted by a licensed professional. This should be available from your fuel delivery company.</w:t>
+              <w:t xml:space="preserve">Have the furnace/boiler and flue inspected and adjusted by a licensed professional. This should be available from your fuel delivery company.</w:t>
             </w:r>
           </w:p>
         </w:tc>
       </w:tr>
       <w:tr>
         <w:trPr>
-          <w:cantSplit/>
+          <w:trHeight w:val="360" w:hRule="auto"/>
         </w:trPr>
+        body 4
         <w:tc>
           <w:tcPr>
             <w:tcBorders>
-              <w:top w:val="single" w:space="0" w:color="D3D3D3"/>
-              <w:bottom w:val="single" w:space="0" w:color="D3D3D3"/>
-              <w:start w:val="single" w:space="0" w:color="D3D3D3"/>
-              <w:end w:val="single" w:space="0" w:color="D3D3D3"/>
+              <w:bottom w:val="none" w:sz="0" w:space="0" w:color="000000"/>
+              <w:top w:val="none" w:sz="0" w:space="0" w:color="000000"/>
+              <w:left w:val="none" w:sz="0" w:space="0" w:color="000000"/>
+              <w:right w:val="none" w:sz="0" w:space="0" w:color="000000"/>
             </w:tcBorders>
+            <w:shd w:val="clear" w:color="auto" w:fill="FFFFFF"/>
+            <w:tcMar>
+              <w:top w:w="0" w:type="dxa"/>
+              <w:bottom w:w="0" w:type="dxa"/>
+              <w:left w:w="0" w:type="dxa"/>
+              <w:right w:w="0" w:type="dxa"/>
+            </w:tcMar>
+            <w:vAlign w:val="top"/>
           </w:tcPr>
           <w:p>
             <w:pPr>
-              <w:spacing w:before="0" w:after="60"/>
-              <w:keepNext/>
-              <w:jc w:val="start"/>
+              <w:jc w:val="left"/>
+              <w:pBdr>
+                <w:bottom w:val="none" w:sz="0" w:space="0" w:color="000000"/>
+                <w:top w:val="none" w:sz="0" w:space="0" w:color="000000"/>
+                <w:left w:val="none" w:sz="0" w:space="0" w:color="000000"/>
+                <w:right w:val="none" w:sz="0" w:space="0" w:color="000000"/>
+              </w:pBdr>
+              <w:spacing w:after="80" w:before="80" w:line="240"/>
+              <w:ind w:left="80" w:right="80" w:firstLine="0" w:firstLineChars="0"/>
+              <w:rPr>
+                <w:rFonts w:ascii="Arial" w:hAnsi="Arial" w:eastAsia="Arial" w:cs="Arial"/>
+                <w:i w:val="false"/>
+                <w:b w:val="false"/>
+                <w:u w:val="none"/>
+                <w:sz w:val="22"/>
+                <w:szCs w:val="22"/>
+                <w:color w:val="000000"/>
+              </w:rPr>
             </w:pPr>
-            <w:r>
+            <w:r xmlns:w="http://schemas.openxmlformats.org/wordprocessingml/2006/main" xmlns:wp="http://schemas.openxmlformats.org/drawingml/2006/wordprocessingDrawing" xmlns:r="http://schemas.openxmlformats.org/officeDocument/2006/relationships" xmlns:w14="http://schemas.microsoft.com/office/word/2010/wordml">
               <w:rPr>
-                <w:rFonts w:ascii="Calibri" w:hAnsi="Calibri"/>
-                <w:sz w:val="20"/>
+                <w:rFonts w:ascii="Arial" w:hAnsi="Arial" w:eastAsia="Arial" w:cs="Arial"/>
+                <w:i w:val="false"/>
+                <w:b w:val="false"/>
+                <w:u w:val="none"/>
+                <w:sz w:val="22"/>
+                <w:szCs w:val="22"/>
+                <w:color w:val="000000"/>
               </w:rPr>
-              <w:t xml:space="default">High-efficiency Shower Head(s)</w:t>
+              <w:t xml:space="preserve">High-efficiency Shower Head(s)</w:t>
             </w:r>
           </w:p>
         </w:tc>
         <w:tc>
           <w:tcPr>
             <w:tcBorders>
-              <w:top w:val="single" w:space="0" w:color="D3D3D3"/>
-              <w:bottom w:val="single" w:space="0" w:color="D3D3D3"/>
-              <w:start w:val="single" w:space="0" w:color="D3D3D3"/>
-              <w:end w:val="single" w:space="0" w:color="D3D3D3"/>
+              <w:bottom w:val="none" w:sz="0" w:space="0" w:color="000000"/>
+              <w:top w:val="none" w:sz="0" w:space="0" w:color="000000"/>
+              <w:left w:val="none" w:sz="0" w:space="0" w:color="000000"/>
+              <w:right w:val="none" w:sz="0" w:space="0" w:color="000000"/>
             </w:tcBorders>
+            <w:shd w:val="clear" w:color="auto" w:fill="FFFFFF"/>
+            <w:tcMar>
+              <w:top w:w="0" w:type="dxa"/>
+              <w:bottom w:w="0" w:type="dxa"/>
+              <w:left w:w="0" w:type="dxa"/>
+              <w:right w:w="0" w:type="dxa"/>
+            </w:tcMar>
+            <w:vAlign w:val="top"/>
           </w:tcPr>
           <w:p>
             <w:pPr>
-              <w:spacing w:before="0" w:after="60"/>
-              <w:keepNext/>
-              <w:jc w:val="start"/>
+              <w:jc w:val="left"/>
+              <w:pBdr>
+                <w:bottom w:val="none" w:sz="0" w:space="0" w:color="000000"/>
+                <w:top w:val="none" w:sz="0" w:space="0" w:color="000000"/>
+                <w:left w:val="none" w:sz="0" w:space="0" w:color="000000"/>
+                <w:right w:val="none" w:sz="0" w:space="0" w:color="000000"/>
+              </w:pBdr>
+              <w:spacing w:after="80" w:before="80" w:line="240"/>
+              <w:ind w:left="80" w:right="80" w:firstLine="0" w:firstLineChars="0"/>
+              <w:rPr>
+                <w:rFonts w:ascii="Arial" w:hAnsi="Arial" w:eastAsia="Arial" w:cs="Arial"/>
+                <w:i w:val="false"/>
+                <w:b w:val="false"/>
+                <w:u w:val="none"/>
+                <w:sz w:val="22"/>
+                <w:szCs w:val="22"/>
+                <w:color w:val="000000"/>
+              </w:rPr>
             </w:pPr>
-            <w:r>
+            <w:r xmlns:w="http://schemas.openxmlformats.org/wordprocessingml/2006/main" xmlns:wp="http://schemas.openxmlformats.org/drawingml/2006/wordprocessingDrawing" xmlns:r="http://schemas.openxmlformats.org/officeDocument/2006/relationships" xmlns:w14="http://schemas.microsoft.com/office/word/2010/wordml">
               <w:rPr>
-                <w:rFonts w:ascii="Calibri" w:hAnsi="Calibri"/>
-                <w:sz w:val="20"/>
+                <w:rFonts w:ascii="Arial" w:hAnsi="Arial" w:eastAsia="Arial" w:cs="Arial"/>
+                <w:i w:val="false"/>
+                <w:b w:val="false"/>
+                <w:u w:val="none"/>
+                <w:sz w:val="22"/>
+                <w:szCs w:val="22"/>
+                <w:color w:val="000000"/>
               </w:rPr>
-              <w:t xml:space="default">Install high-efficiency shower heads to reduce the amount of water and energy to heat the water used when showering.</w:t>
+              <w:t xml:space="preserve">Install high-efficiency shower heads to reduce the amount of water and energy to heat the water used when showering.</w:t>
             </w:r>
           </w:p>
         </w:tc>
       </w:tr>
       <w:tr>
         <w:trPr>
-          <w:cantSplit/>
+          <w:trHeight w:val="360" w:hRule="auto"/>
         </w:trPr>
+        body 5
         <w:tc>
           <w:tcPr>
             <w:tcBorders>
-              <w:top w:val="single" w:space="0" w:color="D3D3D3"/>
-              <w:bottom w:val="single" w:space="0" w:color="D3D3D3"/>
-              <w:start w:val="single" w:space="0" w:color="D3D3D3"/>
-              <w:end w:val="single" w:space="0" w:color="D3D3D3"/>
+              <w:bottom w:val="none" w:sz="0" w:space="0" w:color="000000"/>
+              <w:top w:val="none" w:sz="0" w:space="0" w:color="000000"/>
+              <w:left w:val="none" w:sz="0" w:space="0" w:color="000000"/>
+              <w:right w:val="none" w:sz="0" w:space="0" w:color="000000"/>
             </w:tcBorders>
+            <w:shd w:val="clear" w:color="auto" w:fill="FFFFFF"/>
+            <w:tcMar>
+              <w:top w:w="0" w:type="dxa"/>
+              <w:bottom w:w="0" w:type="dxa"/>
+              <w:left w:w="0" w:type="dxa"/>
+              <w:right w:w="0" w:type="dxa"/>
+            </w:tcMar>
+            <w:vAlign w:val="top"/>
           </w:tcPr>
           <w:p>
             <w:pPr>
-              <w:spacing w:before="0" w:after="60"/>
-              <w:keepNext/>
-              <w:jc w:val="start"/>
+              <w:jc w:val="left"/>
+              <w:pBdr>
+                <w:bottom w:val="none" w:sz="0" w:space="0" w:color="000000"/>
+                <w:top w:val="none" w:sz="0" w:space="0" w:color="000000"/>
+                <w:left w:val="none" w:sz="0" w:space="0" w:color="000000"/>
+                <w:right w:val="none" w:sz="0" w:space="0" w:color="000000"/>
+              </w:pBdr>
+              <w:spacing w:after="80" w:before="80" w:line="240"/>
+              <w:ind w:left="80" w:right="80" w:firstLine="0" w:firstLineChars="0"/>
+              <w:rPr>
+                <w:rFonts w:ascii="Arial" w:hAnsi="Arial" w:eastAsia="Arial" w:cs="Arial"/>
+                <w:i w:val="false"/>
+                <w:b w:val="false"/>
+                <w:u w:val="none"/>
+                <w:sz w:val="22"/>
+                <w:szCs w:val="22"/>
+                <w:color w:val="000000"/>
+              </w:rPr>
             </w:pPr>
-            <w:r>
+            <w:r xmlns:w="http://schemas.openxmlformats.org/wordprocessingml/2006/main" xmlns:wp="http://schemas.openxmlformats.org/drawingml/2006/wordprocessingDrawing" xmlns:r="http://schemas.openxmlformats.org/officeDocument/2006/relationships" xmlns:w14="http://schemas.microsoft.com/office/word/2010/wordml">
               <w:rPr>
-                <w:rFonts w:ascii="Calibri" w:hAnsi="Calibri"/>
-                <w:sz w:val="20"/>
+                <w:rFonts w:ascii="Arial" w:hAnsi="Arial" w:eastAsia="Arial" w:cs="Arial"/>
+                <w:i w:val="false"/>
+                <w:b w:val="false"/>
+                <w:u w:val="none"/>
+                <w:sz w:val="22"/>
+                <w:szCs w:val="22"/>
+                <w:color w:val="000000"/>
               </w:rPr>
-              <w:t xml:space="default">LEDs</w:t>
+              <w:t xml:space="preserve">LEDs</w:t>
             </w:r>
           </w:p>
         </w:tc>
         <w:tc>
           <w:tcPr>
             <w:tcBorders>
-              <w:top w:val="single" w:space="0" w:color="D3D3D3"/>
-              <w:bottom w:val="single" w:space="0" w:color="D3D3D3"/>
-              <w:start w:val="single" w:space="0" w:color="D3D3D3"/>
-              <w:end w:val="single" w:space="0" w:color="D3D3D3"/>
+              <w:bottom w:val="none" w:sz="0" w:space="0" w:color="000000"/>
+              <w:top w:val="none" w:sz="0" w:space="0" w:color="000000"/>
+              <w:left w:val="none" w:sz="0" w:space="0" w:color="000000"/>
+              <w:right w:val="none" w:sz="0" w:space="0" w:color="000000"/>
             </w:tcBorders>
+            <w:shd w:val="clear" w:color="auto" w:fill="FFFFFF"/>
+            <w:tcMar>
+              <w:top w:w="0" w:type="dxa"/>
+              <w:bottom w:w="0" w:type="dxa"/>
+              <w:left w:w="0" w:type="dxa"/>
+              <w:right w:w="0" w:type="dxa"/>
+            </w:tcMar>
+            <w:vAlign w:val="top"/>
           </w:tcPr>
           <w:p>
             <w:pPr>
-              <w:spacing w:before="0" w:after="60"/>
-              <w:keepNext/>
-              <w:jc w:val="start"/>
+              <w:jc w:val="left"/>
+              <w:pBdr>
+                <w:bottom w:val="none" w:sz="0" w:space="0" w:color="000000"/>
+                <w:top w:val="none" w:sz="0" w:space="0" w:color="000000"/>
+                <w:left w:val="none" w:sz="0" w:space="0" w:color="000000"/>
+                <w:right w:val="none" w:sz="0" w:space="0" w:color="000000"/>
+              </w:pBdr>
+              <w:spacing w:after="80" w:before="80" w:line="240"/>
+              <w:ind w:left="80" w:right="80" w:firstLine="0" w:firstLineChars="0"/>
+              <w:rPr>
+                <w:rFonts w:ascii="Arial" w:hAnsi="Arial" w:eastAsia="Arial" w:cs="Arial"/>
+                <w:i w:val="false"/>
+                <w:b w:val="false"/>
+                <w:u w:val="none"/>
+                <w:sz w:val="22"/>
+                <w:szCs w:val="22"/>
+                <w:color w:val="000000"/>
+              </w:rPr>
             </w:pPr>
-            <w:r>
+            <w:r xmlns:w="http://schemas.openxmlformats.org/wordprocessingml/2006/main" xmlns:wp="http://schemas.openxmlformats.org/drawingml/2006/wordprocessingDrawing" xmlns:r="http://schemas.openxmlformats.org/officeDocument/2006/relationships" xmlns:w14="http://schemas.microsoft.com/office/word/2010/wordml">
               <w:rPr>
-                <w:rFonts w:ascii="Calibri" w:hAnsi="Calibri"/>
-                <w:sz w:val="20"/>
+                <w:rFonts w:ascii="Arial" w:hAnsi="Arial" w:eastAsia="Arial" w:cs="Arial"/>
+                <w:i w:val="false"/>
+                <w:b w:val="false"/>
+                <w:u w:val="none"/>
+                <w:sz w:val="22"/>
+                <w:szCs w:val="22"/>
+                <w:color w:val="000000"/>
               </w:rPr>
-              <w:t xml:space="default">Switch your light bulbs to LED light bulbs. LEDs use 80% less energy than incandescent light bulbs, which can significantly reduce your electricity bill.</w:t>
+              <w:t xml:space="preserve">Switch your light bulbs to LED light bulbs. LEDs use 80% less energy than incandescent light bulbs, which can significantly reduce your electricity bill.</w:t>
             </w:r>
           </w:p>
         </w:tc>
       </w:tr>
       <w:tr>
         <w:trPr>
-          <w:cantSplit/>
+          <w:trHeight w:val="360" w:hRule="auto"/>
         </w:trPr>
+        body 6
         <w:tc>
           <w:tcPr>
             <w:tcBorders>
-              <w:top w:val="single" w:space="0" w:color="D3D3D3"/>
-              <w:bottom w:val="single" w:space="0" w:color="D3D3D3"/>
-              <w:start w:val="single" w:space="0" w:color="D3D3D3"/>
-              <w:end w:val="single" w:space="0" w:color="D3D3D3"/>
+              <w:bottom w:val="none" w:sz="0" w:space="0" w:color="000000"/>
+              <w:top w:val="none" w:sz="0" w:space="0" w:color="000000"/>
+              <w:left w:val="none" w:sz="0" w:space="0" w:color="000000"/>
+              <w:right w:val="none" w:sz="0" w:space="0" w:color="000000"/>
             </w:tcBorders>
+            <w:shd w:val="clear" w:color="auto" w:fill="FFFFFF"/>
+            <w:tcMar>
+              <w:top w:w="0" w:type="dxa"/>
+              <w:bottom w:w="0" w:type="dxa"/>
+              <w:left w:w="0" w:type="dxa"/>
+              <w:right w:w="0" w:type="dxa"/>
+            </w:tcMar>
+            <w:vAlign w:val="top"/>
           </w:tcPr>
           <w:p>
             <w:pPr>
-              <w:spacing w:before="0" w:after="60"/>
-              <w:keepNext/>
-              <w:jc w:val="start"/>
+              <w:jc w:val="left"/>
+              <w:pBdr>
+                <w:bottom w:val="none" w:sz="0" w:space="0" w:color="000000"/>
+                <w:top w:val="none" w:sz="0" w:space="0" w:color="000000"/>
+                <w:left w:val="none" w:sz="0" w:space="0" w:color="000000"/>
+                <w:right w:val="none" w:sz="0" w:space="0" w:color="000000"/>
+              </w:pBdr>
+              <w:spacing w:after="80" w:before="80" w:line="240"/>
+              <w:ind w:left="80" w:right="80" w:firstLine="0" w:firstLineChars="0"/>
+              <w:rPr>
+                <w:rFonts w:ascii="Arial" w:hAnsi="Arial" w:eastAsia="Arial" w:cs="Arial"/>
+                <w:i w:val="false"/>
+                <w:b w:val="false"/>
+                <w:u w:val="none"/>
+                <w:sz w:val="22"/>
+                <w:szCs w:val="22"/>
+                <w:color w:val="000000"/>
+              </w:rPr>
             </w:pPr>
-            <w:r>
+            <w:r xmlns:w="http://schemas.openxmlformats.org/wordprocessingml/2006/main" xmlns:wp="http://schemas.openxmlformats.org/drawingml/2006/wordprocessingDrawing" xmlns:r="http://schemas.openxmlformats.org/officeDocument/2006/relationships" xmlns:w14="http://schemas.microsoft.com/office/word/2010/wordml">
               <w:rPr>
-                <w:rFonts w:ascii="Calibri" w:hAnsi="Calibri"/>
-                <w:sz w:val="20"/>
+                <w:rFonts w:ascii="Arial" w:hAnsi="Arial" w:eastAsia="Arial" w:cs="Arial"/>
+                <w:i w:val="false"/>
+                <w:b w:val="false"/>
+                <w:u w:val="none"/>
+                <w:sz w:val="22"/>
+                <w:szCs w:val="22"/>
+                <w:color w:val="000000"/>
               </w:rPr>
-              <w:t xml:space="default">Refrigerator</w:t>
+              <w:t xml:space="preserve">Refrigerator</w:t>
             </w:r>
           </w:p>
         </w:tc>
         <w:tc>
           <w:tcPr>
             <w:tcBorders>
-              <w:top w:val="single" w:space="0" w:color="D3D3D3"/>
-              <w:bottom w:val="single" w:space="0" w:color="D3D3D3"/>
-              <w:start w:val="single" w:space="0" w:color="D3D3D3"/>
-              <w:end w:val="single" w:space="0" w:color="D3D3D3"/>
+              <w:bottom w:val="none" w:sz="0" w:space="0" w:color="000000"/>
+              <w:top w:val="none" w:sz="0" w:space="0" w:color="000000"/>
+              <w:left w:val="none" w:sz="0" w:space="0" w:color="000000"/>
+              <w:right w:val="none" w:sz="0" w:space="0" w:color="000000"/>
             </w:tcBorders>
+            <w:shd w:val="clear" w:color="auto" w:fill="FFFFFF"/>
+            <w:tcMar>
+              <w:top w:w="0" w:type="dxa"/>
+              <w:bottom w:w="0" w:type="dxa"/>
+              <w:left w:w="0" w:type="dxa"/>
+              <w:right w:w="0" w:type="dxa"/>
+            </w:tcMar>
+            <w:vAlign w:val="top"/>
           </w:tcPr>
           <w:p>
             <w:pPr>
-              <w:spacing w:before="0" w:after="60"/>
-              <w:keepNext/>
-              <w:jc w:val="start"/>
+              <w:jc w:val="left"/>
+              <w:pBdr>
+                <w:bottom w:val="none" w:sz="0" w:space="0" w:color="000000"/>
+                <w:top w:val="none" w:sz="0" w:space="0" w:color="000000"/>
+                <w:left w:val="none" w:sz="0" w:space="0" w:color="000000"/>
+                <w:right w:val="none" w:sz="0" w:space="0" w:color="000000"/>
+              </w:pBdr>
+              <w:spacing w:after="80" w:before="80" w:line="240"/>
+              <w:ind w:left="80" w:right="80" w:firstLine="0" w:firstLineChars="0"/>
+              <w:rPr>
+                <w:rFonts w:ascii="Arial" w:hAnsi="Arial" w:eastAsia="Arial" w:cs="Arial"/>
+                <w:i w:val="false"/>
+                <w:b w:val="false"/>
+                <w:u w:val="none"/>
+                <w:sz w:val="22"/>
+                <w:szCs w:val="22"/>
+                <w:color w:val="000000"/>
+              </w:rPr>
             </w:pPr>
-            <w:r>
+            <w:r xmlns:w="http://schemas.openxmlformats.org/wordprocessingml/2006/main" xmlns:wp="http://schemas.openxmlformats.org/drawingml/2006/wordprocessingDrawing" xmlns:r="http://schemas.openxmlformats.org/officeDocument/2006/relationships" xmlns:w14="http://schemas.microsoft.com/office/word/2010/wordml">
               <w:rPr>
-                <w:rFonts w:ascii="Calibri" w:hAnsi="Calibri"/>
-                <w:sz w:val="20"/>
+                <w:rFonts w:ascii="Arial" w:hAnsi="Arial" w:eastAsia="Arial" w:cs="Arial"/>
+                <w:i w:val="false"/>
+                <w:b w:val="false"/>
+                <w:u w:val="none"/>
+                <w:sz w:val="22"/>
+                <w:szCs w:val="22"/>
+                <w:color w:val="000000"/>
               </w:rPr>
-              <w:t xml:space="default">Replace your refrigerator with a new, EnergyStar-certified fridge. Look at the Energy Guide label to compare the energy use of new refrigerators.</w:t>
+              <w:t xml:space="preserve">Replace your refrigerator with a new, EnergyStar-certified fridge. Look at the Energy Guide label to compare the energy use of new refrigerators.</w:t>
             </w:r>
           </w:p>
         </w:tc>
       </w:tr>
       <w:tr>
         <w:trPr>
-          <w:cantSplit/>
+          <w:trHeight w:val="360" w:hRule="auto"/>
         </w:trPr>
+        body 7
         <w:tc>
           <w:tcPr>
             <w:tcBorders>
-              <w:top w:val="single" w:space="0" w:color="D3D3D3"/>
-              <w:bottom w:val="single" w:space="0" w:color="D3D3D3"/>
-              <w:start w:val="single" w:space="0" w:color="D3D3D3"/>
-              <w:end w:val="single" w:space="0" w:color="D3D3D3"/>
+              <w:bottom w:val="none" w:sz="0" w:space="0" w:color="000000"/>
+              <w:top w:val="none" w:sz="0" w:space="0" w:color="000000"/>
+              <w:left w:val="none" w:sz="0" w:space="0" w:color="000000"/>
+              <w:right w:val="none" w:sz="0" w:space="0" w:color="000000"/>
             </w:tcBorders>
+            <w:shd w:val="clear" w:color="auto" w:fill="FFFFFF"/>
+            <w:tcMar>
+              <w:top w:w="0" w:type="dxa"/>
+              <w:bottom w:w="0" w:type="dxa"/>
+              <w:left w:w="0" w:type="dxa"/>
+              <w:right w:w="0" w:type="dxa"/>
+            </w:tcMar>
+            <w:vAlign w:val="top"/>
           </w:tcPr>
           <w:p>
             <w:pPr>
-              <w:spacing w:before="0" w:after="60"/>
-              <w:keepNext/>
-              <w:jc w:val="start"/>
+              <w:jc w:val="left"/>
+              <w:pBdr>
+                <w:bottom w:val="none" w:sz="0" w:space="0" w:color="000000"/>
+                <w:top w:val="none" w:sz="0" w:space="0" w:color="000000"/>
+                <w:left w:val="none" w:sz="0" w:space="0" w:color="000000"/>
+                <w:right w:val="none" w:sz="0" w:space="0" w:color="000000"/>
+              </w:pBdr>
+              <w:spacing w:after="80" w:before="80" w:line="240"/>
+              <w:ind w:left="80" w:right="80" w:firstLine="0" w:firstLineChars="0"/>
+              <w:rPr>
+                <w:rFonts w:ascii="Arial" w:hAnsi="Arial" w:eastAsia="Arial" w:cs="Arial"/>
+                <w:i w:val="false"/>
+                <w:b w:val="false"/>
+                <w:u w:val="none"/>
+                <w:sz w:val="22"/>
+                <w:szCs w:val="22"/>
+                <w:color w:val="000000"/>
+              </w:rPr>
             </w:pPr>
-            <w:r>
+            <w:r xmlns:w="http://schemas.openxmlformats.org/wordprocessingml/2006/main" xmlns:wp="http://schemas.openxmlformats.org/drawingml/2006/wordprocessingDrawing" xmlns:r="http://schemas.openxmlformats.org/officeDocument/2006/relationships" xmlns:w14="http://schemas.microsoft.com/office/word/2010/wordml">
               <w:rPr>
-                <w:rFonts w:ascii="Calibri" w:hAnsi="Calibri"/>
-                <w:sz w:val="20"/>
+                <w:rFonts w:ascii="Arial" w:hAnsi="Arial" w:eastAsia="Arial" w:cs="Arial"/>
+                <w:i w:val="false"/>
+                <w:b w:val="false"/>
+                <w:u w:val="none"/>
+                <w:sz w:val="22"/>
+                <w:szCs w:val="22"/>
+                <w:color w:val="000000"/>
               </w:rPr>
-              <w:t xml:space="default">Induction Stove/Oven</w:t>
+              <w:t xml:space="preserve">Induction Stove/Oven</w:t>
             </w:r>
           </w:p>
         </w:tc>
         <w:tc>
           <w:tcPr>
             <w:tcBorders>
-              <w:top w:val="single" w:space="0" w:color="D3D3D3"/>
-              <w:bottom w:val="single" w:space="0" w:color="D3D3D3"/>
-              <w:start w:val="single" w:space="0" w:color="D3D3D3"/>
-              <w:end w:val="single" w:space="0" w:color="D3D3D3"/>
+              <w:bottom w:val="none" w:sz="0" w:space="0" w:color="000000"/>
+              <w:top w:val="none" w:sz="0" w:space="0" w:color="000000"/>
+              <w:left w:val="none" w:sz="0" w:space="0" w:color="000000"/>
+              <w:right w:val="none" w:sz="0" w:space="0" w:color="000000"/>
             </w:tcBorders>
+            <w:shd w:val="clear" w:color="auto" w:fill="FFFFFF"/>
+            <w:tcMar>
+              <w:top w:w="0" w:type="dxa"/>
+              <w:bottom w:w="0" w:type="dxa"/>
+              <w:left w:w="0" w:type="dxa"/>
+              <w:right w:w="0" w:type="dxa"/>
+            </w:tcMar>
+            <w:vAlign w:val="top"/>
           </w:tcPr>
           <w:p>
             <w:pPr>
-              <w:spacing w:before="0" w:after="60"/>
-              <w:keepNext/>
-              <w:jc w:val="start"/>
+              <w:jc w:val="left"/>
+              <w:pBdr>
+                <w:bottom w:val="none" w:sz="0" w:space="0" w:color="000000"/>
+                <w:top w:val="none" w:sz="0" w:space="0" w:color="000000"/>
+                <w:left w:val="none" w:sz="0" w:space="0" w:color="000000"/>
+                <w:right w:val="none" w:sz="0" w:space="0" w:color="000000"/>
+              </w:pBdr>
+              <w:spacing w:after="80" w:before="80" w:line="240"/>
+              <w:ind w:left="80" w:right="80" w:firstLine="0" w:firstLineChars="0"/>
+              <w:rPr>
+                <w:rFonts w:ascii="Arial" w:hAnsi="Arial" w:eastAsia="Arial" w:cs="Arial"/>
+                <w:i w:val="false"/>
+                <w:b w:val="false"/>
+                <w:u w:val="none"/>
+                <w:sz w:val="22"/>
+                <w:szCs w:val="22"/>
+                <w:color w:val="000000"/>
+              </w:rPr>
             </w:pPr>
-            <w:r>
+            <w:r xmlns:w="http://schemas.openxmlformats.org/wordprocessingml/2006/main" xmlns:wp="http://schemas.openxmlformats.org/drawingml/2006/wordprocessingDrawing" xmlns:r="http://schemas.openxmlformats.org/officeDocument/2006/relationships" xmlns:w14="http://schemas.microsoft.com/office/word/2010/wordml">
               <w:rPr>
-                <w:rFonts w:ascii="Calibri" w:hAnsi="Calibri"/>
-                <w:sz w:val="20"/>
+                <w:rFonts w:ascii="Arial" w:hAnsi="Arial" w:eastAsia="Arial" w:cs="Arial"/>
+                <w:i w:val="false"/>
+                <w:b w:val="false"/>
+                <w:u w:val="none"/>
+                <w:sz w:val="22"/>
+                <w:szCs w:val="22"/>
+                <w:color w:val="000000"/>
               </w:rPr>
-              <w:t xml:space="default">Induction cooking appliances are more efficient and safer than electric or gas ones. There is no risk of carbon monoxide or other harmful combustion gases, and the surface doesn’t heat up without a pot or pan on it.</w:t>
+              <w:t xml:space="preserve">Induction cooking appliances are more efficient and safer than electric or gas ones. There is no risk of carbon monoxide or other harmful combustion gases, and the surface doesn’t heat up without a pot or pan on it.</w:t>
             </w:r>
           </w:p>
         </w:tc>
       </w:tr>
       <w:tr>
         <w:trPr>
-          <w:cantSplit/>
+          <w:trHeight w:val="360" w:hRule="auto"/>
         </w:trPr>
+        body 8
         <w:tc>
           <w:tcPr>
             <w:tcBorders>
-              <w:top w:val="single" w:space="0" w:color="D3D3D3"/>
-              <w:bottom w:val="single" w:space="0" w:color="D3D3D3"/>
-              <w:start w:val="single" w:space="0" w:color="D3D3D3"/>
-              <w:end w:val="single" w:space="0" w:color="D3D3D3"/>
+              <w:bottom w:val="none" w:sz="0" w:space="0" w:color="000000"/>
+              <w:top w:val="none" w:sz="0" w:space="0" w:color="000000"/>
+              <w:left w:val="none" w:sz="0" w:space="0" w:color="000000"/>
+              <w:right w:val="none" w:sz="0" w:space="0" w:color="000000"/>
             </w:tcBorders>
+            <w:shd w:val="clear" w:color="auto" w:fill="FFFFFF"/>
+            <w:tcMar>
+              <w:top w:w="0" w:type="dxa"/>
+              <w:bottom w:w="0" w:type="dxa"/>
+              <w:left w:w="0" w:type="dxa"/>
+              <w:right w:w="0" w:type="dxa"/>
+            </w:tcMar>
+            <w:vAlign w:val="top"/>
           </w:tcPr>
           <w:p>
             <w:pPr>
-              <w:spacing w:before="0" w:after="60"/>
-              <w:keepNext/>
-              <w:jc w:val="start"/>
+              <w:jc w:val="left"/>
+              <w:pBdr>
+                <w:bottom w:val="none" w:sz="0" w:space="0" w:color="000000"/>
+                <w:top w:val="none" w:sz="0" w:space="0" w:color="000000"/>
+                <w:left w:val="none" w:sz="0" w:space="0" w:color="000000"/>
+                <w:right w:val="none" w:sz="0" w:space="0" w:color="000000"/>
+              </w:pBdr>
+              <w:spacing w:after="80" w:before="80" w:line="240"/>
+              <w:ind w:left="80" w:right="80" w:firstLine="0" w:firstLineChars="0"/>
+              <w:rPr>
+                <w:rFonts w:ascii="Arial" w:hAnsi="Arial" w:eastAsia="Arial" w:cs="Arial"/>
+                <w:i w:val="false"/>
+                <w:b w:val="false"/>
+                <w:u w:val="none"/>
+                <w:sz w:val="22"/>
+                <w:szCs w:val="22"/>
+                <w:color w:val="000000"/>
+              </w:rPr>
             </w:pPr>
-            <w:r>
+            <w:r xmlns:w="http://schemas.openxmlformats.org/wordprocessingml/2006/main" xmlns:wp="http://schemas.openxmlformats.org/drawingml/2006/wordprocessingDrawing" xmlns:r="http://schemas.openxmlformats.org/officeDocument/2006/relationships" xmlns:w14="http://schemas.microsoft.com/office/word/2010/wordml">
               <w:rPr>
-                <w:rFonts w:ascii="Calibri" w:hAnsi="Calibri"/>
-                <w:sz w:val="20"/>
+                <w:rFonts w:ascii="Arial" w:hAnsi="Arial" w:eastAsia="Arial" w:cs="Arial"/>
+                <w:i w:val="false"/>
+                <w:b w:val="false"/>
+                <w:u w:val="none"/>
+                <w:sz w:val="22"/>
+                <w:szCs w:val="22"/>
+                <w:color w:val="000000"/>
               </w:rPr>
-              <w:t xml:space="default">Gutters</w:t>
+              <w:t xml:space="preserve">Gutters</w:t>
             </w:r>
           </w:p>
         </w:tc>
         <w:tc>
           <w:tcPr>
             <w:tcBorders>
-              <w:top w:val="single" w:space="0" w:color="D3D3D3"/>
-              <w:bottom w:val="single" w:space="0" w:color="D3D3D3"/>
-              <w:start w:val="single" w:space="0" w:color="D3D3D3"/>
-              <w:end w:val="single" w:space="0" w:color="D3D3D3"/>
+              <w:bottom w:val="none" w:sz="0" w:space="0" w:color="000000"/>
+              <w:top w:val="none" w:sz="0" w:space="0" w:color="000000"/>
+              <w:left w:val="none" w:sz="0" w:space="0" w:color="000000"/>
+              <w:right w:val="none" w:sz="0" w:space="0" w:color="000000"/>
             </w:tcBorders>
+            <w:shd w:val="clear" w:color="auto" w:fill="FFFFFF"/>
+            <w:tcMar>
+              <w:top w:w="0" w:type="dxa"/>
+              <w:bottom w:w="0" w:type="dxa"/>
+              <w:left w:w="0" w:type="dxa"/>
+              <w:right w:w="0" w:type="dxa"/>
+            </w:tcMar>
+            <w:vAlign w:val="top"/>
           </w:tcPr>
           <w:p>
             <w:pPr>
-              <w:spacing w:before="0" w:after="60"/>
-              <w:keepNext/>
-              <w:jc w:val="start"/>
+              <w:jc w:val="left"/>
+              <w:pBdr>
+                <w:bottom w:val="none" w:sz="0" w:space="0" w:color="000000"/>
+                <w:top w:val="none" w:sz="0" w:space="0" w:color="000000"/>
+                <w:left w:val="none" w:sz="0" w:space="0" w:color="000000"/>
+                <w:right w:val="none" w:sz="0" w:space="0" w:color="000000"/>
+              </w:pBdr>
+              <w:spacing w:after="80" w:before="80" w:line="240"/>
+              <w:ind w:left="80" w:right="80" w:firstLine="0" w:firstLineChars="0"/>
+              <w:rPr>
+                <w:rFonts w:ascii="Arial" w:hAnsi="Arial" w:eastAsia="Arial" w:cs="Arial"/>
+                <w:i w:val="false"/>
+                <w:b w:val="false"/>
+                <w:u w:val="none"/>
+                <w:sz w:val="22"/>
+                <w:szCs w:val="22"/>
+                <w:color w:val="000000"/>
+              </w:rPr>
             </w:pPr>
-            <w:r>
+            <w:r xmlns:w="http://schemas.openxmlformats.org/wordprocessingml/2006/main" xmlns:wp="http://schemas.openxmlformats.org/drawingml/2006/wordprocessingDrawing" xmlns:r="http://schemas.openxmlformats.org/officeDocument/2006/relationships" xmlns:w14="http://schemas.microsoft.com/office/word/2010/wordml">
               <w:rPr>
-                <w:rFonts w:ascii="Calibri" w:hAnsi="Calibri"/>
-                <w:sz w:val="20"/>
+                <w:rFonts w:ascii="Arial" w:hAnsi="Arial" w:eastAsia="Arial" w:cs="Arial"/>
+                <w:i w:val="false"/>
+                <w:b w:val="false"/>
+                <w:u w:val="none"/>
+                <w:sz w:val="22"/>
+                <w:szCs w:val="22"/>
+                <w:color w:val="000000"/>
               </w:rPr>
-              <w:t xml:space="default">Install gutters and downspouts that divert water at least six feet away from the foundation and to where the ground slopes away from the house.</w:t>
+              <w:t xml:space="preserve">Install gutters and downspouts that divert water at least six feet away from the foundation and to where the ground slopes away from the house.</w:t>
             </w:r>
           </w:p>
         </w:tc>
       </w:tr>
       <w:tr>
         <w:trPr>
-          <w:cantSplit/>
+          <w:trHeight w:val="360" w:hRule="auto"/>
         </w:trPr>
+        body 9
         <w:tc>
           <w:tcPr>
             <w:tcBorders>
-              <w:top w:val="single" w:space="0" w:color="D3D3D3"/>
-              <w:bottom w:val="single" w:space="0" w:color="D3D3D3"/>
-              <w:start w:val="single" w:space="0" w:color="D3D3D3"/>
-              <w:end w:val="single" w:space="0" w:color="D3D3D3"/>
+              <w:bottom w:val="none" w:sz="0" w:space="0" w:color="000000"/>
+              <w:top w:val="none" w:sz="0" w:space="0" w:color="000000"/>
+              <w:left w:val="none" w:sz="0" w:space="0" w:color="000000"/>
+              <w:right w:val="none" w:sz="0" w:space="0" w:color="000000"/>
             </w:tcBorders>
+            <w:shd w:val="clear" w:color="auto" w:fill="FFFFFF"/>
+            <w:tcMar>
+              <w:top w:w="0" w:type="dxa"/>
+              <w:bottom w:w="0" w:type="dxa"/>
+              <w:left w:w="0" w:type="dxa"/>
+              <w:right w:w="0" w:type="dxa"/>
+            </w:tcMar>
+            <w:vAlign w:val="top"/>
           </w:tcPr>
           <w:p>
             <w:pPr>
-              <w:spacing w:before="0" w:after="60"/>
-              <w:keepNext/>
-              <w:jc w:val="start"/>
+              <w:jc w:val="left"/>
+              <w:pBdr>
+                <w:bottom w:val="none" w:sz="0" w:space="0" w:color="000000"/>
+                <w:top w:val="none" w:sz="0" w:space="0" w:color="000000"/>
+                <w:left w:val="none" w:sz="0" w:space="0" w:color="000000"/>
+                <w:right w:val="none" w:sz="0" w:space="0" w:color="000000"/>
+              </w:pBdr>
+              <w:spacing w:after="80" w:before="80" w:line="240"/>
+              <w:ind w:left="80" w:right="80" w:firstLine="0" w:firstLineChars="0"/>
+              <w:rPr>
+                <w:rFonts w:ascii="Arial" w:hAnsi="Arial" w:eastAsia="Arial" w:cs="Arial"/>
+                <w:i w:val="false"/>
+                <w:b w:val="false"/>
+                <w:u w:val="none"/>
+                <w:sz w:val="22"/>
+                <w:szCs w:val="22"/>
+                <w:color w:val="000000"/>
+              </w:rPr>
             </w:pPr>
-            <w:r>
+            <w:r xmlns:w="http://schemas.openxmlformats.org/wordprocessingml/2006/main" xmlns:wp="http://schemas.openxmlformats.org/drawingml/2006/wordprocessingDrawing" xmlns:r="http://schemas.openxmlformats.org/officeDocument/2006/relationships" xmlns:w14="http://schemas.microsoft.com/office/word/2010/wordml">
               <w:rPr>
-                <w:rFonts w:ascii="Calibri" w:hAnsi="Calibri"/>
-                <w:sz w:val="20"/>
+                <w:rFonts w:ascii="Arial" w:hAnsi="Arial" w:eastAsia="Arial" w:cs="Arial"/>
+                <w:i w:val="false"/>
+                <w:b w:val="false"/>
+                <w:u w:val="none"/>
+                <w:sz w:val="22"/>
+                <w:szCs w:val="22"/>
+                <w:color w:val="000000"/>
               </w:rPr>
-              <w:t xml:space="default">Bathroom Exhaust Fan(s)</w:t>
+              <w:t xml:space="preserve">Bathroom Exhaust Fan(s)</w:t>
             </w:r>
           </w:p>
         </w:tc>
         <w:tc>
           <w:tcPr>
             <w:tcBorders>
-              <w:top w:val="single" w:space="0" w:color="D3D3D3"/>
-              <w:bottom w:val="single" w:space="0" w:color="D3D3D3"/>
-              <w:start w:val="single" w:space="0" w:color="D3D3D3"/>
-              <w:end w:val="single" w:space="0" w:color="D3D3D3"/>
+              <w:bottom w:val="none" w:sz="0" w:space="0" w:color="000000"/>
+              <w:top w:val="none" w:sz="0" w:space="0" w:color="000000"/>
+              <w:left w:val="none" w:sz="0" w:space="0" w:color="000000"/>
+              <w:right w:val="none" w:sz="0" w:space="0" w:color="000000"/>
             </w:tcBorders>
+            <w:shd w:val="clear" w:color="auto" w:fill="FFFFFF"/>
+            <w:tcMar>
+              <w:top w:w="0" w:type="dxa"/>
+              <w:bottom w:w="0" w:type="dxa"/>
+              <w:left w:w="0" w:type="dxa"/>
+              <w:right w:w="0" w:type="dxa"/>
+            </w:tcMar>
+            <w:vAlign w:val="top"/>
           </w:tcPr>
           <w:p>
             <w:pPr>
-              <w:spacing w:before="0" w:after="60"/>
-              <w:keepNext/>
-              <w:jc w:val="start"/>
+              <w:jc w:val="left"/>
+              <w:pBdr>
+                <w:bottom w:val="none" w:sz="0" w:space="0" w:color="000000"/>
+                <w:top w:val="none" w:sz="0" w:space="0" w:color="000000"/>
+                <w:left w:val="none" w:sz="0" w:space="0" w:color="000000"/>
+                <w:right w:val="none" w:sz="0" w:space="0" w:color="000000"/>
+              </w:pBdr>
+              <w:spacing w:after="80" w:before="80" w:line="240"/>
+              <w:ind w:left="80" w:right="80" w:firstLine="0" w:firstLineChars="0"/>
+              <w:rPr>
+                <w:rFonts w:ascii="Arial" w:hAnsi="Arial" w:eastAsia="Arial" w:cs="Arial"/>
+                <w:i w:val="false"/>
+                <w:b w:val="false"/>
+                <w:u w:val="none"/>
+                <w:sz w:val="22"/>
+                <w:szCs w:val="22"/>
+                <w:color w:val="000000"/>
+              </w:rPr>
             </w:pPr>
-            <w:r>
+            <w:r xmlns:w="http://schemas.openxmlformats.org/wordprocessingml/2006/main" xmlns:wp="http://schemas.openxmlformats.org/drawingml/2006/wordprocessingDrawing" xmlns:r="http://schemas.openxmlformats.org/officeDocument/2006/relationships" xmlns:w14="http://schemas.microsoft.com/office/word/2010/wordml">
               <w:rPr>
-                <w:rFonts w:ascii="Calibri" w:hAnsi="Calibri"/>
-                <w:sz w:val="20"/>
+                <w:rFonts w:ascii="Arial" w:hAnsi="Arial" w:eastAsia="Arial" w:cs="Arial"/>
+                <w:i w:val="false"/>
+                <w:b w:val="false"/>
+                <w:u w:val="none"/>
+                <w:sz w:val="22"/>
+                <w:szCs w:val="22"/>
+                <w:color w:val="000000"/>
               </w:rPr>
-              <w:t xml:space="default">Install bathroom exhaust fans in all bathrooms that do not have them. These should be rated for at least 80 cubic feet per minute (CFM) if there is a shower. We recommend the Panasonic Whisper series or similar fans that don’t create excess noise.</w:t>
+              <w:t xml:space="preserve">Install bathroom exhaust fans in all bathrooms that do not have them. These should be rated for at least 80 cubic feet per minute (CFM) if there is a shower. We recommend the Panasonic Whisper series or similar fans that don’t create excess noise.</w:t>
             </w:r>
           </w:p>
         </w:tc>
       </w:tr>
       <w:tr>
         <w:trPr>
-          <w:cantSplit/>
+          <w:trHeight w:val="360" w:hRule="auto"/>
         </w:trPr>
+        body10
         <w:tc>
           <w:tcPr>
             <w:tcBorders>
-              <w:top w:val="single" w:space="0" w:color="D3D3D3"/>
-              <w:bottom w:val="single" w:space="0" w:color="D3D3D3"/>
-              <w:start w:val="single" w:space="0" w:color="D3D3D3"/>
-              <w:end w:val="single" w:space="0" w:color="D3D3D3"/>
+              <w:bottom w:val="none" w:sz="0" w:space="0" w:color="000000"/>
+              <w:top w:val="none" w:sz="0" w:space="0" w:color="000000"/>
+              <w:left w:val="none" w:sz="0" w:space="0" w:color="000000"/>
+              <w:right w:val="none" w:sz="0" w:space="0" w:color="000000"/>
             </w:tcBorders>
+            <w:shd w:val="clear" w:color="auto" w:fill="FFFFFF"/>
+            <w:tcMar>
+              <w:top w:w="0" w:type="dxa"/>
+              <w:bottom w:w="0" w:type="dxa"/>
+              <w:left w:w="0" w:type="dxa"/>
+              <w:right w:w="0" w:type="dxa"/>
+            </w:tcMar>
+            <w:vAlign w:val="top"/>
           </w:tcPr>
           <w:p>
             <w:pPr>
-              <w:spacing w:before="0" w:after="60"/>
-              <w:keepNext/>
-              <w:jc w:val="start"/>
+              <w:jc w:val="left"/>
+              <w:pBdr>
+                <w:bottom w:val="none" w:sz="0" w:space="0" w:color="000000"/>
+                <w:top w:val="none" w:sz="0" w:space="0" w:color="000000"/>
+                <w:left w:val="none" w:sz="0" w:space="0" w:color="000000"/>
+                <w:right w:val="none" w:sz="0" w:space="0" w:color="000000"/>
+              </w:pBdr>
+              <w:spacing w:after="80" w:before="80" w:line="240"/>
+              <w:ind w:left="80" w:right="80" w:firstLine="0" w:firstLineChars="0"/>
+              <w:rPr>
+                <w:rFonts w:ascii="Arial" w:hAnsi="Arial" w:eastAsia="Arial" w:cs="Arial"/>
+                <w:i w:val="false"/>
+                <w:b w:val="false"/>
+                <w:u w:val="none"/>
+                <w:sz w:val="22"/>
+                <w:szCs w:val="22"/>
+                <w:color w:val="000000"/>
+              </w:rPr>
             </w:pPr>
-            <w:r>
+            <w:r xmlns:w="http://schemas.openxmlformats.org/wordprocessingml/2006/main" xmlns:wp="http://schemas.openxmlformats.org/drawingml/2006/wordprocessingDrawing" xmlns:r="http://schemas.openxmlformats.org/officeDocument/2006/relationships" xmlns:w14="http://schemas.microsoft.com/office/word/2010/wordml">
               <w:rPr>
-                <w:rFonts w:ascii="Calibri" w:hAnsi="Calibri"/>
-                <w:sz w:val="20"/>
+                <w:rFonts w:ascii="Arial" w:hAnsi="Arial" w:eastAsia="Arial" w:cs="Arial"/>
+                <w:i w:val="false"/>
+                <w:b w:val="false"/>
+                <w:u w:val="none"/>
+                <w:sz w:val="22"/>
+                <w:szCs w:val="22"/>
+                <w:color w:val="000000"/>
               </w:rPr>
-              <w:t xml:space="default">Kitchen Exhaust Fan</w:t>
+              <w:t xml:space="preserve">Kitchen Exhaust Fan</w:t>
             </w:r>
           </w:p>
         </w:tc>
         <w:tc>
           <w:tcPr>
             <w:tcBorders>
-              <w:top w:val="single" w:space="0" w:color="D3D3D3"/>
-              <w:bottom w:val="single" w:space="0" w:color="D3D3D3"/>
-              <w:start w:val="single" w:space="0" w:color="D3D3D3"/>
-              <w:end w:val="single" w:space="0" w:color="D3D3D3"/>
+              <w:bottom w:val="none" w:sz="0" w:space="0" w:color="000000"/>
+              <w:top w:val="none" w:sz="0" w:space="0" w:color="000000"/>
+              <w:left w:val="none" w:sz="0" w:space="0" w:color="000000"/>
+              <w:right w:val="none" w:sz="0" w:space="0" w:color="000000"/>
             </w:tcBorders>
+            <w:shd w:val="clear" w:color="auto" w:fill="FFFFFF"/>
+            <w:tcMar>
+              <w:top w:w="0" w:type="dxa"/>
+              <w:bottom w:w="0" w:type="dxa"/>
+              <w:left w:w="0" w:type="dxa"/>
+              <w:right w:w="0" w:type="dxa"/>
+            </w:tcMar>
+            <w:vAlign w:val="top"/>
           </w:tcPr>
           <w:p>
             <w:pPr>
-              <w:spacing w:before="0" w:after="60"/>
-              <w:keepNext/>
-              <w:jc w:val="start"/>
+              <w:jc w:val="left"/>
+              <w:pBdr>
+                <w:bottom w:val="none" w:sz="0" w:space="0" w:color="000000"/>
+                <w:top w:val="none" w:sz="0" w:space="0" w:color="000000"/>
+                <w:left w:val="none" w:sz="0" w:space="0" w:color="000000"/>
+                <w:right w:val="none" w:sz="0" w:space="0" w:color="000000"/>
+              </w:pBdr>
+              <w:spacing w:after="80" w:before="80" w:line="240"/>
+              <w:ind w:left="80" w:right="80" w:firstLine="0" w:firstLineChars="0"/>
+              <w:rPr>
+                <w:rFonts w:ascii="Arial" w:hAnsi="Arial" w:eastAsia="Arial" w:cs="Arial"/>
+                <w:i w:val="false"/>
+                <w:b w:val="false"/>
+                <w:u w:val="none"/>
+                <w:sz w:val="22"/>
+                <w:szCs w:val="22"/>
+                <w:color w:val="000000"/>
+              </w:rPr>
             </w:pPr>
-            <w:r>
+            <w:r xmlns:w="http://schemas.openxmlformats.org/wordprocessingml/2006/main" xmlns:wp="http://schemas.openxmlformats.org/drawingml/2006/wordprocessingDrawing" xmlns:r="http://schemas.openxmlformats.org/officeDocument/2006/relationships" xmlns:w14="http://schemas.microsoft.com/office/word/2010/wordml">
               <w:rPr>
-                <w:rFonts w:ascii="Calibri" w:hAnsi="Calibri"/>
-                <w:sz w:val="20"/>
+                <w:rFonts w:ascii="Arial" w:hAnsi="Arial" w:eastAsia="Arial" w:cs="Arial"/>
+                <w:i w:val="false"/>
+                <w:b w:val="false"/>
+                <w:u w:val="none"/>
+                <w:sz w:val="22"/>
+                <w:szCs w:val="22"/>
+                <w:color w:val="000000"/>
               </w:rPr>
-              <w:t xml:space="default">Install a kitchen exhaust fan to remove cooking fumes and moisture from your home. The fan should be rated for at least 100 cubic feet per minute. A kitchen fan should be ducted to the outdoors. If the ductwork will run through the attic, it should be installed before the attic is air-sealed and insulated.</w:t>
+              <w:t xml:space="preserve">Install a kitchen exhaust fan to remove cooking fumes and moisture from your home. The fan should be rated for at least 100 cubic feet per minute. A kitchen fan should be ducted to the outdoors. If the ductwork will run through the attic, it should be installed before the attic is air-sealed and insulated.</w:t>
             </w:r>
           </w:p>
         </w:tc>
       </w:tr>
       <w:tr>
         <w:trPr>
-          <w:cantSplit/>
+          <w:trHeight w:val="360" w:hRule="auto"/>
         </w:trPr>
+        body11
         <w:tc>
           <w:tcPr>
             <w:tcBorders>
-              <w:top w:val="single" w:space="0" w:color="D3D3D3"/>
-              <w:bottom w:val="single" w:space="0" w:color="D3D3D3"/>
-              <w:start w:val="single" w:space="0" w:color="D3D3D3"/>
-              <w:end w:val="single" w:space="0" w:color="D3D3D3"/>
+              <w:bottom w:val="none" w:sz="0" w:space="0" w:color="000000"/>
+              <w:top w:val="none" w:sz="0" w:space="0" w:color="000000"/>
+              <w:left w:val="none" w:sz="0" w:space="0" w:color="000000"/>
+              <w:right w:val="none" w:sz="0" w:space="0" w:color="000000"/>
             </w:tcBorders>
+            <w:shd w:val="clear" w:color="auto" w:fill="FFFFFF"/>
+            <w:tcMar>
+              <w:top w:w="0" w:type="dxa"/>
+              <w:bottom w:w="0" w:type="dxa"/>
+              <w:left w:w="0" w:type="dxa"/>
+              <w:right w:w="0" w:type="dxa"/>
+            </w:tcMar>
+            <w:vAlign w:val="top"/>
           </w:tcPr>
           <w:p>
             <w:pPr>
-              <w:spacing w:before="0" w:after="60"/>
-              <w:keepNext/>
-              <w:jc w:val="start"/>
+              <w:jc w:val="left"/>
+              <w:pBdr>
+                <w:bottom w:val="none" w:sz="0" w:space="0" w:color="000000"/>
+                <w:top w:val="none" w:sz="0" w:space="0" w:color="000000"/>
+                <w:left w:val="none" w:sz="0" w:space="0" w:color="000000"/>
+                <w:right w:val="none" w:sz="0" w:space="0" w:color="000000"/>
+              </w:pBdr>
+              <w:spacing w:after="80" w:before="80" w:line="240"/>
+              <w:ind w:left="80" w:right="80" w:firstLine="0" w:firstLineChars="0"/>
+              <w:rPr>
+                <w:rFonts w:ascii="Arial" w:hAnsi="Arial" w:eastAsia="Arial" w:cs="Arial"/>
+                <w:i w:val="false"/>
+                <w:b w:val="false"/>
+                <w:u w:val="none"/>
+                <w:sz w:val="22"/>
+                <w:szCs w:val="22"/>
+                <w:color w:val="000000"/>
+              </w:rPr>
             </w:pPr>
-            <w:r>
+            <w:r xmlns:w="http://schemas.openxmlformats.org/wordprocessingml/2006/main" xmlns:wp="http://schemas.openxmlformats.org/drawingml/2006/wordprocessingDrawing" xmlns:r="http://schemas.openxmlformats.org/officeDocument/2006/relationships" xmlns:w14="http://schemas.microsoft.com/office/word/2010/wordml">
               <w:rPr>
-                <w:rFonts w:ascii="Calibri" w:hAnsi="Calibri"/>
-                <w:sz w:val="20"/>
+                <w:rFonts w:ascii="Arial" w:hAnsi="Arial" w:eastAsia="Arial" w:cs="Arial"/>
+                <w:i w:val="false"/>
+                <w:b w:val="false"/>
+                <w:u w:val="none"/>
+                <w:sz w:val="22"/>
+                <w:szCs w:val="22"/>
+                <w:color w:val="000000"/>
               </w:rPr>
-              <w:t xml:space="default">Vapor Barrier</w:t>
+              <w:t xml:space="preserve">Vapor Barrier</w:t>
             </w:r>
           </w:p>
         </w:tc>
         <w:tc>
           <w:tcPr>
             <w:tcBorders>
-              <w:top w:val="single" w:space="0" w:color="D3D3D3"/>
-              <w:bottom w:val="single" w:space="0" w:color="D3D3D3"/>
-              <w:start w:val="single" w:space="0" w:color="D3D3D3"/>
-              <w:end w:val="single" w:space="0" w:color="D3D3D3"/>
+              <w:bottom w:val="none" w:sz="0" w:space="0" w:color="000000"/>
+              <w:top w:val="none" w:sz="0" w:space="0" w:color="000000"/>
+              <w:left w:val="none" w:sz="0" w:space="0" w:color="000000"/>
+              <w:right w:val="none" w:sz="0" w:space="0" w:color="000000"/>
             </w:tcBorders>
+            <w:shd w:val="clear" w:color="auto" w:fill="FFFFFF"/>
+            <w:tcMar>
+              <w:top w:w="0" w:type="dxa"/>
+              <w:bottom w:w="0" w:type="dxa"/>
+              <w:left w:w="0" w:type="dxa"/>
+              <w:right w:w="0" w:type="dxa"/>
+            </w:tcMar>
+            <w:vAlign w:val="top"/>
           </w:tcPr>
           <w:p>
             <w:pPr>
-              <w:spacing w:before="0" w:after="60"/>
-              <w:keepNext/>
-              <w:jc w:val="start"/>
+              <w:jc w:val="left"/>
+              <w:pBdr>
+                <w:bottom w:val="none" w:sz="0" w:space="0" w:color="000000"/>
+                <w:top w:val="none" w:sz="0" w:space="0" w:color="000000"/>
+                <w:left w:val="none" w:sz="0" w:space="0" w:color="000000"/>
+                <w:right w:val="none" w:sz="0" w:space="0" w:color="000000"/>
+              </w:pBdr>
+              <w:spacing w:after="80" w:before="80" w:line="240"/>
+              <w:ind w:left="80" w:right="80" w:firstLine="0" w:firstLineChars="0"/>
+              <w:rPr>
+                <w:rFonts w:ascii="Arial" w:hAnsi="Arial" w:eastAsia="Arial" w:cs="Arial"/>
+                <w:i w:val="false"/>
+                <w:b w:val="false"/>
+                <w:u w:val="none"/>
+                <w:sz w:val="22"/>
+                <w:szCs w:val="22"/>
+                <w:color w:val="000000"/>
+              </w:rPr>
             </w:pPr>
-            <w:r>
+            <w:r xmlns:w="http://schemas.openxmlformats.org/wordprocessingml/2006/main" xmlns:wp="http://schemas.openxmlformats.org/drawingml/2006/wordprocessingDrawing" xmlns:r="http://schemas.openxmlformats.org/officeDocument/2006/relationships" xmlns:w14="http://schemas.microsoft.com/office/word/2010/wordml">
               <w:rPr>
-                <w:rFonts w:ascii="Calibri" w:hAnsi="Calibri"/>
-                <w:sz w:val="20"/>
+                <w:rFonts w:ascii="Arial" w:hAnsi="Arial" w:eastAsia="Arial" w:cs="Arial"/>
+                <w:i w:val="false"/>
+                <w:b w:val="false"/>
+                <w:u w:val="none"/>
+                <w:sz w:val="22"/>
+                <w:szCs w:val="22"/>
+                <w:color w:val="000000"/>
               </w:rPr>
-              <w:t xml:space="default">Install a vapor barrier on the **basement / crawlspace** floor to stop moisture from entering the basement and house.</w:t>
+              <w:t xml:space="preserve">Install a vapor barrier on the **basement / crawlspace** floor to stop moisture from entering the basement and house.</w:t>
             </w:r>
           </w:p>
         </w:tc>
       </w:tr>
       <w:tr>
         <w:trPr>
-          <w:cantSplit/>
+          <w:trHeight w:val="360" w:hRule="auto"/>
         </w:trPr>
+        body12
         <w:tc>
           <w:tcPr>
             <w:tcBorders>
-              <w:top w:val="single" w:space="0" w:color="D3D3D3"/>
-              <w:bottom w:val="single" w:space="0" w:color="D3D3D3"/>
-              <w:start w:val="single" w:space="0" w:color="D3D3D3"/>
-              <w:end w:val="single" w:space="0" w:color="D3D3D3"/>
+              <w:bottom w:val="none" w:sz="0" w:space="0" w:color="000000"/>
+              <w:top w:val="none" w:sz="0" w:space="0" w:color="000000"/>
+              <w:left w:val="none" w:sz="0" w:space="0" w:color="000000"/>
+              <w:right w:val="none" w:sz="0" w:space="0" w:color="000000"/>
             </w:tcBorders>
+            <w:shd w:val="clear" w:color="auto" w:fill="FFFFFF"/>
+            <w:tcMar>
+              <w:top w:w="0" w:type="dxa"/>
+              <w:bottom w:w="0" w:type="dxa"/>
+              <w:left w:w="0" w:type="dxa"/>
+              <w:right w:w="0" w:type="dxa"/>
+            </w:tcMar>
+            <w:vAlign w:val="top"/>
           </w:tcPr>
           <w:p>
             <w:pPr>
-              <w:spacing w:before="0" w:after="60"/>
-              <w:keepNext/>
-              <w:jc w:val="start"/>
+              <w:jc w:val="left"/>
+              <w:pBdr>
+                <w:bottom w:val="none" w:sz="0" w:space="0" w:color="000000"/>
+                <w:top w:val="none" w:sz="0" w:space="0" w:color="000000"/>
+                <w:left w:val="none" w:sz="0" w:space="0" w:color="000000"/>
+                <w:right w:val="none" w:sz="0" w:space="0" w:color="000000"/>
+              </w:pBdr>
+              <w:spacing w:after="80" w:before="80" w:line="240"/>
+              <w:ind w:left="80" w:right="80" w:firstLine="0" w:firstLineChars="0"/>
+              <w:rPr>
+                <w:rFonts w:ascii="Arial" w:hAnsi="Arial" w:eastAsia="Arial" w:cs="Arial"/>
+                <w:i w:val="false"/>
+                <w:b w:val="false"/>
+                <w:u w:val="none"/>
+                <w:sz w:val="22"/>
+                <w:szCs w:val="22"/>
+                <w:color w:val="000000"/>
+              </w:rPr>
             </w:pPr>
-            <w:r>
+            <w:r xmlns:w="http://schemas.openxmlformats.org/wordprocessingml/2006/main" xmlns:wp="http://schemas.openxmlformats.org/drawingml/2006/wordprocessingDrawing" xmlns:r="http://schemas.openxmlformats.org/officeDocument/2006/relationships" xmlns:w14="http://schemas.microsoft.com/office/word/2010/wordml">
               <w:rPr>
-                <w:rFonts w:ascii="Calibri" w:hAnsi="Calibri"/>
-                <w:sz w:val="20"/>
+                <w:rFonts w:ascii="Arial" w:hAnsi="Arial" w:eastAsia="Arial" w:cs="Arial"/>
+                <w:i w:val="false"/>
+                <w:b w:val="false"/>
+                <w:u w:val="none"/>
+                <w:sz w:val="22"/>
+                <w:szCs w:val="22"/>
+                <w:color w:val="000000"/>
               </w:rPr>
-              <w:t xml:space="default">Spray Foam ** Basement / Crawlspace ** Walls</w:t>
+              <w:t xml:space="preserve">Spray Foam ** Basement / Crawlspace ** Walls</w:t>
             </w:r>
           </w:p>
         </w:tc>
         <w:tc>
           <w:tcPr>
             <w:tcBorders>
-              <w:top w:val="single" w:space="0" w:color="D3D3D3"/>
-              <w:bottom w:val="single" w:space="0" w:color="D3D3D3"/>
-              <w:start w:val="single" w:space="0" w:color="D3D3D3"/>
-              <w:end w:val="single" w:space="0" w:color="D3D3D3"/>
+              <w:bottom w:val="none" w:sz="0" w:space="0" w:color="000000"/>
+              <w:top w:val="none" w:sz="0" w:space="0" w:color="000000"/>
+              <w:left w:val="none" w:sz="0" w:space="0" w:color="000000"/>
+              <w:right w:val="none" w:sz="0" w:space="0" w:color="000000"/>
             </w:tcBorders>
+            <w:shd w:val="clear" w:color="auto" w:fill="FFFFFF"/>
+            <w:tcMar>
+              <w:top w:w="0" w:type="dxa"/>
+              <w:bottom w:w="0" w:type="dxa"/>
+              <w:left w:w="0" w:type="dxa"/>
+              <w:right w:w="0" w:type="dxa"/>
+            </w:tcMar>
+            <w:vAlign w:val="top"/>
           </w:tcPr>
           <w:p>
             <w:pPr>
-              <w:spacing w:before="0" w:after="60"/>
-              <w:keepNext/>
-              <w:jc w:val="start"/>
+              <w:jc w:val="left"/>
+              <w:pBdr>
+                <w:bottom w:val="none" w:sz="0" w:space="0" w:color="000000"/>
+                <w:top w:val="none" w:sz="0" w:space="0" w:color="000000"/>
+                <w:left w:val="none" w:sz="0" w:space="0" w:color="000000"/>
+                <w:right w:val="none" w:sz="0" w:space="0" w:color="000000"/>
+              </w:pBdr>
+              <w:spacing w:after="80" w:before="80" w:line="240"/>
+              <w:ind w:left="80" w:right="80" w:firstLine="0" w:firstLineChars="0"/>
+              <w:rPr>
+                <w:rFonts w:ascii="Arial" w:hAnsi="Arial" w:eastAsia="Arial" w:cs="Arial"/>
+                <w:i w:val="false"/>
+                <w:b w:val="false"/>
+                <w:u w:val="none"/>
+                <w:sz w:val="22"/>
+                <w:szCs w:val="22"/>
+                <w:color w:val="000000"/>
+              </w:rPr>
             </w:pPr>
-            <w:r>
+            <w:r xmlns:w="http://schemas.openxmlformats.org/wordprocessingml/2006/main" xmlns:wp="http://schemas.openxmlformats.org/drawingml/2006/wordprocessingDrawing" xmlns:r="http://schemas.openxmlformats.org/officeDocument/2006/relationships" xmlns:w14="http://schemas.microsoft.com/office/word/2010/wordml">
               <w:rPr>
-                <w:rFonts w:ascii="Calibri" w:hAnsi="Calibri"/>
-                <w:sz w:val="20"/>
+                <w:rFonts w:ascii="Arial" w:hAnsi="Arial" w:eastAsia="Arial" w:cs="Arial"/>
+                <w:i w:val="false"/>
+                <w:b w:val="false"/>
+                <w:u w:val="none"/>
+                <w:sz w:val="22"/>
+                <w:szCs w:val="22"/>
+                <w:color w:val="000000"/>
               </w:rPr>
-              <w:t xml:space="default">Install spray foam on the **basement / crawlspace** walls to prevent moisture infiltration and reduce heat loss.</w:t>
+              <w:t xml:space="preserve">Install spray foam on the **basement / crawlspace** walls to prevent moisture infiltration and reduce heat loss.</w:t>
             </w:r>
           </w:p>
         </w:tc>
       </w:tr>
       <w:tr>
         <w:trPr>
-          <w:cantSplit/>
+          <w:trHeight w:val="360" w:hRule="auto"/>
         </w:trPr>
+        body13
         <w:tc>
           <w:tcPr>
             <w:tcBorders>
-              <w:top w:val="single" w:space="0" w:color="D3D3D3"/>
-              <w:bottom w:val="single" w:space="0" w:color="D3D3D3"/>
-              <w:start w:val="single" w:space="0" w:color="D3D3D3"/>
-              <w:end w:val="single" w:space="0" w:color="D3D3D3"/>
+              <w:bottom w:val="none" w:sz="0" w:space="0" w:color="000000"/>
+              <w:top w:val="none" w:sz="0" w:space="0" w:color="000000"/>
+              <w:left w:val="none" w:sz="0" w:space="0" w:color="000000"/>
+              <w:right w:val="none" w:sz="0" w:space="0" w:color="000000"/>
             </w:tcBorders>
+            <w:shd w:val="clear" w:color="auto" w:fill="FFFFFF"/>
+            <w:tcMar>
+              <w:top w:w="0" w:type="dxa"/>
+              <w:bottom w:w="0" w:type="dxa"/>
+              <w:left w:w="0" w:type="dxa"/>
+              <w:right w:w="0" w:type="dxa"/>
+            </w:tcMar>
+            <w:vAlign w:val="top"/>
           </w:tcPr>
           <w:p>
             <w:pPr>
-              <w:spacing w:before="0" w:after="60"/>
-              <w:keepNext/>
-              <w:jc w:val="start"/>
+              <w:jc w:val="left"/>
+              <w:pBdr>
+                <w:bottom w:val="none" w:sz="0" w:space="0" w:color="000000"/>
+                <w:top w:val="none" w:sz="0" w:space="0" w:color="000000"/>
+                <w:left w:val="none" w:sz="0" w:space="0" w:color="000000"/>
+                <w:right w:val="none" w:sz="0" w:space="0" w:color="000000"/>
+              </w:pBdr>
+              <w:spacing w:after="80" w:before="80" w:line="240"/>
+              <w:ind w:left="80" w:right="80" w:firstLine="0" w:firstLineChars="0"/>
+              <w:rPr>
+                <w:rFonts w:ascii="Arial" w:hAnsi="Arial" w:eastAsia="Arial" w:cs="Arial"/>
+                <w:i w:val="false"/>
+                <w:b w:val="false"/>
+                <w:u w:val="none"/>
+                <w:sz w:val="22"/>
+                <w:szCs w:val="22"/>
+                <w:color w:val="000000"/>
+              </w:rPr>
             </w:pPr>
-            <w:r>
+            <w:r xmlns:w="http://schemas.openxmlformats.org/wordprocessingml/2006/main" xmlns:wp="http://schemas.openxmlformats.org/drawingml/2006/wordprocessingDrawing" xmlns:r="http://schemas.openxmlformats.org/officeDocument/2006/relationships" xmlns:w14="http://schemas.microsoft.com/office/word/2010/wordml">
               <w:rPr>
-                <w:rFonts w:ascii="Calibri" w:hAnsi="Calibri"/>
-                <w:sz w:val="20"/>
+                <w:rFonts w:ascii="Arial" w:hAnsi="Arial" w:eastAsia="Arial" w:cs="Arial"/>
+                <w:i w:val="false"/>
+                <w:b w:val="false"/>
+                <w:u w:val="none"/>
+                <w:sz w:val="22"/>
+                <w:szCs w:val="22"/>
+                <w:color w:val="000000"/>
               </w:rPr>
-              <w:t xml:space="default">Attic Air Sealing and Insulation</w:t>
+              <w:t xml:space="preserve">Attic Air Sealing and Insulation</w:t>
             </w:r>
           </w:p>
         </w:tc>
         <w:tc>
           <w:tcPr>
             <w:tcBorders>
-              <w:top w:val="single" w:space="0" w:color="D3D3D3"/>
-              <w:bottom w:val="single" w:space="0" w:color="D3D3D3"/>
-              <w:start w:val="single" w:space="0" w:color="D3D3D3"/>
-              <w:end w:val="single" w:space="0" w:color="D3D3D3"/>
+              <w:bottom w:val="none" w:sz="0" w:space="0" w:color="000000"/>
+              <w:top w:val="none" w:sz="0" w:space="0" w:color="000000"/>
+              <w:left w:val="none" w:sz="0" w:space="0" w:color="000000"/>
+              <w:right w:val="none" w:sz="0" w:space="0" w:color="000000"/>
             </w:tcBorders>
+            <w:shd w:val="clear" w:color="auto" w:fill="FFFFFF"/>
+            <w:tcMar>
+              <w:top w:w="0" w:type="dxa"/>
+              <w:bottom w:w="0" w:type="dxa"/>
+              <w:left w:w="0" w:type="dxa"/>
+              <w:right w:w="0" w:type="dxa"/>
+            </w:tcMar>
+            <w:vAlign w:val="top"/>
           </w:tcPr>
           <w:p>
             <w:pPr>
-              <w:spacing w:before="0" w:after="60"/>
-              <w:keepNext/>
-              <w:jc w:val="start"/>
+              <w:jc w:val="left"/>
+              <w:pBdr>
+                <w:bottom w:val="none" w:sz="0" w:space="0" w:color="000000"/>
+                <w:top w:val="none" w:sz="0" w:space="0" w:color="000000"/>
+                <w:left w:val="none" w:sz="0" w:space="0" w:color="000000"/>
+                <w:right w:val="none" w:sz="0" w:space="0" w:color="000000"/>
+              </w:pBdr>
+              <w:spacing w:after="80" w:before="80" w:line="240"/>
+              <w:ind w:left="80" w:right="80" w:firstLine="0" w:firstLineChars="0"/>
+              <w:rPr>
+                <w:rFonts w:ascii="Arial" w:hAnsi="Arial" w:eastAsia="Arial" w:cs="Arial"/>
+                <w:i w:val="false"/>
+                <w:b w:val="false"/>
+                <w:u w:val="none"/>
+                <w:sz w:val="22"/>
+                <w:szCs w:val="22"/>
+                <w:color w:val="000000"/>
+              </w:rPr>
             </w:pPr>
-            <w:r>
+            <w:r xmlns:w="http://schemas.openxmlformats.org/wordprocessingml/2006/main" xmlns:wp="http://schemas.openxmlformats.org/drawingml/2006/wordprocessingDrawing" xmlns:r="http://schemas.openxmlformats.org/officeDocument/2006/relationships" xmlns:w14="http://schemas.microsoft.com/office/word/2010/wordml">
               <w:rPr>
-                <w:rFonts w:ascii="Calibri" w:hAnsi="Calibri"/>
-                <w:sz w:val="20"/>
+                <w:rFonts w:ascii="Arial" w:hAnsi="Arial" w:eastAsia="Arial" w:cs="Arial"/>
+                <w:i w:val="false"/>
+                <w:b w:val="false"/>
+                <w:u w:val="none"/>
+                <w:sz w:val="22"/>
+                <w:szCs w:val="22"/>
+                <w:color w:val="000000"/>
               </w:rPr>
-              <w:t xml:space="default">Air seal the attic and insulate it to at least R-60 (18 inches of loose-fill cellulose insulation).</w:t>
+              <w:t xml:space="preserve">Air seal the attic and insulate it to at least R-60 (18 inches of loose-fill cellulose insulation).</w:t>
             </w:r>
           </w:p>
         </w:tc>
       </w:tr>
       <w:tr>
         <w:trPr>
-          <w:cantSplit/>
+          <w:trHeight w:val="360" w:hRule="auto"/>
         </w:trPr>
+        body14
         <w:tc>
           <w:tcPr>
             <w:tcBorders>
-              <w:top w:val="single" w:space="0" w:color="D3D3D3"/>
-              <w:bottom w:val="single" w:space="0" w:color="D3D3D3"/>
-              <w:start w:val="single" w:space="0" w:color="D3D3D3"/>
-              <w:end w:val="single" w:space="0" w:color="D3D3D3"/>
+              <w:bottom w:val="none" w:sz="0" w:space="0" w:color="000000"/>
+              <w:top w:val="none" w:sz="0" w:space="0" w:color="000000"/>
+              <w:left w:val="none" w:sz="0" w:space="0" w:color="000000"/>
+              <w:right w:val="none" w:sz="0" w:space="0" w:color="000000"/>
             </w:tcBorders>
+            <w:shd w:val="clear" w:color="auto" w:fill="FFFFFF"/>
+            <w:tcMar>
+              <w:top w:w="0" w:type="dxa"/>
+              <w:bottom w:w="0" w:type="dxa"/>
+              <w:left w:w="0" w:type="dxa"/>
+              <w:right w:w="0" w:type="dxa"/>
+            </w:tcMar>
+            <w:vAlign w:val="top"/>
           </w:tcPr>
           <w:p>
             <w:pPr>
-              <w:spacing w:before="0" w:after="60"/>
-              <w:keepNext/>
-              <w:jc w:val="start"/>
+              <w:jc w:val="left"/>
+              <w:pBdr>
+                <w:bottom w:val="none" w:sz="0" w:space="0" w:color="000000"/>
+                <w:top w:val="none" w:sz="0" w:space="0" w:color="000000"/>
+                <w:left w:val="none" w:sz="0" w:space="0" w:color="000000"/>
+                <w:right w:val="none" w:sz="0" w:space="0" w:color="000000"/>
+              </w:pBdr>
+              <w:spacing w:after="80" w:before="80" w:line="240"/>
+              <w:ind w:left="80" w:right="80" w:firstLine="0" w:firstLineChars="0"/>
+              <w:rPr>
+                <w:rFonts w:ascii="Arial" w:hAnsi="Arial" w:eastAsia="Arial" w:cs="Arial"/>
+                <w:i w:val="false"/>
+                <w:b w:val="false"/>
+                <w:u w:val="none"/>
+                <w:sz w:val="22"/>
+                <w:szCs w:val="22"/>
+                <w:color w:val="000000"/>
+              </w:rPr>
             </w:pPr>
-            <w:r>
+            <w:r xmlns:w="http://schemas.openxmlformats.org/wordprocessingml/2006/main" xmlns:wp="http://schemas.openxmlformats.org/drawingml/2006/wordprocessingDrawing" xmlns:r="http://schemas.openxmlformats.org/officeDocument/2006/relationships" xmlns:w14="http://schemas.microsoft.com/office/word/2010/wordml">
               <w:rPr>
-                <w:rFonts w:ascii="Calibri" w:hAnsi="Calibri"/>
-                <w:sz w:val="20"/>
+                <w:rFonts w:ascii="Arial" w:hAnsi="Arial" w:eastAsia="Arial" w:cs="Arial"/>
+                <w:i w:val="false"/>
+                <w:b w:val="false"/>
+                <w:u w:val="none"/>
+                <w:sz w:val="22"/>
+                <w:szCs w:val="22"/>
+                <w:color w:val="000000"/>
               </w:rPr>
-              <w:t xml:space="default">Continuous Exterior Wall Insulation</w:t>
+              <w:t xml:space="preserve">Continuous Exterior Wall Insulation</w:t>
             </w:r>
           </w:p>
         </w:tc>
         <w:tc>
           <w:tcPr>
             <w:tcBorders>
-              <w:top w:val="single" w:space="0" w:color="D3D3D3"/>
-              <w:bottom w:val="single" w:space="0" w:color="D3D3D3"/>
-              <w:start w:val="single" w:space="0" w:color="D3D3D3"/>
-              <w:end w:val="single" w:space="0" w:color="D3D3D3"/>
+              <w:bottom w:val="none" w:sz="0" w:space="0" w:color="000000"/>
+              <w:top w:val="none" w:sz="0" w:space="0" w:color="000000"/>
+              <w:left w:val="none" w:sz="0" w:space="0" w:color="000000"/>
+              <w:right w:val="none" w:sz="0" w:space="0" w:color="000000"/>
             </w:tcBorders>
+            <w:shd w:val="clear" w:color="auto" w:fill="FFFFFF"/>
+            <w:tcMar>
+              <w:top w:w="0" w:type="dxa"/>
+              <w:bottom w:w="0" w:type="dxa"/>
+              <w:left w:w="0" w:type="dxa"/>
+              <w:right w:w="0" w:type="dxa"/>
+            </w:tcMar>
+            <w:vAlign w:val="top"/>
           </w:tcPr>
           <w:p>
             <w:pPr>
-              <w:spacing w:before="0" w:after="60"/>
-              <w:keepNext/>
-              <w:jc w:val="start"/>
+              <w:jc w:val="left"/>
+              <w:pBdr>
+                <w:bottom w:val="none" w:sz="0" w:space="0" w:color="000000"/>
+                <w:top w:val="none" w:sz="0" w:space="0" w:color="000000"/>
+                <w:left w:val="none" w:sz="0" w:space="0" w:color="000000"/>
+                <w:right w:val="none" w:sz="0" w:space="0" w:color="000000"/>
+              </w:pBdr>
+              <w:spacing w:after="80" w:before="80" w:line="240"/>
+              <w:ind w:left="80" w:right="80" w:firstLine="0" w:firstLineChars="0"/>
+              <w:rPr>
+                <w:rFonts w:ascii="Arial" w:hAnsi="Arial" w:eastAsia="Arial" w:cs="Arial"/>
+                <w:i w:val="false"/>
+                <w:b w:val="false"/>
+                <w:u w:val="none"/>
+                <w:sz w:val="22"/>
+                <w:szCs w:val="22"/>
+                <w:color w:val="000000"/>
+              </w:rPr>
             </w:pPr>
-            <w:r>
+            <w:r xmlns:w="http://schemas.openxmlformats.org/wordprocessingml/2006/main" xmlns:wp="http://schemas.openxmlformats.org/drawingml/2006/wordprocessingDrawing" xmlns:r="http://schemas.openxmlformats.org/officeDocument/2006/relationships" xmlns:w14="http://schemas.microsoft.com/office/word/2010/wordml">
               <w:rPr>
-                <w:rFonts w:ascii="Calibri" w:hAnsi="Calibri"/>
-                <w:sz w:val="20"/>
+                <w:rFonts w:ascii="Arial" w:hAnsi="Arial" w:eastAsia="Arial" w:cs="Arial"/>
+                <w:i w:val="false"/>
+                <w:b w:val="false"/>
+                <w:u w:val="none"/>
+                <w:sz w:val="22"/>
+                <w:szCs w:val="22"/>
+                <w:color w:val="000000"/>
               </w:rPr>
-              <w:t xml:space="default">Add a continuous layer of insulation and potentially replace the air and moisture barrier once it becomes time to replace the siding.</w:t>
+              <w:t xml:space="preserve">Add a continuous layer of insulation and potentially replace the air and moisture barrier once it becomes time to replace the siding.</w:t>
             </w:r>
           </w:p>
         </w:tc>
       </w:tr>
       <w:tr>
         <w:trPr>
-          <w:cantSplit/>
+          <w:trHeight w:val="360" w:hRule="auto"/>
         </w:trPr>
+        body15
         <w:tc>
           <w:tcPr>
             <w:tcBorders>
-              <w:top w:val="single" w:space="0" w:color="D3D3D3"/>
-              <w:bottom w:val="single" w:space="0" w:color="D3D3D3"/>
-              <w:start w:val="single" w:space="0" w:color="D3D3D3"/>
-              <w:end w:val="single" w:space="0" w:color="D3D3D3"/>
+              <w:bottom w:val="none" w:sz="0" w:space="0" w:color="000000"/>
+              <w:top w:val="none" w:sz="0" w:space="0" w:color="000000"/>
+              <w:left w:val="none" w:sz="0" w:space="0" w:color="000000"/>
+              <w:right w:val="none" w:sz="0" w:space="0" w:color="000000"/>
             </w:tcBorders>
+            <w:shd w:val="clear" w:color="auto" w:fill="FFFFFF"/>
+            <w:tcMar>
+              <w:top w:w="0" w:type="dxa"/>
+              <w:bottom w:w="0" w:type="dxa"/>
+              <w:left w:w="0" w:type="dxa"/>
+              <w:right w:w="0" w:type="dxa"/>
+            </w:tcMar>
+            <w:vAlign w:val="top"/>
           </w:tcPr>
           <w:p>
             <w:pPr>
-              <w:spacing w:before="0" w:after="60"/>
-              <w:keepNext/>
-              <w:jc w:val="start"/>
+              <w:jc w:val="left"/>
+              <w:pBdr>
+                <w:bottom w:val="none" w:sz="0" w:space="0" w:color="000000"/>
+                <w:top w:val="none" w:sz="0" w:space="0" w:color="000000"/>
+                <w:left w:val="none" w:sz="0" w:space="0" w:color="000000"/>
+                <w:right w:val="none" w:sz="0" w:space="0" w:color="000000"/>
+              </w:pBdr>
+              <w:spacing w:after="80" w:before="80" w:line="240"/>
+              <w:ind w:left="80" w:right="80" w:firstLine="0" w:firstLineChars="0"/>
+              <w:rPr>
+                <w:rFonts w:ascii="Arial" w:hAnsi="Arial" w:eastAsia="Arial" w:cs="Arial"/>
+                <w:i w:val="false"/>
+                <w:b w:val="false"/>
+                <w:u w:val="none"/>
+                <w:sz w:val="22"/>
+                <w:szCs w:val="22"/>
+                <w:color w:val="000000"/>
+              </w:rPr>
             </w:pPr>
-            <w:r>
+            <w:r xmlns:w="http://schemas.openxmlformats.org/wordprocessingml/2006/main" xmlns:wp="http://schemas.openxmlformats.org/drawingml/2006/wordprocessingDrawing" xmlns:r="http://schemas.openxmlformats.org/officeDocument/2006/relationships" xmlns:w14="http://schemas.microsoft.com/office/word/2010/wordml">
               <w:rPr>
-                <w:rFonts w:ascii="Calibri" w:hAnsi="Calibri"/>
-                <w:sz w:val="20"/>
+                <w:rFonts w:ascii="Arial" w:hAnsi="Arial" w:eastAsia="Arial" w:cs="Arial"/>
+                <w:i w:val="false"/>
+                <w:b w:val="false"/>
+                <w:u w:val="none"/>
+                <w:sz w:val="22"/>
+                <w:szCs w:val="22"/>
+                <w:color w:val="000000"/>
               </w:rPr>
-              <w:t xml:space="default">Electrical Panel Upgrade</w:t>
+              <w:t xml:space="preserve">Electrical Panel Upgrade</w:t>
             </w:r>
           </w:p>
         </w:tc>
         <w:tc>
           <w:tcPr>
             <w:tcBorders>
-              <w:top w:val="single" w:space="0" w:color="D3D3D3"/>
-              <w:bottom w:val="single" w:space="0" w:color="D3D3D3"/>
-              <w:start w:val="single" w:space="0" w:color="D3D3D3"/>
-              <w:end w:val="single" w:space="0" w:color="D3D3D3"/>
+              <w:bottom w:val="none" w:sz="0" w:space="0" w:color="000000"/>
+              <w:top w:val="none" w:sz="0" w:space="0" w:color="000000"/>
+              <w:left w:val="none" w:sz="0" w:space="0" w:color="000000"/>
+              <w:right w:val="none" w:sz="0" w:space="0" w:color="000000"/>
             </w:tcBorders>
+            <w:shd w:val="clear" w:color="auto" w:fill="FFFFFF"/>
+            <w:tcMar>
+              <w:top w:w="0" w:type="dxa"/>
+              <w:bottom w:w="0" w:type="dxa"/>
+              <w:left w:w="0" w:type="dxa"/>
+              <w:right w:w="0" w:type="dxa"/>
+            </w:tcMar>
+            <w:vAlign w:val="top"/>
           </w:tcPr>
           <w:p>
             <w:pPr>
-              <w:spacing w:before="0" w:after="60"/>
-              <w:keepNext/>
-              <w:jc w:val="start"/>
+              <w:jc w:val="left"/>
+              <w:pBdr>
+                <w:bottom w:val="none" w:sz="0" w:space="0" w:color="000000"/>
+                <w:top w:val="none" w:sz="0" w:space="0" w:color="000000"/>
+                <w:left w:val="none" w:sz="0" w:space="0" w:color="000000"/>
+                <w:right w:val="none" w:sz="0" w:space="0" w:color="000000"/>
+              </w:pBdr>
+              <w:spacing w:after="80" w:before="80" w:line="240"/>
+              <w:ind w:left="80" w:right="80" w:firstLine="0" w:firstLineChars="0"/>
+              <w:rPr>
+                <w:rFonts w:ascii="Arial" w:hAnsi="Arial" w:eastAsia="Arial" w:cs="Arial"/>
+                <w:i w:val="false"/>
+                <w:b w:val="false"/>
+                <w:u w:val="none"/>
+                <w:sz w:val="22"/>
+                <w:szCs w:val="22"/>
+                <w:color w:val="000000"/>
+              </w:rPr>
             </w:pPr>
-            <w:r>
+            <w:r xmlns:w="http://schemas.openxmlformats.org/wordprocessingml/2006/main" xmlns:wp="http://schemas.openxmlformats.org/drawingml/2006/wordprocessingDrawing" xmlns:r="http://schemas.openxmlformats.org/officeDocument/2006/relationships" xmlns:w14="http://schemas.microsoft.com/office/word/2010/wordml">
               <w:rPr>
-                <w:rFonts w:ascii="Calibri" w:hAnsi="Calibri"/>
-                <w:sz w:val="20"/>
+                <w:rFonts w:ascii="Arial" w:hAnsi="Arial" w:eastAsia="Arial" w:cs="Arial"/>
+                <w:i w:val="false"/>
+                <w:b w:val="false"/>
+                <w:u w:val="none"/>
+                <w:sz w:val="22"/>
+                <w:szCs w:val="22"/>
+                <w:color w:val="000000"/>
               </w:rPr>
-              <w:t xml:space="default">Consult with an electrician about replacing your existing electrical panel with a 200 amp panel as you add electrical appliances to your home.</w:t>
+              <w:t xml:space="preserve">Consult with an electrician about replacing your existing electrical panel with a 200 amp panel as you add electrical appliances to your home.</w:t>
             </w:r>
           </w:p>
         </w:tc>
       </w:tr>
       <w:tr>
         <w:trPr>
-          <w:cantSplit/>
+          <w:trHeight w:val="360" w:hRule="auto"/>
         </w:trPr>
+        body16
         <w:tc>
           <w:tcPr>
             <w:tcBorders>
-              <w:top w:val="single" w:space="0" w:color="D3D3D3"/>
-              <w:bottom w:val="single" w:space="0" w:color="D3D3D3"/>
-              <w:start w:val="single" w:space="0" w:color="D3D3D3"/>
-              <w:end w:val="single" w:space="0" w:color="D3D3D3"/>
+              <w:bottom w:val="none" w:sz="0" w:space="0" w:color="000000"/>
+              <w:top w:val="none" w:sz="0" w:space="0" w:color="000000"/>
+              <w:left w:val="none" w:sz="0" w:space="0" w:color="000000"/>
+              <w:right w:val="none" w:sz="0" w:space="0" w:color="000000"/>
             </w:tcBorders>
+            <w:shd w:val="clear" w:color="auto" w:fill="FFFFFF"/>
+            <w:tcMar>
+              <w:top w:w="0" w:type="dxa"/>
+              <w:bottom w:w="0" w:type="dxa"/>
+              <w:left w:w="0" w:type="dxa"/>
+              <w:right w:w="0" w:type="dxa"/>
+            </w:tcMar>
+            <w:vAlign w:val="top"/>
           </w:tcPr>
           <w:p>
             <w:pPr>
-              <w:spacing w:before="0" w:after="60"/>
-              <w:keepNext/>
-              <w:jc w:val="start"/>
+              <w:jc w:val="left"/>
+              <w:pBdr>
+                <w:bottom w:val="none" w:sz="0" w:space="0" w:color="000000"/>
+                <w:top w:val="none" w:sz="0" w:space="0" w:color="000000"/>
+                <w:left w:val="none" w:sz="0" w:space="0" w:color="000000"/>
+                <w:right w:val="none" w:sz="0" w:space="0" w:color="000000"/>
+              </w:pBdr>
+              <w:spacing w:after="80" w:before="80" w:line="240"/>
+              <w:ind w:left="80" w:right="80" w:firstLine="0" w:firstLineChars="0"/>
+              <w:rPr>
+                <w:rFonts w:ascii="Arial" w:hAnsi="Arial" w:eastAsia="Arial" w:cs="Arial"/>
+                <w:i w:val="false"/>
+                <w:b w:val="false"/>
+                <w:u w:val="none"/>
+                <w:sz w:val="22"/>
+                <w:szCs w:val="22"/>
+                <w:color w:val="000000"/>
+              </w:rPr>
             </w:pPr>
-            <w:r>
+            <w:r xmlns:w="http://schemas.openxmlformats.org/wordprocessingml/2006/main" xmlns:wp="http://schemas.openxmlformats.org/drawingml/2006/wordprocessingDrawing" xmlns:r="http://schemas.openxmlformats.org/officeDocument/2006/relationships" xmlns:w14="http://schemas.microsoft.com/office/word/2010/wordml">
               <w:rPr>
-                <w:rFonts w:ascii="Calibri" w:hAnsi="Calibri"/>
-                <w:sz w:val="20"/>
+                <w:rFonts w:ascii="Arial" w:hAnsi="Arial" w:eastAsia="Arial" w:cs="Arial"/>
+                <w:i w:val="false"/>
+                <w:b w:val="false"/>
+                <w:u w:val="none"/>
+                <w:sz w:val="22"/>
+                <w:szCs w:val="22"/>
+                <w:color w:val="000000"/>
               </w:rPr>
-              <w:t xml:space="default">Air Source Heat Pump</w:t>
+              <w:t xml:space="preserve">Air Source Heat Pump</w:t>
             </w:r>
           </w:p>
         </w:tc>
         <w:tc>
           <w:tcPr>
             <w:tcBorders>
-              <w:top w:val="single" w:space="0" w:color="D3D3D3"/>
-              <w:bottom w:val="single" w:space="0" w:color="D3D3D3"/>
-              <w:start w:val="single" w:space="0" w:color="D3D3D3"/>
-              <w:end w:val="single" w:space="0" w:color="D3D3D3"/>
+              <w:bottom w:val="none" w:sz="0" w:space="0" w:color="000000"/>
+              <w:top w:val="none" w:sz="0" w:space="0" w:color="000000"/>
+              <w:left w:val="none" w:sz="0" w:space="0" w:color="000000"/>
+              <w:right w:val="none" w:sz="0" w:space="0" w:color="000000"/>
             </w:tcBorders>
+            <w:shd w:val="clear" w:color="auto" w:fill="FFFFFF"/>
+            <w:tcMar>
+              <w:top w:w="0" w:type="dxa"/>
+              <w:bottom w:w="0" w:type="dxa"/>
+              <w:left w:w="0" w:type="dxa"/>
+              <w:right w:w="0" w:type="dxa"/>
+            </w:tcMar>
+            <w:vAlign w:val="top"/>
           </w:tcPr>
           <w:p>
             <w:pPr>
-              <w:spacing w:before="0" w:after="60"/>
-              <w:keepNext/>
-              <w:jc w:val="start"/>
+              <w:jc w:val="left"/>
+              <w:pBdr>
+                <w:bottom w:val="none" w:sz="0" w:space="0" w:color="000000"/>
+                <w:top w:val="none" w:sz="0" w:space="0" w:color="000000"/>
+                <w:left w:val="none" w:sz="0" w:space="0" w:color="000000"/>
+                <w:right w:val="none" w:sz="0" w:space="0" w:color="000000"/>
+              </w:pBdr>
+              <w:spacing w:after="80" w:before="80" w:line="240"/>
+              <w:ind w:left="80" w:right="80" w:firstLine="0" w:firstLineChars="0"/>
+              <w:rPr>
+                <w:rFonts w:ascii="Arial" w:hAnsi="Arial" w:eastAsia="Arial" w:cs="Arial"/>
+                <w:i w:val="false"/>
+                <w:b w:val="false"/>
+                <w:u w:val="none"/>
+                <w:sz w:val="22"/>
+                <w:szCs w:val="22"/>
+                <w:color w:val="000000"/>
+              </w:rPr>
             </w:pPr>
-            <w:r>
+            <w:r xmlns:w="http://schemas.openxmlformats.org/wordprocessingml/2006/main" xmlns:wp="http://schemas.openxmlformats.org/drawingml/2006/wordprocessingDrawing" xmlns:r="http://schemas.openxmlformats.org/officeDocument/2006/relationships" xmlns:w14="http://schemas.microsoft.com/office/word/2010/wordml">
               <w:rPr>
-                <w:rFonts w:ascii="Calibri" w:hAnsi="Calibri"/>
-                <w:sz w:val="20"/>
+                <w:rFonts w:ascii="Arial" w:hAnsi="Arial" w:eastAsia="Arial" w:cs="Arial"/>
+                <w:i w:val="false"/>
+                <w:b w:val="false"/>
+                <w:u w:val="none"/>
+                <w:sz w:val="22"/>
+                <w:szCs w:val="22"/>
+                <w:color w:val="000000"/>
               </w:rPr>
-              <w:t xml:space="default">Install air source heat pumps for heating and cooling and whole-house surge protection.</w:t>
+              <w:t xml:space="preserve">Install air source heat pumps for heating and cooling and whole-house surge protection.</w:t>
             </w:r>
           </w:p>
         </w:tc>
       </w:tr>
       <w:tr>
         <w:trPr>
-          <w:cantSplit/>
+          <w:trHeight w:val="360" w:hRule="auto"/>
         </w:trPr>
+        body17
         <w:tc>
           <w:tcPr>
             <w:tcBorders>
-              <w:top w:val="single" w:space="0" w:color="D3D3D3"/>
-              <w:bottom w:val="single" w:space="0" w:color="D3D3D3"/>
-              <w:start w:val="single" w:space="0" w:color="D3D3D3"/>
-              <w:end w:val="single" w:space="0" w:color="D3D3D3"/>
+              <w:bottom w:val="none" w:sz="0" w:space="0" w:color="000000"/>
+              <w:top w:val="none" w:sz="0" w:space="0" w:color="000000"/>
+              <w:left w:val="none" w:sz="0" w:space="0" w:color="000000"/>
+              <w:right w:val="none" w:sz="0" w:space="0" w:color="000000"/>
             </w:tcBorders>
+            <w:shd w:val="clear" w:color="auto" w:fill="FFFFFF"/>
+            <w:tcMar>
+              <w:top w:w="0" w:type="dxa"/>
+              <w:bottom w:w="0" w:type="dxa"/>
+              <w:left w:w="0" w:type="dxa"/>
+              <w:right w:w="0" w:type="dxa"/>
+            </w:tcMar>
+            <w:vAlign w:val="top"/>
           </w:tcPr>
           <w:p>
             <w:pPr>
-              <w:spacing w:before="0" w:after="60"/>
-              <w:keepNext/>
-              <w:jc w:val="start"/>
+              <w:jc w:val="left"/>
+              <w:pBdr>
+                <w:bottom w:val="none" w:sz="0" w:space="0" w:color="000000"/>
+                <w:top w:val="none" w:sz="0" w:space="0" w:color="000000"/>
+                <w:left w:val="none" w:sz="0" w:space="0" w:color="000000"/>
+                <w:right w:val="none" w:sz="0" w:space="0" w:color="000000"/>
+              </w:pBdr>
+              <w:spacing w:after="80" w:before="80" w:line="240"/>
+              <w:ind w:left="80" w:right="80" w:firstLine="0" w:firstLineChars="0"/>
+              <w:rPr>
+                <w:rFonts w:ascii="Arial" w:hAnsi="Arial" w:eastAsia="Arial" w:cs="Arial"/>
+                <w:i w:val="false"/>
+                <w:b w:val="false"/>
+                <w:u w:val="none"/>
+                <w:sz w:val="22"/>
+                <w:szCs w:val="22"/>
+                <w:color w:val="000000"/>
+              </w:rPr>
             </w:pPr>
-            <w:r>
+            <w:r xmlns:w="http://schemas.openxmlformats.org/wordprocessingml/2006/main" xmlns:wp="http://schemas.openxmlformats.org/drawingml/2006/wordprocessingDrawing" xmlns:r="http://schemas.openxmlformats.org/officeDocument/2006/relationships" xmlns:w14="http://schemas.microsoft.com/office/word/2010/wordml">
               <w:rPr>
-                <w:rFonts w:ascii="Calibri" w:hAnsi="Calibri"/>
-                <w:sz w:val="20"/>
+                <w:rFonts w:ascii="Arial" w:hAnsi="Arial" w:eastAsia="Arial" w:cs="Arial"/>
+                <w:i w:val="false"/>
+                <w:b w:val="false"/>
+                <w:u w:val="none"/>
+                <w:sz w:val="22"/>
+                <w:szCs w:val="22"/>
+                <w:color w:val="000000"/>
               </w:rPr>
-              <w:t xml:space="default">Whole-House Surge Protection</w:t>
+              <w:t xml:space="preserve">Whole-House Surge Protection</w:t>
             </w:r>
           </w:p>
         </w:tc>
         <w:tc>
           <w:tcPr>
             <w:tcBorders>
-              <w:top w:val="single" w:space="0" w:color="D3D3D3"/>
-              <w:bottom w:val="single" w:space="0" w:color="D3D3D3"/>
-              <w:start w:val="single" w:space="0" w:color="D3D3D3"/>
-              <w:end w:val="single" w:space="0" w:color="D3D3D3"/>
+              <w:bottom w:val="none" w:sz="0" w:space="0" w:color="000000"/>
+              <w:top w:val="none" w:sz="0" w:space="0" w:color="000000"/>
+              <w:left w:val="none" w:sz="0" w:space="0" w:color="000000"/>
+              <w:right w:val="none" w:sz="0" w:space="0" w:color="000000"/>
             </w:tcBorders>
+            <w:shd w:val="clear" w:color="auto" w:fill="FFFFFF"/>
+            <w:tcMar>
+              <w:top w:w="0" w:type="dxa"/>
+              <w:bottom w:w="0" w:type="dxa"/>
+              <w:left w:w="0" w:type="dxa"/>
+              <w:right w:w="0" w:type="dxa"/>
+            </w:tcMar>
+            <w:vAlign w:val="top"/>
           </w:tcPr>
           <w:p>
             <w:pPr>
-              <w:spacing w:before="0" w:after="60"/>
-              <w:keepNext/>
-              <w:jc w:val="start"/>
+              <w:jc w:val="left"/>
+              <w:pBdr>
+                <w:bottom w:val="none" w:sz="0" w:space="0" w:color="000000"/>
+                <w:top w:val="none" w:sz="0" w:space="0" w:color="000000"/>
+                <w:left w:val="none" w:sz="0" w:space="0" w:color="000000"/>
+                <w:right w:val="none" w:sz="0" w:space="0" w:color="000000"/>
+              </w:pBdr>
+              <w:spacing w:after="80" w:before="80" w:line="240"/>
+              <w:ind w:left="80" w:right="80" w:firstLine="0" w:firstLineChars="0"/>
+              <w:rPr>
+                <w:rFonts w:ascii="Arial" w:hAnsi="Arial" w:eastAsia="Arial" w:cs="Arial"/>
+                <w:i w:val="false"/>
+                <w:b w:val="false"/>
+                <w:u w:val="none"/>
+                <w:sz w:val="22"/>
+                <w:szCs w:val="22"/>
+                <w:color w:val="000000"/>
+              </w:rPr>
             </w:pPr>
-            <w:r>
+            <w:r xmlns:w="http://schemas.openxmlformats.org/wordprocessingml/2006/main" xmlns:wp="http://schemas.openxmlformats.org/drawingml/2006/wordprocessingDrawing" xmlns:r="http://schemas.openxmlformats.org/officeDocument/2006/relationships" xmlns:w14="http://schemas.microsoft.com/office/word/2010/wordml">
               <w:rPr>
-                <w:rFonts w:ascii="Calibri" w:hAnsi="Calibri"/>
-                <w:sz w:val="20"/>
+                <w:rFonts w:ascii="Arial" w:hAnsi="Arial" w:eastAsia="Arial" w:cs="Arial"/>
+                <w:i w:val="false"/>
+                <w:b w:val="false"/>
+                <w:u w:val="none"/>
+                <w:sz w:val="22"/>
+                <w:szCs w:val="22"/>
+                <w:color w:val="000000"/>
               </w:rPr>
-              <w:t xml:space="default">Upgrade your electrical panel to add whole-house surge protection.</w:t>
+              <w:t xml:space="preserve">Upgrade your electrical panel to add whole-house surge protection.</w:t>
             </w:r>
           </w:p>
         </w:tc>
       </w:tr>
       <w:tr>
         <w:trPr>
-          <w:cantSplit/>
+          <w:trHeight w:val="360" w:hRule="auto"/>
         </w:trPr>
+        body18
         <w:tc>
           <w:tcPr>
             <w:tcBorders>
-              <w:top w:val="single" w:space="0" w:color="D3D3D3"/>
-              <w:bottom w:val="single" w:space="0" w:color="D3D3D3"/>
-              <w:start w:val="single" w:space="0" w:color="D3D3D3"/>
-              <w:end w:val="single" w:space="0" w:color="D3D3D3"/>
+              <w:bottom w:val="none" w:sz="0" w:space="0" w:color="000000"/>
+              <w:top w:val="none" w:sz="0" w:space="0" w:color="000000"/>
+              <w:left w:val="none" w:sz="0" w:space="0" w:color="000000"/>
+              <w:right w:val="none" w:sz="0" w:space="0" w:color="000000"/>
             </w:tcBorders>
+            <w:shd w:val="clear" w:color="auto" w:fill="FFFFFF"/>
+            <w:tcMar>
+              <w:top w:w="0" w:type="dxa"/>
+              <w:bottom w:w="0" w:type="dxa"/>
+              <w:left w:w="0" w:type="dxa"/>
+              <w:right w:w="0" w:type="dxa"/>
+            </w:tcMar>
+            <w:vAlign w:val="top"/>
           </w:tcPr>
           <w:p>
             <w:pPr>
-              <w:spacing w:before="0" w:after="60"/>
-              <w:keepNext/>
-              <w:jc w:val="start"/>
+              <w:jc w:val="left"/>
+              <w:pBdr>
+                <w:bottom w:val="none" w:sz="0" w:space="0" w:color="000000"/>
+                <w:top w:val="none" w:sz="0" w:space="0" w:color="000000"/>
+                <w:left w:val="none" w:sz="0" w:space="0" w:color="000000"/>
+                <w:right w:val="none" w:sz="0" w:space="0" w:color="000000"/>
+              </w:pBdr>
+              <w:spacing w:after="80" w:before="80" w:line="240"/>
+              <w:ind w:left="80" w:right="80" w:firstLine="0" w:firstLineChars="0"/>
+              <w:rPr>
+                <w:rFonts w:ascii="Arial" w:hAnsi="Arial" w:eastAsia="Arial" w:cs="Arial"/>
+                <w:i w:val="false"/>
+                <w:b w:val="false"/>
+                <w:u w:val="none"/>
+                <w:sz w:val="22"/>
+                <w:szCs w:val="22"/>
+                <w:color w:val="000000"/>
+              </w:rPr>
             </w:pPr>
-            <w:r>
+            <w:r xmlns:w="http://schemas.openxmlformats.org/wordprocessingml/2006/main" xmlns:wp="http://schemas.openxmlformats.org/drawingml/2006/wordprocessingDrawing" xmlns:r="http://schemas.openxmlformats.org/officeDocument/2006/relationships" xmlns:w14="http://schemas.microsoft.com/office/word/2010/wordml">
               <w:rPr>
-                <w:rFonts w:ascii="Calibri" w:hAnsi="Calibri"/>
-                <w:sz w:val="20"/>
+                <w:rFonts w:ascii="Arial" w:hAnsi="Arial" w:eastAsia="Arial" w:cs="Arial"/>
+                <w:i w:val="false"/>
+                <w:b w:val="false"/>
+                <w:u w:val="none"/>
+                <w:sz w:val="22"/>
+                <w:szCs w:val="22"/>
+                <w:color w:val="000000"/>
               </w:rPr>
-              <w:t xml:space="default">Pipe Insulation</w:t>
+              <w:t xml:space="preserve">Pipe Insulation</w:t>
             </w:r>
           </w:p>
         </w:tc>
         <w:tc>
           <w:tcPr>
             <w:tcBorders>
-              <w:top w:val="single" w:space="0" w:color="D3D3D3"/>
-              <w:bottom w:val="single" w:space="0" w:color="D3D3D3"/>
-              <w:start w:val="single" w:space="0" w:color="D3D3D3"/>
-              <w:end w:val="single" w:space="0" w:color="D3D3D3"/>
+              <w:bottom w:val="none" w:sz="0" w:space="0" w:color="000000"/>
+              <w:top w:val="none" w:sz="0" w:space="0" w:color="000000"/>
+              <w:left w:val="none" w:sz="0" w:space="0" w:color="000000"/>
+              <w:right w:val="none" w:sz="0" w:space="0" w:color="000000"/>
             </w:tcBorders>
+            <w:shd w:val="clear" w:color="auto" w:fill="FFFFFF"/>
+            <w:tcMar>
+              <w:top w:w="0" w:type="dxa"/>
+              <w:bottom w:w="0" w:type="dxa"/>
+              <w:left w:w="0" w:type="dxa"/>
+              <w:right w:w="0" w:type="dxa"/>
+            </w:tcMar>
+            <w:vAlign w:val="top"/>
           </w:tcPr>
           <w:p>
             <w:pPr>
-              <w:spacing w:before="0" w:after="60"/>
-              <w:keepNext/>
-              <w:jc w:val="start"/>
+              <w:jc w:val="left"/>
+              <w:pBdr>
+                <w:bottom w:val="none" w:sz="0" w:space="0" w:color="000000"/>
+                <w:top w:val="none" w:sz="0" w:space="0" w:color="000000"/>
+                <w:left w:val="none" w:sz="0" w:space="0" w:color="000000"/>
+                <w:right w:val="none" w:sz="0" w:space="0" w:color="000000"/>
+              </w:pBdr>
+              <w:spacing w:after="80" w:before="80" w:line="240"/>
+              <w:ind w:left="80" w:right="80" w:firstLine="0" w:firstLineChars="0"/>
+              <w:rPr>
+                <w:rFonts w:ascii="Arial" w:hAnsi="Arial" w:eastAsia="Arial" w:cs="Arial"/>
+                <w:i w:val="false"/>
+                <w:b w:val="false"/>
+                <w:u w:val="none"/>
+                <w:sz w:val="22"/>
+                <w:szCs w:val="22"/>
+                <w:color w:val="000000"/>
+              </w:rPr>
             </w:pPr>
-            <w:r>
+            <w:r xmlns:w="http://schemas.openxmlformats.org/wordprocessingml/2006/main" xmlns:wp="http://schemas.openxmlformats.org/drawingml/2006/wordprocessingDrawing" xmlns:r="http://schemas.openxmlformats.org/officeDocument/2006/relationships" xmlns:w14="http://schemas.microsoft.com/office/word/2010/wordml">
               <w:rPr>
-                <w:rFonts w:ascii="Calibri" w:hAnsi="Calibri"/>
-                <w:sz w:val="20"/>
+                <w:rFonts w:ascii="Arial" w:hAnsi="Arial" w:eastAsia="Arial" w:cs="Arial"/>
+                <w:i w:val="false"/>
+                <w:b w:val="false"/>
+                <w:u w:val="none"/>
+                <w:sz w:val="22"/>
+                <w:szCs w:val="22"/>
+                <w:color w:val="000000"/>
               </w:rPr>
-              <w:t xml:space="default">Insulate both hot and cold water pipes that are uninsulated in the **basement / crawlspace**. This will save energy and prevent condensation.</w:t>
+              <w:t xml:space="preserve">Insulate both hot and cold water pipes that are uninsulated in the **basement / crawlspace**. This will save energy and prevent condensation.</w:t>
             </w:r>
           </w:p>
         </w:tc>
       </w:tr>
       <w:tr>
         <w:trPr>
-          <w:cantSplit/>
+          <w:trHeight w:val="360" w:hRule="auto"/>
         </w:trPr>
+        body19
         <w:tc>
           <w:tcPr>
             <w:tcBorders>
-              <w:top w:val="single" w:space="0" w:color="D3D3D3"/>
-              <w:bottom w:val="single" w:space="0" w:color="D3D3D3"/>
-              <w:start w:val="single" w:space="0" w:color="D3D3D3"/>
-              <w:end w:val="single" w:space="0" w:color="D3D3D3"/>
+              <w:bottom w:val="none" w:sz="0" w:space="0" w:color="000000"/>
+              <w:top w:val="none" w:sz="0" w:space="0" w:color="000000"/>
+              <w:left w:val="none" w:sz="0" w:space="0" w:color="000000"/>
+              <w:right w:val="none" w:sz="0" w:space="0" w:color="000000"/>
             </w:tcBorders>
+            <w:shd w:val="clear" w:color="auto" w:fill="FFFFFF"/>
+            <w:tcMar>
+              <w:top w:w="0" w:type="dxa"/>
+              <w:bottom w:w="0" w:type="dxa"/>
+              <w:left w:w="0" w:type="dxa"/>
+              <w:right w:w="0" w:type="dxa"/>
+            </w:tcMar>
+            <w:vAlign w:val="top"/>
           </w:tcPr>
           <w:p>
             <w:pPr>
-              <w:spacing w:before="0" w:after="60"/>
-              <w:keepNext/>
-              <w:jc w:val="start"/>
+              <w:jc w:val="left"/>
+              <w:pBdr>
+                <w:bottom w:val="none" w:sz="0" w:space="0" w:color="000000"/>
+                <w:top w:val="none" w:sz="0" w:space="0" w:color="000000"/>
+                <w:left w:val="none" w:sz="0" w:space="0" w:color="000000"/>
+                <w:right w:val="none" w:sz="0" w:space="0" w:color="000000"/>
+              </w:pBdr>
+              <w:spacing w:after="80" w:before="80" w:line="240"/>
+              <w:ind w:left="80" w:right="80" w:firstLine="0" w:firstLineChars="0"/>
+              <w:rPr>
+                <w:rFonts w:ascii="Arial" w:hAnsi="Arial" w:eastAsia="Arial" w:cs="Arial"/>
+                <w:i w:val="false"/>
+                <w:b w:val="false"/>
+                <w:u w:val="none"/>
+                <w:sz w:val="22"/>
+                <w:szCs w:val="22"/>
+                <w:color w:val="000000"/>
+              </w:rPr>
             </w:pPr>
-            <w:r>
+            <w:r xmlns:w="http://schemas.openxmlformats.org/wordprocessingml/2006/main" xmlns:wp="http://schemas.openxmlformats.org/drawingml/2006/wordprocessingDrawing" xmlns:r="http://schemas.openxmlformats.org/officeDocument/2006/relationships" xmlns:w14="http://schemas.microsoft.com/office/word/2010/wordml">
               <w:rPr>
-                <w:rFonts w:ascii="Calibri" w:hAnsi="Calibri"/>
-                <w:sz w:val="20"/>
+                <w:rFonts w:ascii="Arial" w:hAnsi="Arial" w:eastAsia="Arial" w:cs="Arial"/>
+                <w:i w:val="false"/>
+                <w:b w:val="false"/>
+                <w:u w:val="none"/>
+                <w:sz w:val="22"/>
+                <w:szCs w:val="22"/>
+                <w:color w:val="000000"/>
               </w:rPr>
-              <w:t xml:space="default">Other 1</w:t>
+              <w:t xml:space="preserve">Other 1</w:t>
             </w:r>
           </w:p>
         </w:tc>
         <w:tc>
           <w:tcPr>
             <w:tcBorders>
-              <w:top w:val="single" w:space="0" w:color="D3D3D3"/>
-              <w:bottom w:val="single" w:space="0" w:color="D3D3D3"/>
-              <w:start w:val="single" w:space="0" w:color="D3D3D3"/>
-              <w:end w:val="single" w:space="0" w:color="D3D3D3"/>
+              <w:bottom w:val="none" w:sz="0" w:space="0" w:color="000000"/>
+              <w:top w:val="none" w:sz="0" w:space="0" w:color="000000"/>
+              <w:left w:val="none" w:sz="0" w:space="0" w:color="000000"/>
+              <w:right w:val="none" w:sz="0" w:space="0" w:color="000000"/>
             </w:tcBorders>
+            <w:shd w:val="clear" w:color="auto" w:fill="FFFFFF"/>
+            <w:tcMar>
+              <w:top w:w="0" w:type="dxa"/>
+              <w:bottom w:w="0" w:type="dxa"/>
+              <w:left w:w="0" w:type="dxa"/>
+              <w:right w:w="0" w:type="dxa"/>
+            </w:tcMar>
+            <w:vAlign w:val="top"/>
           </w:tcPr>
           <w:p>
             <w:pPr>
-              <w:spacing w:before="0" w:after="60"/>
-              <w:keepNext/>
-              <w:jc w:val="start"/>
+              <w:jc w:val="left"/>
+              <w:pBdr>
+                <w:bottom w:val="none" w:sz="0" w:space="0" w:color="000000"/>
+                <w:top w:val="none" w:sz="0" w:space="0" w:color="000000"/>
+                <w:left w:val="none" w:sz="0" w:space="0" w:color="000000"/>
+                <w:right w:val="none" w:sz="0" w:space="0" w:color="000000"/>
+              </w:pBdr>
+              <w:spacing w:after="80" w:before="80" w:line="240"/>
+              <w:ind w:left="80" w:right="80" w:firstLine="0" w:firstLineChars="0"/>
+              <w:rPr>
+                <w:rFonts w:ascii="Arial" w:hAnsi="Arial" w:eastAsia="Arial" w:cs="Arial"/>
+                <w:i w:val="false"/>
+                <w:b w:val="false"/>
+                <w:u w:val="none"/>
+                <w:sz w:val="22"/>
+                <w:szCs w:val="22"/>
+                <w:color w:val="000000"/>
+              </w:rPr>
             </w:pPr>
-            <w:r>
+            <w:r xmlns:w="http://schemas.openxmlformats.org/wordprocessingml/2006/main" xmlns:wp="http://schemas.openxmlformats.org/drawingml/2006/wordprocessingDrawing" xmlns:r="http://schemas.openxmlformats.org/officeDocument/2006/relationships" xmlns:w14="http://schemas.microsoft.com/office/word/2010/wordml">
               <w:rPr>
-                <w:rFonts w:ascii="Calibri" w:hAnsi="Calibri"/>
-                <w:sz w:val="20"/>
+                <w:rFonts w:ascii="Arial" w:hAnsi="Arial" w:eastAsia="Arial" w:cs="Arial"/>
+                <w:i w:val="false"/>
+                <w:b w:val="false"/>
+                <w:u w:val="none"/>
+                <w:sz w:val="22"/>
+                <w:szCs w:val="22"/>
+                <w:color w:val="000000"/>
               </w:rPr>
-              <w:t xml:space="default">TYPE HERE 1</w:t>
+              <w:t xml:space="preserve">TYPE HERE 1</w:t>
             </w:r>
           </w:p>
         </w:tc>
       </w:tr>
       <w:tr>
         <w:trPr>
-          <w:cantSplit/>
+          <w:trHeight w:val="360" w:hRule="auto"/>
         </w:trPr>
+        body20
         <w:tc>
           <w:tcPr>
             <w:tcBorders>
-              <w:top w:val="single" w:space="0" w:color="D3D3D3"/>
-              <w:bottom w:val="single" w:space="0" w:color="D3D3D3"/>
-              <w:start w:val="single" w:space="0" w:color="D3D3D3"/>
-              <w:end w:val="single" w:space="0" w:color="D3D3D3"/>
+              <w:bottom w:val="single" w:sz="12" w:space="0" w:color="666666"/>
+              <w:top w:val="none" w:sz="0" w:space="0" w:color="000000"/>
+              <w:left w:val="none" w:sz="0" w:space="0" w:color="000000"/>
+              <w:right w:val="none" w:sz="0" w:space="0" w:color="000000"/>
             </w:tcBorders>
+            <w:shd w:val="clear" w:color="auto" w:fill="FFFFFF"/>
+            <w:tcMar>
+              <w:top w:w="0" w:type="dxa"/>
+              <w:bottom w:w="0" w:type="dxa"/>
+              <w:left w:w="0" w:type="dxa"/>
+              <w:right w:w="0" w:type="dxa"/>
+            </w:tcMar>
+            <w:vAlign w:val="top"/>
           </w:tcPr>
           <w:p>
             <w:pPr>
-              <w:spacing w:before="0" w:after="60"/>
-              <w:keepNext/>
-              <w:jc w:val="start"/>
+              <w:jc w:val="left"/>
+              <w:pBdr>
+                <w:bottom w:val="none" w:sz="0" w:space="0" w:color="000000"/>
+                <w:top w:val="none" w:sz="0" w:space="0" w:color="000000"/>
+                <w:left w:val="none" w:sz="0" w:space="0" w:color="000000"/>
+                <w:right w:val="none" w:sz="0" w:space="0" w:color="000000"/>
+              </w:pBdr>
+              <w:spacing w:after="80" w:before="80" w:line="240"/>
+              <w:ind w:left="80" w:right="80" w:firstLine="0" w:firstLineChars="0"/>
+              <w:rPr>
+                <w:rFonts w:ascii="Arial" w:hAnsi="Arial" w:eastAsia="Arial" w:cs="Arial"/>
+                <w:i w:val="false"/>
+                <w:b w:val="false"/>
+                <w:u w:val="none"/>
+                <w:sz w:val="22"/>
+                <w:szCs w:val="22"/>
+                <w:color w:val="000000"/>
+              </w:rPr>
             </w:pPr>
-            <w:r>
+            <w:r xmlns:w="http://schemas.openxmlformats.org/wordprocessingml/2006/main" xmlns:wp="http://schemas.openxmlformats.org/drawingml/2006/wordprocessingDrawing" xmlns:r="http://schemas.openxmlformats.org/officeDocument/2006/relationships" xmlns:w14="http://schemas.microsoft.com/office/word/2010/wordml">
               <w:rPr>
-                <w:rFonts w:ascii="Calibri" w:hAnsi="Calibri"/>
-                <w:sz w:val="20"/>
+                <w:rFonts w:ascii="Arial" w:hAnsi="Arial" w:eastAsia="Arial" w:cs="Arial"/>
+                <w:i w:val="false"/>
+                <w:b w:val="false"/>
+                <w:u w:val="none"/>
+                <w:sz w:val="22"/>
+                <w:szCs w:val="22"/>
+                <w:color w:val="000000"/>
               </w:rPr>
-              <w:t xml:space="default">Heat Pump Water Heater</w:t>
+              <w:t xml:space="preserve">Heat Pump Water Heater</w:t>
             </w:r>
           </w:p>
         </w:tc>
         <w:tc>
           <w:tcPr>
             <w:tcBorders>
-              <w:top w:val="single" w:space="0" w:color="D3D3D3"/>
-              <w:bottom w:val="single" w:space="0" w:color="D3D3D3"/>
-              <w:start w:val="single" w:space="0" w:color="D3D3D3"/>
-              <w:end w:val="single" w:space="0" w:color="D3D3D3"/>
+              <w:bottom w:val="single" w:sz="12" w:space="0" w:color="666666"/>
+              <w:top w:val="none" w:sz="0" w:space="0" w:color="000000"/>
+              <w:left w:val="none" w:sz="0" w:space="0" w:color="000000"/>
+              <w:right w:val="none" w:sz="0" w:space="0" w:color="000000"/>
             </w:tcBorders>
+            <w:shd w:val="clear" w:color="auto" w:fill="FFFFFF"/>
+            <w:tcMar>
+              <w:top w:w="0" w:type="dxa"/>
+              <w:bottom w:w="0" w:type="dxa"/>
+              <w:left w:w="0" w:type="dxa"/>
+              <w:right w:w="0" w:type="dxa"/>
+            </w:tcMar>
+            <w:vAlign w:val="top"/>
           </w:tcPr>
           <w:p>
             <w:pPr>
-              <w:spacing w:before="0" w:after="60"/>
-              <w:keepNext/>
-              <w:jc w:val="start"/>
+              <w:jc w:val="left"/>
+              <w:pBdr>
+                <w:bottom w:val="none" w:sz="0" w:space="0" w:color="000000"/>
+                <w:top w:val="none" w:sz="0" w:space="0" w:color="000000"/>
+                <w:left w:val="none" w:sz="0" w:space="0" w:color="000000"/>
+                <w:right w:val="none" w:sz="0" w:space="0" w:color="000000"/>
+              </w:pBdr>
+              <w:spacing w:after="80" w:before="80" w:line="240"/>
+              <w:ind w:left="80" w:right="80" w:firstLine="0" w:firstLineChars="0"/>
+              <w:rPr>
+                <w:rFonts w:ascii="Arial" w:hAnsi="Arial" w:eastAsia="Arial" w:cs="Arial"/>
+                <w:i w:val="false"/>
+                <w:b w:val="false"/>
+                <w:u w:val="none"/>
+                <w:sz w:val="22"/>
+                <w:szCs w:val="22"/>
+                <w:color w:val="000000"/>
+              </w:rPr>
             </w:pPr>
-            <w:r>
+            <w:r xmlns:w="http://schemas.openxmlformats.org/wordprocessingml/2006/main" xmlns:wp="http://schemas.openxmlformats.org/drawingml/2006/wordprocessingDrawing" xmlns:r="http://schemas.openxmlformats.org/officeDocument/2006/relationships" xmlns:w14="http://schemas.microsoft.com/office/word/2010/wordml">
               <w:rPr>
-                <w:rFonts w:ascii="Calibri" w:hAnsi="Calibri"/>
-                <w:sz w:val="20"/>
+                <w:rFonts w:ascii="Arial" w:hAnsi="Arial" w:eastAsia="Arial" w:cs="Arial"/>
+                <w:i w:val="false"/>
+                <w:b w:val="false"/>
+                <w:u w:val="none"/>
+                <w:sz w:val="22"/>
+                <w:szCs w:val="22"/>
+                <w:color w:val="000000"/>
               </w:rPr>
-              <w:t xml:space="default">Install a heat pump water heater to provide your hot water for cooking and bathing. This is the most efficient way to heat water and will save hundreds of dollars a year compared to electric resistance, heating oil, or propane hot water. It will also help to dehumidify while it's running. If your current water heater burns oil or propane, this will also remove a source of combustion gases from your home.</w:t>
+              <w:t xml:space="preserve">Install a heat pump water heater to provide your hot water for cooking and bathing. This is the most efficient way to heat water and will save hundreds of dollars a year compared to electric resistance, heating oil, or propane hot water. It will also help to dehumidify while it's running. If your current water heater burns oil or propane, this will also remove a source of combustion gases from your home.</w:t>
             </w:r>
           </w:p>
         </w:tc>
@@ -7399,13 +8596,14 @@
     <w:link w:val="TitleChar"/>
     <w:uiPriority w:val="10"/>
     <w:qFormat/>
-    <w:rsid w:val="0013442B"/>
+    <w:rsid w:val="00602B7D"/>
     <w:pPr>
       <w:pBdr>
         <w:bottom w:color="4F81BD" w:space="4" w:sz="8" w:themeColor="accent1" w:val="single"/>
       </w:pBdr>
       <w:spacing w:after="300" w:line="240" w:lineRule="auto"/>
       <w:contextualSpacing/>
+      <w:jc w:val="center"/>
     </w:pPr>
     <w:rPr>
       <w:rFonts w:cstheme="majorBidi" w:eastAsiaTheme="majorEastAsia"/>
@@ -7421,7 +8619,7 @@
     <w:basedOn w:val="DefaultParagraphFont"/>
     <w:link w:val="Title"/>
     <w:uiPriority w:val="10"/>
-    <w:rsid w:val="0013442B"/>
+    <w:rsid w:val="00602B7D"/>
     <w:rPr>
       <w:rFonts w:ascii="Arial" w:cstheme="majorBidi" w:eastAsiaTheme="majorEastAsia" w:hAnsi="Arial"/>
       <w:color w:themeColor="text2" w:themeShade="BF" w:val="17365D"/>

</xml_diff>

<commit_message>
Turn basics table into flextable
</commit_message>
<xml_diff>
--- a/Quarto_report/Audit_Report.docx
+++ b/Quarto_report/Audit_Report.docx
@@ -2677,385 +2677,893 @@
         <w:t xml:space="preserve">3.1 Basics</w:t>
       </w:r>
     </w:p>
-    <w:tbl xmlns:w="http://schemas.openxmlformats.org/wordprocessingml/2006/main" xmlns:wp="http://schemas.openxmlformats.org/drawingml/2006/wordprocessingDrawing" xmlns:r="http://schemas.openxmlformats.org/officeDocument/2006/relationships" xmlns:w14="http://schemas.microsoft.com/office/word/2010/wordml">
+    <w:tbl xmlns:w="http://schemas.openxmlformats.org/wordprocessingml/2006/main" xmlns:r="http://schemas.openxmlformats.org/officeDocument/2006/relationships" xmlns:w14="http://schemas.microsoft.com/office/word/2010/wordml" xmlns:wp="http://schemas.openxmlformats.org/drawingml/2006/wordprocessingDrawing" xmlns:a="http://schemas.openxmlformats.org/drawingml/2006/main" xmlns:pic="http://schemas.openxmlformats.org/drawingml/2006/picture">
       <w:tblPr>
-        <w:tblCellMar>
-          <w:top w:w="0" w:type="dxa"/>
-          <w:bottom w:w="0" w:type="dxa"/>
-          <w:start w:w="60" w:type="dxa"/>
-          <w:end w:w="60" w:type="dxa"/>
-        </w:tblCellMar>
-        <w:tblW w:type="auto" w:w="0"/>
-        <w:tblLook w:firstRow="0" w:lastRow="0" w:firstColumn="0" w:lastColumn="0" w:noHBand="0" w:noVBand="0"/>
+        <w:tblLayout w:type="fixed"/>
         <w:jc w:val="center"/>
+        <w:tblLook w:firstRow="1" w:lastRow="0" w:firstColumn="0" w:lastColumn="0" w:noHBand="0" w:noVBand="1"/>
       </w:tblPr>
+      <w:tblGrid>
+        <w:gridCol w:w="2880"/>
+        <w:gridCol w:w="5760"/>
+      </w:tblGrid>
       <w:tr>
         <w:trPr>
-          <w:cantSplit/>
+          <w:trHeight w:val="360" w:hRule="auto"/>
+          <w:tblHeader/>
         </w:trPr>
+        header1
         <w:tc>
           <w:tcPr>
             <w:tcBorders>
-              <w:top w:val="single" w:space="0" w:color="D3D3D3"/>
-              <w:bottom w:val="single" w:space="0" w:color="D3D3D3"/>
-              <w:start w:val="single" w:space="0" w:color="D3D3D3"/>
-              <w:end w:val="single" w:space="0" w:color="D3D3D3"/>
+              <w:bottom w:val="single" w:sz="12" w:space="0" w:color="666666"/>
+              <w:top w:val="single" w:sz="12" w:space="0" w:color="666666"/>
+              <w:left w:val="none" w:sz="0" w:space="0" w:color="000000"/>
+              <w:right w:val="none" w:sz="0" w:space="0" w:color="000000"/>
             </w:tcBorders>
+            <w:shd w:val="clear" w:color="auto" w:fill="FFFFFF"/>
+            <w:tcMar>
+              <w:top w:w="0" w:type="dxa"/>
+              <w:bottom w:w="0" w:type="dxa"/>
+              <w:left w:w="0" w:type="dxa"/>
+              <w:right w:w="0" w:type="dxa"/>
+            </w:tcMar>
+            <w:vAlign w:val="top"/>
           </w:tcPr>
           <w:p>
             <w:pPr>
-              <w:spacing w:before="0" w:after="60"/>
-              <w:keepNext/>
-              <w:jc w:val="center"/>
+              <w:jc w:val="left"/>
+              <w:pBdr>
+                <w:bottom w:val="none" w:sz="0" w:space="0" w:color="000000"/>
+                <w:top w:val="none" w:sz="0" w:space="0" w:color="000000"/>
+                <w:left w:val="none" w:sz="0" w:space="0" w:color="000000"/>
+                <w:right w:val="none" w:sz="0" w:space="0" w:color="000000"/>
+              </w:pBdr>
+              <w:spacing w:after="100" w:before="100" w:line="240"/>
+              <w:ind w:left="100" w:right="100" w:firstLine="0" w:firstLineChars="0"/>
+              <w:rPr>
+                <w:rFonts w:ascii="Arial" w:hAnsi="Arial" w:eastAsia="Arial" w:cs="Arial"/>
+                <w:i w:val="false"/>
+                <w:b w:val="false"/>
+                <w:u w:val="none"/>
+                <w:sz w:val="22"/>
+                <w:szCs w:val="22"/>
+                <w:color w:val="000000"/>
+              </w:rPr>
             </w:pPr>
-            <w:r>
-              <w:rPr>
-                <w:rFonts w:ascii="Calibri" w:hAnsi="Calibri"/>
-                <w:sz w:val="20"/>
-              </w:rPr>
-              <w:t xml:space="default">Date Built:</w:t>
+            <w:r xmlns:w="http://schemas.openxmlformats.org/wordprocessingml/2006/main" xmlns:wp="http://schemas.openxmlformats.org/drawingml/2006/wordprocessingDrawing" xmlns:r="http://schemas.openxmlformats.org/officeDocument/2006/relationships" xmlns:w14="http://schemas.microsoft.com/office/word/2010/wordml">
+              <w:rPr>
+                <w:rFonts w:ascii="Arial" w:hAnsi="Arial" w:eastAsia="Arial" w:cs="Arial"/>
+                <w:i w:val="false"/>
+                <w:b w:val="false"/>
+                <w:u w:val="none"/>
+                <w:sz w:val="22"/>
+                <w:szCs w:val="22"/>
+                <w:color w:val="000000"/>
+              </w:rPr>
+              <w:t xml:space="preserve">Info</w:t>
             </w:r>
           </w:p>
         </w:tc>
         <w:tc>
           <w:tcPr>
             <w:tcBorders>
-              <w:top w:val="single" w:space="0" w:color="D3D3D3"/>
-              <w:bottom w:val="single" w:space="0" w:color="D3D3D3"/>
-              <w:start w:val="single" w:space="0" w:color="D3D3D3"/>
-              <w:end w:val="single" w:space="0" w:color="D3D3D3"/>
+              <w:bottom w:val="single" w:sz="12" w:space="0" w:color="666666"/>
+              <w:top w:val="single" w:sz="12" w:space="0" w:color="666666"/>
+              <w:left w:val="none" w:sz="0" w:space="0" w:color="000000"/>
+              <w:right w:val="none" w:sz="0" w:space="0" w:color="000000"/>
             </w:tcBorders>
+            <w:shd w:val="clear" w:color="auto" w:fill="FFFFFF"/>
+            <w:tcMar>
+              <w:top w:w="0" w:type="dxa"/>
+              <w:bottom w:w="0" w:type="dxa"/>
+              <w:left w:w="0" w:type="dxa"/>
+              <w:right w:w="0" w:type="dxa"/>
+            </w:tcMar>
+            <w:vAlign w:val="top"/>
           </w:tcPr>
           <w:p>
             <w:pPr>
-              <w:spacing w:before="0" w:after="60"/>
-              <w:keepNext/>
-              <w:jc w:val="start"/>
+              <w:jc w:val="left"/>
+              <w:pBdr>
+                <w:bottom w:val="none" w:sz="0" w:space="0" w:color="000000"/>
+                <w:top w:val="none" w:sz="0" w:space="0" w:color="000000"/>
+                <w:left w:val="none" w:sz="0" w:space="0" w:color="000000"/>
+                <w:right w:val="none" w:sz="0" w:space="0" w:color="000000"/>
+              </w:pBdr>
+              <w:spacing w:after="100" w:before="100" w:line="240"/>
+              <w:ind w:left="100" w:right="100" w:firstLine="0" w:firstLineChars="0"/>
+              <w:rPr>
+                <w:rFonts w:ascii="Arial" w:hAnsi="Arial" w:eastAsia="Arial" w:cs="Arial"/>
+                <w:i w:val="false"/>
+                <w:b w:val="false"/>
+                <w:u w:val="none"/>
+                <w:sz w:val="22"/>
+                <w:szCs w:val="22"/>
+                <w:color w:val="000000"/>
+              </w:rPr>
             </w:pPr>
-            <w:r>
-              <w:rPr>
-                <w:rFonts w:ascii="Calibri" w:hAnsi="Calibri"/>
-                <w:sz w:val="20"/>
-              </w:rPr>
-              <w:t xml:space="default">1992</w:t>
+            <w:r xmlns:w="http://schemas.openxmlformats.org/wordprocessingml/2006/main" xmlns:wp="http://schemas.openxmlformats.org/drawingml/2006/wordprocessingDrawing" xmlns:r="http://schemas.openxmlformats.org/officeDocument/2006/relationships" xmlns:w14="http://schemas.microsoft.com/office/word/2010/wordml">
+              <w:rPr>
+                <w:rFonts w:ascii="Arial" w:hAnsi="Arial" w:eastAsia="Arial" w:cs="Arial"/>
+                <w:i w:val="false"/>
+                <w:b w:val="false"/>
+                <w:u w:val="none"/>
+                <w:sz w:val="22"/>
+                <w:szCs w:val="22"/>
+                <w:color w:val="000000"/>
+              </w:rPr>
+              <w:t xml:space="preserve">Values</w:t>
             </w:r>
           </w:p>
         </w:tc>
       </w:tr>
       <w:tr>
         <w:trPr>
-          <w:cantSplit/>
+          <w:trHeight w:val="360" w:hRule="auto"/>
         </w:trPr>
+        body1
         <w:tc>
           <w:tcPr>
             <w:tcBorders>
-              <w:top w:val="single" w:space="0" w:color="D3D3D3"/>
-              <w:bottom w:val="single" w:space="0" w:color="D3D3D3"/>
-              <w:start w:val="single" w:space="0" w:color="D3D3D3"/>
-              <w:end w:val="single" w:space="0" w:color="D3D3D3"/>
+              <w:bottom w:val="none" w:sz="0" w:space="0" w:color="000000"/>
+              <w:top w:val="single" w:sz="12" w:space="0" w:color="666666"/>
+              <w:left w:val="none" w:sz="0" w:space="0" w:color="000000"/>
+              <w:right w:val="none" w:sz="0" w:space="0" w:color="000000"/>
             </w:tcBorders>
+            <w:shd w:val="clear" w:color="auto" w:fill="FFFFFF"/>
+            <w:tcMar>
+              <w:top w:w="0" w:type="dxa"/>
+              <w:bottom w:w="0" w:type="dxa"/>
+              <w:left w:w="0" w:type="dxa"/>
+              <w:right w:w="0" w:type="dxa"/>
+            </w:tcMar>
+            <w:vAlign w:val="top"/>
           </w:tcPr>
           <w:p>
             <w:pPr>
-              <w:spacing w:before="0" w:after="60"/>
-              <w:keepNext/>
-              <w:jc w:val="center"/>
+              <w:jc w:val="left"/>
+              <w:pBdr>
+                <w:bottom w:val="none" w:sz="0" w:space="0" w:color="000000"/>
+                <w:top w:val="none" w:sz="0" w:space="0" w:color="000000"/>
+                <w:left w:val="none" w:sz="0" w:space="0" w:color="000000"/>
+                <w:right w:val="none" w:sz="0" w:space="0" w:color="000000"/>
+              </w:pBdr>
+              <w:spacing w:after="80" w:before="80" w:line="240"/>
+              <w:ind w:left="80" w:right="80" w:firstLine="0" w:firstLineChars="0"/>
+              <w:rPr>
+                <w:rFonts w:ascii="Arial" w:hAnsi="Arial" w:eastAsia="Arial" w:cs="Arial"/>
+                <w:i w:val="false"/>
+                <w:b w:val="false"/>
+                <w:u w:val="none"/>
+                <w:sz w:val="22"/>
+                <w:szCs w:val="22"/>
+                <w:color w:val="000000"/>
+              </w:rPr>
             </w:pPr>
-            <w:r>
-              <w:rPr>
-                <w:rFonts w:ascii="Calibri" w:hAnsi="Calibri"/>
-                <w:sz w:val="20"/>
-              </w:rPr>
-              <w:t xml:space="default">Foundation Type:</w:t>
+            <w:r xmlns:w="http://schemas.openxmlformats.org/wordprocessingml/2006/main" xmlns:wp="http://schemas.openxmlformats.org/drawingml/2006/wordprocessingDrawing" xmlns:r="http://schemas.openxmlformats.org/officeDocument/2006/relationships" xmlns:w14="http://schemas.microsoft.com/office/word/2010/wordml">
+              <w:rPr>
+                <w:rFonts w:ascii="Arial" w:hAnsi="Arial" w:eastAsia="Arial" w:cs="Arial"/>
+                <w:i w:val="false"/>
+                <w:b w:val="false"/>
+                <w:u w:val="none"/>
+                <w:sz w:val="22"/>
+                <w:szCs w:val="22"/>
+                <w:color w:val="000000"/>
+              </w:rPr>
+              <w:t xml:space="preserve">Date Built:</w:t>
             </w:r>
           </w:p>
         </w:tc>
         <w:tc>
           <w:tcPr>
             <w:tcBorders>
-              <w:top w:val="single" w:space="0" w:color="D3D3D3"/>
-              <w:bottom w:val="single" w:space="0" w:color="D3D3D3"/>
-              <w:start w:val="single" w:space="0" w:color="D3D3D3"/>
-              <w:end w:val="single" w:space="0" w:color="D3D3D3"/>
+              <w:bottom w:val="none" w:sz="0" w:space="0" w:color="000000"/>
+              <w:top w:val="single" w:sz="12" w:space="0" w:color="666666"/>
+              <w:left w:val="none" w:sz="0" w:space="0" w:color="000000"/>
+              <w:right w:val="none" w:sz="0" w:space="0" w:color="000000"/>
             </w:tcBorders>
+            <w:shd w:val="clear" w:color="auto" w:fill="FFFFFF"/>
+            <w:tcMar>
+              <w:top w:w="0" w:type="dxa"/>
+              <w:bottom w:w="0" w:type="dxa"/>
+              <w:left w:w="0" w:type="dxa"/>
+              <w:right w:w="0" w:type="dxa"/>
+            </w:tcMar>
+            <w:vAlign w:val="top"/>
           </w:tcPr>
           <w:p>
             <w:pPr>
-              <w:spacing w:before="0" w:after="60"/>
-              <w:keepNext/>
-              <w:jc w:val="start"/>
+              <w:jc w:val="left"/>
+              <w:pBdr>
+                <w:bottom w:val="none" w:sz="0" w:space="0" w:color="000000"/>
+                <w:top w:val="none" w:sz="0" w:space="0" w:color="000000"/>
+                <w:left w:val="none" w:sz="0" w:space="0" w:color="000000"/>
+                <w:right w:val="none" w:sz="0" w:space="0" w:color="000000"/>
+              </w:pBdr>
+              <w:spacing w:after="80" w:before="80" w:line="240"/>
+              <w:ind w:left="80" w:right="80" w:firstLine="0" w:firstLineChars="0"/>
+              <w:rPr>
+                <w:rFonts w:ascii="Arial" w:hAnsi="Arial" w:eastAsia="Arial" w:cs="Arial"/>
+                <w:i w:val="false"/>
+                <w:b w:val="false"/>
+                <w:u w:val="none"/>
+                <w:sz w:val="22"/>
+                <w:szCs w:val="22"/>
+                <w:color w:val="000000"/>
+              </w:rPr>
             </w:pPr>
-            <w:r>
-              <w:rPr>
-                <w:rFonts w:ascii="Calibri" w:hAnsi="Calibri"/>
-                <w:sz w:val="20"/>
-              </w:rPr>
-              <w:t xml:space="default">Crawlspace</w:t>
+            <w:r xmlns:w="http://schemas.openxmlformats.org/wordprocessingml/2006/main" xmlns:wp="http://schemas.openxmlformats.org/drawingml/2006/wordprocessingDrawing" xmlns:r="http://schemas.openxmlformats.org/officeDocument/2006/relationships" xmlns:w14="http://schemas.microsoft.com/office/word/2010/wordml">
+              <w:rPr>
+                <w:rFonts w:ascii="Arial" w:hAnsi="Arial" w:eastAsia="Arial" w:cs="Arial"/>
+                <w:i w:val="false"/>
+                <w:b w:val="false"/>
+                <w:u w:val="none"/>
+                <w:sz w:val="22"/>
+                <w:szCs w:val="22"/>
+                <w:color w:val="000000"/>
+              </w:rPr>
+              <w:t xml:space="preserve">1992</w:t>
             </w:r>
           </w:p>
         </w:tc>
       </w:tr>
       <w:tr>
         <w:trPr>
-          <w:cantSplit/>
+          <w:trHeight w:val="360" w:hRule="auto"/>
         </w:trPr>
+        body2
         <w:tc>
           <w:tcPr>
             <w:tcBorders>
-              <w:top w:val="single" w:space="0" w:color="D3D3D3"/>
-              <w:bottom w:val="single" w:space="0" w:color="D3D3D3"/>
-              <w:start w:val="single" w:space="0" w:color="D3D3D3"/>
-              <w:end w:val="single" w:space="0" w:color="D3D3D3"/>
+              <w:bottom w:val="none" w:sz="0" w:space="0" w:color="000000"/>
+              <w:top w:val="none" w:sz="0" w:space="0" w:color="000000"/>
+              <w:left w:val="none" w:sz="0" w:space="0" w:color="000000"/>
+              <w:right w:val="none" w:sz="0" w:space="0" w:color="000000"/>
             </w:tcBorders>
+            <w:shd w:val="clear" w:color="auto" w:fill="FFFFFF"/>
+            <w:tcMar>
+              <w:top w:w="0" w:type="dxa"/>
+              <w:bottom w:w="0" w:type="dxa"/>
+              <w:left w:w="0" w:type="dxa"/>
+              <w:right w:w="0" w:type="dxa"/>
+            </w:tcMar>
+            <w:vAlign w:val="top"/>
           </w:tcPr>
           <w:p>
             <w:pPr>
-              <w:spacing w:before="0" w:after="60"/>
-              <w:keepNext/>
-              <w:jc w:val="center"/>
+              <w:jc w:val="left"/>
+              <w:pBdr>
+                <w:bottom w:val="none" w:sz="0" w:space="0" w:color="000000"/>
+                <w:top w:val="none" w:sz="0" w:space="0" w:color="000000"/>
+                <w:left w:val="none" w:sz="0" w:space="0" w:color="000000"/>
+                <w:right w:val="none" w:sz="0" w:space="0" w:color="000000"/>
+              </w:pBdr>
+              <w:spacing w:after="80" w:before="80" w:line="240"/>
+              <w:ind w:left="80" w:right="80" w:firstLine="0" w:firstLineChars="0"/>
+              <w:rPr>
+                <w:rFonts w:ascii="Arial" w:hAnsi="Arial" w:eastAsia="Arial" w:cs="Arial"/>
+                <w:i w:val="false"/>
+                <w:b w:val="false"/>
+                <w:u w:val="none"/>
+                <w:sz w:val="22"/>
+                <w:szCs w:val="22"/>
+                <w:color w:val="000000"/>
+              </w:rPr>
             </w:pPr>
-            <w:r>
-              <w:rPr>
-                <w:rFonts w:ascii="Calibri" w:hAnsi="Calibri"/>
-                <w:sz w:val="20"/>
-              </w:rPr>
-              <w:t xml:space="default">Attic:</w:t>
+            <w:r xmlns:w="http://schemas.openxmlformats.org/wordprocessingml/2006/main" xmlns:wp="http://schemas.openxmlformats.org/drawingml/2006/wordprocessingDrawing" xmlns:r="http://schemas.openxmlformats.org/officeDocument/2006/relationships" xmlns:w14="http://schemas.microsoft.com/office/word/2010/wordml">
+              <w:rPr>
+                <w:rFonts w:ascii="Arial" w:hAnsi="Arial" w:eastAsia="Arial" w:cs="Arial"/>
+                <w:i w:val="false"/>
+                <w:b w:val="false"/>
+                <w:u w:val="none"/>
+                <w:sz w:val="22"/>
+                <w:szCs w:val="22"/>
+                <w:color w:val="000000"/>
+              </w:rPr>
+              <w:t xml:space="preserve">Foundation Type:</w:t>
             </w:r>
           </w:p>
         </w:tc>
         <w:tc>
           <w:tcPr>
             <w:tcBorders>
-              <w:top w:val="single" w:space="0" w:color="D3D3D3"/>
-              <w:bottom w:val="single" w:space="0" w:color="D3D3D3"/>
-              <w:start w:val="single" w:space="0" w:color="D3D3D3"/>
-              <w:end w:val="single" w:space="0" w:color="D3D3D3"/>
+              <w:bottom w:val="none" w:sz="0" w:space="0" w:color="000000"/>
+              <w:top w:val="none" w:sz="0" w:space="0" w:color="000000"/>
+              <w:left w:val="none" w:sz="0" w:space="0" w:color="000000"/>
+              <w:right w:val="none" w:sz="0" w:space="0" w:color="000000"/>
             </w:tcBorders>
+            <w:shd w:val="clear" w:color="auto" w:fill="FFFFFF"/>
+            <w:tcMar>
+              <w:top w:w="0" w:type="dxa"/>
+              <w:bottom w:w="0" w:type="dxa"/>
+              <w:left w:w="0" w:type="dxa"/>
+              <w:right w:w="0" w:type="dxa"/>
+            </w:tcMar>
+            <w:vAlign w:val="top"/>
           </w:tcPr>
           <w:p>
             <w:pPr>
-              <w:spacing w:before="0" w:after="60"/>
-              <w:keepNext/>
-              <w:jc w:val="start"/>
+              <w:jc w:val="left"/>
+              <w:pBdr>
+                <w:bottom w:val="none" w:sz="0" w:space="0" w:color="000000"/>
+                <w:top w:val="none" w:sz="0" w:space="0" w:color="000000"/>
+                <w:left w:val="none" w:sz="0" w:space="0" w:color="000000"/>
+                <w:right w:val="none" w:sz="0" w:space="0" w:color="000000"/>
+              </w:pBdr>
+              <w:spacing w:after="80" w:before="80" w:line="240"/>
+              <w:ind w:left="80" w:right="80" w:firstLine="0" w:firstLineChars="0"/>
+              <w:rPr>
+                <w:rFonts w:ascii="Arial" w:hAnsi="Arial" w:eastAsia="Arial" w:cs="Arial"/>
+                <w:i w:val="false"/>
+                <w:b w:val="false"/>
+                <w:u w:val="none"/>
+                <w:sz w:val="22"/>
+                <w:szCs w:val="22"/>
+                <w:color w:val="000000"/>
+              </w:rPr>
             </w:pPr>
-            <w:r>
-              <w:rPr>
-                <w:rFonts w:ascii="Calibri" w:hAnsi="Calibri"/>
-                <w:sz w:val="20"/>
-              </w:rPr>
-              <w:t xml:space="default">Batts of Fiberglass , 9 inches</w:t>
+            <w:r xmlns:w="http://schemas.openxmlformats.org/wordprocessingml/2006/main" xmlns:wp="http://schemas.openxmlformats.org/drawingml/2006/wordprocessingDrawing" xmlns:r="http://schemas.openxmlformats.org/officeDocument/2006/relationships" xmlns:w14="http://schemas.microsoft.com/office/word/2010/wordml">
+              <w:rPr>
+                <w:rFonts w:ascii="Arial" w:hAnsi="Arial" w:eastAsia="Arial" w:cs="Arial"/>
+                <w:i w:val="false"/>
+                <w:b w:val="false"/>
+                <w:u w:val="none"/>
+                <w:sz w:val="22"/>
+                <w:szCs w:val="22"/>
+                <w:color w:val="000000"/>
+              </w:rPr>
+              <w:t xml:space="preserve">Crawlspace</w:t>
             </w:r>
           </w:p>
         </w:tc>
       </w:tr>
       <w:tr>
         <w:trPr>
-          <w:cantSplit/>
+          <w:trHeight w:val="360" w:hRule="auto"/>
         </w:trPr>
+        body3
         <w:tc>
           <w:tcPr>
             <w:tcBorders>
-              <w:top w:val="single" w:space="0" w:color="D3D3D3"/>
-              <w:bottom w:val="single" w:space="0" w:color="D3D3D3"/>
-              <w:start w:val="single" w:space="0" w:color="D3D3D3"/>
-              <w:end w:val="single" w:space="0" w:color="D3D3D3"/>
+              <w:bottom w:val="none" w:sz="0" w:space="0" w:color="000000"/>
+              <w:top w:val="none" w:sz="0" w:space="0" w:color="000000"/>
+              <w:left w:val="none" w:sz="0" w:space="0" w:color="000000"/>
+              <w:right w:val="none" w:sz="0" w:space="0" w:color="000000"/>
             </w:tcBorders>
+            <w:shd w:val="clear" w:color="auto" w:fill="FFFFFF"/>
+            <w:tcMar>
+              <w:top w:w="0" w:type="dxa"/>
+              <w:bottom w:w="0" w:type="dxa"/>
+              <w:left w:w="0" w:type="dxa"/>
+              <w:right w:w="0" w:type="dxa"/>
+            </w:tcMar>
+            <w:vAlign w:val="top"/>
           </w:tcPr>
           <w:p>
             <w:pPr>
-              <w:spacing w:before="0" w:after="60"/>
-              <w:keepNext/>
-              <w:jc w:val="center"/>
+              <w:jc w:val="left"/>
+              <w:pBdr>
+                <w:bottom w:val="none" w:sz="0" w:space="0" w:color="000000"/>
+                <w:top w:val="none" w:sz="0" w:space="0" w:color="000000"/>
+                <w:left w:val="none" w:sz="0" w:space="0" w:color="000000"/>
+                <w:right w:val="none" w:sz="0" w:space="0" w:color="000000"/>
+              </w:pBdr>
+              <w:spacing w:after="80" w:before="80" w:line="240"/>
+              <w:ind w:left="80" w:right="80" w:firstLine="0" w:firstLineChars="0"/>
+              <w:rPr>
+                <w:rFonts w:ascii="Arial" w:hAnsi="Arial" w:eastAsia="Arial" w:cs="Arial"/>
+                <w:i w:val="false"/>
+                <w:b w:val="false"/>
+                <w:u w:val="none"/>
+                <w:sz w:val="22"/>
+                <w:szCs w:val="22"/>
+                <w:color w:val="000000"/>
+              </w:rPr>
             </w:pPr>
-            <w:r>
-              <w:rPr>
-                <w:rFonts w:ascii="Calibri" w:hAnsi="Calibri"/>
-                <w:sz w:val="20"/>
-              </w:rPr>
-              <w:t xml:space="default">Number of floors:</w:t>
+            <w:r xmlns:w="http://schemas.openxmlformats.org/wordprocessingml/2006/main" xmlns:wp="http://schemas.openxmlformats.org/drawingml/2006/wordprocessingDrawing" xmlns:r="http://schemas.openxmlformats.org/officeDocument/2006/relationships" xmlns:w14="http://schemas.microsoft.com/office/word/2010/wordml">
+              <w:rPr>
+                <w:rFonts w:ascii="Arial" w:hAnsi="Arial" w:eastAsia="Arial" w:cs="Arial"/>
+                <w:i w:val="false"/>
+                <w:b w:val="false"/>
+                <w:u w:val="none"/>
+                <w:sz w:val="22"/>
+                <w:szCs w:val="22"/>
+                <w:color w:val="000000"/>
+              </w:rPr>
+              <w:t xml:space="preserve">Attic:</w:t>
             </w:r>
           </w:p>
         </w:tc>
         <w:tc>
           <w:tcPr>
             <w:tcBorders>
-              <w:top w:val="single" w:space="0" w:color="D3D3D3"/>
-              <w:bottom w:val="single" w:space="0" w:color="D3D3D3"/>
-              <w:start w:val="single" w:space="0" w:color="D3D3D3"/>
-              <w:end w:val="single" w:space="0" w:color="D3D3D3"/>
+              <w:bottom w:val="none" w:sz="0" w:space="0" w:color="000000"/>
+              <w:top w:val="none" w:sz="0" w:space="0" w:color="000000"/>
+              <w:left w:val="none" w:sz="0" w:space="0" w:color="000000"/>
+              <w:right w:val="none" w:sz="0" w:space="0" w:color="000000"/>
             </w:tcBorders>
+            <w:shd w:val="clear" w:color="auto" w:fill="FFFFFF"/>
+            <w:tcMar>
+              <w:top w:w="0" w:type="dxa"/>
+              <w:bottom w:w="0" w:type="dxa"/>
+              <w:left w:w="0" w:type="dxa"/>
+              <w:right w:w="0" w:type="dxa"/>
+            </w:tcMar>
+            <w:vAlign w:val="top"/>
           </w:tcPr>
           <w:p>
             <w:pPr>
-              <w:spacing w:before="0" w:after="60"/>
-              <w:keepNext/>
-              <w:jc w:val="start"/>
+              <w:jc w:val="left"/>
+              <w:pBdr>
+                <w:bottom w:val="none" w:sz="0" w:space="0" w:color="000000"/>
+                <w:top w:val="none" w:sz="0" w:space="0" w:color="000000"/>
+                <w:left w:val="none" w:sz="0" w:space="0" w:color="000000"/>
+                <w:right w:val="none" w:sz="0" w:space="0" w:color="000000"/>
+              </w:pBdr>
+              <w:spacing w:after="80" w:before="80" w:line="240"/>
+              <w:ind w:left="80" w:right="80" w:firstLine="0" w:firstLineChars="0"/>
+              <w:rPr>
+                <w:rFonts w:ascii="Arial" w:hAnsi="Arial" w:eastAsia="Arial" w:cs="Arial"/>
+                <w:i w:val="false"/>
+                <w:b w:val="false"/>
+                <w:u w:val="none"/>
+                <w:sz w:val="22"/>
+                <w:szCs w:val="22"/>
+                <w:color w:val="000000"/>
+              </w:rPr>
             </w:pPr>
-            <w:r>
-              <w:rPr>
-                <w:rFonts w:ascii="Calibri" w:hAnsi="Calibri"/>
-                <w:sz w:val="20"/>
-              </w:rPr>
-              <w:t xml:space="default">2</w:t>
+            <w:r xmlns:w="http://schemas.openxmlformats.org/wordprocessingml/2006/main" xmlns:wp="http://schemas.openxmlformats.org/drawingml/2006/wordprocessingDrawing" xmlns:r="http://schemas.openxmlformats.org/officeDocument/2006/relationships" xmlns:w14="http://schemas.microsoft.com/office/word/2010/wordml">
+              <w:rPr>
+                <w:rFonts w:ascii="Arial" w:hAnsi="Arial" w:eastAsia="Arial" w:cs="Arial"/>
+                <w:i w:val="false"/>
+                <w:b w:val="false"/>
+                <w:u w:val="none"/>
+                <w:sz w:val="22"/>
+                <w:szCs w:val="22"/>
+                <w:color w:val="000000"/>
+              </w:rPr>
+              <w:t xml:space="preserve">Batts of Fiberglass , 9 inches</w:t>
             </w:r>
           </w:p>
         </w:tc>
       </w:tr>
       <w:tr>
         <w:trPr>
-          <w:cantSplit/>
+          <w:trHeight w:val="360" w:hRule="auto"/>
         </w:trPr>
+        body4
         <w:tc>
           <w:tcPr>
             <w:tcBorders>
-              <w:top w:val="single" w:space="0" w:color="D3D3D3"/>
-              <w:bottom w:val="single" w:space="0" w:color="D3D3D3"/>
-              <w:start w:val="single" w:space="0" w:color="D3D3D3"/>
-              <w:end w:val="single" w:space="0" w:color="D3D3D3"/>
+              <w:bottom w:val="none" w:sz="0" w:space="0" w:color="000000"/>
+              <w:top w:val="none" w:sz="0" w:space="0" w:color="000000"/>
+              <w:left w:val="none" w:sz="0" w:space="0" w:color="000000"/>
+              <w:right w:val="none" w:sz="0" w:space="0" w:color="000000"/>
             </w:tcBorders>
+            <w:shd w:val="clear" w:color="auto" w:fill="FFFFFF"/>
+            <w:tcMar>
+              <w:top w:w="0" w:type="dxa"/>
+              <w:bottom w:w="0" w:type="dxa"/>
+              <w:left w:w="0" w:type="dxa"/>
+              <w:right w:w="0" w:type="dxa"/>
+            </w:tcMar>
+            <w:vAlign w:val="top"/>
           </w:tcPr>
           <w:p>
             <w:pPr>
-              <w:spacing w:before="0" w:after="60"/>
-              <w:keepNext/>
-              <w:jc w:val="center"/>
+              <w:jc w:val="left"/>
+              <w:pBdr>
+                <w:bottom w:val="none" w:sz="0" w:space="0" w:color="000000"/>
+                <w:top w:val="none" w:sz="0" w:space="0" w:color="000000"/>
+                <w:left w:val="none" w:sz="0" w:space="0" w:color="000000"/>
+                <w:right w:val="none" w:sz="0" w:space="0" w:color="000000"/>
+              </w:pBdr>
+              <w:spacing w:after="80" w:before="80" w:line="240"/>
+              <w:ind w:left="80" w:right="80" w:firstLine="0" w:firstLineChars="0"/>
+              <w:rPr>
+                <w:rFonts w:ascii="Arial" w:hAnsi="Arial" w:eastAsia="Arial" w:cs="Arial"/>
+                <w:i w:val="false"/>
+                <w:b w:val="false"/>
+                <w:u w:val="none"/>
+                <w:sz w:val="22"/>
+                <w:szCs w:val="22"/>
+                <w:color w:val="000000"/>
+              </w:rPr>
             </w:pPr>
-            <w:r>
-              <w:rPr>
-                <w:rFonts w:ascii="Calibri" w:hAnsi="Calibri"/>
-                <w:sz w:val="20"/>
-              </w:rPr>
-              <w:t xml:space="default">Square footage of conditioned space:</w:t>
+            <w:r xmlns:w="http://schemas.openxmlformats.org/wordprocessingml/2006/main" xmlns:wp="http://schemas.openxmlformats.org/drawingml/2006/wordprocessingDrawing" xmlns:r="http://schemas.openxmlformats.org/officeDocument/2006/relationships" xmlns:w14="http://schemas.microsoft.com/office/word/2010/wordml">
+              <w:rPr>
+                <w:rFonts w:ascii="Arial" w:hAnsi="Arial" w:eastAsia="Arial" w:cs="Arial"/>
+                <w:i w:val="false"/>
+                <w:b w:val="false"/>
+                <w:u w:val="none"/>
+                <w:sz w:val="22"/>
+                <w:szCs w:val="22"/>
+                <w:color w:val="000000"/>
+              </w:rPr>
+              <w:t xml:space="preserve">Number of floors:</w:t>
             </w:r>
           </w:p>
         </w:tc>
         <w:tc>
           <w:tcPr>
             <w:tcBorders>
-              <w:top w:val="single" w:space="0" w:color="D3D3D3"/>
-              <w:bottom w:val="single" w:space="0" w:color="D3D3D3"/>
-              <w:start w:val="single" w:space="0" w:color="D3D3D3"/>
-              <w:end w:val="single" w:space="0" w:color="D3D3D3"/>
+              <w:bottom w:val="none" w:sz="0" w:space="0" w:color="000000"/>
+              <w:top w:val="none" w:sz="0" w:space="0" w:color="000000"/>
+              <w:left w:val="none" w:sz="0" w:space="0" w:color="000000"/>
+              <w:right w:val="none" w:sz="0" w:space="0" w:color="000000"/>
             </w:tcBorders>
+            <w:shd w:val="clear" w:color="auto" w:fill="FFFFFF"/>
+            <w:tcMar>
+              <w:top w:w="0" w:type="dxa"/>
+              <w:bottom w:w="0" w:type="dxa"/>
+              <w:left w:w="0" w:type="dxa"/>
+              <w:right w:w="0" w:type="dxa"/>
+            </w:tcMar>
+            <w:vAlign w:val="top"/>
           </w:tcPr>
           <w:p>
             <w:pPr>
-              <w:spacing w:before="0" w:after="60"/>
-              <w:keepNext/>
-              <w:jc w:val="start"/>
+              <w:jc w:val="left"/>
+              <w:pBdr>
+                <w:bottom w:val="none" w:sz="0" w:space="0" w:color="000000"/>
+                <w:top w:val="none" w:sz="0" w:space="0" w:color="000000"/>
+                <w:left w:val="none" w:sz="0" w:space="0" w:color="000000"/>
+                <w:right w:val="none" w:sz="0" w:space="0" w:color="000000"/>
+              </w:pBdr>
+              <w:spacing w:after="80" w:before="80" w:line="240"/>
+              <w:ind w:left="80" w:right="80" w:firstLine="0" w:firstLineChars="0"/>
+              <w:rPr>
+                <w:rFonts w:ascii="Arial" w:hAnsi="Arial" w:eastAsia="Arial" w:cs="Arial"/>
+                <w:i w:val="false"/>
+                <w:b w:val="false"/>
+                <w:u w:val="none"/>
+                <w:sz w:val="22"/>
+                <w:szCs w:val="22"/>
+                <w:color w:val="000000"/>
+              </w:rPr>
             </w:pPr>
-            <w:r>
-              <w:rPr>
-                <w:rFonts w:ascii="Calibri" w:hAnsi="Calibri"/>
-                <w:sz w:val="20"/>
-              </w:rPr>
-              <w:t xml:space="default">1,535 ft²</w:t>
+            <w:r xmlns:w="http://schemas.openxmlformats.org/wordprocessingml/2006/main" xmlns:wp="http://schemas.openxmlformats.org/drawingml/2006/wordprocessingDrawing" xmlns:r="http://schemas.openxmlformats.org/officeDocument/2006/relationships" xmlns:w14="http://schemas.microsoft.com/office/word/2010/wordml">
+              <w:rPr>
+                <w:rFonts w:ascii="Arial" w:hAnsi="Arial" w:eastAsia="Arial" w:cs="Arial"/>
+                <w:i w:val="false"/>
+                <w:b w:val="false"/>
+                <w:u w:val="none"/>
+                <w:sz w:val="22"/>
+                <w:szCs w:val="22"/>
+                <w:color w:val="000000"/>
+              </w:rPr>
+              <w:t xml:space="preserve">2</w:t>
             </w:r>
           </w:p>
         </w:tc>
       </w:tr>
       <w:tr>
         <w:trPr>
-          <w:cantSplit/>
+          <w:trHeight w:val="360" w:hRule="auto"/>
         </w:trPr>
+        body5
         <w:tc>
           <w:tcPr>
             <w:tcBorders>
-              <w:top w:val="single" w:space="0" w:color="D3D3D3"/>
-              <w:bottom w:val="single" w:space="0" w:color="D3D3D3"/>
-              <w:start w:val="single" w:space="0" w:color="D3D3D3"/>
-              <w:end w:val="single" w:space="0" w:color="D3D3D3"/>
+              <w:bottom w:val="none" w:sz="0" w:space="0" w:color="000000"/>
+              <w:top w:val="none" w:sz="0" w:space="0" w:color="000000"/>
+              <w:left w:val="none" w:sz="0" w:space="0" w:color="000000"/>
+              <w:right w:val="none" w:sz="0" w:space="0" w:color="000000"/>
             </w:tcBorders>
+            <w:shd w:val="clear" w:color="auto" w:fill="FFFFFF"/>
+            <w:tcMar>
+              <w:top w:w="0" w:type="dxa"/>
+              <w:bottom w:w="0" w:type="dxa"/>
+              <w:left w:w="0" w:type="dxa"/>
+              <w:right w:w="0" w:type="dxa"/>
+            </w:tcMar>
+            <w:vAlign w:val="top"/>
           </w:tcPr>
           <w:p>
             <w:pPr>
-              <w:spacing w:before="0" w:after="60"/>
-              <w:keepNext/>
-              <w:jc w:val="center"/>
+              <w:jc w:val="left"/>
+              <w:pBdr>
+                <w:bottom w:val="none" w:sz="0" w:space="0" w:color="000000"/>
+                <w:top w:val="none" w:sz="0" w:space="0" w:color="000000"/>
+                <w:left w:val="none" w:sz="0" w:space="0" w:color="000000"/>
+                <w:right w:val="none" w:sz="0" w:space="0" w:color="000000"/>
+              </w:pBdr>
+              <w:spacing w:after="80" w:before="80" w:line="240"/>
+              <w:ind w:left="80" w:right="80" w:firstLine="0" w:firstLineChars="0"/>
+              <w:rPr>
+                <w:rFonts w:ascii="Arial" w:hAnsi="Arial" w:eastAsia="Arial" w:cs="Arial"/>
+                <w:i w:val="false"/>
+                <w:b w:val="false"/>
+                <w:u w:val="none"/>
+                <w:sz w:val="22"/>
+                <w:szCs w:val="22"/>
+                <w:color w:val="000000"/>
+              </w:rPr>
             </w:pPr>
-            <w:r>
-              <w:rPr>
-                <w:rFonts w:ascii="Calibri" w:hAnsi="Calibri"/>
-                <w:sz w:val="20"/>
-              </w:rPr>
-              <w:t xml:space="default">Volume of conditioned space:</w:t>
+            <w:r xmlns:w="http://schemas.openxmlformats.org/wordprocessingml/2006/main" xmlns:wp="http://schemas.openxmlformats.org/drawingml/2006/wordprocessingDrawing" xmlns:r="http://schemas.openxmlformats.org/officeDocument/2006/relationships" xmlns:w14="http://schemas.microsoft.com/office/word/2010/wordml">
+              <w:rPr>
+                <w:rFonts w:ascii="Arial" w:hAnsi="Arial" w:eastAsia="Arial" w:cs="Arial"/>
+                <w:i w:val="false"/>
+                <w:b w:val="false"/>
+                <w:u w:val="none"/>
+                <w:sz w:val="22"/>
+                <w:szCs w:val="22"/>
+                <w:color w:val="000000"/>
+              </w:rPr>
+              <w:t xml:space="preserve">Square footage of conditioned space:</w:t>
             </w:r>
           </w:p>
         </w:tc>
         <w:tc>
           <w:tcPr>
             <w:tcBorders>
-              <w:top w:val="single" w:space="0" w:color="D3D3D3"/>
-              <w:bottom w:val="single" w:space="0" w:color="D3D3D3"/>
-              <w:start w:val="single" w:space="0" w:color="D3D3D3"/>
-              <w:end w:val="single" w:space="0" w:color="D3D3D3"/>
+              <w:bottom w:val="none" w:sz="0" w:space="0" w:color="000000"/>
+              <w:top w:val="none" w:sz="0" w:space="0" w:color="000000"/>
+              <w:left w:val="none" w:sz="0" w:space="0" w:color="000000"/>
+              <w:right w:val="none" w:sz="0" w:space="0" w:color="000000"/>
             </w:tcBorders>
+            <w:shd w:val="clear" w:color="auto" w:fill="FFFFFF"/>
+            <w:tcMar>
+              <w:top w:w="0" w:type="dxa"/>
+              <w:bottom w:w="0" w:type="dxa"/>
+              <w:left w:w="0" w:type="dxa"/>
+              <w:right w:w="0" w:type="dxa"/>
+            </w:tcMar>
+            <w:vAlign w:val="top"/>
           </w:tcPr>
           <w:p>
             <w:pPr>
-              <w:spacing w:before="0" w:after="60"/>
-              <w:keepNext/>
-              <w:jc w:val="start"/>
+              <w:jc w:val="left"/>
+              <w:pBdr>
+                <w:bottom w:val="none" w:sz="0" w:space="0" w:color="000000"/>
+                <w:top w:val="none" w:sz="0" w:space="0" w:color="000000"/>
+                <w:left w:val="none" w:sz="0" w:space="0" w:color="000000"/>
+                <w:right w:val="none" w:sz="0" w:space="0" w:color="000000"/>
+              </w:pBdr>
+              <w:spacing w:after="80" w:before="80" w:line="240"/>
+              <w:ind w:left="80" w:right="80" w:firstLine="0" w:firstLineChars="0"/>
+              <w:rPr>
+                <w:rFonts w:ascii="Arial" w:hAnsi="Arial" w:eastAsia="Arial" w:cs="Arial"/>
+                <w:i w:val="false"/>
+                <w:b w:val="false"/>
+                <w:u w:val="none"/>
+                <w:sz w:val="22"/>
+                <w:szCs w:val="22"/>
+                <w:color w:val="000000"/>
+              </w:rPr>
             </w:pPr>
-            <w:r>
-              <w:rPr>
-                <w:rFonts w:ascii="Calibri" w:hAnsi="Calibri"/>
-                <w:sz w:val="20"/>
-              </w:rPr>
-              <w:t xml:space="default">11,863 ft³</w:t>
+            <w:r xmlns:w="http://schemas.openxmlformats.org/wordprocessingml/2006/main" xmlns:wp="http://schemas.openxmlformats.org/drawingml/2006/wordprocessingDrawing" xmlns:r="http://schemas.openxmlformats.org/officeDocument/2006/relationships" xmlns:w14="http://schemas.microsoft.com/office/word/2010/wordml">
+              <w:rPr>
+                <w:rFonts w:ascii="Arial" w:hAnsi="Arial" w:eastAsia="Arial" w:cs="Arial"/>
+                <w:i w:val="false"/>
+                <w:b w:val="false"/>
+                <w:u w:val="none"/>
+                <w:sz w:val="22"/>
+                <w:szCs w:val="22"/>
+                <w:color w:val="000000"/>
+              </w:rPr>
+              <w:t xml:space="preserve">1,535 ft²</w:t>
             </w:r>
           </w:p>
         </w:tc>
       </w:tr>
       <w:tr>
         <w:trPr>
-          <w:cantSplit/>
+          <w:trHeight w:val="360" w:hRule="auto"/>
         </w:trPr>
+        body6
         <w:tc>
           <w:tcPr>
             <w:tcBorders>
-              <w:top w:val="single" w:space="0" w:color="D3D3D3"/>
-              <w:bottom w:val="single" w:space="0" w:color="D3D3D3"/>
-              <w:start w:val="single" w:space="0" w:color="D3D3D3"/>
-              <w:end w:val="single" w:space="0" w:color="D3D3D3"/>
+              <w:bottom w:val="none" w:sz="0" w:space="0" w:color="000000"/>
+              <w:top w:val="none" w:sz="0" w:space="0" w:color="000000"/>
+              <w:left w:val="none" w:sz="0" w:space="0" w:color="000000"/>
+              <w:right w:val="none" w:sz="0" w:space="0" w:color="000000"/>
             </w:tcBorders>
+            <w:shd w:val="clear" w:color="auto" w:fill="FFFFFF"/>
+            <w:tcMar>
+              <w:top w:w="0" w:type="dxa"/>
+              <w:bottom w:w="0" w:type="dxa"/>
+              <w:left w:w="0" w:type="dxa"/>
+              <w:right w:w="0" w:type="dxa"/>
+            </w:tcMar>
+            <w:vAlign w:val="top"/>
           </w:tcPr>
           <w:p>
             <w:pPr>
-              <w:spacing w:before="0" w:after="60"/>
-              <w:keepNext/>
-              <w:jc w:val="center"/>
+              <w:jc w:val="left"/>
+              <w:pBdr>
+                <w:bottom w:val="none" w:sz="0" w:space="0" w:color="000000"/>
+                <w:top w:val="none" w:sz="0" w:space="0" w:color="000000"/>
+                <w:left w:val="none" w:sz="0" w:space="0" w:color="000000"/>
+                <w:right w:val="none" w:sz="0" w:space="0" w:color="000000"/>
+              </w:pBdr>
+              <w:spacing w:after="80" w:before="80" w:line="240"/>
+              <w:ind w:left="80" w:right="80" w:firstLine="0" w:firstLineChars="0"/>
+              <w:rPr>
+                <w:rFonts w:ascii="Arial" w:hAnsi="Arial" w:eastAsia="Arial" w:cs="Arial"/>
+                <w:i w:val="false"/>
+                <w:b w:val="false"/>
+                <w:u w:val="none"/>
+                <w:sz w:val="22"/>
+                <w:szCs w:val="22"/>
+                <w:color w:val="000000"/>
+              </w:rPr>
             </w:pPr>
-            <w:r>
-              <w:rPr>
-                <w:rFonts w:ascii="Calibri" w:hAnsi="Calibri"/>
-                <w:sz w:val="20"/>
-              </w:rPr>
-              <w:t xml:space="default">Ambient Carbon Monoxide reading:</w:t>
+            <w:r xmlns:w="http://schemas.openxmlformats.org/wordprocessingml/2006/main" xmlns:wp="http://schemas.openxmlformats.org/drawingml/2006/wordprocessingDrawing" xmlns:r="http://schemas.openxmlformats.org/officeDocument/2006/relationships" xmlns:w14="http://schemas.microsoft.com/office/word/2010/wordml">
+              <w:rPr>
+                <w:rFonts w:ascii="Arial" w:hAnsi="Arial" w:eastAsia="Arial" w:cs="Arial"/>
+                <w:i w:val="false"/>
+                <w:b w:val="false"/>
+                <w:u w:val="none"/>
+                <w:sz w:val="22"/>
+                <w:szCs w:val="22"/>
+                <w:color w:val="000000"/>
+              </w:rPr>
+              <w:t xml:space="preserve">Volume of conditioned space:</w:t>
             </w:r>
           </w:p>
         </w:tc>
         <w:tc>
           <w:tcPr>
             <w:tcBorders>
-              <w:top w:val="single" w:space="0" w:color="D3D3D3"/>
-              <w:bottom w:val="single" w:space="0" w:color="D3D3D3"/>
-              <w:start w:val="single" w:space="0" w:color="D3D3D3"/>
-              <w:end w:val="single" w:space="0" w:color="D3D3D3"/>
+              <w:bottom w:val="none" w:sz="0" w:space="0" w:color="000000"/>
+              <w:top w:val="none" w:sz="0" w:space="0" w:color="000000"/>
+              <w:left w:val="none" w:sz="0" w:space="0" w:color="000000"/>
+              <w:right w:val="none" w:sz="0" w:space="0" w:color="000000"/>
             </w:tcBorders>
+            <w:shd w:val="clear" w:color="auto" w:fill="FFFFFF"/>
+            <w:tcMar>
+              <w:top w:w="0" w:type="dxa"/>
+              <w:bottom w:w="0" w:type="dxa"/>
+              <w:left w:w="0" w:type="dxa"/>
+              <w:right w:w="0" w:type="dxa"/>
+            </w:tcMar>
+            <w:vAlign w:val="top"/>
           </w:tcPr>
           <w:p>
             <w:pPr>
-              <w:spacing w:before="0" w:after="60"/>
-              <w:keepNext/>
-              <w:jc w:val="start"/>
+              <w:jc w:val="left"/>
+              <w:pBdr>
+                <w:bottom w:val="none" w:sz="0" w:space="0" w:color="000000"/>
+                <w:top w:val="none" w:sz="0" w:space="0" w:color="000000"/>
+                <w:left w:val="none" w:sz="0" w:space="0" w:color="000000"/>
+                <w:right w:val="none" w:sz="0" w:space="0" w:color="000000"/>
+              </w:pBdr>
+              <w:spacing w:after="80" w:before="80" w:line="240"/>
+              <w:ind w:left="80" w:right="80" w:firstLine="0" w:firstLineChars="0"/>
+              <w:rPr>
+                <w:rFonts w:ascii="Arial" w:hAnsi="Arial" w:eastAsia="Arial" w:cs="Arial"/>
+                <w:i w:val="false"/>
+                <w:b w:val="false"/>
+                <w:u w:val="none"/>
+                <w:sz w:val="22"/>
+                <w:szCs w:val="22"/>
+                <w:color w:val="000000"/>
+              </w:rPr>
             </w:pPr>
-            <w:r>
-              <w:rPr>
-                <w:rFonts w:ascii="Calibri" w:hAnsi="Calibri"/>
-                <w:sz w:val="20"/>
-              </w:rPr>
-              <w:t xml:space="default">0</w:t>
+            <w:r xmlns:w="http://schemas.openxmlformats.org/wordprocessingml/2006/main" xmlns:wp="http://schemas.openxmlformats.org/drawingml/2006/wordprocessingDrawing" xmlns:r="http://schemas.openxmlformats.org/officeDocument/2006/relationships" xmlns:w14="http://schemas.microsoft.com/office/word/2010/wordml">
+              <w:rPr>
+                <w:rFonts w:ascii="Arial" w:hAnsi="Arial" w:eastAsia="Arial" w:cs="Arial"/>
+                <w:i w:val="false"/>
+                <w:b w:val="false"/>
+                <w:u w:val="none"/>
+                <w:sz w:val="22"/>
+                <w:szCs w:val="22"/>
+                <w:color w:val="000000"/>
+              </w:rPr>
+              <w:t xml:space="preserve">11,863 ft³</w:t>
+            </w:r>
+          </w:p>
+        </w:tc>
+      </w:tr>
+      <w:tr>
+        <w:trPr>
+          <w:trHeight w:val="360" w:hRule="auto"/>
+        </w:trPr>
+        body7
+        <w:tc>
+          <w:tcPr>
+            <w:tcBorders>
+              <w:bottom w:val="single" w:sz="12" w:space="0" w:color="666666"/>
+              <w:top w:val="none" w:sz="0" w:space="0" w:color="000000"/>
+              <w:left w:val="none" w:sz="0" w:space="0" w:color="000000"/>
+              <w:right w:val="none" w:sz="0" w:space="0" w:color="000000"/>
+            </w:tcBorders>
+            <w:shd w:val="clear" w:color="auto" w:fill="FFFFFF"/>
+            <w:tcMar>
+              <w:top w:w="0" w:type="dxa"/>
+              <w:bottom w:w="0" w:type="dxa"/>
+              <w:left w:w="0" w:type="dxa"/>
+              <w:right w:w="0" w:type="dxa"/>
+            </w:tcMar>
+            <w:vAlign w:val="top"/>
+          </w:tcPr>
+          <w:p>
+            <w:pPr>
+              <w:jc w:val="left"/>
+              <w:pBdr>
+                <w:bottom w:val="none" w:sz="0" w:space="0" w:color="000000"/>
+                <w:top w:val="none" w:sz="0" w:space="0" w:color="000000"/>
+                <w:left w:val="none" w:sz="0" w:space="0" w:color="000000"/>
+                <w:right w:val="none" w:sz="0" w:space="0" w:color="000000"/>
+              </w:pBdr>
+              <w:spacing w:after="80" w:before="80" w:line="240"/>
+              <w:ind w:left="80" w:right="80" w:firstLine="0" w:firstLineChars="0"/>
+              <w:rPr>
+                <w:rFonts w:ascii="Arial" w:hAnsi="Arial" w:eastAsia="Arial" w:cs="Arial"/>
+                <w:i w:val="false"/>
+                <w:b w:val="false"/>
+                <w:u w:val="none"/>
+                <w:sz w:val="22"/>
+                <w:szCs w:val="22"/>
+                <w:color w:val="000000"/>
+              </w:rPr>
+            </w:pPr>
+            <w:r xmlns:w="http://schemas.openxmlformats.org/wordprocessingml/2006/main" xmlns:wp="http://schemas.openxmlformats.org/drawingml/2006/wordprocessingDrawing" xmlns:r="http://schemas.openxmlformats.org/officeDocument/2006/relationships" xmlns:w14="http://schemas.microsoft.com/office/word/2010/wordml">
+              <w:rPr>
+                <w:rFonts w:ascii="Arial" w:hAnsi="Arial" w:eastAsia="Arial" w:cs="Arial"/>
+                <w:i w:val="false"/>
+                <w:b w:val="false"/>
+                <w:u w:val="none"/>
+                <w:sz w:val="22"/>
+                <w:szCs w:val="22"/>
+                <w:color w:val="000000"/>
+              </w:rPr>
+              <w:t xml:space="preserve">Ambient Carbon Monoxide reading:</w:t>
+            </w:r>
+          </w:p>
+        </w:tc>
+        <w:tc>
+          <w:tcPr>
+            <w:tcBorders>
+              <w:bottom w:val="single" w:sz="12" w:space="0" w:color="666666"/>
+              <w:top w:val="none" w:sz="0" w:space="0" w:color="000000"/>
+              <w:left w:val="none" w:sz="0" w:space="0" w:color="000000"/>
+              <w:right w:val="none" w:sz="0" w:space="0" w:color="000000"/>
+            </w:tcBorders>
+            <w:shd w:val="clear" w:color="auto" w:fill="FFFFFF"/>
+            <w:tcMar>
+              <w:top w:w="0" w:type="dxa"/>
+              <w:bottom w:w="0" w:type="dxa"/>
+              <w:left w:w="0" w:type="dxa"/>
+              <w:right w:w="0" w:type="dxa"/>
+            </w:tcMar>
+            <w:vAlign w:val="top"/>
+          </w:tcPr>
+          <w:p>
+            <w:pPr>
+              <w:jc w:val="left"/>
+              <w:pBdr>
+                <w:bottom w:val="none" w:sz="0" w:space="0" w:color="000000"/>
+                <w:top w:val="none" w:sz="0" w:space="0" w:color="000000"/>
+                <w:left w:val="none" w:sz="0" w:space="0" w:color="000000"/>
+                <w:right w:val="none" w:sz="0" w:space="0" w:color="000000"/>
+              </w:pBdr>
+              <w:spacing w:after="80" w:before="80" w:line="240"/>
+              <w:ind w:left="80" w:right="80" w:firstLine="0" w:firstLineChars="0"/>
+              <w:rPr>
+                <w:rFonts w:ascii="Arial" w:hAnsi="Arial" w:eastAsia="Arial" w:cs="Arial"/>
+                <w:i w:val="false"/>
+                <w:b w:val="false"/>
+                <w:u w:val="none"/>
+                <w:sz w:val="22"/>
+                <w:szCs w:val="22"/>
+                <w:color w:val="000000"/>
+              </w:rPr>
+            </w:pPr>
+            <w:r xmlns:w="http://schemas.openxmlformats.org/wordprocessingml/2006/main" xmlns:wp="http://schemas.openxmlformats.org/drawingml/2006/wordprocessingDrawing" xmlns:r="http://schemas.openxmlformats.org/officeDocument/2006/relationships" xmlns:w14="http://schemas.microsoft.com/office/word/2010/wordml">
+              <w:rPr>
+                <w:rFonts w:ascii="Arial" w:hAnsi="Arial" w:eastAsia="Arial" w:cs="Arial"/>
+                <w:i w:val="false"/>
+                <w:b w:val="false"/>
+                <w:u w:val="none"/>
+                <w:sz w:val="22"/>
+                <w:szCs w:val="22"/>
+                <w:color w:val="000000"/>
+              </w:rPr>
+              <w:t xml:space="preserve">0</w:t>
             </w:r>
           </w:p>
         </w:tc>

</xml_diff>

<commit_message>
Turn interior and blower door tables into flextables
</commit_message>
<xml_diff>
--- a/Quarto_report/Audit_Report.docx
+++ b/Quarto_report/Audit_Report.docx
@@ -350,10 +350,10 @@
         <w:tc>
           <w:tcPr>
             <w:tcBorders>
-              <w:bottom w:val="single" w:sz="12" w:space="0" w:color="666666"/>
-              <w:top w:val="single" w:sz="12" w:space="0" w:color="666666"/>
-              <w:left w:val="none" w:sz="0" w:space="0" w:color="000000"/>
-              <w:right w:val="none" w:sz="0" w:space="0" w:color="000000"/>
+              <w:bottom w:val="single" w:sz="8" w:space="0" w:color="000000"/>
+              <w:top w:val="single" w:sz="8" w:space="0" w:color="000000"/>
+              <w:left w:val="single" w:sz="8" w:space="0" w:color="000000"/>
+              <w:right w:val="single" w:sz="8" w:space="0" w:color="000000"/>
             </w:tcBorders>
             <w:shd w:val="clear" w:color="auto" w:fill="FFFFFF"/>
             <w:tcMar>
@@ -402,10 +402,10 @@
         <w:tc>
           <w:tcPr>
             <w:tcBorders>
-              <w:bottom w:val="single" w:sz="12" w:space="0" w:color="666666"/>
-              <w:top w:val="single" w:sz="12" w:space="0" w:color="666666"/>
-              <w:left w:val="none" w:sz="0" w:space="0" w:color="000000"/>
-              <w:right w:val="none" w:sz="0" w:space="0" w:color="000000"/>
+              <w:bottom w:val="single" w:sz="8" w:space="0" w:color="000000"/>
+              <w:top w:val="single" w:sz="8" w:space="0" w:color="000000"/>
+              <w:left w:val="single" w:sz="8" w:space="0" w:color="000000"/>
+              <w:right w:val="single" w:sz="8" w:space="0" w:color="000000"/>
             </w:tcBorders>
             <w:shd w:val="clear" w:color="auto" w:fill="FFFFFF"/>
             <w:tcMar>
@@ -460,10 +460,10 @@
         <w:tc>
           <w:tcPr>
             <w:tcBorders>
-              <w:bottom w:val="none" w:sz="0" w:space="0" w:color="000000"/>
-              <w:top w:val="single" w:sz="12" w:space="0" w:color="666666"/>
-              <w:left w:val="none" w:sz="0" w:space="0" w:color="000000"/>
-              <w:right w:val="none" w:sz="0" w:space="0" w:color="000000"/>
+              <w:bottom w:val="single" w:sz="8" w:space="0" w:color="000000"/>
+              <w:top w:val="single" w:sz="8" w:space="0" w:color="000000"/>
+              <w:left w:val="single" w:sz="8" w:space="0" w:color="000000"/>
+              <w:right w:val="single" w:sz="8" w:space="0" w:color="000000"/>
             </w:tcBorders>
             <w:shd w:val="clear" w:color="auto" w:fill="FFFFFF"/>
             <w:tcMar>
@@ -512,10 +512,10 @@
         <w:tc>
           <w:tcPr>
             <w:tcBorders>
-              <w:bottom w:val="none" w:sz="0" w:space="0" w:color="000000"/>
-              <w:top w:val="single" w:sz="12" w:space="0" w:color="666666"/>
-              <w:left w:val="none" w:sz="0" w:space="0" w:color="000000"/>
-              <w:right w:val="none" w:sz="0" w:space="0" w:color="000000"/>
+              <w:bottom w:val="single" w:sz="8" w:space="0" w:color="000000"/>
+              <w:top w:val="single" w:sz="8" w:space="0" w:color="000000"/>
+              <w:left w:val="single" w:sz="8" w:space="0" w:color="000000"/>
+              <w:right w:val="single" w:sz="8" w:space="0" w:color="000000"/>
             </w:tcBorders>
             <w:shd w:val="clear" w:color="auto" w:fill="FFFFFF"/>
             <w:tcMar>
@@ -570,10 +570,10 @@
         <w:tc>
           <w:tcPr>
             <w:tcBorders>
-              <w:bottom w:val="none" w:sz="0" w:space="0" w:color="000000"/>
-              <w:top w:val="none" w:sz="0" w:space="0" w:color="000000"/>
-              <w:left w:val="none" w:sz="0" w:space="0" w:color="000000"/>
-              <w:right w:val="none" w:sz="0" w:space="0" w:color="000000"/>
+              <w:bottom w:val="single" w:sz="8" w:space="0" w:color="000000"/>
+              <w:top w:val="single" w:sz="8" w:space="0" w:color="000000"/>
+              <w:left w:val="single" w:sz="8" w:space="0" w:color="000000"/>
+              <w:right w:val="single" w:sz="8" w:space="0" w:color="000000"/>
             </w:tcBorders>
             <w:shd w:val="clear" w:color="auto" w:fill="FFFFFF"/>
             <w:tcMar>
@@ -622,10 +622,10 @@
         <w:tc>
           <w:tcPr>
             <w:tcBorders>
-              <w:bottom w:val="none" w:sz="0" w:space="0" w:color="000000"/>
-              <w:top w:val="none" w:sz="0" w:space="0" w:color="000000"/>
-              <w:left w:val="none" w:sz="0" w:space="0" w:color="000000"/>
-              <w:right w:val="none" w:sz="0" w:space="0" w:color="000000"/>
+              <w:bottom w:val="single" w:sz="8" w:space="0" w:color="000000"/>
+              <w:top w:val="single" w:sz="8" w:space="0" w:color="000000"/>
+              <w:left w:val="single" w:sz="8" w:space="0" w:color="000000"/>
+              <w:right w:val="single" w:sz="8" w:space="0" w:color="000000"/>
             </w:tcBorders>
             <w:shd w:val="clear" w:color="auto" w:fill="FFFFFF"/>
             <w:tcMar>
@@ -680,10 +680,10 @@
         <w:tc>
           <w:tcPr>
             <w:tcBorders>
-              <w:bottom w:val="none" w:sz="0" w:space="0" w:color="000000"/>
-              <w:top w:val="none" w:sz="0" w:space="0" w:color="000000"/>
-              <w:left w:val="none" w:sz="0" w:space="0" w:color="000000"/>
-              <w:right w:val="none" w:sz="0" w:space="0" w:color="000000"/>
+              <w:bottom w:val="single" w:sz="8" w:space="0" w:color="000000"/>
+              <w:top w:val="single" w:sz="8" w:space="0" w:color="000000"/>
+              <w:left w:val="single" w:sz="8" w:space="0" w:color="000000"/>
+              <w:right w:val="single" w:sz="8" w:space="0" w:color="000000"/>
             </w:tcBorders>
             <w:shd w:val="clear" w:color="auto" w:fill="FFFFFF"/>
             <w:tcMar>
@@ -732,10 +732,10 @@
         <w:tc>
           <w:tcPr>
             <w:tcBorders>
-              <w:bottom w:val="none" w:sz="0" w:space="0" w:color="000000"/>
-              <w:top w:val="none" w:sz="0" w:space="0" w:color="000000"/>
-              <w:left w:val="none" w:sz="0" w:space="0" w:color="000000"/>
-              <w:right w:val="none" w:sz="0" w:space="0" w:color="000000"/>
+              <w:bottom w:val="single" w:sz="8" w:space="0" w:color="000000"/>
+              <w:top w:val="single" w:sz="8" w:space="0" w:color="000000"/>
+              <w:left w:val="single" w:sz="8" w:space="0" w:color="000000"/>
+              <w:right w:val="single" w:sz="8" w:space="0" w:color="000000"/>
             </w:tcBorders>
             <w:shd w:val="clear" w:color="auto" w:fill="FFFFFF"/>
             <w:tcMar>
@@ -790,10 +790,10 @@
         <w:tc>
           <w:tcPr>
             <w:tcBorders>
-              <w:bottom w:val="none" w:sz="0" w:space="0" w:color="000000"/>
-              <w:top w:val="none" w:sz="0" w:space="0" w:color="000000"/>
-              <w:left w:val="none" w:sz="0" w:space="0" w:color="000000"/>
-              <w:right w:val="none" w:sz="0" w:space="0" w:color="000000"/>
+              <w:bottom w:val="single" w:sz="8" w:space="0" w:color="000000"/>
+              <w:top w:val="single" w:sz="8" w:space="0" w:color="000000"/>
+              <w:left w:val="single" w:sz="8" w:space="0" w:color="000000"/>
+              <w:right w:val="single" w:sz="8" w:space="0" w:color="000000"/>
             </w:tcBorders>
             <w:shd w:val="clear" w:color="auto" w:fill="FFFFFF"/>
             <w:tcMar>
@@ -842,10 +842,10 @@
         <w:tc>
           <w:tcPr>
             <w:tcBorders>
-              <w:bottom w:val="none" w:sz="0" w:space="0" w:color="000000"/>
-              <w:top w:val="none" w:sz="0" w:space="0" w:color="000000"/>
-              <w:left w:val="none" w:sz="0" w:space="0" w:color="000000"/>
-              <w:right w:val="none" w:sz="0" w:space="0" w:color="000000"/>
+              <w:bottom w:val="single" w:sz="8" w:space="0" w:color="000000"/>
+              <w:top w:val="single" w:sz="8" w:space="0" w:color="000000"/>
+              <w:left w:val="single" w:sz="8" w:space="0" w:color="000000"/>
+              <w:right w:val="single" w:sz="8" w:space="0" w:color="000000"/>
             </w:tcBorders>
             <w:shd w:val="clear" w:color="auto" w:fill="FFFFFF"/>
             <w:tcMar>
@@ -900,10 +900,10 @@
         <w:tc>
           <w:tcPr>
             <w:tcBorders>
-              <w:bottom w:val="none" w:sz="0" w:space="0" w:color="000000"/>
-              <w:top w:val="none" w:sz="0" w:space="0" w:color="000000"/>
-              <w:left w:val="none" w:sz="0" w:space="0" w:color="000000"/>
-              <w:right w:val="none" w:sz="0" w:space="0" w:color="000000"/>
+              <w:bottom w:val="single" w:sz="8" w:space="0" w:color="000000"/>
+              <w:top w:val="single" w:sz="8" w:space="0" w:color="000000"/>
+              <w:left w:val="single" w:sz="8" w:space="0" w:color="000000"/>
+              <w:right w:val="single" w:sz="8" w:space="0" w:color="000000"/>
             </w:tcBorders>
             <w:shd w:val="clear" w:color="auto" w:fill="FFFFFF"/>
             <w:tcMar>
@@ -952,10 +952,10 @@
         <w:tc>
           <w:tcPr>
             <w:tcBorders>
-              <w:bottom w:val="none" w:sz="0" w:space="0" w:color="000000"/>
-              <w:top w:val="none" w:sz="0" w:space="0" w:color="000000"/>
-              <w:left w:val="none" w:sz="0" w:space="0" w:color="000000"/>
-              <w:right w:val="none" w:sz="0" w:space="0" w:color="000000"/>
+              <w:bottom w:val="single" w:sz="8" w:space="0" w:color="000000"/>
+              <w:top w:val="single" w:sz="8" w:space="0" w:color="000000"/>
+              <w:left w:val="single" w:sz="8" w:space="0" w:color="000000"/>
+              <w:right w:val="single" w:sz="8" w:space="0" w:color="000000"/>
             </w:tcBorders>
             <w:shd w:val="clear" w:color="auto" w:fill="FFFFFF"/>
             <w:tcMar>
@@ -1010,10 +1010,10 @@
         <w:tc>
           <w:tcPr>
             <w:tcBorders>
-              <w:bottom w:val="none" w:sz="0" w:space="0" w:color="000000"/>
-              <w:top w:val="none" w:sz="0" w:space="0" w:color="000000"/>
-              <w:left w:val="none" w:sz="0" w:space="0" w:color="000000"/>
-              <w:right w:val="none" w:sz="0" w:space="0" w:color="000000"/>
+              <w:bottom w:val="single" w:sz="8" w:space="0" w:color="000000"/>
+              <w:top w:val="single" w:sz="8" w:space="0" w:color="000000"/>
+              <w:left w:val="single" w:sz="8" w:space="0" w:color="000000"/>
+              <w:right w:val="single" w:sz="8" w:space="0" w:color="000000"/>
             </w:tcBorders>
             <w:shd w:val="clear" w:color="auto" w:fill="FFFFFF"/>
             <w:tcMar>
@@ -1062,10 +1062,10 @@
         <w:tc>
           <w:tcPr>
             <w:tcBorders>
-              <w:bottom w:val="none" w:sz="0" w:space="0" w:color="000000"/>
-              <w:top w:val="none" w:sz="0" w:space="0" w:color="000000"/>
-              <w:left w:val="none" w:sz="0" w:space="0" w:color="000000"/>
-              <w:right w:val="none" w:sz="0" w:space="0" w:color="000000"/>
+              <w:bottom w:val="single" w:sz="8" w:space="0" w:color="000000"/>
+              <w:top w:val="single" w:sz="8" w:space="0" w:color="000000"/>
+              <w:left w:val="single" w:sz="8" w:space="0" w:color="000000"/>
+              <w:right w:val="single" w:sz="8" w:space="0" w:color="000000"/>
             </w:tcBorders>
             <w:shd w:val="clear" w:color="auto" w:fill="FFFFFF"/>
             <w:tcMar>
@@ -1120,10 +1120,10 @@
         <w:tc>
           <w:tcPr>
             <w:tcBorders>
-              <w:bottom w:val="none" w:sz="0" w:space="0" w:color="000000"/>
-              <w:top w:val="none" w:sz="0" w:space="0" w:color="000000"/>
-              <w:left w:val="none" w:sz="0" w:space="0" w:color="000000"/>
-              <w:right w:val="none" w:sz="0" w:space="0" w:color="000000"/>
+              <w:bottom w:val="single" w:sz="8" w:space="0" w:color="000000"/>
+              <w:top w:val="single" w:sz="8" w:space="0" w:color="000000"/>
+              <w:left w:val="single" w:sz="8" w:space="0" w:color="000000"/>
+              <w:right w:val="single" w:sz="8" w:space="0" w:color="000000"/>
             </w:tcBorders>
             <w:shd w:val="clear" w:color="auto" w:fill="FFFFFF"/>
             <w:tcMar>
@@ -1172,10 +1172,10 @@
         <w:tc>
           <w:tcPr>
             <w:tcBorders>
-              <w:bottom w:val="none" w:sz="0" w:space="0" w:color="000000"/>
-              <w:top w:val="none" w:sz="0" w:space="0" w:color="000000"/>
-              <w:left w:val="none" w:sz="0" w:space="0" w:color="000000"/>
-              <w:right w:val="none" w:sz="0" w:space="0" w:color="000000"/>
+              <w:bottom w:val="single" w:sz="8" w:space="0" w:color="000000"/>
+              <w:top w:val="single" w:sz="8" w:space="0" w:color="000000"/>
+              <w:left w:val="single" w:sz="8" w:space="0" w:color="000000"/>
+              <w:right w:val="single" w:sz="8" w:space="0" w:color="000000"/>
             </w:tcBorders>
             <w:shd w:val="clear" w:color="auto" w:fill="FFFFFF"/>
             <w:tcMar>
@@ -1230,10 +1230,10 @@
         <w:tc>
           <w:tcPr>
             <w:tcBorders>
-              <w:bottom w:val="none" w:sz="0" w:space="0" w:color="000000"/>
-              <w:top w:val="none" w:sz="0" w:space="0" w:color="000000"/>
-              <w:left w:val="none" w:sz="0" w:space="0" w:color="000000"/>
-              <w:right w:val="none" w:sz="0" w:space="0" w:color="000000"/>
+              <w:bottom w:val="single" w:sz="8" w:space="0" w:color="000000"/>
+              <w:top w:val="single" w:sz="8" w:space="0" w:color="000000"/>
+              <w:left w:val="single" w:sz="8" w:space="0" w:color="000000"/>
+              <w:right w:val="single" w:sz="8" w:space="0" w:color="000000"/>
             </w:tcBorders>
             <w:shd w:val="clear" w:color="auto" w:fill="FFFFFF"/>
             <w:tcMar>
@@ -1282,10 +1282,10 @@
         <w:tc>
           <w:tcPr>
             <w:tcBorders>
-              <w:bottom w:val="none" w:sz="0" w:space="0" w:color="000000"/>
-              <w:top w:val="none" w:sz="0" w:space="0" w:color="000000"/>
-              <w:left w:val="none" w:sz="0" w:space="0" w:color="000000"/>
-              <w:right w:val="none" w:sz="0" w:space="0" w:color="000000"/>
+              <w:bottom w:val="single" w:sz="8" w:space="0" w:color="000000"/>
+              <w:top w:val="single" w:sz="8" w:space="0" w:color="000000"/>
+              <w:left w:val="single" w:sz="8" w:space="0" w:color="000000"/>
+              <w:right w:val="single" w:sz="8" w:space="0" w:color="000000"/>
             </w:tcBorders>
             <w:shd w:val="clear" w:color="auto" w:fill="FFFFFF"/>
             <w:tcMar>
@@ -1340,10 +1340,10 @@
         <w:tc>
           <w:tcPr>
             <w:tcBorders>
-              <w:bottom w:val="none" w:sz="0" w:space="0" w:color="000000"/>
-              <w:top w:val="none" w:sz="0" w:space="0" w:color="000000"/>
-              <w:left w:val="none" w:sz="0" w:space="0" w:color="000000"/>
-              <w:right w:val="none" w:sz="0" w:space="0" w:color="000000"/>
+              <w:bottom w:val="single" w:sz="8" w:space="0" w:color="000000"/>
+              <w:top w:val="single" w:sz="8" w:space="0" w:color="000000"/>
+              <w:left w:val="single" w:sz="8" w:space="0" w:color="000000"/>
+              <w:right w:val="single" w:sz="8" w:space="0" w:color="000000"/>
             </w:tcBorders>
             <w:shd w:val="clear" w:color="auto" w:fill="FFFFFF"/>
             <w:tcMar>
@@ -1392,10 +1392,10 @@
         <w:tc>
           <w:tcPr>
             <w:tcBorders>
-              <w:bottom w:val="none" w:sz="0" w:space="0" w:color="000000"/>
-              <w:top w:val="none" w:sz="0" w:space="0" w:color="000000"/>
-              <w:left w:val="none" w:sz="0" w:space="0" w:color="000000"/>
-              <w:right w:val="none" w:sz="0" w:space="0" w:color="000000"/>
+              <w:bottom w:val="single" w:sz="8" w:space="0" w:color="000000"/>
+              <w:top w:val="single" w:sz="8" w:space="0" w:color="000000"/>
+              <w:left w:val="single" w:sz="8" w:space="0" w:color="000000"/>
+              <w:right w:val="single" w:sz="8" w:space="0" w:color="000000"/>
             </w:tcBorders>
             <w:shd w:val="clear" w:color="auto" w:fill="FFFFFF"/>
             <w:tcMar>
@@ -1450,10 +1450,10 @@
         <w:tc>
           <w:tcPr>
             <w:tcBorders>
-              <w:bottom w:val="none" w:sz="0" w:space="0" w:color="000000"/>
-              <w:top w:val="none" w:sz="0" w:space="0" w:color="000000"/>
-              <w:left w:val="none" w:sz="0" w:space="0" w:color="000000"/>
-              <w:right w:val="none" w:sz="0" w:space="0" w:color="000000"/>
+              <w:bottom w:val="single" w:sz="8" w:space="0" w:color="000000"/>
+              <w:top w:val="single" w:sz="8" w:space="0" w:color="000000"/>
+              <w:left w:val="single" w:sz="8" w:space="0" w:color="000000"/>
+              <w:right w:val="single" w:sz="8" w:space="0" w:color="000000"/>
             </w:tcBorders>
             <w:shd w:val="clear" w:color="auto" w:fill="FFFFFF"/>
             <w:tcMar>
@@ -1502,10 +1502,10 @@
         <w:tc>
           <w:tcPr>
             <w:tcBorders>
-              <w:bottom w:val="none" w:sz="0" w:space="0" w:color="000000"/>
-              <w:top w:val="none" w:sz="0" w:space="0" w:color="000000"/>
-              <w:left w:val="none" w:sz="0" w:space="0" w:color="000000"/>
-              <w:right w:val="none" w:sz="0" w:space="0" w:color="000000"/>
+              <w:bottom w:val="single" w:sz="8" w:space="0" w:color="000000"/>
+              <w:top w:val="single" w:sz="8" w:space="0" w:color="000000"/>
+              <w:left w:val="single" w:sz="8" w:space="0" w:color="000000"/>
+              <w:right w:val="single" w:sz="8" w:space="0" w:color="000000"/>
             </w:tcBorders>
             <w:shd w:val="clear" w:color="auto" w:fill="FFFFFF"/>
             <w:tcMar>
@@ -1560,10 +1560,10 @@
         <w:tc>
           <w:tcPr>
             <w:tcBorders>
-              <w:bottom w:val="none" w:sz="0" w:space="0" w:color="000000"/>
-              <w:top w:val="none" w:sz="0" w:space="0" w:color="000000"/>
-              <w:left w:val="none" w:sz="0" w:space="0" w:color="000000"/>
-              <w:right w:val="none" w:sz="0" w:space="0" w:color="000000"/>
+              <w:bottom w:val="single" w:sz="8" w:space="0" w:color="000000"/>
+              <w:top w:val="single" w:sz="8" w:space="0" w:color="000000"/>
+              <w:left w:val="single" w:sz="8" w:space="0" w:color="000000"/>
+              <w:right w:val="single" w:sz="8" w:space="0" w:color="000000"/>
             </w:tcBorders>
             <w:shd w:val="clear" w:color="auto" w:fill="FFFFFF"/>
             <w:tcMar>
@@ -1612,10 +1612,10 @@
         <w:tc>
           <w:tcPr>
             <w:tcBorders>
-              <w:bottom w:val="none" w:sz="0" w:space="0" w:color="000000"/>
-              <w:top w:val="none" w:sz="0" w:space="0" w:color="000000"/>
-              <w:left w:val="none" w:sz="0" w:space="0" w:color="000000"/>
-              <w:right w:val="none" w:sz="0" w:space="0" w:color="000000"/>
+              <w:bottom w:val="single" w:sz="8" w:space="0" w:color="000000"/>
+              <w:top w:val="single" w:sz="8" w:space="0" w:color="000000"/>
+              <w:left w:val="single" w:sz="8" w:space="0" w:color="000000"/>
+              <w:right w:val="single" w:sz="8" w:space="0" w:color="000000"/>
             </w:tcBorders>
             <w:shd w:val="clear" w:color="auto" w:fill="FFFFFF"/>
             <w:tcMar>
@@ -1670,10 +1670,10 @@
         <w:tc>
           <w:tcPr>
             <w:tcBorders>
-              <w:bottom w:val="none" w:sz="0" w:space="0" w:color="000000"/>
-              <w:top w:val="none" w:sz="0" w:space="0" w:color="000000"/>
-              <w:left w:val="none" w:sz="0" w:space="0" w:color="000000"/>
-              <w:right w:val="none" w:sz="0" w:space="0" w:color="000000"/>
+              <w:bottom w:val="single" w:sz="8" w:space="0" w:color="000000"/>
+              <w:top w:val="single" w:sz="8" w:space="0" w:color="000000"/>
+              <w:left w:val="single" w:sz="8" w:space="0" w:color="000000"/>
+              <w:right w:val="single" w:sz="8" w:space="0" w:color="000000"/>
             </w:tcBorders>
             <w:shd w:val="clear" w:color="auto" w:fill="FFFFFF"/>
             <w:tcMar>
@@ -1722,10 +1722,10 @@
         <w:tc>
           <w:tcPr>
             <w:tcBorders>
-              <w:bottom w:val="none" w:sz="0" w:space="0" w:color="000000"/>
-              <w:top w:val="none" w:sz="0" w:space="0" w:color="000000"/>
-              <w:left w:val="none" w:sz="0" w:space="0" w:color="000000"/>
-              <w:right w:val="none" w:sz="0" w:space="0" w:color="000000"/>
+              <w:bottom w:val="single" w:sz="8" w:space="0" w:color="000000"/>
+              <w:top w:val="single" w:sz="8" w:space="0" w:color="000000"/>
+              <w:left w:val="single" w:sz="8" w:space="0" w:color="000000"/>
+              <w:right w:val="single" w:sz="8" w:space="0" w:color="000000"/>
             </w:tcBorders>
             <w:shd w:val="clear" w:color="auto" w:fill="FFFFFF"/>
             <w:tcMar>
@@ -1780,10 +1780,10 @@
         <w:tc>
           <w:tcPr>
             <w:tcBorders>
-              <w:bottom w:val="none" w:sz="0" w:space="0" w:color="000000"/>
-              <w:top w:val="none" w:sz="0" w:space="0" w:color="000000"/>
-              <w:left w:val="none" w:sz="0" w:space="0" w:color="000000"/>
-              <w:right w:val="none" w:sz="0" w:space="0" w:color="000000"/>
+              <w:bottom w:val="single" w:sz="8" w:space="0" w:color="000000"/>
+              <w:top w:val="single" w:sz="8" w:space="0" w:color="000000"/>
+              <w:left w:val="single" w:sz="8" w:space="0" w:color="000000"/>
+              <w:right w:val="single" w:sz="8" w:space="0" w:color="000000"/>
             </w:tcBorders>
             <w:shd w:val="clear" w:color="auto" w:fill="FFFFFF"/>
             <w:tcMar>
@@ -1832,10 +1832,10 @@
         <w:tc>
           <w:tcPr>
             <w:tcBorders>
-              <w:bottom w:val="none" w:sz="0" w:space="0" w:color="000000"/>
-              <w:top w:val="none" w:sz="0" w:space="0" w:color="000000"/>
-              <w:left w:val="none" w:sz="0" w:space="0" w:color="000000"/>
-              <w:right w:val="none" w:sz="0" w:space="0" w:color="000000"/>
+              <w:bottom w:val="single" w:sz="8" w:space="0" w:color="000000"/>
+              <w:top w:val="single" w:sz="8" w:space="0" w:color="000000"/>
+              <w:left w:val="single" w:sz="8" w:space="0" w:color="000000"/>
+              <w:right w:val="single" w:sz="8" w:space="0" w:color="000000"/>
             </w:tcBorders>
             <w:shd w:val="clear" w:color="auto" w:fill="FFFFFF"/>
             <w:tcMar>
@@ -1890,10 +1890,10 @@
         <w:tc>
           <w:tcPr>
             <w:tcBorders>
-              <w:bottom w:val="none" w:sz="0" w:space="0" w:color="000000"/>
-              <w:top w:val="none" w:sz="0" w:space="0" w:color="000000"/>
-              <w:left w:val="none" w:sz="0" w:space="0" w:color="000000"/>
-              <w:right w:val="none" w:sz="0" w:space="0" w:color="000000"/>
+              <w:bottom w:val="single" w:sz="8" w:space="0" w:color="000000"/>
+              <w:top w:val="single" w:sz="8" w:space="0" w:color="000000"/>
+              <w:left w:val="single" w:sz="8" w:space="0" w:color="000000"/>
+              <w:right w:val="single" w:sz="8" w:space="0" w:color="000000"/>
             </w:tcBorders>
             <w:shd w:val="clear" w:color="auto" w:fill="FFFFFF"/>
             <w:tcMar>
@@ -1942,10 +1942,10 @@
         <w:tc>
           <w:tcPr>
             <w:tcBorders>
-              <w:bottom w:val="none" w:sz="0" w:space="0" w:color="000000"/>
-              <w:top w:val="none" w:sz="0" w:space="0" w:color="000000"/>
-              <w:left w:val="none" w:sz="0" w:space="0" w:color="000000"/>
-              <w:right w:val="none" w:sz="0" w:space="0" w:color="000000"/>
+              <w:bottom w:val="single" w:sz="8" w:space="0" w:color="000000"/>
+              <w:top w:val="single" w:sz="8" w:space="0" w:color="000000"/>
+              <w:left w:val="single" w:sz="8" w:space="0" w:color="000000"/>
+              <w:right w:val="single" w:sz="8" w:space="0" w:color="000000"/>
             </w:tcBorders>
             <w:shd w:val="clear" w:color="auto" w:fill="FFFFFF"/>
             <w:tcMar>
@@ -2000,10 +2000,10 @@
         <w:tc>
           <w:tcPr>
             <w:tcBorders>
-              <w:bottom w:val="none" w:sz="0" w:space="0" w:color="000000"/>
-              <w:top w:val="none" w:sz="0" w:space="0" w:color="000000"/>
-              <w:left w:val="none" w:sz="0" w:space="0" w:color="000000"/>
-              <w:right w:val="none" w:sz="0" w:space="0" w:color="000000"/>
+              <w:bottom w:val="single" w:sz="8" w:space="0" w:color="000000"/>
+              <w:top w:val="single" w:sz="8" w:space="0" w:color="000000"/>
+              <w:left w:val="single" w:sz="8" w:space="0" w:color="000000"/>
+              <w:right w:val="single" w:sz="8" w:space="0" w:color="000000"/>
             </w:tcBorders>
             <w:shd w:val="clear" w:color="auto" w:fill="FFFFFF"/>
             <w:tcMar>
@@ -2052,10 +2052,10 @@
         <w:tc>
           <w:tcPr>
             <w:tcBorders>
-              <w:bottom w:val="none" w:sz="0" w:space="0" w:color="000000"/>
-              <w:top w:val="none" w:sz="0" w:space="0" w:color="000000"/>
-              <w:left w:val="none" w:sz="0" w:space="0" w:color="000000"/>
-              <w:right w:val="none" w:sz="0" w:space="0" w:color="000000"/>
+              <w:bottom w:val="single" w:sz="8" w:space="0" w:color="000000"/>
+              <w:top w:val="single" w:sz="8" w:space="0" w:color="000000"/>
+              <w:left w:val="single" w:sz="8" w:space="0" w:color="000000"/>
+              <w:right w:val="single" w:sz="8" w:space="0" w:color="000000"/>
             </w:tcBorders>
             <w:shd w:val="clear" w:color="auto" w:fill="FFFFFF"/>
             <w:tcMar>
@@ -2110,10 +2110,10 @@
         <w:tc>
           <w:tcPr>
             <w:tcBorders>
-              <w:bottom w:val="none" w:sz="0" w:space="0" w:color="000000"/>
-              <w:top w:val="none" w:sz="0" w:space="0" w:color="000000"/>
-              <w:left w:val="none" w:sz="0" w:space="0" w:color="000000"/>
-              <w:right w:val="none" w:sz="0" w:space="0" w:color="000000"/>
+              <w:bottom w:val="single" w:sz="8" w:space="0" w:color="000000"/>
+              <w:top w:val="single" w:sz="8" w:space="0" w:color="000000"/>
+              <w:left w:val="single" w:sz="8" w:space="0" w:color="000000"/>
+              <w:right w:val="single" w:sz="8" w:space="0" w:color="000000"/>
             </w:tcBorders>
             <w:shd w:val="clear" w:color="auto" w:fill="FFFFFF"/>
             <w:tcMar>
@@ -2162,10 +2162,10 @@
         <w:tc>
           <w:tcPr>
             <w:tcBorders>
-              <w:bottom w:val="none" w:sz="0" w:space="0" w:color="000000"/>
-              <w:top w:val="none" w:sz="0" w:space="0" w:color="000000"/>
-              <w:left w:val="none" w:sz="0" w:space="0" w:color="000000"/>
-              <w:right w:val="none" w:sz="0" w:space="0" w:color="000000"/>
+              <w:bottom w:val="single" w:sz="8" w:space="0" w:color="000000"/>
+              <w:top w:val="single" w:sz="8" w:space="0" w:color="000000"/>
+              <w:left w:val="single" w:sz="8" w:space="0" w:color="000000"/>
+              <w:right w:val="single" w:sz="8" w:space="0" w:color="000000"/>
             </w:tcBorders>
             <w:shd w:val="clear" w:color="auto" w:fill="FFFFFF"/>
             <w:tcMar>
@@ -2220,10 +2220,10 @@
         <w:tc>
           <w:tcPr>
             <w:tcBorders>
-              <w:bottom w:val="none" w:sz="0" w:space="0" w:color="000000"/>
-              <w:top w:val="none" w:sz="0" w:space="0" w:color="000000"/>
-              <w:left w:val="none" w:sz="0" w:space="0" w:color="000000"/>
-              <w:right w:val="none" w:sz="0" w:space="0" w:color="000000"/>
+              <w:bottom w:val="single" w:sz="8" w:space="0" w:color="000000"/>
+              <w:top w:val="single" w:sz="8" w:space="0" w:color="000000"/>
+              <w:left w:val="single" w:sz="8" w:space="0" w:color="000000"/>
+              <w:right w:val="single" w:sz="8" w:space="0" w:color="000000"/>
             </w:tcBorders>
             <w:shd w:val="clear" w:color="auto" w:fill="FFFFFF"/>
             <w:tcMar>
@@ -2272,10 +2272,10 @@
         <w:tc>
           <w:tcPr>
             <w:tcBorders>
-              <w:bottom w:val="none" w:sz="0" w:space="0" w:color="000000"/>
-              <w:top w:val="none" w:sz="0" w:space="0" w:color="000000"/>
-              <w:left w:val="none" w:sz="0" w:space="0" w:color="000000"/>
-              <w:right w:val="none" w:sz="0" w:space="0" w:color="000000"/>
+              <w:bottom w:val="single" w:sz="8" w:space="0" w:color="000000"/>
+              <w:top w:val="single" w:sz="8" w:space="0" w:color="000000"/>
+              <w:left w:val="single" w:sz="8" w:space="0" w:color="000000"/>
+              <w:right w:val="single" w:sz="8" w:space="0" w:color="000000"/>
             </w:tcBorders>
             <w:shd w:val="clear" w:color="auto" w:fill="FFFFFF"/>
             <w:tcMar>
@@ -2330,10 +2330,10 @@
         <w:tc>
           <w:tcPr>
             <w:tcBorders>
-              <w:bottom w:val="none" w:sz="0" w:space="0" w:color="000000"/>
-              <w:top w:val="none" w:sz="0" w:space="0" w:color="000000"/>
-              <w:left w:val="none" w:sz="0" w:space="0" w:color="000000"/>
-              <w:right w:val="none" w:sz="0" w:space="0" w:color="000000"/>
+              <w:bottom w:val="single" w:sz="8" w:space="0" w:color="000000"/>
+              <w:top w:val="single" w:sz="8" w:space="0" w:color="000000"/>
+              <w:left w:val="single" w:sz="8" w:space="0" w:color="000000"/>
+              <w:right w:val="single" w:sz="8" w:space="0" w:color="000000"/>
             </w:tcBorders>
             <w:shd w:val="clear" w:color="auto" w:fill="FFFFFF"/>
             <w:tcMar>
@@ -2382,10 +2382,10 @@
         <w:tc>
           <w:tcPr>
             <w:tcBorders>
-              <w:bottom w:val="none" w:sz="0" w:space="0" w:color="000000"/>
-              <w:top w:val="none" w:sz="0" w:space="0" w:color="000000"/>
-              <w:left w:val="none" w:sz="0" w:space="0" w:color="000000"/>
-              <w:right w:val="none" w:sz="0" w:space="0" w:color="000000"/>
+              <w:bottom w:val="single" w:sz="8" w:space="0" w:color="000000"/>
+              <w:top w:val="single" w:sz="8" w:space="0" w:color="000000"/>
+              <w:left w:val="single" w:sz="8" w:space="0" w:color="000000"/>
+              <w:right w:val="single" w:sz="8" w:space="0" w:color="000000"/>
             </w:tcBorders>
             <w:shd w:val="clear" w:color="auto" w:fill="FFFFFF"/>
             <w:tcMar>
@@ -2440,10 +2440,10 @@
         <w:tc>
           <w:tcPr>
             <w:tcBorders>
-              <w:bottom w:val="none" w:sz="0" w:space="0" w:color="000000"/>
-              <w:top w:val="none" w:sz="0" w:space="0" w:color="000000"/>
-              <w:left w:val="none" w:sz="0" w:space="0" w:color="000000"/>
-              <w:right w:val="none" w:sz="0" w:space="0" w:color="000000"/>
+              <w:bottom w:val="single" w:sz="8" w:space="0" w:color="000000"/>
+              <w:top w:val="single" w:sz="8" w:space="0" w:color="000000"/>
+              <w:left w:val="single" w:sz="8" w:space="0" w:color="000000"/>
+              <w:right w:val="single" w:sz="8" w:space="0" w:color="000000"/>
             </w:tcBorders>
             <w:shd w:val="clear" w:color="auto" w:fill="FFFFFF"/>
             <w:tcMar>
@@ -2492,10 +2492,10 @@
         <w:tc>
           <w:tcPr>
             <w:tcBorders>
-              <w:bottom w:val="none" w:sz="0" w:space="0" w:color="000000"/>
-              <w:top w:val="none" w:sz="0" w:space="0" w:color="000000"/>
-              <w:left w:val="none" w:sz="0" w:space="0" w:color="000000"/>
-              <w:right w:val="none" w:sz="0" w:space="0" w:color="000000"/>
+              <w:bottom w:val="single" w:sz="8" w:space="0" w:color="000000"/>
+              <w:top w:val="single" w:sz="8" w:space="0" w:color="000000"/>
+              <w:left w:val="single" w:sz="8" w:space="0" w:color="000000"/>
+              <w:right w:val="single" w:sz="8" w:space="0" w:color="000000"/>
             </w:tcBorders>
             <w:shd w:val="clear" w:color="auto" w:fill="FFFFFF"/>
             <w:tcMar>
@@ -2550,10 +2550,10 @@
         <w:tc>
           <w:tcPr>
             <w:tcBorders>
-              <w:bottom w:val="single" w:sz="12" w:space="0" w:color="666666"/>
-              <w:top w:val="none" w:sz="0" w:space="0" w:color="000000"/>
-              <w:left w:val="none" w:sz="0" w:space="0" w:color="000000"/>
-              <w:right w:val="none" w:sz="0" w:space="0" w:color="000000"/>
+              <w:bottom w:val="single" w:sz="8" w:space="0" w:color="000000"/>
+              <w:top w:val="single" w:sz="8" w:space="0" w:color="000000"/>
+              <w:left w:val="single" w:sz="8" w:space="0" w:color="000000"/>
+              <w:right w:val="single" w:sz="8" w:space="0" w:color="000000"/>
             </w:tcBorders>
             <w:shd w:val="clear" w:color="auto" w:fill="FFFFFF"/>
             <w:tcMar>
@@ -2602,10 +2602,10 @@
         <w:tc>
           <w:tcPr>
             <w:tcBorders>
-              <w:bottom w:val="single" w:sz="12" w:space="0" w:color="666666"/>
-              <w:top w:val="none" w:sz="0" w:space="0" w:color="000000"/>
-              <w:left w:val="none" w:sz="0" w:space="0" w:color="000000"/>
-              <w:right w:val="none" w:sz="0" w:space="0" w:color="000000"/>
+              <w:bottom w:val="single" w:sz="8" w:space="0" w:color="000000"/>
+              <w:top w:val="single" w:sz="8" w:space="0" w:color="000000"/>
+              <w:left w:val="single" w:sz="8" w:space="0" w:color="000000"/>
+              <w:right w:val="single" w:sz="8" w:space="0" w:color="000000"/>
             </w:tcBorders>
             <w:shd w:val="clear" w:color="auto" w:fill="FFFFFF"/>
             <w:tcMar>
@@ -2690,126 +2690,15 @@
       <w:tr>
         <w:trPr>
           <w:trHeight w:val="360" w:hRule="auto"/>
-          <w:tblHeader/>
-        </w:trPr>
-        header1
-        <w:tc>
-          <w:tcPr>
-            <w:tcBorders>
-              <w:bottom w:val="single" w:sz="12" w:space="0" w:color="666666"/>
-              <w:top w:val="single" w:sz="12" w:space="0" w:color="666666"/>
-              <w:left w:val="none" w:sz="0" w:space="0" w:color="000000"/>
-              <w:right w:val="none" w:sz="0" w:space="0" w:color="000000"/>
-            </w:tcBorders>
-            <w:shd w:val="clear" w:color="auto" w:fill="FFFFFF"/>
-            <w:tcMar>
-              <w:top w:w="0" w:type="dxa"/>
-              <w:bottom w:w="0" w:type="dxa"/>
-              <w:left w:w="0" w:type="dxa"/>
-              <w:right w:w="0" w:type="dxa"/>
-            </w:tcMar>
-            <w:vAlign w:val="top"/>
-          </w:tcPr>
-          <w:p>
-            <w:pPr>
-              <w:jc w:val="left"/>
-              <w:pBdr>
-                <w:bottom w:val="none" w:sz="0" w:space="0" w:color="000000"/>
-                <w:top w:val="none" w:sz="0" w:space="0" w:color="000000"/>
-                <w:left w:val="none" w:sz="0" w:space="0" w:color="000000"/>
-                <w:right w:val="none" w:sz="0" w:space="0" w:color="000000"/>
-              </w:pBdr>
-              <w:spacing w:after="100" w:before="100" w:line="240"/>
-              <w:ind w:left="100" w:right="100" w:firstLine="0" w:firstLineChars="0"/>
-              <w:rPr>
-                <w:rFonts w:ascii="Arial" w:hAnsi="Arial" w:eastAsia="Arial" w:cs="Arial"/>
-                <w:i w:val="false"/>
-                <w:b w:val="false"/>
-                <w:u w:val="none"/>
-                <w:sz w:val="22"/>
-                <w:szCs w:val="22"/>
-                <w:color w:val="000000"/>
-              </w:rPr>
-            </w:pPr>
-            <w:r xmlns:w="http://schemas.openxmlformats.org/wordprocessingml/2006/main" xmlns:wp="http://schemas.openxmlformats.org/drawingml/2006/wordprocessingDrawing" xmlns:r="http://schemas.openxmlformats.org/officeDocument/2006/relationships" xmlns:w14="http://schemas.microsoft.com/office/word/2010/wordml">
-              <w:rPr>
-                <w:rFonts w:ascii="Arial" w:hAnsi="Arial" w:eastAsia="Arial" w:cs="Arial"/>
-                <w:i w:val="false"/>
-                <w:b w:val="false"/>
-                <w:u w:val="none"/>
-                <w:sz w:val="22"/>
-                <w:szCs w:val="22"/>
-                <w:color w:val="000000"/>
-              </w:rPr>
-              <w:t xml:space="preserve">Info</w:t>
-            </w:r>
-          </w:p>
-        </w:tc>
-        <w:tc>
-          <w:tcPr>
-            <w:tcBorders>
-              <w:bottom w:val="single" w:sz="12" w:space="0" w:color="666666"/>
-              <w:top w:val="single" w:sz="12" w:space="0" w:color="666666"/>
-              <w:left w:val="none" w:sz="0" w:space="0" w:color="000000"/>
-              <w:right w:val="none" w:sz="0" w:space="0" w:color="000000"/>
-            </w:tcBorders>
-            <w:shd w:val="clear" w:color="auto" w:fill="FFFFFF"/>
-            <w:tcMar>
-              <w:top w:w="0" w:type="dxa"/>
-              <w:bottom w:w="0" w:type="dxa"/>
-              <w:left w:w="0" w:type="dxa"/>
-              <w:right w:w="0" w:type="dxa"/>
-            </w:tcMar>
-            <w:vAlign w:val="top"/>
-          </w:tcPr>
-          <w:p>
-            <w:pPr>
-              <w:jc w:val="left"/>
-              <w:pBdr>
-                <w:bottom w:val="none" w:sz="0" w:space="0" w:color="000000"/>
-                <w:top w:val="none" w:sz="0" w:space="0" w:color="000000"/>
-                <w:left w:val="none" w:sz="0" w:space="0" w:color="000000"/>
-                <w:right w:val="none" w:sz="0" w:space="0" w:color="000000"/>
-              </w:pBdr>
-              <w:spacing w:after="100" w:before="100" w:line="240"/>
-              <w:ind w:left="100" w:right="100" w:firstLine="0" w:firstLineChars="0"/>
-              <w:rPr>
-                <w:rFonts w:ascii="Arial" w:hAnsi="Arial" w:eastAsia="Arial" w:cs="Arial"/>
-                <w:i w:val="false"/>
-                <w:b w:val="false"/>
-                <w:u w:val="none"/>
-                <w:sz w:val="22"/>
-                <w:szCs w:val="22"/>
-                <w:color w:val="000000"/>
-              </w:rPr>
-            </w:pPr>
-            <w:r xmlns:w="http://schemas.openxmlformats.org/wordprocessingml/2006/main" xmlns:wp="http://schemas.openxmlformats.org/drawingml/2006/wordprocessingDrawing" xmlns:r="http://schemas.openxmlformats.org/officeDocument/2006/relationships" xmlns:w14="http://schemas.microsoft.com/office/word/2010/wordml">
-              <w:rPr>
-                <w:rFonts w:ascii="Arial" w:hAnsi="Arial" w:eastAsia="Arial" w:cs="Arial"/>
-                <w:i w:val="false"/>
-                <w:b w:val="false"/>
-                <w:u w:val="none"/>
-                <w:sz w:val="22"/>
-                <w:szCs w:val="22"/>
-                <w:color w:val="000000"/>
-              </w:rPr>
-              <w:t xml:space="preserve">Values</w:t>
-            </w:r>
-          </w:p>
-        </w:tc>
-      </w:tr>
-      <w:tr>
-        <w:trPr>
-          <w:trHeight w:val="360" w:hRule="auto"/>
         </w:trPr>
         body1
         <w:tc>
           <w:tcPr>
             <w:tcBorders>
-              <w:bottom w:val="none" w:sz="0" w:space="0" w:color="000000"/>
-              <w:top w:val="single" w:sz="12" w:space="0" w:color="666666"/>
-              <w:left w:val="none" w:sz="0" w:space="0" w:color="000000"/>
-              <w:right w:val="none" w:sz="0" w:space="0" w:color="000000"/>
+              <w:bottom w:val="single" w:sz="8" w:space="0" w:color="000000"/>
+              <w:top w:val="single" w:sz="8" w:space="0" w:color="000000"/>
+              <w:left w:val="single" w:sz="8" w:space="0" w:color="000000"/>
+              <w:right w:val="single" w:sz="8" w:space="0" w:color="000000"/>
             </w:tcBorders>
             <w:shd w:val="clear" w:color="auto" w:fill="FFFFFF"/>
             <w:tcMar>
@@ -2858,10 +2747,10 @@
         <w:tc>
           <w:tcPr>
             <w:tcBorders>
-              <w:bottom w:val="none" w:sz="0" w:space="0" w:color="000000"/>
-              <w:top w:val="single" w:sz="12" w:space="0" w:color="666666"/>
-              <w:left w:val="none" w:sz="0" w:space="0" w:color="000000"/>
-              <w:right w:val="none" w:sz="0" w:space="0" w:color="000000"/>
+              <w:bottom w:val="single" w:sz="8" w:space="0" w:color="000000"/>
+              <w:top w:val="single" w:sz="8" w:space="0" w:color="000000"/>
+              <w:left w:val="single" w:sz="8" w:space="0" w:color="000000"/>
+              <w:right w:val="single" w:sz="8" w:space="0" w:color="000000"/>
             </w:tcBorders>
             <w:shd w:val="clear" w:color="auto" w:fill="FFFFFF"/>
             <w:tcMar>
@@ -2916,10 +2805,10 @@
         <w:tc>
           <w:tcPr>
             <w:tcBorders>
-              <w:bottom w:val="none" w:sz="0" w:space="0" w:color="000000"/>
-              <w:top w:val="none" w:sz="0" w:space="0" w:color="000000"/>
-              <w:left w:val="none" w:sz="0" w:space="0" w:color="000000"/>
-              <w:right w:val="none" w:sz="0" w:space="0" w:color="000000"/>
+              <w:bottom w:val="single" w:sz="8" w:space="0" w:color="000000"/>
+              <w:top w:val="single" w:sz="8" w:space="0" w:color="000000"/>
+              <w:left w:val="single" w:sz="8" w:space="0" w:color="000000"/>
+              <w:right w:val="single" w:sz="8" w:space="0" w:color="000000"/>
             </w:tcBorders>
             <w:shd w:val="clear" w:color="auto" w:fill="FFFFFF"/>
             <w:tcMar>
@@ -2968,10 +2857,10 @@
         <w:tc>
           <w:tcPr>
             <w:tcBorders>
-              <w:bottom w:val="none" w:sz="0" w:space="0" w:color="000000"/>
-              <w:top w:val="none" w:sz="0" w:space="0" w:color="000000"/>
-              <w:left w:val="none" w:sz="0" w:space="0" w:color="000000"/>
-              <w:right w:val="none" w:sz="0" w:space="0" w:color="000000"/>
+              <w:bottom w:val="single" w:sz="8" w:space="0" w:color="000000"/>
+              <w:top w:val="single" w:sz="8" w:space="0" w:color="000000"/>
+              <w:left w:val="single" w:sz="8" w:space="0" w:color="000000"/>
+              <w:right w:val="single" w:sz="8" w:space="0" w:color="000000"/>
             </w:tcBorders>
             <w:shd w:val="clear" w:color="auto" w:fill="FFFFFF"/>
             <w:tcMar>
@@ -3026,10 +2915,10 @@
         <w:tc>
           <w:tcPr>
             <w:tcBorders>
-              <w:bottom w:val="none" w:sz="0" w:space="0" w:color="000000"/>
-              <w:top w:val="none" w:sz="0" w:space="0" w:color="000000"/>
-              <w:left w:val="none" w:sz="0" w:space="0" w:color="000000"/>
-              <w:right w:val="none" w:sz="0" w:space="0" w:color="000000"/>
+              <w:bottom w:val="single" w:sz="8" w:space="0" w:color="000000"/>
+              <w:top w:val="single" w:sz="8" w:space="0" w:color="000000"/>
+              <w:left w:val="single" w:sz="8" w:space="0" w:color="000000"/>
+              <w:right w:val="single" w:sz="8" w:space="0" w:color="000000"/>
             </w:tcBorders>
             <w:shd w:val="clear" w:color="auto" w:fill="FFFFFF"/>
             <w:tcMar>
@@ -3078,10 +2967,10 @@
         <w:tc>
           <w:tcPr>
             <w:tcBorders>
-              <w:bottom w:val="none" w:sz="0" w:space="0" w:color="000000"/>
-              <w:top w:val="none" w:sz="0" w:space="0" w:color="000000"/>
-              <w:left w:val="none" w:sz="0" w:space="0" w:color="000000"/>
-              <w:right w:val="none" w:sz="0" w:space="0" w:color="000000"/>
+              <w:bottom w:val="single" w:sz="8" w:space="0" w:color="000000"/>
+              <w:top w:val="single" w:sz="8" w:space="0" w:color="000000"/>
+              <w:left w:val="single" w:sz="8" w:space="0" w:color="000000"/>
+              <w:right w:val="single" w:sz="8" w:space="0" w:color="000000"/>
             </w:tcBorders>
             <w:shd w:val="clear" w:color="auto" w:fill="FFFFFF"/>
             <w:tcMar>
@@ -3136,10 +3025,10 @@
         <w:tc>
           <w:tcPr>
             <w:tcBorders>
-              <w:bottom w:val="none" w:sz="0" w:space="0" w:color="000000"/>
-              <w:top w:val="none" w:sz="0" w:space="0" w:color="000000"/>
-              <w:left w:val="none" w:sz="0" w:space="0" w:color="000000"/>
-              <w:right w:val="none" w:sz="0" w:space="0" w:color="000000"/>
+              <w:bottom w:val="single" w:sz="8" w:space="0" w:color="000000"/>
+              <w:top w:val="single" w:sz="8" w:space="0" w:color="000000"/>
+              <w:left w:val="single" w:sz="8" w:space="0" w:color="000000"/>
+              <w:right w:val="single" w:sz="8" w:space="0" w:color="000000"/>
             </w:tcBorders>
             <w:shd w:val="clear" w:color="auto" w:fill="FFFFFF"/>
             <w:tcMar>
@@ -3188,10 +3077,10 @@
         <w:tc>
           <w:tcPr>
             <w:tcBorders>
-              <w:bottom w:val="none" w:sz="0" w:space="0" w:color="000000"/>
-              <w:top w:val="none" w:sz="0" w:space="0" w:color="000000"/>
-              <w:left w:val="none" w:sz="0" w:space="0" w:color="000000"/>
-              <w:right w:val="none" w:sz="0" w:space="0" w:color="000000"/>
+              <w:bottom w:val="single" w:sz="8" w:space="0" w:color="000000"/>
+              <w:top w:val="single" w:sz="8" w:space="0" w:color="000000"/>
+              <w:left w:val="single" w:sz="8" w:space="0" w:color="000000"/>
+              <w:right w:val="single" w:sz="8" w:space="0" w:color="000000"/>
             </w:tcBorders>
             <w:shd w:val="clear" w:color="auto" w:fill="FFFFFF"/>
             <w:tcMar>
@@ -3246,10 +3135,10 @@
         <w:tc>
           <w:tcPr>
             <w:tcBorders>
-              <w:bottom w:val="none" w:sz="0" w:space="0" w:color="000000"/>
-              <w:top w:val="none" w:sz="0" w:space="0" w:color="000000"/>
-              <w:left w:val="none" w:sz="0" w:space="0" w:color="000000"/>
-              <w:right w:val="none" w:sz="0" w:space="0" w:color="000000"/>
+              <w:bottom w:val="single" w:sz="8" w:space="0" w:color="000000"/>
+              <w:top w:val="single" w:sz="8" w:space="0" w:color="000000"/>
+              <w:left w:val="single" w:sz="8" w:space="0" w:color="000000"/>
+              <w:right w:val="single" w:sz="8" w:space="0" w:color="000000"/>
             </w:tcBorders>
             <w:shd w:val="clear" w:color="auto" w:fill="FFFFFF"/>
             <w:tcMar>
@@ -3298,10 +3187,10 @@
         <w:tc>
           <w:tcPr>
             <w:tcBorders>
-              <w:bottom w:val="none" w:sz="0" w:space="0" w:color="000000"/>
-              <w:top w:val="none" w:sz="0" w:space="0" w:color="000000"/>
-              <w:left w:val="none" w:sz="0" w:space="0" w:color="000000"/>
-              <w:right w:val="none" w:sz="0" w:space="0" w:color="000000"/>
+              <w:bottom w:val="single" w:sz="8" w:space="0" w:color="000000"/>
+              <w:top w:val="single" w:sz="8" w:space="0" w:color="000000"/>
+              <w:left w:val="single" w:sz="8" w:space="0" w:color="000000"/>
+              <w:right w:val="single" w:sz="8" w:space="0" w:color="000000"/>
             </w:tcBorders>
             <w:shd w:val="clear" w:color="auto" w:fill="FFFFFF"/>
             <w:tcMar>
@@ -3356,10 +3245,10 @@
         <w:tc>
           <w:tcPr>
             <w:tcBorders>
-              <w:bottom w:val="none" w:sz="0" w:space="0" w:color="000000"/>
-              <w:top w:val="none" w:sz="0" w:space="0" w:color="000000"/>
-              <w:left w:val="none" w:sz="0" w:space="0" w:color="000000"/>
-              <w:right w:val="none" w:sz="0" w:space="0" w:color="000000"/>
+              <w:bottom w:val="single" w:sz="8" w:space="0" w:color="000000"/>
+              <w:top w:val="single" w:sz="8" w:space="0" w:color="000000"/>
+              <w:left w:val="single" w:sz="8" w:space="0" w:color="000000"/>
+              <w:right w:val="single" w:sz="8" w:space="0" w:color="000000"/>
             </w:tcBorders>
             <w:shd w:val="clear" w:color="auto" w:fill="FFFFFF"/>
             <w:tcMar>
@@ -3408,10 +3297,10 @@
         <w:tc>
           <w:tcPr>
             <w:tcBorders>
-              <w:bottom w:val="none" w:sz="0" w:space="0" w:color="000000"/>
-              <w:top w:val="none" w:sz="0" w:space="0" w:color="000000"/>
-              <w:left w:val="none" w:sz="0" w:space="0" w:color="000000"/>
-              <w:right w:val="none" w:sz="0" w:space="0" w:color="000000"/>
+              <w:bottom w:val="single" w:sz="8" w:space="0" w:color="000000"/>
+              <w:top w:val="single" w:sz="8" w:space="0" w:color="000000"/>
+              <w:left w:val="single" w:sz="8" w:space="0" w:color="000000"/>
+              <w:right w:val="single" w:sz="8" w:space="0" w:color="000000"/>
             </w:tcBorders>
             <w:shd w:val="clear" w:color="auto" w:fill="FFFFFF"/>
             <w:tcMar>
@@ -3466,10 +3355,10 @@
         <w:tc>
           <w:tcPr>
             <w:tcBorders>
-              <w:bottom w:val="single" w:sz="12" w:space="0" w:color="666666"/>
-              <w:top w:val="none" w:sz="0" w:space="0" w:color="000000"/>
-              <w:left w:val="none" w:sz="0" w:space="0" w:color="000000"/>
-              <w:right w:val="none" w:sz="0" w:space="0" w:color="000000"/>
+              <w:bottom w:val="single" w:sz="8" w:space="0" w:color="000000"/>
+              <w:top w:val="single" w:sz="8" w:space="0" w:color="000000"/>
+              <w:left w:val="single" w:sz="8" w:space="0" w:color="000000"/>
+              <w:right w:val="single" w:sz="8" w:space="0" w:color="000000"/>
             </w:tcBorders>
             <w:shd w:val="clear" w:color="auto" w:fill="FFFFFF"/>
             <w:tcMar>
@@ -3518,10 +3407,10 @@
         <w:tc>
           <w:tcPr>
             <w:tcBorders>
-              <w:bottom w:val="single" w:sz="12" w:space="0" w:color="666666"/>
-              <w:top w:val="none" w:sz="0" w:space="0" w:color="000000"/>
-              <w:left w:val="none" w:sz="0" w:space="0" w:color="000000"/>
-              <w:right w:val="none" w:sz="0" w:space="0" w:color="000000"/>
+              <w:bottom w:val="single" w:sz="8" w:space="0" w:color="000000"/>
+              <w:top w:val="single" w:sz="8" w:space="0" w:color="000000"/>
+              <w:left w:val="single" w:sz="8" w:space="0" w:color="000000"/>
+              <w:right w:val="single" w:sz="8" w:space="0" w:color="000000"/>
             </w:tcBorders>
             <w:shd w:val="clear" w:color="auto" w:fill="FFFFFF"/>
             <w:tcMar>
@@ -3579,385 +3468,782 @@
         <w:t xml:space="preserve">3.2 Exterior</w:t>
       </w:r>
     </w:p>
-    <w:tbl xmlns:w="http://schemas.openxmlformats.org/wordprocessingml/2006/main" xmlns:wp="http://schemas.openxmlformats.org/drawingml/2006/wordprocessingDrawing" xmlns:r="http://schemas.openxmlformats.org/officeDocument/2006/relationships" xmlns:w14="http://schemas.microsoft.com/office/word/2010/wordml">
+    <w:tbl xmlns:w="http://schemas.openxmlformats.org/wordprocessingml/2006/main" xmlns:r="http://schemas.openxmlformats.org/officeDocument/2006/relationships" xmlns:w14="http://schemas.microsoft.com/office/word/2010/wordml" xmlns:wp="http://schemas.openxmlformats.org/drawingml/2006/wordprocessingDrawing" xmlns:a="http://schemas.openxmlformats.org/drawingml/2006/main" xmlns:pic="http://schemas.openxmlformats.org/drawingml/2006/picture">
       <w:tblPr>
-        <w:tblCellMar>
-          <w:top w:w="0" w:type="dxa"/>
-          <w:bottom w:w="0" w:type="dxa"/>
-          <w:start w:w="60" w:type="dxa"/>
-          <w:end w:w="60" w:type="dxa"/>
-        </w:tblCellMar>
-        <w:tblW w:type="auto" w:w="0"/>
-        <w:tblLook w:firstRow="0" w:lastRow="0" w:firstColumn="0" w:lastColumn="0" w:noHBand="0" w:noVBand="0"/>
+        <w:tblLayout w:type="fixed"/>
         <w:jc w:val="center"/>
+        <w:tblLook w:firstRow="1" w:lastRow="0" w:firstColumn="0" w:lastColumn="0" w:noHBand="0" w:noVBand="1"/>
       </w:tblPr>
+      <w:tblGrid>
+        <w:gridCol w:w="2880"/>
+        <w:gridCol w:w="5760"/>
+      </w:tblGrid>
       <w:tr>
         <w:trPr>
-          <w:cantSplit/>
+          <w:trHeight w:val="360" w:hRule="auto"/>
         </w:trPr>
+        body1
         <w:tc>
           <w:tcPr>
             <w:tcBorders>
-              <w:top w:val="single" w:space="0" w:color="D3D3D3"/>
-              <w:bottom w:val="single" w:space="0" w:color="D3D3D3"/>
-              <w:start w:val="single" w:space="0" w:color="D3D3D3"/>
-              <w:end w:val="single" w:space="0" w:color="D3D3D3"/>
+              <w:bottom w:val="single" w:sz="8" w:space="0" w:color="000000"/>
+              <w:top w:val="single" w:sz="8" w:space="0" w:color="000000"/>
+              <w:left w:val="single" w:sz="8" w:space="0" w:color="000000"/>
+              <w:right w:val="single" w:sz="8" w:space="0" w:color="000000"/>
             </w:tcBorders>
+            <w:shd w:val="clear" w:color="auto" w:fill="FFFFFF"/>
+            <w:tcMar>
+              <w:top w:w="0" w:type="dxa"/>
+              <w:bottom w:w="0" w:type="dxa"/>
+              <w:left w:w="0" w:type="dxa"/>
+              <w:right w:w="0" w:type="dxa"/>
+            </w:tcMar>
+            <w:vAlign w:val="top"/>
           </w:tcPr>
           <w:p>
             <w:pPr>
-              <w:spacing w:before="0" w:after="60"/>
-              <w:keepNext/>
-              <w:jc w:val="start"/>
+              <w:jc w:val="left"/>
+              <w:pBdr>
+                <w:bottom w:val="none" w:sz="0" w:space="0" w:color="000000"/>
+                <w:top w:val="none" w:sz="0" w:space="0" w:color="000000"/>
+                <w:left w:val="none" w:sz="0" w:space="0" w:color="000000"/>
+                <w:right w:val="none" w:sz="0" w:space="0" w:color="000000"/>
+              </w:pBdr>
+              <w:spacing w:after="80" w:before="80" w:line="240"/>
+              <w:ind w:left="80" w:right="80" w:firstLine="0" w:firstLineChars="0"/>
+              <w:rPr>
+                <w:rFonts w:ascii="Arial" w:hAnsi="Arial" w:eastAsia="Arial" w:cs="Arial"/>
+                <w:i w:val="false"/>
+                <w:b w:val="false"/>
+                <w:u w:val="none"/>
+                <w:sz w:val="22"/>
+                <w:szCs w:val="22"/>
+                <w:color w:val="000000"/>
+              </w:rPr>
             </w:pPr>
-            <w:r>
-              <w:rPr>
-                <w:rFonts w:ascii="Calibri" w:hAnsi="Calibri"/>
-                <w:sz w:val="20"/>
-              </w:rPr>
-              <w:t xml:space="default">Roof age:</w:t>
+            <w:r xmlns:w="http://schemas.openxmlformats.org/wordprocessingml/2006/main" xmlns:wp="http://schemas.openxmlformats.org/drawingml/2006/wordprocessingDrawing" xmlns:r="http://schemas.openxmlformats.org/officeDocument/2006/relationships" xmlns:w14="http://schemas.microsoft.com/office/word/2010/wordml">
+              <w:rPr>
+                <w:rFonts w:ascii="Arial" w:hAnsi="Arial" w:eastAsia="Arial" w:cs="Arial"/>
+                <w:i w:val="false"/>
+                <w:b w:val="false"/>
+                <w:u w:val="none"/>
+                <w:sz w:val="22"/>
+                <w:szCs w:val="22"/>
+                <w:color w:val="000000"/>
+              </w:rPr>
+              <w:t xml:space="preserve">Roof age:</w:t>
             </w:r>
           </w:p>
         </w:tc>
         <w:tc>
           <w:tcPr>
             <w:tcBorders>
-              <w:top w:val="single" w:space="0" w:color="D3D3D3"/>
-              <w:bottom w:val="single" w:space="0" w:color="D3D3D3"/>
-              <w:start w:val="single" w:space="0" w:color="D3D3D3"/>
-              <w:end w:val="single" w:space="0" w:color="D3D3D3"/>
+              <w:bottom w:val="single" w:sz="8" w:space="0" w:color="000000"/>
+              <w:top w:val="single" w:sz="8" w:space="0" w:color="000000"/>
+              <w:left w:val="single" w:sz="8" w:space="0" w:color="000000"/>
+              <w:right w:val="single" w:sz="8" w:space="0" w:color="000000"/>
             </w:tcBorders>
+            <w:shd w:val="clear" w:color="auto" w:fill="FFFFFF"/>
+            <w:tcMar>
+              <w:top w:w="0" w:type="dxa"/>
+              <w:bottom w:w="0" w:type="dxa"/>
+              <w:left w:w="0" w:type="dxa"/>
+              <w:right w:w="0" w:type="dxa"/>
+            </w:tcMar>
+            <w:vAlign w:val="top"/>
           </w:tcPr>
           <w:p>
             <w:pPr>
-              <w:spacing w:before="0" w:after="60"/>
-              <w:keepNext/>
-              <w:jc w:val="start"/>
+              <w:jc w:val="left"/>
+              <w:pBdr>
+                <w:bottom w:val="none" w:sz="0" w:space="0" w:color="000000"/>
+                <w:top w:val="none" w:sz="0" w:space="0" w:color="000000"/>
+                <w:left w:val="none" w:sz="0" w:space="0" w:color="000000"/>
+                <w:right w:val="none" w:sz="0" w:space="0" w:color="000000"/>
+              </w:pBdr>
+              <w:spacing w:after="80" w:before="80" w:line="240"/>
+              <w:ind w:left="80" w:right="80" w:firstLine="0" w:firstLineChars="0"/>
+              <w:rPr>
+                <w:rFonts w:ascii="Arial" w:hAnsi="Arial" w:eastAsia="Arial" w:cs="Arial"/>
+                <w:i w:val="false"/>
+                <w:b w:val="false"/>
+                <w:u w:val="none"/>
+                <w:sz w:val="22"/>
+                <w:szCs w:val="22"/>
+                <w:color w:val="000000"/>
+              </w:rPr>
             </w:pPr>
-            <w:r>
-              <w:rPr>
-                <w:rFonts w:ascii="Calibri" w:hAnsi="Calibri"/>
-                <w:sz w:val="20"/>
-              </w:rPr>
-              <w:t xml:space="default">15</w:t>
+            <w:r xmlns:w="http://schemas.openxmlformats.org/wordprocessingml/2006/main" xmlns:wp="http://schemas.openxmlformats.org/drawingml/2006/wordprocessingDrawing" xmlns:r="http://schemas.openxmlformats.org/officeDocument/2006/relationships" xmlns:w14="http://schemas.microsoft.com/office/word/2010/wordml">
+              <w:rPr>
+                <w:rFonts w:ascii="Arial" w:hAnsi="Arial" w:eastAsia="Arial" w:cs="Arial"/>
+                <w:i w:val="false"/>
+                <w:b w:val="false"/>
+                <w:u w:val="none"/>
+                <w:sz w:val="22"/>
+                <w:szCs w:val="22"/>
+                <w:color w:val="000000"/>
+              </w:rPr>
+              <w:t xml:space="preserve">15</w:t>
             </w:r>
           </w:p>
         </w:tc>
       </w:tr>
       <w:tr>
         <w:trPr>
-          <w:cantSplit/>
+          <w:trHeight w:val="360" w:hRule="auto"/>
         </w:trPr>
+        body2
         <w:tc>
           <w:tcPr>
             <w:tcBorders>
-              <w:top w:val="single" w:space="0" w:color="D3D3D3"/>
-              <w:bottom w:val="single" w:space="0" w:color="D3D3D3"/>
-              <w:start w:val="single" w:space="0" w:color="D3D3D3"/>
-              <w:end w:val="single" w:space="0" w:color="D3D3D3"/>
+              <w:bottom w:val="single" w:sz="8" w:space="0" w:color="000000"/>
+              <w:top w:val="single" w:sz="8" w:space="0" w:color="000000"/>
+              <w:left w:val="single" w:sz="8" w:space="0" w:color="000000"/>
+              <w:right w:val="single" w:sz="8" w:space="0" w:color="000000"/>
             </w:tcBorders>
+            <w:shd w:val="clear" w:color="auto" w:fill="FFFFFF"/>
+            <w:tcMar>
+              <w:top w:w="0" w:type="dxa"/>
+              <w:bottom w:w="0" w:type="dxa"/>
+              <w:left w:w="0" w:type="dxa"/>
+              <w:right w:w="0" w:type="dxa"/>
+            </w:tcMar>
+            <w:vAlign w:val="top"/>
           </w:tcPr>
           <w:p>
             <w:pPr>
-              <w:spacing w:before="0" w:after="60"/>
-              <w:keepNext/>
-              <w:jc w:val="start"/>
+              <w:jc w:val="left"/>
+              <w:pBdr>
+                <w:bottom w:val="none" w:sz="0" w:space="0" w:color="000000"/>
+                <w:top w:val="none" w:sz="0" w:space="0" w:color="000000"/>
+                <w:left w:val="none" w:sz="0" w:space="0" w:color="000000"/>
+                <w:right w:val="none" w:sz="0" w:space="0" w:color="000000"/>
+              </w:pBdr>
+              <w:spacing w:after="80" w:before="80" w:line="240"/>
+              <w:ind w:left="80" w:right="80" w:firstLine="0" w:firstLineChars="0"/>
+              <w:rPr>
+                <w:rFonts w:ascii="Arial" w:hAnsi="Arial" w:eastAsia="Arial" w:cs="Arial"/>
+                <w:i w:val="false"/>
+                <w:b w:val="false"/>
+                <w:u w:val="none"/>
+                <w:sz w:val="22"/>
+                <w:szCs w:val="22"/>
+                <w:color w:val="000000"/>
+              </w:rPr>
             </w:pPr>
-            <w:r>
-              <w:rPr>
-                <w:rFonts w:ascii="Calibri" w:hAnsi="Calibri"/>
-                <w:sz w:val="20"/>
-              </w:rPr>
-              <w:t xml:space="default">Orientation:</w:t>
+            <w:r xmlns:w="http://schemas.openxmlformats.org/wordprocessingml/2006/main" xmlns:wp="http://schemas.openxmlformats.org/drawingml/2006/wordprocessingDrawing" xmlns:r="http://schemas.openxmlformats.org/officeDocument/2006/relationships" xmlns:w14="http://schemas.microsoft.com/office/word/2010/wordml">
+              <w:rPr>
+                <w:rFonts w:ascii="Arial" w:hAnsi="Arial" w:eastAsia="Arial" w:cs="Arial"/>
+                <w:i w:val="false"/>
+                <w:b w:val="false"/>
+                <w:u w:val="none"/>
+                <w:sz w:val="22"/>
+                <w:szCs w:val="22"/>
+                <w:color w:val="000000"/>
+              </w:rPr>
+              <w:t xml:space="preserve">Orientation:</w:t>
             </w:r>
           </w:p>
         </w:tc>
         <w:tc>
           <w:tcPr>
             <w:tcBorders>
-              <w:top w:val="single" w:space="0" w:color="D3D3D3"/>
-              <w:bottom w:val="single" w:space="0" w:color="D3D3D3"/>
-              <w:start w:val="single" w:space="0" w:color="D3D3D3"/>
-              <w:end w:val="single" w:space="0" w:color="D3D3D3"/>
+              <w:bottom w:val="single" w:sz="8" w:space="0" w:color="000000"/>
+              <w:top w:val="single" w:sz="8" w:space="0" w:color="000000"/>
+              <w:left w:val="single" w:sz="8" w:space="0" w:color="000000"/>
+              <w:right w:val="single" w:sz="8" w:space="0" w:color="000000"/>
             </w:tcBorders>
+            <w:shd w:val="clear" w:color="auto" w:fill="FFFFFF"/>
+            <w:tcMar>
+              <w:top w:w="0" w:type="dxa"/>
+              <w:bottom w:w="0" w:type="dxa"/>
+              <w:left w:w="0" w:type="dxa"/>
+              <w:right w:w="0" w:type="dxa"/>
+            </w:tcMar>
+            <w:vAlign w:val="top"/>
           </w:tcPr>
           <w:p>
             <w:pPr>
-              <w:spacing w:before="0" w:after="60"/>
-              <w:keepNext/>
-              <w:jc w:val="start"/>
+              <w:jc w:val="left"/>
+              <w:pBdr>
+                <w:bottom w:val="none" w:sz="0" w:space="0" w:color="000000"/>
+                <w:top w:val="none" w:sz="0" w:space="0" w:color="000000"/>
+                <w:left w:val="none" w:sz="0" w:space="0" w:color="000000"/>
+                <w:right w:val="none" w:sz="0" w:space="0" w:color="000000"/>
+              </w:pBdr>
+              <w:spacing w:after="80" w:before="80" w:line="240"/>
+              <w:ind w:left="80" w:right="80" w:firstLine="0" w:firstLineChars="0"/>
+              <w:rPr>
+                <w:rFonts w:ascii="Arial" w:hAnsi="Arial" w:eastAsia="Arial" w:cs="Arial"/>
+                <w:i w:val="false"/>
+                <w:b w:val="false"/>
+                <w:u w:val="none"/>
+                <w:sz w:val="22"/>
+                <w:szCs w:val="22"/>
+                <w:color w:val="000000"/>
+              </w:rPr>
             </w:pPr>
-            <w:r>
-              <w:rPr>
-                <w:rFonts w:ascii="Calibri" w:hAnsi="Calibri"/>
-                <w:sz w:val="20"/>
-              </w:rPr>
-              <w:t xml:space="default">Northeast/Southwest</w:t>
+            <w:r xmlns:w="http://schemas.openxmlformats.org/wordprocessingml/2006/main" xmlns:wp="http://schemas.openxmlformats.org/drawingml/2006/wordprocessingDrawing" xmlns:r="http://schemas.openxmlformats.org/officeDocument/2006/relationships" xmlns:w14="http://schemas.microsoft.com/office/word/2010/wordml">
+              <w:rPr>
+                <w:rFonts w:ascii="Arial" w:hAnsi="Arial" w:eastAsia="Arial" w:cs="Arial"/>
+                <w:i w:val="false"/>
+                <w:b w:val="false"/>
+                <w:u w:val="none"/>
+                <w:sz w:val="22"/>
+                <w:szCs w:val="22"/>
+                <w:color w:val="000000"/>
+              </w:rPr>
+              <w:t xml:space="preserve">Northeast/Southwest</w:t>
             </w:r>
           </w:p>
         </w:tc>
       </w:tr>
       <w:tr>
         <w:trPr>
-          <w:cantSplit/>
+          <w:trHeight w:val="360" w:hRule="auto"/>
         </w:trPr>
+        body3
         <w:tc>
           <w:tcPr>
             <w:tcBorders>
-              <w:top w:val="single" w:space="0" w:color="D3D3D3"/>
-              <w:bottom w:val="single" w:space="0" w:color="D3D3D3"/>
-              <w:start w:val="single" w:space="0" w:color="D3D3D3"/>
-              <w:end w:val="single" w:space="0" w:color="D3D3D3"/>
+              <w:bottom w:val="single" w:sz="8" w:space="0" w:color="000000"/>
+              <w:top w:val="single" w:sz="8" w:space="0" w:color="000000"/>
+              <w:left w:val="single" w:sz="8" w:space="0" w:color="000000"/>
+              <w:right w:val="single" w:sz="8" w:space="0" w:color="000000"/>
             </w:tcBorders>
+            <w:shd w:val="clear" w:color="auto" w:fill="FFFFFF"/>
+            <w:tcMar>
+              <w:top w:w="0" w:type="dxa"/>
+              <w:bottom w:w="0" w:type="dxa"/>
+              <w:left w:w="0" w:type="dxa"/>
+              <w:right w:w="0" w:type="dxa"/>
+            </w:tcMar>
+            <w:vAlign w:val="top"/>
           </w:tcPr>
           <w:p>
             <w:pPr>
-              <w:spacing w:before="0" w:after="60"/>
-              <w:keepNext/>
-              <w:jc w:val="start"/>
+              <w:jc w:val="left"/>
+              <w:pBdr>
+                <w:bottom w:val="none" w:sz="0" w:space="0" w:color="000000"/>
+                <w:top w:val="none" w:sz="0" w:space="0" w:color="000000"/>
+                <w:left w:val="none" w:sz="0" w:space="0" w:color="000000"/>
+                <w:right w:val="none" w:sz="0" w:space="0" w:color="000000"/>
+              </w:pBdr>
+              <w:spacing w:after="80" w:before="80" w:line="240"/>
+              <w:ind w:left="80" w:right="80" w:firstLine="0" w:firstLineChars="0"/>
+              <w:rPr>
+                <w:rFonts w:ascii="Arial" w:hAnsi="Arial" w:eastAsia="Arial" w:cs="Arial"/>
+                <w:i w:val="false"/>
+                <w:b w:val="false"/>
+                <w:u w:val="none"/>
+                <w:sz w:val="22"/>
+                <w:szCs w:val="22"/>
+                <w:color w:val="000000"/>
+              </w:rPr>
             </w:pPr>
-            <w:r>
-              <w:rPr>
-                <w:rFonts w:ascii="Calibri" w:hAnsi="Calibri"/>
-                <w:sz w:val="20"/>
-              </w:rPr>
-              <w:t xml:space="default">Roof type:</w:t>
+            <w:r xmlns:w="http://schemas.openxmlformats.org/wordprocessingml/2006/main" xmlns:wp="http://schemas.openxmlformats.org/drawingml/2006/wordprocessingDrawing" xmlns:r="http://schemas.openxmlformats.org/officeDocument/2006/relationships" xmlns:w14="http://schemas.microsoft.com/office/word/2010/wordml">
+              <w:rPr>
+                <w:rFonts w:ascii="Arial" w:hAnsi="Arial" w:eastAsia="Arial" w:cs="Arial"/>
+                <w:i w:val="false"/>
+                <w:b w:val="false"/>
+                <w:u w:val="none"/>
+                <w:sz w:val="22"/>
+                <w:szCs w:val="22"/>
+                <w:color w:val="000000"/>
+              </w:rPr>
+              <w:t xml:space="preserve">Roof type:</w:t>
             </w:r>
           </w:p>
         </w:tc>
         <w:tc>
           <w:tcPr>
             <w:tcBorders>
-              <w:top w:val="single" w:space="0" w:color="D3D3D3"/>
-              <w:bottom w:val="single" w:space="0" w:color="D3D3D3"/>
-              <w:start w:val="single" w:space="0" w:color="D3D3D3"/>
-              <w:end w:val="single" w:space="0" w:color="D3D3D3"/>
+              <w:bottom w:val="single" w:sz="8" w:space="0" w:color="000000"/>
+              <w:top w:val="single" w:sz="8" w:space="0" w:color="000000"/>
+              <w:left w:val="single" w:sz="8" w:space="0" w:color="000000"/>
+              <w:right w:val="single" w:sz="8" w:space="0" w:color="000000"/>
             </w:tcBorders>
+            <w:shd w:val="clear" w:color="auto" w:fill="FFFFFF"/>
+            <w:tcMar>
+              <w:top w:w="0" w:type="dxa"/>
+              <w:bottom w:w="0" w:type="dxa"/>
+              <w:left w:w="0" w:type="dxa"/>
+              <w:right w:w="0" w:type="dxa"/>
+            </w:tcMar>
+            <w:vAlign w:val="top"/>
           </w:tcPr>
           <w:p>
             <w:pPr>
-              <w:spacing w:before="0" w:after="60"/>
-              <w:keepNext/>
-              <w:jc w:val="start"/>
+              <w:jc w:val="left"/>
+              <w:pBdr>
+                <w:bottom w:val="none" w:sz="0" w:space="0" w:color="000000"/>
+                <w:top w:val="none" w:sz="0" w:space="0" w:color="000000"/>
+                <w:left w:val="none" w:sz="0" w:space="0" w:color="000000"/>
+                <w:right w:val="none" w:sz="0" w:space="0" w:color="000000"/>
+              </w:pBdr>
+              <w:spacing w:after="80" w:before="80" w:line="240"/>
+              <w:ind w:left="80" w:right="80" w:firstLine="0" w:firstLineChars="0"/>
+              <w:rPr>
+                <w:rFonts w:ascii="Arial" w:hAnsi="Arial" w:eastAsia="Arial" w:cs="Arial"/>
+                <w:i w:val="false"/>
+                <w:b w:val="false"/>
+                <w:u w:val="none"/>
+                <w:sz w:val="22"/>
+                <w:szCs w:val="22"/>
+                <w:color w:val="000000"/>
+              </w:rPr>
             </w:pPr>
-            <w:r>
-              <w:rPr>
-                <w:rFonts w:ascii="Calibri" w:hAnsi="Calibri"/>
-                <w:sz w:val="20"/>
-              </w:rPr>
-              <w:t xml:space="default">The house has a Asphalt Shingles roof.The roof is in NA condition. The shingles show clear signs of age and weathering. They have not begun to fly away during wind events.</w:t>
+            <w:r xmlns:w="http://schemas.openxmlformats.org/wordprocessingml/2006/main" xmlns:wp="http://schemas.openxmlformats.org/drawingml/2006/wordprocessingDrawing" xmlns:r="http://schemas.openxmlformats.org/officeDocument/2006/relationships" xmlns:w14="http://schemas.microsoft.com/office/word/2010/wordml">
+              <w:rPr>
+                <w:rFonts w:ascii="Arial" w:hAnsi="Arial" w:eastAsia="Arial" w:cs="Arial"/>
+                <w:i w:val="false"/>
+                <w:b w:val="false"/>
+                <w:u w:val="none"/>
+                <w:sz w:val="22"/>
+                <w:szCs w:val="22"/>
+                <w:color w:val="000000"/>
+              </w:rPr>
+              <w:t xml:space="preserve">The house has a Asphalt Shingles roof.The roof is in NA condition. The shingles show clear signs of age and weathering. They have not begun to fly away during wind events.</w:t>
             </w:r>
           </w:p>
         </w:tc>
       </w:tr>
       <w:tr>
         <w:trPr>
-          <w:cantSplit/>
+          <w:trHeight w:val="360" w:hRule="auto"/>
         </w:trPr>
+        body4
         <w:tc>
           <w:tcPr>
             <w:tcBorders>
-              <w:top w:val="single" w:space="0" w:color="D3D3D3"/>
-              <w:bottom w:val="single" w:space="0" w:color="D3D3D3"/>
-              <w:start w:val="single" w:space="0" w:color="D3D3D3"/>
-              <w:end w:val="single" w:space="0" w:color="D3D3D3"/>
+              <w:bottom w:val="single" w:sz="8" w:space="0" w:color="000000"/>
+              <w:top w:val="single" w:sz="8" w:space="0" w:color="000000"/>
+              <w:left w:val="single" w:sz="8" w:space="0" w:color="000000"/>
+              <w:right w:val="single" w:sz="8" w:space="0" w:color="000000"/>
             </w:tcBorders>
+            <w:shd w:val="clear" w:color="auto" w:fill="FFFFFF"/>
+            <w:tcMar>
+              <w:top w:w="0" w:type="dxa"/>
+              <w:bottom w:w="0" w:type="dxa"/>
+              <w:left w:w="0" w:type="dxa"/>
+              <w:right w:w="0" w:type="dxa"/>
+            </w:tcMar>
+            <w:vAlign w:val="top"/>
           </w:tcPr>
           <w:p>
             <w:pPr>
-              <w:spacing w:before="0" w:after="60"/>
-              <w:keepNext/>
-              <w:jc w:val="start"/>
+              <w:jc w:val="left"/>
+              <w:pBdr>
+                <w:bottom w:val="none" w:sz="0" w:space="0" w:color="000000"/>
+                <w:top w:val="none" w:sz="0" w:space="0" w:color="000000"/>
+                <w:left w:val="none" w:sz="0" w:space="0" w:color="000000"/>
+                <w:right w:val="none" w:sz="0" w:space="0" w:color="000000"/>
+              </w:pBdr>
+              <w:spacing w:after="80" w:before="80" w:line="240"/>
+              <w:ind w:left="80" w:right="80" w:firstLine="0" w:firstLineChars="0"/>
+              <w:rPr>
+                <w:rFonts w:ascii="Arial" w:hAnsi="Arial" w:eastAsia="Arial" w:cs="Arial"/>
+                <w:i w:val="false"/>
+                <w:b w:val="false"/>
+                <w:u w:val="none"/>
+                <w:sz w:val="22"/>
+                <w:szCs w:val="22"/>
+                <w:color w:val="000000"/>
+              </w:rPr>
             </w:pPr>
-            <w:r>
-              <w:rPr>
-                <w:rFonts w:ascii="Calibri" w:hAnsi="Calibri"/>
-                <w:sz w:val="20"/>
-              </w:rPr>
-              <w:t xml:space="default">Moisture control:</w:t>
+            <w:r xmlns:w="http://schemas.openxmlformats.org/wordprocessingml/2006/main" xmlns:wp="http://schemas.openxmlformats.org/drawingml/2006/wordprocessingDrawing" xmlns:r="http://schemas.openxmlformats.org/officeDocument/2006/relationships" xmlns:w14="http://schemas.microsoft.com/office/word/2010/wordml">
+              <w:rPr>
+                <w:rFonts w:ascii="Arial" w:hAnsi="Arial" w:eastAsia="Arial" w:cs="Arial"/>
+                <w:i w:val="false"/>
+                <w:b w:val="false"/>
+                <w:u w:val="none"/>
+                <w:sz w:val="22"/>
+                <w:szCs w:val="22"/>
+                <w:color w:val="000000"/>
+              </w:rPr>
+              <w:t xml:space="preserve">Moisture control:</w:t>
             </w:r>
           </w:p>
         </w:tc>
         <w:tc>
           <w:tcPr>
             <w:tcBorders>
-              <w:top w:val="single" w:space="0" w:color="D3D3D3"/>
-              <w:bottom w:val="single" w:space="0" w:color="D3D3D3"/>
-              <w:start w:val="single" w:space="0" w:color="D3D3D3"/>
-              <w:end w:val="single" w:space="0" w:color="D3D3D3"/>
+              <w:bottom w:val="single" w:sz="8" w:space="0" w:color="000000"/>
+              <w:top w:val="single" w:sz="8" w:space="0" w:color="000000"/>
+              <w:left w:val="single" w:sz="8" w:space="0" w:color="000000"/>
+              <w:right w:val="single" w:sz="8" w:space="0" w:color="000000"/>
             </w:tcBorders>
+            <w:shd w:val="clear" w:color="auto" w:fill="FFFFFF"/>
+            <w:tcMar>
+              <w:top w:w="0" w:type="dxa"/>
+              <w:bottom w:w="0" w:type="dxa"/>
+              <w:left w:w="0" w:type="dxa"/>
+              <w:right w:w="0" w:type="dxa"/>
+            </w:tcMar>
+            <w:vAlign w:val="top"/>
           </w:tcPr>
           <w:p>
             <w:pPr>
-              <w:spacing w:before="0" w:after="60"/>
-              <w:keepNext/>
-              <w:jc w:val="start"/>
+              <w:jc w:val="left"/>
+              <w:pBdr>
+                <w:bottom w:val="none" w:sz="0" w:space="0" w:color="000000"/>
+                <w:top w:val="none" w:sz="0" w:space="0" w:color="000000"/>
+                <w:left w:val="none" w:sz="0" w:space="0" w:color="000000"/>
+                <w:right w:val="none" w:sz="0" w:space="0" w:color="000000"/>
+              </w:pBdr>
+              <w:spacing w:after="80" w:before="80" w:line="240"/>
+              <w:ind w:left="80" w:right="80" w:firstLine="0" w:firstLineChars="0"/>
+              <w:rPr>
+                <w:rFonts w:ascii="Arial" w:hAnsi="Arial" w:eastAsia="Arial" w:cs="Arial"/>
+                <w:i w:val="false"/>
+                <w:b w:val="false"/>
+                <w:u w:val="none"/>
+                <w:sz w:val="22"/>
+                <w:szCs w:val="22"/>
+                <w:color w:val="000000"/>
+              </w:rPr>
             </w:pPr>
-            <w:r>
-              <w:rPr>
-                <w:rFonts w:ascii="Calibri" w:hAnsi="Calibri"/>
-                <w:sz w:val="20"/>
-              </w:rPr>
-              <w:t xml:space="default">The house has the following moisture control strategies: NA. These were in NA condition. NA</w:t>
+            <w:r xmlns:w="http://schemas.openxmlformats.org/wordprocessingml/2006/main" xmlns:wp="http://schemas.openxmlformats.org/drawingml/2006/wordprocessingDrawing" xmlns:r="http://schemas.openxmlformats.org/officeDocument/2006/relationships" xmlns:w14="http://schemas.microsoft.com/office/word/2010/wordml">
+              <w:rPr>
+                <w:rFonts w:ascii="Arial" w:hAnsi="Arial" w:eastAsia="Arial" w:cs="Arial"/>
+                <w:i w:val="false"/>
+                <w:b w:val="false"/>
+                <w:u w:val="none"/>
+                <w:sz w:val="22"/>
+                <w:szCs w:val="22"/>
+                <w:color w:val="000000"/>
+              </w:rPr>
+              <w:t xml:space="preserve">The house has the following moisture control strategies: NA.  These were in NA condition. NA</w:t>
             </w:r>
           </w:p>
         </w:tc>
       </w:tr>
       <w:tr>
         <w:trPr>
-          <w:cantSplit/>
+          <w:trHeight w:val="360" w:hRule="auto"/>
         </w:trPr>
+        body5
         <w:tc>
           <w:tcPr>
             <w:tcBorders>
-              <w:top w:val="single" w:space="0" w:color="D3D3D3"/>
-              <w:bottom w:val="single" w:space="0" w:color="D3D3D3"/>
-              <w:start w:val="single" w:space="0" w:color="D3D3D3"/>
-              <w:end w:val="single" w:space="0" w:color="D3D3D3"/>
+              <w:bottom w:val="single" w:sz="8" w:space="0" w:color="000000"/>
+              <w:top w:val="single" w:sz="8" w:space="0" w:color="000000"/>
+              <w:left w:val="single" w:sz="8" w:space="0" w:color="000000"/>
+              <w:right w:val="single" w:sz="8" w:space="0" w:color="000000"/>
             </w:tcBorders>
+            <w:shd w:val="clear" w:color="auto" w:fill="FFFFFF"/>
+            <w:tcMar>
+              <w:top w:w="0" w:type="dxa"/>
+              <w:bottom w:w="0" w:type="dxa"/>
+              <w:left w:w="0" w:type="dxa"/>
+              <w:right w:w="0" w:type="dxa"/>
+            </w:tcMar>
+            <w:vAlign w:val="top"/>
           </w:tcPr>
           <w:p>
             <w:pPr>
-              <w:spacing w:before="0" w:after="60"/>
-              <w:keepNext/>
-              <w:jc w:val="start"/>
+              <w:jc w:val="left"/>
+              <w:pBdr>
+                <w:bottom w:val="none" w:sz="0" w:space="0" w:color="000000"/>
+                <w:top w:val="none" w:sz="0" w:space="0" w:color="000000"/>
+                <w:left w:val="none" w:sz="0" w:space="0" w:color="000000"/>
+                <w:right w:val="none" w:sz="0" w:space="0" w:color="000000"/>
+              </w:pBdr>
+              <w:spacing w:after="80" w:before="80" w:line="240"/>
+              <w:ind w:left="80" w:right="80" w:firstLine="0" w:firstLineChars="0"/>
+              <w:rPr>
+                <w:rFonts w:ascii="Arial" w:hAnsi="Arial" w:eastAsia="Arial" w:cs="Arial"/>
+                <w:i w:val="false"/>
+                <w:b w:val="false"/>
+                <w:u w:val="none"/>
+                <w:sz w:val="22"/>
+                <w:szCs w:val="22"/>
+                <w:color w:val="000000"/>
+              </w:rPr>
             </w:pPr>
-            <w:r>
-              <w:rPr>
-                <w:rFonts w:ascii="Calibri" w:hAnsi="Calibri"/>
-                <w:sz w:val="20"/>
-              </w:rPr>
-              <w:t xml:space="default">Siding:</w:t>
+            <w:r xmlns:w="http://schemas.openxmlformats.org/wordprocessingml/2006/main" xmlns:wp="http://schemas.openxmlformats.org/drawingml/2006/wordprocessingDrawing" xmlns:r="http://schemas.openxmlformats.org/officeDocument/2006/relationships" xmlns:w14="http://schemas.microsoft.com/office/word/2010/wordml">
+              <w:rPr>
+                <w:rFonts w:ascii="Arial" w:hAnsi="Arial" w:eastAsia="Arial" w:cs="Arial"/>
+                <w:i w:val="false"/>
+                <w:b w:val="false"/>
+                <w:u w:val="none"/>
+                <w:sz w:val="22"/>
+                <w:szCs w:val="22"/>
+                <w:color w:val="000000"/>
+              </w:rPr>
+              <w:t xml:space="preserve">Siding:</w:t>
             </w:r>
           </w:p>
         </w:tc>
         <w:tc>
           <w:tcPr>
             <w:tcBorders>
-              <w:top w:val="single" w:space="0" w:color="D3D3D3"/>
-              <w:bottom w:val="single" w:space="0" w:color="D3D3D3"/>
-              <w:start w:val="single" w:space="0" w:color="D3D3D3"/>
-              <w:end w:val="single" w:space="0" w:color="D3D3D3"/>
+              <w:bottom w:val="single" w:sz="8" w:space="0" w:color="000000"/>
+              <w:top w:val="single" w:sz="8" w:space="0" w:color="000000"/>
+              <w:left w:val="single" w:sz="8" w:space="0" w:color="000000"/>
+              <w:right w:val="single" w:sz="8" w:space="0" w:color="000000"/>
             </w:tcBorders>
+            <w:shd w:val="clear" w:color="auto" w:fill="FFFFFF"/>
+            <w:tcMar>
+              <w:top w:w="0" w:type="dxa"/>
+              <w:bottom w:w="0" w:type="dxa"/>
+              <w:left w:w="0" w:type="dxa"/>
+              <w:right w:w="0" w:type="dxa"/>
+            </w:tcMar>
+            <w:vAlign w:val="top"/>
           </w:tcPr>
           <w:p>
             <w:pPr>
-              <w:spacing w:before="0" w:after="60"/>
-              <w:keepNext/>
-              <w:jc w:val="start"/>
+              <w:jc w:val="left"/>
+              <w:pBdr>
+                <w:bottom w:val="none" w:sz="0" w:space="0" w:color="000000"/>
+                <w:top w:val="none" w:sz="0" w:space="0" w:color="000000"/>
+                <w:left w:val="none" w:sz="0" w:space="0" w:color="000000"/>
+                <w:right w:val="none" w:sz="0" w:space="0" w:color="000000"/>
+              </w:pBdr>
+              <w:spacing w:after="80" w:before="80" w:line="240"/>
+              <w:ind w:left="80" w:right="80" w:firstLine="0" w:firstLineChars="0"/>
+              <w:rPr>
+                <w:rFonts w:ascii="Arial" w:hAnsi="Arial" w:eastAsia="Arial" w:cs="Arial"/>
+                <w:i w:val="false"/>
+                <w:b w:val="false"/>
+                <w:u w:val="none"/>
+                <w:sz w:val="22"/>
+                <w:szCs w:val="22"/>
+                <w:color w:val="000000"/>
+              </w:rPr>
             </w:pPr>
-            <w:r>
-              <w:rPr>
-                <w:rFonts w:ascii="Calibri" w:hAnsi="Calibri"/>
-                <w:sz w:val="20"/>
-              </w:rPr>
-              <w:t xml:space="default">The house has vinyl siding. The siding is in fair condition. The siding is in good condition in most areas. There are some spots that have had cracks or breaks in the material.</w:t>
+            <w:r xmlns:w="http://schemas.openxmlformats.org/wordprocessingml/2006/main" xmlns:wp="http://schemas.openxmlformats.org/drawingml/2006/wordprocessingDrawing" xmlns:r="http://schemas.openxmlformats.org/officeDocument/2006/relationships" xmlns:w14="http://schemas.microsoft.com/office/word/2010/wordml">
+              <w:rPr>
+                <w:rFonts w:ascii="Arial" w:hAnsi="Arial" w:eastAsia="Arial" w:cs="Arial"/>
+                <w:i w:val="false"/>
+                <w:b w:val="false"/>
+                <w:u w:val="none"/>
+                <w:sz w:val="22"/>
+                <w:szCs w:val="22"/>
+                <w:color w:val="000000"/>
+              </w:rPr>
+              <w:t xml:space="preserve">The house has vinyl siding. The siding is in fair condition. The siding is in good condition in most areas. There are some spots that have had cracks or breaks in the material.</w:t>
             </w:r>
           </w:p>
         </w:tc>
       </w:tr>
       <w:tr>
         <w:trPr>
-          <w:cantSplit/>
+          <w:trHeight w:val="360" w:hRule="auto"/>
         </w:trPr>
+        body6
         <w:tc>
           <w:tcPr>
             <w:tcBorders>
-              <w:top w:val="single" w:space="0" w:color="D3D3D3"/>
-              <w:bottom w:val="single" w:space="0" w:color="D3D3D3"/>
-              <w:start w:val="single" w:space="0" w:color="D3D3D3"/>
-              <w:end w:val="single" w:space="0" w:color="D3D3D3"/>
+              <w:bottom w:val="single" w:sz="8" w:space="0" w:color="000000"/>
+              <w:top w:val="single" w:sz="8" w:space="0" w:color="000000"/>
+              <w:left w:val="single" w:sz="8" w:space="0" w:color="000000"/>
+              <w:right w:val="single" w:sz="8" w:space="0" w:color="000000"/>
             </w:tcBorders>
+            <w:shd w:val="clear" w:color="auto" w:fill="FFFFFF"/>
+            <w:tcMar>
+              <w:top w:w="0" w:type="dxa"/>
+              <w:bottom w:w="0" w:type="dxa"/>
+              <w:left w:w="0" w:type="dxa"/>
+              <w:right w:w="0" w:type="dxa"/>
+            </w:tcMar>
+            <w:vAlign w:val="top"/>
           </w:tcPr>
           <w:p>
             <w:pPr>
-              <w:spacing w:before="0" w:after="60"/>
-              <w:keepNext/>
-              <w:jc w:val="start"/>
+              <w:jc w:val="left"/>
+              <w:pBdr>
+                <w:bottom w:val="none" w:sz="0" w:space="0" w:color="000000"/>
+                <w:top w:val="none" w:sz="0" w:space="0" w:color="000000"/>
+                <w:left w:val="none" w:sz="0" w:space="0" w:color="000000"/>
+                <w:right w:val="none" w:sz="0" w:space="0" w:color="000000"/>
+              </w:pBdr>
+              <w:spacing w:after="80" w:before="80" w:line="240"/>
+              <w:ind w:left="80" w:right="80" w:firstLine="0" w:firstLineChars="0"/>
+              <w:rPr>
+                <w:rFonts w:ascii="Arial" w:hAnsi="Arial" w:eastAsia="Arial" w:cs="Arial"/>
+                <w:i w:val="false"/>
+                <w:b w:val="false"/>
+                <w:u w:val="none"/>
+                <w:sz w:val="22"/>
+                <w:szCs w:val="22"/>
+                <w:color w:val="000000"/>
+              </w:rPr>
             </w:pPr>
-            <w:r>
-              <w:rPr>
-                <w:rFonts w:ascii="Calibri" w:hAnsi="Calibri"/>
-                <w:sz w:val="20"/>
-              </w:rPr>
-              <w:t xml:space="default">Exterior doors:</w:t>
+            <w:r xmlns:w="http://schemas.openxmlformats.org/wordprocessingml/2006/main" xmlns:wp="http://schemas.openxmlformats.org/drawingml/2006/wordprocessingDrawing" xmlns:r="http://schemas.openxmlformats.org/officeDocument/2006/relationships" xmlns:w14="http://schemas.microsoft.com/office/word/2010/wordml">
+              <w:rPr>
+                <w:rFonts w:ascii="Arial" w:hAnsi="Arial" w:eastAsia="Arial" w:cs="Arial"/>
+                <w:i w:val="false"/>
+                <w:b w:val="false"/>
+                <w:u w:val="none"/>
+                <w:sz w:val="22"/>
+                <w:szCs w:val="22"/>
+                <w:color w:val="000000"/>
+              </w:rPr>
+              <w:t xml:space="preserve">Exterior doors:</w:t>
             </w:r>
           </w:p>
         </w:tc>
         <w:tc>
           <w:tcPr>
             <w:tcBorders>
-              <w:top w:val="single" w:space="0" w:color="D3D3D3"/>
-              <w:bottom w:val="single" w:space="0" w:color="D3D3D3"/>
-              <w:start w:val="single" w:space="0" w:color="D3D3D3"/>
-              <w:end w:val="single" w:space="0" w:color="D3D3D3"/>
+              <w:bottom w:val="single" w:sz="8" w:space="0" w:color="000000"/>
+              <w:top w:val="single" w:sz="8" w:space="0" w:color="000000"/>
+              <w:left w:val="single" w:sz="8" w:space="0" w:color="000000"/>
+              <w:right w:val="single" w:sz="8" w:space="0" w:color="000000"/>
             </w:tcBorders>
+            <w:shd w:val="clear" w:color="auto" w:fill="FFFFFF"/>
+            <w:tcMar>
+              <w:top w:w="0" w:type="dxa"/>
+              <w:bottom w:w="0" w:type="dxa"/>
+              <w:left w:w="0" w:type="dxa"/>
+              <w:right w:w="0" w:type="dxa"/>
+            </w:tcMar>
+            <w:vAlign w:val="top"/>
           </w:tcPr>
           <w:p>
             <w:pPr>
-              <w:spacing w:before="0" w:after="60"/>
-              <w:keepNext/>
-              <w:jc w:val="start"/>
+              <w:jc w:val="left"/>
+              <w:pBdr>
+                <w:bottom w:val="none" w:sz="0" w:space="0" w:color="000000"/>
+                <w:top w:val="none" w:sz="0" w:space="0" w:color="000000"/>
+                <w:left w:val="none" w:sz="0" w:space="0" w:color="000000"/>
+                <w:right w:val="none" w:sz="0" w:space="0" w:color="000000"/>
+              </w:pBdr>
+              <w:spacing w:after="80" w:before="80" w:line="240"/>
+              <w:ind w:left="80" w:right="80" w:firstLine="0" w:firstLineChars="0"/>
+              <w:rPr>
+                <w:rFonts w:ascii="Arial" w:hAnsi="Arial" w:eastAsia="Arial" w:cs="Arial"/>
+                <w:i w:val="false"/>
+                <w:b w:val="false"/>
+                <w:u w:val="none"/>
+                <w:sz w:val="22"/>
+                <w:szCs w:val="22"/>
+                <w:color w:val="000000"/>
+              </w:rPr>
             </w:pPr>
-            <w:r>
-              <w:rPr>
-                <w:rFonts w:ascii="Calibri" w:hAnsi="Calibri"/>
-                <w:sz w:val="20"/>
-              </w:rPr>
-              <w:t xml:space="default">There are 2 hollow fiberglass exterior doors. These are in excellent condition, they have a total area of 37 ft².</w:t>
+            <w:r xmlns:w="http://schemas.openxmlformats.org/wordprocessingml/2006/main" xmlns:wp="http://schemas.openxmlformats.org/drawingml/2006/wordprocessingDrawing" xmlns:r="http://schemas.openxmlformats.org/officeDocument/2006/relationships" xmlns:w14="http://schemas.microsoft.com/office/word/2010/wordml">
+              <w:rPr>
+                <w:rFonts w:ascii="Arial" w:hAnsi="Arial" w:eastAsia="Arial" w:cs="Arial"/>
+                <w:i w:val="false"/>
+                <w:b w:val="false"/>
+                <w:u w:val="none"/>
+                <w:sz w:val="22"/>
+                <w:szCs w:val="22"/>
+                <w:color w:val="000000"/>
+              </w:rPr>
+              <w:t xml:space="preserve">There are 2 hollow fiberglass exterior doors. These are in excellent condition, they have a total area of 37 ft².</w:t>
             </w:r>
           </w:p>
         </w:tc>
       </w:tr>
       <w:tr>
         <w:trPr>
-          <w:cantSplit/>
+          <w:trHeight w:val="360" w:hRule="auto"/>
         </w:trPr>
+        body7
         <w:tc>
           <w:tcPr>
             <w:tcBorders>
-              <w:top w:val="single" w:space="0" w:color="D3D3D3"/>
-              <w:bottom w:val="single" w:space="0" w:color="D3D3D3"/>
-              <w:start w:val="single" w:space="0" w:color="D3D3D3"/>
-              <w:end w:val="single" w:space="0" w:color="D3D3D3"/>
+              <w:bottom w:val="single" w:sz="8" w:space="0" w:color="000000"/>
+              <w:top w:val="single" w:sz="8" w:space="0" w:color="000000"/>
+              <w:left w:val="single" w:sz="8" w:space="0" w:color="000000"/>
+              <w:right w:val="single" w:sz="8" w:space="0" w:color="000000"/>
             </w:tcBorders>
+            <w:shd w:val="clear" w:color="auto" w:fill="FFFFFF"/>
+            <w:tcMar>
+              <w:top w:w="0" w:type="dxa"/>
+              <w:bottom w:w="0" w:type="dxa"/>
+              <w:left w:w="0" w:type="dxa"/>
+              <w:right w:w="0" w:type="dxa"/>
+            </w:tcMar>
+            <w:vAlign w:val="top"/>
           </w:tcPr>
           <w:p>
             <w:pPr>
-              <w:spacing w:before="0" w:after="60"/>
-              <w:keepNext/>
-              <w:jc w:val="start"/>
+              <w:jc w:val="left"/>
+              <w:pBdr>
+                <w:bottom w:val="none" w:sz="0" w:space="0" w:color="000000"/>
+                <w:top w:val="none" w:sz="0" w:space="0" w:color="000000"/>
+                <w:left w:val="none" w:sz="0" w:space="0" w:color="000000"/>
+                <w:right w:val="none" w:sz="0" w:space="0" w:color="000000"/>
+              </w:pBdr>
+              <w:spacing w:after="80" w:before="80" w:line="240"/>
+              <w:ind w:left="80" w:right="80" w:firstLine="0" w:firstLineChars="0"/>
+              <w:rPr>
+                <w:rFonts w:ascii="Arial" w:hAnsi="Arial" w:eastAsia="Arial" w:cs="Arial"/>
+                <w:i w:val="false"/>
+                <w:b w:val="false"/>
+                <w:u w:val="none"/>
+                <w:sz w:val="22"/>
+                <w:szCs w:val="22"/>
+                <w:color w:val="000000"/>
+              </w:rPr>
             </w:pPr>
-            <w:r>
-              <w:rPr>
-                <w:rFonts w:ascii="Calibri" w:hAnsi="Calibri"/>
-                <w:sz w:val="20"/>
-              </w:rPr>
-              <w:t xml:space="default">Exterior windows:</w:t>
+            <w:r xmlns:w="http://schemas.openxmlformats.org/wordprocessingml/2006/main" xmlns:wp="http://schemas.openxmlformats.org/drawingml/2006/wordprocessingDrawing" xmlns:r="http://schemas.openxmlformats.org/officeDocument/2006/relationships" xmlns:w14="http://schemas.microsoft.com/office/word/2010/wordml">
+              <w:rPr>
+                <w:rFonts w:ascii="Arial" w:hAnsi="Arial" w:eastAsia="Arial" w:cs="Arial"/>
+                <w:i w:val="false"/>
+                <w:b w:val="false"/>
+                <w:u w:val="none"/>
+                <w:sz w:val="22"/>
+                <w:szCs w:val="22"/>
+                <w:color w:val="000000"/>
+              </w:rPr>
+              <w:t xml:space="preserve">Exterior windows:</w:t>
             </w:r>
           </w:p>
         </w:tc>
         <w:tc>
           <w:tcPr>
             <w:tcBorders>
-              <w:top w:val="single" w:space="0" w:color="D3D3D3"/>
-              <w:bottom w:val="single" w:space="0" w:color="D3D3D3"/>
-              <w:start w:val="single" w:space="0" w:color="D3D3D3"/>
-              <w:end w:val="single" w:space="0" w:color="D3D3D3"/>
+              <w:bottom w:val="single" w:sz="8" w:space="0" w:color="000000"/>
+              <w:top w:val="single" w:sz="8" w:space="0" w:color="000000"/>
+              <w:left w:val="single" w:sz="8" w:space="0" w:color="000000"/>
+              <w:right w:val="single" w:sz="8" w:space="0" w:color="000000"/>
             </w:tcBorders>
+            <w:shd w:val="clear" w:color="auto" w:fill="FFFFFF"/>
+            <w:tcMar>
+              <w:top w:w="0" w:type="dxa"/>
+              <w:bottom w:w="0" w:type="dxa"/>
+              <w:left w:w="0" w:type="dxa"/>
+              <w:right w:w="0" w:type="dxa"/>
+            </w:tcMar>
+            <w:vAlign w:val="top"/>
           </w:tcPr>
           <w:p>
             <w:pPr>
-              <w:spacing w:before="0" w:after="60"/>
-              <w:keepNext/>
-              <w:jc w:val="start"/>
+              <w:jc w:val="left"/>
+              <w:pBdr>
+                <w:bottom w:val="none" w:sz="0" w:space="0" w:color="000000"/>
+                <w:top w:val="none" w:sz="0" w:space="0" w:color="000000"/>
+                <w:left w:val="none" w:sz="0" w:space="0" w:color="000000"/>
+                <w:right w:val="none" w:sz="0" w:space="0" w:color="000000"/>
+              </w:pBdr>
+              <w:spacing w:after="80" w:before="80" w:line="240"/>
+              <w:ind w:left="80" w:right="80" w:firstLine="0" w:firstLineChars="0"/>
+              <w:rPr>
+                <w:rFonts w:ascii="Arial" w:hAnsi="Arial" w:eastAsia="Arial" w:cs="Arial"/>
+                <w:i w:val="false"/>
+                <w:b w:val="false"/>
+                <w:u w:val="none"/>
+                <w:sz w:val="22"/>
+                <w:szCs w:val="22"/>
+                <w:color w:val="000000"/>
+              </w:rPr>
             </w:pPr>
-            <w:r>
-              <w:rPr>
-                <w:rFonts w:ascii="Calibri" w:hAnsi="Calibri"/>
-                <w:sz w:val="20"/>
-              </w:rPr>
-              <w:t xml:space="default">There are 13 double paned wood windows. These are in fair condition, they have a total area of 148 ft².</w:t>
+            <w:r xmlns:w="http://schemas.openxmlformats.org/wordprocessingml/2006/main" xmlns:wp="http://schemas.openxmlformats.org/drawingml/2006/wordprocessingDrawing" xmlns:r="http://schemas.openxmlformats.org/officeDocument/2006/relationships" xmlns:w14="http://schemas.microsoft.com/office/word/2010/wordml">
+              <w:rPr>
+                <w:rFonts w:ascii="Arial" w:hAnsi="Arial" w:eastAsia="Arial" w:cs="Arial"/>
+                <w:i w:val="false"/>
+                <w:b w:val="false"/>
+                <w:u w:val="none"/>
+                <w:sz w:val="22"/>
+                <w:szCs w:val="22"/>
+                <w:color w:val="000000"/>
+              </w:rPr>
+              <w:t xml:space="preserve">There are 13 double paned wood windows. These are in fair condition, they have a total area of 148 ft².</w:t>
             </w:r>
           </w:p>
         </w:tc>
@@ -3973,226 +4259,452 @@
         <w:t xml:space="preserve">3.3 Interior/Living space</w:t>
       </w:r>
     </w:p>
-    <w:tbl xmlns:w="http://schemas.openxmlformats.org/wordprocessingml/2006/main" xmlns:wp="http://schemas.openxmlformats.org/drawingml/2006/wordprocessingDrawing" xmlns:r="http://schemas.openxmlformats.org/officeDocument/2006/relationships" xmlns:w14="http://schemas.microsoft.com/office/word/2010/wordml">
+    <w:tbl xmlns:w="http://schemas.openxmlformats.org/wordprocessingml/2006/main" xmlns:r="http://schemas.openxmlformats.org/officeDocument/2006/relationships" xmlns:w14="http://schemas.microsoft.com/office/word/2010/wordml" xmlns:wp="http://schemas.openxmlformats.org/drawingml/2006/wordprocessingDrawing" xmlns:a="http://schemas.openxmlformats.org/drawingml/2006/main" xmlns:pic="http://schemas.openxmlformats.org/drawingml/2006/picture">
       <w:tblPr>
-        <w:tblCellMar>
-          <w:top w:w="0" w:type="dxa"/>
-          <w:bottom w:w="0" w:type="dxa"/>
-          <w:start w:w="60" w:type="dxa"/>
-          <w:end w:w="60" w:type="dxa"/>
-        </w:tblCellMar>
-        <w:tblW w:type="auto" w:w="0"/>
-        <w:tblLook w:firstRow="0" w:lastRow="0" w:firstColumn="0" w:lastColumn="0" w:noHBand="0" w:noVBand="0"/>
+        <w:tblLayout w:type="fixed"/>
         <w:jc w:val="center"/>
+        <w:tblLook w:firstRow="1" w:lastRow="0" w:firstColumn="0" w:lastColumn="0" w:noHBand="0" w:noVBand="1"/>
       </w:tblPr>
+      <w:tblGrid>
+        <w:gridCol w:w="2880"/>
+        <w:gridCol w:w="5760"/>
+      </w:tblGrid>
       <w:tr>
         <w:trPr>
-          <w:cantSplit/>
+          <w:trHeight w:val="360" w:hRule="auto"/>
         </w:trPr>
+        body1
         <w:tc>
           <w:tcPr>
             <w:tcBorders>
-              <w:top w:val="single" w:space="0" w:color="D3D3D3"/>
-              <w:bottom w:val="single" w:space="0" w:color="D3D3D3"/>
-              <w:start w:val="single" w:space="0" w:color="D3D3D3"/>
-              <w:end w:val="single" w:space="0" w:color="D3D3D3"/>
+              <w:bottom w:val="single" w:sz="8" w:space="0" w:color="000000"/>
+              <w:top w:val="single" w:sz="8" w:space="0" w:color="000000"/>
+              <w:left w:val="single" w:sz="8" w:space="0" w:color="000000"/>
+              <w:right w:val="single" w:sz="8" w:space="0" w:color="000000"/>
             </w:tcBorders>
+            <w:shd w:val="clear" w:color="auto" w:fill="FFFFFF"/>
+            <w:tcMar>
+              <w:top w:w="0" w:type="dxa"/>
+              <w:bottom w:w="0" w:type="dxa"/>
+              <w:left w:w="0" w:type="dxa"/>
+              <w:right w:w="0" w:type="dxa"/>
+            </w:tcMar>
+            <w:vAlign w:val="top"/>
           </w:tcPr>
           <w:p>
             <w:pPr>
-              <w:spacing w:before="0" w:after="60"/>
-              <w:keepNext/>
-              <w:jc w:val="start"/>
+              <w:jc w:val="left"/>
+              <w:pBdr>
+                <w:bottom w:val="none" w:sz="0" w:space="0" w:color="000000"/>
+                <w:top w:val="none" w:sz="0" w:space="0" w:color="000000"/>
+                <w:left w:val="none" w:sz="0" w:space="0" w:color="000000"/>
+                <w:right w:val="none" w:sz="0" w:space="0" w:color="000000"/>
+              </w:pBdr>
+              <w:spacing w:after="80" w:before="80" w:line="240"/>
+              <w:ind w:left="80" w:right="80" w:firstLine="0" w:firstLineChars="0"/>
+              <w:rPr>
+                <w:rFonts w:ascii="Arial" w:hAnsi="Arial" w:eastAsia="Arial" w:cs="Arial"/>
+                <w:i w:val="false"/>
+                <w:b w:val="false"/>
+                <w:u w:val="none"/>
+                <w:sz w:val="22"/>
+                <w:szCs w:val="22"/>
+                <w:color w:val="000000"/>
+              </w:rPr>
             </w:pPr>
-            <w:r>
-              <w:rPr>
-                <w:rFonts w:ascii="Calibri" w:hAnsi="Calibri"/>
-                <w:sz w:val="20"/>
-              </w:rPr>
-              <w:t xml:space="default">Walls:</w:t>
+            <w:r xmlns:w="http://schemas.openxmlformats.org/wordprocessingml/2006/main" xmlns:wp="http://schemas.openxmlformats.org/drawingml/2006/wordprocessingDrawing" xmlns:r="http://schemas.openxmlformats.org/officeDocument/2006/relationships" xmlns:w14="http://schemas.microsoft.com/office/word/2010/wordml">
+              <w:rPr>
+                <w:rFonts w:ascii="Arial" w:hAnsi="Arial" w:eastAsia="Arial" w:cs="Arial"/>
+                <w:i w:val="false"/>
+                <w:b w:val="false"/>
+                <w:u w:val="none"/>
+                <w:sz w:val="22"/>
+                <w:szCs w:val="22"/>
+                <w:color w:val="000000"/>
+              </w:rPr>
+              <w:t xml:space="preserve">Walls:</w:t>
             </w:r>
           </w:p>
         </w:tc>
         <w:tc>
           <w:tcPr>
             <w:tcBorders>
-              <w:top w:val="single" w:space="0" w:color="D3D3D3"/>
-              <w:bottom w:val="single" w:space="0" w:color="D3D3D3"/>
-              <w:start w:val="single" w:space="0" w:color="D3D3D3"/>
-              <w:end w:val="single" w:space="0" w:color="D3D3D3"/>
+              <w:bottom w:val="single" w:sz="8" w:space="0" w:color="000000"/>
+              <w:top w:val="single" w:sz="8" w:space="0" w:color="000000"/>
+              <w:left w:val="single" w:sz="8" w:space="0" w:color="000000"/>
+              <w:right w:val="single" w:sz="8" w:space="0" w:color="000000"/>
             </w:tcBorders>
+            <w:shd w:val="clear" w:color="auto" w:fill="FFFFFF"/>
+            <w:tcMar>
+              <w:top w:w="0" w:type="dxa"/>
+              <w:bottom w:w="0" w:type="dxa"/>
+              <w:left w:w="0" w:type="dxa"/>
+              <w:right w:w="0" w:type="dxa"/>
+            </w:tcMar>
+            <w:vAlign w:val="top"/>
           </w:tcPr>
           <w:p>
             <w:pPr>
-              <w:spacing w:before="0" w:after="60"/>
-              <w:keepNext/>
-              <w:jc w:val="start"/>
+              <w:jc w:val="left"/>
+              <w:pBdr>
+                <w:bottom w:val="none" w:sz="0" w:space="0" w:color="000000"/>
+                <w:top w:val="none" w:sz="0" w:space="0" w:color="000000"/>
+                <w:left w:val="none" w:sz="0" w:space="0" w:color="000000"/>
+                <w:right w:val="none" w:sz="0" w:space="0" w:color="000000"/>
+              </w:pBdr>
+              <w:spacing w:after="80" w:before="80" w:line="240"/>
+              <w:ind w:left="80" w:right="80" w:firstLine="0" w:firstLineChars="0"/>
+              <w:rPr>
+                <w:rFonts w:ascii="Arial" w:hAnsi="Arial" w:eastAsia="Arial" w:cs="Arial"/>
+                <w:i w:val="false"/>
+                <w:b w:val="false"/>
+                <w:u w:val="none"/>
+                <w:sz w:val="22"/>
+                <w:szCs w:val="22"/>
+                <w:color w:val="000000"/>
+              </w:rPr>
             </w:pPr>
-            <w:r>
-              <w:rPr>
-                <w:rFonts w:ascii="Calibri" w:hAnsi="Calibri"/>
-                <w:sz w:val="20"/>
-              </w:rPr>
-              <w:t xml:space="default">The house has platform framing, which means that wall cavities do not extend the full height of the building, but are instead separated by floors. The exterior walls are insulated with Batts of Fiberglass insulation. This insulation is 4 inches thick and in fair condition. This gives the exterior walls an R-value of around CALCULATE. A material’s R-value tells us how good it is at stopping heat flow, the bigger the number, the better. For comparison, current Maine building code requires an R-value of at least R-13 with additional continuous insulation of R-10 for exterior walls or R-20 with additional continuous insulation of R-5. The insulation in the walls was installed during the construction of the home.</w:t>
+            <w:r xmlns:w="http://schemas.openxmlformats.org/wordprocessingml/2006/main" xmlns:wp="http://schemas.openxmlformats.org/drawingml/2006/wordprocessingDrawing" xmlns:r="http://schemas.openxmlformats.org/officeDocument/2006/relationships" xmlns:w14="http://schemas.microsoft.com/office/word/2010/wordml">
+              <w:rPr>
+                <w:rFonts w:ascii="Arial" w:hAnsi="Arial" w:eastAsia="Arial" w:cs="Arial"/>
+                <w:i w:val="false"/>
+                <w:b w:val="false"/>
+                <w:u w:val="none"/>
+                <w:sz w:val="22"/>
+                <w:szCs w:val="22"/>
+                <w:color w:val="000000"/>
+              </w:rPr>
+              <w:t xml:space="preserve">The house has platform framing, which means that wall cavities do not extend the full height of the building, but are instead separated by floors. The exterior walls are insulated with Batts of Fiberglass insulation. This insulation is 4 inches thick and in fair condition. This gives the exterior walls an R-value of around CALCULATE. A material’s R-value tells us how good it is at stopping heat flow, the bigger the number, the better. For comparison, current Maine building code requires an R-value of at least R-13 with additional continuous insulation of R-10 for exterior walls or R-20 with additional continuous insulation of R-5. The insulation in the walls was installed during the construction of the home.</w:t>
             </w:r>
           </w:p>
         </w:tc>
       </w:tr>
       <w:tr>
         <w:trPr>
-          <w:cantSplit/>
+          <w:trHeight w:val="360" w:hRule="auto"/>
         </w:trPr>
+        body2
         <w:tc>
           <w:tcPr>
             <w:tcBorders>
-              <w:top w:val="single" w:space="0" w:color="D3D3D3"/>
-              <w:bottom w:val="single" w:space="0" w:color="D3D3D3"/>
-              <w:start w:val="single" w:space="0" w:color="D3D3D3"/>
-              <w:end w:val="single" w:space="0" w:color="D3D3D3"/>
+              <w:bottom w:val="single" w:sz="8" w:space="0" w:color="000000"/>
+              <w:top w:val="single" w:sz="8" w:space="0" w:color="000000"/>
+              <w:left w:val="single" w:sz="8" w:space="0" w:color="000000"/>
+              <w:right w:val="single" w:sz="8" w:space="0" w:color="000000"/>
             </w:tcBorders>
+            <w:shd w:val="clear" w:color="auto" w:fill="FFFFFF"/>
+            <w:tcMar>
+              <w:top w:w="0" w:type="dxa"/>
+              <w:bottom w:w="0" w:type="dxa"/>
+              <w:left w:w="0" w:type="dxa"/>
+              <w:right w:w="0" w:type="dxa"/>
+            </w:tcMar>
+            <w:vAlign w:val="top"/>
           </w:tcPr>
           <w:p>
             <w:pPr>
-              <w:spacing w:before="0" w:after="60"/>
-              <w:keepNext/>
-              <w:jc w:val="start"/>
+              <w:jc w:val="left"/>
+              <w:pBdr>
+                <w:bottom w:val="none" w:sz="0" w:space="0" w:color="000000"/>
+                <w:top w:val="none" w:sz="0" w:space="0" w:color="000000"/>
+                <w:left w:val="none" w:sz="0" w:space="0" w:color="000000"/>
+                <w:right w:val="none" w:sz="0" w:space="0" w:color="000000"/>
+              </w:pBdr>
+              <w:spacing w:after="80" w:before="80" w:line="240"/>
+              <w:ind w:left="80" w:right="80" w:firstLine="0" w:firstLineChars="0"/>
+              <w:rPr>
+                <w:rFonts w:ascii="Arial" w:hAnsi="Arial" w:eastAsia="Arial" w:cs="Arial"/>
+                <w:i w:val="false"/>
+                <w:b w:val="false"/>
+                <w:u w:val="none"/>
+                <w:sz w:val="22"/>
+                <w:szCs w:val="22"/>
+                <w:color w:val="000000"/>
+              </w:rPr>
             </w:pPr>
-            <w:r>
-              <w:rPr>
-                <w:rFonts w:ascii="Calibri" w:hAnsi="Calibri"/>
-                <w:sz w:val="20"/>
-              </w:rPr>
-              <w:t xml:space="default">Living room:</w:t>
+            <w:r xmlns:w="http://schemas.openxmlformats.org/wordprocessingml/2006/main" xmlns:wp="http://schemas.openxmlformats.org/drawingml/2006/wordprocessingDrawing" xmlns:r="http://schemas.openxmlformats.org/officeDocument/2006/relationships" xmlns:w14="http://schemas.microsoft.com/office/word/2010/wordml">
+              <w:rPr>
+                <w:rFonts w:ascii="Arial" w:hAnsi="Arial" w:eastAsia="Arial" w:cs="Arial"/>
+                <w:i w:val="false"/>
+                <w:b w:val="false"/>
+                <w:u w:val="none"/>
+                <w:sz w:val="22"/>
+                <w:szCs w:val="22"/>
+                <w:color w:val="000000"/>
+              </w:rPr>
+              <w:t xml:space="preserve">Living room:</w:t>
             </w:r>
           </w:p>
         </w:tc>
         <w:tc>
           <w:tcPr>
             <w:tcBorders>
-              <w:top w:val="single" w:space="0" w:color="D3D3D3"/>
-              <w:bottom w:val="single" w:space="0" w:color="D3D3D3"/>
-              <w:start w:val="single" w:space="0" w:color="D3D3D3"/>
-              <w:end w:val="single" w:space="0" w:color="D3D3D3"/>
+              <w:bottom w:val="single" w:sz="8" w:space="0" w:color="000000"/>
+              <w:top w:val="single" w:sz="8" w:space="0" w:color="000000"/>
+              <w:left w:val="single" w:sz="8" w:space="0" w:color="000000"/>
+              <w:right w:val="single" w:sz="8" w:space="0" w:color="000000"/>
             </w:tcBorders>
+            <w:shd w:val="clear" w:color="auto" w:fill="FFFFFF"/>
+            <w:tcMar>
+              <w:top w:w="0" w:type="dxa"/>
+              <w:bottom w:w="0" w:type="dxa"/>
+              <w:left w:w="0" w:type="dxa"/>
+              <w:right w:w="0" w:type="dxa"/>
+            </w:tcMar>
+            <w:vAlign w:val="top"/>
           </w:tcPr>
           <w:p>
             <w:pPr>
-              <w:spacing w:before="0" w:after="60"/>
-              <w:keepNext/>
-              <w:jc w:val="start"/>
+              <w:jc w:val="left"/>
+              <w:pBdr>
+                <w:bottom w:val="none" w:sz="0" w:space="0" w:color="000000"/>
+                <w:top w:val="none" w:sz="0" w:space="0" w:color="000000"/>
+                <w:left w:val="none" w:sz="0" w:space="0" w:color="000000"/>
+                <w:right w:val="none" w:sz="0" w:space="0" w:color="000000"/>
+              </w:pBdr>
+              <w:spacing w:after="80" w:before="80" w:line="240"/>
+              <w:ind w:left="80" w:right="80" w:firstLine="0" w:firstLineChars="0"/>
+              <w:rPr>
+                <w:rFonts w:ascii="Arial" w:hAnsi="Arial" w:eastAsia="Arial" w:cs="Arial"/>
+                <w:i w:val="false"/>
+                <w:b w:val="false"/>
+                <w:u w:val="none"/>
+                <w:sz w:val="22"/>
+                <w:szCs w:val="22"/>
+                <w:color w:val="000000"/>
+              </w:rPr>
             </w:pPr>
-            <w:r>
-              <w:rPr>
-                <w:rFonts w:ascii="Calibri" w:hAnsi="Calibri"/>
-                <w:sz w:val="20"/>
-              </w:rPr>
-              <w:t xml:space="default">NA</w:t>
+            <w:r xmlns:w="http://schemas.openxmlformats.org/wordprocessingml/2006/main" xmlns:wp="http://schemas.openxmlformats.org/drawingml/2006/wordprocessingDrawing" xmlns:r="http://schemas.openxmlformats.org/officeDocument/2006/relationships" xmlns:w14="http://schemas.microsoft.com/office/word/2010/wordml">
+              <w:rPr>
+                <w:rFonts w:ascii="Arial" w:hAnsi="Arial" w:eastAsia="Arial" w:cs="Arial"/>
+                <w:i w:val="false"/>
+                <w:b w:val="false"/>
+                <w:u w:val="none"/>
+                <w:sz w:val="22"/>
+                <w:szCs w:val="22"/>
+                <w:color w:val="000000"/>
+              </w:rPr>
+              <w:t xml:space="preserve"/>
             </w:r>
           </w:p>
         </w:tc>
       </w:tr>
       <w:tr>
         <w:trPr>
-          <w:cantSplit/>
+          <w:trHeight w:val="360" w:hRule="auto"/>
         </w:trPr>
+        body3
         <w:tc>
           <w:tcPr>
             <w:tcBorders>
-              <w:top w:val="single" w:space="0" w:color="D3D3D3"/>
-              <w:bottom w:val="single" w:space="0" w:color="D3D3D3"/>
-              <w:start w:val="single" w:space="0" w:color="D3D3D3"/>
-              <w:end w:val="single" w:space="0" w:color="D3D3D3"/>
+              <w:bottom w:val="single" w:sz="8" w:space="0" w:color="000000"/>
+              <w:top w:val="single" w:sz="8" w:space="0" w:color="000000"/>
+              <w:left w:val="single" w:sz="8" w:space="0" w:color="000000"/>
+              <w:right w:val="single" w:sz="8" w:space="0" w:color="000000"/>
             </w:tcBorders>
+            <w:shd w:val="clear" w:color="auto" w:fill="FFFFFF"/>
+            <w:tcMar>
+              <w:top w:w="0" w:type="dxa"/>
+              <w:bottom w:w="0" w:type="dxa"/>
+              <w:left w:w="0" w:type="dxa"/>
+              <w:right w:w="0" w:type="dxa"/>
+            </w:tcMar>
+            <w:vAlign w:val="top"/>
           </w:tcPr>
           <w:p>
             <w:pPr>
-              <w:spacing w:before="0" w:after="60"/>
-              <w:keepNext/>
-              <w:jc w:val="start"/>
+              <w:jc w:val="left"/>
+              <w:pBdr>
+                <w:bottom w:val="none" w:sz="0" w:space="0" w:color="000000"/>
+                <w:top w:val="none" w:sz="0" w:space="0" w:color="000000"/>
+                <w:left w:val="none" w:sz="0" w:space="0" w:color="000000"/>
+                <w:right w:val="none" w:sz="0" w:space="0" w:color="000000"/>
+              </w:pBdr>
+              <w:spacing w:after="80" w:before="80" w:line="240"/>
+              <w:ind w:left="80" w:right="80" w:firstLine="0" w:firstLineChars="0"/>
+              <w:rPr>
+                <w:rFonts w:ascii="Arial" w:hAnsi="Arial" w:eastAsia="Arial" w:cs="Arial"/>
+                <w:i w:val="false"/>
+                <w:b w:val="false"/>
+                <w:u w:val="none"/>
+                <w:sz w:val="22"/>
+                <w:szCs w:val="22"/>
+                <w:color w:val="000000"/>
+              </w:rPr>
             </w:pPr>
-            <w:r>
-              <w:rPr>
-                <w:rFonts w:ascii="Calibri" w:hAnsi="Calibri"/>
-                <w:sz w:val="20"/>
-              </w:rPr>
-              <w:t xml:space="default">Bathroom(s):</w:t>
+            <w:r xmlns:w="http://schemas.openxmlformats.org/wordprocessingml/2006/main" xmlns:wp="http://schemas.openxmlformats.org/drawingml/2006/wordprocessingDrawing" xmlns:r="http://schemas.openxmlformats.org/officeDocument/2006/relationships" xmlns:w14="http://schemas.microsoft.com/office/word/2010/wordml">
+              <w:rPr>
+                <w:rFonts w:ascii="Arial" w:hAnsi="Arial" w:eastAsia="Arial" w:cs="Arial"/>
+                <w:i w:val="false"/>
+                <w:b w:val="false"/>
+                <w:u w:val="none"/>
+                <w:sz w:val="22"/>
+                <w:szCs w:val="22"/>
+                <w:color w:val="000000"/>
+              </w:rPr>
+              <w:t xml:space="preserve">Bathroom(s):</w:t>
             </w:r>
           </w:p>
         </w:tc>
         <w:tc>
           <w:tcPr>
             <w:tcBorders>
-              <w:top w:val="single" w:space="0" w:color="D3D3D3"/>
-              <w:bottom w:val="single" w:space="0" w:color="D3D3D3"/>
-              <w:start w:val="single" w:space="0" w:color="D3D3D3"/>
-              <w:end w:val="single" w:space="0" w:color="D3D3D3"/>
+              <w:bottom w:val="single" w:sz="8" w:space="0" w:color="000000"/>
+              <w:top w:val="single" w:sz="8" w:space="0" w:color="000000"/>
+              <w:left w:val="single" w:sz="8" w:space="0" w:color="000000"/>
+              <w:right w:val="single" w:sz="8" w:space="0" w:color="000000"/>
             </w:tcBorders>
+            <w:shd w:val="clear" w:color="auto" w:fill="FFFFFF"/>
+            <w:tcMar>
+              <w:top w:w="0" w:type="dxa"/>
+              <w:bottom w:w="0" w:type="dxa"/>
+              <w:left w:w="0" w:type="dxa"/>
+              <w:right w:w="0" w:type="dxa"/>
+            </w:tcMar>
+            <w:vAlign w:val="top"/>
           </w:tcPr>
           <w:p>
             <w:pPr>
-              <w:spacing w:before="0" w:after="60"/>
-              <w:keepNext/>
-              <w:jc w:val="start"/>
+              <w:jc w:val="left"/>
+              <w:pBdr>
+                <w:bottom w:val="none" w:sz="0" w:space="0" w:color="000000"/>
+                <w:top w:val="none" w:sz="0" w:space="0" w:color="000000"/>
+                <w:left w:val="none" w:sz="0" w:space="0" w:color="000000"/>
+                <w:right w:val="none" w:sz="0" w:space="0" w:color="000000"/>
+              </w:pBdr>
+              <w:spacing w:after="80" w:before="80" w:line="240"/>
+              <w:ind w:left="80" w:right="80" w:firstLine="0" w:firstLineChars="0"/>
+              <w:rPr>
+                <w:rFonts w:ascii="Arial" w:hAnsi="Arial" w:eastAsia="Arial" w:cs="Arial"/>
+                <w:i w:val="false"/>
+                <w:b w:val="false"/>
+                <w:u w:val="none"/>
+                <w:sz w:val="22"/>
+                <w:szCs w:val="22"/>
+                <w:color w:val="000000"/>
+              </w:rPr>
             </w:pPr>
-            <w:r>
-              <w:rPr>
-                <w:rFonts w:ascii="Calibri" w:hAnsi="Calibri"/>
-                <w:sz w:val="20"/>
-              </w:rPr>
-              <w:t xml:space="default">NA</w:t>
+            <w:r xmlns:w="http://schemas.openxmlformats.org/wordprocessingml/2006/main" xmlns:wp="http://schemas.openxmlformats.org/drawingml/2006/wordprocessingDrawing" xmlns:r="http://schemas.openxmlformats.org/officeDocument/2006/relationships" xmlns:w14="http://schemas.microsoft.com/office/word/2010/wordml">
+              <w:rPr>
+                <w:rFonts w:ascii="Arial" w:hAnsi="Arial" w:eastAsia="Arial" w:cs="Arial"/>
+                <w:i w:val="false"/>
+                <w:b w:val="false"/>
+                <w:u w:val="none"/>
+                <w:sz w:val="22"/>
+                <w:szCs w:val="22"/>
+                <w:color w:val="000000"/>
+              </w:rPr>
+              <w:t xml:space="preserve"/>
             </w:r>
           </w:p>
         </w:tc>
       </w:tr>
       <w:tr>
         <w:trPr>
-          <w:cantSplit/>
+          <w:trHeight w:val="360" w:hRule="auto"/>
         </w:trPr>
+        body4
         <w:tc>
           <w:tcPr>
             <w:tcBorders>
-              <w:top w:val="single" w:space="0" w:color="D3D3D3"/>
-              <w:bottom w:val="single" w:space="0" w:color="D3D3D3"/>
-              <w:start w:val="single" w:space="0" w:color="D3D3D3"/>
-              <w:end w:val="single" w:space="0" w:color="D3D3D3"/>
+              <w:bottom w:val="single" w:sz="8" w:space="0" w:color="000000"/>
+              <w:top w:val="single" w:sz="8" w:space="0" w:color="000000"/>
+              <w:left w:val="single" w:sz="8" w:space="0" w:color="000000"/>
+              <w:right w:val="single" w:sz="8" w:space="0" w:color="000000"/>
             </w:tcBorders>
+            <w:shd w:val="clear" w:color="auto" w:fill="FFFFFF"/>
+            <w:tcMar>
+              <w:top w:w="0" w:type="dxa"/>
+              <w:bottom w:w="0" w:type="dxa"/>
+              <w:left w:w="0" w:type="dxa"/>
+              <w:right w:w="0" w:type="dxa"/>
+            </w:tcMar>
+            <w:vAlign w:val="top"/>
           </w:tcPr>
           <w:p>
             <w:pPr>
-              <w:spacing w:before="0" w:after="60"/>
-              <w:keepNext/>
-              <w:jc w:val="start"/>
+              <w:jc w:val="left"/>
+              <w:pBdr>
+                <w:bottom w:val="none" w:sz="0" w:space="0" w:color="000000"/>
+                <w:top w:val="none" w:sz="0" w:space="0" w:color="000000"/>
+                <w:left w:val="none" w:sz="0" w:space="0" w:color="000000"/>
+                <w:right w:val="none" w:sz="0" w:space="0" w:color="000000"/>
+              </w:pBdr>
+              <w:spacing w:after="80" w:before="80" w:line="240"/>
+              <w:ind w:left="80" w:right="80" w:firstLine="0" w:firstLineChars="0"/>
+              <w:rPr>
+                <w:rFonts w:ascii="Arial" w:hAnsi="Arial" w:eastAsia="Arial" w:cs="Arial"/>
+                <w:i w:val="false"/>
+                <w:b w:val="false"/>
+                <w:u w:val="none"/>
+                <w:sz w:val="22"/>
+                <w:szCs w:val="22"/>
+                <w:color w:val="000000"/>
+              </w:rPr>
             </w:pPr>
-            <w:r>
-              <w:rPr>
-                <w:rFonts w:ascii="Calibri" w:hAnsi="Calibri"/>
-                <w:sz w:val="20"/>
-              </w:rPr>
-              <w:t xml:space="default">Kitchen:</w:t>
+            <w:r xmlns:w="http://schemas.openxmlformats.org/wordprocessingml/2006/main" xmlns:wp="http://schemas.openxmlformats.org/drawingml/2006/wordprocessingDrawing" xmlns:r="http://schemas.openxmlformats.org/officeDocument/2006/relationships" xmlns:w14="http://schemas.microsoft.com/office/word/2010/wordml">
+              <w:rPr>
+                <w:rFonts w:ascii="Arial" w:hAnsi="Arial" w:eastAsia="Arial" w:cs="Arial"/>
+                <w:i w:val="false"/>
+                <w:b w:val="false"/>
+                <w:u w:val="none"/>
+                <w:sz w:val="22"/>
+                <w:szCs w:val="22"/>
+                <w:color w:val="000000"/>
+              </w:rPr>
+              <w:t xml:space="preserve">Kitchen:</w:t>
             </w:r>
           </w:p>
         </w:tc>
         <w:tc>
           <w:tcPr>
             <w:tcBorders>
-              <w:top w:val="single" w:space="0" w:color="D3D3D3"/>
-              <w:bottom w:val="single" w:space="0" w:color="D3D3D3"/>
-              <w:start w:val="single" w:space="0" w:color="D3D3D3"/>
-              <w:end w:val="single" w:space="0" w:color="D3D3D3"/>
+              <w:bottom w:val="single" w:sz="8" w:space="0" w:color="000000"/>
+              <w:top w:val="single" w:sz="8" w:space="0" w:color="000000"/>
+              <w:left w:val="single" w:sz="8" w:space="0" w:color="000000"/>
+              <w:right w:val="single" w:sz="8" w:space="0" w:color="000000"/>
             </w:tcBorders>
+            <w:shd w:val="clear" w:color="auto" w:fill="FFFFFF"/>
+            <w:tcMar>
+              <w:top w:w="0" w:type="dxa"/>
+              <w:bottom w:w="0" w:type="dxa"/>
+              <w:left w:w="0" w:type="dxa"/>
+              <w:right w:w="0" w:type="dxa"/>
+            </w:tcMar>
+            <w:vAlign w:val="top"/>
           </w:tcPr>
           <w:p>
             <w:pPr>
-              <w:spacing w:before="0" w:after="60"/>
-              <w:keepNext/>
-              <w:jc w:val="start"/>
+              <w:jc w:val="left"/>
+              <w:pBdr>
+                <w:bottom w:val="none" w:sz="0" w:space="0" w:color="000000"/>
+                <w:top w:val="none" w:sz="0" w:space="0" w:color="000000"/>
+                <w:left w:val="none" w:sz="0" w:space="0" w:color="000000"/>
+                <w:right w:val="none" w:sz="0" w:space="0" w:color="000000"/>
+              </w:pBdr>
+              <w:spacing w:after="80" w:before="80" w:line="240"/>
+              <w:ind w:left="80" w:right="80" w:firstLine="0" w:firstLineChars="0"/>
+              <w:rPr>
+                <w:rFonts w:ascii="Arial" w:hAnsi="Arial" w:eastAsia="Arial" w:cs="Arial"/>
+                <w:i w:val="false"/>
+                <w:b w:val="false"/>
+                <w:u w:val="none"/>
+                <w:sz w:val="22"/>
+                <w:szCs w:val="22"/>
+                <w:color w:val="000000"/>
+              </w:rPr>
             </w:pPr>
-            <w:r>
-              <w:rPr>
-                <w:rFonts w:ascii="Calibri" w:hAnsi="Calibri"/>
-                <w:sz w:val="20"/>
-              </w:rPr>
-              <w:t xml:space="default">During the audit we measured the electricity consumption of the Fridge and Freezer Combo. It used NA kWh in NA hours. We thus estimate that it is costing you around $CALCULATE a month to run. This is **comparable to / more expensive than** newer, efficient models. The Chest Freezer used NA kWh in NA hours. We thus estimate that it is costing you around $CALCULATE a month to run. This is **comparable to / more expensive than** newer, efficient models. The dishwasher is on the older side and is too loud for the homeowner's liking.</w:t>
+            <w:r xmlns:w="http://schemas.openxmlformats.org/wordprocessingml/2006/main" xmlns:wp="http://schemas.openxmlformats.org/drawingml/2006/wordprocessingDrawing" xmlns:r="http://schemas.openxmlformats.org/officeDocument/2006/relationships" xmlns:w14="http://schemas.microsoft.com/office/word/2010/wordml">
+              <w:rPr>
+                <w:rFonts w:ascii="Arial" w:hAnsi="Arial" w:eastAsia="Arial" w:cs="Arial"/>
+                <w:i w:val="false"/>
+                <w:b w:val="false"/>
+                <w:u w:val="none"/>
+                <w:sz w:val="22"/>
+                <w:szCs w:val="22"/>
+                <w:color w:val="000000"/>
+              </w:rPr>
+              <w:t xml:space="preserve">During the audit we measured the electricity consumption of the Fridge and Freezer Combo. It used NA kWh in NA hours. We thus estimate that it is costing you around $CALCULATE a month to run. This is **comparable to / more expensive than** newer, efficient models. The Chest Freezer used NA kWh in NA hours.  We thus estimate that it is costing you around $CALCULATE a month to run. This is **comparable to / more expensive than** newer, efficient models. The dishwasher is on the older side and is too loud for the homeowner's liking.</w:t>
             </w:r>
           </w:p>
         </w:tc>
@@ -4240,322 +4752,661 @@
         <w:t xml:space="preserve">Air leaks are a big source of heat gain in warm weather and heat loss in cold weather. They also allow moisture to get into the home. Below are some numbers, pictures, and descriptions explaining what we found.</w:t>
       </w:r>
     </w:p>
-    <w:tbl xmlns:w="http://schemas.openxmlformats.org/wordprocessingml/2006/main" xmlns:wp="http://schemas.openxmlformats.org/drawingml/2006/wordprocessingDrawing" xmlns:r="http://schemas.openxmlformats.org/officeDocument/2006/relationships" xmlns:w14="http://schemas.microsoft.com/office/word/2010/wordml">
+    <w:tbl xmlns:w="http://schemas.openxmlformats.org/wordprocessingml/2006/main" xmlns:r="http://schemas.openxmlformats.org/officeDocument/2006/relationships" xmlns:w14="http://schemas.microsoft.com/office/word/2010/wordml" xmlns:wp="http://schemas.openxmlformats.org/drawingml/2006/wordprocessingDrawing" xmlns:a="http://schemas.openxmlformats.org/drawingml/2006/main" xmlns:pic="http://schemas.openxmlformats.org/drawingml/2006/picture">
       <w:tblPr>
-        <w:tblCellMar>
-          <w:top w:w="0" w:type="dxa"/>
-          <w:bottom w:w="0" w:type="dxa"/>
-          <w:start w:w="60" w:type="dxa"/>
-          <w:end w:w="60" w:type="dxa"/>
-        </w:tblCellMar>
-        <w:tblW w:type="auto" w:w="0"/>
-        <w:tblLook w:firstRow="0" w:lastRow="0" w:firstColumn="0" w:lastColumn="0" w:noHBand="0" w:noVBand="0"/>
+        <w:tblLayout w:type="fixed"/>
         <w:jc w:val="center"/>
+        <w:tblLook w:firstRow="1" w:lastRow="0" w:firstColumn="0" w:lastColumn="0" w:noHBand="0" w:noVBand="1"/>
       </w:tblPr>
+      <w:tblGrid>
+        <w:gridCol w:w="1440"/>
+        <w:gridCol w:w="1440"/>
+        <w:gridCol w:w="5760"/>
+      </w:tblGrid>
       <w:tr>
         <w:trPr>
-          <w:cantSplit/>
+          <w:trHeight w:val="360" w:hRule="auto"/>
         </w:trPr>
+        body1
         <w:tc>
           <w:tcPr>
             <w:tcBorders>
-              <w:top w:val="single" w:space="0" w:color="D3D3D3"/>
-              <w:bottom w:val="single" w:space="0" w:color="D3D3D3"/>
-              <w:start w:val="single" w:space="0" w:color="D3D3D3"/>
-              <w:end w:val="single" w:space="0" w:color="D3D3D3"/>
+              <w:bottom w:val="single" w:sz="8" w:space="0" w:color="000000"/>
+              <w:top w:val="single" w:sz="8" w:space="0" w:color="000000"/>
+              <w:left w:val="single" w:sz="8" w:space="0" w:color="000000"/>
+              <w:right w:val="single" w:sz="8" w:space="0" w:color="000000"/>
             </w:tcBorders>
+            <w:shd w:val="clear" w:color="auto" w:fill="FFFFFF"/>
+            <w:tcMar>
+              <w:top w:w="0" w:type="dxa"/>
+              <w:bottom w:w="0" w:type="dxa"/>
+              <w:left w:w="0" w:type="dxa"/>
+              <w:right w:w="0" w:type="dxa"/>
+            </w:tcMar>
+            <w:vAlign w:val="top"/>
           </w:tcPr>
           <w:p>
             <w:pPr>
-              <w:spacing w:before="0" w:after="60"/>
-              <w:keepNext/>
-              <w:jc w:val="start"/>
+              <w:jc w:val="left"/>
+              <w:pBdr>
+                <w:bottom w:val="none" w:sz="0" w:space="0" w:color="000000"/>
+                <w:top w:val="none" w:sz="0" w:space="0" w:color="000000"/>
+                <w:left w:val="none" w:sz="0" w:space="0" w:color="000000"/>
+                <w:right w:val="none" w:sz="0" w:space="0" w:color="000000"/>
+              </w:pBdr>
+              <w:spacing w:after="80" w:before="80" w:line="240"/>
+              <w:ind w:left="80" w:right="80" w:firstLine="0" w:firstLineChars="0"/>
+              <w:rPr>
+                <w:rFonts w:ascii="Arial" w:hAnsi="Arial" w:eastAsia="Arial" w:cs="Arial"/>
+                <w:i w:val="false"/>
+                <w:b w:val="false"/>
+                <w:u w:val="none"/>
+                <w:sz w:val="22"/>
+                <w:szCs w:val="22"/>
+                <w:color w:val="000000"/>
+              </w:rPr>
             </w:pPr>
-            <w:r>
-              <w:rPr>
-                <w:rFonts w:ascii="Calibri" w:hAnsi="Calibri"/>
-                <w:sz w:val="20"/>
-              </w:rPr>
-              <w:t xml:space="default">CFM50:</w:t>
+            <w:r xmlns:w="http://schemas.openxmlformats.org/wordprocessingml/2006/main" xmlns:wp="http://schemas.openxmlformats.org/drawingml/2006/wordprocessingDrawing" xmlns:r="http://schemas.openxmlformats.org/officeDocument/2006/relationships" xmlns:w14="http://schemas.microsoft.com/office/word/2010/wordml">
+              <w:rPr>
+                <w:rFonts w:ascii="Arial" w:hAnsi="Arial" w:eastAsia="Arial" w:cs="Arial"/>
+                <w:i w:val="false"/>
+                <w:b w:val="false"/>
+                <w:u w:val="none"/>
+                <w:sz w:val="22"/>
+                <w:szCs w:val="22"/>
+                <w:color w:val="000000"/>
+              </w:rPr>
+              <w:t xml:space="preserve">CFM50:</w:t>
             </w:r>
           </w:p>
         </w:tc>
         <w:tc>
           <w:tcPr>
             <w:tcBorders>
-              <w:top w:val="single" w:space="0" w:color="D3D3D3"/>
-              <w:bottom w:val="single" w:space="0" w:color="D3D3D3"/>
-              <w:start w:val="single" w:space="0" w:color="D3D3D3"/>
-              <w:end w:val="single" w:space="0" w:color="D3D3D3"/>
+              <w:bottom w:val="single" w:sz="8" w:space="0" w:color="000000"/>
+              <w:top w:val="single" w:sz="8" w:space="0" w:color="000000"/>
+              <w:left w:val="single" w:sz="8" w:space="0" w:color="000000"/>
+              <w:right w:val="single" w:sz="8" w:space="0" w:color="000000"/>
             </w:tcBorders>
+            <w:shd w:val="clear" w:color="auto" w:fill="FFFFFF"/>
+            <w:tcMar>
+              <w:top w:w="0" w:type="dxa"/>
+              <w:bottom w:w="0" w:type="dxa"/>
+              <w:left w:w="0" w:type="dxa"/>
+              <w:right w:w="0" w:type="dxa"/>
+            </w:tcMar>
+            <w:vAlign w:val="top"/>
           </w:tcPr>
           <w:p>
             <w:pPr>
-              <w:spacing w:before="0" w:after="60"/>
-              <w:keepNext/>
-              <w:jc w:val="start"/>
+              <w:jc w:val="left"/>
+              <w:pBdr>
+                <w:bottom w:val="none" w:sz="0" w:space="0" w:color="000000"/>
+                <w:top w:val="none" w:sz="0" w:space="0" w:color="000000"/>
+                <w:left w:val="none" w:sz="0" w:space="0" w:color="000000"/>
+                <w:right w:val="none" w:sz="0" w:space="0" w:color="000000"/>
+              </w:pBdr>
+              <w:spacing w:after="80" w:before="80" w:line="240"/>
+              <w:ind w:left="80" w:right="80" w:firstLine="0" w:firstLineChars="0"/>
+              <w:rPr>
+                <w:rFonts w:ascii="Arial" w:hAnsi="Arial" w:eastAsia="Arial" w:cs="Arial"/>
+                <w:i w:val="false"/>
+                <w:b w:val="false"/>
+                <w:u w:val="none"/>
+                <w:sz w:val="22"/>
+                <w:szCs w:val="22"/>
+                <w:color w:val="000000"/>
+              </w:rPr>
             </w:pPr>
-            <w:r>
-              <w:rPr>
-                <w:rFonts w:ascii="Calibri" w:hAnsi="Calibri"/>
-                <w:sz w:val="20"/>
-              </w:rPr>
-              <w:t xml:space="default">1250</w:t>
+            <w:r xmlns:w="http://schemas.openxmlformats.org/wordprocessingml/2006/main" xmlns:wp="http://schemas.openxmlformats.org/drawingml/2006/wordprocessingDrawing" xmlns:r="http://schemas.openxmlformats.org/officeDocument/2006/relationships" xmlns:w14="http://schemas.microsoft.com/office/word/2010/wordml">
+              <w:rPr>
+                <w:rFonts w:ascii="Arial" w:hAnsi="Arial" w:eastAsia="Arial" w:cs="Arial"/>
+                <w:i w:val="false"/>
+                <w:b w:val="false"/>
+                <w:u w:val="none"/>
+                <w:sz w:val="22"/>
+                <w:szCs w:val="22"/>
+                <w:color w:val="000000"/>
+              </w:rPr>
+              <w:t xml:space="preserve">1250</w:t>
             </w:r>
           </w:p>
         </w:tc>
         <w:tc>
           <w:tcPr>
             <w:tcBorders>
-              <w:top w:val="single" w:space="0" w:color="D3D3D3"/>
-              <w:bottom w:val="single" w:space="0" w:color="D3D3D3"/>
-              <w:start w:val="single" w:space="0" w:color="D3D3D3"/>
-              <w:end w:val="single" w:space="0" w:color="D3D3D3"/>
+              <w:bottom w:val="single" w:sz="8" w:space="0" w:color="000000"/>
+              <w:top w:val="single" w:sz="8" w:space="0" w:color="000000"/>
+              <w:left w:val="single" w:sz="8" w:space="0" w:color="000000"/>
+              <w:right w:val="single" w:sz="8" w:space="0" w:color="000000"/>
             </w:tcBorders>
+            <w:shd w:val="clear" w:color="auto" w:fill="FFFFFF"/>
+            <w:tcMar>
+              <w:top w:w="0" w:type="dxa"/>
+              <w:bottom w:w="0" w:type="dxa"/>
+              <w:left w:w="0" w:type="dxa"/>
+              <w:right w:w="0" w:type="dxa"/>
+            </w:tcMar>
+            <w:vAlign w:val="top"/>
           </w:tcPr>
           <w:p>
             <w:pPr>
-              <w:spacing w:before="0" w:after="60"/>
-              <w:keepNext/>
-              <w:jc w:val="start"/>
+              <w:jc w:val="left"/>
+              <w:pBdr>
+                <w:bottom w:val="none" w:sz="0" w:space="0" w:color="000000"/>
+                <w:top w:val="none" w:sz="0" w:space="0" w:color="000000"/>
+                <w:left w:val="none" w:sz="0" w:space="0" w:color="000000"/>
+                <w:right w:val="none" w:sz="0" w:space="0" w:color="000000"/>
+              </w:pBdr>
+              <w:spacing w:after="80" w:before="80" w:line="240"/>
+              <w:ind w:left="80" w:right="80" w:firstLine="0" w:firstLineChars="0"/>
+              <w:rPr>
+                <w:rFonts w:ascii="Arial" w:hAnsi="Arial" w:eastAsia="Arial" w:cs="Arial"/>
+                <w:i w:val="false"/>
+                <w:b w:val="false"/>
+                <w:u w:val="none"/>
+                <w:sz w:val="22"/>
+                <w:szCs w:val="22"/>
+                <w:color w:val="000000"/>
+              </w:rPr>
             </w:pPr>
-            <w:r>
-              <w:rPr>
-                <w:rFonts w:ascii="Calibri" w:hAnsi="Calibri"/>
-                <w:sz w:val="20"/>
-              </w:rPr>
-              <w:t xml:space="default">CFM50 describes how many cubic feet per minute of air are leaving the house at 50 pascals of pressure difference (while the blower door is running). For every cubic foot of air that leaves the house, a cubic foot of air enters the house as well. The higher the number, the leakier the house.</w:t>
+            <w:r xmlns:w="http://schemas.openxmlformats.org/wordprocessingml/2006/main" xmlns:wp="http://schemas.openxmlformats.org/drawingml/2006/wordprocessingDrawing" xmlns:r="http://schemas.openxmlformats.org/officeDocument/2006/relationships" xmlns:w14="http://schemas.microsoft.com/office/word/2010/wordml">
+              <w:rPr>
+                <w:rFonts w:ascii="Arial" w:hAnsi="Arial" w:eastAsia="Arial" w:cs="Arial"/>
+                <w:i w:val="false"/>
+                <w:b w:val="false"/>
+                <w:u w:val="none"/>
+                <w:sz w:val="22"/>
+                <w:szCs w:val="22"/>
+                <w:color w:val="000000"/>
+              </w:rPr>
+              <w:t xml:space="preserve">CFM50 describes how many cubic feet per minute of air are leaving the house at 50 pascals of pressure difference (while the blower door is running). For every cubic foot of air that leaves the house, a cubic foot of air enters the house as well. The higher the number, the leakier the house.</w:t>
             </w:r>
           </w:p>
         </w:tc>
       </w:tr>
       <w:tr>
         <w:trPr>
-          <w:cantSplit/>
+          <w:trHeight w:val="360" w:hRule="auto"/>
         </w:trPr>
+        body2
         <w:tc>
           <w:tcPr>
             <w:tcBorders>
-              <w:top w:val="single" w:space="0" w:color="D3D3D3"/>
-              <w:bottom w:val="single" w:space="0" w:color="D3D3D3"/>
-              <w:start w:val="single" w:space="0" w:color="D3D3D3"/>
-              <w:end w:val="single" w:space="0" w:color="D3D3D3"/>
+              <w:bottom w:val="single" w:sz="8" w:space="0" w:color="000000"/>
+              <w:top w:val="single" w:sz="8" w:space="0" w:color="000000"/>
+              <w:left w:val="single" w:sz="8" w:space="0" w:color="000000"/>
+              <w:right w:val="single" w:sz="8" w:space="0" w:color="000000"/>
             </w:tcBorders>
+            <w:shd w:val="clear" w:color="auto" w:fill="FFFFFF"/>
+            <w:tcMar>
+              <w:top w:w="0" w:type="dxa"/>
+              <w:bottom w:w="0" w:type="dxa"/>
+              <w:left w:w="0" w:type="dxa"/>
+              <w:right w:w="0" w:type="dxa"/>
+            </w:tcMar>
+            <w:vAlign w:val="top"/>
           </w:tcPr>
           <w:p>
             <w:pPr>
-              <w:spacing w:before="0" w:after="60"/>
-              <w:keepNext/>
-              <w:jc w:val="start"/>
+              <w:jc w:val="left"/>
+              <w:pBdr>
+                <w:bottom w:val="none" w:sz="0" w:space="0" w:color="000000"/>
+                <w:top w:val="none" w:sz="0" w:space="0" w:color="000000"/>
+                <w:left w:val="none" w:sz="0" w:space="0" w:color="000000"/>
+                <w:right w:val="none" w:sz="0" w:space="0" w:color="000000"/>
+              </w:pBdr>
+              <w:spacing w:after="80" w:before="80" w:line="240"/>
+              <w:ind w:left="80" w:right="80" w:firstLine="0" w:firstLineChars="0"/>
+              <w:rPr>
+                <w:rFonts w:ascii="Arial" w:hAnsi="Arial" w:eastAsia="Arial" w:cs="Arial"/>
+                <w:i w:val="false"/>
+                <w:b w:val="false"/>
+                <w:u w:val="none"/>
+                <w:sz w:val="22"/>
+                <w:szCs w:val="22"/>
+                <w:color w:val="000000"/>
+              </w:rPr>
             </w:pPr>
-            <w:r>
-              <w:rPr>
-                <w:rFonts w:ascii="Calibri" w:hAnsi="Calibri"/>
-                <w:sz w:val="20"/>
-              </w:rPr>
-              <w:t xml:space="default">ACH50:</w:t>
+            <w:r xmlns:w="http://schemas.openxmlformats.org/wordprocessingml/2006/main" xmlns:wp="http://schemas.openxmlformats.org/drawingml/2006/wordprocessingDrawing" xmlns:r="http://schemas.openxmlformats.org/officeDocument/2006/relationships" xmlns:w14="http://schemas.microsoft.com/office/word/2010/wordml">
+              <w:rPr>
+                <w:rFonts w:ascii="Arial" w:hAnsi="Arial" w:eastAsia="Arial" w:cs="Arial"/>
+                <w:i w:val="false"/>
+                <w:b w:val="false"/>
+                <w:u w:val="none"/>
+                <w:sz w:val="22"/>
+                <w:szCs w:val="22"/>
+                <w:color w:val="000000"/>
+              </w:rPr>
+              <w:t xml:space="preserve">ACH50:</w:t>
             </w:r>
           </w:p>
         </w:tc>
         <w:tc>
           <w:tcPr>
             <w:tcBorders>
-              <w:top w:val="single" w:space="0" w:color="D3D3D3"/>
-              <w:bottom w:val="single" w:space="0" w:color="D3D3D3"/>
-              <w:start w:val="single" w:space="0" w:color="D3D3D3"/>
-              <w:end w:val="single" w:space="0" w:color="D3D3D3"/>
+              <w:bottom w:val="single" w:sz="8" w:space="0" w:color="000000"/>
+              <w:top w:val="single" w:sz="8" w:space="0" w:color="000000"/>
+              <w:left w:val="single" w:sz="8" w:space="0" w:color="000000"/>
+              <w:right w:val="single" w:sz="8" w:space="0" w:color="000000"/>
             </w:tcBorders>
+            <w:shd w:val="clear" w:color="auto" w:fill="FFFFFF"/>
+            <w:tcMar>
+              <w:top w:w="0" w:type="dxa"/>
+              <w:bottom w:w="0" w:type="dxa"/>
+              <w:left w:w="0" w:type="dxa"/>
+              <w:right w:w="0" w:type="dxa"/>
+            </w:tcMar>
+            <w:vAlign w:val="top"/>
           </w:tcPr>
           <w:p>
             <w:pPr>
-              <w:spacing w:before="0" w:after="60"/>
-              <w:keepNext/>
-              <w:jc w:val="start"/>
+              <w:jc w:val="left"/>
+              <w:pBdr>
+                <w:bottom w:val="none" w:sz="0" w:space="0" w:color="000000"/>
+                <w:top w:val="none" w:sz="0" w:space="0" w:color="000000"/>
+                <w:left w:val="none" w:sz="0" w:space="0" w:color="000000"/>
+                <w:right w:val="none" w:sz="0" w:space="0" w:color="000000"/>
+              </w:pBdr>
+              <w:spacing w:after="80" w:before="80" w:line="240"/>
+              <w:ind w:left="80" w:right="80" w:firstLine="0" w:firstLineChars="0"/>
+              <w:rPr>
+                <w:rFonts w:ascii="Arial" w:hAnsi="Arial" w:eastAsia="Arial" w:cs="Arial"/>
+                <w:i w:val="false"/>
+                <w:b w:val="false"/>
+                <w:u w:val="none"/>
+                <w:sz w:val="22"/>
+                <w:szCs w:val="22"/>
+                <w:color w:val="000000"/>
+              </w:rPr>
             </w:pPr>
-            <w:r>
-              <w:rPr>
-                <w:rFonts w:ascii="Calibri" w:hAnsi="Calibri"/>
-                <w:sz w:val="20"/>
-              </w:rPr>
-              <w:t xml:space="default">6</w:t>
+            <w:r xmlns:w="http://schemas.openxmlformats.org/wordprocessingml/2006/main" xmlns:wp="http://schemas.openxmlformats.org/drawingml/2006/wordprocessingDrawing" xmlns:r="http://schemas.openxmlformats.org/officeDocument/2006/relationships" xmlns:w14="http://schemas.microsoft.com/office/word/2010/wordml">
+              <w:rPr>
+                <w:rFonts w:ascii="Arial" w:hAnsi="Arial" w:eastAsia="Arial" w:cs="Arial"/>
+                <w:i w:val="false"/>
+                <w:b w:val="false"/>
+                <w:u w:val="none"/>
+                <w:sz w:val="22"/>
+                <w:szCs w:val="22"/>
+                <w:color w:val="000000"/>
+              </w:rPr>
+              <w:t xml:space="preserve">6</w:t>
             </w:r>
           </w:p>
         </w:tc>
         <w:tc>
           <w:tcPr>
             <w:tcBorders>
-              <w:top w:val="single" w:space="0" w:color="D3D3D3"/>
-              <w:bottom w:val="single" w:space="0" w:color="D3D3D3"/>
-              <w:start w:val="single" w:space="0" w:color="D3D3D3"/>
-              <w:end w:val="single" w:space="0" w:color="D3D3D3"/>
+              <w:bottom w:val="single" w:sz="8" w:space="0" w:color="000000"/>
+              <w:top w:val="single" w:sz="8" w:space="0" w:color="000000"/>
+              <w:left w:val="single" w:sz="8" w:space="0" w:color="000000"/>
+              <w:right w:val="single" w:sz="8" w:space="0" w:color="000000"/>
             </w:tcBorders>
+            <w:shd w:val="clear" w:color="auto" w:fill="FFFFFF"/>
+            <w:tcMar>
+              <w:top w:w="0" w:type="dxa"/>
+              <w:bottom w:w="0" w:type="dxa"/>
+              <w:left w:w="0" w:type="dxa"/>
+              <w:right w:w="0" w:type="dxa"/>
+            </w:tcMar>
+            <w:vAlign w:val="top"/>
           </w:tcPr>
           <w:p>
             <w:pPr>
-              <w:spacing w:before="0" w:after="60"/>
-              <w:keepNext/>
-              <w:jc w:val="start"/>
+              <w:jc w:val="left"/>
+              <w:pBdr>
+                <w:bottom w:val="none" w:sz="0" w:space="0" w:color="000000"/>
+                <w:top w:val="none" w:sz="0" w:space="0" w:color="000000"/>
+                <w:left w:val="none" w:sz="0" w:space="0" w:color="000000"/>
+                <w:right w:val="none" w:sz="0" w:space="0" w:color="000000"/>
+              </w:pBdr>
+              <w:spacing w:after="80" w:before="80" w:line="240"/>
+              <w:ind w:left="80" w:right="80" w:firstLine="0" w:firstLineChars="0"/>
+              <w:rPr>
+                <w:rFonts w:ascii="Arial" w:hAnsi="Arial" w:eastAsia="Arial" w:cs="Arial"/>
+                <w:i w:val="false"/>
+                <w:b w:val="false"/>
+                <w:u w:val="none"/>
+                <w:sz w:val="22"/>
+                <w:szCs w:val="22"/>
+                <w:color w:val="000000"/>
+              </w:rPr>
             </w:pPr>
-            <w:r>
-              <w:rPr>
-                <w:rFonts w:ascii="Calibri" w:hAnsi="Calibri"/>
-                <w:sz w:val="20"/>
-              </w:rPr>
-              <w:t xml:space="default">ACH50 tells us how many air changes per hour are taking place in the house at 50 pascals of pressure difference. This value is normalized for the volume of the house and thus allows for comparison between different houses. The higher the number, the leakier the house.</w:t>
+            <w:r xmlns:w="http://schemas.openxmlformats.org/wordprocessingml/2006/main" xmlns:wp="http://schemas.openxmlformats.org/drawingml/2006/wordprocessingDrawing" xmlns:r="http://schemas.openxmlformats.org/officeDocument/2006/relationships" xmlns:w14="http://schemas.microsoft.com/office/word/2010/wordml">
+              <w:rPr>
+                <w:rFonts w:ascii="Arial" w:hAnsi="Arial" w:eastAsia="Arial" w:cs="Arial"/>
+                <w:i w:val="false"/>
+                <w:b w:val="false"/>
+                <w:u w:val="none"/>
+                <w:sz w:val="22"/>
+                <w:szCs w:val="22"/>
+                <w:color w:val="000000"/>
+              </w:rPr>
+              <w:t xml:space="preserve">ACH50 tells us how many air changes per hour are taking place in the house at 50 pascals of pressure difference. This value is normalized for the volume of the house and thus allows for comparison between different houses. The higher the number, the leakier the house.</w:t>
             </w:r>
           </w:p>
         </w:tc>
       </w:tr>
       <w:tr>
         <w:trPr>
-          <w:cantSplit/>
+          <w:trHeight w:val="360" w:hRule="auto"/>
         </w:trPr>
+        body3
         <w:tc>
           <w:tcPr>
             <w:tcBorders>
-              <w:top w:val="single" w:space="0" w:color="D3D3D3"/>
-              <w:bottom w:val="single" w:space="0" w:color="D3D3D3"/>
-              <w:start w:val="single" w:space="0" w:color="D3D3D3"/>
-              <w:end w:val="single" w:space="0" w:color="D3D3D3"/>
+              <w:bottom w:val="single" w:sz="8" w:space="0" w:color="000000"/>
+              <w:top w:val="single" w:sz="8" w:space="0" w:color="000000"/>
+              <w:left w:val="single" w:sz="8" w:space="0" w:color="000000"/>
+              <w:right w:val="single" w:sz="8" w:space="0" w:color="000000"/>
             </w:tcBorders>
+            <w:shd w:val="clear" w:color="auto" w:fill="FFFFFF"/>
+            <w:tcMar>
+              <w:top w:w="0" w:type="dxa"/>
+              <w:bottom w:w="0" w:type="dxa"/>
+              <w:left w:w="0" w:type="dxa"/>
+              <w:right w:w="0" w:type="dxa"/>
+            </w:tcMar>
+            <w:vAlign w:val="top"/>
           </w:tcPr>
           <w:p>
             <w:pPr>
-              <w:spacing w:before="0" w:after="60"/>
-              <w:keepNext/>
-              <w:jc w:val="start"/>
+              <w:jc w:val="left"/>
+              <w:pBdr>
+                <w:bottom w:val="none" w:sz="0" w:space="0" w:color="000000"/>
+                <w:top w:val="none" w:sz="0" w:space="0" w:color="000000"/>
+                <w:left w:val="none" w:sz="0" w:space="0" w:color="000000"/>
+                <w:right w:val="none" w:sz="0" w:space="0" w:color="000000"/>
+              </w:pBdr>
+              <w:spacing w:after="80" w:before="80" w:line="240"/>
+              <w:ind w:left="80" w:right="80" w:firstLine="0" w:firstLineChars="0"/>
+              <w:rPr>
+                <w:rFonts w:ascii="Arial" w:hAnsi="Arial" w:eastAsia="Arial" w:cs="Arial"/>
+                <w:i w:val="false"/>
+                <w:b w:val="false"/>
+                <w:u w:val="none"/>
+                <w:sz w:val="22"/>
+                <w:szCs w:val="22"/>
+                <w:color w:val="000000"/>
+              </w:rPr>
             </w:pPr>
-            <w:r>
-              <w:rPr>
-                <w:rFonts w:ascii="Calibri" w:hAnsi="Calibri"/>
-                <w:sz w:val="20"/>
-              </w:rPr>
-              <w:t xml:space="default">Equivalent leakage area:</w:t>
+            <w:r xmlns:w="http://schemas.openxmlformats.org/wordprocessingml/2006/main" xmlns:wp="http://schemas.openxmlformats.org/drawingml/2006/wordprocessingDrawing" xmlns:r="http://schemas.openxmlformats.org/officeDocument/2006/relationships" xmlns:w14="http://schemas.microsoft.com/office/word/2010/wordml">
+              <w:rPr>
+                <w:rFonts w:ascii="Arial" w:hAnsi="Arial" w:eastAsia="Arial" w:cs="Arial"/>
+                <w:i w:val="false"/>
+                <w:b w:val="false"/>
+                <w:u w:val="none"/>
+                <w:sz w:val="22"/>
+                <w:szCs w:val="22"/>
+                <w:color w:val="000000"/>
+              </w:rPr>
+              <w:t xml:space="preserve">Equivalent leakage area:</w:t>
             </w:r>
           </w:p>
         </w:tc>
         <w:tc>
           <w:tcPr>
             <w:tcBorders>
-              <w:top w:val="single" w:space="0" w:color="D3D3D3"/>
-              <w:bottom w:val="single" w:space="0" w:color="D3D3D3"/>
-              <w:start w:val="single" w:space="0" w:color="D3D3D3"/>
-              <w:end w:val="single" w:space="0" w:color="D3D3D3"/>
+              <w:bottom w:val="single" w:sz="8" w:space="0" w:color="000000"/>
+              <w:top w:val="single" w:sz="8" w:space="0" w:color="000000"/>
+              <w:left w:val="single" w:sz="8" w:space="0" w:color="000000"/>
+              <w:right w:val="single" w:sz="8" w:space="0" w:color="000000"/>
             </w:tcBorders>
+            <w:shd w:val="clear" w:color="auto" w:fill="FFFFFF"/>
+            <w:tcMar>
+              <w:top w:w="0" w:type="dxa"/>
+              <w:bottom w:w="0" w:type="dxa"/>
+              <w:left w:w="0" w:type="dxa"/>
+              <w:right w:w="0" w:type="dxa"/>
+            </w:tcMar>
+            <w:vAlign w:val="top"/>
           </w:tcPr>
           <w:p>
             <w:pPr>
-              <w:spacing w:before="0" w:after="60"/>
-              <w:keepNext/>
-              <w:jc w:val="start"/>
+              <w:jc w:val="left"/>
+              <w:pBdr>
+                <w:bottom w:val="none" w:sz="0" w:space="0" w:color="000000"/>
+                <w:top w:val="none" w:sz="0" w:space="0" w:color="000000"/>
+                <w:left w:val="none" w:sz="0" w:space="0" w:color="000000"/>
+                <w:right w:val="none" w:sz="0" w:space="0" w:color="000000"/>
+              </w:pBdr>
+              <w:spacing w:after="80" w:before="80" w:line="240"/>
+              <w:ind w:left="80" w:right="80" w:firstLine="0" w:firstLineChars="0"/>
+              <w:rPr>
+                <w:rFonts w:ascii="Arial" w:hAnsi="Arial" w:eastAsia="Arial" w:cs="Arial"/>
+                <w:i w:val="false"/>
+                <w:b w:val="false"/>
+                <w:u w:val="none"/>
+                <w:sz w:val="22"/>
+                <w:szCs w:val="22"/>
+                <w:color w:val="000000"/>
+              </w:rPr>
             </w:pPr>
-            <w:r>
-              <w:rPr>
-                <w:rFonts w:ascii="Calibri" w:hAnsi="Calibri"/>
-                <w:sz w:val="20"/>
-              </w:rPr>
-              <w:t xml:space="default">125 in²</w:t>
+            <w:r xmlns:w="http://schemas.openxmlformats.org/wordprocessingml/2006/main" xmlns:wp="http://schemas.openxmlformats.org/drawingml/2006/wordprocessingDrawing" xmlns:r="http://schemas.openxmlformats.org/officeDocument/2006/relationships" xmlns:w14="http://schemas.microsoft.com/office/word/2010/wordml">
+              <w:rPr>
+                <w:rFonts w:ascii="Arial" w:hAnsi="Arial" w:eastAsia="Arial" w:cs="Arial"/>
+                <w:i w:val="false"/>
+                <w:b w:val="false"/>
+                <w:u w:val="none"/>
+                <w:sz w:val="22"/>
+                <w:szCs w:val="22"/>
+                <w:color w:val="000000"/>
+              </w:rPr>
+              <w:t xml:space="preserve">125 in²</w:t>
             </w:r>
           </w:p>
         </w:tc>
         <w:tc>
           <w:tcPr>
             <w:tcBorders>
-              <w:top w:val="single" w:space="0" w:color="D3D3D3"/>
-              <w:bottom w:val="single" w:space="0" w:color="D3D3D3"/>
-              <w:start w:val="single" w:space="0" w:color="D3D3D3"/>
-              <w:end w:val="single" w:space="0" w:color="D3D3D3"/>
+              <w:bottom w:val="single" w:sz="8" w:space="0" w:color="000000"/>
+              <w:top w:val="single" w:sz="8" w:space="0" w:color="000000"/>
+              <w:left w:val="single" w:sz="8" w:space="0" w:color="000000"/>
+              <w:right w:val="single" w:sz="8" w:space="0" w:color="000000"/>
             </w:tcBorders>
+            <w:shd w:val="clear" w:color="auto" w:fill="FFFFFF"/>
+            <w:tcMar>
+              <w:top w:w="0" w:type="dxa"/>
+              <w:bottom w:w="0" w:type="dxa"/>
+              <w:left w:w="0" w:type="dxa"/>
+              <w:right w:w="0" w:type="dxa"/>
+            </w:tcMar>
+            <w:vAlign w:val="top"/>
           </w:tcPr>
           <w:p>
             <w:pPr>
-              <w:spacing w:before="0" w:after="60"/>
-              <w:keepNext/>
-              <w:jc w:val="start"/>
+              <w:jc w:val="left"/>
+              <w:pBdr>
+                <w:bottom w:val="none" w:sz="0" w:space="0" w:color="000000"/>
+                <w:top w:val="none" w:sz="0" w:space="0" w:color="000000"/>
+                <w:left w:val="none" w:sz="0" w:space="0" w:color="000000"/>
+                <w:right w:val="none" w:sz="0" w:space="0" w:color="000000"/>
+              </w:pBdr>
+              <w:spacing w:after="80" w:before="80" w:line="240"/>
+              <w:ind w:left="80" w:right="80" w:firstLine="0" w:firstLineChars="0"/>
+              <w:rPr>
+                <w:rFonts w:ascii="Arial" w:hAnsi="Arial" w:eastAsia="Arial" w:cs="Arial"/>
+                <w:i w:val="false"/>
+                <w:b w:val="false"/>
+                <w:u w:val="none"/>
+                <w:sz w:val="22"/>
+                <w:szCs w:val="22"/>
+                <w:color w:val="000000"/>
+              </w:rPr>
             </w:pPr>
-            <w:r>
-              <w:rPr>
-                <w:rFonts w:ascii="Calibri" w:hAnsi="Calibri"/>
-                <w:sz w:val="20"/>
-              </w:rPr>
-              <w:t xml:space="default">This is the area equivalent to all of the air leaks in the house combined.</w:t>
+            <w:r xmlns:w="http://schemas.openxmlformats.org/wordprocessingml/2006/main" xmlns:wp="http://schemas.openxmlformats.org/drawingml/2006/wordprocessingDrawing" xmlns:r="http://schemas.openxmlformats.org/officeDocument/2006/relationships" xmlns:w14="http://schemas.microsoft.com/office/word/2010/wordml">
+              <w:rPr>
+                <w:rFonts w:ascii="Arial" w:hAnsi="Arial" w:eastAsia="Arial" w:cs="Arial"/>
+                <w:i w:val="false"/>
+                <w:b w:val="false"/>
+                <w:u w:val="none"/>
+                <w:sz w:val="22"/>
+                <w:szCs w:val="22"/>
+                <w:color w:val="000000"/>
+              </w:rPr>
+              <w:t xml:space="preserve">This is the area equivalent to all of the air leaks in the house combined.</w:t>
             </w:r>
           </w:p>
         </w:tc>
       </w:tr>
       <w:tr>
         <w:trPr>
-          <w:cantSplit/>
+          <w:trHeight w:val="360" w:hRule="auto"/>
         </w:trPr>
+        body4
         <w:tc>
           <w:tcPr>
             <w:tcBorders>
-              <w:top w:val="single" w:space="0" w:color="D3D3D3"/>
-              <w:bottom w:val="single" w:space="0" w:color="D3D3D3"/>
-              <w:start w:val="single" w:space="0" w:color="D3D3D3"/>
-              <w:end w:val="single" w:space="0" w:color="D3D3D3"/>
+              <w:bottom w:val="single" w:sz="8" w:space="0" w:color="000000"/>
+              <w:top w:val="single" w:sz="8" w:space="0" w:color="000000"/>
+              <w:left w:val="single" w:sz="8" w:space="0" w:color="000000"/>
+              <w:right w:val="single" w:sz="8" w:space="0" w:color="000000"/>
             </w:tcBorders>
+            <w:shd w:val="clear" w:color="auto" w:fill="FFFFFF"/>
+            <w:tcMar>
+              <w:top w:w="0" w:type="dxa"/>
+              <w:bottom w:w="0" w:type="dxa"/>
+              <w:left w:w="0" w:type="dxa"/>
+              <w:right w:w="0" w:type="dxa"/>
+            </w:tcMar>
+            <w:vAlign w:val="top"/>
           </w:tcPr>
           <w:p>
             <w:pPr>
-              <w:spacing w:before="0" w:after="60"/>
-              <w:keepNext/>
-              <w:jc w:val="start"/>
+              <w:jc w:val="left"/>
+              <w:pBdr>
+                <w:bottom w:val="none" w:sz="0" w:space="0" w:color="000000"/>
+                <w:top w:val="none" w:sz="0" w:space="0" w:color="000000"/>
+                <w:left w:val="none" w:sz="0" w:space="0" w:color="000000"/>
+                <w:right w:val="none" w:sz="0" w:space="0" w:color="000000"/>
+              </w:pBdr>
+              <w:spacing w:after="80" w:before="80" w:line="240"/>
+              <w:ind w:left="80" w:right="80" w:firstLine="0" w:firstLineChars="0"/>
+              <w:rPr>
+                <w:rFonts w:ascii="Arial" w:hAnsi="Arial" w:eastAsia="Arial" w:cs="Arial"/>
+                <w:i w:val="false"/>
+                <w:b w:val="false"/>
+                <w:u w:val="none"/>
+                <w:sz w:val="22"/>
+                <w:szCs w:val="22"/>
+                <w:color w:val="000000"/>
+              </w:rPr>
             </w:pPr>
-            <w:r>
-              <w:rPr>
-                <w:rFonts w:ascii="Calibri" w:hAnsi="Calibri"/>
-                <w:sz w:val="20"/>
-              </w:rPr>
-              <w:t xml:space="default">ACHnatural:</w:t>
+            <w:r xmlns:w="http://schemas.openxmlformats.org/wordprocessingml/2006/main" xmlns:wp="http://schemas.openxmlformats.org/drawingml/2006/wordprocessingDrawing" xmlns:r="http://schemas.openxmlformats.org/officeDocument/2006/relationships" xmlns:w14="http://schemas.microsoft.com/office/word/2010/wordml">
+              <w:rPr>
+                <w:rFonts w:ascii="Arial" w:hAnsi="Arial" w:eastAsia="Arial" w:cs="Arial"/>
+                <w:i w:val="false"/>
+                <w:b w:val="false"/>
+                <w:u w:val="none"/>
+                <w:sz w:val="22"/>
+                <w:szCs w:val="22"/>
+                <w:color w:val="000000"/>
+              </w:rPr>
+              <w:t xml:space="preserve">ACHnatural:</w:t>
             </w:r>
           </w:p>
         </w:tc>
         <w:tc>
           <w:tcPr>
             <w:tcBorders>
-              <w:top w:val="single" w:space="0" w:color="D3D3D3"/>
-              <w:bottom w:val="single" w:space="0" w:color="D3D3D3"/>
-              <w:start w:val="single" w:space="0" w:color="D3D3D3"/>
-              <w:end w:val="single" w:space="0" w:color="D3D3D3"/>
+              <w:bottom w:val="single" w:sz="8" w:space="0" w:color="000000"/>
+              <w:top w:val="single" w:sz="8" w:space="0" w:color="000000"/>
+              <w:left w:val="single" w:sz="8" w:space="0" w:color="000000"/>
+              <w:right w:val="single" w:sz="8" w:space="0" w:color="000000"/>
             </w:tcBorders>
+            <w:shd w:val="clear" w:color="auto" w:fill="FFFFFF"/>
+            <w:tcMar>
+              <w:top w:w="0" w:type="dxa"/>
+              <w:bottom w:w="0" w:type="dxa"/>
+              <w:left w:w="0" w:type="dxa"/>
+              <w:right w:w="0" w:type="dxa"/>
+            </w:tcMar>
+            <w:vAlign w:val="top"/>
           </w:tcPr>
           <w:p>
             <w:pPr>
-              <w:spacing w:before="0" w:after="60"/>
-              <w:keepNext/>
-              <w:jc w:val="start"/>
+              <w:jc w:val="left"/>
+              <w:pBdr>
+                <w:bottom w:val="none" w:sz="0" w:space="0" w:color="000000"/>
+                <w:top w:val="none" w:sz="0" w:space="0" w:color="000000"/>
+                <w:left w:val="none" w:sz="0" w:space="0" w:color="000000"/>
+                <w:right w:val="none" w:sz="0" w:space="0" w:color="000000"/>
+              </w:pBdr>
+              <w:spacing w:after="80" w:before="80" w:line="240"/>
+              <w:ind w:left="80" w:right="80" w:firstLine="0" w:firstLineChars="0"/>
+              <w:rPr>
+                <w:rFonts w:ascii="Arial" w:hAnsi="Arial" w:eastAsia="Arial" w:cs="Arial"/>
+                <w:i w:val="false"/>
+                <w:b w:val="false"/>
+                <w:u w:val="none"/>
+                <w:sz w:val="22"/>
+                <w:szCs w:val="22"/>
+                <w:color w:val="000000"/>
+              </w:rPr>
             </w:pPr>
-            <w:r>
-              <w:rPr>
-                <w:rFonts w:ascii="Calibri" w:hAnsi="Calibri"/>
-                <w:sz w:val="20"/>
-              </w:rPr>
-              <w:t xml:space="default">0.5</w:t>
+            <w:r xmlns:w="http://schemas.openxmlformats.org/wordprocessingml/2006/main" xmlns:wp="http://schemas.openxmlformats.org/drawingml/2006/wordprocessingDrawing" xmlns:r="http://schemas.openxmlformats.org/officeDocument/2006/relationships" xmlns:w14="http://schemas.microsoft.com/office/word/2010/wordml">
+              <w:rPr>
+                <w:rFonts w:ascii="Arial" w:hAnsi="Arial" w:eastAsia="Arial" w:cs="Arial"/>
+                <w:i w:val="false"/>
+                <w:b w:val="false"/>
+                <w:u w:val="none"/>
+                <w:sz w:val="22"/>
+                <w:szCs w:val="22"/>
+                <w:color w:val="000000"/>
+              </w:rPr>
+              <w:t xml:space="preserve">0.5</w:t>
             </w:r>
           </w:p>
         </w:tc>
         <w:tc>
           <w:tcPr>
             <w:tcBorders>
-              <w:top w:val="single" w:space="0" w:color="D3D3D3"/>
-              <w:bottom w:val="single" w:space="0" w:color="D3D3D3"/>
-              <w:start w:val="single" w:space="0" w:color="D3D3D3"/>
-              <w:end w:val="single" w:space="0" w:color="D3D3D3"/>
+              <w:bottom w:val="single" w:sz="8" w:space="0" w:color="000000"/>
+              <w:top w:val="single" w:sz="8" w:space="0" w:color="000000"/>
+              <w:left w:val="single" w:sz="8" w:space="0" w:color="000000"/>
+              <w:right w:val="single" w:sz="8" w:space="0" w:color="000000"/>
             </w:tcBorders>
+            <w:shd w:val="clear" w:color="auto" w:fill="FFFFFF"/>
+            <w:tcMar>
+              <w:top w:w="0" w:type="dxa"/>
+              <w:bottom w:w="0" w:type="dxa"/>
+              <w:left w:w="0" w:type="dxa"/>
+              <w:right w:w="0" w:type="dxa"/>
+            </w:tcMar>
+            <w:vAlign w:val="top"/>
           </w:tcPr>
           <w:p>
             <w:pPr>
-              <w:spacing w:before="0" w:after="60"/>
-              <w:keepNext/>
-              <w:jc w:val="start"/>
+              <w:jc w:val="left"/>
+              <w:pBdr>
+                <w:bottom w:val="none" w:sz="0" w:space="0" w:color="000000"/>
+                <w:top w:val="none" w:sz="0" w:space="0" w:color="000000"/>
+                <w:left w:val="none" w:sz="0" w:space="0" w:color="000000"/>
+                <w:right w:val="none" w:sz="0" w:space="0" w:color="000000"/>
+              </w:pBdr>
+              <w:spacing w:after="80" w:before="80" w:line="240"/>
+              <w:ind w:left="80" w:right="80" w:firstLine="0" w:firstLineChars="0"/>
+              <w:rPr>
+                <w:rFonts w:ascii="Arial" w:hAnsi="Arial" w:eastAsia="Arial" w:cs="Arial"/>
+                <w:i w:val="false"/>
+                <w:b w:val="false"/>
+                <w:u w:val="none"/>
+                <w:sz w:val="22"/>
+                <w:szCs w:val="22"/>
+                <w:color w:val="000000"/>
+              </w:rPr>
             </w:pPr>
-            <w:r>
-              <w:rPr>
-                <w:rFonts w:ascii="Calibri" w:hAnsi="Calibri"/>
-                <w:sz w:val="20"/>
-              </w:rPr>
-              <w:t xml:space="default">Accounting for the volume of the home, this means that the house exchanges 50% of its air every hour. Over one day, the house goes through 12 complete air changes.</w:t>
+            <w:r xmlns:w="http://schemas.openxmlformats.org/wordprocessingml/2006/main" xmlns:wp="http://schemas.openxmlformats.org/drawingml/2006/wordprocessingDrawing" xmlns:r="http://schemas.openxmlformats.org/officeDocument/2006/relationships" xmlns:w14="http://schemas.microsoft.com/office/word/2010/wordml">
+              <w:rPr>
+                <w:rFonts w:ascii="Arial" w:hAnsi="Arial" w:eastAsia="Arial" w:cs="Arial"/>
+                <w:i w:val="false"/>
+                <w:b w:val="false"/>
+                <w:u w:val="none"/>
+                <w:sz w:val="22"/>
+                <w:szCs w:val="22"/>
+                <w:color w:val="000000"/>
+              </w:rPr>
+              <w:t xml:space="preserve">Accounting for the volume of the home, this means that the house exchanges 50% of its air every hour. Over one day, the house goes through 12 complete air changes.</w:t>
             </w:r>
           </w:p>
         </w:tc>

</xml_diff>

<commit_message>
Turn attic, basement, mechanical and energy tables into flextables
</commit_message>
<xml_diff>
--- a/Quarto_report/Audit_Report.docx
+++ b/Quarto_report/Audit_Report.docx
@@ -5513,544 +5513,1112 @@
         <w:t xml:space="preserve">3.5 Attic</w:t>
       </w:r>
     </w:p>
-    <w:tbl xmlns:w="http://schemas.openxmlformats.org/wordprocessingml/2006/main" xmlns:wp="http://schemas.openxmlformats.org/drawingml/2006/wordprocessingDrawing" xmlns:r="http://schemas.openxmlformats.org/officeDocument/2006/relationships" xmlns:w14="http://schemas.microsoft.com/office/word/2010/wordml">
+    <w:tbl xmlns:w="http://schemas.openxmlformats.org/wordprocessingml/2006/main" xmlns:r="http://schemas.openxmlformats.org/officeDocument/2006/relationships" xmlns:w14="http://schemas.microsoft.com/office/word/2010/wordml" xmlns:wp="http://schemas.openxmlformats.org/drawingml/2006/wordprocessingDrawing" xmlns:a="http://schemas.openxmlformats.org/drawingml/2006/main" xmlns:pic="http://schemas.openxmlformats.org/drawingml/2006/picture">
       <w:tblPr>
-        <w:tblCellMar>
-          <w:top w:w="0" w:type="dxa"/>
-          <w:bottom w:w="0" w:type="dxa"/>
-          <w:start w:w="60" w:type="dxa"/>
-          <w:end w:w="60" w:type="dxa"/>
-        </w:tblCellMar>
-        <w:tblW w:type="auto" w:w="0"/>
-        <w:tblLook w:firstRow="0" w:lastRow="0" w:firstColumn="0" w:lastColumn="0" w:noHBand="0" w:noVBand="0"/>
+        <w:tblLayout w:type="fixed"/>
         <w:jc w:val="center"/>
+        <w:tblLook w:firstRow="1" w:lastRow="0" w:firstColumn="0" w:lastColumn="0" w:noHBand="0" w:noVBand="1"/>
       </w:tblPr>
+      <w:tblGrid>
+        <w:gridCol w:w="2880"/>
+        <w:gridCol w:w="5760"/>
+      </w:tblGrid>
       <w:tr>
         <w:trPr>
-          <w:cantSplit/>
+          <w:trHeight w:val="360" w:hRule="auto"/>
         </w:trPr>
+        body 1
         <w:tc>
           <w:tcPr>
             <w:tcBorders>
-              <w:top w:val="single" w:space="0" w:color="D3D3D3"/>
-              <w:bottom w:val="single" w:space="0" w:color="D3D3D3"/>
-              <w:start w:val="single" w:space="0" w:color="D3D3D3"/>
-              <w:end w:val="single" w:space="0" w:color="D3D3D3"/>
+              <w:bottom w:val="single" w:sz="8" w:space="0" w:color="000000"/>
+              <w:top w:val="single" w:sz="8" w:space="0" w:color="000000"/>
+              <w:left w:val="single" w:sz="8" w:space="0" w:color="000000"/>
+              <w:right w:val="single" w:sz="8" w:space="0" w:color="000000"/>
             </w:tcBorders>
+            <w:shd w:val="clear" w:color="auto" w:fill="FFFFFF"/>
+            <w:tcMar>
+              <w:top w:w="0" w:type="dxa"/>
+              <w:bottom w:w="0" w:type="dxa"/>
+              <w:left w:w="0" w:type="dxa"/>
+              <w:right w:w="0" w:type="dxa"/>
+            </w:tcMar>
+            <w:vAlign w:val="top"/>
           </w:tcPr>
           <w:p>
             <w:pPr>
-              <w:spacing w:before="0" w:after="60"/>
-              <w:keepNext/>
-              <w:jc w:val="center"/>
+              <w:jc w:val="left"/>
+              <w:pBdr>
+                <w:bottom w:val="none" w:sz="0" w:space="0" w:color="000000"/>
+                <w:top w:val="none" w:sz="0" w:space="0" w:color="000000"/>
+                <w:left w:val="none" w:sz="0" w:space="0" w:color="000000"/>
+                <w:right w:val="none" w:sz="0" w:space="0" w:color="000000"/>
+              </w:pBdr>
+              <w:spacing w:after="80" w:before="80" w:line="240"/>
+              <w:ind w:left="80" w:right="80" w:firstLine="0" w:firstLineChars="0"/>
+              <w:rPr>
+                <w:rFonts w:ascii="Arial" w:hAnsi="Arial" w:eastAsia="Arial" w:cs="Arial"/>
+                <w:i w:val="false"/>
+                <w:b w:val="false"/>
+                <w:u w:val="none"/>
+                <w:sz w:val="22"/>
+                <w:szCs w:val="22"/>
+                <w:color w:val="000000"/>
+              </w:rPr>
             </w:pPr>
-            <w:r>
-              <w:rPr>
-                <w:rFonts w:ascii="Calibri" w:hAnsi="Calibri"/>
-                <w:sz w:val="20"/>
-              </w:rPr>
-              <w:t xml:space="default">Area:</w:t>
+            <w:r xmlns:w="http://schemas.openxmlformats.org/wordprocessingml/2006/main" xmlns:wp="http://schemas.openxmlformats.org/drawingml/2006/wordprocessingDrawing" xmlns:r="http://schemas.openxmlformats.org/officeDocument/2006/relationships" xmlns:w14="http://schemas.microsoft.com/office/word/2010/wordml">
+              <w:rPr>
+                <w:rFonts w:ascii="Arial" w:hAnsi="Arial" w:eastAsia="Arial" w:cs="Arial"/>
+                <w:i w:val="false"/>
+                <w:b w:val="false"/>
+                <w:u w:val="none"/>
+                <w:sz w:val="22"/>
+                <w:szCs w:val="22"/>
+                <w:color w:val="000000"/>
+              </w:rPr>
+              <w:t xml:space="preserve">Area:</w:t>
             </w:r>
           </w:p>
         </w:tc>
         <w:tc>
           <w:tcPr>
             <w:tcBorders>
-              <w:top w:val="single" w:space="0" w:color="D3D3D3"/>
-              <w:bottom w:val="single" w:space="0" w:color="D3D3D3"/>
-              <w:start w:val="single" w:space="0" w:color="D3D3D3"/>
-              <w:end w:val="single" w:space="0" w:color="D3D3D3"/>
+              <w:bottom w:val="single" w:sz="8" w:space="0" w:color="000000"/>
+              <w:top w:val="single" w:sz="8" w:space="0" w:color="000000"/>
+              <w:left w:val="single" w:sz="8" w:space="0" w:color="000000"/>
+              <w:right w:val="single" w:sz="8" w:space="0" w:color="000000"/>
             </w:tcBorders>
+            <w:shd w:val="clear" w:color="auto" w:fill="FFFFFF"/>
+            <w:tcMar>
+              <w:top w:w="0" w:type="dxa"/>
+              <w:bottom w:w="0" w:type="dxa"/>
+              <w:left w:w="0" w:type="dxa"/>
+              <w:right w:w="0" w:type="dxa"/>
+            </w:tcMar>
+            <w:vAlign w:val="top"/>
           </w:tcPr>
           <w:p>
             <w:pPr>
-              <w:spacing w:before="0" w:after="60"/>
-              <w:keepNext/>
-              <w:jc w:val="start"/>
+              <w:jc w:val="left"/>
+              <w:pBdr>
+                <w:bottom w:val="none" w:sz="0" w:space="0" w:color="000000"/>
+                <w:top w:val="none" w:sz="0" w:space="0" w:color="000000"/>
+                <w:left w:val="none" w:sz="0" w:space="0" w:color="000000"/>
+                <w:right w:val="none" w:sz="0" w:space="0" w:color="000000"/>
+              </w:pBdr>
+              <w:spacing w:after="80" w:before="80" w:line="240"/>
+              <w:ind w:left="80" w:right="80" w:firstLine="0" w:firstLineChars="0"/>
+              <w:rPr>
+                <w:rFonts w:ascii="Arial" w:hAnsi="Arial" w:eastAsia="Arial" w:cs="Arial"/>
+                <w:i w:val="false"/>
+                <w:b w:val="false"/>
+                <w:u w:val="none"/>
+                <w:sz w:val="22"/>
+                <w:szCs w:val="22"/>
+                <w:color w:val="000000"/>
+              </w:rPr>
             </w:pPr>
-            <w:r>
-              <w:rPr>
-                <w:rFonts w:ascii="Calibri" w:hAnsi="Calibri"/>
-                <w:sz w:val="20"/>
-              </w:rPr>
-              <w:t xml:space="default">586.5 ft²</w:t>
+            <w:r xmlns:w="http://schemas.openxmlformats.org/wordprocessingml/2006/main" xmlns:wp="http://schemas.openxmlformats.org/drawingml/2006/wordprocessingDrawing" xmlns:r="http://schemas.openxmlformats.org/officeDocument/2006/relationships" xmlns:w14="http://schemas.microsoft.com/office/word/2010/wordml">
+              <w:rPr>
+                <w:rFonts w:ascii="Arial" w:hAnsi="Arial" w:eastAsia="Arial" w:cs="Arial"/>
+                <w:i w:val="false"/>
+                <w:b w:val="false"/>
+                <w:u w:val="none"/>
+                <w:sz w:val="22"/>
+                <w:szCs w:val="22"/>
+                <w:color w:val="000000"/>
+              </w:rPr>
+              <w:t xml:space="preserve">586.5 ft²</w:t>
             </w:r>
           </w:p>
         </w:tc>
       </w:tr>
       <w:tr>
         <w:trPr>
-          <w:cantSplit/>
+          <w:trHeight w:val="360" w:hRule="auto"/>
         </w:trPr>
+        body 2
         <w:tc>
           <w:tcPr>
             <w:tcBorders>
-              <w:top w:val="single" w:space="0" w:color="D3D3D3"/>
-              <w:bottom w:val="single" w:space="0" w:color="D3D3D3"/>
-              <w:start w:val="single" w:space="0" w:color="D3D3D3"/>
-              <w:end w:val="single" w:space="0" w:color="D3D3D3"/>
+              <w:bottom w:val="single" w:sz="8" w:space="0" w:color="000000"/>
+              <w:top w:val="single" w:sz="8" w:space="0" w:color="000000"/>
+              <w:left w:val="single" w:sz="8" w:space="0" w:color="000000"/>
+              <w:right w:val="single" w:sz="8" w:space="0" w:color="000000"/>
             </w:tcBorders>
+            <w:shd w:val="clear" w:color="auto" w:fill="FFFFFF"/>
+            <w:tcMar>
+              <w:top w:w="0" w:type="dxa"/>
+              <w:bottom w:w="0" w:type="dxa"/>
+              <w:left w:w="0" w:type="dxa"/>
+              <w:right w:w="0" w:type="dxa"/>
+            </w:tcMar>
+            <w:vAlign w:val="top"/>
           </w:tcPr>
           <w:p>
             <w:pPr>
-              <w:spacing w:before="0" w:after="60"/>
-              <w:keepNext/>
-              <w:jc w:val="center"/>
+              <w:jc w:val="left"/>
+              <w:pBdr>
+                <w:bottom w:val="none" w:sz="0" w:space="0" w:color="000000"/>
+                <w:top w:val="none" w:sz="0" w:space="0" w:color="000000"/>
+                <w:left w:val="none" w:sz="0" w:space="0" w:color="000000"/>
+                <w:right w:val="none" w:sz="0" w:space="0" w:color="000000"/>
+              </w:pBdr>
+              <w:spacing w:after="80" w:before="80" w:line="240"/>
+              <w:ind w:left="80" w:right="80" w:firstLine="0" w:firstLineChars="0"/>
+              <w:rPr>
+                <w:rFonts w:ascii="Arial" w:hAnsi="Arial" w:eastAsia="Arial" w:cs="Arial"/>
+                <w:i w:val="false"/>
+                <w:b w:val="false"/>
+                <w:u w:val="none"/>
+                <w:sz w:val="22"/>
+                <w:szCs w:val="22"/>
+                <w:color w:val="000000"/>
+              </w:rPr>
             </w:pPr>
-            <w:r>
-              <w:rPr>
-                <w:rFonts w:ascii="Calibri" w:hAnsi="Calibri"/>
-                <w:sz w:val="20"/>
-              </w:rPr>
-              <w:t xml:space="default">Pitch of Primary Roof Face:</w:t>
+            <w:r xmlns:w="http://schemas.openxmlformats.org/wordprocessingml/2006/main" xmlns:wp="http://schemas.openxmlformats.org/drawingml/2006/wordprocessingDrawing" xmlns:r="http://schemas.openxmlformats.org/officeDocument/2006/relationships" xmlns:w14="http://schemas.microsoft.com/office/word/2010/wordml">
+              <w:rPr>
+                <w:rFonts w:ascii="Arial" w:hAnsi="Arial" w:eastAsia="Arial" w:cs="Arial"/>
+                <w:i w:val="false"/>
+                <w:b w:val="false"/>
+                <w:u w:val="none"/>
+                <w:sz w:val="22"/>
+                <w:szCs w:val="22"/>
+                <w:color w:val="000000"/>
+              </w:rPr>
+              <w:t xml:space="preserve">Pitch of Primary Roof Face:</w:t>
             </w:r>
           </w:p>
         </w:tc>
         <w:tc>
           <w:tcPr>
             <w:tcBorders>
-              <w:top w:val="single" w:space="0" w:color="D3D3D3"/>
-              <w:bottom w:val="single" w:space="0" w:color="D3D3D3"/>
-              <w:start w:val="single" w:space="0" w:color="D3D3D3"/>
-              <w:end w:val="single" w:space="0" w:color="D3D3D3"/>
+              <w:bottom w:val="single" w:sz="8" w:space="0" w:color="000000"/>
+              <w:top w:val="single" w:sz="8" w:space="0" w:color="000000"/>
+              <w:left w:val="single" w:sz="8" w:space="0" w:color="000000"/>
+              <w:right w:val="single" w:sz="8" w:space="0" w:color="000000"/>
             </w:tcBorders>
+            <w:shd w:val="clear" w:color="auto" w:fill="FFFFFF"/>
+            <w:tcMar>
+              <w:top w:w="0" w:type="dxa"/>
+              <w:bottom w:w="0" w:type="dxa"/>
+              <w:left w:w="0" w:type="dxa"/>
+              <w:right w:w="0" w:type="dxa"/>
+            </w:tcMar>
+            <w:vAlign w:val="top"/>
           </w:tcPr>
           <w:p>
             <w:pPr>
-              <w:spacing w:before="0" w:after="60"/>
-              <w:keepNext/>
-              <w:jc w:val="start"/>
+              <w:jc w:val="left"/>
+              <w:pBdr>
+                <w:bottom w:val="none" w:sz="0" w:space="0" w:color="000000"/>
+                <w:top w:val="none" w:sz="0" w:space="0" w:color="000000"/>
+                <w:left w:val="none" w:sz="0" w:space="0" w:color="000000"/>
+                <w:right w:val="none" w:sz="0" w:space="0" w:color="000000"/>
+              </w:pBdr>
+              <w:spacing w:after="80" w:before="80" w:line="240"/>
+              <w:ind w:left="80" w:right="80" w:firstLine="0" w:firstLineChars="0"/>
+              <w:rPr>
+                <w:rFonts w:ascii="Arial" w:hAnsi="Arial" w:eastAsia="Arial" w:cs="Arial"/>
+                <w:i w:val="false"/>
+                <w:b w:val="false"/>
+                <w:u w:val="none"/>
+                <w:sz w:val="22"/>
+                <w:szCs w:val="22"/>
+                <w:color w:val="000000"/>
+              </w:rPr>
             </w:pPr>
-            <w:r>
-              <w:rPr>
-                <w:rFonts w:ascii="Calibri" w:hAnsi="Calibri"/>
-                <w:sz w:val="20"/>
-              </w:rPr>
-              <w:t xml:space="default">The pitch of the primary roof face is NA degrees.</w:t>
+            <w:r xmlns:w="http://schemas.openxmlformats.org/wordprocessingml/2006/main" xmlns:wp="http://schemas.openxmlformats.org/drawingml/2006/wordprocessingDrawing" xmlns:r="http://schemas.openxmlformats.org/officeDocument/2006/relationships" xmlns:w14="http://schemas.microsoft.com/office/word/2010/wordml">
+              <w:rPr>
+                <w:rFonts w:ascii="Arial" w:hAnsi="Arial" w:eastAsia="Arial" w:cs="Arial"/>
+                <w:i w:val="false"/>
+                <w:b w:val="false"/>
+                <w:u w:val="none"/>
+                <w:sz w:val="22"/>
+                <w:szCs w:val="22"/>
+                <w:color w:val="000000"/>
+              </w:rPr>
+              <w:t xml:space="preserve">The pitch of the primary roof face is NA degrees.</w:t>
             </w:r>
           </w:p>
         </w:tc>
       </w:tr>
       <w:tr>
         <w:trPr>
-          <w:cantSplit/>
+          <w:trHeight w:val="360" w:hRule="auto"/>
         </w:trPr>
+        body 3
         <w:tc>
           <w:tcPr>
             <w:tcBorders>
-              <w:top w:val="single" w:space="0" w:color="D3D3D3"/>
-              <w:bottom w:val="single" w:space="0" w:color="D3D3D3"/>
-              <w:start w:val="single" w:space="0" w:color="D3D3D3"/>
-              <w:end w:val="single" w:space="0" w:color="D3D3D3"/>
+              <w:bottom w:val="single" w:sz="8" w:space="0" w:color="000000"/>
+              <w:top w:val="single" w:sz="8" w:space="0" w:color="000000"/>
+              <w:left w:val="single" w:sz="8" w:space="0" w:color="000000"/>
+              <w:right w:val="single" w:sz="8" w:space="0" w:color="000000"/>
             </w:tcBorders>
+            <w:shd w:val="clear" w:color="auto" w:fill="FFFFFF"/>
+            <w:tcMar>
+              <w:top w:w="0" w:type="dxa"/>
+              <w:bottom w:w="0" w:type="dxa"/>
+              <w:left w:w="0" w:type="dxa"/>
+              <w:right w:w="0" w:type="dxa"/>
+            </w:tcMar>
+            <w:vAlign w:val="top"/>
           </w:tcPr>
           <w:p>
             <w:pPr>
-              <w:spacing w:before="0" w:after="60"/>
-              <w:keepNext/>
-              <w:jc w:val="center"/>
+              <w:jc w:val="left"/>
+              <w:pBdr>
+                <w:bottom w:val="none" w:sz="0" w:space="0" w:color="000000"/>
+                <w:top w:val="none" w:sz="0" w:space="0" w:color="000000"/>
+                <w:left w:val="none" w:sz="0" w:space="0" w:color="000000"/>
+                <w:right w:val="none" w:sz="0" w:space="0" w:color="000000"/>
+              </w:pBdr>
+              <w:spacing w:after="80" w:before="80" w:line="240"/>
+              <w:ind w:left="80" w:right="80" w:firstLine="0" w:firstLineChars="0"/>
+              <w:rPr>
+                <w:rFonts w:ascii="Arial" w:hAnsi="Arial" w:eastAsia="Arial" w:cs="Arial"/>
+                <w:i w:val="false"/>
+                <w:b w:val="false"/>
+                <w:u w:val="none"/>
+                <w:sz w:val="22"/>
+                <w:szCs w:val="22"/>
+                <w:color w:val="000000"/>
+              </w:rPr>
             </w:pPr>
-            <w:r>
-              <w:rPr>
-                <w:rFonts w:ascii="Calibri" w:hAnsi="Calibri"/>
-                <w:sz w:val="20"/>
-              </w:rPr>
-              <w:t xml:space="default">Insulation Type:</w:t>
+            <w:r xmlns:w="http://schemas.openxmlformats.org/wordprocessingml/2006/main" xmlns:wp="http://schemas.openxmlformats.org/drawingml/2006/wordprocessingDrawing" xmlns:r="http://schemas.openxmlformats.org/officeDocument/2006/relationships" xmlns:w14="http://schemas.microsoft.com/office/word/2010/wordml">
+              <w:rPr>
+                <w:rFonts w:ascii="Arial" w:hAnsi="Arial" w:eastAsia="Arial" w:cs="Arial"/>
+                <w:i w:val="false"/>
+                <w:b w:val="false"/>
+                <w:u w:val="none"/>
+                <w:sz w:val="22"/>
+                <w:szCs w:val="22"/>
+                <w:color w:val="000000"/>
+              </w:rPr>
+              <w:t xml:space="preserve">Insulation Type:</w:t>
             </w:r>
           </w:p>
         </w:tc>
         <w:tc>
           <w:tcPr>
             <w:tcBorders>
-              <w:top w:val="single" w:space="0" w:color="D3D3D3"/>
-              <w:bottom w:val="single" w:space="0" w:color="D3D3D3"/>
-              <w:start w:val="single" w:space="0" w:color="D3D3D3"/>
-              <w:end w:val="single" w:space="0" w:color="D3D3D3"/>
+              <w:bottom w:val="single" w:sz="8" w:space="0" w:color="000000"/>
+              <w:top w:val="single" w:sz="8" w:space="0" w:color="000000"/>
+              <w:left w:val="single" w:sz="8" w:space="0" w:color="000000"/>
+              <w:right w:val="single" w:sz="8" w:space="0" w:color="000000"/>
             </w:tcBorders>
+            <w:shd w:val="clear" w:color="auto" w:fill="FFFFFF"/>
+            <w:tcMar>
+              <w:top w:w="0" w:type="dxa"/>
+              <w:bottom w:w="0" w:type="dxa"/>
+              <w:left w:w="0" w:type="dxa"/>
+              <w:right w:w="0" w:type="dxa"/>
+            </w:tcMar>
+            <w:vAlign w:val="top"/>
           </w:tcPr>
           <w:p>
             <w:pPr>
-              <w:spacing w:before="0" w:after="60"/>
-              <w:keepNext/>
-              <w:jc w:val="start"/>
+              <w:jc w:val="left"/>
+              <w:pBdr>
+                <w:bottom w:val="none" w:sz="0" w:space="0" w:color="000000"/>
+                <w:top w:val="none" w:sz="0" w:space="0" w:color="000000"/>
+                <w:left w:val="none" w:sz="0" w:space="0" w:color="000000"/>
+                <w:right w:val="none" w:sz="0" w:space="0" w:color="000000"/>
+              </w:pBdr>
+              <w:spacing w:after="80" w:before="80" w:line="240"/>
+              <w:ind w:left="80" w:right="80" w:firstLine="0" w:firstLineChars="0"/>
+              <w:rPr>
+                <w:rFonts w:ascii="Arial" w:hAnsi="Arial" w:eastAsia="Arial" w:cs="Arial"/>
+                <w:i w:val="false"/>
+                <w:b w:val="false"/>
+                <w:u w:val="none"/>
+                <w:sz w:val="22"/>
+                <w:szCs w:val="22"/>
+                <w:color w:val="000000"/>
+              </w:rPr>
             </w:pPr>
-            <w:r>
-              <w:rPr>
-                <w:rFonts w:ascii="Calibri" w:hAnsi="Calibri"/>
-                <w:sz w:val="20"/>
-              </w:rPr>
-              <w:t xml:space="default">The attic is insulated with Batts of Fiberglass insulation. The insulation is 9 inches thick.</w:t>
+            <w:r xmlns:w="http://schemas.openxmlformats.org/wordprocessingml/2006/main" xmlns:wp="http://schemas.openxmlformats.org/drawingml/2006/wordprocessingDrawing" xmlns:r="http://schemas.openxmlformats.org/officeDocument/2006/relationships" xmlns:w14="http://schemas.microsoft.com/office/word/2010/wordml">
+              <w:rPr>
+                <w:rFonts w:ascii="Arial" w:hAnsi="Arial" w:eastAsia="Arial" w:cs="Arial"/>
+                <w:i w:val="false"/>
+                <w:b w:val="false"/>
+                <w:u w:val="none"/>
+                <w:sz w:val="22"/>
+                <w:szCs w:val="22"/>
+                <w:color w:val="000000"/>
+              </w:rPr>
+              <w:t xml:space="preserve">The attic is insulated with Batts of Fiberglass insulation. The insulation is 9 inches thick.</w:t>
             </w:r>
           </w:p>
         </w:tc>
       </w:tr>
       <w:tr>
         <w:trPr>
-          <w:cantSplit/>
+          <w:trHeight w:val="360" w:hRule="auto"/>
         </w:trPr>
+        body 4
         <w:tc>
           <w:tcPr>
             <w:tcBorders>
-              <w:top w:val="single" w:space="0" w:color="D3D3D3"/>
-              <w:bottom w:val="single" w:space="0" w:color="D3D3D3"/>
-              <w:start w:val="single" w:space="0" w:color="D3D3D3"/>
-              <w:end w:val="single" w:space="0" w:color="D3D3D3"/>
+              <w:bottom w:val="single" w:sz="8" w:space="0" w:color="000000"/>
+              <w:top w:val="single" w:sz="8" w:space="0" w:color="000000"/>
+              <w:left w:val="single" w:sz="8" w:space="0" w:color="000000"/>
+              <w:right w:val="single" w:sz="8" w:space="0" w:color="000000"/>
             </w:tcBorders>
+            <w:shd w:val="clear" w:color="auto" w:fill="FFFFFF"/>
+            <w:tcMar>
+              <w:top w:w="0" w:type="dxa"/>
+              <w:bottom w:w="0" w:type="dxa"/>
+              <w:left w:w="0" w:type="dxa"/>
+              <w:right w:w="0" w:type="dxa"/>
+            </w:tcMar>
+            <w:vAlign w:val="top"/>
           </w:tcPr>
           <w:p>
             <w:pPr>
-              <w:spacing w:before="0" w:after="60"/>
-              <w:keepNext/>
-              <w:jc w:val="center"/>
+              <w:jc w:val="left"/>
+              <w:pBdr>
+                <w:bottom w:val="none" w:sz="0" w:space="0" w:color="000000"/>
+                <w:top w:val="none" w:sz="0" w:space="0" w:color="000000"/>
+                <w:left w:val="none" w:sz="0" w:space="0" w:color="000000"/>
+                <w:right w:val="none" w:sz="0" w:space="0" w:color="000000"/>
+              </w:pBdr>
+              <w:spacing w:after="80" w:before="80" w:line="240"/>
+              <w:ind w:left="80" w:right="80" w:firstLine="0" w:firstLineChars="0"/>
+              <w:rPr>
+                <w:rFonts w:ascii="Arial" w:hAnsi="Arial" w:eastAsia="Arial" w:cs="Arial"/>
+                <w:i w:val="false"/>
+                <w:b w:val="false"/>
+                <w:u w:val="none"/>
+                <w:sz w:val="22"/>
+                <w:szCs w:val="22"/>
+                <w:color w:val="000000"/>
+              </w:rPr>
             </w:pPr>
-            <w:r>
-              <w:rPr>
-                <w:rFonts w:ascii="Calibri" w:hAnsi="Calibri"/>
-                <w:sz w:val="20"/>
-              </w:rPr>
-              <w:t xml:space="default">Insulation Condition:</w:t>
+            <w:r xmlns:w="http://schemas.openxmlformats.org/wordprocessingml/2006/main" xmlns:wp="http://schemas.openxmlformats.org/drawingml/2006/wordprocessingDrawing" xmlns:r="http://schemas.openxmlformats.org/officeDocument/2006/relationships" xmlns:w14="http://schemas.microsoft.com/office/word/2010/wordml">
+              <w:rPr>
+                <w:rFonts w:ascii="Arial" w:hAnsi="Arial" w:eastAsia="Arial" w:cs="Arial"/>
+                <w:i w:val="false"/>
+                <w:b w:val="false"/>
+                <w:u w:val="none"/>
+                <w:sz w:val="22"/>
+                <w:szCs w:val="22"/>
+                <w:color w:val="000000"/>
+              </w:rPr>
+              <w:t xml:space="preserve">Insulation Condition:</w:t>
             </w:r>
           </w:p>
         </w:tc>
         <w:tc>
           <w:tcPr>
             <w:tcBorders>
-              <w:top w:val="single" w:space="0" w:color="D3D3D3"/>
-              <w:bottom w:val="single" w:space="0" w:color="D3D3D3"/>
-              <w:start w:val="single" w:space="0" w:color="D3D3D3"/>
-              <w:end w:val="single" w:space="0" w:color="D3D3D3"/>
+              <w:bottom w:val="single" w:sz="8" w:space="0" w:color="000000"/>
+              <w:top w:val="single" w:sz="8" w:space="0" w:color="000000"/>
+              <w:left w:val="single" w:sz="8" w:space="0" w:color="000000"/>
+              <w:right w:val="single" w:sz="8" w:space="0" w:color="000000"/>
             </w:tcBorders>
+            <w:shd w:val="clear" w:color="auto" w:fill="FFFFFF"/>
+            <w:tcMar>
+              <w:top w:w="0" w:type="dxa"/>
+              <w:bottom w:w="0" w:type="dxa"/>
+              <w:left w:w="0" w:type="dxa"/>
+              <w:right w:w="0" w:type="dxa"/>
+            </w:tcMar>
+            <w:vAlign w:val="top"/>
           </w:tcPr>
           <w:p>
             <w:pPr>
-              <w:spacing w:before="0" w:after="60"/>
-              <w:keepNext/>
-              <w:jc w:val="start"/>
+              <w:jc w:val="left"/>
+              <w:pBdr>
+                <w:bottom w:val="none" w:sz="0" w:space="0" w:color="000000"/>
+                <w:top w:val="none" w:sz="0" w:space="0" w:color="000000"/>
+                <w:left w:val="none" w:sz="0" w:space="0" w:color="000000"/>
+                <w:right w:val="none" w:sz="0" w:space="0" w:color="000000"/>
+              </w:pBdr>
+              <w:spacing w:after="80" w:before="80" w:line="240"/>
+              <w:ind w:left="80" w:right="80" w:firstLine="0" w:firstLineChars="0"/>
+              <w:rPr>
+                <w:rFonts w:ascii="Arial" w:hAnsi="Arial" w:eastAsia="Arial" w:cs="Arial"/>
+                <w:i w:val="false"/>
+                <w:b w:val="false"/>
+                <w:u w:val="none"/>
+                <w:sz w:val="22"/>
+                <w:szCs w:val="22"/>
+                <w:color w:val="000000"/>
+              </w:rPr>
             </w:pPr>
-            <w:r>
-              <w:rPr>
-                <w:rFonts w:ascii="Calibri" w:hAnsi="Calibri"/>
-                <w:sz w:val="20"/>
-              </w:rPr>
-              <w:t xml:space="default">The insulation is in Fair condition. The attic is mostly insulated, some spots have poorly installed fiberglass batts or lack insulation completely. Rodents have begun eating away at the insulation. The chimney is not air sealed, and opens up into an open cavity that is uninsulated.</w:t>
+            <w:r xmlns:w="http://schemas.openxmlformats.org/wordprocessingml/2006/main" xmlns:wp="http://schemas.openxmlformats.org/drawingml/2006/wordprocessingDrawing" xmlns:r="http://schemas.openxmlformats.org/officeDocument/2006/relationships" xmlns:w14="http://schemas.microsoft.com/office/word/2010/wordml">
+              <w:rPr>
+                <w:rFonts w:ascii="Arial" w:hAnsi="Arial" w:eastAsia="Arial" w:cs="Arial"/>
+                <w:i w:val="false"/>
+                <w:b w:val="false"/>
+                <w:u w:val="none"/>
+                <w:sz w:val="22"/>
+                <w:szCs w:val="22"/>
+                <w:color w:val="000000"/>
+              </w:rPr>
+              <w:t xml:space="preserve">The insulation is in Fair condition. The attic is mostly insulated, some spots have poorly installed fiberglass batts or lack insulation completely. Rodents have begun eating away at the insulation. The chimney is not air sealed, and opens up into an open cavity that is uninsulated.</w:t>
             </w:r>
           </w:p>
         </w:tc>
       </w:tr>
       <w:tr>
         <w:trPr>
-          <w:cantSplit/>
+          <w:trHeight w:val="360" w:hRule="auto"/>
         </w:trPr>
+        body 5
         <w:tc>
           <w:tcPr>
             <w:tcBorders>
-              <w:top w:val="single" w:space="0" w:color="D3D3D3"/>
-              <w:bottom w:val="single" w:space="0" w:color="D3D3D3"/>
-              <w:start w:val="single" w:space="0" w:color="D3D3D3"/>
-              <w:end w:val="single" w:space="0" w:color="D3D3D3"/>
+              <w:bottom w:val="single" w:sz="8" w:space="0" w:color="000000"/>
+              <w:top w:val="single" w:sz="8" w:space="0" w:color="000000"/>
+              <w:left w:val="single" w:sz="8" w:space="0" w:color="000000"/>
+              <w:right w:val="single" w:sz="8" w:space="0" w:color="000000"/>
             </w:tcBorders>
+            <w:shd w:val="clear" w:color="auto" w:fill="FFFFFF"/>
+            <w:tcMar>
+              <w:top w:w="0" w:type="dxa"/>
+              <w:bottom w:w="0" w:type="dxa"/>
+              <w:left w:w="0" w:type="dxa"/>
+              <w:right w:w="0" w:type="dxa"/>
+            </w:tcMar>
+            <w:vAlign w:val="top"/>
           </w:tcPr>
           <w:p>
             <w:pPr>
-              <w:spacing w:before="0" w:after="60"/>
-              <w:keepNext/>
-              <w:jc w:val="center"/>
+              <w:jc w:val="left"/>
+              <w:pBdr>
+                <w:bottom w:val="none" w:sz="0" w:space="0" w:color="000000"/>
+                <w:top w:val="none" w:sz="0" w:space="0" w:color="000000"/>
+                <w:left w:val="none" w:sz="0" w:space="0" w:color="000000"/>
+                <w:right w:val="none" w:sz="0" w:space="0" w:color="000000"/>
+              </w:pBdr>
+              <w:spacing w:after="80" w:before="80" w:line="240"/>
+              <w:ind w:left="80" w:right="80" w:firstLine="0" w:firstLineChars="0"/>
+              <w:rPr>
+                <w:rFonts w:ascii="Arial" w:hAnsi="Arial" w:eastAsia="Arial" w:cs="Arial"/>
+                <w:i w:val="false"/>
+                <w:b w:val="false"/>
+                <w:u w:val="none"/>
+                <w:sz w:val="22"/>
+                <w:szCs w:val="22"/>
+                <w:color w:val="000000"/>
+              </w:rPr>
             </w:pPr>
-            <w:r>
-              <w:rPr>
-                <w:rFonts w:ascii="Calibri" w:hAnsi="Calibri"/>
-                <w:sz w:val="20"/>
-              </w:rPr>
-              <w:t xml:space="default">R-Value:</w:t>
+            <w:r xmlns:w="http://schemas.openxmlformats.org/wordprocessingml/2006/main" xmlns:wp="http://schemas.openxmlformats.org/drawingml/2006/wordprocessingDrawing" xmlns:r="http://schemas.openxmlformats.org/officeDocument/2006/relationships" xmlns:w14="http://schemas.microsoft.com/office/word/2010/wordml">
+              <w:rPr>
+                <w:rFonts w:ascii="Arial" w:hAnsi="Arial" w:eastAsia="Arial" w:cs="Arial"/>
+                <w:i w:val="false"/>
+                <w:b w:val="false"/>
+                <w:u w:val="none"/>
+                <w:sz w:val="22"/>
+                <w:szCs w:val="22"/>
+                <w:color w:val="000000"/>
+              </w:rPr>
+              <w:t xml:space="preserve">R-Value:</w:t>
             </w:r>
           </w:p>
         </w:tc>
         <w:tc>
           <w:tcPr>
             <w:tcBorders>
-              <w:top w:val="single" w:space="0" w:color="D3D3D3"/>
-              <w:bottom w:val="single" w:space="0" w:color="D3D3D3"/>
-              <w:start w:val="single" w:space="0" w:color="D3D3D3"/>
-              <w:end w:val="single" w:space="0" w:color="D3D3D3"/>
+              <w:bottom w:val="single" w:sz="8" w:space="0" w:color="000000"/>
+              <w:top w:val="single" w:sz="8" w:space="0" w:color="000000"/>
+              <w:left w:val="single" w:sz="8" w:space="0" w:color="000000"/>
+              <w:right w:val="single" w:sz="8" w:space="0" w:color="000000"/>
             </w:tcBorders>
+            <w:shd w:val="clear" w:color="auto" w:fill="FFFFFF"/>
+            <w:tcMar>
+              <w:top w:w="0" w:type="dxa"/>
+              <w:bottom w:w="0" w:type="dxa"/>
+              <w:left w:w="0" w:type="dxa"/>
+              <w:right w:w="0" w:type="dxa"/>
+            </w:tcMar>
+            <w:vAlign w:val="top"/>
           </w:tcPr>
           <w:p>
             <w:pPr>
-              <w:spacing w:before="0" w:after="60"/>
-              <w:keepNext/>
-              <w:jc w:val="start"/>
+              <w:jc w:val="left"/>
+              <w:pBdr>
+                <w:bottom w:val="none" w:sz="0" w:space="0" w:color="000000"/>
+                <w:top w:val="none" w:sz="0" w:space="0" w:color="000000"/>
+                <w:left w:val="none" w:sz="0" w:space="0" w:color="000000"/>
+                <w:right w:val="none" w:sz="0" w:space="0" w:color="000000"/>
+              </w:pBdr>
+              <w:spacing w:after="80" w:before="80" w:line="240"/>
+              <w:ind w:left="80" w:right="80" w:firstLine="0" w:firstLineChars="0"/>
+              <w:rPr>
+                <w:rFonts w:ascii="Arial" w:hAnsi="Arial" w:eastAsia="Arial" w:cs="Arial"/>
+                <w:i w:val="false"/>
+                <w:b w:val="false"/>
+                <w:u w:val="none"/>
+                <w:sz w:val="22"/>
+                <w:szCs w:val="22"/>
+                <w:color w:val="000000"/>
+              </w:rPr>
             </w:pPr>
-            <w:r>
-              <w:rPr>
-                <w:rFonts w:ascii="Calibri" w:hAnsi="Calibri"/>
-                <w:sz w:val="20"/>
-              </w:rPr>
-              <w:t xml:space="default">The thickness and condition of the insulation give the insulation an R-value of R-DECIDE per inch. This gives the attic a total R-value of R-CALCULATE. For comparison, current Maine building code requires an attic R-value of R-60, and we typically recommend at least R-80 in attics to keep the house warm in the winter and cool in the summer.</w:t>
+            <w:r xmlns:w="http://schemas.openxmlformats.org/wordprocessingml/2006/main" xmlns:wp="http://schemas.openxmlformats.org/drawingml/2006/wordprocessingDrawing" xmlns:r="http://schemas.openxmlformats.org/officeDocument/2006/relationships" xmlns:w14="http://schemas.microsoft.com/office/word/2010/wordml">
+              <w:rPr>
+                <w:rFonts w:ascii="Arial" w:hAnsi="Arial" w:eastAsia="Arial" w:cs="Arial"/>
+                <w:i w:val="false"/>
+                <w:b w:val="false"/>
+                <w:u w:val="none"/>
+                <w:sz w:val="22"/>
+                <w:szCs w:val="22"/>
+                <w:color w:val="000000"/>
+              </w:rPr>
+              <w:t xml:space="preserve">The thickness and condition of the insulation give the insulation an R-value of R-DECIDE per inch. This gives the attic a total R-value of R-CALCULATE. For comparison, current Maine building code requires an attic R-value of R-60, and we typically recommend at least R-80 in attics to keep the house warm in the winter and cool in the summer.</w:t>
             </w:r>
           </w:p>
         </w:tc>
       </w:tr>
       <w:tr>
         <w:trPr>
-          <w:cantSplit/>
+          <w:trHeight w:val="360" w:hRule="auto"/>
         </w:trPr>
+        body 6
         <w:tc>
           <w:tcPr>
             <w:tcBorders>
-              <w:top w:val="single" w:space="0" w:color="D3D3D3"/>
-              <w:bottom w:val="single" w:space="0" w:color="D3D3D3"/>
-              <w:start w:val="single" w:space="0" w:color="D3D3D3"/>
-              <w:end w:val="single" w:space="0" w:color="D3D3D3"/>
+              <w:bottom w:val="single" w:sz="8" w:space="0" w:color="000000"/>
+              <w:top w:val="single" w:sz="8" w:space="0" w:color="000000"/>
+              <w:left w:val="single" w:sz="8" w:space="0" w:color="000000"/>
+              <w:right w:val="single" w:sz="8" w:space="0" w:color="000000"/>
             </w:tcBorders>
+            <w:shd w:val="clear" w:color="auto" w:fill="FFFFFF"/>
+            <w:tcMar>
+              <w:top w:w="0" w:type="dxa"/>
+              <w:bottom w:w="0" w:type="dxa"/>
+              <w:left w:w="0" w:type="dxa"/>
+              <w:right w:w="0" w:type="dxa"/>
+            </w:tcMar>
+            <w:vAlign w:val="top"/>
           </w:tcPr>
           <w:p>
             <w:pPr>
-              <w:spacing w:before="0" w:after="60"/>
-              <w:keepNext/>
-              <w:jc w:val="center"/>
+              <w:jc w:val="left"/>
+              <w:pBdr>
+                <w:bottom w:val="none" w:sz="0" w:space="0" w:color="000000"/>
+                <w:top w:val="none" w:sz="0" w:space="0" w:color="000000"/>
+                <w:left w:val="none" w:sz="0" w:space="0" w:color="000000"/>
+                <w:right w:val="none" w:sz="0" w:space="0" w:color="000000"/>
+              </w:pBdr>
+              <w:spacing w:after="80" w:before="80" w:line="240"/>
+              <w:ind w:left="80" w:right="80" w:firstLine="0" w:firstLineChars="0"/>
+              <w:rPr>
+                <w:rFonts w:ascii="Arial" w:hAnsi="Arial" w:eastAsia="Arial" w:cs="Arial"/>
+                <w:i w:val="false"/>
+                <w:b w:val="false"/>
+                <w:u w:val="none"/>
+                <w:sz w:val="22"/>
+                <w:szCs w:val="22"/>
+                <w:color w:val="000000"/>
+              </w:rPr>
             </w:pPr>
-            <w:r>
-              <w:rPr>
-                <w:rFonts w:ascii="Calibri" w:hAnsi="Calibri"/>
-                <w:sz w:val="20"/>
-              </w:rPr>
-              <w:t xml:space="default">Air Sealing:</w:t>
+            <w:r xmlns:w="http://schemas.openxmlformats.org/wordprocessingml/2006/main" xmlns:wp="http://schemas.openxmlformats.org/drawingml/2006/wordprocessingDrawing" xmlns:r="http://schemas.openxmlformats.org/officeDocument/2006/relationships" xmlns:w14="http://schemas.microsoft.com/office/word/2010/wordml">
+              <w:rPr>
+                <w:rFonts w:ascii="Arial" w:hAnsi="Arial" w:eastAsia="Arial" w:cs="Arial"/>
+                <w:i w:val="false"/>
+                <w:b w:val="false"/>
+                <w:u w:val="none"/>
+                <w:sz w:val="22"/>
+                <w:szCs w:val="22"/>
+                <w:color w:val="000000"/>
+              </w:rPr>
+              <w:t xml:space="preserve">Air Sealing:</w:t>
             </w:r>
           </w:p>
         </w:tc>
         <w:tc>
           <w:tcPr>
             <w:tcBorders>
-              <w:top w:val="single" w:space="0" w:color="D3D3D3"/>
-              <w:bottom w:val="single" w:space="0" w:color="D3D3D3"/>
-              <w:start w:val="single" w:space="0" w:color="D3D3D3"/>
-              <w:end w:val="single" w:space="0" w:color="D3D3D3"/>
+              <w:bottom w:val="single" w:sz="8" w:space="0" w:color="000000"/>
+              <w:top w:val="single" w:sz="8" w:space="0" w:color="000000"/>
+              <w:left w:val="single" w:sz="8" w:space="0" w:color="000000"/>
+              <w:right w:val="single" w:sz="8" w:space="0" w:color="000000"/>
             </w:tcBorders>
+            <w:shd w:val="clear" w:color="auto" w:fill="FFFFFF"/>
+            <w:tcMar>
+              <w:top w:w="0" w:type="dxa"/>
+              <w:bottom w:w="0" w:type="dxa"/>
+              <w:left w:w="0" w:type="dxa"/>
+              <w:right w:w="0" w:type="dxa"/>
+            </w:tcMar>
+            <w:vAlign w:val="top"/>
           </w:tcPr>
           <w:p>
             <w:pPr>
-              <w:spacing w:before="0" w:after="60"/>
-              <w:keepNext/>
-              <w:jc w:val="start"/>
+              <w:jc w:val="left"/>
+              <w:pBdr>
+                <w:bottom w:val="none" w:sz="0" w:space="0" w:color="000000"/>
+                <w:top w:val="none" w:sz="0" w:space="0" w:color="000000"/>
+                <w:left w:val="none" w:sz="0" w:space="0" w:color="000000"/>
+                <w:right w:val="none" w:sz="0" w:space="0" w:color="000000"/>
+              </w:pBdr>
+              <w:spacing w:after="80" w:before="80" w:line="240"/>
+              <w:ind w:left="80" w:right="80" w:firstLine="0" w:firstLineChars="0"/>
+              <w:rPr>
+                <w:rFonts w:ascii="Arial" w:hAnsi="Arial" w:eastAsia="Arial" w:cs="Arial"/>
+                <w:i w:val="false"/>
+                <w:b w:val="false"/>
+                <w:u w:val="none"/>
+                <w:sz w:val="22"/>
+                <w:szCs w:val="22"/>
+                <w:color w:val="000000"/>
+              </w:rPr>
             </w:pPr>
-            <w:r>
-              <w:rPr>
-                <w:rFonts w:ascii="Calibri" w:hAnsi="Calibri"/>
-                <w:sz w:val="20"/>
-              </w:rPr>
-              <w:t xml:space="default">The attic is not air sealed. NA</w:t>
+            <w:r xmlns:w="http://schemas.openxmlformats.org/wordprocessingml/2006/main" xmlns:wp="http://schemas.openxmlformats.org/drawingml/2006/wordprocessingDrawing" xmlns:r="http://schemas.openxmlformats.org/officeDocument/2006/relationships" xmlns:w14="http://schemas.microsoft.com/office/word/2010/wordml">
+              <w:rPr>
+                <w:rFonts w:ascii="Arial" w:hAnsi="Arial" w:eastAsia="Arial" w:cs="Arial"/>
+                <w:i w:val="false"/>
+                <w:b w:val="false"/>
+                <w:u w:val="none"/>
+                <w:sz w:val="22"/>
+                <w:szCs w:val="22"/>
+                <w:color w:val="000000"/>
+              </w:rPr>
+              <w:t xml:space="preserve">The attic is not air sealed. NA</w:t>
             </w:r>
           </w:p>
         </w:tc>
       </w:tr>
       <w:tr>
         <w:trPr>
-          <w:cantSplit/>
+          <w:trHeight w:val="360" w:hRule="auto"/>
         </w:trPr>
+        body 7
         <w:tc>
           <w:tcPr>
             <w:tcBorders>
-              <w:top w:val="single" w:space="0" w:color="D3D3D3"/>
-              <w:bottom w:val="single" w:space="0" w:color="D3D3D3"/>
-              <w:start w:val="single" w:space="0" w:color="D3D3D3"/>
-              <w:end w:val="single" w:space="0" w:color="D3D3D3"/>
+              <w:bottom w:val="single" w:sz="8" w:space="0" w:color="000000"/>
+              <w:top w:val="single" w:sz="8" w:space="0" w:color="000000"/>
+              <w:left w:val="single" w:sz="8" w:space="0" w:color="000000"/>
+              <w:right w:val="single" w:sz="8" w:space="0" w:color="000000"/>
             </w:tcBorders>
+            <w:shd w:val="clear" w:color="auto" w:fill="FFFFFF"/>
+            <w:tcMar>
+              <w:top w:w="0" w:type="dxa"/>
+              <w:bottom w:w="0" w:type="dxa"/>
+              <w:left w:w="0" w:type="dxa"/>
+              <w:right w:w="0" w:type="dxa"/>
+            </w:tcMar>
+            <w:vAlign w:val="top"/>
           </w:tcPr>
           <w:p>
             <w:pPr>
-              <w:spacing w:before="0" w:after="60"/>
-              <w:keepNext/>
-              <w:jc w:val="center"/>
+              <w:jc w:val="left"/>
+              <w:pBdr>
+                <w:bottom w:val="none" w:sz="0" w:space="0" w:color="000000"/>
+                <w:top w:val="none" w:sz="0" w:space="0" w:color="000000"/>
+                <w:left w:val="none" w:sz="0" w:space="0" w:color="000000"/>
+                <w:right w:val="none" w:sz="0" w:space="0" w:color="000000"/>
+              </w:pBdr>
+              <w:spacing w:after="80" w:before="80" w:line="240"/>
+              <w:ind w:left="80" w:right="80" w:firstLine="0" w:firstLineChars="0"/>
+              <w:rPr>
+                <w:rFonts w:ascii="Arial" w:hAnsi="Arial" w:eastAsia="Arial" w:cs="Arial"/>
+                <w:i w:val="false"/>
+                <w:b w:val="false"/>
+                <w:u w:val="none"/>
+                <w:sz w:val="22"/>
+                <w:szCs w:val="22"/>
+                <w:color w:val="000000"/>
+              </w:rPr>
             </w:pPr>
-            <w:r>
-              <w:rPr>
-                <w:rFonts w:ascii="Calibri" w:hAnsi="Calibri"/>
-                <w:sz w:val="20"/>
-              </w:rPr>
-              <w:t xml:space="default">Attic Hatch:</w:t>
+            <w:r xmlns:w="http://schemas.openxmlformats.org/wordprocessingml/2006/main" xmlns:wp="http://schemas.openxmlformats.org/drawingml/2006/wordprocessingDrawing" xmlns:r="http://schemas.openxmlformats.org/officeDocument/2006/relationships" xmlns:w14="http://schemas.microsoft.com/office/word/2010/wordml">
+              <w:rPr>
+                <w:rFonts w:ascii="Arial" w:hAnsi="Arial" w:eastAsia="Arial" w:cs="Arial"/>
+                <w:i w:val="false"/>
+                <w:b w:val="false"/>
+                <w:u w:val="none"/>
+                <w:sz w:val="22"/>
+                <w:szCs w:val="22"/>
+                <w:color w:val="000000"/>
+              </w:rPr>
+              <w:t xml:space="preserve">Attic Hatch:</w:t>
             </w:r>
           </w:p>
         </w:tc>
         <w:tc>
           <w:tcPr>
             <w:tcBorders>
-              <w:top w:val="single" w:space="0" w:color="D3D3D3"/>
-              <w:bottom w:val="single" w:space="0" w:color="D3D3D3"/>
-              <w:start w:val="single" w:space="0" w:color="D3D3D3"/>
-              <w:end w:val="single" w:space="0" w:color="D3D3D3"/>
+              <w:bottom w:val="single" w:sz="8" w:space="0" w:color="000000"/>
+              <w:top w:val="single" w:sz="8" w:space="0" w:color="000000"/>
+              <w:left w:val="single" w:sz="8" w:space="0" w:color="000000"/>
+              <w:right w:val="single" w:sz="8" w:space="0" w:color="000000"/>
             </w:tcBorders>
+            <w:shd w:val="clear" w:color="auto" w:fill="FFFFFF"/>
+            <w:tcMar>
+              <w:top w:w="0" w:type="dxa"/>
+              <w:bottom w:w="0" w:type="dxa"/>
+              <w:left w:w="0" w:type="dxa"/>
+              <w:right w:w="0" w:type="dxa"/>
+            </w:tcMar>
+            <w:vAlign w:val="top"/>
           </w:tcPr>
           <w:p>
             <w:pPr>
-              <w:spacing w:before="0" w:after="60"/>
-              <w:keepNext/>
-              <w:jc w:val="start"/>
+              <w:jc w:val="left"/>
+              <w:pBdr>
+                <w:bottom w:val="none" w:sz="0" w:space="0" w:color="000000"/>
+                <w:top w:val="none" w:sz="0" w:space="0" w:color="000000"/>
+                <w:left w:val="none" w:sz="0" w:space="0" w:color="000000"/>
+                <w:right w:val="none" w:sz="0" w:space="0" w:color="000000"/>
+              </w:pBdr>
+              <w:spacing w:after="80" w:before="80" w:line="240"/>
+              <w:ind w:left="80" w:right="80" w:firstLine="0" w:firstLineChars="0"/>
+              <w:rPr>
+                <w:rFonts w:ascii="Arial" w:hAnsi="Arial" w:eastAsia="Arial" w:cs="Arial"/>
+                <w:i w:val="false"/>
+                <w:b w:val="false"/>
+                <w:u w:val="none"/>
+                <w:sz w:val="22"/>
+                <w:szCs w:val="22"/>
+                <w:color w:val="000000"/>
+              </w:rPr>
             </w:pPr>
-            <w:r>
-              <w:rPr>
-                <w:rFonts w:ascii="Calibri" w:hAnsi="Calibri"/>
-                <w:sz w:val="20"/>
-              </w:rPr>
-              <w:t xml:space="default">The attic hatch is insulated with Uninsulated, 1/2 plywood insulation that is NA inches thick. The insulation is in NA condition and the hatch is **air sealed / not air sealed**.</w:t>
+            <w:r xmlns:w="http://schemas.openxmlformats.org/wordprocessingml/2006/main" xmlns:wp="http://schemas.openxmlformats.org/drawingml/2006/wordprocessingDrawing" xmlns:r="http://schemas.openxmlformats.org/officeDocument/2006/relationships" xmlns:w14="http://schemas.microsoft.com/office/word/2010/wordml">
+              <w:rPr>
+                <w:rFonts w:ascii="Arial" w:hAnsi="Arial" w:eastAsia="Arial" w:cs="Arial"/>
+                <w:i w:val="false"/>
+                <w:b w:val="false"/>
+                <w:u w:val="none"/>
+                <w:sz w:val="22"/>
+                <w:szCs w:val="22"/>
+                <w:color w:val="000000"/>
+              </w:rPr>
+              <w:t xml:space="preserve">The attic hatch is insulated with Uninsulated, 1/2 plywood insulation that is NA inches thick. The insulation is in NA condition and the hatch is **air sealed / not air sealed**.</w:t>
             </w:r>
           </w:p>
         </w:tc>
       </w:tr>
       <w:tr>
         <w:trPr>
-          <w:cantSplit/>
+          <w:trHeight w:val="360" w:hRule="auto"/>
         </w:trPr>
+        body 8
         <w:tc>
           <w:tcPr>
             <w:tcBorders>
-              <w:top w:val="single" w:space="0" w:color="D3D3D3"/>
-              <w:bottom w:val="single" w:space="0" w:color="D3D3D3"/>
-              <w:start w:val="single" w:space="0" w:color="D3D3D3"/>
-              <w:end w:val="single" w:space="0" w:color="D3D3D3"/>
+              <w:bottom w:val="single" w:sz="8" w:space="0" w:color="000000"/>
+              <w:top w:val="single" w:sz="8" w:space="0" w:color="000000"/>
+              <w:left w:val="single" w:sz="8" w:space="0" w:color="000000"/>
+              <w:right w:val="single" w:sz="8" w:space="0" w:color="000000"/>
             </w:tcBorders>
+            <w:shd w:val="clear" w:color="auto" w:fill="FFFFFF"/>
+            <w:tcMar>
+              <w:top w:w="0" w:type="dxa"/>
+              <w:bottom w:w="0" w:type="dxa"/>
+              <w:left w:w="0" w:type="dxa"/>
+              <w:right w:w="0" w:type="dxa"/>
+            </w:tcMar>
+            <w:vAlign w:val="top"/>
           </w:tcPr>
           <w:p>
             <w:pPr>
-              <w:spacing w:before="0" w:after="60"/>
-              <w:keepNext/>
-              <w:jc w:val="center"/>
+              <w:jc w:val="left"/>
+              <w:pBdr>
+                <w:bottom w:val="none" w:sz="0" w:space="0" w:color="000000"/>
+                <w:top w:val="none" w:sz="0" w:space="0" w:color="000000"/>
+                <w:left w:val="none" w:sz="0" w:space="0" w:color="000000"/>
+                <w:right w:val="none" w:sz="0" w:space="0" w:color="000000"/>
+              </w:pBdr>
+              <w:spacing w:after="80" w:before="80" w:line="240"/>
+              <w:ind w:left="80" w:right="80" w:firstLine="0" w:firstLineChars="0"/>
+              <w:rPr>
+                <w:rFonts w:ascii="Arial" w:hAnsi="Arial" w:eastAsia="Arial" w:cs="Arial"/>
+                <w:i w:val="false"/>
+                <w:b w:val="false"/>
+                <w:u w:val="none"/>
+                <w:sz w:val="22"/>
+                <w:szCs w:val="22"/>
+                <w:color w:val="000000"/>
+              </w:rPr>
             </w:pPr>
-            <w:r>
-              <w:rPr>
-                <w:rFonts w:ascii="Calibri" w:hAnsi="Calibri"/>
-                <w:sz w:val="20"/>
-              </w:rPr>
-              <w:t xml:space="default">Ventilation:</w:t>
+            <w:r xmlns:w="http://schemas.openxmlformats.org/wordprocessingml/2006/main" xmlns:wp="http://schemas.openxmlformats.org/drawingml/2006/wordprocessingDrawing" xmlns:r="http://schemas.openxmlformats.org/officeDocument/2006/relationships" xmlns:w14="http://schemas.microsoft.com/office/word/2010/wordml">
+              <w:rPr>
+                <w:rFonts w:ascii="Arial" w:hAnsi="Arial" w:eastAsia="Arial" w:cs="Arial"/>
+                <w:i w:val="false"/>
+                <w:b w:val="false"/>
+                <w:u w:val="none"/>
+                <w:sz w:val="22"/>
+                <w:szCs w:val="22"/>
+                <w:color w:val="000000"/>
+              </w:rPr>
+              <w:t xml:space="preserve">Ventilation:</w:t>
             </w:r>
           </w:p>
         </w:tc>
         <w:tc>
           <w:tcPr>
             <w:tcBorders>
-              <w:top w:val="single" w:space="0" w:color="D3D3D3"/>
-              <w:bottom w:val="single" w:space="0" w:color="D3D3D3"/>
-              <w:start w:val="single" w:space="0" w:color="D3D3D3"/>
-              <w:end w:val="single" w:space="0" w:color="D3D3D3"/>
+              <w:bottom w:val="single" w:sz="8" w:space="0" w:color="000000"/>
+              <w:top w:val="single" w:sz="8" w:space="0" w:color="000000"/>
+              <w:left w:val="single" w:sz="8" w:space="0" w:color="000000"/>
+              <w:right w:val="single" w:sz="8" w:space="0" w:color="000000"/>
             </w:tcBorders>
+            <w:shd w:val="clear" w:color="auto" w:fill="FFFFFF"/>
+            <w:tcMar>
+              <w:top w:w="0" w:type="dxa"/>
+              <w:bottom w:w="0" w:type="dxa"/>
+              <w:left w:w="0" w:type="dxa"/>
+              <w:right w:w="0" w:type="dxa"/>
+            </w:tcMar>
+            <w:vAlign w:val="top"/>
           </w:tcPr>
           <w:p>
             <w:pPr>
-              <w:spacing w:before="0" w:after="60"/>
-              <w:keepNext/>
-              <w:jc w:val="start"/>
+              <w:jc w:val="left"/>
+              <w:pBdr>
+                <w:bottom w:val="none" w:sz="0" w:space="0" w:color="000000"/>
+                <w:top w:val="none" w:sz="0" w:space="0" w:color="000000"/>
+                <w:left w:val="none" w:sz="0" w:space="0" w:color="000000"/>
+                <w:right w:val="none" w:sz="0" w:space="0" w:color="000000"/>
+              </w:pBdr>
+              <w:spacing w:after="80" w:before="80" w:line="240"/>
+              <w:ind w:left="80" w:right="80" w:firstLine="0" w:firstLineChars="0"/>
+              <w:rPr>
+                <w:rFonts w:ascii="Arial" w:hAnsi="Arial" w:eastAsia="Arial" w:cs="Arial"/>
+                <w:i w:val="false"/>
+                <w:b w:val="false"/>
+                <w:u w:val="none"/>
+                <w:sz w:val="22"/>
+                <w:szCs w:val="22"/>
+                <w:color w:val="000000"/>
+              </w:rPr>
             </w:pPr>
-            <w:r>
-              <w:rPr>
-                <w:rFonts w:ascii="Calibri" w:hAnsi="Calibri"/>
-                <w:sz w:val="20"/>
-              </w:rPr>
-              <w:t xml:space="default">The attic is ventilated by Ridge. Attic ventilation is important to keep the attic space and insulation dry and in good condition.</w:t>
+            <w:r xmlns:w="http://schemas.openxmlformats.org/wordprocessingml/2006/main" xmlns:wp="http://schemas.openxmlformats.org/drawingml/2006/wordprocessingDrawing" xmlns:r="http://schemas.openxmlformats.org/officeDocument/2006/relationships" xmlns:w14="http://schemas.microsoft.com/office/word/2010/wordml">
+              <w:rPr>
+                <w:rFonts w:ascii="Arial" w:hAnsi="Arial" w:eastAsia="Arial" w:cs="Arial"/>
+                <w:i w:val="false"/>
+                <w:b w:val="false"/>
+                <w:u w:val="none"/>
+                <w:sz w:val="22"/>
+                <w:szCs w:val="22"/>
+                <w:color w:val="000000"/>
+              </w:rPr>
+              <w:t xml:space="preserve">The attic is ventilated by Ridge. Attic ventilation is important to keep the attic space and insulation dry and in good condition.</w:t>
             </w:r>
           </w:p>
         </w:tc>
       </w:tr>
       <w:tr>
         <w:trPr>
-          <w:cantSplit/>
+          <w:trHeight w:val="360" w:hRule="auto"/>
         </w:trPr>
+        body 9
         <w:tc>
           <w:tcPr>
             <w:tcBorders>
-              <w:top w:val="single" w:space="0" w:color="D3D3D3"/>
-              <w:bottom w:val="single" w:space="0" w:color="D3D3D3"/>
-              <w:start w:val="single" w:space="0" w:color="D3D3D3"/>
-              <w:end w:val="single" w:space="0" w:color="D3D3D3"/>
+              <w:bottom w:val="single" w:sz="8" w:space="0" w:color="000000"/>
+              <w:top w:val="single" w:sz="8" w:space="0" w:color="000000"/>
+              <w:left w:val="single" w:sz="8" w:space="0" w:color="000000"/>
+              <w:right w:val="single" w:sz="8" w:space="0" w:color="000000"/>
             </w:tcBorders>
+            <w:shd w:val="clear" w:color="auto" w:fill="FFFFFF"/>
+            <w:tcMar>
+              <w:top w:w="0" w:type="dxa"/>
+              <w:bottom w:w="0" w:type="dxa"/>
+              <w:left w:w="0" w:type="dxa"/>
+              <w:right w:w="0" w:type="dxa"/>
+            </w:tcMar>
+            <w:vAlign w:val="top"/>
           </w:tcPr>
           <w:p>
             <w:pPr>
-              <w:spacing w:before="0" w:after="60"/>
-              <w:keepNext/>
-              <w:jc w:val="center"/>
+              <w:jc w:val="left"/>
+              <w:pBdr>
+                <w:bottom w:val="none" w:sz="0" w:space="0" w:color="000000"/>
+                <w:top w:val="none" w:sz="0" w:space="0" w:color="000000"/>
+                <w:left w:val="none" w:sz="0" w:space="0" w:color="000000"/>
+                <w:right w:val="none" w:sz="0" w:space="0" w:color="000000"/>
+              </w:pBdr>
+              <w:spacing w:after="80" w:before="80" w:line="240"/>
+              <w:ind w:left="80" w:right="80" w:firstLine="0" w:firstLineChars="0"/>
+              <w:rPr>
+                <w:rFonts w:ascii="Arial" w:hAnsi="Arial" w:eastAsia="Arial" w:cs="Arial"/>
+                <w:i w:val="false"/>
+                <w:b w:val="false"/>
+                <w:u w:val="none"/>
+                <w:sz w:val="22"/>
+                <w:szCs w:val="22"/>
+                <w:color w:val="000000"/>
+              </w:rPr>
             </w:pPr>
-            <w:r>
-              <w:rPr>
-                <w:rFonts w:ascii="Calibri" w:hAnsi="Calibri"/>
-                <w:sz w:val="20"/>
-              </w:rPr>
-              <w:t xml:space="default">Exhaust Ducts:</w:t>
+            <w:r xmlns:w="http://schemas.openxmlformats.org/wordprocessingml/2006/main" xmlns:wp="http://schemas.openxmlformats.org/drawingml/2006/wordprocessingDrawing" xmlns:r="http://schemas.openxmlformats.org/officeDocument/2006/relationships" xmlns:w14="http://schemas.microsoft.com/office/word/2010/wordml">
+              <w:rPr>
+                <w:rFonts w:ascii="Arial" w:hAnsi="Arial" w:eastAsia="Arial" w:cs="Arial"/>
+                <w:i w:val="false"/>
+                <w:b w:val="false"/>
+                <w:u w:val="none"/>
+                <w:sz w:val="22"/>
+                <w:szCs w:val="22"/>
+                <w:color w:val="000000"/>
+              </w:rPr>
+              <w:t xml:space="preserve">Exhaust Ducts:</w:t>
             </w:r>
           </w:p>
         </w:tc>
         <w:tc>
           <w:tcPr>
             <w:tcBorders>
-              <w:top w:val="single" w:space="0" w:color="D3D3D3"/>
-              <w:bottom w:val="single" w:space="0" w:color="D3D3D3"/>
-              <w:start w:val="single" w:space="0" w:color="D3D3D3"/>
-              <w:end w:val="single" w:space="0" w:color="D3D3D3"/>
+              <w:bottom w:val="single" w:sz="8" w:space="0" w:color="000000"/>
+              <w:top w:val="single" w:sz="8" w:space="0" w:color="000000"/>
+              <w:left w:val="single" w:sz="8" w:space="0" w:color="000000"/>
+              <w:right w:val="single" w:sz="8" w:space="0" w:color="000000"/>
             </w:tcBorders>
+            <w:shd w:val="clear" w:color="auto" w:fill="FFFFFF"/>
+            <w:tcMar>
+              <w:top w:w="0" w:type="dxa"/>
+              <w:bottom w:w="0" w:type="dxa"/>
+              <w:left w:w="0" w:type="dxa"/>
+              <w:right w:w="0" w:type="dxa"/>
+            </w:tcMar>
+            <w:vAlign w:val="top"/>
           </w:tcPr>
           <w:p>
             <w:pPr>
-              <w:spacing w:before="0" w:after="60"/>
-              <w:keepNext/>
-              <w:jc w:val="start"/>
+              <w:jc w:val="left"/>
+              <w:pBdr>
+                <w:bottom w:val="none" w:sz="0" w:space="0" w:color="000000"/>
+                <w:top w:val="none" w:sz="0" w:space="0" w:color="000000"/>
+                <w:left w:val="none" w:sz="0" w:space="0" w:color="000000"/>
+                <w:right w:val="none" w:sz="0" w:space="0" w:color="000000"/>
+              </w:pBdr>
+              <w:spacing w:after="80" w:before="80" w:line="240"/>
+              <w:ind w:left="80" w:right="80" w:firstLine="0" w:firstLineChars="0"/>
+              <w:rPr>
+                <w:rFonts w:ascii="Arial" w:hAnsi="Arial" w:eastAsia="Arial" w:cs="Arial"/>
+                <w:i w:val="false"/>
+                <w:b w:val="false"/>
+                <w:u w:val="none"/>
+                <w:sz w:val="22"/>
+                <w:szCs w:val="22"/>
+                <w:color w:val="000000"/>
+              </w:rPr>
             </w:pPr>
-            <w:r>
-              <w:rPr>
-                <w:rFonts w:ascii="Calibri" w:hAnsi="Calibri"/>
-                <w:sz w:val="20"/>
-              </w:rPr>
-              <w:t xml:space="default">Exhaust ducts from bathroom and kitchen fans are No . Venting exhaust fans to outside is important so that they do not add potentially harmful moisture into the attic space and so they can function properly.</w:t>
+            <w:r xmlns:w="http://schemas.openxmlformats.org/wordprocessingml/2006/main" xmlns:wp="http://schemas.openxmlformats.org/drawingml/2006/wordprocessingDrawing" xmlns:r="http://schemas.openxmlformats.org/officeDocument/2006/relationships" xmlns:w14="http://schemas.microsoft.com/office/word/2010/wordml">
+              <w:rPr>
+                <w:rFonts w:ascii="Arial" w:hAnsi="Arial" w:eastAsia="Arial" w:cs="Arial"/>
+                <w:i w:val="false"/>
+                <w:b w:val="false"/>
+                <w:u w:val="none"/>
+                <w:sz w:val="22"/>
+                <w:szCs w:val="22"/>
+                <w:color w:val="000000"/>
+              </w:rPr>
+              <w:t xml:space="preserve">Exhaust ducts from bathroom and kitchen fans are No . Venting exhaust fans to outside is important so that they do not add potentially harmful moisture into the attic space and so they can function properly.</w:t>
             </w:r>
           </w:p>
         </w:tc>
       </w:tr>
       <w:tr>
         <w:trPr>
-          <w:cantSplit/>
+          <w:trHeight w:val="360" w:hRule="auto"/>
         </w:trPr>
+        body10
         <w:tc>
           <w:tcPr>
             <w:tcBorders>
-              <w:top w:val="single" w:space="0" w:color="D3D3D3"/>
-              <w:bottom w:val="single" w:space="0" w:color="D3D3D3"/>
-              <w:start w:val="single" w:space="0" w:color="D3D3D3"/>
-              <w:end w:val="single" w:space="0" w:color="D3D3D3"/>
+              <w:bottom w:val="single" w:sz="8" w:space="0" w:color="000000"/>
+              <w:top w:val="single" w:sz="8" w:space="0" w:color="000000"/>
+              <w:left w:val="single" w:sz="8" w:space="0" w:color="000000"/>
+              <w:right w:val="single" w:sz="8" w:space="0" w:color="000000"/>
             </w:tcBorders>
+            <w:shd w:val="clear" w:color="auto" w:fill="FFFFFF"/>
+            <w:tcMar>
+              <w:top w:w="0" w:type="dxa"/>
+              <w:bottom w:w="0" w:type="dxa"/>
+              <w:left w:w="0" w:type="dxa"/>
+              <w:right w:w="0" w:type="dxa"/>
+            </w:tcMar>
+            <w:vAlign w:val="top"/>
           </w:tcPr>
           <w:p>
             <w:pPr>
-              <w:spacing w:before="0" w:after="60"/>
-              <w:keepNext/>
-              <w:jc w:val="center"/>
+              <w:jc w:val="left"/>
+              <w:pBdr>
+                <w:bottom w:val="none" w:sz="0" w:space="0" w:color="000000"/>
+                <w:top w:val="none" w:sz="0" w:space="0" w:color="000000"/>
+                <w:left w:val="none" w:sz="0" w:space="0" w:color="000000"/>
+                <w:right w:val="none" w:sz="0" w:space="0" w:color="000000"/>
+              </w:pBdr>
+              <w:spacing w:after="80" w:before="80" w:line="240"/>
+              <w:ind w:left="80" w:right="80" w:firstLine="0" w:firstLineChars="0"/>
+              <w:rPr>
+                <w:rFonts w:ascii="Arial" w:hAnsi="Arial" w:eastAsia="Arial" w:cs="Arial"/>
+                <w:i w:val="false"/>
+                <w:b w:val="false"/>
+                <w:u w:val="none"/>
+                <w:sz w:val="22"/>
+                <w:szCs w:val="22"/>
+                <w:color w:val="000000"/>
+              </w:rPr>
             </w:pPr>
-            <w:r>
-              <